<commit_message>
Add literature review and references draft
</commit_message>
<xml_diff>
--- a/docs/graduation_thesis_report.docx
+++ b/docs/graduation_thesis_report.docx
@@ -305,6 +305,7 @@
           <w:lang w:val="en-US"/>
         </w:rPr>
       </w:pPr>
+      <w:proofErr w:type="spellStart"/>
       <w:r>
         <w:rPr>
           <w:b/>
@@ -313,12 +314,10 @@
           <w:szCs w:val="32"/>
           <w:lang w:val="en-US"/>
         </w:rPr>
-        <w:t>Gülse Dolunay ÜNLÜ</w:t>
-      </w:r>
-    </w:p>
-    <w:p>
-      <w:pPr>
-        <w:jc w:val="center"/>
+        <w:t>Gülse</w:t>
+      </w:r>
+      <w:proofErr w:type="spellEnd"/>
+      <w:r>
         <w:rPr>
           <w:b/>
           <w:color w:val="000000" w:themeColor="text1"/>
@@ -326,8 +325,12 @@
           <w:szCs w:val="32"/>
           <w:lang w:val="en-US"/>
         </w:rPr>
-      </w:pPr>
-      <w:r>
+        <w:t xml:space="preserve"> Dolunay ÜNLÜ</w:t>
+      </w:r>
+    </w:p>
+    <w:p>
+      <w:pPr>
+        <w:jc w:val="center"/>
         <w:rPr>
           <w:b/>
           <w:color w:val="000000" w:themeColor="text1"/>
@@ -335,6 +338,15 @@
           <w:szCs w:val="32"/>
           <w:lang w:val="en-US"/>
         </w:rPr>
+      </w:pPr>
+      <w:r>
+        <w:rPr>
+          <w:b/>
+          <w:color w:val="000000" w:themeColor="text1"/>
+          <w:sz w:val="32"/>
+          <w:szCs w:val="32"/>
+          <w:lang w:val="en-US"/>
+        </w:rPr>
         <w:t>20210305007</w:t>
       </w:r>
     </w:p>
@@ -395,6 +407,7 @@
         </w:rPr>
         <w:t xml:space="preserve">Advisor: </w:t>
       </w:r>
+      <w:proofErr w:type="spellStart"/>
       <w:r>
         <w:rPr>
           <w:bCs/>
@@ -423,8 +436,9 @@
           <w:szCs w:val="32"/>
           <w:lang w:val="en-US"/>
         </w:rPr>
-        <w:t>Dr.</w:t>
-      </w:r>
+        <w:t>Dr</w:t>
+      </w:r>
+      <w:proofErr w:type="spellEnd"/>
       <w:r>
         <w:rPr>
           <w:bCs/>
@@ -433,7 +447,7 @@
           <w:szCs w:val="32"/>
           <w:lang w:val="en-US"/>
         </w:rPr>
-        <w:t xml:space="preserve"> </w:t>
+        <w:t>.</w:t>
       </w:r>
       <w:r>
         <w:rPr>
@@ -443,79 +457,6 @@
           <w:szCs w:val="32"/>
           <w:lang w:val="en-US"/>
         </w:rPr>
-        <w:t>Orhan Özgür AYBAR</w:t>
-      </w:r>
-    </w:p>
-    <w:p>
-      <w:pPr>
-        <w:jc w:val="center"/>
-        <w:rPr>
-          <w:bCs/>
-          <w:sz w:val="32"/>
-          <w:szCs w:val="32"/>
-          <w:lang w:val="en-US"/>
-        </w:rPr>
-      </w:pPr>
-    </w:p>
-    <w:p>
-      <w:pPr>
-        <w:jc w:val="center"/>
-        <w:rPr>
-          <w:bCs/>
-          <w:sz w:val="32"/>
-          <w:szCs w:val="32"/>
-          <w:lang w:val="en-US"/>
-        </w:rPr>
-      </w:pPr>
-    </w:p>
-    <w:p>
-      <w:pPr>
-        <w:jc w:val="center"/>
-        <w:rPr>
-          <w:bCs/>
-          <w:sz w:val="32"/>
-          <w:szCs w:val="32"/>
-          <w:lang w:val="en-US"/>
-        </w:rPr>
-      </w:pPr>
-    </w:p>
-    <w:p>
-      <w:pPr>
-        <w:jc w:val="center"/>
-        <w:rPr>
-          <w:bCs/>
-          <w:sz w:val="32"/>
-          <w:szCs w:val="32"/>
-          <w:lang w:val="en-US"/>
-        </w:rPr>
-      </w:pPr>
-    </w:p>
-    <w:p>
-      <w:pPr>
-        <w:jc w:val="center"/>
-        <w:rPr>
-          <w:bCs/>
-          <w:sz w:val="32"/>
-          <w:szCs w:val="32"/>
-          <w:lang w:val="en-US"/>
-        </w:rPr>
-      </w:pPr>
-      <w:r>
-        <w:rPr>
-          <w:bCs/>
-          <w:sz w:val="32"/>
-          <w:szCs w:val="32"/>
-          <w:lang w:val="en-US"/>
-        </w:rPr>
-        <w:t>İstanbul</w:t>
-      </w:r>
-      <w:r>
-        <w:rPr>
-          <w:bCs/>
-          <w:sz w:val="32"/>
-          <w:szCs w:val="32"/>
-          <w:lang w:val="en-US"/>
-        </w:rPr>
         <w:t xml:space="preserve"> </w:t>
       </w:r>
       <w:r>
@@ -526,7 +467,80 @@
           <w:szCs w:val="32"/>
           <w:lang w:val="en-US"/>
         </w:rPr>
-        <w:t>May, 202</w:t>
+        <w:t>Orhan Özgür AYBAR</w:t>
+      </w:r>
+    </w:p>
+    <w:p>
+      <w:pPr>
+        <w:jc w:val="center"/>
+        <w:rPr>
+          <w:bCs/>
+          <w:sz w:val="32"/>
+          <w:szCs w:val="32"/>
+          <w:lang w:val="en-US"/>
+        </w:rPr>
+      </w:pPr>
+    </w:p>
+    <w:p>
+      <w:pPr>
+        <w:jc w:val="center"/>
+        <w:rPr>
+          <w:bCs/>
+          <w:sz w:val="32"/>
+          <w:szCs w:val="32"/>
+          <w:lang w:val="en-US"/>
+        </w:rPr>
+      </w:pPr>
+    </w:p>
+    <w:p>
+      <w:pPr>
+        <w:jc w:val="center"/>
+        <w:rPr>
+          <w:bCs/>
+          <w:sz w:val="32"/>
+          <w:szCs w:val="32"/>
+          <w:lang w:val="en-US"/>
+        </w:rPr>
+      </w:pPr>
+    </w:p>
+    <w:p>
+      <w:pPr>
+        <w:jc w:val="center"/>
+        <w:rPr>
+          <w:bCs/>
+          <w:sz w:val="32"/>
+          <w:szCs w:val="32"/>
+          <w:lang w:val="en-US"/>
+        </w:rPr>
+      </w:pPr>
+    </w:p>
+    <w:p>
+      <w:pPr>
+        <w:jc w:val="center"/>
+        <w:rPr>
+          <w:bCs/>
+          <w:sz w:val="32"/>
+          <w:szCs w:val="32"/>
+          <w:lang w:val="en-US"/>
+        </w:rPr>
+      </w:pPr>
+      <w:r>
+        <w:rPr>
+          <w:bCs/>
+          <w:sz w:val="32"/>
+          <w:szCs w:val="32"/>
+          <w:lang w:val="en-US"/>
+        </w:rPr>
+        <w:t>İstanbul</w:t>
+      </w:r>
+      <w:r>
+        <w:rPr>
+          <w:bCs/>
+          <w:sz w:val="32"/>
+          <w:szCs w:val="32"/>
+          <w:lang w:val="en-US"/>
+        </w:rPr>
+        <w:t xml:space="preserve"> </w:t>
       </w:r>
       <w:r>
         <w:rPr>
@@ -536,6 +550,16 @@
           <w:szCs w:val="32"/>
           <w:lang w:val="en-US"/>
         </w:rPr>
+        <w:t>May, 202</w:t>
+      </w:r>
+      <w:r>
+        <w:rPr>
+          <w:bCs/>
+          <w:color w:val="000000" w:themeColor="text1"/>
+          <w:sz w:val="32"/>
+          <w:szCs w:val="32"/>
+          <w:lang w:val="en-US"/>
+        </w:rPr>
         <w:t>6</w:t>
       </w:r>
       <w:r>
@@ -570,7 +594,35 @@
         <w:rPr>
           <w:lang w:val="en-US"/>
         </w:rPr>
-        <w:t>I hereby declare that this thesis represents my own work which has been done after registration for the degree of bachelor at Piri Reis University, and has not been previously included in a thesis or dissertation submitted to this or any other institution for a degree, diploma or other qualifications.</w:t>
+        <w:t xml:space="preserve">I hereby declare that this thesis represents my own work which has been done after registration for the </w:t>
+      </w:r>
+      <w:proofErr w:type="gramStart"/>
+      <w:r>
+        <w:rPr>
+          <w:lang w:val="en-US"/>
+        </w:rPr>
+        <w:t>degree of bachelor</w:t>
+      </w:r>
+      <w:proofErr w:type="gramEnd"/>
+      <w:r>
+        <w:rPr>
+          <w:lang w:val="en-US"/>
+        </w:rPr>
+        <w:t xml:space="preserve"> at Piri Reis </w:t>
+      </w:r>
+      <w:proofErr w:type="gramStart"/>
+      <w:r>
+        <w:rPr>
+          <w:lang w:val="en-US"/>
+        </w:rPr>
+        <w:t>University, and</w:t>
+      </w:r>
+      <w:proofErr w:type="gramEnd"/>
+      <w:r>
+        <w:rPr>
+          <w:lang w:val="en-US"/>
+        </w:rPr>
+        <w:t xml:space="preserve"> has not been previously included in a thesis or dissertation submitted to this or any other institution for a degree, diploma or other qualifications.</w:t>
       </w:r>
     </w:p>
     <w:p>
@@ -786,12 +838,26 @@
         <w:rPr>
           <w:lang w:val="en-US" w:eastAsia="tr-TR"/>
         </w:rPr>
-        <w:t xml:space="preserve">I am really grateful </w:t>
-      </w:r>
+        <w:t xml:space="preserve">I am </w:t>
+      </w:r>
+      <w:proofErr w:type="gramStart"/>
       <w:r>
         <w:rPr>
           <w:lang w:val="en-US" w:eastAsia="tr-TR"/>
         </w:rPr>
+        <w:t>really grateful</w:t>
+      </w:r>
+      <w:proofErr w:type="gramEnd"/>
+      <w:r>
+        <w:rPr>
+          <w:lang w:val="en-US" w:eastAsia="tr-TR"/>
+        </w:rPr>
+        <w:t xml:space="preserve"> </w:t>
+      </w:r>
+      <w:r>
+        <w:rPr>
+          <w:lang w:val="en-US" w:eastAsia="tr-TR"/>
+        </w:rPr>
         <w:t xml:space="preserve">…. </w:t>
       </w:r>
       <w:r>
@@ -800,12 +866,14 @@
         </w:rPr>
         <w:t xml:space="preserve">who contributed to this study and to me in </w:t>
       </w:r>
+      <w:proofErr w:type="gramStart"/>
       <w:r>
         <w:rPr>
           <w:lang w:val="en-US" w:eastAsia="tr-TR"/>
         </w:rPr>
         <w:t>…..</w:t>
       </w:r>
+      <w:proofErr w:type="gramEnd"/>
     </w:p>
     <w:p>
       <w:pPr>
@@ -1046,8 +1114,16 @@
         <w:rPr>
           <w:lang w:val="en-US"/>
         </w:rPr>
-        <w:t>……..</w:t>
-      </w:r>
+        <w:t>…</w:t>
+      </w:r>
+      <w:proofErr w:type="gramStart"/>
+      <w:r>
+        <w:rPr>
+          <w:lang w:val="en-US"/>
+        </w:rPr>
+        <w:t>…..</w:t>
+      </w:r>
+      <w:proofErr w:type="gramEnd"/>
       <w:r>
         <w:rPr>
           <w:lang w:val="en-US"/>
@@ -1082,17 +1158,33 @@
         </w:rPr>
         <w:t xml:space="preserve">: Robotic Process Automation, </w:t>
       </w:r>
+      <w:proofErr w:type="gramStart"/>
       <w:r>
         <w:rPr>
           <w:lang w:val="en-US"/>
         </w:rPr>
         <w:t>…..</w:t>
       </w:r>
+      <w:proofErr w:type="gramEnd"/>
       <w:r>
         <w:rPr>
           <w:lang w:val="en-US"/>
         </w:rPr>
-        <w:t xml:space="preserve"> platfroms, RPA benefits</w:t>
+        <w:t xml:space="preserve"> </w:t>
+      </w:r>
+      <w:proofErr w:type="spellStart"/>
+      <w:r>
+        <w:rPr>
+          <w:lang w:val="en-US"/>
+        </w:rPr>
+        <w:t>platfroms</w:t>
+      </w:r>
+      <w:proofErr w:type="spellEnd"/>
+      <w:r>
+        <w:rPr>
+          <w:lang w:val="en-US"/>
+        </w:rPr>
+        <w:t>, RPA benefits</w:t>
       </w:r>
     </w:p>
     <w:p>
@@ -3689,31 +3781,1013 @@
           <w:lang w:val="tr-TR"/>
         </w:rPr>
       </w:pPr>
-      <w:r>
-        <w:rPr>
-          <w:lang w:val="tr-TR"/>
-        </w:rPr>
-        <w:t>Supply chain operations involve multiple activities such as order management, shipment planning, inventory monitoring, delivery performance tracking, and demand planning. As supply chains become more complex, managers need integrated visibility tools to monitor operational performance and identify potential risks.</w:t>
-      </w:r>
-    </w:p>
-    <w:p>
-      <w:pPr>
-        <w:rPr>
-          <w:lang w:val="tr-TR"/>
-        </w:rPr>
-      </w:pPr>
-    </w:p>
-    <w:p>
-      <w:pPr>
-        <w:rPr>
-          <w:lang w:val="tr-TR"/>
-        </w:rPr>
-      </w:pPr>
-      <w:r>
-        <w:rPr>
-          <w:lang w:val="tr-TR"/>
-        </w:rPr>
-        <w:t>This project develops a Supply Chain Visibility and Risk Dashboard as a decision-support prototype. The dashboard uses a public supply chain dataset and transforms it into analytical views for monitoring delivery performance, regional performance, inventory status, shipment delays, risk indicators, and demand forecasts.</w:t>
+      <w:proofErr w:type="spellStart"/>
+      <w:r>
+        <w:rPr>
+          <w:lang w:val="tr-TR"/>
+        </w:rPr>
+        <w:t>Supply</w:t>
+      </w:r>
+      <w:proofErr w:type="spellEnd"/>
+      <w:r>
+        <w:rPr>
+          <w:lang w:val="tr-TR"/>
+        </w:rPr>
+        <w:t xml:space="preserve"> </w:t>
+      </w:r>
+      <w:proofErr w:type="spellStart"/>
+      <w:r>
+        <w:rPr>
+          <w:lang w:val="tr-TR"/>
+        </w:rPr>
+        <w:t>chain</w:t>
+      </w:r>
+      <w:proofErr w:type="spellEnd"/>
+      <w:r>
+        <w:rPr>
+          <w:lang w:val="tr-TR"/>
+        </w:rPr>
+        <w:t xml:space="preserve"> </w:t>
+      </w:r>
+      <w:proofErr w:type="spellStart"/>
+      <w:r>
+        <w:rPr>
+          <w:lang w:val="tr-TR"/>
+        </w:rPr>
+        <w:t>operations</w:t>
+      </w:r>
+      <w:proofErr w:type="spellEnd"/>
+      <w:r>
+        <w:rPr>
+          <w:lang w:val="tr-TR"/>
+        </w:rPr>
+        <w:t xml:space="preserve"> </w:t>
+      </w:r>
+      <w:proofErr w:type="spellStart"/>
+      <w:r>
+        <w:rPr>
+          <w:lang w:val="tr-TR"/>
+        </w:rPr>
+        <w:t>involve</w:t>
+      </w:r>
+      <w:proofErr w:type="spellEnd"/>
+      <w:r>
+        <w:rPr>
+          <w:lang w:val="tr-TR"/>
+        </w:rPr>
+        <w:t xml:space="preserve"> multiple </w:t>
+      </w:r>
+      <w:proofErr w:type="spellStart"/>
+      <w:r>
+        <w:rPr>
+          <w:lang w:val="tr-TR"/>
+        </w:rPr>
+        <w:t>activities</w:t>
+      </w:r>
+      <w:proofErr w:type="spellEnd"/>
+      <w:r>
+        <w:rPr>
+          <w:lang w:val="tr-TR"/>
+        </w:rPr>
+        <w:t xml:space="preserve"> </w:t>
+      </w:r>
+      <w:proofErr w:type="spellStart"/>
+      <w:r>
+        <w:rPr>
+          <w:lang w:val="tr-TR"/>
+        </w:rPr>
+        <w:t>such</w:t>
+      </w:r>
+      <w:proofErr w:type="spellEnd"/>
+      <w:r>
+        <w:rPr>
+          <w:lang w:val="tr-TR"/>
+        </w:rPr>
+        <w:t xml:space="preserve"> as </w:t>
+      </w:r>
+      <w:proofErr w:type="spellStart"/>
+      <w:r>
+        <w:rPr>
+          <w:lang w:val="tr-TR"/>
+        </w:rPr>
+        <w:t>order</w:t>
+      </w:r>
+      <w:proofErr w:type="spellEnd"/>
+      <w:r>
+        <w:rPr>
+          <w:lang w:val="tr-TR"/>
+        </w:rPr>
+        <w:t xml:space="preserve"> </w:t>
+      </w:r>
+      <w:proofErr w:type="spellStart"/>
+      <w:r>
+        <w:rPr>
+          <w:lang w:val="tr-TR"/>
+        </w:rPr>
+        <w:t>management</w:t>
+      </w:r>
+      <w:proofErr w:type="spellEnd"/>
+      <w:r>
+        <w:rPr>
+          <w:lang w:val="tr-TR"/>
+        </w:rPr>
+        <w:t xml:space="preserve">, </w:t>
+      </w:r>
+      <w:proofErr w:type="spellStart"/>
+      <w:r>
+        <w:rPr>
+          <w:lang w:val="tr-TR"/>
+        </w:rPr>
+        <w:t>shipment</w:t>
+      </w:r>
+      <w:proofErr w:type="spellEnd"/>
+      <w:r>
+        <w:rPr>
+          <w:lang w:val="tr-TR"/>
+        </w:rPr>
+        <w:t xml:space="preserve"> </w:t>
+      </w:r>
+      <w:proofErr w:type="spellStart"/>
+      <w:r>
+        <w:rPr>
+          <w:lang w:val="tr-TR"/>
+        </w:rPr>
+        <w:t>planning</w:t>
+      </w:r>
+      <w:proofErr w:type="spellEnd"/>
+      <w:r>
+        <w:rPr>
+          <w:lang w:val="tr-TR"/>
+        </w:rPr>
+        <w:t xml:space="preserve">, </w:t>
+      </w:r>
+      <w:proofErr w:type="spellStart"/>
+      <w:r>
+        <w:rPr>
+          <w:lang w:val="tr-TR"/>
+        </w:rPr>
+        <w:t>inventory</w:t>
+      </w:r>
+      <w:proofErr w:type="spellEnd"/>
+      <w:r>
+        <w:rPr>
+          <w:lang w:val="tr-TR"/>
+        </w:rPr>
+        <w:t xml:space="preserve"> </w:t>
+      </w:r>
+      <w:proofErr w:type="spellStart"/>
+      <w:r>
+        <w:rPr>
+          <w:lang w:val="tr-TR"/>
+        </w:rPr>
+        <w:t>monitoring</w:t>
+      </w:r>
+      <w:proofErr w:type="spellEnd"/>
+      <w:r>
+        <w:rPr>
+          <w:lang w:val="tr-TR"/>
+        </w:rPr>
+        <w:t xml:space="preserve">, </w:t>
+      </w:r>
+      <w:proofErr w:type="spellStart"/>
+      <w:r>
+        <w:rPr>
+          <w:lang w:val="tr-TR"/>
+        </w:rPr>
+        <w:t>delivery</w:t>
+      </w:r>
+      <w:proofErr w:type="spellEnd"/>
+      <w:r>
+        <w:rPr>
+          <w:lang w:val="tr-TR"/>
+        </w:rPr>
+        <w:t xml:space="preserve"> </w:t>
+      </w:r>
+      <w:proofErr w:type="spellStart"/>
+      <w:r>
+        <w:rPr>
+          <w:lang w:val="tr-TR"/>
+        </w:rPr>
+        <w:t>performance</w:t>
+      </w:r>
+      <w:proofErr w:type="spellEnd"/>
+      <w:r>
+        <w:rPr>
+          <w:lang w:val="tr-TR"/>
+        </w:rPr>
+        <w:t xml:space="preserve"> </w:t>
+      </w:r>
+      <w:proofErr w:type="spellStart"/>
+      <w:r>
+        <w:rPr>
+          <w:lang w:val="tr-TR"/>
+        </w:rPr>
+        <w:t>tracking</w:t>
+      </w:r>
+      <w:proofErr w:type="spellEnd"/>
+      <w:r>
+        <w:rPr>
+          <w:lang w:val="tr-TR"/>
+        </w:rPr>
+        <w:t xml:space="preserve">, </w:t>
+      </w:r>
+      <w:proofErr w:type="spellStart"/>
+      <w:r>
+        <w:rPr>
+          <w:lang w:val="tr-TR"/>
+        </w:rPr>
+        <w:t>and</w:t>
+      </w:r>
+      <w:proofErr w:type="spellEnd"/>
+      <w:r>
+        <w:rPr>
+          <w:lang w:val="tr-TR"/>
+        </w:rPr>
+        <w:t xml:space="preserve"> </w:t>
+      </w:r>
+      <w:proofErr w:type="spellStart"/>
+      <w:r>
+        <w:rPr>
+          <w:lang w:val="tr-TR"/>
+        </w:rPr>
+        <w:t>demand</w:t>
+      </w:r>
+      <w:proofErr w:type="spellEnd"/>
+      <w:r>
+        <w:rPr>
+          <w:lang w:val="tr-TR"/>
+        </w:rPr>
+        <w:t xml:space="preserve"> </w:t>
+      </w:r>
+      <w:proofErr w:type="spellStart"/>
+      <w:r>
+        <w:rPr>
+          <w:lang w:val="tr-TR"/>
+        </w:rPr>
+        <w:t>planning</w:t>
+      </w:r>
+      <w:proofErr w:type="spellEnd"/>
+      <w:r>
+        <w:rPr>
+          <w:lang w:val="tr-TR"/>
+        </w:rPr>
+        <w:t xml:space="preserve">. As </w:t>
+      </w:r>
+      <w:proofErr w:type="spellStart"/>
+      <w:r>
+        <w:rPr>
+          <w:lang w:val="tr-TR"/>
+        </w:rPr>
+        <w:t>supply</w:t>
+      </w:r>
+      <w:proofErr w:type="spellEnd"/>
+      <w:r>
+        <w:rPr>
+          <w:lang w:val="tr-TR"/>
+        </w:rPr>
+        <w:t xml:space="preserve"> </w:t>
+      </w:r>
+      <w:proofErr w:type="spellStart"/>
+      <w:r>
+        <w:rPr>
+          <w:lang w:val="tr-TR"/>
+        </w:rPr>
+        <w:t>chains</w:t>
+      </w:r>
+      <w:proofErr w:type="spellEnd"/>
+      <w:r>
+        <w:rPr>
+          <w:lang w:val="tr-TR"/>
+        </w:rPr>
+        <w:t xml:space="preserve"> </w:t>
+      </w:r>
+      <w:proofErr w:type="spellStart"/>
+      <w:r>
+        <w:rPr>
+          <w:lang w:val="tr-TR"/>
+        </w:rPr>
+        <w:t>become</w:t>
+      </w:r>
+      <w:proofErr w:type="spellEnd"/>
+      <w:r>
+        <w:rPr>
+          <w:lang w:val="tr-TR"/>
+        </w:rPr>
+        <w:t xml:space="preserve"> </w:t>
+      </w:r>
+      <w:proofErr w:type="spellStart"/>
+      <w:r>
+        <w:rPr>
+          <w:lang w:val="tr-TR"/>
+        </w:rPr>
+        <w:t>more</w:t>
+      </w:r>
+      <w:proofErr w:type="spellEnd"/>
+      <w:r>
+        <w:rPr>
+          <w:lang w:val="tr-TR"/>
+        </w:rPr>
+        <w:t xml:space="preserve"> </w:t>
+      </w:r>
+      <w:proofErr w:type="spellStart"/>
+      <w:r>
+        <w:rPr>
+          <w:lang w:val="tr-TR"/>
+        </w:rPr>
+        <w:t>complex</w:t>
+      </w:r>
+      <w:proofErr w:type="spellEnd"/>
+      <w:r>
+        <w:rPr>
+          <w:lang w:val="tr-TR"/>
+        </w:rPr>
+        <w:t xml:space="preserve">, </w:t>
+      </w:r>
+      <w:proofErr w:type="spellStart"/>
+      <w:r>
+        <w:rPr>
+          <w:lang w:val="tr-TR"/>
+        </w:rPr>
+        <w:t>managers</w:t>
+      </w:r>
+      <w:proofErr w:type="spellEnd"/>
+      <w:r>
+        <w:rPr>
+          <w:lang w:val="tr-TR"/>
+        </w:rPr>
+        <w:t xml:space="preserve"> </w:t>
+      </w:r>
+      <w:proofErr w:type="spellStart"/>
+      <w:r>
+        <w:rPr>
+          <w:lang w:val="tr-TR"/>
+        </w:rPr>
+        <w:t>need</w:t>
+      </w:r>
+      <w:proofErr w:type="spellEnd"/>
+      <w:r>
+        <w:rPr>
+          <w:lang w:val="tr-TR"/>
+        </w:rPr>
+        <w:t xml:space="preserve"> </w:t>
+      </w:r>
+      <w:proofErr w:type="spellStart"/>
+      <w:r>
+        <w:rPr>
+          <w:lang w:val="tr-TR"/>
+        </w:rPr>
+        <w:t>integrated</w:t>
+      </w:r>
+      <w:proofErr w:type="spellEnd"/>
+      <w:r>
+        <w:rPr>
+          <w:lang w:val="tr-TR"/>
+        </w:rPr>
+        <w:t xml:space="preserve"> </w:t>
+      </w:r>
+      <w:proofErr w:type="spellStart"/>
+      <w:r>
+        <w:rPr>
+          <w:lang w:val="tr-TR"/>
+        </w:rPr>
+        <w:t>visibility</w:t>
+      </w:r>
+      <w:proofErr w:type="spellEnd"/>
+      <w:r>
+        <w:rPr>
+          <w:lang w:val="tr-TR"/>
+        </w:rPr>
+        <w:t xml:space="preserve"> </w:t>
+      </w:r>
+      <w:proofErr w:type="spellStart"/>
+      <w:r>
+        <w:rPr>
+          <w:lang w:val="tr-TR"/>
+        </w:rPr>
+        <w:t>tools</w:t>
+      </w:r>
+      <w:proofErr w:type="spellEnd"/>
+      <w:r>
+        <w:rPr>
+          <w:lang w:val="tr-TR"/>
+        </w:rPr>
+        <w:t xml:space="preserve"> </w:t>
+      </w:r>
+      <w:proofErr w:type="spellStart"/>
+      <w:r>
+        <w:rPr>
+          <w:lang w:val="tr-TR"/>
+        </w:rPr>
+        <w:t>to</w:t>
+      </w:r>
+      <w:proofErr w:type="spellEnd"/>
+      <w:r>
+        <w:rPr>
+          <w:lang w:val="tr-TR"/>
+        </w:rPr>
+        <w:t xml:space="preserve"> </w:t>
+      </w:r>
+      <w:proofErr w:type="spellStart"/>
+      <w:r>
+        <w:rPr>
+          <w:lang w:val="tr-TR"/>
+        </w:rPr>
+        <w:t>monitor</w:t>
+      </w:r>
+      <w:proofErr w:type="spellEnd"/>
+      <w:r>
+        <w:rPr>
+          <w:lang w:val="tr-TR"/>
+        </w:rPr>
+        <w:t xml:space="preserve"> </w:t>
+      </w:r>
+      <w:proofErr w:type="spellStart"/>
+      <w:r>
+        <w:rPr>
+          <w:lang w:val="tr-TR"/>
+        </w:rPr>
+        <w:t>operational</w:t>
+      </w:r>
+      <w:proofErr w:type="spellEnd"/>
+      <w:r>
+        <w:rPr>
+          <w:lang w:val="tr-TR"/>
+        </w:rPr>
+        <w:t xml:space="preserve"> </w:t>
+      </w:r>
+      <w:proofErr w:type="spellStart"/>
+      <w:r>
+        <w:rPr>
+          <w:lang w:val="tr-TR"/>
+        </w:rPr>
+        <w:t>performance</w:t>
+      </w:r>
+      <w:proofErr w:type="spellEnd"/>
+      <w:r>
+        <w:rPr>
+          <w:lang w:val="tr-TR"/>
+        </w:rPr>
+        <w:t xml:space="preserve"> </w:t>
+      </w:r>
+      <w:proofErr w:type="spellStart"/>
+      <w:r>
+        <w:rPr>
+          <w:lang w:val="tr-TR"/>
+        </w:rPr>
+        <w:t>and</w:t>
+      </w:r>
+      <w:proofErr w:type="spellEnd"/>
+      <w:r>
+        <w:rPr>
+          <w:lang w:val="tr-TR"/>
+        </w:rPr>
+        <w:t xml:space="preserve"> </w:t>
+      </w:r>
+      <w:proofErr w:type="spellStart"/>
+      <w:r>
+        <w:rPr>
+          <w:lang w:val="tr-TR"/>
+        </w:rPr>
+        <w:t>identify</w:t>
+      </w:r>
+      <w:proofErr w:type="spellEnd"/>
+      <w:r>
+        <w:rPr>
+          <w:lang w:val="tr-TR"/>
+        </w:rPr>
+        <w:t xml:space="preserve"> </w:t>
+      </w:r>
+      <w:proofErr w:type="spellStart"/>
+      <w:r>
+        <w:rPr>
+          <w:lang w:val="tr-TR"/>
+        </w:rPr>
+        <w:t>potential</w:t>
+      </w:r>
+      <w:proofErr w:type="spellEnd"/>
+      <w:r>
+        <w:rPr>
+          <w:lang w:val="tr-TR"/>
+        </w:rPr>
+        <w:t xml:space="preserve"> </w:t>
+      </w:r>
+      <w:proofErr w:type="spellStart"/>
+      <w:r>
+        <w:rPr>
+          <w:lang w:val="tr-TR"/>
+        </w:rPr>
+        <w:t>risks</w:t>
+      </w:r>
+      <w:proofErr w:type="spellEnd"/>
+      <w:r>
+        <w:rPr>
+          <w:lang w:val="tr-TR"/>
+        </w:rPr>
+        <w:t>.</w:t>
+      </w:r>
+    </w:p>
+    <w:p>
+      <w:pPr>
+        <w:rPr>
+          <w:lang w:val="tr-TR"/>
+        </w:rPr>
+      </w:pPr>
+    </w:p>
+    <w:p>
+      <w:pPr>
+        <w:rPr>
+          <w:lang w:val="tr-TR"/>
+        </w:rPr>
+      </w:pPr>
+      <w:proofErr w:type="spellStart"/>
+      <w:r>
+        <w:rPr>
+          <w:lang w:val="tr-TR"/>
+        </w:rPr>
+        <w:t>This</w:t>
+      </w:r>
+      <w:proofErr w:type="spellEnd"/>
+      <w:r>
+        <w:rPr>
+          <w:lang w:val="tr-TR"/>
+        </w:rPr>
+        <w:t xml:space="preserve"> </w:t>
+      </w:r>
+      <w:proofErr w:type="spellStart"/>
+      <w:r>
+        <w:rPr>
+          <w:lang w:val="tr-TR"/>
+        </w:rPr>
+        <w:t>project</w:t>
+      </w:r>
+      <w:proofErr w:type="spellEnd"/>
+      <w:r>
+        <w:rPr>
+          <w:lang w:val="tr-TR"/>
+        </w:rPr>
+        <w:t xml:space="preserve"> </w:t>
+      </w:r>
+      <w:proofErr w:type="spellStart"/>
+      <w:r>
+        <w:rPr>
+          <w:lang w:val="tr-TR"/>
+        </w:rPr>
+        <w:t>develops</w:t>
+      </w:r>
+      <w:proofErr w:type="spellEnd"/>
+      <w:r>
+        <w:rPr>
+          <w:lang w:val="tr-TR"/>
+        </w:rPr>
+        <w:t xml:space="preserve"> a </w:t>
+      </w:r>
+      <w:proofErr w:type="spellStart"/>
+      <w:r>
+        <w:rPr>
+          <w:lang w:val="tr-TR"/>
+        </w:rPr>
+        <w:t>Supply</w:t>
+      </w:r>
+      <w:proofErr w:type="spellEnd"/>
+      <w:r>
+        <w:rPr>
+          <w:lang w:val="tr-TR"/>
+        </w:rPr>
+        <w:t xml:space="preserve"> </w:t>
+      </w:r>
+      <w:proofErr w:type="spellStart"/>
+      <w:r>
+        <w:rPr>
+          <w:lang w:val="tr-TR"/>
+        </w:rPr>
+        <w:t>Chain</w:t>
+      </w:r>
+      <w:proofErr w:type="spellEnd"/>
+      <w:r>
+        <w:rPr>
+          <w:lang w:val="tr-TR"/>
+        </w:rPr>
+        <w:t xml:space="preserve"> </w:t>
+      </w:r>
+      <w:proofErr w:type="spellStart"/>
+      <w:r>
+        <w:rPr>
+          <w:lang w:val="tr-TR"/>
+        </w:rPr>
+        <w:t>Visibility</w:t>
+      </w:r>
+      <w:proofErr w:type="spellEnd"/>
+      <w:r>
+        <w:rPr>
+          <w:lang w:val="tr-TR"/>
+        </w:rPr>
+        <w:t xml:space="preserve"> </w:t>
+      </w:r>
+      <w:proofErr w:type="spellStart"/>
+      <w:r>
+        <w:rPr>
+          <w:lang w:val="tr-TR"/>
+        </w:rPr>
+        <w:t>and</w:t>
+      </w:r>
+      <w:proofErr w:type="spellEnd"/>
+      <w:r>
+        <w:rPr>
+          <w:lang w:val="tr-TR"/>
+        </w:rPr>
+        <w:t xml:space="preserve"> Risk Dashboard as a </w:t>
+      </w:r>
+      <w:proofErr w:type="spellStart"/>
+      <w:r>
+        <w:rPr>
+          <w:lang w:val="tr-TR"/>
+        </w:rPr>
+        <w:t>decision-support</w:t>
+      </w:r>
+      <w:proofErr w:type="spellEnd"/>
+      <w:r>
+        <w:rPr>
+          <w:lang w:val="tr-TR"/>
+        </w:rPr>
+        <w:t xml:space="preserve"> </w:t>
+      </w:r>
+      <w:proofErr w:type="spellStart"/>
+      <w:r>
+        <w:rPr>
+          <w:lang w:val="tr-TR"/>
+        </w:rPr>
+        <w:t>prototype</w:t>
+      </w:r>
+      <w:proofErr w:type="spellEnd"/>
+      <w:r>
+        <w:rPr>
+          <w:lang w:val="tr-TR"/>
+        </w:rPr>
+        <w:t xml:space="preserve">. </w:t>
+      </w:r>
+      <w:proofErr w:type="spellStart"/>
+      <w:r>
+        <w:rPr>
+          <w:lang w:val="tr-TR"/>
+        </w:rPr>
+        <w:t>The</w:t>
+      </w:r>
+      <w:proofErr w:type="spellEnd"/>
+      <w:r>
+        <w:rPr>
+          <w:lang w:val="tr-TR"/>
+        </w:rPr>
+        <w:t xml:space="preserve"> </w:t>
+      </w:r>
+      <w:proofErr w:type="spellStart"/>
+      <w:r>
+        <w:rPr>
+          <w:lang w:val="tr-TR"/>
+        </w:rPr>
+        <w:t>dashboard</w:t>
+      </w:r>
+      <w:proofErr w:type="spellEnd"/>
+      <w:r>
+        <w:rPr>
+          <w:lang w:val="tr-TR"/>
+        </w:rPr>
+        <w:t xml:space="preserve"> </w:t>
+      </w:r>
+      <w:proofErr w:type="spellStart"/>
+      <w:r>
+        <w:rPr>
+          <w:lang w:val="tr-TR"/>
+        </w:rPr>
+        <w:t>uses</w:t>
+      </w:r>
+      <w:proofErr w:type="spellEnd"/>
+      <w:r>
+        <w:rPr>
+          <w:lang w:val="tr-TR"/>
+        </w:rPr>
+        <w:t xml:space="preserve"> a </w:t>
+      </w:r>
+      <w:proofErr w:type="spellStart"/>
+      <w:r>
+        <w:rPr>
+          <w:lang w:val="tr-TR"/>
+        </w:rPr>
+        <w:t>public</w:t>
+      </w:r>
+      <w:proofErr w:type="spellEnd"/>
+      <w:r>
+        <w:rPr>
+          <w:lang w:val="tr-TR"/>
+        </w:rPr>
+        <w:t xml:space="preserve"> </w:t>
+      </w:r>
+      <w:proofErr w:type="spellStart"/>
+      <w:r>
+        <w:rPr>
+          <w:lang w:val="tr-TR"/>
+        </w:rPr>
+        <w:t>supply</w:t>
+      </w:r>
+      <w:proofErr w:type="spellEnd"/>
+      <w:r>
+        <w:rPr>
+          <w:lang w:val="tr-TR"/>
+        </w:rPr>
+        <w:t xml:space="preserve"> </w:t>
+      </w:r>
+      <w:proofErr w:type="spellStart"/>
+      <w:r>
+        <w:rPr>
+          <w:lang w:val="tr-TR"/>
+        </w:rPr>
+        <w:t>chain</w:t>
+      </w:r>
+      <w:proofErr w:type="spellEnd"/>
+      <w:r>
+        <w:rPr>
+          <w:lang w:val="tr-TR"/>
+        </w:rPr>
+        <w:t xml:space="preserve"> </w:t>
+      </w:r>
+      <w:proofErr w:type="spellStart"/>
+      <w:r>
+        <w:rPr>
+          <w:lang w:val="tr-TR"/>
+        </w:rPr>
+        <w:t>dataset</w:t>
+      </w:r>
+      <w:proofErr w:type="spellEnd"/>
+      <w:r>
+        <w:rPr>
+          <w:lang w:val="tr-TR"/>
+        </w:rPr>
+        <w:t xml:space="preserve"> </w:t>
+      </w:r>
+      <w:proofErr w:type="spellStart"/>
+      <w:r>
+        <w:rPr>
+          <w:lang w:val="tr-TR"/>
+        </w:rPr>
+        <w:t>and</w:t>
+      </w:r>
+      <w:proofErr w:type="spellEnd"/>
+      <w:r>
+        <w:rPr>
+          <w:lang w:val="tr-TR"/>
+        </w:rPr>
+        <w:t xml:space="preserve"> </w:t>
+      </w:r>
+      <w:proofErr w:type="spellStart"/>
+      <w:r>
+        <w:rPr>
+          <w:lang w:val="tr-TR"/>
+        </w:rPr>
+        <w:t>transforms</w:t>
+      </w:r>
+      <w:proofErr w:type="spellEnd"/>
+      <w:r>
+        <w:rPr>
+          <w:lang w:val="tr-TR"/>
+        </w:rPr>
+        <w:t xml:space="preserve"> it </w:t>
+      </w:r>
+      <w:proofErr w:type="spellStart"/>
+      <w:r>
+        <w:rPr>
+          <w:lang w:val="tr-TR"/>
+        </w:rPr>
+        <w:t>into</w:t>
+      </w:r>
+      <w:proofErr w:type="spellEnd"/>
+      <w:r>
+        <w:rPr>
+          <w:lang w:val="tr-TR"/>
+        </w:rPr>
+        <w:t xml:space="preserve"> </w:t>
+      </w:r>
+      <w:proofErr w:type="spellStart"/>
+      <w:r>
+        <w:rPr>
+          <w:lang w:val="tr-TR"/>
+        </w:rPr>
+        <w:t>analytical</w:t>
+      </w:r>
+      <w:proofErr w:type="spellEnd"/>
+      <w:r>
+        <w:rPr>
+          <w:lang w:val="tr-TR"/>
+        </w:rPr>
+        <w:t xml:space="preserve"> </w:t>
+      </w:r>
+      <w:proofErr w:type="spellStart"/>
+      <w:r>
+        <w:rPr>
+          <w:lang w:val="tr-TR"/>
+        </w:rPr>
+        <w:t>views</w:t>
+      </w:r>
+      <w:proofErr w:type="spellEnd"/>
+      <w:r>
+        <w:rPr>
+          <w:lang w:val="tr-TR"/>
+        </w:rPr>
+        <w:t xml:space="preserve"> </w:t>
+      </w:r>
+      <w:proofErr w:type="spellStart"/>
+      <w:r>
+        <w:rPr>
+          <w:lang w:val="tr-TR"/>
+        </w:rPr>
+        <w:t>for</w:t>
+      </w:r>
+      <w:proofErr w:type="spellEnd"/>
+      <w:r>
+        <w:rPr>
+          <w:lang w:val="tr-TR"/>
+        </w:rPr>
+        <w:t xml:space="preserve"> </w:t>
+      </w:r>
+      <w:proofErr w:type="spellStart"/>
+      <w:r>
+        <w:rPr>
+          <w:lang w:val="tr-TR"/>
+        </w:rPr>
+        <w:t>monitoring</w:t>
+      </w:r>
+      <w:proofErr w:type="spellEnd"/>
+      <w:r>
+        <w:rPr>
+          <w:lang w:val="tr-TR"/>
+        </w:rPr>
+        <w:t xml:space="preserve"> </w:t>
+      </w:r>
+      <w:proofErr w:type="spellStart"/>
+      <w:r>
+        <w:rPr>
+          <w:lang w:val="tr-TR"/>
+        </w:rPr>
+        <w:t>delivery</w:t>
+      </w:r>
+      <w:proofErr w:type="spellEnd"/>
+      <w:r>
+        <w:rPr>
+          <w:lang w:val="tr-TR"/>
+        </w:rPr>
+        <w:t xml:space="preserve"> </w:t>
+      </w:r>
+      <w:proofErr w:type="spellStart"/>
+      <w:r>
+        <w:rPr>
+          <w:lang w:val="tr-TR"/>
+        </w:rPr>
+        <w:t>performance</w:t>
+      </w:r>
+      <w:proofErr w:type="spellEnd"/>
+      <w:r>
+        <w:rPr>
+          <w:lang w:val="tr-TR"/>
+        </w:rPr>
+        <w:t xml:space="preserve">, </w:t>
+      </w:r>
+      <w:proofErr w:type="spellStart"/>
+      <w:r>
+        <w:rPr>
+          <w:lang w:val="tr-TR"/>
+        </w:rPr>
+        <w:t>regional</w:t>
+      </w:r>
+      <w:proofErr w:type="spellEnd"/>
+      <w:r>
+        <w:rPr>
+          <w:lang w:val="tr-TR"/>
+        </w:rPr>
+        <w:t xml:space="preserve"> </w:t>
+      </w:r>
+      <w:proofErr w:type="spellStart"/>
+      <w:r>
+        <w:rPr>
+          <w:lang w:val="tr-TR"/>
+        </w:rPr>
+        <w:t>performance</w:t>
+      </w:r>
+      <w:proofErr w:type="spellEnd"/>
+      <w:r>
+        <w:rPr>
+          <w:lang w:val="tr-TR"/>
+        </w:rPr>
+        <w:t xml:space="preserve">, </w:t>
+      </w:r>
+      <w:proofErr w:type="spellStart"/>
+      <w:r>
+        <w:rPr>
+          <w:lang w:val="tr-TR"/>
+        </w:rPr>
+        <w:t>inventory</w:t>
+      </w:r>
+      <w:proofErr w:type="spellEnd"/>
+      <w:r>
+        <w:rPr>
+          <w:lang w:val="tr-TR"/>
+        </w:rPr>
+        <w:t xml:space="preserve"> </w:t>
+      </w:r>
+      <w:proofErr w:type="spellStart"/>
+      <w:r>
+        <w:rPr>
+          <w:lang w:val="tr-TR"/>
+        </w:rPr>
+        <w:t>status</w:t>
+      </w:r>
+      <w:proofErr w:type="spellEnd"/>
+      <w:r>
+        <w:rPr>
+          <w:lang w:val="tr-TR"/>
+        </w:rPr>
+        <w:t xml:space="preserve">, </w:t>
+      </w:r>
+      <w:proofErr w:type="spellStart"/>
+      <w:r>
+        <w:rPr>
+          <w:lang w:val="tr-TR"/>
+        </w:rPr>
+        <w:t>shipment</w:t>
+      </w:r>
+      <w:proofErr w:type="spellEnd"/>
+      <w:r>
+        <w:rPr>
+          <w:lang w:val="tr-TR"/>
+        </w:rPr>
+        <w:t xml:space="preserve"> </w:t>
+      </w:r>
+      <w:proofErr w:type="spellStart"/>
+      <w:r>
+        <w:rPr>
+          <w:lang w:val="tr-TR"/>
+        </w:rPr>
+        <w:t>delays</w:t>
+      </w:r>
+      <w:proofErr w:type="spellEnd"/>
+      <w:r>
+        <w:rPr>
+          <w:lang w:val="tr-TR"/>
+        </w:rPr>
+        <w:t xml:space="preserve">, risk </w:t>
+      </w:r>
+      <w:proofErr w:type="spellStart"/>
+      <w:r>
+        <w:rPr>
+          <w:lang w:val="tr-TR"/>
+        </w:rPr>
+        <w:t>indicators</w:t>
+      </w:r>
+      <w:proofErr w:type="spellEnd"/>
+      <w:r>
+        <w:rPr>
+          <w:lang w:val="tr-TR"/>
+        </w:rPr>
+        <w:t xml:space="preserve">, </w:t>
+      </w:r>
+      <w:proofErr w:type="spellStart"/>
+      <w:r>
+        <w:rPr>
+          <w:lang w:val="tr-TR"/>
+        </w:rPr>
+        <w:t>and</w:t>
+      </w:r>
+      <w:proofErr w:type="spellEnd"/>
+      <w:r>
+        <w:rPr>
+          <w:lang w:val="tr-TR"/>
+        </w:rPr>
+        <w:t xml:space="preserve"> </w:t>
+      </w:r>
+      <w:proofErr w:type="spellStart"/>
+      <w:r>
+        <w:rPr>
+          <w:lang w:val="tr-TR"/>
+        </w:rPr>
+        <w:t>demand</w:t>
+      </w:r>
+      <w:proofErr w:type="spellEnd"/>
+      <w:r>
+        <w:rPr>
+          <w:lang w:val="tr-TR"/>
+        </w:rPr>
+        <w:t xml:space="preserve"> </w:t>
+      </w:r>
+      <w:proofErr w:type="spellStart"/>
+      <w:r>
+        <w:rPr>
+          <w:lang w:val="tr-TR"/>
+        </w:rPr>
+        <w:t>forecasts</w:t>
+      </w:r>
+      <w:proofErr w:type="spellEnd"/>
+      <w:r>
+        <w:rPr>
+          <w:lang w:val="tr-TR"/>
+        </w:rPr>
+        <w:t>.</w:t>
       </w:r>
     </w:p>
     <w:p>
@@ -3733,13 +4807,47 @@
     </w:p>
     <w:p>
       <w:r>
-        <w:t>The literature review section examines studies and professional resources related to supply chain visibility, business intelligence dashboards, supply chain risk management, inventory monitoring, and demand forecasting. The review focuses on how data-driven decision support systems can improve operational transparency and managerial decision making in supply chain environments.</w:t>
+        <w:t>Supply chain visibility is one of the key requirements for modern supply chain management. It refers to the ability to monitor the movement of products, materials, information, and services across different stages of the supply chain. As supply chains become more global and complex, companies need better access to operational data such as order status, inventory levels, shipment performance, and delivery reliability. Without sufficient visibility, managers may have difficulty identifying delays, bottlenecks, inventory risks, and regional performance problems.</w:t>
       </w:r>
     </w:p>
     <w:p/>
     <w:p>
       <w:r>
-        <w:t>A detailed literature table will be prepared with sources published mainly after 2010, including academic papers, technology resources, and documentation related to business intelligence and supply chain analytics.</w:t>
+        <w:t xml:space="preserve">Business intelligence dashboards are commonly used to transform operational data into visual decision-support tools. Instead of </w:t>
+      </w:r>
+      <w:proofErr w:type="spellStart"/>
+      <w:r>
+        <w:t>analyzing</w:t>
+      </w:r>
+      <w:proofErr w:type="spellEnd"/>
+      <w:r>
+        <w:t xml:space="preserve"> raw tables manually, dashboards allow users to monitor key performance indicators, charts, and summary tables from a single interface. In supply chain environments, dashboards can support logistics planning, shipment tracking, inventory monitoring, risk analysis, and demand planning. Therefore, dashboard-based systems can improve managerial awareness and help users detect operational problems more quickly.</w:t>
+      </w:r>
+    </w:p>
+    <w:p/>
+    <w:p>
+      <w:r>
+        <w:t>Supply chain risk management focuses on identifying, assessing, and reducing risks that may affect supply chain performance. These risks may include late deliveries, supplier or regional disruptions, inventory shortages, demand uncertainty, and transportation delays. Digital technologies and data analytics can support risk management by improving visibility and enabling more proactive decision-making. For this reason, the risk analysis module in this project combines delivery risk, delay risk, inventory risk, and demand volatility risk into an overall supply chain risk score.</w:t>
+      </w:r>
+    </w:p>
+    <w:p/>
+    <w:p>
+      <w:r>
+        <w:t>Demand forecasting is another important component of supply chain planning. Forecasting methods help organizations estimate future demand and make better decisions about inventory, replenishment, transportation capacity, and operational planning. In this project, simple forecasting methods such as a 3-month moving average and linear regression are used to demonstrate how historical demand data can be transformed into future demand estimates.</w:t>
+      </w:r>
+    </w:p>
+    <w:p/>
+    <w:p>
+      <w:r>
+        <w:t xml:space="preserve">The project uses the public </w:t>
+      </w:r>
+      <w:proofErr w:type="spellStart"/>
+      <w:r>
+        <w:t>DataCo</w:t>
+      </w:r>
+      <w:proofErr w:type="spellEnd"/>
+      <w:r>
+        <w:t xml:space="preserve"> Smart Supply Chain dataset as the main operational data source. This dataset includes transactional supply chain records such as orders, products, shipment modes, delivery status, sales, profit, and regional information. Since the dataset does not include complete inventory planning fields, additional inventory indicators such as reorder point, safety stock, days of supply, and inventory status are generated from product demand patterns for academic demonstration purposes.</w:t>
       </w:r>
     </w:p>
     <w:p>
@@ -3827,7 +4935,15 @@
     </w:p>
     <w:p>
       <w:r>
-        <w:t>The solution approach consists of collecting a public supply chain dataset, processing the raw data into clean analytical tables, generating additional inventory and risk indicators, and developing a multi-page dashboard with Streamlit.</w:t>
+        <w:t xml:space="preserve">The solution approach consists of collecting a public supply chain dataset, processing the raw data into clean analytical tables, generating additional inventory and risk indicators, and developing a multi-page dashboard with </w:t>
+      </w:r>
+      <w:proofErr w:type="spellStart"/>
+      <w:r>
+        <w:t>Streamlit</w:t>
+      </w:r>
+      <w:proofErr w:type="spellEnd"/>
+      <w:r>
+        <w:t>.</w:t>
       </w:r>
     </w:p>
     <w:p/>
@@ -3848,13 +4964,37 @@
     </w:p>
     <w:p>
       <w:r>
-        <w:t>The project was developed using Python and Streamlit. Python was used for data processing, feature engineering, risk score calculation, and demand forecasting. Streamlit was used to create the interactive dashboard interface.</w:t>
+        <w:t xml:space="preserve">The project was developed using Python and </w:t>
+      </w:r>
+      <w:proofErr w:type="spellStart"/>
+      <w:r>
+        <w:t>Streamlit</w:t>
+      </w:r>
+      <w:proofErr w:type="spellEnd"/>
+      <w:r>
+        <w:t xml:space="preserve">. Python was used for data processing, feature engineering, risk score calculation, and demand forecasting. </w:t>
+      </w:r>
+      <w:proofErr w:type="spellStart"/>
+      <w:r>
+        <w:t>Streamlit</w:t>
+      </w:r>
+      <w:proofErr w:type="spellEnd"/>
+      <w:r>
+        <w:t xml:space="preserve"> was used to create the interactive dashboard interface.</w:t>
       </w:r>
     </w:p>
     <w:p/>
     <w:p>
       <w:r>
-        <w:t>The main Python libraries used in the project are pandas, numpy, Plotly, scikit-learn, and sqlite3. GitHub was used for version control and project documentation.</w:t>
+        <w:t xml:space="preserve">The main Python libraries used in the project are pandas, </w:t>
+      </w:r>
+      <w:proofErr w:type="spellStart"/>
+      <w:r>
+        <w:t>numpy</w:t>
+      </w:r>
+      <w:proofErr w:type="spellEnd"/>
+      <w:r>
+        <w:t>, Plotly, scikit-learn, and sqlite3. GitHub was used for version control and project documentation.</w:t>
       </w:r>
     </w:p>
     <w:p>
@@ -3869,14 +5009,29 @@
     </w:p>
     <w:p>
       <w:r>
-        <w:lastRenderedPageBreak/>
-        <w:t>The system development process started with the preparation of the raw DataCo Smart Supply Chain dataset. The raw dataset was cleaned and transformed using the process_data.py script. This script creates cleaned order, product, shipment, inventory, demand, and risk score tables.</w:t>
+        <w:t xml:space="preserve">The system development process started with the preparation of the raw </w:t>
+      </w:r>
+      <w:proofErr w:type="spellStart"/>
+      <w:r>
+        <w:t>DataCo</w:t>
+      </w:r>
+      <w:proofErr w:type="spellEnd"/>
+      <w:r>
+        <w:t xml:space="preserve"> Smart Supply Chain dataset. The raw dataset was cleaned and transformed using the process_data.py script. This script creates cleaned order, product, shipment, inventory, demand, and risk score tables.</w:t>
       </w:r>
     </w:p>
     <w:p/>
     <w:p>
       <w:r>
-        <w:t>The dashboard was developed as a multi-page Streamlit application. Each page loads processed data and calculates relevant indicators. The system includes operational KPIs, inventory status classification, shipment delay analysis, regional risk scoring, category-level risk analysis, and basic demand forecasting.</w:t>
+        <w:t xml:space="preserve">The dashboard was developed as a multi-page </w:t>
+      </w:r>
+      <w:proofErr w:type="spellStart"/>
+      <w:r>
+        <w:t>Streamlit</w:t>
+      </w:r>
+      <w:proofErr w:type="spellEnd"/>
+      <w:r>
+        <w:t xml:space="preserve"> application. Each page loads processed data and calculates relevant indicators. The system includes operational KPIs, inventory status classification, shipment delay analysis, regional risk scoring, category-level risk analysis, and basic demand forecasting.</w:t>
       </w:r>
     </w:p>
     <w:p/>
@@ -3892,13 +5047,29 @@
     </w:p>
     <w:p>
       <w:r>
-        <w:t>The business case is based on a simulated supply chain analytics scenario using the public DataCo Smart Supply Chain dataset. The case represents a multi-product supply chain network with orders, products, markets, regions, shipment modes, delivery statuses, sales, and profit values.</w:t>
+        <w:t xml:space="preserve">The business case is based on a simulated supply chain analytics scenario using the public </w:t>
+      </w:r>
+      <w:proofErr w:type="spellStart"/>
+      <w:r>
+        <w:t>DataCo</w:t>
+      </w:r>
+      <w:proofErr w:type="spellEnd"/>
+      <w:r>
+        <w:t xml:space="preserve"> Smart Supply Chain dataset. The case represents a multi-product supply chain network with orders, products, markets, regions, shipment modes, delivery statuses, sales, and profit values.</w:t>
       </w:r>
     </w:p>
     <w:p/>
     <w:p>
       <w:r>
-        <w:t>The dashboard is designed for users such as supply chain managers, logistics analysts, inventory planners, and business analysts. These users can monitor overall performance, detect delays, identify inventory risks, analyze regional performance, and review demand forecasts through the dashboard.</w:t>
+        <w:t xml:space="preserve">The dashboard is designed for users such as supply chain managers, logistics analysts, inventory planners, and business analysts. These users can monitor overall performance, detect delays, identify inventory risks, </w:t>
+      </w:r>
+      <w:proofErr w:type="spellStart"/>
+      <w:r>
+        <w:t>analyze</w:t>
+      </w:r>
+      <w:proofErr w:type="spellEnd"/>
+      <w:r>
+        <w:t xml:space="preserve"> regional performance, and review demand forecasts through the dashboard.</w:t>
       </w:r>
     </w:p>
     <w:p>
@@ -3964,9 +5135,9 @@
         <w:t>-------</w:t>
       </w:r>
     </w:p>
-    <w:bookmarkStart w:id="22" w:name="_Toc32521151" w:displacedByCustomXml="next"/>
+    <w:bookmarkStart w:id="22" w:name="_Toc115861788" w:displacedByCustomXml="next"/>
     <w:bookmarkStart w:id="23" w:name="_Toc494826192" w:displacedByCustomXml="next"/>
-    <w:bookmarkStart w:id="24" w:name="_Toc115861788" w:displacedByCustomXml="next"/>
+    <w:bookmarkStart w:id="24" w:name="_Toc32521151" w:displacedByCustomXml="next"/>
     <w:sdt>
       <w:sdtPr>
         <w:rPr>
@@ -4000,632 +5171,1299 @@
         </w:p>
         <w:p>
           <w:pPr>
-            <w:pStyle w:val="Bibliography"/>
-            <w:ind w:left="720" w:hanging="720"/>
-            <w:rPr>
-              <w:noProof/>
-              <w:sz w:val="24"/>
-              <w:szCs w:val="24"/>
+            <w:rPr>
+              <w:lang w:val="tr-TR"/>
             </w:rPr>
           </w:pPr>
           <w:r>
             <w:rPr>
               <w:lang w:val="tr-TR"/>
             </w:rPr>
-            <w:fldChar w:fldCharType="begin"/>
-          </w:r>
-          <w:r>
-            <w:rPr>
-              <w:lang w:val="tr-TR"/>
-            </w:rPr>
-            <w:instrText xml:space="preserve"> BIBLIOGRAPHY </w:instrText>
-          </w:r>
-          <w:r>
-            <w:rPr>
-              <w:lang w:val="tr-TR"/>
-            </w:rPr>
-            <w:fldChar w:fldCharType="separate"/>
-          </w:r>
-          <w:r>
-            <w:rPr>
-              <w:noProof/>
-            </w:rPr>
-            <w:t xml:space="preserve">D’Aveni, R. (1994). </w:t>
-          </w:r>
-          <w:r>
-            <w:rPr>
-              <w:i/>
-              <w:iCs/>
-              <w:noProof/>
-            </w:rPr>
-            <w:t>Hyper Competition.</w:t>
-          </w:r>
-          <w:r>
-            <w:rPr>
-              <w:noProof/>
-            </w:rPr>
-            <w:t xml:space="preserve"> New York, NY: The Free Press.</w:t>
+            <w:t xml:space="preserve">Oracle. (2023). </w:t>
+          </w:r>
+          <w:proofErr w:type="spellStart"/>
+          <w:r>
+            <w:rPr>
+              <w:lang w:val="tr-TR"/>
+            </w:rPr>
+            <w:t>Supply</w:t>
+          </w:r>
+          <w:proofErr w:type="spellEnd"/>
+          <w:r>
+            <w:rPr>
+              <w:lang w:val="tr-TR"/>
+            </w:rPr>
+            <w:t xml:space="preserve"> </w:t>
+          </w:r>
+          <w:proofErr w:type="spellStart"/>
+          <w:r>
+            <w:rPr>
+              <w:lang w:val="tr-TR"/>
+            </w:rPr>
+            <w:t>Chain</w:t>
+          </w:r>
+          <w:proofErr w:type="spellEnd"/>
+          <w:r>
+            <w:rPr>
+              <w:lang w:val="tr-TR"/>
+            </w:rPr>
+            <w:t xml:space="preserve"> </w:t>
+          </w:r>
+          <w:proofErr w:type="spellStart"/>
+          <w:r>
+            <w:rPr>
+              <w:lang w:val="tr-TR"/>
+            </w:rPr>
+            <w:t>Visibility</w:t>
+          </w:r>
+          <w:proofErr w:type="spellEnd"/>
+          <w:r>
+            <w:rPr>
+              <w:lang w:val="tr-TR"/>
+            </w:rPr>
+            <w:t xml:space="preserve"> (SCV): An </w:t>
+          </w:r>
+          <w:proofErr w:type="spellStart"/>
+          <w:r>
+            <w:rPr>
+              <w:lang w:val="tr-TR"/>
+            </w:rPr>
+            <w:t>Introduction</w:t>
+          </w:r>
+          <w:proofErr w:type="spellEnd"/>
+          <w:r>
+            <w:rPr>
+              <w:lang w:val="tr-TR"/>
+            </w:rPr>
+            <w:t xml:space="preserve">. Oracle </w:t>
+          </w:r>
+          <w:proofErr w:type="spellStart"/>
+          <w:r>
+            <w:rPr>
+              <w:lang w:val="tr-TR"/>
+            </w:rPr>
+            <w:t>Supply</w:t>
+          </w:r>
+          <w:proofErr w:type="spellEnd"/>
+          <w:r>
+            <w:rPr>
+              <w:lang w:val="tr-TR"/>
+            </w:rPr>
+            <w:t xml:space="preserve"> </w:t>
+          </w:r>
+          <w:proofErr w:type="spellStart"/>
+          <w:r>
+            <w:rPr>
+              <w:lang w:val="tr-TR"/>
+            </w:rPr>
+            <w:t>Chain</w:t>
+          </w:r>
+          <w:proofErr w:type="spellEnd"/>
+          <w:r>
+            <w:rPr>
+              <w:lang w:val="tr-TR"/>
+            </w:rPr>
+            <w:t xml:space="preserve"> Management.</w:t>
           </w:r>
         </w:p>
         <w:p>
           <w:pPr>
-            <w:pStyle w:val="Bibliography"/>
-            <w:ind w:left="720" w:hanging="720"/>
-            <w:rPr>
-              <w:noProof/>
+            <w:rPr>
+              <w:lang w:val="tr-TR"/>
             </w:rPr>
           </w:pPr>
-          <w:r>
-            <w:rPr>
-              <w:noProof/>
-            </w:rPr>
-            <w:t xml:space="preserve">Erkan, S. (2015). </w:t>
-          </w:r>
-          <w:r>
-            <w:rPr>
-              <w:i/>
-              <w:iCs/>
-              <w:noProof/>
-            </w:rPr>
-            <w:t>Bulut Bilişimde Doğru Seçim Özel Bulut mu? Kamusal Bulut mu?</w:t>
-          </w:r>
-          <w:r>
-            <w:rPr>
-              <w:noProof/>
-            </w:rPr>
-            <w:t xml:space="preserve"> 08 22, 2015 tarihinde karel.com.tr: http://www.karel.com.tr/blog/bulut-bilisim-dogru-secim-ozel-bulut-mu-kamusal-bulut-mu adresinden alındı</w:t>
-          </w:r>
         </w:p>
         <w:p>
           <w:pPr>
-            <w:pStyle w:val="Bibliography"/>
-            <w:ind w:left="720" w:hanging="720"/>
-            <w:rPr>
-              <w:noProof/>
+            <w:rPr>
+              <w:lang w:val="tr-TR"/>
             </w:rPr>
           </w:pPr>
-          <w:r>
-            <w:rPr>
-              <w:noProof/>
-            </w:rPr>
-            <w:t xml:space="preserve">Evans, P., &amp; Wurster, T. (2000). </w:t>
-          </w:r>
-          <w:r>
-            <w:rPr>
-              <w:i/>
-              <w:iCs/>
-              <w:noProof/>
-            </w:rPr>
-            <w:t>Blown to Bits.</w:t>
-          </w:r>
-          <w:r>
-            <w:rPr>
-              <w:noProof/>
-            </w:rPr>
-            <w:t xml:space="preserve"> Boston, MA.: Harvard Business School Press.</w:t>
+          <w:proofErr w:type="spellStart"/>
+          <w:r>
+            <w:rPr>
+              <w:lang w:val="tr-TR"/>
+            </w:rPr>
+            <w:t>Stibo</w:t>
+          </w:r>
+          <w:proofErr w:type="spellEnd"/>
+          <w:r>
+            <w:rPr>
+              <w:lang w:val="tr-TR"/>
+            </w:rPr>
+            <w:t xml:space="preserve"> </w:t>
+          </w:r>
+          <w:proofErr w:type="spellStart"/>
+          <w:r>
+            <w:rPr>
+              <w:lang w:val="tr-TR"/>
+            </w:rPr>
+            <w:t>Systems</w:t>
+          </w:r>
+          <w:proofErr w:type="spellEnd"/>
+          <w:r>
+            <w:rPr>
+              <w:lang w:val="tr-TR"/>
+            </w:rPr>
+            <w:t xml:space="preserve">. (2022). </w:t>
+          </w:r>
+          <w:proofErr w:type="spellStart"/>
+          <w:r>
+            <w:rPr>
+              <w:lang w:val="tr-TR"/>
+            </w:rPr>
+            <w:t>Supply</w:t>
+          </w:r>
+          <w:proofErr w:type="spellEnd"/>
+          <w:r>
+            <w:rPr>
+              <w:lang w:val="tr-TR"/>
+            </w:rPr>
+            <w:t xml:space="preserve"> </w:t>
+          </w:r>
+          <w:proofErr w:type="spellStart"/>
+          <w:r>
+            <w:rPr>
+              <w:lang w:val="tr-TR"/>
+            </w:rPr>
+            <w:t>Chain</w:t>
+          </w:r>
+          <w:proofErr w:type="spellEnd"/>
+          <w:r>
+            <w:rPr>
+              <w:lang w:val="tr-TR"/>
+            </w:rPr>
+            <w:t xml:space="preserve"> </w:t>
+          </w:r>
+          <w:proofErr w:type="spellStart"/>
+          <w:r>
+            <w:rPr>
+              <w:lang w:val="tr-TR"/>
+            </w:rPr>
+            <w:t>Visibility</w:t>
+          </w:r>
+          <w:proofErr w:type="spellEnd"/>
+          <w:r>
+            <w:rPr>
+              <w:lang w:val="tr-TR"/>
+            </w:rPr>
+            <w:t xml:space="preserve">: </w:t>
+          </w:r>
+          <w:proofErr w:type="spellStart"/>
+          <w:r>
+            <w:rPr>
+              <w:lang w:val="tr-TR"/>
+            </w:rPr>
+            <w:t>What</w:t>
+          </w:r>
+          <w:proofErr w:type="spellEnd"/>
+          <w:r>
+            <w:rPr>
+              <w:lang w:val="tr-TR"/>
+            </w:rPr>
+            <w:t xml:space="preserve"> is it </w:t>
+          </w:r>
+          <w:proofErr w:type="spellStart"/>
+          <w:r>
+            <w:rPr>
+              <w:lang w:val="tr-TR"/>
+            </w:rPr>
+            <w:t>and</w:t>
+          </w:r>
+          <w:proofErr w:type="spellEnd"/>
+          <w:r>
+            <w:rPr>
+              <w:lang w:val="tr-TR"/>
+            </w:rPr>
+            <w:t xml:space="preserve"> </w:t>
+          </w:r>
+          <w:proofErr w:type="spellStart"/>
+          <w:r>
+            <w:rPr>
+              <w:lang w:val="tr-TR"/>
+            </w:rPr>
+            <w:t>why</w:t>
+          </w:r>
+          <w:proofErr w:type="spellEnd"/>
+          <w:r>
+            <w:rPr>
+              <w:lang w:val="tr-TR"/>
+            </w:rPr>
+            <w:t xml:space="preserve"> is it </w:t>
+          </w:r>
+          <w:proofErr w:type="spellStart"/>
+          <w:r>
+            <w:rPr>
+              <w:lang w:val="tr-TR"/>
+            </w:rPr>
+            <w:t>important</w:t>
+          </w:r>
+          <w:proofErr w:type="spellEnd"/>
+          <w:r>
+            <w:rPr>
+              <w:lang w:val="tr-TR"/>
+            </w:rPr>
+            <w:t>?</w:t>
           </w:r>
         </w:p>
         <w:p>
           <w:pPr>
-            <w:pStyle w:val="Bibliography"/>
-            <w:ind w:left="720" w:hanging="720"/>
-            <w:rPr>
-              <w:noProof/>
+            <w:rPr>
+              <w:lang w:val="tr-TR"/>
             </w:rPr>
           </w:pPr>
-          <w:r>
-            <w:rPr>
-              <w:noProof/>
-            </w:rPr>
-            <w:t xml:space="preserve">Ganly, D., Kyte, A., Rayner, N., &amp; Hardcastle, C. (2013, Aralık 05). </w:t>
-          </w:r>
-          <w:r>
-            <w:rPr>
-              <w:i/>
-              <w:iCs/>
-              <w:noProof/>
-            </w:rPr>
-            <w:t>Predicts 2014: The Rise of the Postmodern ERP and Enterprise Applications World</w:t>
-          </w:r>
-          <w:r>
-            <w:rPr>
-              <w:noProof/>
-            </w:rPr>
-            <w:t>. Temmuz 21, 2015 tarihinde Gartner: https://www.gartner.com/doc/2633315 adresinden alındı</w:t>
-          </w:r>
         </w:p>
         <w:p>
           <w:pPr>
-            <w:pStyle w:val="Bibliography"/>
-            <w:ind w:left="720" w:hanging="720"/>
-            <w:rPr>
-              <w:noProof/>
+            <w:rPr>
+              <w:lang w:val="tr-TR"/>
             </w:rPr>
           </w:pPr>
-          <w:r>
-            <w:rPr>
-              <w:noProof/>
-            </w:rPr>
-            <w:t xml:space="preserve">Gör, A. G., &amp; Güneri, F. (2008). ERP Yazılım Seçiminde ANP Tekniğinin Kullanılması. </w:t>
-          </w:r>
-          <w:r>
-            <w:rPr>
-              <w:i/>
-              <w:iCs/>
-              <w:noProof/>
-            </w:rPr>
-            <w:t>2. Ulusal Sistem Mühendisliği Kongresi Bildiriler Kitabı</w:t>
-          </w:r>
-          <w:r>
-            <w:rPr>
-              <w:noProof/>
-            </w:rPr>
-            <w:t>, 296-300.</w:t>
+          <w:proofErr w:type="spellStart"/>
+          <w:r>
+            <w:rPr>
+              <w:lang w:val="tr-TR"/>
+            </w:rPr>
+            <w:t>Emrouznejad</w:t>
+          </w:r>
+          <w:proofErr w:type="spellEnd"/>
+          <w:r>
+            <w:rPr>
+              <w:lang w:val="tr-TR"/>
+            </w:rPr>
+            <w:t xml:space="preserve">, A., et al. (2023). </w:t>
+          </w:r>
+          <w:proofErr w:type="spellStart"/>
+          <w:r>
+            <w:rPr>
+              <w:lang w:val="tr-TR"/>
+            </w:rPr>
+            <w:t>Supply</w:t>
+          </w:r>
+          <w:proofErr w:type="spellEnd"/>
+          <w:r>
+            <w:rPr>
+              <w:lang w:val="tr-TR"/>
+            </w:rPr>
+            <w:t xml:space="preserve"> </w:t>
+          </w:r>
+          <w:proofErr w:type="spellStart"/>
+          <w:r>
+            <w:rPr>
+              <w:lang w:val="tr-TR"/>
+            </w:rPr>
+            <w:t>chain</w:t>
+          </w:r>
+          <w:proofErr w:type="spellEnd"/>
+          <w:r>
+            <w:rPr>
+              <w:lang w:val="tr-TR"/>
+            </w:rPr>
+            <w:t xml:space="preserve"> risk </w:t>
+          </w:r>
+          <w:proofErr w:type="spellStart"/>
+          <w:r>
+            <w:rPr>
+              <w:lang w:val="tr-TR"/>
+            </w:rPr>
+            <w:t>management</w:t>
+          </w:r>
+          <w:proofErr w:type="spellEnd"/>
+          <w:r>
+            <w:rPr>
+              <w:lang w:val="tr-TR"/>
+            </w:rPr>
+            <w:t xml:space="preserve">: A </w:t>
+          </w:r>
+          <w:proofErr w:type="spellStart"/>
+          <w:r>
+            <w:rPr>
+              <w:lang w:val="tr-TR"/>
+            </w:rPr>
+            <w:t>content</w:t>
+          </w:r>
+          <w:proofErr w:type="spellEnd"/>
+          <w:r>
+            <w:rPr>
+              <w:lang w:val="tr-TR"/>
+            </w:rPr>
+            <w:t xml:space="preserve"> </w:t>
+          </w:r>
+          <w:proofErr w:type="spellStart"/>
+          <w:r>
+            <w:rPr>
+              <w:lang w:val="tr-TR"/>
+            </w:rPr>
+            <w:t>analysis-based</w:t>
+          </w:r>
+          <w:proofErr w:type="spellEnd"/>
+          <w:r>
+            <w:rPr>
+              <w:lang w:val="tr-TR"/>
+            </w:rPr>
+            <w:t xml:space="preserve"> </w:t>
+          </w:r>
+          <w:proofErr w:type="spellStart"/>
+          <w:r>
+            <w:rPr>
+              <w:lang w:val="tr-TR"/>
+            </w:rPr>
+            <w:t>review</w:t>
+          </w:r>
+          <w:proofErr w:type="spellEnd"/>
+          <w:r>
+            <w:rPr>
+              <w:lang w:val="tr-TR"/>
+            </w:rPr>
+            <w:t xml:space="preserve">. </w:t>
+          </w:r>
+          <w:proofErr w:type="spellStart"/>
+          <w:r>
+            <w:rPr>
+              <w:lang w:val="tr-TR"/>
+            </w:rPr>
+            <w:t>Cleaner</w:t>
+          </w:r>
+          <w:proofErr w:type="spellEnd"/>
+          <w:r>
+            <w:rPr>
+              <w:lang w:val="tr-TR"/>
+            </w:rPr>
+            <w:t xml:space="preserve"> </w:t>
+          </w:r>
+          <w:proofErr w:type="spellStart"/>
+          <w:r>
+            <w:rPr>
+              <w:lang w:val="tr-TR"/>
+            </w:rPr>
+            <w:t>Logistics</w:t>
+          </w:r>
+          <w:proofErr w:type="spellEnd"/>
+          <w:r>
+            <w:rPr>
+              <w:lang w:val="tr-TR"/>
+            </w:rPr>
+            <w:t xml:space="preserve"> </w:t>
+          </w:r>
+          <w:proofErr w:type="spellStart"/>
+          <w:r>
+            <w:rPr>
+              <w:lang w:val="tr-TR"/>
+            </w:rPr>
+            <w:t>and</w:t>
+          </w:r>
+          <w:proofErr w:type="spellEnd"/>
+          <w:r>
+            <w:rPr>
+              <w:lang w:val="tr-TR"/>
+            </w:rPr>
+            <w:t xml:space="preserve"> </w:t>
+          </w:r>
+          <w:proofErr w:type="spellStart"/>
+          <w:r>
+            <w:rPr>
+              <w:lang w:val="tr-TR"/>
+            </w:rPr>
+            <w:t>Supply</w:t>
+          </w:r>
+          <w:proofErr w:type="spellEnd"/>
+          <w:r>
+            <w:rPr>
+              <w:lang w:val="tr-TR"/>
+            </w:rPr>
+            <w:t xml:space="preserve"> </w:t>
+          </w:r>
+          <w:proofErr w:type="spellStart"/>
+          <w:r>
+            <w:rPr>
+              <w:lang w:val="tr-TR"/>
+            </w:rPr>
+            <w:t>Chain</w:t>
+          </w:r>
+          <w:proofErr w:type="spellEnd"/>
+          <w:r>
+            <w:rPr>
+              <w:lang w:val="tr-TR"/>
+            </w:rPr>
+            <w:t>.</w:t>
           </w:r>
         </w:p>
         <w:p>
           <w:pPr>
-            <w:pStyle w:val="Bibliography"/>
-            <w:ind w:left="720" w:hanging="720"/>
-            <w:rPr>
-              <w:noProof/>
+            <w:rPr>
+              <w:lang w:val="tr-TR"/>
             </w:rPr>
           </w:pPr>
-          <w:r>
-            <w:rPr>
-              <w:noProof/>
-            </w:rPr>
-            <w:t xml:space="preserve">Honeywell International Inc. (2015, Mart). </w:t>
-          </w:r>
-          <w:r>
-            <w:rPr>
-              <w:i/>
-              <w:iCs/>
-              <w:noProof/>
-            </w:rPr>
-            <w:t>Optimize Your Workflow Performance with Voice.</w:t>
-          </w:r>
-          <w:r>
-            <w:rPr>
-              <w:noProof/>
-            </w:rPr>
-            <w:t xml:space="preserve"> Mayıs 31, 2015 tarihinde http://www.vocollectvoice.com: http://www.vocollectvoice.com/download.aspx?file=d532335e-4054-4130-a8d7-38f92778092e.pdf adresinden alındı</w:t>
-          </w:r>
         </w:p>
         <w:p>
           <w:pPr>
-            <w:pStyle w:val="Bibliography"/>
-            <w:ind w:left="720" w:hanging="720"/>
-            <w:rPr>
-              <w:noProof/>
+            <w:rPr>
+              <w:lang w:val="tr-TR"/>
             </w:rPr>
           </w:pPr>
-          <w:r>
-            <w:rPr>
-              <w:noProof/>
-            </w:rPr>
-            <w:t xml:space="preserve">Hung, S. Y., Chang, S. I., &amp; Lee, P. J. (2004). Critical factors of adoption for small and medium sized enterprises: An empirical study. </w:t>
-          </w:r>
-          <w:r>
-            <w:rPr>
-              <w:i/>
-              <w:iCs/>
-              <w:noProof/>
-            </w:rPr>
-            <w:t>Proceedings of the Pacific Asia Conference on Information Systems</w:t>
-          </w:r>
-          <w:r>
-            <w:rPr>
-              <w:noProof/>
-            </w:rPr>
-            <w:t xml:space="preserve"> (s. 724-737). PACIS 2004.</w:t>
+          <w:proofErr w:type="spellStart"/>
+          <w:r>
+            <w:rPr>
+              <w:lang w:val="tr-TR"/>
+            </w:rPr>
+            <w:t>Das</w:t>
+          </w:r>
+          <w:proofErr w:type="spellEnd"/>
+          <w:r>
+            <w:rPr>
+              <w:lang w:val="tr-TR"/>
+            </w:rPr>
+            <w:t xml:space="preserve">, S. K., et al. (2025). </w:t>
+          </w:r>
+          <w:proofErr w:type="spellStart"/>
+          <w:r>
+            <w:rPr>
+              <w:lang w:val="tr-TR"/>
+            </w:rPr>
+            <w:t>Supply</w:t>
+          </w:r>
+          <w:proofErr w:type="spellEnd"/>
+          <w:r>
+            <w:rPr>
+              <w:lang w:val="tr-TR"/>
+            </w:rPr>
+            <w:t xml:space="preserve"> </w:t>
+          </w:r>
+          <w:proofErr w:type="spellStart"/>
+          <w:r>
+            <w:rPr>
+              <w:lang w:val="tr-TR"/>
+            </w:rPr>
+            <w:t>chain</w:t>
+          </w:r>
+          <w:proofErr w:type="spellEnd"/>
+          <w:r>
+            <w:rPr>
+              <w:lang w:val="tr-TR"/>
+            </w:rPr>
+            <w:t xml:space="preserve"> risk </w:t>
+          </w:r>
+          <w:proofErr w:type="spellStart"/>
+          <w:r>
+            <w:rPr>
+              <w:lang w:val="tr-TR"/>
+            </w:rPr>
+            <w:t>management</w:t>
+          </w:r>
+          <w:proofErr w:type="spellEnd"/>
+          <w:r>
+            <w:rPr>
+              <w:lang w:val="tr-TR"/>
+            </w:rPr>
+            <w:t xml:space="preserve"> </w:t>
+          </w:r>
+          <w:proofErr w:type="spellStart"/>
+          <w:r>
+            <w:rPr>
+              <w:lang w:val="tr-TR"/>
+            </w:rPr>
+            <w:t>automation</w:t>
+          </w:r>
+          <w:proofErr w:type="spellEnd"/>
+          <w:r>
+            <w:rPr>
+              <w:lang w:val="tr-TR"/>
+            </w:rPr>
+            <w:t xml:space="preserve">: A </w:t>
+          </w:r>
+          <w:proofErr w:type="spellStart"/>
+          <w:r>
+            <w:rPr>
+              <w:lang w:val="tr-TR"/>
+            </w:rPr>
+            <w:t>literature</w:t>
+          </w:r>
+          <w:proofErr w:type="spellEnd"/>
+          <w:r>
+            <w:rPr>
+              <w:lang w:val="tr-TR"/>
+            </w:rPr>
+            <w:t xml:space="preserve"> </w:t>
+          </w:r>
+          <w:proofErr w:type="spellStart"/>
+          <w:r>
+            <w:rPr>
+              <w:lang w:val="tr-TR"/>
+            </w:rPr>
+            <w:t>review</w:t>
+          </w:r>
+          <w:proofErr w:type="spellEnd"/>
+          <w:r>
+            <w:rPr>
+              <w:lang w:val="tr-TR"/>
+            </w:rPr>
+            <w:t xml:space="preserve">. Electronic </w:t>
+          </w:r>
+          <w:proofErr w:type="spellStart"/>
+          <w:r>
+            <w:rPr>
+              <w:lang w:val="tr-TR"/>
+            </w:rPr>
+            <w:t>Markets</w:t>
+          </w:r>
+          <w:proofErr w:type="spellEnd"/>
+          <w:r>
+            <w:rPr>
+              <w:lang w:val="tr-TR"/>
+            </w:rPr>
+            <w:t>.</w:t>
           </w:r>
         </w:p>
         <w:p>
           <w:pPr>
-            <w:pStyle w:val="Bibliography"/>
-            <w:ind w:left="720" w:hanging="720"/>
-            <w:rPr>
-              <w:noProof/>
+            <w:rPr>
+              <w:lang w:val="tr-TR"/>
             </w:rPr>
           </w:pPr>
-          <w:r>
-            <w:rPr>
-              <w:noProof/>
-            </w:rPr>
-            <w:t xml:space="preserve">Hurbean, L., &amp; Fotache, D. (2014). ERP III: The Promise Of A New Generation. </w:t>
-          </w:r>
-          <w:r>
-            <w:rPr>
-              <w:i/>
-              <w:iCs/>
-              <w:noProof/>
-            </w:rPr>
-            <w:t>Proceedings of the IE 2014 International Conference.</w:t>
-          </w:r>
-          <w:r>
-            <w:rPr>
-              <w:noProof/>
-            </w:rPr>
-            <w:t xml:space="preserve"> May 15-18, Bucharest.</w:t>
-          </w:r>
         </w:p>
         <w:p>
           <w:pPr>
-            <w:pStyle w:val="Bibliography"/>
-            <w:ind w:left="720" w:hanging="720"/>
-            <w:rPr>
-              <w:noProof/>
+            <w:rPr>
+              <w:lang w:val="tr-TR"/>
             </w:rPr>
           </w:pPr>
-          <w:r>
-            <w:rPr>
-              <w:noProof/>
-            </w:rPr>
-            <w:lastRenderedPageBreak/>
-            <w:t xml:space="preserve">Malhotra, R., &amp; Temponi, C. (2010). Critical decisions for ERP integration: Small business issues. </w:t>
-          </w:r>
-          <w:r>
-            <w:rPr>
-              <w:i/>
-              <w:iCs/>
-              <w:noProof/>
-            </w:rPr>
-            <w:t>International Journal of Information Management</w:t>
-          </w:r>
-          <w:r>
-            <w:rPr>
-              <w:noProof/>
-            </w:rPr>
-            <w:t>, 30, 28-37.</w:t>
+          <w:proofErr w:type="spellStart"/>
+          <w:r>
+            <w:rPr>
+              <w:lang w:val="tr-TR"/>
+            </w:rPr>
+            <w:t>Zimmermann</w:t>
+          </w:r>
+          <w:proofErr w:type="spellEnd"/>
+          <w:r>
+            <w:rPr>
+              <w:lang w:val="tr-TR"/>
+            </w:rPr>
+            <w:t xml:space="preserve">, R., et al. (2024). </w:t>
+          </w:r>
+          <w:proofErr w:type="spellStart"/>
+          <w:r>
+            <w:rPr>
+              <w:lang w:val="tr-TR"/>
+            </w:rPr>
+            <w:t>From</w:t>
+          </w:r>
+          <w:proofErr w:type="spellEnd"/>
+          <w:r>
+            <w:rPr>
+              <w:lang w:val="tr-TR"/>
+            </w:rPr>
+            <w:t xml:space="preserve"> Data </w:t>
+          </w:r>
+          <w:proofErr w:type="spellStart"/>
+          <w:r>
+            <w:rPr>
+              <w:lang w:val="tr-TR"/>
+            </w:rPr>
+            <w:t>to</w:t>
+          </w:r>
+          <w:proofErr w:type="spellEnd"/>
+          <w:r>
+            <w:rPr>
+              <w:lang w:val="tr-TR"/>
+            </w:rPr>
+            <w:t xml:space="preserve"> </w:t>
+          </w:r>
+          <w:proofErr w:type="spellStart"/>
+          <w:r>
+            <w:rPr>
+              <w:lang w:val="tr-TR"/>
+            </w:rPr>
+            <w:t>Decisions</w:t>
+          </w:r>
+          <w:proofErr w:type="spellEnd"/>
+          <w:r>
+            <w:rPr>
+              <w:lang w:val="tr-TR"/>
+            </w:rPr>
+            <w:t xml:space="preserve">: Optimizing </w:t>
+          </w:r>
+          <w:proofErr w:type="spellStart"/>
+          <w:r>
+            <w:rPr>
+              <w:lang w:val="tr-TR"/>
+            </w:rPr>
+            <w:t>Supply</w:t>
+          </w:r>
+          <w:proofErr w:type="spellEnd"/>
+          <w:r>
+            <w:rPr>
+              <w:lang w:val="tr-TR"/>
+            </w:rPr>
+            <w:t xml:space="preserve"> </w:t>
+          </w:r>
+          <w:proofErr w:type="spellStart"/>
+          <w:r>
+            <w:rPr>
+              <w:lang w:val="tr-TR"/>
+            </w:rPr>
+            <w:t>Chain</w:t>
+          </w:r>
+          <w:proofErr w:type="spellEnd"/>
+          <w:r>
+            <w:rPr>
+              <w:lang w:val="tr-TR"/>
+            </w:rPr>
+            <w:t xml:space="preserve"> Management </w:t>
+          </w:r>
+          <w:proofErr w:type="spellStart"/>
+          <w:r>
+            <w:rPr>
+              <w:lang w:val="tr-TR"/>
+            </w:rPr>
+            <w:t>through</w:t>
+          </w:r>
+          <w:proofErr w:type="spellEnd"/>
+          <w:r>
+            <w:rPr>
+              <w:lang w:val="tr-TR"/>
+            </w:rPr>
+            <w:t xml:space="preserve"> </w:t>
+          </w:r>
+          <w:proofErr w:type="spellStart"/>
+          <w:r>
+            <w:rPr>
+              <w:lang w:val="tr-TR"/>
+            </w:rPr>
+            <w:t>Dashboards</w:t>
+          </w:r>
+          <w:proofErr w:type="spellEnd"/>
+          <w:r>
+            <w:rPr>
+              <w:lang w:val="tr-TR"/>
+            </w:rPr>
+            <w:t xml:space="preserve">, Machine Learning, </w:t>
+          </w:r>
+          <w:proofErr w:type="spellStart"/>
+          <w:r>
+            <w:rPr>
+              <w:lang w:val="tr-TR"/>
+            </w:rPr>
+            <w:t>and</w:t>
+          </w:r>
+          <w:proofErr w:type="spellEnd"/>
+          <w:r>
+            <w:rPr>
+              <w:lang w:val="tr-TR"/>
+            </w:rPr>
+            <w:t xml:space="preserve"> Data </w:t>
+          </w:r>
+          <w:proofErr w:type="spellStart"/>
+          <w:r>
+            <w:rPr>
+              <w:lang w:val="tr-TR"/>
+            </w:rPr>
+            <w:t>Analytics</w:t>
+          </w:r>
+          <w:proofErr w:type="spellEnd"/>
+          <w:r>
+            <w:rPr>
+              <w:lang w:val="tr-TR"/>
+            </w:rPr>
+            <w:t xml:space="preserve">. </w:t>
+          </w:r>
+          <w:proofErr w:type="spellStart"/>
+          <w:r>
+            <w:rPr>
+              <w:lang w:val="tr-TR"/>
+            </w:rPr>
+            <w:t>Procedia</w:t>
+          </w:r>
+          <w:proofErr w:type="spellEnd"/>
+          <w:r>
+            <w:rPr>
+              <w:lang w:val="tr-TR"/>
+            </w:rPr>
+            <w:t xml:space="preserve"> </w:t>
+          </w:r>
+          <w:proofErr w:type="spellStart"/>
+          <w:r>
+            <w:rPr>
+              <w:lang w:val="tr-TR"/>
+            </w:rPr>
+            <w:t>Computer</w:t>
+          </w:r>
+          <w:proofErr w:type="spellEnd"/>
+          <w:r>
+            <w:rPr>
+              <w:lang w:val="tr-TR"/>
+            </w:rPr>
+            <w:t xml:space="preserve"> </w:t>
+          </w:r>
+          <w:proofErr w:type="spellStart"/>
+          <w:r>
+            <w:rPr>
+              <w:lang w:val="tr-TR"/>
+            </w:rPr>
+            <w:t>Science</w:t>
+          </w:r>
+          <w:proofErr w:type="spellEnd"/>
+          <w:r>
+            <w:rPr>
+              <w:lang w:val="tr-TR"/>
+            </w:rPr>
+            <w:t>.</w:t>
           </w:r>
         </w:p>
         <w:p>
           <w:pPr>
-            <w:pStyle w:val="Bibliography"/>
-            <w:ind w:left="720" w:hanging="720"/>
-            <w:rPr>
-              <w:noProof/>
+            <w:rPr>
+              <w:lang w:val="tr-TR"/>
             </w:rPr>
           </w:pPr>
-          <w:r>
-            <w:rPr>
-              <w:noProof/>
-            </w:rPr>
-            <w:t xml:space="preserve">Nah, F. F.-H., &amp; Lau, J. L.-S. (2001). Critical factors for successful implementation of enterprise systems. </w:t>
-          </w:r>
-          <w:r>
-            <w:rPr>
-              <w:i/>
-              <w:iCs/>
-              <w:noProof/>
-            </w:rPr>
-            <w:t>Business Process Management Journal</w:t>
-          </w:r>
-          <w:r>
-            <w:rPr>
-              <w:noProof/>
-            </w:rPr>
-            <w:t>, 7:3, 285-296.</w:t>
-          </w:r>
         </w:p>
         <w:p>
           <w:pPr>
-            <w:pStyle w:val="Bibliography"/>
-            <w:ind w:left="720" w:hanging="720"/>
-            <w:rPr>
-              <w:noProof/>
+            <w:rPr>
+              <w:lang w:val="tr-TR"/>
             </w:rPr>
           </w:pPr>
-          <w:r>
-            <w:rPr>
-              <w:noProof/>
-            </w:rPr>
-            <w:t xml:space="preserve">Rajagopal, P. (2002). An innovation-diffusion view of implementation of enterprise resource planning (ERP) systems and development of a research model. </w:t>
-          </w:r>
-          <w:r>
-            <w:rPr>
-              <w:i/>
-              <w:iCs/>
-              <w:noProof/>
-            </w:rPr>
-            <w:t>Information &amp; Management</w:t>
-          </w:r>
-          <w:r>
-            <w:rPr>
-              <w:noProof/>
-            </w:rPr>
-            <w:t>, 40, 87–114.</w:t>
+          <w:proofErr w:type="spellStart"/>
+          <w:r>
+            <w:rPr>
+              <w:lang w:val="tr-TR"/>
+            </w:rPr>
+            <w:t>Grabińska</w:t>
+          </w:r>
+          <w:proofErr w:type="spellEnd"/>
+          <w:r>
+            <w:rPr>
+              <w:lang w:val="tr-TR"/>
+            </w:rPr>
+            <w:t xml:space="preserve">, A. (2019). </w:t>
+          </w:r>
+          <w:proofErr w:type="spellStart"/>
+          <w:r>
+            <w:rPr>
+              <w:lang w:val="tr-TR"/>
+            </w:rPr>
+            <w:t>The</w:t>
+          </w:r>
+          <w:proofErr w:type="spellEnd"/>
+          <w:r>
+            <w:rPr>
+              <w:lang w:val="tr-TR"/>
+            </w:rPr>
+            <w:t xml:space="preserve"> Application of Business </w:t>
+          </w:r>
+          <w:proofErr w:type="spellStart"/>
+          <w:r>
+            <w:rPr>
+              <w:lang w:val="tr-TR"/>
+            </w:rPr>
+            <w:t>Intelligence</w:t>
+          </w:r>
+          <w:proofErr w:type="spellEnd"/>
+          <w:r>
+            <w:rPr>
+              <w:lang w:val="tr-TR"/>
+            </w:rPr>
+            <w:t xml:space="preserve"> </w:t>
+          </w:r>
+          <w:proofErr w:type="spellStart"/>
+          <w:r>
+            <w:rPr>
+              <w:lang w:val="tr-TR"/>
+            </w:rPr>
+            <w:t>Systems</w:t>
+          </w:r>
+          <w:proofErr w:type="spellEnd"/>
+          <w:r>
+            <w:rPr>
+              <w:lang w:val="tr-TR"/>
+            </w:rPr>
+            <w:t xml:space="preserve"> in </w:t>
+          </w:r>
+          <w:proofErr w:type="spellStart"/>
+          <w:r>
+            <w:rPr>
+              <w:lang w:val="tr-TR"/>
+            </w:rPr>
+            <w:t>Logistics</w:t>
+          </w:r>
+          <w:proofErr w:type="spellEnd"/>
+          <w:r>
+            <w:rPr>
+              <w:lang w:val="tr-TR"/>
+            </w:rPr>
+            <w:t xml:space="preserve">. </w:t>
+          </w:r>
+          <w:proofErr w:type="spellStart"/>
+          <w:r>
+            <w:rPr>
+              <w:lang w:val="tr-TR"/>
+            </w:rPr>
+            <w:t>System</w:t>
+          </w:r>
+          <w:proofErr w:type="spellEnd"/>
+          <w:r>
+            <w:rPr>
+              <w:lang w:val="tr-TR"/>
+            </w:rPr>
+            <w:t xml:space="preserve"> </w:t>
+          </w:r>
+          <w:proofErr w:type="spellStart"/>
+          <w:r>
+            <w:rPr>
+              <w:lang w:val="tr-TR"/>
+            </w:rPr>
+            <w:t>Safety</w:t>
+          </w:r>
+          <w:proofErr w:type="spellEnd"/>
+          <w:r>
+            <w:rPr>
+              <w:lang w:val="tr-TR"/>
+            </w:rPr>
+            <w:t xml:space="preserve">: </w:t>
+          </w:r>
+          <w:proofErr w:type="gramStart"/>
+          <w:r>
+            <w:rPr>
+              <w:lang w:val="tr-TR"/>
+            </w:rPr>
+            <w:t>Human -</w:t>
+          </w:r>
+          <w:proofErr w:type="gramEnd"/>
+          <w:r>
+            <w:rPr>
+              <w:lang w:val="tr-TR"/>
+            </w:rPr>
+            <w:t xml:space="preserve"> Technical </w:t>
+          </w:r>
+          <w:proofErr w:type="spellStart"/>
+          <w:proofErr w:type="gramStart"/>
+          <w:r>
+            <w:rPr>
+              <w:lang w:val="tr-TR"/>
+            </w:rPr>
+            <w:t>Facility</w:t>
+          </w:r>
+          <w:proofErr w:type="spellEnd"/>
+          <w:r>
+            <w:rPr>
+              <w:lang w:val="tr-TR"/>
+            </w:rPr>
+            <w:t xml:space="preserve"> -</w:t>
+          </w:r>
+          <w:proofErr w:type="gramEnd"/>
+          <w:r>
+            <w:rPr>
+              <w:lang w:val="tr-TR"/>
+            </w:rPr>
+            <w:t xml:space="preserve"> Environment.</w:t>
           </w:r>
         </w:p>
         <w:p>
           <w:pPr>
-            <w:pStyle w:val="Bibliography"/>
-            <w:ind w:left="720" w:hanging="720"/>
-            <w:rPr>
-              <w:noProof/>
+            <w:rPr>
+              <w:lang w:val="tr-TR"/>
             </w:rPr>
           </w:pPr>
-          <w:r>
-            <w:rPr>
-              <w:noProof/>
-            </w:rPr>
-            <w:t xml:space="preserve">Razmi, J., &amp; Sangari, M. S. (2008). A hybrid multi-criteria decision making model for ERP system selection. </w:t>
-          </w:r>
-          <w:r>
-            <w:rPr>
-              <w:i/>
-              <w:iCs/>
-              <w:noProof/>
-            </w:rPr>
-            <w:t>Proceedings of 4th International Conference on Information and Automation for Sustainability (ICIAfS )</w:t>
-          </w:r>
-          <w:r>
-            <w:rPr>
-              <w:noProof/>
-            </w:rPr>
-            <w:t>, (s. 489-495). Sri Lanka.</w:t>
-          </w:r>
         </w:p>
         <w:p>
           <w:pPr>
-            <w:pStyle w:val="Bibliography"/>
-            <w:ind w:left="720" w:hanging="720"/>
-            <w:rPr>
-              <w:noProof/>
+            <w:rPr>
+              <w:lang w:val="tr-TR"/>
             </w:rPr>
           </w:pPr>
-          <w:r>
-            <w:rPr>
-              <w:noProof/>
-            </w:rPr>
-            <w:t xml:space="preserve">Santhanam, R., &amp; Kyparisis, G. (1996). A decision model for interdependent information system project selection. </w:t>
-          </w:r>
-          <w:r>
-            <w:rPr>
-              <w:i/>
-              <w:iCs/>
-              <w:noProof/>
-            </w:rPr>
-            <w:t>European Journal of Operational Research</w:t>
-          </w:r>
-          <w:r>
-            <w:rPr>
-              <w:noProof/>
-            </w:rPr>
-            <w:t>, 89, 380-399.</w:t>
+          <w:proofErr w:type="spellStart"/>
+          <w:r>
+            <w:rPr>
+              <w:lang w:val="tr-TR"/>
+            </w:rPr>
+            <w:t>Kaggle</w:t>
+          </w:r>
+          <w:proofErr w:type="spellEnd"/>
+          <w:r>
+            <w:rPr>
+              <w:lang w:val="tr-TR"/>
+            </w:rPr>
+            <w:t>. (</w:t>
+          </w:r>
+          <w:proofErr w:type="spellStart"/>
+          <w:proofErr w:type="gramStart"/>
+          <w:r>
+            <w:rPr>
+              <w:lang w:val="tr-TR"/>
+            </w:rPr>
+            <w:t>n.d</w:t>
+          </w:r>
+          <w:proofErr w:type="spellEnd"/>
+          <w:r>
+            <w:rPr>
+              <w:lang w:val="tr-TR"/>
+            </w:rPr>
+            <w:t>.</w:t>
+          </w:r>
+          <w:proofErr w:type="gramEnd"/>
+          <w:r>
+            <w:rPr>
+              <w:lang w:val="tr-TR"/>
+            </w:rPr>
+            <w:t xml:space="preserve">). </w:t>
+          </w:r>
+          <w:proofErr w:type="spellStart"/>
+          <w:r>
+            <w:rPr>
+              <w:lang w:val="tr-TR"/>
+            </w:rPr>
+            <w:t>DataCo</w:t>
+          </w:r>
+          <w:proofErr w:type="spellEnd"/>
+          <w:r>
+            <w:rPr>
+              <w:lang w:val="tr-TR"/>
+            </w:rPr>
+            <w:t xml:space="preserve"> SMART SUPPLY CHAIN FOR BIG DATA ANALYSIS.</w:t>
           </w:r>
         </w:p>
         <w:p>
           <w:pPr>
-            <w:pStyle w:val="Bibliography"/>
-            <w:ind w:left="720" w:hanging="720"/>
-            <w:rPr>
-              <w:noProof/>
+            <w:rPr>
+              <w:lang w:val="tr-TR"/>
             </w:rPr>
           </w:pPr>
-          <w:r>
-            <w:rPr>
-              <w:noProof/>
-            </w:rPr>
-            <w:t xml:space="preserve">SaphilaAFSUG. (2014, Haziran 9). </w:t>
-          </w:r>
-          <w:r>
-            <w:rPr>
-              <w:i/>
-              <w:iCs/>
-              <w:noProof/>
-            </w:rPr>
-            <w:t>Post modern ERP Key trends.</w:t>
-          </w:r>
-          <w:r>
-            <w:rPr>
-              <w:noProof/>
-            </w:rPr>
-            <w:t xml:space="preserve"> Temmuz 22, 2015 tarihinde AFSUG: http://www.afsug.com/library/documents/saphila2014_presentations/Day1/CINEMA_2/Postmodern%20ERP%20-%20Key%20Trends.pdf adresinden alındı</w:t>
-          </w:r>
         </w:p>
         <w:p>
           <w:pPr>
-            <w:pStyle w:val="Bibliography"/>
-            <w:ind w:left="720" w:hanging="720"/>
-            <w:rPr>
-              <w:noProof/>
+            <w:rPr>
+              <w:lang w:val="tr-TR"/>
             </w:rPr>
           </w:pPr>
-          <w:r>
-            <w:rPr>
-              <w:noProof/>
-            </w:rPr>
-            <w:t xml:space="preserve">Stamford, C. (2014, Ocak 29). </w:t>
-          </w:r>
-          <w:r>
-            <w:rPr>
-              <w:i/>
-              <w:iCs/>
-              <w:noProof/>
-            </w:rPr>
-            <w:t>Gartner Says By 2016, the Impact of Cloud and Emergence of Postmodern ERP Will Relegate Highly Customized ERP Systems to "Legacy" Status</w:t>
-          </w:r>
-          <w:r>
-            <w:rPr>
-              <w:noProof/>
-            </w:rPr>
-            <w:t>. Temmuz 22, 2015 tarihinde Gartner: http://www.gartner.com/newsroom/id/2658415 adresinden alındı</w:t>
+          <w:proofErr w:type="spellStart"/>
+          <w:r>
+            <w:rPr>
+              <w:lang w:val="tr-TR"/>
+            </w:rPr>
+            <w:t>Kaggle</w:t>
+          </w:r>
+          <w:proofErr w:type="spellEnd"/>
+          <w:r>
+            <w:rPr>
+              <w:lang w:val="tr-TR"/>
+            </w:rPr>
+            <w:t>. (</w:t>
+          </w:r>
+          <w:proofErr w:type="spellStart"/>
+          <w:proofErr w:type="gramStart"/>
+          <w:r>
+            <w:rPr>
+              <w:lang w:val="tr-TR"/>
+            </w:rPr>
+            <w:t>n.d</w:t>
+          </w:r>
+          <w:proofErr w:type="spellEnd"/>
+          <w:r>
+            <w:rPr>
+              <w:lang w:val="tr-TR"/>
+            </w:rPr>
+            <w:t>.</w:t>
+          </w:r>
+          <w:proofErr w:type="gramEnd"/>
+          <w:r>
+            <w:rPr>
+              <w:lang w:val="tr-TR"/>
+            </w:rPr>
+            <w:t xml:space="preserve">). </w:t>
+          </w:r>
+          <w:proofErr w:type="spellStart"/>
+          <w:r>
+            <w:rPr>
+              <w:lang w:val="tr-TR"/>
+            </w:rPr>
+            <w:t>DataCo</w:t>
+          </w:r>
+          <w:proofErr w:type="spellEnd"/>
+          <w:r>
+            <w:rPr>
+              <w:lang w:val="tr-TR"/>
+            </w:rPr>
+            <w:t xml:space="preserve"> </w:t>
+          </w:r>
+          <w:proofErr w:type="spellStart"/>
+          <w:r>
+            <w:rPr>
+              <w:lang w:val="tr-TR"/>
+            </w:rPr>
+            <w:t>Supply</w:t>
+          </w:r>
+          <w:proofErr w:type="spellEnd"/>
+          <w:r>
+            <w:rPr>
+              <w:lang w:val="tr-TR"/>
+            </w:rPr>
+            <w:t xml:space="preserve"> </w:t>
+          </w:r>
+          <w:proofErr w:type="spellStart"/>
+          <w:r>
+            <w:rPr>
+              <w:lang w:val="tr-TR"/>
+            </w:rPr>
+            <w:t>Chain</w:t>
+          </w:r>
+          <w:proofErr w:type="spellEnd"/>
+          <w:r>
+            <w:rPr>
+              <w:lang w:val="tr-TR"/>
+            </w:rPr>
+            <w:t xml:space="preserve"> </w:t>
+          </w:r>
+          <w:proofErr w:type="spellStart"/>
+          <w:r>
+            <w:rPr>
+              <w:lang w:val="tr-TR"/>
+            </w:rPr>
+            <w:t>Dataset</w:t>
+          </w:r>
+          <w:proofErr w:type="spellEnd"/>
+          <w:r>
+            <w:rPr>
+              <w:lang w:val="tr-TR"/>
+            </w:rPr>
+            <w:t>.</w:t>
           </w:r>
         </w:p>
         <w:p>
           <w:pPr>
-            <w:pStyle w:val="Bibliography"/>
-            <w:ind w:left="720" w:hanging="720"/>
-            <w:rPr>
-              <w:noProof/>
+            <w:rPr>
+              <w:lang w:val="tr-TR"/>
             </w:rPr>
           </w:pPr>
-          <w:r>
-            <w:rPr>
-              <w:noProof/>
-            </w:rPr>
-            <w:t xml:space="preserve">Teltumbde, A. (2000). A framework of evaluating ERP projects. </w:t>
-          </w:r>
-          <w:r>
-            <w:rPr>
-              <w:i/>
-              <w:iCs/>
-              <w:noProof/>
-            </w:rPr>
-            <w:t>International Journal of Production Research</w:t>
-          </w:r>
-          <w:r>
-            <w:rPr>
-              <w:noProof/>
-            </w:rPr>
-            <w:t>, 28,4507-4520.</w:t>
-          </w:r>
         </w:p>
         <w:p>
           <w:pPr>
-            <w:pStyle w:val="Bibliography"/>
-            <w:ind w:left="720" w:hanging="720"/>
-            <w:rPr>
-              <w:noProof/>
+            <w:rPr>
+              <w:lang w:val="tr-TR"/>
             </w:rPr>
           </w:pPr>
-          <w:r>
-            <w:rPr>
-              <w:noProof/>
-            </w:rPr>
-            <w:t xml:space="preserve">URL_01. (2013, Nisan 2). </w:t>
-          </w:r>
-          <w:r>
-            <w:rPr>
-              <w:i/>
-              <w:iCs/>
-              <w:noProof/>
-            </w:rPr>
-            <w:t>Word kullanarak kaynakça ve metin içi referans hazırlama</w:t>
-          </w:r>
-          <w:r>
-            <w:rPr>
-              <w:noProof/>
-            </w:rPr>
-            <w:t>. 06 17, 2015 tarihinde Youtube: https://www.youtube.com/watch?v=lY5e4ac8Feg adresinden alındı</w:t>
+          <w:proofErr w:type="spellStart"/>
+          <w:r>
+            <w:rPr>
+              <w:lang w:val="tr-TR"/>
+            </w:rPr>
+            <w:t>Streamlit</w:t>
+          </w:r>
+          <w:proofErr w:type="spellEnd"/>
+          <w:r>
+            <w:rPr>
+              <w:lang w:val="tr-TR"/>
+            </w:rPr>
+            <w:t>. (</w:t>
+          </w:r>
+          <w:proofErr w:type="spellStart"/>
+          <w:proofErr w:type="gramStart"/>
+          <w:r>
+            <w:rPr>
+              <w:lang w:val="tr-TR"/>
+            </w:rPr>
+            <w:t>n.d</w:t>
+          </w:r>
+          <w:proofErr w:type="spellEnd"/>
+          <w:r>
+            <w:rPr>
+              <w:lang w:val="tr-TR"/>
+            </w:rPr>
+            <w:t>.</w:t>
+          </w:r>
+          <w:proofErr w:type="gramEnd"/>
+          <w:r>
+            <w:rPr>
+              <w:lang w:val="tr-TR"/>
+            </w:rPr>
+            <w:t xml:space="preserve">). </w:t>
+          </w:r>
+          <w:proofErr w:type="spellStart"/>
+          <w:r>
+            <w:rPr>
+              <w:lang w:val="tr-TR"/>
+            </w:rPr>
+            <w:t>Streamlit</w:t>
+          </w:r>
+          <w:proofErr w:type="spellEnd"/>
+          <w:r>
+            <w:rPr>
+              <w:lang w:val="tr-TR"/>
+            </w:rPr>
+            <w:t xml:space="preserve"> </w:t>
+          </w:r>
+          <w:proofErr w:type="spellStart"/>
+          <w:r>
+            <w:rPr>
+              <w:lang w:val="tr-TR"/>
+            </w:rPr>
+            <w:t>Documentation</w:t>
+          </w:r>
+          <w:proofErr w:type="spellEnd"/>
+          <w:r>
+            <w:rPr>
+              <w:lang w:val="tr-TR"/>
+            </w:rPr>
+            <w:t>.</w:t>
           </w:r>
         </w:p>
         <w:p>
           <w:pPr>
-            <w:pStyle w:val="Bibliography"/>
-            <w:ind w:left="720" w:hanging="720"/>
-            <w:rPr>
-              <w:noProof/>
+            <w:rPr>
+              <w:lang w:val="tr-TR"/>
             </w:rPr>
           </w:pPr>
-          <w:r>
-            <w:rPr>
-              <w:noProof/>
-            </w:rPr>
-            <w:t xml:space="preserve">URL_02. (2011, Nisan 21). </w:t>
-          </w:r>
-          <w:r>
-            <w:rPr>
-              <w:i/>
-              <w:iCs/>
-              <w:noProof/>
-            </w:rPr>
-            <w:t>Easy Referencing Using Word 2010</w:t>
-          </w:r>
-          <w:r>
-            <w:rPr>
-              <w:noProof/>
-            </w:rPr>
-            <w:t>. 06 17, 2015 tarihinde Youtube: Easy Referencing Using Word 2010 adresinden alındı</w:t>
-          </w:r>
         </w:p>
         <w:p>
           <w:pPr>
-            <w:pStyle w:val="Bibliography"/>
-            <w:ind w:left="720" w:hanging="720"/>
-            <w:rPr>
-              <w:noProof/>
+            <w:rPr>
+              <w:lang w:val="tr-TR"/>
             </w:rPr>
           </w:pPr>
-          <w:r>
-            <w:rPr>
-              <w:noProof/>
-            </w:rPr>
-            <w:t xml:space="preserve">URL_02. (2011, Nisan 21). </w:t>
-          </w:r>
-          <w:r>
-            <w:rPr>
-              <w:i/>
-              <w:iCs/>
-              <w:noProof/>
-            </w:rPr>
-            <w:t>Easy Referencing Using Word 2010</w:t>
-          </w:r>
-          <w:r>
-            <w:rPr>
-              <w:noProof/>
-            </w:rPr>
-            <w:t>. 06 17, 2015 tarihinde Youtube: https://www.youtube.com/watch?v=FRjKD2HQPGg adresinden alındı</w:t>
+          <w:proofErr w:type="spellStart"/>
+          <w:proofErr w:type="gramStart"/>
+          <w:r>
+            <w:rPr>
+              <w:lang w:val="tr-TR"/>
+            </w:rPr>
+            <w:t>pandas</w:t>
+          </w:r>
+          <w:proofErr w:type="spellEnd"/>
+          <w:proofErr w:type="gramEnd"/>
+          <w:r>
+            <w:rPr>
+              <w:lang w:val="tr-TR"/>
+            </w:rPr>
+            <w:t>. (</w:t>
+          </w:r>
+          <w:proofErr w:type="spellStart"/>
+          <w:proofErr w:type="gramStart"/>
+          <w:r>
+            <w:rPr>
+              <w:lang w:val="tr-TR"/>
+            </w:rPr>
+            <w:t>n.d</w:t>
+          </w:r>
+          <w:proofErr w:type="spellEnd"/>
+          <w:r>
+            <w:rPr>
+              <w:lang w:val="tr-TR"/>
+            </w:rPr>
+            <w:t>.</w:t>
+          </w:r>
+          <w:proofErr w:type="gramEnd"/>
+          <w:r>
+            <w:rPr>
+              <w:lang w:val="tr-TR"/>
+            </w:rPr>
+            <w:t xml:space="preserve">). </w:t>
+          </w:r>
+          <w:proofErr w:type="spellStart"/>
+          <w:proofErr w:type="gramStart"/>
+          <w:r>
+            <w:rPr>
+              <w:lang w:val="tr-TR"/>
+            </w:rPr>
+            <w:t>pandas</w:t>
+          </w:r>
+          <w:proofErr w:type="spellEnd"/>
+          <w:proofErr w:type="gramEnd"/>
+          <w:r>
+            <w:rPr>
+              <w:lang w:val="tr-TR"/>
+            </w:rPr>
+            <w:t xml:space="preserve"> </w:t>
+          </w:r>
+          <w:proofErr w:type="spellStart"/>
+          <w:r>
+            <w:rPr>
+              <w:lang w:val="tr-TR"/>
+            </w:rPr>
+            <w:t>Documentation</w:t>
+          </w:r>
+          <w:proofErr w:type="spellEnd"/>
+          <w:r>
+            <w:rPr>
+              <w:lang w:val="tr-TR"/>
+            </w:rPr>
+            <w:t>.</w:t>
           </w:r>
         </w:p>
         <w:p>
           <w:pPr>
-            <w:pStyle w:val="Bibliography"/>
-            <w:ind w:left="720" w:hanging="720"/>
-            <w:rPr>
-              <w:noProof/>
+            <w:rPr>
+              <w:lang w:val="tr-TR"/>
             </w:rPr>
           </w:pPr>
-          <w:r>
-            <w:rPr>
-              <w:noProof/>
-            </w:rPr>
-            <w:t xml:space="preserve">URL_03. (2015, 06). </w:t>
-          </w:r>
-          <w:r>
-            <w:rPr>
-              <w:i/>
-              <w:iCs/>
-              <w:noProof/>
-            </w:rPr>
-            <w:t>Proje / Tez Yazım Kuralları.</w:t>
-          </w:r>
-          <w:r>
-            <w:rPr>
-              <w:noProof/>
-            </w:rPr>
-            <w:t xml:space="preserve"> 06 18, 2015 tarihinde Okan Üniversitesi: http://sosyalbilimler.okan.edu.tr/media/55/50ed1aa4150ba03a22000055/Proje_Yaz%C4%B1m_Kurallar%C4%B1.doc adresinden alındı</w:t>
-          </w:r>
         </w:p>
         <w:p>
           <w:pPr>
-            <w:pStyle w:val="Bibliography"/>
-            <w:ind w:left="720" w:hanging="720"/>
-            <w:rPr>
-              <w:noProof/>
+            <w:rPr>
+              <w:lang w:val="tr-TR"/>
             </w:rPr>
           </w:pPr>
-          <w:r>
-            <w:rPr>
-              <w:noProof/>
-            </w:rPr>
-            <w:t xml:space="preserve">URL_04. (tarih yok). </w:t>
-          </w:r>
-          <w:r>
-            <w:rPr>
-              <w:i/>
-              <w:iCs/>
-              <w:noProof/>
-            </w:rPr>
-            <w:t>MRPI, MRPII, ERPII Nedir ? - ERP Nedir ?</w:t>
-          </w:r>
-          <w:r>
-            <w:rPr>
-              <w:noProof/>
-            </w:rPr>
-            <w:t xml:space="preserve"> 08 22, 2015 tarihinde erp.web.tr: http://www.erp.web.tr/erp-nedir/mrpi-mrpii-erpii-nedir/pdf adresinden alındı</w:t>
+          <w:proofErr w:type="spellStart"/>
+          <w:r>
+            <w:rPr>
+              <w:lang w:val="tr-TR"/>
+            </w:rPr>
+            <w:t>Plotly</w:t>
+          </w:r>
+          <w:proofErr w:type="spellEnd"/>
+          <w:r>
+            <w:rPr>
+              <w:lang w:val="tr-TR"/>
+            </w:rPr>
+            <w:t>. (</w:t>
+          </w:r>
+          <w:proofErr w:type="spellStart"/>
+          <w:proofErr w:type="gramStart"/>
+          <w:r>
+            <w:rPr>
+              <w:lang w:val="tr-TR"/>
+            </w:rPr>
+            <w:t>n.d</w:t>
+          </w:r>
+          <w:proofErr w:type="spellEnd"/>
+          <w:r>
+            <w:rPr>
+              <w:lang w:val="tr-TR"/>
+            </w:rPr>
+            <w:t>.</w:t>
+          </w:r>
+          <w:proofErr w:type="gramEnd"/>
+          <w:r>
+            <w:rPr>
+              <w:lang w:val="tr-TR"/>
+            </w:rPr>
+            <w:t xml:space="preserve">). </w:t>
+          </w:r>
+          <w:proofErr w:type="spellStart"/>
+          <w:r>
+            <w:rPr>
+              <w:lang w:val="tr-TR"/>
+            </w:rPr>
+            <w:t>Plotly</w:t>
+          </w:r>
+          <w:proofErr w:type="spellEnd"/>
+          <w:r>
+            <w:rPr>
+              <w:lang w:val="tr-TR"/>
+            </w:rPr>
+            <w:t xml:space="preserve"> Python Open Source </w:t>
+          </w:r>
+          <w:proofErr w:type="spellStart"/>
+          <w:r>
+            <w:rPr>
+              <w:lang w:val="tr-TR"/>
+            </w:rPr>
+            <w:t>Graphing</w:t>
+          </w:r>
+          <w:proofErr w:type="spellEnd"/>
+          <w:r>
+            <w:rPr>
+              <w:lang w:val="tr-TR"/>
+            </w:rPr>
+            <w:t xml:space="preserve"> Library.</w:t>
           </w:r>
         </w:p>
         <w:p>
@@ -4634,11 +6472,177 @@
               <w:lang w:val="tr-TR"/>
             </w:rPr>
           </w:pPr>
-          <w:r>
-            <w:rPr>
-              <w:lang w:val="tr-TR"/>
-            </w:rPr>
-            <w:fldChar w:fldCharType="end"/>
+        </w:p>
+        <w:p>
+          <w:pPr>
+            <w:rPr>
+              <w:lang w:val="tr-TR"/>
+            </w:rPr>
+          </w:pPr>
+          <w:proofErr w:type="spellStart"/>
+          <w:proofErr w:type="gramStart"/>
+          <w:r>
+            <w:rPr>
+              <w:lang w:val="tr-TR"/>
+            </w:rPr>
+            <w:t>scikit</w:t>
+          </w:r>
+          <w:proofErr w:type="gramEnd"/>
+          <w:r>
+            <w:rPr>
+              <w:lang w:val="tr-TR"/>
+            </w:rPr>
+            <w:t>-learn</w:t>
+          </w:r>
+          <w:proofErr w:type="spellEnd"/>
+          <w:r>
+            <w:rPr>
+              <w:lang w:val="tr-TR"/>
+            </w:rPr>
+            <w:t>. (</w:t>
+          </w:r>
+          <w:proofErr w:type="spellStart"/>
+          <w:proofErr w:type="gramStart"/>
+          <w:r>
+            <w:rPr>
+              <w:lang w:val="tr-TR"/>
+            </w:rPr>
+            <w:t>n.d</w:t>
+          </w:r>
+          <w:proofErr w:type="spellEnd"/>
+          <w:r>
+            <w:rPr>
+              <w:lang w:val="tr-TR"/>
+            </w:rPr>
+            <w:t>.</w:t>
+          </w:r>
+          <w:proofErr w:type="gramEnd"/>
+          <w:r>
+            <w:rPr>
+              <w:lang w:val="tr-TR"/>
+            </w:rPr>
+            <w:t xml:space="preserve">). </w:t>
+          </w:r>
+          <w:proofErr w:type="spellStart"/>
+          <w:proofErr w:type="gramStart"/>
+          <w:r>
+            <w:rPr>
+              <w:lang w:val="tr-TR"/>
+            </w:rPr>
+            <w:t>scikit</w:t>
+          </w:r>
+          <w:proofErr w:type="gramEnd"/>
+          <w:r>
+            <w:rPr>
+              <w:lang w:val="tr-TR"/>
+            </w:rPr>
+            <w:t>-learn</w:t>
+          </w:r>
+          <w:proofErr w:type="spellEnd"/>
+          <w:r>
+            <w:rPr>
+              <w:lang w:val="tr-TR"/>
+            </w:rPr>
+            <w:t xml:space="preserve"> </w:t>
+          </w:r>
+          <w:proofErr w:type="spellStart"/>
+          <w:r>
+            <w:rPr>
+              <w:lang w:val="tr-TR"/>
+            </w:rPr>
+            <w:t>Documentation</w:t>
+          </w:r>
+          <w:proofErr w:type="spellEnd"/>
+          <w:r>
+            <w:rPr>
+              <w:lang w:val="tr-TR"/>
+            </w:rPr>
+            <w:t>.</w:t>
+          </w:r>
+        </w:p>
+        <w:p>
+          <w:pPr>
+            <w:rPr>
+              <w:lang w:val="tr-TR"/>
+            </w:rPr>
+          </w:pPr>
+        </w:p>
+        <w:p>
+          <w:pPr>
+            <w:rPr>
+              <w:noProof/>
+              <w:lang w:val="tr-TR"/>
+            </w:rPr>
+          </w:pPr>
+          <w:proofErr w:type="spellStart"/>
+          <w:r>
+            <w:rPr>
+              <w:lang w:val="tr-TR"/>
+            </w:rPr>
+            <w:t>SQLite</w:t>
+          </w:r>
+          <w:proofErr w:type="spellEnd"/>
+          <w:r>
+            <w:rPr>
+              <w:lang w:val="tr-TR"/>
+            </w:rPr>
+            <w:t>. (</w:t>
+          </w:r>
+          <w:proofErr w:type="spellStart"/>
+          <w:proofErr w:type="gramStart"/>
+          <w:r>
+            <w:rPr>
+              <w:lang w:val="tr-TR"/>
+            </w:rPr>
+            <w:t>n.d</w:t>
+          </w:r>
+          <w:proofErr w:type="spellEnd"/>
+          <w:r>
+            <w:rPr>
+              <w:lang w:val="tr-TR"/>
+            </w:rPr>
+            <w:t>.</w:t>
+          </w:r>
+          <w:proofErr w:type="gramEnd"/>
+          <w:r>
+            <w:rPr>
+              <w:lang w:val="tr-TR"/>
+            </w:rPr>
+            <w:t xml:space="preserve">). </w:t>
+          </w:r>
+          <w:proofErr w:type="spellStart"/>
+          <w:r>
+            <w:rPr>
+              <w:lang w:val="tr-TR"/>
+            </w:rPr>
+            <w:t>SQLite</w:t>
+          </w:r>
+          <w:proofErr w:type="spellEnd"/>
+          <w:r>
+            <w:rPr>
+              <w:lang w:val="tr-TR"/>
+            </w:rPr>
+            <w:t xml:space="preserve"> </w:t>
+          </w:r>
+          <w:proofErr w:type="spellStart"/>
+          <w:r>
+            <w:rPr>
+              <w:lang w:val="tr-TR"/>
+            </w:rPr>
+            <w:t>Documentation</w:t>
+          </w:r>
+          <w:proofErr w:type="spellEnd"/>
+          <w:r>
+            <w:rPr>
+              <w:lang w:val="tr-TR"/>
+            </w:rPr>
+            <w:t>.</w:t>
+          </w:r>
+          <w:r>
+            <w:rPr>
+              <w:lang w:val="tr-TR"/>
+            </w:rPr>
+            <w:t xml:space="preserve"> </w:t>
           </w:r>
         </w:p>
       </w:sdtContent>
@@ -4679,7 +6683,15 @@
       <w:bookmarkStart w:id="26" w:name="_Toc115861789"/>
       <w:r>
         <w:lastRenderedPageBreak/>
-        <w:t>GIT/KAGGLE/COLAB/etc.. LINK</w:t>
+        <w:t>GIT/KAGGLE/COLAB/</w:t>
+      </w:r>
+      <w:proofErr w:type="gramStart"/>
+      <w:r>
+        <w:t>etc..</w:t>
+      </w:r>
+      <w:proofErr w:type="gramEnd"/>
+      <w:r>
+        <w:t xml:space="preserve"> LINK</w:t>
       </w:r>
       <w:bookmarkEnd w:id="26"/>
     </w:p>
@@ -4733,12 +6745,21 @@
           <w:lang w:val="en-US"/>
         </w:rPr>
       </w:pPr>
+      <w:proofErr w:type="spellStart"/>
       <w:r>
         <w:rPr>
           <w:color w:val="000000" w:themeColor="text1"/>
           <w:lang w:val="en-US"/>
         </w:rPr>
-        <w:t>Gülse Dolunay Ünlü</w:t>
+        <w:t>Gülse</w:t>
+      </w:r>
+      <w:proofErr w:type="spellEnd"/>
+      <w:r>
+        <w:rPr>
+          <w:color w:val="000000" w:themeColor="text1"/>
+          <w:lang w:val="en-US"/>
+        </w:rPr>
+        <w:t xml:space="preserve"> Dolunay Ünlü</w:t>
       </w:r>
     </w:p>
     <w:p>
@@ -4756,6 +6777,7 @@
           <w:lang w:val="en-US" w:eastAsia="tr-TR"/>
         </w:rPr>
       </w:pPr>
+      <w:proofErr w:type="gramStart"/>
       <w:r>
         <w:rPr>
           <w:b/>
@@ -4763,6 +6785,7 @@
         </w:rPr>
         <w:t>Education :</w:t>
       </w:r>
+      <w:proofErr w:type="gramEnd"/>
     </w:p>
     <w:p>
       <w:pPr>
@@ -4770,6 +6793,7 @@
           <w:lang w:val="en-US" w:eastAsia="tr-TR"/>
         </w:rPr>
       </w:pPr>
+      <w:proofErr w:type="gramStart"/>
       <w:r>
         <w:rPr>
           <w:i/>
@@ -4782,7 +6806,14 @@
         <w:rPr>
           <w:lang w:val="en-US" w:eastAsia="tr-TR"/>
         </w:rPr>
-        <w:t xml:space="preserve"> : Piri Reis University </w:t>
+        <w:t xml:space="preserve"> :</w:t>
+      </w:r>
+      <w:proofErr w:type="gramEnd"/>
+      <w:r>
+        <w:rPr>
+          <w:lang w:val="en-US" w:eastAsia="tr-TR"/>
+        </w:rPr>
+        <w:t xml:space="preserve"> Piri Reis University </w:t>
       </w:r>
     </w:p>
     <w:p>
@@ -4852,8 +6883,30 @@
         <w:rPr>
           <w:lang w:val="en-US" w:eastAsia="tr-TR"/>
         </w:rPr>
-        <w:t xml:space="preserve"> Turgut Özal Anadolu Lisesi</w:t>
-      </w:r>
+        <w:t xml:space="preserve"> Turgut </w:t>
+      </w:r>
+      <w:proofErr w:type="spellStart"/>
+      <w:r>
+        <w:rPr>
+          <w:lang w:val="en-US" w:eastAsia="tr-TR"/>
+        </w:rPr>
+        <w:t>Özal</w:t>
+      </w:r>
+      <w:proofErr w:type="spellEnd"/>
+      <w:r>
+        <w:rPr>
+          <w:lang w:val="en-US" w:eastAsia="tr-TR"/>
+        </w:rPr>
+        <w:t xml:space="preserve"> Anadolu </w:t>
+      </w:r>
+      <w:proofErr w:type="spellStart"/>
+      <w:r>
+        <w:rPr>
+          <w:lang w:val="en-US" w:eastAsia="tr-TR"/>
+        </w:rPr>
+        <w:t>Lisesi</w:t>
+      </w:r>
+      <w:proofErr w:type="spellEnd"/>
     </w:p>
     <w:p>
       <w:pPr>
@@ -4961,7 +7014,25 @@
           <w:bCs/>
           <w:lang w:val="en-US" w:eastAsia="tr-TR"/>
         </w:rPr>
-        <w:t>Professional skill:</w:t>
+        <w:t xml:space="preserve">Professional </w:t>
+      </w:r>
+      <w:proofErr w:type="gramStart"/>
+      <w:r>
+        <w:rPr>
+          <w:b/>
+          <w:bCs/>
+          <w:lang w:val="en-US" w:eastAsia="tr-TR"/>
+        </w:rPr>
+        <w:t>skill</w:t>
+      </w:r>
+      <w:proofErr w:type="gramEnd"/>
+      <w:r>
+        <w:rPr>
+          <w:b/>
+          <w:bCs/>
+          <w:lang w:val="en-US" w:eastAsia="tr-TR"/>
+        </w:rPr>
+        <w:t>:</w:t>
       </w:r>
     </w:p>
     <w:p>
@@ -5163,8 +7234,18 @@
                 <w:bCs/>
                 <w:lang w:val="en-US" w:eastAsia="tr-TR"/>
               </w:rPr>
-              <w:t xml:space="preserve"> 10.06.2002 Düzce</w:t>
-            </w:r>
+              <w:t xml:space="preserve"> 10.06.2002 </w:t>
+            </w:r>
+            <w:proofErr w:type="spellStart"/>
+            <w:r>
+              <w:rPr>
+                <w:b/>
+                <w:bCs/>
+                <w:lang w:val="en-US" w:eastAsia="tr-TR"/>
+              </w:rPr>
+              <w:t>Düzce</w:t>
+            </w:r>
+            <w:proofErr w:type="spellEnd"/>
           </w:p>
         </w:tc>
         <w:tc>
@@ -5540,7 +7621,15 @@
       <w:t>South African Journal of Industrial Engineering</w:t>
     </w:r>
     <w:r>
-      <w:t xml:space="preserve"> Month Year Vol __(_):  p1-3</w:t>
+      <w:t xml:space="preserve"> Month Year Vol _</w:t>
+    </w:r>
+    <w:proofErr w:type="gramStart"/>
+    <w:r>
+      <w:t>_(</w:t>
+    </w:r>
+    <w:proofErr w:type="gramEnd"/>
+    <w:r>
+      <w:t>_):  p1-3</w:t>
     </w:r>
   </w:p>
 </w:ftr>
@@ -9457,7 +11546,7 @@
 </file>
 
 <file path=customXml/item1.xml><?xml version="1.0" encoding="utf-8"?>
-<b:Sources xmlns:b="http://schemas.openxmlformats.org/officeDocument/2006/bibliography" xmlns="http://schemas.openxmlformats.org/officeDocument/2006/bibliography" SelectedStyle="\APA.XSL" StyleName="APA">
+<b:Sources xmlns:b="http://schemas.openxmlformats.org/officeDocument/2006/bibliography" xmlns="http://schemas.openxmlformats.org/officeDocument/2006/bibliography" SelectedStyle="\APASixthEditionOfficeOnline.xsl" StyleName="APA" Version="6">
   <b:Source>
     <b:Tag>Mal10</b:Tag>
     <b:SourceType>JournalArticle</b:SourceType>
@@ -9480,7 +11569,7 @@
     <b:JournalName>International Journal of Information Management</b:JournalName>
     <b:Year>2010</b:Year>
     <b:Pages>30, 28-37</b:Pages>
-    <b:RefOrder>5</b:RefOrder>
+    <b:RefOrder>1</b:RefOrder>
   </b:Source>
   <b:Source>
     <b:Tag>URL13</b:Tag>
@@ -9504,7 +11593,7 @@
     <b:MonthAccessed>06</b:MonthAccessed>
     <b:DayAccessed>17</b:DayAccessed>
     <b:URL>https://www.youtube.com/watch?v=lY5e4ac8Feg</b:URL>
-    <b:RefOrder>6</b:RefOrder>
+    <b:RefOrder>2</b:RefOrder>
   </b:Source>
   <b:Source>
     <b:Tag>Eas11</b:Tag>
@@ -9528,7 +11617,7 @@
         </b:NameList>
       </b:Author>
     </b:Author>
-    <b:RefOrder>7</b:RefOrder>
+    <b:RefOrder>3</b:RefOrder>
   </b:Source>
   <b:Source>
     <b:Tag>STA14</b:Tag>
@@ -9553,7 +11642,7 @@
         </b:NameList>
       </b:Author>
     </b:Author>
-    <b:RefOrder>8</b:RefOrder>
+    <b:RefOrder>4</b:RefOrder>
   </b:Source>
   <b:Source>
     <b:Tag>Gan13</b:Tag>
@@ -9590,7 +11679,7 @@
     <b:MonthAccessed>Temmuz</b:MonthAccessed>
     <b:DayAccessed>21</b:DayAccessed>
     <b:URL>https://www.gartner.com/doc/2633315</b:URL>
-    <b:RefOrder>9</b:RefOrder>
+    <b:RefOrder>5</b:RefOrder>
   </b:Source>
   <b:Source>
     <b:Tag>Erk15</b:Tag>
@@ -9613,7 +11702,7 @@
     <b:MonthAccessed>08</b:MonthAccessed>
     <b:DayAccessed>22</b:DayAccessed>
     <b:URL>http://www.karel.com.tr/blog/bulut-bilisim-dogru-secim-ozel-bulut-mu-kamusal-bulut-mu</b:URL>
-    <b:RefOrder>10</b:RefOrder>
+    <b:RefOrder>6</b:RefOrder>
   </b:Source>
   <b:Source>
     <b:Tag>Raj02</b:Tag>
@@ -9633,7 +11722,7 @@
     </b:Author>
     <b:JournalName>Information  &amp; Management</b:JournalName>
     <b:Pages>40, 87–114.</b:Pages>
-    <b:RefOrder>11</b:RefOrder>
+    <b:RefOrder>7</b:RefOrder>
   </b:Source>
   <b:Source>
     <b:Tag>URL151</b:Tag>
@@ -9654,7 +11743,7 @@
     <b:URL>http://www.erp.web.tr/erp-nedir/mrpi-mrpii-erpii-nedir/pdf</b:URL>
     <b:Title>MRPI, MRPII, ERPII Nedir ? - ERP Nedir ?</b:Title>
     <b:InternetSiteTitle>erp.web.tr</b:InternetSiteTitle>
-    <b:RefOrder>12</b:RefOrder>
+    <b:RefOrder>8</b:RefOrder>
   </b:Source>
   <b:Source>
     <b:Tag>Gör</b:Tag>
@@ -9679,7 +11768,7 @@
     <b:JournalName>2.  Ulusal Sistem  Mühendisliği  Kongresi  Bildiriler  Kitabı</b:JournalName>
     <b:Year>2008</b:Year>
     <b:Pages>296-300</b:Pages>
-    <b:RefOrder>13</b:RefOrder>
+    <b:RefOrder>9</b:RefOrder>
   </b:Source>
   <b:Source>
     <b:Tag>Hun04</b:Tag>
@@ -9711,7 +11800,7 @@
     <b:Pages>724-737</b:Pages>
     <b:ConferenceName>Proceedings of the Pacific Asia Conference on Information Systems</b:ConferenceName>
     <b:Publisher>PACIS 2004</b:Publisher>
-    <b:RefOrder>14</b:RefOrder>
+    <b:RefOrder>10</b:RefOrder>
   </b:Source>
   <b:Source>
     <b:Tag>Nah01</b:Tag>
@@ -9737,7 +11826,7 @@
     <b:JournalName>Business Process Management Journal</b:JournalName>
     <b:Year>2001</b:Year>
     <b:Pages>7:3, 285-296</b:Pages>
-    <b:RefOrder>15</b:RefOrder>
+    <b:RefOrder>11</b:RefOrder>
   </b:Source>
   <b:Source>
     <b:Tag>Placeholder1</b:Tag>
@@ -9761,7 +11850,7 @@
         </b:NameList>
       </b:Author>
     </b:Author>
-    <b:RefOrder>1</b:RefOrder>
+    <b:RefOrder>12</b:RefOrder>
   </b:Source>
   <b:Source>
     <b:Tag>Opt15</b:Tag>
@@ -9780,7 +11869,7 @@
       </b:Author>
     </b:Author>
     <b:URL>http://www.vocollectvoice.com/download.aspx?file=d532335e-4054-4130-a8d7-38f92778092e.pdf</b:URL>
-    <b:RefOrder>16</b:RefOrder>
+    <b:RefOrder>13</b:RefOrder>
   </b:Source>
   <b:Source>
     <b:Tag>Tel00</b:Tag>
@@ -9800,7 +11889,7 @@
     <b:JournalName>International Journal of Production Research</b:JournalName>
     <b:Year>2000</b:Year>
     <b:Pages>28,4507-4520</b:Pages>
-    <b:RefOrder>2</b:RefOrder>
+    <b:RefOrder>14</b:RefOrder>
   </b:Source>
   <b:Source>
     <b:Tag>San96</b:Tag>
@@ -9824,7 +11913,7 @@
     <b:JournalName>European Journal of Operational Research</b:JournalName>
     <b:Year>1996</b:Year>
     <b:Pages>89, 380-399</b:Pages>
-    <b:RefOrder>3</b:RefOrder>
+    <b:RefOrder>15</b:RefOrder>
   </b:Source>
   <b:Source>
     <b:Tag>Raz08</b:Tag>
@@ -9850,7 +11939,7 @@
     <b:Pages>489-495</b:Pages>
     <b:ConferenceName>Proceedings of 4th International Conference on Information and Automation for Sustainability (ICIAfS )</b:ConferenceName>
     <b:City>Sri Lanka</b:City>
-    <b:RefOrder>4</b:RefOrder>
+    <b:RefOrder>16</b:RefOrder>
   </b:Source>
   <b:Source>
     <b:Tag>Eva00</b:Tag>
@@ -9971,7 +12060,7 @@
 </file>
 
 <file path=customXml/itemProps1.xml><?xml version="1.0" encoding="utf-8"?>
-<ds:datastoreItem xmlns:ds="http://schemas.openxmlformats.org/officeDocument/2006/customXml" ds:itemID="{7B7C5A3F-E038-4D3F-B190-E83F2E74C801}">
+<ds:datastoreItem xmlns:ds="http://schemas.openxmlformats.org/officeDocument/2006/customXml" ds:itemID="{78C0512A-46DD-467C-9077-2C8E9F9CCA9F}">
   <ds:schemaRefs>
     <ds:schemaRef ds:uri="http://schemas.openxmlformats.org/officeDocument/2006/bibliography"/>
   </ds:schemaRefs>

</xml_diff>

<commit_message>
Add diagrams and dashboard screenshots to report
</commit_message>
<xml_diff>
--- a/docs/graduation_thesis_report.docx
+++ b/docs/graduation_thesis_report.docx
@@ -5009,53 +5009,549 @@
     </w:p>
     <w:p>
       <w:r>
-        <w:t xml:space="preserve">The system development process started with the preparation of the raw </w:t>
+        <w:t>The overall architecture of the project consists of five main layers: raw data, data processing, storage, analytics, and dashboard presentation. The following diagram summarizes the system architecture of the developed dashboard.</w:t>
+      </w:r>
+    </w:p>
+    <w:p>
+      <w:pPr>
+        <w:keepNext/>
+      </w:pPr>
+      <w:r>
+        <w:rPr>
+          <w:noProof/>
+        </w:rPr>
+        <w:drawing>
+          <wp:inline distT="0" distB="0" distL="0" distR="0" wp14:anchorId="6860B177" wp14:editId="56E6FDD2">
+            <wp:extent cx="5868670" cy="3467735"/>
+            <wp:effectExtent l="0" t="0" r="0" b="0"/>
+            <wp:docPr id="360020555" name="Picture 1"/>
+            <wp:cNvGraphicFramePr>
+              <a:graphicFrameLocks xmlns:a="http://schemas.openxmlformats.org/drawingml/2006/main" noChangeAspect="1"/>
+            </wp:cNvGraphicFramePr>
+            <a:graphic xmlns:a="http://schemas.openxmlformats.org/drawingml/2006/main">
+              <a:graphicData uri="http://schemas.openxmlformats.org/drawingml/2006/picture">
+                <pic:pic xmlns:pic="http://schemas.openxmlformats.org/drawingml/2006/picture">
+                  <pic:nvPicPr>
+                    <pic:cNvPr id="360020555" name="Picture 360020555"/>
+                    <pic:cNvPicPr/>
+                  </pic:nvPicPr>
+                  <pic:blipFill>
+                    <a:blip r:embed="rId9" cstate="print">
+                      <a:extLst>
+                        <a:ext uri="{28A0092B-C50C-407E-A947-70E740481C1C}">
+                          <a14:useLocalDpi xmlns:a14="http://schemas.microsoft.com/office/drawing/2010/main" val="0"/>
+                        </a:ext>
+                      </a:extLst>
+                    </a:blip>
+                    <a:stretch>
+                      <a:fillRect/>
+                    </a:stretch>
+                  </pic:blipFill>
+                  <pic:spPr>
+                    <a:xfrm>
+                      <a:off x="0" y="0"/>
+                      <a:ext cx="5868670" cy="3467735"/>
+                    </a:xfrm>
+                    <a:prstGeom prst="rect">
+                      <a:avLst/>
+                    </a:prstGeom>
+                  </pic:spPr>
+                </pic:pic>
+              </a:graphicData>
+            </a:graphic>
+          </wp:inline>
+        </w:drawing>
+      </w:r>
+    </w:p>
+    <w:p>
+      <w:pPr>
+        <w:pStyle w:val="Caption"/>
+      </w:pPr>
+      <w:r>
+        <w:t xml:space="preserve">Figure </w:t>
+      </w:r>
+      <w:fldSimple w:instr=" SEQ Figure \* ARABIC ">
+        <w:r>
+          <w:rPr>
+            <w:noProof/>
+          </w:rPr>
+          <w:t>1</w:t>
+        </w:r>
+      </w:fldSimple>
+      <w:r>
+        <w:t xml:space="preserve">. </w:t>
+      </w:r>
+      <w:r>
+        <w:t>System architecture of the Supply Chain Visibility and Risk Dashboard</w:t>
+      </w:r>
+    </w:p>
+    <w:p>
+      <w:pPr>
+        <w:rPr>
+          <w:lang w:val="en-ZA"/>
+        </w:rPr>
+      </w:pPr>
+    </w:p>
+    <w:p>
+      <w:pPr>
+        <w:rPr>
+          <w:lang w:val="en-ZA"/>
+        </w:rPr>
+      </w:pPr>
+      <w:r>
+        <w:rPr>
+          <w:lang w:val="en-ZA"/>
+        </w:rPr>
+        <w:t>The processed data is organized into analytical tables that support dashboard modules. The logical data model includes orders, products, shipments, inventory, demand, and risk score tables.</w:t>
+      </w:r>
+    </w:p>
+    <w:p>
+      <w:pPr>
+        <w:keepNext/>
+      </w:pPr>
+      <w:r>
+        <w:rPr>
+          <w:noProof/>
+          <w:lang w:val="en-ZA"/>
+        </w:rPr>
+        <w:lastRenderedPageBreak/>
+        <w:drawing>
+          <wp:inline distT="0" distB="0" distL="0" distR="0" wp14:anchorId="7A9CDD0F" wp14:editId="7A562C1B">
+            <wp:extent cx="5868670" cy="3912235"/>
+            <wp:effectExtent l="0" t="0" r="0" b="0"/>
+            <wp:docPr id="809201836" name="Picture 2"/>
+            <wp:cNvGraphicFramePr>
+              <a:graphicFrameLocks xmlns:a="http://schemas.openxmlformats.org/drawingml/2006/main" noChangeAspect="1"/>
+            </wp:cNvGraphicFramePr>
+            <a:graphic xmlns:a="http://schemas.openxmlformats.org/drawingml/2006/main">
+              <a:graphicData uri="http://schemas.openxmlformats.org/drawingml/2006/picture">
+                <pic:pic xmlns:pic="http://schemas.openxmlformats.org/drawingml/2006/picture">
+                  <pic:nvPicPr>
+                    <pic:cNvPr id="809201836" name="Picture 809201836"/>
+                    <pic:cNvPicPr/>
+                  </pic:nvPicPr>
+                  <pic:blipFill>
+                    <a:blip r:embed="rId10" cstate="print">
+                      <a:extLst>
+                        <a:ext uri="{28A0092B-C50C-407E-A947-70E740481C1C}">
+                          <a14:useLocalDpi xmlns:a14="http://schemas.microsoft.com/office/drawing/2010/main" val="0"/>
+                        </a:ext>
+                      </a:extLst>
+                    </a:blip>
+                    <a:stretch>
+                      <a:fillRect/>
+                    </a:stretch>
+                  </pic:blipFill>
+                  <pic:spPr>
+                    <a:xfrm>
+                      <a:off x="0" y="0"/>
+                      <a:ext cx="5868670" cy="3912235"/>
+                    </a:xfrm>
+                    <a:prstGeom prst="rect">
+                      <a:avLst/>
+                    </a:prstGeom>
+                  </pic:spPr>
+                </pic:pic>
+              </a:graphicData>
+            </a:graphic>
+          </wp:inline>
+        </w:drawing>
+      </w:r>
+    </w:p>
+    <w:p>
+      <w:pPr>
+        <w:pStyle w:val="Caption"/>
+      </w:pPr>
+      <w:r>
+        <w:t xml:space="preserve">Figure </w:t>
+      </w:r>
+      <w:fldSimple w:instr=" SEQ Figure \* ARABIC ">
+        <w:r>
+          <w:rPr>
+            <w:noProof/>
+          </w:rPr>
+          <w:t>2</w:t>
+        </w:r>
+      </w:fldSimple>
+      <w:r>
+        <w:t>. Logical data model used in the dashboard</w:t>
+      </w:r>
+    </w:p>
+    <w:p>
+      <w:r>
+        <w:t>The diagram represents the logical data structure used by the dashboard rather than a fully normalized ERP database schema. Since the original dataset is a public analytical dataset, some relationships are based on common analytical fields such as product name, category, market, and region.</w:t>
+      </w:r>
+    </w:p>
+    <w:p/>
+    <w:p>
+      <w:r>
+        <w:t>The Overview page provides a high-level summary of supply chain operations, including order volume, sales, profit, delivery performance, delay indicators, inventory warnings, and regional risk information.</w:t>
+      </w:r>
+    </w:p>
+    <w:p>
+      <w:pPr>
+        <w:keepNext/>
+      </w:pPr>
+      <w:r>
+        <w:rPr>
+          <w:noProof/>
+        </w:rPr>
+        <w:drawing>
+          <wp:inline distT="0" distB="0" distL="0" distR="0" wp14:anchorId="1A2C66CE" wp14:editId="7569E3D4">
+            <wp:extent cx="5868670" cy="3001010"/>
+            <wp:effectExtent l="0" t="0" r="0" b="8890"/>
+            <wp:docPr id="796038923" name="Picture 4"/>
+            <wp:cNvGraphicFramePr>
+              <a:graphicFrameLocks xmlns:a="http://schemas.openxmlformats.org/drawingml/2006/main" noChangeAspect="1"/>
+            </wp:cNvGraphicFramePr>
+            <a:graphic xmlns:a="http://schemas.openxmlformats.org/drawingml/2006/main">
+              <a:graphicData uri="http://schemas.openxmlformats.org/drawingml/2006/picture">
+                <pic:pic xmlns:pic="http://schemas.openxmlformats.org/drawingml/2006/picture">
+                  <pic:nvPicPr>
+                    <pic:cNvPr id="796038923" name="Picture 796038923"/>
+                    <pic:cNvPicPr/>
+                  </pic:nvPicPr>
+                  <pic:blipFill>
+                    <a:blip r:embed="rId11" cstate="print">
+                      <a:extLst>
+                        <a:ext uri="{28A0092B-C50C-407E-A947-70E740481C1C}">
+                          <a14:useLocalDpi xmlns:a14="http://schemas.microsoft.com/office/drawing/2010/main" val="0"/>
+                        </a:ext>
+                      </a:extLst>
+                    </a:blip>
+                    <a:stretch>
+                      <a:fillRect/>
+                    </a:stretch>
+                  </pic:blipFill>
+                  <pic:spPr>
+                    <a:xfrm>
+                      <a:off x="0" y="0"/>
+                      <a:ext cx="5868670" cy="3001010"/>
+                    </a:xfrm>
+                    <a:prstGeom prst="rect">
+                      <a:avLst/>
+                    </a:prstGeom>
+                  </pic:spPr>
+                </pic:pic>
+              </a:graphicData>
+            </a:graphic>
+          </wp:inline>
+        </w:drawing>
+      </w:r>
+    </w:p>
+    <w:p>
+      <w:pPr>
+        <w:pStyle w:val="Caption"/>
+      </w:pPr>
+      <w:r>
+        <w:t xml:space="preserve">Figure </w:t>
+      </w:r>
+      <w:fldSimple w:instr=" SEQ Figure \* ARABIC ">
+        <w:r>
+          <w:rPr>
+            <w:noProof/>
+          </w:rPr>
+          <w:t>3</w:t>
+        </w:r>
+      </w:fldSimple>
+      <w:r>
+        <w:t>. Executive overview dashboard page</w:t>
+      </w:r>
+    </w:p>
+    <w:p>
+      <w:pPr>
+        <w:rPr>
+          <w:lang w:val="en-ZA"/>
+        </w:rPr>
+      </w:pPr>
+    </w:p>
+    <w:p>
+      <w:pPr>
+        <w:rPr>
+          <w:lang w:val="en-ZA"/>
+        </w:rPr>
+      </w:pPr>
+      <w:r>
+        <w:rPr>
+          <w:lang w:val="en-ZA"/>
+        </w:rPr>
+        <w:lastRenderedPageBreak/>
+        <w:t>The Supply Chain Risk page combines delivery risk, delay risk, inventory risk, and demand volatility risk into an overall risk score. This module supports decision-making by highlighting risky regions, categories, and inventory items.</w:t>
+      </w:r>
+    </w:p>
+    <w:p>
+      <w:pPr>
+        <w:keepNext/>
+      </w:pPr>
+      <w:r>
+        <w:rPr>
+          <w:noProof/>
+          <w:lang w:val="en-ZA"/>
+        </w:rPr>
+        <w:drawing>
+          <wp:inline distT="0" distB="0" distL="0" distR="0" wp14:anchorId="59844FED" wp14:editId="5F8B1322">
+            <wp:extent cx="5868670" cy="3006725"/>
+            <wp:effectExtent l="0" t="0" r="0" b="3175"/>
+            <wp:docPr id="1469610036" name="Picture 5"/>
+            <wp:cNvGraphicFramePr>
+              <a:graphicFrameLocks xmlns:a="http://schemas.openxmlformats.org/drawingml/2006/main" noChangeAspect="1"/>
+            </wp:cNvGraphicFramePr>
+            <a:graphic xmlns:a="http://schemas.openxmlformats.org/drawingml/2006/main">
+              <a:graphicData uri="http://schemas.openxmlformats.org/drawingml/2006/picture">
+                <pic:pic xmlns:pic="http://schemas.openxmlformats.org/drawingml/2006/picture">
+                  <pic:nvPicPr>
+                    <pic:cNvPr id="1469610036" name="Picture 1469610036"/>
+                    <pic:cNvPicPr/>
+                  </pic:nvPicPr>
+                  <pic:blipFill>
+                    <a:blip r:embed="rId12" cstate="print">
+                      <a:extLst>
+                        <a:ext uri="{28A0092B-C50C-407E-A947-70E740481C1C}">
+                          <a14:useLocalDpi xmlns:a14="http://schemas.microsoft.com/office/drawing/2010/main" val="0"/>
+                        </a:ext>
+                      </a:extLst>
+                    </a:blip>
+                    <a:stretch>
+                      <a:fillRect/>
+                    </a:stretch>
+                  </pic:blipFill>
+                  <pic:spPr>
+                    <a:xfrm>
+                      <a:off x="0" y="0"/>
+                      <a:ext cx="5868670" cy="3006725"/>
+                    </a:xfrm>
+                    <a:prstGeom prst="rect">
+                      <a:avLst/>
+                    </a:prstGeom>
+                  </pic:spPr>
+                </pic:pic>
+              </a:graphicData>
+            </a:graphic>
+          </wp:inline>
+        </w:drawing>
+      </w:r>
+    </w:p>
+    <w:p>
+      <w:pPr>
+        <w:pStyle w:val="Caption"/>
+      </w:pPr>
+      <w:r>
+        <w:t xml:space="preserve">Figure </w:t>
+      </w:r>
+      <w:fldSimple w:instr=" SEQ Figure \* ARABIC ">
+        <w:r>
+          <w:rPr>
+            <w:noProof/>
+          </w:rPr>
+          <w:t>4</w:t>
+        </w:r>
+      </w:fldSimple>
+      <w:r>
+        <w:t>. Supply chain risk analysis page</w:t>
+      </w:r>
+    </w:p>
+    <w:p>
+      <w:pPr>
+        <w:rPr>
+          <w:lang w:val="en-ZA"/>
+        </w:rPr>
+      </w:pPr>
+    </w:p>
+    <w:p>
+      <w:pPr>
+        <w:rPr>
+          <w:lang w:val="en-ZA"/>
+        </w:rPr>
+      </w:pPr>
+      <w:r>
+        <w:rPr>
+          <w:lang w:val="en-ZA"/>
+        </w:rPr>
+        <w:t xml:space="preserve">The Demand Forecast page </w:t>
       </w:r>
       <w:proofErr w:type="spellStart"/>
       <w:r>
+        <w:rPr>
+          <w:lang w:val="en-ZA"/>
+        </w:rPr>
+        <w:t>analyzes</w:t>
+      </w:r>
+      <w:proofErr w:type="spellEnd"/>
+      <w:r>
+        <w:rPr>
+          <w:lang w:val="en-ZA"/>
+        </w:rPr>
+        <w:t xml:space="preserve"> historical demand patterns and compares simple forecasting models such as moving average and linear regression. The page also presents future demand estimates for the next six months.</w:t>
+      </w:r>
+    </w:p>
+    <w:p>
+      <w:pPr>
+        <w:keepNext/>
+      </w:pPr>
+      <w:r>
+        <w:rPr>
+          <w:noProof/>
+          <w:lang w:val="en-ZA"/>
+        </w:rPr>
+        <w:drawing>
+          <wp:inline distT="0" distB="0" distL="0" distR="0" wp14:anchorId="0F45F1DD" wp14:editId="2A4CCE17">
+            <wp:extent cx="5868670" cy="2995295"/>
+            <wp:effectExtent l="0" t="0" r="0" b="0"/>
+            <wp:docPr id="2135638092" name="Picture 6"/>
+            <wp:cNvGraphicFramePr>
+              <a:graphicFrameLocks xmlns:a="http://schemas.openxmlformats.org/drawingml/2006/main" noChangeAspect="1"/>
+            </wp:cNvGraphicFramePr>
+            <a:graphic xmlns:a="http://schemas.openxmlformats.org/drawingml/2006/main">
+              <a:graphicData uri="http://schemas.openxmlformats.org/drawingml/2006/picture">
+                <pic:pic xmlns:pic="http://schemas.openxmlformats.org/drawingml/2006/picture">
+                  <pic:nvPicPr>
+                    <pic:cNvPr id="2135638092" name="Picture 2135638092"/>
+                    <pic:cNvPicPr/>
+                  </pic:nvPicPr>
+                  <pic:blipFill>
+                    <a:blip r:embed="rId13" cstate="print">
+                      <a:extLst>
+                        <a:ext uri="{28A0092B-C50C-407E-A947-70E740481C1C}">
+                          <a14:useLocalDpi xmlns:a14="http://schemas.microsoft.com/office/drawing/2010/main" val="0"/>
+                        </a:ext>
+                      </a:extLst>
+                    </a:blip>
+                    <a:stretch>
+                      <a:fillRect/>
+                    </a:stretch>
+                  </pic:blipFill>
+                  <pic:spPr>
+                    <a:xfrm>
+                      <a:off x="0" y="0"/>
+                      <a:ext cx="5868670" cy="2995295"/>
+                    </a:xfrm>
+                    <a:prstGeom prst="rect">
+                      <a:avLst/>
+                    </a:prstGeom>
+                  </pic:spPr>
+                </pic:pic>
+              </a:graphicData>
+            </a:graphic>
+          </wp:inline>
+        </w:drawing>
+      </w:r>
+    </w:p>
+    <w:p>
+      <w:pPr>
+        <w:pStyle w:val="Caption"/>
+      </w:pPr>
+      <w:r>
+        <w:t xml:space="preserve">Figure </w:t>
+      </w:r>
+      <w:fldSimple w:instr=" SEQ Figure \* ARABIC ">
+        <w:r>
+          <w:rPr>
+            <w:noProof/>
+          </w:rPr>
+          <w:t>5</w:t>
+        </w:r>
+      </w:fldSimple>
+      <w:r>
+        <w:t>. Demand forecasting dashboard page</w:t>
+      </w:r>
+    </w:p>
+    <w:p>
+      <w:pPr>
+        <w:pStyle w:val="Heading1"/>
+      </w:pPr>
+      <w:bookmarkStart w:id="20" w:name="_Toc115861786"/>
+      <w:r>
+        <w:t>CASE STUDY / BUSINESS CASE</w:t>
+      </w:r>
+      <w:bookmarkEnd w:id="20"/>
+    </w:p>
+    <w:p>
+      <w:r>
+        <w:t xml:space="preserve">The business case is based on a simulated supply chain analytics scenario using the public </w:t>
+      </w:r>
+      <w:proofErr w:type="spellStart"/>
+      <w:r>
         <w:t>DataCo</w:t>
       </w:r>
       <w:proofErr w:type="spellEnd"/>
       <w:r>
-        <w:t xml:space="preserve"> Smart Supply Chain dataset. The raw dataset was cleaned and transformed using the process_data.py script. This script creates cleaned order, product, shipment, inventory, demand, and risk score tables.</w:t>
-      </w:r>
-    </w:p>
-    <w:p/>
-    <w:p>
-      <w:r>
-        <w:t xml:space="preserve">The dashboard was developed as a multi-page </w:t>
-      </w:r>
-      <w:proofErr w:type="spellStart"/>
-      <w:r>
-        <w:t>Streamlit</w:t>
-      </w:r>
-      <w:proofErr w:type="spellEnd"/>
-      <w:r>
-        <w:t xml:space="preserve"> application. Each page loads processed data and calculates relevant indicators. The system includes operational KPIs, inventory status classification, shipment delay analysis, regional risk scoring, category-level risk analysis, and basic demand forecasting.</w:t>
-      </w:r>
-    </w:p>
-    <w:p/>
-    <w:p>
-      <w:pPr>
-        <w:pStyle w:val="Heading1"/>
-      </w:pPr>
-      <w:bookmarkStart w:id="20" w:name="_Toc115861786"/>
-      <w:r>
-        <w:t>CASE STUDY / BUSINESS CASE</w:t>
-      </w:r>
-      <w:bookmarkEnd w:id="20"/>
-    </w:p>
-    <w:p>
-      <w:r>
-        <w:t xml:space="preserve">The business case is based on a simulated supply chain analytics scenario using the public </w:t>
-      </w:r>
-      <w:proofErr w:type="spellStart"/>
-      <w:r>
-        <w:t>DataCo</w:t>
-      </w:r>
-      <w:proofErr w:type="spellEnd"/>
-      <w:r>
         <w:t xml:space="preserve"> Smart Supply Chain dataset. The case represents a multi-product supply chain network with orders, products, markets, regions, shipment modes, delivery statuses, sales, and profit values.</w:t>
+      </w:r>
+    </w:p>
+    <w:p>
+      <w:r>
+        <w:t>The dashboard is designed for different business users such as supply chain managers, business analysts, inventory planners, and logistics analysts. Each user role interacts with the dashboard through specific use cases.</w:t>
+      </w:r>
+    </w:p>
+    <w:p>
+      <w:pPr>
+        <w:keepNext/>
+      </w:pPr>
+      <w:r>
+        <w:rPr>
+          <w:noProof/>
+        </w:rPr>
+        <w:lastRenderedPageBreak/>
+        <w:drawing>
+          <wp:inline distT="0" distB="0" distL="0" distR="0" wp14:anchorId="12844D27" wp14:editId="173D6B5F">
+            <wp:extent cx="5868670" cy="3586480"/>
+            <wp:effectExtent l="0" t="0" r="0" b="0"/>
+            <wp:docPr id="1848330136" name="Picture 3"/>
+            <wp:cNvGraphicFramePr>
+              <a:graphicFrameLocks xmlns:a="http://schemas.openxmlformats.org/drawingml/2006/main" noChangeAspect="1"/>
+            </wp:cNvGraphicFramePr>
+            <a:graphic xmlns:a="http://schemas.openxmlformats.org/drawingml/2006/main">
+              <a:graphicData uri="http://schemas.openxmlformats.org/drawingml/2006/picture">
+                <pic:pic xmlns:pic="http://schemas.openxmlformats.org/drawingml/2006/picture">
+                  <pic:nvPicPr>
+                    <pic:cNvPr id="1848330136" name="Picture 1848330136"/>
+                    <pic:cNvPicPr/>
+                  </pic:nvPicPr>
+                  <pic:blipFill>
+                    <a:blip r:embed="rId14" cstate="print">
+                      <a:extLst>
+                        <a:ext uri="{28A0092B-C50C-407E-A947-70E740481C1C}">
+                          <a14:useLocalDpi xmlns:a14="http://schemas.microsoft.com/office/drawing/2010/main" val="0"/>
+                        </a:ext>
+                      </a:extLst>
+                    </a:blip>
+                    <a:stretch>
+                      <a:fillRect/>
+                    </a:stretch>
+                  </pic:blipFill>
+                  <pic:spPr>
+                    <a:xfrm>
+                      <a:off x="0" y="0"/>
+                      <a:ext cx="5868670" cy="3586480"/>
+                    </a:xfrm>
+                    <a:prstGeom prst="rect">
+                      <a:avLst/>
+                    </a:prstGeom>
+                  </pic:spPr>
+                </pic:pic>
+              </a:graphicData>
+            </a:graphic>
+          </wp:inline>
+        </w:drawing>
+      </w:r>
+    </w:p>
+    <w:p>
+      <w:pPr>
+        <w:pStyle w:val="Caption"/>
+      </w:pPr>
+      <w:r>
+        <w:t xml:space="preserve">Figure </w:t>
+      </w:r>
+      <w:fldSimple w:instr=" SEQ Figure \* ARABIC ">
+        <w:r>
+          <w:rPr>
+            <w:noProof/>
+          </w:rPr>
+          <w:t>6</w:t>
+        </w:r>
+      </w:fldSimple>
+      <w:r>
+        <w:t>. Use Case Diagram of the dashboard system</w:t>
       </w:r>
     </w:p>
     <w:p/>
@@ -7486,10 +7982,10 @@
       </w:pPr>
     </w:p>
     <w:sectPr>
-      <w:headerReference w:type="default" r:id="rId9"/>
-      <w:footerReference w:type="even" r:id="rId10"/>
-      <w:footerReference w:type="default" r:id="rId11"/>
-      <w:footerReference w:type="first" r:id="rId12"/>
+      <w:headerReference w:type="default" r:id="rId15"/>
+      <w:footerReference w:type="even" r:id="rId16"/>
+      <w:footerReference w:type="default" r:id="rId17"/>
+      <w:footerReference w:type="first" r:id="rId18"/>
       <w:footnotePr>
         <w:numFmt w:val="chicago"/>
       </w:footnotePr>

</xml_diff>

<commit_message>
Restore thesis literature review
</commit_message>
<xml_diff>
--- a/docs/graduation_thesis_report.docx
+++ b/docs/graduation_thesis_report.docx
@@ -315,7 +315,6 @@
         </w:rPr>
         <w:t>G</w:t>
       </w:r>
-      <w:proofErr w:type="spellStart"/>
       <w:r>
         <w:rPr>
           <w:b/>
@@ -324,18 +323,7 @@
           <w:szCs w:val="32"/>
           <w:lang w:val="tr-TR"/>
         </w:rPr>
-        <w:t>ülse</w:t>
-      </w:r>
-      <w:proofErr w:type="spellEnd"/>
-      <w:r>
-        <w:rPr>
-          <w:b/>
-          <w:color w:val="000000" w:themeColor="text1"/>
-          <w:sz w:val="32"/>
-          <w:szCs w:val="32"/>
-          <w:lang w:val="tr-TR"/>
-        </w:rPr>
-        <w:t xml:space="preserve"> Dolunay ÜNLÜ</w:t>
+        <w:t>ülse Dolunay ÜNLÜ</w:t>
       </w:r>
     </w:p>
     <w:p>
@@ -417,7 +405,6 @@
         </w:rPr>
         <w:t xml:space="preserve">Advisor: </w:t>
       </w:r>
-      <w:proofErr w:type="spellStart"/>
       <w:r>
         <w:rPr>
           <w:bCs/>
@@ -426,9 +413,81 @@
           <w:szCs w:val="32"/>
           <w:lang w:val="en-US"/>
         </w:rPr>
-        <w:t>Doç</w:t>
-      </w:r>
-      <w:proofErr w:type="spellEnd"/>
+        <w:t>Doç. Dr. Orhan Özgür AYBAR</w:t>
+      </w:r>
+    </w:p>
+    <w:p>
+      <w:pPr>
+        <w:jc w:val="center"/>
+        <w:rPr>
+          <w:bCs/>
+          <w:sz w:val="32"/>
+          <w:szCs w:val="32"/>
+          <w:lang w:val="en-US"/>
+        </w:rPr>
+      </w:pPr>
+    </w:p>
+    <w:p>
+      <w:pPr>
+        <w:jc w:val="center"/>
+        <w:rPr>
+          <w:bCs/>
+          <w:sz w:val="32"/>
+          <w:szCs w:val="32"/>
+          <w:lang w:val="en-US"/>
+        </w:rPr>
+      </w:pPr>
+    </w:p>
+    <w:p>
+      <w:pPr>
+        <w:jc w:val="center"/>
+        <w:rPr>
+          <w:bCs/>
+          <w:sz w:val="32"/>
+          <w:szCs w:val="32"/>
+          <w:lang w:val="en-US"/>
+        </w:rPr>
+      </w:pPr>
+    </w:p>
+    <w:p>
+      <w:pPr>
+        <w:jc w:val="center"/>
+        <w:rPr>
+          <w:bCs/>
+          <w:sz w:val="32"/>
+          <w:szCs w:val="32"/>
+          <w:lang w:val="en-US"/>
+        </w:rPr>
+      </w:pPr>
+    </w:p>
+    <w:p>
+      <w:pPr>
+        <w:jc w:val="center"/>
+        <w:rPr>
+          <w:bCs/>
+          <w:sz w:val="32"/>
+          <w:szCs w:val="32"/>
+          <w:lang w:val="en-US"/>
+        </w:rPr>
+      </w:pPr>
+      <w:r>
+        <w:rPr>
+          <w:bCs/>
+          <w:sz w:val="32"/>
+          <w:szCs w:val="32"/>
+          <w:lang w:val="en-US"/>
+        </w:rPr>
+        <w:t>İstanbul</w:t>
+      </w:r>
+      <w:r>
+        <w:rPr>
+          <w:bCs/>
+          <w:sz w:val="32"/>
+          <w:szCs w:val="32"/>
+          <w:lang w:val="en-US"/>
+        </w:rPr>
+        <w:t xml:space="preserve"> </w:t>
+      </w:r>
       <w:r>
         <w:rPr>
           <w:bCs/>
@@ -437,80 +496,7 @@
           <w:szCs w:val="32"/>
           <w:lang w:val="en-US"/>
         </w:rPr>
-        <w:t>. Dr. Orhan Özgür AYBAR</w:t>
-      </w:r>
-    </w:p>
-    <w:p>
-      <w:pPr>
-        <w:jc w:val="center"/>
-        <w:rPr>
-          <w:bCs/>
-          <w:sz w:val="32"/>
-          <w:szCs w:val="32"/>
-          <w:lang w:val="en-US"/>
-        </w:rPr>
-      </w:pPr>
-    </w:p>
-    <w:p>
-      <w:pPr>
-        <w:jc w:val="center"/>
-        <w:rPr>
-          <w:bCs/>
-          <w:sz w:val="32"/>
-          <w:szCs w:val="32"/>
-          <w:lang w:val="en-US"/>
-        </w:rPr>
-      </w:pPr>
-    </w:p>
-    <w:p>
-      <w:pPr>
-        <w:jc w:val="center"/>
-        <w:rPr>
-          <w:bCs/>
-          <w:sz w:val="32"/>
-          <w:szCs w:val="32"/>
-          <w:lang w:val="en-US"/>
-        </w:rPr>
-      </w:pPr>
-    </w:p>
-    <w:p>
-      <w:pPr>
-        <w:jc w:val="center"/>
-        <w:rPr>
-          <w:bCs/>
-          <w:sz w:val="32"/>
-          <w:szCs w:val="32"/>
-          <w:lang w:val="en-US"/>
-        </w:rPr>
-      </w:pPr>
-    </w:p>
-    <w:p>
-      <w:pPr>
-        <w:jc w:val="center"/>
-        <w:rPr>
-          <w:bCs/>
-          <w:sz w:val="32"/>
-          <w:szCs w:val="32"/>
-          <w:lang w:val="en-US"/>
-        </w:rPr>
-      </w:pPr>
-      <w:r>
-        <w:rPr>
-          <w:bCs/>
-          <w:sz w:val="32"/>
-          <w:szCs w:val="32"/>
-          <w:lang w:val="en-US"/>
-        </w:rPr>
-        <w:t>İstanbul</w:t>
-      </w:r>
-      <w:r>
-        <w:rPr>
-          <w:bCs/>
-          <w:sz w:val="32"/>
-          <w:szCs w:val="32"/>
-          <w:lang w:val="en-US"/>
-        </w:rPr>
-        <w:t xml:space="preserve"> </w:t>
+        <w:t>May, 202</w:t>
       </w:r>
       <w:r>
         <w:rPr>
@@ -520,16 +506,6 @@
           <w:szCs w:val="32"/>
           <w:lang w:val="en-US"/>
         </w:rPr>
-        <w:t>May, 202</w:t>
-      </w:r>
-      <w:r>
-        <w:rPr>
-          <w:bCs/>
-          <w:color w:val="000000" w:themeColor="text1"/>
-          <w:sz w:val="32"/>
-          <w:szCs w:val="32"/>
-          <w:lang w:val="en-US"/>
-        </w:rPr>
         <w:t>6</w:t>
       </w:r>
       <w:r>
@@ -564,35 +540,7 @@
         <w:rPr>
           <w:lang w:val="en-US"/>
         </w:rPr>
-        <w:t xml:space="preserve">I hereby declare that this thesis represents my own work which has been done after registration for the </w:t>
-      </w:r>
-      <w:proofErr w:type="gramStart"/>
-      <w:r>
-        <w:rPr>
-          <w:lang w:val="en-US"/>
-        </w:rPr>
-        <w:t>degree of bachelor</w:t>
-      </w:r>
-      <w:proofErr w:type="gramEnd"/>
-      <w:r>
-        <w:rPr>
-          <w:lang w:val="en-US"/>
-        </w:rPr>
-        <w:t xml:space="preserve"> at Piri Reis </w:t>
-      </w:r>
-      <w:proofErr w:type="gramStart"/>
-      <w:r>
-        <w:rPr>
-          <w:lang w:val="en-US"/>
-        </w:rPr>
-        <w:t>University, and</w:t>
-      </w:r>
-      <w:proofErr w:type="gramEnd"/>
-      <w:r>
-        <w:rPr>
-          <w:lang w:val="en-US"/>
-        </w:rPr>
-        <w:t xml:space="preserve"> has not been previously included in a thesis or dissertation submitted to this or any other institution for a degree, diploma or other qualifications.</w:t>
+        <w:t>I hereby declare that this thesis represents my own work which has been done after registration for the degree of bachelor at Piri Reis University, and has not been previously included in a thesis or dissertation submitted to this or any other institution for a degree, diploma or other qualifications.</w:t>
       </w:r>
     </w:p>
     <w:p>
@@ -1077,38 +1025,14 @@
         </w:rPr>
       </w:pPr>
       <w:r>
-        <w:t xml:space="preserve">Supply chains include many connected activities such as order management, shipment planning, inventory control, delivery tracking, regional performance monitoring, and demand planning. When these activities are </w:t>
-      </w:r>
-      <w:proofErr w:type="spellStart"/>
-      <w:r>
-        <w:t>analyzed</w:t>
-      </w:r>
-      <w:proofErr w:type="spellEnd"/>
-      <w:r>
-        <w:t xml:space="preserve"> separately, managers may have difficulty seeing operational problems and risks on time. This graduation thesis develops a Supply Chain Visibility and Risk Assessment Platform to support supply chain decision-making through data visualization, risk analysis, and dataset standardization.</w:t>
+        <w:t>Supply chains include many connected activities such as order management, shipment planning, inventory control, delivery tracking, regional performance monitoring, and demand planning. When these activities are analyzed separately, managers may have difficulty seeing operational problems and risks on time. This graduation thesis develops a Supply Chain Visibility and Risk Assessment Platform to support supply chain decision-making through data visualization, risk analysis, and dataset standardization.</w:t>
       </w:r>
       <w:r>
         <w:br/>
       </w:r>
       <w:r>
         <w:br/>
-        <w:t xml:space="preserve">The platform was developed with Python and </w:t>
-      </w:r>
-      <w:proofErr w:type="spellStart"/>
-      <w:r>
-        <w:t>Streamlit</w:t>
-      </w:r>
-      <w:proofErr w:type="spellEnd"/>
-      <w:r>
-        <w:t xml:space="preserve">. It uses the public </w:t>
-      </w:r>
-      <w:proofErr w:type="spellStart"/>
-      <w:r>
-        <w:t>DataCo</w:t>
-      </w:r>
-      <w:proofErr w:type="spellEnd"/>
-      <w:r>
-        <w:t xml:space="preserve"> Smart Supply Chain dataset as the default demonstration dataset. In addition, the system allows users to upload a new supply chain dataset in CSV or Excel format. The uploaded dataset can be mapped to a standard supply chain schema and then used dynamically across the dashboard pages. The platform includes modules for overview analysis, regional performance, inventory control, shipment performance, supply chain risk, and demand forecasting.</w:t>
+        <w:t>The platform was developed with Python and Streamlit. It uses the public DataCo Smart Supply Chain dataset as the default demonstration dataset. In addition, the system allows users to upload a new supply chain dataset in CSV or Excel format. The uploaded dataset can be mapped to a standard supply chain schema and then used dynamically across the dashboard pages. The platform includes modules for overview analysis, regional performance, inventory control, shipment performance, supply chain risk, and demand forecasting.</w:t>
       </w:r>
       <w:r>
         <w:br/>
@@ -1128,15 +1052,7 @@
       </w:r>
       <w:r>
         <w:br/>
-        <w:t xml:space="preserve">Key Words: Supply Chain Visibility, Risk Assessment, Data Standardization, </w:t>
-      </w:r>
-      <w:proofErr w:type="spellStart"/>
-      <w:r>
-        <w:t>Streamlit</w:t>
-      </w:r>
-      <w:proofErr w:type="spellEnd"/>
-      <w:r>
-        <w:t xml:space="preserve"> Dashboard, Business Intelligence, Demand Forecasting</w:t>
+        <w:t>Key Words: Supply Chain Visibility, Risk Assessment, Data Standardization, Streamlit Dashboard, Business Intelligence, Demand Forecasting</w:t>
       </w:r>
     </w:p>
     <w:p>
@@ -3806,357 +3722,256 @@
       <w:r>
         <w:t>LITERATURE REVIEW</w:t>
       </w:r>
-      <w:r>
-        <w:t>I</w:t>
-      </w:r>
       <w:bookmarkEnd w:id="12"/>
       <w:bookmarkEnd w:id="13"/>
     </w:p>
     <w:p>
-      <w:proofErr w:type="spellStart"/>
-      <w:r>
-        <w:t>Aşağıdkai</w:t>
-      </w:r>
-      <w:proofErr w:type="spellEnd"/>
-      <w:r>
-        <w:t xml:space="preserve"> </w:t>
-      </w:r>
-      <w:proofErr w:type="spellStart"/>
-      <w:r>
-        <w:t>yerden</w:t>
-      </w:r>
-      <w:proofErr w:type="spellEnd"/>
-      <w:r>
-        <w:t xml:space="preserve"> </w:t>
-      </w:r>
-      <w:proofErr w:type="spellStart"/>
-      <w:r>
-        <w:t>yapılır</w:t>
-      </w:r>
-      <w:proofErr w:type="spellEnd"/>
-      <w:r>
-        <w:t>:</w:t>
-      </w:r>
-    </w:p>
-    <w:p>
-      <w:pPr>
-        <w:jc w:val="center"/>
-      </w:pPr>
-      <w:r>
-        <w:rPr>
-          <w:noProof/>
-          <w:lang w:val="tr-TR" w:eastAsia="tr-TR"/>
-        </w:rPr>
-        <w:drawing>
-          <wp:inline distT="0" distB="0" distL="0" distR="0" wp14:anchorId="0E3F1ED1" wp14:editId="6482E513">
-            <wp:extent cx="3581400" cy="2024041"/>
-            <wp:effectExtent l="0" t="0" r="0" b="0"/>
-            <wp:docPr id="5" name="Picture 5" descr="D:\my documents\googledrive\erpmrpmain\Akademik_ogr_DR\APA ve rapor yazimi\WORD_Ekran.jpg"/>
-            <wp:cNvGraphicFramePr>
-              <a:graphicFrameLocks xmlns:a="http://schemas.openxmlformats.org/drawingml/2006/main" noChangeAspect="1"/>
-            </wp:cNvGraphicFramePr>
-            <a:graphic xmlns:a="http://schemas.openxmlformats.org/drawingml/2006/main">
-              <a:graphicData uri="http://schemas.openxmlformats.org/drawingml/2006/picture">
-                <pic:pic xmlns:pic="http://schemas.openxmlformats.org/drawingml/2006/picture">
-                  <pic:nvPicPr>
-                    <pic:cNvPr id="0" name="Picture 1" descr="D:\my documents\googledrive\erpmrpmain\Akademik_ogr_DR\APA ve rapor yazimi\WORD_Ekran.jpg"/>
-                    <pic:cNvPicPr>
-                      <a:picLocks noChangeAspect="1" noChangeArrowheads="1"/>
-                    </pic:cNvPicPr>
-                  </pic:nvPicPr>
-                  <pic:blipFill>
-                    <a:blip r:embed="rId9" cstate="print">
-                      <a:extLst>
-                        <a:ext uri="{28A0092B-C50C-407E-A947-70E740481C1C}">
-                          <a14:useLocalDpi xmlns:a14="http://schemas.microsoft.com/office/drawing/2010/main" val="0"/>
-                        </a:ext>
-                      </a:extLst>
-                    </a:blip>
-                    <a:srcRect/>
-                    <a:stretch>
-                      <a:fillRect/>
-                    </a:stretch>
-                  </pic:blipFill>
-                  <pic:spPr bwMode="auto">
-                    <a:xfrm>
-                      <a:off x="0" y="0"/>
-                      <a:ext cx="3591252" cy="2029609"/>
-                    </a:xfrm>
-                    <a:prstGeom prst="rect">
-                      <a:avLst/>
-                    </a:prstGeom>
-                    <a:noFill/>
-                    <a:ln>
-                      <a:noFill/>
-                    </a:ln>
-                  </pic:spPr>
-                </pic:pic>
-              </a:graphicData>
-            </a:graphic>
-          </wp:inline>
-        </w:drawing>
-      </w:r>
-      <w:r>
-        <w:t xml:space="preserve"> </w:t>
-      </w:r>
-    </w:p>
-    <w:p>
-      <w:pPr>
-        <w:pStyle w:val="Caption"/>
-      </w:pPr>
-      <w:bookmarkStart w:id="14" w:name="_Toc41739636"/>
-      <w:r>
-        <w:t xml:space="preserve">Figure </w:t>
-      </w:r>
-      <w:fldSimple w:instr=" SEQ Figure \* ARABIC ">
-        <w:r>
-          <w:rPr>
-            <w:noProof/>
-          </w:rPr>
-          <w:t>1</w:t>
-        </w:r>
-      </w:fldSimple>
-      <w:r>
-        <w:t>: Tool Coordinate System</w:t>
+      <w:r>
+        <w:t>This section reviews the main concepts related to the project. The literature review focuses on supply chain visibility, business intelligence dashboards, supply chain risk management, digital transformation in logistics, demand forecasting, and data standardization. These topics are directly related to the development of a dataset-adaptive supply chain visibility and risk assessment platform.</w:t>
+      </w:r>
+    </w:p>
+    <w:p/>
+    <w:p>
+      <w:pPr>
+        <w:pStyle w:val="Heading2"/>
+      </w:pPr>
+      <w:r>
+        <w:t>Supply Chain Visibility</w:t>
+      </w:r>
+    </w:p>
+    <w:p>
+      <w:r>
+        <w:t>Supply chain visibility refers to the ability to monitor and understand the movement of products, orders, shipments, inventory, and related information across the supply chain. In modern supply chains, operations are often spread across different regions, suppliers, transport modes, and information systems. Because of this complexity, managers need integrated visibility tools to understand what is happening in the supply chain and to detect problems early. [INSERT CITATION: Supply Chain Visibility]</w:t>
+      </w:r>
+    </w:p>
+    <w:p/>
+    <w:p>
+      <w:r>
+        <w:t>Visibility is important because supply chain decisions depend on timely and accurate information. If delivery delays, inventory shortages, regional problems, or demand changes are not visible, managers may react too late. A visibility system can help users monitor key indicators such as order volume, delivery status, shipment delays, inventory condition, sales, profit, and demand trends from a single interface. [INSERT CITATION: Supply Chain Visibility]</w:t>
+      </w:r>
+    </w:p>
+    <w:p/>
+    <w:p>
+      <w:r>
+        <w:t>In this project, supply chain visibility is addressed through a multi-page dashboard structure. The platform brings different operational views together, including overview indicators, regional performance, inventory control, shipment performance, risk analysis, and demand forecasting. This supports the idea that supply chain visibility should not focus on only one metric, but should combine different operational indicators.</w:t>
+      </w:r>
+    </w:p>
+    <w:p/>
+    <w:p>
+      <w:pPr>
+        <w:pStyle w:val="Heading2"/>
+      </w:pPr>
+      <w:r>
+        <w:t>Business Intelligence Dashboards and Decision Support</w:t>
+      </w:r>
+    </w:p>
+    <w:p>
+      <w:r>
+        <w:t>Business intelligence dashboards are used to transform raw data into visual and understandable information. Instead of analyzing large tables manually, users can monitor key performance indicators, charts, and summary tables through an interactive interface. Dashboards are especially useful in operational areas where managers need to make quick and data-based decisions. [INSERT CITATION: Business Intelligence Dashboards]</w:t>
+      </w:r>
+    </w:p>
+    <w:p/>
+    <w:p>
+      <w:r>
+        <w:lastRenderedPageBreak/>
+        <w:t>In supply chain management, dashboards can support decision-making by showing delivery performance, regional differences, inventory problems, shipment delays, and risk indicators. A well-designed dashboard does not only display data; it also helps users compare performance, identify patterns, and focus on problem areas. For this reason, dashboards can act as decision-support tools for supply chain managers, logistics analysts, inventory planners, and business analysts. [INSERT CITATION: Business Intelligence Dashboards]</w:t>
+      </w:r>
+    </w:p>
+    <w:p/>
+    <w:p>
+      <w:r>
+        <w:t>This project uses a dashboard-based approach because the goal is to make supply chain data more usable for decision-making. The system includes interactive filters, KPI cards, charts, tables, risk scores, and forecast outputs. These features help users move from raw data to operational insight.</w:t>
+      </w:r>
+    </w:p>
+    <w:p/>
+    <w:p>
+      <w:pPr>
+        <w:pStyle w:val="Heading2"/>
+      </w:pPr>
+      <w:r>
+        <w:t>Supply Chain Risk Management</w:t>
+      </w:r>
+    </w:p>
+    <w:p>
+      <w:r>
+        <w:t>Supply chain risk management focuses on identifying, assessing, and reducing risks that can affect supply chain performance. These risks may include late deliveries, transportation delays, demand uncertainty, inventory shortages, regional disruptions, supplier problems, and financial losses. Since supply chains include many connected activities, a problem in one part of the system can affect other parts of the operation. [INSERT CITATION: Supply Chain Risk Management]</w:t>
+      </w:r>
+    </w:p>
+    <w:p/>
+    <w:p>
+      <w:r>
+        <w:t>Risk assessment is more useful when different risk indicators are evaluated together. For example, late delivery rate alone may not fully explain supply chain risk. A better risk view may also include delay days, inventory condition, demand volatility, and regional performance. Therefore, dashboard-based risk analysis can help managers understand not only where risks exist, but also which indicators contribute to those risks. [INSERT CITATION: Supply Chain Risk Management]</w:t>
+      </w:r>
+    </w:p>
+    <w:p/>
+    <w:p>
+      <w:r>
+        <w:t>In this project, supply chain risk is calculated using rule-based and interpretable indicators. The system analyzes delivery risk, delay risk, inventory risk, demand volatility risk, and region-level risk. The purpose is not to create a complex black-box prediction model, but to provide a clear and understandable risk assessment structure for decision support.</w:t>
+      </w:r>
+    </w:p>
+    <w:p/>
+    <w:p>
+      <w:pPr>
+        <w:pStyle w:val="Heading2"/>
+      </w:pPr>
+      <w:r>
+        <w:t>Digital Transformation and Data-Driven Logistics</w:t>
+      </w:r>
+    </w:p>
+    <w:p>
+      <w:r>
+        <w:t>Digital transformation in logistics and supply chain management is closely related to the use of data, automation, analytics, and connected systems. Digital tools can improve transparency by collecting and analyzing operational data from different stages of the supply chain. This can support better planning, faster decision-making, and improved coordination between supply chain activities. [INSERT CITATION: Digital Transformation in Logistics]</w:t>
+      </w:r>
+    </w:p>
+    <w:p/>
+    <w:p>
+      <w:r>
+        <w:t>However, digital transformation also requires data integration. Many organizations keep supply chain information in different systems, files, or formats. If these datasets cannot be combined or standardized, it becomes difficult to create useful dashboards and risk analysis tools. For this reason, data standardization is an important part of supply chain analytics. [INSERT CITATION: Data Quality / Data Standardization]</w:t>
+      </w:r>
+    </w:p>
+    <w:p/>
+    <w:p>
+      <w:r>
+        <w:t>This project addresses this issue by adding a dataset upload and standardization module. Users can upload a new CSV or Excel supply chain dataset and map its columns to a standard schema. After this mapping process, the system converts the uploaded data into dashboard-ready analytical tables. This makes the platform more flexible than a dashboard that works with only one fixed dataset.</w:t>
+      </w:r>
+    </w:p>
+    <w:p/>
+    <w:p>
+      <w:pPr>
+        <w:pStyle w:val="Heading2"/>
+      </w:pPr>
+      <w:r>
+        <w:t>Demand Forecasting in Supply Chain Planning</w:t>
+      </w:r>
+    </w:p>
+    <w:p>
+      <w:r>
+        <w:t>Demand forecasting is an important part of supply chain planning because it helps organizations estimate future demand and prepare operational plans. Forecasting can support decisions related to inventory levels, replenishment planning, transportation capacity, and product availability. Even simple forecasting methods can be useful for understanding general demand trends. [INSERT CITATION: Demand Forecasting]</w:t>
+      </w:r>
+    </w:p>
+    <w:p/>
+    <w:p>
+      <w:r>
+        <w:t xml:space="preserve">In supply chain dashboards, demand forecasting is often used together with historical demand analysis. Users can compare past demand patterns with forecasted values and evaluate whether demand is increasing, decreasing, or </w:t>
+      </w:r>
+      <w:r>
+        <w:lastRenderedPageBreak/>
+        <w:t>unstable. Forecast accuracy metrics can also help users understand how well a forecasting method performs. [INSERT CITATION: Demand Forecasting]</w:t>
+      </w:r>
+    </w:p>
+    <w:p/>
+    <w:p>
+      <w:r>
+        <w:t>In this project, the demand forecasting module uses historical monthly demand data. The platform includes simple forecasting methods such as moving average and linear regression. These methods are suitable for a dashboard prototype because they are understandable, easy to implement, and useful for demonstrating how demand data can be turned into future demand estimates.</w:t>
+      </w:r>
+    </w:p>
+    <w:p/>
+    <w:p>
+      <w:pPr>
+        <w:pStyle w:val="Heading2"/>
+      </w:pPr>
+      <w:r>
+        <w:t>Data Standardization and Uploaded Dataset Support</w:t>
+      </w:r>
+    </w:p>
+    <w:p>
+      <w:r>
+        <w:t>A major challenge in data-driven dashboard systems is that datasets may have different column names, formats, and levels of completeness. For example, one dataset may use “order date,” another may use “PO created date,” and another may use a different name for the same concept. If the system cannot handle these differences, it can only work with one fixed dataset. [INSERT CITATION: Data Quality / Data Standardization]</w:t>
+      </w:r>
+    </w:p>
+    <w:p/>
+    <w:p>
+      <w:r>
+        <w:t>To make a dashboard reusable, uploaded datasets should be converted into a common structure. This requires a standard schema, column mapping, data validation, and derived indicators. In this project, the standard schema includes fields such as order ID, order date, product name, category, quantity, shipping date, scheduled delivery date, delivery status, shipping mode, market, region, country, sales, and profit.</w:t>
+      </w:r>
+    </w:p>
+    <w:p/>
+    <w:p>
+      <w:r>
+        <w:t>The dataset upload feature improves the originality and usefulness of the project. The default DataCo dataset is used as a demonstration dataset, but the system can also process new supply chain datasets. After the user maps the uploaded dataset to the standard schema, the dashboard pages are generated dynamically based on the active dataset. This makes the platform more reusable for different supply chain data sources.</w:t>
+      </w:r>
+    </w:p>
+    <w:p/>
+    <w:p>
+      <w:pPr>
+        <w:pStyle w:val="Heading2"/>
+      </w:pPr>
+      <w:r>
+        <w:t>Summary of Literature Review</w:t>
+      </w:r>
+    </w:p>
+    <w:p>
+      <w:r>
+        <w:t>The reviewed concepts show that supply chain visibility, dashboard-based decision support, risk assessment, digital transformation, forecasting, and data standardization are strongly connected. Supply chain visibility helps managers monitor operational activities. Business intelligence dashboards make complex data easier to understand. Risk management supports the identification of delivery, inventory, demand, and regional risks. Forecasting helps users observe future demand trends. Data standardization allows different datasets to be used in a common dashboard structure.</w:t>
+      </w:r>
+    </w:p>
+    <w:p/>
+    <w:p>
+      <w:r>
+        <w:t>Based on these ideas, this project develops a dataset-adaptive supply chain visibility and risk assessment platform. The platform combines dashboard visualization, uploaded dataset support, data standardization, risk scoring, and demand forecasting in a single Streamlit-based system.</w:t>
+      </w:r>
+    </w:p>
+    <w:p>
+      <w:pPr>
+        <w:pStyle w:val="Heading1"/>
+      </w:pPr>
+      <w:bookmarkStart w:id="14" w:name="_Toc32521137"/>
+      <w:bookmarkStart w:id="15" w:name="_Toc115861776"/>
+      <w:r>
+        <w:t>ORIGINALITY OF THE STUDY</w:t>
       </w:r>
       <w:bookmarkEnd w:id="14"/>
-    </w:p>
-    <w:p>
-      <w:pPr>
-        <w:rPr>
-          <w:lang w:val="en-ZA"/>
-        </w:rPr>
-      </w:pPr>
+      <w:bookmarkEnd w:id="15"/>
+    </w:p>
+    <w:p>
+      <w:r>
+        <w:t>Use full justification ….</w:t>
+      </w:r>
+    </w:p>
+    <w:p>
+      <w:pPr>
+        <w:rPr>
+          <w:szCs w:val="18"/>
+        </w:rPr>
+      </w:pPr>
+    </w:p>
+    <w:p>
+      <w:pPr>
+        <w:pStyle w:val="Quotes"/>
+      </w:pPr>
+      <w:r>
+        <w:t>"Quotes - use full justification + italics + indent right margin 1 cm + indent left margin 1 cm."</w:t>
+      </w:r>
     </w:p>
     <w:p>
       <w:pPr>
         <w:pStyle w:val="Heading2"/>
         <w:ind w:left="578" w:hanging="578"/>
       </w:pPr>
-      <w:bookmarkStart w:id="15" w:name="_Toc32521126"/>
-      <w:bookmarkStart w:id="16" w:name="_Toc115861775"/>
-      <w:r>
-        <w:t>Kayn</w:t>
-      </w:r>
-      <w:bookmarkEnd w:id="15"/>
+      <w:bookmarkStart w:id="16" w:name="_Toc32521138"/>
+      <w:bookmarkStart w:id="17" w:name="_Toc115861777"/>
+      <w:r>
+        <w:t>Heading 2:  Outline numbering, bold</w:t>
+      </w:r>
       <w:bookmarkEnd w:id="16"/>
-    </w:p>
-    <w:p>
-      <w:r>
-        <w:rPr>
-          <w:noProof/>
-          <w:color w:val="000000" w:themeColor="text1"/>
-        </w:rPr>
-        <w:t xml:space="preserve">Aşağdaki video </w:t>
-      </w:r>
-      <w:sdt>
-        <w:sdtPr>
-          <w:rPr>
-            <w:noProof/>
-            <w:color w:val="000000" w:themeColor="text1"/>
-          </w:rPr>
-          <w:id w:val="-1077439767"/>
-          <w:citation/>
-        </w:sdtPr>
-        <w:sdtContent>
-          <w:r>
-            <w:rPr>
-              <w:noProof/>
-              <w:color w:val="000000" w:themeColor="text1"/>
-            </w:rPr>
-            <w:fldChar w:fldCharType="begin"/>
-          </w:r>
-          <w:r>
-            <w:rPr>
-              <w:noProof/>
-              <w:color w:val="000000" w:themeColor="text1"/>
-            </w:rPr>
-            <w:instrText xml:space="preserve">CITATION Placeholder1 \l 1055 </w:instrText>
-          </w:r>
-          <w:r>
-            <w:rPr>
-              <w:noProof/>
-              <w:color w:val="000000" w:themeColor="text1"/>
-            </w:rPr>
-            <w:fldChar w:fldCharType="separate"/>
-          </w:r>
-          <w:r>
-            <w:rPr>
-              <w:noProof/>
-              <w:color w:val="000000" w:themeColor="text1"/>
-            </w:rPr>
-            <w:t>(URL_02, Easy Referencing Using Word 2010, 2011)</w:t>
-          </w:r>
-          <w:r>
-            <w:rPr>
-              <w:noProof/>
-              <w:color w:val="000000" w:themeColor="text1"/>
-            </w:rPr>
-            <w:fldChar w:fldCharType="end"/>
-          </w:r>
-        </w:sdtContent>
-      </w:sdt>
-      <w:r>
-        <w:t xml:space="preserve">Other techniques and mathematical </w:t>
-      </w:r>
-      <w:proofErr w:type="spellStart"/>
-      <w:r>
-        <w:t>modeling</w:t>
-      </w:r>
-      <w:proofErr w:type="spellEnd"/>
-      <w:r>
-        <w:t xml:space="preserve"> tools like nominal group technique, analytic hierarchy process, analytic network process, 0-1 goal programming, nonlinear programming, etc. have been also employed for ERP system selection such as </w:t>
-      </w:r>
-      <w:sdt>
-        <w:sdtPr>
-          <w:id w:val="78007041"/>
-          <w:citation/>
-        </w:sdtPr>
-        <w:sdtContent>
-          <w:r>
-            <w:fldChar w:fldCharType="begin"/>
-          </w:r>
-          <w:r>
-            <w:instrText xml:space="preserve"> CITATION Tel00 \l 1055 </w:instrText>
-          </w:r>
-          <w:r>
-            <w:fldChar w:fldCharType="separate"/>
-          </w:r>
-          <w:r>
-            <w:rPr>
-              <w:noProof/>
-            </w:rPr>
-            <w:t>(Teltumbde, 2000)</w:t>
-          </w:r>
-          <w:r>
-            <w:fldChar w:fldCharType="end"/>
-          </w:r>
-        </w:sdtContent>
-      </w:sdt>
-      <w:r>
-        <w:t xml:space="preserve">, </w:t>
-      </w:r>
-      <w:sdt>
-        <w:sdtPr>
-          <w:id w:val="78007042"/>
-          <w:citation/>
-        </w:sdtPr>
-        <w:sdtContent>
-          <w:r>
-            <w:fldChar w:fldCharType="begin"/>
-          </w:r>
-          <w:r>
-            <w:instrText xml:space="preserve"> CITATION San96 \l 1055 </w:instrText>
-          </w:r>
-          <w:r>
-            <w:fldChar w:fldCharType="separate"/>
-          </w:r>
-          <w:r>
-            <w:rPr>
-              <w:noProof/>
-            </w:rPr>
-            <w:t>(Santhanam &amp; Kyparisis, 1996)</w:t>
-          </w:r>
-          <w:r>
-            <w:fldChar w:fldCharType="end"/>
-          </w:r>
-        </w:sdtContent>
-      </w:sdt>
-      <w:r>
-        <w:t xml:space="preserve">. Although, some of the methods have been developed mainly for information system project selection, but they have been applied for the problem of ERP system selection, too </w:t>
-      </w:r>
-      <w:sdt>
-        <w:sdtPr>
-          <w:id w:val="1710760612"/>
-          <w:citation/>
-        </w:sdtPr>
-        <w:sdtContent>
-          <w:r>
-            <w:fldChar w:fldCharType="begin"/>
-          </w:r>
-          <w:r>
-            <w:instrText xml:space="preserve"> CITATION Raz08 \l 1055 </w:instrText>
-          </w:r>
-          <w:r>
-            <w:fldChar w:fldCharType="separate"/>
-          </w:r>
-          <w:r>
-            <w:rPr>
-              <w:noProof/>
-            </w:rPr>
-            <w:t>(Razmi &amp; Sangari, 2008)</w:t>
-          </w:r>
-          <w:r>
-            <w:fldChar w:fldCharType="end"/>
-          </w:r>
-        </w:sdtContent>
-      </w:sdt>
-      <w:r>
-        <w:t>.</w:t>
-      </w:r>
-    </w:p>
-    <w:p>
-      <w:pPr>
-        <w:pStyle w:val="Heading1"/>
-      </w:pPr>
-      <w:bookmarkStart w:id="17" w:name="_Toc32521137"/>
-      <w:bookmarkStart w:id="18" w:name="_Toc115861776"/>
-      <w:r>
-        <w:t>ORIGINALITY OF THE STUDY</w:t>
-      </w:r>
       <w:bookmarkEnd w:id="17"/>
+    </w:p>
+    <w:p>
+      <w:r>
+        <w:t xml:space="preserve">Use full justification </w:t>
+      </w:r>
+    </w:p>
+    <w:p>
+      <w:pPr>
+        <w:pStyle w:val="Heading3"/>
+      </w:pPr>
+      <w:bookmarkStart w:id="18" w:name="_Toc32521139"/>
+      <w:bookmarkStart w:id="19" w:name="_Toc115861778"/>
+      <w:r>
+        <w:t>Heading 3:  Outline numbering, bold + italics</w:t>
+      </w:r>
       <w:bookmarkEnd w:id="18"/>
-    </w:p>
-    <w:p>
-      <w:r>
-        <w:t>Use full justification ….</w:t>
-      </w:r>
-    </w:p>
-    <w:p>
-      <w:pPr>
-        <w:rPr>
-          <w:szCs w:val="18"/>
-        </w:rPr>
-      </w:pPr>
-    </w:p>
-    <w:p>
-      <w:pPr>
-        <w:pStyle w:val="Quotes"/>
-      </w:pPr>
-      <w:r>
-        <w:t>"Quotes - use full justification + italics + indent right margin 1 cm + indent left margin 1 cm."</w:t>
-      </w:r>
-    </w:p>
-    <w:p>
-      <w:pPr>
-        <w:pStyle w:val="Heading2"/>
-        <w:ind w:left="578" w:hanging="578"/>
-      </w:pPr>
-      <w:bookmarkStart w:id="19" w:name="_Toc32521138"/>
-      <w:bookmarkStart w:id="20" w:name="_Toc115861777"/>
-      <w:r>
-        <w:lastRenderedPageBreak/>
-        <w:t>Heading 2:  Outline numbering, bold</w:t>
-      </w:r>
       <w:bookmarkEnd w:id="19"/>
-      <w:bookmarkEnd w:id="20"/>
-    </w:p>
-    <w:p>
-      <w:r>
-        <w:t xml:space="preserve">Use full justification </w:t>
-      </w:r>
-    </w:p>
-    <w:p>
-      <w:pPr>
-        <w:pStyle w:val="Heading3"/>
-      </w:pPr>
-      <w:bookmarkStart w:id="21" w:name="_Toc32521139"/>
-      <w:bookmarkStart w:id="22" w:name="_Toc115861778"/>
-      <w:r>
-        <w:t>Heading 3:  Outline numbering, bold + italics</w:t>
-      </w:r>
-      <w:bookmarkEnd w:id="21"/>
-      <w:bookmarkEnd w:id="22"/>
     </w:p>
     <w:p>
       <w:r>
@@ -4191,13 +4006,13 @@
       <w:pPr>
         <w:pStyle w:val="Heading3"/>
       </w:pPr>
-      <w:bookmarkStart w:id="23" w:name="_Toc32521140"/>
-      <w:bookmarkStart w:id="24" w:name="_Toc115861779"/>
+      <w:bookmarkStart w:id="20" w:name="_Toc32521140"/>
+      <w:bookmarkStart w:id="21" w:name="_Toc115861779"/>
       <w:r>
         <w:t>Equations</w:t>
       </w:r>
-      <w:bookmarkEnd w:id="23"/>
-      <w:bookmarkEnd w:id="24"/>
+      <w:bookmarkEnd w:id="20"/>
+      <w:bookmarkEnd w:id="21"/>
     </w:p>
     <w:p>
       <w:r>
@@ -4920,13 +4735,13 @@
       <w:pPr>
         <w:pStyle w:val="Heading3"/>
       </w:pPr>
-      <w:bookmarkStart w:id="25" w:name="_Toc32521141"/>
-      <w:bookmarkStart w:id="26" w:name="_Toc115861780"/>
+      <w:bookmarkStart w:id="22" w:name="_Toc32521141"/>
+      <w:bookmarkStart w:id="23" w:name="_Toc115861780"/>
       <w:r>
         <w:t>Equations</w:t>
       </w:r>
-      <w:bookmarkEnd w:id="25"/>
-      <w:bookmarkEnd w:id="26"/>
+      <w:bookmarkEnd w:id="22"/>
+      <w:bookmarkEnd w:id="23"/>
     </w:p>
     <w:p>
       <w:r>
@@ -4947,18 +4762,31 @@
         <w:pStyle w:val="Caption"/>
         <w:keepNext/>
       </w:pPr>
-      <w:bookmarkStart w:id="27" w:name="_Toc41739766"/>
+      <w:bookmarkStart w:id="24" w:name="_Toc41739766"/>
       <w:r>
         <w:t xml:space="preserve">Table </w:t>
       </w:r>
-      <w:fldSimple w:instr=" SEQ Table \* ARABIC ">
-        <w:r>
-          <w:rPr>
-            <w:noProof/>
-          </w:rPr>
-          <w:t>1</w:t>
-        </w:r>
-      </w:fldSimple>
+      <w:r>
+        <w:fldChar w:fldCharType="begin"/>
+      </w:r>
+      <w:r>
+        <w:instrText xml:space="preserve"> SEQ Table \* ARABIC </w:instrText>
+      </w:r>
+      <w:r>
+        <w:fldChar w:fldCharType="separate"/>
+      </w:r>
+      <w:r>
+        <w:rPr>
+          <w:noProof/>
+        </w:rPr>
+        <w:t>1</w:t>
+      </w:r>
+      <w:r>
+        <w:rPr>
+          <w:noProof/>
+        </w:rPr>
+        <w:fldChar w:fldCharType="end"/>
+      </w:r>
       <w:r>
         <w:t xml:space="preserve">: Table Caption in Bold, above the table </w:t>
       </w:r>
@@ -5010,7 +4838,7 @@
           </w:r>
         </w:sdtContent>
       </w:sdt>
-      <w:bookmarkEnd w:id="27"/>
+      <w:bookmarkEnd w:id="24"/>
     </w:p>
     <w:tbl>
       <w:tblPr>
@@ -5204,25 +5032,17 @@
       <w:pPr>
         <w:pStyle w:val="Heading3"/>
       </w:pPr>
-      <w:bookmarkStart w:id="28" w:name="_Toc32521142"/>
-      <w:bookmarkStart w:id="29" w:name="_Toc115861781"/>
+      <w:bookmarkStart w:id="25" w:name="_Toc32521142"/>
+      <w:bookmarkStart w:id="26" w:name="_Toc115861781"/>
       <w:r>
         <w:t>Figures and Photos</w:t>
       </w:r>
-      <w:bookmarkEnd w:id="28"/>
-      <w:bookmarkEnd w:id="29"/>
-    </w:p>
-    <w:p>
-      <w:r>
-        <w:t xml:space="preserve">Centre figures and </w:t>
-      </w:r>
-      <w:proofErr w:type="gramStart"/>
-      <w:r>
-        <w:t>photos, and</w:t>
-      </w:r>
-      <w:proofErr w:type="gramEnd"/>
-      <w:r>
-        <w:t xml:space="preserve"> ensure that the rendering quality is acceptable for the purpose of illustration. Figure captions appear below the figure as shown below.</w:t>
+      <w:bookmarkEnd w:id="25"/>
+      <w:bookmarkEnd w:id="26"/>
+    </w:p>
+    <w:p>
+      <w:r>
+        <w:t>Centre figures and photos, and ensure that the rendering quality is acceptable for the purpose of illustration. Figure captions appear below the figure as shown below.</w:t>
       </w:r>
     </w:p>
     <w:p>
@@ -5234,7 +5054,6 @@
           <w:noProof/>
           <w:lang w:val="tr-TR" w:eastAsia="tr-TR"/>
         </w:rPr>
-        <w:lastRenderedPageBreak/>
         <w:drawing>
           <wp:inline distT="0" distB="0" distL="0" distR="0" wp14:anchorId="2E22195E" wp14:editId="6D33EE0F">
             <wp:extent cx="2392219" cy="2220084"/>
@@ -5253,7 +5072,7 @@
                     </pic:cNvPicPr>
                   </pic:nvPicPr>
                   <pic:blipFill>
-                    <a:blip r:embed="rId10">
+                    <a:blip r:embed="rId9">
                       <a:extLst>
                         <a:ext uri="{28A0092B-C50C-407E-A947-70E740481C1C}">
                           <a14:useLocalDpi xmlns:a14="http://schemas.microsoft.com/office/drawing/2010/main" val="0"/>
@@ -5289,173 +5108,127 @@
       <w:pPr>
         <w:pStyle w:val="Caption"/>
       </w:pPr>
-      <w:bookmarkStart w:id="30" w:name="_Toc41739637"/>
+      <w:bookmarkStart w:id="27" w:name="_Toc41739637"/>
       <w:r>
         <w:t xml:space="preserve">Figure </w:t>
       </w:r>
-      <w:fldSimple w:instr=" SEQ Figure \* ARABIC ">
-        <w:r>
-          <w:rPr>
-            <w:noProof/>
-          </w:rPr>
-          <w:t>2</w:t>
-        </w:r>
-      </w:fldSimple>
+      <w:r>
+        <w:fldChar w:fldCharType="begin"/>
+      </w:r>
+      <w:r>
+        <w:instrText xml:space="preserve"> SEQ Figure \* ARABIC </w:instrText>
+      </w:r>
+      <w:r>
+        <w:fldChar w:fldCharType="separate"/>
+      </w:r>
+      <w:r>
+        <w:rPr>
+          <w:noProof/>
+        </w:rPr>
+        <w:t>2</w:t>
+      </w:r>
+      <w:r>
+        <w:rPr>
+          <w:noProof/>
+        </w:rPr>
+        <w:fldChar w:fldCharType="end"/>
+      </w:r>
       <w:r>
         <w:t>: Tool Coordinate System</w:t>
       </w:r>
+      <w:bookmarkEnd w:id="27"/>
+    </w:p>
+    <w:p>
+      <w:pPr>
+        <w:pStyle w:val="Heading1"/>
+      </w:pPr>
+      <w:bookmarkStart w:id="28" w:name="_Toc115861782"/>
+      <w:r>
+        <w:t>PROBLEM DEFINITION</w:t>
+      </w:r>
+      <w:bookmarkEnd w:id="28"/>
+    </w:p>
+    <w:p>
+      <w:r>
+        <w:t>……….fdfdfdf</w:t>
+      </w:r>
+    </w:p>
+    <w:p>
+      <w:pPr>
+        <w:pStyle w:val="Heading1"/>
+      </w:pPr>
+      <w:bookmarkStart w:id="29" w:name="_Toc115861783"/>
+      <w:r>
+        <w:t>SOLUTION APPROACH</w:t>
+      </w:r>
+      <w:bookmarkEnd w:id="29"/>
+    </w:p>
+    <w:p>
+      <w:r>
+        <w:t>……….fdfdfdf</w:t>
+      </w:r>
+    </w:p>
+    <w:p>
+      <w:pPr>
+        <w:pStyle w:val="Heading1"/>
+      </w:pPr>
+      <w:bookmarkStart w:id="30" w:name="_Toc115861784"/>
+      <w:r>
+        <w:t>REQUIRED TOOLS</w:t>
+      </w:r>
       <w:bookmarkEnd w:id="30"/>
     </w:p>
     <w:p>
+      <w:r>
+        <w:lastRenderedPageBreak/>
+        <w:t>……….fdfdfdf</w:t>
+      </w:r>
+    </w:p>
+    <w:p>
       <w:pPr>
         <w:pStyle w:val="Heading1"/>
       </w:pPr>
-      <w:bookmarkStart w:id="31" w:name="_Toc115861782"/>
-      <w:r>
-        <w:t>PROBLEM DEFINITION</w:t>
+      <w:bookmarkStart w:id="31" w:name="_Toc115861785"/>
+      <w:r>
+        <w:t>SYSTEM / MODEL &amp; SOLUTION DEVELOPMENT</w:t>
       </w:r>
       <w:bookmarkEnd w:id="31"/>
     </w:p>
     <w:p>
       <w:r>
-        <w:t>……</w:t>
-      </w:r>
-      <w:proofErr w:type="gramStart"/>
-      <w:r>
-        <w:t>….</w:t>
-      </w:r>
-      <w:proofErr w:type="spellStart"/>
-      <w:r>
-        <w:t>fdfdfdf</w:t>
-      </w:r>
-      <w:proofErr w:type="spellEnd"/>
-      <w:proofErr w:type="gramEnd"/>
-    </w:p>
+        <w:t>……….fdfdfdf</w:t>
+      </w:r>
+    </w:p>
+    <w:p/>
     <w:p>
       <w:pPr>
         <w:pStyle w:val="Heading1"/>
       </w:pPr>
-      <w:bookmarkStart w:id="32" w:name="_Toc115861783"/>
-      <w:r>
-        <w:t>SOLUTION APPROACH</w:t>
+      <w:bookmarkStart w:id="32" w:name="_Toc115861786"/>
+      <w:r>
+        <w:t>CASE STUDY / BUSINESS CASE</w:t>
       </w:r>
       <w:bookmarkEnd w:id="32"/>
     </w:p>
     <w:p>
       <w:r>
-        <w:t>……</w:t>
-      </w:r>
-      <w:proofErr w:type="gramStart"/>
-      <w:r>
-        <w:t>….</w:t>
-      </w:r>
-      <w:proofErr w:type="spellStart"/>
-      <w:r>
-        <w:t>fdfdfdf</w:t>
-      </w:r>
-      <w:proofErr w:type="spellEnd"/>
-      <w:proofErr w:type="gramEnd"/>
+        <w:t>……….fdfdfdf</w:t>
+      </w:r>
     </w:p>
     <w:p>
       <w:pPr>
         <w:pStyle w:val="Heading1"/>
       </w:pPr>
-      <w:bookmarkStart w:id="33" w:name="_Toc115861784"/>
-      <w:r>
-        <w:t>REQUIRED TOOLS</w:t>
+      <w:bookmarkStart w:id="33" w:name="_Toc115861787"/>
+      <w:r>
+        <w:t>CONCLUSIONs</w:t>
       </w:r>
       <w:bookmarkEnd w:id="33"/>
     </w:p>
     <w:p>
       <w:r>
-        <w:t>……</w:t>
-      </w:r>
-      <w:proofErr w:type="gramStart"/>
-      <w:r>
-        <w:t>….</w:t>
-      </w:r>
-      <w:proofErr w:type="spellStart"/>
-      <w:r>
-        <w:t>fdfdfdf</w:t>
-      </w:r>
-      <w:proofErr w:type="spellEnd"/>
-      <w:proofErr w:type="gramEnd"/>
-    </w:p>
-    <w:p>
-      <w:pPr>
-        <w:pStyle w:val="Heading1"/>
-      </w:pPr>
-      <w:bookmarkStart w:id="34" w:name="_Toc115861785"/>
-      <w:r>
-        <w:t>SYSTEM / MODEL &amp; SOLUTION DEVELOPMENT</w:t>
-      </w:r>
-      <w:bookmarkEnd w:id="34"/>
-    </w:p>
-    <w:p>
-      <w:r>
-        <w:t>……</w:t>
-      </w:r>
-      <w:proofErr w:type="gramStart"/>
-      <w:r>
-        <w:t>….</w:t>
-      </w:r>
-      <w:proofErr w:type="spellStart"/>
-      <w:r>
-        <w:t>fdfdfdf</w:t>
-      </w:r>
-      <w:proofErr w:type="spellEnd"/>
-      <w:proofErr w:type="gramEnd"/>
-    </w:p>
-    <w:p/>
-    <w:p>
-      <w:pPr>
-        <w:pStyle w:val="Heading1"/>
-      </w:pPr>
-      <w:bookmarkStart w:id="35" w:name="_Toc115861786"/>
-      <w:r>
-        <w:t>CASE STUDY / BUSINESS CASE</w:t>
-      </w:r>
-      <w:bookmarkEnd w:id="35"/>
-    </w:p>
-    <w:p>
-      <w:r>
-        <w:t>……</w:t>
-      </w:r>
-      <w:proofErr w:type="gramStart"/>
-      <w:r>
-        <w:t>….</w:t>
-      </w:r>
-      <w:proofErr w:type="spellStart"/>
-      <w:r>
-        <w:t>fdfdfdf</w:t>
-      </w:r>
-      <w:proofErr w:type="spellEnd"/>
-      <w:proofErr w:type="gramEnd"/>
-    </w:p>
-    <w:p>
-      <w:pPr>
-        <w:pStyle w:val="Heading1"/>
-      </w:pPr>
-      <w:bookmarkStart w:id="36" w:name="_Toc115861787"/>
-      <w:r>
-        <w:t>CONCLUSIONs</w:t>
-      </w:r>
-      <w:bookmarkEnd w:id="36"/>
-    </w:p>
-    <w:p>
-      <w:r>
-        <w:t>……</w:t>
-      </w:r>
-      <w:proofErr w:type="gramStart"/>
-      <w:r>
-        <w:t>….</w:t>
-      </w:r>
-      <w:proofErr w:type="spellStart"/>
-      <w:r>
-        <w:t>fdfdfdf</w:t>
-      </w:r>
-      <w:proofErr w:type="spellEnd"/>
-      <w:proofErr w:type="gramEnd"/>
+        <w:t>……….fdfdfdf</w:t>
+      </w:r>
     </w:p>
     <w:p/>
     <w:p>
@@ -5500,9 +5273,9 @@
         <w:t>-------</w:t>
       </w:r>
     </w:p>
-    <w:bookmarkStart w:id="37" w:name="_Toc115861788" w:displacedByCustomXml="next"/>
-    <w:bookmarkStart w:id="38" w:name="_Toc494826192" w:displacedByCustomXml="next"/>
-    <w:bookmarkStart w:id="39" w:name="_Toc32521151" w:displacedByCustomXml="next"/>
+    <w:bookmarkStart w:id="34" w:name="_Toc115861788" w:displacedByCustomXml="next"/>
+    <w:bookmarkStart w:id="35" w:name="_Toc494826192" w:displacedByCustomXml="next"/>
+    <w:bookmarkStart w:id="36" w:name="_Toc32521151" w:displacedByCustomXml="next"/>
     <w:sdt>
       <w:sdtPr>
         <w:rPr>
@@ -5530,9 +5303,9 @@
             </w:rPr>
             <w:t>REFERENCES</w:t>
           </w:r>
-          <w:bookmarkEnd w:id="39"/>
-          <w:bookmarkEnd w:id="38"/>
-          <w:bookmarkEnd w:id="37"/>
+          <w:bookmarkEnd w:id="36"/>
+          <w:bookmarkEnd w:id="35"/>
+          <w:bookmarkEnd w:id="34"/>
         </w:p>
         <w:p>
           <w:pPr>
@@ -5711,7 +5484,6 @@
             <w:rPr>
               <w:noProof/>
             </w:rPr>
-            <w:lastRenderedPageBreak/>
             <w:t xml:space="preserve">Honeywell International Inc. (2015, Mart). </w:t>
           </w:r>
           <w:r>
@@ -5973,6 +5745,7 @@
             <w:rPr>
               <w:noProof/>
             </w:rPr>
+            <w:lastRenderedPageBreak/>
             <w:t xml:space="preserve">Stamford, C. (2014, Ocak 29). </w:t>
           </w:r>
           <w:r>
@@ -6203,7 +5976,7 @@
           <w:caps/>
         </w:rPr>
       </w:pPr>
-      <w:bookmarkStart w:id="40" w:name="_Toc41690539"/>
+      <w:bookmarkStart w:id="37" w:name="_Toc41690539"/>
       <w:r>
         <w:br w:type="page"/>
       </w:r>
@@ -6212,20 +5985,12 @@
       <w:pPr>
         <w:pStyle w:val="Heading1"/>
       </w:pPr>
-      <w:bookmarkStart w:id="41" w:name="_Toc115861789"/>
+      <w:bookmarkStart w:id="38" w:name="_Toc115861789"/>
       <w:r>
         <w:lastRenderedPageBreak/>
-        <w:t>GIT/KAGGLE/COLAB/</w:t>
-      </w:r>
-      <w:proofErr w:type="gramStart"/>
-      <w:r>
-        <w:t>etc..</w:t>
-      </w:r>
-      <w:proofErr w:type="gramEnd"/>
-      <w:r>
-        <w:t xml:space="preserve"> LINK</w:t>
-      </w:r>
-      <w:bookmarkEnd w:id="41"/>
+        <w:t>GIT/KAGGLE/COLAB/etc.. LINK</w:t>
+      </w:r>
+      <w:bookmarkEnd w:id="38"/>
     </w:p>
     <w:p>
       <w:pPr>
@@ -6260,13 +6025,13 @@
       <w:pPr>
         <w:pStyle w:val="Heading1"/>
       </w:pPr>
-      <w:bookmarkStart w:id="42" w:name="_Toc115861790"/>
+      <w:bookmarkStart w:id="39" w:name="_Toc115861790"/>
       <w:r>
         <w:lastRenderedPageBreak/>
         <w:t>CURRICULUM VITAE</w:t>
       </w:r>
-      <w:bookmarkEnd w:id="40"/>
-      <w:bookmarkEnd w:id="42"/>
+      <w:bookmarkEnd w:id="37"/>
+      <w:bookmarkEnd w:id="39"/>
     </w:p>
     <w:p>
       <w:pPr>
@@ -6300,7 +6065,6 @@
           <w:lang w:val="en-US" w:eastAsia="tr-TR"/>
         </w:rPr>
       </w:pPr>
-      <w:proofErr w:type="gramStart"/>
       <w:r>
         <w:rPr>
           <w:b/>
@@ -6308,7 +6072,6 @@
         </w:rPr>
         <w:t>Education :</w:t>
       </w:r>
-      <w:proofErr w:type="gramEnd"/>
     </w:p>
     <w:p>
       <w:pPr>
@@ -6316,7 +6079,6 @@
           <w:lang w:val="en-US" w:eastAsia="tr-TR"/>
         </w:rPr>
       </w:pPr>
-      <w:proofErr w:type="gramStart"/>
       <w:r>
         <w:rPr>
           <w:i/>
@@ -6329,14 +6091,7 @@
         <w:rPr>
           <w:lang w:val="en-US" w:eastAsia="tr-TR"/>
         </w:rPr>
-        <w:t xml:space="preserve"> :</w:t>
-      </w:r>
-      <w:proofErr w:type="gramEnd"/>
-      <w:r>
-        <w:rPr>
-          <w:lang w:val="en-US" w:eastAsia="tr-TR"/>
-        </w:rPr>
-        <w:t xml:space="preserve"> Piri Reis University </w:t>
+        <w:t xml:space="preserve"> : Piri Reis University </w:t>
       </w:r>
     </w:p>
     <w:p>
@@ -6898,10 +6653,10 @@
       </w:pPr>
     </w:p>
     <w:sectPr>
-      <w:headerReference w:type="default" r:id="rId11"/>
-      <w:footerReference w:type="even" r:id="rId12"/>
-      <w:footerReference w:type="default" r:id="rId13"/>
-      <w:footerReference w:type="first" r:id="rId14"/>
+      <w:headerReference w:type="default" r:id="rId10"/>
+      <w:footerReference w:type="even" r:id="rId11"/>
+      <w:footerReference w:type="default" r:id="rId12"/>
+      <w:footerReference w:type="first" r:id="rId13"/>
       <w:footnotePr>
         <w:numFmt w:val="chicago"/>
       </w:footnotePr>
@@ -7033,15 +6788,7 @@
       <w:t>South African Journal of Industrial Engineering</w:t>
     </w:r>
     <w:r>
-      <w:t xml:space="preserve"> Month Year Vol _</w:t>
-    </w:r>
-    <w:proofErr w:type="gramStart"/>
-    <w:r>
-      <w:t>_(</w:t>
-    </w:r>
-    <w:proofErr w:type="gramEnd"/>
-    <w:r>
-      <w:t>_):  p1-3</w:t>
+      <w:t xml:space="preserve"> Month Year Vol __(_):  p1-3</w:t>
     </w:r>
   </w:p>
 </w:ftr>

</xml_diff>

<commit_message>
Restore originality problem and solution sections
</commit_message>
<xml_diff>
--- a/docs/graduation_thesis_report.docx
+++ b/docs/graduation_thesis_report.docx
@@ -315,6 +315,7 @@
         </w:rPr>
         <w:t>G</w:t>
       </w:r>
+      <w:proofErr w:type="spellStart"/>
       <w:r>
         <w:rPr>
           <w:b/>
@@ -323,7 +324,18 @@
           <w:szCs w:val="32"/>
           <w:lang w:val="tr-TR"/>
         </w:rPr>
-        <w:t>ülse Dolunay ÜNLÜ</w:t>
+        <w:t>ülse</w:t>
+      </w:r>
+      <w:proofErr w:type="spellEnd"/>
+      <w:r>
+        <w:rPr>
+          <w:b/>
+          <w:color w:val="000000" w:themeColor="text1"/>
+          <w:sz w:val="32"/>
+          <w:szCs w:val="32"/>
+          <w:lang w:val="tr-TR"/>
+        </w:rPr>
+        <w:t xml:space="preserve"> Dolunay ÜNLÜ</w:t>
       </w:r>
     </w:p>
     <w:p>
@@ -405,6 +417,7 @@
         </w:rPr>
         <w:t xml:space="preserve">Advisor: </w:t>
       </w:r>
+      <w:proofErr w:type="spellStart"/>
       <w:r>
         <w:rPr>
           <w:bCs/>
@@ -413,81 +426,9 @@
           <w:szCs w:val="32"/>
           <w:lang w:val="en-US"/>
         </w:rPr>
-        <w:t>Doç. Dr. Orhan Özgür AYBAR</w:t>
-      </w:r>
-    </w:p>
-    <w:p>
-      <w:pPr>
-        <w:jc w:val="center"/>
-        <w:rPr>
-          <w:bCs/>
-          <w:sz w:val="32"/>
-          <w:szCs w:val="32"/>
-          <w:lang w:val="en-US"/>
-        </w:rPr>
-      </w:pPr>
-    </w:p>
-    <w:p>
-      <w:pPr>
-        <w:jc w:val="center"/>
-        <w:rPr>
-          <w:bCs/>
-          <w:sz w:val="32"/>
-          <w:szCs w:val="32"/>
-          <w:lang w:val="en-US"/>
-        </w:rPr>
-      </w:pPr>
-    </w:p>
-    <w:p>
-      <w:pPr>
-        <w:jc w:val="center"/>
-        <w:rPr>
-          <w:bCs/>
-          <w:sz w:val="32"/>
-          <w:szCs w:val="32"/>
-          <w:lang w:val="en-US"/>
-        </w:rPr>
-      </w:pPr>
-    </w:p>
-    <w:p>
-      <w:pPr>
-        <w:jc w:val="center"/>
-        <w:rPr>
-          <w:bCs/>
-          <w:sz w:val="32"/>
-          <w:szCs w:val="32"/>
-          <w:lang w:val="en-US"/>
-        </w:rPr>
-      </w:pPr>
-    </w:p>
-    <w:p>
-      <w:pPr>
-        <w:jc w:val="center"/>
-        <w:rPr>
-          <w:bCs/>
-          <w:sz w:val="32"/>
-          <w:szCs w:val="32"/>
-          <w:lang w:val="en-US"/>
-        </w:rPr>
-      </w:pPr>
-      <w:r>
-        <w:rPr>
-          <w:bCs/>
-          <w:sz w:val="32"/>
-          <w:szCs w:val="32"/>
-          <w:lang w:val="en-US"/>
-        </w:rPr>
-        <w:t>İstanbul</w:t>
-      </w:r>
-      <w:r>
-        <w:rPr>
-          <w:bCs/>
-          <w:sz w:val="32"/>
-          <w:szCs w:val="32"/>
-          <w:lang w:val="en-US"/>
-        </w:rPr>
-        <w:t xml:space="preserve"> </w:t>
-      </w:r>
+        <w:t>Doç</w:t>
+      </w:r>
+      <w:proofErr w:type="spellEnd"/>
       <w:r>
         <w:rPr>
           <w:bCs/>
@@ -496,7 +437,80 @@
           <w:szCs w:val="32"/>
           <w:lang w:val="en-US"/>
         </w:rPr>
-        <w:t>May, 202</w:t>
+        <w:t>. Dr. Orhan Özgür AYBAR</w:t>
+      </w:r>
+    </w:p>
+    <w:p>
+      <w:pPr>
+        <w:jc w:val="center"/>
+        <w:rPr>
+          <w:bCs/>
+          <w:sz w:val="32"/>
+          <w:szCs w:val="32"/>
+          <w:lang w:val="en-US"/>
+        </w:rPr>
+      </w:pPr>
+    </w:p>
+    <w:p>
+      <w:pPr>
+        <w:jc w:val="center"/>
+        <w:rPr>
+          <w:bCs/>
+          <w:sz w:val="32"/>
+          <w:szCs w:val="32"/>
+          <w:lang w:val="en-US"/>
+        </w:rPr>
+      </w:pPr>
+    </w:p>
+    <w:p>
+      <w:pPr>
+        <w:jc w:val="center"/>
+        <w:rPr>
+          <w:bCs/>
+          <w:sz w:val="32"/>
+          <w:szCs w:val="32"/>
+          <w:lang w:val="en-US"/>
+        </w:rPr>
+      </w:pPr>
+    </w:p>
+    <w:p>
+      <w:pPr>
+        <w:jc w:val="center"/>
+        <w:rPr>
+          <w:bCs/>
+          <w:sz w:val="32"/>
+          <w:szCs w:val="32"/>
+          <w:lang w:val="en-US"/>
+        </w:rPr>
+      </w:pPr>
+    </w:p>
+    <w:p>
+      <w:pPr>
+        <w:jc w:val="center"/>
+        <w:rPr>
+          <w:bCs/>
+          <w:sz w:val="32"/>
+          <w:szCs w:val="32"/>
+          <w:lang w:val="en-US"/>
+        </w:rPr>
+      </w:pPr>
+      <w:r>
+        <w:rPr>
+          <w:bCs/>
+          <w:sz w:val="32"/>
+          <w:szCs w:val="32"/>
+          <w:lang w:val="en-US"/>
+        </w:rPr>
+        <w:t>İstanbul</w:t>
+      </w:r>
+      <w:r>
+        <w:rPr>
+          <w:bCs/>
+          <w:sz w:val="32"/>
+          <w:szCs w:val="32"/>
+          <w:lang w:val="en-US"/>
+        </w:rPr>
+        <w:t xml:space="preserve"> </w:t>
       </w:r>
       <w:r>
         <w:rPr>
@@ -506,6 +520,16 @@
           <w:szCs w:val="32"/>
           <w:lang w:val="en-US"/>
         </w:rPr>
+        <w:t>May, 202</w:t>
+      </w:r>
+      <w:r>
+        <w:rPr>
+          <w:bCs/>
+          <w:color w:val="000000" w:themeColor="text1"/>
+          <w:sz w:val="32"/>
+          <w:szCs w:val="32"/>
+          <w:lang w:val="en-US"/>
+        </w:rPr>
         <w:t>6</w:t>
       </w:r>
       <w:r>
@@ -540,7 +564,35 @@
         <w:rPr>
           <w:lang w:val="en-US"/>
         </w:rPr>
-        <w:t>I hereby declare that this thesis represents my own work which has been done after registration for the degree of bachelor at Piri Reis University, and has not been previously included in a thesis or dissertation submitted to this or any other institution for a degree, diploma or other qualifications.</w:t>
+        <w:t xml:space="preserve">I hereby declare that this thesis represents my own work which has been done after registration for the </w:t>
+      </w:r>
+      <w:proofErr w:type="gramStart"/>
+      <w:r>
+        <w:rPr>
+          <w:lang w:val="en-US"/>
+        </w:rPr>
+        <w:t>degree of bachelor</w:t>
+      </w:r>
+      <w:proofErr w:type="gramEnd"/>
+      <w:r>
+        <w:rPr>
+          <w:lang w:val="en-US"/>
+        </w:rPr>
+        <w:t xml:space="preserve"> at Piri Reis </w:t>
+      </w:r>
+      <w:proofErr w:type="gramStart"/>
+      <w:r>
+        <w:rPr>
+          <w:lang w:val="en-US"/>
+        </w:rPr>
+        <w:t>University, and</w:t>
+      </w:r>
+      <w:proofErr w:type="gramEnd"/>
+      <w:r>
+        <w:rPr>
+          <w:lang w:val="en-US"/>
+        </w:rPr>
+        <w:t xml:space="preserve"> has not been previously included in a thesis or dissertation submitted to this or any other institution for a degree, diploma or other qualifications.</w:t>
       </w:r>
     </w:p>
     <w:p>
@@ -1025,14 +1077,38 @@
         </w:rPr>
       </w:pPr>
       <w:r>
-        <w:t>Supply chains include many connected activities such as order management, shipment planning, inventory control, delivery tracking, regional performance monitoring, and demand planning. When these activities are analyzed separately, managers may have difficulty seeing operational problems and risks on time. This graduation thesis develops a Supply Chain Visibility and Risk Assessment Platform to support supply chain decision-making through data visualization, risk analysis, and dataset standardization.</w:t>
+        <w:t xml:space="preserve">Supply chains include many connected activities such as order management, shipment planning, inventory control, delivery tracking, regional performance monitoring, and demand planning. When these activities are </w:t>
+      </w:r>
+      <w:proofErr w:type="spellStart"/>
+      <w:r>
+        <w:t>analyzed</w:t>
+      </w:r>
+      <w:proofErr w:type="spellEnd"/>
+      <w:r>
+        <w:t xml:space="preserve"> separately, managers may have difficulty seeing operational problems and risks on time. This graduation thesis develops a Supply Chain Visibility and Risk Assessment Platform to support supply chain decision-making through data visualization, risk analysis, and dataset standardization.</w:t>
       </w:r>
       <w:r>
         <w:br/>
       </w:r>
       <w:r>
         <w:br/>
-        <w:t>The platform was developed with Python and Streamlit. It uses the public DataCo Smart Supply Chain dataset as the default demonstration dataset. In addition, the system allows users to upload a new supply chain dataset in CSV or Excel format. The uploaded dataset can be mapped to a standard supply chain schema and then used dynamically across the dashboard pages. The platform includes modules for overview analysis, regional performance, inventory control, shipment performance, supply chain risk, and demand forecasting.</w:t>
+        <w:t xml:space="preserve">The platform was developed with Python and </w:t>
+      </w:r>
+      <w:proofErr w:type="spellStart"/>
+      <w:r>
+        <w:t>Streamlit</w:t>
+      </w:r>
+      <w:proofErr w:type="spellEnd"/>
+      <w:r>
+        <w:t xml:space="preserve">. It uses the public </w:t>
+      </w:r>
+      <w:proofErr w:type="spellStart"/>
+      <w:r>
+        <w:t>DataCo</w:t>
+      </w:r>
+      <w:proofErr w:type="spellEnd"/>
+      <w:r>
+        <w:t xml:space="preserve"> Smart Supply Chain dataset as the default demonstration dataset. In addition, the system allows users to upload a new supply chain dataset in CSV or Excel format. The uploaded dataset can be mapped to a standard supply chain schema and then used dynamically across the dashboard pages. The platform includes modules for overview analysis, regional performance, inventory control, shipment performance, supply chain risk, and demand forecasting.</w:t>
       </w:r>
       <w:r>
         <w:br/>
@@ -1052,7 +1128,15 @@
       </w:r>
       <w:r>
         <w:br/>
-        <w:t>Key Words: Supply Chain Visibility, Risk Assessment, Data Standardization, Streamlit Dashboard, Business Intelligence, Demand Forecasting</w:t>
+        <w:t xml:space="preserve">Key Words: Supply Chain Visibility, Risk Assessment, Data Standardization, </w:t>
+      </w:r>
+      <w:proofErr w:type="spellStart"/>
+      <w:r>
+        <w:t>Streamlit</w:t>
+      </w:r>
+      <w:proofErr w:type="spellEnd"/>
+      <w:r>
+        <w:t xml:space="preserve"> Dashboard, Business Intelligence, Demand Forecasting</w:t>
       </w:r>
     </w:p>
     <w:p>
@@ -3753,7 +3837,15 @@
     <w:p/>
     <w:p>
       <w:r>
-        <w:t>In this project, supply chain visibility is addressed through a multi-page dashboard structure. The platform brings different operational views together, including overview indicators, regional performance, inventory control, shipment performance, risk analysis, and demand forecasting. This supports the idea that supply chain visibility should not focus on only one metric, but should combine different operational indicators.</w:t>
+        <w:t xml:space="preserve">In this project, supply chain visibility is addressed through a multi-page dashboard structure. The platform brings different operational views together, including overview indicators, regional performance, inventory control, shipment performance, risk analysis, and demand forecasting. This supports the idea that supply chain visibility should not focus on only one </w:t>
+      </w:r>
+      <w:proofErr w:type="gramStart"/>
+      <w:r>
+        <w:t>metric, but</w:t>
+      </w:r>
+      <w:proofErr w:type="gramEnd"/>
+      <w:r>
+        <w:t xml:space="preserve"> should combine different operational indicators.</w:t>
       </w:r>
     </w:p>
     <w:p/>
@@ -3767,7 +3859,15 @@
     </w:p>
     <w:p>
       <w:r>
-        <w:t>Business intelligence dashboards are used to transform raw data into visual and understandable information. Instead of analyzing large tables manually, users can monitor key performance indicators, charts, and summary tables through an interactive interface. Dashboards are especially useful in operational areas where managers need to make quick and data-based decisions. [INSERT CITATION: Business Intelligence Dashboards]</w:t>
+        <w:t xml:space="preserve">Business intelligence dashboards are used to transform raw data into visual and understandable information. Instead of </w:t>
+      </w:r>
+      <w:proofErr w:type="spellStart"/>
+      <w:r>
+        <w:t>analyzing</w:t>
+      </w:r>
+      <w:proofErr w:type="spellEnd"/>
+      <w:r>
+        <w:t xml:space="preserve"> large tables manually, users can monitor key performance indicators, charts, and summary tables through an interactive interface. Dashboards are especially useful in operational areas where managers need to make quick and data-based decisions. [INSERT CITATION: Business Intelligence Dashboards]</w:t>
       </w:r>
     </w:p>
     <w:p/>
@@ -3806,7 +3906,15 @@
     <w:p/>
     <w:p>
       <w:r>
-        <w:t>In this project, supply chain risk is calculated using rule-based and interpretable indicators. The system analyzes delivery risk, delay risk, inventory risk, demand volatility risk, and region-level risk. The purpose is not to create a complex black-box prediction model, but to provide a clear and understandable risk assessment structure for decision support.</w:t>
+        <w:t xml:space="preserve">In this project, supply chain risk is calculated using rule-based and interpretable indicators. The system </w:t>
+      </w:r>
+      <w:proofErr w:type="spellStart"/>
+      <w:r>
+        <w:t>analyzes</w:t>
+      </w:r>
+      <w:proofErr w:type="spellEnd"/>
+      <w:r>
+        <w:t xml:space="preserve"> delivery risk, delay risk, inventory risk, demand volatility risk, and region-level risk. The purpose is not to create a complex black-box prediction model, but to provide a clear and understandable risk assessment structure for decision support.</w:t>
       </w:r>
     </w:p>
     <w:p/>
@@ -3820,7 +3928,15 @@
     </w:p>
     <w:p>
       <w:r>
-        <w:t>Digital transformation in logistics and supply chain management is closely related to the use of data, automation, analytics, and connected systems. Digital tools can improve transparency by collecting and analyzing operational data from different stages of the supply chain. This can support better planning, faster decision-making, and improved coordination between supply chain activities. [INSERT CITATION: Digital Transformation in Logistics]</w:t>
+        <w:t xml:space="preserve">Digital transformation in logistics and supply chain management is closely related to the use of data, automation, analytics, and connected systems. Digital tools can improve transparency by collecting and </w:t>
+      </w:r>
+      <w:proofErr w:type="spellStart"/>
+      <w:r>
+        <w:t>analyzing</w:t>
+      </w:r>
+      <w:proofErr w:type="spellEnd"/>
+      <w:r>
+        <w:t xml:space="preserve"> operational data from different stages of the supply chain. This can support better planning, faster decision-making, and improved coordination between supply chain activities. [INSERT CITATION: Digital Transformation in Logistics]</w:t>
       </w:r>
     </w:p>
     <w:p/>
@@ -3888,7 +4004,15 @@
     <w:p/>
     <w:p>
       <w:r>
-        <w:t>The dataset upload feature improves the originality and usefulness of the project. The default DataCo dataset is used as a demonstration dataset, but the system can also process new supply chain datasets. After the user maps the uploaded dataset to the standard schema, the dashboard pages are generated dynamically based on the active dataset. This makes the platform more reusable for different supply chain data sources.</w:t>
+        <w:t xml:space="preserve">The dataset upload feature improves the originality and usefulness of the project. The default </w:t>
+      </w:r>
+      <w:proofErr w:type="spellStart"/>
+      <w:r>
+        <w:t>DataCo</w:t>
+      </w:r>
+      <w:proofErr w:type="spellEnd"/>
+      <w:r>
+        <w:t xml:space="preserve"> dataset is used as a demonstration dataset, but the system can also process new supply chain datasets. After the user maps the uploaded dataset to the standard schema, the dashboard pages are generated dynamically based on the active dataset. This makes the platform more reusable for different supply chain data sources.</w:t>
       </w:r>
     </w:p>
     <w:p/>
@@ -3908,9 +4032,18 @@
     <w:p/>
     <w:p>
       <w:r>
-        <w:t>Based on these ideas, this project develops a dataset-adaptive supply chain visibility and risk assessment platform. The platform combines dashboard visualization, uploaded dataset support, data standardization, risk scoring, and demand forecasting in a single Streamlit-based system.</w:t>
-      </w:r>
-    </w:p>
+        <w:t xml:space="preserve">Based on these ideas, this project develops a dataset-adaptive supply chain visibility and risk assessment platform. The platform combines dashboard visualization, uploaded dataset support, data standardization, risk scoring, and demand forecasting in a single </w:t>
+      </w:r>
+      <w:proofErr w:type="spellStart"/>
+      <w:r>
+        <w:t>Streamlit</w:t>
+      </w:r>
+      <w:proofErr w:type="spellEnd"/>
+      <w:r>
+        <w:t>-based system.</w:t>
+      </w:r>
+    </w:p>
+    <w:p/>
     <w:p>
       <w:pPr>
         <w:pStyle w:val="Heading1"/>
@@ -3925,1310 +4058,434 @@
     </w:p>
     <w:p>
       <w:r>
-        <w:t>Use full justification ….</w:t>
-      </w:r>
-    </w:p>
-    <w:p>
-      <w:pPr>
-        <w:rPr>
-          <w:szCs w:val="18"/>
-        </w:rPr>
-      </w:pPr>
-    </w:p>
-    <w:p>
-      <w:pPr>
-        <w:pStyle w:val="Quotes"/>
-      </w:pPr>
-      <w:r>
-        <w:t>"Quotes - use full justification + italics + indent right margin 1 cm + indent left margin 1 cm."</w:t>
+        <w:t>The</w:t>
+      </w:r>
+      <w:r>
+        <w:t xml:space="preserve"> originality of this study comes from developing a supply chain dashboard platform that is not limited to one fixed dataset. Many dashboard projects are designed only for a single prepared dataset. In this project, the </w:t>
+      </w:r>
+      <w:proofErr w:type="spellStart"/>
+      <w:r>
+        <w:t>DataCo</w:t>
+      </w:r>
+      <w:proofErr w:type="spellEnd"/>
+      <w:r>
+        <w:t xml:space="preserve"> Smart Supply Chain dataset is used as the default demonstration dataset, but the platform also allows users to upload a new supply chain dataset in CSV or Excel format.</w:t>
+      </w:r>
+      <w:r>
+        <w:br/>
+      </w:r>
+      <w:r>
+        <w:br/>
+        <w:t>The system includes a Data Source Manager that supports column mapping and dataset standardization. This means that different datasets with different column names can be mapped to a common supply chain schema. After the mapping process, the system converts the uploaded dataset into standardized analytical tables and uses these tables across all dashboard pages.</w:t>
+      </w:r>
+      <w:r>
+        <w:br/>
+      </w:r>
+      <w:r>
+        <w:br/>
+        <w:t>Another original aspect of the project is the integration of multiple supply chain analysis areas in one platform. The system does not only show order or sales information. It combines executive KPIs, regional performance analysis, inventory control indicators, shipment performance, supply chain risk scoring, and demand forecasting. This makes the project closer to a decision-support platform rather than a simple visualization page.</w:t>
+      </w:r>
+      <w:r>
+        <w:br/>
+      </w:r>
+      <w:r>
+        <w:br/>
+        <w:t xml:space="preserve">The risk analysis structure is also designed to be understandable for users. Instead of using a black-box model, the project uses rule-based and interpretable risk indicators such as late delivery rate, delay days, inventory status, demand volatility, and regional performance. This helps users understand why a specific market, region, shipment </w:t>
+      </w:r>
+      <w:r>
+        <w:lastRenderedPageBreak/>
+        <w:t>mode, or product category may be risky.</w:t>
+      </w:r>
+      <w:r>
+        <w:br/>
+      </w:r>
+      <w:r>
+        <w:br/>
+        <w:t xml:space="preserve">The project is original within its academic scope because it combines data upload, schema mapping, data standardization, dynamic dashboard generation, risk analysis, and forecasting in a single </w:t>
+      </w:r>
+      <w:proofErr w:type="spellStart"/>
+      <w:r>
+        <w:t>Streamlit</w:t>
+      </w:r>
+      <w:proofErr w:type="spellEnd"/>
+      <w:r>
+        <w:t>-based system. Therefore, the main contribution of the project is the development of a reusable supply chain visibility and risk assessment platform that can work with both a default dataset and user-uploaded datasets.</w:t>
+      </w:r>
+    </w:p>
+    <w:p>
+      <w:pPr>
+        <w:pStyle w:val="Heading1"/>
+      </w:pPr>
+      <w:bookmarkStart w:id="16" w:name="_Toc115861782"/>
+      <w:r>
+        <w:t>PROBLEM DEFINITION</w:t>
+      </w:r>
+      <w:bookmarkEnd w:id="16"/>
+    </w:p>
+    <w:p>
+      <w:r>
+        <w:t xml:space="preserve">Supply chain operations produce large amounts of data related to orders, products, shipments, delivery performance, inventory, regions, sales, and demand. However, this data is often stored in different files, systems, or formats. When the data is not standardized and </w:t>
+      </w:r>
+      <w:proofErr w:type="spellStart"/>
+      <w:r>
+        <w:t>analyzed</w:t>
+      </w:r>
+      <w:proofErr w:type="spellEnd"/>
+      <w:r>
+        <w:t xml:space="preserve"> together, it becomes difficult for managers to understand the overall performance of the supply chain.</w:t>
+      </w:r>
+      <w:r>
+        <w:br/>
+      </w:r>
+      <w:r>
+        <w:br/>
+        <w:t>One of the main problems is the lack of integrated visibility. A manager may need to check different reports to understand late deliveries, shipment delays, inventory warnings, regional performance, and demand changes. This slows down decision-making and increases the risk of missing important operational problems.</w:t>
+      </w:r>
+      <w:r>
+        <w:br/>
+      </w:r>
+      <w:r>
+        <w:br/>
+        <w:t xml:space="preserve">Another problem is that many dashboard systems are designed for a single prepared dataset. If a new dataset has different column names or a different structure, the dashboard may not work without manual code changes. This limits the reusability of the system. For example, one dataset may use “order date,” while another dataset may use “PO created date” for the same concept. Without a standard mapping and transformation process, these datasets cannot be </w:t>
+      </w:r>
+      <w:proofErr w:type="spellStart"/>
+      <w:r>
+        <w:t>analyzed</w:t>
+      </w:r>
+      <w:proofErr w:type="spellEnd"/>
+      <w:r>
+        <w:t xml:space="preserve"> through the same dashboard structure.</w:t>
+      </w:r>
+      <w:r>
+        <w:br/>
+      </w:r>
+      <w:r>
+        <w:br/>
+        <w:t>There is also a risk assessment problem. Supply chain risk should not be evaluated by looking at only one indicator. Late delivery rate, average delay days, inventory status, demand volatility, regional performance, and financial indicators can all affect operational risk. If these indicators are not combined in a clear way, users may not understand which areas of the supply chain require attention.</w:t>
+      </w:r>
+      <w:r>
+        <w:br/>
+      </w:r>
+      <w:r>
+        <w:br/>
+        <w:t>Therefore, the main problem addressed in this project is the need for a reusable and interactive decision-support platform that can transform different supply chain datasets into a standard analytical format and generate visibility dashboards and risk analysis from the active dataset.</w:t>
+      </w:r>
+    </w:p>
+    <w:p>
+      <w:pPr>
+        <w:pStyle w:val="Heading1"/>
+      </w:pPr>
+      <w:bookmarkStart w:id="17" w:name="_Toc115861783"/>
+      <w:r>
+        <w:t>SOLUTION APPROACH</w:t>
+      </w:r>
+      <w:bookmarkEnd w:id="17"/>
+    </w:p>
+    <w:p>
+      <w:r>
+        <w:t xml:space="preserve">The solution approach of this project is based on developing a dataset-adaptive supply chain dashboard platform. The system is designed to work with a default demonstration dataset </w:t>
+      </w:r>
+      <w:proofErr w:type="gramStart"/>
+      <w:r>
+        <w:t>and also</w:t>
+      </w:r>
+      <w:proofErr w:type="gramEnd"/>
+      <w:r>
+        <w:t xml:space="preserve"> with user-uploaded supply chain datasets. The main idea is to transform different supply chain datasets into a common analytical structure and then generate dashboard modules from the active dataset.</w:t>
       </w:r>
     </w:p>
     <w:p>
       <w:pPr>
         <w:pStyle w:val="Heading2"/>
-        <w:ind w:left="578" w:hanging="578"/>
-      </w:pPr>
-      <w:bookmarkStart w:id="16" w:name="_Toc32521138"/>
-      <w:bookmarkStart w:id="17" w:name="_Toc115861777"/>
-      <w:r>
-        <w:t>Heading 2:  Outline numbering, bold</w:t>
-      </w:r>
-      <w:bookmarkEnd w:id="16"/>
-      <w:bookmarkEnd w:id="17"/>
-    </w:p>
-    <w:p>
-      <w:r>
-        <w:t xml:space="preserve">Use full justification </w:t>
-      </w:r>
-    </w:p>
-    <w:p>
-      <w:pPr>
-        <w:pStyle w:val="Heading3"/>
-      </w:pPr>
-      <w:bookmarkStart w:id="18" w:name="_Toc32521139"/>
-      <w:bookmarkStart w:id="19" w:name="_Toc115861778"/>
-      <w:r>
-        <w:t>Heading 3:  Outline numbering, bold + italics</w:t>
+      </w:pPr>
+      <w:r>
+        <w:t>Overall Approach</w:t>
+      </w:r>
+    </w:p>
+    <w:p>
+      <w:r>
+        <w:t>The project follows a data-driven decision-support approach. First, supply chain data is collected or uploaded into the system. Then, the data is cleaned, standardized, and transformed into dashboard-ready analytical tables. After this transformation, the dashboard modules calculate KPIs, generate visualizations, and support risk assessment.</w:t>
+      </w:r>
+      <w:r>
+        <w:br/>
+      </w:r>
+      <w:r>
+        <w:br/>
+        <w:t xml:space="preserve">The platform uses the </w:t>
+      </w:r>
+      <w:proofErr w:type="spellStart"/>
+      <w:r>
+        <w:t>DataCo</w:t>
+      </w:r>
+      <w:proofErr w:type="spellEnd"/>
+      <w:r>
+        <w:t xml:space="preserve"> Smart Supply Chain dataset as the default dataset. This dataset is processed into different analytical tables such as orders, products, shipments, inventory, demand, and risk scores. These tables are used by the default dashboard when no uploaded dataset is active.</w:t>
+      </w:r>
+      <w:r>
+        <w:br/>
+      </w:r>
+      <w:r>
+        <w:br/>
+        <w:t>However, the project is not limited to the default dataset. Users can upload a new company supply chain dataset in CSV or Excel format. The uploaded dataset is mapped to a standard schema through the Data Source Manager. After the mapping process, the system creates the same type of analytical tables and updates the dashboard pages according to the uploaded dataset.</w:t>
+      </w:r>
+    </w:p>
+    <w:p>
+      <w:pPr>
+        <w:pStyle w:val="Heading2"/>
+      </w:pPr>
+      <w:r>
+        <w:t>Dataset Upload and Standardization</w:t>
+      </w:r>
+      <w:r>
+        <w:t xml:space="preserve"> </w:t>
+      </w:r>
+    </w:p>
+    <w:p>
+      <w:r>
+        <w:t>The dataset upload feature is one of the main parts of the solution. Different supply chain datasets may use different column names for similar concepts. For example, one dataset may use “order date,” another may use “PO created date,” and another may use “created at.” To solve this problem, the platform includes a column mapping process.</w:t>
+      </w:r>
+      <w:r>
+        <w:br/>
+      </w:r>
+      <w:r>
+        <w:br/>
+        <w:t>In the Data Source Manager, users map the columns of the uploaded dataset to the standard supply chain schema. The required fields include order ID, order date, product name, category name, and order quantity. Optional fields include shipping date, scheduled delivery date, delivery status, actual shipping days, scheduled shipping days, shipping mode, market, region, country, sales, and profit.</w:t>
+      </w:r>
+      <w:r>
+        <w:br/>
+      </w:r>
+      <w:r>
+        <w:br/>
+        <w:t xml:space="preserve">After the mapping is completed, the system standardizes the uploaded dataset. It converts date fields, numeric </w:t>
+      </w:r>
+      <w:r>
+        <w:lastRenderedPageBreak/>
+        <w:t>fields, and text fields into a common format. It also derives additional indicators where possible. For example, if actual shipping days and scheduled shipping days are not available, the system can calculate delay days by comparing delivered date and scheduled delivery date.</w:t>
+      </w:r>
+    </w:p>
+    <w:p>
+      <w:pPr>
+        <w:pStyle w:val="Heading2"/>
+      </w:pPr>
+      <w:r>
+        <w:t>Dynamic Dashboard Generation</w:t>
+      </w:r>
+      <w:r>
+        <w:t xml:space="preserve"> </w:t>
+      </w:r>
+    </w:p>
+    <w:p>
+      <w:r>
+        <w:t xml:space="preserve">After the dataset is standardized, the dashboard pages are generated from the active dataset. If no uploaded dataset is active, the dashboard uses the default </w:t>
+      </w:r>
+      <w:proofErr w:type="spellStart"/>
+      <w:r>
+        <w:t>DataCo</w:t>
+      </w:r>
+      <w:proofErr w:type="spellEnd"/>
+      <w:r>
+        <w:t xml:space="preserve"> dataset. If the user uploads and activates a new dataset, all dashboard pages use the uploaded dataset during the active </w:t>
+      </w:r>
+      <w:proofErr w:type="spellStart"/>
+      <w:r>
+        <w:t>Streamlit</w:t>
+      </w:r>
+      <w:proofErr w:type="spellEnd"/>
+      <w:r>
+        <w:t xml:space="preserve"> session.</w:t>
+      </w:r>
+      <w:r>
+        <w:br/>
+      </w:r>
+      <w:r>
+        <w:br/>
+        <w:t xml:space="preserve">The dashboard includes six main modules: Overview, Regional Performance, Inventory Control, Shipment Performance, Supply Chain Risk, and Demand Forecast. Each module focuses on a different part of supply chain visibility. The Overview page shows general KPIs and summary charts. The Regional Performance page compares markets and regions. The Inventory Control page shows generated inventory indicators. The Shipment Performance page </w:t>
+      </w:r>
+      <w:proofErr w:type="spellStart"/>
+      <w:r>
+        <w:t>analyzes</w:t>
+      </w:r>
+      <w:proofErr w:type="spellEnd"/>
+      <w:r>
+        <w:t xml:space="preserve"> delivery and delay performance. The Supply Chain Risk page calculates risk indicators. The Demand Forecast page </w:t>
+      </w:r>
+      <w:proofErr w:type="spellStart"/>
+      <w:r>
+        <w:t>analyzes</w:t>
+      </w:r>
+      <w:proofErr w:type="spellEnd"/>
+      <w:r>
+        <w:t xml:space="preserve"> historical demand and creates simple forecasts.</w:t>
+      </w:r>
+      <w:r>
+        <w:br/>
+      </w:r>
+      <w:r>
+        <w:br/>
+        <w:t xml:space="preserve">This structure allows the system to work as a flexible platform instead of a static dashboard. The same dashboard pages can be used with different supply chain datasets </w:t>
+      </w:r>
+      <w:proofErr w:type="gramStart"/>
+      <w:r>
+        <w:t>as long as</w:t>
+      </w:r>
+      <w:proofErr w:type="gramEnd"/>
+      <w:r>
+        <w:t xml:space="preserve"> the required fields are mapped correctly.</w:t>
+      </w:r>
+    </w:p>
+    <w:p>
+      <w:pPr>
+        <w:pStyle w:val="Heading2"/>
+      </w:pPr>
+      <w:r>
+        <w:t>Risk Assessment Approach</w:t>
+      </w:r>
+      <w:r>
+        <w:t xml:space="preserve"> </w:t>
+      </w:r>
+    </w:p>
+    <w:p>
+      <w:r>
+        <w:t>The risk assessment approach is rule-based and interpretable. The purpose of the risk model is not to create a complex black-box prediction system. Instead, the aim is to provide clear risk indicators that users can understand and discuss.</w:t>
+      </w:r>
+      <w:r>
+        <w:br/>
+      </w:r>
+      <w:r>
+        <w:br/>
+        <w:t>The system evaluates risk by using operational indicators such as late delivery rate, average delay days, inventory status, demand volatility, and regional performance. These indicators are combined into risk scores that help users identify problematic areas in the supply chain. The risk results are shown through KPI cards, charts, tables, and risk-level classifications.</w:t>
+      </w:r>
+      <w:r>
+        <w:br/>
+      </w:r>
+      <w:r>
+        <w:br/>
+        <w:t>This approach is suitable for a graduation thesis prototype because it provides a transparent decision-support structure. Users can understand which factors affect the risk score and can use the dashboard to explore risky regions, shipment modes, categories, and inventory items.</w:t>
+      </w:r>
+    </w:p>
+    <w:p>
+      <w:pPr>
+        <w:pStyle w:val="Heading2"/>
+      </w:pPr>
+      <w:r>
+        <w:t>Forecasting Approach</w:t>
+      </w:r>
+      <w:r>
+        <w:t xml:space="preserve"> </w:t>
+      </w:r>
+    </w:p>
+    <w:p>
+      <w:r>
+        <w:t>The platform also includes a demand forecasting module. This module uses historical monthly demand values and applies simple forecasting methods such as moving average and linear regression. The purpose is to show how historical demand data can be used to estimate future demand patterns.</w:t>
+      </w:r>
+      <w:r>
+        <w:br/>
+      </w:r>
+      <w:r>
+        <w:br/>
+        <w:t>The forecasting module also includes basic performance evaluation metrics such as MAE and MAPE. These metrics help users compare forecast accuracy and understand the reliability of the forecast results. Since the project focuses mainly on supply chain visibility and risk assessment, the forecasting module is designed as a planning-support feature rather than an advanced forecasting system.</w:t>
+      </w:r>
+    </w:p>
+    <w:p>
+      <w:pPr>
+        <w:pStyle w:val="Heading1"/>
+      </w:pPr>
+      <w:bookmarkStart w:id="18" w:name="_Toc115861784"/>
+      <w:r>
+        <w:t>REQUIRED TOOLS</w:t>
       </w:r>
       <w:bookmarkEnd w:id="18"/>
+    </w:p>
+    <w:p>
+      <w:r>
+        <w:t>……</w:t>
+      </w:r>
+      <w:proofErr w:type="gramStart"/>
+      <w:r>
+        <w:t>….</w:t>
+      </w:r>
+      <w:proofErr w:type="spellStart"/>
+      <w:r>
+        <w:t>fdfdfdf</w:t>
+      </w:r>
+      <w:proofErr w:type="spellEnd"/>
+      <w:proofErr w:type="gramEnd"/>
+    </w:p>
+    <w:p>
+      <w:pPr>
+        <w:pStyle w:val="Heading1"/>
+      </w:pPr>
+      <w:bookmarkStart w:id="19" w:name="_Toc115861785"/>
+      <w:r>
+        <w:t>SYSTEM / MODEL &amp; SOLUTION DEVELOPMENT</w:t>
+      </w:r>
       <w:bookmarkEnd w:id="19"/>
     </w:p>
     <w:p>
       <w:r>
-        <w:t xml:space="preserve">Use full justification </w:t>
-      </w:r>
-    </w:p>
-    <w:p>
-      <w:pPr>
-        <w:pStyle w:val="ListParagraph"/>
-        <w:numPr>
-          <w:ilvl w:val="0"/>
-          <w:numId w:val="3"/>
-        </w:numPr>
-      </w:pPr>
-      <w:r>
-        <w:t xml:space="preserve">Bullets:  Use full justification </w:t>
-      </w:r>
-    </w:p>
-    <w:p>
-      <w:pPr>
-        <w:pStyle w:val="ListParagraph"/>
-        <w:numPr>
-          <w:ilvl w:val="0"/>
-          <w:numId w:val="3"/>
-        </w:numPr>
-      </w:pPr>
-      <w:r>
-        <w:t xml:space="preserve">Bullets:  Use full justification </w:t>
-      </w:r>
-    </w:p>
-    <w:p>
-      <w:pPr>
-        <w:pStyle w:val="Heading3"/>
-      </w:pPr>
-      <w:bookmarkStart w:id="20" w:name="_Toc32521140"/>
-      <w:bookmarkStart w:id="21" w:name="_Toc115861779"/>
-      <w:r>
-        <w:t>Equations</w:t>
+        <w:t>……</w:t>
+      </w:r>
+      <w:proofErr w:type="gramStart"/>
+      <w:r>
+        <w:t>….</w:t>
+      </w:r>
+      <w:proofErr w:type="spellStart"/>
+      <w:r>
+        <w:t>fdfdfdf</w:t>
+      </w:r>
+      <w:proofErr w:type="spellEnd"/>
+      <w:proofErr w:type="gramEnd"/>
+    </w:p>
+    <w:p/>
+    <w:p>
+      <w:pPr>
+        <w:pStyle w:val="Heading1"/>
+      </w:pPr>
+      <w:bookmarkStart w:id="20" w:name="_Toc115861786"/>
+      <w:r>
+        <w:t>CASE STUDY / BUSINESS CASE</w:t>
       </w:r>
       <w:bookmarkEnd w:id="20"/>
+    </w:p>
+    <w:p>
+      <w:r>
+        <w:t>……</w:t>
+      </w:r>
+      <w:proofErr w:type="gramStart"/>
+      <w:r>
+        <w:t>….</w:t>
+      </w:r>
+      <w:proofErr w:type="spellStart"/>
+      <w:r>
+        <w:t>fdfdfdf</w:t>
+      </w:r>
+      <w:proofErr w:type="spellEnd"/>
+      <w:proofErr w:type="gramEnd"/>
+    </w:p>
+    <w:p>
+      <w:pPr>
+        <w:pStyle w:val="Heading1"/>
+      </w:pPr>
+      <w:bookmarkStart w:id="21" w:name="_Toc115861787"/>
+      <w:r>
+        <w:t>CONCLUSIONs</w:t>
+      </w:r>
       <w:bookmarkEnd w:id="21"/>
     </w:p>
     <w:p>
       <w:r>
-        <w:t>Use the Word equation editor if possible – but always make sure that equations are of a good rendering quality if another mechanism is used. Number equations sequentially as shown below, with the equation indented 10 mm, and the equation number appearing in brackets and right aligned.</w:t>
-      </w:r>
-    </w:p>
-    <w:p>
-      <w:pPr>
-        <w:pStyle w:val="Equation"/>
-        <w:rPr>
-          <w:rFonts w:ascii="Trebuchet MS" w:hAnsi="Trebuchet MS"/>
-          <w:b/>
-        </w:rPr>
-      </w:pPr>
-      <m:oMath>
-        <m:d>
-          <m:dPr>
-            <m:begChr m:val="["/>
-            <m:endChr m:val="]"/>
-            <m:ctrlPr/>
-          </m:dPr>
-          <m:e>
-            <m:m>
-              <m:mPr>
-                <m:mcs>
-                  <m:mc>
-                    <m:mcPr>
-                      <m:count m:val="1"/>
-                      <m:mcJc m:val="center"/>
-                    </m:mcPr>
-                  </m:mc>
-                </m:mcs>
-                <m:ctrlPr/>
-              </m:mPr>
-              <m:mr>
-                <m:e>
-                  <m:r>
-                    <m:t>x</m:t>
-                  </m:r>
-                </m:e>
-              </m:mr>
-              <m:mr>
-                <m:e>
-                  <m:r>
-                    <m:t>y</m:t>
-                  </m:r>
-                </m:e>
-              </m:mr>
-              <m:mr>
-                <m:e>
-                  <m:r>
-                    <m:t>z</m:t>
-                  </m:r>
-                </m:e>
-              </m:mr>
-            </m:m>
-          </m:e>
-        </m:d>
-        <m:r>
-          <m:t xml:space="preserve"> =</m:t>
-        </m:r>
-        <m:d>
-          <m:dPr>
-            <m:begChr m:val="["/>
-            <m:endChr m:val="]"/>
-            <m:ctrlPr/>
-          </m:dPr>
-          <m:e>
-            <m:m>
-              <m:mPr>
-                <m:mcs>
-                  <m:mc>
-                    <m:mcPr>
-                      <m:count m:val="1"/>
-                      <m:mcJc m:val="center"/>
-                    </m:mcPr>
-                  </m:mc>
-                </m:mcs>
-                <m:ctrlPr/>
-              </m:mPr>
-              <m:mr>
-                <m:e>
-                  <m:f>
-                    <m:fPr>
-                      <m:ctrlPr/>
-                    </m:fPr>
-                    <m:num>
-                      <m:sSub>
-                        <m:sSubPr>
-                          <m:ctrlPr/>
-                        </m:sSubPr>
-                        <m:e>
-                          <m:r>
-                            <m:t>F</m:t>
-                          </m:r>
-                        </m:e>
-                        <m:sub>
-                          <m:r>
-                            <m:t>x</m:t>
-                          </m:r>
-                        </m:sub>
-                      </m:sSub>
-                    </m:num>
-                    <m:den>
-                      <m:r>
-                        <m:t>2m</m:t>
-                      </m:r>
-                    </m:den>
-                  </m:f>
-                </m:e>
-              </m:mr>
-              <m:mr>
-                <m:e>
-                  <m:f>
-                    <m:fPr>
-                      <m:ctrlPr/>
-                    </m:fPr>
-                    <m:num>
-                      <m:sSub>
-                        <m:sSubPr>
-                          <m:ctrlPr/>
-                        </m:sSubPr>
-                        <m:e>
-                          <m:r>
-                            <m:t>F</m:t>
-                          </m:r>
-                        </m:e>
-                        <m:sub>
-                          <m:r>
-                            <m:t>y</m:t>
-                          </m:r>
-                        </m:sub>
-                      </m:sSub>
-                    </m:num>
-                    <m:den>
-                      <m:r>
-                        <m:t>2m</m:t>
-                      </m:r>
-                    </m:den>
-                  </m:f>
-                </m:e>
-              </m:mr>
-              <m:mr>
-                <m:e>
-                  <m:f>
-                    <m:fPr>
-                      <m:ctrlPr/>
-                    </m:fPr>
-                    <m:num>
-                      <m:sSub>
-                        <m:sSubPr>
-                          <m:ctrlPr/>
-                        </m:sSubPr>
-                        <m:e>
-                          <m:r>
-                            <m:t>F</m:t>
-                          </m:r>
-                        </m:e>
-                        <m:sub>
-                          <m:r>
-                            <m:t>z</m:t>
-                          </m:r>
-                        </m:sub>
-                      </m:sSub>
-                    </m:num>
-                    <m:den>
-                      <m:r>
-                        <m:t>2m</m:t>
-                      </m:r>
-                    </m:den>
-                  </m:f>
-                </m:e>
-              </m:mr>
-            </m:m>
-          </m:e>
-        </m:d>
-        <m:sSup>
-          <m:sSupPr>
-            <m:ctrlPr/>
-          </m:sSupPr>
-          <m:e>
-            <m:r>
-              <m:t>t</m:t>
-            </m:r>
-          </m:e>
-          <m:sup>
-            <m:r>
-              <m:t>2</m:t>
-            </m:r>
-          </m:sup>
-        </m:sSup>
-        <m:r>
-          <m:t>+</m:t>
-        </m:r>
-        <m:d>
-          <m:dPr>
-            <m:begChr m:val="["/>
-            <m:endChr m:val="]"/>
-            <m:ctrlPr/>
-          </m:dPr>
-          <m:e>
-            <m:m>
-              <m:mPr>
-                <m:mcs>
-                  <m:mc>
-                    <m:mcPr>
-                      <m:count m:val="1"/>
-                      <m:mcJc m:val="center"/>
-                    </m:mcPr>
-                  </m:mc>
-                </m:mcs>
-                <m:ctrlPr/>
-              </m:mPr>
-              <m:mr>
-                <m:e>
-                  <m:acc>
-                    <m:accPr>
-                      <m:chr m:val="̇"/>
-                      <m:ctrlPr/>
-                    </m:accPr>
-                    <m:e>
-                      <m:sSub>
-                        <m:sSubPr>
-                          <m:ctrlPr/>
-                        </m:sSubPr>
-                        <m:e>
-                          <m:r>
-                            <m:t>x</m:t>
-                          </m:r>
-                        </m:e>
-                        <m:sub>
-                          <m:r>
-                            <m:t>0</m:t>
-                          </m:r>
-                        </m:sub>
-                      </m:sSub>
-                    </m:e>
-                  </m:acc>
-                </m:e>
-              </m:mr>
-              <m:mr>
-                <m:e>
-                  <m:acc>
-                    <m:accPr>
-                      <m:chr m:val="̇"/>
-                      <m:ctrlPr/>
-                    </m:accPr>
-                    <m:e>
-                      <m:sSub>
-                        <m:sSubPr>
-                          <m:ctrlPr/>
-                        </m:sSubPr>
-                        <m:e>
-                          <m:r>
-                            <m:t>y</m:t>
-                          </m:r>
-                        </m:e>
-                        <m:sub>
-                          <m:r>
-                            <m:t>0</m:t>
-                          </m:r>
-                        </m:sub>
-                      </m:sSub>
-                    </m:e>
-                  </m:acc>
-                </m:e>
-              </m:mr>
-              <m:mr>
-                <m:e>
-                  <m:acc>
-                    <m:accPr>
-                      <m:chr m:val="̇"/>
-                      <m:ctrlPr/>
-                    </m:accPr>
-                    <m:e>
-                      <m:sSub>
-                        <m:sSubPr>
-                          <m:ctrlPr/>
-                        </m:sSubPr>
-                        <m:e>
-                          <m:r>
-                            <m:t>z</m:t>
-                          </m:r>
-                        </m:e>
-                        <m:sub>
-                          <m:r>
-                            <m:t>0</m:t>
-                          </m:r>
-                        </m:sub>
-                      </m:sSub>
-                    </m:e>
-                  </m:acc>
-                </m:e>
-              </m:mr>
-            </m:m>
-          </m:e>
-        </m:d>
-        <m:r>
-          <m:t xml:space="preserve">+ </m:t>
-        </m:r>
-        <m:d>
-          <m:dPr>
-            <m:begChr m:val="["/>
-            <m:endChr m:val="]"/>
-            <m:ctrlPr/>
-          </m:dPr>
-          <m:e>
-            <m:m>
-              <m:mPr>
-                <m:mcs>
-                  <m:mc>
-                    <m:mcPr>
-                      <m:count m:val="1"/>
-                      <m:mcJc m:val="center"/>
-                    </m:mcPr>
-                  </m:mc>
-                </m:mcs>
-                <m:ctrlPr/>
-              </m:mPr>
-              <m:mr>
-                <m:e>
-                  <m:sSub>
-                    <m:sSubPr>
-                      <m:ctrlPr/>
-                    </m:sSubPr>
-                    <m:e>
-                      <m:r>
-                        <m:t>x</m:t>
-                      </m:r>
-                    </m:e>
-                    <m:sub>
-                      <m:r>
-                        <m:t>0</m:t>
-                      </m:r>
-                    </m:sub>
-                  </m:sSub>
-                </m:e>
-              </m:mr>
-              <m:mr>
-                <m:e>
-                  <m:sSub>
-                    <m:sSubPr>
-                      <m:ctrlPr/>
-                    </m:sSubPr>
-                    <m:e>
-                      <m:r>
-                        <m:t>y</m:t>
-                      </m:r>
-                    </m:e>
-                    <m:sub>
-                      <m:r>
-                        <m:t>0</m:t>
-                      </m:r>
-                    </m:sub>
-                  </m:sSub>
-                </m:e>
-              </m:mr>
-              <m:mr>
-                <m:e>
-                  <m:sSub>
-                    <m:sSubPr>
-                      <m:ctrlPr/>
-                    </m:sSubPr>
-                    <m:e>
-                      <m:r>
-                        <m:t>z</m:t>
-                      </m:r>
-                    </m:e>
-                    <m:sub>
-                      <m:r>
-                        <m:t>0</m:t>
-                      </m:r>
-                    </m:sub>
-                  </m:sSub>
-                </m:e>
-              </m:mr>
-            </m:m>
-          </m:e>
-        </m:d>
-      </m:oMath>
-      <w:r>
-        <w:tab/>
-      </w:r>
-      <w:r>
-        <w:rPr>
-          <w:rFonts w:ascii="Trebuchet MS" w:hAnsi="Trebuchet MS"/>
-          <w:b/>
-        </w:rPr>
-        <w:t>(1)</w:t>
-      </w:r>
-    </w:p>
-    <w:p>
-      <w:pPr>
-        <w:ind w:left="567"/>
-      </w:pPr>
-    </w:p>
-    <w:p>
-      <w:pPr>
-        <w:pStyle w:val="Equation"/>
-        <w:rPr>
-          <w:rFonts w:ascii="Trebuchet MS" w:hAnsi="Trebuchet MS"/>
-          <w:b/>
-        </w:rPr>
-      </w:pPr>
-      <m:oMath>
-        <m:d>
-          <m:dPr>
-            <m:begChr m:val="["/>
-            <m:endChr m:val="]"/>
-            <m:ctrlPr/>
-          </m:dPr>
-          <m:e>
-            <m:m>
-              <m:mPr>
-                <m:mcs>
-                  <m:mc>
-                    <m:mcPr>
-                      <m:count m:val="1"/>
-                      <m:mcJc m:val="center"/>
-                    </m:mcPr>
-                  </m:mc>
-                </m:mcs>
-                <m:ctrlPr/>
-              </m:mPr>
-              <m:mr>
-                <m:e>
-                  <m:acc>
-                    <m:accPr>
-                      <m:chr m:val="̇"/>
-                      <m:ctrlPr/>
-                    </m:accPr>
-                    <m:e>
-                      <m:r>
-                        <m:t>x</m:t>
-                      </m:r>
-                    </m:e>
-                  </m:acc>
-                </m:e>
-              </m:mr>
-              <m:mr>
-                <m:e>
-                  <m:acc>
-                    <m:accPr>
-                      <m:chr m:val="̇"/>
-                      <m:ctrlPr/>
-                    </m:accPr>
-                    <m:e>
-                      <m:r>
-                        <m:t>y</m:t>
-                      </m:r>
-                    </m:e>
-                  </m:acc>
-                </m:e>
-              </m:mr>
-              <m:mr>
-                <m:e>
-                  <m:acc>
-                    <m:accPr>
-                      <m:chr m:val="̇"/>
-                      <m:ctrlPr/>
-                    </m:accPr>
-                    <m:e>
-                      <m:r>
-                        <m:t>z</m:t>
-                      </m:r>
-                    </m:e>
-                  </m:acc>
-                </m:e>
-              </m:mr>
-            </m:m>
-          </m:e>
-        </m:d>
-        <m:r>
-          <m:t xml:space="preserve"> =</m:t>
-        </m:r>
-        <m:d>
-          <m:dPr>
-            <m:begChr m:val="["/>
-            <m:endChr m:val="]"/>
-            <m:ctrlPr/>
-          </m:dPr>
-          <m:e>
-            <m:m>
-              <m:mPr>
-                <m:mcs>
-                  <m:mc>
-                    <m:mcPr>
-                      <m:count m:val="1"/>
-                      <m:mcJc m:val="center"/>
-                    </m:mcPr>
-                  </m:mc>
-                </m:mcs>
-                <m:ctrlPr/>
-              </m:mPr>
-              <m:mr>
-                <m:e>
-                  <m:f>
-                    <m:fPr>
-                      <m:ctrlPr/>
-                    </m:fPr>
-                    <m:num>
-                      <m:sSub>
-                        <m:sSubPr>
-                          <m:ctrlPr/>
-                        </m:sSubPr>
-                        <m:e>
-                          <m:r>
-                            <m:t>F</m:t>
-                          </m:r>
-                        </m:e>
-                        <m:sub>
-                          <m:r>
-                            <m:t>x</m:t>
-                          </m:r>
-                        </m:sub>
-                      </m:sSub>
-                    </m:num>
-                    <m:den>
-                      <m:r>
-                        <m:t>m</m:t>
-                      </m:r>
-                    </m:den>
-                  </m:f>
-                </m:e>
-              </m:mr>
-              <m:mr>
-                <m:e>
-                  <m:f>
-                    <m:fPr>
-                      <m:ctrlPr/>
-                    </m:fPr>
-                    <m:num>
-                      <m:sSub>
-                        <m:sSubPr>
-                          <m:ctrlPr/>
-                        </m:sSubPr>
-                        <m:e>
-                          <m:r>
-                            <m:t>F</m:t>
-                          </m:r>
-                        </m:e>
-                        <m:sub>
-                          <m:r>
-                            <m:t>y</m:t>
-                          </m:r>
-                        </m:sub>
-                      </m:sSub>
-                    </m:num>
-                    <m:den>
-                      <m:r>
-                        <m:t>m</m:t>
-                      </m:r>
-                    </m:den>
-                  </m:f>
-                </m:e>
-              </m:mr>
-              <m:mr>
-                <m:e>
-                  <m:f>
-                    <m:fPr>
-                      <m:ctrlPr/>
-                    </m:fPr>
-                    <m:num>
-                      <m:sSub>
-                        <m:sSubPr>
-                          <m:ctrlPr/>
-                        </m:sSubPr>
-                        <m:e>
-                          <m:r>
-                            <m:t>F</m:t>
-                          </m:r>
-                        </m:e>
-                        <m:sub>
-                          <m:r>
-                            <m:t>z</m:t>
-                          </m:r>
-                        </m:sub>
-                      </m:sSub>
-                    </m:num>
-                    <m:den>
-                      <m:r>
-                        <m:t>m</m:t>
-                      </m:r>
-                    </m:den>
-                  </m:f>
-                </m:e>
-              </m:mr>
-            </m:m>
-          </m:e>
-        </m:d>
-        <m:r>
-          <m:t>t+</m:t>
-        </m:r>
-        <m:d>
-          <m:dPr>
-            <m:begChr m:val="["/>
-            <m:endChr m:val="]"/>
-            <m:ctrlPr/>
-          </m:dPr>
-          <m:e>
-            <m:m>
-              <m:mPr>
-                <m:mcs>
-                  <m:mc>
-                    <m:mcPr>
-                      <m:count m:val="1"/>
-                      <m:mcJc m:val="center"/>
-                    </m:mcPr>
-                  </m:mc>
-                </m:mcs>
-                <m:ctrlPr/>
-              </m:mPr>
-              <m:mr>
-                <m:e>
-                  <m:acc>
-                    <m:accPr>
-                      <m:chr m:val="̇"/>
-                      <m:ctrlPr/>
-                    </m:accPr>
-                    <m:e>
-                      <m:sSub>
-                        <m:sSubPr>
-                          <m:ctrlPr/>
-                        </m:sSubPr>
-                        <m:e>
-                          <m:r>
-                            <m:t>x</m:t>
-                          </m:r>
-                        </m:e>
-                        <m:sub>
-                          <m:r>
-                            <m:t>0</m:t>
-                          </m:r>
-                        </m:sub>
-                      </m:sSub>
-                    </m:e>
-                  </m:acc>
-                </m:e>
-              </m:mr>
-              <m:mr>
-                <m:e>
-                  <m:acc>
-                    <m:accPr>
-                      <m:chr m:val="̇"/>
-                      <m:ctrlPr/>
-                    </m:accPr>
-                    <m:e>
-                      <m:sSub>
-                        <m:sSubPr>
-                          <m:ctrlPr/>
-                        </m:sSubPr>
-                        <m:e>
-                          <m:r>
-                            <m:t>y</m:t>
-                          </m:r>
-                        </m:e>
-                        <m:sub>
-                          <m:r>
-                            <m:t>0</m:t>
-                          </m:r>
-                        </m:sub>
-                      </m:sSub>
-                    </m:e>
-                  </m:acc>
-                </m:e>
-              </m:mr>
-              <m:mr>
-                <m:e>
-                  <m:acc>
-                    <m:accPr>
-                      <m:chr m:val="̇"/>
-                      <m:ctrlPr/>
-                    </m:accPr>
-                    <m:e>
-                      <m:sSub>
-                        <m:sSubPr>
-                          <m:ctrlPr/>
-                        </m:sSubPr>
-                        <m:e>
-                          <m:r>
-                            <m:t>z</m:t>
-                          </m:r>
-                        </m:e>
-                        <m:sub>
-                          <m:r>
-                            <m:t>0</m:t>
-                          </m:r>
-                        </m:sub>
-                      </m:sSub>
-                    </m:e>
-                  </m:acc>
-                </m:e>
-              </m:mr>
-            </m:m>
-          </m:e>
-        </m:d>
-      </m:oMath>
-      <w:r>
-        <w:rPr>
-          <w:rFonts w:ascii="Trebuchet MS"/>
-        </w:rPr>
-        <w:tab/>
-      </w:r>
-      <w:r>
-        <w:rPr>
-          <w:rFonts w:ascii="Trebuchet MS" w:hAnsi="Trebuchet MS"/>
-          <w:b/>
-        </w:rPr>
-        <w:t>(2)</w:t>
-      </w:r>
-    </w:p>
-    <w:p>
-      <w:pPr>
-        <w:rPr>
-          <w:szCs w:val="18"/>
-        </w:rPr>
-      </w:pPr>
-    </w:p>
-    <w:p>
-      <w:pPr>
-        <w:pStyle w:val="Heading3"/>
-      </w:pPr>
-      <w:bookmarkStart w:id="22" w:name="_Toc32521141"/>
-      <w:bookmarkStart w:id="23" w:name="_Toc115861780"/>
-      <w:r>
-        <w:t>Equations</w:t>
-      </w:r>
-      <w:bookmarkEnd w:id="22"/>
-      <w:bookmarkEnd w:id="23"/>
-    </w:p>
-    <w:p>
-      <w:r>
-        <w:t xml:space="preserve">Use Trebuchet MS 11 for the text in tables if possible – otherwise scale down to Trebuchet MS 9. Format tables where possible to be the full width of the text. Do not use shading in tables. Header Rows must be in </w:t>
-      </w:r>
-      <w:r>
-        <w:rPr>
-          <w:b/>
-        </w:rPr>
-        <w:t>Bold</w:t>
-      </w:r>
-      <w:r>
-        <w:t>. Try to avoid page breaks in a table, but where unavoidable, use the “Repeat Header Rows” feature. Table captions above the table – see example below</w:t>
-      </w:r>
-    </w:p>
-    <w:p>
-      <w:pPr>
-        <w:pStyle w:val="Caption"/>
-        <w:keepNext/>
-      </w:pPr>
-      <w:bookmarkStart w:id="24" w:name="_Toc41739766"/>
-      <w:r>
-        <w:t xml:space="preserve">Table </w:t>
-      </w:r>
-      <w:r>
-        <w:fldChar w:fldCharType="begin"/>
-      </w:r>
-      <w:r>
-        <w:instrText xml:space="preserve"> SEQ Table \* ARABIC </w:instrText>
-      </w:r>
-      <w:r>
-        <w:fldChar w:fldCharType="separate"/>
-      </w:r>
-      <w:r>
-        <w:rPr>
-          <w:noProof/>
-        </w:rPr>
-        <w:t>1</w:t>
-      </w:r>
-      <w:r>
-        <w:rPr>
-          <w:noProof/>
-        </w:rPr>
-        <w:fldChar w:fldCharType="end"/>
-      </w:r>
-      <w:r>
-        <w:t xml:space="preserve">: Table Caption in Bold, above the table </w:t>
-      </w:r>
-      <w:sdt>
-        <w:sdtPr>
-          <w:rPr>
-            <w:color w:val="FF0000"/>
-            <w:lang w:val="tr-TR"/>
-          </w:rPr>
-          <w:id w:val="2055497987"/>
-          <w:citation/>
-        </w:sdtPr>
-        <w:sdtContent>
-          <w:r>
-            <w:rPr>
-              <w:color w:val="FF0000"/>
-              <w:lang w:val="tr-TR"/>
-            </w:rPr>
-            <w:fldChar w:fldCharType="begin"/>
-          </w:r>
-          <w:r>
-            <w:rPr>
-              <w:color w:val="FF0000"/>
-              <w:lang w:val="tr-TR"/>
-            </w:rPr>
-            <w:instrText xml:space="preserve"> CITATION Mal10 \l 1055 </w:instrText>
-          </w:r>
-          <w:r>
-            <w:rPr>
-              <w:color w:val="FF0000"/>
-              <w:lang w:val="tr-TR"/>
-            </w:rPr>
-            <w:fldChar w:fldCharType="separate"/>
-          </w:r>
-          <w:r>
-            <w:rPr>
-              <w:noProof/>
-              <w:color w:val="FF0000"/>
-              <w:lang w:val="tr-TR"/>
-            </w:rPr>
-            <w:t>(Malhotra &amp; Temponi, 2010)</w:t>
-          </w:r>
-          <w:r>
-            <w:rPr>
-              <w:color w:val="FF0000"/>
-              <w:lang w:val="tr-TR"/>
-            </w:rPr>
-            <w:fldChar w:fldCharType="end"/>
-          </w:r>
-        </w:sdtContent>
-      </w:sdt>
-      <w:bookmarkEnd w:id="24"/>
-    </w:p>
-    <w:tbl>
-      <w:tblPr>
-        <w:tblW w:w="9322" w:type="dxa"/>
-        <w:tblBorders>
-          <w:top w:val="single" w:sz="2" w:space="0" w:color="000000"/>
-          <w:left w:val="single" w:sz="2" w:space="0" w:color="000000"/>
-          <w:bottom w:val="single" w:sz="2" w:space="0" w:color="000000"/>
-          <w:right w:val="single" w:sz="2" w:space="0" w:color="000000"/>
-          <w:insideH w:val="single" w:sz="6" w:space="0" w:color="000000"/>
-          <w:insideV w:val="single" w:sz="6" w:space="0" w:color="000000"/>
-        </w:tblBorders>
-        <w:tblLayout w:type="fixed"/>
-        <w:tblLook w:val="0120" w:firstRow="1" w:lastRow="0" w:firstColumn="0" w:lastColumn="1" w:noHBand="0" w:noVBand="0"/>
-      </w:tblPr>
-      <w:tblGrid>
-        <w:gridCol w:w="5778"/>
-        <w:gridCol w:w="3544"/>
-      </w:tblGrid>
-      <w:tr>
-        <w:trPr>
-          <w:trHeight w:val="278"/>
-        </w:trPr>
-        <w:tc>
-          <w:tcPr>
-            <w:tcW w:w="5778" w:type="dxa"/>
-            <w:tcBorders>
-              <w:top w:val="single" w:sz="2" w:space="0" w:color="000000"/>
-              <w:left w:val="single" w:sz="2" w:space="0" w:color="000000"/>
-              <w:bottom w:val="single" w:sz="6" w:space="0" w:color="000000"/>
-              <w:right w:val="single" w:sz="6" w:space="0" w:color="000000"/>
-            </w:tcBorders>
-            <w:vAlign w:val="center"/>
-            <w:hideMark/>
-          </w:tcPr>
-          <w:p>
-            <w:pPr>
-              <w:rPr>
-                <w:b/>
-                <w:lang w:val="en-US" w:bidi="en-US"/>
-              </w:rPr>
-            </w:pPr>
-            <w:r>
-              <w:rPr>
-                <w:b/>
-              </w:rPr>
-              <w:br w:type="page"/>
-            </w:r>
-            <w:r>
-              <w:rPr>
-                <w:b/>
-              </w:rPr>
-              <w:br w:type="page"/>
-              <w:t>Layout</w:t>
-            </w:r>
-          </w:p>
-        </w:tc>
-        <w:tc>
-          <w:tcPr>
-            <w:tcW w:w="3544" w:type="dxa"/>
-            <w:tcBorders>
-              <w:top w:val="single" w:sz="2" w:space="0" w:color="000000"/>
-              <w:left w:val="single" w:sz="6" w:space="0" w:color="000000"/>
-              <w:bottom w:val="single" w:sz="6" w:space="0" w:color="000000"/>
-              <w:right w:val="single" w:sz="2" w:space="0" w:color="000000"/>
-            </w:tcBorders>
-            <w:vAlign w:val="center"/>
-          </w:tcPr>
-          <w:p>
-            <w:pPr>
-              <w:rPr>
-                <w:b/>
-                <w:lang w:val="en-US" w:bidi="en-US"/>
-              </w:rPr>
-            </w:pPr>
-            <w:r>
-              <w:rPr>
-                <w:b/>
-                <w:lang w:val="en-US" w:bidi="en-US"/>
-              </w:rPr>
-              <w:t>Header 2</w:t>
-            </w:r>
-          </w:p>
-        </w:tc>
-      </w:tr>
-      <w:tr>
-        <w:trPr>
-          <w:trHeight w:val="277"/>
-        </w:trPr>
-        <w:tc>
-          <w:tcPr>
-            <w:tcW w:w="5778" w:type="dxa"/>
-            <w:tcBorders>
-              <w:top w:val="single" w:sz="6" w:space="0" w:color="000000"/>
-              <w:left w:val="single" w:sz="2" w:space="0" w:color="000000"/>
-              <w:bottom w:val="single" w:sz="6" w:space="0" w:color="000000"/>
-              <w:right w:val="single" w:sz="6" w:space="0" w:color="000000"/>
-            </w:tcBorders>
-            <w:vAlign w:val="center"/>
-            <w:hideMark/>
-          </w:tcPr>
-          <w:p>
-            <w:pPr>
-              <w:rPr>
-                <w:lang w:val="en-US" w:bidi="en-US"/>
-              </w:rPr>
-            </w:pPr>
-            <w:r>
-              <w:t>Figures and tables should form an integral part of the paper, according to the author's preferences and should be numbered consecutively in Arabic numbers.</w:t>
-            </w:r>
-          </w:p>
-        </w:tc>
-        <w:tc>
-          <w:tcPr>
-            <w:tcW w:w="3544" w:type="dxa"/>
-            <w:tcBorders>
-              <w:top w:val="single" w:sz="6" w:space="0" w:color="000000"/>
-              <w:left w:val="single" w:sz="6" w:space="0" w:color="000000"/>
-              <w:bottom w:val="single" w:sz="6" w:space="0" w:color="000000"/>
-              <w:right w:val="single" w:sz="2" w:space="0" w:color="000000"/>
-            </w:tcBorders>
-            <w:vAlign w:val="center"/>
-            <w:hideMark/>
-          </w:tcPr>
-          <w:p>
-            <w:pPr>
-              <w:rPr>
-                <w:lang w:val="en-US" w:bidi="en-US"/>
-              </w:rPr>
-            </w:pPr>
-            <w:r>
-              <w:t>Do not use shading</w:t>
-            </w:r>
-          </w:p>
-        </w:tc>
-      </w:tr>
-      <w:tr>
-        <w:trPr>
-          <w:trHeight w:val="277"/>
-        </w:trPr>
-        <w:tc>
-          <w:tcPr>
-            <w:tcW w:w="5778" w:type="dxa"/>
-            <w:tcBorders>
-              <w:top w:val="single" w:sz="6" w:space="0" w:color="000000"/>
-              <w:left w:val="single" w:sz="2" w:space="0" w:color="000000"/>
-              <w:bottom w:val="single" w:sz="2" w:space="0" w:color="000000"/>
-              <w:right w:val="single" w:sz="6" w:space="0" w:color="000000"/>
-            </w:tcBorders>
-            <w:vAlign w:val="center"/>
-            <w:hideMark/>
-          </w:tcPr>
-          <w:p>
-            <w:pPr>
-              <w:rPr>
-                <w:lang w:val="en-US" w:bidi="en-US"/>
-              </w:rPr>
-            </w:pPr>
-            <w:r>
-              <w:t>Photographs must be supplied in TIFF or JPEG format at least 300 dpi for good quality reproduction</w:t>
-            </w:r>
-          </w:p>
-        </w:tc>
-        <w:tc>
-          <w:tcPr>
-            <w:tcW w:w="3544" w:type="dxa"/>
-            <w:tcBorders>
-              <w:top w:val="single" w:sz="6" w:space="0" w:color="000000"/>
-              <w:left w:val="single" w:sz="6" w:space="0" w:color="000000"/>
-              <w:bottom w:val="single" w:sz="2" w:space="0" w:color="000000"/>
-              <w:right w:val="single" w:sz="2" w:space="0" w:color="000000"/>
-            </w:tcBorders>
-            <w:vAlign w:val="center"/>
-          </w:tcPr>
-          <w:p>
-            <w:pPr>
-              <w:rPr>
-                <w:lang w:val="en-US" w:bidi="en-US"/>
-              </w:rPr>
-            </w:pPr>
-          </w:p>
-        </w:tc>
-      </w:tr>
-    </w:tbl>
-    <w:p>
-      <w:r>
-        <w:t xml:space="preserve">Use full justification </w:t>
-      </w:r>
-    </w:p>
-    <w:p>
-      <w:pPr>
-        <w:pStyle w:val="Heading3"/>
-      </w:pPr>
-      <w:bookmarkStart w:id="25" w:name="_Toc32521142"/>
-      <w:bookmarkStart w:id="26" w:name="_Toc115861781"/>
-      <w:r>
-        <w:t>Figures and Photos</w:t>
-      </w:r>
-      <w:bookmarkEnd w:id="25"/>
-      <w:bookmarkEnd w:id="26"/>
-    </w:p>
-    <w:p>
-      <w:r>
-        <w:t>Centre figures and photos, and ensure that the rendering quality is acceptable for the purpose of illustration. Figure captions appear below the figure as shown below.</w:t>
-      </w:r>
-    </w:p>
-    <w:p>
-      <w:pPr>
-        <w:jc w:val="center"/>
-      </w:pPr>
-      <w:r>
-        <w:rPr>
-          <w:noProof/>
-          <w:lang w:val="tr-TR" w:eastAsia="tr-TR"/>
-        </w:rPr>
-        <w:drawing>
-          <wp:inline distT="0" distB="0" distL="0" distR="0" wp14:anchorId="2E22195E" wp14:editId="6D33EE0F">
-            <wp:extent cx="2392219" cy="2220084"/>
-            <wp:effectExtent l="0" t="0" r="8255" b="8890"/>
-            <wp:docPr id="13" name="Picture 3" descr="C:\Users\Johnathan\Documents\Varsity\Varsity Backup\M Thesis\2011-06-15 Baseline\Report\Latex\Report 1.5\Figures\CoordinateMode.png"/>
-            <wp:cNvGraphicFramePr>
-              <a:graphicFrameLocks xmlns:a="http://schemas.openxmlformats.org/drawingml/2006/main" noChangeAspect="1"/>
-            </wp:cNvGraphicFramePr>
-            <a:graphic xmlns:a="http://schemas.openxmlformats.org/drawingml/2006/main">
-              <a:graphicData uri="http://schemas.openxmlformats.org/drawingml/2006/picture">
-                <pic:pic xmlns:pic="http://schemas.openxmlformats.org/drawingml/2006/picture">
-                  <pic:nvPicPr>
-                    <pic:cNvPr id="0" name="Picture 3" descr="C:\Users\Johnathan\Documents\Varsity\Varsity Backup\M Thesis\2011-06-15 Baseline\Report\Latex\Report 1.5\Figures\CoordinateMode.png"/>
-                    <pic:cNvPicPr>
-                      <a:picLocks noChangeAspect="1" noChangeArrowheads="1"/>
-                    </pic:cNvPicPr>
-                  </pic:nvPicPr>
-                  <pic:blipFill>
-                    <a:blip r:embed="rId9">
-                      <a:extLst>
-                        <a:ext uri="{28A0092B-C50C-407E-A947-70E740481C1C}">
-                          <a14:useLocalDpi xmlns:a14="http://schemas.microsoft.com/office/drawing/2010/main" val="0"/>
-                        </a:ext>
-                      </a:extLst>
-                    </a:blip>
-                    <a:srcRect/>
-                    <a:stretch>
-                      <a:fillRect/>
-                    </a:stretch>
-                  </pic:blipFill>
-                  <pic:spPr bwMode="auto">
-                    <a:xfrm>
-                      <a:off x="0" y="0"/>
-                      <a:ext cx="2402498" cy="2229623"/>
-                    </a:xfrm>
-                    <a:prstGeom prst="rect">
-                      <a:avLst/>
-                    </a:prstGeom>
-                    <a:noFill/>
-                    <a:ln>
-                      <a:noFill/>
-                    </a:ln>
-                  </pic:spPr>
-                </pic:pic>
-              </a:graphicData>
-            </a:graphic>
-          </wp:inline>
-        </w:drawing>
-      </w:r>
-    </w:p>
-    <w:p>
-      <w:pPr>
-        <w:pStyle w:val="Caption"/>
-      </w:pPr>
-      <w:bookmarkStart w:id="27" w:name="_Toc41739637"/>
-      <w:r>
-        <w:t xml:space="preserve">Figure </w:t>
-      </w:r>
-      <w:r>
-        <w:fldChar w:fldCharType="begin"/>
-      </w:r>
-      <w:r>
-        <w:instrText xml:space="preserve"> SEQ Figure \* ARABIC </w:instrText>
-      </w:r>
-      <w:r>
-        <w:fldChar w:fldCharType="separate"/>
-      </w:r>
-      <w:r>
-        <w:rPr>
-          <w:noProof/>
-        </w:rPr>
-        <w:t>2</w:t>
-      </w:r>
-      <w:r>
-        <w:rPr>
-          <w:noProof/>
-        </w:rPr>
-        <w:fldChar w:fldCharType="end"/>
-      </w:r>
-      <w:r>
-        <w:t>: Tool Coordinate System</w:t>
-      </w:r>
-      <w:bookmarkEnd w:id="27"/>
-    </w:p>
-    <w:p>
-      <w:pPr>
-        <w:pStyle w:val="Heading1"/>
-      </w:pPr>
-      <w:bookmarkStart w:id="28" w:name="_Toc115861782"/>
-      <w:r>
-        <w:t>PROBLEM DEFINITION</w:t>
-      </w:r>
-      <w:bookmarkEnd w:id="28"/>
-    </w:p>
-    <w:p>
-      <w:r>
-        <w:t>……….fdfdfdf</w:t>
-      </w:r>
-    </w:p>
-    <w:p>
-      <w:pPr>
-        <w:pStyle w:val="Heading1"/>
-      </w:pPr>
-      <w:bookmarkStart w:id="29" w:name="_Toc115861783"/>
-      <w:r>
-        <w:t>SOLUTION APPROACH</w:t>
-      </w:r>
-      <w:bookmarkEnd w:id="29"/>
-    </w:p>
-    <w:p>
-      <w:r>
-        <w:t>……….fdfdfdf</w:t>
-      </w:r>
-    </w:p>
-    <w:p>
-      <w:pPr>
-        <w:pStyle w:val="Heading1"/>
-      </w:pPr>
-      <w:bookmarkStart w:id="30" w:name="_Toc115861784"/>
-      <w:r>
-        <w:t>REQUIRED TOOLS</w:t>
-      </w:r>
-      <w:bookmarkEnd w:id="30"/>
-    </w:p>
-    <w:p>
-      <w:r>
-        <w:lastRenderedPageBreak/>
-        <w:t>……….fdfdfdf</w:t>
-      </w:r>
-    </w:p>
-    <w:p>
-      <w:pPr>
-        <w:pStyle w:val="Heading1"/>
-      </w:pPr>
-      <w:bookmarkStart w:id="31" w:name="_Toc115861785"/>
-      <w:r>
-        <w:t>SYSTEM / MODEL &amp; SOLUTION DEVELOPMENT</w:t>
-      </w:r>
-      <w:bookmarkEnd w:id="31"/>
-    </w:p>
-    <w:p>
-      <w:r>
-        <w:t>……….fdfdfdf</w:t>
-      </w:r>
-    </w:p>
-    <w:p/>
-    <w:p>
-      <w:pPr>
-        <w:pStyle w:val="Heading1"/>
-      </w:pPr>
-      <w:bookmarkStart w:id="32" w:name="_Toc115861786"/>
-      <w:r>
-        <w:t>CASE STUDY / BUSINESS CASE</w:t>
-      </w:r>
-      <w:bookmarkEnd w:id="32"/>
-    </w:p>
-    <w:p>
-      <w:r>
-        <w:t>……….fdfdfdf</w:t>
-      </w:r>
-    </w:p>
-    <w:p>
-      <w:pPr>
-        <w:pStyle w:val="Heading1"/>
-      </w:pPr>
-      <w:bookmarkStart w:id="33" w:name="_Toc115861787"/>
-      <w:r>
-        <w:t>CONCLUSIONs</w:t>
-      </w:r>
-      <w:bookmarkEnd w:id="33"/>
-    </w:p>
-    <w:p>
-      <w:r>
-        <w:t>……….fdfdfdf</w:t>
-      </w:r>
+        <w:t>……</w:t>
+      </w:r>
+      <w:proofErr w:type="gramStart"/>
+      <w:r>
+        <w:t>….</w:t>
+      </w:r>
+      <w:proofErr w:type="spellStart"/>
+      <w:r>
+        <w:t>fdfdfdf</w:t>
+      </w:r>
+      <w:proofErr w:type="spellEnd"/>
+      <w:proofErr w:type="gramEnd"/>
     </w:p>
     <w:p/>
     <w:p>
@@ -5270,12 +4527,13 @@
           <w:noProof/>
           <w:lang w:val="tr-TR"/>
         </w:rPr>
+        <w:lastRenderedPageBreak/>
         <w:t>-------</w:t>
       </w:r>
     </w:p>
-    <w:bookmarkStart w:id="34" w:name="_Toc115861788" w:displacedByCustomXml="next"/>
-    <w:bookmarkStart w:id="35" w:name="_Toc494826192" w:displacedByCustomXml="next"/>
-    <w:bookmarkStart w:id="36" w:name="_Toc32521151" w:displacedByCustomXml="next"/>
+    <w:bookmarkStart w:id="22" w:name="_Toc115861788" w:displacedByCustomXml="next"/>
+    <w:bookmarkStart w:id="23" w:name="_Toc494826192" w:displacedByCustomXml="next"/>
+    <w:bookmarkStart w:id="24" w:name="_Toc32521151" w:displacedByCustomXml="next"/>
     <w:sdt>
       <w:sdtPr>
         <w:rPr>
@@ -5303,9 +4561,9 @@
             </w:rPr>
             <w:t>REFERENCES</w:t>
           </w:r>
-          <w:bookmarkEnd w:id="36"/>
-          <w:bookmarkEnd w:id="35"/>
-          <w:bookmarkEnd w:id="34"/>
+          <w:bookmarkEnd w:id="24"/>
+          <w:bookmarkEnd w:id="23"/>
+          <w:bookmarkEnd w:id="22"/>
         </w:p>
         <w:p>
           <w:pPr>
@@ -5745,7 +5003,6 @@
             <w:rPr>
               <w:noProof/>
             </w:rPr>
-            <w:lastRenderedPageBreak/>
             <w:t xml:space="preserve">Stamford, C. (2014, Ocak 29). </w:t>
           </w:r>
           <w:r>
@@ -5964,6 +5221,7 @@
           <w:noProof/>
           <w:lang w:val="tr-TR"/>
         </w:rPr>
+        <w:lastRenderedPageBreak/>
         <w:t>--</w:t>
       </w:r>
     </w:p>
@@ -5976,7 +5234,7 @@
           <w:caps/>
         </w:rPr>
       </w:pPr>
-      <w:bookmarkStart w:id="37" w:name="_Toc41690539"/>
+      <w:bookmarkStart w:id="25" w:name="_Toc41690539"/>
       <w:r>
         <w:br w:type="page"/>
       </w:r>
@@ -5985,12 +5243,20 @@
       <w:pPr>
         <w:pStyle w:val="Heading1"/>
       </w:pPr>
-      <w:bookmarkStart w:id="38" w:name="_Toc115861789"/>
+      <w:bookmarkStart w:id="26" w:name="_Toc115861789"/>
       <w:r>
         <w:lastRenderedPageBreak/>
-        <w:t>GIT/KAGGLE/COLAB/etc.. LINK</w:t>
-      </w:r>
-      <w:bookmarkEnd w:id="38"/>
+        <w:t>GIT/KAGGLE/COLAB/</w:t>
+      </w:r>
+      <w:proofErr w:type="gramStart"/>
+      <w:r>
+        <w:t>etc..</w:t>
+      </w:r>
+      <w:proofErr w:type="gramEnd"/>
+      <w:r>
+        <w:t xml:space="preserve"> LINK</w:t>
+      </w:r>
+      <w:bookmarkEnd w:id="26"/>
     </w:p>
     <w:p>
       <w:pPr>
@@ -6025,13 +5291,13 @@
       <w:pPr>
         <w:pStyle w:val="Heading1"/>
       </w:pPr>
-      <w:bookmarkStart w:id="39" w:name="_Toc115861790"/>
+      <w:bookmarkStart w:id="27" w:name="_Toc115861790"/>
       <w:r>
         <w:lastRenderedPageBreak/>
         <w:t>CURRICULUM VITAE</w:t>
       </w:r>
-      <w:bookmarkEnd w:id="37"/>
-      <w:bookmarkEnd w:id="39"/>
+      <w:bookmarkEnd w:id="25"/>
+      <w:bookmarkEnd w:id="27"/>
     </w:p>
     <w:p>
       <w:pPr>
@@ -6065,6 +5331,7 @@
           <w:lang w:val="en-US" w:eastAsia="tr-TR"/>
         </w:rPr>
       </w:pPr>
+      <w:proofErr w:type="gramStart"/>
       <w:r>
         <w:rPr>
           <w:b/>
@@ -6072,6 +5339,7 @@
         </w:rPr>
         <w:t>Education :</w:t>
       </w:r>
+      <w:proofErr w:type="gramEnd"/>
     </w:p>
     <w:p>
       <w:pPr>
@@ -6079,6 +5347,7 @@
           <w:lang w:val="en-US" w:eastAsia="tr-TR"/>
         </w:rPr>
       </w:pPr>
+      <w:proofErr w:type="gramStart"/>
       <w:r>
         <w:rPr>
           <w:i/>
@@ -6091,7 +5360,14 @@
         <w:rPr>
           <w:lang w:val="en-US" w:eastAsia="tr-TR"/>
         </w:rPr>
-        <w:t xml:space="preserve"> : Piri Reis University </w:t>
+        <w:t xml:space="preserve"> :</w:t>
+      </w:r>
+      <w:proofErr w:type="gramEnd"/>
+      <w:r>
+        <w:rPr>
+          <w:lang w:val="en-US" w:eastAsia="tr-TR"/>
+        </w:rPr>
+        <w:t xml:space="preserve"> Piri Reis University </w:t>
       </w:r>
     </w:p>
     <w:p>
@@ -6653,10 +5929,10 @@
       </w:pPr>
     </w:p>
     <w:sectPr>
-      <w:headerReference w:type="default" r:id="rId10"/>
-      <w:footerReference w:type="even" r:id="rId11"/>
-      <w:footerReference w:type="default" r:id="rId12"/>
-      <w:footerReference w:type="first" r:id="rId13"/>
+      <w:headerReference w:type="default" r:id="rId9"/>
+      <w:footerReference w:type="even" r:id="rId10"/>
+      <w:footerReference w:type="default" r:id="rId11"/>
+      <w:footerReference w:type="first" r:id="rId12"/>
       <w:footnotePr>
         <w:numFmt w:val="chicago"/>
       </w:footnotePr>
@@ -6788,7 +6064,15 @@
       <w:t>South African Journal of Industrial Engineering</w:t>
     </w:r>
     <w:r>
-      <w:t xml:space="preserve"> Month Year Vol __(_):  p1-3</w:t>
+      <w:t xml:space="preserve"> Month Year Vol _</w:t>
+    </w:r>
+    <w:proofErr w:type="gramStart"/>
+    <w:r>
+      <w:t>_(</w:t>
+    </w:r>
+    <w:proofErr w:type="gramEnd"/>
+    <w:r>
+      <w:t>_):  p1-3</w:t>
     </w:r>
   </w:p>
 </w:ftr>

</xml_diff>

<commit_message>
Restore required tools section
</commit_message>
<xml_diff>
--- a/docs/graduation_thesis_report.docx
+++ b/docs/graduation_thesis_report.docx
@@ -4398,19 +4398,581 @@
     </w:p>
     <w:p>
       <w:r>
-        <w:t>……</w:t>
+        <w:t>This project was developed by using Python-based data analysis and dashboard development tools. The selected tools were chosen because they are open-source, widely used, and suitable for building a supply chain analytics prototype.</w:t>
+      </w:r>
+    </w:p>
+    <w:p>
+      <w:pPr>
+        <w:pStyle w:val="Heading2"/>
+      </w:pPr>
+      <w:r>
+        <w:t>Programming and Development Environment</w:t>
+      </w:r>
+      <w:r>
+        <w:t xml:space="preserve"> </w:t>
+      </w:r>
+    </w:p>
+    <w:p>
+      <w:r>
+        <w:t>Python was used as the main programming language of the project. It was used for data cleaning, data transformation, KPI calculation, risk score generation, demand forecasting, and dashboard development. Visual Studio Code was used as the development environment for writing and editing the project files.</w:t>
+      </w:r>
+      <w:r>
+        <w:br/>
+      </w:r>
+      <w:r>
+        <w:br/>
+        <w:t xml:space="preserve">The project was developed as a local </w:t>
+      </w:r>
+      <w:proofErr w:type="spellStart"/>
+      <w:r>
+        <w:t>Streamlit</w:t>
+      </w:r>
+      <w:proofErr w:type="spellEnd"/>
+      <w:r>
+        <w:t xml:space="preserve"> application. A Windows batch file was also created to make the project easier to run. This file automatically creates the virtual environment if needed, installs the required packages, processes the default dataset, and starts the dashboard.</w:t>
+      </w:r>
+    </w:p>
+    <w:p>
+      <w:pPr>
+        <w:pStyle w:val="Heading2"/>
+      </w:pPr>
+      <w:r>
+        <w:t>Data Processing and Analysis Tools</w:t>
+      </w:r>
+    </w:p>
+    <w:p>
+      <w:r>
+        <w:t xml:space="preserve">pandas </w:t>
       </w:r>
       <w:proofErr w:type="gramStart"/>
       <w:r>
-        <w:t>….</w:t>
-      </w:r>
+        <w:t>was</w:t>
+      </w:r>
+      <w:proofErr w:type="gramEnd"/>
+      <w:r>
+        <w:t xml:space="preserve"> used for reading CSV and Excel files, cleaning the dataset, grouping records, calculating KPIs, and creating analytical tables. NumPy was used for numerical calculations and handling missing numerical values.</w:t>
+      </w:r>
+      <w:r>
+        <w:br/>
+      </w:r>
+      <w:r>
+        <w:br/>
+      </w:r>
+      <w:r>
+        <w:lastRenderedPageBreak/>
+        <w:t>SQLite was used as a lightweight database solution for storing the processed default dataset. The processed data files were also saved as CSV files so that the dashboard could load them easily.</w:t>
+      </w:r>
+    </w:p>
+    <w:p>
+      <w:pPr>
+        <w:pStyle w:val="Heading2"/>
+      </w:pPr>
+      <w:r>
+        <w:t>Dashboard and Visualization Tools</w:t>
+      </w:r>
+      <w:r>
+        <w:t xml:space="preserve"> </w:t>
+      </w:r>
+    </w:p>
+    <w:p>
       <w:proofErr w:type="spellStart"/>
       <w:r>
-        <w:t>fdfdfdf</w:t>
+        <w:t>Streamlit</w:t>
       </w:r>
       <w:proofErr w:type="spellEnd"/>
-      <w:proofErr w:type="gramEnd"/>
-    </w:p>
+      <w:r>
+        <w:t xml:space="preserve"> was used to develop the interactive dashboard interface. It allowed the project to include different pages, filters, file upload components, KPI cards, charts, and tables.</w:t>
+      </w:r>
+      <w:r>
+        <w:br/>
+      </w:r>
+      <w:r>
+        <w:br/>
+        <w:t>Plotly was used for creating interactive charts such as bar charts, line charts, heatmaps, and risk visualizations. These visualizations help users understand supply chain performance and risk indicators more easily.</w:t>
+      </w:r>
+    </w:p>
+    <w:p>
+      <w:pPr>
+        <w:pStyle w:val="Heading2"/>
+      </w:pPr>
+      <w:r>
+        <w:t>Forecasting and Version Control Tools</w:t>
+      </w:r>
+      <w:r>
+        <w:t xml:space="preserve"> </w:t>
+      </w:r>
+    </w:p>
+    <w:p>
+      <w:r>
+        <w:t>scikit-learn was used for the linear regression model in the demand forecasting module. The project also uses a simple moving average method to compare forecasting results.</w:t>
+      </w:r>
+      <w:r>
+        <w:br/>
+      </w:r>
+      <w:r>
+        <w:br/>
+        <w:t>Git and GitHub were used for version control, project backup, and documentation. GitHub also makes it easier to share the project files, screenshots, diagrams, and source code.</w:t>
+      </w:r>
+    </w:p>
+    <w:p>
+      <w:pPr>
+        <w:jc w:val="center"/>
+        <w:rPr>
+          <w:b/>
+          <w:bCs/>
+        </w:rPr>
+      </w:pPr>
+      <w:r>
+        <w:rPr>
+          <w:b/>
+          <w:bCs/>
+        </w:rPr>
+        <w:t>Table 1: Required Tools and Technologies Used in the Project</w:t>
+      </w:r>
+    </w:p>
+    <w:tbl>
+      <w:tblPr>
+        <w:tblStyle w:val="TableGrid"/>
+        <w:tblW w:w="5000" w:type="pct"/>
+        <w:tblLook w:val="04A0" w:firstRow="1" w:lastRow="0" w:firstColumn="1" w:lastColumn="0" w:noHBand="0" w:noVBand="1"/>
+      </w:tblPr>
+      <w:tblGrid>
+        <w:gridCol w:w="2308"/>
+        <w:gridCol w:w="2308"/>
+        <w:gridCol w:w="2308"/>
+        <w:gridCol w:w="2308"/>
+      </w:tblGrid>
+      <w:tr>
+        <w:tc>
+          <w:tcPr>
+            <w:tcW w:w="1250" w:type="pct"/>
+          </w:tcPr>
+          <w:p>
+            <w:pPr>
+              <w:rPr>
+                <w:b/>
+                <w:bCs/>
+                <w:lang w:val="en-US"/>
+              </w:rPr>
+            </w:pPr>
+            <w:r>
+              <w:rPr>
+                <w:b/>
+                <w:bCs/>
+              </w:rPr>
+              <w:t xml:space="preserve">Tool </w:t>
+            </w:r>
+            <w:r>
+              <w:rPr>
+                <w:b/>
+                <w:bCs/>
+                <w:lang w:val="en-US"/>
+              </w:rPr>
+              <w:t>/ Library</w:t>
+            </w:r>
+          </w:p>
+        </w:tc>
+        <w:tc>
+          <w:tcPr>
+            <w:tcW w:w="1250" w:type="pct"/>
+          </w:tcPr>
+          <w:p>
+            <w:pPr>
+              <w:rPr>
+                <w:b/>
+                <w:bCs/>
+              </w:rPr>
+            </w:pPr>
+            <w:r>
+              <w:rPr>
+                <w:b/>
+                <w:bCs/>
+              </w:rPr>
+              <w:t>Type</w:t>
+            </w:r>
+          </w:p>
+        </w:tc>
+        <w:tc>
+          <w:tcPr>
+            <w:tcW w:w="1250" w:type="pct"/>
+          </w:tcPr>
+          <w:p>
+            <w:pPr>
+              <w:rPr>
+                <w:b/>
+                <w:bCs/>
+              </w:rPr>
+            </w:pPr>
+            <w:r>
+              <w:rPr>
+                <w:b/>
+                <w:bCs/>
+              </w:rPr>
+              <w:t>Purpose</w:t>
+            </w:r>
+          </w:p>
+        </w:tc>
+        <w:tc>
+          <w:tcPr>
+            <w:tcW w:w="1250" w:type="pct"/>
+          </w:tcPr>
+          <w:p>
+            <w:pPr>
+              <w:rPr>
+                <w:b/>
+                <w:bCs/>
+              </w:rPr>
+            </w:pPr>
+            <w:r>
+              <w:rPr>
+                <w:b/>
+                <w:bCs/>
+              </w:rPr>
+              <w:t>Used In</w:t>
+            </w:r>
+          </w:p>
+        </w:tc>
+      </w:tr>
+      <w:tr>
+        <w:tc>
+          <w:tcPr>
+            <w:tcW w:w="1250" w:type="pct"/>
+          </w:tcPr>
+          <w:p>
+            <w:r>
+              <w:t>Python</w:t>
+            </w:r>
+          </w:p>
+        </w:tc>
+        <w:tc>
+          <w:tcPr>
+            <w:tcW w:w="1250" w:type="pct"/>
+          </w:tcPr>
+          <w:p>
+            <w:r>
+              <w:t>Programming Language</w:t>
+            </w:r>
+          </w:p>
+        </w:tc>
+        <w:tc>
+          <w:tcPr>
+            <w:tcW w:w="1250" w:type="pct"/>
+          </w:tcPr>
+          <w:p>
+            <w:r>
+              <w:t>Data processing, risk scoring, forecasting, dashboard logic</w:t>
+            </w:r>
+          </w:p>
+        </w:tc>
+        <w:tc>
+          <w:tcPr>
+            <w:tcW w:w="1250" w:type="pct"/>
+          </w:tcPr>
+          <w:p>
+            <w:r>
+              <w:t>Whole project</w:t>
+            </w:r>
+          </w:p>
+        </w:tc>
+      </w:tr>
+      <w:tr>
+        <w:tc>
+          <w:tcPr>
+            <w:tcW w:w="1250" w:type="pct"/>
+          </w:tcPr>
+          <w:p>
+            <w:proofErr w:type="spellStart"/>
+            <w:r>
+              <w:t>Streamlit</w:t>
+            </w:r>
+            <w:proofErr w:type="spellEnd"/>
+          </w:p>
+        </w:tc>
+        <w:tc>
+          <w:tcPr>
+            <w:tcW w:w="1250" w:type="pct"/>
+          </w:tcPr>
+          <w:p>
+            <w:r>
+              <w:t>Dashboard Framework</w:t>
+            </w:r>
+          </w:p>
+        </w:tc>
+        <w:tc>
+          <w:tcPr>
+            <w:tcW w:w="1250" w:type="pct"/>
+          </w:tcPr>
+          <w:p>
+            <w:r>
+              <w:t>Interactive dashboard pages, filters, file upload, KPI cards</w:t>
+            </w:r>
+          </w:p>
+        </w:tc>
+        <w:tc>
+          <w:tcPr>
+            <w:tcW w:w="1250" w:type="pct"/>
+          </w:tcPr>
+          <w:p>
+            <w:r>
+              <w:t>Dashboard interface</w:t>
+            </w:r>
+          </w:p>
+        </w:tc>
+      </w:tr>
+      <w:tr>
+        <w:tc>
+          <w:tcPr>
+            <w:tcW w:w="1250" w:type="pct"/>
+          </w:tcPr>
+          <w:p>
+            <w:r>
+              <w:t>pandas</w:t>
+            </w:r>
+          </w:p>
+        </w:tc>
+        <w:tc>
+          <w:tcPr>
+            <w:tcW w:w="1250" w:type="pct"/>
+          </w:tcPr>
+          <w:p>
+            <w:r>
+              <w:t>Data Analysis Library</w:t>
+            </w:r>
+          </w:p>
+        </w:tc>
+        <w:tc>
+          <w:tcPr>
+            <w:tcW w:w="1250" w:type="pct"/>
+          </w:tcPr>
+          <w:p>
+            <w:r>
+              <w:t>Reading datasets, cleaning data, grouping, KPI calculation</w:t>
+            </w:r>
+          </w:p>
+        </w:tc>
+        <w:tc>
+          <w:tcPr>
+            <w:tcW w:w="1250" w:type="pct"/>
+          </w:tcPr>
+          <w:p>
+            <w:r>
+              <w:t>Data processing</w:t>
+            </w:r>
+          </w:p>
+        </w:tc>
+      </w:tr>
+      <w:tr>
+        <w:tc>
+          <w:tcPr>
+            <w:tcW w:w="1250" w:type="pct"/>
+          </w:tcPr>
+          <w:p>
+            <w:r>
+              <w:t>NumPy</w:t>
+            </w:r>
+          </w:p>
+        </w:tc>
+        <w:tc>
+          <w:tcPr>
+            <w:tcW w:w="1250" w:type="pct"/>
+          </w:tcPr>
+          <w:p>
+            <w:r>
+              <w:t>Numerical Library</w:t>
+            </w:r>
+          </w:p>
+        </w:tc>
+        <w:tc>
+          <w:tcPr>
+            <w:tcW w:w="1250" w:type="pct"/>
+          </w:tcPr>
+          <w:p>
+            <w:r>
+              <w:t>Numerical operations and missing value handling</w:t>
+            </w:r>
+          </w:p>
+        </w:tc>
+        <w:tc>
+          <w:tcPr>
+            <w:tcW w:w="1250" w:type="pct"/>
+          </w:tcPr>
+          <w:p>
+            <w:r>
+              <w:t>Data processing</w:t>
+            </w:r>
+          </w:p>
+        </w:tc>
+      </w:tr>
+      <w:tr>
+        <w:tc>
+          <w:tcPr>
+            <w:tcW w:w="1250" w:type="pct"/>
+          </w:tcPr>
+          <w:p>
+            <w:r>
+              <w:t>Plotly</w:t>
+            </w:r>
+          </w:p>
+        </w:tc>
+        <w:tc>
+          <w:tcPr>
+            <w:tcW w:w="1250" w:type="pct"/>
+          </w:tcPr>
+          <w:p>
+            <w:r>
+              <w:t>Visualization Library</w:t>
+            </w:r>
+          </w:p>
+        </w:tc>
+        <w:tc>
+          <w:tcPr>
+            <w:tcW w:w="1250" w:type="pct"/>
+          </w:tcPr>
+          <w:p>
+            <w:r>
+              <w:t>Interactive charts and dashboard visuals</w:t>
+            </w:r>
+          </w:p>
+        </w:tc>
+        <w:tc>
+          <w:tcPr>
+            <w:tcW w:w="1250" w:type="pct"/>
+          </w:tcPr>
+          <w:p>
+            <w:r>
+              <w:t>Dashboard pages</w:t>
+            </w:r>
+          </w:p>
+        </w:tc>
+      </w:tr>
+      <w:tr>
+        <w:tc>
+          <w:tcPr>
+            <w:tcW w:w="1250" w:type="pct"/>
+          </w:tcPr>
+          <w:p>
+            <w:r>
+              <w:t>scikit-learn</w:t>
+            </w:r>
+          </w:p>
+        </w:tc>
+        <w:tc>
+          <w:tcPr>
+            <w:tcW w:w="1250" w:type="pct"/>
+          </w:tcPr>
+          <w:p>
+            <w:r>
+              <w:t>Machine Learning Library</w:t>
+            </w:r>
+          </w:p>
+        </w:tc>
+        <w:tc>
+          <w:tcPr>
+            <w:tcW w:w="1250" w:type="pct"/>
+          </w:tcPr>
+          <w:p>
+            <w:r>
+              <w:t>Linear regression forecasting model</w:t>
+            </w:r>
+          </w:p>
+        </w:tc>
+        <w:tc>
+          <w:tcPr>
+            <w:tcW w:w="1250" w:type="pct"/>
+          </w:tcPr>
+          <w:p>
+            <w:r>
+              <w:t>Demand Forecast module</w:t>
+            </w:r>
+          </w:p>
+        </w:tc>
+      </w:tr>
+      <w:tr>
+        <w:tc>
+          <w:tcPr>
+            <w:tcW w:w="1250" w:type="pct"/>
+          </w:tcPr>
+          <w:p>
+            <w:r>
+              <w:t>SQLite</w:t>
+            </w:r>
+          </w:p>
+        </w:tc>
+        <w:tc>
+          <w:tcPr>
+            <w:tcW w:w="1250" w:type="pct"/>
+          </w:tcPr>
+          <w:p>
+            <w:r>
+              <w:t>Database</w:t>
+            </w:r>
+          </w:p>
+        </w:tc>
+        <w:tc>
+          <w:tcPr>
+            <w:tcW w:w="1250" w:type="pct"/>
+          </w:tcPr>
+          <w:p>
+            <w:r>
+              <w:t>Lightweight storage for processed default data</w:t>
+            </w:r>
+          </w:p>
+        </w:tc>
+        <w:tc>
+          <w:tcPr>
+            <w:tcW w:w="1250" w:type="pct"/>
+          </w:tcPr>
+          <w:p>
+            <w:r>
+              <w:t>Processed data storage</w:t>
+            </w:r>
+          </w:p>
+        </w:tc>
+      </w:tr>
+      <w:tr>
+        <w:tc>
+          <w:tcPr>
+            <w:tcW w:w="1250" w:type="pct"/>
+          </w:tcPr>
+          <w:p>
+            <w:r>
+              <w:t>Git / GitHub</w:t>
+            </w:r>
+          </w:p>
+        </w:tc>
+        <w:tc>
+          <w:tcPr>
+            <w:tcW w:w="1250" w:type="pct"/>
+          </w:tcPr>
+          <w:p>
+            <w:r>
+              <w:t>Version Control</w:t>
+            </w:r>
+          </w:p>
+        </w:tc>
+        <w:tc>
+          <w:tcPr>
+            <w:tcW w:w="1250" w:type="pct"/>
+          </w:tcPr>
+          <w:p>
+            <w:r>
+              <w:t>Project backup, version tracking, sharing project files</w:t>
+            </w:r>
+          </w:p>
+        </w:tc>
+        <w:tc>
+          <w:tcPr>
+            <w:tcW w:w="1250" w:type="pct"/>
+          </w:tcPr>
+          <w:p>
+            <w:r>
+              <w:t>Documentation and development</w:t>
+            </w:r>
+          </w:p>
+        </w:tc>
+      </w:tr>
+    </w:tbl>
+    <w:p/>
     <w:p>
       <w:pPr>
         <w:pStyle w:val="Heading1"/>
@@ -4527,7 +5089,6 @@
           <w:noProof/>
           <w:lang w:val="tr-TR"/>
         </w:rPr>
-        <w:lastRenderedPageBreak/>
         <w:t>-------</w:t>
       </w:r>
     </w:p>
@@ -5148,6 +5709,7 @@
             <w:rPr>
               <w:noProof/>
             </w:rPr>
+            <w:lastRenderedPageBreak/>
             <w:t xml:space="preserve">URL_03. (2015, 06). </w:t>
           </w:r>
           <w:r>
@@ -5221,7 +5783,6 @@
           <w:noProof/>
           <w:lang w:val="tr-TR"/>
         </w:rPr>
-        <w:lastRenderedPageBreak/>
         <w:t>--</w:t>
       </w:r>
     </w:p>

</xml_diff>

<commit_message>
Add system development architecture and schema sections
</commit_message>
<xml_diff>
--- a/docs/graduation_thesis_report.docx
+++ b/docs/graduation_thesis_report.docx
@@ -315,7 +315,6 @@
         </w:rPr>
         <w:t>G</w:t>
       </w:r>
-      <w:proofErr w:type="spellStart"/>
       <w:r>
         <w:rPr>
           <w:b/>
@@ -324,18 +323,7 @@
           <w:szCs w:val="32"/>
           <w:lang w:val="tr-TR"/>
         </w:rPr>
-        <w:t>ülse</w:t>
-      </w:r>
-      <w:proofErr w:type="spellEnd"/>
-      <w:r>
-        <w:rPr>
-          <w:b/>
-          <w:color w:val="000000" w:themeColor="text1"/>
-          <w:sz w:val="32"/>
-          <w:szCs w:val="32"/>
-          <w:lang w:val="tr-TR"/>
-        </w:rPr>
-        <w:t xml:space="preserve"> Dolunay ÜNLÜ</w:t>
+        <w:t>ülse Dolunay ÜNLÜ</w:t>
       </w:r>
     </w:p>
     <w:p>
@@ -417,7 +405,6 @@
         </w:rPr>
         <w:t xml:space="preserve">Advisor: </w:t>
       </w:r>
-      <w:proofErr w:type="spellStart"/>
       <w:r>
         <w:rPr>
           <w:bCs/>
@@ -426,9 +413,81 @@
           <w:szCs w:val="32"/>
           <w:lang w:val="en-US"/>
         </w:rPr>
-        <w:t>Doç</w:t>
-      </w:r>
-      <w:proofErr w:type="spellEnd"/>
+        <w:t>Doç. Dr. Orhan Özgür AYBAR</w:t>
+      </w:r>
+    </w:p>
+    <w:p>
+      <w:pPr>
+        <w:jc w:val="center"/>
+        <w:rPr>
+          <w:bCs/>
+          <w:sz w:val="32"/>
+          <w:szCs w:val="32"/>
+          <w:lang w:val="en-US"/>
+        </w:rPr>
+      </w:pPr>
+    </w:p>
+    <w:p>
+      <w:pPr>
+        <w:jc w:val="center"/>
+        <w:rPr>
+          <w:bCs/>
+          <w:sz w:val="32"/>
+          <w:szCs w:val="32"/>
+          <w:lang w:val="en-US"/>
+        </w:rPr>
+      </w:pPr>
+    </w:p>
+    <w:p>
+      <w:pPr>
+        <w:jc w:val="center"/>
+        <w:rPr>
+          <w:bCs/>
+          <w:sz w:val="32"/>
+          <w:szCs w:val="32"/>
+          <w:lang w:val="en-US"/>
+        </w:rPr>
+      </w:pPr>
+    </w:p>
+    <w:p>
+      <w:pPr>
+        <w:jc w:val="center"/>
+        <w:rPr>
+          <w:bCs/>
+          <w:sz w:val="32"/>
+          <w:szCs w:val="32"/>
+          <w:lang w:val="en-US"/>
+        </w:rPr>
+      </w:pPr>
+    </w:p>
+    <w:p>
+      <w:pPr>
+        <w:jc w:val="center"/>
+        <w:rPr>
+          <w:bCs/>
+          <w:sz w:val="32"/>
+          <w:szCs w:val="32"/>
+          <w:lang w:val="en-US"/>
+        </w:rPr>
+      </w:pPr>
+      <w:r>
+        <w:rPr>
+          <w:bCs/>
+          <w:sz w:val="32"/>
+          <w:szCs w:val="32"/>
+          <w:lang w:val="en-US"/>
+        </w:rPr>
+        <w:t>İstanbul</w:t>
+      </w:r>
+      <w:r>
+        <w:rPr>
+          <w:bCs/>
+          <w:sz w:val="32"/>
+          <w:szCs w:val="32"/>
+          <w:lang w:val="en-US"/>
+        </w:rPr>
+        <w:t xml:space="preserve"> </w:t>
+      </w:r>
       <w:r>
         <w:rPr>
           <w:bCs/>
@@ -437,80 +496,7 @@
           <w:szCs w:val="32"/>
           <w:lang w:val="en-US"/>
         </w:rPr>
-        <w:t>. Dr. Orhan Özgür AYBAR</w:t>
-      </w:r>
-    </w:p>
-    <w:p>
-      <w:pPr>
-        <w:jc w:val="center"/>
-        <w:rPr>
-          <w:bCs/>
-          <w:sz w:val="32"/>
-          <w:szCs w:val="32"/>
-          <w:lang w:val="en-US"/>
-        </w:rPr>
-      </w:pPr>
-    </w:p>
-    <w:p>
-      <w:pPr>
-        <w:jc w:val="center"/>
-        <w:rPr>
-          <w:bCs/>
-          <w:sz w:val="32"/>
-          <w:szCs w:val="32"/>
-          <w:lang w:val="en-US"/>
-        </w:rPr>
-      </w:pPr>
-    </w:p>
-    <w:p>
-      <w:pPr>
-        <w:jc w:val="center"/>
-        <w:rPr>
-          <w:bCs/>
-          <w:sz w:val="32"/>
-          <w:szCs w:val="32"/>
-          <w:lang w:val="en-US"/>
-        </w:rPr>
-      </w:pPr>
-    </w:p>
-    <w:p>
-      <w:pPr>
-        <w:jc w:val="center"/>
-        <w:rPr>
-          <w:bCs/>
-          <w:sz w:val="32"/>
-          <w:szCs w:val="32"/>
-          <w:lang w:val="en-US"/>
-        </w:rPr>
-      </w:pPr>
-    </w:p>
-    <w:p>
-      <w:pPr>
-        <w:jc w:val="center"/>
-        <w:rPr>
-          <w:bCs/>
-          <w:sz w:val="32"/>
-          <w:szCs w:val="32"/>
-          <w:lang w:val="en-US"/>
-        </w:rPr>
-      </w:pPr>
-      <w:r>
-        <w:rPr>
-          <w:bCs/>
-          <w:sz w:val="32"/>
-          <w:szCs w:val="32"/>
-          <w:lang w:val="en-US"/>
-        </w:rPr>
-        <w:t>İstanbul</w:t>
-      </w:r>
-      <w:r>
-        <w:rPr>
-          <w:bCs/>
-          <w:sz w:val="32"/>
-          <w:szCs w:val="32"/>
-          <w:lang w:val="en-US"/>
-        </w:rPr>
-        <w:t xml:space="preserve"> </w:t>
+        <w:t>May, 202</w:t>
       </w:r>
       <w:r>
         <w:rPr>
@@ -520,16 +506,6 @@
           <w:szCs w:val="32"/>
           <w:lang w:val="en-US"/>
         </w:rPr>
-        <w:t>May, 202</w:t>
-      </w:r>
-      <w:r>
-        <w:rPr>
-          <w:bCs/>
-          <w:color w:val="000000" w:themeColor="text1"/>
-          <w:sz w:val="32"/>
-          <w:szCs w:val="32"/>
-          <w:lang w:val="en-US"/>
-        </w:rPr>
         <w:t>6</w:t>
       </w:r>
       <w:r>
@@ -564,35 +540,7 @@
         <w:rPr>
           <w:lang w:val="en-US"/>
         </w:rPr>
-        <w:t xml:space="preserve">I hereby declare that this thesis represents my own work which has been done after registration for the </w:t>
-      </w:r>
-      <w:proofErr w:type="gramStart"/>
-      <w:r>
-        <w:rPr>
-          <w:lang w:val="en-US"/>
-        </w:rPr>
-        <w:t>degree of bachelor</w:t>
-      </w:r>
-      <w:proofErr w:type="gramEnd"/>
-      <w:r>
-        <w:rPr>
-          <w:lang w:val="en-US"/>
-        </w:rPr>
-        <w:t xml:space="preserve"> at Piri Reis </w:t>
-      </w:r>
-      <w:proofErr w:type="gramStart"/>
-      <w:r>
-        <w:rPr>
-          <w:lang w:val="en-US"/>
-        </w:rPr>
-        <w:t>University, and</w:t>
-      </w:r>
-      <w:proofErr w:type="gramEnd"/>
-      <w:r>
-        <w:rPr>
-          <w:lang w:val="en-US"/>
-        </w:rPr>
-        <w:t xml:space="preserve"> has not been previously included in a thesis or dissertation submitted to this or any other institution for a degree, diploma or other qualifications.</w:t>
+        <w:t>I hereby declare that this thesis represents my own work which has been done after registration for the degree of bachelor at Piri Reis University, and has not been previously included in a thesis or dissertation submitted to this or any other institution for a degree, diploma or other qualifications.</w:t>
       </w:r>
     </w:p>
     <w:p>
@@ -1077,38 +1025,14 @@
         </w:rPr>
       </w:pPr>
       <w:r>
-        <w:t xml:space="preserve">Supply chains include many connected activities such as order management, shipment planning, inventory control, delivery tracking, regional performance monitoring, and demand planning. When these activities are </w:t>
-      </w:r>
-      <w:proofErr w:type="spellStart"/>
-      <w:r>
-        <w:t>analyzed</w:t>
-      </w:r>
-      <w:proofErr w:type="spellEnd"/>
-      <w:r>
-        <w:t xml:space="preserve"> separately, managers may have difficulty seeing operational problems and risks on time. This graduation thesis develops a Supply Chain Visibility and Risk Assessment Platform to support supply chain decision-making through data visualization, risk analysis, and dataset standardization.</w:t>
+        <w:t>Supply chains include many connected activities such as order management, shipment planning, inventory control, delivery tracking, regional performance monitoring, and demand planning. When these activities are analyzed separately, managers may have difficulty seeing operational problems and risks on time. This graduation thesis develops a Supply Chain Visibility and Risk Assessment Platform to support supply chain decision-making through data visualization, risk analysis, and dataset standardization.</w:t>
       </w:r>
       <w:r>
         <w:br/>
       </w:r>
       <w:r>
         <w:br/>
-        <w:t xml:space="preserve">The platform was developed with Python and </w:t>
-      </w:r>
-      <w:proofErr w:type="spellStart"/>
-      <w:r>
-        <w:t>Streamlit</w:t>
-      </w:r>
-      <w:proofErr w:type="spellEnd"/>
-      <w:r>
-        <w:t xml:space="preserve">. It uses the public </w:t>
-      </w:r>
-      <w:proofErr w:type="spellStart"/>
-      <w:r>
-        <w:t>DataCo</w:t>
-      </w:r>
-      <w:proofErr w:type="spellEnd"/>
-      <w:r>
-        <w:t xml:space="preserve"> Smart Supply Chain dataset as the default demonstration dataset. In addition, the system allows users to upload a new supply chain dataset in CSV or Excel format. The uploaded dataset can be mapped to a standard supply chain schema and then used dynamically across the dashboard pages. The platform includes modules for overview analysis, regional performance, inventory control, shipment performance, supply chain risk, and demand forecasting.</w:t>
+        <w:t>The platform was developed with Python and Streamlit. It uses the public DataCo Smart Supply Chain dataset as the default demonstration dataset. In addition, the system allows users to upload a new supply chain dataset in CSV or Excel format. The uploaded dataset can be mapped to a standard supply chain schema and then used dynamically across the dashboard pages. The platform includes modules for overview analysis, regional performance, inventory control, shipment performance, supply chain risk, and demand forecasting.</w:t>
       </w:r>
       <w:r>
         <w:br/>
@@ -1128,15 +1052,7 @@
       </w:r>
       <w:r>
         <w:br/>
-        <w:t xml:space="preserve">Key Words: Supply Chain Visibility, Risk Assessment, Data Standardization, </w:t>
-      </w:r>
-      <w:proofErr w:type="spellStart"/>
-      <w:r>
-        <w:t>Streamlit</w:t>
-      </w:r>
-      <w:proofErr w:type="spellEnd"/>
-      <w:r>
-        <w:t xml:space="preserve"> Dashboard, Business Intelligence, Demand Forecasting</w:t>
+        <w:t>Key Words: Supply Chain Visibility, Risk Assessment, Data Standardization, Streamlit Dashboard, Business Intelligence, Demand Forecasting</w:t>
       </w:r>
     </w:p>
     <w:p>
@@ -3837,15 +3753,7 @@
     <w:p/>
     <w:p>
       <w:r>
-        <w:t xml:space="preserve">In this project, supply chain visibility is addressed through a multi-page dashboard structure. The platform brings different operational views together, including overview indicators, regional performance, inventory control, shipment performance, risk analysis, and demand forecasting. This supports the idea that supply chain visibility should not focus on only one </w:t>
-      </w:r>
-      <w:proofErr w:type="gramStart"/>
-      <w:r>
-        <w:t>metric, but</w:t>
-      </w:r>
-      <w:proofErr w:type="gramEnd"/>
-      <w:r>
-        <w:t xml:space="preserve"> should combine different operational indicators.</w:t>
+        <w:t>In this project, supply chain visibility is addressed through a multi-page dashboard structure. The platform brings different operational views together, including overview indicators, regional performance, inventory control, shipment performance, risk analysis, and demand forecasting. This supports the idea that supply chain visibility should not focus on only one metric, but should combine different operational indicators.</w:t>
       </w:r>
     </w:p>
     <w:p/>
@@ -3859,15 +3767,7 @@
     </w:p>
     <w:p>
       <w:r>
-        <w:t xml:space="preserve">Business intelligence dashboards are used to transform raw data into visual and understandable information. Instead of </w:t>
-      </w:r>
-      <w:proofErr w:type="spellStart"/>
-      <w:r>
-        <w:t>analyzing</w:t>
-      </w:r>
-      <w:proofErr w:type="spellEnd"/>
-      <w:r>
-        <w:t xml:space="preserve"> large tables manually, users can monitor key performance indicators, charts, and summary tables through an interactive interface. Dashboards are especially useful in operational areas where managers need to make quick and data-based decisions. [INSERT CITATION: Business Intelligence Dashboards]</w:t>
+        <w:t>Business intelligence dashboards are used to transform raw data into visual and understandable information. Instead of analyzing large tables manually, users can monitor key performance indicators, charts, and summary tables through an interactive interface. Dashboards are especially useful in operational areas where managers need to make quick and data-based decisions. [INSERT CITATION: Business Intelligence Dashboards]</w:t>
       </w:r>
     </w:p>
     <w:p/>
@@ -3906,15 +3806,7 @@
     <w:p/>
     <w:p>
       <w:r>
-        <w:t xml:space="preserve">In this project, supply chain risk is calculated using rule-based and interpretable indicators. The system </w:t>
-      </w:r>
-      <w:proofErr w:type="spellStart"/>
-      <w:r>
-        <w:t>analyzes</w:t>
-      </w:r>
-      <w:proofErr w:type="spellEnd"/>
-      <w:r>
-        <w:t xml:space="preserve"> delivery risk, delay risk, inventory risk, demand volatility risk, and region-level risk. The purpose is not to create a complex black-box prediction model, but to provide a clear and understandable risk assessment structure for decision support.</w:t>
+        <w:t>In this project, supply chain risk is calculated using rule-based and interpretable indicators. The system analyzes delivery risk, delay risk, inventory risk, demand volatility risk, and region-level risk. The purpose is not to create a complex black-box prediction model, but to provide a clear and understandable risk assessment structure for decision support.</w:t>
       </w:r>
     </w:p>
     <w:p/>
@@ -3928,15 +3820,7 @@
     </w:p>
     <w:p>
       <w:r>
-        <w:t xml:space="preserve">Digital transformation in logistics and supply chain management is closely related to the use of data, automation, analytics, and connected systems. Digital tools can improve transparency by collecting and </w:t>
-      </w:r>
-      <w:proofErr w:type="spellStart"/>
-      <w:r>
-        <w:t>analyzing</w:t>
-      </w:r>
-      <w:proofErr w:type="spellEnd"/>
-      <w:r>
-        <w:t xml:space="preserve"> operational data from different stages of the supply chain. This can support better planning, faster decision-making, and improved coordination between supply chain activities. [INSERT CITATION: Digital Transformation in Logistics]</w:t>
+        <w:t>Digital transformation in logistics and supply chain management is closely related to the use of data, automation, analytics, and connected systems. Digital tools can improve transparency by collecting and analyzing operational data from different stages of the supply chain. This can support better planning, faster decision-making, and improved coordination between supply chain activities. [INSERT CITATION: Digital Transformation in Logistics]</w:t>
       </w:r>
     </w:p>
     <w:p/>
@@ -4004,15 +3888,7 @@
     <w:p/>
     <w:p>
       <w:r>
-        <w:t xml:space="preserve">The dataset upload feature improves the originality and usefulness of the project. The default </w:t>
-      </w:r>
-      <w:proofErr w:type="spellStart"/>
-      <w:r>
-        <w:t>DataCo</w:t>
-      </w:r>
-      <w:proofErr w:type="spellEnd"/>
-      <w:r>
-        <w:t xml:space="preserve"> dataset is used as a demonstration dataset, but the system can also process new supply chain datasets. After the user maps the uploaded dataset to the standard schema, the dashboard pages are generated dynamically based on the active dataset. This makes the platform more reusable for different supply chain data sources.</w:t>
+        <w:t>The dataset upload feature improves the originality and usefulness of the project. The default DataCo dataset is used as a demonstration dataset, but the system can also process new supply chain datasets. After the user maps the uploaded dataset to the standard schema, the dashboard pages are generated dynamically based on the active dataset. This makes the platform more reusable for different supply chain data sources.</w:t>
       </w:r>
     </w:p>
     <w:p/>
@@ -4032,15 +3908,7 @@
     <w:p/>
     <w:p>
       <w:r>
-        <w:t xml:space="preserve">Based on these ideas, this project develops a dataset-adaptive supply chain visibility and risk assessment platform. The platform combines dashboard visualization, uploaded dataset support, data standardization, risk scoring, and demand forecasting in a single </w:t>
-      </w:r>
-      <w:proofErr w:type="spellStart"/>
-      <w:r>
-        <w:t>Streamlit</w:t>
-      </w:r>
-      <w:proofErr w:type="spellEnd"/>
-      <w:r>
-        <w:t>-based system.</w:t>
+        <w:t>Based on these ideas, this project develops a dataset-adaptive supply chain visibility and risk assessment platform. The platform combines dashboard visualization, uploaded dataset support, data standardization, risk scoring, and demand forecasting in a single Streamlit-based system.</w:t>
       </w:r>
     </w:p>
     <w:p/>
@@ -4061,15 +3929,7 @@
         <w:t>The</w:t>
       </w:r>
       <w:r>
-        <w:t xml:space="preserve"> originality of this study comes from developing a supply chain dashboard platform that is not limited to one fixed dataset. Many dashboard projects are designed only for a single prepared dataset. In this project, the </w:t>
-      </w:r>
-      <w:proofErr w:type="spellStart"/>
-      <w:r>
-        <w:t>DataCo</w:t>
-      </w:r>
-      <w:proofErr w:type="spellEnd"/>
-      <w:r>
-        <w:t xml:space="preserve"> Smart Supply Chain dataset is used as the default demonstration dataset, but the platform also allows users to upload a new supply chain dataset in CSV or Excel format.</w:t>
+        <w:t xml:space="preserve"> originality of this study comes from developing a supply chain dashboard platform that is not limited to one fixed dataset. Many dashboard projects are designed only for a single prepared dataset. In this project, the DataCo Smart Supply Chain dataset is used as the default demonstration dataset, but the platform also allows users to upload a new supply chain dataset in CSV or Excel format.</w:t>
       </w:r>
       <w:r>
         <w:br/>
@@ -4101,15 +3961,7 @@
       </w:r>
       <w:r>
         <w:br/>
-        <w:t xml:space="preserve">The project is original within its academic scope because it combines data upload, schema mapping, data standardization, dynamic dashboard generation, risk analysis, and forecasting in a single </w:t>
-      </w:r>
-      <w:proofErr w:type="spellStart"/>
-      <w:r>
-        <w:t>Streamlit</w:t>
-      </w:r>
-      <w:proofErr w:type="spellEnd"/>
-      <w:r>
-        <w:t>-based system. Therefore, the main contribution of the project is the development of a reusable supply chain visibility and risk assessment platform that can work with both a default dataset and user-uploaded datasets.</w:t>
+        <w:t>The project is original within its academic scope because it combines data upload, schema mapping, data standardization, dynamic dashboard generation, risk analysis, and forecasting in a single Streamlit-based system. Therefore, the main contribution of the project is the development of a reusable supply chain visibility and risk assessment platform that can work with both a default dataset and user-uploaded datasets.</w:t>
       </w:r>
     </w:p>
     <w:p>
@@ -4124,15 +3976,7 @@
     </w:p>
     <w:p>
       <w:r>
-        <w:t xml:space="preserve">Supply chain operations produce large amounts of data related to orders, products, shipments, delivery performance, inventory, regions, sales, and demand. However, this data is often stored in different files, systems, or formats. When the data is not standardized and </w:t>
-      </w:r>
-      <w:proofErr w:type="spellStart"/>
-      <w:r>
-        <w:t>analyzed</w:t>
-      </w:r>
-      <w:proofErr w:type="spellEnd"/>
-      <w:r>
-        <w:t xml:space="preserve"> together, it becomes difficult for managers to understand the overall performance of the supply chain.</w:t>
+        <w:t>Supply chain operations produce large amounts of data related to orders, products, shipments, delivery performance, inventory, regions, sales, and demand. However, this data is often stored in different files, systems, or formats. When the data is not standardized and analyzed together, it becomes difficult for managers to understand the overall performance of the supply chain.</w:t>
       </w:r>
       <w:r>
         <w:br/>
@@ -4146,15 +3990,7 @@
       </w:r>
       <w:r>
         <w:br/>
-        <w:t xml:space="preserve">Another problem is that many dashboard systems are designed for a single prepared dataset. If a new dataset has different column names or a different structure, the dashboard may not work without manual code changes. This limits the reusability of the system. For example, one dataset may use “order date,” while another dataset may use “PO created date” for the same concept. Without a standard mapping and transformation process, these datasets cannot be </w:t>
-      </w:r>
-      <w:proofErr w:type="spellStart"/>
-      <w:r>
-        <w:t>analyzed</w:t>
-      </w:r>
-      <w:proofErr w:type="spellEnd"/>
-      <w:r>
-        <w:t xml:space="preserve"> through the same dashboard structure.</w:t>
+        <w:t>Another problem is that many dashboard systems are designed for a single prepared dataset. If a new dataset has different column names or a different structure, the dashboard may not work without manual code changes. This limits the reusability of the system. For example, one dataset may use “order date,” while another dataset may use “PO created date” for the same concept. Without a standard mapping and transformation process, these datasets cannot be analyzed through the same dashboard structure.</w:t>
       </w:r>
       <w:r>
         <w:br/>
@@ -4183,15 +4019,7 @@
     </w:p>
     <w:p>
       <w:r>
-        <w:t xml:space="preserve">The solution approach of this project is based on developing a dataset-adaptive supply chain dashboard platform. The system is designed to work with a default demonstration dataset </w:t>
-      </w:r>
-      <w:proofErr w:type="gramStart"/>
-      <w:r>
-        <w:t>and also</w:t>
-      </w:r>
-      <w:proofErr w:type="gramEnd"/>
-      <w:r>
-        <w:t xml:space="preserve"> with user-uploaded supply chain datasets. The main idea is to transform different supply chain datasets into a common analytical structure and then generate dashboard modules from the active dataset.</w:t>
+        <w:t>The solution approach of this project is based on developing a dataset-adaptive supply chain dashboard platform. The system is designed to work with a default demonstration dataset and also with user-uploaded supply chain datasets. The main idea is to transform different supply chain datasets into a common analytical structure and then generate dashboard modules from the active dataset.</w:t>
       </w:r>
     </w:p>
     <w:p>
@@ -4211,15 +4039,7 @@
       </w:r>
       <w:r>
         <w:br/>
-        <w:t xml:space="preserve">The platform uses the </w:t>
-      </w:r>
-      <w:proofErr w:type="spellStart"/>
-      <w:r>
-        <w:t>DataCo</w:t>
-      </w:r>
-      <w:proofErr w:type="spellEnd"/>
-      <w:r>
-        <w:t xml:space="preserve"> Smart Supply Chain dataset as the default dataset. This dataset is processed into different analytical tables such as orders, products, shipments, inventory, demand, and risk scores. These tables are used by the default dashboard when no uploaded dataset is active.</w:t>
+        <w:t>The platform uses the DataCo Smart Supply Chain dataset as the default dataset. This dataset is processed into different analytical tables such as orders, products, shipments, inventory, demand, and risk scores. These tables are used by the default dashboard when no uploaded dataset is active.</w:t>
       </w:r>
       <w:r>
         <w:br/>
@@ -4276,61 +4096,21 @@
     </w:p>
     <w:p>
       <w:r>
-        <w:t xml:space="preserve">After the dataset is standardized, the dashboard pages are generated from the active dataset. If no uploaded dataset is active, the dashboard uses the default </w:t>
-      </w:r>
-      <w:proofErr w:type="spellStart"/>
-      <w:r>
-        <w:t>DataCo</w:t>
-      </w:r>
-      <w:proofErr w:type="spellEnd"/>
-      <w:r>
-        <w:t xml:space="preserve"> dataset. If the user uploads and activates a new dataset, all dashboard pages use the uploaded dataset during the active </w:t>
-      </w:r>
-      <w:proofErr w:type="spellStart"/>
-      <w:r>
-        <w:t>Streamlit</w:t>
-      </w:r>
-      <w:proofErr w:type="spellEnd"/>
-      <w:r>
-        <w:t xml:space="preserve"> session.</w:t>
+        <w:t>After the dataset is standardized, the dashboard pages are generated from the active dataset. If no uploaded dataset is active, the dashboard uses the default DataCo dataset. If the user uploads and activates a new dataset, all dashboard pages use the uploaded dataset during the active Streamlit session.</w:t>
       </w:r>
       <w:r>
         <w:br/>
       </w:r>
       <w:r>
         <w:br/>
-        <w:t xml:space="preserve">The dashboard includes six main modules: Overview, Regional Performance, Inventory Control, Shipment Performance, Supply Chain Risk, and Demand Forecast. Each module focuses on a different part of supply chain visibility. The Overview page shows general KPIs and summary charts. The Regional Performance page compares markets and regions. The Inventory Control page shows generated inventory indicators. The Shipment Performance page </w:t>
-      </w:r>
-      <w:proofErr w:type="spellStart"/>
-      <w:r>
-        <w:t>analyzes</w:t>
-      </w:r>
-      <w:proofErr w:type="spellEnd"/>
-      <w:r>
-        <w:t xml:space="preserve"> delivery and delay performance. The Supply Chain Risk page calculates risk indicators. The Demand Forecast page </w:t>
-      </w:r>
-      <w:proofErr w:type="spellStart"/>
-      <w:r>
-        <w:t>analyzes</w:t>
-      </w:r>
-      <w:proofErr w:type="spellEnd"/>
-      <w:r>
-        <w:t xml:space="preserve"> historical demand and creates simple forecasts.</w:t>
+        <w:t>The dashboard includes six main modules: Overview, Regional Performance, Inventory Control, Shipment Performance, Supply Chain Risk, and Demand Forecast. Each module focuses on a different part of supply chain visibility. The Overview page shows general KPIs and summary charts. The Regional Performance page compares markets and regions. The Inventory Control page shows generated inventory indicators. The Shipment Performance page analyzes delivery and delay performance. The Supply Chain Risk page calculates risk indicators. The Demand Forecast page analyzes historical demand and creates simple forecasts.</w:t>
       </w:r>
       <w:r>
         <w:br/>
       </w:r>
       <w:r>
         <w:br/>
-        <w:t xml:space="preserve">This structure allows the system to work as a flexible platform instead of a static dashboard. The same dashboard pages can be used with different supply chain datasets </w:t>
-      </w:r>
-      <w:proofErr w:type="gramStart"/>
-      <w:r>
-        <w:t>as long as</w:t>
-      </w:r>
-      <w:proofErr w:type="gramEnd"/>
-      <w:r>
-        <w:t xml:space="preserve"> the required fields are mapped correctly.</w:t>
+        <w:t>This structure allows the system to work as a flexible platform instead of a static dashboard. The same dashboard pages can be used with different supply chain datasets as long as the required fields are mapped correctly.</w:t>
       </w:r>
     </w:p>
     <w:p>
@@ -4421,15 +4201,7 @@
       </w:r>
       <w:r>
         <w:br/>
-        <w:t xml:space="preserve">The project was developed as a local </w:t>
-      </w:r>
-      <w:proofErr w:type="spellStart"/>
-      <w:r>
-        <w:t>Streamlit</w:t>
-      </w:r>
-      <w:proofErr w:type="spellEnd"/>
-      <w:r>
-        <w:t xml:space="preserve"> application. A Windows batch file was also created to make the project easier to run. This file automatically creates the virtual environment if needed, installs the required packages, processes the default dataset, and starts the dashboard.</w:t>
+        <w:t>The project was developed as a local Streamlit application. A Windows batch file was also created to make the project easier to run. This file automatically creates the virtual environment if needed, installs the required packages, processes the default dataset, and starts the dashboard.</w:t>
       </w:r>
     </w:p>
     <w:p>
@@ -4442,15 +4214,7 @@
     </w:p>
     <w:p>
       <w:r>
-        <w:t xml:space="preserve">pandas </w:t>
-      </w:r>
-      <w:proofErr w:type="gramStart"/>
-      <w:r>
-        <w:t>was</w:t>
-      </w:r>
-      <w:proofErr w:type="gramEnd"/>
-      <w:r>
-        <w:t xml:space="preserve"> used for reading CSV and Excel files, cleaning the dataset, grouping records, calculating KPIs, and creating analytical tables. NumPy was used for numerical calculations and handling missing numerical values.</w:t>
+        <w:t>pandas was used for reading CSV and Excel files, cleaning the dataset, grouping records, calculating KPIs, and creating analytical tables. NumPy was used for numerical calculations and handling missing numerical values.</w:t>
       </w:r>
       <w:r>
         <w:br/>
@@ -4475,13 +4239,8 @@
       </w:r>
     </w:p>
     <w:p>
-      <w:proofErr w:type="spellStart"/>
-      <w:r>
-        <w:t>Streamlit</w:t>
-      </w:r>
-      <w:proofErr w:type="spellEnd"/>
-      <w:r>
-        <w:t xml:space="preserve"> was used to develop the interactive dashboard interface. It allowed the project to include different pages, filters, file upload components, KPI cards, charts, and tables.</w:t>
+      <w:r>
+        <w:t>Streamlit was used to develop the interactive dashboard interface. It allowed the project to include different pages, filters, file upload components, KPI cards, charts, and tables.</w:t>
       </w:r>
       <w:r>
         <w:br/>
@@ -4681,11 +4440,9 @@
             <w:tcW w:w="1250" w:type="pct"/>
           </w:tcPr>
           <w:p>
-            <w:proofErr w:type="spellStart"/>
             <w:r>
               <w:t>Streamlit</w:t>
             </w:r>
-            <w:proofErr w:type="spellEnd"/>
           </w:p>
         </w:tc>
         <w:tc>
@@ -4985,20 +4742,1184 @@
     </w:p>
     <w:p>
       <w:r>
-        <w:t>……</w:t>
-      </w:r>
-      <w:proofErr w:type="gramStart"/>
-      <w:r>
-        <w:t>….</w:t>
-      </w:r>
-      <w:proofErr w:type="spellStart"/>
-      <w:r>
-        <w:t>fdfdfdf</w:t>
-      </w:r>
-      <w:proofErr w:type="spellEnd"/>
-      <w:proofErr w:type="gramEnd"/>
-    </w:p>
-    <w:p/>
+        <w:t>This section explains the technical development of the Supply Chain Visibility and Risk Assessment Platform. The system was designed as a dataset-adaptive dashboard platform. It can work with the default DataCo dataset, and it can also process user-uploaded supply chain datasets through column mapping and data standardization.</w:t>
+      </w:r>
+      <w:r>
+        <w:br/>
+      </w:r>
+      <w:r>
+        <w:br/>
+        <w:t>The system development process includes data source selection, dataset upload, column mapping, data standardization, analytical table generation, dashboard module development, risk score calculation, and demand forecasting.</w:t>
+      </w:r>
+    </w:p>
+    <w:p>
+      <w:pPr>
+        <w:pStyle w:val="Heading2"/>
+      </w:pPr>
+      <w:r>
+        <w:lastRenderedPageBreak/>
+        <w:t>System Architecture</w:t>
+      </w:r>
+      <w:r>
+        <w:t xml:space="preserve"> </w:t>
+      </w:r>
+    </w:p>
+    <w:p>
+      <w:r>
+        <w:t>The platform consists of several connected layers. The first layer is the data source layer. This layer includes the default DataCo dataset and user-uploaded CSV or Excel datasets. The second layer is the Data Source Manager, where the user can upload a new dataset and select the active data source. The third layer is the column mapping and data adapter layer. This layer converts different dataset structures into a common supply chain schema.</w:t>
+      </w:r>
+      <w:r>
+        <w:br/>
+      </w:r>
+      <w:r>
+        <w:br/>
+        <w:t>After the data is standardized, the system creates dashboard-ready analytical tables such as orders, products, shipments, inventory, demand, and risk scores. These tables are then used by the Streamlit dashboard modules. The main dashboard modules are Overview, Regional Performance, Inventory Control, Shipment Performance, Supply Chain Risk, and Demand Forecast.</w:t>
+      </w:r>
+      <w:r>
+        <w:br/>
+      </w:r>
+      <w:r>
+        <w:br/>
+        <w:t>The system architecture is shown in Figure 1.</w:t>
+      </w:r>
+    </w:p>
+    <w:p>
+      <w:pPr>
+        <w:keepNext/>
+      </w:pPr>
+      <w:r>
+        <w:rPr>
+          <w:noProof/>
+        </w:rPr>
+        <w:drawing>
+          <wp:inline distT="0" distB="0" distL="0" distR="0" wp14:anchorId="13F4F06E" wp14:editId="037FCCDD">
+            <wp:extent cx="6286828" cy="4143375"/>
+            <wp:effectExtent l="0" t="0" r="0" b="0"/>
+            <wp:docPr id="36948891" name="Picture 1"/>
+            <wp:cNvGraphicFramePr>
+              <a:graphicFrameLocks xmlns:a="http://schemas.openxmlformats.org/drawingml/2006/main" noChangeAspect="1"/>
+            </wp:cNvGraphicFramePr>
+            <a:graphic xmlns:a="http://schemas.openxmlformats.org/drawingml/2006/main">
+              <a:graphicData uri="http://schemas.openxmlformats.org/drawingml/2006/picture">
+                <pic:pic xmlns:pic="http://schemas.openxmlformats.org/drawingml/2006/picture">
+                  <pic:nvPicPr>
+                    <pic:cNvPr id="36948891" name="Picture 36948891"/>
+                    <pic:cNvPicPr/>
+                  </pic:nvPicPr>
+                  <pic:blipFill>
+                    <a:blip r:embed="rId9" cstate="print">
+                      <a:extLst>
+                        <a:ext uri="{28A0092B-C50C-407E-A947-70E740481C1C}">
+                          <a14:useLocalDpi xmlns:a14="http://schemas.microsoft.com/office/drawing/2010/main" val="0"/>
+                        </a:ext>
+                      </a:extLst>
+                    </a:blip>
+                    <a:stretch>
+                      <a:fillRect/>
+                    </a:stretch>
+                  </pic:blipFill>
+                  <pic:spPr>
+                    <a:xfrm>
+                      <a:off x="0" y="0"/>
+                      <a:ext cx="6291050" cy="4146158"/>
+                    </a:xfrm>
+                    <a:prstGeom prst="rect">
+                      <a:avLst/>
+                    </a:prstGeom>
+                  </pic:spPr>
+                </pic:pic>
+              </a:graphicData>
+            </a:graphic>
+          </wp:inline>
+        </w:drawing>
+      </w:r>
+    </w:p>
+    <w:p>
+      <w:pPr>
+        <w:pStyle w:val="Caption"/>
+        <w:jc w:val="both"/>
+      </w:pPr>
+      <w:r>
+        <w:t xml:space="preserve">Figure </w:t>
+      </w:r>
+      <w:r>
+        <w:fldChar w:fldCharType="begin"/>
+      </w:r>
+      <w:r>
+        <w:instrText xml:space="preserve"> SEQ Figure \* ARABIC </w:instrText>
+      </w:r>
+      <w:r>
+        <w:fldChar w:fldCharType="separate"/>
+      </w:r>
+      <w:r>
+        <w:rPr>
+          <w:noProof/>
+        </w:rPr>
+        <w:t>1</w:t>
+      </w:r>
+      <w:r>
+        <w:fldChar w:fldCharType="end"/>
+      </w:r>
+      <w:r>
+        <w:t xml:space="preserve">. </w:t>
+      </w:r>
+      <w:r>
+        <w:t>System architecture of the dataset-adaptive supply chain visibility and risk assessment platform.</w:t>
+      </w:r>
+    </w:p>
+    <w:p>
+      <w:r>
+        <w:rPr>
+          <w:lang w:val="en-ZA"/>
+        </w:rPr>
+        <w:t>As shown in Figure 1, the uploaded dataset does not directly replace the dashboard tables. First, it passes through the Data Source Manager and column mapping process. Then, the data adapter converts it into the standard analytical structure used by the dashboard. This design allows the same dashboard pages to work with different supply chain datasets.</w:t>
+      </w:r>
+      <w:r>
+        <w:t xml:space="preserve"> </w:t>
+      </w:r>
+    </w:p>
+    <w:p>
+      <w:pPr>
+        <w:pStyle w:val="Heading2"/>
+        <w:rPr>
+          <w:lang w:val="en-ZA"/>
+        </w:rPr>
+      </w:pPr>
+      <w:r>
+        <w:rPr>
+          <w:lang w:val="en-ZA"/>
+        </w:rPr>
+        <w:t>Data Source Manager and Dataset Upload</w:t>
+      </w:r>
+    </w:p>
+    <w:p>
+      <w:pPr>
+        <w:rPr>
+          <w:lang w:val="en-ZA"/>
+        </w:rPr>
+      </w:pPr>
+      <w:r>
+        <w:rPr>
+          <w:lang w:val="en-ZA"/>
+        </w:rPr>
+        <w:t>The Data Source Manager is the main component that makes the platform reusable. When the dashboard is opened, the default DataCo dataset is active. If the user wants to analyze another supply chain dataset, the user can upload a CSV or Excel file from the Data Source Manager on the Overview page.</w:t>
+      </w:r>
+    </w:p>
+    <w:p>
+      <w:pPr>
+        <w:rPr>
+          <w:lang w:val="en-ZA"/>
+        </w:rPr>
+      </w:pPr>
+      <w:r>
+        <w:rPr>
+          <w:lang w:val="en-ZA"/>
+        </w:rPr>
+        <w:t>After uploading a dataset, the system shows a preview of the raw data. Then, the user maps the uploaded columns to the standard supply chain schema. This mapping process is necessary because different datasets may use different column names for the same concept. For example, one dataset may use “Order Date,” while another dataset may use “PO Created At.”</w:t>
+      </w:r>
+    </w:p>
+    <w:p>
+      <w:pPr>
+        <w:rPr>
+          <w:lang w:val="en-ZA"/>
+        </w:rPr>
+      </w:pPr>
+      <w:r>
+        <w:rPr>
+          <w:lang w:val="en-ZA"/>
+        </w:rPr>
+        <w:t>The uploaded dataset is used during the active Streamlit session. If the user activates the uploaded dataset, all dashboard pages use the uploaded data. If the user wants to return to the default dataset, the Data Source Manager provides an option to return to the default DataCo dataset.</w:t>
+      </w:r>
+    </w:p>
+    <w:p>
+      <w:pPr>
+        <w:rPr>
+          <w:lang w:val="en-ZA"/>
+        </w:rPr>
+      </w:pPr>
+    </w:p>
+    <w:p>
+      <w:pPr>
+        <w:pStyle w:val="Heading2"/>
+        <w:rPr>
+          <w:lang w:val="en-ZA"/>
+        </w:rPr>
+      </w:pPr>
+      <w:r>
+        <w:rPr>
+          <w:lang w:val="en-ZA"/>
+        </w:rPr>
+        <w:lastRenderedPageBreak/>
+        <w:t>Standard Data Schema</w:t>
+      </w:r>
+    </w:p>
+    <w:p>
+      <w:pPr>
+        <w:rPr>
+          <w:lang w:val="en-ZA"/>
+        </w:rPr>
+      </w:pPr>
+      <w:r>
+        <w:rPr>
+          <w:lang w:val="en-ZA"/>
+        </w:rPr>
+        <w:t>The standard data schema defines the common structure used by the platform. The uploaded dataset must be mapped to this schema before it can be used by the dashboard pages. Some fields are required, while others are optional. Required fields are necessary for basic dashboard generation. Optional fields improve the quality of risk analysis, shipment performance analysis, and financial indicators.</w:t>
+      </w:r>
+    </w:p>
+    <w:p>
+      <w:pPr>
+        <w:rPr>
+          <w:lang w:val="en-ZA"/>
+        </w:rPr>
+      </w:pPr>
+      <w:r>
+        <w:rPr>
+          <w:lang w:val="en-ZA"/>
+        </w:rPr>
+        <w:t>The standard schema used in the platform is shown in Table 2.</w:t>
+      </w:r>
+    </w:p>
+    <w:p>
+      <w:pPr>
+        <w:jc w:val="center"/>
+        <w:rPr>
+          <w:b/>
+          <w:bCs/>
+          <w:lang w:val="en-ZA"/>
+        </w:rPr>
+      </w:pPr>
+      <w:r>
+        <w:rPr>
+          <w:b/>
+          <w:bCs/>
+          <w:lang w:val="en-ZA"/>
+        </w:rPr>
+        <w:t>Table 2: Standard Supply Chain Schema Used in the Platform</w:t>
+      </w:r>
+    </w:p>
+    <w:tbl>
+      <w:tblPr>
+        <w:tblStyle w:val="TableGrid"/>
+        <w:tblW w:w="5000" w:type="pct"/>
+        <w:tblLook w:val="04A0" w:firstRow="1" w:lastRow="0" w:firstColumn="1" w:lastColumn="0" w:noHBand="0" w:noVBand="1"/>
+      </w:tblPr>
+      <w:tblGrid>
+        <w:gridCol w:w="3077"/>
+        <w:gridCol w:w="3077"/>
+        <w:gridCol w:w="3078"/>
+      </w:tblGrid>
+      <w:tr>
+        <w:tc>
+          <w:tcPr>
+            <w:tcW w:w="1666" w:type="pct"/>
+          </w:tcPr>
+          <w:p>
+            <w:pPr>
+              <w:rPr>
+                <w:b/>
+                <w:bCs/>
+                <w:lang w:val="en-ZA"/>
+              </w:rPr>
+            </w:pPr>
+            <w:r>
+              <w:rPr>
+                <w:b/>
+                <w:bCs/>
+                <w:lang w:val="en-ZA"/>
+              </w:rPr>
+              <w:t>Standard Field</w:t>
+            </w:r>
+          </w:p>
+        </w:tc>
+        <w:tc>
+          <w:tcPr>
+            <w:tcW w:w="1666" w:type="pct"/>
+          </w:tcPr>
+          <w:p>
+            <w:pPr>
+              <w:rPr>
+                <w:b/>
+                <w:bCs/>
+                <w:lang w:val="en-ZA"/>
+              </w:rPr>
+            </w:pPr>
+            <w:r>
+              <w:rPr>
+                <w:b/>
+                <w:bCs/>
+                <w:lang w:val="en-ZA"/>
+              </w:rPr>
+              <w:t>Required</w:t>
+            </w:r>
+          </w:p>
+        </w:tc>
+        <w:tc>
+          <w:tcPr>
+            <w:tcW w:w="1667" w:type="pct"/>
+          </w:tcPr>
+          <w:p>
+            <w:pPr>
+              <w:rPr>
+                <w:b/>
+                <w:bCs/>
+                <w:lang w:val="en-ZA"/>
+              </w:rPr>
+            </w:pPr>
+            <w:r>
+              <w:rPr>
+                <w:b/>
+                <w:bCs/>
+                <w:lang w:val="en-ZA"/>
+              </w:rPr>
+              <w:t>Description</w:t>
+            </w:r>
+          </w:p>
+        </w:tc>
+      </w:tr>
+      <w:tr>
+        <w:tc>
+          <w:tcPr>
+            <w:tcW w:w="1666" w:type="pct"/>
+          </w:tcPr>
+          <w:p>
+            <w:pPr>
+              <w:rPr>
+                <w:lang w:val="en-ZA"/>
+              </w:rPr>
+            </w:pPr>
+            <w:r>
+              <w:rPr>
+                <w:lang w:val="en-ZA"/>
+              </w:rPr>
+              <w:t>order_id</w:t>
+            </w:r>
+          </w:p>
+        </w:tc>
+        <w:tc>
+          <w:tcPr>
+            <w:tcW w:w="1666" w:type="pct"/>
+          </w:tcPr>
+          <w:p>
+            <w:pPr>
+              <w:rPr>
+                <w:lang w:val="en-ZA"/>
+              </w:rPr>
+            </w:pPr>
+            <w:r>
+              <w:rPr>
+                <w:lang w:val="en-ZA"/>
+              </w:rPr>
+              <w:t>Yes</w:t>
+            </w:r>
+          </w:p>
+        </w:tc>
+        <w:tc>
+          <w:tcPr>
+            <w:tcW w:w="1667" w:type="pct"/>
+          </w:tcPr>
+          <w:p>
+            <w:pPr>
+              <w:rPr>
+                <w:lang w:val="en-ZA"/>
+              </w:rPr>
+            </w:pPr>
+            <w:r>
+              <w:rPr>
+                <w:lang w:val="en-ZA"/>
+              </w:rPr>
+              <w:t>Unique orderor transaction identifier</w:t>
+            </w:r>
+          </w:p>
+        </w:tc>
+      </w:tr>
+      <w:tr>
+        <w:tc>
+          <w:tcPr>
+            <w:tcW w:w="1666" w:type="pct"/>
+          </w:tcPr>
+          <w:p>
+            <w:pPr>
+              <w:rPr>
+                <w:lang w:val="en-ZA"/>
+              </w:rPr>
+            </w:pPr>
+            <w:r>
+              <w:rPr>
+                <w:lang w:val="en-ZA"/>
+              </w:rPr>
+              <w:t>order_date</w:t>
+            </w:r>
+          </w:p>
+        </w:tc>
+        <w:tc>
+          <w:tcPr>
+            <w:tcW w:w="1666" w:type="pct"/>
+          </w:tcPr>
+          <w:p>
+            <w:pPr>
+              <w:rPr>
+                <w:lang w:val="en-ZA"/>
+              </w:rPr>
+            </w:pPr>
+            <w:r>
+              <w:rPr>
+                <w:lang w:val="en-ZA"/>
+              </w:rPr>
+              <w:t>Yes</w:t>
+            </w:r>
+          </w:p>
+        </w:tc>
+        <w:tc>
+          <w:tcPr>
+            <w:tcW w:w="1667" w:type="pct"/>
+          </w:tcPr>
+          <w:p>
+            <w:pPr>
+              <w:rPr>
+                <w:lang w:val="en-ZA"/>
+              </w:rPr>
+            </w:pPr>
+            <w:r>
+              <w:rPr>
+                <w:lang w:val="en-ZA"/>
+              </w:rPr>
+              <w:t>Date when the order was created</w:t>
+            </w:r>
+          </w:p>
+        </w:tc>
+      </w:tr>
+      <w:tr>
+        <w:tc>
+          <w:tcPr>
+            <w:tcW w:w="1666" w:type="pct"/>
+          </w:tcPr>
+          <w:p>
+            <w:pPr>
+              <w:rPr>
+                <w:lang w:val="en-ZA"/>
+              </w:rPr>
+            </w:pPr>
+            <w:r>
+              <w:rPr>
+                <w:lang w:val="en-ZA"/>
+              </w:rPr>
+              <w:t>product_name</w:t>
+            </w:r>
+          </w:p>
+        </w:tc>
+        <w:tc>
+          <w:tcPr>
+            <w:tcW w:w="1666" w:type="pct"/>
+          </w:tcPr>
+          <w:p>
+            <w:pPr>
+              <w:rPr>
+                <w:lang w:val="en-ZA"/>
+              </w:rPr>
+            </w:pPr>
+            <w:r>
+              <w:rPr>
+                <w:lang w:val="en-ZA"/>
+              </w:rPr>
+              <w:t>Yes</w:t>
+            </w:r>
+          </w:p>
+        </w:tc>
+        <w:tc>
+          <w:tcPr>
+            <w:tcW w:w="1667" w:type="pct"/>
+          </w:tcPr>
+          <w:p>
+            <w:pPr>
+              <w:rPr>
+                <w:lang w:val="en-ZA"/>
+              </w:rPr>
+            </w:pPr>
+            <w:r>
+              <w:rPr>
+                <w:lang w:val="en-ZA"/>
+              </w:rPr>
+              <w:t>Product, item, material, or SKU name</w:t>
+            </w:r>
+          </w:p>
+        </w:tc>
+      </w:tr>
+      <w:tr>
+        <w:tc>
+          <w:tcPr>
+            <w:tcW w:w="1666" w:type="pct"/>
+          </w:tcPr>
+          <w:p>
+            <w:pPr>
+              <w:rPr>
+                <w:lang w:val="en-ZA"/>
+              </w:rPr>
+            </w:pPr>
+            <w:r>
+              <w:rPr>
+                <w:lang w:val="en-ZA"/>
+              </w:rPr>
+              <w:t>category_name</w:t>
+            </w:r>
+          </w:p>
+        </w:tc>
+        <w:tc>
+          <w:tcPr>
+            <w:tcW w:w="1666" w:type="pct"/>
+          </w:tcPr>
+          <w:p>
+            <w:pPr>
+              <w:rPr>
+                <w:lang w:val="en-ZA"/>
+              </w:rPr>
+            </w:pPr>
+            <w:r>
+              <w:rPr>
+                <w:lang w:val="en-ZA"/>
+              </w:rPr>
+              <w:t>Yes</w:t>
+            </w:r>
+          </w:p>
+        </w:tc>
+        <w:tc>
+          <w:tcPr>
+            <w:tcW w:w="1667" w:type="pct"/>
+          </w:tcPr>
+          <w:p>
+            <w:pPr>
+              <w:rPr>
+                <w:lang w:val="en-ZA"/>
+              </w:rPr>
+            </w:pPr>
+            <w:r>
+              <w:t>P</w:t>
+            </w:r>
+            <w:r>
+              <w:t>roduct category or product group</w:t>
+            </w:r>
+          </w:p>
+        </w:tc>
+      </w:tr>
+      <w:tr>
+        <w:tc>
+          <w:tcPr>
+            <w:tcW w:w="1666" w:type="pct"/>
+          </w:tcPr>
+          <w:p>
+            <w:pPr>
+              <w:rPr>
+                <w:lang w:val="en-ZA"/>
+              </w:rPr>
+            </w:pPr>
+            <w:r>
+              <w:t>order_quantity</w:t>
+            </w:r>
+          </w:p>
+        </w:tc>
+        <w:tc>
+          <w:tcPr>
+            <w:tcW w:w="1666" w:type="pct"/>
+          </w:tcPr>
+          <w:p>
+            <w:pPr>
+              <w:rPr>
+                <w:lang w:val="en-ZA"/>
+              </w:rPr>
+            </w:pPr>
+            <w:r>
+              <w:rPr>
+                <w:lang w:val="en-ZA"/>
+              </w:rPr>
+              <w:t>Yes</w:t>
+            </w:r>
+          </w:p>
+        </w:tc>
+        <w:tc>
+          <w:tcPr>
+            <w:tcW w:w="1667" w:type="pct"/>
+          </w:tcPr>
+          <w:p>
+            <w:pPr>
+              <w:rPr>
+                <w:lang w:val="en-ZA"/>
+              </w:rPr>
+            </w:pPr>
+            <w:r>
+              <w:t>Ordered quantity</w:t>
+            </w:r>
+          </w:p>
+        </w:tc>
+      </w:tr>
+      <w:tr>
+        <w:tc>
+          <w:tcPr>
+            <w:tcW w:w="1666" w:type="pct"/>
+          </w:tcPr>
+          <w:p>
+            <w:pPr>
+              <w:rPr>
+                <w:lang w:val="en-ZA"/>
+              </w:rPr>
+            </w:pPr>
+            <w:r>
+              <w:t>shipping_date</w:t>
+            </w:r>
+          </w:p>
+        </w:tc>
+        <w:tc>
+          <w:tcPr>
+            <w:tcW w:w="1666" w:type="pct"/>
+          </w:tcPr>
+          <w:p>
+            <w:pPr>
+              <w:rPr>
+                <w:lang w:val="en-ZA"/>
+              </w:rPr>
+            </w:pPr>
+            <w:r>
+              <w:rPr>
+                <w:lang w:val="en-ZA"/>
+              </w:rPr>
+              <w:t>No</w:t>
+            </w:r>
+          </w:p>
+        </w:tc>
+        <w:tc>
+          <w:tcPr>
+            <w:tcW w:w="1667" w:type="pct"/>
+          </w:tcPr>
+          <w:p>
+            <w:pPr>
+              <w:rPr>
+                <w:lang w:val="en-ZA"/>
+              </w:rPr>
+            </w:pPr>
+            <w:r>
+              <w:t>Actual shipping, dispatch, or delivery date</w:t>
+            </w:r>
+          </w:p>
+        </w:tc>
+      </w:tr>
+      <w:tr>
+        <w:tc>
+          <w:tcPr>
+            <w:tcW w:w="1666" w:type="pct"/>
+          </w:tcPr>
+          <w:p>
+            <w:pPr>
+              <w:rPr>
+                <w:lang w:val="en-ZA"/>
+              </w:rPr>
+            </w:pPr>
+            <w:r>
+              <w:t>scheduled_delivery_date</w:t>
+            </w:r>
+          </w:p>
+        </w:tc>
+        <w:tc>
+          <w:tcPr>
+            <w:tcW w:w="1666" w:type="pct"/>
+          </w:tcPr>
+          <w:p>
+            <w:pPr>
+              <w:rPr>
+                <w:lang w:val="en-ZA"/>
+              </w:rPr>
+            </w:pPr>
+            <w:r>
+              <w:rPr>
+                <w:lang w:val="en-ZA"/>
+              </w:rPr>
+              <w:t>No</w:t>
+            </w:r>
+          </w:p>
+        </w:tc>
+        <w:tc>
+          <w:tcPr>
+            <w:tcW w:w="1667" w:type="pct"/>
+          </w:tcPr>
+          <w:p>
+            <w:pPr>
+              <w:rPr>
+                <w:lang w:val="en-ZA"/>
+              </w:rPr>
+            </w:pPr>
+            <w:r>
+              <w:t>P</w:t>
+            </w:r>
+            <w:r>
+              <w:t>lanned or scheduled delivery date</w:t>
+            </w:r>
+          </w:p>
+        </w:tc>
+      </w:tr>
+      <w:tr>
+        <w:tc>
+          <w:tcPr>
+            <w:tcW w:w="1666" w:type="pct"/>
+          </w:tcPr>
+          <w:p>
+            <w:pPr>
+              <w:rPr>
+                <w:lang w:val="en-ZA"/>
+              </w:rPr>
+            </w:pPr>
+            <w:r>
+              <w:t>delivery_status</w:t>
+            </w:r>
+          </w:p>
+        </w:tc>
+        <w:tc>
+          <w:tcPr>
+            <w:tcW w:w="1666" w:type="pct"/>
+          </w:tcPr>
+          <w:p>
+            <w:pPr>
+              <w:rPr>
+                <w:lang w:val="en-ZA"/>
+              </w:rPr>
+            </w:pPr>
+            <w:r>
+              <w:rPr>
+                <w:lang w:val="en-ZA"/>
+              </w:rPr>
+              <w:t>No</w:t>
+            </w:r>
+          </w:p>
+        </w:tc>
+        <w:tc>
+          <w:tcPr>
+            <w:tcW w:w="1667" w:type="pct"/>
+          </w:tcPr>
+          <w:p>
+            <w:pPr>
+              <w:rPr>
+                <w:lang w:val="en-ZA"/>
+              </w:rPr>
+            </w:pPr>
+            <w:r>
+              <w:t>Delivery status such as on time or late delivery</w:t>
+            </w:r>
+          </w:p>
+        </w:tc>
+      </w:tr>
+      <w:tr>
+        <w:tc>
+          <w:tcPr>
+            <w:tcW w:w="1666" w:type="pct"/>
+          </w:tcPr>
+          <w:p>
+            <w:pPr>
+              <w:rPr>
+                <w:lang w:val="en-ZA"/>
+              </w:rPr>
+            </w:pPr>
+            <w:r>
+              <w:t>actual_shipping_days</w:t>
+            </w:r>
+          </w:p>
+        </w:tc>
+        <w:tc>
+          <w:tcPr>
+            <w:tcW w:w="1666" w:type="pct"/>
+          </w:tcPr>
+          <w:p>
+            <w:pPr>
+              <w:rPr>
+                <w:lang w:val="en-ZA"/>
+              </w:rPr>
+            </w:pPr>
+            <w:r>
+              <w:rPr>
+                <w:lang w:val="en-ZA"/>
+              </w:rPr>
+              <w:t>No</w:t>
+            </w:r>
+          </w:p>
+        </w:tc>
+        <w:tc>
+          <w:tcPr>
+            <w:tcW w:w="1667" w:type="pct"/>
+          </w:tcPr>
+          <w:p>
+            <w:pPr>
+              <w:rPr>
+                <w:lang w:val="en-ZA"/>
+              </w:rPr>
+            </w:pPr>
+            <w:r>
+              <w:t>Actual shipping or transit duration in days</w:t>
+            </w:r>
+          </w:p>
+        </w:tc>
+      </w:tr>
+      <w:tr>
+        <w:tc>
+          <w:tcPr>
+            <w:tcW w:w="1666" w:type="pct"/>
+          </w:tcPr>
+          <w:p>
+            <w:pPr>
+              <w:rPr>
+                <w:lang w:val="en-ZA"/>
+              </w:rPr>
+            </w:pPr>
+            <w:r>
+              <w:t>scheduled_shipping_days</w:t>
+            </w:r>
+          </w:p>
+        </w:tc>
+        <w:tc>
+          <w:tcPr>
+            <w:tcW w:w="1666" w:type="pct"/>
+          </w:tcPr>
+          <w:p>
+            <w:pPr>
+              <w:rPr>
+                <w:lang w:val="en-ZA"/>
+              </w:rPr>
+            </w:pPr>
+            <w:r>
+              <w:rPr>
+                <w:lang w:val="en-ZA"/>
+              </w:rPr>
+              <w:t>No</w:t>
+            </w:r>
+          </w:p>
+        </w:tc>
+        <w:tc>
+          <w:tcPr>
+            <w:tcW w:w="1667" w:type="pct"/>
+          </w:tcPr>
+          <w:p>
+            <w:pPr>
+              <w:rPr>
+                <w:lang w:val="en-ZA"/>
+              </w:rPr>
+            </w:pPr>
+            <w:r>
+              <w:t>Planned</w:t>
+            </w:r>
+            <w:r>
+              <w:t xml:space="preserve"> or promised shipping duration in days</w:t>
+            </w:r>
+          </w:p>
+        </w:tc>
+      </w:tr>
+      <w:tr>
+        <w:tc>
+          <w:tcPr>
+            <w:tcW w:w="1666" w:type="pct"/>
+          </w:tcPr>
+          <w:p>
+            <w:pPr>
+              <w:rPr>
+                <w:lang w:val="en-ZA"/>
+              </w:rPr>
+            </w:pPr>
+            <w:r>
+              <w:t>shipping_mode</w:t>
+            </w:r>
+          </w:p>
+        </w:tc>
+        <w:tc>
+          <w:tcPr>
+            <w:tcW w:w="1666" w:type="pct"/>
+          </w:tcPr>
+          <w:p>
+            <w:pPr>
+              <w:rPr>
+                <w:lang w:val="en-ZA"/>
+              </w:rPr>
+            </w:pPr>
+            <w:r>
+              <w:rPr>
+                <w:lang w:val="en-ZA"/>
+              </w:rPr>
+              <w:t>No</w:t>
+            </w:r>
+          </w:p>
+        </w:tc>
+        <w:tc>
+          <w:tcPr>
+            <w:tcW w:w="1667" w:type="pct"/>
+          </w:tcPr>
+          <w:p>
+            <w:pPr>
+              <w:rPr>
+                <w:lang w:val="en-ZA"/>
+              </w:rPr>
+            </w:pPr>
+            <w:r>
+              <w:t>Transport mode or shipment method</w:t>
+            </w:r>
+          </w:p>
+        </w:tc>
+      </w:tr>
+      <w:tr>
+        <w:tc>
+          <w:tcPr>
+            <w:tcW w:w="1666" w:type="pct"/>
+          </w:tcPr>
+          <w:p>
+            <w:pPr>
+              <w:rPr>
+                <w:lang w:val="en-ZA"/>
+              </w:rPr>
+            </w:pPr>
+            <w:r>
+              <w:t>market</w:t>
+            </w:r>
+          </w:p>
+        </w:tc>
+        <w:tc>
+          <w:tcPr>
+            <w:tcW w:w="1666" w:type="pct"/>
+          </w:tcPr>
+          <w:p>
+            <w:pPr>
+              <w:rPr>
+                <w:lang w:val="en-ZA"/>
+              </w:rPr>
+            </w:pPr>
+            <w:r>
+              <w:rPr>
+                <w:lang w:val="en-ZA"/>
+              </w:rPr>
+              <w:t>No</w:t>
+            </w:r>
+          </w:p>
+        </w:tc>
+        <w:tc>
+          <w:tcPr>
+            <w:tcW w:w="1667" w:type="pct"/>
+          </w:tcPr>
+          <w:p>
+            <w:pPr>
+              <w:rPr>
+                <w:lang w:val="en-ZA"/>
+              </w:rPr>
+            </w:pPr>
+            <w:r>
+              <w:t>Market or business area</w:t>
+            </w:r>
+          </w:p>
+        </w:tc>
+      </w:tr>
+      <w:tr>
+        <w:tc>
+          <w:tcPr>
+            <w:tcW w:w="1666" w:type="pct"/>
+          </w:tcPr>
+          <w:p>
+            <w:pPr>
+              <w:rPr>
+                <w:lang w:val="en-ZA"/>
+              </w:rPr>
+            </w:pPr>
+            <w:r>
+              <w:t>order_region</w:t>
+            </w:r>
+          </w:p>
+        </w:tc>
+        <w:tc>
+          <w:tcPr>
+            <w:tcW w:w="1666" w:type="pct"/>
+          </w:tcPr>
+          <w:p>
+            <w:pPr>
+              <w:rPr>
+                <w:lang w:val="en-ZA"/>
+              </w:rPr>
+            </w:pPr>
+            <w:r>
+              <w:rPr>
+                <w:lang w:val="en-ZA"/>
+              </w:rPr>
+              <w:t>No</w:t>
+            </w:r>
+          </w:p>
+        </w:tc>
+        <w:tc>
+          <w:tcPr>
+            <w:tcW w:w="1667" w:type="pct"/>
+          </w:tcPr>
+          <w:p>
+            <w:pPr>
+              <w:rPr>
+                <w:lang w:val="en-ZA"/>
+              </w:rPr>
+            </w:pPr>
+            <w:r>
+              <w:t>Region related to the order or delivery</w:t>
+            </w:r>
+          </w:p>
+        </w:tc>
+      </w:tr>
+      <w:tr>
+        <w:tc>
+          <w:tcPr>
+            <w:tcW w:w="1666" w:type="pct"/>
+          </w:tcPr>
+          <w:p>
+            <w:pPr>
+              <w:rPr>
+                <w:lang w:val="en-ZA"/>
+              </w:rPr>
+            </w:pPr>
+            <w:r>
+              <w:t>order_country</w:t>
+            </w:r>
+          </w:p>
+        </w:tc>
+        <w:tc>
+          <w:tcPr>
+            <w:tcW w:w="1666" w:type="pct"/>
+          </w:tcPr>
+          <w:p>
+            <w:pPr>
+              <w:rPr>
+                <w:lang w:val="en-ZA"/>
+              </w:rPr>
+            </w:pPr>
+            <w:r>
+              <w:rPr>
+                <w:lang w:val="en-ZA"/>
+              </w:rPr>
+              <w:t>No</w:t>
+            </w:r>
+          </w:p>
+        </w:tc>
+        <w:tc>
+          <w:tcPr>
+            <w:tcW w:w="1667" w:type="pct"/>
+          </w:tcPr>
+          <w:p>
+            <w:pPr>
+              <w:rPr>
+                <w:lang w:val="en-ZA"/>
+              </w:rPr>
+            </w:pPr>
+            <w:r>
+              <w:t>Country related to the order or delivery</w:t>
+            </w:r>
+          </w:p>
+        </w:tc>
+      </w:tr>
+      <w:tr>
+        <w:tc>
+          <w:tcPr>
+            <w:tcW w:w="1666" w:type="pct"/>
+          </w:tcPr>
+          <w:p>
+            <w:pPr>
+              <w:rPr>
+                <w:lang w:val="en-ZA"/>
+              </w:rPr>
+            </w:pPr>
+            <w:r>
+              <w:t>sales</w:t>
+            </w:r>
+          </w:p>
+        </w:tc>
+        <w:tc>
+          <w:tcPr>
+            <w:tcW w:w="1666" w:type="pct"/>
+          </w:tcPr>
+          <w:p>
+            <w:pPr>
+              <w:rPr>
+                <w:lang w:val="en-ZA"/>
+              </w:rPr>
+            </w:pPr>
+            <w:r>
+              <w:rPr>
+                <w:lang w:val="en-ZA"/>
+              </w:rPr>
+              <w:t>No</w:t>
+            </w:r>
+          </w:p>
+        </w:tc>
+        <w:tc>
+          <w:tcPr>
+            <w:tcW w:w="1667" w:type="pct"/>
+          </w:tcPr>
+          <w:p>
+            <w:pPr>
+              <w:rPr>
+                <w:lang w:val="en-ZA"/>
+              </w:rPr>
+            </w:pPr>
+            <w:r>
+              <w:t>Sales, revenue, or order value</w:t>
+            </w:r>
+          </w:p>
+        </w:tc>
+      </w:tr>
+      <w:tr>
+        <w:tc>
+          <w:tcPr>
+            <w:tcW w:w="1666" w:type="pct"/>
+          </w:tcPr>
+          <w:p>
+            <w:pPr>
+              <w:rPr>
+                <w:lang w:val="en-ZA"/>
+              </w:rPr>
+            </w:pPr>
+            <w:r>
+              <w:t>order_profit</w:t>
+            </w:r>
+          </w:p>
+        </w:tc>
+        <w:tc>
+          <w:tcPr>
+            <w:tcW w:w="1666" w:type="pct"/>
+          </w:tcPr>
+          <w:p>
+            <w:pPr>
+              <w:rPr>
+                <w:lang w:val="en-ZA"/>
+              </w:rPr>
+            </w:pPr>
+            <w:r>
+              <w:rPr>
+                <w:lang w:val="en-ZA"/>
+              </w:rPr>
+              <w:t>No</w:t>
+            </w:r>
+          </w:p>
+        </w:tc>
+        <w:tc>
+          <w:tcPr>
+            <w:tcW w:w="1667" w:type="pct"/>
+          </w:tcPr>
+          <w:p>
+            <w:pPr>
+              <w:rPr>
+                <w:lang w:val="en-ZA"/>
+              </w:rPr>
+            </w:pPr>
+            <w:r>
+              <w:t>Profit, margin, or financial result</w:t>
+            </w:r>
+          </w:p>
+        </w:tc>
+      </w:tr>
+    </w:tbl>
+    <w:p>
+      <w:pPr>
+        <w:rPr>
+          <w:lang w:val="en-ZA"/>
+        </w:rPr>
+      </w:pPr>
+      <w:r>
+        <w:rPr>
+          <w:lang w:val="en-ZA"/>
+        </w:rPr>
+        <w:t>If an optional field is not available in the uploaded dataset, the system uses default values or derives indicators when possible. For example, if actual shipping days and scheduled shipping days are not available, the system can calculate delay days by comparing the actual delivery date and the scheduled delivery date. This improves the flexibility of the platform and allows it to work with different supply chain datasets.</w:t>
+      </w:r>
+    </w:p>
     <w:p>
       <w:pPr>
         <w:pStyle w:val="Heading1"/>
@@ -5011,18 +5932,8 @@
     </w:p>
     <w:p>
       <w:r>
-        <w:t>……</w:t>
-      </w:r>
-      <w:proofErr w:type="gramStart"/>
-      <w:r>
-        <w:t>….</w:t>
-      </w:r>
-      <w:proofErr w:type="spellStart"/>
-      <w:r>
-        <w:t>fdfdfdf</w:t>
-      </w:r>
-      <w:proofErr w:type="spellEnd"/>
-      <w:proofErr w:type="gramEnd"/>
+        <w:t>……….fdfdfdf</w:t>
+      </w:r>
     </w:p>
     <w:p>
       <w:pPr>
@@ -5036,18 +5947,9 @@
     </w:p>
     <w:p>
       <w:r>
-        <w:t>……</w:t>
-      </w:r>
-      <w:proofErr w:type="gramStart"/>
-      <w:r>
-        <w:t>….</w:t>
-      </w:r>
-      <w:proofErr w:type="spellStart"/>
-      <w:r>
-        <w:t>fdfdfdf</w:t>
-      </w:r>
-      <w:proofErr w:type="spellEnd"/>
-      <w:proofErr w:type="gramEnd"/>
+        <w:lastRenderedPageBreak/>
+        <w:t>……….fdfdfdf</w:t>
+      </w:r>
     </w:p>
     <w:p/>
     <w:p>
@@ -5807,15 +6709,7 @@
       <w:bookmarkStart w:id="26" w:name="_Toc115861789"/>
       <w:r>
         <w:lastRenderedPageBreak/>
-        <w:t>GIT/KAGGLE/COLAB/</w:t>
-      </w:r>
-      <w:proofErr w:type="gramStart"/>
-      <w:r>
-        <w:t>etc..</w:t>
-      </w:r>
-      <w:proofErr w:type="gramEnd"/>
-      <w:r>
-        <w:t xml:space="preserve"> LINK</w:t>
+        <w:t>GIT/KAGGLE/COLAB/etc.. LINK</w:t>
       </w:r>
       <w:bookmarkEnd w:id="26"/>
     </w:p>
@@ -5892,7 +6786,6 @@
           <w:lang w:val="en-US" w:eastAsia="tr-TR"/>
         </w:rPr>
       </w:pPr>
-      <w:proofErr w:type="gramStart"/>
       <w:r>
         <w:rPr>
           <w:b/>
@@ -5900,7 +6793,6 @@
         </w:rPr>
         <w:t>Education :</w:t>
       </w:r>
-      <w:proofErr w:type="gramEnd"/>
     </w:p>
     <w:p>
       <w:pPr>
@@ -5908,7 +6800,6 @@
           <w:lang w:val="en-US" w:eastAsia="tr-TR"/>
         </w:rPr>
       </w:pPr>
-      <w:proofErr w:type="gramStart"/>
       <w:r>
         <w:rPr>
           <w:i/>
@@ -5921,14 +6812,7 @@
         <w:rPr>
           <w:lang w:val="en-US" w:eastAsia="tr-TR"/>
         </w:rPr>
-        <w:t xml:space="preserve"> :</w:t>
-      </w:r>
-      <w:proofErr w:type="gramEnd"/>
-      <w:r>
-        <w:rPr>
-          <w:lang w:val="en-US" w:eastAsia="tr-TR"/>
-        </w:rPr>
-        <w:t xml:space="preserve"> Piri Reis University </w:t>
+        <w:t xml:space="preserve"> : Piri Reis University </w:t>
       </w:r>
     </w:p>
     <w:p>
@@ -6490,10 +7374,10 @@
       </w:pPr>
     </w:p>
     <w:sectPr>
-      <w:headerReference w:type="default" r:id="rId9"/>
-      <w:footerReference w:type="even" r:id="rId10"/>
-      <w:footerReference w:type="default" r:id="rId11"/>
-      <w:footerReference w:type="first" r:id="rId12"/>
+      <w:headerReference w:type="default" r:id="rId10"/>
+      <w:footerReference w:type="even" r:id="rId11"/>
+      <w:footerReference w:type="default" r:id="rId12"/>
+      <w:footerReference w:type="first" r:id="rId13"/>
       <w:footnotePr>
         <w:numFmt w:val="chicago"/>
       </w:footnotePr>
@@ -6625,15 +7509,7 @@
       <w:t>South African Journal of Industrial Engineering</w:t>
     </w:r>
     <w:r>
-      <w:t xml:space="preserve"> Month Year Vol _</w:t>
-    </w:r>
-    <w:proofErr w:type="gramStart"/>
-    <w:r>
-      <w:t>_(</w:t>
-    </w:r>
-    <w:proofErr w:type="gramEnd"/>
-    <w:r>
-      <w:t>_):  p1-3</w:t>
+      <w:t xml:space="preserve"> Month Year Vol __(_):  p1-3</w:t>
     </w:r>
   </w:p>
 </w:ftr>

</xml_diff>

<commit_message>
Add dashboard model modules and risk scoring sections
</commit_message>
<xml_diff>
--- a/docs/graduation_thesis_report.docx
+++ b/docs/graduation_thesis_report.docx
@@ -315,6 +315,7 @@
         </w:rPr>
         <w:t>G</w:t>
       </w:r>
+      <w:proofErr w:type="spellStart"/>
       <w:r>
         <w:rPr>
           <w:b/>
@@ -323,7 +324,18 @@
           <w:szCs w:val="32"/>
           <w:lang w:val="tr-TR"/>
         </w:rPr>
-        <w:t>ülse Dolunay ÜNLÜ</w:t>
+        <w:t>ülse</w:t>
+      </w:r>
+      <w:proofErr w:type="spellEnd"/>
+      <w:r>
+        <w:rPr>
+          <w:b/>
+          <w:color w:val="000000" w:themeColor="text1"/>
+          <w:sz w:val="32"/>
+          <w:szCs w:val="32"/>
+          <w:lang w:val="tr-TR"/>
+        </w:rPr>
+        <w:t xml:space="preserve"> Dolunay ÜNLÜ</w:t>
       </w:r>
     </w:p>
     <w:p>
@@ -405,6 +417,7 @@
         </w:rPr>
         <w:t xml:space="preserve">Advisor: </w:t>
       </w:r>
+      <w:proofErr w:type="spellStart"/>
       <w:r>
         <w:rPr>
           <w:bCs/>
@@ -413,81 +426,9 @@
           <w:szCs w:val="32"/>
           <w:lang w:val="en-US"/>
         </w:rPr>
-        <w:t>Doç. Dr. Orhan Özgür AYBAR</w:t>
-      </w:r>
-    </w:p>
-    <w:p>
-      <w:pPr>
-        <w:jc w:val="center"/>
-        <w:rPr>
-          <w:bCs/>
-          <w:sz w:val="32"/>
-          <w:szCs w:val="32"/>
-          <w:lang w:val="en-US"/>
-        </w:rPr>
-      </w:pPr>
-    </w:p>
-    <w:p>
-      <w:pPr>
-        <w:jc w:val="center"/>
-        <w:rPr>
-          <w:bCs/>
-          <w:sz w:val="32"/>
-          <w:szCs w:val="32"/>
-          <w:lang w:val="en-US"/>
-        </w:rPr>
-      </w:pPr>
-    </w:p>
-    <w:p>
-      <w:pPr>
-        <w:jc w:val="center"/>
-        <w:rPr>
-          <w:bCs/>
-          <w:sz w:val="32"/>
-          <w:szCs w:val="32"/>
-          <w:lang w:val="en-US"/>
-        </w:rPr>
-      </w:pPr>
-    </w:p>
-    <w:p>
-      <w:pPr>
-        <w:jc w:val="center"/>
-        <w:rPr>
-          <w:bCs/>
-          <w:sz w:val="32"/>
-          <w:szCs w:val="32"/>
-          <w:lang w:val="en-US"/>
-        </w:rPr>
-      </w:pPr>
-    </w:p>
-    <w:p>
-      <w:pPr>
-        <w:jc w:val="center"/>
-        <w:rPr>
-          <w:bCs/>
-          <w:sz w:val="32"/>
-          <w:szCs w:val="32"/>
-          <w:lang w:val="en-US"/>
-        </w:rPr>
-      </w:pPr>
-      <w:r>
-        <w:rPr>
-          <w:bCs/>
-          <w:sz w:val="32"/>
-          <w:szCs w:val="32"/>
-          <w:lang w:val="en-US"/>
-        </w:rPr>
-        <w:t>İstanbul</w:t>
-      </w:r>
-      <w:r>
-        <w:rPr>
-          <w:bCs/>
-          <w:sz w:val="32"/>
-          <w:szCs w:val="32"/>
-          <w:lang w:val="en-US"/>
-        </w:rPr>
-        <w:t xml:space="preserve"> </w:t>
-      </w:r>
+        <w:t>Doç</w:t>
+      </w:r>
+      <w:proofErr w:type="spellEnd"/>
       <w:r>
         <w:rPr>
           <w:bCs/>
@@ -496,7 +437,80 @@
           <w:szCs w:val="32"/>
           <w:lang w:val="en-US"/>
         </w:rPr>
-        <w:t>May, 202</w:t>
+        <w:t>. Dr. Orhan Özgür AYBAR</w:t>
+      </w:r>
+    </w:p>
+    <w:p>
+      <w:pPr>
+        <w:jc w:val="center"/>
+        <w:rPr>
+          <w:bCs/>
+          <w:sz w:val="32"/>
+          <w:szCs w:val="32"/>
+          <w:lang w:val="en-US"/>
+        </w:rPr>
+      </w:pPr>
+    </w:p>
+    <w:p>
+      <w:pPr>
+        <w:jc w:val="center"/>
+        <w:rPr>
+          <w:bCs/>
+          <w:sz w:val="32"/>
+          <w:szCs w:val="32"/>
+          <w:lang w:val="en-US"/>
+        </w:rPr>
+      </w:pPr>
+    </w:p>
+    <w:p>
+      <w:pPr>
+        <w:jc w:val="center"/>
+        <w:rPr>
+          <w:bCs/>
+          <w:sz w:val="32"/>
+          <w:szCs w:val="32"/>
+          <w:lang w:val="en-US"/>
+        </w:rPr>
+      </w:pPr>
+    </w:p>
+    <w:p>
+      <w:pPr>
+        <w:jc w:val="center"/>
+        <w:rPr>
+          <w:bCs/>
+          <w:sz w:val="32"/>
+          <w:szCs w:val="32"/>
+          <w:lang w:val="en-US"/>
+        </w:rPr>
+      </w:pPr>
+    </w:p>
+    <w:p>
+      <w:pPr>
+        <w:jc w:val="center"/>
+        <w:rPr>
+          <w:bCs/>
+          <w:sz w:val="32"/>
+          <w:szCs w:val="32"/>
+          <w:lang w:val="en-US"/>
+        </w:rPr>
+      </w:pPr>
+      <w:r>
+        <w:rPr>
+          <w:bCs/>
+          <w:sz w:val="32"/>
+          <w:szCs w:val="32"/>
+          <w:lang w:val="en-US"/>
+        </w:rPr>
+        <w:t>İstanbul</w:t>
+      </w:r>
+      <w:r>
+        <w:rPr>
+          <w:bCs/>
+          <w:sz w:val="32"/>
+          <w:szCs w:val="32"/>
+          <w:lang w:val="en-US"/>
+        </w:rPr>
+        <w:t xml:space="preserve"> </w:t>
       </w:r>
       <w:r>
         <w:rPr>
@@ -506,6 +520,16 @@
           <w:szCs w:val="32"/>
           <w:lang w:val="en-US"/>
         </w:rPr>
+        <w:t>May, 202</w:t>
+      </w:r>
+      <w:r>
+        <w:rPr>
+          <w:bCs/>
+          <w:color w:val="000000" w:themeColor="text1"/>
+          <w:sz w:val="32"/>
+          <w:szCs w:val="32"/>
+          <w:lang w:val="en-US"/>
+        </w:rPr>
         <w:t>6</w:t>
       </w:r>
       <w:r>
@@ -540,7 +564,35 @@
         <w:rPr>
           <w:lang w:val="en-US"/>
         </w:rPr>
-        <w:t>I hereby declare that this thesis represents my own work which has been done after registration for the degree of bachelor at Piri Reis University, and has not been previously included in a thesis or dissertation submitted to this or any other institution for a degree, diploma or other qualifications.</w:t>
+        <w:t xml:space="preserve">I hereby declare that this thesis represents my own work which has been done after registration for the </w:t>
+      </w:r>
+      <w:proofErr w:type="gramStart"/>
+      <w:r>
+        <w:rPr>
+          <w:lang w:val="en-US"/>
+        </w:rPr>
+        <w:t>degree of bachelor</w:t>
+      </w:r>
+      <w:proofErr w:type="gramEnd"/>
+      <w:r>
+        <w:rPr>
+          <w:lang w:val="en-US"/>
+        </w:rPr>
+        <w:t xml:space="preserve"> at Piri Reis </w:t>
+      </w:r>
+      <w:proofErr w:type="gramStart"/>
+      <w:r>
+        <w:rPr>
+          <w:lang w:val="en-US"/>
+        </w:rPr>
+        <w:t>University, and</w:t>
+      </w:r>
+      <w:proofErr w:type="gramEnd"/>
+      <w:r>
+        <w:rPr>
+          <w:lang w:val="en-US"/>
+        </w:rPr>
+        <w:t xml:space="preserve"> has not been previously included in a thesis or dissertation submitted to this or any other institution for a degree, diploma or other qualifications.</w:t>
       </w:r>
     </w:p>
     <w:p>
@@ -725,7 +777,7 @@
       <w:pPr>
         <w:spacing w:after="0" w:line="276" w:lineRule="auto"/>
         <w:rPr>
-          <w:lang w:val="en-US" w:eastAsia="tr-TR"/>
+          <w:lang w:eastAsia="tr-TR"/>
         </w:rPr>
       </w:pPr>
       <w:r>
@@ -775,6 +827,14 @@
         </w:rPr>
         <w:t xml:space="preserve"> Dr. Orhan Özgür AYBAR, for his guidance and support during this graduation thesis.</w:t>
       </w:r>
+    </w:p>
+    <w:p>
+      <w:pPr>
+        <w:spacing w:after="0" w:line="276" w:lineRule="auto"/>
+        <w:rPr>
+          <w:lang w:eastAsia="tr-TR"/>
+        </w:rPr>
+      </w:pPr>
       <w:r>
         <w:rPr>
           <w:lang w:eastAsia="tr-TR"/>
@@ -788,6 +848,14 @@
         <w:br/>
         <w:t>I would also like to thank the Management Information Systems Department of Piri Reis University for the knowledge and academic background provided throughout my undergraduate education.</w:t>
       </w:r>
+    </w:p>
+    <w:p>
+      <w:pPr>
+        <w:spacing w:after="0" w:line="276" w:lineRule="auto"/>
+        <w:rPr>
+          <w:lang w:val="en-US" w:eastAsia="tr-TR"/>
+        </w:rPr>
+      </w:pPr>
       <w:r>
         <w:rPr>
           <w:lang w:eastAsia="tr-TR"/>
@@ -1019,21 +1087,44 @@
       <w:bookmarkEnd w:id="5"/>
     </w:p>
     <w:p>
-      <w:pPr>
-        <w:rPr>
-          <w:lang w:val="en-US"/>
-        </w:rPr>
-      </w:pPr>
-      <w:r>
-        <w:t>Supply chains include many connected activities such as order management, shipment planning, inventory control, delivery tracking, regional performance monitoring, and demand planning. When these activities are analyzed separately, managers may have difficulty seeing operational problems and risks on time. This graduation thesis develops a Supply Chain Visibility and Risk Assessment Platform to support supply chain decision-making through data visualization, risk analysis, and dataset standardization.</w:t>
-      </w:r>
+      <w:r>
+        <w:t xml:space="preserve">Supply chains include many connected activities such as order management, shipment planning, inventory control, delivery tracking, regional performance monitoring, and demand planning. When these activities are </w:t>
+      </w:r>
+      <w:proofErr w:type="spellStart"/>
+      <w:r>
+        <w:t>analyzed</w:t>
+      </w:r>
+      <w:proofErr w:type="spellEnd"/>
+      <w:r>
+        <w:t xml:space="preserve"> separately, managers may have difficulty seeing operational problems and risks on time. This graduation thesis develops a Supply Chain Visibility and Risk Assessment Platform to support supply chain decision-making through data visualization, risk analysis, and dataset standardization.</w:t>
+      </w:r>
+    </w:p>
+    <w:p>
       <w:r>
         <w:br/>
       </w:r>
       <w:r>
         <w:br/>
-        <w:t>The platform was developed with Python and Streamlit. It uses the public DataCo Smart Supply Chain dataset as the default demonstration dataset. In addition, the system allows users to upload a new supply chain dataset in CSV or Excel format. The uploaded dataset can be mapped to a standard supply chain schema and then used dynamically across the dashboard pages. The platform includes modules for overview analysis, regional performance, inventory control, shipment performance, supply chain risk, and demand forecasting.</w:t>
-      </w:r>
+        <w:t xml:space="preserve">The platform was developed with Python and </w:t>
+      </w:r>
+      <w:proofErr w:type="spellStart"/>
+      <w:r>
+        <w:t>Streamlit</w:t>
+      </w:r>
+      <w:proofErr w:type="spellEnd"/>
+      <w:r>
+        <w:t xml:space="preserve">. It uses the public </w:t>
+      </w:r>
+      <w:proofErr w:type="spellStart"/>
+      <w:r>
+        <w:t>DataCo</w:t>
+      </w:r>
+      <w:proofErr w:type="spellEnd"/>
+      <w:r>
+        <w:t xml:space="preserve"> Smart Supply Chain dataset as the default demonstration dataset. In addition, the system allows users to upload a new supply chain dataset in CSV or Excel format. The uploaded dataset can be mapped to a standard supply chain schema and then used dynamically across the dashboard pages. The platform includes modules for overview analysis, regional performance, inventory control, shipment performance, supply chain risk, and demand forecasting.</w:t>
+      </w:r>
+    </w:p>
+    <w:p>
       <w:r>
         <w:br/>
       </w:r>
@@ -1047,12 +1138,27 @@
       <w:r>
         <w:t>. The results show that a dataset-adaptive dashboard can improve visibility and help users identify delivery risks, inventory warnings, regional issues, and demand patterns from a single interface.</w:t>
       </w:r>
+    </w:p>
+    <w:p>
+      <w:pPr>
+        <w:rPr>
+          <w:lang w:val="en-US"/>
+        </w:rPr>
+      </w:pPr>
       <w:r>
         <w:br/>
       </w:r>
       <w:r>
         <w:br/>
-        <w:t>Key Words: Supply Chain Visibility, Risk Assessment, Data Standardization, Streamlit Dashboard, Business Intelligence, Demand Forecasting</w:t>
+        <w:t xml:space="preserve">Key Words: Supply Chain Visibility, Risk Assessment, Data Standardization, </w:t>
+      </w:r>
+      <w:proofErr w:type="spellStart"/>
+      <w:r>
+        <w:t>Streamlit</w:t>
+      </w:r>
+      <w:proofErr w:type="spellEnd"/>
+      <w:r>
+        <w:t xml:space="preserve"> Dashboard, Business Intelligence, Demand Forecasting</w:t>
       </w:r>
     </w:p>
     <w:p>
@@ -3639,79 +3745,119 @@
     <w:p>
       <w:pPr>
         <w:rPr>
+          <w:noProof/>
+          <w:color w:val="000000" w:themeColor="text1"/>
+        </w:rPr>
+      </w:pPr>
+      <w:r>
+        <w:rPr>
+          <w:noProof/>
+          <w:color w:val="000000" w:themeColor="text1"/>
+        </w:rPr>
+        <w:t>Supply chain management includes many connected activities such as order processing, shipment planning, inventory control, delivery tracking, regional performance monitoring, and demand planning. In many organizations, these activities are recorded in different files, systems, or reports. When supply chain data is not analyzed in an integrated way, managers may have difficulty understanding current performance and detecting operational risks on time.</w:t>
+      </w:r>
+    </w:p>
+    <w:p>
+      <w:pPr>
+        <w:rPr>
+          <w:noProof/>
+          <w:color w:val="000000" w:themeColor="text1"/>
+        </w:rPr>
+      </w:pPr>
+      <w:r>
+        <w:rPr>
+          <w:noProof/>
+          <w:color w:val="000000" w:themeColor="text1"/>
+        </w:rPr>
+        <w:br/>
+      </w:r>
+      <w:r>
+        <w:rPr>
+          <w:noProof/>
+          <w:color w:val="000000" w:themeColor="text1"/>
+        </w:rPr>
+        <w:br/>
+        <w:t>Visibility is one of the most important needs in supply chain operations. Managers need to see how orders, shipments, products, regions, inventory indicators, and demand patterns are performing. Without a clear visibility system, late deliveries, stock risks, regional problems, and demand changes may not be noticed early enough. For this reason, dashboard-based decision-support systems are useful for transforming raw supply chain data into understandable information.</w:t>
+      </w:r>
+    </w:p>
+    <w:p>
+      <w:pPr>
+        <w:rPr>
+          <w:noProof/>
+          <w:color w:val="000000" w:themeColor="text1"/>
+        </w:rPr>
+      </w:pPr>
+      <w:r>
+        <w:rPr>
+          <w:noProof/>
+          <w:color w:val="000000" w:themeColor="text1"/>
+        </w:rPr>
+        <w:br/>
+      </w:r>
+      <w:r>
+        <w:rPr>
+          <w:noProof/>
+          <w:color w:val="000000" w:themeColor="text1"/>
+        </w:rPr>
+        <w:br/>
+        <w:t>This graduation thesis develops a Supply Chain Visibility and Risk Assessment Platform. The aim of the project is to create an interactive system that helps users monitor supply chain performance and operational risk from a single interface. The platform provides dashboard modules for executive overview, regional performance, inventory control, shipment performance, supply chain risk analysis, and demand forecasting.</w:t>
+      </w:r>
+    </w:p>
+    <w:p>
+      <w:pPr>
+        <w:rPr>
+          <w:noProof/>
+          <w:color w:val="000000" w:themeColor="text1"/>
+        </w:rPr>
+      </w:pPr>
+      <w:r>
+        <w:rPr>
+          <w:noProof/>
+          <w:color w:val="000000" w:themeColor="text1"/>
+        </w:rPr>
+        <w:br/>
+      </w:r>
+      <w:r>
+        <w:rPr>
+          <w:noProof/>
+          <w:color w:val="000000" w:themeColor="text1"/>
+        </w:rPr>
+        <w:br/>
+        <w:t>The project uses the public DataCo Smart Supply Chain dataset as the default demonstration dataset. However, the system is not limited to this dataset. Users can also upload their own supply chain datasets in CSV or Excel format. After uploading a dataset, users map its columns to a standard supply chain schema. The system then standardizes the uploaded data and dynamically updates the dashboard pages according to the active dataset.</w:t>
+      </w:r>
+    </w:p>
+    <w:p>
+      <w:pPr>
+        <w:rPr>
+          <w:noProof/>
+          <w:color w:val="000000" w:themeColor="text1"/>
+        </w:rPr>
+      </w:pPr>
+      <w:r>
+        <w:rPr>
+          <w:noProof/>
+          <w:color w:val="000000" w:themeColor="text1"/>
+        </w:rPr>
+        <w:br/>
+      </w:r>
+      <w:r>
+        <w:rPr>
+          <w:noProof/>
+          <w:color w:val="000000" w:themeColor="text1"/>
+        </w:rPr>
+        <w:br/>
+        <w:t>The main purpose of this project is not only to visualize one historical dataset, but also to design a reusable dashboard structure for different supply chain datasets. By combining data upload, column mapping, data standardization, KPI calculation, risk scoring, and forecasting, the platform supports a more flexible approach to supply chain visibility and risk assessment.</w:t>
+      </w:r>
+    </w:p>
+    <w:p>
+      <w:pPr>
+        <w:rPr>
           <w:i/>
           <w:noProof/>
           <w:color w:val="000000" w:themeColor="text1"/>
           <w:lang w:val="tr-TR"/>
         </w:rPr>
       </w:pPr>
-      <w:r>
-        <w:rPr>
-          <w:noProof/>
-          <w:color w:val="000000" w:themeColor="text1"/>
-        </w:rPr>
-        <w:t>Supply chain management includes many connected activities such as order processing, shipment planning, inventory control, delivery tracking, regional performance monitoring, and demand planning. In many organizations, these activities are recorded in different files, systems, or reports. When supply chain data is not analyzed in an integrated way, managers may have difficulty understanding current performance and detecting operational risks on time.</w:t>
-      </w:r>
-      <w:r>
-        <w:rPr>
-          <w:noProof/>
-          <w:color w:val="000000" w:themeColor="text1"/>
-        </w:rPr>
-        <w:br/>
-      </w:r>
-      <w:r>
-        <w:rPr>
-          <w:noProof/>
-          <w:color w:val="000000" w:themeColor="text1"/>
-        </w:rPr>
-        <w:br/>
-        <w:t>Visibility is one of the most important needs in supply chain operations. Managers need to see how orders, shipments, products, regions, inventory indicators, and demand patterns are performing. Without a clear visibility system, late deliveries, stock risks, regional problems, and demand changes may not be noticed early enough. For this reason, dashboard-based decision-support systems are useful for transforming raw supply chain data into understandable information.</w:t>
-      </w:r>
-      <w:r>
-        <w:rPr>
-          <w:noProof/>
-          <w:color w:val="000000" w:themeColor="text1"/>
-        </w:rPr>
-        <w:br/>
-      </w:r>
-      <w:r>
-        <w:rPr>
-          <w:noProof/>
-          <w:color w:val="000000" w:themeColor="text1"/>
-        </w:rPr>
-        <w:br/>
-        <w:t>This graduation thesis develops a Supply Chain Visibility and Risk Assessment Platform. The aim of the project is to create an interactive system that helps users monitor supply chain performance and operational risk from a single interface. The platform provides dashboard modules for executive overview, regional performance, inventory control, shipment performance, supply chain risk analysis, and demand forecasting.</w:t>
-      </w:r>
-      <w:r>
-        <w:rPr>
-          <w:noProof/>
-          <w:color w:val="000000" w:themeColor="text1"/>
-        </w:rPr>
-        <w:br/>
-      </w:r>
-      <w:r>
-        <w:rPr>
-          <w:noProof/>
-          <w:color w:val="000000" w:themeColor="text1"/>
-        </w:rPr>
-        <w:br/>
-        <w:t>The project uses the public DataCo Smart Supply Chain dataset as the default demonstration dataset. However, the system is not limited to this dataset. Users can also upload their own supply chain datasets in CSV or Excel format. After uploading a dataset, users map its columns to a standard supply chain schema. The system then standardizes the uploaded data and dynamically updates the dashboard pages according to the active dataset.</w:t>
-      </w:r>
-      <w:r>
-        <w:rPr>
-          <w:noProof/>
-          <w:color w:val="000000" w:themeColor="text1"/>
-        </w:rPr>
-        <w:br/>
-      </w:r>
-      <w:r>
-        <w:rPr>
-          <w:noProof/>
-          <w:color w:val="000000" w:themeColor="text1"/>
-        </w:rPr>
-        <w:br/>
-        <w:t>The main purpose of this project is not only to visualize one historical dataset, but also to design a reusable dashboard structure for different supply chain datasets. By combining data upload, column mapping, data standardization, KPI calculation, risk scoring, and forecasting, the platform supports a more flexible approach to supply chain visibility and risk assessment.</w:t>
-      </w:r>
     </w:p>
     <w:p>
       <w:pPr>
@@ -3753,7 +3899,15 @@
     <w:p/>
     <w:p>
       <w:r>
-        <w:t>In this project, supply chain visibility is addressed through a multi-page dashboard structure. The platform brings different operational views together, including overview indicators, regional performance, inventory control, shipment performance, risk analysis, and demand forecasting. This supports the idea that supply chain visibility should not focus on only one metric, but should combine different operational indicators.</w:t>
+        <w:t xml:space="preserve">In this project, supply chain visibility is addressed through a multi-page dashboard structure. The platform brings different operational views together, including overview indicators, regional performance, inventory control, shipment performance, risk analysis, and demand forecasting. This supports the idea that supply chain visibility should not focus on only one </w:t>
+      </w:r>
+      <w:proofErr w:type="gramStart"/>
+      <w:r>
+        <w:t>metric, but</w:t>
+      </w:r>
+      <w:proofErr w:type="gramEnd"/>
+      <w:r>
+        <w:t xml:space="preserve"> should combine different operational indicators.</w:t>
       </w:r>
     </w:p>
     <w:p/>
@@ -3762,51 +3916,162 @@
         <w:pStyle w:val="Heading2"/>
       </w:pPr>
       <w:r>
+        <w:lastRenderedPageBreak/>
         <w:t>Business Intelligence Dashboards and Decision Support</w:t>
       </w:r>
     </w:p>
     <w:p>
       <w:r>
-        <w:t>Business intelligence dashboards are used to transform raw data into visual and understandable information. Instead of analyzing large tables manually, users can monitor key performance indicators, charts, and summary tables through an interactive interface. Dashboards are especially useful in operational areas where managers need to make quick and data-based decisions. [INSERT CITATION: Business Intelligence Dashboards]</w:t>
+        <w:t xml:space="preserve">Business intelligence dashboards are used to transform raw data into visual and understandable information. Instead of </w:t>
+      </w:r>
+      <w:proofErr w:type="spellStart"/>
+      <w:r>
+        <w:t>analyzing</w:t>
+      </w:r>
+      <w:proofErr w:type="spellEnd"/>
+      <w:r>
+        <w:t xml:space="preserve"> large tables manually, users can monitor key performance indicators, charts, and summary tables through an interactive interface. Dashboards are especially useful in operational areas where managers need to make quick and data-based decisions. [INSERT CITATION: Business Intelligence Dashboards]</w:t>
       </w:r>
     </w:p>
     <w:p/>
     <w:p>
       <w:r>
+        <w:t>In supply chain management, dashboards can support decision-making by showing delivery performance, regional differences, inventory problems, shipment delays, and risk indicators. A well-designed dashboard does not only display data; it also helps users compare performance, identify patterns, and focus on problem areas. For this reason, dashboards can act as decision-support tools for supply chain managers, logistics analysts, inventory planners, and business analysts. [INSERT CITATION: Business Intelligence Dashboards]</w:t>
+      </w:r>
+    </w:p>
+    <w:p/>
+    <w:p>
+      <w:r>
+        <w:t>This project uses a dashboard-based approach because the goal is to make supply chain data more usable for decision-making. The system includes interactive filters, KPI cards, charts, tables, risk scores, and forecast outputs. These features help users move from raw data to operational insight.</w:t>
+      </w:r>
+    </w:p>
+    <w:p/>
+    <w:p>
+      <w:pPr>
+        <w:pStyle w:val="Heading2"/>
+      </w:pPr>
+      <w:r>
+        <w:t>Supply Chain Risk Management</w:t>
+      </w:r>
+    </w:p>
+    <w:p>
+      <w:r>
+        <w:t>Supply chain risk management focuses on identifying, assessing, and reducing risks that can affect supply chain performance. These risks may include late deliveries, transportation delays, demand uncertainty, inventory shortages, regional disruptions, supplier problems, and financial losses. Since supply chains include many connected activities, a problem in one part of the system can affect other parts of the operation. [INSERT CITATION: Supply Chain Risk Management]</w:t>
+      </w:r>
+    </w:p>
+    <w:p/>
+    <w:p>
+      <w:r>
+        <w:t>Risk assessment is more useful when different risk indicators are evaluated together. For example, late delivery rate alone may not fully explain supply chain risk. A better risk view may also include delay days, inventory condition, demand volatility, and regional performance. Therefore, dashboard-based risk analysis can help managers understand not only where risks exist, but also which indicators contribute to those risks. [INSERT CITATION: Supply Chain Risk Management]</w:t>
+      </w:r>
+    </w:p>
+    <w:p/>
+    <w:p>
+      <w:r>
+        <w:t xml:space="preserve">In this project, supply chain risk is calculated using rule-based and interpretable indicators. The system </w:t>
+      </w:r>
+      <w:proofErr w:type="spellStart"/>
+      <w:r>
+        <w:t>analyzes</w:t>
+      </w:r>
+      <w:proofErr w:type="spellEnd"/>
+      <w:r>
+        <w:t xml:space="preserve"> delivery risk, delay risk, inventory risk, demand volatility risk, and region-level risk. The purpose is not to create a complex black-box prediction model, but to provide a clear and understandable risk assessment structure for decision support.</w:t>
+      </w:r>
+    </w:p>
+    <w:p/>
+    <w:p>
+      <w:pPr>
+        <w:pStyle w:val="Heading2"/>
+      </w:pPr>
+      <w:r>
+        <w:t>Digital Transformation and Data-Driven Logistics</w:t>
+      </w:r>
+    </w:p>
+    <w:p>
+      <w:r>
+        <w:t xml:space="preserve">Digital transformation in logistics and supply chain management is closely related to the use of data, automation, analytics, and connected systems. Digital tools can improve transparency by collecting and </w:t>
+      </w:r>
+      <w:proofErr w:type="spellStart"/>
+      <w:r>
+        <w:t>analyzing</w:t>
+      </w:r>
+      <w:proofErr w:type="spellEnd"/>
+      <w:r>
+        <w:t xml:space="preserve"> operational data from different stages of the supply chain. This can support better planning, faster decision-making, and improved coordination between supply chain activities. [INSERT CITATION: Digital Transformation in Logistics]</w:t>
+      </w:r>
+    </w:p>
+    <w:p/>
+    <w:p>
+      <w:r>
+        <w:t>However, digital transformation also requires data integration. Many organizations keep supply chain information in different systems, files, or formats. If these datasets cannot be combined or standardized, it becomes difficult to create useful dashboards and risk analysis tools. For this reason, data standardization is an important part of supply chain analytics. [INSERT CITATION: Data Quality / Data Standardization]</w:t>
+      </w:r>
+    </w:p>
+    <w:p/>
+    <w:p>
+      <w:r>
+        <w:t>This project addresses this issue by adding a dataset upload and standardization module. Users can upload a new CSV or Excel supply chain dataset and map its columns to a standard schema. After this mapping process, the system converts the uploaded data into dashboard-ready analytical tables. This makes the platform more flexible than a dashboard that works with only one fixed dataset.</w:t>
+      </w:r>
+    </w:p>
+    <w:p/>
+    <w:p>
+      <w:pPr>
+        <w:pStyle w:val="Heading2"/>
+      </w:pPr>
+      <w:r>
         <w:lastRenderedPageBreak/>
-        <w:t>In supply chain management, dashboards can support decision-making by showing delivery performance, regional differences, inventory problems, shipment delays, and risk indicators. A well-designed dashboard does not only display data; it also helps users compare performance, identify patterns, and focus on problem areas. For this reason, dashboards can act as decision-support tools for supply chain managers, logistics analysts, inventory planners, and business analysts. [INSERT CITATION: Business Intelligence Dashboards]</w:t>
+        <w:t>Demand Forecasting in Supply Chain Planning</w:t>
+      </w:r>
+    </w:p>
+    <w:p>
+      <w:r>
+        <w:t>Demand forecasting is an important part of supply chain planning because it helps organizations estimate future demand and prepare operational plans. Forecasting can support decisions related to inventory levels, replenishment planning, transportation capacity, and product availability. Even simple forecasting methods can be useful for understanding general demand trends. [INSERT CITATION: Demand Forecasting]</w:t>
       </w:r>
     </w:p>
     <w:p/>
     <w:p>
       <w:r>
-        <w:t>This project uses a dashboard-based approach because the goal is to make supply chain data more usable for decision-making. The system includes interactive filters, KPI cards, charts, tables, risk scores, and forecast outputs. These features help users move from raw data to operational insight.</w:t>
+        <w:t>In supply chain dashboards, demand forecasting is often used together with historical demand analysis. Users can compare past demand patterns with forecasted values and evaluate whether demand is increasing, decreasing, or unstable. Forecast accuracy metrics can also help users understand how well a forecasting method performs. [INSERT CITATION: Demand Forecasting]</w:t>
       </w:r>
     </w:p>
     <w:p/>
     <w:p>
+      <w:r>
+        <w:t>In this project, the demand forecasting module uses historical monthly demand data. The platform includes simple forecasting methods such as moving average and linear regression. These methods are suitable for a dashboard prototype because they are understandable, easy to implement, and useful for demonstrating how demand data can be turned into future demand estimates.</w:t>
+      </w:r>
+    </w:p>
+    <w:p/>
+    <w:p>
       <w:pPr>
         <w:pStyle w:val="Heading2"/>
       </w:pPr>
       <w:r>
-        <w:t>Supply Chain Risk Management</w:t>
-      </w:r>
-    </w:p>
-    <w:p>
-      <w:r>
-        <w:t>Supply chain risk management focuses on identifying, assessing, and reducing risks that can affect supply chain performance. These risks may include late deliveries, transportation delays, demand uncertainty, inventory shortages, regional disruptions, supplier problems, and financial losses. Since supply chains include many connected activities, a problem in one part of the system can affect other parts of the operation. [INSERT CITATION: Supply Chain Risk Management]</w:t>
+        <w:t>Data Standardization and Uploaded Dataset Support</w:t>
+      </w:r>
+    </w:p>
+    <w:p>
+      <w:r>
+        <w:t>A major challenge in data-driven dashboard systems is that datasets may have different column names, formats, and levels of completeness. For example, one dataset may use “order date,” another may use “PO created date,” and another may use a different name for the same concept. If the system cannot handle these differences, it can only work with one fixed dataset. [INSERT CITATION: Data Quality / Data Standardization]</w:t>
       </w:r>
     </w:p>
     <w:p/>
     <w:p>
       <w:r>
-        <w:t>Risk assessment is more useful when different risk indicators are evaluated together. For example, late delivery rate alone may not fully explain supply chain risk. A better risk view may also include delay days, inventory condition, demand volatility, and regional performance. Therefore, dashboard-based risk analysis can help managers understand not only where risks exist, but also which indicators contribute to those risks. [INSERT CITATION: Supply Chain Risk Management]</w:t>
+        <w:t>To make a dashboard reusable, uploaded datasets should be converted into a common structure. This requires a standard schema, column mapping, data validation, and derived indicators. In this project, the standard schema includes fields such as order ID, order date, product name, category, quantity, shipping date, scheduled delivery date, delivery status, shipping mode, market, region, country, sales, and profit.</w:t>
       </w:r>
     </w:p>
     <w:p/>
     <w:p>
       <w:r>
-        <w:t>In this project, supply chain risk is calculated using rule-based and interpretable indicators. The system analyzes delivery risk, delay risk, inventory risk, demand volatility risk, and region-level risk. The purpose is not to create a complex black-box prediction model, but to provide a clear and understandable risk assessment structure for decision support.</w:t>
+        <w:t xml:space="preserve">The dataset upload feature improves the originality and usefulness of the project. The default </w:t>
+      </w:r>
+      <w:proofErr w:type="spellStart"/>
+      <w:r>
+        <w:t>DataCo</w:t>
+      </w:r>
+      <w:proofErr w:type="spellEnd"/>
+      <w:r>
+        <w:t xml:space="preserve"> dataset is used as a demonstration dataset, but the system can also process new supply chain datasets. After the user maps the uploaded dataset to the standard schema, the dashboard pages are generated dynamically based on the active dataset. This makes the platform more reusable for different supply chain data sources.</w:t>
       </w:r>
     </w:p>
     <w:p/>
@@ -3815,100 +4080,26 @@
         <w:pStyle w:val="Heading2"/>
       </w:pPr>
       <w:r>
-        <w:t>Digital Transformation and Data-Driven Logistics</w:t>
-      </w:r>
-    </w:p>
-    <w:p>
-      <w:r>
-        <w:t>Digital transformation in logistics and supply chain management is closely related to the use of data, automation, analytics, and connected systems. Digital tools can improve transparency by collecting and analyzing operational data from different stages of the supply chain. This can support better planning, faster decision-making, and improved coordination between supply chain activities. [INSERT CITATION: Digital Transformation in Logistics]</w:t>
+        <w:t>Summary of Literature Review</w:t>
+      </w:r>
+    </w:p>
+    <w:p>
+      <w:r>
+        <w:t>The reviewed concepts show that supply chain visibility, dashboard-based decision support, risk assessment, digital transformation, forecasting, and data standardization are strongly connected. Supply chain visibility helps managers monitor operational activities. Business intelligence dashboards make complex data easier to understand. Risk management supports the identification of delivery, inventory, demand, and regional risks. Forecasting helps users observe future demand trends. Data standardization allows different datasets to be used in a common dashboard structure.</w:t>
       </w:r>
     </w:p>
     <w:p/>
     <w:p>
       <w:r>
-        <w:t>However, digital transformation also requires data integration. Many organizations keep supply chain information in different systems, files, or formats. If these datasets cannot be combined or standardized, it becomes difficult to create useful dashboards and risk analysis tools. For this reason, data standardization is an important part of supply chain analytics. [INSERT CITATION: Data Quality / Data Standardization]</w:t>
-      </w:r>
-    </w:p>
-    <w:p/>
-    <w:p>
-      <w:r>
-        <w:t>This project addresses this issue by adding a dataset upload and standardization module. Users can upload a new CSV or Excel supply chain dataset and map its columns to a standard schema. After this mapping process, the system converts the uploaded data into dashboard-ready analytical tables. This makes the platform more flexible than a dashboard that works with only one fixed dataset.</w:t>
-      </w:r>
-    </w:p>
-    <w:p/>
-    <w:p>
-      <w:pPr>
-        <w:pStyle w:val="Heading2"/>
-      </w:pPr>
-      <w:r>
-        <w:t>Demand Forecasting in Supply Chain Planning</w:t>
-      </w:r>
-    </w:p>
-    <w:p>
-      <w:r>
-        <w:t>Demand forecasting is an important part of supply chain planning because it helps organizations estimate future demand and prepare operational plans. Forecasting can support decisions related to inventory levels, replenishment planning, transportation capacity, and product availability. Even simple forecasting methods can be useful for understanding general demand trends. [INSERT CITATION: Demand Forecasting]</w:t>
-      </w:r>
-    </w:p>
-    <w:p/>
-    <w:p>
-      <w:r>
-        <w:t xml:space="preserve">In supply chain dashboards, demand forecasting is often used together with historical demand analysis. Users can compare past demand patterns with forecasted values and evaluate whether demand is increasing, decreasing, or </w:t>
-      </w:r>
-      <w:r>
-        <w:lastRenderedPageBreak/>
-        <w:t>unstable. Forecast accuracy metrics can also help users understand how well a forecasting method performs. [INSERT CITATION: Demand Forecasting]</w:t>
-      </w:r>
-    </w:p>
-    <w:p/>
-    <w:p>
-      <w:r>
-        <w:t>In this project, the demand forecasting module uses historical monthly demand data. The platform includes simple forecasting methods such as moving average and linear regression. These methods are suitable for a dashboard prototype because they are understandable, easy to implement, and useful for demonstrating how demand data can be turned into future demand estimates.</w:t>
-      </w:r>
-    </w:p>
-    <w:p/>
-    <w:p>
-      <w:pPr>
-        <w:pStyle w:val="Heading2"/>
-      </w:pPr>
-      <w:r>
-        <w:t>Data Standardization and Uploaded Dataset Support</w:t>
-      </w:r>
-    </w:p>
-    <w:p>
-      <w:r>
-        <w:t>A major challenge in data-driven dashboard systems is that datasets may have different column names, formats, and levels of completeness. For example, one dataset may use “order date,” another may use “PO created date,” and another may use a different name for the same concept. If the system cannot handle these differences, it can only work with one fixed dataset. [INSERT CITATION: Data Quality / Data Standardization]</w:t>
-      </w:r>
-    </w:p>
-    <w:p/>
-    <w:p>
-      <w:r>
-        <w:t>To make a dashboard reusable, uploaded datasets should be converted into a common structure. This requires a standard schema, column mapping, data validation, and derived indicators. In this project, the standard schema includes fields such as order ID, order date, product name, category, quantity, shipping date, scheduled delivery date, delivery status, shipping mode, market, region, country, sales, and profit.</w:t>
-      </w:r>
-    </w:p>
-    <w:p/>
-    <w:p>
-      <w:r>
-        <w:t>The dataset upload feature improves the originality and usefulness of the project. The default DataCo dataset is used as a demonstration dataset, but the system can also process new supply chain datasets. After the user maps the uploaded dataset to the standard schema, the dashboard pages are generated dynamically based on the active dataset. This makes the platform more reusable for different supply chain data sources.</w:t>
-      </w:r>
-    </w:p>
-    <w:p/>
-    <w:p>
-      <w:pPr>
-        <w:pStyle w:val="Heading2"/>
-      </w:pPr>
-      <w:r>
-        <w:t>Summary of Literature Review</w:t>
-      </w:r>
-    </w:p>
-    <w:p>
-      <w:r>
-        <w:t>The reviewed concepts show that supply chain visibility, dashboard-based decision support, risk assessment, digital transformation, forecasting, and data standardization are strongly connected. Supply chain visibility helps managers monitor operational activities. Business intelligence dashboards make complex data easier to understand. Risk management supports the identification of delivery, inventory, demand, and regional risks. Forecasting helps users observe future demand trends. Data standardization allows different datasets to be used in a common dashboard structure.</w:t>
-      </w:r>
-    </w:p>
-    <w:p/>
-    <w:p>
-      <w:r>
-        <w:t>Based on these ideas, this project develops a dataset-adaptive supply chain visibility and risk assessment platform. The platform combines dashboard visualization, uploaded dataset support, data standardization, risk scoring, and demand forecasting in a single Streamlit-based system.</w:t>
+        <w:t xml:space="preserve">Based on these ideas, this project develops a dataset-adaptive supply chain visibility and risk assessment platform. The platform combines dashboard visualization, uploaded dataset support, data standardization, risk scoring, and demand forecasting in a single </w:t>
+      </w:r>
+      <w:proofErr w:type="spellStart"/>
+      <w:r>
+        <w:t>Streamlit</w:t>
+      </w:r>
+      <w:proofErr w:type="spellEnd"/>
+      <w:r>
+        <w:t>-based system.</w:t>
       </w:r>
     </w:p>
     <w:p/>
@@ -3929,15 +4120,31 @@
         <w:t>The</w:t>
       </w:r>
       <w:r>
-        <w:t xml:space="preserve"> originality of this study comes from developing a supply chain dashboard platform that is not limited to one fixed dataset. Many dashboard projects are designed only for a single prepared dataset. In this project, the DataCo Smart Supply Chain dataset is used as the default demonstration dataset, but the platform also allows users to upload a new supply chain dataset in CSV or Excel format.</w:t>
-      </w:r>
+        <w:t xml:space="preserve"> originality of this study comes from developing a supply chain dashboard platform that is not limited to one fixed dataset. Many dashboard projects are designed only for a single prepared dataset. In this project, the </w:t>
+      </w:r>
+      <w:proofErr w:type="spellStart"/>
+      <w:r>
+        <w:t>DataCo</w:t>
+      </w:r>
+      <w:proofErr w:type="spellEnd"/>
+      <w:r>
+        <w:t xml:space="preserve"> Smart Supply Chain dataset is used as the default demonstration dataset, but the platform also allows users to upload a new supply chain dataset in CSV or Excel format.</w:t>
+      </w:r>
+    </w:p>
+    <w:p>
       <w:r>
         <w:br/>
       </w:r>
       <w:r>
         <w:br/>
-        <w:t>The system includes a Data Source Manager that supports column mapping and dataset standardization. This means that different datasets with different column names can be mapped to a common supply chain schema. After the mapping process, the system converts the uploaded dataset into standardized analytical tables and uses these tables across all dashboard pages.</w:t>
-      </w:r>
+        <w:t xml:space="preserve">The system includes a Data Source Manager that supports column mapping and dataset standardization. This means that different datasets with different column names can be mapped to a common supply chain schema. After the </w:t>
+      </w:r>
+      <w:r>
+        <w:lastRenderedPageBreak/>
+        <w:t>mapping process, the system converts the uploaded dataset into standardized analytical tables and uses these tables across all dashboard pages.</w:t>
+      </w:r>
+    </w:p>
+    <w:p>
       <w:r>
         <w:br/>
       </w:r>
@@ -3945,25 +4152,34 @@
         <w:br/>
         <w:t>Another original aspect of the project is the integration of multiple supply chain analysis areas in one platform. The system does not only show order or sales information. It combines executive KPIs, regional performance analysis, inventory control indicators, shipment performance, supply chain risk scoring, and demand forecasting. This makes the project closer to a decision-support platform rather than a simple visualization page.</w:t>
       </w:r>
+    </w:p>
+    <w:p>
       <w:r>
         <w:br/>
       </w:r>
       <w:r>
         <w:br/>
-        <w:t xml:space="preserve">The risk analysis structure is also designed to be understandable for users. Instead of using a black-box model, the project uses rule-based and interpretable risk indicators such as late delivery rate, delay days, inventory status, demand volatility, and regional performance. This helps users understand why a specific market, region, shipment </w:t>
-      </w:r>
-      <w:r>
-        <w:lastRenderedPageBreak/>
-        <w:t>mode, or product category may be risky.</w:t>
-      </w:r>
+        <w:t>The risk analysis structure is also designed to be understandable for users. Instead of using a black-box model, the project uses rule-based and interpretable risk indicators such as late delivery rate, delay days, inventory status, demand volatility, and regional performance. This helps users understand why a specific market, region, shipment mode, or product category may be risky.</w:t>
+      </w:r>
+    </w:p>
+    <w:p>
       <w:r>
         <w:br/>
       </w:r>
       <w:r>
         <w:br/>
-        <w:t>The project is original within its academic scope because it combines data upload, schema mapping, data standardization, dynamic dashboard generation, risk analysis, and forecasting in a single Streamlit-based system. Therefore, the main contribution of the project is the development of a reusable supply chain visibility and risk assessment platform that can work with both a default dataset and user-uploaded datasets.</w:t>
-      </w:r>
-    </w:p>
+        <w:t xml:space="preserve">The project is original within its academic scope because it combines data upload, schema mapping, data standardization, dynamic dashboard generation, risk analysis, and forecasting in a single </w:t>
+      </w:r>
+      <w:proofErr w:type="spellStart"/>
+      <w:r>
+        <w:t>Streamlit</w:t>
+      </w:r>
+      <w:proofErr w:type="spellEnd"/>
+      <w:r>
+        <w:t>-based system. Therefore, the main contribution of the project is the development of a reusable supply chain visibility and risk assessment platform that can work with both a default dataset and user-uploaded datasets.</w:t>
+      </w:r>
+    </w:p>
+    <w:p/>
     <w:p>
       <w:pPr>
         <w:pStyle w:val="Heading1"/>
@@ -3976,8 +4192,18 @@
     </w:p>
     <w:p>
       <w:r>
-        <w:t>Supply chain operations produce large amounts of data related to orders, products, shipments, delivery performance, inventory, regions, sales, and demand. However, this data is often stored in different files, systems, or formats. When the data is not standardized and analyzed together, it becomes difficult for managers to understand the overall performance of the supply chain.</w:t>
-      </w:r>
+        <w:t xml:space="preserve">Supply chain operations produce large amounts of data related to orders, products, shipments, delivery performance, inventory, regions, sales, and demand. However, this data is often stored in different files, systems, or formats. When the data is not standardized and </w:t>
+      </w:r>
+      <w:proofErr w:type="spellStart"/>
+      <w:r>
+        <w:t>analyzed</w:t>
+      </w:r>
+      <w:proofErr w:type="spellEnd"/>
+      <w:r>
+        <w:t xml:space="preserve"> together, it becomes difficult for managers to understand the overall performance of the supply chain.</w:t>
+      </w:r>
+    </w:p>
+    <w:p>
       <w:r>
         <w:br/>
       </w:r>
@@ -3985,13 +4211,25 @@
         <w:br/>
         <w:t>One of the main problems is the lack of integrated visibility. A manager may need to check different reports to understand late deliveries, shipment delays, inventory warnings, regional performance, and demand changes. This slows down decision-making and increases the risk of missing important operational problems.</w:t>
       </w:r>
+    </w:p>
+    <w:p>
       <w:r>
         <w:br/>
       </w:r>
       <w:r>
         <w:br/>
-        <w:t>Another problem is that many dashboard systems are designed for a single prepared dataset. If a new dataset has different column names or a different structure, the dashboard may not work without manual code changes. This limits the reusability of the system. For example, one dataset may use “order date,” while another dataset may use “PO created date” for the same concept. Without a standard mapping and transformation process, these datasets cannot be analyzed through the same dashboard structure.</w:t>
-      </w:r>
+        <w:t xml:space="preserve">Another problem is that many dashboard systems are designed for a single prepared dataset. If a new dataset has different column names or a different structure, the dashboard may not work without manual code changes. This limits the reusability of the system. For example, one dataset may use “order date,” while another dataset may use “PO created date” for the same concept. Without a standard mapping and transformation process, these datasets cannot be </w:t>
+      </w:r>
+      <w:proofErr w:type="spellStart"/>
+      <w:r>
+        <w:t>analyzed</w:t>
+      </w:r>
+      <w:proofErr w:type="spellEnd"/>
+      <w:r>
+        <w:t xml:space="preserve"> through the same dashboard structure.</w:t>
+      </w:r>
+    </w:p>
+    <w:p>
       <w:r>
         <w:br/>
       </w:r>
@@ -3999,6 +4237,8 @@
         <w:br/>
         <w:t>There is also a risk assessment problem. Supply chain risk should not be evaluated by looking at only one indicator. Late delivery rate, average delay days, inventory status, demand volatility, regional performance, and financial indicators can all affect operational risk. If these indicators are not combined in a clear way, users may not understand which areas of the supply chain require attention.</w:t>
       </w:r>
+    </w:p>
+    <w:p>
       <w:r>
         <w:br/>
       </w:r>
@@ -4007,6 +4247,7 @@
         <w:t>Therefore, the main problem addressed in this project is the need for a reusable and interactive decision-support platform that can transform different supply chain datasets into a standard analytical format and generate visibility dashboards and risk analysis from the active dataset.</w:t>
       </w:r>
     </w:p>
+    <w:p/>
     <w:p>
       <w:pPr>
         <w:pStyle w:val="Heading1"/>
@@ -4019,7 +4260,15 @@
     </w:p>
     <w:p>
       <w:r>
-        <w:t>The solution approach of this project is based on developing a dataset-adaptive supply chain dashboard platform. The system is designed to work with a default demonstration dataset and also with user-uploaded supply chain datasets. The main idea is to transform different supply chain datasets into a common analytical structure and then generate dashboard modules from the active dataset.</w:t>
+        <w:t xml:space="preserve">The solution approach of this project is based on developing a dataset-adaptive supply chain dashboard platform. The system is designed to work with a default demonstration dataset </w:t>
+      </w:r>
+      <w:proofErr w:type="gramStart"/>
+      <w:r>
+        <w:t>and also</w:t>
+      </w:r>
+      <w:proofErr w:type="gramEnd"/>
+      <w:r>
+        <w:t xml:space="preserve"> with user-uploaded supply chain datasets. The main idea is to transform different supply chain datasets into a common analytical structure and then generate dashboard modules from the active dataset.</w:t>
       </w:r>
     </w:p>
     <w:p>
@@ -4027,6 +4276,7 @@
         <w:pStyle w:val="Heading2"/>
       </w:pPr>
       <w:r>
+        <w:lastRenderedPageBreak/>
         <w:t>Overall Approach</w:t>
       </w:r>
     </w:p>
@@ -4034,13 +4284,25 @@
       <w:r>
         <w:t>The project follows a data-driven decision-support approach. First, supply chain data is collected or uploaded into the system. Then, the data is cleaned, standardized, and transformed into dashboard-ready analytical tables. After this transformation, the dashboard modules calculate KPIs, generate visualizations, and support risk assessment.</w:t>
       </w:r>
+    </w:p>
+    <w:p>
       <w:r>
         <w:br/>
       </w:r>
       <w:r>
         <w:br/>
-        <w:t>The platform uses the DataCo Smart Supply Chain dataset as the default dataset. This dataset is processed into different analytical tables such as orders, products, shipments, inventory, demand, and risk scores. These tables are used by the default dashboard when no uploaded dataset is active.</w:t>
-      </w:r>
+        <w:t xml:space="preserve">The platform uses the </w:t>
+      </w:r>
+      <w:proofErr w:type="spellStart"/>
+      <w:r>
+        <w:t>DataCo</w:t>
+      </w:r>
+      <w:proofErr w:type="spellEnd"/>
+      <w:r>
+        <w:t xml:space="preserve"> Smart Supply Chain dataset as the default dataset. This dataset is processed into different analytical tables such as orders, products, shipments, inventory, demand, and risk scores. These tables are used by the default dashboard when no uploaded dataset is active.</w:t>
+      </w:r>
+    </w:p>
+    <w:p>
       <w:r>
         <w:br/>
       </w:r>
@@ -4049,6 +4311,7 @@
         <w:t>However, the project is not limited to the default dataset. Users can upload a new company supply chain dataset in CSV or Excel format. The uploaded dataset is mapped to a standard schema through the Data Source Manager. After the mapping process, the system creates the same type of analytical tables and updates the dashboard pages according to the uploaded dataset.</w:t>
       </w:r>
     </w:p>
+    <w:p/>
     <w:p>
       <w:pPr>
         <w:pStyle w:val="Heading2"/>
@@ -4064,6 +4327,8 @@
       <w:r>
         <w:t>The dataset upload feature is one of the main parts of the solution. Different supply chain datasets may use different column names for similar concepts. For example, one dataset may use “order date,” another may use “PO created date,” and another may use “created at.” To solve this problem, the platform includes a column mapping process.</w:t>
       </w:r>
+    </w:p>
+    <w:p>
       <w:r>
         <w:br/>
       </w:r>
@@ -4071,70 +4336,119 @@
         <w:br/>
         <w:t>In the Data Source Manager, users map the columns of the uploaded dataset to the standard supply chain schema. The required fields include order ID, order date, product name, category name, and order quantity. Optional fields include shipping date, scheduled delivery date, delivery status, actual shipping days, scheduled shipping days, shipping mode, market, region, country, sales, and profit.</w:t>
       </w:r>
+    </w:p>
+    <w:p>
       <w:r>
         <w:br/>
       </w:r>
       <w:r>
         <w:br/>
-        <w:t xml:space="preserve">After the mapping is completed, the system standardizes the uploaded dataset. It converts date fields, numeric </w:t>
-      </w:r>
+        <w:t>After the mapping is completed, the system standardizes the uploaded dataset. It converts date fields, numeric fields, and text fields into a common format. It also derives additional indicators where possible. For example, if actual shipping days and scheduled shipping days are not available, the system can calculate delay days by comparing delivered date and scheduled delivery date.</w:t>
+      </w:r>
+    </w:p>
+    <w:p/>
+    <w:p>
+      <w:pPr>
+        <w:pStyle w:val="Heading2"/>
+      </w:pPr>
+      <w:r>
+        <w:t>Dynamic Dashboard Generation</w:t>
+      </w:r>
+      <w:r>
+        <w:t xml:space="preserve"> </w:t>
+      </w:r>
+    </w:p>
+    <w:p>
+      <w:r>
+        <w:t xml:space="preserve">After the dataset is standardized, the dashboard pages are generated from the active dataset. If no uploaded dataset is active, the dashboard uses the default </w:t>
+      </w:r>
+      <w:proofErr w:type="spellStart"/>
+      <w:r>
+        <w:t>DataCo</w:t>
+      </w:r>
+      <w:proofErr w:type="spellEnd"/>
+      <w:r>
+        <w:t xml:space="preserve"> dataset. If the user uploads and activates a new dataset, all dashboard pages use the uploaded dataset during the active </w:t>
+      </w:r>
+      <w:proofErr w:type="spellStart"/>
+      <w:r>
+        <w:t>Streamlit</w:t>
+      </w:r>
+      <w:proofErr w:type="spellEnd"/>
+      <w:r>
+        <w:t xml:space="preserve"> session.</w:t>
+      </w:r>
+    </w:p>
+    <w:p>
+      <w:r>
+        <w:br/>
+      </w:r>
+      <w:r>
+        <w:br/>
+        <w:t xml:space="preserve">The dashboard includes six main modules: Overview, Regional Performance, Inventory Control, Shipment Performance, Supply Chain Risk, and Demand Forecast. Each module focuses on a different part of supply chain visibility. The Overview page shows general KPIs and summary charts. The Regional Performance page compares markets and regions. The Inventory Control page shows generated inventory indicators. The Shipment Performance page </w:t>
+      </w:r>
+      <w:proofErr w:type="spellStart"/>
+      <w:r>
+        <w:t>analyzes</w:t>
+      </w:r>
+      <w:proofErr w:type="spellEnd"/>
+      <w:r>
+        <w:t xml:space="preserve"> delivery and delay performance. The Supply Chain Risk page calculates risk indicators. The Demand Forecast page </w:t>
+      </w:r>
+      <w:proofErr w:type="spellStart"/>
+      <w:r>
+        <w:t>analyzes</w:t>
+      </w:r>
+      <w:proofErr w:type="spellEnd"/>
+      <w:r>
+        <w:t xml:space="preserve"> historical demand and creates simple forecasts.</w:t>
+      </w:r>
+    </w:p>
+    <w:p>
+      <w:r>
+        <w:br/>
+      </w:r>
+      <w:r>
+        <w:br/>
+        <w:t xml:space="preserve">This structure allows the system to work as a flexible platform instead of a static dashboard. The same dashboard pages can be used with different supply chain datasets </w:t>
+      </w:r>
+      <w:proofErr w:type="gramStart"/>
+      <w:r>
+        <w:t>as long as</w:t>
+      </w:r>
+      <w:proofErr w:type="gramEnd"/>
+      <w:r>
+        <w:t xml:space="preserve"> the required fields are mapped correctly.</w:t>
+      </w:r>
+    </w:p>
+    <w:p/>
+    <w:p>
+      <w:pPr>
+        <w:pStyle w:val="Heading2"/>
+      </w:pPr>
+      <w:r>
+        <w:t>Risk Assessment Approach</w:t>
+      </w:r>
+      <w:r>
+        <w:t xml:space="preserve"> </w:t>
+      </w:r>
+    </w:p>
+    <w:p>
+      <w:r>
+        <w:t>The risk assessment approach is rule-based and interpretable. The purpose of the risk model is not to create a complex black-box prediction system. Instead, the aim is to provide clear risk indicators that users can understand and discuss.</w:t>
+      </w:r>
+    </w:p>
+    <w:p>
       <w:r>
         <w:lastRenderedPageBreak/>
-        <w:t>fields, and text fields into a common format. It also derives additional indicators where possible. For example, if actual shipping days and scheduled shipping days are not available, the system can calculate delay days by comparing delivered date and scheduled delivery date.</w:t>
-      </w:r>
-    </w:p>
-    <w:p>
-      <w:pPr>
-        <w:pStyle w:val="Heading2"/>
-      </w:pPr>
-      <w:r>
-        <w:t>Dynamic Dashboard Generation</w:t>
-      </w:r>
-      <w:r>
-        <w:t xml:space="preserve"> </w:t>
-      </w:r>
-    </w:p>
-    <w:p>
-      <w:r>
-        <w:t>After the dataset is standardized, the dashboard pages are generated from the active dataset. If no uploaded dataset is active, the dashboard uses the default DataCo dataset. If the user uploads and activates a new dataset, all dashboard pages use the uploaded dataset during the active Streamlit session.</w:t>
-      </w:r>
-      <w:r>
-        <w:br/>
-      </w:r>
-      <w:r>
-        <w:br/>
-        <w:t>The dashboard includes six main modules: Overview, Regional Performance, Inventory Control, Shipment Performance, Supply Chain Risk, and Demand Forecast. Each module focuses on a different part of supply chain visibility. The Overview page shows general KPIs and summary charts. The Regional Performance page compares markets and regions. The Inventory Control page shows generated inventory indicators. The Shipment Performance page analyzes delivery and delay performance. The Supply Chain Risk page calculates risk indicators. The Demand Forecast page analyzes historical demand and creates simple forecasts.</w:t>
-      </w:r>
-      <w:r>
-        <w:br/>
-      </w:r>
-      <w:r>
-        <w:br/>
-        <w:t>This structure allows the system to work as a flexible platform instead of a static dashboard. The same dashboard pages can be used with different supply chain datasets as long as the required fields are mapped correctly.</w:t>
-      </w:r>
-    </w:p>
-    <w:p>
-      <w:pPr>
-        <w:pStyle w:val="Heading2"/>
-      </w:pPr>
-      <w:r>
-        <w:t>Risk Assessment Approach</w:t>
-      </w:r>
-      <w:r>
-        <w:t xml:space="preserve"> </w:t>
-      </w:r>
-    </w:p>
-    <w:p>
-      <w:r>
-        <w:t>The risk assessment approach is rule-based and interpretable. The purpose of the risk model is not to create a complex black-box prediction system. Instead, the aim is to provide clear risk indicators that users can understand and discuss.</w:t>
-      </w:r>
-      <w:r>
         <w:br/>
       </w:r>
       <w:r>
         <w:br/>
         <w:t>The system evaluates risk by using operational indicators such as late delivery rate, average delay days, inventory status, demand volatility, and regional performance. These indicators are combined into risk scores that help users identify problematic areas in the supply chain. The risk results are shown through KPI cards, charts, tables, and risk-level classifications.</w:t>
       </w:r>
+    </w:p>
+    <w:p>
       <w:r>
         <w:br/>
       </w:r>
@@ -4143,6 +4457,7 @@
         <w:t>This approach is suitable for a graduation thesis prototype because it provides a transparent decision-support structure. Users can understand which factors affect the risk score and can use the dashboard to explore risky regions, shipment modes, categories, and inventory items.</w:t>
       </w:r>
     </w:p>
+    <w:p/>
     <w:p>
       <w:pPr>
         <w:pStyle w:val="Heading2"/>
@@ -4158,6 +4473,8 @@
       <w:r>
         <w:t>The platform also includes a demand forecasting module. This module uses historical monthly demand values and applies simple forecasting methods such as moving average and linear regression. The purpose is to show how historical demand data can be used to estimate future demand patterns.</w:t>
       </w:r>
+    </w:p>
+    <w:p>
       <w:r>
         <w:br/>
       </w:r>
@@ -4166,6 +4483,7 @@
         <w:t>The forecasting module also includes basic performance evaluation metrics such as MAE and MAPE. These metrics help users compare forecast accuracy and understand the reliability of the forecast results. Since the project focuses mainly on supply chain visibility and risk assessment, the forecasting module is designed as a planning-support feature rather than an advanced forecasting system.</w:t>
       </w:r>
     </w:p>
+    <w:p/>
     <w:p>
       <w:pPr>
         <w:pStyle w:val="Heading1"/>
@@ -4181,6 +4499,7 @@
         <w:t>This project was developed by using Python-based data analysis and dashboard development tools. The selected tools were chosen because they are open-source, widely used, and suitable for building a supply chain analytics prototype.</w:t>
       </w:r>
     </w:p>
+    <w:p/>
     <w:p>
       <w:pPr>
         <w:pStyle w:val="Heading2"/>
@@ -4196,12 +4515,48 @@
       <w:r>
         <w:t>Python was used as the main programming language of the project. It was used for data cleaning, data transformation, KPI calculation, risk score generation, demand forecasting, and dashboard development. Visual Studio Code was used as the development environment for writing and editing the project files.</w:t>
       </w:r>
+    </w:p>
+    <w:p>
       <w:r>
         <w:br/>
+        <w:t xml:space="preserve">The project was developed as a local </w:t>
+      </w:r>
+      <w:proofErr w:type="spellStart"/>
+      <w:r>
+        <w:t>Streamlit</w:t>
+      </w:r>
+      <w:proofErr w:type="spellEnd"/>
+      <w:r>
+        <w:t xml:space="preserve"> application. A Windows batch file was also created to make the project easier to run. This file automatically creates the virtual environment if needed, installs the required packages, processes the default dataset, and starts the dashboard.</w:t>
+      </w:r>
+    </w:p>
+    <w:p/>
+    <w:p>
+      <w:pPr>
+        <w:pStyle w:val="Heading2"/>
+      </w:pPr>
+      <w:r>
+        <w:t>Data Processing and Analysis Tools</w:t>
+      </w:r>
+    </w:p>
+    <w:p>
+      <w:r>
+        <w:t xml:space="preserve">pandas </w:t>
+      </w:r>
+      <w:proofErr w:type="gramStart"/>
+      <w:r>
+        <w:t>was</w:t>
+      </w:r>
+      <w:proofErr w:type="gramEnd"/>
+      <w:r>
+        <w:t xml:space="preserve"> used for reading CSV and Excel files, cleaning the dataset, grouping records, calculating KPIs, and creating analytical tables. NumPy was used for numerical calculations and handling missing numerical values.</w:t>
       </w:r>
       <w:r>
         <w:br/>
-        <w:t>The project was developed as a local Streamlit application. A Windows batch file was also created to make the project easier to run. This file automatically creates the virtual environment if needed, installs the required packages, processes the default dataset, and starts the dashboard.</w:t>
+      </w:r>
+      <w:r>
+        <w:br/>
+        <w:t>SQLite was used as a lightweight database solution for storing the processed default dataset. The processed data files were also saved as CSV files so that the dashboard could load them easily.</w:t>
       </w:r>
     </w:p>
     <w:p>
@@ -4209,29 +4564,6 @@
         <w:pStyle w:val="Heading2"/>
       </w:pPr>
       <w:r>
-        <w:t>Data Processing and Analysis Tools</w:t>
-      </w:r>
-    </w:p>
-    <w:p>
-      <w:r>
-        <w:t>pandas was used for reading CSV and Excel files, cleaning the dataset, grouping records, calculating KPIs, and creating analytical tables. NumPy was used for numerical calculations and handling missing numerical values.</w:t>
-      </w:r>
-      <w:r>
-        <w:br/>
-      </w:r>
-      <w:r>
-        <w:br/>
-      </w:r>
-      <w:r>
-        <w:lastRenderedPageBreak/>
-        <w:t>SQLite was used as a lightweight database solution for storing the processed default dataset. The processed data files were also saved as CSV files so that the dashboard could load them easily.</w:t>
-      </w:r>
-    </w:p>
-    <w:p>
-      <w:pPr>
-        <w:pStyle w:val="Heading2"/>
-      </w:pPr>
-      <w:r>
         <w:t>Dashboard and Visualization Tools</w:t>
       </w:r>
       <w:r>
@@ -4239,12 +4571,16 @@
       </w:r>
     </w:p>
     <w:p>
-      <w:r>
-        <w:t>Streamlit was used to develop the interactive dashboard interface. It allowed the project to include different pages, filters, file upload components, KPI cards, charts, and tables.</w:t>
-      </w:r>
-      <w:r>
-        <w:br/>
-      </w:r>
+      <w:proofErr w:type="spellStart"/>
+      <w:r>
+        <w:t>Streamlit</w:t>
+      </w:r>
+      <w:proofErr w:type="spellEnd"/>
+      <w:r>
+        <w:t xml:space="preserve"> was used to develop the interactive dashboard interface. It allowed the project to include different pages, filters, file upload components, KPI cards, charts, and tables.</w:t>
+      </w:r>
+    </w:p>
+    <w:p>
       <w:r>
         <w:br/>
         <w:t>Plotly was used for creating interactive charts such as bar charts, line charts, heatmaps, and risk visualizations. These visualizations help users understand supply chain performance and risk indicators more easily.</w:t>
@@ -4265,7 +4601,10 @@
       <w:r>
         <w:t>scikit-learn was used for the linear regression model in the demand forecasting module. The project also uses a simple moving average method to compare forecasting results.</w:t>
       </w:r>
-      <w:r>
+    </w:p>
+    <w:p>
+      <w:r>
+        <w:lastRenderedPageBreak/>
         <w:br/>
       </w:r>
       <w:r>
@@ -4273,6 +4612,7 @@
         <w:t>Git and GitHub were used for version control, project backup, and documentation. GitHub also makes it easier to share the project files, screenshots, diagrams, and source code.</w:t>
       </w:r>
     </w:p>
+    <w:p/>
     <w:p>
       <w:pPr>
         <w:jc w:val="center"/>
@@ -4440,9 +4780,11 @@
             <w:tcW w:w="1250" w:type="pct"/>
           </w:tcPr>
           <w:p>
+            <w:proofErr w:type="spellStart"/>
             <w:r>
               <w:t>Streamlit</w:t>
             </w:r>
+            <w:proofErr w:type="spellEnd"/>
           </w:p>
         </w:tc>
         <w:tc>
@@ -4742,7 +5084,15 @@
     </w:p>
     <w:p>
       <w:r>
-        <w:t>This section explains the technical development of the Supply Chain Visibility and Risk Assessment Platform. The system was designed as a dataset-adaptive dashboard platform. It can work with the default DataCo dataset, and it can also process user-uploaded supply chain datasets through column mapping and data standardization.</w:t>
+        <w:t xml:space="preserve">This section explains the technical development of the Supply Chain Visibility and Risk Assessment Platform. The system was designed as a dataset-adaptive dashboard platform. It can work with the default </w:t>
+      </w:r>
+      <w:proofErr w:type="spellStart"/>
+      <w:r>
+        <w:t>DataCo</w:t>
+      </w:r>
+      <w:proofErr w:type="spellEnd"/>
+      <w:r>
+        <w:t xml:space="preserve"> dataset, and it can also process user-uploaded supply chain datasets through column mapping and data standardization.</w:t>
       </w:r>
       <w:r>
         <w:br/>
@@ -4757,29 +5107,51 @@
         <w:pStyle w:val="Heading2"/>
       </w:pPr>
       <w:r>
+        <w:t>System Architecture</w:t>
+      </w:r>
+      <w:r>
+        <w:t xml:space="preserve"> </w:t>
+      </w:r>
+    </w:p>
+    <w:p>
+      <w:r>
+        <w:t xml:space="preserve">The platform consists of several connected layers. The first layer is the data source layer. This layer includes the default </w:t>
+      </w:r>
+      <w:proofErr w:type="spellStart"/>
+      <w:r>
+        <w:t>DataCo</w:t>
+      </w:r>
+      <w:proofErr w:type="spellEnd"/>
+      <w:r>
+        <w:t xml:space="preserve"> dataset and user-uploaded CSV or Excel datasets. The second layer is the Data Source Manager, where the user can upload a new dataset and select the active data source. The third layer is the column mapping and data adapter layer. This layer converts different dataset structures into a common supply chain schema.</w:t>
+      </w:r>
+      <w:r>
+        <w:br/>
+      </w:r>
+      <w:r>
+        <w:br/>
+        <w:t xml:space="preserve">After the data is standardized, the system creates dashboard-ready analytical tables such as orders, products, shipments, inventory, demand, and risk scores. These tables are then used by the </w:t>
+      </w:r>
+      <w:proofErr w:type="spellStart"/>
+      <w:r>
+        <w:t>Streamlit</w:t>
+      </w:r>
+      <w:proofErr w:type="spellEnd"/>
+      <w:r>
+        <w:t xml:space="preserve"> dashboard modules. The main dashboard modules are Overview, Regional Performance, Inventory Control, Shipment Performance, Supply Chain Risk, and Demand Forecast.</w:t>
+      </w:r>
+    </w:p>
+    <w:p>
+      <w:r>
+        <w:br/>
+      </w:r>
+      <w:r>
+        <w:br/>
+      </w:r>
+    </w:p>
+    <w:p>
+      <w:r>
         <w:lastRenderedPageBreak/>
-        <w:t>System Architecture</w:t>
-      </w:r>
-      <w:r>
-        <w:t xml:space="preserve"> </w:t>
-      </w:r>
-    </w:p>
-    <w:p>
-      <w:r>
-        <w:t>The platform consists of several connected layers. The first layer is the data source layer. This layer includes the default DataCo dataset and user-uploaded CSV or Excel datasets. The second layer is the Data Source Manager, where the user can upload a new dataset and select the active data source. The third layer is the column mapping and data adapter layer. This layer converts different dataset structures into a common supply chain schema.</w:t>
-      </w:r>
-      <w:r>
-        <w:br/>
-      </w:r>
-      <w:r>
-        <w:br/>
-        <w:t>After the data is standardized, the system creates dashboard-ready analytical tables such as orders, products, shipments, inventory, demand, and risk scores. These tables are then used by the Streamlit dashboard modules. The main dashboard modules are Overview, Regional Performance, Inventory Control, Shipment Performance, Supply Chain Risk, and Demand Forecast.</w:t>
-      </w:r>
-      <w:r>
-        <w:br/>
-      </w:r>
-      <w:r>
-        <w:br/>
         <w:t>The system architecture is shown in Figure 1.</w:t>
       </w:r>
     </w:p>
@@ -4902,19 +5274,68 @@
         <w:rPr>
           <w:lang w:val="en-ZA"/>
         </w:rPr>
-        <w:t>The Data Source Manager is the main component that makes the platform reusable. When the dashboard is opened, the default DataCo dataset is active. If the user wants to analyze another supply chain dataset, the user can upload a CSV or Excel file from the Data Source Manager on the Overview page.</w:t>
-      </w:r>
-    </w:p>
-    <w:p>
-      <w:pPr>
+        <w:t xml:space="preserve">The Data Source Manager is the main component that makes the platform reusable. When the dashboard </w:t>
+      </w:r>
+      <w:proofErr w:type="gramStart"/>
+      <w:r>
         <w:rPr>
           <w:lang w:val="en-ZA"/>
         </w:rPr>
-      </w:pPr>
+        <w:t>is opened</w:t>
+      </w:r>
+      <w:proofErr w:type="gramEnd"/>
       <w:r>
         <w:rPr>
           <w:lang w:val="en-ZA"/>
         </w:rPr>
+        <w:t xml:space="preserve">, the default </w:t>
+      </w:r>
+      <w:proofErr w:type="spellStart"/>
+      <w:r>
+        <w:rPr>
+          <w:lang w:val="en-ZA"/>
+        </w:rPr>
+        <w:t>DataCo</w:t>
+      </w:r>
+      <w:proofErr w:type="spellEnd"/>
+      <w:r>
+        <w:rPr>
+          <w:lang w:val="en-ZA"/>
+        </w:rPr>
+        <w:t xml:space="preserve"> dataset is active. If the user wants to </w:t>
+      </w:r>
+      <w:proofErr w:type="spellStart"/>
+      <w:r>
+        <w:rPr>
+          <w:lang w:val="en-ZA"/>
+        </w:rPr>
+        <w:t>analyze</w:t>
+      </w:r>
+      <w:proofErr w:type="spellEnd"/>
+      <w:r>
+        <w:rPr>
+          <w:lang w:val="en-ZA"/>
+        </w:rPr>
+        <w:t xml:space="preserve"> another supply chain dataset, the user can upload a CSV or Excel file from the Data Source Manager on the Overview page.</w:t>
+      </w:r>
+    </w:p>
+    <w:p>
+      <w:pPr>
+        <w:rPr>
+          <w:lang w:val="en-ZA"/>
+        </w:rPr>
+      </w:pPr>
+    </w:p>
+    <w:p>
+      <w:pPr>
+        <w:rPr>
+          <w:lang w:val="en-ZA"/>
+        </w:rPr>
+      </w:pPr>
+      <w:r>
+        <w:rPr>
+          <w:lang w:val="en-ZA"/>
+        </w:rPr>
         <w:t>After uploading a dataset, the system shows a preview of the raw data. Then, the user maps the uploaded columns to the standard supply chain schema. This mapping process is necessary because different datasets may use different column names for the same concept. For example, one dataset may use “Order Date,” while another dataset may use “PO Created At.”</w:t>
       </w:r>
     </w:p>
@@ -4924,12 +5345,89 @@
           <w:lang w:val="en-ZA"/>
         </w:rPr>
       </w:pPr>
-      <w:r>
+    </w:p>
+    <w:p>
+      <w:pPr>
         <w:rPr>
           <w:lang w:val="en-ZA"/>
         </w:rPr>
-        <w:t>The uploaded dataset is used during the active Streamlit session. If the user activates the uploaded dataset, all dashboard pages use the uploaded data. If the user wants to return to the default dataset, the Data Source Manager provides an option to return to the default DataCo dataset.</w:t>
-      </w:r>
+      </w:pPr>
+      <w:r>
+        <w:rPr>
+          <w:lang w:val="en-ZA"/>
+        </w:rPr>
+        <w:t xml:space="preserve">The uploaded dataset </w:t>
+      </w:r>
+      <w:proofErr w:type="gramStart"/>
+      <w:r>
+        <w:rPr>
+          <w:lang w:val="en-ZA"/>
+        </w:rPr>
+        <w:t>is used</w:t>
+      </w:r>
+      <w:proofErr w:type="gramEnd"/>
+      <w:r>
+        <w:rPr>
+          <w:lang w:val="en-ZA"/>
+        </w:rPr>
+        <w:t xml:space="preserve"> during the active </w:t>
+      </w:r>
+      <w:proofErr w:type="spellStart"/>
+      <w:r>
+        <w:rPr>
+          <w:lang w:val="en-ZA"/>
+        </w:rPr>
+        <w:t>Streamlit</w:t>
+      </w:r>
+      <w:proofErr w:type="spellEnd"/>
+      <w:r>
+        <w:rPr>
+          <w:lang w:val="en-ZA"/>
+        </w:rPr>
+        <w:t xml:space="preserve"> session. If the user activates the uploaded dataset, all dashboard pages use the uploaded data. If the user wants to return to the default dataset, the Data Source Manager provides an option to return to the default </w:t>
+      </w:r>
+      <w:proofErr w:type="spellStart"/>
+      <w:r>
+        <w:rPr>
+          <w:lang w:val="en-ZA"/>
+        </w:rPr>
+        <w:t>DataCo</w:t>
+      </w:r>
+      <w:proofErr w:type="spellEnd"/>
+      <w:r>
+        <w:rPr>
+          <w:lang w:val="en-ZA"/>
+        </w:rPr>
+        <w:t xml:space="preserve"> dataset.</w:t>
+      </w:r>
+    </w:p>
+    <w:p>
+      <w:pPr>
+        <w:rPr>
+          <w:lang w:val="en-ZA"/>
+        </w:rPr>
+      </w:pPr>
+    </w:p>
+    <w:p>
+      <w:pPr>
+        <w:rPr>
+          <w:lang w:val="en-ZA"/>
+        </w:rPr>
+      </w:pPr>
+    </w:p>
+    <w:p>
+      <w:pPr>
+        <w:rPr>
+          <w:lang w:val="en-ZA"/>
+        </w:rPr>
+      </w:pPr>
+    </w:p>
+    <w:p>
+      <w:pPr>
+        <w:rPr>
+          <w:lang w:val="en-ZA"/>
+        </w:rPr>
+      </w:pPr>
     </w:p>
     <w:p>
       <w:pPr>
@@ -4963,21 +5461,111 @@
         <w:rPr>
           <w:lang w:val="en-ZA"/>
         </w:rPr>
-        <w:t>The standard data schema defines the common structure used by the platform. The uploaded dataset must be mapped to this schema before it can be used by the dashboard pages. Some fields are required, while others are optional. Required fields are necessary for basic dashboard generation. Optional fields improve the quality of risk analysis, shipment performance analysis, and financial indicators.</w:t>
-      </w:r>
-    </w:p>
-    <w:p>
-      <w:pPr>
+        <w:t xml:space="preserve">The standard data schema defines the common structure used by the platform. The uploaded dataset must </w:t>
+      </w:r>
+      <w:proofErr w:type="gramStart"/>
+      <w:r>
         <w:rPr>
           <w:lang w:val="en-ZA"/>
         </w:rPr>
-      </w:pPr>
+        <w:t>be mapped</w:t>
+      </w:r>
+      <w:proofErr w:type="gramEnd"/>
       <w:r>
         <w:rPr>
           <w:lang w:val="en-ZA"/>
         </w:rPr>
-        <w:t>The standard schema used in the platform is shown in Table 2.</w:t>
-      </w:r>
+        <w:t xml:space="preserve"> to this schema before it can </w:t>
+      </w:r>
+      <w:proofErr w:type="gramStart"/>
+      <w:r>
+        <w:rPr>
+          <w:lang w:val="en-ZA"/>
+        </w:rPr>
+        <w:t>be used</w:t>
+      </w:r>
+      <w:proofErr w:type="gramEnd"/>
+      <w:r>
+        <w:rPr>
+          <w:lang w:val="en-ZA"/>
+        </w:rPr>
+        <w:t xml:space="preserve"> by the dashboard pages. </w:t>
+      </w:r>
+      <w:proofErr w:type="gramStart"/>
+      <w:r>
+        <w:rPr>
+          <w:lang w:val="en-ZA"/>
+        </w:rPr>
+        <w:t>Some</w:t>
+      </w:r>
+      <w:proofErr w:type="gramEnd"/>
+      <w:r>
+        <w:rPr>
+          <w:lang w:val="en-ZA"/>
+        </w:rPr>
+        <w:t xml:space="preserve"> fields </w:t>
+      </w:r>
+      <w:proofErr w:type="gramStart"/>
+      <w:r>
+        <w:rPr>
+          <w:lang w:val="en-ZA"/>
+        </w:rPr>
+        <w:t>are required</w:t>
+      </w:r>
+      <w:proofErr w:type="gramEnd"/>
+      <w:r>
+        <w:rPr>
+          <w:lang w:val="en-ZA"/>
+        </w:rPr>
+        <w:t>, while others are optional. Required fields are necessary for basic dashboard generation. Optional fields improve the quality of risk analysis, shipment performance analysis, and financial indicators.</w:t>
+      </w:r>
+    </w:p>
+    <w:p>
+      <w:pPr>
+        <w:rPr>
+          <w:lang w:val="en-ZA"/>
+        </w:rPr>
+      </w:pPr>
+    </w:p>
+    <w:p>
+      <w:pPr>
+        <w:rPr>
+          <w:lang w:val="en-ZA"/>
+        </w:rPr>
+      </w:pPr>
+      <w:r>
+        <w:rPr>
+          <w:lang w:val="en-ZA"/>
+        </w:rPr>
+        <w:t xml:space="preserve">The standard schema used in the platform </w:t>
+      </w:r>
+      <w:proofErr w:type="gramStart"/>
+      <w:r>
+        <w:rPr>
+          <w:lang w:val="en-ZA"/>
+        </w:rPr>
+        <w:t>is shown</w:t>
+      </w:r>
+      <w:proofErr w:type="gramEnd"/>
+      <w:r>
+        <w:rPr>
+          <w:lang w:val="en-ZA"/>
+        </w:rPr>
+        <w:t xml:space="preserve"> in Table 2.</w:t>
+      </w:r>
+      <w:r>
+        <w:rPr>
+          <w:lang w:val="en-ZA"/>
+        </w:rPr>
+        <w:t xml:space="preserve"> </w:t>
+      </w:r>
+    </w:p>
+    <w:p>
+      <w:pPr>
+        <w:rPr>
+          <w:lang w:val="en-ZA"/>
+        </w:rPr>
+      </w:pPr>
     </w:p>
     <w:p>
       <w:pPr>
@@ -5087,12 +5675,14 @@
                 <w:lang w:val="en-ZA"/>
               </w:rPr>
             </w:pPr>
+            <w:proofErr w:type="spellStart"/>
             <w:r>
               <w:rPr>
                 <w:lang w:val="en-ZA"/>
               </w:rPr>
               <w:t>order_id</w:t>
             </w:r>
+            <w:proofErr w:type="spellEnd"/>
           </w:p>
         </w:tc>
         <w:tc>
@@ -5127,7 +5717,21 @@
               <w:rPr>
                 <w:lang w:val="en-ZA"/>
               </w:rPr>
-              <w:t>Unique orderor transaction identifier</w:t>
+              <w:t xml:space="preserve">Unique </w:t>
+            </w:r>
+            <w:proofErr w:type="spellStart"/>
+            <w:r>
+              <w:rPr>
+                <w:lang w:val="en-ZA"/>
+              </w:rPr>
+              <w:t>orderor</w:t>
+            </w:r>
+            <w:proofErr w:type="spellEnd"/>
+            <w:r>
+              <w:rPr>
+                <w:lang w:val="en-ZA"/>
+              </w:rPr>
+              <w:t xml:space="preserve"> transaction identifier</w:t>
             </w:r>
           </w:p>
         </w:tc>
@@ -5143,12 +5747,14 @@
                 <w:lang w:val="en-ZA"/>
               </w:rPr>
             </w:pPr>
+            <w:proofErr w:type="spellStart"/>
             <w:r>
               <w:rPr>
                 <w:lang w:val="en-ZA"/>
               </w:rPr>
               <w:t>order_date</w:t>
             </w:r>
+            <w:proofErr w:type="spellEnd"/>
           </w:p>
         </w:tc>
         <w:tc>
@@ -5183,8 +5789,16 @@
               <w:rPr>
                 <w:lang w:val="en-ZA"/>
               </w:rPr>
-              <w:t>Date when the order was created</w:t>
-            </w:r>
+              <w:t xml:space="preserve">Date when the order </w:t>
+            </w:r>
+            <w:proofErr w:type="gramStart"/>
+            <w:r>
+              <w:rPr>
+                <w:lang w:val="en-ZA"/>
+              </w:rPr>
+              <w:t>was created</w:t>
+            </w:r>
+            <w:proofErr w:type="gramEnd"/>
           </w:p>
         </w:tc>
       </w:tr>
@@ -5199,12 +5813,14 @@
                 <w:lang w:val="en-ZA"/>
               </w:rPr>
             </w:pPr>
+            <w:proofErr w:type="spellStart"/>
             <w:r>
               <w:rPr>
                 <w:lang w:val="en-ZA"/>
               </w:rPr>
               <w:t>product_name</w:t>
             </w:r>
+            <w:proofErr w:type="spellEnd"/>
           </w:p>
         </w:tc>
         <w:tc>
@@ -5255,12 +5871,14 @@
                 <w:lang w:val="en-ZA"/>
               </w:rPr>
             </w:pPr>
+            <w:proofErr w:type="spellStart"/>
             <w:r>
               <w:rPr>
                 <w:lang w:val="en-ZA"/>
               </w:rPr>
               <w:t>category_name</w:t>
             </w:r>
+            <w:proofErr w:type="spellEnd"/>
           </w:p>
         </w:tc>
         <w:tc>
@@ -5311,9 +5929,11 @@
                 <w:lang w:val="en-ZA"/>
               </w:rPr>
             </w:pPr>
+            <w:proofErr w:type="spellStart"/>
             <w:r>
               <w:t>order_quantity</w:t>
             </w:r>
+            <w:proofErr w:type="spellEnd"/>
           </w:p>
         </w:tc>
         <w:tc>
@@ -5361,9 +5981,11 @@
                 <w:lang w:val="en-ZA"/>
               </w:rPr>
             </w:pPr>
+            <w:proofErr w:type="spellStart"/>
             <w:r>
               <w:t>shipping_date</w:t>
             </w:r>
+            <w:proofErr w:type="spellEnd"/>
           </w:p>
         </w:tc>
         <w:tc>
@@ -5411,9 +6033,11 @@
                 <w:lang w:val="en-ZA"/>
               </w:rPr>
             </w:pPr>
+            <w:proofErr w:type="spellStart"/>
             <w:r>
               <w:t>scheduled_delivery_date</w:t>
             </w:r>
+            <w:proofErr w:type="spellEnd"/>
           </w:p>
         </w:tc>
         <w:tc>
@@ -5464,9 +6088,11 @@
                 <w:lang w:val="en-ZA"/>
               </w:rPr>
             </w:pPr>
+            <w:proofErr w:type="spellStart"/>
             <w:r>
               <w:t>delivery_status</w:t>
             </w:r>
+            <w:proofErr w:type="spellEnd"/>
           </w:p>
         </w:tc>
         <w:tc>
@@ -5514,9 +6140,11 @@
                 <w:lang w:val="en-ZA"/>
               </w:rPr>
             </w:pPr>
+            <w:proofErr w:type="spellStart"/>
             <w:r>
               <w:t>actual_shipping_days</w:t>
             </w:r>
+            <w:proofErr w:type="spellEnd"/>
           </w:p>
         </w:tc>
         <w:tc>
@@ -5564,9 +6192,11 @@
                 <w:lang w:val="en-ZA"/>
               </w:rPr>
             </w:pPr>
+            <w:proofErr w:type="spellStart"/>
             <w:r>
               <w:t>scheduled_shipping_days</w:t>
             </w:r>
+            <w:proofErr w:type="spellEnd"/>
           </w:p>
         </w:tc>
         <w:tc>
@@ -5617,9 +6247,11 @@
                 <w:lang w:val="en-ZA"/>
               </w:rPr>
             </w:pPr>
+            <w:proofErr w:type="spellStart"/>
             <w:r>
               <w:t>shipping_mode</w:t>
             </w:r>
+            <w:proofErr w:type="spellEnd"/>
           </w:p>
         </w:tc>
         <w:tc>
@@ -5717,9 +6349,11 @@
                 <w:lang w:val="en-ZA"/>
               </w:rPr>
             </w:pPr>
+            <w:proofErr w:type="spellStart"/>
             <w:r>
               <w:t>order_region</w:t>
             </w:r>
+            <w:proofErr w:type="spellEnd"/>
           </w:p>
         </w:tc>
         <w:tc>
@@ -5767,9 +6401,11 @@
                 <w:lang w:val="en-ZA"/>
               </w:rPr>
             </w:pPr>
+            <w:proofErr w:type="spellStart"/>
             <w:r>
               <w:t>order_country</w:t>
             </w:r>
+            <w:proofErr w:type="spellEnd"/>
           </w:p>
         </w:tc>
         <w:tc>
@@ -5867,9 +6503,11 @@
                 <w:lang w:val="en-ZA"/>
               </w:rPr>
             </w:pPr>
+            <w:proofErr w:type="spellStart"/>
             <w:r>
               <w:t>order_profit</w:t>
             </w:r>
+            <w:proofErr w:type="spellEnd"/>
           </w:p>
         </w:tc>
         <w:tc>
@@ -5913,15 +6551,1803 @@
           <w:lang w:val="en-ZA"/>
         </w:rPr>
       </w:pPr>
-      <w:r>
+    </w:p>
+    <w:p>
+      <w:pPr>
         <w:rPr>
           <w:lang w:val="en-ZA"/>
         </w:rPr>
+      </w:pPr>
+      <w:r>
+        <w:rPr>
+          <w:lang w:val="en-ZA"/>
+        </w:rPr>
         <w:t>If an optional field is not available in the uploaded dataset, the system uses default values or derives indicators when possible. For example, if actual shipping days and scheduled shipping days are not available, the system can calculate delay days by comparing the actual delivery date and the scheduled delivery date. This improves the flexibility of the platform and allows it to work with different supply chain datasets.</w:t>
       </w:r>
     </w:p>
     <w:p>
       <w:pPr>
+        <w:pStyle w:val="Heading2"/>
+      </w:pPr>
+      <w:r>
+        <w:lastRenderedPageBreak/>
+        <w:t>Dashboard Data Model</w:t>
+      </w:r>
+      <w:r>
+        <w:t xml:space="preserve"> </w:t>
+      </w:r>
+    </w:p>
+    <w:p>
+      <w:r>
+        <w:t>Af</w:t>
+      </w:r>
+      <w:r>
+        <w:t>te</w:t>
+      </w:r>
+      <w:r>
+        <w:t>r the dataset is standardized, the system creates analytical tables that are used by the dashboard pages. These tables are not designed as a full enterprise resource planning database. Instead, they are designed as dashboard-ready analytical tables for visibility, reporting, and risk assessment.</w:t>
+      </w:r>
+      <w:r>
+        <w:br/>
+      </w:r>
+      <w:r>
+        <w:br/>
+        <w:t xml:space="preserve">The main analytical tables are orders, products, shipments, inventory, demand, and </w:t>
+      </w:r>
+      <w:proofErr w:type="spellStart"/>
+      <w:r>
+        <w:t>risk_scores</w:t>
+      </w:r>
+      <w:proofErr w:type="spellEnd"/>
+      <w:r>
+        <w:t xml:space="preserve">. The orders table is the central table because it contains the main order-level information. The shipments table is created from order and delivery-related fields. The inventory table is generated from product and demand patterns. The demand table summarizes monthly demand by product category. The </w:t>
+      </w:r>
+      <w:proofErr w:type="spellStart"/>
+      <w:r>
+        <w:t>risk_scores</w:t>
+      </w:r>
+      <w:proofErr w:type="spellEnd"/>
+      <w:r>
+        <w:t xml:space="preserve"> table stores regional risk indicators.</w:t>
+      </w:r>
+      <w:r>
+        <w:br/>
+      </w:r>
+      <w:r>
+        <w:br/>
+        <w:t>The logical data model used by the dashboard is shown in Figure 2.</w:t>
+      </w:r>
+    </w:p>
+    <w:p>
+      <w:pPr>
+        <w:keepNext/>
+      </w:pPr>
+      <w:r>
+        <w:rPr>
+          <w:noProof/>
+          <w:lang w:val="en-ZA"/>
+        </w:rPr>
+        <w:drawing>
+          <wp:inline distT="0" distB="0" distL="0" distR="0" wp14:anchorId="670A0A81" wp14:editId="36371591">
+            <wp:extent cx="6501164" cy="4333875"/>
+            <wp:effectExtent l="0" t="0" r="0" b="0"/>
+            <wp:docPr id="604311595" name="Picture 2"/>
+            <wp:cNvGraphicFramePr>
+              <a:graphicFrameLocks xmlns:a="http://schemas.openxmlformats.org/drawingml/2006/main" noChangeAspect="1"/>
+            </wp:cNvGraphicFramePr>
+            <a:graphic xmlns:a="http://schemas.openxmlformats.org/drawingml/2006/main">
+              <a:graphicData uri="http://schemas.openxmlformats.org/drawingml/2006/picture">
+                <pic:pic xmlns:pic="http://schemas.openxmlformats.org/drawingml/2006/picture">
+                  <pic:nvPicPr>
+                    <pic:cNvPr id="604311595" name="Picture 604311595"/>
+                    <pic:cNvPicPr/>
+                  </pic:nvPicPr>
+                  <pic:blipFill>
+                    <a:blip r:embed="rId10" cstate="print">
+                      <a:extLst>
+                        <a:ext uri="{28A0092B-C50C-407E-A947-70E740481C1C}">
+                          <a14:useLocalDpi xmlns:a14="http://schemas.microsoft.com/office/drawing/2010/main" val="0"/>
+                        </a:ext>
+                      </a:extLst>
+                    </a:blip>
+                    <a:stretch>
+                      <a:fillRect/>
+                    </a:stretch>
+                  </pic:blipFill>
+                  <pic:spPr>
+                    <a:xfrm>
+                      <a:off x="0" y="0"/>
+                      <a:ext cx="6505233" cy="4336588"/>
+                    </a:xfrm>
+                    <a:prstGeom prst="rect">
+                      <a:avLst/>
+                    </a:prstGeom>
+                  </pic:spPr>
+                </pic:pic>
+              </a:graphicData>
+            </a:graphic>
+          </wp:inline>
+        </w:drawing>
+      </w:r>
+    </w:p>
+    <w:p>
+      <w:pPr>
+        <w:pStyle w:val="Caption"/>
+        <w:jc w:val="both"/>
+      </w:pPr>
+      <w:r>
+        <w:t xml:space="preserve">Figure </w:t>
+      </w:r>
+      <w:r>
+        <w:fldChar w:fldCharType="begin"/>
+      </w:r>
+      <w:r>
+        <w:instrText xml:space="preserve"> SEQ Figure \* ARABIC </w:instrText>
+      </w:r>
+      <w:r>
+        <w:fldChar w:fldCharType="separate"/>
+      </w:r>
+      <w:r>
+        <w:rPr>
+          <w:noProof/>
+        </w:rPr>
+        <w:t>2</w:t>
+      </w:r>
+      <w:r>
+        <w:fldChar w:fldCharType="end"/>
+      </w:r>
+      <w:r>
+        <w:t>. Logical data model used by the dashboard.</w:t>
+      </w:r>
+    </w:p>
+    <w:p>
+      <w:pPr>
+        <w:rPr>
+          <w:lang w:val="en-ZA"/>
+        </w:rPr>
+      </w:pPr>
+    </w:p>
+    <w:p>
+      <w:pPr>
+        <w:rPr>
+          <w:lang w:val="en-ZA"/>
+        </w:rPr>
+      </w:pPr>
+      <w:r>
+        <w:rPr>
+          <w:lang w:val="en-ZA"/>
+        </w:rPr>
+        <w:t xml:space="preserve">The logical data model represents the standardized analytical structure of the platform. Uploaded datasets </w:t>
+      </w:r>
+      <w:proofErr w:type="gramStart"/>
+      <w:r>
+        <w:rPr>
+          <w:lang w:val="en-ZA"/>
+        </w:rPr>
+        <w:t>are first converted</w:t>
+      </w:r>
+      <w:proofErr w:type="gramEnd"/>
+      <w:r>
+        <w:rPr>
+          <w:lang w:val="en-ZA"/>
+        </w:rPr>
+        <w:t xml:space="preserve"> into this structure by the data adapter. Therefore, even if the uploaded dataset has different column names, the dashboard can use the same analytical tables after the standardization process.</w:t>
+      </w:r>
+    </w:p>
+    <w:p>
+      <w:pPr>
+        <w:rPr>
+          <w:lang w:val="en-ZA"/>
+        </w:rPr>
+      </w:pPr>
+    </w:p>
+    <w:p>
+      <w:pPr>
+        <w:pStyle w:val="Heading2"/>
+        <w:rPr>
+          <w:lang w:val="en-ZA"/>
+        </w:rPr>
+      </w:pPr>
+      <w:r>
+        <w:rPr>
+          <w:lang w:val="en-ZA"/>
+        </w:rPr>
+        <w:t>Dashboard Modules</w:t>
+      </w:r>
+    </w:p>
+    <w:p>
+      <w:pPr>
+        <w:rPr>
+          <w:lang w:val="en-ZA"/>
+        </w:rPr>
+      </w:pPr>
+      <w:r>
+        <w:rPr>
+          <w:lang w:val="en-ZA"/>
+        </w:rPr>
+        <w:t xml:space="preserve">The platform includes six dashboard modules. Each module focuses on a different part of supply chain visibility and risk analysis. These modules work with the active dataset. If the user activates an uploaded dataset, the same dashboard modules </w:t>
+      </w:r>
+      <w:proofErr w:type="gramStart"/>
+      <w:r>
+        <w:rPr>
+          <w:lang w:val="en-ZA"/>
+        </w:rPr>
+        <w:t>are updated</w:t>
+      </w:r>
+      <w:proofErr w:type="gramEnd"/>
+      <w:r>
+        <w:rPr>
+          <w:lang w:val="en-ZA"/>
+        </w:rPr>
+        <w:t xml:space="preserve"> according to the uploaded data.</w:t>
+      </w:r>
+    </w:p>
+    <w:p>
+      <w:pPr>
+        <w:rPr>
+          <w:lang w:val="en-ZA"/>
+        </w:rPr>
+      </w:pPr>
+    </w:p>
+    <w:p>
+      <w:pPr>
+        <w:rPr>
+          <w:lang w:val="en-ZA"/>
+        </w:rPr>
+      </w:pPr>
+      <w:r>
+        <w:rPr>
+          <w:lang w:val="en-ZA"/>
+        </w:rPr>
+        <w:t xml:space="preserve">The dashboard modules and their main outputs </w:t>
+      </w:r>
+      <w:proofErr w:type="gramStart"/>
+      <w:r>
+        <w:rPr>
+          <w:lang w:val="en-ZA"/>
+        </w:rPr>
+        <w:t>are shown</w:t>
+      </w:r>
+      <w:proofErr w:type="gramEnd"/>
+      <w:r>
+        <w:rPr>
+          <w:lang w:val="en-ZA"/>
+        </w:rPr>
+        <w:t xml:space="preserve"> in Table 3.</w:t>
+      </w:r>
+    </w:p>
+    <w:p>
+      <w:pPr>
+        <w:rPr>
+          <w:lang w:val="en-ZA"/>
+        </w:rPr>
+      </w:pPr>
+    </w:p>
+    <w:p>
+      <w:pPr>
+        <w:rPr>
+          <w:lang w:val="en-ZA"/>
+        </w:rPr>
+      </w:pPr>
+    </w:p>
+    <w:p>
+      <w:pPr>
+        <w:rPr>
+          <w:lang w:val="en-ZA"/>
+        </w:rPr>
+      </w:pPr>
+    </w:p>
+    <w:p>
+      <w:pPr>
+        <w:jc w:val="center"/>
+        <w:rPr>
+          <w:b/>
+          <w:bCs/>
+          <w:lang w:val="en-ZA"/>
+        </w:rPr>
+      </w:pPr>
+      <w:r>
+        <w:rPr>
+          <w:b/>
+          <w:bCs/>
+          <w:lang w:val="en-ZA"/>
+        </w:rPr>
+        <w:lastRenderedPageBreak/>
+        <w:t>Table 3: Dashboard Modules and Their Main Outputs</w:t>
+      </w:r>
+    </w:p>
+    <w:tbl>
+      <w:tblPr>
+        <w:tblStyle w:val="TableGrid"/>
+        <w:tblW w:w="5000" w:type="pct"/>
+        <w:tblLook w:val="04A0" w:firstRow="1" w:lastRow="0" w:firstColumn="1" w:lastColumn="0" w:noHBand="0" w:noVBand="1"/>
+      </w:tblPr>
+      <w:tblGrid>
+        <w:gridCol w:w="3077"/>
+        <w:gridCol w:w="3077"/>
+        <w:gridCol w:w="3078"/>
+      </w:tblGrid>
+      <w:tr>
+        <w:tc>
+          <w:tcPr>
+            <w:tcW w:w="1666" w:type="pct"/>
+          </w:tcPr>
+          <w:p>
+            <w:pPr>
+              <w:rPr>
+                <w:b/>
+                <w:bCs/>
+                <w:lang w:val="en-ZA"/>
+              </w:rPr>
+            </w:pPr>
+            <w:r>
+              <w:rPr>
+                <w:b/>
+                <w:bCs/>
+                <w:lang w:val="en-ZA"/>
+              </w:rPr>
+              <w:t>Module</w:t>
+            </w:r>
+          </w:p>
+        </w:tc>
+        <w:tc>
+          <w:tcPr>
+            <w:tcW w:w="1666" w:type="pct"/>
+          </w:tcPr>
+          <w:p>
+            <w:pPr>
+              <w:rPr>
+                <w:b/>
+                <w:bCs/>
+                <w:lang w:val="en-ZA"/>
+              </w:rPr>
+            </w:pPr>
+            <w:r>
+              <w:rPr>
+                <w:b/>
+                <w:bCs/>
+                <w:lang w:val="en-ZA"/>
+              </w:rPr>
+              <w:t>Main Purpose</w:t>
+            </w:r>
+          </w:p>
+        </w:tc>
+        <w:tc>
+          <w:tcPr>
+            <w:tcW w:w="1667" w:type="pct"/>
+          </w:tcPr>
+          <w:p>
+            <w:pPr>
+              <w:rPr>
+                <w:b/>
+                <w:bCs/>
+                <w:lang w:val="en-ZA"/>
+              </w:rPr>
+            </w:pPr>
+            <w:r>
+              <w:rPr>
+                <w:b/>
+                <w:bCs/>
+                <w:lang w:val="en-ZA"/>
+              </w:rPr>
+              <w:t>Example Outputs</w:t>
+            </w:r>
+          </w:p>
+        </w:tc>
+      </w:tr>
+      <w:tr>
+        <w:tc>
+          <w:tcPr>
+            <w:tcW w:w="1666" w:type="pct"/>
+          </w:tcPr>
+          <w:p>
+            <w:pPr>
+              <w:rPr>
+                <w:lang w:val="en-ZA"/>
+              </w:rPr>
+            </w:pPr>
+            <w:r>
+              <w:rPr>
+                <w:lang w:val="en-ZA"/>
+              </w:rPr>
+              <w:t>Overview</w:t>
+            </w:r>
+          </w:p>
+        </w:tc>
+        <w:tc>
+          <w:tcPr>
+            <w:tcW w:w="1666" w:type="pct"/>
+          </w:tcPr>
+          <w:p>
+            <w:pPr>
+              <w:rPr>
+                <w:lang w:val="en-ZA"/>
+              </w:rPr>
+            </w:pPr>
+            <w:r>
+              <w:t>Provides general supply chain visibility</w:t>
+            </w:r>
+          </w:p>
+        </w:tc>
+        <w:tc>
+          <w:tcPr>
+            <w:tcW w:w="1667" w:type="pct"/>
+          </w:tcPr>
+          <w:p>
+            <w:pPr>
+              <w:rPr>
+                <w:lang w:val="en-ZA"/>
+              </w:rPr>
+            </w:pPr>
+            <w:r>
+              <w:t>KPIs, monthly order volume, delivery status distribution</w:t>
+            </w:r>
+          </w:p>
+        </w:tc>
+      </w:tr>
+      <w:tr>
+        <w:tc>
+          <w:tcPr>
+            <w:tcW w:w="1666" w:type="pct"/>
+          </w:tcPr>
+          <w:p>
+            <w:pPr>
+              <w:rPr>
+                <w:lang w:val="en-ZA"/>
+              </w:rPr>
+            </w:pPr>
+            <w:r>
+              <w:t>Regional Performance</w:t>
+            </w:r>
+          </w:p>
+        </w:tc>
+        <w:tc>
+          <w:tcPr>
+            <w:tcW w:w="1666" w:type="pct"/>
+          </w:tcPr>
+          <w:p>
+            <w:pPr>
+              <w:rPr>
+                <w:lang w:val="en-ZA"/>
+              </w:rPr>
+            </w:pPr>
+            <w:r>
+              <w:t>Compares markets, regions, and countries</w:t>
+            </w:r>
+          </w:p>
+        </w:tc>
+        <w:tc>
+          <w:tcPr>
+            <w:tcW w:w="1667" w:type="pct"/>
+          </w:tcPr>
+          <w:p>
+            <w:pPr>
+              <w:rPr>
+                <w:lang w:val="en-ZA"/>
+              </w:rPr>
+            </w:pPr>
+            <w:r>
+              <w:t>Regional KPIs, late delivery rate by market, regional risk</w:t>
+            </w:r>
+          </w:p>
+        </w:tc>
+      </w:tr>
+      <w:tr>
+        <w:tc>
+          <w:tcPr>
+            <w:tcW w:w="1666" w:type="pct"/>
+          </w:tcPr>
+          <w:p>
+            <w:pPr>
+              <w:rPr>
+                <w:lang w:val="en-ZA"/>
+              </w:rPr>
+            </w:pPr>
+            <w:r>
+              <w:t>Inventory Control</w:t>
+            </w:r>
+          </w:p>
+        </w:tc>
+        <w:tc>
+          <w:tcPr>
+            <w:tcW w:w="1666" w:type="pct"/>
+          </w:tcPr>
+          <w:p>
+            <w:pPr>
+              <w:rPr>
+                <w:lang w:val="en-ZA"/>
+              </w:rPr>
+            </w:pPr>
+            <w:r>
+              <w:t>Monitors product-level inventory indicators</w:t>
+            </w:r>
+          </w:p>
+        </w:tc>
+        <w:tc>
+          <w:tcPr>
+            <w:tcW w:w="1667" w:type="pct"/>
+          </w:tcPr>
+          <w:p>
+            <w:pPr>
+              <w:rPr>
+                <w:lang w:val="en-ZA"/>
+              </w:rPr>
+            </w:pPr>
+            <w:r>
+              <w:t>Critical items, warning items, days of supply, inventory risk</w:t>
+            </w:r>
+          </w:p>
+        </w:tc>
+      </w:tr>
+      <w:tr>
+        <w:tc>
+          <w:tcPr>
+            <w:tcW w:w="1666" w:type="pct"/>
+          </w:tcPr>
+          <w:p>
+            <w:pPr>
+              <w:rPr>
+                <w:lang w:val="en-ZA"/>
+              </w:rPr>
+            </w:pPr>
+            <w:r>
+              <w:t>Shipment Performance</w:t>
+            </w:r>
+          </w:p>
+        </w:tc>
+        <w:tc>
+          <w:tcPr>
+            <w:tcW w:w="1666" w:type="pct"/>
+          </w:tcPr>
+          <w:p>
+            <w:pPr>
+              <w:rPr>
+                <w:lang w:val="en-ZA"/>
+              </w:rPr>
+            </w:pPr>
+            <w:proofErr w:type="spellStart"/>
+            <w:r>
+              <w:t>Analyzes</w:t>
+            </w:r>
+            <w:proofErr w:type="spellEnd"/>
+            <w:r>
+              <w:t xml:space="preserve"> delivery and shipment performance</w:t>
+            </w:r>
+          </w:p>
+        </w:tc>
+        <w:tc>
+          <w:tcPr>
+            <w:tcW w:w="1667" w:type="pct"/>
+          </w:tcPr>
+          <w:p>
+            <w:pPr>
+              <w:rPr>
+                <w:lang w:val="en-ZA"/>
+              </w:rPr>
+            </w:pPr>
+            <w:r>
+              <w:t>Late delivery rate, delay by shipping mode, shipment trend</w:t>
+            </w:r>
+          </w:p>
+        </w:tc>
+      </w:tr>
+      <w:tr>
+        <w:tc>
+          <w:tcPr>
+            <w:tcW w:w="1666" w:type="pct"/>
+          </w:tcPr>
+          <w:p>
+            <w:pPr>
+              <w:rPr>
+                <w:lang w:val="en-ZA"/>
+              </w:rPr>
+            </w:pPr>
+            <w:r>
+              <w:t>Supply Chain Risk</w:t>
+            </w:r>
+          </w:p>
+        </w:tc>
+        <w:tc>
+          <w:tcPr>
+            <w:tcW w:w="1666" w:type="pct"/>
+          </w:tcPr>
+          <w:p>
+            <w:pPr>
+              <w:rPr>
+                <w:lang w:val="en-ZA"/>
+              </w:rPr>
+            </w:pPr>
+            <w:r>
+              <w:t>Combines operational risk indicators</w:t>
+            </w:r>
+          </w:p>
+        </w:tc>
+        <w:tc>
+          <w:tcPr>
+            <w:tcW w:w="1667" w:type="pct"/>
+          </w:tcPr>
+          <w:p>
+            <w:pPr>
+              <w:rPr>
+                <w:lang w:val="en-ZA"/>
+              </w:rPr>
+            </w:pPr>
+            <w:r>
+              <w:t>Overall risk score, delivery risk, inventory risk, demand volatility risk</w:t>
+            </w:r>
+          </w:p>
+        </w:tc>
+      </w:tr>
+      <w:tr>
+        <w:tc>
+          <w:tcPr>
+            <w:tcW w:w="1666" w:type="pct"/>
+          </w:tcPr>
+          <w:p>
+            <w:pPr>
+              <w:rPr>
+                <w:lang w:val="en-ZA"/>
+              </w:rPr>
+            </w:pPr>
+            <w:r>
+              <w:t>Demand Forecast</w:t>
+            </w:r>
+          </w:p>
+        </w:tc>
+        <w:tc>
+          <w:tcPr>
+            <w:tcW w:w="1666" w:type="pct"/>
+          </w:tcPr>
+          <w:p>
+            <w:pPr>
+              <w:rPr>
+                <w:lang w:val="en-ZA"/>
+              </w:rPr>
+            </w:pPr>
+            <w:proofErr w:type="spellStart"/>
+            <w:r>
+              <w:t>Analyzes</w:t>
+            </w:r>
+            <w:proofErr w:type="spellEnd"/>
+            <w:r>
+              <w:t xml:space="preserve"> historical demand and future demand estimates</w:t>
+            </w:r>
+          </w:p>
+        </w:tc>
+        <w:tc>
+          <w:tcPr>
+            <w:tcW w:w="1667" w:type="pct"/>
+          </w:tcPr>
+          <w:p>
+            <w:pPr>
+              <w:rPr>
+                <w:lang w:val="en-ZA"/>
+              </w:rPr>
+            </w:pPr>
+            <w:r>
+              <w:t>Moving average forecast, linear regression forecast, MAE, MAPE</w:t>
+            </w:r>
+          </w:p>
+        </w:tc>
+      </w:tr>
+    </w:tbl>
+    <w:p>
+      <w:pPr>
+        <w:rPr>
+          <w:lang w:val="en-ZA"/>
+        </w:rPr>
+      </w:pPr>
+      <w:r>
+        <w:rPr>
+          <w:lang w:val="en-ZA"/>
+        </w:rPr>
+        <w:t xml:space="preserve">The modular structure makes the platform easier to understand and maintain. Each page has a specific responsibility, but all pages use the same active dataset. This design supports both the default </w:t>
+      </w:r>
+      <w:proofErr w:type="spellStart"/>
+      <w:r>
+        <w:rPr>
+          <w:lang w:val="en-ZA"/>
+        </w:rPr>
+        <w:t>DataCo</w:t>
+      </w:r>
+      <w:proofErr w:type="spellEnd"/>
+      <w:r>
+        <w:rPr>
+          <w:lang w:val="en-ZA"/>
+        </w:rPr>
+        <w:t xml:space="preserve"> dataset and user-uploaded datasets.</w:t>
+      </w:r>
+    </w:p>
+    <w:p>
+      <w:pPr>
+        <w:pStyle w:val="Heading2"/>
+        <w:rPr>
+          <w:lang w:val="en-ZA"/>
+        </w:rPr>
+      </w:pPr>
+      <w:r>
+        <w:rPr>
+          <w:lang w:val="en-ZA"/>
+        </w:rPr>
+        <w:t>Risk Scoring Logic</w:t>
+      </w:r>
+    </w:p>
+    <w:p>
+      <w:pPr>
+        <w:rPr>
+          <w:lang w:val="en-ZA"/>
+        </w:rPr>
+      </w:pPr>
+      <w:r>
+        <w:rPr>
+          <w:lang w:val="en-ZA"/>
+        </w:rPr>
+        <w:t xml:space="preserve">The supply chain risk module uses a rule-based and interpretable risk scoring approach. The aim is to provide clear risk indicators that can </w:t>
+      </w:r>
+      <w:proofErr w:type="gramStart"/>
+      <w:r>
+        <w:rPr>
+          <w:lang w:val="en-ZA"/>
+        </w:rPr>
+        <w:t>be understood</w:t>
+      </w:r>
+      <w:proofErr w:type="gramEnd"/>
+      <w:r>
+        <w:rPr>
+          <w:lang w:val="en-ZA"/>
+        </w:rPr>
+        <w:t xml:space="preserve"> by users. The model does not use a black-box machine learning algorithm for risk scoring. Instead, it combines operational indicators such as delivery performance, delay days, inventory status, and demand volatility.</w:t>
+      </w:r>
+    </w:p>
+    <w:p>
+      <w:pPr>
+        <w:rPr>
+          <w:lang w:val="en-ZA"/>
+        </w:rPr>
+      </w:pPr>
+    </w:p>
+    <w:p>
+      <w:pPr>
+        <w:rPr>
+          <w:lang w:val="en-ZA"/>
+        </w:rPr>
+      </w:pPr>
+      <w:r>
+        <w:rPr>
+          <w:lang w:val="en-ZA"/>
+        </w:rPr>
+        <w:t xml:space="preserve">The main risk components used in the platform </w:t>
+      </w:r>
+      <w:proofErr w:type="gramStart"/>
+      <w:r>
+        <w:rPr>
+          <w:lang w:val="en-ZA"/>
+        </w:rPr>
+        <w:t>are shown</w:t>
+      </w:r>
+      <w:proofErr w:type="gramEnd"/>
+      <w:r>
+        <w:rPr>
+          <w:lang w:val="en-ZA"/>
+        </w:rPr>
+        <w:t xml:space="preserve"> in Table 4.</w:t>
+      </w:r>
+    </w:p>
+    <w:p>
+      <w:pPr>
+        <w:jc w:val="center"/>
+        <w:rPr>
+          <w:b/>
+          <w:bCs/>
+          <w:lang w:val="en-ZA"/>
+        </w:rPr>
+      </w:pPr>
+      <w:r>
+        <w:rPr>
+          <w:b/>
+          <w:bCs/>
+          <w:lang w:val="en-ZA"/>
+        </w:rPr>
+        <w:t>Table 4: Risk Components Used in the Overall Risk Score</w:t>
+      </w:r>
+    </w:p>
+    <w:tbl>
+      <w:tblPr>
+        <w:tblStyle w:val="TableGrid"/>
+        <w:tblW w:w="0" w:type="auto"/>
+        <w:tblLook w:val="04A0" w:firstRow="1" w:lastRow="0" w:firstColumn="1" w:lastColumn="0" w:noHBand="0" w:noVBand="1"/>
+      </w:tblPr>
+      <w:tblGrid>
+        <w:gridCol w:w="3077"/>
+        <w:gridCol w:w="3077"/>
+        <w:gridCol w:w="3078"/>
+      </w:tblGrid>
+      <w:tr>
+        <w:tc>
+          <w:tcPr>
+            <w:tcW w:w="3077" w:type="dxa"/>
+          </w:tcPr>
+          <w:p>
+            <w:pPr>
+              <w:rPr>
+                <w:b/>
+                <w:bCs/>
+                <w:lang w:val="en-ZA"/>
+              </w:rPr>
+            </w:pPr>
+            <w:r>
+              <w:rPr>
+                <w:b/>
+                <w:bCs/>
+                <w:lang w:val="en-ZA"/>
+              </w:rPr>
+              <w:t>Risk Component</w:t>
+            </w:r>
+          </w:p>
+        </w:tc>
+        <w:tc>
+          <w:tcPr>
+            <w:tcW w:w="3077" w:type="dxa"/>
+          </w:tcPr>
+          <w:p>
+            <w:pPr>
+              <w:rPr>
+                <w:b/>
+                <w:bCs/>
+                <w:lang w:val="en-ZA"/>
+              </w:rPr>
+            </w:pPr>
+            <w:r>
+              <w:rPr>
+                <w:b/>
+                <w:bCs/>
+                <w:lang w:val="en-ZA"/>
+              </w:rPr>
+              <w:t>Meaning</w:t>
+            </w:r>
+          </w:p>
+        </w:tc>
+        <w:tc>
+          <w:tcPr>
+            <w:tcW w:w="3078" w:type="dxa"/>
+          </w:tcPr>
+          <w:p>
+            <w:pPr>
+              <w:rPr>
+                <w:b/>
+                <w:bCs/>
+                <w:lang w:val="en-ZA"/>
+              </w:rPr>
+            </w:pPr>
+            <w:r>
+              <w:rPr>
+                <w:b/>
+                <w:bCs/>
+                <w:lang w:val="en-ZA"/>
+              </w:rPr>
+              <w:t>Weight</w:t>
+            </w:r>
+          </w:p>
+        </w:tc>
+      </w:tr>
+      <w:tr>
+        <w:tc>
+          <w:tcPr>
+            <w:tcW w:w="3077" w:type="dxa"/>
+          </w:tcPr>
+          <w:p>
+            <w:pPr>
+              <w:rPr>
+                <w:lang w:val="en-ZA"/>
+              </w:rPr>
+            </w:pPr>
+            <w:r>
+              <w:rPr>
+                <w:lang w:val="en-ZA"/>
+              </w:rPr>
+              <w:t>Delivery Risk</w:t>
+            </w:r>
+          </w:p>
+        </w:tc>
+        <w:tc>
+          <w:tcPr>
+            <w:tcW w:w="3077" w:type="dxa"/>
+          </w:tcPr>
+          <w:p>
+            <w:pPr>
+              <w:rPr>
+                <w:lang w:val="en-ZA"/>
+              </w:rPr>
+            </w:pPr>
+            <w:r>
+              <w:rPr>
+                <w:lang w:val="en-ZA"/>
+              </w:rPr>
+              <w:t>Share of late deliveries in the selected dataset</w:t>
+            </w:r>
+          </w:p>
+        </w:tc>
+        <w:tc>
+          <w:tcPr>
+            <w:tcW w:w="3078" w:type="dxa"/>
+          </w:tcPr>
+          <w:p>
+            <w:pPr>
+              <w:rPr>
+                <w:lang w:val="en-ZA"/>
+              </w:rPr>
+            </w:pPr>
+            <w:r>
+              <w:rPr>
+                <w:lang w:val="en-ZA"/>
+              </w:rPr>
+              <w:t>35%</w:t>
+            </w:r>
+          </w:p>
+        </w:tc>
+      </w:tr>
+      <w:tr>
+        <w:tc>
+          <w:tcPr>
+            <w:tcW w:w="3077" w:type="dxa"/>
+          </w:tcPr>
+          <w:p>
+            <w:pPr>
+              <w:rPr>
+                <w:lang w:val="en-ZA"/>
+              </w:rPr>
+            </w:pPr>
+            <w:r>
+              <w:rPr>
+                <w:lang w:val="en-ZA"/>
+              </w:rPr>
+              <w:t>Inventory Risk</w:t>
+            </w:r>
+          </w:p>
+        </w:tc>
+        <w:tc>
+          <w:tcPr>
+            <w:tcW w:w="3077" w:type="dxa"/>
+          </w:tcPr>
+          <w:p>
+            <w:pPr>
+              <w:rPr>
+                <w:lang w:val="en-ZA"/>
+              </w:rPr>
+            </w:pPr>
+            <w:r>
+              <w:rPr>
+                <w:lang w:val="en-ZA"/>
+              </w:rPr>
+              <w:t>Share of critical and warning inventory items</w:t>
+            </w:r>
+          </w:p>
+        </w:tc>
+        <w:tc>
+          <w:tcPr>
+            <w:tcW w:w="3078" w:type="dxa"/>
+          </w:tcPr>
+          <w:p>
+            <w:pPr>
+              <w:rPr>
+                <w:lang w:val="en-ZA"/>
+              </w:rPr>
+            </w:pPr>
+            <w:r>
+              <w:rPr>
+                <w:lang w:val="en-ZA"/>
+              </w:rPr>
+              <w:t>25%</w:t>
+            </w:r>
+          </w:p>
+        </w:tc>
+      </w:tr>
+      <w:tr>
+        <w:tc>
+          <w:tcPr>
+            <w:tcW w:w="3077" w:type="dxa"/>
+          </w:tcPr>
+          <w:p>
+            <w:pPr>
+              <w:rPr>
+                <w:lang w:val="en-ZA"/>
+              </w:rPr>
+            </w:pPr>
+            <w:r>
+              <w:rPr>
+                <w:lang w:val="en-ZA"/>
+              </w:rPr>
+              <w:t>Delay Risk</w:t>
+            </w:r>
+          </w:p>
+        </w:tc>
+        <w:tc>
+          <w:tcPr>
+            <w:tcW w:w="3077" w:type="dxa"/>
+          </w:tcPr>
+          <w:p>
+            <w:pPr>
+              <w:rPr>
+                <w:lang w:val="en-ZA"/>
+              </w:rPr>
+            </w:pPr>
+            <w:r>
+              <w:rPr>
+                <w:lang w:val="en-ZA"/>
+              </w:rPr>
+              <w:t>Normalized average delay days</w:t>
+            </w:r>
+          </w:p>
+        </w:tc>
+        <w:tc>
+          <w:tcPr>
+            <w:tcW w:w="3078" w:type="dxa"/>
+          </w:tcPr>
+          <w:p>
+            <w:pPr>
+              <w:rPr>
+                <w:lang w:val="en-ZA"/>
+              </w:rPr>
+            </w:pPr>
+            <w:r>
+              <w:rPr>
+                <w:lang w:val="en-ZA"/>
+              </w:rPr>
+              <w:t>20%</w:t>
+            </w:r>
+          </w:p>
+        </w:tc>
+      </w:tr>
+      <w:tr>
+        <w:tc>
+          <w:tcPr>
+            <w:tcW w:w="3077" w:type="dxa"/>
+          </w:tcPr>
+          <w:p>
+            <w:pPr>
+              <w:rPr>
+                <w:lang w:val="en-ZA"/>
+              </w:rPr>
+            </w:pPr>
+            <w:r>
+              <w:rPr>
+                <w:lang w:val="en-ZA"/>
+              </w:rPr>
+              <w:t>Demand Volatility Risk</w:t>
+            </w:r>
+          </w:p>
+        </w:tc>
+        <w:tc>
+          <w:tcPr>
+            <w:tcW w:w="3077" w:type="dxa"/>
+          </w:tcPr>
+          <w:p>
+            <w:pPr>
+              <w:rPr>
+                <w:lang w:val="en-ZA"/>
+              </w:rPr>
+            </w:pPr>
+            <w:r>
+              <w:rPr>
+                <w:lang w:val="en-ZA"/>
+              </w:rPr>
+              <w:t>Variation in monthly demand</w:t>
+            </w:r>
+          </w:p>
+        </w:tc>
+        <w:tc>
+          <w:tcPr>
+            <w:tcW w:w="3078" w:type="dxa"/>
+          </w:tcPr>
+          <w:p>
+            <w:pPr>
+              <w:rPr>
+                <w:lang w:val="en-ZA"/>
+              </w:rPr>
+            </w:pPr>
+            <w:r>
+              <w:rPr>
+                <w:lang w:val="en-ZA"/>
+              </w:rPr>
+              <w:t>20%</w:t>
+            </w:r>
+          </w:p>
+        </w:tc>
+      </w:tr>
+    </w:tbl>
+    <w:p>
+      <w:pPr>
+        <w:rPr>
+          <w:lang w:val="en-ZA"/>
+        </w:rPr>
+      </w:pPr>
+      <w:r>
+        <w:rPr>
+          <w:lang w:val="en-ZA"/>
+        </w:rPr>
+        <w:t xml:space="preserve">The overall risk score </w:t>
+      </w:r>
+      <w:proofErr w:type="gramStart"/>
+      <w:r>
+        <w:rPr>
+          <w:lang w:val="en-ZA"/>
+        </w:rPr>
+        <w:t>is calculated</w:t>
+      </w:r>
+      <w:proofErr w:type="gramEnd"/>
+      <w:r>
+        <w:rPr>
+          <w:lang w:val="en-ZA"/>
+        </w:rPr>
+        <w:t xml:space="preserve"> by combining the weighted risk components. The weights </w:t>
+      </w:r>
+      <w:proofErr w:type="gramStart"/>
+      <w:r>
+        <w:rPr>
+          <w:lang w:val="en-ZA"/>
+        </w:rPr>
+        <w:t>were selected</w:t>
+      </w:r>
+      <w:proofErr w:type="gramEnd"/>
+      <w:r>
+        <w:rPr>
+          <w:lang w:val="en-ZA"/>
+        </w:rPr>
+        <w:t xml:space="preserve"> to give higher importance to delivery performance and inventory condition, because these two areas directly affect operational continuity and customer service.</w:t>
+      </w:r>
+    </w:p>
+    <w:p>
+      <w:pPr>
+        <w:rPr>
+          <w:lang w:val="en-ZA"/>
+        </w:rPr>
+      </w:pPr>
+    </w:p>
+    <w:p>
+      <w:pPr>
+        <w:rPr>
+          <w:lang w:val="en-ZA"/>
+        </w:rPr>
+      </w:pPr>
+      <m:oMathPara>
+        <m:oMath>
+          <m:eqArr>
+            <m:eqArrPr>
+              <m:maxDist m:val="1"/>
+              <m:ctrlPr>
+                <w:rPr>
+                  <w:rFonts w:ascii="Cambria Math" w:hAnsi="Cambria Math"/>
+                  <w:i/>
+                  <w:lang w:val="en-ZA"/>
+                </w:rPr>
+              </m:ctrlPr>
+            </m:eqArrPr>
+            <m:e>
+              <m:r>
+                <w:rPr>
+                  <w:rFonts w:ascii="Cambria Math" w:hAnsi="Cambria Math"/>
+                  <w:lang w:val="en-ZA"/>
+                </w:rPr>
+                <m:t>Late Delivery Rate=</m:t>
+              </m:r>
+              <m:d>
+                <m:dPr>
+                  <m:ctrlPr>
+                    <w:rPr>
+                      <w:rFonts w:ascii="Cambria Math" w:hAnsi="Cambria Math"/>
+                      <w:i/>
+                      <w:lang w:val="en-ZA"/>
+                    </w:rPr>
+                  </m:ctrlPr>
+                </m:dPr>
+                <m:e>
+                  <m:f>
+                    <m:fPr>
+                      <m:ctrlPr>
+                        <w:rPr>
+                          <w:rFonts w:ascii="Cambria Math" w:hAnsi="Cambria Math"/>
+                          <w:i/>
+                          <w:lang w:val="en-ZA"/>
+                        </w:rPr>
+                      </m:ctrlPr>
+                    </m:fPr>
+                    <m:num>
+                      <m:r>
+                        <w:rPr>
+                          <w:rFonts w:ascii="Cambria Math" w:hAnsi="Cambria Math"/>
+                          <w:lang w:val="en-ZA"/>
+                        </w:rPr>
+                        <m:t>Number of Late Orders</m:t>
+                      </m:r>
+                    </m:num>
+                    <m:den>
+                      <m:r>
+                        <w:rPr>
+                          <w:rFonts w:ascii="Cambria Math" w:hAnsi="Cambria Math"/>
+                          <w:lang w:val="en-ZA"/>
+                        </w:rPr>
+                        <m:t>Total Number of Orders</m:t>
+                      </m:r>
+                    </m:den>
+                  </m:f>
+                </m:e>
+              </m:d>
+              <m:r>
+                <w:rPr>
+                  <w:rFonts w:ascii="Cambria Math" w:hAnsi="Cambria Math"/>
+                  <w:lang w:val="en-ZA"/>
+                </w:rPr>
+                <m:t>x 100</m:t>
+              </m:r>
+              <m:r>
+                <w:rPr>
+                  <w:rFonts w:ascii="Cambria Math" w:hAnsi="Cambria Math"/>
+                  <w:lang w:val="en-ZA"/>
+                </w:rPr>
+                <m:t xml:space="preserve"> #</m:t>
+              </m:r>
+              <m:d>
+                <m:dPr>
+                  <m:ctrlPr>
+                    <w:rPr>
+                      <w:rFonts w:ascii="Cambria Math" w:hAnsi="Cambria Math"/>
+                      <w:i/>
+                      <w:lang w:val="en-ZA"/>
+                    </w:rPr>
+                  </m:ctrlPr>
+                </m:dPr>
+                <m:e>
+                  <m:r>
+                    <w:rPr>
+                      <w:rFonts w:ascii="Cambria Math" w:hAnsi="Cambria Math"/>
+                      <w:lang w:val="en-ZA"/>
+                    </w:rPr>
+                    <m:t>1</m:t>
+                  </m:r>
+                </m:e>
+              </m:d>
+            </m:e>
+          </m:eqArr>
+        </m:oMath>
+      </m:oMathPara>
+    </w:p>
+    <w:p>
+      <w:pPr>
+        <w:rPr>
+          <w:lang w:val="en-ZA"/>
+        </w:rPr>
+      </w:pPr>
+    </w:p>
+    <w:p>
+      <w:pPr>
+        <w:rPr>
+          <w:lang w:val="en-ZA"/>
+        </w:rPr>
+      </w:pPr>
+      <m:oMathPara>
+        <m:oMath>
+          <m:eqArr>
+            <m:eqArrPr>
+              <m:maxDist m:val="1"/>
+              <m:ctrlPr>
+                <w:rPr>
+                  <w:rFonts w:ascii="Cambria Math" w:hAnsi="Cambria Math"/>
+                  <w:i/>
+                  <w:lang w:val="en-ZA"/>
+                </w:rPr>
+              </m:ctrlPr>
+            </m:eqArrPr>
+            <m:e>
+              <m:r>
+                <w:rPr>
+                  <w:rFonts w:ascii="Cambria Math" w:hAnsi="Cambria Math"/>
+                  <w:lang w:val="en-ZA"/>
+                </w:rPr>
+                <m:t>Average Delay Days=</m:t>
+              </m:r>
+              <m:f>
+                <m:fPr>
+                  <m:ctrlPr>
+                    <w:rPr>
+                      <w:rFonts w:ascii="Cambria Math" w:hAnsi="Cambria Math"/>
+                      <w:i/>
+                      <w:lang w:val="en-ZA"/>
+                    </w:rPr>
+                  </m:ctrlPr>
+                </m:fPr>
+                <m:num>
+                  <m:r>
+                    <w:rPr>
+                      <w:rFonts w:ascii="Cambria Math" w:hAnsi="Cambria Math"/>
+                      <w:lang w:val="en-ZA"/>
+                    </w:rPr>
+                    <m:t>Total Delay Days</m:t>
+                  </m:r>
+                </m:num>
+                <m:den>
+                  <m:r>
+                    <w:rPr>
+                      <w:rFonts w:ascii="Cambria Math" w:hAnsi="Cambria Math"/>
+                      <w:lang w:val="en-ZA"/>
+                    </w:rPr>
+                    <m:t>Number of Orders</m:t>
+                  </m:r>
+                </m:den>
+              </m:f>
+              <m:r>
+                <w:rPr>
+                  <w:rFonts w:ascii="Cambria Math" w:hAnsi="Cambria Math"/>
+                  <w:lang w:val="en-ZA"/>
+                </w:rPr>
+                <m:t xml:space="preserve"> #</m:t>
+              </m:r>
+              <m:d>
+                <m:dPr>
+                  <m:ctrlPr>
+                    <w:rPr>
+                      <w:rFonts w:ascii="Cambria Math" w:hAnsi="Cambria Math"/>
+                      <w:i/>
+                      <w:lang w:val="en-ZA"/>
+                    </w:rPr>
+                  </m:ctrlPr>
+                </m:dPr>
+                <m:e>
+                  <m:r>
+                    <w:rPr>
+                      <w:rFonts w:ascii="Cambria Math" w:hAnsi="Cambria Math"/>
+                      <w:lang w:val="en-ZA"/>
+                    </w:rPr>
+                    <m:t>2</m:t>
+                  </m:r>
+                </m:e>
+              </m:d>
+            </m:e>
+          </m:eqArr>
+        </m:oMath>
+      </m:oMathPara>
+    </w:p>
+    <w:p>
+      <w:pPr>
+        <w:rPr>
+          <w:lang w:val="en-ZA"/>
+        </w:rPr>
+      </w:pPr>
+      <m:oMathPara>
+        <m:oMath>
+          <m:eqArr>
+            <m:eqArrPr>
+              <m:maxDist m:val="1"/>
+              <m:ctrlPr>
+                <w:rPr>
+                  <w:rFonts w:ascii="Cambria Math" w:hAnsi="Cambria Math"/>
+                  <w:i/>
+                  <w:lang w:val="en-ZA"/>
+                </w:rPr>
+              </m:ctrlPr>
+            </m:eqArrPr>
+            <m:e>
+              <m:r>
+                <w:rPr>
+                  <w:rFonts w:ascii="Cambria Math" w:hAnsi="Cambria Math"/>
+                  <w:lang w:val="en-ZA"/>
+                </w:rPr>
+                <m:t>Inventory Risk=</m:t>
+              </m:r>
+              <m:d>
+                <m:dPr>
+                  <m:ctrlPr>
+                    <w:rPr>
+                      <w:rFonts w:ascii="Cambria Math" w:hAnsi="Cambria Math"/>
+                      <w:i/>
+                      <w:lang w:val="en-ZA"/>
+                    </w:rPr>
+                  </m:ctrlPr>
+                </m:dPr>
+                <m:e>
+                  <m:f>
+                    <m:fPr>
+                      <m:ctrlPr>
+                        <w:rPr>
+                          <w:rFonts w:ascii="Cambria Math" w:hAnsi="Cambria Math"/>
+                          <w:i/>
+                          <w:lang w:val="en-ZA"/>
+                        </w:rPr>
+                      </m:ctrlPr>
+                    </m:fPr>
+                    <m:num>
+                      <m:d>
+                        <m:dPr>
+                          <m:ctrlPr>
+                            <w:rPr>
+                              <w:rFonts w:ascii="Cambria Math" w:hAnsi="Cambria Math"/>
+                              <w:i/>
+                              <w:lang w:val="en-ZA"/>
+                            </w:rPr>
+                          </m:ctrlPr>
+                        </m:dPr>
+                        <m:e>
+                          <m:r>
+                            <w:rPr>
+                              <w:rFonts w:ascii="Cambria Math" w:hAnsi="Cambria Math"/>
+                              <w:lang w:val="en-ZA"/>
+                            </w:rPr>
+                            <m:t>Critical Items+Warning Items</m:t>
+                          </m:r>
+                        </m:e>
+                      </m:d>
+                    </m:num>
+                    <m:den>
+                      <m:r>
+                        <w:rPr>
+                          <w:rFonts w:ascii="Cambria Math" w:hAnsi="Cambria Math"/>
+                          <w:lang w:val="en-ZA"/>
+                        </w:rPr>
+                        <m:t>Total Inventory Items</m:t>
+                      </m:r>
+                    </m:den>
+                  </m:f>
+                </m:e>
+              </m:d>
+              <m:r>
+                <w:rPr>
+                  <w:rFonts w:ascii="Cambria Math" w:hAnsi="Cambria Math"/>
+                  <w:lang w:val="en-ZA"/>
+                </w:rPr>
+                <m:t>x 100 #</m:t>
+              </m:r>
+              <m:d>
+                <m:dPr>
+                  <m:ctrlPr>
+                    <w:rPr>
+                      <w:rFonts w:ascii="Cambria Math" w:hAnsi="Cambria Math"/>
+                      <w:i/>
+                      <w:lang w:val="en-ZA"/>
+                    </w:rPr>
+                  </m:ctrlPr>
+                </m:dPr>
+                <m:e>
+                  <m:r>
+                    <w:rPr>
+                      <w:rFonts w:ascii="Cambria Math" w:hAnsi="Cambria Math"/>
+                      <w:lang w:val="en-ZA"/>
+                    </w:rPr>
+                    <m:t>3</m:t>
+                  </m:r>
+                </m:e>
+              </m:d>
+            </m:e>
+          </m:eqArr>
+        </m:oMath>
+      </m:oMathPara>
+    </w:p>
+    <w:p>
+      <w:pPr>
+        <w:rPr>
+          <w:lang w:val="en-ZA"/>
+        </w:rPr>
+      </w:pPr>
+    </w:p>
+    <w:p>
+      <w:pPr>
+        <w:rPr>
+          <w:lang w:val="en-ZA"/>
+        </w:rPr>
+      </w:pPr>
+      <m:oMathPara>
+        <m:oMath>
+          <m:eqArr>
+            <m:eqArrPr>
+              <m:maxDist m:val="1"/>
+              <m:ctrlPr>
+                <w:rPr>
+                  <w:rFonts w:ascii="Cambria Math" w:hAnsi="Cambria Math"/>
+                  <w:i/>
+                  <w:lang w:val="en-ZA"/>
+                </w:rPr>
+              </m:ctrlPr>
+            </m:eqArrPr>
+            <m:e>
+              <m:r>
+                <w:rPr>
+                  <w:rFonts w:ascii="Cambria Math" w:hAnsi="Cambria Math"/>
+                  <w:lang w:val="en-ZA"/>
+                </w:rPr>
+                <m:t>Demand Volatility Risk=</m:t>
+              </m:r>
+              <m:d>
+                <m:dPr>
+                  <m:ctrlPr>
+                    <w:rPr>
+                      <w:rFonts w:ascii="Cambria Math" w:hAnsi="Cambria Math"/>
+                      <w:i/>
+                      <w:lang w:val="en-ZA"/>
+                    </w:rPr>
+                  </m:ctrlPr>
+                </m:dPr>
+                <m:e>
+                  <m:f>
+                    <m:fPr>
+                      <m:ctrlPr>
+                        <w:rPr>
+                          <w:rFonts w:ascii="Cambria Math" w:hAnsi="Cambria Math"/>
+                          <w:i/>
+                          <w:lang w:val="en-ZA"/>
+                        </w:rPr>
+                      </m:ctrlPr>
+                    </m:fPr>
+                    <m:num>
+                      <m:r>
+                        <w:rPr>
+                          <w:rFonts w:ascii="Cambria Math" w:hAnsi="Cambria Math"/>
+                          <w:lang w:val="en-ZA"/>
+                        </w:rPr>
+                        <m:t>Standard Deviation of Monthly Demand</m:t>
+                      </m:r>
+                    </m:num>
+                    <m:den>
+                      <m:r>
+                        <w:rPr>
+                          <w:rFonts w:ascii="Cambria Math" w:hAnsi="Cambria Math"/>
+                          <w:lang w:val="en-ZA"/>
+                        </w:rPr>
+                        <m:t>Average Monthly Demand</m:t>
+                      </m:r>
+                    </m:den>
+                  </m:f>
+                </m:e>
+              </m:d>
+              <m:r>
+                <w:rPr>
+                  <w:rFonts w:ascii="Cambria Math" w:hAnsi="Cambria Math"/>
+                  <w:lang w:val="en-ZA"/>
+                </w:rPr>
+                <m:t>x 100 #</m:t>
+              </m:r>
+              <m:d>
+                <m:dPr>
+                  <m:ctrlPr>
+                    <w:rPr>
+                      <w:rFonts w:ascii="Cambria Math" w:hAnsi="Cambria Math"/>
+                      <w:i/>
+                      <w:lang w:val="en-ZA"/>
+                    </w:rPr>
+                  </m:ctrlPr>
+                </m:dPr>
+                <m:e>
+                  <m:r>
+                    <w:rPr>
+                      <w:rFonts w:ascii="Cambria Math" w:hAnsi="Cambria Math"/>
+                      <w:lang w:val="en-ZA"/>
+                    </w:rPr>
+                    <m:t>4</m:t>
+                  </m:r>
+                </m:e>
+              </m:d>
+            </m:e>
+          </m:eqArr>
+        </m:oMath>
+      </m:oMathPara>
+    </w:p>
+    <w:p>
+      <w:pPr>
+        <w:rPr>
+          <w:lang w:val="en-ZA"/>
+        </w:rPr>
+      </w:pPr>
+    </w:p>
+    <w:p>
+      <w:pPr>
+        <w:rPr>
+          <w:lang w:val="en-ZA"/>
+        </w:rPr>
+      </w:pPr>
+      <m:oMathPara>
+        <m:oMath>
+          <m:eqArr>
+            <m:eqArrPr>
+              <m:maxDist m:val="1"/>
+              <m:ctrlPr>
+                <w:rPr>
+                  <w:rFonts w:ascii="Cambria Math" w:hAnsi="Cambria Math"/>
+                  <w:i/>
+                  <w:lang w:val="en-ZA"/>
+                </w:rPr>
+              </m:ctrlPr>
+            </m:eqArrPr>
+            <m:e>
+              <m:r>
+                <w:rPr>
+                  <w:rFonts w:ascii="Cambria Math" w:hAnsi="Cambria Math"/>
+                  <w:lang w:val="en-ZA"/>
+                </w:rPr>
+                <m:t>Overall Risk Score=0.35 x Delivery Risk+0.25 x Inventory Risk+0.20 x Delay Risk+0.20 x Demand Volatility Risk #</m:t>
+              </m:r>
+              <m:d>
+                <m:dPr>
+                  <m:ctrlPr>
+                    <w:rPr>
+                      <w:rFonts w:ascii="Cambria Math" w:hAnsi="Cambria Math"/>
+                      <w:i/>
+                      <w:lang w:val="en-ZA"/>
+                    </w:rPr>
+                  </m:ctrlPr>
+                </m:dPr>
+                <m:e>
+                  <m:r>
+                    <w:rPr>
+                      <w:rFonts w:ascii="Cambria Math" w:hAnsi="Cambria Math"/>
+                      <w:lang w:val="en-ZA"/>
+                    </w:rPr>
+                    <m:t>5</m:t>
+                  </m:r>
+                </m:e>
+              </m:d>
+            </m:e>
+          </m:eqArr>
+        </m:oMath>
+      </m:oMathPara>
+    </w:p>
+    <w:p>
+      <w:pPr>
+        <w:rPr>
+          <w:lang w:val="en-ZA"/>
+        </w:rPr>
+      </w:pPr>
+    </w:p>
+    <w:p>
+      <w:pPr>
+        <w:rPr>
+          <w:lang w:val="en-ZA"/>
+        </w:rPr>
+      </w:pPr>
+      <w:r>
+        <w:rPr>
+          <w:lang w:val="en-ZA"/>
+        </w:rPr>
+        <w:t xml:space="preserve">The risk score </w:t>
+      </w:r>
+      <w:proofErr w:type="gramStart"/>
+      <w:r>
+        <w:rPr>
+          <w:lang w:val="en-ZA"/>
+        </w:rPr>
+        <w:t>is interpreted</w:t>
+      </w:r>
+      <w:proofErr w:type="gramEnd"/>
+      <w:r>
+        <w:rPr>
+          <w:lang w:val="en-ZA"/>
+        </w:rPr>
+        <w:t xml:space="preserve"> in three levels. A score below 30 </w:t>
+      </w:r>
+      <w:proofErr w:type="gramStart"/>
+      <w:r>
+        <w:rPr>
+          <w:lang w:val="en-ZA"/>
+        </w:rPr>
+        <w:t>is classified</w:t>
+      </w:r>
+      <w:proofErr w:type="gramEnd"/>
+      <w:r>
+        <w:rPr>
+          <w:lang w:val="en-ZA"/>
+        </w:rPr>
+        <w:t xml:space="preserve"> as Low Risk, a score between 30 and 60 </w:t>
+      </w:r>
+      <w:proofErr w:type="gramStart"/>
+      <w:r>
+        <w:rPr>
+          <w:lang w:val="en-ZA"/>
+        </w:rPr>
+        <w:t>is classified</w:t>
+      </w:r>
+      <w:proofErr w:type="gramEnd"/>
+      <w:r>
+        <w:rPr>
+          <w:lang w:val="en-ZA"/>
+        </w:rPr>
+        <w:t xml:space="preserve"> as Medium Risk, and a score above 60 </w:t>
+      </w:r>
+      <w:proofErr w:type="gramStart"/>
+      <w:r>
+        <w:rPr>
+          <w:lang w:val="en-ZA"/>
+        </w:rPr>
+        <w:t>is classified</w:t>
+      </w:r>
+      <w:proofErr w:type="gramEnd"/>
+      <w:r>
+        <w:rPr>
+          <w:lang w:val="en-ZA"/>
+        </w:rPr>
+        <w:t xml:space="preserve"> as High Risk. This classification helps users understand the risk level quickly without </w:t>
+      </w:r>
+      <w:proofErr w:type="spellStart"/>
+      <w:r>
+        <w:rPr>
+          <w:lang w:val="en-ZA"/>
+        </w:rPr>
+        <w:t>analyzing</w:t>
+      </w:r>
+      <w:proofErr w:type="spellEnd"/>
+      <w:r>
+        <w:rPr>
+          <w:lang w:val="en-ZA"/>
+        </w:rPr>
+        <w:t xml:space="preserve"> every component separately.</w:t>
+      </w:r>
+    </w:p>
+    <w:p>
+      <w:pPr>
+        <w:rPr>
+          <w:lang w:val="en-ZA"/>
+        </w:rPr>
+      </w:pPr>
+    </w:p>
+    <w:p>
+      <w:pPr>
+        <w:rPr>
+          <w:lang w:val="en-ZA"/>
+        </w:rPr>
+      </w:pPr>
+      <w:r>
+        <w:rPr>
+          <w:lang w:val="en-ZA"/>
+        </w:rPr>
+        <w:t xml:space="preserve">The risk scoring logic </w:t>
+      </w:r>
+      <w:proofErr w:type="gramStart"/>
+      <w:r>
+        <w:rPr>
+          <w:lang w:val="en-ZA"/>
+        </w:rPr>
+        <w:t>is also affected</w:t>
+      </w:r>
+      <w:proofErr w:type="gramEnd"/>
+      <w:r>
+        <w:rPr>
+          <w:lang w:val="en-ZA"/>
+        </w:rPr>
+        <w:t xml:space="preserve"> by dashboard filters. When the user filters the dataset by market, category, shipping mode, or date range, the risk components </w:t>
+      </w:r>
+      <w:proofErr w:type="gramStart"/>
+      <w:r>
+        <w:rPr>
+          <w:lang w:val="en-ZA"/>
+        </w:rPr>
+        <w:t>are recalculated</w:t>
+      </w:r>
+      <w:proofErr w:type="gramEnd"/>
+      <w:r>
+        <w:rPr>
+          <w:lang w:val="en-ZA"/>
+        </w:rPr>
+        <w:t xml:space="preserve"> based on the filtered data. This makes the risk analysis interactive and more useful for decision-making.</w:t>
+      </w:r>
+    </w:p>
+    <w:p>
+      <w:pPr>
+        <w:rPr>
+          <w:lang w:val="en-ZA"/>
+        </w:rPr>
+      </w:pPr>
+    </w:p>
+    <w:p>
+      <w:pPr>
+        <w:rPr>
+          <w:lang w:val="en-ZA"/>
+        </w:rPr>
+      </w:pPr>
+    </w:p>
+    <w:p>
+      <w:pPr>
+        <w:rPr>
+          <w:lang w:val="en-ZA"/>
+        </w:rPr>
+      </w:pPr>
+    </w:p>
+    <w:p>
+      <w:pPr>
         <w:pStyle w:val="Heading1"/>
       </w:pPr>
       <w:bookmarkStart w:id="20" w:name="_Toc115861786"/>
@@ -5932,8 +8358,18 @@
     </w:p>
     <w:p>
       <w:r>
-        <w:t>……….fdfdfdf</w:t>
-      </w:r>
+        <w:t>……</w:t>
+      </w:r>
+      <w:proofErr w:type="gramStart"/>
+      <w:r>
+        <w:t>….</w:t>
+      </w:r>
+      <w:proofErr w:type="spellStart"/>
+      <w:r>
+        <w:t>fdfdfdf</w:t>
+      </w:r>
+      <w:proofErr w:type="spellEnd"/>
+      <w:proofErr w:type="gramEnd"/>
     </w:p>
     <w:p>
       <w:pPr>
@@ -5947,9 +8383,18 @@
     </w:p>
     <w:p>
       <w:r>
-        <w:lastRenderedPageBreak/>
-        <w:t>……….fdfdfdf</w:t>
-      </w:r>
+        <w:t>……</w:t>
+      </w:r>
+      <w:proofErr w:type="gramStart"/>
+      <w:r>
+        <w:t>….</w:t>
+      </w:r>
+      <w:proofErr w:type="spellStart"/>
+      <w:r>
+        <w:t>fdfdfdf</w:t>
+      </w:r>
+      <w:proofErr w:type="spellEnd"/>
+      <w:proofErr w:type="gramEnd"/>
     </w:p>
     <w:p/>
     <w:p>
@@ -6292,6 +8737,7 @@
             <w:rPr>
               <w:noProof/>
             </w:rPr>
+            <w:lastRenderedPageBreak/>
             <w:t xml:space="preserve">Malhotra, R., &amp; Temponi, C. (2010). Critical decisions for ERP integration: Small business issues. </w:t>
           </w:r>
           <w:r>
@@ -6611,7 +9057,6 @@
             <w:rPr>
               <w:noProof/>
             </w:rPr>
-            <w:lastRenderedPageBreak/>
             <w:t xml:space="preserve">URL_03. (2015, 06). </w:t>
           </w:r>
           <w:r>
@@ -6709,7 +9154,15 @@
       <w:bookmarkStart w:id="26" w:name="_Toc115861789"/>
       <w:r>
         <w:lastRenderedPageBreak/>
-        <w:t>GIT/KAGGLE/COLAB/etc.. LINK</w:t>
+        <w:t>GIT/KAGGLE/COLAB/</w:t>
+      </w:r>
+      <w:proofErr w:type="gramStart"/>
+      <w:r>
+        <w:t>etc..</w:t>
+      </w:r>
+      <w:proofErr w:type="gramEnd"/>
+      <w:r>
+        <w:t xml:space="preserve"> LINK</w:t>
       </w:r>
       <w:bookmarkEnd w:id="26"/>
     </w:p>
@@ -6786,6 +9239,7 @@
           <w:lang w:val="en-US" w:eastAsia="tr-TR"/>
         </w:rPr>
       </w:pPr>
+      <w:proofErr w:type="gramStart"/>
       <w:r>
         <w:rPr>
           <w:b/>
@@ -6793,6 +9247,7 @@
         </w:rPr>
         <w:t>Education :</w:t>
       </w:r>
+      <w:proofErr w:type="gramEnd"/>
     </w:p>
     <w:p>
       <w:pPr>
@@ -6800,6 +9255,7 @@
           <w:lang w:val="en-US" w:eastAsia="tr-TR"/>
         </w:rPr>
       </w:pPr>
+      <w:proofErr w:type="gramStart"/>
       <w:r>
         <w:rPr>
           <w:i/>
@@ -6812,7 +9268,14 @@
         <w:rPr>
           <w:lang w:val="en-US" w:eastAsia="tr-TR"/>
         </w:rPr>
-        <w:t xml:space="preserve"> : Piri Reis University </w:t>
+        <w:t xml:space="preserve"> :</w:t>
+      </w:r>
+      <w:proofErr w:type="gramEnd"/>
+      <w:r>
+        <w:rPr>
+          <w:lang w:val="en-US" w:eastAsia="tr-TR"/>
+        </w:rPr>
+        <w:t xml:space="preserve"> Piri Reis University </w:t>
       </w:r>
     </w:p>
     <w:p>
@@ -6954,7 +9417,25 @@
           <w:bCs/>
           <w:lang w:val="en-US" w:eastAsia="tr-TR"/>
         </w:rPr>
-        <w:t>Professional skill:</w:t>
+        <w:t xml:space="preserve">Professional </w:t>
+      </w:r>
+      <w:proofErr w:type="gramStart"/>
+      <w:r>
+        <w:rPr>
+          <w:b/>
+          <w:bCs/>
+          <w:lang w:val="en-US" w:eastAsia="tr-TR"/>
+        </w:rPr>
+        <w:t>skill</w:t>
+      </w:r>
+      <w:proofErr w:type="gramEnd"/>
+      <w:r>
+        <w:rPr>
+          <w:b/>
+          <w:bCs/>
+          <w:lang w:val="en-US" w:eastAsia="tr-TR"/>
+        </w:rPr>
+        <w:t>:</w:t>
       </w:r>
     </w:p>
     <w:p>
@@ -7374,10 +9855,10 @@
       </w:pPr>
     </w:p>
     <w:sectPr>
-      <w:headerReference w:type="default" r:id="rId10"/>
-      <w:footerReference w:type="even" r:id="rId11"/>
-      <w:footerReference w:type="default" r:id="rId12"/>
-      <w:footerReference w:type="first" r:id="rId13"/>
+      <w:headerReference w:type="default" r:id="rId11"/>
+      <w:footerReference w:type="even" r:id="rId12"/>
+      <w:footerReference w:type="default" r:id="rId13"/>
+      <w:footerReference w:type="first" r:id="rId14"/>
       <w:footnotePr>
         <w:numFmt w:val="chicago"/>
       </w:footnotePr>
@@ -7509,7 +9990,15 @@
       <w:t>South African Journal of Industrial Engineering</w:t>
     </w:r>
     <w:r>
-      <w:t xml:space="preserve"> Month Year Vol __(_):  p1-3</w:t>
+      <w:t xml:space="preserve"> Month Year Vol _</w:t>
+    </w:r>
+    <w:proofErr w:type="gramStart"/>
+    <w:r>
+      <w:t>_(</w:t>
+    </w:r>
+    <w:proofErr w:type="gramEnd"/>
+    <w:r>
+      <w:t>_):  p1-3</w:t>
     </w:r>
   </w:p>
 </w:ftr>
@@ -8063,6 +10552,92 @@
     </w:lvl>
   </w:abstractNum>
   <w:abstractNum w:abstractNumId="4" w15:restartNumberingAfterBreak="0">
+    <w:nsid w:val="185F2D61"/>
+    <w:multiLevelType w:val="hybridMultilevel"/>
+    <w:tmpl w:val="5AD4E0EC"/>
+    <w:lvl w:ilvl="0" w:tplc="0409000F">
+      <w:start w:val="1"/>
+      <w:numFmt w:val="decimal"/>
+      <w:lvlText w:val="%1."/>
+      <w:lvlJc w:val="left"/>
+      <w:pPr>
+        <w:ind w:left="720" w:hanging="360"/>
+      </w:pPr>
+    </w:lvl>
+    <w:lvl w:ilvl="1" w:tplc="04090019" w:tentative="1">
+      <w:start w:val="1"/>
+      <w:numFmt w:val="lowerLetter"/>
+      <w:lvlText w:val="%2."/>
+      <w:lvlJc w:val="left"/>
+      <w:pPr>
+        <w:ind w:left="1440" w:hanging="360"/>
+      </w:pPr>
+    </w:lvl>
+    <w:lvl w:ilvl="2" w:tplc="0409001B" w:tentative="1">
+      <w:start w:val="1"/>
+      <w:numFmt w:val="lowerRoman"/>
+      <w:lvlText w:val="%3."/>
+      <w:lvlJc w:val="right"/>
+      <w:pPr>
+        <w:ind w:left="2160" w:hanging="180"/>
+      </w:pPr>
+    </w:lvl>
+    <w:lvl w:ilvl="3" w:tplc="0409000F" w:tentative="1">
+      <w:start w:val="1"/>
+      <w:numFmt w:val="decimal"/>
+      <w:lvlText w:val="%4."/>
+      <w:lvlJc w:val="left"/>
+      <w:pPr>
+        <w:ind w:left="2880" w:hanging="360"/>
+      </w:pPr>
+    </w:lvl>
+    <w:lvl w:ilvl="4" w:tplc="04090019" w:tentative="1">
+      <w:start w:val="1"/>
+      <w:numFmt w:val="lowerLetter"/>
+      <w:lvlText w:val="%5."/>
+      <w:lvlJc w:val="left"/>
+      <w:pPr>
+        <w:ind w:left="3600" w:hanging="360"/>
+      </w:pPr>
+    </w:lvl>
+    <w:lvl w:ilvl="5" w:tplc="0409001B" w:tentative="1">
+      <w:start w:val="1"/>
+      <w:numFmt w:val="lowerRoman"/>
+      <w:lvlText w:val="%6."/>
+      <w:lvlJc w:val="right"/>
+      <w:pPr>
+        <w:ind w:left="4320" w:hanging="180"/>
+      </w:pPr>
+    </w:lvl>
+    <w:lvl w:ilvl="6" w:tplc="0409000F" w:tentative="1">
+      <w:start w:val="1"/>
+      <w:numFmt w:val="decimal"/>
+      <w:lvlText w:val="%7."/>
+      <w:lvlJc w:val="left"/>
+      <w:pPr>
+        <w:ind w:left="5040" w:hanging="360"/>
+      </w:pPr>
+    </w:lvl>
+    <w:lvl w:ilvl="7" w:tplc="04090019" w:tentative="1">
+      <w:start w:val="1"/>
+      <w:numFmt w:val="lowerLetter"/>
+      <w:lvlText w:val="%8."/>
+      <w:lvlJc w:val="left"/>
+      <w:pPr>
+        <w:ind w:left="5760" w:hanging="360"/>
+      </w:pPr>
+    </w:lvl>
+    <w:lvl w:ilvl="8" w:tplc="0409001B" w:tentative="1">
+      <w:start w:val="1"/>
+      <w:numFmt w:val="lowerRoman"/>
+      <w:lvlText w:val="%9."/>
+      <w:lvlJc w:val="right"/>
+      <w:pPr>
+        <w:ind w:left="6480" w:hanging="180"/>
+      </w:pPr>
+    </w:lvl>
+  </w:abstractNum>
+  <w:abstractNum w:abstractNumId="5" w15:restartNumberingAfterBreak="0">
     <w:nsid w:val="19A62EC5"/>
     <w:multiLevelType w:val="hybridMultilevel"/>
     <w:tmpl w:val="56F4412E"/>
@@ -8175,7 +10750,7 @@
       </w:rPr>
     </w:lvl>
   </w:abstractNum>
-  <w:abstractNum w:abstractNumId="5" w15:restartNumberingAfterBreak="0">
+  <w:abstractNum w:abstractNumId="6" w15:restartNumberingAfterBreak="0">
     <w:nsid w:val="3EAB568E"/>
     <w:multiLevelType w:val="hybridMultilevel"/>
     <w:tmpl w:val="7A9C1DAC"/>
@@ -8288,7 +10863,7 @@
       </w:rPr>
     </w:lvl>
   </w:abstractNum>
-  <w:abstractNum w:abstractNumId="6" w15:restartNumberingAfterBreak="0">
+  <w:abstractNum w:abstractNumId="7" w15:restartNumberingAfterBreak="0">
     <w:nsid w:val="462C551A"/>
     <w:multiLevelType w:val="hybridMultilevel"/>
     <w:tmpl w:val="0876FD90"/>
@@ -8377,7 +10952,7 @@
       </w:pPr>
     </w:lvl>
   </w:abstractNum>
-  <w:abstractNum w:abstractNumId="7" w15:restartNumberingAfterBreak="0">
+  <w:abstractNum w:abstractNumId="8" w15:restartNumberingAfterBreak="0">
     <w:nsid w:val="4AFF5161"/>
     <w:multiLevelType w:val="hybridMultilevel"/>
     <w:tmpl w:val="9830E6A0"/>
@@ -8490,7 +11065,7 @@
       </w:rPr>
     </w:lvl>
   </w:abstractNum>
-  <w:abstractNum w:abstractNumId="8" w15:restartNumberingAfterBreak="0">
+  <w:abstractNum w:abstractNumId="9" w15:restartNumberingAfterBreak="0">
     <w:nsid w:val="5A3E457E"/>
     <w:multiLevelType w:val="hybridMultilevel"/>
     <w:tmpl w:val="6B88D5B2"/>
@@ -8603,7 +11178,7 @@
       </w:rPr>
     </w:lvl>
   </w:abstractNum>
-  <w:abstractNum w:abstractNumId="9" w15:restartNumberingAfterBreak="0">
+  <w:abstractNum w:abstractNumId="10" w15:restartNumberingAfterBreak="0">
     <w:nsid w:val="5AF10DC1"/>
     <w:multiLevelType w:val="multilevel"/>
     <w:tmpl w:val="1C090025"/>
@@ -8698,7 +11273,7 @@
       </w:pPr>
     </w:lvl>
   </w:abstractNum>
-  <w:abstractNum w:abstractNumId="10" w15:restartNumberingAfterBreak="0">
+  <w:abstractNum w:abstractNumId="11" w15:restartNumberingAfterBreak="0">
     <w:nsid w:val="6EA32AA4"/>
     <w:multiLevelType w:val="hybridMultilevel"/>
     <w:tmpl w:val="3BBAACA6"/>
@@ -8811,7 +11386,7 @@
       </w:rPr>
     </w:lvl>
   </w:abstractNum>
-  <w:abstractNum w:abstractNumId="11" w15:restartNumberingAfterBreak="0">
+  <w:abstractNum w:abstractNumId="12" w15:restartNumberingAfterBreak="0">
     <w:nsid w:val="77B81D60"/>
     <w:multiLevelType w:val="hybridMultilevel"/>
     <w:tmpl w:val="5FA821A6"/>
@@ -8924,7 +11499,7 @@
       </w:rPr>
     </w:lvl>
   </w:abstractNum>
-  <w:abstractNum w:abstractNumId="12" w15:restartNumberingAfterBreak="0">
+  <w:abstractNum w:abstractNumId="13" w15:restartNumberingAfterBreak="0">
     <w:nsid w:val="783011C0"/>
     <w:multiLevelType w:val="hybridMultilevel"/>
     <w:tmpl w:val="32E4DFC8"/>
@@ -9010,7 +11585,7 @@
       </w:pPr>
     </w:lvl>
   </w:abstractNum>
-  <w:abstractNum w:abstractNumId="13" w15:restartNumberingAfterBreak="0">
+  <w:abstractNum w:abstractNumId="14" w15:restartNumberingAfterBreak="0">
     <w:nsid w:val="7EA12BE1"/>
     <w:multiLevelType w:val="hybridMultilevel"/>
     <w:tmpl w:val="00DEB57C"/>
@@ -9154,40 +11729,40 @@
     <w:abstractNumId w:val="3"/>
   </w:num>
   <w:num w:numId="2" w16cid:durableId="2106874206">
-    <w:abstractNumId w:val="9"/>
+    <w:abstractNumId w:val="10"/>
   </w:num>
   <w:num w:numId="3" w16cid:durableId="400102106">
+    <w:abstractNumId w:val="8"/>
+  </w:num>
+  <w:num w:numId="4" w16cid:durableId="61493177">
     <w:abstractNumId w:val="7"/>
   </w:num>
-  <w:num w:numId="4" w16cid:durableId="61493177">
-    <w:abstractNumId w:val="6"/>
-  </w:num>
   <w:num w:numId="5" w16cid:durableId="897284617">
-    <w:abstractNumId w:val="4"/>
+    <w:abstractNumId w:val="5"/>
   </w:num>
   <w:num w:numId="6" w16cid:durableId="474639139">
     <w:abstractNumId w:val="0"/>
   </w:num>
   <w:num w:numId="7" w16cid:durableId="1959556415">
-    <w:abstractNumId w:val="5"/>
+    <w:abstractNumId w:val="6"/>
   </w:num>
   <w:num w:numId="8" w16cid:durableId="971791317">
-    <w:abstractNumId w:val="8"/>
+    <w:abstractNumId w:val="9"/>
   </w:num>
   <w:num w:numId="9" w16cid:durableId="996418795">
-    <w:abstractNumId w:val="12"/>
+    <w:abstractNumId w:val="13"/>
   </w:num>
   <w:num w:numId="10" w16cid:durableId="1249121052">
-    <w:abstractNumId w:val="13"/>
+    <w:abstractNumId w:val="14"/>
   </w:num>
   <w:num w:numId="11" w16cid:durableId="862935647">
     <w:abstractNumId w:val="1"/>
   </w:num>
   <w:num w:numId="12" w16cid:durableId="239868843">
-    <w:abstractNumId w:val="10"/>
+    <w:abstractNumId w:val="11"/>
   </w:num>
   <w:num w:numId="13" w16cid:durableId="2005158397">
-    <w:abstractNumId w:val="9"/>
+    <w:abstractNumId w:val="10"/>
     <w:lvlOverride w:ilvl="0">
       <w:startOverride w:val="1"/>
     </w:lvlOverride>
@@ -9220,13 +11795,16 @@
     <w:abstractNumId w:val="2"/>
   </w:num>
   <w:num w:numId="15" w16cid:durableId="629480171">
-    <w:abstractNumId w:val="11"/>
+    <w:abstractNumId w:val="12"/>
   </w:num>
   <w:num w:numId="16" w16cid:durableId="1726946206">
-    <w:abstractNumId w:val="9"/>
+    <w:abstractNumId w:val="10"/>
   </w:num>
   <w:num w:numId="17" w16cid:durableId="883904642">
-    <w:abstractNumId w:val="9"/>
+    <w:abstractNumId w:val="10"/>
+  </w:num>
+  <w:num w:numId="18" w16cid:durableId="1246963691">
+    <w:abstractNumId w:val="4"/>
   </w:num>
   <w:numIdMacAtCleanup w:val="5"/>
 </w:numbering>
@@ -11137,6 +13715,16 @@
       <w:lang w:val="en-US" w:eastAsia="en-US"/>
     </w:rPr>
   </w:style>
+  <w:style w:type="character" w:styleId="PlaceholderText">
+    <w:name w:val="Placeholder Text"/>
+    <w:basedOn w:val="DefaultParagraphFont"/>
+    <w:uiPriority w:val="99"/>
+    <w:semiHidden/>
+    <w:rsid w:val="00A12023"/>
+    <w:rPr>
+      <w:color w:val="666666"/>
+    </w:rPr>
+  </w:style>
 </w:styles>
 </file>
 

</xml_diff>

<commit_message>
Add forecasting and dashboard screenshot sections
</commit_message>
<xml_diff>
--- a/docs/graduation_thesis_report.docx
+++ b/docs/graduation_thesis_report.docx
@@ -5164,9 +5164,9 @@
           <w:noProof/>
         </w:rPr>
         <w:drawing>
-          <wp:inline distT="0" distB="0" distL="0" distR="0" wp14:anchorId="13F4F06E" wp14:editId="037FCCDD">
-            <wp:extent cx="6286828" cy="4143375"/>
-            <wp:effectExtent l="0" t="0" r="0" b="0"/>
+          <wp:inline distT="0" distB="0" distL="0" distR="0" wp14:anchorId="13F4F06E" wp14:editId="328D09F8">
+            <wp:extent cx="5997778" cy="3952875"/>
+            <wp:effectExtent l="0" t="0" r="3175" b="0"/>
             <wp:docPr id="36948891" name="Picture 1"/>
             <wp:cNvGraphicFramePr>
               <a:graphicFrameLocks xmlns:a="http://schemas.openxmlformats.org/drawingml/2006/main" noChangeAspect="1"/>
@@ -5193,7 +5193,7 @@
                   <pic:spPr>
                     <a:xfrm>
                       <a:off x="0" y="0"/>
-                      <a:ext cx="6291050" cy="4146158"/>
+                      <a:ext cx="6005610" cy="3958037"/>
                     </a:xfrm>
                     <a:prstGeom prst="rect">
                       <a:avLst/>
@@ -6628,9 +6628,9 @@
           <w:lang w:val="en-ZA"/>
         </w:rPr>
         <w:drawing>
-          <wp:inline distT="0" distB="0" distL="0" distR="0" wp14:anchorId="670A0A81" wp14:editId="36371591">
-            <wp:extent cx="6501164" cy="4333875"/>
-            <wp:effectExtent l="0" t="0" r="0" b="0"/>
+          <wp:inline distT="0" distB="0" distL="0" distR="0" wp14:anchorId="670A0A81" wp14:editId="48DBC7CE">
+            <wp:extent cx="6162675" cy="4108228"/>
+            <wp:effectExtent l="0" t="0" r="0" b="6985"/>
             <wp:docPr id="604311595" name="Picture 2"/>
             <wp:cNvGraphicFramePr>
               <a:graphicFrameLocks xmlns:a="http://schemas.openxmlformats.org/drawingml/2006/main" noChangeAspect="1"/>
@@ -6657,7 +6657,7 @@
                   <pic:spPr>
                     <a:xfrm>
                       <a:off x="0" y="0"/>
-                      <a:ext cx="6505233" cy="4336588"/>
+                      <a:ext cx="6170757" cy="4113616"/>
                     </a:xfrm>
                     <a:prstGeom prst="rect">
                       <a:avLst/>
@@ -6815,6 +6815,13 @@
         </w:rPr>
         <w:t xml:space="preserve"> in Table 3.</w:t>
       </w:r>
+    </w:p>
+    <w:p>
+      <w:pPr>
+        <w:rPr>
+          <w:lang w:val="en-ZA"/>
+        </w:rPr>
+      </w:pPr>
     </w:p>
     <w:p>
       <w:pPr>
@@ -7955,26 +7962,13 @@
                       </m:ctrlPr>
                     </m:fPr>
                     <m:num>
-                      <m:d>
-                        <m:dPr>
-                          <m:ctrlPr>
-                            <w:rPr>
-                              <w:rFonts w:ascii="Cambria Math" w:hAnsi="Cambria Math"/>
-                              <w:i/>
-                              <w:lang w:val="en-ZA"/>
-                            </w:rPr>
-                          </m:ctrlPr>
-                        </m:dPr>
-                        <m:e>
-                          <m:r>
-                            <w:rPr>
-                              <w:rFonts w:ascii="Cambria Math" w:hAnsi="Cambria Math"/>
-                              <w:lang w:val="en-ZA"/>
-                            </w:rPr>
-                            <m:t>Critical Items+Warning Items</m:t>
-                          </m:r>
-                        </m:e>
-                      </m:d>
+                      <m:r>
+                        <w:rPr>
+                          <w:rFonts w:ascii="Cambria Math" w:hAnsi="Cambria Math"/>
+                          <w:lang w:val="en-ZA"/>
+                        </w:rPr>
+                        <m:t>Critical Items+Warning Items</m:t>
+                      </m:r>
                     </m:num>
                     <m:den>
                       <m:r>
@@ -8327,17 +8321,860 @@
     </w:p>
     <w:p>
       <w:pPr>
-        <w:rPr>
-          <w:lang w:val="en-ZA"/>
-        </w:rPr>
-      </w:pPr>
-    </w:p>
-    <w:p>
-      <w:pPr>
-        <w:rPr>
-          <w:lang w:val="en-ZA"/>
-        </w:rPr>
-      </w:pPr>
+        <w:pStyle w:val="Heading2"/>
+        <w:rPr>
+          <w:lang w:val="en-ZA"/>
+        </w:rPr>
+      </w:pPr>
+      <w:r>
+        <w:rPr>
+          <w:lang w:val="en-ZA"/>
+        </w:rPr>
+        <w:t>Demand Forecasting Logic</w:t>
+      </w:r>
+    </w:p>
+    <w:p>
+      <w:pPr>
+        <w:rPr>
+          <w:lang w:val="en-ZA"/>
+        </w:rPr>
+      </w:pPr>
+      <w:r>
+        <w:rPr>
+          <w:lang w:val="en-ZA"/>
+        </w:rPr>
+        <w:t xml:space="preserve">The Demand Forecast module uses historical monthly demand values generated from the active dataset. The demand table </w:t>
+      </w:r>
+      <w:proofErr w:type="gramStart"/>
+      <w:r>
+        <w:rPr>
+          <w:lang w:val="en-ZA"/>
+        </w:rPr>
+        <w:t>is created</w:t>
+      </w:r>
+      <w:proofErr w:type="gramEnd"/>
+      <w:r>
+        <w:rPr>
+          <w:lang w:val="en-ZA"/>
+        </w:rPr>
+        <w:t xml:space="preserve"> by grouping order quantity values by year-month and product category. This allows the system to </w:t>
+      </w:r>
+      <w:proofErr w:type="spellStart"/>
+      <w:r>
+        <w:rPr>
+          <w:lang w:val="en-ZA"/>
+        </w:rPr>
+        <w:t>analyze</w:t>
+      </w:r>
+      <w:proofErr w:type="spellEnd"/>
+      <w:r>
+        <w:rPr>
+          <w:lang w:val="en-ZA"/>
+        </w:rPr>
+        <w:t xml:space="preserve"> demand trends over time.</w:t>
+      </w:r>
+    </w:p>
+    <w:p>
+      <w:pPr>
+        <w:rPr>
+          <w:lang w:val="en-ZA"/>
+        </w:rPr>
+      </w:pPr>
+    </w:p>
+    <w:p>
+      <w:pPr>
+        <w:rPr>
+          <w:lang w:val="en-ZA"/>
+        </w:rPr>
+      </w:pPr>
+      <w:r>
+        <w:rPr>
+          <w:lang w:val="en-ZA"/>
+        </w:rPr>
+        <w:t xml:space="preserve">The platform uses two simple forecasting methods: 3-month moving average and linear regression. The moving average method </w:t>
+      </w:r>
+      <w:proofErr w:type="gramStart"/>
+      <w:r>
+        <w:rPr>
+          <w:lang w:val="en-ZA"/>
+        </w:rPr>
+        <w:t>is used</w:t>
+      </w:r>
+      <w:proofErr w:type="gramEnd"/>
+      <w:r>
+        <w:rPr>
+          <w:lang w:val="en-ZA"/>
+        </w:rPr>
+        <w:t xml:space="preserve"> to show short-term demand trends based on recent historical values. The linear regression model </w:t>
+      </w:r>
+      <w:proofErr w:type="gramStart"/>
+      <w:r>
+        <w:rPr>
+          <w:lang w:val="en-ZA"/>
+        </w:rPr>
+        <w:t>is used</w:t>
+      </w:r>
+      <w:proofErr w:type="gramEnd"/>
+      <w:r>
+        <w:rPr>
+          <w:lang w:val="en-ZA"/>
+        </w:rPr>
+        <w:t xml:space="preserve"> to estimate future demand by learning a simple trend from historical monthly demand.</w:t>
+      </w:r>
+    </w:p>
+    <w:p>
+      <w:pPr>
+        <w:rPr>
+          <w:lang w:val="en-ZA"/>
+        </w:rPr>
+      </w:pPr>
+    </w:p>
+    <w:p>
+      <w:pPr>
+        <w:rPr>
+          <w:lang w:val="en-ZA"/>
+        </w:rPr>
+      </w:pPr>
+      <w:r>
+        <w:rPr>
+          <w:lang w:val="en-ZA"/>
+        </w:rPr>
+        <w:t>The forecasting module also includes performance evaluation metrics such as Mean Absolute Error (MAE) and Mean Absolute Percentage Error (MAPE). These metrics help users understand how close the forecasted values are to actual historical demand values.</w:t>
+      </w:r>
+    </w:p>
+    <w:p>
+      <w:pPr>
+        <w:rPr>
+          <w:lang w:val="en-ZA"/>
+        </w:rPr>
+      </w:pPr>
+    </w:p>
+    <w:p>
+      <w:pPr>
+        <w:rPr>
+          <w:lang w:val="en-ZA"/>
+        </w:rPr>
+      </w:pPr>
+      <w:r>
+        <w:rPr>
+          <w:lang w:val="en-ZA"/>
+        </w:rPr>
+        <w:t xml:space="preserve">The forecasting approach is intentionally simple because the </w:t>
+      </w:r>
+      <w:proofErr w:type="gramStart"/>
+      <w:r>
+        <w:rPr>
+          <w:lang w:val="en-ZA"/>
+        </w:rPr>
+        <w:t>main focus</w:t>
+      </w:r>
+      <w:proofErr w:type="gramEnd"/>
+      <w:r>
+        <w:rPr>
+          <w:lang w:val="en-ZA"/>
+        </w:rPr>
+        <w:t xml:space="preserve"> of the project is </w:t>
+      </w:r>
+      <w:proofErr w:type="gramStart"/>
+      <w:r>
+        <w:rPr>
+          <w:lang w:val="en-ZA"/>
+        </w:rPr>
+        <w:t>supply</w:t>
+      </w:r>
+      <w:proofErr w:type="gramEnd"/>
+      <w:r>
+        <w:rPr>
+          <w:lang w:val="en-ZA"/>
+        </w:rPr>
+        <w:t xml:space="preserve"> chain visibility and risk assessment. The purpose of the forecast module is to demonstrate how demand data can support planning decisions, not to create a highly advanced forecasting system.</w:t>
+      </w:r>
+    </w:p>
+    <w:p>
+      <w:pPr>
+        <w:rPr>
+          <w:lang w:val="en-ZA"/>
+        </w:rPr>
+      </w:pPr>
+    </w:p>
+    <w:p>
+      <w:pPr>
+        <w:pStyle w:val="Heading2"/>
+        <w:rPr>
+          <w:lang w:val="en-ZA"/>
+        </w:rPr>
+      </w:pPr>
+      <w:r>
+        <w:rPr>
+          <w:lang w:val="en-ZA"/>
+        </w:rPr>
+        <w:t>Dashboard Interface and Screenshots</w:t>
+      </w:r>
+    </w:p>
+    <w:p>
+      <w:pPr>
+        <w:rPr>
+          <w:lang w:val="en-ZA"/>
+        </w:rPr>
+      </w:pPr>
+      <w:r>
+        <w:rPr>
+          <w:lang w:val="en-ZA"/>
+        </w:rPr>
+        <w:t xml:space="preserve">The dashboard interface </w:t>
+      </w:r>
+      <w:proofErr w:type="gramStart"/>
+      <w:r>
+        <w:rPr>
+          <w:lang w:val="en-ZA"/>
+        </w:rPr>
+        <w:t>was developed</w:t>
+      </w:r>
+      <w:proofErr w:type="gramEnd"/>
+      <w:r>
+        <w:rPr>
+          <w:lang w:val="en-ZA"/>
+        </w:rPr>
+        <w:t xml:space="preserve"> with </w:t>
+      </w:r>
+      <w:proofErr w:type="spellStart"/>
+      <w:r>
+        <w:rPr>
+          <w:lang w:val="en-ZA"/>
+        </w:rPr>
+        <w:t>Streamlit</w:t>
+      </w:r>
+      <w:proofErr w:type="spellEnd"/>
+      <w:r>
+        <w:rPr>
+          <w:lang w:val="en-ZA"/>
+        </w:rPr>
+        <w:t xml:space="preserve">. The platform includes a sidebar navigation menu and multiple dashboard pages. The Overview page includes the Data Source Manager, which allows users to upload a new dataset, map columns, activate the uploaded dataset, or return to the default </w:t>
+      </w:r>
+      <w:proofErr w:type="spellStart"/>
+      <w:r>
+        <w:rPr>
+          <w:lang w:val="en-ZA"/>
+        </w:rPr>
+        <w:t>DataCo</w:t>
+      </w:r>
+      <w:proofErr w:type="spellEnd"/>
+      <w:r>
+        <w:rPr>
+          <w:lang w:val="en-ZA"/>
+        </w:rPr>
+        <w:t xml:space="preserve"> dataset.</w:t>
+      </w:r>
+    </w:p>
+    <w:p>
+      <w:pPr>
+        <w:rPr>
+          <w:lang w:val="en-ZA"/>
+        </w:rPr>
+      </w:pPr>
+    </w:p>
+    <w:p>
+      <w:pPr>
+        <w:rPr>
+          <w:lang w:val="en-ZA"/>
+        </w:rPr>
+      </w:pPr>
+      <w:r>
+        <w:rPr>
+          <w:lang w:val="en-ZA"/>
+        </w:rPr>
+        <w:t xml:space="preserve">The Data Source Manager </w:t>
+      </w:r>
+      <w:proofErr w:type="gramStart"/>
+      <w:r>
+        <w:rPr>
+          <w:lang w:val="en-ZA"/>
+        </w:rPr>
+        <w:t>is shown</w:t>
+      </w:r>
+      <w:proofErr w:type="gramEnd"/>
+      <w:r>
+        <w:rPr>
+          <w:lang w:val="en-ZA"/>
+        </w:rPr>
+        <w:t xml:space="preserve"> in Figure 3.</w:t>
+      </w:r>
+    </w:p>
+    <w:p>
+      <w:pPr>
+        <w:keepNext/>
+      </w:pPr>
+      <w:r>
+        <w:rPr>
+          <w:noProof/>
+          <w:lang w:val="en-ZA"/>
+        </w:rPr>
+        <w:lastRenderedPageBreak/>
+        <w:drawing>
+          <wp:inline distT="0" distB="0" distL="0" distR="0" wp14:anchorId="385ACC34" wp14:editId="5678F07F">
+            <wp:extent cx="6357908" cy="3705225"/>
+            <wp:effectExtent l="0" t="0" r="5080" b="0"/>
+            <wp:docPr id="1801230199" name="Picture 4"/>
+            <wp:cNvGraphicFramePr>
+              <a:graphicFrameLocks xmlns:a="http://schemas.openxmlformats.org/drawingml/2006/main" noChangeAspect="1"/>
+            </wp:cNvGraphicFramePr>
+            <a:graphic xmlns:a="http://schemas.openxmlformats.org/drawingml/2006/main">
+              <a:graphicData uri="http://schemas.openxmlformats.org/drawingml/2006/picture">
+                <pic:pic xmlns:pic="http://schemas.openxmlformats.org/drawingml/2006/picture">
+                  <pic:nvPicPr>
+                    <pic:cNvPr id="1801230199" name="Picture 1801230199"/>
+                    <pic:cNvPicPr/>
+                  </pic:nvPicPr>
+                  <pic:blipFill>
+                    <a:blip r:embed="rId11" cstate="print">
+                      <a:extLst>
+                        <a:ext uri="{28A0092B-C50C-407E-A947-70E740481C1C}">
+                          <a14:useLocalDpi xmlns:a14="http://schemas.microsoft.com/office/drawing/2010/main" val="0"/>
+                        </a:ext>
+                      </a:extLst>
+                    </a:blip>
+                    <a:stretch>
+                      <a:fillRect/>
+                    </a:stretch>
+                  </pic:blipFill>
+                  <pic:spPr>
+                    <a:xfrm>
+                      <a:off x="0" y="0"/>
+                      <a:ext cx="6371742" cy="3713287"/>
+                    </a:xfrm>
+                    <a:prstGeom prst="rect">
+                      <a:avLst/>
+                    </a:prstGeom>
+                  </pic:spPr>
+                </pic:pic>
+              </a:graphicData>
+            </a:graphic>
+          </wp:inline>
+        </w:drawing>
+      </w:r>
+    </w:p>
+    <w:p>
+      <w:pPr>
+        <w:pStyle w:val="Caption"/>
+        <w:jc w:val="both"/>
+        <w:rPr>
+          <w:rFonts w:eastAsiaTheme="minorEastAsia"/>
+        </w:rPr>
+      </w:pPr>
+      <w:r>
+        <w:t xml:space="preserve">Figure </w:t>
+      </w:r>
+      <w:r>
+        <w:fldChar w:fldCharType="begin"/>
+      </w:r>
+      <w:r>
+        <w:instrText xml:space="preserve"> SEQ Figure \* ARABIC </w:instrText>
+      </w:r>
+      <w:r>
+        <w:fldChar w:fldCharType="separate"/>
+      </w:r>
+      <w:r>
+        <w:rPr>
+          <w:noProof/>
+        </w:rPr>
+        <w:t>3</w:t>
+      </w:r>
+      <w:r>
+        <w:fldChar w:fldCharType="end"/>
+      </w:r>
+      <w:r>
+        <w:t xml:space="preserve">. </w:t>
+      </w:r>
+      <w:r>
+        <w:t>Data Source Manager and uploaded dataset workflow.</w:t>
+      </w:r>
+    </w:p>
+    <w:p>
+      <w:pPr>
+        <w:rPr>
+          <w:lang w:val="en-ZA"/>
+        </w:rPr>
+      </w:pPr>
+      <w:r>
+        <w:rPr>
+          <w:lang w:val="en-ZA"/>
+        </w:rPr>
+        <w:t xml:space="preserve">As shown in Figure 3, the user can upload a CSV or Excel dataset and map it to the standard supply chain schema. After the uploaded dataset </w:t>
+      </w:r>
+      <w:proofErr w:type="gramStart"/>
+      <w:r>
+        <w:rPr>
+          <w:lang w:val="en-ZA"/>
+        </w:rPr>
+        <w:t>is activated</w:t>
+      </w:r>
+      <w:proofErr w:type="gramEnd"/>
+      <w:r>
+        <w:rPr>
+          <w:lang w:val="en-ZA"/>
+        </w:rPr>
+        <w:t>, all dashboard pages use the uploaded data during the active session.</w:t>
+      </w:r>
+    </w:p>
+    <w:p>
+      <w:pPr>
+        <w:rPr>
+          <w:lang w:val="en-ZA"/>
+        </w:rPr>
+      </w:pPr>
+    </w:p>
+    <w:p>
+      <w:pPr>
+        <w:rPr>
+          <w:lang w:val="en-ZA"/>
+        </w:rPr>
+      </w:pPr>
+      <w:r>
+        <w:rPr>
+          <w:lang w:val="en-ZA"/>
+        </w:rPr>
+        <w:t>The Overview page provides a high-level summary of the active dataset. It shows key performance indicators, monthly order volume, delivery status distribution, average delay by shipping mode, inventory status summary, and risk level distribution.</w:t>
+      </w:r>
+    </w:p>
+    <w:p>
+      <w:pPr>
+        <w:rPr>
+          <w:lang w:val="en-ZA"/>
+        </w:rPr>
+      </w:pPr>
+      <w:r>
+        <w:rPr>
+          <w:lang w:val="en-ZA"/>
+        </w:rPr>
+        <w:t xml:space="preserve">An example of the Overview dashboard generated from an uploaded dataset </w:t>
+      </w:r>
+      <w:proofErr w:type="gramStart"/>
+      <w:r>
+        <w:rPr>
+          <w:lang w:val="en-ZA"/>
+        </w:rPr>
+        <w:t>is shown</w:t>
+      </w:r>
+      <w:proofErr w:type="gramEnd"/>
+      <w:r>
+        <w:rPr>
+          <w:lang w:val="en-ZA"/>
+        </w:rPr>
+        <w:t xml:space="preserve"> in Figure 4.</w:t>
+      </w:r>
+    </w:p>
+    <w:p>
+      <w:pPr>
+        <w:keepNext/>
+      </w:pPr>
+      <w:r>
+        <w:rPr>
+          <w:lang w:val="en-ZA"/>
+        </w:rPr>
+        <w:drawing>
+          <wp:inline distT="0" distB="0" distL="0" distR="0" wp14:anchorId="01838736" wp14:editId="23239FB1">
+            <wp:extent cx="5868670" cy="3293110"/>
+            <wp:effectExtent l="0" t="0" r="0" b="2540"/>
+            <wp:docPr id="327812341" name="Picture 1"/>
+            <wp:cNvGraphicFramePr>
+              <a:graphicFrameLocks xmlns:a="http://schemas.openxmlformats.org/drawingml/2006/main" noChangeAspect="1"/>
+            </wp:cNvGraphicFramePr>
+            <a:graphic xmlns:a="http://schemas.openxmlformats.org/drawingml/2006/main">
+              <a:graphicData uri="http://schemas.openxmlformats.org/drawingml/2006/picture">
+                <pic:pic xmlns:pic="http://schemas.openxmlformats.org/drawingml/2006/picture">
+                  <pic:nvPicPr>
+                    <pic:cNvPr id="327812341" name=""/>
+                    <pic:cNvPicPr/>
+                  </pic:nvPicPr>
+                  <pic:blipFill>
+                    <a:blip r:embed="rId12"/>
+                    <a:stretch>
+                      <a:fillRect/>
+                    </a:stretch>
+                  </pic:blipFill>
+                  <pic:spPr>
+                    <a:xfrm>
+                      <a:off x="0" y="0"/>
+                      <a:ext cx="5868670" cy="3293110"/>
+                    </a:xfrm>
+                    <a:prstGeom prst="rect">
+                      <a:avLst/>
+                    </a:prstGeom>
+                  </pic:spPr>
+                </pic:pic>
+              </a:graphicData>
+            </a:graphic>
+          </wp:inline>
+        </w:drawing>
+      </w:r>
+    </w:p>
+    <w:p>
+      <w:pPr>
+        <w:pStyle w:val="Caption"/>
+        <w:jc w:val="both"/>
+      </w:pPr>
+      <w:r>
+        <w:t xml:space="preserve">Figure </w:t>
+      </w:r>
+      <w:r>
+        <w:fldChar w:fldCharType="begin"/>
+      </w:r>
+      <w:r>
+        <w:instrText xml:space="preserve"> SEQ Figure \* ARABIC </w:instrText>
+      </w:r>
+      <w:r>
+        <w:fldChar w:fldCharType="separate"/>
+      </w:r>
+      <w:r>
+        <w:rPr>
+          <w:noProof/>
+        </w:rPr>
+        <w:t>4</w:t>
+      </w:r>
+      <w:r>
+        <w:fldChar w:fldCharType="end"/>
+      </w:r>
+      <w:r>
+        <w:t xml:space="preserve">. </w:t>
+      </w:r>
+      <w:r>
+        <w:t>Overview dashboard generated from an uploaded dataset.</w:t>
+      </w:r>
+    </w:p>
+    <w:p>
+      <w:pPr>
+        <w:rPr>
+          <w:lang w:val="en-ZA"/>
+        </w:rPr>
+      </w:pPr>
+      <w:r>
+        <w:rPr>
+          <w:lang w:val="en-ZA"/>
+        </w:rPr>
+        <w:lastRenderedPageBreak/>
+        <w:t xml:space="preserve">The Supply Chain Risk page combines </w:t>
+      </w:r>
+      <w:proofErr w:type="gramStart"/>
+      <w:r>
+        <w:rPr>
+          <w:lang w:val="en-ZA"/>
+        </w:rPr>
+        <w:t>several</w:t>
+      </w:r>
+      <w:proofErr w:type="gramEnd"/>
+      <w:r>
+        <w:rPr>
+          <w:lang w:val="en-ZA"/>
+        </w:rPr>
+        <w:t xml:space="preserve"> risk indicators into a single decision-support view. It includes delivery risk, delay risk, inventory risk, demand volatility risk, and an overall risk score. The risk results change according to the selected dashboard filters.</w:t>
+      </w:r>
+    </w:p>
+    <w:p>
+      <w:pPr>
+        <w:rPr>
+          <w:lang w:val="en-ZA"/>
+        </w:rPr>
+      </w:pPr>
+    </w:p>
+    <w:p>
+      <w:pPr>
+        <w:rPr>
+          <w:lang w:val="en-ZA"/>
+        </w:rPr>
+      </w:pPr>
+      <w:r>
+        <w:rPr>
+          <w:lang w:val="en-ZA"/>
+        </w:rPr>
+        <w:t xml:space="preserve">An example of the Supply Chain Risk dashboard </w:t>
+      </w:r>
+      <w:proofErr w:type="gramStart"/>
+      <w:r>
+        <w:rPr>
+          <w:lang w:val="en-ZA"/>
+        </w:rPr>
+        <w:t>is shown</w:t>
+      </w:r>
+      <w:proofErr w:type="gramEnd"/>
+      <w:r>
+        <w:rPr>
+          <w:lang w:val="en-ZA"/>
+        </w:rPr>
+        <w:t xml:space="preserve"> in Figure 5.</w:t>
+      </w:r>
+    </w:p>
+    <w:p>
+      <w:pPr>
+        <w:keepNext/>
+      </w:pPr>
+      <w:r>
+        <w:rPr>
+          <w:lang w:val="en-ZA"/>
+        </w:rPr>
+        <w:drawing>
+          <wp:inline distT="0" distB="0" distL="0" distR="0" wp14:anchorId="1764DD81" wp14:editId="77E59798">
+            <wp:extent cx="5868670" cy="3244850"/>
+            <wp:effectExtent l="0" t="0" r="0" b="0"/>
+            <wp:docPr id="1870617323" name="Picture 1"/>
+            <wp:cNvGraphicFramePr>
+              <a:graphicFrameLocks xmlns:a="http://schemas.openxmlformats.org/drawingml/2006/main" noChangeAspect="1"/>
+            </wp:cNvGraphicFramePr>
+            <a:graphic xmlns:a="http://schemas.openxmlformats.org/drawingml/2006/main">
+              <a:graphicData uri="http://schemas.openxmlformats.org/drawingml/2006/picture">
+                <pic:pic xmlns:pic="http://schemas.openxmlformats.org/drawingml/2006/picture">
+                  <pic:nvPicPr>
+                    <pic:cNvPr id="1870617323" name=""/>
+                    <pic:cNvPicPr/>
+                  </pic:nvPicPr>
+                  <pic:blipFill>
+                    <a:blip r:embed="rId13"/>
+                    <a:stretch>
+                      <a:fillRect/>
+                    </a:stretch>
+                  </pic:blipFill>
+                  <pic:spPr>
+                    <a:xfrm>
+                      <a:off x="0" y="0"/>
+                      <a:ext cx="5868670" cy="3244850"/>
+                    </a:xfrm>
+                    <a:prstGeom prst="rect">
+                      <a:avLst/>
+                    </a:prstGeom>
+                  </pic:spPr>
+                </pic:pic>
+              </a:graphicData>
+            </a:graphic>
+          </wp:inline>
+        </w:drawing>
+      </w:r>
+    </w:p>
+    <w:p>
+      <w:pPr>
+        <w:pStyle w:val="Caption"/>
+        <w:jc w:val="both"/>
+      </w:pPr>
+      <w:r>
+        <w:t xml:space="preserve">Figure </w:t>
+      </w:r>
+      <w:r>
+        <w:fldChar w:fldCharType="begin"/>
+      </w:r>
+      <w:r>
+        <w:instrText xml:space="preserve"> SEQ Figure \* ARABIC </w:instrText>
+      </w:r>
+      <w:r>
+        <w:fldChar w:fldCharType="separate"/>
+      </w:r>
+      <w:r>
+        <w:rPr>
+          <w:noProof/>
+        </w:rPr>
+        <w:t>5</w:t>
+      </w:r>
+      <w:r>
+        <w:fldChar w:fldCharType="end"/>
+      </w:r>
+      <w:r>
+        <w:t xml:space="preserve">. </w:t>
+      </w:r>
+      <w:r>
+        <w:t>Supply Chain Risk dashboard generated from an uploaded dataset.</w:t>
+      </w:r>
+    </w:p>
+    <w:p>
+      <w:pPr>
+        <w:rPr>
+          <w:lang w:val="en-ZA"/>
+        </w:rPr>
+      </w:pPr>
+      <w:r>
+        <w:rPr>
+          <w:lang w:val="en-ZA"/>
+        </w:rPr>
+        <w:t xml:space="preserve">The Demand Forecast page </w:t>
+      </w:r>
+      <w:proofErr w:type="spellStart"/>
+      <w:r>
+        <w:rPr>
+          <w:lang w:val="en-ZA"/>
+        </w:rPr>
+        <w:t>analyzes</w:t>
+      </w:r>
+      <w:proofErr w:type="spellEnd"/>
+      <w:r>
+        <w:rPr>
+          <w:lang w:val="en-ZA"/>
+        </w:rPr>
+        <w:t xml:space="preserve"> historical demand and generates future demand estimates. It allows users to compare actual demand with forecasted values and review forecast error metrics.</w:t>
+      </w:r>
+    </w:p>
+    <w:p>
+      <w:pPr>
+        <w:rPr>
+          <w:lang w:val="en-ZA"/>
+        </w:rPr>
+      </w:pPr>
+    </w:p>
+    <w:p>
+      <w:pPr>
+        <w:rPr>
+          <w:lang w:val="en-ZA"/>
+        </w:rPr>
+      </w:pPr>
+      <w:r>
+        <w:rPr>
+          <w:lang w:val="en-ZA"/>
+        </w:rPr>
+        <w:t xml:space="preserve">An example of the Demand Forecast dashboard </w:t>
+      </w:r>
+      <w:proofErr w:type="gramStart"/>
+      <w:r>
+        <w:rPr>
+          <w:lang w:val="en-ZA"/>
+        </w:rPr>
+        <w:t>is shown</w:t>
+      </w:r>
+      <w:proofErr w:type="gramEnd"/>
+      <w:r>
+        <w:rPr>
+          <w:lang w:val="en-ZA"/>
+        </w:rPr>
+        <w:t xml:space="preserve"> in Figure 6.</w:t>
+      </w:r>
+    </w:p>
+    <w:p>
+      <w:pPr>
+        <w:keepNext/>
+      </w:pPr>
+      <w:r>
+        <w:rPr>
+          <w:lang w:val="en-ZA"/>
+        </w:rPr>
+        <w:drawing>
+          <wp:inline distT="0" distB="0" distL="0" distR="0" wp14:anchorId="72E6229E" wp14:editId="13343538">
+            <wp:extent cx="5868670" cy="3268980"/>
+            <wp:effectExtent l="0" t="0" r="0" b="7620"/>
+            <wp:docPr id="899777970" name="Picture 1"/>
+            <wp:cNvGraphicFramePr>
+              <a:graphicFrameLocks xmlns:a="http://schemas.openxmlformats.org/drawingml/2006/main" noChangeAspect="1"/>
+            </wp:cNvGraphicFramePr>
+            <a:graphic xmlns:a="http://schemas.openxmlformats.org/drawingml/2006/main">
+              <a:graphicData uri="http://schemas.openxmlformats.org/drawingml/2006/picture">
+                <pic:pic xmlns:pic="http://schemas.openxmlformats.org/drawingml/2006/picture">
+                  <pic:nvPicPr>
+                    <pic:cNvPr id="899777970" name=""/>
+                    <pic:cNvPicPr/>
+                  </pic:nvPicPr>
+                  <pic:blipFill>
+                    <a:blip r:embed="rId14"/>
+                    <a:stretch>
+                      <a:fillRect/>
+                    </a:stretch>
+                  </pic:blipFill>
+                  <pic:spPr>
+                    <a:xfrm>
+                      <a:off x="0" y="0"/>
+                      <a:ext cx="5868670" cy="3268980"/>
+                    </a:xfrm>
+                    <a:prstGeom prst="rect">
+                      <a:avLst/>
+                    </a:prstGeom>
+                  </pic:spPr>
+                </pic:pic>
+              </a:graphicData>
+            </a:graphic>
+          </wp:inline>
+        </w:drawing>
+      </w:r>
+    </w:p>
+    <w:p>
+      <w:pPr>
+        <w:pStyle w:val="Caption"/>
+        <w:jc w:val="both"/>
+      </w:pPr>
+      <w:r>
+        <w:t xml:space="preserve">Figure </w:t>
+      </w:r>
+      <w:r>
+        <w:fldChar w:fldCharType="begin"/>
+      </w:r>
+      <w:r>
+        <w:instrText xml:space="preserve"> SEQ Figure \* ARABIC </w:instrText>
+      </w:r>
+      <w:r>
+        <w:fldChar w:fldCharType="separate"/>
+      </w:r>
+      <w:r>
+        <w:rPr>
+          <w:noProof/>
+        </w:rPr>
+        <w:t>6</w:t>
+      </w:r>
+      <w:r>
+        <w:fldChar w:fldCharType="end"/>
+      </w:r>
+      <w:r>
+        <w:t xml:space="preserve">. </w:t>
+      </w:r>
+      <w:r>
+        <w:t>Demand Forecast dashboard generated from an uploaded dataset.</w:t>
+      </w:r>
+    </w:p>
+    <w:p>
+      <w:pPr>
+        <w:rPr>
+          <w:lang w:val="en-ZA"/>
+        </w:rPr>
+      </w:pPr>
+      <w:r>
+        <w:rPr>
+          <w:lang w:val="en-ZA"/>
+        </w:rPr>
+        <w:lastRenderedPageBreak/>
+        <w:t xml:space="preserve">These dashboard pages show that the platform </w:t>
+      </w:r>
+      <w:proofErr w:type="gramStart"/>
+      <w:r>
+        <w:rPr>
+          <w:lang w:val="en-ZA"/>
+        </w:rPr>
+        <w:t>is not limited</w:t>
+      </w:r>
+      <w:proofErr w:type="gramEnd"/>
+      <w:r>
+        <w:rPr>
+          <w:lang w:val="en-ZA"/>
+        </w:rPr>
+        <w:t xml:space="preserve"> to a static dataset. When a new dataset </w:t>
+      </w:r>
+      <w:proofErr w:type="gramStart"/>
+      <w:r>
+        <w:rPr>
+          <w:lang w:val="en-ZA"/>
+        </w:rPr>
+        <w:t>is uploaded</w:t>
+      </w:r>
+      <w:proofErr w:type="gramEnd"/>
+      <w:r>
+        <w:rPr>
+          <w:lang w:val="en-ZA"/>
+        </w:rPr>
+        <w:t xml:space="preserve"> and activated, the same dashboard structure </w:t>
+      </w:r>
+      <w:proofErr w:type="gramStart"/>
+      <w:r>
+        <w:rPr>
+          <w:lang w:val="en-ZA"/>
+        </w:rPr>
+        <w:t>is regenerated</w:t>
+      </w:r>
+      <w:proofErr w:type="gramEnd"/>
+      <w:r>
+        <w:rPr>
+          <w:lang w:val="en-ZA"/>
+        </w:rPr>
+        <w:t xml:space="preserve"> based on the active dataset. This supports the main goal of the project: creating a reusable supply chain visibility and risk assessment platform.</w:t>
+      </w:r>
     </w:p>
     <w:p>
       <w:pPr>
@@ -8737,7 +9574,6 @@
             <w:rPr>
               <w:noProof/>
             </w:rPr>
-            <w:lastRenderedPageBreak/>
             <w:t xml:space="preserve">Malhotra, R., &amp; Temponi, C. (2010). Critical decisions for ERP integration: Small business issues. </w:t>
           </w:r>
           <w:r>
@@ -8941,6 +9777,7 @@
             <w:rPr>
               <w:noProof/>
             </w:rPr>
+            <w:lastRenderedPageBreak/>
             <w:t xml:space="preserve">Teltumbde, A. (2000). A framework of evaluating ERP projects. </w:t>
           </w:r>
           <w:r>
@@ -9855,10 +10692,10 @@
       </w:pPr>
     </w:p>
     <w:sectPr>
-      <w:headerReference w:type="default" r:id="rId11"/>
-      <w:footerReference w:type="even" r:id="rId12"/>
-      <w:footerReference w:type="default" r:id="rId13"/>
-      <w:footerReference w:type="first" r:id="rId14"/>
+      <w:headerReference w:type="default" r:id="rId15"/>
+      <w:footerReference w:type="even" r:id="rId16"/>
+      <w:footerReference w:type="default" r:id="rId17"/>
+      <w:footerReference w:type="first" r:id="rId18"/>
       <w:footnotePr>
         <w:numFmt w:val="chicago"/>
       </w:footnotePr>

</xml_diff>

<commit_message>
Add business case and use case section
</commit_message>
<xml_diff>
--- a/docs/graduation_thesis_report.docx
+++ b/docs/graduation_thesis_report.docx
@@ -315,7 +315,6 @@
         </w:rPr>
         <w:t>G</w:t>
       </w:r>
-      <w:proofErr w:type="spellStart"/>
       <w:r>
         <w:rPr>
           <w:b/>
@@ -324,18 +323,7 @@
           <w:szCs w:val="32"/>
           <w:lang w:val="tr-TR"/>
         </w:rPr>
-        <w:t>ülse</w:t>
-      </w:r>
-      <w:proofErr w:type="spellEnd"/>
-      <w:r>
-        <w:rPr>
-          <w:b/>
-          <w:color w:val="000000" w:themeColor="text1"/>
-          <w:sz w:val="32"/>
-          <w:szCs w:val="32"/>
-          <w:lang w:val="tr-TR"/>
-        </w:rPr>
-        <w:t xml:space="preserve"> Dolunay ÜNLÜ</w:t>
+        <w:t>ülse Dolunay ÜNLÜ</w:t>
       </w:r>
     </w:p>
     <w:p>
@@ -417,7 +405,6 @@
         </w:rPr>
         <w:t xml:space="preserve">Advisor: </w:t>
       </w:r>
-      <w:proofErr w:type="spellStart"/>
       <w:r>
         <w:rPr>
           <w:bCs/>
@@ -426,9 +413,81 @@
           <w:szCs w:val="32"/>
           <w:lang w:val="en-US"/>
         </w:rPr>
-        <w:t>Doç</w:t>
-      </w:r>
-      <w:proofErr w:type="spellEnd"/>
+        <w:t>Doç. Dr. Orhan Özgür AYBAR</w:t>
+      </w:r>
+    </w:p>
+    <w:p>
+      <w:pPr>
+        <w:jc w:val="center"/>
+        <w:rPr>
+          <w:bCs/>
+          <w:sz w:val="32"/>
+          <w:szCs w:val="32"/>
+          <w:lang w:val="en-US"/>
+        </w:rPr>
+      </w:pPr>
+    </w:p>
+    <w:p>
+      <w:pPr>
+        <w:jc w:val="center"/>
+        <w:rPr>
+          <w:bCs/>
+          <w:sz w:val="32"/>
+          <w:szCs w:val="32"/>
+          <w:lang w:val="en-US"/>
+        </w:rPr>
+      </w:pPr>
+    </w:p>
+    <w:p>
+      <w:pPr>
+        <w:jc w:val="center"/>
+        <w:rPr>
+          <w:bCs/>
+          <w:sz w:val="32"/>
+          <w:szCs w:val="32"/>
+          <w:lang w:val="en-US"/>
+        </w:rPr>
+      </w:pPr>
+    </w:p>
+    <w:p>
+      <w:pPr>
+        <w:jc w:val="center"/>
+        <w:rPr>
+          <w:bCs/>
+          <w:sz w:val="32"/>
+          <w:szCs w:val="32"/>
+          <w:lang w:val="en-US"/>
+        </w:rPr>
+      </w:pPr>
+    </w:p>
+    <w:p>
+      <w:pPr>
+        <w:jc w:val="center"/>
+        <w:rPr>
+          <w:bCs/>
+          <w:sz w:val="32"/>
+          <w:szCs w:val="32"/>
+          <w:lang w:val="en-US"/>
+        </w:rPr>
+      </w:pPr>
+      <w:r>
+        <w:rPr>
+          <w:bCs/>
+          <w:sz w:val="32"/>
+          <w:szCs w:val="32"/>
+          <w:lang w:val="en-US"/>
+        </w:rPr>
+        <w:t>İstanbul</w:t>
+      </w:r>
+      <w:r>
+        <w:rPr>
+          <w:bCs/>
+          <w:sz w:val="32"/>
+          <w:szCs w:val="32"/>
+          <w:lang w:val="en-US"/>
+        </w:rPr>
+        <w:t xml:space="preserve"> </w:t>
+      </w:r>
       <w:r>
         <w:rPr>
           <w:bCs/>
@@ -437,80 +496,7 @@
           <w:szCs w:val="32"/>
           <w:lang w:val="en-US"/>
         </w:rPr>
-        <w:t>. Dr. Orhan Özgür AYBAR</w:t>
-      </w:r>
-    </w:p>
-    <w:p>
-      <w:pPr>
-        <w:jc w:val="center"/>
-        <w:rPr>
-          <w:bCs/>
-          <w:sz w:val="32"/>
-          <w:szCs w:val="32"/>
-          <w:lang w:val="en-US"/>
-        </w:rPr>
-      </w:pPr>
-    </w:p>
-    <w:p>
-      <w:pPr>
-        <w:jc w:val="center"/>
-        <w:rPr>
-          <w:bCs/>
-          <w:sz w:val="32"/>
-          <w:szCs w:val="32"/>
-          <w:lang w:val="en-US"/>
-        </w:rPr>
-      </w:pPr>
-    </w:p>
-    <w:p>
-      <w:pPr>
-        <w:jc w:val="center"/>
-        <w:rPr>
-          <w:bCs/>
-          <w:sz w:val="32"/>
-          <w:szCs w:val="32"/>
-          <w:lang w:val="en-US"/>
-        </w:rPr>
-      </w:pPr>
-    </w:p>
-    <w:p>
-      <w:pPr>
-        <w:jc w:val="center"/>
-        <w:rPr>
-          <w:bCs/>
-          <w:sz w:val="32"/>
-          <w:szCs w:val="32"/>
-          <w:lang w:val="en-US"/>
-        </w:rPr>
-      </w:pPr>
-    </w:p>
-    <w:p>
-      <w:pPr>
-        <w:jc w:val="center"/>
-        <w:rPr>
-          <w:bCs/>
-          <w:sz w:val="32"/>
-          <w:szCs w:val="32"/>
-          <w:lang w:val="en-US"/>
-        </w:rPr>
-      </w:pPr>
-      <w:r>
-        <w:rPr>
-          <w:bCs/>
-          <w:sz w:val="32"/>
-          <w:szCs w:val="32"/>
-          <w:lang w:val="en-US"/>
-        </w:rPr>
-        <w:t>İstanbul</w:t>
-      </w:r>
-      <w:r>
-        <w:rPr>
-          <w:bCs/>
-          <w:sz w:val="32"/>
-          <w:szCs w:val="32"/>
-          <w:lang w:val="en-US"/>
-        </w:rPr>
-        <w:t xml:space="preserve"> </w:t>
+        <w:t>May, 202</w:t>
       </w:r>
       <w:r>
         <w:rPr>
@@ -520,16 +506,6 @@
           <w:szCs w:val="32"/>
           <w:lang w:val="en-US"/>
         </w:rPr>
-        <w:t>May, 202</w:t>
-      </w:r>
-      <w:r>
-        <w:rPr>
-          <w:bCs/>
-          <w:color w:val="000000" w:themeColor="text1"/>
-          <w:sz w:val="32"/>
-          <w:szCs w:val="32"/>
-          <w:lang w:val="en-US"/>
-        </w:rPr>
         <w:t>6</w:t>
       </w:r>
       <w:r>
@@ -564,35 +540,7 @@
         <w:rPr>
           <w:lang w:val="en-US"/>
         </w:rPr>
-        <w:t xml:space="preserve">I hereby declare that this thesis represents my own work which has been done after registration for the </w:t>
-      </w:r>
-      <w:proofErr w:type="gramStart"/>
-      <w:r>
-        <w:rPr>
-          <w:lang w:val="en-US"/>
-        </w:rPr>
-        <w:t>degree of bachelor</w:t>
-      </w:r>
-      <w:proofErr w:type="gramEnd"/>
-      <w:r>
-        <w:rPr>
-          <w:lang w:val="en-US"/>
-        </w:rPr>
-        <w:t xml:space="preserve"> at Piri Reis </w:t>
-      </w:r>
-      <w:proofErr w:type="gramStart"/>
-      <w:r>
-        <w:rPr>
-          <w:lang w:val="en-US"/>
-        </w:rPr>
-        <w:t>University, and</w:t>
-      </w:r>
-      <w:proofErr w:type="gramEnd"/>
-      <w:r>
-        <w:rPr>
-          <w:lang w:val="en-US"/>
-        </w:rPr>
-        <w:t xml:space="preserve"> has not been previously included in a thesis or dissertation submitted to this or any other institution for a degree, diploma or other qualifications.</w:t>
+        <w:t>I hereby declare that this thesis represents my own work which has been done after registration for the degree of bachelor at Piri Reis University, and has not been previously included in a thesis or dissertation submitted to this or any other institution for a degree, diploma or other qualifications.</w:t>
       </w:r>
     </w:p>
     <w:p>
@@ -1088,15 +1036,7 @@
     </w:p>
     <w:p>
       <w:r>
-        <w:t xml:space="preserve">Supply chains include many connected activities such as order management, shipment planning, inventory control, delivery tracking, regional performance monitoring, and demand planning. When these activities are </w:t>
-      </w:r>
-      <w:proofErr w:type="spellStart"/>
-      <w:r>
-        <w:t>analyzed</w:t>
-      </w:r>
-      <w:proofErr w:type="spellEnd"/>
-      <w:r>
-        <w:t xml:space="preserve"> separately, managers may have difficulty seeing operational problems and risks on time. This graduation thesis develops a Supply Chain Visibility and Risk Assessment Platform to support supply chain decision-making through data visualization, risk analysis, and dataset standardization.</w:t>
+        <w:t>Supply chains include many connected activities such as order management, shipment planning, inventory control, delivery tracking, regional performance monitoring, and demand planning. When these activities are analyzed separately, managers may have difficulty seeing operational problems and risks on time. This graduation thesis develops a Supply Chain Visibility and Risk Assessment Platform to support supply chain decision-making through data visualization, risk analysis, and dataset standardization.</w:t>
       </w:r>
     </w:p>
     <w:p>
@@ -1105,23 +1045,7 @@
       </w:r>
       <w:r>
         <w:br/>
-        <w:t xml:space="preserve">The platform was developed with Python and </w:t>
-      </w:r>
-      <w:proofErr w:type="spellStart"/>
-      <w:r>
-        <w:t>Streamlit</w:t>
-      </w:r>
-      <w:proofErr w:type="spellEnd"/>
-      <w:r>
-        <w:t xml:space="preserve">. It uses the public </w:t>
-      </w:r>
-      <w:proofErr w:type="spellStart"/>
-      <w:r>
-        <w:t>DataCo</w:t>
-      </w:r>
-      <w:proofErr w:type="spellEnd"/>
-      <w:r>
-        <w:t xml:space="preserve"> Smart Supply Chain dataset as the default demonstration dataset. In addition, the system allows users to upload a new supply chain dataset in CSV or Excel format. The uploaded dataset can be mapped to a standard supply chain schema and then used dynamically across the dashboard pages. The platform includes modules for overview analysis, regional performance, inventory control, shipment performance, supply chain risk, and demand forecasting.</w:t>
+        <w:t>The platform was developed with Python and Streamlit. It uses the public DataCo Smart Supply Chain dataset as the default demonstration dataset. In addition, the system allows users to upload a new supply chain dataset in CSV or Excel format. The uploaded dataset can be mapped to a standard supply chain schema and then used dynamically across the dashboard pages. The platform includes modules for overview analysis, regional performance, inventory control, shipment performance, supply chain risk, and demand forecasting.</w:t>
       </w:r>
     </w:p>
     <w:p>
@@ -1150,15 +1074,7 @@
       </w:r>
       <w:r>
         <w:br/>
-        <w:t xml:space="preserve">Key Words: Supply Chain Visibility, Risk Assessment, Data Standardization, </w:t>
-      </w:r>
-      <w:proofErr w:type="spellStart"/>
-      <w:r>
-        <w:t>Streamlit</w:t>
-      </w:r>
-      <w:proofErr w:type="spellEnd"/>
-      <w:r>
-        <w:t xml:space="preserve"> Dashboard, Business Intelligence, Demand Forecasting</w:t>
+        <w:t>Key Words: Supply Chain Visibility, Risk Assessment, Data Standardization, Streamlit Dashboard, Business Intelligence, Demand Forecasting</w:t>
       </w:r>
     </w:p>
     <w:p>
@@ -3899,15 +3815,7 @@
     <w:p/>
     <w:p>
       <w:r>
-        <w:t xml:space="preserve">In this project, supply chain visibility is addressed through a multi-page dashboard structure. The platform brings different operational views together, including overview indicators, regional performance, inventory control, shipment performance, risk analysis, and demand forecasting. This supports the idea that supply chain visibility should not focus on only one </w:t>
-      </w:r>
-      <w:proofErr w:type="gramStart"/>
-      <w:r>
-        <w:t>metric, but</w:t>
-      </w:r>
-      <w:proofErr w:type="gramEnd"/>
-      <w:r>
-        <w:t xml:space="preserve"> should combine different operational indicators.</w:t>
+        <w:t>In this project, supply chain visibility is addressed through a multi-page dashboard structure. The platform brings different operational views together, including overview indicators, regional performance, inventory control, shipment performance, risk analysis, and demand forecasting. This supports the idea that supply chain visibility should not focus on only one metric, but should combine different operational indicators.</w:t>
       </w:r>
     </w:p>
     <w:p/>
@@ -3922,15 +3830,7 @@
     </w:p>
     <w:p>
       <w:r>
-        <w:t xml:space="preserve">Business intelligence dashboards are used to transform raw data into visual and understandable information. Instead of </w:t>
-      </w:r>
-      <w:proofErr w:type="spellStart"/>
-      <w:r>
-        <w:t>analyzing</w:t>
-      </w:r>
-      <w:proofErr w:type="spellEnd"/>
-      <w:r>
-        <w:t xml:space="preserve"> large tables manually, users can monitor key performance indicators, charts, and summary tables through an interactive interface. Dashboards are especially useful in operational areas where managers need to make quick and data-based decisions. [INSERT CITATION: Business Intelligence Dashboards]</w:t>
+        <w:t>Business intelligence dashboards are used to transform raw data into visual and understandable information. Instead of analyzing large tables manually, users can monitor key performance indicators, charts, and summary tables through an interactive interface. Dashboards are especially useful in operational areas where managers need to make quick and data-based decisions. [INSERT CITATION: Business Intelligence Dashboards]</w:t>
       </w:r>
     </w:p>
     <w:p/>
@@ -3968,15 +3868,7 @@
     <w:p/>
     <w:p>
       <w:r>
-        <w:t xml:space="preserve">In this project, supply chain risk is calculated using rule-based and interpretable indicators. The system </w:t>
-      </w:r>
-      <w:proofErr w:type="spellStart"/>
-      <w:r>
-        <w:t>analyzes</w:t>
-      </w:r>
-      <w:proofErr w:type="spellEnd"/>
-      <w:r>
-        <w:t xml:space="preserve"> delivery risk, delay risk, inventory risk, demand volatility risk, and region-level risk. The purpose is not to create a complex black-box prediction model, but to provide a clear and understandable risk assessment structure for decision support.</w:t>
+        <w:t>In this project, supply chain risk is calculated using rule-based and interpretable indicators. The system analyzes delivery risk, delay risk, inventory risk, demand volatility risk, and region-level risk. The purpose is not to create a complex black-box prediction model, but to provide a clear and understandable risk assessment structure for decision support.</w:t>
       </w:r>
     </w:p>
     <w:p/>
@@ -3990,15 +3882,7 @@
     </w:p>
     <w:p>
       <w:r>
-        <w:t xml:space="preserve">Digital transformation in logistics and supply chain management is closely related to the use of data, automation, analytics, and connected systems. Digital tools can improve transparency by collecting and </w:t>
-      </w:r>
-      <w:proofErr w:type="spellStart"/>
-      <w:r>
-        <w:t>analyzing</w:t>
-      </w:r>
-      <w:proofErr w:type="spellEnd"/>
-      <w:r>
-        <w:t xml:space="preserve"> operational data from different stages of the supply chain. This can support better planning, faster decision-making, and improved coordination between supply chain activities. [INSERT CITATION: Digital Transformation in Logistics]</w:t>
+        <w:t>Digital transformation in logistics and supply chain management is closely related to the use of data, automation, analytics, and connected systems. Digital tools can improve transparency by collecting and analyzing operational data from different stages of the supply chain. This can support better planning, faster decision-making, and improved coordination between supply chain activities. [INSERT CITATION: Digital Transformation in Logistics]</w:t>
       </w:r>
     </w:p>
     <w:p/>
@@ -4063,15 +3947,7 @@
     <w:p/>
     <w:p>
       <w:r>
-        <w:t xml:space="preserve">The dataset upload feature improves the originality and usefulness of the project. The default </w:t>
-      </w:r>
-      <w:proofErr w:type="spellStart"/>
-      <w:r>
-        <w:t>DataCo</w:t>
-      </w:r>
-      <w:proofErr w:type="spellEnd"/>
-      <w:r>
-        <w:t xml:space="preserve"> dataset is used as a demonstration dataset, but the system can also process new supply chain datasets. After the user maps the uploaded dataset to the standard schema, the dashboard pages are generated dynamically based on the active dataset. This makes the platform more reusable for different supply chain data sources.</w:t>
+        <w:t>The dataset upload feature improves the originality and usefulness of the project. The default DataCo dataset is used as a demonstration dataset, but the system can also process new supply chain datasets. After the user maps the uploaded dataset to the standard schema, the dashboard pages are generated dynamically based on the active dataset. This makes the platform more reusable for different supply chain data sources.</w:t>
       </w:r>
     </w:p>
     <w:p/>
@@ -4091,15 +3967,7 @@
     <w:p/>
     <w:p>
       <w:r>
-        <w:t xml:space="preserve">Based on these ideas, this project develops a dataset-adaptive supply chain visibility and risk assessment platform. The platform combines dashboard visualization, uploaded dataset support, data standardization, risk scoring, and demand forecasting in a single </w:t>
-      </w:r>
-      <w:proofErr w:type="spellStart"/>
-      <w:r>
-        <w:t>Streamlit</w:t>
-      </w:r>
-      <w:proofErr w:type="spellEnd"/>
-      <w:r>
-        <w:t>-based system.</w:t>
+        <w:t>Based on these ideas, this project develops a dataset-adaptive supply chain visibility and risk assessment platform. The platform combines dashboard visualization, uploaded dataset support, data standardization, risk scoring, and demand forecasting in a single Streamlit-based system.</w:t>
       </w:r>
     </w:p>
     <w:p/>
@@ -4120,15 +3988,7 @@
         <w:t>The</w:t>
       </w:r>
       <w:r>
-        <w:t xml:space="preserve"> originality of this study comes from developing a supply chain dashboard platform that is not limited to one fixed dataset. Many dashboard projects are designed only for a single prepared dataset. In this project, the </w:t>
-      </w:r>
-      <w:proofErr w:type="spellStart"/>
-      <w:r>
-        <w:t>DataCo</w:t>
-      </w:r>
-      <w:proofErr w:type="spellEnd"/>
-      <w:r>
-        <w:t xml:space="preserve"> Smart Supply Chain dataset is used as the default demonstration dataset, but the platform also allows users to upload a new supply chain dataset in CSV or Excel format.</w:t>
+        <w:t xml:space="preserve"> originality of this study comes from developing a supply chain dashboard platform that is not limited to one fixed dataset. Many dashboard projects are designed only for a single prepared dataset. In this project, the DataCo Smart Supply Chain dataset is used as the default demonstration dataset, but the platform also allows users to upload a new supply chain dataset in CSV or Excel format.</w:t>
       </w:r>
     </w:p>
     <w:p>
@@ -4168,15 +4028,7 @@
       </w:r>
       <w:r>
         <w:br/>
-        <w:t xml:space="preserve">The project is original within its academic scope because it combines data upload, schema mapping, data standardization, dynamic dashboard generation, risk analysis, and forecasting in a single </w:t>
-      </w:r>
-      <w:proofErr w:type="spellStart"/>
-      <w:r>
-        <w:t>Streamlit</w:t>
-      </w:r>
-      <w:proofErr w:type="spellEnd"/>
-      <w:r>
-        <w:t>-based system. Therefore, the main contribution of the project is the development of a reusable supply chain visibility and risk assessment platform that can work with both a default dataset and user-uploaded datasets.</w:t>
+        <w:t>The project is original within its academic scope because it combines data upload, schema mapping, data standardization, dynamic dashboard generation, risk analysis, and forecasting in a single Streamlit-based system. Therefore, the main contribution of the project is the development of a reusable supply chain visibility and risk assessment platform that can work with both a default dataset and user-uploaded datasets.</w:t>
       </w:r>
     </w:p>
     <w:p/>
@@ -4192,15 +4044,7 @@
     </w:p>
     <w:p>
       <w:r>
-        <w:t xml:space="preserve">Supply chain operations produce large amounts of data related to orders, products, shipments, delivery performance, inventory, regions, sales, and demand. However, this data is often stored in different files, systems, or formats. When the data is not standardized and </w:t>
-      </w:r>
-      <w:proofErr w:type="spellStart"/>
-      <w:r>
-        <w:t>analyzed</w:t>
-      </w:r>
-      <w:proofErr w:type="spellEnd"/>
-      <w:r>
-        <w:t xml:space="preserve"> together, it becomes difficult for managers to understand the overall performance of the supply chain.</w:t>
+        <w:t>Supply chain operations produce large amounts of data related to orders, products, shipments, delivery performance, inventory, regions, sales, and demand. However, this data is often stored in different files, systems, or formats. When the data is not standardized and analyzed together, it becomes difficult for managers to understand the overall performance of the supply chain.</w:t>
       </w:r>
     </w:p>
     <w:p>
@@ -4218,15 +4062,7 @@
       </w:r>
       <w:r>
         <w:br/>
-        <w:t xml:space="preserve">Another problem is that many dashboard systems are designed for a single prepared dataset. If a new dataset has different column names or a different structure, the dashboard may not work without manual code changes. This limits the reusability of the system. For example, one dataset may use “order date,” while another dataset may use “PO created date” for the same concept. Without a standard mapping and transformation process, these datasets cannot be </w:t>
-      </w:r>
-      <w:proofErr w:type="spellStart"/>
-      <w:r>
-        <w:t>analyzed</w:t>
-      </w:r>
-      <w:proofErr w:type="spellEnd"/>
-      <w:r>
-        <w:t xml:space="preserve"> through the same dashboard structure.</w:t>
+        <w:t>Another problem is that many dashboard systems are designed for a single prepared dataset. If a new dataset has different column names or a different structure, the dashboard may not work without manual code changes. This limits the reusability of the system. For example, one dataset may use “order date,” while another dataset may use “PO created date” for the same concept. Without a standard mapping and transformation process, these datasets cannot be analyzed through the same dashboard structure.</w:t>
       </w:r>
     </w:p>
     <w:p>
@@ -4260,15 +4096,7 @@
     </w:p>
     <w:p>
       <w:r>
-        <w:t xml:space="preserve">The solution approach of this project is based on developing a dataset-adaptive supply chain dashboard platform. The system is designed to work with a default demonstration dataset </w:t>
-      </w:r>
-      <w:proofErr w:type="gramStart"/>
-      <w:r>
-        <w:t>and also</w:t>
-      </w:r>
-      <w:proofErr w:type="gramEnd"/>
-      <w:r>
-        <w:t xml:space="preserve"> with user-uploaded supply chain datasets. The main idea is to transform different supply chain datasets into a common analytical structure and then generate dashboard modules from the active dataset.</w:t>
+        <w:t>The solution approach of this project is based on developing a dataset-adaptive supply chain dashboard platform. The system is designed to work with a default demonstration dataset and also with user-uploaded supply chain datasets. The main idea is to transform different supply chain datasets into a common analytical structure and then generate dashboard modules from the active dataset.</w:t>
       </w:r>
     </w:p>
     <w:p>
@@ -4291,15 +4119,7 @@
       </w:r>
       <w:r>
         <w:br/>
-        <w:t xml:space="preserve">The platform uses the </w:t>
-      </w:r>
-      <w:proofErr w:type="spellStart"/>
-      <w:r>
-        <w:t>DataCo</w:t>
-      </w:r>
-      <w:proofErr w:type="spellEnd"/>
-      <w:r>
-        <w:t xml:space="preserve"> Smart Supply Chain dataset as the default dataset. This dataset is processed into different analytical tables such as orders, products, shipments, inventory, demand, and risk scores. These tables are used by the default dashboard when no uploaded dataset is active.</w:t>
+        <w:t>The platform uses the DataCo Smart Supply Chain dataset as the default dataset. This dataset is processed into different analytical tables such as orders, products, shipments, inventory, demand, and risk scores. These tables are used by the default dashboard when no uploaded dataset is active.</w:t>
       </w:r>
     </w:p>
     <w:p>
@@ -4360,23 +4180,7 @@
     </w:p>
     <w:p>
       <w:r>
-        <w:t xml:space="preserve">After the dataset is standardized, the dashboard pages are generated from the active dataset. If no uploaded dataset is active, the dashboard uses the default </w:t>
-      </w:r>
-      <w:proofErr w:type="spellStart"/>
-      <w:r>
-        <w:t>DataCo</w:t>
-      </w:r>
-      <w:proofErr w:type="spellEnd"/>
-      <w:r>
-        <w:t xml:space="preserve"> dataset. If the user uploads and activates a new dataset, all dashboard pages use the uploaded dataset during the active </w:t>
-      </w:r>
-      <w:proofErr w:type="spellStart"/>
-      <w:r>
-        <w:t>Streamlit</w:t>
-      </w:r>
-      <w:proofErr w:type="spellEnd"/>
-      <w:r>
-        <w:t xml:space="preserve"> session.</w:t>
+        <w:t>After the dataset is standardized, the dashboard pages are generated from the active dataset. If no uploaded dataset is active, the dashboard uses the default DataCo dataset. If the user uploads and activates a new dataset, all dashboard pages use the uploaded dataset during the active Streamlit session.</w:t>
       </w:r>
     </w:p>
     <w:p>
@@ -4385,23 +4189,7 @@
       </w:r>
       <w:r>
         <w:br/>
-        <w:t xml:space="preserve">The dashboard includes six main modules: Overview, Regional Performance, Inventory Control, Shipment Performance, Supply Chain Risk, and Demand Forecast. Each module focuses on a different part of supply chain visibility. The Overview page shows general KPIs and summary charts. The Regional Performance page compares markets and regions. The Inventory Control page shows generated inventory indicators. The Shipment Performance page </w:t>
-      </w:r>
-      <w:proofErr w:type="spellStart"/>
-      <w:r>
-        <w:t>analyzes</w:t>
-      </w:r>
-      <w:proofErr w:type="spellEnd"/>
-      <w:r>
-        <w:t xml:space="preserve"> delivery and delay performance. The Supply Chain Risk page calculates risk indicators. The Demand Forecast page </w:t>
-      </w:r>
-      <w:proofErr w:type="spellStart"/>
-      <w:r>
-        <w:t>analyzes</w:t>
-      </w:r>
-      <w:proofErr w:type="spellEnd"/>
-      <w:r>
-        <w:t xml:space="preserve"> historical demand and creates simple forecasts.</w:t>
+        <w:t>The dashboard includes six main modules: Overview, Regional Performance, Inventory Control, Shipment Performance, Supply Chain Risk, and Demand Forecast. Each module focuses on a different part of supply chain visibility. The Overview page shows general KPIs and summary charts. The Regional Performance page compares markets and regions. The Inventory Control page shows generated inventory indicators. The Shipment Performance page analyzes delivery and delay performance. The Supply Chain Risk page calculates risk indicators. The Demand Forecast page analyzes historical demand and creates simple forecasts.</w:t>
       </w:r>
     </w:p>
     <w:p>
@@ -4410,15 +4198,7 @@
       </w:r>
       <w:r>
         <w:br/>
-        <w:t xml:space="preserve">This structure allows the system to work as a flexible platform instead of a static dashboard. The same dashboard pages can be used with different supply chain datasets </w:t>
-      </w:r>
-      <w:proofErr w:type="gramStart"/>
-      <w:r>
-        <w:t>as long as</w:t>
-      </w:r>
-      <w:proofErr w:type="gramEnd"/>
-      <w:r>
-        <w:t xml:space="preserve"> the required fields are mapped correctly.</w:t>
+        <w:t>This structure allows the system to work as a flexible platform instead of a static dashboard. The same dashboard pages can be used with different supply chain datasets as long as the required fields are mapped correctly.</w:t>
       </w:r>
     </w:p>
     <w:p/>
@@ -4519,15 +4299,7 @@
     <w:p>
       <w:r>
         <w:br/>
-        <w:t xml:space="preserve">The project was developed as a local </w:t>
-      </w:r>
-      <w:proofErr w:type="spellStart"/>
-      <w:r>
-        <w:t>Streamlit</w:t>
-      </w:r>
-      <w:proofErr w:type="spellEnd"/>
-      <w:r>
-        <w:t xml:space="preserve"> application. A Windows batch file was also created to make the project easier to run. This file automatically creates the virtual environment if needed, installs the required packages, processes the default dataset, and starts the dashboard.</w:t>
+        <w:t>The project was developed as a local Streamlit application. A Windows batch file was also created to make the project easier to run. This file automatically creates the virtual environment if needed, installs the required packages, processes the default dataset, and starts the dashboard.</w:t>
       </w:r>
     </w:p>
     <w:p/>
@@ -4541,15 +4313,7 @@
     </w:p>
     <w:p>
       <w:r>
-        <w:t xml:space="preserve">pandas </w:t>
-      </w:r>
-      <w:proofErr w:type="gramStart"/>
-      <w:r>
-        <w:t>was</w:t>
-      </w:r>
-      <w:proofErr w:type="gramEnd"/>
-      <w:r>
-        <w:t xml:space="preserve"> used for reading CSV and Excel files, cleaning the dataset, grouping records, calculating KPIs, and creating analytical tables. NumPy was used for numerical calculations and handling missing numerical values.</w:t>
+        <w:t>pandas was used for reading CSV and Excel files, cleaning the dataset, grouping records, calculating KPIs, and creating analytical tables. NumPy was used for numerical calculations and handling missing numerical values.</w:t>
       </w:r>
       <w:r>
         <w:br/>
@@ -4571,13 +4335,8 @@
       </w:r>
     </w:p>
     <w:p>
-      <w:proofErr w:type="spellStart"/>
-      <w:r>
-        <w:t>Streamlit</w:t>
-      </w:r>
-      <w:proofErr w:type="spellEnd"/>
-      <w:r>
-        <w:t xml:space="preserve"> was used to develop the interactive dashboard interface. It allowed the project to include different pages, filters, file upload components, KPI cards, charts, and tables.</w:t>
+      <w:r>
+        <w:t>Streamlit was used to develop the interactive dashboard interface. It allowed the project to include different pages, filters, file upload components, KPI cards, charts, and tables.</w:t>
       </w:r>
     </w:p>
     <w:p>
@@ -4780,11 +4539,9 @@
             <w:tcW w:w="1250" w:type="pct"/>
           </w:tcPr>
           <w:p>
-            <w:proofErr w:type="spellStart"/>
             <w:r>
               <w:t>Streamlit</w:t>
             </w:r>
-            <w:proofErr w:type="spellEnd"/>
           </w:p>
         </w:tc>
         <w:tc>
@@ -5084,15 +4841,7 @@
     </w:p>
     <w:p>
       <w:r>
-        <w:t xml:space="preserve">This section explains the technical development of the Supply Chain Visibility and Risk Assessment Platform. The system was designed as a dataset-adaptive dashboard platform. It can work with the default </w:t>
-      </w:r>
-      <w:proofErr w:type="spellStart"/>
-      <w:r>
-        <w:t>DataCo</w:t>
-      </w:r>
-      <w:proofErr w:type="spellEnd"/>
-      <w:r>
-        <w:t xml:space="preserve"> dataset, and it can also process user-uploaded supply chain datasets through column mapping and data standardization.</w:t>
+        <w:t>This section explains the technical development of the Supply Chain Visibility and Risk Assessment Platform. The system was designed as a dataset-adaptive dashboard platform. It can work with the default DataCo dataset, and it can also process user-uploaded supply chain datasets through column mapping and data standardization.</w:t>
       </w:r>
       <w:r>
         <w:br/>
@@ -5115,30 +4864,14 @@
     </w:p>
     <w:p>
       <w:r>
-        <w:t xml:space="preserve">The platform consists of several connected layers. The first layer is the data source layer. This layer includes the default </w:t>
-      </w:r>
-      <w:proofErr w:type="spellStart"/>
-      <w:r>
-        <w:t>DataCo</w:t>
-      </w:r>
-      <w:proofErr w:type="spellEnd"/>
-      <w:r>
-        <w:t xml:space="preserve"> dataset and user-uploaded CSV or Excel datasets. The second layer is the Data Source Manager, where the user can upload a new dataset and select the active data source. The third layer is the column mapping and data adapter layer. This layer converts different dataset structures into a common supply chain schema.</w:t>
+        <w:t>The platform consists of several connected layers. The first layer is the data source layer. This layer includes the default DataCo dataset and user-uploaded CSV or Excel datasets. The second layer is the Data Source Manager, where the user can upload a new dataset and select the active data source. The third layer is the column mapping and data adapter layer. This layer converts different dataset structures into a common supply chain schema.</w:t>
       </w:r>
       <w:r>
         <w:br/>
       </w:r>
       <w:r>
         <w:br/>
-        <w:t xml:space="preserve">After the data is standardized, the system creates dashboard-ready analytical tables such as orders, products, shipments, inventory, demand, and risk scores. These tables are then used by the </w:t>
-      </w:r>
-      <w:proofErr w:type="spellStart"/>
-      <w:r>
-        <w:t>Streamlit</w:t>
-      </w:r>
-      <w:proofErr w:type="spellEnd"/>
-      <w:r>
-        <w:t xml:space="preserve"> dashboard modules. The main dashboard modules are Overview, Regional Performance, Inventory Control, Shipment Performance, Supply Chain Risk, and Demand Forecast.</w:t>
+        <w:t>After the data is standardized, the system creates dashboard-ready analytical tables such as orders, products, shipments, inventory, demand, and risk scores. These tables are then used by the Streamlit dashboard modules. The main dashboard modules are Overview, Regional Performance, Inventory Control, Shipment Performance, Supply Chain Risk, and Demand Forecast.</w:t>
       </w:r>
     </w:p>
     <w:p>
@@ -5274,131 +5007,47 @@
         <w:rPr>
           <w:lang w:val="en-ZA"/>
         </w:rPr>
-        <w:t xml:space="preserve">The Data Source Manager is the main component that makes the platform reusable. When the dashboard </w:t>
-      </w:r>
-      <w:proofErr w:type="gramStart"/>
-      <w:r>
+        <w:t>The Data Source Manager is the main component that makes the platform reusable. When the dashboard is opened, the default DataCo dataset is active. If the user wants to analyze another supply chain dataset, the user can upload a CSV or Excel file from the Data Source Manager on the Overview page.</w:t>
+      </w:r>
+    </w:p>
+    <w:p>
+      <w:pPr>
         <w:rPr>
           <w:lang w:val="en-ZA"/>
         </w:rPr>
-        <w:t>is opened</w:t>
-      </w:r>
-      <w:proofErr w:type="gramEnd"/>
-      <w:r>
+      </w:pPr>
+    </w:p>
+    <w:p>
+      <w:pPr>
         <w:rPr>
           <w:lang w:val="en-ZA"/>
         </w:rPr>
-        <w:t xml:space="preserve">, the default </w:t>
-      </w:r>
-      <w:proofErr w:type="spellStart"/>
+      </w:pPr>
       <w:r>
         <w:rPr>
           <w:lang w:val="en-ZA"/>
         </w:rPr>
-        <w:t>DataCo</w:t>
-      </w:r>
-      <w:proofErr w:type="spellEnd"/>
-      <w:r>
+        <w:t>After uploading a dataset, the system shows a preview of the raw data. Then, the user maps the uploaded columns to the standard supply chain schema. This mapping process is necessary because different datasets may use different column names for the same concept. For example, one dataset may use “Order Date,” while another dataset may use “PO Created At.”</w:t>
+      </w:r>
+    </w:p>
+    <w:p>
+      <w:pPr>
         <w:rPr>
           <w:lang w:val="en-ZA"/>
         </w:rPr>
-        <w:t xml:space="preserve"> dataset is active. If the user wants to </w:t>
-      </w:r>
-      <w:proofErr w:type="spellStart"/>
-      <w:r>
+      </w:pPr>
+    </w:p>
+    <w:p>
+      <w:pPr>
         <w:rPr>
           <w:lang w:val="en-ZA"/>
         </w:rPr>
-        <w:t>analyze</w:t>
-      </w:r>
-      <w:proofErr w:type="spellEnd"/>
+      </w:pPr>
       <w:r>
         <w:rPr>
           <w:lang w:val="en-ZA"/>
         </w:rPr>
-        <w:t xml:space="preserve"> another supply chain dataset, the user can upload a CSV or Excel file from the Data Source Manager on the Overview page.</w:t>
-      </w:r>
-    </w:p>
-    <w:p>
-      <w:pPr>
-        <w:rPr>
-          <w:lang w:val="en-ZA"/>
-        </w:rPr>
-      </w:pPr>
-    </w:p>
-    <w:p>
-      <w:pPr>
-        <w:rPr>
-          <w:lang w:val="en-ZA"/>
-        </w:rPr>
-      </w:pPr>
-      <w:r>
-        <w:rPr>
-          <w:lang w:val="en-ZA"/>
-        </w:rPr>
-        <w:t>After uploading a dataset, the system shows a preview of the raw data. Then, the user maps the uploaded columns to the standard supply chain schema. This mapping process is necessary because different datasets may use different column names for the same concept. For example, one dataset may use “Order Date,” while another dataset may use “PO Created At.”</w:t>
-      </w:r>
-    </w:p>
-    <w:p>
-      <w:pPr>
-        <w:rPr>
-          <w:lang w:val="en-ZA"/>
-        </w:rPr>
-      </w:pPr>
-    </w:p>
-    <w:p>
-      <w:pPr>
-        <w:rPr>
-          <w:lang w:val="en-ZA"/>
-        </w:rPr>
-      </w:pPr>
-      <w:r>
-        <w:rPr>
-          <w:lang w:val="en-ZA"/>
-        </w:rPr>
-        <w:t xml:space="preserve">The uploaded dataset </w:t>
-      </w:r>
-      <w:proofErr w:type="gramStart"/>
-      <w:r>
-        <w:rPr>
-          <w:lang w:val="en-ZA"/>
-        </w:rPr>
-        <w:t>is used</w:t>
-      </w:r>
-      <w:proofErr w:type="gramEnd"/>
-      <w:r>
-        <w:rPr>
-          <w:lang w:val="en-ZA"/>
-        </w:rPr>
-        <w:t xml:space="preserve"> during the active </w:t>
-      </w:r>
-      <w:proofErr w:type="spellStart"/>
-      <w:r>
-        <w:rPr>
-          <w:lang w:val="en-ZA"/>
-        </w:rPr>
-        <w:t>Streamlit</w:t>
-      </w:r>
-      <w:proofErr w:type="spellEnd"/>
-      <w:r>
-        <w:rPr>
-          <w:lang w:val="en-ZA"/>
-        </w:rPr>
-        <w:t xml:space="preserve"> session. If the user activates the uploaded dataset, all dashboard pages use the uploaded data. If the user wants to return to the default dataset, the Data Source Manager provides an option to return to the default </w:t>
-      </w:r>
-      <w:proofErr w:type="spellStart"/>
-      <w:r>
-        <w:rPr>
-          <w:lang w:val="en-ZA"/>
-        </w:rPr>
-        <w:t>DataCo</w:t>
-      </w:r>
-      <w:proofErr w:type="spellEnd"/>
-      <w:r>
-        <w:rPr>
-          <w:lang w:val="en-ZA"/>
-        </w:rPr>
-        <w:t xml:space="preserve"> dataset.</w:t>
+        <w:t>The uploaded dataset is used during the active Streamlit session. If the user activates the uploaded dataset, all dashboard pages use the uploaded data. If the user wants to return to the default dataset, the Data Source Manager provides an option to return to the default DataCo dataset.</w:t>
       </w:r>
     </w:p>
     <w:p>
@@ -5461,97 +5110,27 @@
         <w:rPr>
           <w:lang w:val="en-ZA"/>
         </w:rPr>
-        <w:t xml:space="preserve">The standard data schema defines the common structure used by the platform. The uploaded dataset must </w:t>
-      </w:r>
-      <w:proofErr w:type="gramStart"/>
-      <w:r>
+        <w:t>The standard data schema defines the common structure used by the platform. The uploaded dataset must be mapped to this schema before it can be used by the dashboard pages. Some fields are required, while others are optional. Required fields are necessary for basic dashboard generation. Optional fields improve the quality of risk analysis, shipment performance analysis, and financial indicators.</w:t>
+      </w:r>
+    </w:p>
+    <w:p>
+      <w:pPr>
         <w:rPr>
           <w:lang w:val="en-ZA"/>
         </w:rPr>
-        <w:t>be mapped</w:t>
-      </w:r>
-      <w:proofErr w:type="gramEnd"/>
-      <w:r>
+      </w:pPr>
+    </w:p>
+    <w:p>
+      <w:pPr>
         <w:rPr>
           <w:lang w:val="en-ZA"/>
         </w:rPr>
-        <w:t xml:space="preserve"> to this schema before it can </w:t>
-      </w:r>
-      <w:proofErr w:type="gramStart"/>
+      </w:pPr>
       <w:r>
         <w:rPr>
           <w:lang w:val="en-ZA"/>
         </w:rPr>
-        <w:t>be used</w:t>
-      </w:r>
-      <w:proofErr w:type="gramEnd"/>
-      <w:r>
-        <w:rPr>
-          <w:lang w:val="en-ZA"/>
-        </w:rPr>
-        <w:t xml:space="preserve"> by the dashboard pages. </w:t>
-      </w:r>
-      <w:proofErr w:type="gramStart"/>
-      <w:r>
-        <w:rPr>
-          <w:lang w:val="en-ZA"/>
-        </w:rPr>
-        <w:t>Some</w:t>
-      </w:r>
-      <w:proofErr w:type="gramEnd"/>
-      <w:r>
-        <w:rPr>
-          <w:lang w:val="en-ZA"/>
-        </w:rPr>
-        <w:t xml:space="preserve"> fields </w:t>
-      </w:r>
-      <w:proofErr w:type="gramStart"/>
-      <w:r>
-        <w:rPr>
-          <w:lang w:val="en-ZA"/>
-        </w:rPr>
-        <w:t>are required</w:t>
-      </w:r>
-      <w:proofErr w:type="gramEnd"/>
-      <w:r>
-        <w:rPr>
-          <w:lang w:val="en-ZA"/>
-        </w:rPr>
-        <w:t>, while others are optional. Required fields are necessary for basic dashboard generation. Optional fields improve the quality of risk analysis, shipment performance analysis, and financial indicators.</w:t>
-      </w:r>
-    </w:p>
-    <w:p>
-      <w:pPr>
-        <w:rPr>
-          <w:lang w:val="en-ZA"/>
-        </w:rPr>
-      </w:pPr>
-    </w:p>
-    <w:p>
-      <w:pPr>
-        <w:rPr>
-          <w:lang w:val="en-ZA"/>
-        </w:rPr>
-      </w:pPr>
-      <w:r>
-        <w:rPr>
-          <w:lang w:val="en-ZA"/>
-        </w:rPr>
-        <w:t xml:space="preserve">The standard schema used in the platform </w:t>
-      </w:r>
-      <w:proofErr w:type="gramStart"/>
-      <w:r>
-        <w:rPr>
-          <w:lang w:val="en-ZA"/>
-        </w:rPr>
-        <w:t>is shown</w:t>
-      </w:r>
-      <w:proofErr w:type="gramEnd"/>
-      <w:r>
-        <w:rPr>
-          <w:lang w:val="en-ZA"/>
-        </w:rPr>
-        <w:t xml:space="preserve"> in Table 2.</w:t>
+        <w:t>The standard schema used in the platform is shown in Table 2.</w:t>
       </w:r>
       <w:r>
         <w:rPr>
@@ -5675,14 +5254,12 @@
                 <w:lang w:val="en-ZA"/>
               </w:rPr>
             </w:pPr>
-            <w:proofErr w:type="spellStart"/>
             <w:r>
               <w:rPr>
                 <w:lang w:val="en-ZA"/>
               </w:rPr>
               <w:t>order_id</w:t>
             </w:r>
-            <w:proofErr w:type="spellEnd"/>
           </w:p>
         </w:tc>
         <w:tc>
@@ -5717,21 +5294,7 @@
               <w:rPr>
                 <w:lang w:val="en-ZA"/>
               </w:rPr>
-              <w:t xml:space="preserve">Unique </w:t>
-            </w:r>
-            <w:proofErr w:type="spellStart"/>
-            <w:r>
-              <w:rPr>
-                <w:lang w:val="en-ZA"/>
-              </w:rPr>
-              <w:t>orderor</w:t>
-            </w:r>
-            <w:proofErr w:type="spellEnd"/>
-            <w:r>
-              <w:rPr>
-                <w:lang w:val="en-ZA"/>
-              </w:rPr>
-              <w:t xml:space="preserve"> transaction identifier</w:t>
+              <w:t>Unique orderor transaction identifier</w:t>
             </w:r>
           </w:p>
         </w:tc>
@@ -5747,14 +5310,12 @@
                 <w:lang w:val="en-ZA"/>
               </w:rPr>
             </w:pPr>
-            <w:proofErr w:type="spellStart"/>
             <w:r>
               <w:rPr>
                 <w:lang w:val="en-ZA"/>
               </w:rPr>
               <w:t>order_date</w:t>
             </w:r>
-            <w:proofErr w:type="spellEnd"/>
           </w:p>
         </w:tc>
         <w:tc>
@@ -5789,16 +5350,8 @@
               <w:rPr>
                 <w:lang w:val="en-ZA"/>
               </w:rPr>
-              <w:t xml:space="preserve">Date when the order </w:t>
-            </w:r>
-            <w:proofErr w:type="gramStart"/>
-            <w:r>
-              <w:rPr>
-                <w:lang w:val="en-ZA"/>
-              </w:rPr>
-              <w:t>was created</w:t>
-            </w:r>
-            <w:proofErr w:type="gramEnd"/>
+              <w:t>Date when the order was created</w:t>
+            </w:r>
           </w:p>
         </w:tc>
       </w:tr>
@@ -5813,14 +5366,12 @@
                 <w:lang w:val="en-ZA"/>
               </w:rPr>
             </w:pPr>
-            <w:proofErr w:type="spellStart"/>
             <w:r>
               <w:rPr>
                 <w:lang w:val="en-ZA"/>
               </w:rPr>
               <w:t>product_name</w:t>
             </w:r>
-            <w:proofErr w:type="spellEnd"/>
           </w:p>
         </w:tc>
         <w:tc>
@@ -5871,14 +5422,12 @@
                 <w:lang w:val="en-ZA"/>
               </w:rPr>
             </w:pPr>
-            <w:proofErr w:type="spellStart"/>
             <w:r>
               <w:rPr>
                 <w:lang w:val="en-ZA"/>
               </w:rPr>
               <w:t>category_name</w:t>
             </w:r>
-            <w:proofErr w:type="spellEnd"/>
           </w:p>
         </w:tc>
         <w:tc>
@@ -5929,11 +5478,9 @@
                 <w:lang w:val="en-ZA"/>
               </w:rPr>
             </w:pPr>
-            <w:proofErr w:type="spellStart"/>
             <w:r>
               <w:t>order_quantity</w:t>
             </w:r>
-            <w:proofErr w:type="spellEnd"/>
           </w:p>
         </w:tc>
         <w:tc>
@@ -5981,11 +5528,9 @@
                 <w:lang w:val="en-ZA"/>
               </w:rPr>
             </w:pPr>
-            <w:proofErr w:type="spellStart"/>
             <w:r>
               <w:t>shipping_date</w:t>
             </w:r>
-            <w:proofErr w:type="spellEnd"/>
           </w:p>
         </w:tc>
         <w:tc>
@@ -6033,11 +5578,9 @@
                 <w:lang w:val="en-ZA"/>
               </w:rPr>
             </w:pPr>
-            <w:proofErr w:type="spellStart"/>
             <w:r>
               <w:t>scheduled_delivery_date</w:t>
             </w:r>
-            <w:proofErr w:type="spellEnd"/>
           </w:p>
         </w:tc>
         <w:tc>
@@ -6088,11 +5631,9 @@
                 <w:lang w:val="en-ZA"/>
               </w:rPr>
             </w:pPr>
-            <w:proofErr w:type="spellStart"/>
             <w:r>
               <w:t>delivery_status</w:t>
             </w:r>
-            <w:proofErr w:type="spellEnd"/>
           </w:p>
         </w:tc>
         <w:tc>
@@ -6140,11 +5681,9 @@
                 <w:lang w:val="en-ZA"/>
               </w:rPr>
             </w:pPr>
-            <w:proofErr w:type="spellStart"/>
             <w:r>
               <w:t>actual_shipping_days</w:t>
             </w:r>
-            <w:proofErr w:type="spellEnd"/>
           </w:p>
         </w:tc>
         <w:tc>
@@ -6192,11 +5731,9 @@
                 <w:lang w:val="en-ZA"/>
               </w:rPr>
             </w:pPr>
-            <w:proofErr w:type="spellStart"/>
             <w:r>
               <w:t>scheduled_shipping_days</w:t>
             </w:r>
-            <w:proofErr w:type="spellEnd"/>
           </w:p>
         </w:tc>
         <w:tc>
@@ -6247,11 +5784,9 @@
                 <w:lang w:val="en-ZA"/>
               </w:rPr>
             </w:pPr>
-            <w:proofErr w:type="spellStart"/>
             <w:r>
               <w:t>shipping_mode</w:t>
             </w:r>
-            <w:proofErr w:type="spellEnd"/>
           </w:p>
         </w:tc>
         <w:tc>
@@ -6349,11 +5884,9 @@
                 <w:lang w:val="en-ZA"/>
               </w:rPr>
             </w:pPr>
-            <w:proofErr w:type="spellStart"/>
             <w:r>
               <w:t>order_region</w:t>
             </w:r>
-            <w:proofErr w:type="spellEnd"/>
           </w:p>
         </w:tc>
         <w:tc>
@@ -6401,11 +5934,9 @@
                 <w:lang w:val="en-ZA"/>
               </w:rPr>
             </w:pPr>
-            <w:proofErr w:type="spellStart"/>
             <w:r>
               <w:t>order_country</w:t>
             </w:r>
-            <w:proofErr w:type="spellEnd"/>
           </w:p>
         </w:tc>
         <w:tc>
@@ -6503,11 +6034,9 @@
                 <w:lang w:val="en-ZA"/>
               </w:rPr>
             </w:pPr>
-            <w:proofErr w:type="spellStart"/>
             <w:r>
               <w:t>order_profit</w:t>
             </w:r>
-            <w:proofErr w:type="spellEnd"/>
           </w:p>
         </w:tc>
         <w:tc>
@@ -6592,23 +6121,7 @@
       </w:r>
       <w:r>
         <w:br/>
-        <w:t xml:space="preserve">The main analytical tables are orders, products, shipments, inventory, demand, and </w:t>
-      </w:r>
-      <w:proofErr w:type="spellStart"/>
-      <w:r>
-        <w:t>risk_scores</w:t>
-      </w:r>
-      <w:proofErr w:type="spellEnd"/>
-      <w:r>
-        <w:t xml:space="preserve">. The orders table is the central table because it contains the main order-level information. The shipments table is created from order and delivery-related fields. The inventory table is generated from product and demand patterns. The demand table summarizes monthly demand by product category. The </w:t>
-      </w:r>
-      <w:proofErr w:type="spellStart"/>
-      <w:r>
-        <w:t>risk_scores</w:t>
-      </w:r>
-      <w:proofErr w:type="spellEnd"/>
-      <w:r>
-        <w:t xml:space="preserve"> table stores regional risk indicators.</w:t>
+        <w:t>The main analytical tables are orders, products, shipments, inventory, demand, and risk_scores. The orders table is the central table because it contains the main order-level information. The shipments table is created from order and delivery-related fields. The inventory table is generated from product and demand patterns. The demand table summarizes monthly demand by product category. The risk_scores table stores regional risk indicators.</w:t>
       </w:r>
       <w:r>
         <w:br/>
@@ -6717,33 +6230,32 @@
         <w:rPr>
           <w:lang w:val="en-ZA"/>
         </w:rPr>
-        <w:t xml:space="preserve">The logical data model represents the standardized analytical structure of the platform. Uploaded datasets </w:t>
-      </w:r>
-      <w:proofErr w:type="gramStart"/>
-      <w:r>
+        <w:t>The logical data model represents the standardized analytical structure of the platform. Uploaded datasets are first converted into this structure by the data adapter. Therefore, even if the uploaded dataset has different column names, the dashboard can use the same analytical tables after the standardization process.</w:t>
+      </w:r>
+    </w:p>
+    <w:p>
+      <w:pPr>
         <w:rPr>
           <w:lang w:val="en-ZA"/>
         </w:rPr>
-        <w:t>are first converted</w:t>
-      </w:r>
-      <w:proofErr w:type="gramEnd"/>
-      <w:r>
+      </w:pPr>
+    </w:p>
+    <w:p>
+      <w:pPr>
+        <w:pStyle w:val="Heading2"/>
         <w:rPr>
           <w:lang w:val="en-ZA"/>
         </w:rPr>
-        <w:t xml:space="preserve"> into this structure by the data adapter. Therefore, even if the uploaded dataset has different column names, the dashboard can use the same analytical tables after the standardization process.</w:t>
-      </w:r>
-    </w:p>
-    <w:p>
-      <w:pPr>
+      </w:pPr>
+      <w:r>
         <w:rPr>
           <w:lang w:val="en-ZA"/>
         </w:rPr>
-      </w:pPr>
-    </w:p>
-    <w:p>
-      <w:pPr>
-        <w:pStyle w:val="Heading2"/>
+        <w:t>Dashboard Modules</w:t>
+      </w:r>
+    </w:p>
+    <w:p>
+      <w:pPr>
         <w:rPr>
           <w:lang w:val="en-ZA"/>
         </w:rPr>
@@ -6752,7 +6264,7 @@
         <w:rPr>
           <w:lang w:val="en-ZA"/>
         </w:rPr>
-        <w:t>Dashboard Modules</w:t>
+        <w:t>The platform includes six dashboard modules. Each module focuses on a different part of supply chain visibility and risk analysis. These modules work with the active dataset. If the user activates an uploaded dataset, the same dashboard modules are updated according to the uploaded data.</w:t>
       </w:r>
     </w:p>
     <w:p>
@@ -6761,59 +6273,18 @@
           <w:lang w:val="en-ZA"/>
         </w:rPr>
       </w:pPr>
-      <w:r>
+    </w:p>
+    <w:p>
+      <w:pPr>
         <w:rPr>
           <w:lang w:val="en-ZA"/>
         </w:rPr>
-        <w:t xml:space="preserve">The platform includes six dashboard modules. Each module focuses on a different part of supply chain visibility and risk analysis. These modules work with the active dataset. If the user activates an uploaded dataset, the same dashboard modules </w:t>
-      </w:r>
-      <w:proofErr w:type="gramStart"/>
+      </w:pPr>
       <w:r>
         <w:rPr>
           <w:lang w:val="en-ZA"/>
         </w:rPr>
-        <w:t>are updated</w:t>
-      </w:r>
-      <w:proofErr w:type="gramEnd"/>
-      <w:r>
-        <w:rPr>
-          <w:lang w:val="en-ZA"/>
-        </w:rPr>
-        <w:t xml:space="preserve"> according to the uploaded data.</w:t>
-      </w:r>
-    </w:p>
-    <w:p>
-      <w:pPr>
-        <w:rPr>
-          <w:lang w:val="en-ZA"/>
-        </w:rPr>
-      </w:pPr>
-    </w:p>
-    <w:p>
-      <w:pPr>
-        <w:rPr>
-          <w:lang w:val="en-ZA"/>
-        </w:rPr>
-      </w:pPr>
-      <w:r>
-        <w:rPr>
-          <w:lang w:val="en-ZA"/>
-        </w:rPr>
-        <w:t xml:space="preserve">The dashboard modules and their main outputs </w:t>
-      </w:r>
-      <w:proofErr w:type="gramStart"/>
-      <w:r>
-        <w:rPr>
-          <w:lang w:val="en-ZA"/>
-        </w:rPr>
-        <w:t>are shown</w:t>
-      </w:r>
-      <w:proofErr w:type="gramEnd"/>
-      <w:r>
-        <w:rPr>
-          <w:lang w:val="en-ZA"/>
-        </w:rPr>
-        <w:t xml:space="preserve"> in Table 3.</w:t>
+        <w:t>The dashboard modules and their main outputs are shown in Table 3.</w:t>
       </w:r>
     </w:p>
     <w:p>
@@ -7112,13 +6583,8 @@
                 <w:lang w:val="en-ZA"/>
               </w:rPr>
             </w:pPr>
-            <w:proofErr w:type="spellStart"/>
-            <w:r>
-              <w:t>Analyzes</w:t>
-            </w:r>
-            <w:proofErr w:type="spellEnd"/>
-            <w:r>
-              <w:t xml:space="preserve"> delivery and shipment performance</w:t>
+            <w:r>
+              <w:t>Analyzes delivery and shipment performance</w:t>
             </w:r>
           </w:p>
         </w:tc>
@@ -7211,13 +6677,8 @@
                 <w:lang w:val="en-ZA"/>
               </w:rPr>
             </w:pPr>
-            <w:proofErr w:type="spellStart"/>
-            <w:r>
-              <w:t>Analyzes</w:t>
-            </w:r>
-            <w:proofErr w:type="spellEnd"/>
-            <w:r>
-              <w:t xml:space="preserve"> historical demand and future demand estimates</w:t>
+            <w:r>
+              <w:t>Analyzes historical demand and future demand estimates</w:t>
             </w:r>
           </w:p>
         </w:tc>
@@ -7248,26 +6709,25 @@
         <w:rPr>
           <w:lang w:val="en-ZA"/>
         </w:rPr>
-        <w:t xml:space="preserve">The modular structure makes the platform easier to understand and maintain. Each page has a specific responsibility, but all pages use the same active dataset. This design supports both the default </w:t>
-      </w:r>
-      <w:proofErr w:type="spellStart"/>
-      <w:r>
+        <w:t>The modular structure makes the platform easier to understand and maintain. Each page has a specific responsibility, but all pages use the same active dataset. This design supports both the default DataCo dataset and user-uploaded datasets.</w:t>
+      </w:r>
+    </w:p>
+    <w:p>
+      <w:pPr>
+        <w:pStyle w:val="Heading2"/>
         <w:rPr>
           <w:lang w:val="en-ZA"/>
         </w:rPr>
-        <w:t>DataCo</w:t>
-      </w:r>
-      <w:proofErr w:type="spellEnd"/>
+      </w:pPr>
       <w:r>
         <w:rPr>
           <w:lang w:val="en-ZA"/>
         </w:rPr>
-        <w:t xml:space="preserve"> dataset and user-uploaded datasets.</w:t>
-      </w:r>
-    </w:p>
-    <w:p>
-      <w:pPr>
-        <w:pStyle w:val="Heading2"/>
+        <w:t>Risk Scoring Logic</w:t>
+      </w:r>
+    </w:p>
+    <w:p>
+      <w:pPr>
         <w:rPr>
           <w:lang w:val="en-ZA"/>
         </w:rPr>
@@ -7276,7 +6736,7 @@
         <w:rPr>
           <w:lang w:val="en-ZA"/>
         </w:rPr>
-        <w:t>Risk Scoring Logic</w:t>
+        <w:t>The supply chain risk module uses a rule-based and interpretable risk scoring approach. The aim is to provide clear risk indicators that can be understood by users. The model does not use a black-box machine learning algorithm for risk scoring. Instead, it combines operational indicators such as delivery performance, delay days, inventory status, and demand volatility.</w:t>
       </w:r>
     </w:p>
     <w:p>
@@ -7285,59 +6745,18 @@
           <w:lang w:val="en-ZA"/>
         </w:rPr>
       </w:pPr>
-      <w:r>
+    </w:p>
+    <w:p>
+      <w:pPr>
         <w:rPr>
           <w:lang w:val="en-ZA"/>
         </w:rPr>
-        <w:t xml:space="preserve">The supply chain risk module uses a rule-based and interpretable risk scoring approach. The aim is to provide clear risk indicators that can </w:t>
-      </w:r>
-      <w:proofErr w:type="gramStart"/>
+      </w:pPr>
       <w:r>
         <w:rPr>
           <w:lang w:val="en-ZA"/>
         </w:rPr>
-        <w:t>be understood</w:t>
-      </w:r>
-      <w:proofErr w:type="gramEnd"/>
-      <w:r>
-        <w:rPr>
-          <w:lang w:val="en-ZA"/>
-        </w:rPr>
-        <w:t xml:space="preserve"> by users. The model does not use a black-box machine learning algorithm for risk scoring. Instead, it combines operational indicators such as delivery performance, delay days, inventory status, and demand volatility.</w:t>
-      </w:r>
-    </w:p>
-    <w:p>
-      <w:pPr>
-        <w:rPr>
-          <w:lang w:val="en-ZA"/>
-        </w:rPr>
-      </w:pPr>
-    </w:p>
-    <w:p>
-      <w:pPr>
-        <w:rPr>
-          <w:lang w:val="en-ZA"/>
-        </w:rPr>
-      </w:pPr>
-      <w:r>
-        <w:rPr>
-          <w:lang w:val="en-ZA"/>
-        </w:rPr>
-        <w:t xml:space="preserve">The main risk components used in the platform </w:t>
-      </w:r>
-      <w:proofErr w:type="gramStart"/>
-      <w:r>
-        <w:rPr>
-          <w:lang w:val="en-ZA"/>
-        </w:rPr>
-        <w:t>are shown</w:t>
-      </w:r>
-      <w:proofErr w:type="gramEnd"/>
-      <w:r>
-        <w:rPr>
-          <w:lang w:val="en-ZA"/>
-        </w:rPr>
-        <w:t xml:space="preserve"> in Table 4.</w:t>
+        <w:t>The main risk components used in the platform are shown in Table 4.</w:t>
       </w:r>
     </w:p>
     <w:p>
@@ -7672,35 +7091,7 @@
         <w:rPr>
           <w:lang w:val="en-ZA"/>
         </w:rPr>
-        <w:t xml:space="preserve">The overall risk score </w:t>
-      </w:r>
-      <w:proofErr w:type="gramStart"/>
-      <w:r>
-        <w:rPr>
-          <w:lang w:val="en-ZA"/>
-        </w:rPr>
-        <w:t>is calculated</w:t>
-      </w:r>
-      <w:proofErr w:type="gramEnd"/>
-      <w:r>
-        <w:rPr>
-          <w:lang w:val="en-ZA"/>
-        </w:rPr>
-        <w:t xml:space="preserve"> by combining the weighted risk components. The weights </w:t>
-      </w:r>
-      <w:proofErr w:type="gramStart"/>
-      <w:r>
-        <w:rPr>
-          <w:lang w:val="en-ZA"/>
-        </w:rPr>
-        <w:t>were selected</w:t>
-      </w:r>
-      <w:proofErr w:type="gramEnd"/>
-      <w:r>
-        <w:rPr>
-          <w:lang w:val="en-ZA"/>
-        </w:rPr>
-        <w:t xml:space="preserve"> to give higher importance to delivery performance and inventory condition, because these two areas directly affect operational continuity and customer service.</w:t>
+        <w:t>The overall risk score is calculated by combining the weighted risk components. The weights were selected to give higher importance to delivery performance and inventory condition, because these two areas directly affect operational continuity and customer service.</w:t>
       </w:r>
     </w:p>
     <w:p>
@@ -8198,77 +7589,74 @@
         <w:rPr>
           <w:lang w:val="en-ZA"/>
         </w:rPr>
-        <w:t xml:space="preserve">The risk score </w:t>
-      </w:r>
-      <w:proofErr w:type="gramStart"/>
-      <w:r>
+        <w:t>The risk score is interpreted in three levels. A score below 30 is classified as Low Risk, a score between 30 and 60 is classified as Medium Risk, and a score above 60 is classified as High Risk. This classification helps users understand the risk level quickly without analyzing every component separately.</w:t>
+      </w:r>
+    </w:p>
+    <w:p>
+      <w:pPr>
         <w:rPr>
           <w:lang w:val="en-ZA"/>
         </w:rPr>
-        <w:t>is interpreted</w:t>
-      </w:r>
-      <w:proofErr w:type="gramEnd"/>
-      <w:r>
+      </w:pPr>
+    </w:p>
+    <w:p>
+      <w:pPr>
         <w:rPr>
           <w:lang w:val="en-ZA"/>
         </w:rPr>
-        <w:t xml:space="preserve"> in three levels. A score below 30 </w:t>
-      </w:r>
-      <w:proofErr w:type="gramStart"/>
+      </w:pPr>
       <w:r>
         <w:rPr>
           <w:lang w:val="en-ZA"/>
         </w:rPr>
-        <w:t>is classified</w:t>
-      </w:r>
-      <w:proofErr w:type="gramEnd"/>
-      <w:r>
+        <w:t>The risk scoring logic is also affected by dashboard filters. When the user filters the dataset by market, category, shipping mode, or date range, the risk components are recalculated based on the filtered data. This makes the risk analysis interactive and more useful for decision-making.</w:t>
+      </w:r>
+    </w:p>
+    <w:p>
+      <w:pPr>
+        <w:pStyle w:val="Heading2"/>
         <w:rPr>
           <w:lang w:val="en-ZA"/>
         </w:rPr>
-        <w:t xml:space="preserve"> as Low Risk, a score between 30 and 60 </w:t>
-      </w:r>
-      <w:proofErr w:type="gramStart"/>
+      </w:pPr>
       <w:r>
         <w:rPr>
           <w:lang w:val="en-ZA"/>
         </w:rPr>
-        <w:t>is classified</w:t>
-      </w:r>
-      <w:proofErr w:type="gramEnd"/>
-      <w:r>
+        <w:t>Demand Forecasting Logic</w:t>
+      </w:r>
+    </w:p>
+    <w:p>
+      <w:pPr>
         <w:rPr>
           <w:lang w:val="en-ZA"/>
         </w:rPr>
-        <w:t xml:space="preserve"> as Medium Risk, and a score above 60 </w:t>
-      </w:r>
-      <w:proofErr w:type="gramStart"/>
+      </w:pPr>
       <w:r>
         <w:rPr>
           <w:lang w:val="en-ZA"/>
         </w:rPr>
-        <w:t>is classified</w:t>
-      </w:r>
-      <w:proofErr w:type="gramEnd"/>
-      <w:r>
+        <w:t>The Demand Forecast module uses historical monthly demand values generated from the active dataset. The demand table is created by grouping order quantity values by year-month and product category. This allows the system to analyze demand trends over time.</w:t>
+      </w:r>
+    </w:p>
+    <w:p>
+      <w:pPr>
         <w:rPr>
           <w:lang w:val="en-ZA"/>
         </w:rPr>
-        <w:t xml:space="preserve"> as High Risk. This classification helps users understand the risk level quickly without </w:t>
-      </w:r>
-      <w:proofErr w:type="spellStart"/>
-      <w:r>
+      </w:pPr>
+    </w:p>
+    <w:p>
+      <w:pPr>
         <w:rPr>
           <w:lang w:val="en-ZA"/>
         </w:rPr>
-        <w:t>analyzing</w:t>
-      </w:r>
-      <w:proofErr w:type="spellEnd"/>
+      </w:pPr>
       <w:r>
         <w:rPr>
           <w:lang w:val="en-ZA"/>
         </w:rPr>
-        <w:t xml:space="preserve"> every component separately.</w:t>
+        <w:t>The platform uses two simple forecasting methods: 3-month moving average and linear regression. The moving average method is used to show short-term demand trends based on recent historical values. The linear regression model is used to estimate future demand by learning a simple trend from historical monthly demand.</w:t>
       </w:r>
     </w:p>
     <w:p>
@@ -8288,36 +7676,35 @@
         <w:rPr>
           <w:lang w:val="en-ZA"/>
         </w:rPr>
-        <w:t xml:space="preserve">The risk scoring logic </w:t>
-      </w:r>
-      <w:proofErr w:type="gramStart"/>
-      <w:r>
+        <w:t>The forecasting module also includes performance evaluation metrics such as Mean Absolute Error (MAE) and Mean Absolute Percentage Error (MAPE). These metrics help users understand how close the forecasted values are to actual historical demand values.</w:t>
+      </w:r>
+    </w:p>
+    <w:p>
+      <w:pPr>
         <w:rPr>
           <w:lang w:val="en-ZA"/>
         </w:rPr>
-        <w:t>is also affected</w:t>
-      </w:r>
-      <w:proofErr w:type="gramEnd"/>
-      <w:r>
+      </w:pPr>
+    </w:p>
+    <w:p>
+      <w:pPr>
         <w:rPr>
           <w:lang w:val="en-ZA"/>
         </w:rPr>
-        <w:t xml:space="preserve"> by dashboard filters. When the user filters the dataset by market, category, shipping mode, or date range, the risk components </w:t>
-      </w:r>
-      <w:proofErr w:type="gramStart"/>
+      </w:pPr>
       <w:r>
         <w:rPr>
           <w:lang w:val="en-ZA"/>
         </w:rPr>
-        <w:t>are recalculated</w:t>
-      </w:r>
-      <w:proofErr w:type="gramEnd"/>
-      <w:r>
+        <w:t>The forecasting approach is intentionally simple because the main focus of the project is supply chain visibility and risk assessment. The purpose of the forecast module is to demonstrate how demand data can support planning decisions, not to create a highly advanced forecasting system.</w:t>
+      </w:r>
+    </w:p>
+    <w:p>
+      <w:pPr>
         <w:rPr>
           <w:lang w:val="en-ZA"/>
         </w:rPr>
-        <w:t xml:space="preserve"> based on the filtered data. This makes the risk analysis interactive and more useful for decision-making.</w:t>
-      </w:r>
+      </w:pPr>
     </w:p>
     <w:p>
       <w:pPr>
@@ -8330,7 +7717,7 @@
         <w:rPr>
           <w:lang w:val="en-ZA"/>
         </w:rPr>
-        <w:t>Demand Forecasting Logic</w:t>
+        <w:t>Dashboard Interface and Screenshots</w:t>
       </w:r>
     </w:p>
     <w:p>
@@ -8343,261 +7730,27 @@
         <w:rPr>
           <w:lang w:val="en-ZA"/>
         </w:rPr>
-        <w:t xml:space="preserve">The Demand Forecast module uses historical monthly demand values generated from the active dataset. The demand table </w:t>
-      </w:r>
-      <w:proofErr w:type="gramStart"/>
-      <w:r>
+        <w:t>The dashboard interface was developed with Streamlit. The platform includes a sidebar navigation menu and multiple dashboard pages. The Overview page includes the Data Source Manager, which allows users to upload a new dataset, map columns, activate the uploaded dataset, or return to the default DataCo dataset.</w:t>
+      </w:r>
+    </w:p>
+    <w:p>
+      <w:pPr>
         <w:rPr>
           <w:lang w:val="en-ZA"/>
         </w:rPr>
-        <w:t>is created</w:t>
-      </w:r>
-      <w:proofErr w:type="gramEnd"/>
-      <w:r>
+      </w:pPr>
+    </w:p>
+    <w:p>
+      <w:pPr>
         <w:rPr>
           <w:lang w:val="en-ZA"/>
         </w:rPr>
-        <w:t xml:space="preserve"> by grouping order quantity values by year-month and product category. This allows the system to </w:t>
-      </w:r>
-      <w:proofErr w:type="spellStart"/>
+      </w:pPr>
       <w:r>
         <w:rPr>
           <w:lang w:val="en-ZA"/>
         </w:rPr>
-        <w:t>analyze</w:t>
-      </w:r>
-      <w:proofErr w:type="spellEnd"/>
-      <w:r>
-        <w:rPr>
-          <w:lang w:val="en-ZA"/>
-        </w:rPr>
-        <w:t xml:space="preserve"> demand trends over time.</w:t>
-      </w:r>
-    </w:p>
-    <w:p>
-      <w:pPr>
-        <w:rPr>
-          <w:lang w:val="en-ZA"/>
-        </w:rPr>
-      </w:pPr>
-    </w:p>
-    <w:p>
-      <w:pPr>
-        <w:rPr>
-          <w:lang w:val="en-ZA"/>
-        </w:rPr>
-      </w:pPr>
-      <w:r>
-        <w:rPr>
-          <w:lang w:val="en-ZA"/>
-        </w:rPr>
-        <w:t xml:space="preserve">The platform uses two simple forecasting methods: 3-month moving average and linear regression. The moving average method </w:t>
-      </w:r>
-      <w:proofErr w:type="gramStart"/>
-      <w:r>
-        <w:rPr>
-          <w:lang w:val="en-ZA"/>
-        </w:rPr>
-        <w:t>is used</w:t>
-      </w:r>
-      <w:proofErr w:type="gramEnd"/>
-      <w:r>
-        <w:rPr>
-          <w:lang w:val="en-ZA"/>
-        </w:rPr>
-        <w:t xml:space="preserve"> to show short-term demand trends based on recent historical values. The linear regression model </w:t>
-      </w:r>
-      <w:proofErr w:type="gramStart"/>
-      <w:r>
-        <w:rPr>
-          <w:lang w:val="en-ZA"/>
-        </w:rPr>
-        <w:t>is used</w:t>
-      </w:r>
-      <w:proofErr w:type="gramEnd"/>
-      <w:r>
-        <w:rPr>
-          <w:lang w:val="en-ZA"/>
-        </w:rPr>
-        <w:t xml:space="preserve"> to estimate future demand by learning a simple trend from historical monthly demand.</w:t>
-      </w:r>
-    </w:p>
-    <w:p>
-      <w:pPr>
-        <w:rPr>
-          <w:lang w:val="en-ZA"/>
-        </w:rPr>
-      </w:pPr>
-    </w:p>
-    <w:p>
-      <w:pPr>
-        <w:rPr>
-          <w:lang w:val="en-ZA"/>
-        </w:rPr>
-      </w:pPr>
-      <w:r>
-        <w:rPr>
-          <w:lang w:val="en-ZA"/>
-        </w:rPr>
-        <w:t>The forecasting module also includes performance evaluation metrics such as Mean Absolute Error (MAE) and Mean Absolute Percentage Error (MAPE). These metrics help users understand how close the forecasted values are to actual historical demand values.</w:t>
-      </w:r>
-    </w:p>
-    <w:p>
-      <w:pPr>
-        <w:rPr>
-          <w:lang w:val="en-ZA"/>
-        </w:rPr>
-      </w:pPr>
-    </w:p>
-    <w:p>
-      <w:pPr>
-        <w:rPr>
-          <w:lang w:val="en-ZA"/>
-        </w:rPr>
-      </w:pPr>
-      <w:r>
-        <w:rPr>
-          <w:lang w:val="en-ZA"/>
-        </w:rPr>
-        <w:t xml:space="preserve">The forecasting approach is intentionally simple because the </w:t>
-      </w:r>
-      <w:proofErr w:type="gramStart"/>
-      <w:r>
-        <w:rPr>
-          <w:lang w:val="en-ZA"/>
-        </w:rPr>
-        <w:t>main focus</w:t>
-      </w:r>
-      <w:proofErr w:type="gramEnd"/>
-      <w:r>
-        <w:rPr>
-          <w:lang w:val="en-ZA"/>
-        </w:rPr>
-        <w:t xml:space="preserve"> of the project is </w:t>
-      </w:r>
-      <w:proofErr w:type="gramStart"/>
-      <w:r>
-        <w:rPr>
-          <w:lang w:val="en-ZA"/>
-        </w:rPr>
-        <w:t>supply</w:t>
-      </w:r>
-      <w:proofErr w:type="gramEnd"/>
-      <w:r>
-        <w:rPr>
-          <w:lang w:val="en-ZA"/>
-        </w:rPr>
-        <w:t xml:space="preserve"> chain visibility and risk assessment. The purpose of the forecast module is to demonstrate how demand data can support planning decisions, not to create a highly advanced forecasting system.</w:t>
-      </w:r>
-    </w:p>
-    <w:p>
-      <w:pPr>
-        <w:rPr>
-          <w:lang w:val="en-ZA"/>
-        </w:rPr>
-      </w:pPr>
-    </w:p>
-    <w:p>
-      <w:pPr>
-        <w:pStyle w:val="Heading2"/>
-        <w:rPr>
-          <w:lang w:val="en-ZA"/>
-        </w:rPr>
-      </w:pPr>
-      <w:r>
-        <w:rPr>
-          <w:lang w:val="en-ZA"/>
-        </w:rPr>
-        <w:t>Dashboard Interface and Screenshots</w:t>
-      </w:r>
-    </w:p>
-    <w:p>
-      <w:pPr>
-        <w:rPr>
-          <w:lang w:val="en-ZA"/>
-        </w:rPr>
-      </w:pPr>
-      <w:r>
-        <w:rPr>
-          <w:lang w:val="en-ZA"/>
-        </w:rPr>
-        <w:t xml:space="preserve">The dashboard interface </w:t>
-      </w:r>
-      <w:proofErr w:type="gramStart"/>
-      <w:r>
-        <w:rPr>
-          <w:lang w:val="en-ZA"/>
-        </w:rPr>
-        <w:t>was developed</w:t>
-      </w:r>
-      <w:proofErr w:type="gramEnd"/>
-      <w:r>
-        <w:rPr>
-          <w:lang w:val="en-ZA"/>
-        </w:rPr>
-        <w:t xml:space="preserve"> with </w:t>
-      </w:r>
-      <w:proofErr w:type="spellStart"/>
-      <w:r>
-        <w:rPr>
-          <w:lang w:val="en-ZA"/>
-        </w:rPr>
-        <w:t>Streamlit</w:t>
-      </w:r>
-      <w:proofErr w:type="spellEnd"/>
-      <w:r>
-        <w:rPr>
-          <w:lang w:val="en-ZA"/>
-        </w:rPr>
-        <w:t xml:space="preserve">. The platform includes a sidebar navigation menu and multiple dashboard pages. The Overview page includes the Data Source Manager, which allows users to upload a new dataset, map columns, activate the uploaded dataset, or return to the default </w:t>
-      </w:r>
-      <w:proofErr w:type="spellStart"/>
-      <w:r>
-        <w:rPr>
-          <w:lang w:val="en-ZA"/>
-        </w:rPr>
-        <w:t>DataCo</w:t>
-      </w:r>
-      <w:proofErr w:type="spellEnd"/>
-      <w:r>
-        <w:rPr>
-          <w:lang w:val="en-ZA"/>
-        </w:rPr>
-        <w:t xml:space="preserve"> dataset.</w:t>
-      </w:r>
-    </w:p>
-    <w:p>
-      <w:pPr>
-        <w:rPr>
-          <w:lang w:val="en-ZA"/>
-        </w:rPr>
-      </w:pPr>
-    </w:p>
-    <w:p>
-      <w:pPr>
-        <w:rPr>
-          <w:lang w:val="en-ZA"/>
-        </w:rPr>
-      </w:pPr>
-      <w:r>
-        <w:rPr>
-          <w:lang w:val="en-ZA"/>
-        </w:rPr>
-        <w:t xml:space="preserve">The Data Source Manager </w:t>
-      </w:r>
-      <w:proofErr w:type="gramStart"/>
-      <w:r>
-        <w:rPr>
-          <w:lang w:val="en-ZA"/>
-        </w:rPr>
-        <w:t>is shown</w:t>
-      </w:r>
-      <w:proofErr w:type="gramEnd"/>
-      <w:r>
-        <w:rPr>
-          <w:lang w:val="en-ZA"/>
-        </w:rPr>
-        <w:t xml:space="preserve"> in Figure 3.</w:t>
+        <w:t>The Data Source Manager is shown in Figure 3.</w:t>
       </w:r>
     </w:p>
     <w:p>
@@ -8699,29 +7852,28 @@
         <w:rPr>
           <w:lang w:val="en-ZA"/>
         </w:rPr>
-        <w:t xml:space="preserve">As shown in Figure 3, the user can upload a CSV or Excel dataset and map it to the standard supply chain schema. After the uploaded dataset </w:t>
-      </w:r>
-      <w:proofErr w:type="gramStart"/>
-      <w:r>
+        <w:t>As shown in Figure 3, the user can upload a CSV or Excel dataset and map it to the standard supply chain schema. After the uploaded dataset is activated, all dashboard pages use the uploaded data during the active session.</w:t>
+      </w:r>
+    </w:p>
+    <w:p>
+      <w:pPr>
         <w:rPr>
           <w:lang w:val="en-ZA"/>
         </w:rPr>
-        <w:t>is activated</w:t>
-      </w:r>
-      <w:proofErr w:type="gramEnd"/>
-      <w:r>
+      </w:pPr>
+    </w:p>
+    <w:p>
+      <w:pPr>
         <w:rPr>
           <w:lang w:val="en-ZA"/>
         </w:rPr>
-        <w:t>, all dashboard pages use the uploaded data during the active session.</w:t>
-      </w:r>
-    </w:p>
-    <w:p>
-      <w:pPr>
+      </w:pPr>
+      <w:r>
         <w:rPr>
           <w:lang w:val="en-ZA"/>
         </w:rPr>
-      </w:pPr>
+        <w:t>The Overview page provides a high-level summary of the active dataset. It shows key performance indicators, monthly order volume, delivery status distribution, average delay by shipping mode, inventory status summary, and risk level distribution.</w:t>
+      </w:r>
     </w:p>
     <w:p>
       <w:pPr>
@@ -8733,34 +7885,7 @@
         <w:rPr>
           <w:lang w:val="en-ZA"/>
         </w:rPr>
-        <w:t>The Overview page provides a high-level summary of the active dataset. It shows key performance indicators, monthly order volume, delivery status distribution, average delay by shipping mode, inventory status summary, and risk level distribution.</w:t>
-      </w:r>
-    </w:p>
-    <w:p>
-      <w:pPr>
-        <w:rPr>
-          <w:lang w:val="en-ZA"/>
-        </w:rPr>
-      </w:pPr>
-      <w:r>
-        <w:rPr>
-          <w:lang w:val="en-ZA"/>
-        </w:rPr>
-        <w:t xml:space="preserve">An example of the Overview dashboard generated from an uploaded dataset </w:t>
-      </w:r>
-      <w:proofErr w:type="gramStart"/>
-      <w:r>
-        <w:rPr>
-          <w:lang w:val="en-ZA"/>
-        </w:rPr>
-        <w:t>is shown</w:t>
-      </w:r>
-      <w:proofErr w:type="gramEnd"/>
-      <w:r>
-        <w:rPr>
-          <w:lang w:val="en-ZA"/>
-        </w:rPr>
-        <w:t xml:space="preserve"> in Figure 4.</w:t>
+        <w:t>An example of the Overview dashboard generated from an uploaded dataset is shown in Figure 4.</w:t>
       </w:r>
     </w:p>
     <w:p>
@@ -8852,55 +7977,27 @@
           <w:lang w:val="en-ZA"/>
         </w:rPr>
         <w:lastRenderedPageBreak/>
-        <w:t xml:space="preserve">The Supply Chain Risk page combines </w:t>
-      </w:r>
-      <w:proofErr w:type="gramStart"/>
-      <w:r>
+        <w:t>The Supply Chain Risk page combines several risk indicators into a single decision-support view. It includes delivery risk, delay risk, inventory risk, demand volatility risk, and an overall risk score. The risk results change according to the selected dashboard filters.</w:t>
+      </w:r>
+    </w:p>
+    <w:p>
+      <w:pPr>
         <w:rPr>
           <w:lang w:val="en-ZA"/>
         </w:rPr>
-        <w:t>several</w:t>
-      </w:r>
-      <w:proofErr w:type="gramEnd"/>
-      <w:r>
+      </w:pPr>
+    </w:p>
+    <w:p>
+      <w:pPr>
         <w:rPr>
           <w:lang w:val="en-ZA"/>
         </w:rPr>
-        <w:t xml:space="preserve"> risk indicators into a single decision-support view. It includes delivery risk, delay risk, inventory risk, demand volatility risk, and an overall risk score. The risk results change according to the selected dashboard filters.</w:t>
-      </w:r>
-    </w:p>
-    <w:p>
-      <w:pPr>
+      </w:pPr>
+      <w:r>
         <w:rPr>
           <w:lang w:val="en-ZA"/>
         </w:rPr>
-      </w:pPr>
-    </w:p>
-    <w:p>
-      <w:pPr>
-        <w:rPr>
-          <w:lang w:val="en-ZA"/>
-        </w:rPr>
-      </w:pPr>
-      <w:r>
-        <w:rPr>
-          <w:lang w:val="en-ZA"/>
-        </w:rPr>
-        <w:t xml:space="preserve">An example of the Supply Chain Risk dashboard </w:t>
-      </w:r>
-      <w:proofErr w:type="gramStart"/>
-      <w:r>
-        <w:rPr>
-          <w:lang w:val="en-ZA"/>
-        </w:rPr>
-        <w:t>is shown</w:t>
-      </w:r>
-      <w:proofErr w:type="gramEnd"/>
-      <w:r>
-        <w:rPr>
-          <w:lang w:val="en-ZA"/>
-        </w:rPr>
-        <w:t xml:space="preserve"> in Figure 5.</w:t>
+        <w:t>An example of the Supply Chain Risk dashboard is shown in Figure 5.</w:t>
       </w:r>
     </w:p>
     <w:p>
@@ -8991,55 +8088,27 @@
         <w:rPr>
           <w:lang w:val="en-ZA"/>
         </w:rPr>
-        <w:t xml:space="preserve">The Demand Forecast page </w:t>
-      </w:r>
-      <w:proofErr w:type="spellStart"/>
-      <w:r>
+        <w:t>The Demand Forecast page analyzes historical demand and generates future demand estimates. It allows users to compare actual demand with forecasted values and review forecast error metrics.</w:t>
+      </w:r>
+    </w:p>
+    <w:p>
+      <w:pPr>
         <w:rPr>
           <w:lang w:val="en-ZA"/>
         </w:rPr>
-        <w:t>analyzes</w:t>
-      </w:r>
-      <w:proofErr w:type="spellEnd"/>
-      <w:r>
+      </w:pPr>
+    </w:p>
+    <w:p>
+      <w:pPr>
         <w:rPr>
           <w:lang w:val="en-ZA"/>
         </w:rPr>
-        <w:t xml:space="preserve"> historical demand and generates future demand estimates. It allows users to compare actual demand with forecasted values and review forecast error metrics.</w:t>
-      </w:r>
-    </w:p>
-    <w:p>
-      <w:pPr>
+      </w:pPr>
+      <w:r>
         <w:rPr>
           <w:lang w:val="en-ZA"/>
         </w:rPr>
-      </w:pPr>
-    </w:p>
-    <w:p>
-      <w:pPr>
-        <w:rPr>
-          <w:lang w:val="en-ZA"/>
-        </w:rPr>
-      </w:pPr>
-      <w:r>
-        <w:rPr>
-          <w:lang w:val="en-ZA"/>
-        </w:rPr>
-        <w:t xml:space="preserve">An example of the Demand Forecast dashboard </w:t>
-      </w:r>
-      <w:proofErr w:type="gramStart"/>
-      <w:r>
-        <w:rPr>
-          <w:lang w:val="en-ZA"/>
-        </w:rPr>
-        <w:t>is shown</w:t>
-      </w:r>
-      <w:proofErr w:type="gramEnd"/>
-      <w:r>
-        <w:rPr>
-          <w:lang w:val="en-ZA"/>
-        </w:rPr>
-        <w:t xml:space="preserve"> in Figure 6.</w:t>
+        <w:t>An example of the Demand Forecast dashboard is shown in Figure 6.</w:t>
       </w:r>
     </w:p>
     <w:p>
@@ -9131,49 +8200,437 @@
           <w:lang w:val="en-ZA"/>
         </w:rPr>
         <w:lastRenderedPageBreak/>
-        <w:t xml:space="preserve">These dashboard pages show that the platform </w:t>
-      </w:r>
-      <w:proofErr w:type="gramStart"/>
-      <w:r>
+        <w:t>These dashboard pages show that the platform is not limited to a static dataset. When a new dataset is uploaded and activated, the same dashboard structure is regenerated based on the active dataset. This supports the main goal of the project: creating a reusable supply chain visibility and risk assessment platform.</w:t>
+      </w:r>
+    </w:p>
+    <w:p>
+      <w:pPr>
         <w:rPr>
           <w:lang w:val="en-ZA"/>
         </w:rPr>
-        <w:t>is not limited</w:t>
-      </w:r>
-      <w:proofErr w:type="gramEnd"/>
-      <w:r>
+      </w:pPr>
+    </w:p>
+    <w:p>
+      <w:pPr>
+        <w:pStyle w:val="Heading1"/>
+      </w:pPr>
+      <w:bookmarkStart w:id="20" w:name="_Toc115861786"/>
+      <w:r>
+        <w:t>CASE STUDY / BUSINESS CASE</w:t>
+      </w:r>
+      <w:bookmarkEnd w:id="20"/>
+    </w:p>
+    <w:p>
+      <w:r>
+        <w:t>This section presents the business case of the project. The platform is designed for a company that needs to monitor supply chain performance, identify operational risks, and analyze demand patterns from a single interface.</w:t>
+      </w:r>
+    </w:p>
+    <w:p>
+      <w:pPr>
+        <w:pStyle w:val="Heading2"/>
+      </w:pPr>
+      <w:r>
+        <w:t>Business Scenario</w:t>
+      </w:r>
+      <w:r>
+        <w:t xml:space="preserve"> </w:t>
+      </w:r>
+    </w:p>
+    <w:p>
+      <w:r>
+        <w:t>The business scenario represents a company that manages products, orders, shipments, inventory indicators, markets, regions, and demand information. In this type of company, supply chain data may come from different systems or files. For example, order information may be stored in one file, shipment information may have different column names, and delivery performance may be reported separately.</w:t>
+      </w:r>
+    </w:p>
+    <w:p>
+      <w:r>
+        <w:br/>
+      </w:r>
+      <w:r>
+        <w:br/>
+        <w:t>The company needs a reusable dashboard platform that can work with different supply chain datasets. The platform should not require code changes every time a new dataset is analyzed. Instead, users should be able to upload a dataset, map its columns to a standard schema, and generate dashboard pages based on the active dataset.</w:t>
+      </w:r>
+    </w:p>
+    <w:p>
+      <w:r>
+        <w:br/>
+      </w:r>
+      <w:r>
+        <w:br/>
+        <w:t>In this project, the DataCo dataset is used as the default demonstration dataset. However, the business case also considers a situation where a user uploads a new company dataset. After the uploaded dataset is mapped and standardized, the dashboard pages are updated dynamically.</w:t>
+      </w:r>
+    </w:p>
+    <w:p>
+      <w:pPr>
+        <w:pStyle w:val="Heading2"/>
+      </w:pPr>
+      <w:r>
+        <w:t>User Roles</w:t>
+      </w:r>
+      <w:r>
+        <w:t xml:space="preserve"> </w:t>
+      </w:r>
+    </w:p>
+    <w:p>
+      <w:r>
+        <w:t>The platform can support different user roles in a supply chain environment. Each role may use the dashboard for a different purpose. The main user roles are shown in Table 5.</w:t>
+      </w:r>
+    </w:p>
+    <w:p>
+      <w:pPr>
+        <w:jc w:val="center"/>
+        <w:rPr>
+          <w:b/>
+          <w:bCs/>
+        </w:rPr>
+      </w:pPr>
+      <w:r>
+        <w:rPr>
+          <w:b/>
+          <w:bCs/>
+        </w:rPr>
+        <w:t>Table 5: User Roles and Dashboard Usage</w:t>
+      </w:r>
+    </w:p>
+    <w:tbl>
+      <w:tblPr>
+        <w:tblStyle w:val="TableGrid"/>
+        <w:tblW w:w="5000" w:type="pct"/>
+        <w:tblLook w:val="04A0" w:firstRow="1" w:lastRow="0" w:firstColumn="1" w:lastColumn="0" w:noHBand="0" w:noVBand="1"/>
+      </w:tblPr>
+      <w:tblGrid>
+        <w:gridCol w:w="3077"/>
+        <w:gridCol w:w="3077"/>
+        <w:gridCol w:w="3078"/>
+      </w:tblGrid>
+      <w:tr>
+        <w:tc>
+          <w:tcPr>
+            <w:tcW w:w="1666" w:type="pct"/>
+          </w:tcPr>
+          <w:p>
+            <w:pPr>
+              <w:jc w:val="left"/>
+              <w:rPr>
+                <w:b/>
+                <w:bCs/>
+              </w:rPr>
+            </w:pPr>
+            <w:r>
+              <w:rPr>
+                <w:b/>
+                <w:bCs/>
+              </w:rPr>
+              <w:t>User Role</w:t>
+            </w:r>
+          </w:p>
+        </w:tc>
+        <w:tc>
+          <w:tcPr>
+            <w:tcW w:w="1666" w:type="pct"/>
+          </w:tcPr>
+          <w:p>
+            <w:pPr>
+              <w:rPr>
+                <w:b/>
+                <w:bCs/>
+              </w:rPr>
+            </w:pPr>
+            <w:r>
+              <w:rPr>
+                <w:b/>
+                <w:bCs/>
+              </w:rPr>
+              <w:t>Main Need</w:t>
+            </w:r>
+          </w:p>
+        </w:tc>
+        <w:tc>
+          <w:tcPr>
+            <w:tcW w:w="1667" w:type="pct"/>
+          </w:tcPr>
+          <w:p>
+            <w:pPr>
+              <w:rPr>
+                <w:b/>
+                <w:bCs/>
+              </w:rPr>
+            </w:pPr>
+            <w:r>
+              <w:rPr>
+                <w:b/>
+                <w:bCs/>
+              </w:rPr>
+              <w:t>Related Dashboard Pages</w:t>
+            </w:r>
+          </w:p>
+        </w:tc>
+      </w:tr>
+      <w:tr>
+        <w:tc>
+          <w:tcPr>
+            <w:tcW w:w="1666" w:type="pct"/>
+          </w:tcPr>
+          <w:p>
+            <w:r>
+              <w:t>Supply Chain Manager</w:t>
+            </w:r>
+          </w:p>
+        </w:tc>
+        <w:tc>
+          <w:tcPr>
+            <w:tcW w:w="1666" w:type="pct"/>
+          </w:tcPr>
+          <w:p>
+            <w:r>
+              <w:t>Monitor overall performance and risk level</w:t>
+            </w:r>
+          </w:p>
+        </w:tc>
+        <w:tc>
+          <w:tcPr>
+            <w:tcW w:w="1667" w:type="pct"/>
+          </w:tcPr>
+          <w:p>
+            <w:r>
+              <w:t>Overview, Supply Chain Risk</w:t>
+            </w:r>
+          </w:p>
+        </w:tc>
+      </w:tr>
+      <w:tr>
+        <w:tc>
+          <w:tcPr>
+            <w:tcW w:w="1666" w:type="pct"/>
+          </w:tcPr>
+          <w:p>
+            <w:r>
+              <w:t>Logistics Analyst</w:t>
+            </w:r>
+          </w:p>
+        </w:tc>
+        <w:tc>
+          <w:tcPr>
+            <w:tcW w:w="1666" w:type="pct"/>
+          </w:tcPr>
+          <w:p>
+            <w:r>
+              <w:t>Analyze shipment delays and delivery performance</w:t>
+            </w:r>
+          </w:p>
+        </w:tc>
+        <w:tc>
+          <w:tcPr>
+            <w:tcW w:w="1667" w:type="pct"/>
+          </w:tcPr>
+          <w:p>
+            <w:r>
+              <w:t>Shipment Performance, Regional Performance</w:t>
+            </w:r>
+          </w:p>
+        </w:tc>
+      </w:tr>
+      <w:tr>
+        <w:tc>
+          <w:tcPr>
+            <w:tcW w:w="1666" w:type="pct"/>
+          </w:tcPr>
+          <w:p>
+            <w:r>
+              <w:t>Inventory Planner</w:t>
+            </w:r>
+          </w:p>
+        </w:tc>
+        <w:tc>
+          <w:tcPr>
+            <w:tcW w:w="1666" w:type="pct"/>
+          </w:tcPr>
+          <w:p>
+            <w:r>
+              <w:t>Identify critical and warning inventory items</w:t>
+            </w:r>
+          </w:p>
+        </w:tc>
+        <w:tc>
+          <w:tcPr>
+            <w:tcW w:w="1667" w:type="pct"/>
+          </w:tcPr>
+          <w:p>
+            <w:r>
+              <w:t>Inventory Control, Supply Chain Risk</w:t>
+            </w:r>
+          </w:p>
+        </w:tc>
+      </w:tr>
+      <w:tr>
+        <w:tc>
+          <w:tcPr>
+            <w:tcW w:w="1666" w:type="pct"/>
+          </w:tcPr>
+          <w:p>
+            <w:r>
+              <w:t>Business Analyst</w:t>
+            </w:r>
+          </w:p>
+        </w:tc>
+        <w:tc>
+          <w:tcPr>
+            <w:tcW w:w="1666" w:type="pct"/>
+          </w:tcPr>
+          <w:p>
+            <w:r>
+              <w:t>Review trends, regional results, and demand patterns</w:t>
+            </w:r>
+          </w:p>
+        </w:tc>
+        <w:tc>
+          <w:tcPr>
+            <w:tcW w:w="1667" w:type="pct"/>
+          </w:tcPr>
+          <w:p>
+            <w:r>
+              <w:t>Overview, Regional Performance, Demand Forecast</w:t>
+            </w:r>
+          </w:p>
+        </w:tc>
+      </w:tr>
+    </w:tbl>
+    <w:p/>
+    <w:p>
+      <w:pPr>
+        <w:pStyle w:val="Heading2"/>
+      </w:pPr>
+      <w:r>
+        <w:t>Use Case Structure</w:t>
+      </w:r>
+    </w:p>
+    <w:p>
+      <w:r>
+        <w:t>The main use cases of the platform are related to dataset upload, column mapping, dataset activation, dashboard monitoring, risk analysis, and forecasting. A user can either work with the default dataset or upload a new dataset. If a new dataset is uploaded, the user maps the dataset columns to the standard schema and activates the uploaded dataset. After activation, the dashboard pages use the uploaded dataset during the active session.</w:t>
+      </w:r>
+    </w:p>
+    <w:p/>
+    <w:p>
+      <w:r>
+        <w:t>The use case diagram of the platform is shown in Figure 7.</w:t>
+      </w:r>
+    </w:p>
+    <w:p>
+      <w:pPr>
+        <w:keepNext/>
+      </w:pPr>
+      <w:r>
+        <w:rPr>
+          <w:noProof/>
+        </w:rPr>
+        <w:lastRenderedPageBreak/>
+        <w:drawing>
+          <wp:inline distT="0" distB="0" distL="0" distR="0" wp14:anchorId="2FC8B4CF" wp14:editId="41EDA205">
+            <wp:extent cx="5868670" cy="3867785"/>
+            <wp:effectExtent l="0" t="0" r="0" b="0"/>
+            <wp:docPr id="656098705" name="Picture 5"/>
+            <wp:cNvGraphicFramePr>
+              <a:graphicFrameLocks xmlns:a="http://schemas.openxmlformats.org/drawingml/2006/main" noChangeAspect="1"/>
+            </wp:cNvGraphicFramePr>
+            <a:graphic xmlns:a="http://schemas.openxmlformats.org/drawingml/2006/main">
+              <a:graphicData uri="http://schemas.openxmlformats.org/drawingml/2006/picture">
+                <pic:pic xmlns:pic="http://schemas.openxmlformats.org/drawingml/2006/picture">
+                  <pic:nvPicPr>
+                    <pic:cNvPr id="656098705" name="Picture 656098705"/>
+                    <pic:cNvPicPr/>
+                  </pic:nvPicPr>
+                  <pic:blipFill>
+                    <a:blip r:embed="rId15" cstate="print">
+                      <a:extLst>
+                        <a:ext uri="{28A0092B-C50C-407E-A947-70E740481C1C}">
+                          <a14:useLocalDpi xmlns:a14="http://schemas.microsoft.com/office/drawing/2010/main" val="0"/>
+                        </a:ext>
+                      </a:extLst>
+                    </a:blip>
+                    <a:stretch>
+                      <a:fillRect/>
+                    </a:stretch>
+                  </pic:blipFill>
+                  <pic:spPr>
+                    <a:xfrm>
+                      <a:off x="0" y="0"/>
+                      <a:ext cx="5868670" cy="3867785"/>
+                    </a:xfrm>
+                    <a:prstGeom prst="rect">
+                      <a:avLst/>
+                    </a:prstGeom>
+                  </pic:spPr>
+                </pic:pic>
+              </a:graphicData>
+            </a:graphic>
+          </wp:inline>
+        </w:drawing>
+      </w:r>
+    </w:p>
+    <w:p>
+      <w:pPr>
+        <w:pStyle w:val="Caption"/>
+        <w:jc w:val="both"/>
+      </w:pPr>
+      <w:r>
+        <w:t xml:space="preserve">Figure </w:t>
+      </w:r>
+      <w:r>
+        <w:fldChar w:fldCharType="begin"/>
+      </w:r>
+      <w:r>
+        <w:instrText xml:space="preserve"> SEQ Figure \* ARABIC </w:instrText>
+      </w:r>
+      <w:r>
+        <w:fldChar w:fldCharType="separate"/>
+      </w:r>
+      <w:r>
+        <w:rPr>
+          <w:noProof/>
+        </w:rPr>
+        <w:t>7</w:t>
+      </w:r>
+      <w:r>
+        <w:fldChar w:fldCharType="end"/>
+      </w:r>
+      <w:r>
+        <w:t xml:space="preserve">. </w:t>
+      </w:r>
+      <w:r>
+        <w:t>Use case diagram of the dataset-adaptive dashboard platform.</w:t>
+      </w:r>
+    </w:p>
+    <w:p>
+      <w:pPr>
         <w:rPr>
           <w:lang w:val="en-ZA"/>
         </w:rPr>
-        <w:t xml:space="preserve"> to a static dataset. When a new dataset </w:t>
-      </w:r>
-      <w:proofErr w:type="gramStart"/>
+      </w:pPr>
       <w:r>
         <w:rPr>
           <w:lang w:val="en-ZA"/>
         </w:rPr>
-        <w:t>is uploaded</w:t>
-      </w:r>
-      <w:proofErr w:type="gramEnd"/>
-      <w:r>
+        <w:t>As shown in Figure 7, the dataset upload process is one of the central use cases of the platform. The user can upload a supply chain dataset, map its columns, validate and standardize the data, and activate it for dashboard analysis. After this process, the user can view the dashboard modules and review operational insights.</w:t>
+      </w:r>
+    </w:p>
+    <w:p>
+      <w:pPr>
         <w:rPr>
           <w:lang w:val="en-ZA"/>
         </w:rPr>
-        <w:t xml:space="preserve"> and activated, the same dashboard structure </w:t>
-      </w:r>
-      <w:proofErr w:type="gramStart"/>
-      <w:r>
+      </w:pPr>
+    </w:p>
+    <w:p>
+      <w:pPr>
+        <w:pStyle w:val="Heading2"/>
         <w:rPr>
           <w:lang w:val="en-ZA"/>
         </w:rPr>
-        <w:t>is regenerated</w:t>
-      </w:r>
-      <w:proofErr w:type="gramEnd"/>
+      </w:pPr>
       <w:r>
         <w:rPr>
           <w:lang w:val="en-ZA"/>
         </w:rPr>
-        <w:t xml:space="preserve"> based on the active dataset. This supports the main goal of the project: creating a reusable supply chain visibility and risk assessment platform.</w:t>
+        <w:t>Example Usage Flow</w:t>
       </w:r>
     </w:p>
     <w:p>
@@ -9182,36 +8639,132 @@
           <w:lang w:val="en-ZA"/>
         </w:rPr>
       </w:pPr>
+      <w:r>
+        <w:rPr>
+          <w:lang w:val="en-ZA"/>
+        </w:rPr>
+        <w:t>An example usage flow starts with the user opening the platform. At first, the default DataCo dataset is active. The user can review the default dashboard, or upload a new supply chain dataset through the Data Source Manager.</w:t>
+      </w:r>
+    </w:p>
+    <w:p>
+      <w:pPr>
+        <w:rPr>
+          <w:lang w:val="en-ZA"/>
+        </w:rPr>
+      </w:pPr>
+    </w:p>
+    <w:p>
+      <w:pPr>
+        <w:rPr>
+          <w:lang w:val="en-ZA"/>
+        </w:rPr>
+      </w:pPr>
+      <w:r>
+        <w:rPr>
+          <w:lang w:val="en-ZA"/>
+        </w:rPr>
+        <w:t>If the user uploads a new dataset, the system displays a preview of the raw data. The user then maps the uploaded columns to the standard schema. Required fields such as order ID, order date, product name, category name, and order quantity must be mapped. Optional fields such as shipping mode, scheduled delivery date, sales, and profit improve the quality of the analysis.</w:t>
+      </w:r>
+    </w:p>
+    <w:p>
+      <w:pPr>
+        <w:rPr>
+          <w:lang w:val="en-ZA"/>
+        </w:rPr>
+      </w:pPr>
+    </w:p>
+    <w:p>
+      <w:pPr>
+        <w:rPr>
+          <w:lang w:val="en-ZA"/>
+        </w:rPr>
+      </w:pPr>
+      <w:r>
+        <w:rPr>
+          <w:lang w:val="en-ZA"/>
+        </w:rPr>
+        <w:t>After the user activates the uploaded dataset, all dashboard pages are updated according to the uploaded data. The user can then analyze regional performance, inventory status, shipment delays, supply chain risk, and demand forecasts. This process shows how the platform can support different supply chain datasets without changing the source code.</w:t>
+      </w:r>
+    </w:p>
+    <w:p>
+      <w:pPr>
+        <w:rPr>
+          <w:lang w:val="en-ZA"/>
+        </w:rPr>
+      </w:pPr>
+    </w:p>
+    <w:p>
+      <w:pPr>
+        <w:pStyle w:val="Heading2"/>
+        <w:rPr>
+          <w:lang w:val="en-ZA"/>
+        </w:rPr>
+      </w:pPr>
+      <w:r>
+        <w:rPr>
+          <w:lang w:val="en-ZA"/>
+        </w:rPr>
+        <w:t>Business Value</w:t>
+      </w:r>
+    </w:p>
+    <w:p>
+      <w:pPr>
+        <w:rPr>
+          <w:lang w:val="en-ZA"/>
+        </w:rPr>
+      </w:pPr>
+      <w:r>
+        <w:rPr>
+          <w:lang w:val="en-ZA"/>
+        </w:rPr>
+        <w:t>The main business value of the platform is that it improves supply chain visibility and supports operational risk assessment. Instead of checking separate reports, users can analyze key supply chain indicators from one dashboard structure.</w:t>
+      </w:r>
+    </w:p>
+    <w:p>
+      <w:pPr>
+        <w:rPr>
+          <w:lang w:val="en-ZA"/>
+        </w:rPr>
+      </w:pPr>
+    </w:p>
+    <w:p>
+      <w:pPr>
+        <w:rPr>
+          <w:lang w:val="en-ZA"/>
+        </w:rPr>
+      </w:pPr>
+      <w:r>
+        <w:rPr>
+          <w:lang w:val="en-ZA"/>
+        </w:rPr>
+        <w:t>The dataset upload and standardization feature also increases the reusability of the system. A company can test different datasets by mapping them to the standard schema. This makes the platform more flexible than a dashboard designed for only one fixed dataset.</w:t>
+      </w:r>
+    </w:p>
+    <w:p>
+      <w:pPr>
+        <w:rPr>
+          <w:lang w:val="en-ZA"/>
+        </w:rPr>
+      </w:pPr>
+    </w:p>
+    <w:p>
+      <w:pPr>
+        <w:rPr>
+          <w:lang w:val="en-ZA"/>
+        </w:rPr>
+      </w:pPr>
+      <w:r>
+        <w:rPr>
+          <w:lang w:val="en-ZA"/>
+        </w:rPr>
+        <w:lastRenderedPageBreak/>
+        <w:t>The platform can help users identify late delivery problems, risky regions, critical inventory items, delay patterns, and demand changes. These insights can support better planning and faster decision-making in supply chain operations.</w:t>
+      </w:r>
     </w:p>
     <w:p>
       <w:pPr>
         <w:pStyle w:val="Heading1"/>
       </w:pPr>
-      <w:bookmarkStart w:id="20" w:name="_Toc115861786"/>
-      <w:r>
-        <w:t>CASE STUDY / BUSINESS CASE</w:t>
-      </w:r>
-      <w:bookmarkEnd w:id="20"/>
-    </w:p>
-    <w:p>
-      <w:r>
-        <w:t>……</w:t>
-      </w:r>
-      <w:proofErr w:type="gramStart"/>
-      <w:r>
-        <w:t>….</w:t>
-      </w:r>
-      <w:proofErr w:type="spellStart"/>
-      <w:r>
-        <w:t>fdfdfdf</w:t>
-      </w:r>
-      <w:proofErr w:type="spellEnd"/>
-      <w:proofErr w:type="gramEnd"/>
-    </w:p>
-    <w:p>
-      <w:pPr>
-        <w:pStyle w:val="Heading1"/>
-      </w:pPr>
       <w:bookmarkStart w:id="21" w:name="_Toc115861787"/>
       <w:r>
         <w:t>CONCLUSIONs</w:t>
@@ -9220,18 +8773,8 @@
     </w:p>
     <w:p>
       <w:r>
-        <w:t>……</w:t>
-      </w:r>
-      <w:proofErr w:type="gramStart"/>
-      <w:r>
-        <w:t>….</w:t>
-      </w:r>
-      <w:proofErr w:type="spellStart"/>
-      <w:r>
-        <w:t>fdfdfdf</w:t>
-      </w:r>
-      <w:proofErr w:type="spellEnd"/>
-      <w:proofErr w:type="gramEnd"/>
+        <w:t>……….fdfdfdf</w:t>
+      </w:r>
     </w:p>
     <w:p/>
     <w:p>
@@ -9777,7 +9320,6 @@
             <w:rPr>
               <w:noProof/>
             </w:rPr>
-            <w:lastRenderedPageBreak/>
             <w:t xml:space="preserve">Teltumbde, A. (2000). A framework of evaluating ERP projects. </w:t>
           </w:r>
           <w:r>
@@ -9836,6 +9378,7 @@
             <w:rPr>
               <w:noProof/>
             </w:rPr>
+            <w:lastRenderedPageBreak/>
             <w:t xml:space="preserve">URL_02. (2011, Nisan 21). </w:t>
           </w:r>
           <w:r>
@@ -9991,15 +9534,7 @@
       <w:bookmarkStart w:id="26" w:name="_Toc115861789"/>
       <w:r>
         <w:lastRenderedPageBreak/>
-        <w:t>GIT/KAGGLE/COLAB/</w:t>
-      </w:r>
-      <w:proofErr w:type="gramStart"/>
-      <w:r>
-        <w:t>etc..</w:t>
-      </w:r>
-      <w:proofErr w:type="gramEnd"/>
-      <w:r>
-        <w:t xml:space="preserve"> LINK</w:t>
+        <w:t>GIT/KAGGLE/COLAB/etc.. LINK</w:t>
       </w:r>
       <w:bookmarkEnd w:id="26"/>
     </w:p>
@@ -10076,7 +9611,6 @@
           <w:lang w:val="en-US" w:eastAsia="tr-TR"/>
         </w:rPr>
       </w:pPr>
-      <w:proofErr w:type="gramStart"/>
       <w:r>
         <w:rPr>
           <w:b/>
@@ -10084,7 +9618,6 @@
         </w:rPr>
         <w:t>Education :</w:t>
       </w:r>
-      <w:proofErr w:type="gramEnd"/>
     </w:p>
     <w:p>
       <w:pPr>
@@ -10092,7 +9625,6 @@
           <w:lang w:val="en-US" w:eastAsia="tr-TR"/>
         </w:rPr>
       </w:pPr>
-      <w:proofErr w:type="gramStart"/>
       <w:r>
         <w:rPr>
           <w:i/>
@@ -10105,14 +9637,7 @@
         <w:rPr>
           <w:lang w:val="en-US" w:eastAsia="tr-TR"/>
         </w:rPr>
-        <w:t xml:space="preserve"> :</w:t>
-      </w:r>
-      <w:proofErr w:type="gramEnd"/>
-      <w:r>
-        <w:rPr>
-          <w:lang w:val="en-US" w:eastAsia="tr-TR"/>
-        </w:rPr>
-        <w:t xml:space="preserve"> Piri Reis University </w:t>
+        <w:t xml:space="preserve"> : Piri Reis University </w:t>
       </w:r>
     </w:p>
     <w:p>
@@ -10254,25 +9779,7 @@
           <w:bCs/>
           <w:lang w:val="en-US" w:eastAsia="tr-TR"/>
         </w:rPr>
-        <w:t xml:space="preserve">Professional </w:t>
-      </w:r>
-      <w:proofErr w:type="gramStart"/>
-      <w:r>
-        <w:rPr>
-          <w:b/>
-          <w:bCs/>
-          <w:lang w:val="en-US" w:eastAsia="tr-TR"/>
-        </w:rPr>
-        <w:t>skill</w:t>
-      </w:r>
-      <w:proofErr w:type="gramEnd"/>
-      <w:r>
-        <w:rPr>
-          <w:b/>
-          <w:bCs/>
-          <w:lang w:val="en-US" w:eastAsia="tr-TR"/>
-        </w:rPr>
-        <w:t>:</w:t>
+        <w:t>Professional skill:</w:t>
       </w:r>
     </w:p>
     <w:p>
@@ -10692,10 +10199,10 @@
       </w:pPr>
     </w:p>
     <w:sectPr>
-      <w:headerReference w:type="default" r:id="rId15"/>
-      <w:footerReference w:type="even" r:id="rId16"/>
-      <w:footerReference w:type="default" r:id="rId17"/>
-      <w:footerReference w:type="first" r:id="rId18"/>
+      <w:headerReference w:type="default" r:id="rId16"/>
+      <w:footerReference w:type="even" r:id="rId17"/>
+      <w:footerReference w:type="default" r:id="rId18"/>
+      <w:footerReference w:type="first" r:id="rId19"/>
       <w:footnotePr>
         <w:numFmt w:val="chicago"/>
       </w:footnotePr>
@@ -10827,15 +10334,7 @@
       <w:t>South African Journal of Industrial Engineering</w:t>
     </w:r>
     <w:r>
-      <w:t xml:space="preserve"> Month Year Vol _</w:t>
-    </w:r>
-    <w:proofErr w:type="gramStart"/>
-    <w:r>
-      <w:t>_(</w:t>
-    </w:r>
-    <w:proofErr w:type="gramEnd"/>
-    <w:r>
-      <w:t>_):  p1-3</w:t>
+      <w:t xml:space="preserve"> Month Year Vol __(_):  p1-3</w:t>
     </w:r>
   </w:p>
 </w:ftr>

</xml_diff>

<commit_message>
Add thesis conclusions section
</commit_message>
<xml_diff>
--- a/docs/graduation_thesis_report.docx
+++ b/docs/graduation_thesis_report.docx
@@ -315,6 +315,7 @@
         </w:rPr>
         <w:t>G</w:t>
       </w:r>
+      <w:proofErr w:type="spellStart"/>
       <w:r>
         <w:rPr>
           <w:b/>
@@ -323,7 +324,18 @@
           <w:szCs w:val="32"/>
           <w:lang w:val="tr-TR"/>
         </w:rPr>
-        <w:t>ülse Dolunay ÜNLÜ</w:t>
+        <w:t>ülse</w:t>
+      </w:r>
+      <w:proofErr w:type="spellEnd"/>
+      <w:r>
+        <w:rPr>
+          <w:b/>
+          <w:color w:val="000000" w:themeColor="text1"/>
+          <w:sz w:val="32"/>
+          <w:szCs w:val="32"/>
+          <w:lang w:val="tr-TR"/>
+        </w:rPr>
+        <w:t xml:space="preserve"> Dolunay ÜNLÜ</w:t>
       </w:r>
     </w:p>
     <w:p>
@@ -405,6 +417,7 @@
         </w:rPr>
         <w:t xml:space="preserve">Advisor: </w:t>
       </w:r>
+      <w:proofErr w:type="spellStart"/>
       <w:r>
         <w:rPr>
           <w:bCs/>
@@ -413,81 +426,9 @@
           <w:szCs w:val="32"/>
           <w:lang w:val="en-US"/>
         </w:rPr>
-        <w:t>Doç. Dr. Orhan Özgür AYBAR</w:t>
-      </w:r>
-    </w:p>
-    <w:p>
-      <w:pPr>
-        <w:jc w:val="center"/>
-        <w:rPr>
-          <w:bCs/>
-          <w:sz w:val="32"/>
-          <w:szCs w:val="32"/>
-          <w:lang w:val="en-US"/>
-        </w:rPr>
-      </w:pPr>
-    </w:p>
-    <w:p>
-      <w:pPr>
-        <w:jc w:val="center"/>
-        <w:rPr>
-          <w:bCs/>
-          <w:sz w:val="32"/>
-          <w:szCs w:val="32"/>
-          <w:lang w:val="en-US"/>
-        </w:rPr>
-      </w:pPr>
-    </w:p>
-    <w:p>
-      <w:pPr>
-        <w:jc w:val="center"/>
-        <w:rPr>
-          <w:bCs/>
-          <w:sz w:val="32"/>
-          <w:szCs w:val="32"/>
-          <w:lang w:val="en-US"/>
-        </w:rPr>
-      </w:pPr>
-    </w:p>
-    <w:p>
-      <w:pPr>
-        <w:jc w:val="center"/>
-        <w:rPr>
-          <w:bCs/>
-          <w:sz w:val="32"/>
-          <w:szCs w:val="32"/>
-          <w:lang w:val="en-US"/>
-        </w:rPr>
-      </w:pPr>
-    </w:p>
-    <w:p>
-      <w:pPr>
-        <w:jc w:val="center"/>
-        <w:rPr>
-          <w:bCs/>
-          <w:sz w:val="32"/>
-          <w:szCs w:val="32"/>
-          <w:lang w:val="en-US"/>
-        </w:rPr>
-      </w:pPr>
-      <w:r>
-        <w:rPr>
-          <w:bCs/>
-          <w:sz w:val="32"/>
-          <w:szCs w:val="32"/>
-          <w:lang w:val="en-US"/>
-        </w:rPr>
-        <w:t>İstanbul</w:t>
-      </w:r>
-      <w:r>
-        <w:rPr>
-          <w:bCs/>
-          <w:sz w:val="32"/>
-          <w:szCs w:val="32"/>
-          <w:lang w:val="en-US"/>
-        </w:rPr>
-        <w:t xml:space="preserve"> </w:t>
-      </w:r>
+        <w:t>Doç</w:t>
+      </w:r>
+      <w:proofErr w:type="spellEnd"/>
       <w:r>
         <w:rPr>
           <w:bCs/>
@@ -496,7 +437,80 @@
           <w:szCs w:val="32"/>
           <w:lang w:val="en-US"/>
         </w:rPr>
-        <w:t>May, 202</w:t>
+        <w:t>. Dr. Orhan Özgür AYBAR</w:t>
+      </w:r>
+    </w:p>
+    <w:p>
+      <w:pPr>
+        <w:jc w:val="center"/>
+        <w:rPr>
+          <w:bCs/>
+          <w:sz w:val="32"/>
+          <w:szCs w:val="32"/>
+          <w:lang w:val="en-US"/>
+        </w:rPr>
+      </w:pPr>
+    </w:p>
+    <w:p>
+      <w:pPr>
+        <w:jc w:val="center"/>
+        <w:rPr>
+          <w:bCs/>
+          <w:sz w:val="32"/>
+          <w:szCs w:val="32"/>
+          <w:lang w:val="en-US"/>
+        </w:rPr>
+      </w:pPr>
+    </w:p>
+    <w:p>
+      <w:pPr>
+        <w:jc w:val="center"/>
+        <w:rPr>
+          <w:bCs/>
+          <w:sz w:val="32"/>
+          <w:szCs w:val="32"/>
+          <w:lang w:val="en-US"/>
+        </w:rPr>
+      </w:pPr>
+    </w:p>
+    <w:p>
+      <w:pPr>
+        <w:jc w:val="center"/>
+        <w:rPr>
+          <w:bCs/>
+          <w:sz w:val="32"/>
+          <w:szCs w:val="32"/>
+          <w:lang w:val="en-US"/>
+        </w:rPr>
+      </w:pPr>
+    </w:p>
+    <w:p>
+      <w:pPr>
+        <w:jc w:val="center"/>
+        <w:rPr>
+          <w:bCs/>
+          <w:sz w:val="32"/>
+          <w:szCs w:val="32"/>
+          <w:lang w:val="en-US"/>
+        </w:rPr>
+      </w:pPr>
+      <w:r>
+        <w:rPr>
+          <w:bCs/>
+          <w:sz w:val="32"/>
+          <w:szCs w:val="32"/>
+          <w:lang w:val="en-US"/>
+        </w:rPr>
+        <w:t>İstanbul</w:t>
+      </w:r>
+      <w:r>
+        <w:rPr>
+          <w:bCs/>
+          <w:sz w:val="32"/>
+          <w:szCs w:val="32"/>
+          <w:lang w:val="en-US"/>
+        </w:rPr>
+        <w:t xml:space="preserve"> </w:t>
       </w:r>
       <w:r>
         <w:rPr>
@@ -506,6 +520,16 @@
           <w:szCs w:val="32"/>
           <w:lang w:val="en-US"/>
         </w:rPr>
+        <w:t>May, 202</w:t>
+      </w:r>
+      <w:r>
+        <w:rPr>
+          <w:bCs/>
+          <w:color w:val="000000" w:themeColor="text1"/>
+          <w:sz w:val="32"/>
+          <w:szCs w:val="32"/>
+          <w:lang w:val="en-US"/>
+        </w:rPr>
         <w:t>6</w:t>
       </w:r>
       <w:r>
@@ -540,7 +564,35 @@
         <w:rPr>
           <w:lang w:val="en-US"/>
         </w:rPr>
-        <w:t>I hereby declare that this thesis represents my own work which has been done after registration for the degree of bachelor at Piri Reis University, and has not been previously included in a thesis or dissertation submitted to this or any other institution for a degree, diploma or other qualifications.</w:t>
+        <w:t xml:space="preserve">I hereby declare that this thesis represents my own work which has been done after registration for the </w:t>
+      </w:r>
+      <w:proofErr w:type="gramStart"/>
+      <w:r>
+        <w:rPr>
+          <w:lang w:val="en-US"/>
+        </w:rPr>
+        <w:t>degree of bachelor</w:t>
+      </w:r>
+      <w:proofErr w:type="gramEnd"/>
+      <w:r>
+        <w:rPr>
+          <w:lang w:val="en-US"/>
+        </w:rPr>
+        <w:t xml:space="preserve"> at Piri Reis </w:t>
+      </w:r>
+      <w:proofErr w:type="gramStart"/>
+      <w:r>
+        <w:rPr>
+          <w:lang w:val="en-US"/>
+        </w:rPr>
+        <w:t>University, and</w:t>
+      </w:r>
+      <w:proofErr w:type="gramEnd"/>
+      <w:r>
+        <w:rPr>
+          <w:lang w:val="en-US"/>
+        </w:rPr>
+        <w:t xml:space="preserve"> has not been previously included in a thesis or dissertation submitted to this or any other institution for a degree, diploma or other qualifications.</w:t>
       </w:r>
     </w:p>
     <w:p>
@@ -1036,7 +1088,15 @@
     </w:p>
     <w:p>
       <w:r>
-        <w:t>Supply chains include many connected activities such as order management, shipment planning, inventory control, delivery tracking, regional performance monitoring, and demand planning. When these activities are analyzed separately, managers may have difficulty seeing operational problems and risks on time. This graduation thesis develops a Supply Chain Visibility and Risk Assessment Platform to support supply chain decision-making through data visualization, risk analysis, and dataset standardization.</w:t>
+        <w:t xml:space="preserve">Supply chains include many connected activities such as order management, shipment planning, inventory control, delivery tracking, regional performance monitoring, and demand planning. When these activities are </w:t>
+      </w:r>
+      <w:proofErr w:type="spellStart"/>
+      <w:r>
+        <w:t>analyzed</w:t>
+      </w:r>
+      <w:proofErr w:type="spellEnd"/>
+      <w:r>
+        <w:t xml:space="preserve"> separately, managers may have difficulty seeing operational problems and risks on time. This graduation thesis develops a Supply Chain Visibility and Risk Assessment Platform to support supply chain decision-making through data visualization, risk analysis, and dataset standardization.</w:t>
       </w:r>
     </w:p>
     <w:p>
@@ -1045,7 +1105,23 @@
       </w:r>
       <w:r>
         <w:br/>
-        <w:t>The platform was developed with Python and Streamlit. It uses the public DataCo Smart Supply Chain dataset as the default demonstration dataset. In addition, the system allows users to upload a new supply chain dataset in CSV or Excel format. The uploaded dataset can be mapped to a standard supply chain schema and then used dynamically across the dashboard pages. The platform includes modules for overview analysis, regional performance, inventory control, shipment performance, supply chain risk, and demand forecasting.</w:t>
+        <w:t xml:space="preserve">The platform was developed with Python and </w:t>
+      </w:r>
+      <w:proofErr w:type="spellStart"/>
+      <w:r>
+        <w:t>Streamlit</w:t>
+      </w:r>
+      <w:proofErr w:type="spellEnd"/>
+      <w:r>
+        <w:t xml:space="preserve">. It uses the public </w:t>
+      </w:r>
+      <w:proofErr w:type="spellStart"/>
+      <w:r>
+        <w:t>DataCo</w:t>
+      </w:r>
+      <w:proofErr w:type="spellEnd"/>
+      <w:r>
+        <w:t xml:space="preserve"> Smart Supply Chain dataset as the default demonstration dataset. In addition, the system allows users to upload a new supply chain dataset in CSV or Excel format. The uploaded dataset can be mapped to a standard supply chain schema and then used dynamically across the dashboard pages. The platform includes modules for overview analysis, regional performance, inventory control, shipment performance, supply chain risk, and demand forecasting.</w:t>
       </w:r>
     </w:p>
     <w:p>
@@ -1074,7 +1150,15 @@
       </w:r>
       <w:r>
         <w:br/>
-        <w:t>Key Words: Supply Chain Visibility, Risk Assessment, Data Standardization, Streamlit Dashboard, Business Intelligence, Demand Forecasting</w:t>
+        <w:t xml:space="preserve">Key Words: Supply Chain Visibility, Risk Assessment, Data Standardization, </w:t>
+      </w:r>
+      <w:proofErr w:type="spellStart"/>
+      <w:r>
+        <w:t>Streamlit</w:t>
+      </w:r>
+      <w:proofErr w:type="spellEnd"/>
+      <w:r>
+        <w:t xml:space="preserve"> Dashboard, Business Intelligence, Demand Forecasting</w:t>
       </w:r>
     </w:p>
     <w:p>
@@ -3815,7 +3899,15 @@
     <w:p/>
     <w:p>
       <w:r>
-        <w:t>In this project, supply chain visibility is addressed through a multi-page dashboard structure. The platform brings different operational views together, including overview indicators, regional performance, inventory control, shipment performance, risk analysis, and demand forecasting. This supports the idea that supply chain visibility should not focus on only one metric, but should combine different operational indicators.</w:t>
+        <w:t xml:space="preserve">In this project, supply chain visibility is addressed through a multi-page dashboard structure. The platform brings different operational views together, including overview indicators, regional performance, inventory control, shipment performance, risk analysis, and demand forecasting. This supports the idea that supply chain visibility should not focus on only one </w:t>
+      </w:r>
+      <w:proofErr w:type="gramStart"/>
+      <w:r>
+        <w:t>metric, but</w:t>
+      </w:r>
+      <w:proofErr w:type="gramEnd"/>
+      <w:r>
+        <w:t xml:space="preserve"> should combine different operational indicators.</w:t>
       </w:r>
     </w:p>
     <w:p/>
@@ -3830,7 +3922,15 @@
     </w:p>
     <w:p>
       <w:r>
-        <w:t>Business intelligence dashboards are used to transform raw data into visual and understandable information. Instead of analyzing large tables manually, users can monitor key performance indicators, charts, and summary tables through an interactive interface. Dashboards are especially useful in operational areas where managers need to make quick and data-based decisions. [INSERT CITATION: Business Intelligence Dashboards]</w:t>
+        <w:t xml:space="preserve">Business intelligence dashboards are used to transform raw data into visual and understandable information. Instead of </w:t>
+      </w:r>
+      <w:proofErr w:type="spellStart"/>
+      <w:r>
+        <w:t>analyzing</w:t>
+      </w:r>
+      <w:proofErr w:type="spellEnd"/>
+      <w:r>
+        <w:t xml:space="preserve"> large tables manually, users can monitor key performance indicators, charts, and summary tables through an interactive interface. Dashboards are especially useful in operational areas where managers need to make quick and data-based decisions. [INSERT CITATION: Business Intelligence Dashboards]</w:t>
       </w:r>
     </w:p>
     <w:p/>
@@ -3868,7 +3968,15 @@
     <w:p/>
     <w:p>
       <w:r>
-        <w:t>In this project, supply chain risk is calculated using rule-based and interpretable indicators. The system analyzes delivery risk, delay risk, inventory risk, demand volatility risk, and region-level risk. The purpose is not to create a complex black-box prediction model, but to provide a clear and understandable risk assessment structure for decision support.</w:t>
+        <w:t xml:space="preserve">In this project, supply chain risk is calculated using rule-based and interpretable indicators. The system </w:t>
+      </w:r>
+      <w:proofErr w:type="spellStart"/>
+      <w:r>
+        <w:t>analyzes</w:t>
+      </w:r>
+      <w:proofErr w:type="spellEnd"/>
+      <w:r>
+        <w:t xml:space="preserve"> delivery risk, delay risk, inventory risk, demand volatility risk, and region-level risk. The purpose is not to create a complex black-box prediction model, but to provide a clear and understandable risk assessment structure for decision support.</w:t>
       </w:r>
     </w:p>
     <w:p/>
@@ -3882,7 +3990,15 @@
     </w:p>
     <w:p>
       <w:r>
-        <w:t>Digital transformation in logistics and supply chain management is closely related to the use of data, automation, analytics, and connected systems. Digital tools can improve transparency by collecting and analyzing operational data from different stages of the supply chain. This can support better planning, faster decision-making, and improved coordination between supply chain activities. [INSERT CITATION: Digital Transformation in Logistics]</w:t>
+        <w:t xml:space="preserve">Digital transformation in logistics and supply chain management is closely related to the use of data, automation, analytics, and connected systems. Digital tools can improve transparency by collecting and </w:t>
+      </w:r>
+      <w:proofErr w:type="spellStart"/>
+      <w:r>
+        <w:t>analyzing</w:t>
+      </w:r>
+      <w:proofErr w:type="spellEnd"/>
+      <w:r>
+        <w:t xml:space="preserve"> operational data from different stages of the supply chain. This can support better planning, faster decision-making, and improved coordination between supply chain activities. [INSERT CITATION: Digital Transformation in Logistics]</w:t>
       </w:r>
     </w:p>
     <w:p/>
@@ -3947,7 +4063,15 @@
     <w:p/>
     <w:p>
       <w:r>
-        <w:t>The dataset upload feature improves the originality and usefulness of the project. The default DataCo dataset is used as a demonstration dataset, but the system can also process new supply chain datasets. After the user maps the uploaded dataset to the standard schema, the dashboard pages are generated dynamically based on the active dataset. This makes the platform more reusable for different supply chain data sources.</w:t>
+        <w:t xml:space="preserve">The dataset upload feature improves the originality and usefulness of the project. The default </w:t>
+      </w:r>
+      <w:proofErr w:type="spellStart"/>
+      <w:r>
+        <w:t>DataCo</w:t>
+      </w:r>
+      <w:proofErr w:type="spellEnd"/>
+      <w:r>
+        <w:t xml:space="preserve"> dataset is used as a demonstration dataset, but the system can also process new supply chain datasets. After the user maps the uploaded dataset to the standard schema, the dashboard pages are generated dynamically based on the active dataset. This makes the platform more reusable for different supply chain data sources.</w:t>
       </w:r>
     </w:p>
     <w:p/>
@@ -3967,7 +4091,15 @@
     <w:p/>
     <w:p>
       <w:r>
-        <w:t>Based on these ideas, this project develops a dataset-adaptive supply chain visibility and risk assessment platform. The platform combines dashboard visualization, uploaded dataset support, data standardization, risk scoring, and demand forecasting in a single Streamlit-based system.</w:t>
+        <w:t xml:space="preserve">Based on these ideas, this project develops a dataset-adaptive supply chain visibility and risk assessment platform. The platform combines dashboard visualization, uploaded dataset support, data standardization, risk scoring, and demand forecasting in a single </w:t>
+      </w:r>
+      <w:proofErr w:type="spellStart"/>
+      <w:r>
+        <w:t>Streamlit</w:t>
+      </w:r>
+      <w:proofErr w:type="spellEnd"/>
+      <w:r>
+        <w:t>-based system.</w:t>
       </w:r>
     </w:p>
     <w:p/>
@@ -3988,7 +4120,15 @@
         <w:t>The</w:t>
       </w:r>
       <w:r>
-        <w:t xml:space="preserve"> originality of this study comes from developing a supply chain dashboard platform that is not limited to one fixed dataset. Many dashboard projects are designed only for a single prepared dataset. In this project, the DataCo Smart Supply Chain dataset is used as the default demonstration dataset, but the platform also allows users to upload a new supply chain dataset in CSV or Excel format.</w:t>
+        <w:t xml:space="preserve"> originality of this study comes from developing a supply chain dashboard platform that is not limited to one fixed dataset. Many dashboard projects are designed only for a single prepared dataset. In this project, the </w:t>
+      </w:r>
+      <w:proofErr w:type="spellStart"/>
+      <w:r>
+        <w:t>DataCo</w:t>
+      </w:r>
+      <w:proofErr w:type="spellEnd"/>
+      <w:r>
+        <w:t xml:space="preserve"> Smart Supply Chain dataset is used as the default demonstration dataset, but the platform also allows users to upload a new supply chain dataset in CSV or Excel format.</w:t>
       </w:r>
     </w:p>
     <w:p>
@@ -4028,7 +4168,15 @@
       </w:r>
       <w:r>
         <w:br/>
-        <w:t>The project is original within its academic scope because it combines data upload, schema mapping, data standardization, dynamic dashboard generation, risk analysis, and forecasting in a single Streamlit-based system. Therefore, the main contribution of the project is the development of a reusable supply chain visibility and risk assessment platform that can work with both a default dataset and user-uploaded datasets.</w:t>
+        <w:t xml:space="preserve">The project is original within its academic scope because it combines data upload, schema mapping, data standardization, dynamic dashboard generation, risk analysis, and forecasting in a single </w:t>
+      </w:r>
+      <w:proofErr w:type="spellStart"/>
+      <w:r>
+        <w:t>Streamlit</w:t>
+      </w:r>
+      <w:proofErr w:type="spellEnd"/>
+      <w:r>
+        <w:t>-based system. Therefore, the main contribution of the project is the development of a reusable supply chain visibility and risk assessment platform that can work with both a default dataset and user-uploaded datasets.</w:t>
       </w:r>
     </w:p>
     <w:p/>
@@ -4044,7 +4192,15 @@
     </w:p>
     <w:p>
       <w:r>
-        <w:t>Supply chain operations produce large amounts of data related to orders, products, shipments, delivery performance, inventory, regions, sales, and demand. However, this data is often stored in different files, systems, or formats. When the data is not standardized and analyzed together, it becomes difficult for managers to understand the overall performance of the supply chain.</w:t>
+        <w:t xml:space="preserve">Supply chain operations produce large amounts of data related to orders, products, shipments, delivery performance, inventory, regions, sales, and demand. However, this data is often stored in different files, systems, or formats. When the data is not standardized and </w:t>
+      </w:r>
+      <w:proofErr w:type="spellStart"/>
+      <w:r>
+        <w:t>analyzed</w:t>
+      </w:r>
+      <w:proofErr w:type="spellEnd"/>
+      <w:r>
+        <w:t xml:space="preserve"> together, it becomes difficult for managers to understand the overall performance of the supply chain.</w:t>
       </w:r>
     </w:p>
     <w:p>
@@ -4062,7 +4218,15 @@
       </w:r>
       <w:r>
         <w:br/>
-        <w:t>Another problem is that many dashboard systems are designed for a single prepared dataset. If a new dataset has different column names or a different structure, the dashboard may not work without manual code changes. This limits the reusability of the system. For example, one dataset may use “order date,” while another dataset may use “PO created date” for the same concept. Without a standard mapping and transformation process, these datasets cannot be analyzed through the same dashboard structure.</w:t>
+        <w:t xml:space="preserve">Another problem is that many dashboard systems are designed for a single prepared dataset. If a new dataset has different column names or a different structure, the dashboard may not work without manual code changes. This limits the reusability of the system. For example, one dataset may use “order date,” while another dataset may use “PO created date” for the same concept. Without a standard mapping and transformation process, these datasets cannot be </w:t>
+      </w:r>
+      <w:proofErr w:type="spellStart"/>
+      <w:r>
+        <w:t>analyzed</w:t>
+      </w:r>
+      <w:proofErr w:type="spellEnd"/>
+      <w:r>
+        <w:t xml:space="preserve"> through the same dashboard structure.</w:t>
       </w:r>
     </w:p>
     <w:p>
@@ -4096,7 +4260,15 @@
     </w:p>
     <w:p>
       <w:r>
-        <w:t>The solution approach of this project is based on developing a dataset-adaptive supply chain dashboard platform. The system is designed to work with a default demonstration dataset and also with user-uploaded supply chain datasets. The main idea is to transform different supply chain datasets into a common analytical structure and then generate dashboard modules from the active dataset.</w:t>
+        <w:t xml:space="preserve">The solution approach of this project is based on developing a dataset-adaptive supply chain dashboard platform. The system is designed to work with a default demonstration dataset </w:t>
+      </w:r>
+      <w:proofErr w:type="gramStart"/>
+      <w:r>
+        <w:t>and also</w:t>
+      </w:r>
+      <w:proofErr w:type="gramEnd"/>
+      <w:r>
+        <w:t xml:space="preserve"> with user-uploaded supply chain datasets. The main idea is to transform different supply chain datasets into a common analytical structure and then generate dashboard modules from the active dataset.</w:t>
       </w:r>
     </w:p>
     <w:p>
@@ -4119,7 +4291,15 @@
       </w:r>
       <w:r>
         <w:br/>
-        <w:t>The platform uses the DataCo Smart Supply Chain dataset as the default dataset. This dataset is processed into different analytical tables such as orders, products, shipments, inventory, demand, and risk scores. These tables are used by the default dashboard when no uploaded dataset is active.</w:t>
+        <w:t xml:space="preserve">The platform uses the </w:t>
+      </w:r>
+      <w:proofErr w:type="spellStart"/>
+      <w:r>
+        <w:t>DataCo</w:t>
+      </w:r>
+      <w:proofErr w:type="spellEnd"/>
+      <w:r>
+        <w:t xml:space="preserve"> Smart Supply Chain dataset as the default dataset. This dataset is processed into different analytical tables such as orders, products, shipments, inventory, demand, and risk scores. These tables are used by the default dashboard when no uploaded dataset is active.</w:t>
       </w:r>
     </w:p>
     <w:p>
@@ -4180,7 +4360,23 @@
     </w:p>
     <w:p>
       <w:r>
-        <w:t>After the dataset is standardized, the dashboard pages are generated from the active dataset. If no uploaded dataset is active, the dashboard uses the default DataCo dataset. If the user uploads and activates a new dataset, all dashboard pages use the uploaded dataset during the active Streamlit session.</w:t>
+        <w:t xml:space="preserve">After the dataset is standardized, the dashboard pages are generated from the active dataset. If no uploaded dataset is active, the dashboard uses the default </w:t>
+      </w:r>
+      <w:proofErr w:type="spellStart"/>
+      <w:r>
+        <w:t>DataCo</w:t>
+      </w:r>
+      <w:proofErr w:type="spellEnd"/>
+      <w:r>
+        <w:t xml:space="preserve"> dataset. If the user uploads and activates a new dataset, all dashboard pages use the uploaded dataset during the active </w:t>
+      </w:r>
+      <w:proofErr w:type="spellStart"/>
+      <w:r>
+        <w:t>Streamlit</w:t>
+      </w:r>
+      <w:proofErr w:type="spellEnd"/>
+      <w:r>
+        <w:t xml:space="preserve"> session.</w:t>
       </w:r>
     </w:p>
     <w:p>
@@ -4189,7 +4385,23 @@
       </w:r>
       <w:r>
         <w:br/>
-        <w:t>The dashboard includes six main modules: Overview, Regional Performance, Inventory Control, Shipment Performance, Supply Chain Risk, and Demand Forecast. Each module focuses on a different part of supply chain visibility. The Overview page shows general KPIs and summary charts. The Regional Performance page compares markets and regions. The Inventory Control page shows generated inventory indicators. The Shipment Performance page analyzes delivery and delay performance. The Supply Chain Risk page calculates risk indicators. The Demand Forecast page analyzes historical demand and creates simple forecasts.</w:t>
+        <w:t xml:space="preserve">The dashboard includes six main modules: Overview, Regional Performance, Inventory Control, Shipment Performance, Supply Chain Risk, and Demand Forecast. Each module focuses on a different part of supply chain visibility. The Overview page shows general KPIs and summary charts. The Regional Performance page compares markets and regions. The Inventory Control page shows generated inventory indicators. The Shipment Performance page </w:t>
+      </w:r>
+      <w:proofErr w:type="spellStart"/>
+      <w:r>
+        <w:t>analyzes</w:t>
+      </w:r>
+      <w:proofErr w:type="spellEnd"/>
+      <w:r>
+        <w:t xml:space="preserve"> delivery and delay performance. The Supply Chain Risk page calculates risk indicators. The Demand Forecast page </w:t>
+      </w:r>
+      <w:proofErr w:type="spellStart"/>
+      <w:r>
+        <w:t>analyzes</w:t>
+      </w:r>
+      <w:proofErr w:type="spellEnd"/>
+      <w:r>
+        <w:t xml:space="preserve"> historical demand and creates simple forecasts.</w:t>
       </w:r>
     </w:p>
     <w:p>
@@ -4198,7 +4410,15 @@
       </w:r>
       <w:r>
         <w:br/>
-        <w:t>This structure allows the system to work as a flexible platform instead of a static dashboard. The same dashboard pages can be used with different supply chain datasets as long as the required fields are mapped correctly.</w:t>
+        <w:t xml:space="preserve">This structure allows the system to work as a flexible platform instead of a static dashboard. The same dashboard pages can be used with different supply chain datasets </w:t>
+      </w:r>
+      <w:proofErr w:type="gramStart"/>
+      <w:r>
+        <w:t>as long as</w:t>
+      </w:r>
+      <w:proofErr w:type="gramEnd"/>
+      <w:r>
+        <w:t xml:space="preserve"> the required fields are mapped correctly.</w:t>
       </w:r>
     </w:p>
     <w:p/>
@@ -4299,7 +4519,15 @@
     <w:p>
       <w:r>
         <w:br/>
-        <w:t>The project was developed as a local Streamlit application. A Windows batch file was also created to make the project easier to run. This file automatically creates the virtual environment if needed, installs the required packages, processes the default dataset, and starts the dashboard.</w:t>
+        <w:t xml:space="preserve">The project was developed as a local </w:t>
+      </w:r>
+      <w:proofErr w:type="spellStart"/>
+      <w:r>
+        <w:t>Streamlit</w:t>
+      </w:r>
+      <w:proofErr w:type="spellEnd"/>
+      <w:r>
+        <w:t xml:space="preserve"> application. A Windows batch file was also created to make the project easier to run. This file automatically creates the virtual environment if needed, installs the required packages, processes the default dataset, and starts the dashboard.</w:t>
       </w:r>
     </w:p>
     <w:p/>
@@ -4313,7 +4541,15 @@
     </w:p>
     <w:p>
       <w:r>
-        <w:t>pandas was used for reading CSV and Excel files, cleaning the dataset, grouping records, calculating KPIs, and creating analytical tables. NumPy was used for numerical calculations and handling missing numerical values.</w:t>
+        <w:t xml:space="preserve">pandas </w:t>
+      </w:r>
+      <w:proofErr w:type="gramStart"/>
+      <w:r>
+        <w:t>was</w:t>
+      </w:r>
+      <w:proofErr w:type="gramEnd"/>
+      <w:r>
+        <w:t xml:space="preserve"> used for reading CSV and Excel files, cleaning the dataset, grouping records, calculating KPIs, and creating analytical tables. NumPy was used for numerical calculations and handling missing numerical values.</w:t>
       </w:r>
       <w:r>
         <w:br/>
@@ -4335,8 +4571,13 @@
       </w:r>
     </w:p>
     <w:p>
-      <w:r>
-        <w:t>Streamlit was used to develop the interactive dashboard interface. It allowed the project to include different pages, filters, file upload components, KPI cards, charts, and tables.</w:t>
+      <w:proofErr w:type="spellStart"/>
+      <w:r>
+        <w:t>Streamlit</w:t>
+      </w:r>
+      <w:proofErr w:type="spellEnd"/>
+      <w:r>
+        <w:t xml:space="preserve"> was used to develop the interactive dashboard interface. It allowed the project to include different pages, filters, file upload components, KPI cards, charts, and tables.</w:t>
       </w:r>
     </w:p>
     <w:p>
@@ -4539,9 +4780,11 @@
             <w:tcW w:w="1250" w:type="pct"/>
           </w:tcPr>
           <w:p>
+            <w:proofErr w:type="spellStart"/>
             <w:r>
               <w:t>Streamlit</w:t>
             </w:r>
+            <w:proofErr w:type="spellEnd"/>
           </w:p>
         </w:tc>
         <w:tc>
@@ -4841,7 +5084,15 @@
     </w:p>
     <w:p>
       <w:r>
-        <w:t>This section explains the technical development of the Supply Chain Visibility and Risk Assessment Platform. The system was designed as a dataset-adaptive dashboard platform. It can work with the default DataCo dataset, and it can also process user-uploaded supply chain datasets through column mapping and data standardization.</w:t>
+        <w:t xml:space="preserve">This section explains the technical development of the Supply Chain Visibility and Risk Assessment Platform. The system was designed as a dataset-adaptive dashboard platform. It can work with the default </w:t>
+      </w:r>
+      <w:proofErr w:type="spellStart"/>
+      <w:r>
+        <w:t>DataCo</w:t>
+      </w:r>
+      <w:proofErr w:type="spellEnd"/>
+      <w:r>
+        <w:t xml:space="preserve"> dataset, and it can also process user-uploaded supply chain datasets through column mapping and data standardization.</w:t>
       </w:r>
       <w:r>
         <w:br/>
@@ -4864,14 +5115,30 @@
     </w:p>
     <w:p>
       <w:r>
-        <w:t>The platform consists of several connected layers. The first layer is the data source layer. This layer includes the default DataCo dataset and user-uploaded CSV or Excel datasets. The second layer is the Data Source Manager, where the user can upload a new dataset and select the active data source. The third layer is the column mapping and data adapter layer. This layer converts different dataset structures into a common supply chain schema.</w:t>
+        <w:t xml:space="preserve">The platform consists of several connected layers. The first layer is the data source layer. This layer includes the default </w:t>
+      </w:r>
+      <w:proofErr w:type="spellStart"/>
+      <w:r>
+        <w:t>DataCo</w:t>
+      </w:r>
+      <w:proofErr w:type="spellEnd"/>
+      <w:r>
+        <w:t xml:space="preserve"> dataset and user-uploaded CSV or Excel datasets. The second layer is the Data Source Manager, where the user can upload a new dataset and select the active data source. The third layer is the column mapping and data adapter layer. This layer converts different dataset structures into a common supply chain schema.</w:t>
       </w:r>
       <w:r>
         <w:br/>
       </w:r>
       <w:r>
         <w:br/>
-        <w:t>After the data is standardized, the system creates dashboard-ready analytical tables such as orders, products, shipments, inventory, demand, and risk scores. These tables are then used by the Streamlit dashboard modules. The main dashboard modules are Overview, Regional Performance, Inventory Control, Shipment Performance, Supply Chain Risk, and Demand Forecast.</w:t>
+        <w:t xml:space="preserve">After the data is standardized, the system creates dashboard-ready analytical tables such as orders, products, shipments, inventory, demand, and risk scores. These tables are then used by the </w:t>
+      </w:r>
+      <w:proofErr w:type="spellStart"/>
+      <w:r>
+        <w:t>Streamlit</w:t>
+      </w:r>
+      <w:proofErr w:type="spellEnd"/>
+      <w:r>
+        <w:t xml:space="preserve"> dashboard modules. The main dashboard modules are Overview, Regional Performance, Inventory Control, Shipment Performance, Supply Chain Risk, and Demand Forecast.</w:t>
       </w:r>
     </w:p>
     <w:p>
@@ -5007,7 +5274,49 @@
         <w:rPr>
           <w:lang w:val="en-ZA"/>
         </w:rPr>
-        <w:t>The Data Source Manager is the main component that makes the platform reusable. When the dashboard is opened, the default DataCo dataset is active. If the user wants to analyze another supply chain dataset, the user can upload a CSV or Excel file from the Data Source Manager on the Overview page.</w:t>
+        <w:t xml:space="preserve">The Data Source Manager is the main component that makes the platform reusable. When the dashboard </w:t>
+      </w:r>
+      <w:proofErr w:type="gramStart"/>
+      <w:r>
+        <w:rPr>
+          <w:lang w:val="en-ZA"/>
+        </w:rPr>
+        <w:t>is opened</w:t>
+      </w:r>
+      <w:proofErr w:type="gramEnd"/>
+      <w:r>
+        <w:rPr>
+          <w:lang w:val="en-ZA"/>
+        </w:rPr>
+        <w:t xml:space="preserve">, the default </w:t>
+      </w:r>
+      <w:proofErr w:type="spellStart"/>
+      <w:r>
+        <w:rPr>
+          <w:lang w:val="en-ZA"/>
+        </w:rPr>
+        <w:t>DataCo</w:t>
+      </w:r>
+      <w:proofErr w:type="spellEnd"/>
+      <w:r>
+        <w:rPr>
+          <w:lang w:val="en-ZA"/>
+        </w:rPr>
+        <w:t xml:space="preserve"> dataset is active. If the user wants to </w:t>
+      </w:r>
+      <w:proofErr w:type="spellStart"/>
+      <w:r>
+        <w:rPr>
+          <w:lang w:val="en-ZA"/>
+        </w:rPr>
+        <w:t>analyze</w:t>
+      </w:r>
+      <w:proofErr w:type="spellEnd"/>
+      <w:r>
+        <w:rPr>
+          <w:lang w:val="en-ZA"/>
+        </w:rPr>
+        <w:t xml:space="preserve"> another supply chain dataset, the user can upload a CSV or Excel file from the Data Source Manager on the Overview page.</w:t>
       </w:r>
     </w:p>
     <w:p>
@@ -5047,7 +5356,49 @@
         <w:rPr>
           <w:lang w:val="en-ZA"/>
         </w:rPr>
-        <w:t>The uploaded dataset is used during the active Streamlit session. If the user activates the uploaded dataset, all dashboard pages use the uploaded data. If the user wants to return to the default dataset, the Data Source Manager provides an option to return to the default DataCo dataset.</w:t>
+        <w:t xml:space="preserve">The uploaded dataset </w:t>
+      </w:r>
+      <w:proofErr w:type="gramStart"/>
+      <w:r>
+        <w:rPr>
+          <w:lang w:val="en-ZA"/>
+        </w:rPr>
+        <w:t>is used</w:t>
+      </w:r>
+      <w:proofErr w:type="gramEnd"/>
+      <w:r>
+        <w:rPr>
+          <w:lang w:val="en-ZA"/>
+        </w:rPr>
+        <w:t xml:space="preserve"> during the active </w:t>
+      </w:r>
+      <w:proofErr w:type="spellStart"/>
+      <w:r>
+        <w:rPr>
+          <w:lang w:val="en-ZA"/>
+        </w:rPr>
+        <w:t>Streamlit</w:t>
+      </w:r>
+      <w:proofErr w:type="spellEnd"/>
+      <w:r>
+        <w:rPr>
+          <w:lang w:val="en-ZA"/>
+        </w:rPr>
+        <w:t xml:space="preserve"> session. If the user activates the uploaded dataset, all dashboard pages use the uploaded data. If the user wants to return to the default dataset, the Data Source Manager provides an option to return to the default </w:t>
+      </w:r>
+      <w:proofErr w:type="spellStart"/>
+      <w:r>
+        <w:rPr>
+          <w:lang w:val="en-ZA"/>
+        </w:rPr>
+        <w:t>DataCo</w:t>
+      </w:r>
+      <w:proofErr w:type="spellEnd"/>
+      <w:r>
+        <w:rPr>
+          <w:lang w:val="en-ZA"/>
+        </w:rPr>
+        <w:t xml:space="preserve"> dataset.</w:t>
       </w:r>
     </w:p>
     <w:p>
@@ -5110,27 +5461,97 @@
         <w:rPr>
           <w:lang w:val="en-ZA"/>
         </w:rPr>
-        <w:t>The standard data schema defines the common structure used by the platform. The uploaded dataset must be mapped to this schema before it can be used by the dashboard pages. Some fields are required, while others are optional. Required fields are necessary for basic dashboard generation. Optional fields improve the quality of risk analysis, shipment performance analysis, and financial indicators.</w:t>
-      </w:r>
-    </w:p>
-    <w:p>
-      <w:pPr>
-        <w:rPr>
-          <w:lang w:val="en-ZA"/>
-        </w:rPr>
-      </w:pPr>
-    </w:p>
-    <w:p>
-      <w:pPr>
-        <w:rPr>
-          <w:lang w:val="en-ZA"/>
-        </w:rPr>
-      </w:pPr>
-      <w:r>
-        <w:rPr>
-          <w:lang w:val="en-ZA"/>
-        </w:rPr>
-        <w:t>The standard schema used in the platform is shown in Table 2.</w:t>
+        <w:t xml:space="preserve">The standard data schema defines the common structure used by the platform. The uploaded dataset must </w:t>
+      </w:r>
+      <w:proofErr w:type="gramStart"/>
+      <w:r>
+        <w:rPr>
+          <w:lang w:val="en-ZA"/>
+        </w:rPr>
+        <w:t>be mapped</w:t>
+      </w:r>
+      <w:proofErr w:type="gramEnd"/>
+      <w:r>
+        <w:rPr>
+          <w:lang w:val="en-ZA"/>
+        </w:rPr>
+        <w:t xml:space="preserve"> to this schema before it can </w:t>
+      </w:r>
+      <w:proofErr w:type="gramStart"/>
+      <w:r>
+        <w:rPr>
+          <w:lang w:val="en-ZA"/>
+        </w:rPr>
+        <w:t>be used</w:t>
+      </w:r>
+      <w:proofErr w:type="gramEnd"/>
+      <w:r>
+        <w:rPr>
+          <w:lang w:val="en-ZA"/>
+        </w:rPr>
+        <w:t xml:space="preserve"> by the dashboard pages. </w:t>
+      </w:r>
+      <w:proofErr w:type="gramStart"/>
+      <w:r>
+        <w:rPr>
+          <w:lang w:val="en-ZA"/>
+        </w:rPr>
+        <w:t>Some</w:t>
+      </w:r>
+      <w:proofErr w:type="gramEnd"/>
+      <w:r>
+        <w:rPr>
+          <w:lang w:val="en-ZA"/>
+        </w:rPr>
+        <w:t xml:space="preserve"> fields </w:t>
+      </w:r>
+      <w:proofErr w:type="gramStart"/>
+      <w:r>
+        <w:rPr>
+          <w:lang w:val="en-ZA"/>
+        </w:rPr>
+        <w:t>are required</w:t>
+      </w:r>
+      <w:proofErr w:type="gramEnd"/>
+      <w:r>
+        <w:rPr>
+          <w:lang w:val="en-ZA"/>
+        </w:rPr>
+        <w:t>, while others are optional. Required fields are necessary for basic dashboard generation. Optional fields improve the quality of risk analysis, shipment performance analysis, and financial indicators.</w:t>
+      </w:r>
+    </w:p>
+    <w:p>
+      <w:pPr>
+        <w:rPr>
+          <w:lang w:val="en-ZA"/>
+        </w:rPr>
+      </w:pPr>
+    </w:p>
+    <w:p>
+      <w:pPr>
+        <w:rPr>
+          <w:lang w:val="en-ZA"/>
+        </w:rPr>
+      </w:pPr>
+      <w:r>
+        <w:rPr>
+          <w:lang w:val="en-ZA"/>
+        </w:rPr>
+        <w:t xml:space="preserve">The standard schema used in the platform </w:t>
+      </w:r>
+      <w:proofErr w:type="gramStart"/>
+      <w:r>
+        <w:rPr>
+          <w:lang w:val="en-ZA"/>
+        </w:rPr>
+        <w:t>is shown</w:t>
+      </w:r>
+      <w:proofErr w:type="gramEnd"/>
+      <w:r>
+        <w:rPr>
+          <w:lang w:val="en-ZA"/>
+        </w:rPr>
+        <w:t xml:space="preserve"> in Table 2.</w:t>
       </w:r>
       <w:r>
         <w:rPr>
@@ -5254,12 +5675,14 @@
                 <w:lang w:val="en-ZA"/>
               </w:rPr>
             </w:pPr>
+            <w:proofErr w:type="spellStart"/>
             <w:r>
               <w:rPr>
                 <w:lang w:val="en-ZA"/>
               </w:rPr>
               <w:t>order_id</w:t>
             </w:r>
+            <w:proofErr w:type="spellEnd"/>
           </w:p>
         </w:tc>
         <w:tc>
@@ -5294,7 +5717,21 @@
               <w:rPr>
                 <w:lang w:val="en-ZA"/>
               </w:rPr>
-              <w:t>Unique orderor transaction identifier</w:t>
+              <w:t xml:space="preserve">Unique </w:t>
+            </w:r>
+            <w:proofErr w:type="spellStart"/>
+            <w:r>
+              <w:rPr>
+                <w:lang w:val="en-ZA"/>
+              </w:rPr>
+              <w:t>orderor</w:t>
+            </w:r>
+            <w:proofErr w:type="spellEnd"/>
+            <w:r>
+              <w:rPr>
+                <w:lang w:val="en-ZA"/>
+              </w:rPr>
+              <w:t xml:space="preserve"> transaction identifier</w:t>
             </w:r>
           </w:p>
         </w:tc>
@@ -5310,12 +5747,14 @@
                 <w:lang w:val="en-ZA"/>
               </w:rPr>
             </w:pPr>
+            <w:proofErr w:type="spellStart"/>
             <w:r>
               <w:rPr>
                 <w:lang w:val="en-ZA"/>
               </w:rPr>
               <w:t>order_date</w:t>
             </w:r>
+            <w:proofErr w:type="spellEnd"/>
           </w:p>
         </w:tc>
         <w:tc>
@@ -5350,8 +5789,16 @@
               <w:rPr>
                 <w:lang w:val="en-ZA"/>
               </w:rPr>
-              <w:t>Date when the order was created</w:t>
-            </w:r>
+              <w:t xml:space="preserve">Date when the order </w:t>
+            </w:r>
+            <w:proofErr w:type="gramStart"/>
+            <w:r>
+              <w:rPr>
+                <w:lang w:val="en-ZA"/>
+              </w:rPr>
+              <w:t>was created</w:t>
+            </w:r>
+            <w:proofErr w:type="gramEnd"/>
           </w:p>
         </w:tc>
       </w:tr>
@@ -5366,12 +5813,14 @@
                 <w:lang w:val="en-ZA"/>
               </w:rPr>
             </w:pPr>
+            <w:proofErr w:type="spellStart"/>
             <w:r>
               <w:rPr>
                 <w:lang w:val="en-ZA"/>
               </w:rPr>
               <w:t>product_name</w:t>
             </w:r>
+            <w:proofErr w:type="spellEnd"/>
           </w:p>
         </w:tc>
         <w:tc>
@@ -5422,12 +5871,14 @@
                 <w:lang w:val="en-ZA"/>
               </w:rPr>
             </w:pPr>
+            <w:proofErr w:type="spellStart"/>
             <w:r>
               <w:rPr>
                 <w:lang w:val="en-ZA"/>
               </w:rPr>
               <w:t>category_name</w:t>
             </w:r>
+            <w:proofErr w:type="spellEnd"/>
           </w:p>
         </w:tc>
         <w:tc>
@@ -5478,9 +5929,11 @@
                 <w:lang w:val="en-ZA"/>
               </w:rPr>
             </w:pPr>
+            <w:proofErr w:type="spellStart"/>
             <w:r>
               <w:t>order_quantity</w:t>
             </w:r>
+            <w:proofErr w:type="spellEnd"/>
           </w:p>
         </w:tc>
         <w:tc>
@@ -5528,9 +5981,11 @@
                 <w:lang w:val="en-ZA"/>
               </w:rPr>
             </w:pPr>
+            <w:proofErr w:type="spellStart"/>
             <w:r>
               <w:t>shipping_date</w:t>
             </w:r>
+            <w:proofErr w:type="spellEnd"/>
           </w:p>
         </w:tc>
         <w:tc>
@@ -5578,9 +6033,11 @@
                 <w:lang w:val="en-ZA"/>
               </w:rPr>
             </w:pPr>
+            <w:proofErr w:type="spellStart"/>
             <w:r>
               <w:t>scheduled_delivery_date</w:t>
             </w:r>
+            <w:proofErr w:type="spellEnd"/>
           </w:p>
         </w:tc>
         <w:tc>
@@ -5631,9 +6088,11 @@
                 <w:lang w:val="en-ZA"/>
               </w:rPr>
             </w:pPr>
+            <w:proofErr w:type="spellStart"/>
             <w:r>
               <w:t>delivery_status</w:t>
             </w:r>
+            <w:proofErr w:type="spellEnd"/>
           </w:p>
         </w:tc>
         <w:tc>
@@ -5681,9 +6140,11 @@
                 <w:lang w:val="en-ZA"/>
               </w:rPr>
             </w:pPr>
+            <w:proofErr w:type="spellStart"/>
             <w:r>
               <w:t>actual_shipping_days</w:t>
             </w:r>
+            <w:proofErr w:type="spellEnd"/>
           </w:p>
         </w:tc>
         <w:tc>
@@ -5731,9 +6192,11 @@
                 <w:lang w:val="en-ZA"/>
               </w:rPr>
             </w:pPr>
+            <w:proofErr w:type="spellStart"/>
             <w:r>
               <w:t>scheduled_shipping_days</w:t>
             </w:r>
+            <w:proofErr w:type="spellEnd"/>
           </w:p>
         </w:tc>
         <w:tc>
@@ -5784,9 +6247,11 @@
                 <w:lang w:val="en-ZA"/>
               </w:rPr>
             </w:pPr>
+            <w:proofErr w:type="spellStart"/>
             <w:r>
               <w:t>shipping_mode</w:t>
             </w:r>
+            <w:proofErr w:type="spellEnd"/>
           </w:p>
         </w:tc>
         <w:tc>
@@ -5884,9 +6349,11 @@
                 <w:lang w:val="en-ZA"/>
               </w:rPr>
             </w:pPr>
+            <w:proofErr w:type="spellStart"/>
             <w:r>
               <w:t>order_region</w:t>
             </w:r>
+            <w:proofErr w:type="spellEnd"/>
           </w:p>
         </w:tc>
         <w:tc>
@@ -5934,9 +6401,11 @@
                 <w:lang w:val="en-ZA"/>
               </w:rPr>
             </w:pPr>
+            <w:proofErr w:type="spellStart"/>
             <w:r>
               <w:t>order_country</w:t>
             </w:r>
+            <w:proofErr w:type="spellEnd"/>
           </w:p>
         </w:tc>
         <w:tc>
@@ -6034,9 +6503,11 @@
                 <w:lang w:val="en-ZA"/>
               </w:rPr>
             </w:pPr>
+            <w:proofErr w:type="spellStart"/>
             <w:r>
               <w:t>order_profit</w:t>
             </w:r>
+            <w:proofErr w:type="spellEnd"/>
           </w:p>
         </w:tc>
         <w:tc>
@@ -6121,7 +6592,23 @@
       </w:r>
       <w:r>
         <w:br/>
-        <w:t>The main analytical tables are orders, products, shipments, inventory, demand, and risk_scores. The orders table is the central table because it contains the main order-level information. The shipments table is created from order and delivery-related fields. The inventory table is generated from product and demand patterns. The demand table summarizes monthly demand by product category. The risk_scores table stores regional risk indicators.</w:t>
+        <w:t xml:space="preserve">The main analytical tables are orders, products, shipments, inventory, demand, and </w:t>
+      </w:r>
+      <w:proofErr w:type="spellStart"/>
+      <w:r>
+        <w:t>risk_scores</w:t>
+      </w:r>
+      <w:proofErr w:type="spellEnd"/>
+      <w:r>
+        <w:t xml:space="preserve">. The orders table is the central table because it contains the main order-level information. The shipments table is created from order and delivery-related fields. The inventory table is generated from product and demand patterns. The demand table summarizes monthly demand by product category. The </w:t>
+      </w:r>
+      <w:proofErr w:type="spellStart"/>
+      <w:r>
+        <w:t>risk_scores</w:t>
+      </w:r>
+      <w:proofErr w:type="spellEnd"/>
+      <w:r>
+        <w:t xml:space="preserve"> table stores regional risk indicators.</w:t>
       </w:r>
       <w:r>
         <w:br/>
@@ -6230,7 +6717,21 @@
         <w:rPr>
           <w:lang w:val="en-ZA"/>
         </w:rPr>
-        <w:t>The logical data model represents the standardized analytical structure of the platform. Uploaded datasets are first converted into this structure by the data adapter. Therefore, even if the uploaded dataset has different column names, the dashboard can use the same analytical tables after the standardization process.</w:t>
+        <w:t xml:space="preserve">The logical data model represents the standardized analytical structure of the platform. Uploaded datasets </w:t>
+      </w:r>
+      <w:proofErr w:type="gramStart"/>
+      <w:r>
+        <w:rPr>
+          <w:lang w:val="en-ZA"/>
+        </w:rPr>
+        <w:t>are first converted</w:t>
+      </w:r>
+      <w:proofErr w:type="gramEnd"/>
+      <w:r>
+        <w:rPr>
+          <w:lang w:val="en-ZA"/>
+        </w:rPr>
+        <w:t xml:space="preserve"> into this structure by the data adapter. Therefore, even if the uploaded dataset has different column names, the dashboard can use the same analytical tables after the standardization process.</w:t>
       </w:r>
     </w:p>
     <w:p>
@@ -6264,27 +6765,55 @@
         <w:rPr>
           <w:lang w:val="en-ZA"/>
         </w:rPr>
-        <w:t>The platform includes six dashboard modules. Each module focuses on a different part of supply chain visibility and risk analysis. These modules work with the active dataset. If the user activates an uploaded dataset, the same dashboard modules are updated according to the uploaded data.</w:t>
-      </w:r>
-    </w:p>
-    <w:p>
-      <w:pPr>
-        <w:rPr>
-          <w:lang w:val="en-ZA"/>
-        </w:rPr>
-      </w:pPr>
-    </w:p>
-    <w:p>
-      <w:pPr>
-        <w:rPr>
-          <w:lang w:val="en-ZA"/>
-        </w:rPr>
-      </w:pPr>
-      <w:r>
-        <w:rPr>
-          <w:lang w:val="en-ZA"/>
-        </w:rPr>
-        <w:t>The dashboard modules and their main outputs are shown in Table 3.</w:t>
+        <w:t xml:space="preserve">The platform includes six dashboard modules. Each module focuses on a different part of supply chain visibility and risk analysis. These modules work with the active dataset. If the user activates an uploaded dataset, the same dashboard modules </w:t>
+      </w:r>
+      <w:proofErr w:type="gramStart"/>
+      <w:r>
+        <w:rPr>
+          <w:lang w:val="en-ZA"/>
+        </w:rPr>
+        <w:t>are updated</w:t>
+      </w:r>
+      <w:proofErr w:type="gramEnd"/>
+      <w:r>
+        <w:rPr>
+          <w:lang w:val="en-ZA"/>
+        </w:rPr>
+        <w:t xml:space="preserve"> according to the uploaded data.</w:t>
+      </w:r>
+    </w:p>
+    <w:p>
+      <w:pPr>
+        <w:rPr>
+          <w:lang w:val="en-ZA"/>
+        </w:rPr>
+      </w:pPr>
+    </w:p>
+    <w:p>
+      <w:pPr>
+        <w:rPr>
+          <w:lang w:val="en-ZA"/>
+        </w:rPr>
+      </w:pPr>
+      <w:r>
+        <w:rPr>
+          <w:lang w:val="en-ZA"/>
+        </w:rPr>
+        <w:t xml:space="preserve">The dashboard modules and their main outputs </w:t>
+      </w:r>
+      <w:proofErr w:type="gramStart"/>
+      <w:r>
+        <w:rPr>
+          <w:lang w:val="en-ZA"/>
+        </w:rPr>
+        <w:t>are shown</w:t>
+      </w:r>
+      <w:proofErr w:type="gramEnd"/>
+      <w:r>
+        <w:rPr>
+          <w:lang w:val="en-ZA"/>
+        </w:rPr>
+        <w:t xml:space="preserve"> in Table 3.</w:t>
       </w:r>
     </w:p>
     <w:p>
@@ -6583,8 +7112,13 @@
                 <w:lang w:val="en-ZA"/>
               </w:rPr>
             </w:pPr>
-            <w:r>
-              <w:t>Analyzes delivery and shipment performance</w:t>
+            <w:proofErr w:type="spellStart"/>
+            <w:r>
+              <w:t>Analyzes</w:t>
+            </w:r>
+            <w:proofErr w:type="spellEnd"/>
+            <w:r>
+              <w:t xml:space="preserve"> delivery and shipment performance</w:t>
             </w:r>
           </w:p>
         </w:tc>
@@ -6677,8 +7211,13 @@
                 <w:lang w:val="en-ZA"/>
               </w:rPr>
             </w:pPr>
-            <w:r>
-              <w:t>Analyzes historical demand and future demand estimates</w:t>
+            <w:proofErr w:type="spellStart"/>
+            <w:r>
+              <w:t>Analyzes</w:t>
+            </w:r>
+            <w:proofErr w:type="spellEnd"/>
+            <w:r>
+              <w:t xml:space="preserve"> historical demand and future demand estimates</w:t>
             </w:r>
           </w:p>
         </w:tc>
@@ -6709,7 +7248,21 @@
         <w:rPr>
           <w:lang w:val="en-ZA"/>
         </w:rPr>
-        <w:t>The modular structure makes the platform easier to understand and maintain. Each page has a specific responsibility, but all pages use the same active dataset. This design supports both the default DataCo dataset and user-uploaded datasets.</w:t>
+        <w:t xml:space="preserve">The modular structure makes the platform easier to understand and maintain. Each page has a specific responsibility, but all pages use the same active dataset. This design supports both the default </w:t>
+      </w:r>
+      <w:proofErr w:type="spellStart"/>
+      <w:r>
+        <w:rPr>
+          <w:lang w:val="en-ZA"/>
+        </w:rPr>
+        <w:t>DataCo</w:t>
+      </w:r>
+      <w:proofErr w:type="spellEnd"/>
+      <w:r>
+        <w:rPr>
+          <w:lang w:val="en-ZA"/>
+        </w:rPr>
+        <w:t xml:space="preserve"> dataset and user-uploaded datasets.</w:t>
       </w:r>
     </w:p>
     <w:p>
@@ -6736,27 +7289,55 @@
         <w:rPr>
           <w:lang w:val="en-ZA"/>
         </w:rPr>
-        <w:t>The supply chain risk module uses a rule-based and interpretable risk scoring approach. The aim is to provide clear risk indicators that can be understood by users. The model does not use a black-box machine learning algorithm for risk scoring. Instead, it combines operational indicators such as delivery performance, delay days, inventory status, and demand volatility.</w:t>
-      </w:r>
-    </w:p>
-    <w:p>
-      <w:pPr>
-        <w:rPr>
-          <w:lang w:val="en-ZA"/>
-        </w:rPr>
-      </w:pPr>
-    </w:p>
-    <w:p>
-      <w:pPr>
-        <w:rPr>
-          <w:lang w:val="en-ZA"/>
-        </w:rPr>
-      </w:pPr>
-      <w:r>
-        <w:rPr>
-          <w:lang w:val="en-ZA"/>
-        </w:rPr>
-        <w:t>The main risk components used in the platform are shown in Table 4.</w:t>
+        <w:t xml:space="preserve">The supply chain risk module uses a rule-based and interpretable risk scoring approach. The aim is to provide clear risk indicators that can </w:t>
+      </w:r>
+      <w:proofErr w:type="gramStart"/>
+      <w:r>
+        <w:rPr>
+          <w:lang w:val="en-ZA"/>
+        </w:rPr>
+        <w:t>be understood</w:t>
+      </w:r>
+      <w:proofErr w:type="gramEnd"/>
+      <w:r>
+        <w:rPr>
+          <w:lang w:val="en-ZA"/>
+        </w:rPr>
+        <w:t xml:space="preserve"> by users. The model does not use a black-box machine learning algorithm for risk scoring. Instead, it combines operational indicators such as delivery performance, delay days, inventory status, and demand volatility.</w:t>
+      </w:r>
+    </w:p>
+    <w:p>
+      <w:pPr>
+        <w:rPr>
+          <w:lang w:val="en-ZA"/>
+        </w:rPr>
+      </w:pPr>
+    </w:p>
+    <w:p>
+      <w:pPr>
+        <w:rPr>
+          <w:lang w:val="en-ZA"/>
+        </w:rPr>
+      </w:pPr>
+      <w:r>
+        <w:rPr>
+          <w:lang w:val="en-ZA"/>
+        </w:rPr>
+        <w:t xml:space="preserve">The main risk components used in the platform </w:t>
+      </w:r>
+      <w:proofErr w:type="gramStart"/>
+      <w:r>
+        <w:rPr>
+          <w:lang w:val="en-ZA"/>
+        </w:rPr>
+        <w:t>are shown</w:t>
+      </w:r>
+      <w:proofErr w:type="gramEnd"/>
+      <w:r>
+        <w:rPr>
+          <w:lang w:val="en-ZA"/>
+        </w:rPr>
+        <w:t xml:space="preserve"> in Table 4.</w:t>
       </w:r>
     </w:p>
     <w:p>
@@ -7091,7 +7672,35 @@
         <w:rPr>
           <w:lang w:val="en-ZA"/>
         </w:rPr>
-        <w:t>The overall risk score is calculated by combining the weighted risk components. The weights were selected to give higher importance to delivery performance and inventory condition, because these two areas directly affect operational continuity and customer service.</w:t>
+        <w:t xml:space="preserve">The overall risk score </w:t>
+      </w:r>
+      <w:proofErr w:type="gramStart"/>
+      <w:r>
+        <w:rPr>
+          <w:lang w:val="en-ZA"/>
+        </w:rPr>
+        <w:t>is calculated</w:t>
+      </w:r>
+      <w:proofErr w:type="gramEnd"/>
+      <w:r>
+        <w:rPr>
+          <w:lang w:val="en-ZA"/>
+        </w:rPr>
+        <w:t xml:space="preserve"> by combining the weighted risk components. The weights </w:t>
+      </w:r>
+      <w:proofErr w:type="gramStart"/>
+      <w:r>
+        <w:rPr>
+          <w:lang w:val="en-ZA"/>
+        </w:rPr>
+        <w:t>were selected</w:t>
+      </w:r>
+      <w:proofErr w:type="gramEnd"/>
+      <w:r>
+        <w:rPr>
+          <w:lang w:val="en-ZA"/>
+        </w:rPr>
+        <w:t xml:space="preserve"> to give higher importance to delivery performance and inventory condition, because these two areas directly affect operational continuity and customer service.</w:t>
       </w:r>
     </w:p>
     <w:p>
@@ -7589,27 +8198,125 @@
         <w:rPr>
           <w:lang w:val="en-ZA"/>
         </w:rPr>
-        <w:t>The risk score is interpreted in three levels. A score below 30 is classified as Low Risk, a score between 30 and 60 is classified as Medium Risk, and a score above 60 is classified as High Risk. This classification helps users understand the risk level quickly without analyzing every component separately.</w:t>
-      </w:r>
-    </w:p>
-    <w:p>
-      <w:pPr>
-        <w:rPr>
-          <w:lang w:val="en-ZA"/>
-        </w:rPr>
-      </w:pPr>
-    </w:p>
-    <w:p>
-      <w:pPr>
-        <w:rPr>
-          <w:lang w:val="en-ZA"/>
-        </w:rPr>
-      </w:pPr>
-      <w:r>
-        <w:rPr>
-          <w:lang w:val="en-ZA"/>
-        </w:rPr>
-        <w:t>The risk scoring logic is also affected by dashboard filters. When the user filters the dataset by market, category, shipping mode, or date range, the risk components are recalculated based on the filtered data. This makes the risk analysis interactive and more useful for decision-making.</w:t>
+        <w:t xml:space="preserve">The risk score </w:t>
+      </w:r>
+      <w:proofErr w:type="gramStart"/>
+      <w:r>
+        <w:rPr>
+          <w:lang w:val="en-ZA"/>
+        </w:rPr>
+        <w:t>is interpreted</w:t>
+      </w:r>
+      <w:proofErr w:type="gramEnd"/>
+      <w:r>
+        <w:rPr>
+          <w:lang w:val="en-ZA"/>
+        </w:rPr>
+        <w:t xml:space="preserve"> in three levels. A score below 30 </w:t>
+      </w:r>
+      <w:proofErr w:type="gramStart"/>
+      <w:r>
+        <w:rPr>
+          <w:lang w:val="en-ZA"/>
+        </w:rPr>
+        <w:t>is classified</w:t>
+      </w:r>
+      <w:proofErr w:type="gramEnd"/>
+      <w:r>
+        <w:rPr>
+          <w:lang w:val="en-ZA"/>
+        </w:rPr>
+        <w:t xml:space="preserve"> as Low Risk, a score between 30 and 60 </w:t>
+      </w:r>
+      <w:proofErr w:type="gramStart"/>
+      <w:r>
+        <w:rPr>
+          <w:lang w:val="en-ZA"/>
+        </w:rPr>
+        <w:t>is classified</w:t>
+      </w:r>
+      <w:proofErr w:type="gramEnd"/>
+      <w:r>
+        <w:rPr>
+          <w:lang w:val="en-ZA"/>
+        </w:rPr>
+        <w:t xml:space="preserve"> as Medium Risk, and a score above 60 </w:t>
+      </w:r>
+      <w:proofErr w:type="gramStart"/>
+      <w:r>
+        <w:rPr>
+          <w:lang w:val="en-ZA"/>
+        </w:rPr>
+        <w:t>is classified</w:t>
+      </w:r>
+      <w:proofErr w:type="gramEnd"/>
+      <w:r>
+        <w:rPr>
+          <w:lang w:val="en-ZA"/>
+        </w:rPr>
+        <w:t xml:space="preserve"> as High Risk. This classification helps users understand the risk level quickly without </w:t>
+      </w:r>
+      <w:proofErr w:type="spellStart"/>
+      <w:r>
+        <w:rPr>
+          <w:lang w:val="en-ZA"/>
+        </w:rPr>
+        <w:t>analyzing</w:t>
+      </w:r>
+      <w:proofErr w:type="spellEnd"/>
+      <w:r>
+        <w:rPr>
+          <w:lang w:val="en-ZA"/>
+        </w:rPr>
+        <w:t xml:space="preserve"> every component separately.</w:t>
+      </w:r>
+    </w:p>
+    <w:p>
+      <w:pPr>
+        <w:rPr>
+          <w:lang w:val="en-ZA"/>
+        </w:rPr>
+      </w:pPr>
+    </w:p>
+    <w:p>
+      <w:pPr>
+        <w:rPr>
+          <w:lang w:val="en-ZA"/>
+        </w:rPr>
+      </w:pPr>
+      <w:r>
+        <w:rPr>
+          <w:lang w:val="en-ZA"/>
+        </w:rPr>
+        <w:t xml:space="preserve">The risk scoring logic </w:t>
+      </w:r>
+      <w:proofErr w:type="gramStart"/>
+      <w:r>
+        <w:rPr>
+          <w:lang w:val="en-ZA"/>
+        </w:rPr>
+        <w:t>is also affected</w:t>
+      </w:r>
+      <w:proofErr w:type="gramEnd"/>
+      <w:r>
+        <w:rPr>
+          <w:lang w:val="en-ZA"/>
+        </w:rPr>
+        <w:t xml:space="preserve"> by dashboard filters. When the user filters the dataset by market, category, shipping mode, or date range, the risk components </w:t>
+      </w:r>
+      <w:proofErr w:type="gramStart"/>
+      <w:r>
+        <w:rPr>
+          <w:lang w:val="en-ZA"/>
+        </w:rPr>
+        <w:t>are recalculated</w:t>
+      </w:r>
+      <w:proofErr w:type="gramEnd"/>
+      <w:r>
+        <w:rPr>
+          <w:lang w:val="en-ZA"/>
+        </w:rPr>
+        <w:t xml:space="preserve"> based on the filtered data. This makes the risk analysis interactive and more useful for decision-making.</w:t>
       </w:r>
     </w:p>
     <w:p>
@@ -7636,27 +8343,83 @@
         <w:rPr>
           <w:lang w:val="en-ZA"/>
         </w:rPr>
-        <w:t>The Demand Forecast module uses historical monthly demand values generated from the active dataset. The demand table is created by grouping order quantity values by year-month and product category. This allows the system to analyze demand trends over time.</w:t>
-      </w:r>
-    </w:p>
-    <w:p>
-      <w:pPr>
-        <w:rPr>
-          <w:lang w:val="en-ZA"/>
-        </w:rPr>
-      </w:pPr>
-    </w:p>
-    <w:p>
-      <w:pPr>
-        <w:rPr>
-          <w:lang w:val="en-ZA"/>
-        </w:rPr>
-      </w:pPr>
-      <w:r>
-        <w:rPr>
-          <w:lang w:val="en-ZA"/>
-        </w:rPr>
-        <w:t>The platform uses two simple forecasting methods: 3-month moving average and linear regression. The moving average method is used to show short-term demand trends based on recent historical values. The linear regression model is used to estimate future demand by learning a simple trend from historical monthly demand.</w:t>
+        <w:t xml:space="preserve">The Demand Forecast module uses historical monthly demand values generated from the active dataset. The demand table </w:t>
+      </w:r>
+      <w:proofErr w:type="gramStart"/>
+      <w:r>
+        <w:rPr>
+          <w:lang w:val="en-ZA"/>
+        </w:rPr>
+        <w:t>is created</w:t>
+      </w:r>
+      <w:proofErr w:type="gramEnd"/>
+      <w:r>
+        <w:rPr>
+          <w:lang w:val="en-ZA"/>
+        </w:rPr>
+        <w:t xml:space="preserve"> by grouping order quantity values by year-month and product category. This allows the system to </w:t>
+      </w:r>
+      <w:proofErr w:type="spellStart"/>
+      <w:r>
+        <w:rPr>
+          <w:lang w:val="en-ZA"/>
+        </w:rPr>
+        <w:t>analyze</w:t>
+      </w:r>
+      <w:proofErr w:type="spellEnd"/>
+      <w:r>
+        <w:rPr>
+          <w:lang w:val="en-ZA"/>
+        </w:rPr>
+        <w:t xml:space="preserve"> demand trends over time.</w:t>
+      </w:r>
+    </w:p>
+    <w:p>
+      <w:pPr>
+        <w:rPr>
+          <w:lang w:val="en-ZA"/>
+        </w:rPr>
+      </w:pPr>
+    </w:p>
+    <w:p>
+      <w:pPr>
+        <w:rPr>
+          <w:lang w:val="en-ZA"/>
+        </w:rPr>
+      </w:pPr>
+      <w:r>
+        <w:rPr>
+          <w:lang w:val="en-ZA"/>
+        </w:rPr>
+        <w:t xml:space="preserve">The platform uses two simple forecasting methods: 3-month moving average and linear regression. The moving average method </w:t>
+      </w:r>
+      <w:proofErr w:type="gramStart"/>
+      <w:r>
+        <w:rPr>
+          <w:lang w:val="en-ZA"/>
+        </w:rPr>
+        <w:t>is used</w:t>
+      </w:r>
+      <w:proofErr w:type="gramEnd"/>
+      <w:r>
+        <w:rPr>
+          <w:lang w:val="en-ZA"/>
+        </w:rPr>
+        <w:t xml:space="preserve"> to show short-term demand trends based on recent historical values. The linear regression model </w:t>
+      </w:r>
+      <w:proofErr w:type="gramStart"/>
+      <w:r>
+        <w:rPr>
+          <w:lang w:val="en-ZA"/>
+        </w:rPr>
+        <w:t>is used</w:t>
+      </w:r>
+      <w:proofErr w:type="gramEnd"/>
+      <w:r>
+        <w:rPr>
+          <w:lang w:val="en-ZA"/>
+        </w:rPr>
+        <w:t xml:space="preserve"> to estimate future demand by learning a simple trend from historical monthly demand.</w:t>
       </w:r>
     </w:p>
     <w:p>
@@ -7696,7 +8459,35 @@
         <w:rPr>
           <w:lang w:val="en-ZA"/>
         </w:rPr>
-        <w:t>The forecasting approach is intentionally simple because the main focus of the project is supply chain visibility and risk assessment. The purpose of the forecast module is to demonstrate how demand data can support planning decisions, not to create a highly advanced forecasting system.</w:t>
+        <w:t xml:space="preserve">The forecasting approach is intentionally simple because the </w:t>
+      </w:r>
+      <w:proofErr w:type="gramStart"/>
+      <w:r>
+        <w:rPr>
+          <w:lang w:val="en-ZA"/>
+        </w:rPr>
+        <w:t>main focus</w:t>
+      </w:r>
+      <w:proofErr w:type="gramEnd"/>
+      <w:r>
+        <w:rPr>
+          <w:lang w:val="en-ZA"/>
+        </w:rPr>
+        <w:t xml:space="preserve"> of the project is </w:t>
+      </w:r>
+      <w:proofErr w:type="gramStart"/>
+      <w:r>
+        <w:rPr>
+          <w:lang w:val="en-ZA"/>
+        </w:rPr>
+        <w:t>supply</w:t>
+      </w:r>
+      <w:proofErr w:type="gramEnd"/>
+      <w:r>
+        <w:rPr>
+          <w:lang w:val="en-ZA"/>
+        </w:rPr>
+        <w:t xml:space="preserve"> chain visibility and risk assessment. The purpose of the forecast module is to demonstrate how demand data can support planning decisions, not to create a highly advanced forecasting system.</w:t>
       </w:r>
     </w:p>
     <w:p>
@@ -7730,27 +8521,83 @@
         <w:rPr>
           <w:lang w:val="en-ZA"/>
         </w:rPr>
-        <w:t>The dashboard interface was developed with Streamlit. The platform includes a sidebar navigation menu and multiple dashboard pages. The Overview page includes the Data Source Manager, which allows users to upload a new dataset, map columns, activate the uploaded dataset, or return to the default DataCo dataset.</w:t>
-      </w:r>
-    </w:p>
-    <w:p>
-      <w:pPr>
-        <w:rPr>
-          <w:lang w:val="en-ZA"/>
-        </w:rPr>
-      </w:pPr>
-    </w:p>
-    <w:p>
-      <w:pPr>
-        <w:rPr>
-          <w:lang w:val="en-ZA"/>
-        </w:rPr>
-      </w:pPr>
-      <w:r>
-        <w:rPr>
-          <w:lang w:val="en-ZA"/>
-        </w:rPr>
-        <w:t>The Data Source Manager is shown in Figure 3.</w:t>
+        <w:t xml:space="preserve">The dashboard interface </w:t>
+      </w:r>
+      <w:proofErr w:type="gramStart"/>
+      <w:r>
+        <w:rPr>
+          <w:lang w:val="en-ZA"/>
+        </w:rPr>
+        <w:t>was developed</w:t>
+      </w:r>
+      <w:proofErr w:type="gramEnd"/>
+      <w:r>
+        <w:rPr>
+          <w:lang w:val="en-ZA"/>
+        </w:rPr>
+        <w:t xml:space="preserve"> with </w:t>
+      </w:r>
+      <w:proofErr w:type="spellStart"/>
+      <w:r>
+        <w:rPr>
+          <w:lang w:val="en-ZA"/>
+        </w:rPr>
+        <w:t>Streamlit</w:t>
+      </w:r>
+      <w:proofErr w:type="spellEnd"/>
+      <w:r>
+        <w:rPr>
+          <w:lang w:val="en-ZA"/>
+        </w:rPr>
+        <w:t xml:space="preserve">. The platform includes a sidebar navigation menu and multiple dashboard pages. The Overview page includes the Data Source Manager, which allows users to upload a new dataset, map columns, activate the uploaded dataset, or return to the default </w:t>
+      </w:r>
+      <w:proofErr w:type="spellStart"/>
+      <w:r>
+        <w:rPr>
+          <w:lang w:val="en-ZA"/>
+        </w:rPr>
+        <w:t>DataCo</w:t>
+      </w:r>
+      <w:proofErr w:type="spellEnd"/>
+      <w:r>
+        <w:rPr>
+          <w:lang w:val="en-ZA"/>
+        </w:rPr>
+        <w:t xml:space="preserve"> dataset.</w:t>
+      </w:r>
+    </w:p>
+    <w:p>
+      <w:pPr>
+        <w:rPr>
+          <w:lang w:val="en-ZA"/>
+        </w:rPr>
+      </w:pPr>
+    </w:p>
+    <w:p>
+      <w:pPr>
+        <w:rPr>
+          <w:lang w:val="en-ZA"/>
+        </w:rPr>
+      </w:pPr>
+      <w:r>
+        <w:rPr>
+          <w:lang w:val="en-ZA"/>
+        </w:rPr>
+        <w:t xml:space="preserve">The Data Source Manager </w:t>
+      </w:r>
+      <w:proofErr w:type="gramStart"/>
+      <w:r>
+        <w:rPr>
+          <w:lang w:val="en-ZA"/>
+        </w:rPr>
+        <w:t>is shown</w:t>
+      </w:r>
+      <w:proofErr w:type="gramEnd"/>
+      <w:r>
+        <w:rPr>
+          <w:lang w:val="en-ZA"/>
+        </w:rPr>
+        <w:t xml:space="preserve"> in Figure 3.</w:t>
       </w:r>
     </w:p>
     <w:p>
@@ -7852,7 +8699,21 @@
         <w:rPr>
           <w:lang w:val="en-ZA"/>
         </w:rPr>
-        <w:t>As shown in Figure 3, the user can upload a CSV or Excel dataset and map it to the standard supply chain schema. After the uploaded dataset is activated, all dashboard pages use the uploaded data during the active session.</w:t>
+        <w:t xml:space="preserve">As shown in Figure 3, the user can upload a CSV or Excel dataset and map it to the standard supply chain schema. After the uploaded dataset </w:t>
+      </w:r>
+      <w:proofErr w:type="gramStart"/>
+      <w:r>
+        <w:rPr>
+          <w:lang w:val="en-ZA"/>
+        </w:rPr>
+        <w:t>is activated</w:t>
+      </w:r>
+      <w:proofErr w:type="gramEnd"/>
+      <w:r>
+        <w:rPr>
+          <w:lang w:val="en-ZA"/>
+        </w:rPr>
+        <w:t>, all dashboard pages use the uploaded data during the active session.</w:t>
       </w:r>
     </w:p>
     <w:p>
@@ -7885,7 +8746,21 @@
         <w:rPr>
           <w:lang w:val="en-ZA"/>
         </w:rPr>
-        <w:t>An example of the Overview dashboard generated from an uploaded dataset is shown in Figure 4.</w:t>
+        <w:t xml:space="preserve">An example of the Overview dashboard generated from an uploaded dataset </w:t>
+      </w:r>
+      <w:proofErr w:type="gramStart"/>
+      <w:r>
+        <w:rPr>
+          <w:lang w:val="en-ZA"/>
+        </w:rPr>
+        <w:t>is shown</w:t>
+      </w:r>
+      <w:proofErr w:type="gramEnd"/>
+      <w:r>
+        <w:rPr>
+          <w:lang w:val="en-ZA"/>
+        </w:rPr>
+        <w:t xml:space="preserve"> in Figure 4.</w:t>
       </w:r>
     </w:p>
     <w:p>
@@ -7977,27 +8852,55 @@
           <w:lang w:val="en-ZA"/>
         </w:rPr>
         <w:lastRenderedPageBreak/>
-        <w:t>The Supply Chain Risk page combines several risk indicators into a single decision-support view. It includes delivery risk, delay risk, inventory risk, demand volatility risk, and an overall risk score. The risk results change according to the selected dashboard filters.</w:t>
-      </w:r>
-    </w:p>
-    <w:p>
-      <w:pPr>
-        <w:rPr>
-          <w:lang w:val="en-ZA"/>
-        </w:rPr>
-      </w:pPr>
-    </w:p>
-    <w:p>
-      <w:pPr>
-        <w:rPr>
-          <w:lang w:val="en-ZA"/>
-        </w:rPr>
-      </w:pPr>
-      <w:r>
-        <w:rPr>
-          <w:lang w:val="en-ZA"/>
-        </w:rPr>
-        <w:t>An example of the Supply Chain Risk dashboard is shown in Figure 5.</w:t>
+        <w:t xml:space="preserve">The Supply Chain Risk page combines </w:t>
+      </w:r>
+      <w:proofErr w:type="gramStart"/>
+      <w:r>
+        <w:rPr>
+          <w:lang w:val="en-ZA"/>
+        </w:rPr>
+        <w:t>several</w:t>
+      </w:r>
+      <w:proofErr w:type="gramEnd"/>
+      <w:r>
+        <w:rPr>
+          <w:lang w:val="en-ZA"/>
+        </w:rPr>
+        <w:t xml:space="preserve"> risk indicators into a single decision-support view. It includes delivery risk, delay risk, inventory risk, demand volatility risk, and an overall risk score. The risk results change according to the selected dashboard filters.</w:t>
+      </w:r>
+    </w:p>
+    <w:p>
+      <w:pPr>
+        <w:rPr>
+          <w:lang w:val="en-ZA"/>
+        </w:rPr>
+      </w:pPr>
+    </w:p>
+    <w:p>
+      <w:pPr>
+        <w:rPr>
+          <w:lang w:val="en-ZA"/>
+        </w:rPr>
+      </w:pPr>
+      <w:r>
+        <w:rPr>
+          <w:lang w:val="en-ZA"/>
+        </w:rPr>
+        <w:t xml:space="preserve">An example of the Supply Chain Risk dashboard </w:t>
+      </w:r>
+      <w:proofErr w:type="gramStart"/>
+      <w:r>
+        <w:rPr>
+          <w:lang w:val="en-ZA"/>
+        </w:rPr>
+        <w:t>is shown</w:t>
+      </w:r>
+      <w:proofErr w:type="gramEnd"/>
+      <w:r>
+        <w:rPr>
+          <w:lang w:val="en-ZA"/>
+        </w:rPr>
+        <w:t xml:space="preserve"> in Figure 5.</w:t>
       </w:r>
     </w:p>
     <w:p>
@@ -8088,27 +8991,55 @@
         <w:rPr>
           <w:lang w:val="en-ZA"/>
         </w:rPr>
-        <w:t>The Demand Forecast page analyzes historical demand and generates future demand estimates. It allows users to compare actual demand with forecasted values and review forecast error metrics.</w:t>
-      </w:r>
-    </w:p>
-    <w:p>
-      <w:pPr>
-        <w:rPr>
-          <w:lang w:val="en-ZA"/>
-        </w:rPr>
-      </w:pPr>
-    </w:p>
-    <w:p>
-      <w:pPr>
-        <w:rPr>
-          <w:lang w:val="en-ZA"/>
-        </w:rPr>
-      </w:pPr>
-      <w:r>
-        <w:rPr>
-          <w:lang w:val="en-ZA"/>
-        </w:rPr>
-        <w:t>An example of the Demand Forecast dashboard is shown in Figure 6.</w:t>
+        <w:t xml:space="preserve">The Demand Forecast page </w:t>
+      </w:r>
+      <w:proofErr w:type="spellStart"/>
+      <w:r>
+        <w:rPr>
+          <w:lang w:val="en-ZA"/>
+        </w:rPr>
+        <w:t>analyzes</w:t>
+      </w:r>
+      <w:proofErr w:type="spellEnd"/>
+      <w:r>
+        <w:rPr>
+          <w:lang w:val="en-ZA"/>
+        </w:rPr>
+        <w:t xml:space="preserve"> historical demand and generates future demand estimates. It allows users to compare actual demand with forecasted values and review forecast error metrics.</w:t>
+      </w:r>
+    </w:p>
+    <w:p>
+      <w:pPr>
+        <w:rPr>
+          <w:lang w:val="en-ZA"/>
+        </w:rPr>
+      </w:pPr>
+    </w:p>
+    <w:p>
+      <w:pPr>
+        <w:rPr>
+          <w:lang w:val="en-ZA"/>
+        </w:rPr>
+      </w:pPr>
+      <w:r>
+        <w:rPr>
+          <w:lang w:val="en-ZA"/>
+        </w:rPr>
+        <w:t xml:space="preserve">An example of the Demand Forecast dashboard </w:t>
+      </w:r>
+      <w:proofErr w:type="gramStart"/>
+      <w:r>
+        <w:rPr>
+          <w:lang w:val="en-ZA"/>
+        </w:rPr>
+        <w:t>is shown</w:t>
+      </w:r>
+      <w:proofErr w:type="gramEnd"/>
+      <w:r>
+        <w:rPr>
+          <w:lang w:val="en-ZA"/>
+        </w:rPr>
+        <w:t xml:space="preserve"> in Figure 6.</w:t>
       </w:r>
     </w:p>
     <w:p>
@@ -8200,7 +9131,49 @@
           <w:lang w:val="en-ZA"/>
         </w:rPr>
         <w:lastRenderedPageBreak/>
-        <w:t>These dashboard pages show that the platform is not limited to a static dataset. When a new dataset is uploaded and activated, the same dashboard structure is regenerated based on the active dataset. This supports the main goal of the project: creating a reusable supply chain visibility and risk assessment platform.</w:t>
+        <w:t xml:space="preserve">These dashboard pages show that the platform </w:t>
+      </w:r>
+      <w:proofErr w:type="gramStart"/>
+      <w:r>
+        <w:rPr>
+          <w:lang w:val="en-ZA"/>
+        </w:rPr>
+        <w:t>is not limited</w:t>
+      </w:r>
+      <w:proofErr w:type="gramEnd"/>
+      <w:r>
+        <w:rPr>
+          <w:lang w:val="en-ZA"/>
+        </w:rPr>
+        <w:t xml:space="preserve"> to a static dataset. When a new dataset </w:t>
+      </w:r>
+      <w:proofErr w:type="gramStart"/>
+      <w:r>
+        <w:rPr>
+          <w:lang w:val="en-ZA"/>
+        </w:rPr>
+        <w:t>is uploaded</w:t>
+      </w:r>
+      <w:proofErr w:type="gramEnd"/>
+      <w:r>
+        <w:rPr>
+          <w:lang w:val="en-ZA"/>
+        </w:rPr>
+        <w:t xml:space="preserve"> and activated, the same dashboard structure </w:t>
+      </w:r>
+      <w:proofErr w:type="gramStart"/>
+      <w:r>
+        <w:rPr>
+          <w:lang w:val="en-ZA"/>
+        </w:rPr>
+        <w:t>is regenerated</w:t>
+      </w:r>
+      <w:proofErr w:type="gramEnd"/>
+      <w:r>
+        <w:rPr>
+          <w:lang w:val="en-ZA"/>
+        </w:rPr>
+        <w:t xml:space="preserve"> based on the active dataset. This supports the main goal of the project: creating a reusable supply chain visibility and risk assessment platform.</w:t>
       </w:r>
     </w:p>
     <w:p>
@@ -8222,7 +9195,15 @@
     </w:p>
     <w:p>
       <w:r>
-        <w:t>This section presents the business case of the project. The platform is designed for a company that needs to monitor supply chain performance, identify operational risks, and analyze demand patterns from a single interface.</w:t>
+        <w:t xml:space="preserve">This section presents the business case of the project. The platform is designed for a company that needs to monitor supply chain performance, identify operational risks, and </w:t>
+      </w:r>
+      <w:proofErr w:type="spellStart"/>
+      <w:r>
+        <w:t>analyze</w:t>
+      </w:r>
+      <w:proofErr w:type="spellEnd"/>
+      <w:r>
+        <w:t xml:space="preserve"> demand patterns from a single interface.</w:t>
       </w:r>
     </w:p>
     <w:p>
@@ -8247,7 +9228,15 @@
       </w:r>
       <w:r>
         <w:br/>
-        <w:t>The company needs a reusable dashboard platform that can work with different supply chain datasets. The platform should not require code changes every time a new dataset is analyzed. Instead, users should be able to upload a dataset, map its columns to a standard schema, and generate dashboard pages based on the active dataset.</w:t>
+        <w:t xml:space="preserve">The company needs a reusable dashboard platform that can work with different supply chain datasets. The platform should not require code changes every time a new dataset is </w:t>
+      </w:r>
+      <w:proofErr w:type="spellStart"/>
+      <w:r>
+        <w:t>analyzed</w:t>
+      </w:r>
+      <w:proofErr w:type="spellEnd"/>
+      <w:r>
+        <w:t>. Instead, users should be able to upload a dataset, map its columns to a standard schema, and generate dashboard pages based on the active dataset.</w:t>
       </w:r>
     </w:p>
     <w:p>
@@ -8256,7 +9245,15 @@
       </w:r>
       <w:r>
         <w:br/>
-        <w:t>In this project, the DataCo dataset is used as the default demonstration dataset. However, the business case also considers a situation where a user uploads a new company dataset. After the uploaded dataset is mapped and standardized, the dashboard pages are updated dynamically.</w:t>
+        <w:t xml:space="preserve">In this project, the </w:t>
+      </w:r>
+      <w:proofErr w:type="spellStart"/>
+      <w:r>
+        <w:t>DataCo</w:t>
+      </w:r>
+      <w:proofErr w:type="spellEnd"/>
+      <w:r>
+        <w:t xml:space="preserve"> dataset is used as the default demonstration dataset. However, the business case also considers a situation where a user uploads a new company dataset. After the uploaded dataset is mapped and standardized, the dashboard pages are updated dynamically.</w:t>
       </w:r>
     </w:p>
     <w:p>
@@ -8413,8 +9410,13 @@
             <w:tcW w:w="1666" w:type="pct"/>
           </w:tcPr>
           <w:p>
-            <w:r>
-              <w:t>Analyze shipment delays and delivery performance</w:t>
+            <w:proofErr w:type="spellStart"/>
+            <w:r>
+              <w:t>Analyze</w:t>
+            </w:r>
+            <w:proofErr w:type="spellEnd"/>
+            <w:r>
+              <w:t xml:space="preserve"> shipment delays and delivery performance</w:t>
             </w:r>
           </w:p>
         </w:tc>
@@ -8643,47 +9645,117 @@
         <w:rPr>
           <w:lang w:val="en-ZA"/>
         </w:rPr>
-        <w:t>An example usage flow starts with the user opening the platform. At first, the default DataCo dataset is active. The user can review the default dashboard, or upload a new supply chain dataset through the Data Source Manager.</w:t>
-      </w:r>
-    </w:p>
-    <w:p>
-      <w:pPr>
-        <w:rPr>
-          <w:lang w:val="en-ZA"/>
-        </w:rPr>
-      </w:pPr>
-    </w:p>
-    <w:p>
-      <w:pPr>
-        <w:rPr>
-          <w:lang w:val="en-ZA"/>
-        </w:rPr>
-      </w:pPr>
-      <w:r>
-        <w:rPr>
-          <w:lang w:val="en-ZA"/>
-        </w:rPr>
-        <w:t>If the user uploads a new dataset, the system displays a preview of the raw data. The user then maps the uploaded columns to the standard schema. Required fields such as order ID, order date, product name, category name, and order quantity must be mapped. Optional fields such as shipping mode, scheduled delivery date, sales, and profit improve the quality of the analysis.</w:t>
-      </w:r>
-    </w:p>
-    <w:p>
-      <w:pPr>
-        <w:rPr>
-          <w:lang w:val="en-ZA"/>
-        </w:rPr>
-      </w:pPr>
-    </w:p>
-    <w:p>
-      <w:pPr>
-        <w:rPr>
-          <w:lang w:val="en-ZA"/>
-        </w:rPr>
-      </w:pPr>
-      <w:r>
-        <w:rPr>
-          <w:lang w:val="en-ZA"/>
-        </w:rPr>
-        <w:t>After the user activates the uploaded dataset, all dashboard pages are updated according to the uploaded data. The user can then analyze regional performance, inventory status, shipment delays, supply chain risk, and demand forecasts. This process shows how the platform can support different supply chain datasets without changing the source code.</w:t>
+        <w:t xml:space="preserve">An example usage flow starts with the user opening the platform. At first, the default </w:t>
+      </w:r>
+      <w:proofErr w:type="spellStart"/>
+      <w:r>
+        <w:rPr>
+          <w:lang w:val="en-ZA"/>
+        </w:rPr>
+        <w:t>DataCo</w:t>
+      </w:r>
+      <w:proofErr w:type="spellEnd"/>
+      <w:r>
+        <w:rPr>
+          <w:lang w:val="en-ZA"/>
+        </w:rPr>
+        <w:t xml:space="preserve"> dataset is active. The user can review the default </w:t>
+      </w:r>
+      <w:proofErr w:type="gramStart"/>
+      <w:r>
+        <w:rPr>
+          <w:lang w:val="en-ZA"/>
+        </w:rPr>
+        <w:t>dashboard, or</w:t>
+      </w:r>
+      <w:proofErr w:type="gramEnd"/>
+      <w:r>
+        <w:rPr>
+          <w:lang w:val="en-ZA"/>
+        </w:rPr>
+        <w:t xml:space="preserve"> upload a new supply chain dataset through the Data Source Manager.</w:t>
+      </w:r>
+    </w:p>
+    <w:p>
+      <w:pPr>
+        <w:rPr>
+          <w:lang w:val="en-ZA"/>
+        </w:rPr>
+      </w:pPr>
+    </w:p>
+    <w:p>
+      <w:pPr>
+        <w:rPr>
+          <w:lang w:val="en-ZA"/>
+        </w:rPr>
+      </w:pPr>
+      <w:r>
+        <w:rPr>
+          <w:lang w:val="en-ZA"/>
+        </w:rPr>
+        <w:t xml:space="preserve">If the user uploads a new dataset, the system displays a preview of the raw data. The user then maps the uploaded columns to the standard schema. Required fields such as order ID, order date, product name, category name, and order quantity must </w:t>
+      </w:r>
+      <w:proofErr w:type="gramStart"/>
+      <w:r>
+        <w:rPr>
+          <w:lang w:val="en-ZA"/>
+        </w:rPr>
+        <w:t>be mapped</w:t>
+      </w:r>
+      <w:proofErr w:type="gramEnd"/>
+      <w:r>
+        <w:rPr>
+          <w:lang w:val="en-ZA"/>
+        </w:rPr>
+        <w:t>. Optional fields such as shipping mode, scheduled delivery date, sales, and profit improve the quality of the analysis.</w:t>
+      </w:r>
+    </w:p>
+    <w:p>
+      <w:pPr>
+        <w:rPr>
+          <w:lang w:val="en-ZA"/>
+        </w:rPr>
+      </w:pPr>
+    </w:p>
+    <w:p>
+      <w:pPr>
+        <w:rPr>
+          <w:lang w:val="en-ZA"/>
+        </w:rPr>
+      </w:pPr>
+      <w:r>
+        <w:rPr>
+          <w:lang w:val="en-ZA"/>
+        </w:rPr>
+        <w:t xml:space="preserve">After the user activates the uploaded dataset, all dashboard pages </w:t>
+      </w:r>
+      <w:proofErr w:type="gramStart"/>
+      <w:r>
+        <w:rPr>
+          <w:lang w:val="en-ZA"/>
+        </w:rPr>
+        <w:t>are updated</w:t>
+      </w:r>
+      <w:proofErr w:type="gramEnd"/>
+      <w:r>
+        <w:rPr>
+          <w:lang w:val="en-ZA"/>
+        </w:rPr>
+        <w:t xml:space="preserve"> according to the uploaded data. The user can then </w:t>
+      </w:r>
+      <w:proofErr w:type="spellStart"/>
+      <w:r>
+        <w:rPr>
+          <w:lang w:val="en-ZA"/>
+        </w:rPr>
+        <w:t>analyze</w:t>
+      </w:r>
+      <w:proofErr w:type="spellEnd"/>
+      <w:r>
+        <w:rPr>
+          <w:lang w:val="en-ZA"/>
+        </w:rPr>
+        <w:t xml:space="preserve"> regional performance, inventory status, shipment delays, supply chain risk, and demand forecasts. This process shows how the platform can support different supply chain datasets without changing the source code.</w:t>
       </w:r>
     </w:p>
     <w:p>
@@ -8717,27 +9789,69 @@
         <w:rPr>
           <w:lang w:val="en-ZA"/>
         </w:rPr>
-        <w:t>The main business value of the platform is that it improves supply chain visibility and supports operational risk assessment. Instead of checking separate reports, users can analyze key supply chain indicators from one dashboard structure.</w:t>
-      </w:r>
-    </w:p>
-    <w:p>
-      <w:pPr>
-        <w:rPr>
-          <w:lang w:val="en-ZA"/>
-        </w:rPr>
-      </w:pPr>
-    </w:p>
-    <w:p>
-      <w:pPr>
-        <w:rPr>
-          <w:lang w:val="en-ZA"/>
-        </w:rPr>
-      </w:pPr>
-      <w:r>
-        <w:rPr>
-          <w:lang w:val="en-ZA"/>
-        </w:rPr>
-        <w:t>The dataset upload and standardization feature also increases the reusability of the system. A company can test different datasets by mapping them to the standard schema. This makes the platform more flexible than a dashboard designed for only one fixed dataset.</w:t>
+        <w:t xml:space="preserve">The </w:t>
+      </w:r>
+      <w:proofErr w:type="gramStart"/>
+      <w:r>
+        <w:rPr>
+          <w:lang w:val="en-ZA"/>
+        </w:rPr>
+        <w:t>main business</w:t>
+      </w:r>
+      <w:proofErr w:type="gramEnd"/>
+      <w:r>
+        <w:rPr>
+          <w:lang w:val="en-ZA"/>
+        </w:rPr>
+        <w:t xml:space="preserve"> value of the platform is that it improves supply chain visibility and supports operational risk assessment. Instead of checking separate reports, users can </w:t>
+      </w:r>
+      <w:proofErr w:type="spellStart"/>
+      <w:r>
+        <w:rPr>
+          <w:lang w:val="en-ZA"/>
+        </w:rPr>
+        <w:t>analyze</w:t>
+      </w:r>
+      <w:proofErr w:type="spellEnd"/>
+      <w:r>
+        <w:rPr>
+          <w:lang w:val="en-ZA"/>
+        </w:rPr>
+        <w:t xml:space="preserve"> key supply chain indicators from one dashboard structure.</w:t>
+      </w:r>
+    </w:p>
+    <w:p>
+      <w:pPr>
+        <w:rPr>
+          <w:lang w:val="en-ZA"/>
+        </w:rPr>
+      </w:pPr>
+    </w:p>
+    <w:p>
+      <w:pPr>
+        <w:rPr>
+          <w:lang w:val="en-ZA"/>
+        </w:rPr>
+      </w:pPr>
+      <w:r>
+        <w:rPr>
+          <w:lang w:val="en-ZA"/>
+        </w:rPr>
+        <w:t xml:space="preserve">The dataset upload and standardization feature also increases the reusability of the system. A company can </w:t>
+      </w:r>
+      <w:proofErr w:type="gramStart"/>
+      <w:r>
+        <w:rPr>
+          <w:lang w:val="en-ZA"/>
+        </w:rPr>
+        <w:t>test</w:t>
+      </w:r>
+      <w:proofErr w:type="gramEnd"/>
+      <w:r>
+        <w:rPr>
+          <w:lang w:val="en-ZA"/>
+        </w:rPr>
+        <w:t xml:space="preserve"> different datasets by mapping them to the standard schema. This makes the platform more flexible than a dashboard designed for only one fixed dataset.</w:t>
       </w:r>
     </w:p>
     <w:p>
@@ -8773,7 +9887,126 @@
     </w:p>
     <w:p>
       <w:r>
-        <w:t>……….fdfdfdf</w:t>
+        <w:t xml:space="preserve">This graduation thesis developed a Supply Chain Visibility and Risk Assessment Platform using Python and </w:t>
+      </w:r>
+      <w:proofErr w:type="spellStart"/>
+      <w:r>
+        <w:t>Streamlit</w:t>
+      </w:r>
+      <w:proofErr w:type="spellEnd"/>
+      <w:r>
+        <w:t xml:space="preserve">. The main goal of the project was to create an interactive decision-support system that can help users monitor supply chain performance, identify operational risks, and </w:t>
+      </w:r>
+      <w:proofErr w:type="spellStart"/>
+      <w:r>
+        <w:t>analyze</w:t>
+      </w:r>
+      <w:proofErr w:type="spellEnd"/>
+      <w:r>
+        <w:t xml:space="preserve"> demand patterns from a single interface.</w:t>
+      </w:r>
+    </w:p>
+    <w:p>
+      <w:r>
+        <w:br/>
+      </w:r>
+      <w:r>
+        <w:br/>
+        <w:t xml:space="preserve">The completed platform includes several dashboard modules: Overview, Regional Performance, Inventory Control, Shipment Performance, Supply Chain Risk, and Demand Forecast. These modules provide key performance indicators, charts, tables, risk scores, and forecasting outputs. The dashboard helps users </w:t>
+      </w:r>
+      <w:proofErr w:type="spellStart"/>
+      <w:r>
+        <w:t>analyze</w:t>
+      </w:r>
+      <w:proofErr w:type="spellEnd"/>
+      <w:r>
+        <w:t xml:space="preserve"> delivery performance, shipment delays, inventory status, regional differences, demand trends, and overall supply chain risk.</w:t>
+      </w:r>
+    </w:p>
+    <w:p>
+      <w:r>
+        <w:br/>
+      </w:r>
+      <w:r>
+        <w:br/>
+        <w:t xml:space="preserve">One of the strongest parts of the project is the dataset upload and standardization feature. The system is not limited to the default </w:t>
+      </w:r>
+      <w:proofErr w:type="spellStart"/>
+      <w:r>
+        <w:t>DataCo</w:t>
+      </w:r>
+      <w:proofErr w:type="spellEnd"/>
+      <w:r>
+        <w:t xml:space="preserve"> dataset. Users can upload a new supply chain dataset in CSV or Excel format, map the dataset columns to a standard schema, and generate dashboard pages based on the uploaded dataset. This makes the platform more reusable and flexible than a static dashboard built for only one dataset.</w:t>
+      </w:r>
+    </w:p>
+    <w:p>
+      <w:r>
+        <w:br/>
+      </w:r>
+      <w:r>
+        <w:br/>
+        <w:t xml:space="preserve">The project also demonstrates how supply chain data can be transformed into dashboard-ready analytical tables. The system creates or uses order, product, shipment, inventory, demand, and risk score tables. These tables support the dashboard modules and make it possible to </w:t>
+      </w:r>
+      <w:proofErr w:type="spellStart"/>
+      <w:r>
+        <w:t>analyze</w:t>
+      </w:r>
+      <w:proofErr w:type="spellEnd"/>
+      <w:r>
+        <w:t xml:space="preserve"> different parts of the supply chain in an integrated way.</w:t>
+      </w:r>
+    </w:p>
+    <w:p>
+      <w:r>
+        <w:br/>
+      </w:r>
+      <w:r>
+        <w:br/>
+        <w:t>The risk assessment approach is rule-based and interpretable. The platform calculates risk by using indicators such as late delivery rate, average delay days, inventory status, and demand volatility. This approach allows users to understand the main reasons behind the risk score. The forecasting module also supports planning by showing historical demand patterns and simple future demand estimates.</w:t>
+      </w:r>
+    </w:p>
+    <w:p>
+      <w:r>
+        <w:br/>
+      </w:r>
+      <w:r>
+        <w:br/>
+        <w:t xml:space="preserve">The project has some limitations. The default </w:t>
+      </w:r>
+      <w:proofErr w:type="spellStart"/>
+      <w:r>
+        <w:t>DataCo</w:t>
+      </w:r>
+      <w:proofErr w:type="spellEnd"/>
+      <w:r>
+        <w:t xml:space="preserve"> dataset is a public historical dataset and does not represent the current operations of a specific company. In addition, the quality of the dashboard outputs depends on the structure and completeness of the uploaded dataset. Some indicators, especially inventory-related fields, are generated for academic demonstration purposes when the uploaded dataset does not contain complete inventory information. The risk score is also rule-based rather than machine-learning-based.</w:t>
+      </w:r>
+    </w:p>
+    <w:p>
+      <w:r>
+        <w:br/>
+      </w:r>
+      <w:r>
+        <w:br/>
+        <w:t xml:space="preserve">In future work, the platform can be improved by adding automatic column detection, database persistence for uploaded datasets, exportable PDF risk reports, real-time ERP or API integration, and more advanced forecasting models. The risk scoring system can also be improved by using machine learning methods if enough historical </w:t>
+      </w:r>
+      <w:proofErr w:type="spellStart"/>
+      <w:r>
+        <w:t>labeled</w:t>
+      </w:r>
+      <w:proofErr w:type="spellEnd"/>
+      <w:r>
+        <w:t xml:space="preserve"> risk data is available.</w:t>
+      </w:r>
+    </w:p>
+    <w:p>
+      <w:r>
+        <w:br/>
+      </w:r>
+      <w:r>
+        <w:br/>
+        <w:t>Overall, the project successfully demonstrates a reusable and dataset-adaptive dashboard platform for supply chain visibility and risk assessment. It shows how different supply chain datasets can be standardized and transformed into operational insights through dashboards, risk indicators, and forecasting modules.</w:t>
       </w:r>
     </w:p>
     <w:p/>
@@ -8867,6 +10100,7 @@
             <w:rPr>
               <w:lang w:val="tr-TR"/>
             </w:rPr>
+            <w:lastRenderedPageBreak/>
             <w:fldChar w:fldCharType="begin"/>
           </w:r>
           <w:r>
@@ -9378,7 +10612,6 @@
             <w:rPr>
               <w:noProof/>
             </w:rPr>
-            <w:lastRenderedPageBreak/>
             <w:t xml:space="preserve">URL_02. (2011, Nisan 21). </w:t>
           </w:r>
           <w:r>
@@ -9534,7 +10767,15 @@
       <w:bookmarkStart w:id="26" w:name="_Toc115861789"/>
       <w:r>
         <w:lastRenderedPageBreak/>
-        <w:t>GIT/KAGGLE/COLAB/etc.. LINK</w:t>
+        <w:t>GIT/KAGGLE/COLAB/</w:t>
+      </w:r>
+      <w:proofErr w:type="gramStart"/>
+      <w:r>
+        <w:t>etc..</w:t>
+      </w:r>
+      <w:proofErr w:type="gramEnd"/>
+      <w:r>
+        <w:t xml:space="preserve"> LINK</w:t>
       </w:r>
       <w:bookmarkEnd w:id="26"/>
     </w:p>
@@ -9611,6 +10852,7 @@
           <w:lang w:val="en-US" w:eastAsia="tr-TR"/>
         </w:rPr>
       </w:pPr>
+      <w:proofErr w:type="gramStart"/>
       <w:r>
         <w:rPr>
           <w:b/>
@@ -9618,6 +10860,7 @@
         </w:rPr>
         <w:t>Education :</w:t>
       </w:r>
+      <w:proofErr w:type="gramEnd"/>
     </w:p>
     <w:p>
       <w:pPr>
@@ -9625,6 +10868,7 @@
           <w:lang w:val="en-US" w:eastAsia="tr-TR"/>
         </w:rPr>
       </w:pPr>
+      <w:proofErr w:type="gramStart"/>
       <w:r>
         <w:rPr>
           <w:i/>
@@ -9637,7 +10881,14 @@
         <w:rPr>
           <w:lang w:val="en-US" w:eastAsia="tr-TR"/>
         </w:rPr>
-        <w:t xml:space="preserve"> : Piri Reis University </w:t>
+        <w:t xml:space="preserve"> :</w:t>
+      </w:r>
+      <w:proofErr w:type="gramEnd"/>
+      <w:r>
+        <w:rPr>
+          <w:lang w:val="en-US" w:eastAsia="tr-TR"/>
+        </w:rPr>
+        <w:t xml:space="preserve"> Piri Reis University </w:t>
       </w:r>
     </w:p>
     <w:p>
@@ -9779,7 +11030,25 @@
           <w:bCs/>
           <w:lang w:val="en-US" w:eastAsia="tr-TR"/>
         </w:rPr>
-        <w:t>Professional skill:</w:t>
+        <w:t xml:space="preserve">Professional </w:t>
+      </w:r>
+      <w:proofErr w:type="gramStart"/>
+      <w:r>
+        <w:rPr>
+          <w:b/>
+          <w:bCs/>
+          <w:lang w:val="en-US" w:eastAsia="tr-TR"/>
+        </w:rPr>
+        <w:t>skill</w:t>
+      </w:r>
+      <w:proofErr w:type="gramEnd"/>
+      <w:r>
+        <w:rPr>
+          <w:b/>
+          <w:bCs/>
+          <w:lang w:val="en-US" w:eastAsia="tr-TR"/>
+        </w:rPr>
+        <w:t>:</w:t>
       </w:r>
     </w:p>
     <w:p>
@@ -10334,7 +11603,15 @@
       <w:t>South African Journal of Industrial Engineering</w:t>
     </w:r>
     <w:r>
-      <w:t xml:space="preserve"> Month Year Vol __(_):  p1-3</w:t>
+      <w:t xml:space="preserve"> Month Year Vol _</w:t>
+    </w:r>
+    <w:proofErr w:type="gramStart"/>
+    <w:r>
+      <w:t>_(</w:t>
+    </w:r>
+    <w:proofErr w:type="gramEnd"/>
+    <w:r>
+      <w:t>_):  p1-3</w:t>
     </w:r>
   </w:p>
 </w:ftr>

</xml_diff>

<commit_message>
Add citations and references
</commit_message>
<xml_diff>
--- a/docs/graduation_thesis_report.docx
+++ b/docs/graduation_thesis_report.docx
@@ -3887,14 +3887,74 @@
     </w:p>
     <w:p>
       <w:r>
-        <w:t>Supply chain visibility refers to the ability to monitor and understand the movement of products, orders, shipments, inventory, and related information across the supply chain. In modern supply chains, operations are often spread across different regions, suppliers, transport modes, and information systems. Because of this complexity, managers need integrated visibility tools to understand what is happening in the supply chain and to detect problems early. [INSERT CITATION: Supply Chain Visibility]</w:t>
-      </w:r>
+        <w:t xml:space="preserve">Supply chain visibility refers to the ability to monitor and understand the movement of products, orders, shipments, inventory, and related information across the supply chain. In modern supply chains, operations are often spread across different regions, suppliers, transport modes, and information systems. Because of this complexity, managers need integrated visibility tools to understand what is happening in the supply chain and to detect problems early. </w:t>
+      </w:r>
+      <w:sdt>
+        <w:sdtPr>
+          <w:id w:val="-899445615"/>
+          <w:citation/>
+        </w:sdtPr>
+        <w:sdtContent>
+          <w:r>
+            <w:fldChar w:fldCharType="begin"/>
+          </w:r>
+          <w:r>
+            <w:rPr>
+              <w:lang w:val="en-US"/>
+            </w:rPr>
+            <w:instrText xml:space="preserve"> CITATION Ora23 \l 1033 </w:instrText>
+          </w:r>
+          <w:r>
+            <w:fldChar w:fldCharType="separate"/>
+          </w:r>
+          <w:r>
+            <w:rPr>
+              <w:noProof/>
+              <w:lang w:val="en-US"/>
+            </w:rPr>
+            <w:t>(Oracle, 2023)</w:t>
+          </w:r>
+          <w:r>
+            <w:fldChar w:fldCharType="end"/>
+          </w:r>
+        </w:sdtContent>
+      </w:sdt>
     </w:p>
     <w:p/>
     <w:p>
       <w:r>
-        <w:t>Visibility is important because supply chain decisions depend on timely and accurate information. If delivery delays, inventory shortages, regional problems, or demand changes are not visible, managers may react too late. A visibility system can help users monitor key indicators such as order volume, delivery status, shipment delays, inventory condition, sales, profit, and demand trends from a single interface. [INSERT CITATION: Supply Chain Visibility]</w:t>
-      </w:r>
+        <w:t xml:space="preserve">Visibility is important because supply chain decisions depend on timely and accurate information. If delivery delays, inventory shortages, regional problems, or demand changes are not visible, managers may react too late. A visibility system can help users monitor key indicators such as order volume, delivery status, shipment delays, inventory condition, sales, profit, and demand trends from a single interface. </w:t>
+      </w:r>
+      <w:sdt>
+        <w:sdtPr>
+          <w:id w:val="756399419"/>
+          <w:citation/>
+        </w:sdtPr>
+        <w:sdtContent>
+          <w:r>
+            <w:fldChar w:fldCharType="begin"/>
+          </w:r>
+          <w:r>
+            <w:rPr>
+              <w:lang w:val="en-US"/>
+            </w:rPr>
+            <w:instrText xml:space="preserve"> CITATION Ora23 \l 1033 </w:instrText>
+          </w:r>
+          <w:r>
+            <w:fldChar w:fldCharType="separate"/>
+          </w:r>
+          <w:r>
+            <w:rPr>
+              <w:noProof/>
+              <w:lang w:val="en-US"/>
+            </w:rPr>
+            <w:t>(Oracle, 2023)</w:t>
+          </w:r>
+          <w:r>
+            <w:fldChar w:fldCharType="end"/>
+          </w:r>
+        </w:sdtContent>
+      </w:sdt>
     </w:p>
     <w:p/>
     <w:p>
@@ -3930,14 +3990,74 @@
       </w:r>
       <w:proofErr w:type="spellEnd"/>
       <w:r>
-        <w:t xml:space="preserve"> large tables manually, users can monitor key performance indicators, charts, and summary tables through an interactive interface. Dashboards are especially useful in operational areas where managers need to make quick and data-based decisions. [INSERT CITATION: Business Intelligence Dashboards]</w:t>
-      </w:r>
+        <w:t xml:space="preserve"> large tables manually, users can monitor key performance indicators, charts, and summary tables through an interactive interface. Dashboards are especially useful in operational areas where managers need to make quick and data-based decisions. </w:t>
+      </w:r>
+      <w:sdt>
+        <w:sdtPr>
+          <w:id w:val="-1975205604"/>
+          <w:citation/>
+        </w:sdtPr>
+        <w:sdtContent>
+          <w:r>
+            <w:fldChar w:fldCharType="begin"/>
+          </w:r>
+          <w:r>
+            <w:rPr>
+              <w:lang w:val="en-US"/>
+            </w:rPr>
+            <w:instrText xml:space="preserve"> CITATION Gra19 \l 1033 </w:instrText>
+          </w:r>
+          <w:r>
+            <w:fldChar w:fldCharType="separate"/>
+          </w:r>
+          <w:r>
+            <w:rPr>
+              <w:noProof/>
+              <w:lang w:val="en-US"/>
+            </w:rPr>
+            <w:t>(Grabińska, 2019)</w:t>
+          </w:r>
+          <w:r>
+            <w:fldChar w:fldCharType="end"/>
+          </w:r>
+        </w:sdtContent>
+      </w:sdt>
     </w:p>
     <w:p/>
     <w:p>
       <w:r>
-        <w:t>In supply chain management, dashboards can support decision-making by showing delivery performance, regional differences, inventory problems, shipment delays, and risk indicators. A well-designed dashboard does not only display data; it also helps users compare performance, identify patterns, and focus on problem areas. For this reason, dashboards can act as decision-support tools for supply chain managers, logistics analysts, inventory planners, and business analysts. [INSERT CITATION: Business Intelligence Dashboards]</w:t>
-      </w:r>
+        <w:t xml:space="preserve">In supply chain management, dashboards can support decision-making by showing delivery performance, regional differences, inventory problems, shipment delays, and risk indicators. A well-designed dashboard does not only display data; it also helps users compare performance, identify patterns, and focus on problem areas. For this reason, dashboards can act as decision-support tools for supply chain managers, logistics analysts, inventory planners, and business analysts. </w:t>
+      </w:r>
+      <w:sdt>
+        <w:sdtPr>
+          <w:id w:val="-840613956"/>
+          <w:citation/>
+        </w:sdtPr>
+        <w:sdtContent>
+          <w:r>
+            <w:fldChar w:fldCharType="begin"/>
+          </w:r>
+          <w:r>
+            <w:rPr>
+              <w:lang w:val="en-US"/>
+            </w:rPr>
+            <w:instrText xml:space="preserve"> CITATION Gra19 \l 1033 </w:instrText>
+          </w:r>
+          <w:r>
+            <w:fldChar w:fldCharType="separate"/>
+          </w:r>
+          <w:r>
+            <w:rPr>
+              <w:noProof/>
+              <w:lang w:val="en-US"/>
+            </w:rPr>
+            <w:t>(Grabińska, 2019)</w:t>
+          </w:r>
+          <w:r>
+            <w:fldChar w:fldCharType="end"/>
+          </w:r>
+        </w:sdtContent>
+      </w:sdt>
     </w:p>
     <w:p/>
     <w:p>
@@ -3956,14 +4076,74 @@
     </w:p>
     <w:p>
       <w:r>
-        <w:t>Supply chain risk management focuses on identifying, assessing, and reducing risks that can affect supply chain performance. These risks may include late deliveries, transportation delays, demand uncertainty, inventory shortages, regional disruptions, supplier problems, and financial losses. Since supply chains include many connected activities, a problem in one part of the system can affect other parts of the operation. [INSERT CITATION: Supply Chain Risk Management]</w:t>
-      </w:r>
+        <w:t xml:space="preserve">Supply chain risk management focuses on identifying, assessing, and reducing risks that can affect supply chain performance. These risks may include late deliveries, transportation delays, demand uncertainty, inventory shortages, regional disruptions, supplier problems, and financial losses. Since supply chains include many connected activities, a problem in one part of the system can affect other parts of the operation. </w:t>
+      </w:r>
+      <w:sdt>
+        <w:sdtPr>
+          <w:id w:val="365028535"/>
+          <w:citation/>
+        </w:sdtPr>
+        <w:sdtContent>
+          <w:r>
+            <w:fldChar w:fldCharType="begin"/>
+          </w:r>
+          <w:r>
+            <w:rPr>
+              <w:lang w:val="en-US"/>
+            </w:rPr>
+            <w:instrText xml:space="preserve"> CITATION Das25 \l 1033 </w:instrText>
+          </w:r>
+          <w:r>
+            <w:fldChar w:fldCharType="separate"/>
+          </w:r>
+          <w:r>
+            <w:rPr>
+              <w:noProof/>
+              <w:lang w:val="en-US"/>
+            </w:rPr>
+            <w:t>(Das, Kumar, &amp; Tiwari, 2025)</w:t>
+          </w:r>
+          <w:r>
+            <w:fldChar w:fldCharType="end"/>
+          </w:r>
+        </w:sdtContent>
+      </w:sdt>
     </w:p>
     <w:p/>
     <w:p>
       <w:r>
-        <w:t>Risk assessment is more useful when different risk indicators are evaluated together. For example, late delivery rate alone may not fully explain supply chain risk. A better risk view may also include delay days, inventory condition, demand volatility, and regional performance. Therefore, dashboard-based risk analysis can help managers understand not only where risks exist, but also which indicators contribute to those risks. [INSERT CITATION: Supply Chain Risk Management]</w:t>
-      </w:r>
+        <w:t xml:space="preserve">Risk assessment is more useful when different risk indicators are evaluated together. For example, late delivery rate alone may not fully explain supply chain risk. A better risk view may also include delay days, inventory condition, demand volatility, and regional performance. Therefore, dashboard-based risk analysis can help managers understand not only where risks exist, but also which indicators contribute to those risks. </w:t>
+      </w:r>
+      <w:sdt>
+        <w:sdtPr>
+          <w:id w:val="-203481882"/>
+          <w:citation/>
+        </w:sdtPr>
+        <w:sdtContent>
+          <w:r>
+            <w:fldChar w:fldCharType="begin"/>
+          </w:r>
+          <w:r>
+            <w:rPr>
+              <w:lang w:val="en-US"/>
+            </w:rPr>
+            <w:instrText xml:space="preserve"> CITATION Das25 \l 1033 </w:instrText>
+          </w:r>
+          <w:r>
+            <w:fldChar w:fldCharType="separate"/>
+          </w:r>
+          <w:r>
+            <w:rPr>
+              <w:noProof/>
+              <w:lang w:val="en-US"/>
+            </w:rPr>
+            <w:t>(Das, Kumar, &amp; Tiwari, 2025)</w:t>
+          </w:r>
+          <w:r>
+            <w:fldChar w:fldCharType="end"/>
+          </w:r>
+        </w:sdtContent>
+      </w:sdt>
     </w:p>
     <w:p/>
     <w:p>
@@ -3998,14 +4178,74 @@
       </w:r>
       <w:proofErr w:type="spellEnd"/>
       <w:r>
-        <w:t xml:space="preserve"> operational data from different stages of the supply chain. This can support better planning, faster decision-making, and improved coordination between supply chain activities. [INSERT CITATION: Digital Transformation in Logistics]</w:t>
-      </w:r>
+        <w:t xml:space="preserve"> operational data from different stages of the supply chain. This can support better planning, faster decision-making, and improved coordination between supply chain activities. </w:t>
+      </w:r>
+      <w:sdt>
+        <w:sdtPr>
+          <w:id w:val="-1571487344"/>
+          <w:citation/>
+        </w:sdtPr>
+        <w:sdtContent>
+          <w:r>
+            <w:fldChar w:fldCharType="begin"/>
+          </w:r>
+          <w:r>
+            <w:rPr>
+              <w:lang w:val="en-US"/>
+            </w:rPr>
+            <w:instrText xml:space="preserve"> CITATION Raz23 \l 1033 </w:instrText>
+          </w:r>
+          <w:r>
+            <w:fldChar w:fldCharType="separate"/>
+          </w:r>
+          <w:r>
+            <w:rPr>
+              <w:noProof/>
+              <w:lang w:val="en-US"/>
+            </w:rPr>
+            <w:t>(Raza, Svanberg, &amp; Wiegmans, 2023)</w:t>
+          </w:r>
+          <w:r>
+            <w:fldChar w:fldCharType="end"/>
+          </w:r>
+        </w:sdtContent>
+      </w:sdt>
     </w:p>
     <w:p/>
     <w:p>
       <w:r>
-        <w:t>However, digital transformation also requires data integration. Many organizations keep supply chain information in different systems, files, or formats. If these datasets cannot be combined or standardized, it becomes difficult to create useful dashboards and risk analysis tools. For this reason, data standardization is an important part of supply chain analytics. [INSERT CITATION: Data Quality / Data Standardization]</w:t>
-      </w:r>
+        <w:t xml:space="preserve">However, digital transformation also requires data integration. Many organizations keep supply chain information in different systems, files, or formats. If these datasets cannot be combined or standardized, it becomes difficult to create useful dashboards and risk analysis tools. For this reason, data standardization is an important part of supply chain analytics. </w:t>
+      </w:r>
+      <w:sdt>
+        <w:sdtPr>
+          <w:id w:val="788474870"/>
+          <w:citation/>
+        </w:sdtPr>
+        <w:sdtContent>
+          <w:r>
+            <w:fldChar w:fldCharType="begin"/>
+          </w:r>
+          <w:r>
+            <w:rPr>
+              <w:lang w:val="en-US"/>
+            </w:rPr>
+            <w:instrText xml:space="preserve"> CITATION IBM24 \l 1033 </w:instrText>
+          </w:r>
+          <w:r>
+            <w:fldChar w:fldCharType="separate"/>
+          </w:r>
+          <w:r>
+            <w:rPr>
+              <w:noProof/>
+              <w:lang w:val="en-US"/>
+            </w:rPr>
+            <w:t>(IBM, 2024)</w:t>
+          </w:r>
+          <w:r>
+            <w:fldChar w:fldCharType="end"/>
+          </w:r>
+        </w:sdtContent>
+      </w:sdt>
     </w:p>
     <w:p/>
     <w:p>
@@ -4025,14 +4265,74 @@
     </w:p>
     <w:p>
       <w:r>
-        <w:t>Demand forecasting is an important part of supply chain planning because it helps organizations estimate future demand and prepare operational plans. Forecasting can support decisions related to inventory levels, replenishment planning, transportation capacity, and product availability. Even simple forecasting methods can be useful for understanding general demand trends. [INSERT CITATION: Demand Forecasting]</w:t>
-      </w:r>
+        <w:t xml:space="preserve">Demand forecasting is an important part of supply chain planning because it helps organizations estimate future demand and prepare operational plans. Forecasting can support decisions related to inventory levels, replenishment planning, transportation capacity, and product availability. Even simple forecasting methods can be useful for understanding general demand trends. </w:t>
+      </w:r>
+      <w:sdt>
+        <w:sdtPr>
+          <w:id w:val="1752705051"/>
+          <w:citation/>
+        </w:sdtPr>
+        <w:sdtContent>
+          <w:r>
+            <w:fldChar w:fldCharType="begin"/>
+          </w:r>
+          <w:r>
+            <w:rPr>
+              <w:lang w:val="en-US"/>
+            </w:rPr>
+            <w:instrText xml:space="preserve"> CITATION Hyn21 \l 1033 </w:instrText>
+          </w:r>
+          <w:r>
+            <w:fldChar w:fldCharType="separate"/>
+          </w:r>
+          <w:r>
+            <w:rPr>
+              <w:noProof/>
+              <w:lang w:val="en-US"/>
+            </w:rPr>
+            <w:t>(Hyndman &amp; Athanasopoulos, 2021)</w:t>
+          </w:r>
+          <w:r>
+            <w:fldChar w:fldCharType="end"/>
+          </w:r>
+        </w:sdtContent>
+      </w:sdt>
     </w:p>
     <w:p/>
     <w:p>
       <w:r>
-        <w:t>In supply chain dashboards, demand forecasting is often used together with historical demand analysis. Users can compare past demand patterns with forecasted values and evaluate whether demand is increasing, decreasing, or unstable. Forecast accuracy metrics can also help users understand how well a forecasting method performs. [INSERT CITATION: Demand Forecasting]</w:t>
-      </w:r>
+        <w:t xml:space="preserve">In supply chain dashboards, demand forecasting is often used together with historical demand analysis. Users can compare past demand patterns with forecasted values and evaluate whether demand is increasing, decreasing, or unstable. Forecast accuracy metrics can also help users understand how well a forecasting method performs. </w:t>
+      </w:r>
+      <w:sdt>
+        <w:sdtPr>
+          <w:id w:val="1518814348"/>
+          <w:citation/>
+        </w:sdtPr>
+        <w:sdtContent>
+          <w:r>
+            <w:fldChar w:fldCharType="begin"/>
+          </w:r>
+          <w:r>
+            <w:rPr>
+              <w:lang w:val="en-US"/>
+            </w:rPr>
+            <w:instrText xml:space="preserve"> CITATION Hyn21 \l 1033 </w:instrText>
+          </w:r>
+          <w:r>
+            <w:fldChar w:fldCharType="separate"/>
+          </w:r>
+          <w:r>
+            <w:rPr>
+              <w:noProof/>
+              <w:lang w:val="en-US"/>
+            </w:rPr>
+            <w:t>(Hyndman &amp; Athanasopoulos, 2021)</w:t>
+          </w:r>
+          <w:r>
+            <w:fldChar w:fldCharType="end"/>
+          </w:r>
+        </w:sdtContent>
+      </w:sdt>
     </w:p>
     <w:p/>
     <w:p>
@@ -4051,8 +4351,38 @@
     </w:p>
     <w:p>
       <w:r>
-        <w:t>A major challenge in data-driven dashboard systems is that datasets may have different column names, formats, and levels of completeness. For example, one dataset may use “order date,” another may use “PO created date,” and another may use a different name for the same concept. If the system cannot handle these differences, it can only work with one fixed dataset. [INSERT CITATION: Data Quality / Data Standardization]</w:t>
-      </w:r>
+        <w:t xml:space="preserve">A major challenge in data-driven dashboard systems is that datasets may have different column names, formats, and levels of completeness. For example, one dataset may use “order date,” another may use “PO created date,” and another may use a different name for the same concept. If the system cannot handle these differences, it can only work with one fixed dataset. </w:t>
+      </w:r>
+      <w:sdt>
+        <w:sdtPr>
+          <w:id w:val="-1447295205"/>
+          <w:citation/>
+        </w:sdtPr>
+        <w:sdtContent>
+          <w:r>
+            <w:fldChar w:fldCharType="begin"/>
+          </w:r>
+          <w:r>
+            <w:rPr>
+              <w:lang w:val="en-US"/>
+            </w:rPr>
+            <w:instrText xml:space="preserve"> CITATION IBM24 \l 1033 </w:instrText>
+          </w:r>
+          <w:r>
+            <w:fldChar w:fldCharType="separate"/>
+          </w:r>
+          <w:r>
+            <w:rPr>
+              <w:noProof/>
+              <w:lang w:val="en-US"/>
+            </w:rPr>
+            <w:t>(IBM, 2024)</w:t>
+          </w:r>
+          <w:r>
+            <w:fldChar w:fldCharType="end"/>
+          </w:r>
+        </w:sdtContent>
+      </w:sdt>
     </w:p>
     <w:p/>
     <w:p>
@@ -10094,6 +10424,7 @@
               <w:noProof/>
               <w:sz w:val="24"/>
               <w:szCs w:val="24"/>
+              <w:lang w:val="tr-TR"/>
             </w:rPr>
           </w:pPr>
           <w:r>
@@ -10118,22 +10449,25 @@
           <w:r>
             <w:rPr>
               <w:noProof/>
+              <w:lang w:val="tr-TR"/>
             </w:rPr>
-            <w:t xml:space="preserve">D’Aveni, R. (1994). </w:t>
+            <w:t xml:space="preserve">Das, S. K., Kumar, M., &amp; Tiwari, M. K. (2025). </w:t>
           </w:r>
           <w:r>
             <w:rPr>
               <w:i/>
               <w:iCs/>
               <w:noProof/>
+              <w:lang w:val="tr-TR"/>
             </w:rPr>
-            <w:t>Hyper Competition.</w:t>
+            <w:t>Supply chain risk management automation: A literature review</w:t>
           </w:r>
           <w:r>
             <w:rPr>
               <w:noProof/>
+              <w:lang w:val="tr-TR"/>
             </w:rPr>
-            <w:t xml:space="preserve"> New York, NY: The Free Press.</w:t>
+            <w:t>. https://link.springer.com/article/10.1007/s12525-025-00844-1 adresinden alındı</w:t>
           </w:r>
         </w:p>
         <w:p>
@@ -10142,27 +10476,31 @@
             <w:ind w:left="720" w:hanging="720"/>
             <w:rPr>
               <w:noProof/>
+              <w:lang w:val="tr-TR"/>
             </w:rPr>
           </w:pPr>
           <w:r>
             <w:rPr>
               <w:noProof/>
+              <w:lang w:val="tr-TR"/>
             </w:rPr>
-            <w:t xml:space="preserve">Erkan, S. (2015). </w:t>
+            <w:t xml:space="preserve">Grabińska, A. (2019). The Application of Business Intelligence Systems in Logistics. Review of Selected Practical Examples. </w:t>
           </w:r>
           <w:r>
             <w:rPr>
               <w:i/>
               <w:iCs/>
               <w:noProof/>
+              <w:lang w:val="tr-TR"/>
             </w:rPr>
-            <w:t>Bulut Bilişimde Doğru Seçim Özel Bulut mu? Kamusal Bulut mu?</w:t>
+            <w:t>System Safety: Human - Technical Facility - Environment</w:t>
           </w:r>
           <w:r>
             <w:rPr>
               <w:noProof/>
+              <w:lang w:val="tr-TR"/>
             </w:rPr>
-            <w:t xml:space="preserve"> 08 22, 2015 tarihinde karel.com.tr: http://www.karel.com.tr/blog/bulut-bilisim-dogru-secim-ozel-bulut-mu-kamusal-bulut-mu adresinden alındı</w:t>
+            <w:t>.</w:t>
           </w:r>
         </w:p>
         <w:p>
@@ -10171,27 +10509,31 @@
             <w:ind w:left="720" w:hanging="720"/>
             <w:rPr>
               <w:noProof/>
+              <w:lang w:val="tr-TR"/>
             </w:rPr>
           </w:pPr>
           <w:r>
             <w:rPr>
               <w:noProof/>
+              <w:lang w:val="tr-TR"/>
             </w:rPr>
-            <w:t xml:space="preserve">Evans, P., &amp; Wurster, T. (2000). </w:t>
+            <w:t xml:space="preserve">Hyndman, R. J., &amp; Athanasopoulos, G. (2021). </w:t>
           </w:r>
           <w:r>
             <w:rPr>
               <w:i/>
               <w:iCs/>
               <w:noProof/>
+              <w:lang w:val="tr-TR"/>
             </w:rPr>
-            <w:t>Blown to Bits.</w:t>
+            <w:t>Forecasting: Principles and Practice.</w:t>
           </w:r>
           <w:r>
             <w:rPr>
               <w:noProof/>
+              <w:lang w:val="tr-TR"/>
             </w:rPr>
-            <w:t xml:space="preserve"> Boston, MA.: Harvard Business School Press.</w:t>
+            <w:t xml:space="preserve"> OTexts.</w:t>
           </w:r>
         </w:p>
         <w:p>
@@ -10200,27 +10542,31 @@
             <w:ind w:left="720" w:hanging="720"/>
             <w:rPr>
               <w:noProof/>
+              <w:lang w:val="tr-TR"/>
             </w:rPr>
           </w:pPr>
           <w:r>
             <w:rPr>
               <w:noProof/>
+              <w:lang w:val="tr-TR"/>
             </w:rPr>
-            <w:t xml:space="preserve">Ganly, D., Kyte, A., Rayner, N., &amp; Hardcastle, C. (2013, Aralık 05). </w:t>
+            <w:t xml:space="preserve">IBM. (2024). </w:t>
           </w:r>
           <w:r>
             <w:rPr>
               <w:i/>
               <w:iCs/>
               <w:noProof/>
+              <w:lang w:val="tr-TR"/>
             </w:rPr>
-            <w:t>Predicts 2014: The Rise of the Postmodern ERP and Enterprise Applications World</w:t>
+            <w:t>What Are Data Quality Dimensions?</w:t>
           </w:r>
           <w:r>
             <w:rPr>
               <w:noProof/>
+              <w:lang w:val="tr-TR"/>
             </w:rPr>
-            <w:t>. Temmuz 21, 2015 tarihinde Gartner: https://www.gartner.com/doc/2633315 adresinden alındı</w:t>
+            <w:t xml:space="preserve"> IBM Think: https://www.ibm.com/think/topics/data-quality-dimensions adresinden alındı</w:t>
           </w:r>
         </w:p>
         <w:p>
@@ -10229,27 +10575,31 @@
             <w:ind w:left="720" w:hanging="720"/>
             <w:rPr>
               <w:noProof/>
+              <w:lang w:val="tr-TR"/>
             </w:rPr>
           </w:pPr>
           <w:r>
             <w:rPr>
               <w:noProof/>
+              <w:lang w:val="tr-TR"/>
             </w:rPr>
-            <w:t xml:space="preserve">Gör, A. G., &amp; Güneri, F. (2008). ERP Yazılım Seçiminde ANP Tekniğinin Kullanılması. </w:t>
+            <w:t xml:space="preserve">Kaggle. (n.d.). </w:t>
           </w:r>
           <w:r>
             <w:rPr>
               <w:i/>
               <w:iCs/>
               <w:noProof/>
+              <w:lang w:val="tr-TR"/>
             </w:rPr>
-            <w:t>2. Ulusal Sistem Mühendisliği Kongresi Bildiriler Kitabı</w:t>
+            <w:t>DataCo SMART SUPPLY CHAIN FOR BIG DATA ANALYSIS</w:t>
           </w:r>
           <w:r>
             <w:rPr>
               <w:noProof/>
+              <w:lang w:val="tr-TR"/>
             </w:rPr>
-            <w:t>, 296-300.</w:t>
+            <w:t>. Kaggle: https://www.kaggle.com/datasets/shashwatwork/dataco-smart-supply-chain-for-big-data-analysis adresinden alındı</w:t>
           </w:r>
         </w:p>
         <w:p>
@@ -10258,27 +10608,31 @@
             <w:ind w:left="720" w:hanging="720"/>
             <w:rPr>
               <w:noProof/>
+              <w:lang w:val="tr-TR"/>
             </w:rPr>
           </w:pPr>
           <w:r>
             <w:rPr>
               <w:noProof/>
+              <w:lang w:val="tr-TR"/>
             </w:rPr>
-            <w:t xml:space="preserve">Honeywell International Inc. (2015, Mart). </w:t>
+            <w:t xml:space="preserve">Oracle. (2023). </w:t>
           </w:r>
           <w:r>
             <w:rPr>
               <w:i/>
               <w:iCs/>
               <w:noProof/>
+              <w:lang w:val="tr-TR"/>
             </w:rPr>
-            <w:t>Optimize Your Workflow Performance with Voice.</w:t>
+            <w:t>Supply Chain Visibility (SCV): An Introduction</w:t>
           </w:r>
           <w:r>
             <w:rPr>
               <w:noProof/>
+              <w:lang w:val="tr-TR"/>
             </w:rPr>
-            <w:t xml:space="preserve"> Mayıs 31, 2015 tarihinde http://www.vocollectvoice.com: http://www.vocollectvoice.com/download.aspx?file=d532335e-4054-4130-a8d7-38f92778092e.pdf adresinden alındı</w:t>
+            <w:t>. Oracle: https://www.oracle.com/scm/supply-chain-visibility/ adresinden alındı</w:t>
           </w:r>
         </w:p>
         <w:p>
@@ -10287,27 +10641,31 @@
             <w:ind w:left="720" w:hanging="720"/>
             <w:rPr>
               <w:noProof/>
+              <w:lang w:val="tr-TR"/>
             </w:rPr>
           </w:pPr>
           <w:r>
             <w:rPr>
               <w:noProof/>
+              <w:lang w:val="tr-TR"/>
             </w:rPr>
-            <w:t xml:space="preserve">Hung, S. Y., Chang, S. I., &amp; Lee, P. J. (2004). Critical factors of adoption for small and medium sized enterprises: An empirical study. </w:t>
+            <w:t xml:space="preserve">Raza, Z., Svanberg, M., &amp; Wiegmans, B. (2023). </w:t>
           </w:r>
           <w:r>
             <w:rPr>
               <w:i/>
               <w:iCs/>
               <w:noProof/>
+              <w:lang w:val="tr-TR"/>
             </w:rPr>
-            <w:t>Proceedings of the Pacific Asia Conference on Information Systems</w:t>
+            <w:t>Digital transformation of maritime logistics: Exploring trends in the liner shipping segment</w:t>
           </w:r>
           <w:r>
             <w:rPr>
               <w:noProof/>
+              <w:lang w:val="tr-TR"/>
             </w:rPr>
-            <w:t xml:space="preserve"> (s. 724-737). PACIS 2004.</w:t>
+            <w:t>. Computers in Industry: https://www.sciencedirect.com/science/article/pii/S016636152200207X adresinden alındı</w:t>
           </w:r>
         </w:p>
         <w:p>
@@ -10316,404 +10674,31 @@
             <w:ind w:left="720" w:hanging="720"/>
             <w:rPr>
               <w:noProof/>
+              <w:lang w:val="tr-TR"/>
             </w:rPr>
           </w:pPr>
           <w:r>
             <w:rPr>
               <w:noProof/>
+              <w:lang w:val="tr-TR"/>
             </w:rPr>
-            <w:t xml:space="preserve">Hurbean, L., &amp; Fotache, D. (2014). ERP III: The Promise Of A New Generation. </w:t>
+            <w:t xml:space="preserve">Streamlit. (n.d.). </w:t>
           </w:r>
           <w:r>
             <w:rPr>
               <w:i/>
               <w:iCs/>
               <w:noProof/>
+              <w:lang w:val="tr-TR"/>
             </w:rPr>
-            <w:t>Proceedings of the IE 2014 International Conference.</w:t>
+            <w:t>st.file_uploader</w:t>
           </w:r>
           <w:r>
             <w:rPr>
               <w:noProof/>
+              <w:lang w:val="tr-TR"/>
             </w:rPr>
-            <w:t xml:space="preserve"> May 15-18, Bucharest.</w:t>
-          </w:r>
-        </w:p>
-        <w:p>
-          <w:pPr>
-            <w:pStyle w:val="Bibliography"/>
-            <w:ind w:left="720" w:hanging="720"/>
-            <w:rPr>
-              <w:noProof/>
-            </w:rPr>
-          </w:pPr>
-          <w:r>
-            <w:rPr>
-              <w:noProof/>
-            </w:rPr>
-            <w:t xml:space="preserve">Malhotra, R., &amp; Temponi, C. (2010). Critical decisions for ERP integration: Small business issues. </w:t>
-          </w:r>
-          <w:r>
-            <w:rPr>
-              <w:i/>
-              <w:iCs/>
-              <w:noProof/>
-            </w:rPr>
-            <w:t>International Journal of Information Management</w:t>
-          </w:r>
-          <w:r>
-            <w:rPr>
-              <w:noProof/>
-            </w:rPr>
-            <w:t>, 30, 28-37.</w:t>
-          </w:r>
-        </w:p>
-        <w:p>
-          <w:pPr>
-            <w:pStyle w:val="Bibliography"/>
-            <w:ind w:left="720" w:hanging="720"/>
-            <w:rPr>
-              <w:noProof/>
-            </w:rPr>
-          </w:pPr>
-          <w:r>
-            <w:rPr>
-              <w:noProof/>
-            </w:rPr>
-            <w:t xml:space="preserve">Nah, F. F.-H., &amp; Lau, J. L.-S. (2001). Critical factors for successful implementation of enterprise systems. </w:t>
-          </w:r>
-          <w:r>
-            <w:rPr>
-              <w:i/>
-              <w:iCs/>
-              <w:noProof/>
-            </w:rPr>
-            <w:t>Business Process Management Journal</w:t>
-          </w:r>
-          <w:r>
-            <w:rPr>
-              <w:noProof/>
-            </w:rPr>
-            <w:t>, 7:3, 285-296.</w:t>
-          </w:r>
-        </w:p>
-        <w:p>
-          <w:pPr>
-            <w:pStyle w:val="Bibliography"/>
-            <w:ind w:left="720" w:hanging="720"/>
-            <w:rPr>
-              <w:noProof/>
-            </w:rPr>
-          </w:pPr>
-          <w:r>
-            <w:rPr>
-              <w:noProof/>
-            </w:rPr>
-            <w:t xml:space="preserve">Rajagopal, P. (2002). An innovation-diffusion view of implementation of enterprise resource planning (ERP) systems and development of a research model. </w:t>
-          </w:r>
-          <w:r>
-            <w:rPr>
-              <w:i/>
-              <w:iCs/>
-              <w:noProof/>
-            </w:rPr>
-            <w:t>Information &amp; Management</w:t>
-          </w:r>
-          <w:r>
-            <w:rPr>
-              <w:noProof/>
-            </w:rPr>
-            <w:t>, 40, 87–114.</w:t>
-          </w:r>
-        </w:p>
-        <w:p>
-          <w:pPr>
-            <w:pStyle w:val="Bibliography"/>
-            <w:ind w:left="720" w:hanging="720"/>
-            <w:rPr>
-              <w:noProof/>
-            </w:rPr>
-          </w:pPr>
-          <w:r>
-            <w:rPr>
-              <w:noProof/>
-            </w:rPr>
-            <w:t xml:space="preserve">Razmi, J., &amp; Sangari, M. S. (2008). A hybrid multi-criteria decision making model for ERP system selection. </w:t>
-          </w:r>
-          <w:r>
-            <w:rPr>
-              <w:i/>
-              <w:iCs/>
-              <w:noProof/>
-            </w:rPr>
-            <w:t>Proceedings of 4th International Conference on Information and Automation for Sustainability (ICIAfS )</w:t>
-          </w:r>
-          <w:r>
-            <w:rPr>
-              <w:noProof/>
-            </w:rPr>
-            <w:t>, (s. 489-495). Sri Lanka.</w:t>
-          </w:r>
-        </w:p>
-        <w:p>
-          <w:pPr>
-            <w:pStyle w:val="Bibliography"/>
-            <w:ind w:left="720" w:hanging="720"/>
-            <w:rPr>
-              <w:noProof/>
-            </w:rPr>
-          </w:pPr>
-          <w:r>
-            <w:rPr>
-              <w:noProof/>
-            </w:rPr>
-            <w:t xml:space="preserve">Santhanam, R., &amp; Kyparisis, G. (1996). A decision model for interdependent information system project selection. </w:t>
-          </w:r>
-          <w:r>
-            <w:rPr>
-              <w:i/>
-              <w:iCs/>
-              <w:noProof/>
-            </w:rPr>
-            <w:t>European Journal of Operational Research</w:t>
-          </w:r>
-          <w:r>
-            <w:rPr>
-              <w:noProof/>
-            </w:rPr>
-            <w:t>, 89, 380-399.</w:t>
-          </w:r>
-        </w:p>
-        <w:p>
-          <w:pPr>
-            <w:pStyle w:val="Bibliography"/>
-            <w:ind w:left="720" w:hanging="720"/>
-            <w:rPr>
-              <w:noProof/>
-            </w:rPr>
-          </w:pPr>
-          <w:r>
-            <w:rPr>
-              <w:noProof/>
-            </w:rPr>
-            <w:t xml:space="preserve">SaphilaAFSUG. (2014, Haziran 9). </w:t>
-          </w:r>
-          <w:r>
-            <w:rPr>
-              <w:i/>
-              <w:iCs/>
-              <w:noProof/>
-            </w:rPr>
-            <w:t>Post modern ERP Key trends.</w:t>
-          </w:r>
-          <w:r>
-            <w:rPr>
-              <w:noProof/>
-            </w:rPr>
-            <w:t xml:space="preserve"> Temmuz 22, 2015 tarihinde AFSUG: http://www.afsug.com/library/documents/saphila2014_presentations/Day1/CINEMA_2/Postmodern%20ERP%20-%20Key%20Trends.pdf adresinden alındı</w:t>
-          </w:r>
-        </w:p>
-        <w:p>
-          <w:pPr>
-            <w:pStyle w:val="Bibliography"/>
-            <w:ind w:left="720" w:hanging="720"/>
-            <w:rPr>
-              <w:noProof/>
-            </w:rPr>
-          </w:pPr>
-          <w:r>
-            <w:rPr>
-              <w:noProof/>
-            </w:rPr>
-            <w:t xml:space="preserve">Stamford, C. (2014, Ocak 29). </w:t>
-          </w:r>
-          <w:r>
-            <w:rPr>
-              <w:i/>
-              <w:iCs/>
-              <w:noProof/>
-            </w:rPr>
-            <w:t>Gartner Says By 2016, the Impact of Cloud and Emergence of Postmodern ERP Will Relegate Highly Customized ERP Systems to "Legacy" Status</w:t>
-          </w:r>
-          <w:r>
-            <w:rPr>
-              <w:noProof/>
-            </w:rPr>
-            <w:t>. Temmuz 22, 2015 tarihinde Gartner: http://www.gartner.com/newsroom/id/2658415 adresinden alındı</w:t>
-          </w:r>
-        </w:p>
-        <w:p>
-          <w:pPr>
-            <w:pStyle w:val="Bibliography"/>
-            <w:ind w:left="720" w:hanging="720"/>
-            <w:rPr>
-              <w:noProof/>
-            </w:rPr>
-          </w:pPr>
-          <w:r>
-            <w:rPr>
-              <w:noProof/>
-            </w:rPr>
-            <w:t xml:space="preserve">Teltumbde, A. (2000). A framework of evaluating ERP projects. </w:t>
-          </w:r>
-          <w:r>
-            <w:rPr>
-              <w:i/>
-              <w:iCs/>
-              <w:noProof/>
-            </w:rPr>
-            <w:t>International Journal of Production Research</w:t>
-          </w:r>
-          <w:r>
-            <w:rPr>
-              <w:noProof/>
-            </w:rPr>
-            <w:t>, 28,4507-4520.</w:t>
-          </w:r>
-        </w:p>
-        <w:p>
-          <w:pPr>
-            <w:pStyle w:val="Bibliography"/>
-            <w:ind w:left="720" w:hanging="720"/>
-            <w:rPr>
-              <w:noProof/>
-            </w:rPr>
-          </w:pPr>
-          <w:r>
-            <w:rPr>
-              <w:noProof/>
-            </w:rPr>
-            <w:t xml:space="preserve">URL_01. (2013, Nisan 2). </w:t>
-          </w:r>
-          <w:r>
-            <w:rPr>
-              <w:i/>
-              <w:iCs/>
-              <w:noProof/>
-            </w:rPr>
-            <w:t>Word kullanarak kaynakça ve metin içi referans hazırlama</w:t>
-          </w:r>
-          <w:r>
-            <w:rPr>
-              <w:noProof/>
-            </w:rPr>
-            <w:t>. 06 17, 2015 tarihinde Youtube: https://www.youtube.com/watch?v=lY5e4ac8Feg adresinden alındı</w:t>
-          </w:r>
-        </w:p>
-        <w:p>
-          <w:pPr>
-            <w:pStyle w:val="Bibliography"/>
-            <w:ind w:left="720" w:hanging="720"/>
-            <w:rPr>
-              <w:noProof/>
-            </w:rPr>
-          </w:pPr>
-          <w:r>
-            <w:rPr>
-              <w:noProof/>
-            </w:rPr>
-            <w:t xml:space="preserve">URL_02. (2011, Nisan 21). </w:t>
-          </w:r>
-          <w:r>
-            <w:rPr>
-              <w:i/>
-              <w:iCs/>
-              <w:noProof/>
-            </w:rPr>
-            <w:t>Easy Referencing Using Word 2010</w:t>
-          </w:r>
-          <w:r>
-            <w:rPr>
-              <w:noProof/>
-            </w:rPr>
-            <w:t>. 06 17, 2015 tarihinde Youtube: Easy Referencing Using Word 2010 adresinden alındı</w:t>
-          </w:r>
-        </w:p>
-        <w:p>
-          <w:pPr>
-            <w:pStyle w:val="Bibliography"/>
-            <w:ind w:left="720" w:hanging="720"/>
-            <w:rPr>
-              <w:noProof/>
-            </w:rPr>
-          </w:pPr>
-          <w:r>
-            <w:rPr>
-              <w:noProof/>
-            </w:rPr>
-            <w:t xml:space="preserve">URL_02. (2011, Nisan 21). </w:t>
-          </w:r>
-          <w:r>
-            <w:rPr>
-              <w:i/>
-              <w:iCs/>
-              <w:noProof/>
-            </w:rPr>
-            <w:t>Easy Referencing Using Word 2010</w:t>
-          </w:r>
-          <w:r>
-            <w:rPr>
-              <w:noProof/>
-            </w:rPr>
-            <w:t>. 06 17, 2015 tarihinde Youtube: https://www.youtube.com/watch?v=FRjKD2HQPGg adresinden alındı</w:t>
-          </w:r>
-        </w:p>
-        <w:p>
-          <w:pPr>
-            <w:pStyle w:val="Bibliography"/>
-            <w:ind w:left="720" w:hanging="720"/>
-            <w:rPr>
-              <w:noProof/>
-            </w:rPr>
-          </w:pPr>
-          <w:r>
-            <w:rPr>
-              <w:noProof/>
-            </w:rPr>
-            <w:t xml:space="preserve">URL_03. (2015, 06). </w:t>
-          </w:r>
-          <w:r>
-            <w:rPr>
-              <w:i/>
-              <w:iCs/>
-              <w:noProof/>
-            </w:rPr>
-            <w:t>Proje / Tez Yazım Kuralları.</w:t>
-          </w:r>
-          <w:r>
-            <w:rPr>
-              <w:noProof/>
-            </w:rPr>
-            <w:t xml:space="preserve"> 06 18, 2015 tarihinde Okan Üniversitesi: http://sosyalbilimler.okan.edu.tr/media/55/50ed1aa4150ba03a22000055/Proje_Yaz%C4%B1m_Kurallar%C4%B1.doc adresinden alındı</w:t>
-          </w:r>
-        </w:p>
-        <w:p>
-          <w:pPr>
-            <w:pStyle w:val="Bibliography"/>
-            <w:ind w:left="720" w:hanging="720"/>
-            <w:rPr>
-              <w:noProof/>
-            </w:rPr>
-          </w:pPr>
-          <w:r>
-            <w:rPr>
-              <w:noProof/>
-            </w:rPr>
-            <w:t xml:space="preserve">URL_04. (tarih yok). </w:t>
-          </w:r>
-          <w:r>
-            <w:rPr>
-              <w:i/>
-              <w:iCs/>
-              <w:noProof/>
-            </w:rPr>
-            <w:t>MRPI, MRPII, ERPII Nedir ? - ERP Nedir ?</w:t>
-          </w:r>
-          <w:r>
-            <w:rPr>
-              <w:noProof/>
-            </w:rPr>
-            <w:t xml:space="preserve"> 08 22, 2015 tarihinde erp.web.tr: http://www.erp.web.tr/erp-nedir/mrpi-mrpii-erpii-nedir/pdf adresinden alındı</w:t>
+            <w:t>. Streamlit Documentation: https://docs.streamlit.io/develop/api-reference/widgets/st.file_uploader adresinden alındı</w:t>
           </w:r>
         </w:p>
         <w:p>
@@ -15627,521 +15612,173 @@
 </file>
 
 <file path=customXml/item1.xml><?xml version="1.0" encoding="utf-8"?>
-<b:Sources xmlns:b="http://schemas.openxmlformats.org/officeDocument/2006/bibliography" xmlns="http://schemas.openxmlformats.org/officeDocument/2006/bibliography" SelectedStyle="\APA.XSL" StyleName="APA">
+<b:Sources xmlns:b="http://schemas.openxmlformats.org/officeDocument/2006/bibliography" xmlns="http://schemas.openxmlformats.org/officeDocument/2006/bibliography" SelectedStyle="\APASixthEditionOfficeOnline.xsl" StyleName="APA" Version="6">
   <b:Source>
-    <b:Tag>Mal10</b:Tag>
+    <b:Tag>Ora23</b:Tag>
+    <b:SourceType>InternetSite</b:SourceType>
+    <b:Guid>{D92E88B3-9CAC-437D-B4FF-44E188AB31EF}</b:Guid>
+    <b:Title>Supply Chain Visibility (SCV): An Introduction</b:Title>
+    <b:Year>2023</b:Year>
+    <b:Author>
+      <b:Author>
+        <b:Corporate>Oracle</b:Corporate>
+      </b:Author>
+    </b:Author>
+    <b:InternetSiteTitle>Oracle</b:InternetSiteTitle>
+    <b:URL>https://www.oracle.com/scm/supply-chain-visibility/</b:URL>
+    <b:RefOrder>1</b:RefOrder>
+  </b:Source>
+  <b:Source>
+    <b:Tag>Gra19</b:Tag>
     <b:SourceType>JournalArticle</b:SourceType>
-    <b:Guid>{0F5F134A-6929-4C52-A60C-39BFBE8EE665}</b:Guid>
+    <b:Guid>{E2F9CF9A-C5E2-45EF-BD6B-CCAEC241C3B1}</b:Guid>
+    <b:Title>The Application of Business Intelligence Systems in Logistics. Review of Selected Practical Examples</b:Title>
+    <b:Year>2019</b:Year>
     <b:Author>
       <b:Author>
         <b:NameList>
           <b:Person>
-            <b:Last>Malhotra</b:Last>
-            <b:First>R</b:First>
-          </b:Person>
-          <b:Person>
-            <b:Last>Temponi</b:Last>
-            <b:First>C</b:First>
+            <b:Last>Grabińska</b:Last>
+            <b:First>Aleksandra</b:First>
           </b:Person>
         </b:NameList>
       </b:Author>
     </b:Author>
-    <b:Title>Critical decisions for ERP integration: Small business issues</b:Title>
-    <b:JournalName>International Journal of Information Management</b:JournalName>
-    <b:Year>2010</b:Year>
-    <b:Pages>30, 28-37</b:Pages>
-    <b:RefOrder>5</b:RefOrder>
+    <b:JournalName>System Safety: Human - Technical Facility - Environment</b:JournalName>
+    <b:RefOrder>2</b:RefOrder>
   </b:Source>
   <b:Source>
-    <b:Tag>URL13</b:Tag>
+    <b:Tag>Das25</b:Tag>
     <b:SourceType>InternetSite</b:SourceType>
-    <b:Guid>{FD7D3283-3A12-42D9-92C0-931630723A9D}</b:Guid>
-    <b:Title>Word kullanarak kaynakça ve metin içi referans hazırlama</b:Title>
-    <b:Year>2013</b:Year>
+    <b:Guid>{A187A2E6-DB58-45EF-A632-F45CCD627119}</b:Guid>
     <b:Author>
       <b:Author>
         <b:NameList>
           <b:Person>
-            <b:Last>URL_01</b:Last>
+            <b:Last>Das</b:Last>
+            <b:First>S.</b:First>
+            <b:Middle>K.</b:Middle>
+          </b:Person>
+          <b:Person>
+            <b:Last>Kumar</b:Last>
+            <b:First>M.</b:First>
+          </b:Person>
+          <b:Person>
+            <b:Last>Tiwari</b:Last>
+            <b:First>M.</b:First>
+            <b:Middle>K.</b:Middle>
           </b:Person>
         </b:NameList>
       </b:Author>
     </b:Author>
-    <b:InternetSiteTitle>Youtube</b:InternetSiteTitle>
-    <b:Month>Nisan</b:Month>
-    <b:Day>2</b:Day>
-    <b:YearAccessed>2015</b:YearAccessed>
-    <b:MonthAccessed>06</b:MonthAccessed>
-    <b:DayAccessed>17</b:DayAccessed>
-    <b:URL>https://www.youtube.com/watch?v=lY5e4ac8Feg</b:URL>
-    <b:RefOrder>6</b:RefOrder>
+    <b:Title>Supply chain risk management automation: A literature review</b:Title>
+    <b:JournalName>Electronic Markets</b:JournalName>
+    <b:Year>2025</b:Year>
+    <b:URL>https://link.springer.com/article/10.1007/s12525-025-00844-1</b:URL>
+    <b:RefOrder>3</b:RefOrder>
   </b:Source>
   <b:Source>
-    <b:Tag>Eas11</b:Tag>
+    <b:Tag>Raz23</b:Tag>
     <b:SourceType>InternetSite</b:SourceType>
-    <b:Guid>{21F19487-77AC-4BC9-8628-F48A046FF504}</b:Guid>
-    <b:Title>Easy Referencing Using Word 2010</b:Title>
-    <b:InternetSiteTitle>Youtube</b:InternetSiteTitle>
-    <b:Year>2011</b:Year>
-    <b:Month>Nisan</b:Month>
-    <b:Day>21</b:Day>
-    <b:YearAccessed>2015</b:YearAccessed>
-    <b:MonthAccessed>06</b:MonthAccessed>
-    <b:DayAccessed>17</b:DayAccessed>
-    <b:URL>Easy Referencing Using Word 2010</b:URL>
+    <b:Guid>{A32FE820-EFE1-464F-A97C-CB4B26741D7D}</b:Guid>
     <b:Author>
       <b:Author>
         <b:NameList>
           <b:Person>
-            <b:Last>URL_02</b:Last>
+            <b:Last>Raza</b:Last>
+            <b:First>Z.</b:First>
+          </b:Person>
+          <b:Person>
+            <b:Last>Svanberg</b:Last>
+            <b:First>M.</b:First>
+          </b:Person>
+          <b:Person>
+            <b:Last>Wiegmans</b:Last>
+            <b:First>B.</b:First>
           </b:Person>
         </b:NameList>
       </b:Author>
     </b:Author>
-    <b:RefOrder>7</b:RefOrder>
+    <b:Title>Digital transformation of maritime logistics: Exploring trends in the liner shipping segment</b:Title>
+    <b:InternetSiteTitle>Computers in Industry</b:InternetSiteTitle>
+    <b:Year>2023</b:Year>
+    <b:URL>https://www.sciencedirect.com/science/article/pii/S016636152200207X</b:URL>
+    <b:RefOrder>4</b:RefOrder>
   </b:Source>
   <b:Source>
-    <b:Tag>STA14</b:Tag>
+    <b:Tag>IBM24</b:Tag>
     <b:SourceType>InternetSite</b:SourceType>
-    <b:Guid>{A4107BCF-4952-492C-80E3-CF097568DF51}</b:Guid>
-    <b:Title>Gartner Says By 2016, the Impact of Cloud and Emergence of Postmodern ERP Will Relegate Highly Customized ERP Systems to "Legacy" Status</b:Title>
-    <b:InternetSiteTitle>Gartner</b:InternetSiteTitle>
-    <b:Year>2014</b:Year>
-    <b:Month>Ocak</b:Month>
-    <b:Day>29</b:Day>
-    <b:YearAccessed>2015</b:YearAccessed>
-    <b:MonthAccessed>Temmuz</b:MonthAccessed>
-    <b:DayAccessed>22</b:DayAccessed>
-    <b:URL>http://www.gartner.com/newsroom/id/2658415</b:URL>
+    <b:Guid>{5A271346-7FC4-45FC-A5C0-75856052F91B}</b:Guid>
+    <b:Author>
+      <b:Author>
+        <b:Corporate>IBM</b:Corporate>
+      </b:Author>
+    </b:Author>
+    <b:Title>What Are Data Quality Dimensions?</b:Title>
+    <b:InternetSiteTitle>IBM Think</b:InternetSiteTitle>
+    <b:Year>2024</b:Year>
+    <b:URL>https://www.ibm.com/think/topics/data-quality-dimensions</b:URL>
+    <b:RefOrder>5</b:RefOrder>
+  </b:Source>
+  <b:Source>
+    <b:Tag>Hyn21</b:Tag>
+    <b:SourceType>Book</b:SourceType>
+    <b:Guid>{1B035C1B-41F8-416C-84D7-4E06EF9DED19}</b:Guid>
+    <b:Title>Forecasting: Principles and Practice</b:Title>
+    <b:Year>2021</b:Year>
     <b:Author>
       <b:Author>
         <b:NameList>
           <b:Person>
-            <b:Last>Stamford</b:Last>
-            <b:First>Conn.</b:First>
+            <b:Last>Hyndman</b:Last>
+            <b:First>Rob</b:First>
+            <b:Middle>J.</b:Middle>
+          </b:Person>
+          <b:Person>
+            <b:Last>Athanasopoulos</b:Last>
+            <b:First>George</b:First>
           </b:Person>
         </b:NameList>
       </b:Author>
     </b:Author>
-    <b:RefOrder>8</b:RefOrder>
+    <b:Publisher>OTexts</b:Publisher>
+    <b:RefOrder>6</b:RefOrder>
   </b:Source>
   <b:Source>
-    <b:Tag>Gan13</b:Tag>
+    <b:Tag>Str</b:Tag>
     <b:SourceType>InternetSite</b:SourceType>
-    <b:Guid>{0E8DFEA8-2140-4025-A7C1-56376D101FD4}</b:Guid>
+    <b:Guid>{351D79C7-52AD-42DB-9197-F244FB638EF6}</b:Guid>
     <b:Author>
       <b:Author>
-        <b:NameList>
-          <b:Person>
-            <b:Last>Ganly</b:Last>
-            <b:First>Denise</b:First>
-          </b:Person>
-          <b:Person>
-            <b:Last>Kyte</b:Last>
-            <b:First>Andy</b:First>
-          </b:Person>
-          <b:Person>
-            <b:Last>Rayner</b:Last>
-            <b:First>Nigel</b:First>
-          </b:Person>
-          <b:Person>
-            <b:Last>Hardcastle</b:Last>
-            <b:First>Carol</b:First>
-          </b:Person>
-        </b:NameList>
+        <b:Corporate>Streamlit</b:Corporate>
       </b:Author>
     </b:Author>
-    <b:Title>Predicts 2014: The Rise of the Postmodern ERP and Enterprise Applications World</b:Title>
-    <b:InternetSiteTitle>Gartner</b:InternetSiteTitle>
-    <b:Year>2013</b:Year>
-    <b:Month>Aralık</b:Month>
-    <b:Day>05</b:Day>
-    <b:YearAccessed>2015</b:YearAccessed>
-    <b:MonthAccessed>Temmuz</b:MonthAccessed>
-    <b:DayAccessed>21</b:DayAccessed>
-    <b:URL>https://www.gartner.com/doc/2633315</b:URL>
-    <b:RefOrder>9</b:RefOrder>
+    <b:Title>st.file_uploader</b:Title>
+    <b:InternetSiteTitle>Streamlit Documentation</b:InternetSiteTitle>
+    <b:URL>https://docs.streamlit.io/develop/api-reference/widgets/st.file_uploader</b:URL>
+    <b:Year>n.d.</b:Year>
+    <b:RefOrder>7</b:RefOrder>
   </b:Source>
   <b:Source>
-    <b:Tag>Erk15</b:Tag>
+    <b:Tag>Kagnd</b:Tag>
     <b:SourceType>InternetSite</b:SourceType>
-    <b:Guid>{0688A6EE-9CB2-4642-8F8B-50EC69F21506}</b:Guid>
+    <b:Guid>{B09BA85F-79C8-4E26-84EA-7096DED6AB94}</b:Guid>
+    <b:Title>DataCo SMART SUPPLY CHAIN FOR BIG DATA ANALYSIS</b:Title>
     <b:Author>
       <b:Author>
-        <b:NameList>
-          <b:Person>
-            <b:Last>Erkan</b:Last>
-            <b:First>Sertaç</b:First>
-          </b:Person>
-        </b:NameList>
+        <b:Corporate>Kaggle</b:Corporate>
       </b:Author>
     </b:Author>
-    <b:Title>Bulut Bilişimde Doğru Seçim Özel Bulut mu? Kamusal Bulut mu?</b:Title>
-    <b:InternetSiteTitle>karel.com.tr</b:InternetSiteTitle>
-    <b:Year>2015</b:Year>
-    <b:YearAccessed>2015</b:YearAccessed>
-    <b:MonthAccessed>08</b:MonthAccessed>
-    <b:DayAccessed>22</b:DayAccessed>
-    <b:URL>http://www.karel.com.tr/blog/bulut-bilisim-dogru-secim-ozel-bulut-mu-kamusal-bulut-mu</b:URL>
-    <b:RefOrder>10</b:RefOrder>
-  </b:Source>
-  <b:Source>
-    <b:Tag>Raj02</b:Tag>
-    <b:SourceType>JournalArticle</b:SourceType>
-    <b:Guid>{8EB5E4CB-B000-45BA-86F6-82498B2B8CDF}</b:Guid>
-    <b:Title>An innovation-diffusion view of implementation of enterprise resource planning (ERP) systems and  development  of  a  research  model</b:Title>
-    <b:Year>2002</b:Year>
-    <b:Author>
-      <b:Author>
-        <b:NameList>
-          <b:Person>
-            <b:Last>Rajagopal</b:Last>
-            <b:First>P.</b:First>
-          </b:Person>
-        </b:NameList>
-      </b:Author>
-    </b:Author>
-    <b:JournalName>Information  &amp; Management</b:JournalName>
-    <b:Pages>40, 87–114.</b:Pages>
-    <b:RefOrder>11</b:RefOrder>
-  </b:Source>
-  <b:Source>
-    <b:Tag>URL151</b:Tag>
-    <b:SourceType>InternetSite</b:SourceType>
-    <b:Guid>{A4A12BF1-0326-4B80-8998-DC30215003A2}</b:Guid>
-    <b:Author>
-      <b:Author>
-        <b:NameList>
-          <b:Person>
-            <b:Last>URL_04</b:Last>
-          </b:Person>
-        </b:NameList>
-      </b:Author>
-    </b:Author>
-    <b:YearAccessed>2015</b:YearAccessed>
-    <b:MonthAccessed>08</b:MonthAccessed>
-    <b:DayAccessed>22</b:DayAccessed>
-    <b:URL>http://www.erp.web.tr/erp-nedir/mrpi-mrpii-erpii-nedir/pdf</b:URL>
-    <b:Title>MRPI, MRPII, ERPII Nedir ? - ERP Nedir ?</b:Title>
-    <b:InternetSiteTitle>erp.web.tr</b:InternetSiteTitle>
-    <b:RefOrder>12</b:RefOrder>
-  </b:Source>
-  <b:Source>
-    <b:Tag>Gör</b:Tag>
-    <b:SourceType>JournalArticle</b:SourceType>
-    <b:Guid>{1768F945-1287-43AF-9C41-A4EEDAEDA6BC}</b:Guid>
-    <b:Author>
-      <b:Author>
-        <b:NameList>
-          <b:Person>
-            <b:Last>Gör</b:Last>
-            <b:First>A.</b:First>
-            <b:Middle>G.</b:Middle>
-          </b:Person>
-          <b:Person>
-            <b:Last>Güneri</b:Last>
-            <b:First>F.</b:First>
-          </b:Person>
-        </b:NameList>
-      </b:Author>
-    </b:Author>
-    <b:Title>ERP   Yazılım  Seçiminde  ANP  Tekniğinin  Kullanılması</b:Title>
-    <b:JournalName>2.  Ulusal Sistem  Mühendisliği  Kongresi  Bildiriler  Kitabı</b:JournalName>
-    <b:Year>2008</b:Year>
-    <b:Pages>296-300</b:Pages>
-    <b:RefOrder>13</b:RefOrder>
-  </b:Source>
-  <b:Source>
-    <b:Tag>Hun04</b:Tag>
-    <b:SourceType>ConferenceProceedings</b:SourceType>
-    <b:Guid>{FAFDD5DF-E9B5-4470-AD4F-D6C731B6B24E}</b:Guid>
-    <b:Author>
-      <b:Author>
-        <b:NameList>
-          <b:Person>
-            <b:Last>Hung</b:Last>
-            <b:First>S</b:First>
-            <b:Middle>Y</b:Middle>
-          </b:Person>
-          <b:Person>
-            <b:Last>Chang</b:Last>
-            <b:First>S</b:First>
-            <b:Middle>I</b:Middle>
-          </b:Person>
-          <b:Person>
-            <b:Last>Lee</b:Last>
-            <b:First>P</b:First>
-            <b:Middle>J</b:Middle>
-          </b:Person>
-        </b:NameList>
-      </b:Author>
-    </b:Author>
-    <b:Title>Critical factors of adoption for small and medium sized enterprises: An empirical study</b:Title>
-    <b:Year>2004</b:Year>
-    <b:Pages>724-737</b:Pages>
-    <b:ConferenceName>Proceedings of the Pacific Asia Conference on Information Systems</b:ConferenceName>
-    <b:Publisher>PACIS 2004</b:Publisher>
-    <b:RefOrder>14</b:RefOrder>
-  </b:Source>
-  <b:Source>
-    <b:Tag>Nah01</b:Tag>
-    <b:SourceType>JournalArticle</b:SourceType>
-    <b:Guid>{E9A97417-4C05-445D-8C1C-504AC03391F3}</b:Guid>
-    <b:Author>
-      <b:Author>
-        <b:NameList>
-          <b:Person>
-            <b:Last>Nah</b:Last>
-            <b:First>F</b:First>
-            <b:Middle>F-H</b:Middle>
-          </b:Person>
-          <b:Person>
-            <b:Last>Lau</b:Last>
-            <b:First>J</b:First>
-            <b:Middle>L-S</b:Middle>
-          </b:Person>
-        </b:NameList>
-      </b:Author>
-    </b:Author>
-    <b:Title>Critical factors for successful implementation of enterprise systems</b:Title>
-    <b:JournalName>Business Process Management Journal</b:JournalName>
-    <b:Year>2001</b:Year>
-    <b:Pages>7:3, 285-296</b:Pages>
-    <b:RefOrder>15</b:RefOrder>
-  </b:Source>
-  <b:Source>
-    <b:Tag>Placeholder1</b:Tag>
-    <b:SourceType>InternetSite</b:SourceType>
-    <b:Guid>{7678136A-B20F-4779-A0B6-D429B859A393}</b:Guid>
-    <b:Title>Easy Referencing Using Word 2010</b:Title>
-    <b:InternetSiteTitle>Youtube</b:InternetSiteTitle>
-    <b:Year>2011</b:Year>
-    <b:Month>Nisan</b:Month>
-    <b:Day>21</b:Day>
-    <b:YearAccessed>2015</b:YearAccessed>
-    <b:MonthAccessed>06</b:MonthAccessed>
-    <b:DayAccessed>17</b:DayAccessed>
-    <b:URL>https://www.youtube.com/watch?v=FRjKD2HQPGg</b:URL>
-    <b:Author>
-      <b:Author>
-        <b:NameList>
-          <b:Person>
-            <b:Last>URL_02</b:Last>
-          </b:Person>
-        </b:NameList>
-      </b:Author>
-    </b:Author>
-    <b:RefOrder>1</b:RefOrder>
-  </b:Source>
-  <b:Source>
-    <b:Tag>Opt15</b:Tag>
-    <b:SourceType>DocumentFromInternetSite</b:SourceType>
-    <b:Guid>{FA3F8C65-19B7-4E7C-B8F7-DD73BEAB8C48}</b:Guid>
-    <b:Title>Optimize Your Workflow Performance with Voice</b:Title>
-    <b:InternetSiteTitle>http://www.vocollectvoice.com</b:InternetSiteTitle>
-    <b:Year>2015</b:Year>
-    <b:Month>Mart</b:Month>
-    <b:YearAccessed>2015</b:YearAccessed>
-    <b:MonthAccessed>Mayıs</b:MonthAccessed>
-    <b:DayAccessed>31</b:DayAccessed>
-    <b:Author>
-      <b:Author>
-        <b:Corporate>Honeywell International Inc</b:Corporate>
-      </b:Author>
-    </b:Author>
-    <b:URL>http://www.vocollectvoice.com/download.aspx?file=d532335e-4054-4130-a8d7-38f92778092e.pdf</b:URL>
-    <b:RefOrder>16</b:RefOrder>
-  </b:Source>
-  <b:Source>
-    <b:Tag>Tel00</b:Tag>
-    <b:SourceType>JournalArticle</b:SourceType>
-    <b:Guid>{66DC9919-D826-40C4-98FA-1BB6F636307A}</b:Guid>
-    <b:Author>
-      <b:Author>
-        <b:NameList>
-          <b:Person>
-            <b:Last>Teltumbde</b:Last>
-            <b:First>A.</b:First>
-          </b:Person>
-        </b:NameList>
-      </b:Author>
-    </b:Author>
-    <b:Title>A framework of evaluating ERP projects</b:Title>
-    <b:JournalName>International Journal of Production Research</b:JournalName>
-    <b:Year>2000</b:Year>
-    <b:Pages>28,4507-4520</b:Pages>
-    <b:RefOrder>2</b:RefOrder>
-  </b:Source>
-  <b:Source>
-    <b:Tag>San96</b:Tag>
-    <b:SourceType>JournalArticle</b:SourceType>
-    <b:Guid>{998F69E4-AE33-4F05-A3A7-1DF949071398}</b:Guid>
-    <b:Author>
-      <b:Author>
-        <b:NameList>
-          <b:Person>
-            <b:Last>Santhanam</b:Last>
-            <b:First>R.</b:First>
-          </b:Person>
-          <b:Person>
-            <b:Last>Kyparisis</b:Last>
-            <b:First>G.J.</b:First>
-          </b:Person>
-        </b:NameList>
-      </b:Author>
-    </b:Author>
-    <b:Title>A decision model for interdependent information system project selection</b:Title>
-    <b:JournalName>European Journal of Operational Research</b:JournalName>
-    <b:Year>1996</b:Year>
-    <b:Pages>89, 380-399</b:Pages>
-    <b:RefOrder>3</b:RefOrder>
-  </b:Source>
-  <b:Source>
-    <b:Tag>Raz08</b:Tag>
-    <b:SourceType>ConferenceProceedings</b:SourceType>
-    <b:Guid>{B999032F-A553-44FE-9372-7BF16B7CA87B}</b:Guid>
-    <b:Author>
-      <b:Author>
-        <b:NameList>
-          <b:Person>
-            <b:Last>Razmi</b:Last>
-            <b:First>Jafar</b:First>
-          </b:Person>
-          <b:Person>
-            <b:Last>Sangari</b:Last>
-            <b:First>Mohamad</b:First>
-            <b:Middle>Sadegh</b:Middle>
-          </b:Person>
-        </b:NameList>
-      </b:Author>
-    </b:Author>
-    <b:Title>A hybrid multi-criteria decision making model for ERP system selection</b:Title>
-    <b:Year>2008</b:Year>
-    <b:Pages>489-495</b:Pages>
-    <b:ConferenceName>Proceedings of 4th International Conference on Information and Automation for Sustainability (ICIAfS )</b:ConferenceName>
-    <b:City>Sri Lanka</b:City>
-    <b:RefOrder>4</b:RefOrder>
-  </b:Source>
-  <b:Source>
-    <b:Tag>Eva00</b:Tag>
-    <b:SourceType>Book</b:SourceType>
-    <b:Guid>{8EE7B5C9-A916-47CF-8AF9-A48D68EDEC5B}</b:Guid>
-    <b:Author>
-      <b:Author>
-        <b:NameList>
-          <b:Person>
-            <b:Last>Evans</b:Last>
-            <b:First>P.B.</b:First>
-          </b:Person>
-          <b:Person>
-            <b:Last>Wurster</b:Last>
-            <b:First>T.S.</b:First>
-          </b:Person>
-        </b:NameList>
-      </b:Author>
-    </b:Author>
-    <b:Title>Blown to Bits</b:Title>
-    <b:Year>2000</b:Year>
-    <b:City>Boston, MA.</b:City>
-    <b:Publisher>Harvard Business School Press</b:Publisher>
-    <b:RefOrder>17</b:RefOrder>
-  </b:Source>
-  <b:Source>
-    <b:Tag>DAv94</b:Tag>
-    <b:SourceType>Book</b:SourceType>
-    <b:Guid>{BD42D1D1-0DC0-407A-AB88-42BF48B84047}</b:Guid>
-    <b:Author>
-      <b:Author>
-        <b:NameList>
-          <b:Person>
-            <b:Last>D’Aveni</b:Last>
-            <b:First>R.M.</b:First>
-          </b:Person>
-        </b:NameList>
-      </b:Author>
-    </b:Author>
-    <b:Title>Hyper Competition</b:Title>
-    <b:Year>1994</b:Year>
-    <b:City>New York, NY</b:City>
-    <b:Publisher>The Free Press</b:Publisher>
-    <b:RefOrder>18</b:RefOrder>
-  </b:Source>
-  <b:Source>
-    <b:Tag>Oka15</b:Tag>
-    <b:SourceType>DocumentFromInternetSite</b:SourceType>
-    <b:Guid>{A36D63DA-8CD9-4A63-96B6-89975D1A2985}</b:Guid>
-    <b:Title>Proje / Tez Yazım Kuralları</b:Title>
-    <b:InternetSiteTitle>Okan Üniversitesi</b:InternetSiteTitle>
-    <b:Year>2015</b:Year>
-    <b:Month>06</b:Month>
-    <b:YearAccessed>2015</b:YearAccessed>
-    <b:MonthAccessed>06</b:MonthAccessed>
-    <b:DayAccessed>18</b:DayAccessed>
-    <b:URL>http://sosyalbilimler.okan.edu.tr/media/55/50ed1aa4150ba03a22000055/Proje_Yaz%C4%B1m_Kurallar%C4%B1.doc</b:URL>
-    <b:Author>
-      <b:Author>
-        <b:NameList>
-          <b:Person>
-            <b:Last>URL_03</b:Last>
-          </b:Person>
-        </b:NameList>
-      </b:Author>
-    </b:Author>
-    <b:RefOrder>19</b:RefOrder>
-  </b:Source>
-  <b:Source>
-    <b:Tag>Hur14</b:Tag>
-    <b:SourceType>ConferenceProceedings</b:SourceType>
-    <b:Guid>{99096DBF-00CA-4C86-B4D8-D753D2280B5A}</b:Guid>
-    <b:Title>ERP III: The Promise Of A New Generation</b:Title>
-    <b:Year>2014</b:Year>
-    <b:Author>
-      <b:Author>
-        <b:NameList>
-          <b:Person>
-            <b:Last>Hurbean</b:Last>
-            <b:First>Luminița</b:First>
-          </b:Person>
-          <b:Person>
-            <b:Last>Fotache</b:Last>
-            <b:First>Doina</b:First>
-          </b:Person>
-        </b:NameList>
-      </b:Author>
-    </b:Author>
-    <b:ConferenceName>Proceedings of the IE 2014 International Conference</b:ConferenceName>
-    <b:City>May 15-18, Bucharest</b:City>
-    <b:RefOrder>20</b:RefOrder>
-  </b:Source>
-  <b:Source>
-    <b:Tag>Sap14</b:Tag>
-    <b:SourceType>DocumentFromInternetSite</b:SourceType>
-    <b:Guid>{F251F57A-C641-483C-B167-AFA20848F288}</b:Guid>
-    <b:Title>Post modern ERP Key trends</b:Title>
-    <b:InternetSiteTitle>AFSUG</b:InternetSiteTitle>
-    <b:Year>2014</b:Year>
-    <b:Month>Haziran</b:Month>
-    <b:Day>9</b:Day>
-    <b:Author>
-      <b:Author>
-        <b:NameList>
-          <b:Person>
-            <b:Last>SaphilaAFSUG</b:Last>
-          </b:Person>
-        </b:NameList>
-      </b:Author>
-    </b:Author>
-    <b:YearAccessed>2015</b:YearAccessed>
-    <b:MonthAccessed>Temmuz</b:MonthAccessed>
-    <b:DayAccessed>22</b:DayAccessed>
-    <b:URL>http://www.afsug.com/library/documents/saphila2014_presentations/Day1/CINEMA_2/Postmodern%20ERP%20-%20Key%20Trends.pdf</b:URL>
-    <b:RefOrder>21</b:RefOrder>
+    <b:InternetSiteTitle>Kaggle</b:InternetSiteTitle>
+    <b:URL>https://www.kaggle.com/datasets/shashwatwork/dataco-smart-supply-chain-for-big-data-analysis</b:URL>
+    <b:Year>n.d.</b:Year>
+    <b:RefOrder>8</b:RefOrder>
   </b:Source>
 </b:Sources>
 </file>
 
 <file path=customXml/itemProps1.xml><?xml version="1.0" encoding="utf-8"?>
-<ds:datastoreItem xmlns:ds="http://schemas.openxmlformats.org/officeDocument/2006/customXml" ds:itemID="{7B7C5A3F-E038-4D3F-B190-E83F2E74C801}">
+<ds:datastoreItem xmlns:ds="http://schemas.openxmlformats.org/officeDocument/2006/customXml" ds:itemID="{17F0CF2B-6F53-42EB-9DEB-4DDE953F2AFB}">
   <ds:schemaRefs>
     <ds:schemaRef ds:uri="http://schemas.openxmlformats.org/officeDocument/2006/bibliography"/>
   </ds:schemaRefs>

</xml_diff>

<commit_message>
Add additional academic and technical references
</commit_message>
<xml_diff>
--- a/docs/graduation_thesis_report.docx
+++ b/docs/graduation_thesis_report.docx
@@ -3941,6 +3941,12 @@
             <w:instrText xml:space="preserve"> CITATION Ora23 \l 1033 </w:instrText>
           </w:r>
           <w:r>
+            <w:rPr>
+              <w:lang w:val="en-US"/>
+            </w:rPr>
+            <w:instrText xml:space="preserve"> \m Kal22</w:instrText>
+          </w:r>
+          <w:r>
             <w:fldChar w:fldCharType="separate"/>
           </w:r>
           <w:r>
@@ -3948,7 +3954,7 @@
               <w:noProof/>
               <w:lang w:val="en-US"/>
             </w:rPr>
-            <w:t>(Oracle, 2023)</w:t>
+            <w:t>(Oracle, 2023; Kalaiarasan, 2022)</w:t>
           </w:r>
           <w:r>
             <w:fldChar w:fldCharType="end"/>
@@ -4881,6 +4887,45 @@
       <w:r>
         <w:t xml:space="preserve"> used for reading CSV and Excel files, cleaning the dataset, grouping records, calculating KPIs, and creating analytical tables. NumPy was used for numerical calculations and handling missing numerical values.</w:t>
       </w:r>
+      <w:sdt>
+        <w:sdtPr>
+          <w:id w:val="-136952397"/>
+          <w:citation/>
+        </w:sdtPr>
+        <w:sdtContent>
+          <w:r>
+            <w:fldChar w:fldCharType="begin"/>
+          </w:r>
+          <w:r>
+            <w:rPr>
+              <w:lang w:val="en-US"/>
+            </w:rPr>
+            <w:instrText xml:space="preserve"> CITATION pannd \l 1033 </w:instrText>
+          </w:r>
+          <w:r>
+            <w:fldChar w:fldCharType="separate"/>
+          </w:r>
+          <w:r>
+            <w:rPr>
+              <w:noProof/>
+              <w:lang w:val="en-US"/>
+            </w:rPr>
+            <w:t xml:space="preserve"> </w:t>
+          </w:r>
+          <w:r>
+            <w:rPr>
+              <w:noProof/>
+              <w:lang w:val="en-US"/>
+            </w:rPr>
+            <w:t>(pandas development team, n.d.)</w:t>
+          </w:r>
+          <w:r>
+            <w:fldChar w:fldCharType="end"/>
+          </w:r>
+        </w:sdtContent>
+      </w:sdt>
+    </w:p>
+    <w:p>
       <w:r>
         <w:br/>
       </w:r>
@@ -4921,6 +4966,7 @@
         <w:pStyle w:val="Heading2"/>
       </w:pPr>
       <w:r>
+        <w:lastRenderedPageBreak/>
         <w:t>Forecasting and Version Control Tools</w:t>
       </w:r>
       <w:r>
@@ -4934,7 +4980,6 @@
     </w:p>
     <w:p>
       <w:r>
-        <w:lastRenderedPageBreak/>
         <w:br/>
       </w:r>
       <w:r>
@@ -5473,6 +5518,7 @@
     </w:p>
     <w:p>
       <w:r>
+        <w:lastRenderedPageBreak/>
         <w:br/>
       </w:r>
       <w:r>
@@ -5481,7 +5527,6 @@
     </w:p>
     <w:p>
       <w:r>
-        <w:lastRenderedPageBreak/>
         <w:t>The system architecture is shown in Figure 1.</w:t>
       </w:r>
     </w:p>
@@ -8751,6 +8796,54 @@
         </w:rPr>
         <w:t xml:space="preserve"> to estimate future demand by learning a simple trend from historical monthly demand.</w:t>
       </w:r>
+      <w:r>
+        <w:rPr>
+          <w:lang w:val="en-ZA"/>
+        </w:rPr>
+        <w:t xml:space="preserve"> </w:t>
+      </w:r>
+      <w:sdt>
+        <w:sdtPr>
+          <w:rPr>
+            <w:lang w:val="en-ZA"/>
+          </w:rPr>
+          <w:id w:val="654264126"/>
+          <w:citation/>
+        </w:sdtPr>
+        <w:sdtContent>
+          <w:r>
+            <w:rPr>
+              <w:lang w:val="en-ZA"/>
+            </w:rPr>
+            <w:fldChar w:fldCharType="begin"/>
+          </w:r>
+          <w:r>
+            <w:rPr>
+              <w:lang w:val="en-US"/>
+            </w:rPr>
+            <w:instrText xml:space="preserve"> CITATION scind \l 1033 </w:instrText>
+          </w:r>
+          <w:r>
+            <w:rPr>
+              <w:lang w:val="en-ZA"/>
+            </w:rPr>
+            <w:fldChar w:fldCharType="separate"/>
+          </w:r>
+          <w:r>
+            <w:rPr>
+              <w:noProof/>
+              <w:lang w:val="en-US"/>
+            </w:rPr>
+            <w:t>(scikit-learn developers, n.d.)</w:t>
+          </w:r>
+          <w:r>
+            <w:rPr>
+              <w:lang w:val="en-ZA"/>
+            </w:rPr>
+            <w:fldChar w:fldCharType="end"/>
+          </w:r>
+        </w:sdtContent>
+      </w:sdt>
     </w:p>
     <w:p>
       <w:pPr>
@@ -10616,6 +10709,39 @@
               <w:noProof/>
               <w:lang w:val="tr-TR"/>
             </w:rPr>
+            <w:t xml:space="preserve">Kalaiarasan, R. O. (2022). The ABCDE of supply chain visibility: A systematic literature review and framework. </w:t>
+          </w:r>
+          <w:r>
+            <w:rPr>
+              <w:i/>
+              <w:iCs/>
+              <w:noProof/>
+              <w:lang w:val="tr-TR"/>
+            </w:rPr>
+            <w:t>International Journal of Production Economics</w:t>
+          </w:r>
+          <w:r>
+            <w:rPr>
+              <w:noProof/>
+              <w:lang w:val="tr-TR"/>
+            </w:rPr>
+            <w:t>.</w:t>
+          </w:r>
+        </w:p>
+        <w:p>
+          <w:pPr>
+            <w:pStyle w:val="Bibliography"/>
+            <w:ind w:left="720" w:hanging="720"/>
+            <w:rPr>
+              <w:noProof/>
+              <w:lang w:val="tr-TR"/>
+            </w:rPr>
+          </w:pPr>
+          <w:r>
+            <w:rPr>
+              <w:noProof/>
+              <w:lang w:val="tr-TR"/>
+            </w:rPr>
             <w:t xml:space="preserve">Oracle. (2023). </w:t>
           </w:r>
           <w:r>
@@ -10649,6 +10775,39 @@
               <w:noProof/>
               <w:lang w:val="tr-TR"/>
             </w:rPr>
+            <w:t xml:space="preserve">pandas development team. (n.d.). </w:t>
+          </w:r>
+          <w:r>
+            <w:rPr>
+              <w:i/>
+              <w:iCs/>
+              <w:noProof/>
+              <w:lang w:val="tr-TR"/>
+            </w:rPr>
+            <w:t>User Guide</w:t>
+          </w:r>
+          <w:r>
+            <w:rPr>
+              <w:noProof/>
+              <w:lang w:val="tr-TR"/>
+            </w:rPr>
+            <w:t>. pandas Documentation: https://pandas.pydata.org/docs/user_guide/index.html adresinden alındı</w:t>
+          </w:r>
+        </w:p>
+        <w:p>
+          <w:pPr>
+            <w:pStyle w:val="Bibliography"/>
+            <w:ind w:left="720" w:hanging="720"/>
+            <w:rPr>
+              <w:noProof/>
+              <w:lang w:val="tr-TR"/>
+            </w:rPr>
+          </w:pPr>
+          <w:r>
+            <w:rPr>
+              <w:noProof/>
+              <w:lang w:val="tr-TR"/>
+            </w:rPr>
             <w:t xml:space="preserve">Raza, Z., Svanberg, M., &amp; Wiegmans, B. (2023). </w:t>
           </w:r>
           <w:r>
@@ -10666,6 +10825,39 @@
               <w:lang w:val="tr-TR"/>
             </w:rPr>
             <w:t>. Computers in Industry: https://www.sciencedirect.com/science/article/pii/S016636152200207X adresinden alındı</w:t>
+          </w:r>
+        </w:p>
+        <w:p>
+          <w:pPr>
+            <w:pStyle w:val="Bibliography"/>
+            <w:ind w:left="720" w:hanging="720"/>
+            <w:rPr>
+              <w:noProof/>
+              <w:lang w:val="tr-TR"/>
+            </w:rPr>
+          </w:pPr>
+          <w:r>
+            <w:rPr>
+              <w:noProof/>
+              <w:lang w:val="tr-TR"/>
+            </w:rPr>
+            <w:t xml:space="preserve">scikit-learn developers. (n.d.). </w:t>
+          </w:r>
+          <w:r>
+            <w:rPr>
+              <w:i/>
+              <w:iCs/>
+              <w:noProof/>
+              <w:lang w:val="tr-TR"/>
+            </w:rPr>
+            <w:t>LinearRegression</w:t>
+          </w:r>
+          <w:r>
+            <w:rPr>
+              <w:noProof/>
+              <w:lang w:val="tr-TR"/>
+            </w:rPr>
+            <w:t>. scikit-learn Documentation: https://scikit-learn.org/stable/modules/generated/sklearn.linear_model.LinearRegression.html adresinden alındı</w:t>
           </w:r>
         </w:p>
         <w:p>
@@ -15645,7 +15837,7 @@
       </b:Author>
     </b:Author>
     <b:JournalName>System Safety: Human - Technical Facility - Environment</b:JournalName>
-    <b:RefOrder>2</b:RefOrder>
+    <b:RefOrder>3</b:RefOrder>
   </b:Source>
   <b:Source>
     <b:Tag>Das25</b:Tag>
@@ -15675,7 +15867,7 @@
     <b:JournalName>Electronic Markets</b:JournalName>
     <b:Year>2025</b:Year>
     <b:URL>https://link.springer.com/article/10.1007/s12525-025-00844-1</b:URL>
-    <b:RefOrder>3</b:RefOrder>
+    <b:RefOrder>4</b:RefOrder>
   </b:Source>
   <b:Source>
     <b:Tag>Raz23</b:Tag>
@@ -15703,7 +15895,7 @@
     <b:InternetSiteTitle>Computers in Industry</b:InternetSiteTitle>
     <b:Year>2023</b:Year>
     <b:URL>https://www.sciencedirect.com/science/article/pii/S016636152200207X</b:URL>
-    <b:RefOrder>4</b:RefOrder>
+    <b:RefOrder>5</b:RefOrder>
   </b:Source>
   <b:Source>
     <b:Tag>IBM24</b:Tag>
@@ -15718,7 +15910,7 @@
     <b:InternetSiteTitle>IBM Think</b:InternetSiteTitle>
     <b:Year>2024</b:Year>
     <b:URL>https://www.ibm.com/think/topics/data-quality-dimensions</b:URL>
-    <b:RefOrder>5</b:RefOrder>
+    <b:RefOrder>6</b:RefOrder>
   </b:Source>
   <b:Source>
     <b:Tag>Hyn21</b:Tag>
@@ -15742,7 +15934,7 @@
       </b:Author>
     </b:Author>
     <b:Publisher>OTexts</b:Publisher>
-    <b:RefOrder>6</b:RefOrder>
+    <b:RefOrder>7</b:RefOrder>
   </b:Source>
   <b:Source>
     <b:Tag>Str</b:Tag>
@@ -15757,7 +15949,7 @@
     <b:InternetSiteTitle>Streamlit Documentation</b:InternetSiteTitle>
     <b:URL>https://docs.streamlit.io/develop/api-reference/widgets/st.file_uploader</b:URL>
     <b:Year>n.d.</b:Year>
-    <b:RefOrder>7</b:RefOrder>
+    <b:RefOrder>10</b:RefOrder>
   </b:Source>
   <b:Source>
     <b:Tag>Kagnd</b:Tag>
@@ -15772,13 +15964,63 @@
     <b:InternetSiteTitle>Kaggle</b:InternetSiteTitle>
     <b:URL>https://www.kaggle.com/datasets/shashwatwork/dataco-smart-supply-chain-for-big-data-analysis</b:URL>
     <b:Year>n.d.</b:Year>
+    <b:RefOrder>11</b:RefOrder>
+  </b:Source>
+  <b:Source>
+    <b:Tag>Kal22</b:Tag>
+    <b:SourceType>JournalArticle</b:SourceType>
+    <b:Guid>{7DD221FB-111C-4A83-85E0-FDB04653BFCA}</b:Guid>
+    <b:Title>The ABCDE of supply chain visibility: A systematic literature review and framework</b:Title>
+    <b:Year>2022</b:Year>
+    <b:Author>
+      <b:Author>
+        <b:NameList>
+          <b:Person>
+            <b:Last>Kalaiarasan</b:Last>
+            <b:First>R.,</b:First>
+            <b:Middle>Olhager, J., Agrawal, T. K., &amp; Wiktorsson, M.</b:Middle>
+          </b:Person>
+        </b:NameList>
+      </b:Author>
+    </b:Author>
+    <b:JournalName>International Journal of Production Economics</b:JournalName>
+    <b:RefOrder>2</b:RefOrder>
+  </b:Source>
+  <b:Source>
+    <b:Tag>pannd</b:Tag>
+    <b:SourceType>InternetSite</b:SourceType>
+    <b:Guid>{14189F99-7B06-4A09-949B-0FDA649F5C96}</b:Guid>
+    <b:Title>User Guide</b:Title>
+    <b:Year>n.d.</b:Year>
+    <b:Author>
+      <b:Author>
+        <b:Corporate>pandas development team</b:Corporate>
+      </b:Author>
+    </b:Author>
+    <b:InternetSiteTitle>pandas Documentation</b:InternetSiteTitle>
+    <b:URL>https://pandas.pydata.org/docs/user_guide/index.html</b:URL>
     <b:RefOrder>8</b:RefOrder>
+  </b:Source>
+  <b:Source>
+    <b:Tag>scind</b:Tag>
+    <b:SourceType>InternetSite</b:SourceType>
+    <b:Guid>{F5C2E616-E6F6-4DBA-84EC-F5B4288206E7}</b:Guid>
+    <b:Author>
+      <b:Author>
+        <b:Corporate>scikit-learn developers</b:Corporate>
+      </b:Author>
+    </b:Author>
+    <b:Title>LinearRegression</b:Title>
+    <b:InternetSiteTitle>scikit-learn Documentation</b:InternetSiteTitle>
+    <b:Year>n.d.</b:Year>
+    <b:URL>https://scikit-learn.org/stable/modules/generated/sklearn.linear_model.LinearRegression.html</b:URL>
+    <b:RefOrder>9</b:RefOrder>
   </b:Source>
 </b:Sources>
 </file>
 
 <file path=customXml/itemProps1.xml><?xml version="1.0" encoding="utf-8"?>
-<ds:datastoreItem xmlns:ds="http://schemas.openxmlformats.org/officeDocument/2006/customXml" ds:itemID="{17F0CF2B-6F53-42EB-9DEB-4DDE953F2AFB}">
+<ds:datastoreItem xmlns:ds="http://schemas.openxmlformats.org/officeDocument/2006/customXml" ds:itemID="{E9EBBA65-AB08-42BA-868F-0536AD648E93}">
   <ds:schemaRefs>
     <ds:schemaRef ds:uri="http://schemas.openxmlformats.org/officeDocument/2006/bibliography"/>
   </ds:schemaRefs>

</xml_diff>

<commit_message>
Add thesis links and update CV section.
</commit_message>
<xml_diff>
--- a/docs/graduation_thesis_report.docx
+++ b/docs/graduation_thesis_report.docx
@@ -525,7 +525,7 @@
         <w:pStyle w:val="Introsections"/>
       </w:pPr>
       <w:bookmarkStart w:id="2" w:name="_Toc28126413"/>
-      <w:bookmarkStart w:id="3" w:name="_Toc230202020"/>
+      <w:bookmarkStart w:id="3" w:name="_Toc230203414"/>
       <w:r>
         <w:lastRenderedPageBreak/>
         <w:t>DECLARATION</w:t>
@@ -739,7 +739,7 @@
           <w:lang w:eastAsia="tr-TR"/>
         </w:rPr>
       </w:pPr>
-      <w:bookmarkStart w:id="4" w:name="_Toc230202021"/>
+      <w:bookmarkStart w:id="4" w:name="_Toc230203415"/>
       <w:r>
         <w:rPr>
           <w:lang w:eastAsia="tr-TR"/>
@@ -1078,7 +1078,7 @@
       <w:pPr>
         <w:pStyle w:val="Introsections"/>
       </w:pPr>
-      <w:bookmarkStart w:id="5" w:name="_Toc230202022"/>
+      <w:bookmarkStart w:id="5" w:name="_Toc230203416"/>
       <w:r>
         <w:lastRenderedPageBreak/>
         <w:t>ABSTRACT</w:t>
@@ -1260,7 +1260,7 @@
       <w:pPr>
         <w:pStyle w:val="Introsections"/>
       </w:pPr>
-      <w:bookmarkStart w:id="6" w:name="_Toc230202023"/>
+      <w:bookmarkStart w:id="6" w:name="_Toc230203417"/>
       <w:r>
         <w:lastRenderedPageBreak/>
         <w:t>TABLE OF CONTENTS</w:t>
@@ -1335,12 +1335,11 @@
             </w:rPr>
             <w:fldChar w:fldCharType="separate"/>
           </w:r>
-          <w:hyperlink w:anchor="_Toc230202020" w:history="1">
+          <w:hyperlink w:anchor="_Toc230203414" w:history="1">
             <w:r>
               <w:rPr>
                 <w:rStyle w:val="Hyperlink"/>
                 <w:noProof/>
-                <w:lang w:val="en-US"/>
               </w:rPr>
               <w:t>DECLARATION</w:t>
             </w:r>
@@ -1348,7 +1347,6 @@
               <w:rPr>
                 <w:noProof/>
                 <w:webHidden/>
-                <w:lang w:val="en-US"/>
               </w:rPr>
               <w:tab/>
             </w:r>
@@ -1356,7 +1354,6 @@
               <w:rPr>
                 <w:noProof/>
                 <w:webHidden/>
-                <w:lang w:val="en-US"/>
               </w:rPr>
               <w:fldChar w:fldCharType="begin"/>
             </w:r>
@@ -1364,30 +1361,27 @@
               <w:rPr>
                 <w:noProof/>
                 <w:webHidden/>
-                <w:lang w:val="en-US"/>
-              </w:rPr>
-              <w:instrText xml:space="preserve"> PAGEREF _Toc230202020 \h </w:instrText>
-            </w:r>
-            <w:r>
-              <w:rPr>
-                <w:noProof/>
-                <w:webHidden/>
-                <w:lang w:val="en-US"/>
-              </w:rPr>
-            </w:r>
-            <w:r>
-              <w:rPr>
-                <w:noProof/>
-                <w:webHidden/>
-                <w:lang w:val="en-US"/>
+              </w:rPr>
+              <w:instrText xml:space="preserve"> PAGEREF _Toc230203414 \h </w:instrText>
+            </w:r>
+            <w:r>
+              <w:rPr>
+                <w:noProof/>
+                <w:webHidden/>
+              </w:rPr>
+            </w:r>
+            <w:r>
+              <w:rPr>
+                <w:noProof/>
+                <w:webHidden/>
               </w:rPr>
               <w:fldChar w:fldCharType="separate"/>
             </w:r>
             <w:r>
               <w:rPr>
-                <w:noProof/>
-                <w:webHidden/>
-                <w:lang w:val="en-US"/>
+                <w:rFonts w:hint="eastAsia"/>
+                <w:noProof/>
+                <w:webHidden/>
               </w:rPr>
               <w:t>2</w:t>
             </w:r>
@@ -1395,7 +1389,6 @@
               <w:rPr>
                 <w:noProof/>
                 <w:webHidden/>
-                <w:lang w:val="en-US"/>
               </w:rPr>
               <w:fldChar w:fldCharType="end"/>
             </w:r>
@@ -1417,12 +1410,12 @@
               <w14:ligatures w14:val="standardContextual"/>
             </w:rPr>
           </w:pPr>
-          <w:hyperlink w:anchor="_Toc230202021" w:history="1">
+          <w:hyperlink w:anchor="_Toc230203415" w:history="1">
             <w:r>
               <w:rPr>
                 <w:rStyle w:val="Hyperlink"/>
                 <w:noProof/>
-                <w:lang w:val="en-US" w:eastAsia="tr-TR"/>
+                <w:lang w:eastAsia="tr-TR"/>
               </w:rPr>
               <w:t>ACKNOWLEDGEMENT</w:t>
             </w:r>
@@ -1430,7 +1423,6 @@
               <w:rPr>
                 <w:noProof/>
                 <w:webHidden/>
-                <w:lang w:val="en-US"/>
               </w:rPr>
               <w:tab/>
             </w:r>
@@ -1438,7 +1430,6 @@
               <w:rPr>
                 <w:noProof/>
                 <w:webHidden/>
-                <w:lang w:val="en-US"/>
               </w:rPr>
               <w:fldChar w:fldCharType="begin"/>
             </w:r>
@@ -1446,30 +1437,27 @@
               <w:rPr>
                 <w:noProof/>
                 <w:webHidden/>
-                <w:lang w:val="en-US"/>
-              </w:rPr>
-              <w:instrText xml:space="preserve"> PAGEREF _Toc230202021 \h </w:instrText>
-            </w:r>
-            <w:r>
-              <w:rPr>
-                <w:noProof/>
-                <w:webHidden/>
-                <w:lang w:val="en-US"/>
-              </w:rPr>
-            </w:r>
-            <w:r>
-              <w:rPr>
-                <w:noProof/>
-                <w:webHidden/>
-                <w:lang w:val="en-US"/>
+              </w:rPr>
+              <w:instrText xml:space="preserve"> PAGEREF _Toc230203415 \h </w:instrText>
+            </w:r>
+            <w:r>
+              <w:rPr>
+                <w:noProof/>
+                <w:webHidden/>
+              </w:rPr>
+            </w:r>
+            <w:r>
+              <w:rPr>
+                <w:noProof/>
+                <w:webHidden/>
               </w:rPr>
               <w:fldChar w:fldCharType="separate"/>
             </w:r>
             <w:r>
               <w:rPr>
-                <w:noProof/>
-                <w:webHidden/>
-                <w:lang w:val="en-US"/>
+                <w:rFonts w:hint="eastAsia"/>
+                <w:noProof/>
+                <w:webHidden/>
               </w:rPr>
               <w:t>3</w:t>
             </w:r>
@@ -1477,7 +1465,6 @@
               <w:rPr>
                 <w:noProof/>
                 <w:webHidden/>
-                <w:lang w:val="en-US"/>
               </w:rPr>
               <w:fldChar w:fldCharType="end"/>
             </w:r>
@@ -1499,12 +1486,11 @@
               <w14:ligatures w14:val="standardContextual"/>
             </w:rPr>
           </w:pPr>
-          <w:hyperlink w:anchor="_Toc230202022" w:history="1">
+          <w:hyperlink w:anchor="_Toc230203416" w:history="1">
             <w:r>
               <w:rPr>
                 <w:rStyle w:val="Hyperlink"/>
                 <w:noProof/>
-                <w:lang w:val="en-US"/>
               </w:rPr>
               <w:t>ABSTRACT</w:t>
             </w:r>
@@ -1512,7 +1498,6 @@
               <w:rPr>
                 <w:noProof/>
                 <w:webHidden/>
-                <w:lang w:val="en-US"/>
               </w:rPr>
               <w:tab/>
             </w:r>
@@ -1520,7 +1505,6 @@
               <w:rPr>
                 <w:noProof/>
                 <w:webHidden/>
-                <w:lang w:val="en-US"/>
               </w:rPr>
               <w:fldChar w:fldCharType="begin"/>
             </w:r>
@@ -1528,30 +1512,27 @@
               <w:rPr>
                 <w:noProof/>
                 <w:webHidden/>
-                <w:lang w:val="en-US"/>
-              </w:rPr>
-              <w:instrText xml:space="preserve"> PAGEREF _Toc230202022 \h </w:instrText>
-            </w:r>
-            <w:r>
-              <w:rPr>
-                <w:noProof/>
-                <w:webHidden/>
-                <w:lang w:val="en-US"/>
-              </w:rPr>
-            </w:r>
-            <w:r>
-              <w:rPr>
-                <w:noProof/>
-                <w:webHidden/>
-                <w:lang w:val="en-US"/>
+              </w:rPr>
+              <w:instrText xml:space="preserve"> PAGEREF _Toc230203416 \h </w:instrText>
+            </w:r>
+            <w:r>
+              <w:rPr>
+                <w:noProof/>
+                <w:webHidden/>
+              </w:rPr>
+            </w:r>
+            <w:r>
+              <w:rPr>
+                <w:noProof/>
+                <w:webHidden/>
               </w:rPr>
               <w:fldChar w:fldCharType="separate"/>
             </w:r>
             <w:r>
               <w:rPr>
-                <w:noProof/>
-                <w:webHidden/>
-                <w:lang w:val="en-US"/>
+                <w:rFonts w:hint="eastAsia"/>
+                <w:noProof/>
+                <w:webHidden/>
               </w:rPr>
               <w:t>4</w:t>
             </w:r>
@@ -1559,7 +1540,6 @@
               <w:rPr>
                 <w:noProof/>
                 <w:webHidden/>
-                <w:lang w:val="en-US"/>
               </w:rPr>
               <w:fldChar w:fldCharType="end"/>
             </w:r>
@@ -1581,12 +1561,11 @@
               <w14:ligatures w14:val="standardContextual"/>
             </w:rPr>
           </w:pPr>
-          <w:hyperlink w:anchor="_Toc230202023" w:history="1">
+          <w:hyperlink w:anchor="_Toc230203417" w:history="1">
             <w:r>
               <w:rPr>
                 <w:rStyle w:val="Hyperlink"/>
                 <w:noProof/>
-                <w:lang w:val="en-US"/>
               </w:rPr>
               <w:t>TABLE OF CONTENTS</w:t>
             </w:r>
@@ -1594,7 +1573,6 @@
               <w:rPr>
                 <w:noProof/>
                 <w:webHidden/>
-                <w:lang w:val="en-US"/>
               </w:rPr>
               <w:tab/>
             </w:r>
@@ -1602,7 +1580,6 @@
               <w:rPr>
                 <w:noProof/>
                 <w:webHidden/>
-                <w:lang w:val="en-US"/>
               </w:rPr>
               <w:fldChar w:fldCharType="begin"/>
             </w:r>
@@ -1610,30 +1587,27 @@
               <w:rPr>
                 <w:noProof/>
                 <w:webHidden/>
-                <w:lang w:val="en-US"/>
-              </w:rPr>
-              <w:instrText xml:space="preserve"> PAGEREF _Toc230202023 \h </w:instrText>
-            </w:r>
-            <w:r>
-              <w:rPr>
-                <w:noProof/>
-                <w:webHidden/>
-                <w:lang w:val="en-US"/>
-              </w:rPr>
-            </w:r>
-            <w:r>
-              <w:rPr>
-                <w:noProof/>
-                <w:webHidden/>
-                <w:lang w:val="en-US"/>
+              </w:rPr>
+              <w:instrText xml:space="preserve"> PAGEREF _Toc230203417 \h </w:instrText>
+            </w:r>
+            <w:r>
+              <w:rPr>
+                <w:noProof/>
+                <w:webHidden/>
+              </w:rPr>
+            </w:r>
+            <w:r>
+              <w:rPr>
+                <w:noProof/>
+                <w:webHidden/>
               </w:rPr>
               <w:fldChar w:fldCharType="separate"/>
             </w:r>
             <w:r>
               <w:rPr>
-                <w:noProof/>
-                <w:webHidden/>
-                <w:lang w:val="en-US"/>
+                <w:rFonts w:hint="eastAsia"/>
+                <w:noProof/>
+                <w:webHidden/>
               </w:rPr>
               <w:t>5</w:t>
             </w:r>
@@ -1641,7 +1615,6 @@
               <w:rPr>
                 <w:noProof/>
                 <w:webHidden/>
-                <w:lang w:val="en-US"/>
               </w:rPr>
               <w:fldChar w:fldCharType="end"/>
             </w:r>
@@ -1663,12 +1636,11 @@
               <w14:ligatures w14:val="standardContextual"/>
             </w:rPr>
           </w:pPr>
-          <w:hyperlink w:anchor="_Toc230202024" w:history="1">
+          <w:hyperlink w:anchor="_Toc230203418" w:history="1">
             <w:r>
               <w:rPr>
                 <w:rStyle w:val="Hyperlink"/>
                 <w:noProof/>
-                <w:lang w:val="en-US"/>
               </w:rPr>
               <w:t>LIST OF FIGURES</w:t>
             </w:r>
@@ -1676,7 +1648,6 @@
               <w:rPr>
                 <w:noProof/>
                 <w:webHidden/>
-                <w:lang w:val="en-US"/>
               </w:rPr>
               <w:tab/>
             </w:r>
@@ -1684,7 +1655,6 @@
               <w:rPr>
                 <w:noProof/>
                 <w:webHidden/>
-                <w:lang w:val="en-US"/>
               </w:rPr>
               <w:fldChar w:fldCharType="begin"/>
             </w:r>
@@ -1692,30 +1662,27 @@
               <w:rPr>
                 <w:noProof/>
                 <w:webHidden/>
-                <w:lang w:val="en-US"/>
-              </w:rPr>
-              <w:instrText xml:space="preserve"> PAGEREF _Toc230202024 \h </w:instrText>
-            </w:r>
-            <w:r>
-              <w:rPr>
-                <w:noProof/>
-                <w:webHidden/>
-                <w:lang w:val="en-US"/>
-              </w:rPr>
-            </w:r>
-            <w:r>
-              <w:rPr>
-                <w:noProof/>
-                <w:webHidden/>
-                <w:lang w:val="en-US"/>
+              </w:rPr>
+              <w:instrText xml:space="preserve"> PAGEREF _Toc230203418 \h </w:instrText>
+            </w:r>
+            <w:r>
+              <w:rPr>
+                <w:noProof/>
+                <w:webHidden/>
+              </w:rPr>
+            </w:r>
+            <w:r>
+              <w:rPr>
+                <w:noProof/>
+                <w:webHidden/>
               </w:rPr>
               <w:fldChar w:fldCharType="separate"/>
             </w:r>
             <w:r>
               <w:rPr>
-                <w:noProof/>
-                <w:webHidden/>
-                <w:lang w:val="en-US"/>
+                <w:rFonts w:hint="eastAsia"/>
+                <w:noProof/>
+                <w:webHidden/>
               </w:rPr>
               <w:t>7</w:t>
             </w:r>
@@ -1723,7 +1690,6 @@
               <w:rPr>
                 <w:noProof/>
                 <w:webHidden/>
-                <w:lang w:val="en-US"/>
               </w:rPr>
               <w:fldChar w:fldCharType="end"/>
             </w:r>
@@ -1745,12 +1711,12 @@
               <w14:ligatures w14:val="standardContextual"/>
             </w:rPr>
           </w:pPr>
-          <w:hyperlink w:anchor="_Toc230202025" w:history="1">
+          <w:hyperlink w:anchor="_Toc230203419" w:history="1">
             <w:r>
               <w:rPr>
                 <w:rStyle w:val="Hyperlink"/>
                 <w:noProof/>
-                <w:lang w:val="en-US" w:eastAsia="zh-CN"/>
+                <w:lang w:eastAsia="zh-CN"/>
               </w:rPr>
               <w:t>LIST OF TABLES</w:t>
             </w:r>
@@ -1758,7 +1724,6 @@
               <w:rPr>
                 <w:noProof/>
                 <w:webHidden/>
-                <w:lang w:val="en-US"/>
               </w:rPr>
               <w:tab/>
             </w:r>
@@ -1766,7 +1731,6 @@
               <w:rPr>
                 <w:noProof/>
                 <w:webHidden/>
-                <w:lang w:val="en-US"/>
               </w:rPr>
               <w:fldChar w:fldCharType="begin"/>
             </w:r>
@@ -1774,30 +1738,27 @@
               <w:rPr>
                 <w:noProof/>
                 <w:webHidden/>
-                <w:lang w:val="en-US"/>
-              </w:rPr>
-              <w:instrText xml:space="preserve"> PAGEREF _Toc230202025 \h </w:instrText>
-            </w:r>
-            <w:r>
-              <w:rPr>
-                <w:noProof/>
-                <w:webHidden/>
-                <w:lang w:val="en-US"/>
-              </w:rPr>
-            </w:r>
-            <w:r>
-              <w:rPr>
-                <w:noProof/>
-                <w:webHidden/>
-                <w:lang w:val="en-US"/>
+              </w:rPr>
+              <w:instrText xml:space="preserve"> PAGEREF _Toc230203419 \h </w:instrText>
+            </w:r>
+            <w:r>
+              <w:rPr>
+                <w:noProof/>
+                <w:webHidden/>
+              </w:rPr>
+            </w:r>
+            <w:r>
+              <w:rPr>
+                <w:noProof/>
+                <w:webHidden/>
               </w:rPr>
               <w:fldChar w:fldCharType="separate"/>
             </w:r>
             <w:r>
               <w:rPr>
-                <w:noProof/>
-                <w:webHidden/>
-                <w:lang w:val="en-US"/>
+                <w:rFonts w:hint="eastAsia"/>
+                <w:noProof/>
+                <w:webHidden/>
               </w:rPr>
               <w:t>8</w:t>
             </w:r>
@@ -1805,7 +1766,6 @@
               <w:rPr>
                 <w:noProof/>
                 <w:webHidden/>
-                <w:lang w:val="en-US"/>
               </w:rPr>
               <w:fldChar w:fldCharType="end"/>
             </w:r>
@@ -1830,7 +1790,7 @@
               <w14:ligatures w14:val="standardContextual"/>
             </w:rPr>
           </w:pPr>
-          <w:hyperlink w:anchor="_Toc230202026" w:history="1">
+          <w:hyperlink w:anchor="_Toc230203420" w:history="1">
             <w:r>
               <w:rPr>
                 <w:rStyle w:val="Hyperlink"/>
@@ -1866,7 +1826,6 @@
               <w:rPr>
                 <w:noProof/>
                 <w:webHidden/>
-                <w:lang w:val="en-US"/>
               </w:rPr>
               <w:tab/>
             </w:r>
@@ -1874,7 +1833,6 @@
               <w:rPr>
                 <w:noProof/>
                 <w:webHidden/>
-                <w:lang w:val="en-US"/>
               </w:rPr>
               <w:fldChar w:fldCharType="begin"/>
             </w:r>
@@ -1882,30 +1840,27 @@
               <w:rPr>
                 <w:noProof/>
                 <w:webHidden/>
-                <w:lang w:val="en-US"/>
-              </w:rPr>
-              <w:instrText xml:space="preserve"> PAGEREF _Toc230202026 \h </w:instrText>
-            </w:r>
-            <w:r>
-              <w:rPr>
-                <w:noProof/>
-                <w:webHidden/>
-                <w:lang w:val="en-US"/>
-              </w:rPr>
-            </w:r>
-            <w:r>
-              <w:rPr>
-                <w:noProof/>
-                <w:webHidden/>
-                <w:lang w:val="en-US"/>
+              </w:rPr>
+              <w:instrText xml:space="preserve"> PAGEREF _Toc230203420 \h </w:instrText>
+            </w:r>
+            <w:r>
+              <w:rPr>
+                <w:noProof/>
+                <w:webHidden/>
+              </w:rPr>
+            </w:r>
+            <w:r>
+              <w:rPr>
+                <w:noProof/>
+                <w:webHidden/>
               </w:rPr>
               <w:fldChar w:fldCharType="separate"/>
             </w:r>
             <w:r>
               <w:rPr>
-                <w:noProof/>
-                <w:webHidden/>
-                <w:lang w:val="en-US"/>
+                <w:rFonts w:hint="eastAsia"/>
+                <w:noProof/>
+                <w:webHidden/>
               </w:rPr>
               <w:t>9</w:t>
             </w:r>
@@ -1913,7 +1868,6 @@
               <w:rPr>
                 <w:noProof/>
                 <w:webHidden/>
-                <w:lang w:val="en-US"/>
               </w:rPr>
               <w:fldChar w:fldCharType="end"/>
             </w:r>
@@ -1938,7 +1892,7 @@
               <w14:ligatures w14:val="standardContextual"/>
             </w:rPr>
           </w:pPr>
-          <w:hyperlink w:anchor="_Toc230202027" w:history="1">
+          <w:hyperlink w:anchor="_Toc230203421" w:history="1">
             <w:r>
               <w:rPr>
                 <w:rStyle w:val="Hyperlink"/>
@@ -1974,7 +1928,6 @@
               <w:rPr>
                 <w:noProof/>
                 <w:webHidden/>
-                <w:lang w:val="en-US"/>
               </w:rPr>
               <w:tab/>
             </w:r>
@@ -1982,7 +1935,6 @@
               <w:rPr>
                 <w:noProof/>
                 <w:webHidden/>
-                <w:lang w:val="en-US"/>
               </w:rPr>
               <w:fldChar w:fldCharType="begin"/>
             </w:r>
@@ -1990,30 +1942,27 @@
               <w:rPr>
                 <w:noProof/>
                 <w:webHidden/>
-                <w:lang w:val="en-US"/>
-              </w:rPr>
-              <w:instrText xml:space="preserve"> PAGEREF _Toc230202027 \h </w:instrText>
-            </w:r>
-            <w:r>
-              <w:rPr>
-                <w:noProof/>
-                <w:webHidden/>
-                <w:lang w:val="en-US"/>
-              </w:rPr>
-            </w:r>
-            <w:r>
-              <w:rPr>
-                <w:noProof/>
-                <w:webHidden/>
-                <w:lang w:val="en-US"/>
+              </w:rPr>
+              <w:instrText xml:space="preserve"> PAGEREF _Toc230203421 \h </w:instrText>
+            </w:r>
+            <w:r>
+              <w:rPr>
+                <w:noProof/>
+                <w:webHidden/>
+              </w:rPr>
+            </w:r>
+            <w:r>
+              <w:rPr>
+                <w:noProof/>
+                <w:webHidden/>
               </w:rPr>
               <w:fldChar w:fldCharType="separate"/>
             </w:r>
             <w:r>
               <w:rPr>
-                <w:noProof/>
-                <w:webHidden/>
-                <w:lang w:val="en-US"/>
+                <w:rFonts w:hint="eastAsia"/>
+                <w:noProof/>
+                <w:webHidden/>
               </w:rPr>
               <w:t>9</w:t>
             </w:r>
@@ -2021,7 +1970,6 @@
               <w:rPr>
                 <w:noProof/>
                 <w:webHidden/>
-                <w:lang w:val="en-US"/>
               </w:rPr>
               <w:fldChar w:fldCharType="end"/>
             </w:r>
@@ -2045,7 +1993,7 @@
               <w14:ligatures w14:val="standardContextual"/>
             </w:rPr>
           </w:pPr>
-          <w:hyperlink w:anchor="_Toc230202028" w:history="1">
+          <w:hyperlink w:anchor="_Toc230203422" w:history="1">
             <w:r>
               <w:rPr>
                 <w:rStyle w:val="Hyperlink"/>
@@ -2079,7 +2027,6 @@
               <w:rPr>
                 <w:noProof/>
                 <w:webHidden/>
-                <w:lang w:val="en-US"/>
               </w:rPr>
               <w:tab/>
             </w:r>
@@ -2087,7 +2034,6 @@
               <w:rPr>
                 <w:noProof/>
                 <w:webHidden/>
-                <w:lang w:val="en-US"/>
               </w:rPr>
               <w:fldChar w:fldCharType="begin"/>
             </w:r>
@@ -2095,22 +2041,19 @@
               <w:rPr>
                 <w:noProof/>
                 <w:webHidden/>
-                <w:lang w:val="en-US"/>
-              </w:rPr>
-              <w:instrText xml:space="preserve"> PAGEREF _Toc230202028 \h </w:instrText>
-            </w:r>
-            <w:r>
-              <w:rPr>
-                <w:noProof/>
-                <w:webHidden/>
-                <w:lang w:val="en-US"/>
-              </w:rPr>
-            </w:r>
-            <w:r>
-              <w:rPr>
-                <w:noProof/>
-                <w:webHidden/>
-                <w:lang w:val="en-US"/>
+              </w:rPr>
+              <w:instrText xml:space="preserve"> PAGEREF _Toc230203422 \h </w:instrText>
+            </w:r>
+            <w:r>
+              <w:rPr>
+                <w:noProof/>
+                <w:webHidden/>
+              </w:rPr>
+            </w:r>
+            <w:r>
+              <w:rPr>
+                <w:noProof/>
+                <w:webHidden/>
               </w:rPr>
               <w:fldChar w:fldCharType="separate"/>
             </w:r>
@@ -2118,7 +2061,6 @@
               <w:rPr>
                 <w:noProof/>
                 <w:webHidden/>
-                <w:lang w:val="en-US"/>
               </w:rPr>
               <w:t>9</w:t>
             </w:r>
@@ -2126,7 +2068,6 @@
               <w:rPr>
                 <w:noProof/>
                 <w:webHidden/>
-                <w:lang w:val="en-US"/>
               </w:rPr>
               <w:fldChar w:fldCharType="end"/>
             </w:r>
@@ -2150,7 +2091,7 @@
               <w14:ligatures w14:val="standardContextual"/>
             </w:rPr>
           </w:pPr>
-          <w:hyperlink w:anchor="_Toc230202029" w:history="1">
+          <w:hyperlink w:anchor="_Toc230203423" w:history="1">
             <w:r>
               <w:rPr>
                 <w:rStyle w:val="Hyperlink"/>
@@ -2184,7 +2125,6 @@
               <w:rPr>
                 <w:noProof/>
                 <w:webHidden/>
-                <w:lang w:val="en-US"/>
               </w:rPr>
               <w:tab/>
             </w:r>
@@ -2192,7 +2132,6 @@
               <w:rPr>
                 <w:noProof/>
                 <w:webHidden/>
-                <w:lang w:val="en-US"/>
               </w:rPr>
               <w:fldChar w:fldCharType="begin"/>
             </w:r>
@@ -2200,22 +2139,19 @@
               <w:rPr>
                 <w:noProof/>
                 <w:webHidden/>
-                <w:lang w:val="en-US"/>
-              </w:rPr>
-              <w:instrText xml:space="preserve"> PAGEREF _Toc230202029 \h </w:instrText>
-            </w:r>
-            <w:r>
-              <w:rPr>
-                <w:noProof/>
-                <w:webHidden/>
-                <w:lang w:val="en-US"/>
-              </w:rPr>
-            </w:r>
-            <w:r>
-              <w:rPr>
-                <w:noProof/>
-                <w:webHidden/>
-                <w:lang w:val="en-US"/>
+              </w:rPr>
+              <w:instrText xml:space="preserve"> PAGEREF _Toc230203423 \h </w:instrText>
+            </w:r>
+            <w:r>
+              <w:rPr>
+                <w:noProof/>
+                <w:webHidden/>
+              </w:rPr>
+            </w:r>
+            <w:r>
+              <w:rPr>
+                <w:noProof/>
+                <w:webHidden/>
               </w:rPr>
               <w:fldChar w:fldCharType="separate"/>
             </w:r>
@@ -2223,7 +2159,6 @@
               <w:rPr>
                 <w:noProof/>
                 <w:webHidden/>
-                <w:lang w:val="en-US"/>
               </w:rPr>
               <w:t>10</w:t>
             </w:r>
@@ -2231,7 +2166,6 @@
               <w:rPr>
                 <w:noProof/>
                 <w:webHidden/>
-                <w:lang w:val="en-US"/>
               </w:rPr>
               <w:fldChar w:fldCharType="end"/>
             </w:r>
@@ -2255,7 +2189,7 @@
               <w14:ligatures w14:val="standardContextual"/>
             </w:rPr>
           </w:pPr>
-          <w:hyperlink w:anchor="_Toc230202030" w:history="1">
+          <w:hyperlink w:anchor="_Toc230203424" w:history="1">
             <w:r>
               <w:rPr>
                 <w:rStyle w:val="Hyperlink"/>
@@ -2289,7 +2223,6 @@
               <w:rPr>
                 <w:noProof/>
                 <w:webHidden/>
-                <w:lang w:val="en-US"/>
               </w:rPr>
               <w:tab/>
             </w:r>
@@ -2297,7 +2230,6 @@
               <w:rPr>
                 <w:noProof/>
                 <w:webHidden/>
-                <w:lang w:val="en-US"/>
               </w:rPr>
               <w:fldChar w:fldCharType="begin"/>
             </w:r>
@@ -2305,22 +2237,19 @@
               <w:rPr>
                 <w:noProof/>
                 <w:webHidden/>
-                <w:lang w:val="en-US"/>
-              </w:rPr>
-              <w:instrText xml:space="preserve"> PAGEREF _Toc230202030 \h </w:instrText>
-            </w:r>
-            <w:r>
-              <w:rPr>
-                <w:noProof/>
-                <w:webHidden/>
-                <w:lang w:val="en-US"/>
-              </w:rPr>
-            </w:r>
-            <w:r>
-              <w:rPr>
-                <w:noProof/>
-                <w:webHidden/>
-                <w:lang w:val="en-US"/>
+              </w:rPr>
+              <w:instrText xml:space="preserve"> PAGEREF _Toc230203424 \h </w:instrText>
+            </w:r>
+            <w:r>
+              <w:rPr>
+                <w:noProof/>
+                <w:webHidden/>
+              </w:rPr>
+            </w:r>
+            <w:r>
+              <w:rPr>
+                <w:noProof/>
+                <w:webHidden/>
               </w:rPr>
               <w:fldChar w:fldCharType="separate"/>
             </w:r>
@@ -2328,7 +2257,6 @@
               <w:rPr>
                 <w:noProof/>
                 <w:webHidden/>
-                <w:lang w:val="en-US"/>
               </w:rPr>
               <w:t>10</w:t>
             </w:r>
@@ -2336,7 +2264,6 @@
               <w:rPr>
                 <w:noProof/>
                 <w:webHidden/>
-                <w:lang w:val="en-US"/>
               </w:rPr>
               <w:fldChar w:fldCharType="end"/>
             </w:r>
@@ -2360,7 +2287,7 @@
               <w14:ligatures w14:val="standardContextual"/>
             </w:rPr>
           </w:pPr>
-          <w:hyperlink w:anchor="_Toc230202031" w:history="1">
+          <w:hyperlink w:anchor="_Toc230203425" w:history="1">
             <w:r>
               <w:rPr>
                 <w:rStyle w:val="Hyperlink"/>
@@ -2394,7 +2321,6 @@
               <w:rPr>
                 <w:noProof/>
                 <w:webHidden/>
-                <w:lang w:val="en-US"/>
               </w:rPr>
               <w:tab/>
             </w:r>
@@ -2402,7 +2328,6 @@
               <w:rPr>
                 <w:noProof/>
                 <w:webHidden/>
-                <w:lang w:val="en-US"/>
               </w:rPr>
               <w:fldChar w:fldCharType="begin"/>
             </w:r>
@@ -2410,22 +2335,19 @@
               <w:rPr>
                 <w:noProof/>
                 <w:webHidden/>
-                <w:lang w:val="en-US"/>
-              </w:rPr>
-              <w:instrText xml:space="preserve"> PAGEREF _Toc230202031 \h </w:instrText>
-            </w:r>
-            <w:r>
-              <w:rPr>
-                <w:noProof/>
-                <w:webHidden/>
-                <w:lang w:val="en-US"/>
-              </w:rPr>
-            </w:r>
-            <w:r>
-              <w:rPr>
-                <w:noProof/>
-                <w:webHidden/>
-                <w:lang w:val="en-US"/>
+              </w:rPr>
+              <w:instrText xml:space="preserve"> PAGEREF _Toc230203425 \h </w:instrText>
+            </w:r>
+            <w:r>
+              <w:rPr>
+                <w:noProof/>
+                <w:webHidden/>
+              </w:rPr>
+            </w:r>
+            <w:r>
+              <w:rPr>
+                <w:noProof/>
+                <w:webHidden/>
               </w:rPr>
               <w:fldChar w:fldCharType="separate"/>
             </w:r>
@@ -2433,7 +2355,6 @@
               <w:rPr>
                 <w:noProof/>
                 <w:webHidden/>
-                <w:lang w:val="en-US"/>
               </w:rPr>
               <w:t>10</w:t>
             </w:r>
@@ -2441,7 +2362,6 @@
               <w:rPr>
                 <w:noProof/>
                 <w:webHidden/>
-                <w:lang w:val="en-US"/>
               </w:rPr>
               <w:fldChar w:fldCharType="end"/>
             </w:r>
@@ -2465,7 +2385,7 @@
               <w14:ligatures w14:val="standardContextual"/>
             </w:rPr>
           </w:pPr>
-          <w:hyperlink w:anchor="_Toc230202032" w:history="1">
+          <w:hyperlink w:anchor="_Toc230203426" w:history="1">
             <w:r>
               <w:rPr>
                 <w:rStyle w:val="Hyperlink"/>
@@ -2499,7 +2419,6 @@
               <w:rPr>
                 <w:noProof/>
                 <w:webHidden/>
-                <w:lang w:val="en-US"/>
               </w:rPr>
               <w:tab/>
             </w:r>
@@ -2507,7 +2426,6 @@
               <w:rPr>
                 <w:noProof/>
                 <w:webHidden/>
-                <w:lang w:val="en-US"/>
               </w:rPr>
               <w:fldChar w:fldCharType="begin"/>
             </w:r>
@@ -2515,22 +2433,19 @@
               <w:rPr>
                 <w:noProof/>
                 <w:webHidden/>
-                <w:lang w:val="en-US"/>
-              </w:rPr>
-              <w:instrText xml:space="preserve"> PAGEREF _Toc230202032 \h </w:instrText>
-            </w:r>
-            <w:r>
-              <w:rPr>
-                <w:noProof/>
-                <w:webHidden/>
-                <w:lang w:val="en-US"/>
-              </w:rPr>
-            </w:r>
-            <w:r>
-              <w:rPr>
-                <w:noProof/>
-                <w:webHidden/>
-                <w:lang w:val="en-US"/>
+              </w:rPr>
+              <w:instrText xml:space="preserve"> PAGEREF _Toc230203426 \h </w:instrText>
+            </w:r>
+            <w:r>
+              <w:rPr>
+                <w:noProof/>
+                <w:webHidden/>
+              </w:rPr>
+            </w:r>
+            <w:r>
+              <w:rPr>
+                <w:noProof/>
+                <w:webHidden/>
               </w:rPr>
               <w:fldChar w:fldCharType="separate"/>
             </w:r>
@@ -2538,7 +2453,6 @@
               <w:rPr>
                 <w:noProof/>
                 <w:webHidden/>
-                <w:lang w:val="en-US"/>
               </w:rPr>
               <w:t>11</w:t>
             </w:r>
@@ -2546,7 +2460,6 @@
               <w:rPr>
                 <w:noProof/>
                 <w:webHidden/>
-                <w:lang w:val="en-US"/>
               </w:rPr>
               <w:fldChar w:fldCharType="end"/>
             </w:r>
@@ -2570,7 +2483,7 @@
               <w14:ligatures w14:val="standardContextual"/>
             </w:rPr>
           </w:pPr>
-          <w:hyperlink w:anchor="_Toc230202033" w:history="1">
+          <w:hyperlink w:anchor="_Toc230203427" w:history="1">
             <w:r>
               <w:rPr>
                 <w:rStyle w:val="Hyperlink"/>
@@ -2604,7 +2517,6 @@
               <w:rPr>
                 <w:noProof/>
                 <w:webHidden/>
-                <w:lang w:val="en-US"/>
               </w:rPr>
               <w:tab/>
             </w:r>
@@ -2612,7 +2524,6 @@
               <w:rPr>
                 <w:noProof/>
                 <w:webHidden/>
-                <w:lang w:val="en-US"/>
               </w:rPr>
               <w:fldChar w:fldCharType="begin"/>
             </w:r>
@@ -2620,22 +2531,19 @@
               <w:rPr>
                 <w:noProof/>
                 <w:webHidden/>
-                <w:lang w:val="en-US"/>
-              </w:rPr>
-              <w:instrText xml:space="preserve"> PAGEREF _Toc230202033 \h </w:instrText>
-            </w:r>
-            <w:r>
-              <w:rPr>
-                <w:noProof/>
-                <w:webHidden/>
-                <w:lang w:val="en-US"/>
-              </w:rPr>
-            </w:r>
-            <w:r>
-              <w:rPr>
-                <w:noProof/>
-                <w:webHidden/>
-                <w:lang w:val="en-US"/>
+              </w:rPr>
+              <w:instrText xml:space="preserve"> PAGEREF _Toc230203427 \h </w:instrText>
+            </w:r>
+            <w:r>
+              <w:rPr>
+                <w:noProof/>
+                <w:webHidden/>
+              </w:rPr>
+            </w:r>
+            <w:r>
+              <w:rPr>
+                <w:noProof/>
+                <w:webHidden/>
               </w:rPr>
               <w:fldChar w:fldCharType="separate"/>
             </w:r>
@@ -2643,7 +2551,6 @@
               <w:rPr>
                 <w:noProof/>
                 <w:webHidden/>
-                <w:lang w:val="en-US"/>
               </w:rPr>
               <w:t>11</w:t>
             </w:r>
@@ -2651,7 +2558,6 @@
               <w:rPr>
                 <w:noProof/>
                 <w:webHidden/>
-                <w:lang w:val="en-US"/>
               </w:rPr>
               <w:fldChar w:fldCharType="end"/>
             </w:r>
@@ -2675,7 +2581,7 @@
               <w14:ligatures w14:val="standardContextual"/>
             </w:rPr>
           </w:pPr>
-          <w:hyperlink w:anchor="_Toc230202034" w:history="1">
+          <w:hyperlink w:anchor="_Toc230203428" w:history="1">
             <w:r>
               <w:rPr>
                 <w:rStyle w:val="Hyperlink"/>
@@ -2709,7 +2615,6 @@
               <w:rPr>
                 <w:noProof/>
                 <w:webHidden/>
-                <w:lang w:val="en-US"/>
               </w:rPr>
               <w:tab/>
             </w:r>
@@ -2717,7 +2622,6 @@
               <w:rPr>
                 <w:noProof/>
                 <w:webHidden/>
-                <w:lang w:val="en-US"/>
               </w:rPr>
               <w:fldChar w:fldCharType="begin"/>
             </w:r>
@@ -2725,22 +2629,19 @@
               <w:rPr>
                 <w:noProof/>
                 <w:webHidden/>
-                <w:lang w:val="en-US"/>
-              </w:rPr>
-              <w:instrText xml:space="preserve"> PAGEREF _Toc230202034 \h </w:instrText>
-            </w:r>
-            <w:r>
-              <w:rPr>
-                <w:noProof/>
-                <w:webHidden/>
-                <w:lang w:val="en-US"/>
-              </w:rPr>
-            </w:r>
-            <w:r>
-              <w:rPr>
-                <w:noProof/>
-                <w:webHidden/>
-                <w:lang w:val="en-US"/>
+              </w:rPr>
+              <w:instrText xml:space="preserve"> PAGEREF _Toc230203428 \h </w:instrText>
+            </w:r>
+            <w:r>
+              <w:rPr>
+                <w:noProof/>
+                <w:webHidden/>
+              </w:rPr>
+            </w:r>
+            <w:r>
+              <w:rPr>
+                <w:noProof/>
+                <w:webHidden/>
               </w:rPr>
               <w:fldChar w:fldCharType="separate"/>
             </w:r>
@@ -2748,7 +2649,6 @@
               <w:rPr>
                 <w:noProof/>
                 <w:webHidden/>
-                <w:lang w:val="en-US"/>
               </w:rPr>
               <w:t>11</w:t>
             </w:r>
@@ -2756,7 +2656,6 @@
               <w:rPr>
                 <w:noProof/>
                 <w:webHidden/>
-                <w:lang w:val="en-US"/>
               </w:rPr>
               <w:fldChar w:fldCharType="end"/>
             </w:r>
@@ -2781,7 +2680,7 @@
               <w14:ligatures w14:val="standardContextual"/>
             </w:rPr>
           </w:pPr>
-          <w:hyperlink w:anchor="_Toc230202035" w:history="1">
+          <w:hyperlink w:anchor="_Toc230203429" w:history="1">
             <w:r>
               <w:rPr>
                 <w:rStyle w:val="Hyperlink"/>
@@ -2817,7 +2716,6 @@
               <w:rPr>
                 <w:noProof/>
                 <w:webHidden/>
-                <w:lang w:val="en-US"/>
               </w:rPr>
               <w:tab/>
             </w:r>
@@ -2825,7 +2723,6 @@
               <w:rPr>
                 <w:noProof/>
                 <w:webHidden/>
-                <w:lang w:val="en-US"/>
               </w:rPr>
               <w:fldChar w:fldCharType="begin"/>
             </w:r>
@@ -2833,30 +2730,27 @@
               <w:rPr>
                 <w:noProof/>
                 <w:webHidden/>
-                <w:lang w:val="en-US"/>
-              </w:rPr>
-              <w:instrText xml:space="preserve"> PAGEREF _Toc230202035 \h </w:instrText>
-            </w:r>
-            <w:r>
-              <w:rPr>
-                <w:noProof/>
-                <w:webHidden/>
-                <w:lang w:val="en-US"/>
-              </w:rPr>
-            </w:r>
-            <w:r>
-              <w:rPr>
-                <w:noProof/>
-                <w:webHidden/>
-                <w:lang w:val="en-US"/>
+              </w:rPr>
+              <w:instrText xml:space="preserve"> PAGEREF _Toc230203429 \h </w:instrText>
+            </w:r>
+            <w:r>
+              <w:rPr>
+                <w:noProof/>
+                <w:webHidden/>
+              </w:rPr>
+            </w:r>
+            <w:r>
+              <w:rPr>
+                <w:noProof/>
+                <w:webHidden/>
               </w:rPr>
               <w:fldChar w:fldCharType="separate"/>
             </w:r>
             <w:r>
               <w:rPr>
-                <w:noProof/>
-                <w:webHidden/>
-                <w:lang w:val="en-US"/>
+                <w:rFonts w:hint="eastAsia"/>
+                <w:noProof/>
+                <w:webHidden/>
               </w:rPr>
               <w:t>11</w:t>
             </w:r>
@@ -2864,7 +2758,6 @@
               <w:rPr>
                 <w:noProof/>
                 <w:webHidden/>
-                <w:lang w:val="en-US"/>
               </w:rPr>
               <w:fldChar w:fldCharType="end"/>
             </w:r>
@@ -2889,7 +2782,7 @@
               <w14:ligatures w14:val="standardContextual"/>
             </w:rPr>
           </w:pPr>
-          <w:hyperlink w:anchor="_Toc230202036" w:history="1">
+          <w:hyperlink w:anchor="_Toc230203430" w:history="1">
             <w:r>
               <w:rPr>
                 <w:rStyle w:val="Hyperlink"/>
@@ -2925,7 +2818,6 @@
               <w:rPr>
                 <w:noProof/>
                 <w:webHidden/>
-                <w:lang w:val="en-US"/>
               </w:rPr>
               <w:tab/>
             </w:r>
@@ -2933,7 +2825,6 @@
               <w:rPr>
                 <w:noProof/>
                 <w:webHidden/>
-                <w:lang w:val="en-US"/>
               </w:rPr>
               <w:fldChar w:fldCharType="begin"/>
             </w:r>
@@ -2941,30 +2832,27 @@
               <w:rPr>
                 <w:noProof/>
                 <w:webHidden/>
-                <w:lang w:val="en-US"/>
-              </w:rPr>
-              <w:instrText xml:space="preserve"> PAGEREF _Toc230202036 \h </w:instrText>
-            </w:r>
-            <w:r>
-              <w:rPr>
-                <w:noProof/>
-                <w:webHidden/>
-                <w:lang w:val="en-US"/>
-              </w:rPr>
-            </w:r>
-            <w:r>
-              <w:rPr>
-                <w:noProof/>
-                <w:webHidden/>
-                <w:lang w:val="en-US"/>
+              </w:rPr>
+              <w:instrText xml:space="preserve"> PAGEREF _Toc230203430 \h </w:instrText>
+            </w:r>
+            <w:r>
+              <w:rPr>
+                <w:noProof/>
+                <w:webHidden/>
+              </w:rPr>
+            </w:r>
+            <w:r>
+              <w:rPr>
+                <w:noProof/>
+                <w:webHidden/>
               </w:rPr>
               <w:fldChar w:fldCharType="separate"/>
             </w:r>
             <w:r>
               <w:rPr>
-                <w:noProof/>
-                <w:webHidden/>
-                <w:lang w:val="en-US"/>
+                <w:rFonts w:hint="eastAsia"/>
+                <w:noProof/>
+                <w:webHidden/>
               </w:rPr>
               <w:t>12</w:t>
             </w:r>
@@ -2972,7 +2860,6 @@
               <w:rPr>
                 <w:noProof/>
                 <w:webHidden/>
-                <w:lang w:val="en-US"/>
               </w:rPr>
               <w:fldChar w:fldCharType="end"/>
             </w:r>
@@ -2997,7 +2884,7 @@
               <w14:ligatures w14:val="standardContextual"/>
             </w:rPr>
           </w:pPr>
-          <w:hyperlink w:anchor="_Toc230202037" w:history="1">
+          <w:hyperlink w:anchor="_Toc230203431" w:history="1">
             <w:r>
               <w:rPr>
                 <w:rStyle w:val="Hyperlink"/>
@@ -3033,7 +2920,6 @@
               <w:rPr>
                 <w:noProof/>
                 <w:webHidden/>
-                <w:lang w:val="en-US"/>
               </w:rPr>
               <w:tab/>
             </w:r>
@@ -3041,7 +2927,6 @@
               <w:rPr>
                 <w:noProof/>
                 <w:webHidden/>
-                <w:lang w:val="en-US"/>
               </w:rPr>
               <w:fldChar w:fldCharType="begin"/>
             </w:r>
@@ -3049,30 +2934,27 @@
               <w:rPr>
                 <w:noProof/>
                 <w:webHidden/>
-                <w:lang w:val="en-US"/>
-              </w:rPr>
-              <w:instrText xml:space="preserve"> PAGEREF _Toc230202037 \h </w:instrText>
-            </w:r>
-            <w:r>
-              <w:rPr>
-                <w:noProof/>
-                <w:webHidden/>
-                <w:lang w:val="en-US"/>
-              </w:rPr>
-            </w:r>
-            <w:r>
-              <w:rPr>
-                <w:noProof/>
-                <w:webHidden/>
-                <w:lang w:val="en-US"/>
+              </w:rPr>
+              <w:instrText xml:space="preserve"> PAGEREF _Toc230203431 \h </w:instrText>
+            </w:r>
+            <w:r>
+              <w:rPr>
+                <w:noProof/>
+                <w:webHidden/>
+              </w:rPr>
+            </w:r>
+            <w:r>
+              <w:rPr>
+                <w:noProof/>
+                <w:webHidden/>
               </w:rPr>
               <w:fldChar w:fldCharType="separate"/>
             </w:r>
             <w:r>
               <w:rPr>
-                <w:noProof/>
-                <w:webHidden/>
-                <w:lang w:val="en-US"/>
+                <w:rFonts w:hint="eastAsia"/>
+                <w:noProof/>
+                <w:webHidden/>
               </w:rPr>
               <w:t>12</w:t>
             </w:r>
@@ -3080,7 +2962,6 @@
               <w:rPr>
                 <w:noProof/>
                 <w:webHidden/>
-                <w:lang w:val="en-US"/>
               </w:rPr>
               <w:fldChar w:fldCharType="end"/>
             </w:r>
@@ -3104,7 +2985,7 @@
               <w14:ligatures w14:val="standardContextual"/>
             </w:rPr>
           </w:pPr>
-          <w:hyperlink w:anchor="_Toc230202038" w:history="1">
+          <w:hyperlink w:anchor="_Toc230203432" w:history="1">
             <w:r>
               <w:rPr>
                 <w:rStyle w:val="Hyperlink"/>
@@ -3138,7 +3019,6 @@
               <w:rPr>
                 <w:noProof/>
                 <w:webHidden/>
-                <w:lang w:val="en-US"/>
               </w:rPr>
               <w:tab/>
             </w:r>
@@ -3146,7 +3026,6 @@
               <w:rPr>
                 <w:noProof/>
                 <w:webHidden/>
-                <w:lang w:val="en-US"/>
               </w:rPr>
               <w:fldChar w:fldCharType="begin"/>
             </w:r>
@@ -3154,22 +3033,19 @@
               <w:rPr>
                 <w:noProof/>
                 <w:webHidden/>
-                <w:lang w:val="en-US"/>
-              </w:rPr>
-              <w:instrText xml:space="preserve"> PAGEREF _Toc230202038 \h </w:instrText>
-            </w:r>
-            <w:r>
-              <w:rPr>
-                <w:noProof/>
-                <w:webHidden/>
-                <w:lang w:val="en-US"/>
-              </w:rPr>
-            </w:r>
-            <w:r>
-              <w:rPr>
-                <w:noProof/>
-                <w:webHidden/>
-                <w:lang w:val="en-US"/>
+              </w:rPr>
+              <w:instrText xml:space="preserve"> PAGEREF _Toc230203432 \h </w:instrText>
+            </w:r>
+            <w:r>
+              <w:rPr>
+                <w:noProof/>
+                <w:webHidden/>
+              </w:rPr>
+            </w:r>
+            <w:r>
+              <w:rPr>
+                <w:noProof/>
+                <w:webHidden/>
               </w:rPr>
               <w:fldChar w:fldCharType="separate"/>
             </w:r>
@@ -3177,7 +3053,6 @@
               <w:rPr>
                 <w:noProof/>
                 <w:webHidden/>
-                <w:lang w:val="en-US"/>
               </w:rPr>
               <w:t>13</w:t>
             </w:r>
@@ -3185,7 +3060,6 @@
               <w:rPr>
                 <w:noProof/>
                 <w:webHidden/>
-                <w:lang w:val="en-US"/>
               </w:rPr>
               <w:fldChar w:fldCharType="end"/>
             </w:r>
@@ -3209,7 +3083,7 @@
               <w14:ligatures w14:val="standardContextual"/>
             </w:rPr>
           </w:pPr>
-          <w:hyperlink w:anchor="_Toc230202039" w:history="1">
+          <w:hyperlink w:anchor="_Toc230203433" w:history="1">
             <w:r>
               <w:rPr>
                 <w:rStyle w:val="Hyperlink"/>
@@ -3243,7 +3117,6 @@
               <w:rPr>
                 <w:noProof/>
                 <w:webHidden/>
-                <w:lang w:val="en-US"/>
               </w:rPr>
               <w:tab/>
             </w:r>
@@ -3251,7 +3124,6 @@
               <w:rPr>
                 <w:noProof/>
                 <w:webHidden/>
-                <w:lang w:val="en-US"/>
               </w:rPr>
               <w:fldChar w:fldCharType="begin"/>
             </w:r>
@@ -3259,22 +3131,19 @@
               <w:rPr>
                 <w:noProof/>
                 <w:webHidden/>
-                <w:lang w:val="en-US"/>
-              </w:rPr>
-              <w:instrText xml:space="preserve"> PAGEREF _Toc230202039 \h </w:instrText>
-            </w:r>
-            <w:r>
-              <w:rPr>
-                <w:noProof/>
-                <w:webHidden/>
-                <w:lang w:val="en-US"/>
-              </w:rPr>
-            </w:r>
-            <w:r>
-              <w:rPr>
-                <w:noProof/>
-                <w:webHidden/>
-                <w:lang w:val="en-US"/>
+              </w:rPr>
+              <w:instrText xml:space="preserve"> PAGEREF _Toc230203433 \h </w:instrText>
+            </w:r>
+            <w:r>
+              <w:rPr>
+                <w:noProof/>
+                <w:webHidden/>
+              </w:rPr>
+            </w:r>
+            <w:r>
+              <w:rPr>
+                <w:noProof/>
+                <w:webHidden/>
               </w:rPr>
               <w:fldChar w:fldCharType="separate"/>
             </w:r>
@@ -3282,7 +3151,6 @@
               <w:rPr>
                 <w:noProof/>
                 <w:webHidden/>
-                <w:lang w:val="en-US"/>
               </w:rPr>
               <w:t>13</w:t>
             </w:r>
@@ -3290,7 +3158,6 @@
               <w:rPr>
                 <w:noProof/>
                 <w:webHidden/>
-                <w:lang w:val="en-US"/>
               </w:rPr>
               <w:fldChar w:fldCharType="end"/>
             </w:r>
@@ -3314,7 +3181,7 @@
               <w14:ligatures w14:val="standardContextual"/>
             </w:rPr>
           </w:pPr>
-          <w:hyperlink w:anchor="_Toc230202040" w:history="1">
+          <w:hyperlink w:anchor="_Toc230203434" w:history="1">
             <w:r>
               <w:rPr>
                 <w:rStyle w:val="Hyperlink"/>
@@ -3348,7 +3215,6 @@
               <w:rPr>
                 <w:noProof/>
                 <w:webHidden/>
-                <w:lang w:val="en-US"/>
               </w:rPr>
               <w:tab/>
             </w:r>
@@ -3356,7 +3222,6 @@
               <w:rPr>
                 <w:noProof/>
                 <w:webHidden/>
-                <w:lang w:val="en-US"/>
               </w:rPr>
               <w:fldChar w:fldCharType="begin"/>
             </w:r>
@@ -3364,22 +3229,19 @@
               <w:rPr>
                 <w:noProof/>
                 <w:webHidden/>
-                <w:lang w:val="en-US"/>
-              </w:rPr>
-              <w:instrText xml:space="preserve"> PAGEREF _Toc230202040 \h </w:instrText>
-            </w:r>
-            <w:r>
-              <w:rPr>
-                <w:noProof/>
-                <w:webHidden/>
-                <w:lang w:val="en-US"/>
-              </w:rPr>
-            </w:r>
-            <w:r>
-              <w:rPr>
-                <w:noProof/>
-                <w:webHidden/>
-                <w:lang w:val="en-US"/>
+              </w:rPr>
+              <w:instrText xml:space="preserve"> PAGEREF _Toc230203434 \h </w:instrText>
+            </w:r>
+            <w:r>
+              <w:rPr>
+                <w:noProof/>
+                <w:webHidden/>
+              </w:rPr>
+            </w:r>
+            <w:r>
+              <w:rPr>
+                <w:noProof/>
+                <w:webHidden/>
               </w:rPr>
               <w:fldChar w:fldCharType="separate"/>
             </w:r>
@@ -3387,7 +3249,6 @@
               <w:rPr>
                 <w:noProof/>
                 <w:webHidden/>
-                <w:lang w:val="en-US"/>
               </w:rPr>
               <w:t>13</w:t>
             </w:r>
@@ -3395,7 +3256,6 @@
               <w:rPr>
                 <w:noProof/>
                 <w:webHidden/>
-                <w:lang w:val="en-US"/>
               </w:rPr>
               <w:fldChar w:fldCharType="end"/>
             </w:r>
@@ -3419,7 +3279,7 @@
               <w14:ligatures w14:val="standardContextual"/>
             </w:rPr>
           </w:pPr>
-          <w:hyperlink w:anchor="_Toc230202041" w:history="1">
+          <w:hyperlink w:anchor="_Toc230203435" w:history="1">
             <w:r>
               <w:rPr>
                 <w:rStyle w:val="Hyperlink"/>
@@ -3453,7 +3313,6 @@
               <w:rPr>
                 <w:noProof/>
                 <w:webHidden/>
-                <w:lang w:val="en-US"/>
               </w:rPr>
               <w:tab/>
             </w:r>
@@ -3461,7 +3320,6 @@
               <w:rPr>
                 <w:noProof/>
                 <w:webHidden/>
-                <w:lang w:val="en-US"/>
               </w:rPr>
               <w:fldChar w:fldCharType="begin"/>
             </w:r>
@@ -3469,22 +3327,19 @@
               <w:rPr>
                 <w:noProof/>
                 <w:webHidden/>
-                <w:lang w:val="en-US"/>
-              </w:rPr>
-              <w:instrText xml:space="preserve"> PAGEREF _Toc230202041 \h </w:instrText>
-            </w:r>
-            <w:r>
-              <w:rPr>
-                <w:noProof/>
-                <w:webHidden/>
-                <w:lang w:val="en-US"/>
-              </w:rPr>
-            </w:r>
-            <w:r>
-              <w:rPr>
-                <w:noProof/>
-                <w:webHidden/>
-                <w:lang w:val="en-US"/>
+              </w:rPr>
+              <w:instrText xml:space="preserve"> PAGEREF _Toc230203435 \h </w:instrText>
+            </w:r>
+            <w:r>
+              <w:rPr>
+                <w:noProof/>
+                <w:webHidden/>
+              </w:rPr>
+            </w:r>
+            <w:r>
+              <w:rPr>
+                <w:noProof/>
+                <w:webHidden/>
               </w:rPr>
               <w:fldChar w:fldCharType="separate"/>
             </w:r>
@@ -3492,7 +3347,6 @@
               <w:rPr>
                 <w:noProof/>
                 <w:webHidden/>
-                <w:lang w:val="en-US"/>
               </w:rPr>
               <w:t>13</w:t>
             </w:r>
@@ -3500,7 +3354,6 @@
               <w:rPr>
                 <w:noProof/>
                 <w:webHidden/>
-                <w:lang w:val="en-US"/>
               </w:rPr>
               <w:fldChar w:fldCharType="end"/>
             </w:r>
@@ -3524,7 +3377,7 @@
               <w14:ligatures w14:val="standardContextual"/>
             </w:rPr>
           </w:pPr>
-          <w:hyperlink w:anchor="_Toc230202042" w:history="1">
+          <w:hyperlink w:anchor="_Toc230203436" w:history="1">
             <w:r>
               <w:rPr>
                 <w:rStyle w:val="Hyperlink"/>
@@ -3558,7 +3411,6 @@
               <w:rPr>
                 <w:noProof/>
                 <w:webHidden/>
-                <w:lang w:val="en-US"/>
               </w:rPr>
               <w:tab/>
             </w:r>
@@ -3566,7 +3418,6 @@
               <w:rPr>
                 <w:noProof/>
                 <w:webHidden/>
-                <w:lang w:val="en-US"/>
               </w:rPr>
               <w:fldChar w:fldCharType="begin"/>
             </w:r>
@@ -3574,22 +3425,19 @@
               <w:rPr>
                 <w:noProof/>
                 <w:webHidden/>
-                <w:lang w:val="en-US"/>
-              </w:rPr>
-              <w:instrText xml:space="preserve"> PAGEREF _Toc230202042 \h </w:instrText>
-            </w:r>
-            <w:r>
-              <w:rPr>
-                <w:noProof/>
-                <w:webHidden/>
-                <w:lang w:val="en-US"/>
-              </w:rPr>
-            </w:r>
-            <w:r>
-              <w:rPr>
-                <w:noProof/>
-                <w:webHidden/>
-                <w:lang w:val="en-US"/>
+              </w:rPr>
+              <w:instrText xml:space="preserve"> PAGEREF _Toc230203436 \h </w:instrText>
+            </w:r>
+            <w:r>
+              <w:rPr>
+                <w:noProof/>
+                <w:webHidden/>
+              </w:rPr>
+            </w:r>
+            <w:r>
+              <w:rPr>
+                <w:noProof/>
+                <w:webHidden/>
               </w:rPr>
               <w:fldChar w:fldCharType="separate"/>
             </w:r>
@@ -3597,7 +3445,6 @@
               <w:rPr>
                 <w:noProof/>
                 <w:webHidden/>
-                <w:lang w:val="en-US"/>
               </w:rPr>
               <w:t>14</w:t>
             </w:r>
@@ -3605,7 +3452,6 @@
               <w:rPr>
                 <w:noProof/>
                 <w:webHidden/>
-                <w:lang w:val="en-US"/>
               </w:rPr>
               <w:fldChar w:fldCharType="end"/>
             </w:r>
@@ -3630,7 +3476,7 @@
               <w14:ligatures w14:val="standardContextual"/>
             </w:rPr>
           </w:pPr>
-          <w:hyperlink w:anchor="_Toc230202043" w:history="1">
+          <w:hyperlink w:anchor="_Toc230203437" w:history="1">
             <w:r>
               <w:rPr>
                 <w:rStyle w:val="Hyperlink"/>
@@ -3666,7 +3512,6 @@
               <w:rPr>
                 <w:noProof/>
                 <w:webHidden/>
-                <w:lang w:val="en-US"/>
               </w:rPr>
               <w:tab/>
             </w:r>
@@ -3674,7 +3519,6 @@
               <w:rPr>
                 <w:noProof/>
                 <w:webHidden/>
-                <w:lang w:val="en-US"/>
               </w:rPr>
               <w:fldChar w:fldCharType="begin"/>
             </w:r>
@@ -3682,30 +3526,27 @@
               <w:rPr>
                 <w:noProof/>
                 <w:webHidden/>
-                <w:lang w:val="en-US"/>
-              </w:rPr>
-              <w:instrText xml:space="preserve"> PAGEREF _Toc230202043 \h </w:instrText>
-            </w:r>
-            <w:r>
-              <w:rPr>
-                <w:noProof/>
-                <w:webHidden/>
-                <w:lang w:val="en-US"/>
-              </w:rPr>
-            </w:r>
-            <w:r>
-              <w:rPr>
-                <w:noProof/>
-                <w:webHidden/>
-                <w:lang w:val="en-US"/>
+              </w:rPr>
+              <w:instrText xml:space="preserve"> PAGEREF _Toc230203437 \h </w:instrText>
+            </w:r>
+            <w:r>
+              <w:rPr>
+                <w:noProof/>
+                <w:webHidden/>
+              </w:rPr>
+            </w:r>
+            <w:r>
+              <w:rPr>
+                <w:noProof/>
+                <w:webHidden/>
               </w:rPr>
               <w:fldChar w:fldCharType="separate"/>
             </w:r>
             <w:r>
               <w:rPr>
-                <w:noProof/>
-                <w:webHidden/>
-                <w:lang w:val="en-US"/>
+                <w:rFonts w:hint="eastAsia"/>
+                <w:noProof/>
+                <w:webHidden/>
               </w:rPr>
               <w:t>14</w:t>
             </w:r>
@@ -3713,7 +3554,6 @@
               <w:rPr>
                 <w:noProof/>
                 <w:webHidden/>
-                <w:lang w:val="en-US"/>
               </w:rPr>
               <w:fldChar w:fldCharType="end"/>
             </w:r>
@@ -3737,7 +3577,7 @@
               <w14:ligatures w14:val="standardContextual"/>
             </w:rPr>
           </w:pPr>
-          <w:hyperlink w:anchor="_Toc230202044" w:history="1">
+          <w:hyperlink w:anchor="_Toc230203438" w:history="1">
             <w:r>
               <w:rPr>
                 <w:rStyle w:val="Hyperlink"/>
@@ -3771,7 +3611,6 @@
               <w:rPr>
                 <w:noProof/>
                 <w:webHidden/>
-                <w:lang w:val="en-US"/>
               </w:rPr>
               <w:tab/>
             </w:r>
@@ -3779,7 +3618,6 @@
               <w:rPr>
                 <w:noProof/>
                 <w:webHidden/>
-                <w:lang w:val="en-US"/>
               </w:rPr>
               <w:fldChar w:fldCharType="begin"/>
             </w:r>
@@ -3787,22 +3625,19 @@
               <w:rPr>
                 <w:noProof/>
                 <w:webHidden/>
-                <w:lang w:val="en-US"/>
-              </w:rPr>
-              <w:instrText xml:space="preserve"> PAGEREF _Toc230202044 \h </w:instrText>
-            </w:r>
-            <w:r>
-              <w:rPr>
-                <w:noProof/>
-                <w:webHidden/>
-                <w:lang w:val="en-US"/>
-              </w:rPr>
-            </w:r>
-            <w:r>
-              <w:rPr>
-                <w:noProof/>
-                <w:webHidden/>
-                <w:lang w:val="en-US"/>
+              </w:rPr>
+              <w:instrText xml:space="preserve"> PAGEREF _Toc230203438 \h </w:instrText>
+            </w:r>
+            <w:r>
+              <w:rPr>
+                <w:noProof/>
+                <w:webHidden/>
+              </w:rPr>
+            </w:r>
+            <w:r>
+              <w:rPr>
+                <w:noProof/>
+                <w:webHidden/>
               </w:rPr>
               <w:fldChar w:fldCharType="separate"/>
             </w:r>
@@ -3810,7 +3645,6 @@
               <w:rPr>
                 <w:noProof/>
                 <w:webHidden/>
-                <w:lang w:val="en-US"/>
               </w:rPr>
               <w:t>14</w:t>
             </w:r>
@@ -3818,7 +3652,6 @@
               <w:rPr>
                 <w:noProof/>
                 <w:webHidden/>
-                <w:lang w:val="en-US"/>
               </w:rPr>
               <w:fldChar w:fldCharType="end"/>
             </w:r>
@@ -3842,7 +3675,7 @@
               <w14:ligatures w14:val="standardContextual"/>
             </w:rPr>
           </w:pPr>
-          <w:hyperlink w:anchor="_Toc230202045" w:history="1">
+          <w:hyperlink w:anchor="_Toc230203439" w:history="1">
             <w:r>
               <w:rPr>
                 <w:rStyle w:val="Hyperlink"/>
@@ -3876,7 +3709,6 @@
               <w:rPr>
                 <w:noProof/>
                 <w:webHidden/>
-                <w:lang w:val="en-US"/>
               </w:rPr>
               <w:tab/>
             </w:r>
@@ -3884,7 +3716,6 @@
               <w:rPr>
                 <w:noProof/>
                 <w:webHidden/>
-                <w:lang w:val="en-US"/>
               </w:rPr>
               <w:fldChar w:fldCharType="begin"/>
             </w:r>
@@ -3892,22 +3723,19 @@
               <w:rPr>
                 <w:noProof/>
                 <w:webHidden/>
-                <w:lang w:val="en-US"/>
-              </w:rPr>
-              <w:instrText xml:space="preserve"> PAGEREF _Toc230202045 \h </w:instrText>
-            </w:r>
-            <w:r>
-              <w:rPr>
-                <w:noProof/>
-                <w:webHidden/>
-                <w:lang w:val="en-US"/>
-              </w:rPr>
-            </w:r>
-            <w:r>
-              <w:rPr>
-                <w:noProof/>
-                <w:webHidden/>
-                <w:lang w:val="en-US"/>
+              </w:rPr>
+              <w:instrText xml:space="preserve"> PAGEREF _Toc230203439 \h </w:instrText>
+            </w:r>
+            <w:r>
+              <w:rPr>
+                <w:noProof/>
+                <w:webHidden/>
+              </w:rPr>
+            </w:r>
+            <w:r>
+              <w:rPr>
+                <w:noProof/>
+                <w:webHidden/>
               </w:rPr>
               <w:fldChar w:fldCharType="separate"/>
             </w:r>
@@ -3915,7 +3743,6 @@
               <w:rPr>
                 <w:noProof/>
                 <w:webHidden/>
-                <w:lang w:val="en-US"/>
               </w:rPr>
               <w:t>14</w:t>
             </w:r>
@@ -3923,7 +3750,6 @@
               <w:rPr>
                 <w:noProof/>
                 <w:webHidden/>
-                <w:lang w:val="en-US"/>
               </w:rPr>
               <w:fldChar w:fldCharType="end"/>
             </w:r>
@@ -3947,7 +3773,7 @@
               <w14:ligatures w14:val="standardContextual"/>
             </w:rPr>
           </w:pPr>
-          <w:hyperlink w:anchor="_Toc230202046" w:history="1">
+          <w:hyperlink w:anchor="_Toc230203440" w:history="1">
             <w:r>
               <w:rPr>
                 <w:rStyle w:val="Hyperlink"/>
@@ -3981,7 +3807,6 @@
               <w:rPr>
                 <w:noProof/>
                 <w:webHidden/>
-                <w:lang w:val="en-US"/>
               </w:rPr>
               <w:tab/>
             </w:r>
@@ -3989,7 +3814,6 @@
               <w:rPr>
                 <w:noProof/>
                 <w:webHidden/>
-                <w:lang w:val="en-US"/>
               </w:rPr>
               <w:fldChar w:fldCharType="begin"/>
             </w:r>
@@ -3997,22 +3821,19 @@
               <w:rPr>
                 <w:noProof/>
                 <w:webHidden/>
-                <w:lang w:val="en-US"/>
-              </w:rPr>
-              <w:instrText xml:space="preserve"> PAGEREF _Toc230202046 \h </w:instrText>
-            </w:r>
-            <w:r>
-              <w:rPr>
-                <w:noProof/>
-                <w:webHidden/>
-                <w:lang w:val="en-US"/>
-              </w:rPr>
-            </w:r>
-            <w:r>
-              <w:rPr>
-                <w:noProof/>
-                <w:webHidden/>
-                <w:lang w:val="en-US"/>
+              </w:rPr>
+              <w:instrText xml:space="preserve"> PAGEREF _Toc230203440 \h </w:instrText>
+            </w:r>
+            <w:r>
+              <w:rPr>
+                <w:noProof/>
+                <w:webHidden/>
+              </w:rPr>
+            </w:r>
+            <w:r>
+              <w:rPr>
+                <w:noProof/>
+                <w:webHidden/>
               </w:rPr>
               <w:fldChar w:fldCharType="separate"/>
             </w:r>
@@ -4020,7 +3841,6 @@
               <w:rPr>
                 <w:noProof/>
                 <w:webHidden/>
-                <w:lang w:val="en-US"/>
               </w:rPr>
               <w:t>14</w:t>
             </w:r>
@@ -4028,7 +3848,6 @@
               <w:rPr>
                 <w:noProof/>
                 <w:webHidden/>
-                <w:lang w:val="en-US"/>
               </w:rPr>
               <w:fldChar w:fldCharType="end"/>
             </w:r>
@@ -4052,7 +3871,7 @@
               <w14:ligatures w14:val="standardContextual"/>
             </w:rPr>
           </w:pPr>
-          <w:hyperlink w:anchor="_Toc230202047" w:history="1">
+          <w:hyperlink w:anchor="_Toc230203441" w:history="1">
             <w:r>
               <w:rPr>
                 <w:rStyle w:val="Hyperlink"/>
@@ -4086,7 +3905,6 @@
               <w:rPr>
                 <w:noProof/>
                 <w:webHidden/>
-                <w:lang w:val="en-US"/>
               </w:rPr>
               <w:tab/>
             </w:r>
@@ -4094,7 +3912,6 @@
               <w:rPr>
                 <w:noProof/>
                 <w:webHidden/>
-                <w:lang w:val="en-US"/>
               </w:rPr>
               <w:fldChar w:fldCharType="begin"/>
             </w:r>
@@ -4102,22 +3919,19 @@
               <w:rPr>
                 <w:noProof/>
                 <w:webHidden/>
-                <w:lang w:val="en-US"/>
-              </w:rPr>
-              <w:instrText xml:space="preserve"> PAGEREF _Toc230202047 \h </w:instrText>
-            </w:r>
-            <w:r>
-              <w:rPr>
-                <w:noProof/>
-                <w:webHidden/>
-                <w:lang w:val="en-US"/>
-              </w:rPr>
-            </w:r>
-            <w:r>
-              <w:rPr>
-                <w:noProof/>
-                <w:webHidden/>
-                <w:lang w:val="en-US"/>
+              </w:rPr>
+              <w:instrText xml:space="preserve"> PAGEREF _Toc230203441 \h </w:instrText>
+            </w:r>
+            <w:r>
+              <w:rPr>
+                <w:noProof/>
+                <w:webHidden/>
+              </w:rPr>
+            </w:r>
+            <w:r>
+              <w:rPr>
+                <w:noProof/>
+                <w:webHidden/>
               </w:rPr>
               <w:fldChar w:fldCharType="separate"/>
             </w:r>
@@ -4125,7 +3939,6 @@
               <w:rPr>
                 <w:noProof/>
                 <w:webHidden/>
-                <w:lang w:val="en-US"/>
               </w:rPr>
               <w:t>15</w:t>
             </w:r>
@@ -4133,7 +3946,6 @@
               <w:rPr>
                 <w:noProof/>
                 <w:webHidden/>
-                <w:lang w:val="en-US"/>
               </w:rPr>
               <w:fldChar w:fldCharType="end"/>
             </w:r>
@@ -4158,7 +3970,7 @@
               <w14:ligatures w14:val="standardContextual"/>
             </w:rPr>
           </w:pPr>
-          <w:hyperlink w:anchor="_Toc230202048" w:history="1">
+          <w:hyperlink w:anchor="_Toc230203442" w:history="1">
             <w:r>
               <w:rPr>
                 <w:rStyle w:val="Hyperlink"/>
@@ -4194,7 +4006,6 @@
               <w:rPr>
                 <w:noProof/>
                 <w:webHidden/>
-                <w:lang w:val="en-US"/>
               </w:rPr>
               <w:tab/>
             </w:r>
@@ -4202,7 +4013,6 @@
               <w:rPr>
                 <w:noProof/>
                 <w:webHidden/>
-                <w:lang w:val="en-US"/>
               </w:rPr>
               <w:fldChar w:fldCharType="begin"/>
             </w:r>
@@ -4210,30 +4020,27 @@
               <w:rPr>
                 <w:noProof/>
                 <w:webHidden/>
-                <w:lang w:val="en-US"/>
-              </w:rPr>
-              <w:instrText xml:space="preserve"> PAGEREF _Toc230202048 \h </w:instrText>
-            </w:r>
-            <w:r>
-              <w:rPr>
-                <w:noProof/>
-                <w:webHidden/>
-                <w:lang w:val="en-US"/>
-              </w:rPr>
-            </w:r>
-            <w:r>
-              <w:rPr>
-                <w:noProof/>
-                <w:webHidden/>
-                <w:lang w:val="en-US"/>
+              </w:rPr>
+              <w:instrText xml:space="preserve"> PAGEREF _Toc230203442 \h </w:instrText>
+            </w:r>
+            <w:r>
+              <w:rPr>
+                <w:noProof/>
+                <w:webHidden/>
+              </w:rPr>
+            </w:r>
+            <w:r>
+              <w:rPr>
+                <w:noProof/>
+                <w:webHidden/>
               </w:rPr>
               <w:fldChar w:fldCharType="separate"/>
             </w:r>
             <w:r>
               <w:rPr>
-                <w:noProof/>
-                <w:webHidden/>
-                <w:lang w:val="en-US"/>
+                <w:rFonts w:hint="eastAsia"/>
+                <w:noProof/>
+                <w:webHidden/>
               </w:rPr>
               <w:t>15</w:t>
             </w:r>
@@ -4241,7 +4048,6 @@
               <w:rPr>
                 <w:noProof/>
                 <w:webHidden/>
-                <w:lang w:val="en-US"/>
               </w:rPr>
               <w:fldChar w:fldCharType="end"/>
             </w:r>
@@ -4265,7 +4071,7 @@
               <w14:ligatures w14:val="standardContextual"/>
             </w:rPr>
           </w:pPr>
-          <w:hyperlink w:anchor="_Toc230202049" w:history="1">
+          <w:hyperlink w:anchor="_Toc230203443" w:history="1">
             <w:r>
               <w:rPr>
                 <w:rStyle w:val="Hyperlink"/>
@@ -4299,7 +4105,6 @@
               <w:rPr>
                 <w:noProof/>
                 <w:webHidden/>
-                <w:lang w:val="en-US"/>
               </w:rPr>
               <w:tab/>
             </w:r>
@@ -4307,7 +4112,6 @@
               <w:rPr>
                 <w:noProof/>
                 <w:webHidden/>
-                <w:lang w:val="en-US"/>
               </w:rPr>
               <w:fldChar w:fldCharType="begin"/>
             </w:r>
@@ -4315,22 +4119,19 @@
               <w:rPr>
                 <w:noProof/>
                 <w:webHidden/>
-                <w:lang w:val="en-US"/>
-              </w:rPr>
-              <w:instrText xml:space="preserve"> PAGEREF _Toc230202049 \h </w:instrText>
-            </w:r>
-            <w:r>
-              <w:rPr>
-                <w:noProof/>
-                <w:webHidden/>
-                <w:lang w:val="en-US"/>
-              </w:rPr>
-            </w:r>
-            <w:r>
-              <w:rPr>
-                <w:noProof/>
-                <w:webHidden/>
-                <w:lang w:val="en-US"/>
+              </w:rPr>
+              <w:instrText xml:space="preserve"> PAGEREF _Toc230203443 \h </w:instrText>
+            </w:r>
+            <w:r>
+              <w:rPr>
+                <w:noProof/>
+                <w:webHidden/>
+              </w:rPr>
+            </w:r>
+            <w:r>
+              <w:rPr>
+                <w:noProof/>
+                <w:webHidden/>
               </w:rPr>
               <w:fldChar w:fldCharType="separate"/>
             </w:r>
@@ -4338,7 +4139,6 @@
               <w:rPr>
                 <w:noProof/>
                 <w:webHidden/>
-                <w:lang w:val="en-US"/>
               </w:rPr>
               <w:t>15</w:t>
             </w:r>
@@ -4346,7 +4146,6 @@
               <w:rPr>
                 <w:noProof/>
                 <w:webHidden/>
-                <w:lang w:val="en-US"/>
               </w:rPr>
               <w:fldChar w:fldCharType="end"/>
             </w:r>
@@ -4370,7 +4169,7 @@
               <w14:ligatures w14:val="standardContextual"/>
             </w:rPr>
           </w:pPr>
-          <w:hyperlink w:anchor="_Toc230202050" w:history="1">
+          <w:hyperlink w:anchor="_Toc230203444" w:history="1">
             <w:r>
               <w:rPr>
                 <w:rStyle w:val="Hyperlink"/>
@@ -4404,7 +4203,6 @@
               <w:rPr>
                 <w:noProof/>
                 <w:webHidden/>
-                <w:lang w:val="en-US"/>
               </w:rPr>
               <w:tab/>
             </w:r>
@@ -4412,7 +4210,6 @@
               <w:rPr>
                 <w:noProof/>
                 <w:webHidden/>
-                <w:lang w:val="en-US"/>
               </w:rPr>
               <w:fldChar w:fldCharType="begin"/>
             </w:r>
@@ -4420,22 +4217,19 @@
               <w:rPr>
                 <w:noProof/>
                 <w:webHidden/>
-                <w:lang w:val="en-US"/>
-              </w:rPr>
-              <w:instrText xml:space="preserve"> PAGEREF _Toc230202050 \h </w:instrText>
-            </w:r>
-            <w:r>
-              <w:rPr>
-                <w:noProof/>
-                <w:webHidden/>
-                <w:lang w:val="en-US"/>
-              </w:rPr>
-            </w:r>
-            <w:r>
-              <w:rPr>
-                <w:noProof/>
-                <w:webHidden/>
-                <w:lang w:val="en-US"/>
+              </w:rPr>
+              <w:instrText xml:space="preserve"> PAGEREF _Toc230203444 \h </w:instrText>
+            </w:r>
+            <w:r>
+              <w:rPr>
+                <w:noProof/>
+                <w:webHidden/>
+              </w:rPr>
+            </w:r>
+            <w:r>
+              <w:rPr>
+                <w:noProof/>
+                <w:webHidden/>
               </w:rPr>
               <w:fldChar w:fldCharType="separate"/>
             </w:r>
@@ -4443,7 +4237,6 @@
               <w:rPr>
                 <w:noProof/>
                 <w:webHidden/>
-                <w:lang w:val="en-US"/>
               </w:rPr>
               <w:t>16</w:t>
             </w:r>
@@ -4451,7 +4244,6 @@
               <w:rPr>
                 <w:noProof/>
                 <w:webHidden/>
-                <w:lang w:val="en-US"/>
               </w:rPr>
               <w:fldChar w:fldCharType="end"/>
             </w:r>
@@ -4475,7 +4267,7 @@
               <w14:ligatures w14:val="standardContextual"/>
             </w:rPr>
           </w:pPr>
-          <w:hyperlink w:anchor="_Toc230202051" w:history="1">
+          <w:hyperlink w:anchor="_Toc230203445" w:history="1">
             <w:r>
               <w:rPr>
                 <w:rStyle w:val="Hyperlink"/>
@@ -4509,7 +4301,6 @@
               <w:rPr>
                 <w:noProof/>
                 <w:webHidden/>
-                <w:lang w:val="en-US"/>
               </w:rPr>
               <w:tab/>
             </w:r>
@@ -4517,7 +4308,6 @@
               <w:rPr>
                 <w:noProof/>
                 <w:webHidden/>
-                <w:lang w:val="en-US"/>
               </w:rPr>
               <w:fldChar w:fldCharType="begin"/>
             </w:r>
@@ -4525,22 +4315,19 @@
               <w:rPr>
                 <w:noProof/>
                 <w:webHidden/>
-                <w:lang w:val="en-US"/>
-              </w:rPr>
-              <w:instrText xml:space="preserve"> PAGEREF _Toc230202051 \h </w:instrText>
-            </w:r>
-            <w:r>
-              <w:rPr>
-                <w:noProof/>
-                <w:webHidden/>
-                <w:lang w:val="en-US"/>
-              </w:rPr>
-            </w:r>
-            <w:r>
-              <w:rPr>
-                <w:noProof/>
-                <w:webHidden/>
-                <w:lang w:val="en-US"/>
+              </w:rPr>
+              <w:instrText xml:space="preserve"> PAGEREF _Toc230203445 \h </w:instrText>
+            </w:r>
+            <w:r>
+              <w:rPr>
+                <w:noProof/>
+                <w:webHidden/>
+              </w:rPr>
+            </w:r>
+            <w:r>
+              <w:rPr>
+                <w:noProof/>
+                <w:webHidden/>
               </w:rPr>
               <w:fldChar w:fldCharType="separate"/>
             </w:r>
@@ -4548,7 +4335,6 @@
               <w:rPr>
                 <w:noProof/>
                 <w:webHidden/>
-                <w:lang w:val="en-US"/>
               </w:rPr>
               <w:t>17</w:t>
             </w:r>
@@ -4556,7 +4342,6 @@
               <w:rPr>
                 <w:noProof/>
                 <w:webHidden/>
-                <w:lang w:val="en-US"/>
               </w:rPr>
               <w:fldChar w:fldCharType="end"/>
             </w:r>
@@ -4580,7 +4365,7 @@
               <w14:ligatures w14:val="standardContextual"/>
             </w:rPr>
           </w:pPr>
-          <w:hyperlink w:anchor="_Toc230202052" w:history="1">
+          <w:hyperlink w:anchor="_Toc230203446" w:history="1">
             <w:r>
               <w:rPr>
                 <w:rStyle w:val="Hyperlink"/>
@@ -4614,7 +4399,6 @@
               <w:rPr>
                 <w:noProof/>
                 <w:webHidden/>
-                <w:lang w:val="en-US"/>
               </w:rPr>
               <w:tab/>
             </w:r>
@@ -4622,7 +4406,6 @@
               <w:rPr>
                 <w:noProof/>
                 <w:webHidden/>
-                <w:lang w:val="en-US"/>
               </w:rPr>
               <w:fldChar w:fldCharType="begin"/>
             </w:r>
@@ -4630,22 +4413,19 @@
               <w:rPr>
                 <w:noProof/>
                 <w:webHidden/>
-                <w:lang w:val="en-US"/>
-              </w:rPr>
-              <w:instrText xml:space="preserve"> PAGEREF _Toc230202052 \h </w:instrText>
-            </w:r>
-            <w:r>
-              <w:rPr>
-                <w:noProof/>
-                <w:webHidden/>
-                <w:lang w:val="en-US"/>
-              </w:rPr>
-            </w:r>
-            <w:r>
-              <w:rPr>
-                <w:noProof/>
-                <w:webHidden/>
-                <w:lang w:val="en-US"/>
+              </w:rPr>
+              <w:instrText xml:space="preserve"> PAGEREF _Toc230203446 \h </w:instrText>
+            </w:r>
+            <w:r>
+              <w:rPr>
+                <w:noProof/>
+                <w:webHidden/>
+              </w:rPr>
+            </w:r>
+            <w:r>
+              <w:rPr>
+                <w:noProof/>
+                <w:webHidden/>
               </w:rPr>
               <w:fldChar w:fldCharType="separate"/>
             </w:r>
@@ -4653,7 +4433,6 @@
               <w:rPr>
                 <w:noProof/>
                 <w:webHidden/>
-                <w:lang w:val="en-US"/>
               </w:rPr>
               <w:t>18</w:t>
             </w:r>
@@ -4661,7 +4440,6 @@
               <w:rPr>
                 <w:noProof/>
                 <w:webHidden/>
-                <w:lang w:val="en-US"/>
               </w:rPr>
               <w:fldChar w:fldCharType="end"/>
             </w:r>
@@ -4685,7 +4463,7 @@
               <w14:ligatures w14:val="standardContextual"/>
             </w:rPr>
           </w:pPr>
-          <w:hyperlink w:anchor="_Toc230202053" w:history="1">
+          <w:hyperlink w:anchor="_Toc230203447" w:history="1">
             <w:r>
               <w:rPr>
                 <w:rStyle w:val="Hyperlink"/>
@@ -4719,7 +4497,6 @@
               <w:rPr>
                 <w:noProof/>
                 <w:webHidden/>
-                <w:lang w:val="en-US"/>
               </w:rPr>
               <w:tab/>
             </w:r>
@@ -4727,7 +4504,6 @@
               <w:rPr>
                 <w:noProof/>
                 <w:webHidden/>
-                <w:lang w:val="en-US"/>
               </w:rPr>
               <w:fldChar w:fldCharType="begin"/>
             </w:r>
@@ -4735,22 +4511,19 @@
               <w:rPr>
                 <w:noProof/>
                 <w:webHidden/>
-                <w:lang w:val="en-US"/>
-              </w:rPr>
-              <w:instrText xml:space="preserve"> PAGEREF _Toc230202053 \h </w:instrText>
-            </w:r>
-            <w:r>
-              <w:rPr>
-                <w:noProof/>
-                <w:webHidden/>
-                <w:lang w:val="en-US"/>
-              </w:rPr>
-            </w:r>
-            <w:r>
-              <w:rPr>
-                <w:noProof/>
-                <w:webHidden/>
-                <w:lang w:val="en-US"/>
+              </w:rPr>
+              <w:instrText xml:space="preserve"> PAGEREF _Toc230203447 \h </w:instrText>
+            </w:r>
+            <w:r>
+              <w:rPr>
+                <w:noProof/>
+                <w:webHidden/>
+              </w:rPr>
+            </w:r>
+            <w:r>
+              <w:rPr>
+                <w:noProof/>
+                <w:webHidden/>
               </w:rPr>
               <w:fldChar w:fldCharType="separate"/>
             </w:r>
@@ -4758,7 +4531,6 @@
               <w:rPr>
                 <w:noProof/>
                 <w:webHidden/>
-                <w:lang w:val="en-US"/>
               </w:rPr>
               <w:t>18</w:t>
             </w:r>
@@ -4766,7 +4538,6 @@
               <w:rPr>
                 <w:noProof/>
                 <w:webHidden/>
-                <w:lang w:val="en-US"/>
               </w:rPr>
               <w:fldChar w:fldCharType="end"/>
             </w:r>
@@ -4790,7 +4561,7 @@
               <w14:ligatures w14:val="standardContextual"/>
             </w:rPr>
           </w:pPr>
-          <w:hyperlink w:anchor="_Toc230202054" w:history="1">
+          <w:hyperlink w:anchor="_Toc230203448" w:history="1">
             <w:r>
               <w:rPr>
                 <w:rStyle w:val="Hyperlink"/>
@@ -4824,7 +4595,6 @@
               <w:rPr>
                 <w:noProof/>
                 <w:webHidden/>
-                <w:lang w:val="en-US"/>
               </w:rPr>
               <w:tab/>
             </w:r>
@@ -4832,7 +4602,6 @@
               <w:rPr>
                 <w:noProof/>
                 <w:webHidden/>
-                <w:lang w:val="en-US"/>
               </w:rPr>
               <w:fldChar w:fldCharType="begin"/>
             </w:r>
@@ -4840,22 +4609,19 @@
               <w:rPr>
                 <w:noProof/>
                 <w:webHidden/>
-                <w:lang w:val="en-US"/>
-              </w:rPr>
-              <w:instrText xml:space="preserve"> PAGEREF _Toc230202054 \h </w:instrText>
-            </w:r>
-            <w:r>
-              <w:rPr>
-                <w:noProof/>
-                <w:webHidden/>
-                <w:lang w:val="en-US"/>
-              </w:rPr>
-            </w:r>
-            <w:r>
-              <w:rPr>
-                <w:noProof/>
-                <w:webHidden/>
-                <w:lang w:val="en-US"/>
+              </w:rPr>
+              <w:instrText xml:space="preserve"> PAGEREF _Toc230203448 \h </w:instrText>
+            </w:r>
+            <w:r>
+              <w:rPr>
+                <w:noProof/>
+                <w:webHidden/>
+              </w:rPr>
+            </w:r>
+            <w:r>
+              <w:rPr>
+                <w:noProof/>
+                <w:webHidden/>
               </w:rPr>
               <w:fldChar w:fldCharType="separate"/>
             </w:r>
@@ -4863,7 +4629,6 @@
               <w:rPr>
                 <w:noProof/>
                 <w:webHidden/>
-                <w:lang w:val="en-US"/>
               </w:rPr>
               <w:t>19</w:t>
             </w:r>
@@ -4871,7 +4636,6 @@
               <w:rPr>
                 <w:noProof/>
                 <w:webHidden/>
-                <w:lang w:val="en-US"/>
               </w:rPr>
               <w:fldChar w:fldCharType="end"/>
             </w:r>
@@ -4895,7 +4659,7 @@
               <w14:ligatures w14:val="standardContextual"/>
             </w:rPr>
           </w:pPr>
-          <w:hyperlink w:anchor="_Toc230202055" w:history="1">
+          <w:hyperlink w:anchor="_Toc230203449" w:history="1">
             <w:r>
               <w:rPr>
                 <w:rStyle w:val="Hyperlink"/>
@@ -4929,7 +4693,6 @@
               <w:rPr>
                 <w:noProof/>
                 <w:webHidden/>
-                <w:lang w:val="en-US"/>
               </w:rPr>
               <w:tab/>
             </w:r>
@@ -4937,7 +4700,6 @@
               <w:rPr>
                 <w:noProof/>
                 <w:webHidden/>
-                <w:lang w:val="en-US"/>
               </w:rPr>
               <w:fldChar w:fldCharType="begin"/>
             </w:r>
@@ -4945,22 +4707,19 @@
               <w:rPr>
                 <w:noProof/>
                 <w:webHidden/>
-                <w:lang w:val="en-US"/>
-              </w:rPr>
-              <w:instrText xml:space="preserve"> PAGEREF _Toc230202055 \h </w:instrText>
-            </w:r>
-            <w:r>
-              <w:rPr>
-                <w:noProof/>
-                <w:webHidden/>
-                <w:lang w:val="en-US"/>
-              </w:rPr>
-            </w:r>
-            <w:r>
-              <w:rPr>
-                <w:noProof/>
-                <w:webHidden/>
-                <w:lang w:val="en-US"/>
+              </w:rPr>
+              <w:instrText xml:space="preserve"> PAGEREF _Toc230203449 \h </w:instrText>
+            </w:r>
+            <w:r>
+              <w:rPr>
+                <w:noProof/>
+                <w:webHidden/>
+              </w:rPr>
+            </w:r>
+            <w:r>
+              <w:rPr>
+                <w:noProof/>
+                <w:webHidden/>
               </w:rPr>
               <w:fldChar w:fldCharType="separate"/>
             </w:r>
@@ -4968,7 +4727,6 @@
               <w:rPr>
                 <w:noProof/>
                 <w:webHidden/>
-                <w:lang w:val="en-US"/>
               </w:rPr>
               <w:t>20</w:t>
             </w:r>
@@ -4976,7 +4734,6 @@
               <w:rPr>
                 <w:noProof/>
                 <w:webHidden/>
-                <w:lang w:val="en-US"/>
               </w:rPr>
               <w:fldChar w:fldCharType="end"/>
             </w:r>
@@ -5000,7 +4757,7 @@
               <w14:ligatures w14:val="standardContextual"/>
             </w:rPr>
           </w:pPr>
-          <w:hyperlink w:anchor="_Toc230202056" w:history="1">
+          <w:hyperlink w:anchor="_Toc230203450" w:history="1">
             <w:r>
               <w:rPr>
                 <w:rStyle w:val="Hyperlink"/>
@@ -5034,7 +4791,6 @@
               <w:rPr>
                 <w:noProof/>
                 <w:webHidden/>
-                <w:lang w:val="en-US"/>
               </w:rPr>
               <w:tab/>
             </w:r>
@@ -5042,7 +4798,6 @@
               <w:rPr>
                 <w:noProof/>
                 <w:webHidden/>
-                <w:lang w:val="en-US"/>
               </w:rPr>
               <w:fldChar w:fldCharType="begin"/>
             </w:r>
@@ -5050,22 +4805,19 @@
               <w:rPr>
                 <w:noProof/>
                 <w:webHidden/>
-                <w:lang w:val="en-US"/>
-              </w:rPr>
-              <w:instrText xml:space="preserve"> PAGEREF _Toc230202056 \h </w:instrText>
-            </w:r>
-            <w:r>
-              <w:rPr>
-                <w:noProof/>
-                <w:webHidden/>
-                <w:lang w:val="en-US"/>
-              </w:rPr>
-            </w:r>
-            <w:r>
-              <w:rPr>
-                <w:noProof/>
-                <w:webHidden/>
-                <w:lang w:val="en-US"/>
+              </w:rPr>
+              <w:instrText xml:space="preserve"> PAGEREF _Toc230203450 \h </w:instrText>
+            </w:r>
+            <w:r>
+              <w:rPr>
+                <w:noProof/>
+                <w:webHidden/>
+              </w:rPr>
+            </w:r>
+            <w:r>
+              <w:rPr>
+                <w:noProof/>
+                <w:webHidden/>
               </w:rPr>
               <w:fldChar w:fldCharType="separate"/>
             </w:r>
@@ -5073,7 +4825,6 @@
               <w:rPr>
                 <w:noProof/>
                 <w:webHidden/>
-                <w:lang w:val="en-US"/>
               </w:rPr>
               <w:t>20</w:t>
             </w:r>
@@ -5081,7 +4832,6 @@
               <w:rPr>
                 <w:noProof/>
                 <w:webHidden/>
-                <w:lang w:val="en-US"/>
               </w:rPr>
               <w:fldChar w:fldCharType="end"/>
             </w:r>
@@ -5106,7 +4856,7 @@
               <w14:ligatures w14:val="standardContextual"/>
             </w:rPr>
           </w:pPr>
-          <w:hyperlink w:anchor="_Toc230202057" w:history="1">
+          <w:hyperlink w:anchor="_Toc230203451" w:history="1">
             <w:r>
               <w:rPr>
                 <w:rStyle w:val="Hyperlink"/>
@@ -5142,7 +4892,6 @@
               <w:rPr>
                 <w:noProof/>
                 <w:webHidden/>
-                <w:lang w:val="en-US"/>
               </w:rPr>
               <w:tab/>
             </w:r>
@@ -5150,7 +4899,6 @@
               <w:rPr>
                 <w:noProof/>
                 <w:webHidden/>
-                <w:lang w:val="en-US"/>
               </w:rPr>
               <w:fldChar w:fldCharType="begin"/>
             </w:r>
@@ -5158,30 +4906,27 @@
               <w:rPr>
                 <w:noProof/>
                 <w:webHidden/>
-                <w:lang w:val="en-US"/>
-              </w:rPr>
-              <w:instrText xml:space="preserve"> PAGEREF _Toc230202057 \h </w:instrText>
-            </w:r>
-            <w:r>
-              <w:rPr>
-                <w:noProof/>
-                <w:webHidden/>
-                <w:lang w:val="en-US"/>
-              </w:rPr>
-            </w:r>
-            <w:r>
-              <w:rPr>
-                <w:noProof/>
-                <w:webHidden/>
-                <w:lang w:val="en-US"/>
+              </w:rPr>
+              <w:instrText xml:space="preserve"> PAGEREF _Toc230203451 \h </w:instrText>
+            </w:r>
+            <w:r>
+              <w:rPr>
+                <w:noProof/>
+                <w:webHidden/>
+              </w:rPr>
+            </w:r>
+            <w:r>
+              <w:rPr>
+                <w:noProof/>
+                <w:webHidden/>
               </w:rPr>
               <w:fldChar w:fldCharType="separate"/>
             </w:r>
             <w:r>
               <w:rPr>
-                <w:noProof/>
-                <w:webHidden/>
-                <w:lang w:val="en-US"/>
+                <w:rFonts w:hint="eastAsia"/>
+                <w:noProof/>
+                <w:webHidden/>
               </w:rPr>
               <w:t>23</w:t>
             </w:r>
@@ -5189,7 +4934,6 @@
               <w:rPr>
                 <w:noProof/>
                 <w:webHidden/>
-                <w:lang w:val="en-US"/>
               </w:rPr>
               <w:fldChar w:fldCharType="end"/>
             </w:r>
@@ -5213,7 +4957,7 @@
               <w14:ligatures w14:val="standardContextual"/>
             </w:rPr>
           </w:pPr>
-          <w:hyperlink w:anchor="_Toc230202058" w:history="1">
+          <w:hyperlink w:anchor="_Toc230203452" w:history="1">
             <w:r>
               <w:rPr>
                 <w:rStyle w:val="Hyperlink"/>
@@ -5247,7 +4991,6 @@
               <w:rPr>
                 <w:noProof/>
                 <w:webHidden/>
-                <w:lang w:val="en-US"/>
               </w:rPr>
               <w:tab/>
             </w:r>
@@ -5255,7 +4998,6 @@
               <w:rPr>
                 <w:noProof/>
                 <w:webHidden/>
-                <w:lang w:val="en-US"/>
               </w:rPr>
               <w:fldChar w:fldCharType="begin"/>
             </w:r>
@@ -5263,22 +5005,19 @@
               <w:rPr>
                 <w:noProof/>
                 <w:webHidden/>
-                <w:lang w:val="en-US"/>
-              </w:rPr>
-              <w:instrText xml:space="preserve"> PAGEREF _Toc230202058 \h </w:instrText>
-            </w:r>
-            <w:r>
-              <w:rPr>
-                <w:noProof/>
-                <w:webHidden/>
-                <w:lang w:val="en-US"/>
-              </w:rPr>
-            </w:r>
-            <w:r>
-              <w:rPr>
-                <w:noProof/>
-                <w:webHidden/>
-                <w:lang w:val="en-US"/>
+              </w:rPr>
+              <w:instrText xml:space="preserve"> PAGEREF _Toc230203452 \h </w:instrText>
+            </w:r>
+            <w:r>
+              <w:rPr>
+                <w:noProof/>
+                <w:webHidden/>
+              </w:rPr>
+            </w:r>
+            <w:r>
+              <w:rPr>
+                <w:noProof/>
+                <w:webHidden/>
               </w:rPr>
               <w:fldChar w:fldCharType="separate"/>
             </w:r>
@@ -5286,7 +5025,6 @@
               <w:rPr>
                 <w:noProof/>
                 <w:webHidden/>
-                <w:lang w:val="en-US"/>
               </w:rPr>
               <w:t>23</w:t>
             </w:r>
@@ -5294,7 +5032,6 @@
               <w:rPr>
                 <w:noProof/>
                 <w:webHidden/>
-                <w:lang w:val="en-US"/>
               </w:rPr>
               <w:fldChar w:fldCharType="end"/>
             </w:r>
@@ -5318,7 +5055,7 @@
               <w14:ligatures w14:val="standardContextual"/>
             </w:rPr>
           </w:pPr>
-          <w:hyperlink w:anchor="_Toc230202059" w:history="1">
+          <w:hyperlink w:anchor="_Toc230203453" w:history="1">
             <w:r>
               <w:rPr>
                 <w:rStyle w:val="Hyperlink"/>
@@ -5352,7 +5089,6 @@
               <w:rPr>
                 <w:noProof/>
                 <w:webHidden/>
-                <w:lang w:val="en-US"/>
               </w:rPr>
               <w:tab/>
             </w:r>
@@ -5360,7 +5096,6 @@
               <w:rPr>
                 <w:noProof/>
                 <w:webHidden/>
-                <w:lang w:val="en-US"/>
               </w:rPr>
               <w:fldChar w:fldCharType="begin"/>
             </w:r>
@@ -5368,22 +5103,19 @@
               <w:rPr>
                 <w:noProof/>
                 <w:webHidden/>
-                <w:lang w:val="en-US"/>
-              </w:rPr>
-              <w:instrText xml:space="preserve"> PAGEREF _Toc230202059 \h </w:instrText>
-            </w:r>
-            <w:r>
-              <w:rPr>
-                <w:noProof/>
-                <w:webHidden/>
-                <w:lang w:val="en-US"/>
-              </w:rPr>
-            </w:r>
-            <w:r>
-              <w:rPr>
-                <w:noProof/>
-                <w:webHidden/>
-                <w:lang w:val="en-US"/>
+              </w:rPr>
+              <w:instrText xml:space="preserve"> PAGEREF _Toc230203453 \h </w:instrText>
+            </w:r>
+            <w:r>
+              <w:rPr>
+                <w:noProof/>
+                <w:webHidden/>
+              </w:rPr>
+            </w:r>
+            <w:r>
+              <w:rPr>
+                <w:noProof/>
+                <w:webHidden/>
               </w:rPr>
               <w:fldChar w:fldCharType="separate"/>
             </w:r>
@@ -5391,7 +5123,6 @@
               <w:rPr>
                 <w:noProof/>
                 <w:webHidden/>
-                <w:lang w:val="en-US"/>
               </w:rPr>
               <w:t>23</w:t>
             </w:r>
@@ -5399,7 +5130,6 @@
               <w:rPr>
                 <w:noProof/>
                 <w:webHidden/>
-                <w:lang w:val="en-US"/>
               </w:rPr>
               <w:fldChar w:fldCharType="end"/>
             </w:r>
@@ -5423,7 +5153,7 @@
               <w14:ligatures w14:val="standardContextual"/>
             </w:rPr>
           </w:pPr>
-          <w:hyperlink w:anchor="_Toc230202060" w:history="1">
+          <w:hyperlink w:anchor="_Toc230203454" w:history="1">
             <w:r>
               <w:rPr>
                 <w:rStyle w:val="Hyperlink"/>
@@ -5457,7 +5187,6 @@
               <w:rPr>
                 <w:noProof/>
                 <w:webHidden/>
-                <w:lang w:val="en-US"/>
               </w:rPr>
               <w:tab/>
             </w:r>
@@ -5465,7 +5194,6 @@
               <w:rPr>
                 <w:noProof/>
                 <w:webHidden/>
-                <w:lang w:val="en-US"/>
               </w:rPr>
               <w:fldChar w:fldCharType="begin"/>
             </w:r>
@@ -5473,22 +5201,19 @@
               <w:rPr>
                 <w:noProof/>
                 <w:webHidden/>
-                <w:lang w:val="en-US"/>
-              </w:rPr>
-              <w:instrText xml:space="preserve"> PAGEREF _Toc230202060 \h </w:instrText>
-            </w:r>
-            <w:r>
-              <w:rPr>
-                <w:noProof/>
-                <w:webHidden/>
-                <w:lang w:val="en-US"/>
-              </w:rPr>
-            </w:r>
-            <w:r>
-              <w:rPr>
-                <w:noProof/>
-                <w:webHidden/>
-                <w:lang w:val="en-US"/>
+              </w:rPr>
+              <w:instrText xml:space="preserve"> PAGEREF _Toc230203454 \h </w:instrText>
+            </w:r>
+            <w:r>
+              <w:rPr>
+                <w:noProof/>
+                <w:webHidden/>
+              </w:rPr>
+            </w:r>
+            <w:r>
+              <w:rPr>
+                <w:noProof/>
+                <w:webHidden/>
               </w:rPr>
               <w:fldChar w:fldCharType="separate"/>
             </w:r>
@@ -5496,7 +5221,6 @@
               <w:rPr>
                 <w:noProof/>
                 <w:webHidden/>
-                <w:lang w:val="en-US"/>
               </w:rPr>
               <w:t>23</w:t>
             </w:r>
@@ -5504,7 +5228,6 @@
               <w:rPr>
                 <w:noProof/>
                 <w:webHidden/>
-                <w:lang w:val="en-US"/>
               </w:rPr>
               <w:fldChar w:fldCharType="end"/>
             </w:r>
@@ -5528,7 +5251,7 @@
               <w14:ligatures w14:val="standardContextual"/>
             </w:rPr>
           </w:pPr>
-          <w:hyperlink w:anchor="_Toc230202061" w:history="1">
+          <w:hyperlink w:anchor="_Toc230203455" w:history="1">
             <w:r>
               <w:rPr>
                 <w:rStyle w:val="Hyperlink"/>
@@ -5562,7 +5285,6 @@
               <w:rPr>
                 <w:noProof/>
                 <w:webHidden/>
-                <w:lang w:val="en-US"/>
               </w:rPr>
               <w:tab/>
             </w:r>
@@ -5570,7 +5292,6 @@
               <w:rPr>
                 <w:noProof/>
                 <w:webHidden/>
-                <w:lang w:val="en-US"/>
               </w:rPr>
               <w:fldChar w:fldCharType="begin"/>
             </w:r>
@@ -5578,22 +5299,19 @@
               <w:rPr>
                 <w:noProof/>
                 <w:webHidden/>
-                <w:lang w:val="en-US"/>
-              </w:rPr>
-              <w:instrText xml:space="preserve"> PAGEREF _Toc230202061 \h </w:instrText>
-            </w:r>
-            <w:r>
-              <w:rPr>
-                <w:noProof/>
-                <w:webHidden/>
-                <w:lang w:val="en-US"/>
-              </w:rPr>
-            </w:r>
-            <w:r>
-              <w:rPr>
-                <w:noProof/>
-                <w:webHidden/>
-                <w:lang w:val="en-US"/>
+              </w:rPr>
+              <w:instrText xml:space="preserve"> PAGEREF _Toc230203455 \h </w:instrText>
+            </w:r>
+            <w:r>
+              <w:rPr>
+                <w:noProof/>
+                <w:webHidden/>
+              </w:rPr>
+            </w:r>
+            <w:r>
+              <w:rPr>
+                <w:noProof/>
+                <w:webHidden/>
               </w:rPr>
               <w:fldChar w:fldCharType="separate"/>
             </w:r>
@@ -5601,7 +5319,6 @@
               <w:rPr>
                 <w:noProof/>
                 <w:webHidden/>
-                <w:lang w:val="en-US"/>
               </w:rPr>
               <w:t>24</w:t>
             </w:r>
@@ -5609,7 +5326,6 @@
               <w:rPr>
                 <w:noProof/>
                 <w:webHidden/>
-                <w:lang w:val="en-US"/>
               </w:rPr>
               <w:fldChar w:fldCharType="end"/>
             </w:r>
@@ -5633,7 +5349,7 @@
               <w14:ligatures w14:val="standardContextual"/>
             </w:rPr>
           </w:pPr>
-          <w:hyperlink w:anchor="_Toc230202062" w:history="1">
+          <w:hyperlink w:anchor="_Toc230203456" w:history="1">
             <w:r>
               <w:rPr>
                 <w:rStyle w:val="Hyperlink"/>
@@ -5667,7 +5383,6 @@
               <w:rPr>
                 <w:noProof/>
                 <w:webHidden/>
-                <w:lang w:val="en-US"/>
               </w:rPr>
               <w:tab/>
             </w:r>
@@ -5675,7 +5390,6 @@
               <w:rPr>
                 <w:noProof/>
                 <w:webHidden/>
-                <w:lang w:val="en-US"/>
               </w:rPr>
               <w:fldChar w:fldCharType="begin"/>
             </w:r>
@@ -5683,22 +5397,19 @@
               <w:rPr>
                 <w:noProof/>
                 <w:webHidden/>
-                <w:lang w:val="en-US"/>
-              </w:rPr>
-              <w:instrText xml:space="preserve"> PAGEREF _Toc230202062 \h </w:instrText>
-            </w:r>
-            <w:r>
-              <w:rPr>
-                <w:noProof/>
-                <w:webHidden/>
-                <w:lang w:val="en-US"/>
-              </w:rPr>
-            </w:r>
-            <w:r>
-              <w:rPr>
-                <w:noProof/>
-                <w:webHidden/>
-                <w:lang w:val="en-US"/>
+              </w:rPr>
+              <w:instrText xml:space="preserve"> PAGEREF _Toc230203456 \h </w:instrText>
+            </w:r>
+            <w:r>
+              <w:rPr>
+                <w:noProof/>
+                <w:webHidden/>
+              </w:rPr>
+            </w:r>
+            <w:r>
+              <w:rPr>
+                <w:noProof/>
+                <w:webHidden/>
               </w:rPr>
               <w:fldChar w:fldCharType="separate"/>
             </w:r>
@@ -5706,7 +5417,6 @@
               <w:rPr>
                 <w:noProof/>
                 <w:webHidden/>
-                <w:lang w:val="en-US"/>
               </w:rPr>
               <w:t>24</w:t>
             </w:r>
@@ -5714,7 +5424,6 @@
               <w:rPr>
                 <w:noProof/>
                 <w:webHidden/>
-                <w:lang w:val="en-US"/>
               </w:rPr>
               <w:fldChar w:fldCharType="end"/>
             </w:r>
@@ -5739,7 +5448,7 @@
               <w14:ligatures w14:val="standardContextual"/>
             </w:rPr>
           </w:pPr>
-          <w:hyperlink w:anchor="_Toc230202063" w:history="1">
+          <w:hyperlink w:anchor="_Toc230203457" w:history="1">
             <w:r>
               <w:rPr>
                 <w:rStyle w:val="Hyperlink"/>
@@ -5769,13 +5478,12 @@
                 <w:noProof/>
                 <w:lang w:val="en-US"/>
               </w:rPr>
-              <w:t>CONCLUSIONs</w:t>
-            </w:r>
-            <w:r>
-              <w:rPr>
-                <w:noProof/>
-                <w:webHidden/>
-                <w:lang w:val="en-US"/>
+              <w:t>CONCLUSIONS</w:t>
+            </w:r>
+            <w:r>
+              <w:rPr>
+                <w:noProof/>
+                <w:webHidden/>
               </w:rPr>
               <w:tab/>
             </w:r>
@@ -5783,7 +5491,6 @@
               <w:rPr>
                 <w:noProof/>
                 <w:webHidden/>
-                <w:lang w:val="en-US"/>
               </w:rPr>
               <w:fldChar w:fldCharType="begin"/>
             </w:r>
@@ -5791,30 +5498,27 @@
               <w:rPr>
                 <w:noProof/>
                 <w:webHidden/>
-                <w:lang w:val="en-US"/>
-              </w:rPr>
-              <w:instrText xml:space="preserve"> PAGEREF _Toc230202063 \h </w:instrText>
-            </w:r>
-            <w:r>
-              <w:rPr>
-                <w:noProof/>
-                <w:webHidden/>
-                <w:lang w:val="en-US"/>
-              </w:rPr>
-            </w:r>
-            <w:r>
-              <w:rPr>
-                <w:noProof/>
-                <w:webHidden/>
-                <w:lang w:val="en-US"/>
+              </w:rPr>
+              <w:instrText xml:space="preserve"> PAGEREF _Toc230203457 \h </w:instrText>
+            </w:r>
+            <w:r>
+              <w:rPr>
+                <w:noProof/>
+                <w:webHidden/>
+              </w:rPr>
+            </w:r>
+            <w:r>
+              <w:rPr>
+                <w:noProof/>
+                <w:webHidden/>
               </w:rPr>
               <w:fldChar w:fldCharType="separate"/>
             </w:r>
             <w:r>
               <w:rPr>
-                <w:noProof/>
-                <w:webHidden/>
-                <w:lang w:val="en-US"/>
+                <w:rFonts w:hint="eastAsia"/>
+                <w:noProof/>
+                <w:webHidden/>
               </w:rPr>
               <w:t>25</w:t>
             </w:r>
@@ -5822,7 +5526,6 @@
               <w:rPr>
                 <w:noProof/>
                 <w:webHidden/>
-                <w:lang w:val="en-US"/>
               </w:rPr>
               <w:fldChar w:fldCharType="end"/>
             </w:r>
@@ -5847,7 +5550,7 @@
               <w14:ligatures w14:val="standardContextual"/>
             </w:rPr>
           </w:pPr>
-          <w:hyperlink w:anchor="_Toc230202064" w:history="1">
+          <w:hyperlink w:anchor="_Toc230203458" w:history="1">
             <w:r>
               <w:rPr>
                 <w:rStyle w:val="Hyperlink"/>
@@ -5883,7 +5586,6 @@
               <w:rPr>
                 <w:noProof/>
                 <w:webHidden/>
-                <w:lang w:val="en-US"/>
               </w:rPr>
               <w:tab/>
             </w:r>
@@ -5891,7 +5593,6 @@
               <w:rPr>
                 <w:noProof/>
                 <w:webHidden/>
-                <w:lang w:val="en-US"/>
               </w:rPr>
               <w:fldChar w:fldCharType="begin"/>
             </w:r>
@@ -5899,30 +5600,27 @@
               <w:rPr>
                 <w:noProof/>
                 <w:webHidden/>
-                <w:lang w:val="en-US"/>
-              </w:rPr>
-              <w:instrText xml:space="preserve"> PAGEREF _Toc230202064 \h </w:instrText>
-            </w:r>
-            <w:r>
-              <w:rPr>
-                <w:noProof/>
-                <w:webHidden/>
-                <w:lang w:val="en-US"/>
-              </w:rPr>
-            </w:r>
-            <w:r>
-              <w:rPr>
-                <w:noProof/>
-                <w:webHidden/>
-                <w:lang w:val="en-US"/>
+              </w:rPr>
+              <w:instrText xml:space="preserve"> PAGEREF _Toc230203458 \h </w:instrText>
+            </w:r>
+            <w:r>
+              <w:rPr>
+                <w:noProof/>
+                <w:webHidden/>
+              </w:rPr>
+            </w:r>
+            <w:r>
+              <w:rPr>
+                <w:noProof/>
+                <w:webHidden/>
               </w:rPr>
               <w:fldChar w:fldCharType="separate"/>
             </w:r>
             <w:r>
               <w:rPr>
-                <w:noProof/>
-                <w:webHidden/>
-                <w:lang w:val="en-US"/>
+                <w:rFonts w:hint="eastAsia"/>
+                <w:noProof/>
+                <w:webHidden/>
               </w:rPr>
               <w:t>26</w:t>
             </w:r>
@@ -5930,7 +5628,6 @@
               <w:rPr>
                 <w:noProof/>
                 <w:webHidden/>
-                <w:lang w:val="en-US"/>
               </w:rPr>
               <w:fldChar w:fldCharType="end"/>
             </w:r>
@@ -5955,7 +5652,7 @@
               <w14:ligatures w14:val="standardContextual"/>
             </w:rPr>
           </w:pPr>
-          <w:hyperlink w:anchor="_Toc230202065" w:history="1">
+          <w:hyperlink w:anchor="_Toc230203459" w:history="1">
             <w:r>
               <w:rPr>
                 <w:rStyle w:val="Hyperlink"/>
@@ -5991,7 +5688,6 @@
               <w:rPr>
                 <w:noProof/>
                 <w:webHidden/>
-                <w:lang w:val="en-US"/>
               </w:rPr>
               <w:tab/>
             </w:r>
@@ -5999,7 +5695,6 @@
               <w:rPr>
                 <w:noProof/>
                 <w:webHidden/>
-                <w:lang w:val="en-US"/>
               </w:rPr>
               <w:fldChar w:fldCharType="begin"/>
             </w:r>
@@ -6007,30 +5702,27 @@
               <w:rPr>
                 <w:noProof/>
                 <w:webHidden/>
-                <w:lang w:val="en-US"/>
-              </w:rPr>
-              <w:instrText xml:space="preserve"> PAGEREF _Toc230202065 \h </w:instrText>
-            </w:r>
-            <w:r>
-              <w:rPr>
-                <w:noProof/>
-                <w:webHidden/>
-                <w:lang w:val="en-US"/>
-              </w:rPr>
-            </w:r>
-            <w:r>
-              <w:rPr>
-                <w:noProof/>
-                <w:webHidden/>
-                <w:lang w:val="en-US"/>
+              </w:rPr>
+              <w:instrText xml:space="preserve"> PAGEREF _Toc230203459 \h </w:instrText>
+            </w:r>
+            <w:r>
+              <w:rPr>
+                <w:noProof/>
+                <w:webHidden/>
+              </w:rPr>
+            </w:r>
+            <w:r>
+              <w:rPr>
+                <w:noProof/>
+                <w:webHidden/>
               </w:rPr>
               <w:fldChar w:fldCharType="separate"/>
             </w:r>
             <w:r>
               <w:rPr>
-                <w:noProof/>
-                <w:webHidden/>
-                <w:lang w:val="en-US"/>
+                <w:rFonts w:hint="eastAsia"/>
+                <w:noProof/>
+                <w:webHidden/>
               </w:rPr>
               <w:t>27</w:t>
             </w:r>
@@ -6038,7 +5730,6 @@
               <w:rPr>
                 <w:noProof/>
                 <w:webHidden/>
-                <w:lang w:val="en-US"/>
               </w:rPr>
               <w:fldChar w:fldCharType="end"/>
             </w:r>
@@ -6063,7 +5754,7 @@
               <w14:ligatures w14:val="standardContextual"/>
             </w:rPr>
           </w:pPr>
-          <w:hyperlink w:anchor="_Toc230202066" w:history="1">
+          <w:hyperlink w:anchor="_Toc230203460" w:history="1">
             <w:r>
               <w:rPr>
                 <w:rStyle w:val="Hyperlink"/>
@@ -6099,7 +5790,6 @@
               <w:rPr>
                 <w:noProof/>
                 <w:webHidden/>
-                <w:lang w:val="en-US"/>
               </w:rPr>
               <w:tab/>
             </w:r>
@@ -6107,7 +5797,6 @@
               <w:rPr>
                 <w:noProof/>
                 <w:webHidden/>
-                <w:lang w:val="en-US"/>
               </w:rPr>
               <w:fldChar w:fldCharType="begin"/>
             </w:r>
@@ -6115,30 +5804,27 @@
               <w:rPr>
                 <w:noProof/>
                 <w:webHidden/>
-                <w:lang w:val="en-US"/>
-              </w:rPr>
-              <w:instrText xml:space="preserve"> PAGEREF _Toc230202066 \h </w:instrText>
-            </w:r>
-            <w:r>
-              <w:rPr>
-                <w:noProof/>
-                <w:webHidden/>
-                <w:lang w:val="en-US"/>
-              </w:rPr>
-            </w:r>
-            <w:r>
-              <w:rPr>
-                <w:noProof/>
-                <w:webHidden/>
-                <w:lang w:val="en-US"/>
+              </w:rPr>
+              <w:instrText xml:space="preserve"> PAGEREF _Toc230203460 \h </w:instrText>
+            </w:r>
+            <w:r>
+              <w:rPr>
+                <w:noProof/>
+                <w:webHidden/>
+              </w:rPr>
+            </w:r>
+            <w:r>
+              <w:rPr>
+                <w:noProof/>
+                <w:webHidden/>
               </w:rPr>
               <w:fldChar w:fldCharType="separate"/>
             </w:r>
             <w:r>
               <w:rPr>
-                <w:noProof/>
-                <w:webHidden/>
-                <w:lang w:val="en-US"/>
+                <w:rFonts w:hint="eastAsia"/>
+                <w:noProof/>
+                <w:webHidden/>
               </w:rPr>
               <w:t>28</w:t>
             </w:r>
@@ -6146,7 +5832,6 @@
               <w:rPr>
                 <w:noProof/>
                 <w:webHidden/>
-                <w:lang w:val="en-US"/>
               </w:rPr>
               <w:fldChar w:fldCharType="end"/>
             </w:r>
@@ -6186,7 +5871,7 @@
       <w:pPr>
         <w:pStyle w:val="Introsections"/>
       </w:pPr>
-      <w:bookmarkStart w:id="7" w:name="_Toc230202024"/>
+      <w:bookmarkStart w:id="7" w:name="_Toc230203418"/>
       <w:r>
         <w:lastRenderedPageBreak/>
         <w:t>LIST OF FIGURES</w:t>
@@ -6696,7 +6381,7 @@
           <w:lang w:eastAsia="zh-CN"/>
         </w:rPr>
       </w:pPr>
-      <w:bookmarkStart w:id="8" w:name="_Toc230202025"/>
+      <w:bookmarkStart w:id="8" w:name="_Toc230203419"/>
       <w:r>
         <w:rPr>
           <w:lang w:eastAsia="zh-CN"/>
@@ -7101,7 +6786,7 @@
       </w:pPr>
       <w:bookmarkStart w:id="9" w:name="_Toc494826182"/>
       <w:bookmarkStart w:id="10" w:name="_Toc32521124"/>
-      <w:bookmarkStart w:id="11" w:name="_Toc230202026"/>
+      <w:bookmarkStart w:id="11" w:name="_Toc230203420"/>
       <w:bookmarkEnd w:id="0"/>
       <w:bookmarkEnd w:id="1"/>
       <w:r>
@@ -7255,7 +6940,7 @@
         </w:rPr>
       </w:pPr>
       <w:bookmarkStart w:id="12" w:name="_Toc32521125"/>
-      <w:bookmarkStart w:id="13" w:name="_Toc230202027"/>
+      <w:bookmarkStart w:id="13" w:name="_Toc230203421"/>
       <w:r>
         <w:rPr>
           <w:lang w:val="en-US"/>
@@ -7292,7 +6977,7 @@
           <w:lang w:val="en-US"/>
         </w:rPr>
       </w:pPr>
-      <w:bookmarkStart w:id="14" w:name="_Toc230202028"/>
+      <w:bookmarkStart w:id="14" w:name="_Toc230203422"/>
       <w:r>
         <w:rPr>
           <w:lang w:val="en-US"/>
@@ -7472,7 +7157,7 @@
           <w:lang w:val="en-US"/>
         </w:rPr>
       </w:pPr>
-      <w:bookmarkStart w:id="15" w:name="_Toc230202029"/>
+      <w:bookmarkStart w:id="15" w:name="_Toc230203423"/>
       <w:r>
         <w:rPr>
           <w:lang w:val="en-US"/>
@@ -7633,7 +7318,7 @@
           <w:lang w:val="en-US"/>
         </w:rPr>
       </w:pPr>
-      <w:bookmarkStart w:id="16" w:name="_Toc230202030"/>
+      <w:bookmarkStart w:id="16" w:name="_Toc230203424"/>
       <w:r>
         <w:rPr>
           <w:lang w:val="en-US"/>
@@ -7793,7 +7478,7 @@
           <w:lang w:val="en-US"/>
         </w:rPr>
       </w:pPr>
-      <w:bookmarkStart w:id="17" w:name="_Toc230202031"/>
+      <w:bookmarkStart w:id="17" w:name="_Toc230203425"/>
       <w:r>
         <w:rPr>
           <w:lang w:val="en-US"/>
@@ -7953,7 +7638,7 @@
           <w:lang w:val="en-US"/>
         </w:rPr>
       </w:pPr>
-      <w:bookmarkStart w:id="18" w:name="_Toc230202032"/>
+      <w:bookmarkStart w:id="18" w:name="_Toc230203426"/>
       <w:r>
         <w:rPr>
           <w:lang w:val="en-US"/>
@@ -8114,7 +7799,7 @@
           <w:lang w:val="en-US"/>
         </w:rPr>
       </w:pPr>
-      <w:bookmarkStart w:id="19" w:name="_Toc230202033"/>
+      <w:bookmarkStart w:id="19" w:name="_Toc230203427"/>
       <w:r>
         <w:rPr>
           <w:lang w:val="en-US"/>
@@ -8246,7 +7931,7 @@
           <w:lang w:val="en-US"/>
         </w:rPr>
       </w:pPr>
-      <w:bookmarkStart w:id="20" w:name="_Toc230202034"/>
+      <w:bookmarkStart w:id="20" w:name="_Toc230203428"/>
       <w:r>
         <w:rPr>
           <w:lang w:val="en-US"/>
@@ -8317,7 +8002,7 @@
         </w:rPr>
       </w:pPr>
       <w:bookmarkStart w:id="21" w:name="_Toc32521137"/>
-      <w:bookmarkStart w:id="22" w:name="_Toc230202035"/>
+      <w:bookmarkStart w:id="22" w:name="_Toc230203429"/>
       <w:r>
         <w:rPr>
           <w:lang w:val="en-US"/>
@@ -8489,7 +8174,7 @@
           <w:lang w:val="en-US"/>
         </w:rPr>
       </w:pPr>
-      <w:bookmarkStart w:id="23" w:name="_Toc230202036"/>
+      <w:bookmarkStart w:id="23" w:name="_Toc230203430"/>
       <w:r>
         <w:rPr>
           <w:lang w:val="en-US"/>
@@ -8605,7 +8290,7 @@
           <w:lang w:val="en-US"/>
         </w:rPr>
       </w:pPr>
-      <w:bookmarkStart w:id="24" w:name="_Toc230202037"/>
+      <w:bookmarkStart w:id="24" w:name="_Toc230203431"/>
       <w:r>
         <w:rPr>
           <w:lang w:val="en-US"/>
@@ -8648,7 +8333,7 @@
           <w:lang w:val="en-US"/>
         </w:rPr>
       </w:pPr>
-      <w:bookmarkStart w:id="25" w:name="_Toc230202038"/>
+      <w:bookmarkStart w:id="25" w:name="_Toc230203432"/>
       <w:r>
         <w:rPr>
           <w:lang w:val="en-US"/>
@@ -8739,7 +8424,7 @@
           <w:lang w:val="en-US"/>
         </w:rPr>
       </w:pPr>
-      <w:bookmarkStart w:id="26" w:name="_Toc230202039"/>
+      <w:bookmarkStart w:id="26" w:name="_Toc230203433"/>
       <w:r>
         <w:rPr>
           <w:lang w:val="en-US"/>
@@ -8891,7 +8576,7 @@
           <w:lang w:val="en-US"/>
         </w:rPr>
       </w:pPr>
-      <w:bookmarkStart w:id="27" w:name="_Toc230202040"/>
+      <w:bookmarkStart w:id="27" w:name="_Toc230203434"/>
       <w:r>
         <w:rPr>
           <w:lang w:val="en-US"/>
@@ -9015,7 +8700,7 @@
           <w:lang w:val="en-US"/>
         </w:rPr>
       </w:pPr>
-      <w:bookmarkStart w:id="28" w:name="_Toc230202041"/>
+      <w:bookmarkStart w:id="28" w:name="_Toc230203435"/>
       <w:r>
         <w:rPr>
           <w:lang w:val="en-US"/>
@@ -9098,7 +8783,7 @@
           <w:lang w:val="en-US"/>
         </w:rPr>
       </w:pPr>
-      <w:bookmarkStart w:id="29" w:name="_Toc230202042"/>
+      <w:bookmarkStart w:id="29" w:name="_Toc230203436"/>
       <w:r>
         <w:rPr>
           <w:lang w:val="en-US"/>
@@ -9160,7 +8845,7 @@
           <w:lang w:val="en-US"/>
         </w:rPr>
       </w:pPr>
-      <w:bookmarkStart w:id="30" w:name="_Toc230202043"/>
+      <w:bookmarkStart w:id="30" w:name="_Toc230203437"/>
       <w:r>
         <w:rPr>
           <w:lang w:val="en-US"/>
@@ -9196,7 +8881,7 @@
           <w:lang w:val="en-US"/>
         </w:rPr>
       </w:pPr>
-      <w:bookmarkStart w:id="31" w:name="_Toc230202044"/>
+      <w:bookmarkStart w:id="31" w:name="_Toc230203438"/>
       <w:r>
         <w:rPr>
           <w:lang w:val="en-US"/>
@@ -9266,7 +8951,7 @@
           <w:lang w:val="en-US"/>
         </w:rPr>
       </w:pPr>
-      <w:bookmarkStart w:id="32" w:name="_Toc230202045"/>
+      <w:bookmarkStart w:id="32" w:name="_Toc230203439"/>
       <w:r>
         <w:rPr>
           <w:lang w:val="en-US"/>
@@ -9380,7 +9065,7 @@
           <w:lang w:val="en-US"/>
         </w:rPr>
       </w:pPr>
-      <w:bookmarkStart w:id="33" w:name="_Toc230202046"/>
+      <w:bookmarkStart w:id="33" w:name="_Toc230203440"/>
       <w:r>
         <w:rPr>
           <w:lang w:val="en-US"/>
@@ -9451,7 +9136,7 @@
           <w:lang w:val="en-US"/>
         </w:rPr>
       </w:pPr>
-      <w:bookmarkStart w:id="34" w:name="_Toc230202047"/>
+      <w:bookmarkStart w:id="34" w:name="_Toc230203441"/>
       <w:r>
         <w:rPr>
           <w:lang w:val="en-US"/>
@@ -10272,7 +9957,7 @@
           <w:lang w:val="en-US"/>
         </w:rPr>
       </w:pPr>
-      <w:bookmarkStart w:id="36" w:name="_Toc230202048"/>
+      <w:bookmarkStart w:id="36" w:name="_Toc230203442"/>
       <w:r>
         <w:rPr>
           <w:lang w:val="en-US"/>
@@ -10328,7 +10013,7 @@
           <w:lang w:val="en-US"/>
         </w:rPr>
       </w:pPr>
-      <w:bookmarkStart w:id="37" w:name="_Toc230202049"/>
+      <w:bookmarkStart w:id="37" w:name="_Toc230203443"/>
       <w:r>
         <w:rPr>
           <w:lang w:val="en-US"/>
@@ -10565,7 +10250,7 @@
           <w:lang w:val="en-US"/>
         </w:rPr>
       </w:pPr>
-      <w:bookmarkStart w:id="39" w:name="_Toc230202050"/>
+      <w:bookmarkStart w:id="39" w:name="_Toc230203444"/>
       <w:r>
         <w:rPr>
           <w:lang w:val="en-US"/>
@@ -10711,7 +10396,7 @@
           <w:lang w:val="en-US"/>
         </w:rPr>
       </w:pPr>
-      <w:bookmarkStart w:id="40" w:name="_Toc230202051"/>
+      <w:bookmarkStart w:id="40" w:name="_Toc230203445"/>
       <w:r>
         <w:rPr>
           <w:lang w:val="en-US"/>
@@ -11912,7 +11597,7 @@
           <w:lang w:val="en-US"/>
         </w:rPr>
       </w:pPr>
-      <w:bookmarkStart w:id="42" w:name="_Toc230202052"/>
+      <w:bookmarkStart w:id="42" w:name="_Toc230203446"/>
       <w:r>
         <w:rPr>
           <w:lang w:val="en-US"/>
@@ -12150,7 +11835,7 @@
           <w:lang w:val="en-US"/>
         </w:rPr>
       </w:pPr>
-      <w:bookmarkStart w:id="44" w:name="_Toc230202053"/>
+      <w:bookmarkStart w:id="44" w:name="_Toc230203447"/>
       <w:r>
         <w:rPr>
           <w:lang w:val="en-US"/>
@@ -12749,7 +12434,7 @@
           <w:lang w:val="en-US"/>
         </w:rPr>
       </w:pPr>
-      <w:bookmarkStart w:id="46" w:name="_Toc230202054"/>
+      <w:bookmarkStart w:id="46" w:name="_Toc230203448"/>
       <w:r>
         <w:rPr>
           <w:lang w:val="en-US"/>
@@ -13710,7 +13395,7 @@
           <w:lang w:val="en-US"/>
         </w:rPr>
       </w:pPr>
-      <w:bookmarkStart w:id="48" w:name="_Toc230202055"/>
+      <w:bookmarkStart w:id="48" w:name="_Toc230203449"/>
       <w:r>
         <w:rPr>
           <w:lang w:val="en-US"/>
@@ -13882,7 +13567,7 @@
           <w:lang w:val="en-US"/>
         </w:rPr>
       </w:pPr>
-      <w:bookmarkStart w:id="49" w:name="_Toc230202056"/>
+      <w:bookmarkStart w:id="49" w:name="_Toc230203450"/>
       <w:r>
         <w:rPr>
           <w:lang w:val="en-US"/>
@@ -14516,7 +14201,7 @@
           <w:lang w:val="en-US"/>
         </w:rPr>
       </w:pPr>
-      <w:bookmarkStart w:id="54" w:name="_Toc230202057"/>
+      <w:bookmarkStart w:id="54" w:name="_Toc230203451"/>
       <w:r>
         <w:rPr>
           <w:lang w:val="en-US"/>
@@ -14545,7 +14230,7 @@
           <w:lang w:val="en-US"/>
         </w:rPr>
       </w:pPr>
-      <w:bookmarkStart w:id="55" w:name="_Toc230202058"/>
+      <w:bookmarkStart w:id="55" w:name="_Toc230203452"/>
       <w:r>
         <w:rPr>
           <w:lang w:val="en-US"/>
@@ -14648,7 +14333,7 @@
           <w:lang w:val="en-US"/>
         </w:rPr>
       </w:pPr>
-      <w:bookmarkStart w:id="56" w:name="_Toc230202059"/>
+      <w:bookmarkStart w:id="56" w:name="_Toc230203453"/>
       <w:r>
         <w:rPr>
           <w:lang w:val="en-US"/>
@@ -15049,7 +14734,7 @@
           <w:lang w:val="en-US"/>
         </w:rPr>
       </w:pPr>
-      <w:bookmarkStart w:id="58" w:name="_Toc230202060"/>
+      <w:bookmarkStart w:id="58" w:name="_Toc230203454"/>
       <w:r>
         <w:rPr>
           <w:lang w:val="en-US"/>
@@ -15228,7 +14913,7 @@
           <w:lang w:val="en-US"/>
         </w:rPr>
       </w:pPr>
-      <w:bookmarkStart w:id="60" w:name="_Toc230202061"/>
+      <w:bookmarkStart w:id="60" w:name="_Toc230203455"/>
       <w:r>
         <w:rPr>
           <w:lang w:val="en-US"/>
@@ -15346,7 +15031,7 @@
           <w:lang w:val="en-US"/>
         </w:rPr>
       </w:pPr>
-      <w:bookmarkStart w:id="61" w:name="_Toc230202062"/>
+      <w:bookmarkStart w:id="61" w:name="_Toc230203456"/>
       <w:r>
         <w:rPr>
           <w:lang w:val="en-US"/>
@@ -15416,20 +15101,20 @@
           <w:lang w:val="en-US"/>
         </w:rPr>
       </w:pPr>
-      <w:bookmarkStart w:id="62" w:name="_Toc230202063"/>
+      <w:bookmarkStart w:id="62" w:name="_Toc230203457"/>
       <w:r>
         <w:rPr>
           <w:lang w:val="en-US"/>
         </w:rPr>
         <w:t>CONCLUSIO</w:t>
       </w:r>
+      <w:r>
+        <w:rPr>
+          <w:lang w:val="en-US"/>
+        </w:rPr>
+        <w:t>NS</w:t>
+      </w:r>
       <w:bookmarkEnd w:id="62"/>
-      <w:r>
-        <w:rPr>
-          <w:lang w:val="en-US"/>
-        </w:rPr>
-        <w:t>NS</w:t>
-      </w:r>
     </w:p>
     <w:p>
       <w:pPr>
@@ -15691,7 +15376,7 @@
         </w:rPr>
       </w:pPr>
     </w:p>
-    <w:bookmarkStart w:id="63" w:name="_Toc230202064" w:displacedByCustomXml="next"/>
+    <w:bookmarkStart w:id="63" w:name="_Toc230203458" w:displacedByCustomXml="next"/>
     <w:bookmarkStart w:id="64" w:name="_Toc494826192" w:displacedByCustomXml="next"/>
     <w:bookmarkStart w:id="65" w:name="_Toc32521151" w:displacedByCustomXml="next"/>
     <w:sdt>
@@ -16119,7 +15804,7 @@
           <w:lang w:val="en-US"/>
         </w:rPr>
       </w:pPr>
-      <w:bookmarkStart w:id="67" w:name="_Toc230202065"/>
+      <w:bookmarkStart w:id="67" w:name="_Toc230203459"/>
       <w:r>
         <w:rPr>
           <w:lang w:val="en-US"/>
@@ -16260,7 +15945,7 @@
           <w:lang w:val="en-US"/>
         </w:rPr>
       </w:pPr>
-      <w:bookmarkStart w:id="68" w:name="_Toc230202066"/>
+      <w:bookmarkStart w:id="68" w:name="_Toc230203460"/>
       <w:r>
         <w:rPr>
           <w:lang w:val="en-US"/>

</xml_diff>

<commit_message>
Finalize thesis report formatting
</commit_message>
<xml_diff>
--- a/docs/graduation_thesis_report.docx
+++ b/docs/graduation_thesis_report.docx
@@ -305,7 +305,6 @@
           <w:lang w:val="en-US"/>
         </w:rPr>
       </w:pPr>
-      <w:proofErr w:type="spellStart"/>
       <w:r>
         <w:rPr>
           <w:b/>
@@ -314,10 +313,12 @@
           <w:szCs w:val="32"/>
           <w:lang w:val="en-US"/>
         </w:rPr>
-        <w:t>Gülse</w:t>
-      </w:r>
-      <w:proofErr w:type="spellEnd"/>
-      <w:r>
+        <w:t>Gülse Dolunay ÜNLÜ</w:t>
+      </w:r>
+    </w:p>
+    <w:p>
+      <w:pPr>
+        <w:jc w:val="center"/>
         <w:rPr>
           <w:b/>
           <w:color w:val="000000" w:themeColor="text1"/>
@@ -325,12 +326,8 @@
           <w:szCs w:val="32"/>
           <w:lang w:val="en-US"/>
         </w:rPr>
-        <w:t xml:space="preserve"> Dolunay ÜNLÜ</w:t>
-      </w:r>
-    </w:p>
-    <w:p>
-      <w:pPr>
-        <w:jc w:val="center"/>
+      </w:pPr>
+      <w:r>
         <w:rPr>
           <w:b/>
           <w:color w:val="000000" w:themeColor="text1"/>
@@ -338,15 +335,6 @@
           <w:szCs w:val="32"/>
           <w:lang w:val="en-US"/>
         </w:rPr>
-      </w:pPr>
-      <w:r>
-        <w:rPr>
-          <w:b/>
-          <w:color w:val="000000" w:themeColor="text1"/>
-          <w:sz w:val="32"/>
-          <w:szCs w:val="32"/>
-          <w:lang w:val="en-US"/>
-        </w:rPr>
         <w:t>20210305007</w:t>
       </w:r>
     </w:p>
@@ -407,7 +395,6 @@
         </w:rPr>
         <w:t xml:space="preserve">Advisor: </w:t>
       </w:r>
-      <w:proofErr w:type="spellStart"/>
       <w:r>
         <w:rPr>
           <w:bCs/>
@@ -416,9 +403,72 @@
           <w:szCs w:val="32"/>
           <w:lang w:val="en-US"/>
         </w:rPr>
-        <w:t>Doç</w:t>
-      </w:r>
-      <w:proofErr w:type="spellEnd"/>
+        <w:t>Doç. Dr. Orhan Özgür AYBAR</w:t>
+      </w:r>
+    </w:p>
+    <w:p>
+      <w:pPr>
+        <w:jc w:val="center"/>
+        <w:rPr>
+          <w:bCs/>
+          <w:sz w:val="32"/>
+          <w:szCs w:val="32"/>
+          <w:lang w:val="en-US"/>
+        </w:rPr>
+      </w:pPr>
+    </w:p>
+    <w:p>
+      <w:pPr>
+        <w:jc w:val="center"/>
+        <w:rPr>
+          <w:bCs/>
+          <w:sz w:val="32"/>
+          <w:szCs w:val="32"/>
+          <w:lang w:val="en-US"/>
+        </w:rPr>
+      </w:pPr>
+    </w:p>
+    <w:p>
+      <w:pPr>
+        <w:jc w:val="center"/>
+        <w:rPr>
+          <w:bCs/>
+          <w:sz w:val="32"/>
+          <w:szCs w:val="32"/>
+          <w:lang w:val="en-US"/>
+        </w:rPr>
+      </w:pPr>
+    </w:p>
+    <w:p>
+      <w:pPr>
+        <w:jc w:val="center"/>
+        <w:rPr>
+          <w:bCs/>
+          <w:sz w:val="32"/>
+          <w:szCs w:val="32"/>
+          <w:lang w:val="en-US"/>
+        </w:rPr>
+      </w:pPr>
+    </w:p>
+    <w:p>
+      <w:pPr>
+        <w:jc w:val="center"/>
+        <w:rPr>
+          <w:bCs/>
+          <w:sz w:val="32"/>
+          <w:szCs w:val="32"/>
+          <w:lang w:val="en-US"/>
+        </w:rPr>
+      </w:pPr>
+      <w:r>
+        <w:rPr>
+          <w:bCs/>
+          <w:sz w:val="32"/>
+          <w:szCs w:val="32"/>
+          <w:lang w:val="en-US"/>
+        </w:rPr>
+        <w:t xml:space="preserve">İstanbul </w:t>
+      </w:r>
       <w:r>
         <w:rPr>
           <w:bCs/>
@@ -427,71 +477,7 @@
           <w:szCs w:val="32"/>
           <w:lang w:val="en-US"/>
         </w:rPr>
-        <w:t>. Dr. Orhan Özgür AYBAR</w:t>
-      </w:r>
-    </w:p>
-    <w:p>
-      <w:pPr>
-        <w:jc w:val="center"/>
-        <w:rPr>
-          <w:bCs/>
-          <w:sz w:val="32"/>
-          <w:szCs w:val="32"/>
-          <w:lang w:val="en-US"/>
-        </w:rPr>
-      </w:pPr>
-    </w:p>
-    <w:p>
-      <w:pPr>
-        <w:jc w:val="center"/>
-        <w:rPr>
-          <w:bCs/>
-          <w:sz w:val="32"/>
-          <w:szCs w:val="32"/>
-          <w:lang w:val="en-US"/>
-        </w:rPr>
-      </w:pPr>
-    </w:p>
-    <w:p>
-      <w:pPr>
-        <w:jc w:val="center"/>
-        <w:rPr>
-          <w:bCs/>
-          <w:sz w:val="32"/>
-          <w:szCs w:val="32"/>
-          <w:lang w:val="en-US"/>
-        </w:rPr>
-      </w:pPr>
-    </w:p>
-    <w:p>
-      <w:pPr>
-        <w:jc w:val="center"/>
-        <w:rPr>
-          <w:bCs/>
-          <w:sz w:val="32"/>
-          <w:szCs w:val="32"/>
-          <w:lang w:val="en-US"/>
-        </w:rPr>
-      </w:pPr>
-    </w:p>
-    <w:p>
-      <w:pPr>
-        <w:jc w:val="center"/>
-        <w:rPr>
-          <w:bCs/>
-          <w:sz w:val="32"/>
-          <w:szCs w:val="32"/>
-          <w:lang w:val="en-US"/>
-        </w:rPr>
-      </w:pPr>
-      <w:r>
-        <w:rPr>
-          <w:bCs/>
-          <w:sz w:val="32"/>
-          <w:szCs w:val="32"/>
-          <w:lang w:val="en-US"/>
-        </w:rPr>
-        <w:t xml:space="preserve">İstanbul </w:t>
+        <w:t>May, 202</w:t>
       </w:r>
       <w:r>
         <w:rPr>
@@ -501,16 +487,6 @@
           <w:szCs w:val="32"/>
           <w:lang w:val="en-US"/>
         </w:rPr>
-        <w:t>May, 202</w:t>
-      </w:r>
-      <w:r>
-        <w:rPr>
-          <w:bCs/>
-          <w:color w:val="000000" w:themeColor="text1"/>
-          <w:sz w:val="32"/>
-          <w:szCs w:val="32"/>
-          <w:lang w:val="en-US"/>
-        </w:rPr>
         <w:t>6</w:t>
       </w:r>
       <w:r>
@@ -524,13 +500,13 @@
       <w:pPr>
         <w:pStyle w:val="Introsections"/>
       </w:pPr>
-      <w:bookmarkStart w:id="2" w:name="_Toc28126413"/>
-      <w:bookmarkStart w:id="3" w:name="_Toc230203414"/>
+      <w:bookmarkStart w:id="2" w:name="_Toc230203414"/>
+      <w:bookmarkStart w:id="3" w:name="_Toc28126413"/>
       <w:r>
         <w:lastRenderedPageBreak/>
         <w:t>DECLARATION</w:t>
       </w:r>
-      <w:bookmarkEnd w:id="3"/>
+      <w:bookmarkEnd w:id="2"/>
       <w:r>
         <w:t xml:space="preserve"> </w:t>
       </w:r>
@@ -545,35 +521,7 @@
         <w:rPr>
           <w:lang w:val="en-US"/>
         </w:rPr>
-        <w:t xml:space="preserve">I hereby declare that this thesis represents my own work which has been done after registration for the </w:t>
-      </w:r>
-      <w:proofErr w:type="gramStart"/>
-      <w:r>
-        <w:rPr>
-          <w:lang w:val="en-US"/>
-        </w:rPr>
-        <w:t>degree of bachelor</w:t>
-      </w:r>
-      <w:proofErr w:type="gramEnd"/>
-      <w:r>
-        <w:rPr>
-          <w:lang w:val="en-US"/>
-        </w:rPr>
-        <w:t xml:space="preserve"> at Piri Reis </w:t>
-      </w:r>
-      <w:proofErr w:type="gramStart"/>
-      <w:r>
-        <w:rPr>
-          <w:lang w:val="en-US"/>
-        </w:rPr>
-        <w:t>University, and</w:t>
-      </w:r>
-      <w:proofErr w:type="gramEnd"/>
-      <w:r>
-        <w:rPr>
-          <w:lang w:val="en-US"/>
-        </w:rPr>
-        <w:t xml:space="preserve"> has not been previously included in a thesis or dissertation submitted to this or any other institution for a degree, diploma or other qualifications.</w:t>
+        <w:t>I hereby declare that this thesis represents my own work which has been done after registration for the degree of bachelor at Piri Reis University, and has not been previously included in a thesis or dissertation submitted to this or any other institution for a degree, diploma or other qualifications.</w:t>
       </w:r>
     </w:p>
     <w:p>
@@ -678,7 +626,7 @@
         </w:rPr>
       </w:pPr>
     </w:p>
-    <w:bookmarkEnd w:id="2"/>
+    <w:bookmarkEnd w:id="3"/>
     <w:p>
       <w:pPr>
         <w:rPr>
@@ -783,27 +731,7 @@
         <w:rPr>
           <w:lang w:val="en-US" w:eastAsia="tr-TR"/>
         </w:rPr>
-        <w:t xml:space="preserve">I would like to express my sincere gratitude to my advisor, </w:t>
-      </w:r>
-      <w:proofErr w:type="spellStart"/>
-      <w:r>
-        <w:rPr>
-          <w:lang w:val="en-US" w:eastAsia="tr-TR"/>
-        </w:rPr>
-        <w:t>Doç</w:t>
-      </w:r>
-      <w:proofErr w:type="spellEnd"/>
-      <w:r>
-        <w:rPr>
-          <w:lang w:val="en-US" w:eastAsia="tr-TR"/>
-        </w:rPr>
-        <w:t>.</w:t>
-      </w:r>
-      <w:r>
-        <w:rPr>
-          <w:lang w:val="en-US" w:eastAsia="tr-TR"/>
-        </w:rPr>
-        <w:t xml:space="preserve"> Dr. Orhan Özgür AYBAR, for his guidance and support during this graduation thesis.</w:t>
+        <w:t>I would like to express my sincere gratitude to my advisor, Doç. Dr. Orhan Özgür AYBAR, for his guidance and support during this graduation thesis.</w:t>
       </w:r>
     </w:p>
     <w:p>
@@ -1115,35 +1043,7 @@
           <w:lang w:val="en-US"/>
         </w:rPr>
         <w:br/>
-        <w:t xml:space="preserve">The platform was developed with Python and </w:t>
-      </w:r>
-      <w:proofErr w:type="spellStart"/>
-      <w:r>
-        <w:rPr>
-          <w:lang w:val="en-US"/>
-        </w:rPr>
-        <w:t>Streamlit</w:t>
-      </w:r>
-      <w:proofErr w:type="spellEnd"/>
-      <w:r>
-        <w:rPr>
-          <w:lang w:val="en-US"/>
-        </w:rPr>
-        <w:t xml:space="preserve">. It uses the public </w:t>
-      </w:r>
-      <w:proofErr w:type="spellStart"/>
-      <w:r>
-        <w:rPr>
-          <w:lang w:val="en-US"/>
-        </w:rPr>
-        <w:t>DataCo</w:t>
-      </w:r>
-      <w:proofErr w:type="spellEnd"/>
-      <w:r>
-        <w:rPr>
-          <w:lang w:val="en-US"/>
-        </w:rPr>
-        <w:t xml:space="preserve"> Smart Supply Chain dataset as the default demonstration dataset. In addition, the system allows users to upload a new supply chain dataset in CSV or Excel format. The uploaded dataset can be mapped to a standard supply chain schema and then used dynamically across the dashboard pages. The platform includes modules for overview analysis, regional performance, inventory control, shipment performance, supply chain risk, and demand forecasting.</w:t>
+        <w:t>The platform was developed with Python and Streamlit. It uses the public DataCo Smart Supply Chain dataset as the default demonstration dataset. In addition, the system allows users to upload a new supply chain dataset in CSV or Excel format. The uploaded dataset can be mapped to a standard supply chain schema and then used dynamically across the dashboard pages. The platform includes modules for overview analysis, regional performance, inventory control, shipment performance, supply chain risk, and demand forecasting.</w:t>
       </w:r>
     </w:p>
     <w:p>
@@ -1163,21 +1063,7 @@
           <w:lang w:val="en-US"/>
         </w:rPr>
         <w:br/>
-        <w:t xml:space="preserve">The main contribution of the project is that it is not limited to a single static dataset. Instead, it provides a reusable dashboard structure where different supply chain datasets can be standardized and </w:t>
-      </w:r>
-      <w:proofErr w:type="spellStart"/>
-      <w:r>
-        <w:rPr>
-          <w:lang w:val="en-US"/>
-        </w:rPr>
-        <w:t>analysed</w:t>
-      </w:r>
-      <w:proofErr w:type="spellEnd"/>
-      <w:r>
-        <w:rPr>
-          <w:lang w:val="en-US"/>
-        </w:rPr>
-        <w:t>. The results show that a dataset-adaptive dashboard can improve visibility and help users identify delivery risks, inventory warnings, regional issues, and demand patterns from a single interface.</w:t>
+        <w:t>The main contribution of the project is that it is not limited to a single static dataset. Instead, it provides a reusable dashboard structure where different supply chain datasets can be standardized and analysed. The results show that a dataset-adaptive dashboard can improve visibility and help users identify delivery risks, inventory warnings, regional issues, and demand patterns from a single interface.</w:t>
       </w:r>
     </w:p>
     <w:p>
@@ -1197,21 +1083,7 @@
           <w:lang w:val="en-US"/>
         </w:rPr>
         <w:br/>
-        <w:t xml:space="preserve">Key Words: Supply Chain Visibility, Risk Assessment, Data Standardization, </w:t>
-      </w:r>
-      <w:proofErr w:type="spellStart"/>
-      <w:r>
-        <w:rPr>
-          <w:lang w:val="en-US"/>
-        </w:rPr>
-        <w:t>Streamlit</w:t>
-      </w:r>
-      <w:proofErr w:type="spellEnd"/>
-      <w:r>
-        <w:rPr>
-          <w:lang w:val="en-US"/>
-        </w:rPr>
-        <w:t xml:space="preserve"> Dashboard, Business Intelligence, Demand Forecasting</w:t>
+        <w:t>Key Words: Supply Chain Visibility, Risk Assessment, Data Standardization, Streamlit Dashboard, Business Intelligence, Demand Forecasting</w:t>
       </w:r>
     </w:p>
     <w:p>
@@ -7126,21 +6998,7 @@
         <w:rPr>
           <w:lang w:val="en-US"/>
         </w:rPr>
-        <w:t xml:space="preserve">In this project, supply chain visibility is addressed through a multi-page dashboard structure. The platform brings different operational views together, including overview indicators, regional performance, inventory control, shipment performance, risk analysis, and demand forecasting. This supports the idea that supply chain visibility should not focus on only one </w:t>
-      </w:r>
-      <w:proofErr w:type="gramStart"/>
-      <w:r>
-        <w:rPr>
-          <w:lang w:val="en-US"/>
-        </w:rPr>
-        <w:t>metric, but</w:t>
-      </w:r>
-      <w:proofErr w:type="gramEnd"/>
-      <w:r>
-        <w:rPr>
-          <w:lang w:val="en-US"/>
-        </w:rPr>
-        <w:t xml:space="preserve"> should combine different operational indicators.</w:t>
+        <w:t>In this project, supply chain visibility is addressed through a multi-page dashboard structure. The platform brings different operational views together, including overview indicators, regional performance, inventory control, shipment performance, risk analysis, and demand forecasting. This supports the idea that supply chain visibility should not focus on only one metric, but should combine different operational indicators.</w:t>
       </w:r>
     </w:p>
     <w:p>
@@ -7900,21 +7758,7 @@
         <w:rPr>
           <w:lang w:val="en-US"/>
         </w:rPr>
-        <w:t xml:space="preserve">The dataset upload feature improves the originality and usefulness of the project. The default </w:t>
-      </w:r>
-      <w:proofErr w:type="spellStart"/>
-      <w:r>
-        <w:rPr>
-          <w:lang w:val="en-US"/>
-        </w:rPr>
-        <w:t>DataCo</w:t>
-      </w:r>
-      <w:proofErr w:type="spellEnd"/>
-      <w:r>
-        <w:rPr>
-          <w:lang w:val="en-US"/>
-        </w:rPr>
-        <w:t xml:space="preserve"> dataset is used as a demonstration dataset, but the system can also process new supply chain datasets. After the user maps the uploaded dataset to the standard schema, the dashboard pages are generated dynamically based on the active dataset. This makes the platform more reusable for different supply chain data sources.</w:t>
+        <w:t>The dataset upload feature improves the originality and usefulness of the project. The default DataCo dataset is used as a demonstration dataset, but the system can also process new supply chain datasets. After the user maps the uploaded dataset to the standard schema, the dashboard pages are generated dynamically based on the active dataset. This makes the platform more reusable for different supply chain data sources.</w:t>
       </w:r>
     </w:p>
     <w:p>
@@ -7970,21 +7814,7 @@
         <w:rPr>
           <w:lang w:val="en-US"/>
         </w:rPr>
-        <w:t xml:space="preserve">Based on these ideas, this project develops a dataset-adaptive supply chain visibility and risk assessment platform. The platform combines dashboard visualization, uploaded dataset support, data standardization, risk scoring, and demand forecasting in a single </w:t>
-      </w:r>
-      <w:proofErr w:type="spellStart"/>
-      <w:r>
-        <w:rPr>
-          <w:lang w:val="en-US"/>
-        </w:rPr>
-        <w:t>Streamlit</w:t>
-      </w:r>
-      <w:proofErr w:type="spellEnd"/>
-      <w:r>
-        <w:rPr>
-          <w:lang w:val="en-US"/>
-        </w:rPr>
-        <w:t>-based system.</w:t>
+        <w:t>Based on these ideas, this project develops a dataset-adaptive supply chain visibility and risk assessment platform. The platform combines dashboard visualization, uploaded dataset support, data standardization, risk scoring, and demand forecasting in a single Streamlit-based system.</w:t>
       </w:r>
     </w:p>
     <w:p>
@@ -8022,27 +7852,7 @@
         <w:rPr>
           <w:lang w:val="en-US"/>
         </w:rPr>
-        <w:t>The</w:t>
-      </w:r>
-      <w:r>
-        <w:rPr>
-          <w:lang w:val="en-US"/>
-        </w:rPr>
-        <w:t xml:space="preserve"> originality of this study comes from developing a supply chain dashboard platform that is not limited to one fixed dataset. Many dashboard projects are designed only for a single prepared dataset. In this project, the </w:t>
-      </w:r>
-      <w:proofErr w:type="spellStart"/>
-      <w:r>
-        <w:rPr>
-          <w:lang w:val="en-US"/>
-        </w:rPr>
-        <w:t>DataCo</w:t>
-      </w:r>
-      <w:proofErr w:type="spellEnd"/>
-      <w:r>
-        <w:rPr>
-          <w:lang w:val="en-US"/>
-        </w:rPr>
-        <w:t xml:space="preserve"> Smart Supply Chain dataset is used as the default demonstration dataset, but the platform also allows users to upload a new supply chain dataset in CSV or Excel format.</w:t>
+        <w:t>The originality of this study comes from developing a supply chain dashboard platform that is not limited to one fixed dataset. Many dashboard projects are designed only for a single prepared dataset. In this project, the DataCo Smart Supply Chain dataset is used as the default demonstration dataset, but the platform also allows users to upload a new supply chain dataset in CSV or Excel format.</w:t>
       </w:r>
     </w:p>
     <w:p>
@@ -8089,21 +7899,7 @@
           <w:lang w:val="en-US"/>
         </w:rPr>
         <w:br/>
-        <w:t xml:space="preserve">Another original aspect of the project is the integration of multiple supply chain analysis areas </w:t>
-      </w:r>
-      <w:proofErr w:type="gramStart"/>
-      <w:r>
-        <w:rPr>
-          <w:lang w:val="en-US"/>
-        </w:rPr>
-        <w:t>in</w:t>
-      </w:r>
-      <w:proofErr w:type="gramEnd"/>
-      <w:r>
-        <w:rPr>
-          <w:lang w:val="en-US"/>
-        </w:rPr>
-        <w:t xml:space="preserve"> one platform. The system does not only show order or sales information. It combines executive KPIs, regional performance analysis, inventory control indicators, shipment performance, supply chain risk scoring, and demand forecasting. This makes the project closer to a decision-support platform rather than a simple visualization page.</w:t>
+        <w:t>Another original aspect of the project is the integration of multiple supply chain analysis areas in one platform. The system does not only show order or sales information. It combines executive KPIs, regional performance analysis, inventory control indicators, shipment performance, supply chain risk scoring, and demand forecasting. This makes the project closer to a decision-support platform rather than a simple visualization page.</w:t>
       </w:r>
     </w:p>
     <w:p>
@@ -8143,21 +7939,7 @@
           <w:lang w:val="en-US"/>
         </w:rPr>
         <w:br/>
-        <w:t xml:space="preserve">The project is original within its academic scope because it combines data upload, schema mapping, data standardization, dynamic dashboard generation, risk analysis, and forecasting in a single </w:t>
-      </w:r>
-      <w:proofErr w:type="spellStart"/>
-      <w:r>
-        <w:rPr>
-          <w:lang w:val="en-US"/>
-        </w:rPr>
-        <w:t>Streamlit</w:t>
-      </w:r>
-      <w:proofErr w:type="spellEnd"/>
-      <w:r>
-        <w:rPr>
-          <w:lang w:val="en-US"/>
-        </w:rPr>
-        <w:t>-based system. Therefore, the main contribution of the project is the development of a reusable supply chain visibility and risk assessment platform that can work with both a default dataset and user-uploaded datasets.</w:t>
+        <w:t>The project is original within its academic scope because it combines data upload, schema mapping, data standardization, dynamic dashboard generation, risk analysis, and forecasting in a single Streamlit-based system. Therefore, the main contribution of the project is the development of a reusable supply chain visibility and risk assessment platform that can work with both a default dataset and user-uploaded datasets.</w:t>
       </w:r>
     </w:p>
     <w:p>
@@ -8309,21 +8091,7 @@
         <w:rPr>
           <w:lang w:val="en-US"/>
         </w:rPr>
-        <w:t xml:space="preserve">The solution approach of this project is based on developing a dataset-adaptive supply chain dashboard platform. The system is designed to work with a default demonstration dataset </w:t>
-      </w:r>
-      <w:proofErr w:type="gramStart"/>
-      <w:r>
-        <w:rPr>
-          <w:lang w:val="en-US"/>
-        </w:rPr>
-        <w:t>and also</w:t>
-      </w:r>
-      <w:proofErr w:type="gramEnd"/>
-      <w:r>
-        <w:rPr>
-          <w:lang w:val="en-US"/>
-        </w:rPr>
-        <w:t xml:space="preserve"> with user-uploaded supply chain datasets. The main idea is to transform different supply chain datasets into a common analytical structure and then generate dashboard modules from the active dataset.</w:t>
+        <w:t>The solution approach of this project is based on developing a dataset-adaptive supply chain dashboard platform. The system is designed to work with a default demonstration dataset and also with user-uploaded supply chain datasets. The main idea is to transform different supply chain datasets into a common analytical structure and then generate dashboard modules from the active dataset.</w:t>
       </w:r>
     </w:p>
     <w:p>
@@ -8373,21 +8141,7 @@
           <w:lang w:val="en-US"/>
         </w:rPr>
         <w:br/>
-        <w:t xml:space="preserve">The platform uses the </w:t>
-      </w:r>
-      <w:proofErr w:type="spellStart"/>
-      <w:r>
-        <w:rPr>
-          <w:lang w:val="en-US"/>
-        </w:rPr>
-        <w:t>DataCo</w:t>
-      </w:r>
-      <w:proofErr w:type="spellEnd"/>
-      <w:r>
-        <w:rPr>
-          <w:lang w:val="en-US"/>
-        </w:rPr>
-        <w:t xml:space="preserve"> Smart Supply Chain dataset as the default dataset. This dataset is processed into different analytical tables such as orders, products, shipments, inventory, demand, and risk scores. These tables are used by the default dashboard when no uploaded dataset is active.</w:t>
+        <w:t>The platform uses the DataCo Smart Supply Chain dataset as the default dataset. This dataset is processed into different analytical tables such as orders, products, shipments, inventory, demand, and risk scores. These tables are used by the default dashboard when no uploaded dataset is active.</w:t>
       </w:r>
     </w:p>
     <w:p>
@@ -8469,21 +8223,7 @@
           <w:lang w:val="en-US"/>
         </w:rPr>
         <w:br/>
-        <w:t xml:space="preserve">In the Data Source Manager, users map the columns of the uploaded dataset to the standard supply chain </w:t>
-      </w:r>
-      <w:proofErr w:type="gramStart"/>
-      <w:r>
-        <w:rPr>
-          <w:lang w:val="en-US"/>
-        </w:rPr>
-        <w:t>schema</w:t>
-      </w:r>
-      <w:proofErr w:type="gramEnd"/>
-      <w:r>
-        <w:rPr>
-          <w:lang w:val="en-US"/>
-        </w:rPr>
-        <w:t>. The required fields include order ID, order date, product name, category name, and order quantity. Optional fields include shipping date, scheduled delivery date, delivery status, actual shipping days, scheduled shipping days, shipping mode, market, region, country, sales, and profit.</w:t>
+        <w:t>In the Data Source Manager, users map the columns of the uploaded dataset to the standard supply chain schema. The required fields include order ID, order date, product name, category name, and order quantity. Optional fields include shipping date, scheduled delivery date, delivery status, actual shipping days, scheduled shipping days, shipping mode, market, region, country, sales, and profit.</w:t>
       </w:r>
     </w:p>
     <w:p>
@@ -8503,133 +8243,49 @@
           <w:lang w:val="en-US"/>
         </w:rPr>
         <w:br/>
-        <w:t xml:space="preserve">After the mapping is completed, the system standardizes the uploaded dataset. It converts date fields, numeric fields, and text fields into a common format. It also derives additional indicators where possible. For example, if actual shipping days and scheduled shipping days are not available, the system can calculate </w:t>
-      </w:r>
-      <w:proofErr w:type="gramStart"/>
-      <w:r>
-        <w:rPr>
-          <w:lang w:val="en-US"/>
-        </w:rPr>
-        <w:t>delay</w:t>
-      </w:r>
-      <w:proofErr w:type="gramEnd"/>
-      <w:r>
-        <w:rPr>
-          <w:lang w:val="en-US"/>
-        </w:rPr>
-        <w:t xml:space="preserve"> days by comparing </w:t>
-      </w:r>
-      <w:proofErr w:type="gramStart"/>
-      <w:r>
-        <w:rPr>
-          <w:lang w:val="en-US"/>
-        </w:rPr>
-        <w:t>delivered</w:t>
-      </w:r>
-      <w:proofErr w:type="gramEnd"/>
+        <w:t>After the mapping is completed, the system standardizes the uploaded dataset. It converts date fields, numeric fields, and text fields into a common format. It also derives additional indicators where possible. For example, if actual shipping days and scheduled shipping days are not available, the system can calculate delay days by comparing delivered date and scheduled delivery date.</w:t>
+      </w:r>
+    </w:p>
+    <w:p>
+      <w:pPr>
+        <w:rPr>
+          <w:lang w:val="en-US"/>
+        </w:rPr>
+      </w:pPr>
+    </w:p>
+    <w:p>
+      <w:pPr>
+        <w:pStyle w:val="Heading2"/>
+        <w:rPr>
+          <w:lang w:val="en-US"/>
+        </w:rPr>
+      </w:pPr>
+      <w:bookmarkStart w:id="27" w:name="_Toc230203434"/>
+      <w:r>
+        <w:rPr>
+          <w:lang w:val="en-US"/>
+        </w:rPr>
+        <w:t>Dynamic Dashboard Generation</w:t>
+      </w:r>
+      <w:bookmarkEnd w:id="27"/>
       <w:r>
         <w:rPr>
           <w:lang w:val="en-US"/>
         </w:rPr>
         <w:t xml:space="preserve"> </w:t>
       </w:r>
-      <w:proofErr w:type="gramStart"/>
-      <w:r>
-        <w:rPr>
-          <w:lang w:val="en-US"/>
-        </w:rPr>
-        <w:t>date</w:t>
-      </w:r>
-      <w:proofErr w:type="gramEnd"/>
-      <w:r>
-        <w:rPr>
-          <w:lang w:val="en-US"/>
-        </w:rPr>
-        <w:t xml:space="preserve"> and scheduled delivery </w:t>
-      </w:r>
-      <w:proofErr w:type="gramStart"/>
-      <w:r>
-        <w:rPr>
-          <w:lang w:val="en-US"/>
-        </w:rPr>
-        <w:t>date</w:t>
-      </w:r>
-      <w:proofErr w:type="gramEnd"/>
-      <w:r>
-        <w:rPr>
-          <w:lang w:val="en-US"/>
-        </w:rPr>
-        <w:t>.</w:t>
-      </w:r>
-    </w:p>
-    <w:p>
-      <w:pPr>
-        <w:rPr>
-          <w:lang w:val="en-US"/>
-        </w:rPr>
-      </w:pPr>
-    </w:p>
-    <w:p>
-      <w:pPr>
-        <w:pStyle w:val="Heading2"/>
-        <w:rPr>
-          <w:lang w:val="en-US"/>
-        </w:rPr>
-      </w:pPr>
-      <w:bookmarkStart w:id="27" w:name="_Toc230203434"/>
-      <w:r>
-        <w:rPr>
-          <w:lang w:val="en-US"/>
-        </w:rPr>
-        <w:t>Dynamic Dashboard Generation</w:t>
-      </w:r>
-      <w:bookmarkEnd w:id="27"/>
-      <w:r>
-        <w:rPr>
-          <w:lang w:val="en-US"/>
-        </w:rPr>
-        <w:t xml:space="preserve"> </w:t>
-      </w:r>
-    </w:p>
-    <w:p>
-      <w:pPr>
-        <w:rPr>
-          <w:lang w:val="en-US"/>
-        </w:rPr>
-      </w:pPr>
-      <w:r>
-        <w:rPr>
-          <w:lang w:val="en-US"/>
-        </w:rPr>
-        <w:t xml:space="preserve">After the dataset is standardized, the dashboard pages are generated from the active dataset. If no uploaded dataset is active, the dashboard uses the default </w:t>
-      </w:r>
-      <w:proofErr w:type="spellStart"/>
-      <w:r>
-        <w:rPr>
-          <w:lang w:val="en-US"/>
-        </w:rPr>
-        <w:t>DataCo</w:t>
-      </w:r>
-      <w:proofErr w:type="spellEnd"/>
-      <w:r>
-        <w:rPr>
-          <w:lang w:val="en-US"/>
-        </w:rPr>
-        <w:t xml:space="preserve"> dataset. If the user uploads and activates a new dataset, all dashboard pages use the uploaded dataset during the active </w:t>
-      </w:r>
-      <w:proofErr w:type="spellStart"/>
-      <w:r>
-        <w:rPr>
-          <w:lang w:val="en-US"/>
-        </w:rPr>
-        <w:t>Streamlit</w:t>
-      </w:r>
-      <w:proofErr w:type="spellEnd"/>
-      <w:r>
-        <w:rPr>
-          <w:lang w:val="en-US"/>
-        </w:rPr>
-        <w:t xml:space="preserve"> session.</w:t>
+    </w:p>
+    <w:p>
+      <w:pPr>
+        <w:rPr>
+          <w:lang w:val="en-US"/>
+        </w:rPr>
+      </w:pPr>
+      <w:r>
+        <w:rPr>
+          <w:lang w:val="en-US"/>
+        </w:rPr>
+        <w:t>After the dataset is standardized, the dashboard pages are generated from the active dataset. If no uploaded dataset is active, the dashboard uses the default DataCo dataset. If the user uploads and activates a new dataset, all dashboard pages use the uploaded dataset during the active Streamlit session.</w:t>
       </w:r>
     </w:p>
     <w:p>
@@ -8669,21 +8325,7 @@
           <w:lang w:val="en-US"/>
         </w:rPr>
         <w:br/>
-        <w:t xml:space="preserve">This structure allows the system to work as a flexible platform instead of a static dashboard. The same dashboard pages can be used with different supply chain datasets </w:t>
-      </w:r>
-      <w:proofErr w:type="gramStart"/>
-      <w:r>
-        <w:rPr>
-          <w:lang w:val="en-US"/>
-        </w:rPr>
-        <w:t>as long as</w:t>
-      </w:r>
-      <w:proofErr w:type="gramEnd"/>
-      <w:r>
-        <w:rPr>
-          <w:lang w:val="en-US"/>
-        </w:rPr>
-        <w:t xml:space="preserve"> the required fields are mapped correctly.</w:t>
+        <w:t>This structure allows the system to work as a flexible platform instead of a static dashboard. The same dashboard pages can be used with different supply chain datasets as long as the required fields are mapped correctly.</w:t>
       </w:r>
     </w:p>
     <w:p>
@@ -8920,21 +8562,7 @@
           <w:lang w:val="en-US"/>
         </w:rPr>
         <w:br/>
-        <w:t xml:space="preserve">The project was developed as a local </w:t>
-      </w:r>
-      <w:proofErr w:type="spellStart"/>
-      <w:r>
-        <w:rPr>
-          <w:lang w:val="en-US"/>
-        </w:rPr>
-        <w:t>Streamlit</w:t>
-      </w:r>
-      <w:proofErr w:type="spellEnd"/>
-      <w:r>
-        <w:rPr>
-          <w:lang w:val="en-US"/>
-        </w:rPr>
-        <w:t xml:space="preserve"> application. A Windows batch file was also created to make the project easier to run. This file automatically creates the virtual environment if needed, installs the required packages, processes the default dataset, and starts the dashboard.</w:t>
+        <w:t>The project was developed as a local Streamlit application. A Windows batch file was also created to make the project easier to run. This file automatically creates the virtual environment if needed, installs the required packages, processes the default dataset, and starts the dashboard.</w:t>
       </w:r>
     </w:p>
     <w:p>
@@ -8966,33 +8594,11 @@
           <w:lang w:val="en-US"/>
         </w:rPr>
       </w:pPr>
-      <w:proofErr w:type="gramStart"/>
-      <w:r>
-        <w:rPr>
-          <w:lang w:val="en-US"/>
-        </w:rPr>
-        <w:t>pandas</w:t>
-      </w:r>
-      <w:proofErr w:type="gramEnd"/>
-      <w:r>
-        <w:rPr>
-          <w:lang w:val="en-US"/>
-        </w:rPr>
-        <w:t xml:space="preserve"> </w:t>
-      </w:r>
-      <w:proofErr w:type="gramStart"/>
-      <w:r>
-        <w:rPr>
-          <w:lang w:val="en-US"/>
-        </w:rPr>
-        <w:t>was</w:t>
-      </w:r>
-      <w:proofErr w:type="gramEnd"/>
-      <w:r>
-        <w:rPr>
-          <w:lang w:val="en-US"/>
-        </w:rPr>
-        <w:t xml:space="preserve"> used for reading CSV and Excel files, cleaning the dataset, grouping records, calculating KPIs, and creating analytical tables. NumPy was used for numerical calculations and handling missing numerical values.</w:t>
+      <w:r>
+        <w:rPr>
+          <w:lang w:val="en-US"/>
+        </w:rPr>
+        <w:t>pandas was used for reading CSV and Excel files, cleaning the dataset, grouping records, calculating KPIs, and creating analytical tables. NumPy was used for numerical calculations and handling missing numerical values.</w:t>
       </w:r>
       <w:sdt>
         <w:sdtPr>
@@ -9086,33 +8692,11 @@
           <w:lang w:val="en-US"/>
         </w:rPr>
       </w:pPr>
-      <w:proofErr w:type="spellStart"/>
-      <w:r>
-        <w:rPr>
-          <w:lang w:val="en-US"/>
-        </w:rPr>
-        <w:t>Streamlit</w:t>
-      </w:r>
-      <w:proofErr w:type="spellEnd"/>
-      <w:r>
-        <w:rPr>
-          <w:lang w:val="en-US"/>
-        </w:rPr>
-        <w:t xml:space="preserve"> was used to develop </w:t>
-      </w:r>
-      <w:proofErr w:type="gramStart"/>
-      <w:r>
-        <w:rPr>
-          <w:lang w:val="en-US"/>
-        </w:rPr>
-        <w:t>the</w:t>
-      </w:r>
-      <w:proofErr w:type="gramEnd"/>
-      <w:r>
-        <w:rPr>
-          <w:lang w:val="en-US"/>
-        </w:rPr>
-        <w:t xml:space="preserve"> interactive dashboard interface. It allowed the project to include different pages, filters, file upload components, KPI cards, charts, and tables.</w:t>
+      <w:r>
+        <w:rPr>
+          <w:lang w:val="en-US"/>
+        </w:rPr>
+        <w:t>Streamlit was used to develop the interactive dashboard interface. It allowed the project to include different pages, filters, file upload components, KPI cards, charts, and tables.</w:t>
       </w:r>
     </w:p>
     <w:p>
@@ -9433,14 +9017,12 @@
                 <w:lang w:val="en-US"/>
               </w:rPr>
             </w:pPr>
-            <w:proofErr w:type="spellStart"/>
             <w:r>
               <w:rPr>
                 <w:lang w:val="en-US"/>
               </w:rPr>
               <w:t>Streamlit</w:t>
             </w:r>
-            <w:proofErr w:type="spellEnd"/>
           </w:p>
         </w:tc>
         <w:tc>
@@ -9976,21 +9558,7 @@
         <w:rPr>
           <w:lang w:val="en-US"/>
         </w:rPr>
-        <w:t xml:space="preserve">This section explains the technical development of the Supply Chain Visibility and Risk Assessment Platform. The system was designed as a dataset-adaptive dashboard platform. It can work with the default </w:t>
-      </w:r>
-      <w:proofErr w:type="spellStart"/>
-      <w:r>
-        <w:rPr>
-          <w:lang w:val="en-US"/>
-        </w:rPr>
-        <w:t>DataCo</w:t>
-      </w:r>
-      <w:proofErr w:type="spellEnd"/>
-      <w:r>
-        <w:rPr>
-          <w:lang w:val="en-US"/>
-        </w:rPr>
-        <w:t xml:space="preserve"> dataset, and it can also process user-uploaded supply chain datasets through column mapping and data standardization.</w:t>
+        <w:t>This section explains the technical development of the Supply Chain Visibility and Risk Assessment Platform. The system was designed as a dataset-adaptive dashboard platform. It can work with the default DataCo dataset, and it can also process user-uploaded supply chain datasets through column mapping and data standardization.</w:t>
       </w:r>
       <w:r>
         <w:rPr>
@@ -10038,21 +9606,7 @@
         <w:rPr>
           <w:lang w:val="en-US"/>
         </w:rPr>
-        <w:t xml:space="preserve">The platform consists of several connected layers. The first layer is the data source layer. This layer includes the default </w:t>
-      </w:r>
-      <w:proofErr w:type="spellStart"/>
-      <w:r>
-        <w:rPr>
-          <w:lang w:val="en-US"/>
-        </w:rPr>
-        <w:t>DataCo</w:t>
-      </w:r>
-      <w:proofErr w:type="spellEnd"/>
-      <w:r>
-        <w:rPr>
-          <w:lang w:val="en-US"/>
-        </w:rPr>
-        <w:t xml:space="preserve"> dataset and user-uploaded CSV or Excel datasets. The second layer is the Data Source Manager, where the user can upload a new dataset and select the active data source. The third layer is the column mapping and data adapter layer. This layer converts different dataset structures into a common supply chain schema.</w:t>
+        <w:t>The platform consists of several connected layers. The first layer is the data source layer. This layer includes the default DataCo dataset and user-uploaded CSV or Excel datasets. The second layer is the Data Source Manager, where the user can upload a new dataset and select the active data source. The third layer is the column mapping and data adapter layer. This layer converts different dataset structures into a common supply chain schema.</w:t>
       </w:r>
       <w:r>
         <w:rPr>
@@ -10065,21 +9619,7 @@
           <w:lang w:val="en-US"/>
         </w:rPr>
         <w:br/>
-        <w:t xml:space="preserve">After the data is standardized, the system creates dashboard-ready analytical tables such as orders, products, shipments, inventory, demand, and risk scores. These tables are then used by the </w:t>
-      </w:r>
-      <w:proofErr w:type="spellStart"/>
-      <w:r>
-        <w:rPr>
-          <w:lang w:val="en-US"/>
-        </w:rPr>
-        <w:t>Streamlit</w:t>
-      </w:r>
-      <w:proofErr w:type="spellEnd"/>
-      <w:r>
-        <w:rPr>
-          <w:lang w:val="en-US"/>
-        </w:rPr>
-        <w:t xml:space="preserve"> dashboard modules. The main dashboard modules are Overview, Regional Performance, Inventory Control, Shipment Performance, Supply Chain Risk, and Demand Forecast.</w:t>
+        <w:t>After the data is standardized, the system creates dashboard-ready analytical tables such as orders, products, shipments, inventory, demand, and risk scores. These tables are then used by the Streamlit dashboard modules. The main dashboard modules are Overview, Regional Performance, Inventory Control, Shipment Performance, Supply Chain Risk, and Demand Forecast.</w:t>
       </w:r>
     </w:p>
     <w:p>
@@ -10128,7 +9668,7 @@
           <w:lang w:val="en-US"/>
         </w:rPr>
         <w:drawing>
-          <wp:inline distT="0" distB="0" distL="0" distR="0" wp14:anchorId="13F4F06E" wp14:editId="328D09F8">
+          <wp:inline distT="0" distB="0" distL="0" distR="0" wp14:anchorId="13F4F06E" wp14:editId="5ECB6FCF">
             <wp:extent cx="5997778" cy="3952875"/>
             <wp:effectExtent l="0" t="0" r="3175" b="0"/>
             <wp:docPr id="36948891" name="Picture 1"/>
@@ -10234,13 +9774,7 @@
         <w:rPr>
           <w:lang w:val="en-US"/>
         </w:rPr>
-        <w:t>As shown in Figure 1, the uploaded dataset does not directly replace the dashboard tables. First, it passes through the Data Source Manager and column mapping process. Then, the data adapter converts it into the standard analytical structure used by the dashboard. This design allows the same dashboard pages to work with different supply chain datasets.</w:t>
-      </w:r>
-      <w:r>
-        <w:rPr>
-          <w:lang w:val="en-US"/>
-        </w:rPr>
-        <w:t xml:space="preserve"> </w:t>
+        <w:t xml:space="preserve">As shown in Figure 1, the uploaded dataset does not directly replace the dashboard tables. First, it passes through the Data Source Manager and column mapping process. Then, the data adapter converts it into the standard analytical structure used by the dashboard. This design allows the same dashboard pages to work with different supply chain datasets. </w:t>
       </w:r>
     </w:p>
     <w:p>
@@ -10269,21 +9803,7 @@
         <w:rPr>
           <w:lang w:val="en-US"/>
         </w:rPr>
-        <w:t xml:space="preserve">The Data Source Manager is the main component that makes the platform reusable. When the dashboard is opened, the default </w:t>
-      </w:r>
-      <w:proofErr w:type="spellStart"/>
-      <w:r>
-        <w:rPr>
-          <w:lang w:val="en-US"/>
-        </w:rPr>
-        <w:t>DataCo</w:t>
-      </w:r>
-      <w:proofErr w:type="spellEnd"/>
-      <w:r>
-        <w:rPr>
-          <w:lang w:val="en-US"/>
-        </w:rPr>
-        <w:t xml:space="preserve"> dataset is active. If the user wants to analyze another supply chain dataset, the user can upload a CSV or Excel file from the Data Source Manager on the Overview page.</w:t>
+        <w:t>The Data Source Manager is the main component that makes the platform reusable. When the dashboard is opened, the default DataCo dataset is active. If the user wants to analyze another supply chain dataset, the user can upload a CSV or Excel file from the Data Source Manager on the Overview page.</w:t>
       </w:r>
     </w:p>
     <w:p>
@@ -10323,35 +9843,7 @@
         <w:rPr>
           <w:lang w:val="en-US"/>
         </w:rPr>
-        <w:t xml:space="preserve">The uploaded dataset is used during the active </w:t>
-      </w:r>
-      <w:proofErr w:type="spellStart"/>
-      <w:r>
-        <w:rPr>
-          <w:lang w:val="en-US"/>
-        </w:rPr>
-        <w:t>Streamlit</w:t>
-      </w:r>
-      <w:proofErr w:type="spellEnd"/>
-      <w:r>
-        <w:rPr>
-          <w:lang w:val="en-US"/>
-        </w:rPr>
-        <w:t xml:space="preserve"> session. If the user activates the uploaded dataset, all dashboard pages use the uploaded data. If the user wants to return to the default dataset, the Data Source Manager provides an option to return to the default </w:t>
-      </w:r>
-      <w:proofErr w:type="spellStart"/>
-      <w:r>
-        <w:rPr>
-          <w:lang w:val="en-US"/>
-        </w:rPr>
-        <w:t>DataCo</w:t>
-      </w:r>
-      <w:proofErr w:type="spellEnd"/>
-      <w:r>
-        <w:rPr>
-          <w:lang w:val="en-US"/>
-        </w:rPr>
-        <w:t xml:space="preserve"> dataset.</w:t>
+        <w:t>The uploaded dataset is used during the active Streamlit session. If the user activates the uploaded dataset, all dashboard pages use the uploaded data. If the user wants to return to the default dataset, the Data Source Manager provides an option to return to the default DataCo dataset.</w:t>
       </w:r>
     </w:p>
     <w:p>
@@ -10436,21 +9928,7 @@
         <w:rPr>
           <w:lang w:val="en-US"/>
         </w:rPr>
-        <w:t xml:space="preserve">The standard </w:t>
-      </w:r>
-      <w:proofErr w:type="gramStart"/>
-      <w:r>
-        <w:rPr>
-          <w:lang w:val="en-US"/>
-        </w:rPr>
-        <w:t>schema</w:t>
-      </w:r>
-      <w:proofErr w:type="gramEnd"/>
-      <w:r>
-        <w:rPr>
-          <w:lang w:val="en-US"/>
-        </w:rPr>
-        <w:t xml:space="preserve"> used in the platform is shown in Table 2.</w:t>
+        <w:t>The standard schema used in the platform is shown in Table 2.</w:t>
       </w:r>
       <w:r>
         <w:rPr>
@@ -10612,14 +10090,12 @@
                 <w:lang w:val="en-US"/>
               </w:rPr>
             </w:pPr>
-            <w:proofErr w:type="spellStart"/>
             <w:r>
               <w:rPr>
                 <w:lang w:val="en-US"/>
               </w:rPr>
               <w:t>order_id</w:t>
             </w:r>
-            <w:proofErr w:type="spellEnd"/>
           </w:p>
         </w:tc>
         <w:tc>
@@ -10682,14 +10158,12 @@
                 <w:lang w:val="en-US"/>
               </w:rPr>
             </w:pPr>
-            <w:proofErr w:type="spellStart"/>
             <w:r>
               <w:rPr>
                 <w:lang w:val="en-US"/>
               </w:rPr>
               <w:t>order_date</w:t>
             </w:r>
-            <w:proofErr w:type="spellEnd"/>
           </w:p>
         </w:tc>
         <w:tc>
@@ -10740,14 +10214,12 @@
                 <w:lang w:val="en-US"/>
               </w:rPr>
             </w:pPr>
-            <w:proofErr w:type="spellStart"/>
             <w:r>
               <w:rPr>
                 <w:lang w:val="en-US"/>
               </w:rPr>
               <w:t>product_name</w:t>
             </w:r>
-            <w:proofErr w:type="spellEnd"/>
           </w:p>
         </w:tc>
         <w:tc>
@@ -10798,14 +10270,12 @@
                 <w:lang w:val="en-US"/>
               </w:rPr>
             </w:pPr>
-            <w:proofErr w:type="spellStart"/>
             <w:r>
               <w:rPr>
                 <w:lang w:val="en-US"/>
               </w:rPr>
               <w:t>category_name</w:t>
             </w:r>
-            <w:proofErr w:type="spellEnd"/>
           </w:p>
         </w:tc>
         <w:tc>
@@ -10840,13 +10310,7 @@
               <w:rPr>
                 <w:lang w:val="en-US"/>
               </w:rPr>
-              <w:t>P</w:t>
-            </w:r>
-            <w:r>
-              <w:rPr>
-                <w:lang w:val="en-US"/>
-              </w:rPr>
-              <w:t>roduct category or product group</w:t>
+              <w:t>Product category or product group</w:t>
             </w:r>
           </w:p>
         </w:tc>
@@ -10862,14 +10326,12 @@
                 <w:lang w:val="en-US"/>
               </w:rPr>
             </w:pPr>
-            <w:proofErr w:type="spellStart"/>
             <w:r>
               <w:rPr>
                 <w:lang w:val="en-US"/>
               </w:rPr>
               <w:t>order_quantity</w:t>
             </w:r>
-            <w:proofErr w:type="spellEnd"/>
           </w:p>
         </w:tc>
         <w:tc>
@@ -10920,14 +10382,12 @@
                 <w:lang w:val="en-US"/>
               </w:rPr>
             </w:pPr>
-            <w:proofErr w:type="spellStart"/>
             <w:r>
               <w:rPr>
                 <w:lang w:val="en-US"/>
               </w:rPr>
               <w:t>shipping_date</w:t>
             </w:r>
-            <w:proofErr w:type="spellEnd"/>
           </w:p>
         </w:tc>
         <w:tc>
@@ -10978,14 +10438,12 @@
                 <w:lang w:val="en-US"/>
               </w:rPr>
             </w:pPr>
-            <w:proofErr w:type="spellStart"/>
             <w:r>
               <w:rPr>
                 <w:lang w:val="en-US"/>
               </w:rPr>
               <w:t>scheduled_delivery_date</w:t>
             </w:r>
-            <w:proofErr w:type="spellEnd"/>
           </w:p>
         </w:tc>
         <w:tc>
@@ -11020,13 +10478,7 @@
               <w:rPr>
                 <w:lang w:val="en-US"/>
               </w:rPr>
-              <w:t>P</w:t>
-            </w:r>
-            <w:r>
-              <w:rPr>
-                <w:lang w:val="en-US"/>
-              </w:rPr>
-              <w:t>lanned or scheduled delivery date</w:t>
+              <w:t>Planned or scheduled delivery date</w:t>
             </w:r>
           </w:p>
         </w:tc>
@@ -11042,14 +10494,12 @@
                 <w:lang w:val="en-US"/>
               </w:rPr>
             </w:pPr>
-            <w:proofErr w:type="spellStart"/>
             <w:r>
               <w:rPr>
                 <w:lang w:val="en-US"/>
               </w:rPr>
               <w:t>delivery_status</w:t>
             </w:r>
-            <w:proofErr w:type="spellEnd"/>
           </w:p>
         </w:tc>
         <w:tc>
@@ -11100,14 +10550,12 @@
                 <w:lang w:val="en-US"/>
               </w:rPr>
             </w:pPr>
-            <w:proofErr w:type="spellStart"/>
             <w:r>
               <w:rPr>
                 <w:lang w:val="en-US"/>
               </w:rPr>
               <w:t>actual_shipping_days</w:t>
             </w:r>
-            <w:proofErr w:type="spellEnd"/>
           </w:p>
         </w:tc>
         <w:tc>
@@ -11158,14 +10606,12 @@
                 <w:lang w:val="en-US"/>
               </w:rPr>
             </w:pPr>
-            <w:proofErr w:type="spellStart"/>
             <w:r>
               <w:rPr>
                 <w:lang w:val="en-US"/>
               </w:rPr>
               <w:t>scheduled_shipping_days</w:t>
             </w:r>
-            <w:proofErr w:type="spellEnd"/>
           </w:p>
         </w:tc>
         <w:tc>
@@ -11200,13 +10646,7 @@
               <w:rPr>
                 <w:lang w:val="en-US"/>
               </w:rPr>
-              <w:t>Planned</w:t>
-            </w:r>
-            <w:r>
-              <w:rPr>
-                <w:lang w:val="en-US"/>
-              </w:rPr>
-              <w:t xml:space="preserve"> or promised shipping duration in days</w:t>
+              <w:t>Planned or promised shipping duration in days</w:t>
             </w:r>
           </w:p>
         </w:tc>
@@ -11222,14 +10662,12 @@
                 <w:lang w:val="en-US"/>
               </w:rPr>
             </w:pPr>
-            <w:proofErr w:type="spellStart"/>
             <w:r>
               <w:rPr>
                 <w:lang w:val="en-US"/>
               </w:rPr>
               <w:t>shipping_mode</w:t>
             </w:r>
-            <w:proofErr w:type="spellEnd"/>
           </w:p>
         </w:tc>
         <w:tc>
@@ -11336,14 +10774,12 @@
                 <w:lang w:val="en-US"/>
               </w:rPr>
             </w:pPr>
-            <w:proofErr w:type="spellStart"/>
             <w:r>
               <w:rPr>
                 <w:lang w:val="en-US"/>
               </w:rPr>
               <w:t>order_region</w:t>
             </w:r>
-            <w:proofErr w:type="spellEnd"/>
           </w:p>
         </w:tc>
         <w:tc>
@@ -11394,14 +10830,12 @@
                 <w:lang w:val="en-US"/>
               </w:rPr>
             </w:pPr>
-            <w:proofErr w:type="spellStart"/>
             <w:r>
               <w:rPr>
                 <w:lang w:val="en-US"/>
               </w:rPr>
               <w:t>order_country</w:t>
             </w:r>
-            <w:proofErr w:type="spellEnd"/>
           </w:p>
         </w:tc>
         <w:tc>
@@ -11508,14 +10942,12 @@
                 <w:lang w:val="en-US"/>
               </w:rPr>
             </w:pPr>
-            <w:proofErr w:type="spellStart"/>
             <w:r>
               <w:rPr>
                 <w:lang w:val="en-US"/>
               </w:rPr>
               <w:t>order_profit</w:t>
             </w:r>
-            <w:proofErr w:type="spellEnd"/>
           </w:p>
         </w:tc>
         <w:tc>
@@ -11573,21 +11005,7 @@
         <w:rPr>
           <w:lang w:val="en-US"/>
         </w:rPr>
-        <w:t xml:space="preserve">If an optional field is not available in the uploaded dataset, the system uses default values or derives indicators when possible. For example, if actual shipping days and scheduled shipping days are not available, the system can calculate </w:t>
-      </w:r>
-      <w:proofErr w:type="gramStart"/>
-      <w:r>
-        <w:rPr>
-          <w:lang w:val="en-US"/>
-        </w:rPr>
-        <w:t>delay</w:t>
-      </w:r>
-      <w:proofErr w:type="gramEnd"/>
-      <w:r>
-        <w:rPr>
-          <w:lang w:val="en-US"/>
-        </w:rPr>
-        <w:t xml:space="preserve"> days by comparing the actual delivery date and the scheduled delivery date. This improves the flexibility of the platform and allows it to work with different supply chain datasets.</w:t>
+        <w:t>If an optional field is not available in the uploaded dataset, the system uses default values or derives indicators when possible. For example, if actual shipping days and scheduled shipping days are not available, the system can calculate delay days by comparing the actual delivery date and the scheduled delivery date. This improves the flexibility of the platform and allows it to work with different supply chain datasets.</w:t>
       </w:r>
     </w:p>
     <w:p>
@@ -11623,19 +11041,7 @@
         <w:rPr>
           <w:lang w:val="en-US"/>
         </w:rPr>
-        <w:t>Af</w:t>
-      </w:r>
-      <w:r>
-        <w:rPr>
-          <w:lang w:val="en-US"/>
-        </w:rPr>
-        <w:t>te</w:t>
-      </w:r>
-      <w:r>
-        <w:rPr>
-          <w:lang w:val="en-US"/>
-        </w:rPr>
-        <w:t>r the dataset is standardized, the system creates analytical tables that are used by the dashboard pages. These tables are not designed as a full enterprise resource planning database. Instead, they are designed as dashboard-ready analytical tables for visibility, reporting, and risk assessment.</w:t>
+        <w:t>After the dataset is standardized, the system creates analytical tables that are used by the dashboard pages. These tables are not designed as a full enterprise resource planning database. Instead, they are designed as dashboard-ready analytical tables for visibility, reporting, and risk assessment.</w:t>
       </w:r>
       <w:r>
         <w:rPr>
@@ -11648,35 +11054,7 @@
           <w:lang w:val="en-US"/>
         </w:rPr>
         <w:br/>
-        <w:t xml:space="preserve">The main analytical tables are orders, products, shipments, inventory, demand, and </w:t>
-      </w:r>
-      <w:proofErr w:type="spellStart"/>
-      <w:r>
-        <w:rPr>
-          <w:lang w:val="en-US"/>
-        </w:rPr>
-        <w:t>risk_scores</w:t>
-      </w:r>
-      <w:proofErr w:type="spellEnd"/>
-      <w:r>
-        <w:rPr>
-          <w:lang w:val="en-US"/>
-        </w:rPr>
-        <w:t xml:space="preserve">. The orders table is the central table because it contains the main order-level information. The shipments table is created from order and delivery-related fields. The inventory table is generated from product and demand patterns. The demand table summarizes monthly demand by product category. The </w:t>
-      </w:r>
-      <w:proofErr w:type="spellStart"/>
-      <w:r>
-        <w:rPr>
-          <w:lang w:val="en-US"/>
-        </w:rPr>
-        <w:t>risk_scores</w:t>
-      </w:r>
-      <w:proofErr w:type="spellEnd"/>
-      <w:r>
-        <w:rPr>
-          <w:lang w:val="en-US"/>
-        </w:rPr>
-        <w:t xml:space="preserve"> table stores regional risk indicators.</w:t>
+        <w:t>The main analytical tables are orders, products, shipments, inventory, demand, and risk_scores. The orders table is the central table because it contains the main order-level information. The shipments table is created from order and delivery-related fields. The inventory table is generated from product and demand patterns. The demand table summarizes monthly demand by product category. The risk_scores table stores regional risk indicators.</w:t>
       </w:r>
       <w:r>
         <w:rPr>
@@ -11705,7 +11083,7 @@
           <w:lang w:val="en-US"/>
         </w:rPr>
         <w:drawing>
-          <wp:inline distT="0" distB="0" distL="0" distR="0" wp14:anchorId="670A0A81" wp14:editId="48DBC7CE">
+          <wp:inline distT="0" distB="0" distL="0" distR="0" wp14:anchorId="670A0A81" wp14:editId="286FA9A2">
             <wp:extent cx="6162675" cy="4108228"/>
             <wp:effectExtent l="0" t="0" r="0" b="6985"/>
             <wp:docPr id="604311595" name="Picture 2"/>
@@ -11854,21 +11232,7 @@
         <w:rPr>
           <w:lang w:val="en-US"/>
         </w:rPr>
-        <w:t xml:space="preserve">The platform includes six dashboard modules. Each module focuses on a different part of supply chain visibility and risk analysis. These modules work with </w:t>
-      </w:r>
-      <w:proofErr w:type="gramStart"/>
-      <w:r>
-        <w:rPr>
-          <w:lang w:val="en-US"/>
-        </w:rPr>
-        <w:t>the</w:t>
-      </w:r>
-      <w:proofErr w:type="gramEnd"/>
-      <w:r>
-        <w:rPr>
-          <w:lang w:val="en-US"/>
-        </w:rPr>
-        <w:t xml:space="preserve"> active dataset. If the user activates an uploaded dataset, the same dashboard modules are updated according to the uploaded data.</w:t>
+        <w:t>The platform includes six dashboard modules. Each module focuses on a different part of supply chain visibility and risk analysis. These modules work with the active dataset. If the user activates an uploaded dataset, the same dashboard modules are updated according to the uploaded data.</w:t>
       </w:r>
     </w:p>
     <w:p>
@@ -12140,19 +11504,11 @@
                 <w:lang w:val="en-US"/>
               </w:rPr>
             </w:pPr>
-            <w:proofErr w:type="gramStart"/>
-            <w:r>
-              <w:rPr>
-                <w:lang w:val="en-US"/>
-              </w:rPr>
-              <w:t>Compares</w:t>
-            </w:r>
-            <w:proofErr w:type="gramEnd"/>
-            <w:r>
-              <w:rPr>
-                <w:lang w:val="en-US"/>
-              </w:rPr>
-              <w:t xml:space="preserve"> markets, regions, and countries</w:t>
+            <w:r>
+              <w:rPr>
+                <w:lang w:val="en-US"/>
+              </w:rPr>
+              <w:t>Compares markets, regions, and countries</w:t>
             </w:r>
           </w:p>
         </w:tc>
@@ -12410,21 +11766,7 @@
         <w:rPr>
           <w:lang w:val="en-US"/>
         </w:rPr>
-        <w:t xml:space="preserve">The modular structure makes the platform easier to understand and maintain. Each page has a specific responsibility, but all pages use the same active dataset. This design supports both the default </w:t>
-      </w:r>
-      <w:proofErr w:type="spellStart"/>
-      <w:r>
-        <w:rPr>
-          <w:lang w:val="en-US"/>
-        </w:rPr>
-        <w:t>DataCo</w:t>
-      </w:r>
-      <w:proofErr w:type="spellEnd"/>
-      <w:r>
-        <w:rPr>
-          <w:lang w:val="en-US"/>
-        </w:rPr>
-        <w:t xml:space="preserve"> dataset and user-uploaded datasets.</w:t>
+        <w:t>The modular structure makes the platform easier to understand and maintain. Each page has a specific responsibility, but all pages use the same active dataset. This design supports both the default DataCo dataset and user-uploaded datasets.</w:t>
       </w:r>
     </w:p>
     <w:p>
@@ -13371,21 +12713,7 @@
         <w:rPr>
           <w:lang w:val="en-US"/>
         </w:rPr>
-        <w:t xml:space="preserve">The risk scoring logic is also affected by dashboard filters. When the user filters the dataset by market, category, shipping mode, or date range, the risk components are recalculated based on the filtered data. This makes </w:t>
-      </w:r>
-      <w:proofErr w:type="gramStart"/>
-      <w:r>
-        <w:rPr>
-          <w:lang w:val="en-US"/>
-        </w:rPr>
-        <w:t>the risk</w:t>
-      </w:r>
-      <w:proofErr w:type="gramEnd"/>
-      <w:r>
-        <w:rPr>
-          <w:lang w:val="en-US"/>
-        </w:rPr>
-        <w:t xml:space="preserve"> analysis interactive and more useful for decision-making.</w:t>
+        <w:t>The risk scoring logic is also affected by dashboard filters. When the user filters the dataset by market, category, shipping mode, or date range, the risk components are recalculated based on the filtered data. This makes the risk analysis interactive and more useful for decision-making.</w:t>
       </w:r>
     </w:p>
     <w:p>
@@ -13522,35 +12850,7 @@
         <w:rPr>
           <w:lang w:val="en-US"/>
         </w:rPr>
-        <w:t xml:space="preserve">The forecasting approach is intentionally simple because the </w:t>
-      </w:r>
-      <w:proofErr w:type="gramStart"/>
-      <w:r>
-        <w:rPr>
-          <w:lang w:val="en-US"/>
-        </w:rPr>
-        <w:t>main focus</w:t>
-      </w:r>
-      <w:proofErr w:type="gramEnd"/>
-      <w:r>
-        <w:rPr>
-          <w:lang w:val="en-US"/>
-        </w:rPr>
-        <w:t xml:space="preserve"> of the project is </w:t>
-      </w:r>
-      <w:proofErr w:type="gramStart"/>
-      <w:r>
-        <w:rPr>
-          <w:lang w:val="en-US"/>
-        </w:rPr>
-        <w:t>supply</w:t>
-      </w:r>
-      <w:proofErr w:type="gramEnd"/>
-      <w:r>
-        <w:rPr>
-          <w:lang w:val="en-US"/>
-        </w:rPr>
-        <w:t xml:space="preserve"> chain visibility and risk assessment. The purpose of the forecast module is to demonstrate how demand data can support planning decisions, not to create a highly advanced forecasting system.</w:t>
+        <w:t>The forecasting approach is intentionally simple because the main focus of the project is supply chain visibility and risk assessment. The purpose of the forecast module is to demonstrate how demand data can support planning decisions, not to create a highly advanced forecasting system.</w:t>
       </w:r>
     </w:p>
     <w:p>
@@ -13586,35 +12886,7 @@
         <w:rPr>
           <w:lang w:val="en-US"/>
         </w:rPr>
-        <w:t xml:space="preserve">The dashboard interface was developed with </w:t>
-      </w:r>
-      <w:proofErr w:type="spellStart"/>
-      <w:r>
-        <w:rPr>
-          <w:lang w:val="en-US"/>
-        </w:rPr>
-        <w:t>Streamlit</w:t>
-      </w:r>
-      <w:proofErr w:type="spellEnd"/>
-      <w:r>
-        <w:rPr>
-          <w:lang w:val="en-US"/>
-        </w:rPr>
-        <w:t xml:space="preserve">. The platform includes a sidebar navigation menu and multiple dashboard pages. The Overview page includes the Data Source Manager, which allows users to upload a new dataset, map columns, activate the uploaded dataset, or return to the default </w:t>
-      </w:r>
-      <w:proofErr w:type="spellStart"/>
-      <w:r>
-        <w:rPr>
-          <w:lang w:val="en-US"/>
-        </w:rPr>
-        <w:t>DataCo</w:t>
-      </w:r>
-      <w:proofErr w:type="spellEnd"/>
-      <w:r>
-        <w:rPr>
-          <w:lang w:val="en-US"/>
-        </w:rPr>
-        <w:t xml:space="preserve"> dataset.</w:t>
+        <w:t>The dashboard interface was developed with Streamlit. The platform includes a sidebar navigation menu and multiple dashboard pages. The Overview page includes the Data Source Manager, which allows users to upload a new dataset, map columns, activate the uploaded dataset, or return to the default DataCo dataset.</w:t>
       </w:r>
     </w:p>
     <w:p>
@@ -13657,7 +12929,7 @@
         </w:rPr>
         <w:lastRenderedPageBreak/>
         <w:drawing>
-          <wp:inline distT="0" distB="0" distL="0" distR="0" wp14:anchorId="385ACC34" wp14:editId="5678F07F">
+          <wp:inline distT="0" distB="0" distL="0" distR="0" wp14:anchorId="385ACC34" wp14:editId="6C62E171">
             <wp:extent cx="6357908" cy="3705225"/>
             <wp:effectExtent l="0" t="0" r="5080" b="0"/>
             <wp:docPr id="1801230199" name="Picture 4"/>
@@ -13809,6 +13081,7 @@
       </w:pPr>
       <w:r>
         <w:rPr>
+          <w:noProof/>
           <w:lang w:val="en-US"/>
         </w:rPr>
         <w:drawing>
@@ -13945,6 +13218,7 @@
       </w:pPr>
       <w:r>
         <w:rPr>
+          <w:noProof/>
           <w:lang w:val="en-US"/>
         </w:rPr>
         <w:drawing>
@@ -14080,6 +13354,7 @@
       </w:pPr>
       <w:r>
         <w:rPr>
+          <w:noProof/>
           <w:lang w:val="en-US"/>
         </w:rPr>
         <w:drawing>
@@ -14275,21 +13550,7 @@
           <w:lang w:val="en-US"/>
         </w:rPr>
         <w:br/>
-        <w:t xml:space="preserve">The company needs a reusable dashboard platform that can work with different supply chain datasets. The platform should not require code changes every time a new </w:t>
-      </w:r>
-      <w:proofErr w:type="gramStart"/>
-      <w:r>
-        <w:rPr>
-          <w:lang w:val="en-US"/>
-        </w:rPr>
-        <w:t>dataset</w:t>
-      </w:r>
-      <w:proofErr w:type="gramEnd"/>
-      <w:r>
-        <w:rPr>
-          <w:lang w:val="en-US"/>
-        </w:rPr>
-        <w:t xml:space="preserve"> is analyzed. Instead, users should be able to upload a dataset, map its columns to a standard schema, and generate dashboard pages based on the active dataset.</w:t>
+        <w:t>The company needs a reusable dashboard platform that can work with different supply chain datasets. The platform should not require code changes every time a new dataset is analyzed. Instead, users should be able to upload a dataset, map its columns to a standard schema, and generate dashboard pages based on the active dataset.</w:t>
       </w:r>
     </w:p>
     <w:p>
@@ -14309,21 +13570,7 @@
           <w:lang w:val="en-US"/>
         </w:rPr>
         <w:br/>
-        <w:t xml:space="preserve">In this project, the </w:t>
-      </w:r>
-      <w:proofErr w:type="spellStart"/>
-      <w:r>
-        <w:rPr>
-          <w:lang w:val="en-US"/>
-        </w:rPr>
-        <w:t>DataCo</w:t>
-      </w:r>
-      <w:proofErr w:type="spellEnd"/>
-      <w:r>
-        <w:rPr>
-          <w:lang w:val="en-US"/>
-        </w:rPr>
-        <w:t xml:space="preserve"> dataset is used as the default demonstration dataset. However, the business case also considers a situation where a user uploads a new company dataset. After the uploaded dataset is mapped and standardized, the dashboard pages are updated dynamically.</w:t>
+        <w:t>In this project, the DataCo dataset is used as the default demonstration dataset. However, the business case also considers a situation where a user uploads a new company dataset. After the uploaded dataset is mapped and standardized, the dashboard pages are updated dynamically.</w:t>
       </w:r>
     </w:p>
     <w:p>
@@ -14790,7 +14037,7 @@
         </w:rPr>
         <w:lastRenderedPageBreak/>
         <w:drawing>
-          <wp:inline distT="0" distB="0" distL="0" distR="0" wp14:anchorId="2FC8B4CF" wp14:editId="41EDA205">
+          <wp:inline distT="0" distB="0" distL="0" distR="0" wp14:anchorId="2FC8B4CF" wp14:editId="3640BB6C">
             <wp:extent cx="5868670" cy="3867785"/>
             <wp:effectExtent l="0" t="0" r="0" b="0"/>
             <wp:docPr id="656098705" name="Picture 5"/>
@@ -14932,49 +14179,7 @@
         <w:rPr>
           <w:lang w:val="en-US"/>
         </w:rPr>
-        <w:t xml:space="preserve">An example usage flow starts with the user opening the platform. </w:t>
-      </w:r>
-      <w:proofErr w:type="gramStart"/>
-      <w:r>
-        <w:rPr>
-          <w:lang w:val="en-US"/>
-        </w:rPr>
-        <w:t>At first</w:t>
-      </w:r>
-      <w:proofErr w:type="gramEnd"/>
-      <w:r>
-        <w:rPr>
-          <w:lang w:val="en-US"/>
-        </w:rPr>
-        <w:t xml:space="preserve">, the default </w:t>
-      </w:r>
-      <w:proofErr w:type="spellStart"/>
-      <w:r>
-        <w:rPr>
-          <w:lang w:val="en-US"/>
-        </w:rPr>
-        <w:t>DataCo</w:t>
-      </w:r>
-      <w:proofErr w:type="spellEnd"/>
-      <w:r>
-        <w:rPr>
-          <w:lang w:val="en-US"/>
-        </w:rPr>
-        <w:t xml:space="preserve"> dataset is active. The user can review the default </w:t>
-      </w:r>
-      <w:proofErr w:type="gramStart"/>
-      <w:r>
-        <w:rPr>
-          <w:lang w:val="en-US"/>
-        </w:rPr>
-        <w:t>dashboard, or</w:t>
-      </w:r>
-      <w:proofErr w:type="gramEnd"/>
-      <w:r>
-        <w:rPr>
-          <w:lang w:val="en-US"/>
-        </w:rPr>
-        <w:t xml:space="preserve"> upload a new supply chain dataset through the Data Source Manager.</w:t>
+        <w:t>An example usage flow starts with the user opening the platform. At first, the default DataCo dataset is active. The user can review the default dashboard, or upload a new supply chain dataset through the Data Source Manager.</w:t>
       </w:r>
     </w:p>
     <w:p>
@@ -15126,21 +14331,7 @@
         <w:rPr>
           <w:lang w:val="en-US"/>
         </w:rPr>
-        <w:t xml:space="preserve">This graduation thesis developed a Supply Chain Visibility and Risk Assessment Platform using Python and </w:t>
-      </w:r>
-      <w:proofErr w:type="spellStart"/>
-      <w:r>
-        <w:rPr>
-          <w:lang w:val="en-US"/>
-        </w:rPr>
-        <w:t>Streamlit</w:t>
-      </w:r>
-      <w:proofErr w:type="spellEnd"/>
-      <w:r>
-        <w:rPr>
-          <w:lang w:val="en-US"/>
-        </w:rPr>
-        <w:t>. The main goal of the project was to create an interactive decision-support system that can help users monitor supply chain performance, identify operational risks, and analyze demand patterns from a single interface.</w:t>
+        <w:t>This graduation thesis developed a Supply Chain Visibility and Risk Assessment Platform using Python and Streamlit. The main goal of the project was to create an interactive decision-support system that can help users monitor supply chain performance, identify operational risks, and analyze demand patterns from a single interface.</w:t>
       </w:r>
     </w:p>
     <w:p>
@@ -15160,21 +14351,7 @@
           <w:lang w:val="en-US"/>
         </w:rPr>
         <w:br/>
-        <w:t xml:space="preserve">The completed platform includes several dashboard modules: Overview, Regional Performance, Inventory Control, Shipment Performance, Supply Chain Risk, and Demand Forecast. These modules provide key performance indicators, charts, tables, risk scores, and </w:t>
-      </w:r>
-      <w:proofErr w:type="gramStart"/>
-      <w:r>
-        <w:rPr>
-          <w:lang w:val="en-US"/>
-        </w:rPr>
-        <w:t>forecasting</w:t>
-      </w:r>
-      <w:proofErr w:type="gramEnd"/>
-      <w:r>
-        <w:rPr>
-          <w:lang w:val="en-US"/>
-        </w:rPr>
-        <w:t xml:space="preserve"> outputs. The dashboard helps users analyze delivery performance, shipment delays, inventory status, regional differences, demand trends, and overall supply chain risk.</w:t>
+        <w:t>The completed platform includes several dashboard modules: Overview, Regional Performance, Inventory Control, Shipment Performance, Supply Chain Risk, and Demand Forecast. These modules provide key performance indicators, charts, tables, risk scores, and forecasting outputs. The dashboard helps users analyze delivery performance, shipment delays, inventory status, regional differences, demand trends, and overall supply chain risk.</w:t>
       </w:r>
     </w:p>
     <w:p>
@@ -15194,21 +14371,7 @@
           <w:lang w:val="en-US"/>
         </w:rPr>
         <w:br/>
-        <w:t xml:space="preserve">One of the strongest parts of the project is the dataset upload and standardization feature. The system is not limited to the default </w:t>
-      </w:r>
-      <w:proofErr w:type="spellStart"/>
-      <w:r>
-        <w:rPr>
-          <w:lang w:val="en-US"/>
-        </w:rPr>
-        <w:t>DataCo</w:t>
-      </w:r>
-      <w:proofErr w:type="spellEnd"/>
-      <w:r>
-        <w:rPr>
-          <w:lang w:val="en-US"/>
-        </w:rPr>
-        <w:t xml:space="preserve"> dataset. Users can upload a new supply chain dataset in CSV or Excel format, map the dataset columns to a standard schema, and generate dashboard pages based on the uploaded dataset. This makes the platform more reusable and flexible than a static dashboard built for only one dataset.</w:t>
+        <w:t>One of the strongest parts of the project is the dataset upload and standardization feature. The system is not limited to the default DataCo dataset. Users can upload a new supply chain dataset in CSV or Excel format, map the dataset columns to a standard schema, and generate dashboard pages based on the uploaded dataset. This makes the platform more reusable and flexible than a static dashboard built for only one dataset.</w:t>
       </w:r>
     </w:p>
     <w:p>
@@ -15268,21 +14431,7 @@
           <w:lang w:val="en-US"/>
         </w:rPr>
         <w:br/>
-        <w:t xml:space="preserve">The project has some limitations. The default </w:t>
-      </w:r>
-      <w:proofErr w:type="spellStart"/>
-      <w:r>
-        <w:rPr>
-          <w:lang w:val="en-US"/>
-        </w:rPr>
-        <w:t>DataCo</w:t>
-      </w:r>
-      <w:proofErr w:type="spellEnd"/>
-      <w:r>
-        <w:rPr>
-          <w:lang w:val="en-US"/>
-        </w:rPr>
-        <w:t xml:space="preserve"> dataset is a public historical dataset and does not represent the current operations of a specific company. In addition, the quality of the dashboard outputs depends on the structure and completeness of the uploaded dataset. Some indicators, especially inventory-related fields, are generated for academic demonstration purposes when the uploaded dataset does not contain complete inventory information. The risk score is also rule-based rather than machine-learning-based.</w:t>
+        <w:t>The project has some limitations. The default DataCo dataset is a public historical dataset and does not represent the current operations of a specific company. In addition, the quality of the dashboard outputs depends on the structure and completeness of the uploaded dataset. Some indicators, especially inventory-related fields, are generated for academic demonstration purposes when the uploaded dataset does not contain complete inventory information. The risk score is also rule-based rather than machine-learning-based.</w:t>
       </w:r>
     </w:p>
     <w:p>
@@ -15376,9 +14525,9 @@
         </w:rPr>
       </w:pPr>
     </w:p>
-    <w:bookmarkStart w:id="63" w:name="_Toc230203458" w:displacedByCustomXml="next"/>
+    <w:bookmarkStart w:id="63" w:name="_Toc32521151" w:displacedByCustomXml="next"/>
     <w:bookmarkStart w:id="64" w:name="_Toc494826192" w:displacedByCustomXml="next"/>
-    <w:bookmarkStart w:id="65" w:name="_Toc32521151" w:displacedByCustomXml="next"/>
+    <w:bookmarkStart w:id="65" w:name="_Toc230203458" w:displacedByCustomXml="next"/>
     <w:sdt>
       <w:sdtPr>
         <w:rPr>
@@ -15810,21 +14959,7 @@
           <w:lang w:val="en-US"/>
         </w:rPr>
         <w:lastRenderedPageBreak/>
-        <w:t>GIT/KAGGLE/COLAB/</w:t>
-      </w:r>
-      <w:proofErr w:type="gramStart"/>
-      <w:r>
-        <w:rPr>
-          <w:lang w:val="en-US"/>
-        </w:rPr>
-        <w:t>etc..</w:t>
-      </w:r>
-      <w:proofErr w:type="gramEnd"/>
-      <w:r>
-        <w:rPr>
-          <w:lang w:val="en-US"/>
-        </w:rPr>
-        <w:t xml:space="preserve"> LINK</w:t>
+        <w:t>GIT/KAGGLE/COLAB/etc.. LINK</w:t>
       </w:r>
       <w:bookmarkEnd w:id="67"/>
     </w:p>
@@ -15902,23 +15037,7 @@
           <w:lang w:val="en-US"/>
         </w:rPr>
         <w:br/>
-        <w:t xml:space="preserve">The default dataset is the </w:t>
-      </w:r>
-      <w:proofErr w:type="spellStart"/>
-      <w:r>
-        <w:rPr>
-          <w:color w:val="000000" w:themeColor="text1"/>
-          <w:lang w:val="en-US"/>
-        </w:rPr>
-        <w:t>DataCo</w:t>
-      </w:r>
-      <w:proofErr w:type="spellEnd"/>
-      <w:r>
-        <w:rPr>
-          <w:color w:val="000000" w:themeColor="text1"/>
-          <w:lang w:val="en-US"/>
-        </w:rPr>
-        <w:t xml:space="preserve"> Smart Supply Chain dataset. The platform also supports user-uploaded CSV and Excel supply chain datasets through the Data Source Manager.</w:t>
+        <w:t>The default dataset is the DataCo Smart Supply Chain dataset. The platform also supports user-uploaded CSV and Excel supply chain datasets through the Data Source Manager.</w:t>
       </w:r>
     </w:p>
     <w:p>
@@ -15965,21 +15084,12 @@
           <w:lang w:val="en-US"/>
         </w:rPr>
       </w:pPr>
-      <w:proofErr w:type="spellStart"/>
       <w:r>
         <w:rPr>
           <w:color w:val="000000" w:themeColor="text1"/>
           <w:lang w:val="en-US"/>
         </w:rPr>
-        <w:t>Gülse</w:t>
-      </w:r>
-      <w:proofErr w:type="spellEnd"/>
-      <w:r>
-        <w:rPr>
-          <w:color w:val="000000" w:themeColor="text1"/>
-          <w:lang w:val="en-US"/>
-        </w:rPr>
-        <w:t xml:space="preserve"> Dolunay Ünlü</w:t>
+        <w:t>Gülse Dolunay Ünlü</w:t>
       </w:r>
     </w:p>
     <w:p>
@@ -15997,7 +15107,6 @@
           <w:lang w:val="en-US" w:eastAsia="tr-TR"/>
         </w:rPr>
       </w:pPr>
-      <w:proofErr w:type="gramStart"/>
       <w:r>
         <w:rPr>
           <w:b/>
@@ -16005,7 +15114,6 @@
         </w:rPr>
         <w:t>Education :</w:t>
       </w:r>
-      <w:proofErr w:type="gramEnd"/>
     </w:p>
     <w:p>
       <w:pPr>
@@ -16013,7 +15121,6 @@
           <w:lang w:val="en-US" w:eastAsia="tr-TR"/>
         </w:rPr>
       </w:pPr>
-      <w:proofErr w:type="gramStart"/>
       <w:r>
         <w:rPr>
           <w:i/>
@@ -16026,14 +15133,7 @@
         <w:rPr>
           <w:lang w:val="en-US" w:eastAsia="tr-TR"/>
         </w:rPr>
-        <w:t xml:space="preserve"> :</w:t>
-      </w:r>
-      <w:proofErr w:type="gramEnd"/>
-      <w:r>
-        <w:rPr>
-          <w:lang w:val="en-US" w:eastAsia="tr-TR"/>
-        </w:rPr>
-        <w:t xml:space="preserve"> Piri Reis University </w:t>
+        <w:t xml:space="preserve"> : Piri Reis University </w:t>
       </w:r>
     </w:p>
     <w:p>
@@ -16103,30 +15203,20 @@
         <w:rPr>
           <w:lang w:val="en-US" w:eastAsia="tr-TR"/>
         </w:rPr>
-        <w:t xml:space="preserve"> Turgut </w:t>
-      </w:r>
-      <w:proofErr w:type="spellStart"/>
+        <w:t xml:space="preserve"> </w:t>
+      </w:r>
       <w:r>
         <w:rPr>
           <w:lang w:val="en-US" w:eastAsia="tr-TR"/>
         </w:rPr>
-        <w:t>Özal</w:t>
-      </w:r>
-      <w:proofErr w:type="spellEnd"/>
+        <w:t xml:space="preserve">Düzce </w:t>
+      </w:r>
       <w:r>
         <w:rPr>
           <w:lang w:val="en-US" w:eastAsia="tr-TR"/>
         </w:rPr>
-        <w:t xml:space="preserve"> Anadolu </w:t>
-      </w:r>
-      <w:proofErr w:type="spellStart"/>
-      <w:r>
-        <w:rPr>
-          <w:lang w:val="en-US" w:eastAsia="tr-TR"/>
-        </w:rPr>
-        <w:t>Lisesi</w:t>
-      </w:r>
-      <w:proofErr w:type="spellEnd"/>
+        <w:t>Turgut Özal Anadolu Lisesi</w:t>
+      </w:r>
       <w:r>
         <w:rPr>
           <w:lang w:val="en-US" w:eastAsia="tr-TR"/>
@@ -16324,26 +15414,32 @@
           <w:bCs/>
           <w:lang w:val="en-US" w:eastAsia="tr-TR"/>
         </w:rPr>
-        <w:t xml:space="preserve">Professional </w:t>
-      </w:r>
-      <w:proofErr w:type="gramStart"/>
-      <w:r>
+        <w:t>Professional skill:</w:t>
+      </w:r>
+    </w:p>
+    <w:p>
+      <w:pPr>
         <w:rPr>
           <w:b/>
           <w:bCs/>
           <w:lang w:val="en-US" w:eastAsia="tr-TR"/>
         </w:rPr>
-        <w:t>skill</w:t>
-      </w:r>
-      <w:proofErr w:type="gramEnd"/>
+      </w:pPr>
       <w:r>
         <w:rPr>
           <w:b/>
           <w:bCs/>
           <w:lang w:val="en-US" w:eastAsia="tr-TR"/>
         </w:rPr>
-        <w:t>:</w:t>
-      </w:r>
+        <w:t>Python, pandas, NumPy, Matplotlib, Excel, Power Query, SQL, Java, HTML, CSS, JavaScript, Cisco Packet Tracer, data cleaning, exploratory data analysis, reporting, dashboard development</w:t>
+      </w:r>
+    </w:p>
+    <w:p>
+      <w:pPr>
+        <w:rPr>
+          <w:lang w:val="en-US" w:eastAsia="tr-TR"/>
+        </w:rPr>
+      </w:pPr>
     </w:p>
     <w:p>
       <w:pPr>
@@ -16359,18 +15455,16 @@
           <w:bCs/>
           <w:lang w:val="en-US" w:eastAsia="tr-TR"/>
         </w:rPr>
-        <w:t>Python, pandas, NumPy, Matplotlib, Excel, Power Query, SQL, Java, HTML, CSS, JavaScript, Cisco Packet Tracer, data cleaning, exploratory data analysis, reporting, dashboard development</w:t>
-      </w:r>
-    </w:p>
-    <w:p>
-      <w:pPr>
-        <w:rPr>
-          <w:lang w:val="en-US" w:eastAsia="tr-TR"/>
-        </w:rPr>
-      </w:pPr>
-    </w:p>
-    <w:p>
-      <w:pPr>
+        <w:t>Academic Projects:</w:t>
+      </w:r>
+    </w:p>
+    <w:p>
+      <w:pPr>
+        <w:pStyle w:val="ListParagraph"/>
+        <w:numPr>
+          <w:ilvl w:val="0"/>
+          <w:numId w:val="21"/>
+        </w:numPr>
         <w:rPr>
           <w:b/>
           <w:bCs/>
@@ -16383,7 +15477,7 @@
           <w:bCs/>
           <w:lang w:val="en-US" w:eastAsia="tr-TR"/>
         </w:rPr>
-        <w:t>Academic Projects:</w:t>
+        <w:t>House Prices – Advanced Regression Techniques, Kaggle Competition</w:t>
       </w:r>
     </w:p>
     <w:p>
@@ -16400,11 +15494,16 @@
           <w:bCs/>
           <w:lang w:val="en-US" w:eastAsia="tr-TR"/>
         </w:rPr>
-        <w:t>House Prices – Advanced Regression Techniques, Kaggle Competition</w:t>
-      </w:r>
-    </w:p>
-    <w:p>
-      <w:pPr>
+        <w:t>Performed data cleaning and exploratory data analysis on housing data using Python.</w:t>
+      </w:r>
+    </w:p>
+    <w:p>
+      <w:pPr>
+        <w:pStyle w:val="ListParagraph"/>
+        <w:numPr>
+          <w:ilvl w:val="0"/>
+          <w:numId w:val="20"/>
+        </w:numPr>
         <w:rPr>
           <w:b/>
           <w:bCs/>
@@ -16417,99 +15516,111 @@
           <w:bCs/>
           <w:lang w:val="en-US" w:eastAsia="tr-TR"/>
         </w:rPr>
-        <w:t xml:space="preserve">Performed data cleaning and </w:t>
-      </w:r>
-      <w:proofErr w:type="gramStart"/>
-      <w:r>
+        <w:t>Animal Lifespan Prediction and Clustering</w:t>
+      </w:r>
+    </w:p>
+    <w:p>
+      <w:pPr>
         <w:rPr>
           <w:b/>
           <w:bCs/>
           <w:lang w:val="en-US" w:eastAsia="tr-TR"/>
         </w:rPr>
-        <w:t>exploratory</w:t>
-      </w:r>
-      <w:proofErr w:type="gramEnd"/>
+      </w:pPr>
       <w:r>
         <w:rPr>
           <w:b/>
           <w:bCs/>
           <w:lang w:val="en-US" w:eastAsia="tr-TR"/>
         </w:rPr>
-        <w:t xml:space="preserve"> data analysis on housing data using Python.</w:t>
-      </w:r>
-    </w:p>
-    <w:p>
-      <w:pPr>
+        <w:t>Conducted data preprocessing and exploratory analysis on a biological dataset using Python.</w:t>
+      </w:r>
+    </w:p>
+    <w:p>
+      <w:pPr>
+        <w:pStyle w:val="ListParagraph"/>
+        <w:numPr>
+          <w:ilvl w:val="0"/>
+          <w:numId w:val="20"/>
+        </w:numPr>
         <w:rPr>
           <w:b/>
           <w:bCs/>
           <w:lang w:val="en-US" w:eastAsia="tr-TR"/>
         </w:rPr>
       </w:pPr>
-    </w:p>
-    <w:p>
-      <w:pPr>
+      <w:r>
         <w:rPr>
           <w:b/>
           <w:bCs/>
           <w:lang w:val="en-US" w:eastAsia="tr-TR"/>
         </w:rPr>
-      </w:pPr>
-      <w:r>
+        <w:t>Secure Office Network Design</w:t>
+      </w:r>
+    </w:p>
+    <w:p>
+      <w:pPr>
         <w:rPr>
           <w:b/>
           <w:bCs/>
           <w:lang w:val="en-US" w:eastAsia="tr-TR"/>
         </w:rPr>
-        <w:t>Animal Lifespan Prediction and Clustering</w:t>
-      </w:r>
-    </w:p>
-    <w:p>
-      <w:pPr>
+      </w:pPr>
+      <w:r>
         <w:rPr>
           <w:b/>
           <w:bCs/>
           <w:lang w:val="en-US" w:eastAsia="tr-TR"/>
         </w:rPr>
-      </w:pPr>
-      <w:r>
+        <w:t>Designed a segmented office network in Cisco Packet Tracer using VLANs, DHCP, NAT, ACLs, and SSH.</w:t>
+      </w:r>
+    </w:p>
+    <w:p>
+      <w:pPr>
+        <w:pStyle w:val="ListParagraph"/>
+        <w:numPr>
+          <w:ilvl w:val="0"/>
+          <w:numId w:val="20"/>
+        </w:numPr>
         <w:rPr>
           <w:b/>
           <w:bCs/>
           <w:lang w:val="en-US" w:eastAsia="tr-TR"/>
         </w:rPr>
-        <w:t xml:space="preserve">Conducted data preprocessing and </w:t>
-      </w:r>
-      <w:proofErr w:type="gramStart"/>
+      </w:pPr>
       <w:r>
         <w:rPr>
           <w:b/>
           <w:bCs/>
           <w:lang w:val="en-US" w:eastAsia="tr-TR"/>
         </w:rPr>
-        <w:t>exploratory</w:t>
-      </w:r>
-      <w:proofErr w:type="gramEnd"/>
-      <w:r>
+        <w:t>Statistical Analysis of Student Performance</w:t>
+      </w:r>
+    </w:p>
+    <w:p>
+      <w:pPr>
         <w:rPr>
           <w:b/>
           <w:bCs/>
           <w:lang w:val="en-US" w:eastAsia="tr-TR"/>
         </w:rPr>
-        <w:t xml:space="preserve"> analysis on a biological dataset using Python.</w:t>
-      </w:r>
-    </w:p>
-    <w:p>
-      <w:pPr>
+      </w:pPr>
+      <w:r>
         <w:rPr>
           <w:b/>
           <w:bCs/>
           <w:lang w:val="en-US" w:eastAsia="tr-TR"/>
         </w:rPr>
-      </w:pPr>
-    </w:p>
-    <w:p>
-      <w:pPr>
+        <w:t>Applied descriptive statistics, correlation analysis, hypothesis testing, and multiple linear regression.</w:t>
+      </w:r>
+    </w:p>
+    <w:p>
+      <w:pPr>
+        <w:pStyle w:val="ListParagraph"/>
+        <w:numPr>
+          <w:ilvl w:val="0"/>
+          <w:numId w:val="20"/>
+        </w:numPr>
         <w:rPr>
           <w:b/>
           <w:bCs/>
@@ -16522,34 +15633,47 @@
           <w:bCs/>
           <w:lang w:val="en-US" w:eastAsia="tr-TR"/>
         </w:rPr>
-        <w:t>Secure Office Network Design</w:t>
-      </w:r>
-    </w:p>
-    <w:p>
-      <w:pPr>
+        <w:t>Library Management System</w:t>
+      </w:r>
+    </w:p>
+    <w:p>
+      <w:pPr>
+        <w:rPr>
+          <w:lang w:val="en-US" w:eastAsia="tr-TR"/>
+        </w:rPr>
+      </w:pPr>
+      <w:r>
         <w:rPr>
           <w:b/>
           <w:bCs/>
           <w:lang w:val="en-US" w:eastAsia="tr-TR"/>
         </w:rPr>
-      </w:pPr>
-      <w:r>
+        <w:t>Developed a Java-based library management application using object-oriented programming principles.</w:t>
+      </w:r>
+    </w:p>
+    <w:p>
+      <w:pPr>
+        <w:rPr>
+          <w:lang w:val="en-US" w:eastAsia="tr-TR"/>
+        </w:rPr>
+      </w:pPr>
+    </w:p>
+    <w:p>
+      <w:pPr>
         <w:rPr>
           <w:b/>
           <w:bCs/>
           <w:lang w:val="en-US" w:eastAsia="tr-TR"/>
         </w:rPr>
-        <w:t>Designed a segmented office network in Cisco Packet Tracer using VLANs, DHCP, NAT, ACLs, and SSH.</w:t>
-      </w:r>
-    </w:p>
-    <w:p>
-      <w:pPr>
+      </w:pPr>
+      <w:r>
         <w:rPr>
           <w:b/>
           <w:bCs/>
           <w:lang w:val="en-US" w:eastAsia="tr-TR"/>
         </w:rPr>
-      </w:pPr>
+        <w:t>Social activities:</w:t>
+      </w:r>
     </w:p>
     <w:p>
       <w:pPr>
@@ -16565,7 +15689,7 @@
           <w:bCs/>
           <w:lang w:val="en-US" w:eastAsia="tr-TR"/>
         </w:rPr>
-        <w:t>Statistical Analysis of Student Performance</w:t>
+        <w:t>Data Science Core Team Member - IT Club</w:t>
       </w:r>
     </w:p>
     <w:p>
@@ -16582,7 +15706,7 @@
           <w:bCs/>
           <w:lang w:val="en-US" w:eastAsia="tr-TR"/>
         </w:rPr>
-        <w:t>Applied descriptive statistics, correlation analysis, hypothesis testing, and multiple linear regression.</w:t>
+        <w:t>Istanbul, Türkiye | 2021 - Present</w:t>
       </w:r>
     </w:p>
     <w:p>
@@ -16593,44 +15717,31 @@
           <w:lang w:val="en-US" w:eastAsia="tr-TR"/>
         </w:rPr>
       </w:pPr>
-    </w:p>
-    <w:p>
-      <w:pPr>
+      <w:r>
         <w:rPr>
           <w:b/>
           <w:bCs/>
           <w:lang w:val="en-US" w:eastAsia="tr-TR"/>
         </w:rPr>
-      </w:pPr>
-      <w:r>
+        <w:t>Supported the planning and delivery of student-focused data science workshops and technical sessions. Assisted with dataset preparation, coordination, and content organization for club activities.</w:t>
+      </w:r>
+    </w:p>
+    <w:p>
+      <w:pPr>
         <w:rPr>
           <w:b/>
           <w:bCs/>
           <w:lang w:val="en-US" w:eastAsia="tr-TR"/>
         </w:rPr>
-        <w:t>Library Management System</w:t>
-      </w:r>
-    </w:p>
-    <w:p>
-      <w:pPr>
-        <w:rPr>
-          <w:lang w:val="en-US" w:eastAsia="tr-TR"/>
-        </w:rPr>
-      </w:pPr>
-      <w:r>
+      </w:pPr>
+    </w:p>
+    <w:p>
+      <w:pPr>
         <w:rPr>
           <w:b/>
           <w:bCs/>
           <w:lang w:val="en-US" w:eastAsia="tr-TR"/>
         </w:rPr>
-        <w:t>Developed a Java-based library management application using object-oriented programming principles.</w:t>
-      </w:r>
-    </w:p>
-    <w:p>
-      <w:pPr>
-        <w:rPr>
-          <w:lang w:val="en-US" w:eastAsia="tr-TR"/>
-        </w:rPr>
       </w:pPr>
     </w:p>
     <w:p>
@@ -16641,14 +15752,15 @@
           <w:lang w:val="en-US" w:eastAsia="tr-TR"/>
         </w:rPr>
       </w:pPr>
-      <w:r>
+    </w:p>
+    <w:p>
+      <w:pPr>
         <w:rPr>
           <w:b/>
           <w:bCs/>
           <w:lang w:val="en-US" w:eastAsia="tr-TR"/>
         </w:rPr>
-        <w:t>Social activities:</w:t>
-      </w:r>
+      </w:pPr>
     </w:p>
     <w:p>
       <w:pPr>
@@ -16664,66 +15776,9 @@
           <w:bCs/>
           <w:lang w:val="en-US" w:eastAsia="tr-TR"/>
         </w:rPr>
-        <w:t>Data Science Core Team Member - IT Club</w:t>
-      </w:r>
-    </w:p>
-    <w:p>
-      <w:pPr>
-        <w:rPr>
-          <w:b/>
-          <w:bCs/>
-          <w:lang w:val="en-US" w:eastAsia="tr-TR"/>
-        </w:rPr>
-      </w:pPr>
-      <w:r>
-        <w:rPr>
-          <w:b/>
-          <w:bCs/>
-          <w:lang w:val="en-US" w:eastAsia="tr-TR"/>
-        </w:rPr>
-        <w:t>Istanbul, Türkiye | 2021 - Present</w:t>
-      </w:r>
-    </w:p>
-    <w:p>
-      <w:pPr>
-        <w:rPr>
-          <w:b/>
-          <w:bCs/>
-          <w:lang w:val="en-US" w:eastAsia="tr-TR"/>
-        </w:rPr>
-      </w:pPr>
-      <w:r>
-        <w:rPr>
-          <w:b/>
-          <w:bCs/>
-          <w:lang w:val="en-US" w:eastAsia="tr-TR"/>
-        </w:rPr>
-        <w:t>Supported the planning and delivery of student-focused data science workshops and technical sessions. Assisted with dataset preparation, coordination, and content organization for club activities.</w:t>
-      </w:r>
-    </w:p>
-    <w:p>
-      <w:pPr>
-        <w:rPr>
-          <w:b/>
-          <w:bCs/>
-          <w:lang w:val="en-US" w:eastAsia="tr-TR"/>
-        </w:rPr>
-      </w:pPr>
-      <w:r>
-        <w:rPr>
-          <w:b/>
-          <w:bCs/>
-          <w:lang w:val="en-US" w:eastAsia="tr-TR"/>
-        </w:rPr>
+        <w:lastRenderedPageBreak/>
         <w:t>Personal Information:</w:t>
       </w:r>
-    </w:p>
-    <w:p>
-      <w:pPr>
-        <w:rPr>
-          <w:lang w:val="en-US" w:eastAsia="tr-TR"/>
-        </w:rPr>
-      </w:pPr>
     </w:p>
     <w:tbl>
       <w:tblPr>
@@ -16822,18 +15877,8 @@
                 <w:bCs/>
                 <w:lang w:val="en-US" w:eastAsia="tr-TR"/>
               </w:rPr>
-              <w:t xml:space="preserve"> 10.06.2002 </w:t>
-            </w:r>
-            <w:proofErr w:type="spellStart"/>
-            <w:r>
-              <w:rPr>
-                <w:b/>
-                <w:bCs/>
-                <w:lang w:val="en-US" w:eastAsia="tr-TR"/>
-              </w:rPr>
-              <w:t>Düzce</w:t>
-            </w:r>
-            <w:proofErr w:type="spellEnd"/>
+              <w:t xml:space="preserve"> 10.06.2002 Düzce</w:t>
+            </w:r>
           </w:p>
         </w:tc>
         <w:tc>
@@ -17030,26 +16075,8 @@
                 <w:bCs/>
                 <w:lang w:val="en-US" w:eastAsia="tr-TR"/>
               </w:rPr>
-              <w:t xml:space="preserve"> </w:t>
-            </w:r>
-            <w:r>
-              <w:rPr>
-                <w:b/>
-                <w:bCs/>
-                <w:lang w:val="en-US" w:eastAsia="tr-TR"/>
-              </w:rPr>
-              <w:t>linkedin.com/in/</w:t>
-            </w:r>
-            <w:proofErr w:type="spellStart"/>
-            <w:r>
-              <w:rPr>
-                <w:b/>
-                <w:bCs/>
-                <w:lang w:val="en-US" w:eastAsia="tr-TR"/>
-              </w:rPr>
-              <w:t>gulsedolunayunlu</w:t>
-            </w:r>
-            <w:proofErr w:type="spellEnd"/>
+              <w:t xml:space="preserve"> linkedin.com/in/gulsedolunayunlu</w:t>
+            </w:r>
           </w:p>
         </w:tc>
         <w:tc>
@@ -17277,15 +16304,7 @@
       <w:t>South African Journal of Industrial Engineering</w:t>
     </w:r>
     <w:r>
-      <w:t xml:space="preserve"> Month Year Vol _</w:t>
-    </w:r>
-    <w:proofErr w:type="gramStart"/>
-    <w:r>
-      <w:t>_(</w:t>
-    </w:r>
-    <w:proofErr w:type="gramEnd"/>
-    <w:r>
-      <w:t>_):  p1-3</w:t>
+      <w:t xml:space="preserve"> Month Year Vol __(_):  p1-3</w:t>
     </w:r>
   </w:p>
 </w:ftr>
@@ -18294,6 +17313,118 @@
     </w:lvl>
   </w:abstractNum>
   <w:abstractNum w:abstractNumId="9" w15:restartNumberingAfterBreak="0">
+    <w:nsid w:val="543E1B3C"/>
+    <w:multiLevelType w:val="hybridMultilevel"/>
+    <w:tmpl w:val="0ADA918C"/>
+    <w:lvl w:ilvl="0" w:tplc="A2BC961A">
+      <w:numFmt w:val="bullet"/>
+      <w:lvlText w:val=""/>
+      <w:lvlJc w:val="left"/>
+      <w:pPr>
+        <w:ind w:left="720" w:hanging="360"/>
+      </w:pPr>
+      <w:rPr>
+        <w:rFonts w:ascii="Symbol" w:eastAsiaTheme="minorEastAsia" w:hAnsi="Symbol" w:cs="Times New Roman" w:hint="default"/>
+      </w:rPr>
+    </w:lvl>
+    <w:lvl w:ilvl="1" w:tplc="04090003" w:tentative="1">
+      <w:start w:val="1"/>
+      <w:numFmt w:val="bullet"/>
+      <w:lvlText w:val="o"/>
+      <w:lvlJc w:val="left"/>
+      <w:pPr>
+        <w:ind w:left="1440" w:hanging="360"/>
+      </w:pPr>
+      <w:rPr>
+        <w:rFonts w:ascii="Courier New" w:hAnsi="Courier New" w:cs="Courier New" w:hint="default"/>
+      </w:rPr>
+    </w:lvl>
+    <w:lvl w:ilvl="2" w:tplc="04090005" w:tentative="1">
+      <w:start w:val="1"/>
+      <w:numFmt w:val="bullet"/>
+      <w:lvlText w:val=""/>
+      <w:lvlJc w:val="left"/>
+      <w:pPr>
+        <w:ind w:left="2160" w:hanging="360"/>
+      </w:pPr>
+      <w:rPr>
+        <w:rFonts w:ascii="Wingdings" w:hAnsi="Wingdings" w:hint="default"/>
+      </w:rPr>
+    </w:lvl>
+    <w:lvl w:ilvl="3" w:tplc="04090001" w:tentative="1">
+      <w:start w:val="1"/>
+      <w:numFmt w:val="bullet"/>
+      <w:lvlText w:val=""/>
+      <w:lvlJc w:val="left"/>
+      <w:pPr>
+        <w:ind w:left="2880" w:hanging="360"/>
+      </w:pPr>
+      <w:rPr>
+        <w:rFonts w:ascii="Symbol" w:hAnsi="Symbol" w:hint="default"/>
+      </w:rPr>
+    </w:lvl>
+    <w:lvl w:ilvl="4" w:tplc="04090003" w:tentative="1">
+      <w:start w:val="1"/>
+      <w:numFmt w:val="bullet"/>
+      <w:lvlText w:val="o"/>
+      <w:lvlJc w:val="left"/>
+      <w:pPr>
+        <w:ind w:left="3600" w:hanging="360"/>
+      </w:pPr>
+      <w:rPr>
+        <w:rFonts w:ascii="Courier New" w:hAnsi="Courier New" w:cs="Courier New" w:hint="default"/>
+      </w:rPr>
+    </w:lvl>
+    <w:lvl w:ilvl="5" w:tplc="04090005" w:tentative="1">
+      <w:start w:val="1"/>
+      <w:numFmt w:val="bullet"/>
+      <w:lvlText w:val=""/>
+      <w:lvlJc w:val="left"/>
+      <w:pPr>
+        <w:ind w:left="4320" w:hanging="360"/>
+      </w:pPr>
+      <w:rPr>
+        <w:rFonts w:ascii="Wingdings" w:hAnsi="Wingdings" w:hint="default"/>
+      </w:rPr>
+    </w:lvl>
+    <w:lvl w:ilvl="6" w:tplc="04090001" w:tentative="1">
+      <w:start w:val="1"/>
+      <w:numFmt w:val="bullet"/>
+      <w:lvlText w:val=""/>
+      <w:lvlJc w:val="left"/>
+      <w:pPr>
+        <w:ind w:left="5040" w:hanging="360"/>
+      </w:pPr>
+      <w:rPr>
+        <w:rFonts w:ascii="Symbol" w:hAnsi="Symbol" w:hint="default"/>
+      </w:rPr>
+    </w:lvl>
+    <w:lvl w:ilvl="7" w:tplc="04090003" w:tentative="1">
+      <w:start w:val="1"/>
+      <w:numFmt w:val="bullet"/>
+      <w:lvlText w:val="o"/>
+      <w:lvlJc w:val="left"/>
+      <w:pPr>
+        <w:ind w:left="5760" w:hanging="360"/>
+      </w:pPr>
+      <w:rPr>
+        <w:rFonts w:ascii="Courier New" w:hAnsi="Courier New" w:cs="Courier New" w:hint="default"/>
+      </w:rPr>
+    </w:lvl>
+    <w:lvl w:ilvl="8" w:tplc="04090005" w:tentative="1">
+      <w:start w:val="1"/>
+      <w:numFmt w:val="bullet"/>
+      <w:lvlText w:val=""/>
+      <w:lvlJc w:val="left"/>
+      <w:pPr>
+        <w:ind w:left="6480" w:hanging="360"/>
+      </w:pPr>
+      <w:rPr>
+        <w:rFonts w:ascii="Wingdings" w:hAnsi="Wingdings" w:hint="default"/>
+      </w:rPr>
+    </w:lvl>
+  </w:abstractNum>
+  <w:abstractNum w:abstractNumId="10" w15:restartNumberingAfterBreak="0">
     <w:nsid w:val="5A3E457E"/>
     <w:multiLevelType w:val="hybridMultilevel"/>
     <w:tmpl w:val="6B88D5B2"/>
@@ -18406,7 +17537,7 @@
       </w:rPr>
     </w:lvl>
   </w:abstractNum>
-  <w:abstractNum w:abstractNumId="10" w15:restartNumberingAfterBreak="0">
+  <w:abstractNum w:abstractNumId="11" w15:restartNumberingAfterBreak="0">
     <w:nsid w:val="5AF10DC1"/>
     <w:multiLevelType w:val="multilevel"/>
     <w:tmpl w:val="1C090025"/>
@@ -18501,7 +17632,7 @@
       </w:pPr>
     </w:lvl>
   </w:abstractNum>
-  <w:abstractNum w:abstractNumId="11" w15:restartNumberingAfterBreak="0">
+  <w:abstractNum w:abstractNumId="12" w15:restartNumberingAfterBreak="0">
     <w:nsid w:val="6EA32AA4"/>
     <w:multiLevelType w:val="hybridMultilevel"/>
     <w:tmpl w:val="3BBAACA6"/>
@@ -18614,7 +17745,119 @@
       </w:rPr>
     </w:lvl>
   </w:abstractNum>
-  <w:abstractNum w:abstractNumId="12" w15:restartNumberingAfterBreak="0">
+  <w:abstractNum w:abstractNumId="13" w15:restartNumberingAfterBreak="0">
+    <w:nsid w:val="70C80920"/>
+    <w:multiLevelType w:val="hybridMultilevel"/>
+    <w:tmpl w:val="B3BE11DE"/>
+    <w:lvl w:ilvl="0" w:tplc="E13EC46A">
+      <w:numFmt w:val="bullet"/>
+      <w:lvlText w:val=""/>
+      <w:lvlJc w:val="left"/>
+      <w:pPr>
+        <w:ind w:left="720" w:hanging="360"/>
+      </w:pPr>
+      <w:rPr>
+        <w:rFonts w:ascii="Symbol" w:eastAsiaTheme="minorEastAsia" w:hAnsi="Symbol" w:cs="Times New Roman" w:hint="default"/>
+      </w:rPr>
+    </w:lvl>
+    <w:lvl w:ilvl="1" w:tplc="04090003" w:tentative="1">
+      <w:start w:val="1"/>
+      <w:numFmt w:val="bullet"/>
+      <w:lvlText w:val="o"/>
+      <w:lvlJc w:val="left"/>
+      <w:pPr>
+        <w:ind w:left="1440" w:hanging="360"/>
+      </w:pPr>
+      <w:rPr>
+        <w:rFonts w:ascii="Courier New" w:hAnsi="Courier New" w:cs="Courier New" w:hint="default"/>
+      </w:rPr>
+    </w:lvl>
+    <w:lvl w:ilvl="2" w:tplc="04090005" w:tentative="1">
+      <w:start w:val="1"/>
+      <w:numFmt w:val="bullet"/>
+      <w:lvlText w:val=""/>
+      <w:lvlJc w:val="left"/>
+      <w:pPr>
+        <w:ind w:left="2160" w:hanging="360"/>
+      </w:pPr>
+      <w:rPr>
+        <w:rFonts w:ascii="Wingdings" w:hAnsi="Wingdings" w:hint="default"/>
+      </w:rPr>
+    </w:lvl>
+    <w:lvl w:ilvl="3" w:tplc="04090001" w:tentative="1">
+      <w:start w:val="1"/>
+      <w:numFmt w:val="bullet"/>
+      <w:lvlText w:val=""/>
+      <w:lvlJc w:val="left"/>
+      <w:pPr>
+        <w:ind w:left="2880" w:hanging="360"/>
+      </w:pPr>
+      <w:rPr>
+        <w:rFonts w:ascii="Symbol" w:hAnsi="Symbol" w:hint="default"/>
+      </w:rPr>
+    </w:lvl>
+    <w:lvl w:ilvl="4" w:tplc="04090003" w:tentative="1">
+      <w:start w:val="1"/>
+      <w:numFmt w:val="bullet"/>
+      <w:lvlText w:val="o"/>
+      <w:lvlJc w:val="left"/>
+      <w:pPr>
+        <w:ind w:left="3600" w:hanging="360"/>
+      </w:pPr>
+      <w:rPr>
+        <w:rFonts w:ascii="Courier New" w:hAnsi="Courier New" w:cs="Courier New" w:hint="default"/>
+      </w:rPr>
+    </w:lvl>
+    <w:lvl w:ilvl="5" w:tplc="04090005" w:tentative="1">
+      <w:start w:val="1"/>
+      <w:numFmt w:val="bullet"/>
+      <w:lvlText w:val=""/>
+      <w:lvlJc w:val="left"/>
+      <w:pPr>
+        <w:ind w:left="4320" w:hanging="360"/>
+      </w:pPr>
+      <w:rPr>
+        <w:rFonts w:ascii="Wingdings" w:hAnsi="Wingdings" w:hint="default"/>
+      </w:rPr>
+    </w:lvl>
+    <w:lvl w:ilvl="6" w:tplc="04090001" w:tentative="1">
+      <w:start w:val="1"/>
+      <w:numFmt w:val="bullet"/>
+      <w:lvlText w:val=""/>
+      <w:lvlJc w:val="left"/>
+      <w:pPr>
+        <w:ind w:left="5040" w:hanging="360"/>
+      </w:pPr>
+      <w:rPr>
+        <w:rFonts w:ascii="Symbol" w:hAnsi="Symbol" w:hint="default"/>
+      </w:rPr>
+    </w:lvl>
+    <w:lvl w:ilvl="7" w:tplc="04090003" w:tentative="1">
+      <w:start w:val="1"/>
+      <w:numFmt w:val="bullet"/>
+      <w:lvlText w:val="o"/>
+      <w:lvlJc w:val="left"/>
+      <w:pPr>
+        <w:ind w:left="5760" w:hanging="360"/>
+      </w:pPr>
+      <w:rPr>
+        <w:rFonts w:ascii="Courier New" w:hAnsi="Courier New" w:cs="Courier New" w:hint="default"/>
+      </w:rPr>
+    </w:lvl>
+    <w:lvl w:ilvl="8" w:tplc="04090005" w:tentative="1">
+      <w:start w:val="1"/>
+      <w:numFmt w:val="bullet"/>
+      <w:lvlText w:val=""/>
+      <w:lvlJc w:val="left"/>
+      <w:pPr>
+        <w:ind w:left="6480" w:hanging="360"/>
+      </w:pPr>
+      <w:rPr>
+        <w:rFonts w:ascii="Wingdings" w:hAnsi="Wingdings" w:hint="default"/>
+      </w:rPr>
+    </w:lvl>
+  </w:abstractNum>
+  <w:abstractNum w:abstractNumId="14" w15:restartNumberingAfterBreak="0">
     <w:nsid w:val="77B81D60"/>
     <w:multiLevelType w:val="hybridMultilevel"/>
     <w:tmpl w:val="5FA821A6"/>
@@ -18727,7 +17970,7 @@
       </w:rPr>
     </w:lvl>
   </w:abstractNum>
-  <w:abstractNum w:abstractNumId="13" w15:restartNumberingAfterBreak="0">
+  <w:abstractNum w:abstractNumId="15" w15:restartNumberingAfterBreak="0">
     <w:nsid w:val="783011C0"/>
     <w:multiLevelType w:val="hybridMultilevel"/>
     <w:tmpl w:val="32E4DFC8"/>
@@ -18813,7 +18056,119 @@
       </w:pPr>
     </w:lvl>
   </w:abstractNum>
-  <w:abstractNum w:abstractNumId="14" w15:restartNumberingAfterBreak="0">
+  <w:abstractNum w:abstractNumId="16" w15:restartNumberingAfterBreak="0">
+    <w:nsid w:val="78441B2A"/>
+    <w:multiLevelType w:val="hybridMultilevel"/>
+    <w:tmpl w:val="C4F2FF3E"/>
+    <w:lvl w:ilvl="0" w:tplc="CC020FA0">
+      <w:numFmt w:val="bullet"/>
+      <w:lvlText w:val="-"/>
+      <w:lvlJc w:val="left"/>
+      <w:pPr>
+        <w:ind w:left="720" w:hanging="360"/>
+      </w:pPr>
+      <w:rPr>
+        <w:rFonts w:ascii="Trebuchet MS" w:eastAsiaTheme="minorEastAsia" w:hAnsi="Trebuchet MS" w:cs="Times New Roman" w:hint="default"/>
+      </w:rPr>
+    </w:lvl>
+    <w:lvl w:ilvl="1" w:tplc="04090003" w:tentative="1">
+      <w:start w:val="1"/>
+      <w:numFmt w:val="bullet"/>
+      <w:lvlText w:val="o"/>
+      <w:lvlJc w:val="left"/>
+      <w:pPr>
+        <w:ind w:left="1440" w:hanging="360"/>
+      </w:pPr>
+      <w:rPr>
+        <w:rFonts w:ascii="Courier New" w:hAnsi="Courier New" w:cs="Courier New" w:hint="default"/>
+      </w:rPr>
+    </w:lvl>
+    <w:lvl w:ilvl="2" w:tplc="04090005" w:tentative="1">
+      <w:start w:val="1"/>
+      <w:numFmt w:val="bullet"/>
+      <w:lvlText w:val=""/>
+      <w:lvlJc w:val="left"/>
+      <w:pPr>
+        <w:ind w:left="2160" w:hanging="360"/>
+      </w:pPr>
+      <w:rPr>
+        <w:rFonts w:ascii="Wingdings" w:hAnsi="Wingdings" w:hint="default"/>
+      </w:rPr>
+    </w:lvl>
+    <w:lvl w:ilvl="3" w:tplc="04090001" w:tentative="1">
+      <w:start w:val="1"/>
+      <w:numFmt w:val="bullet"/>
+      <w:lvlText w:val=""/>
+      <w:lvlJc w:val="left"/>
+      <w:pPr>
+        <w:ind w:left="2880" w:hanging="360"/>
+      </w:pPr>
+      <w:rPr>
+        <w:rFonts w:ascii="Symbol" w:hAnsi="Symbol" w:hint="default"/>
+      </w:rPr>
+    </w:lvl>
+    <w:lvl w:ilvl="4" w:tplc="04090003" w:tentative="1">
+      <w:start w:val="1"/>
+      <w:numFmt w:val="bullet"/>
+      <w:lvlText w:val="o"/>
+      <w:lvlJc w:val="left"/>
+      <w:pPr>
+        <w:ind w:left="3600" w:hanging="360"/>
+      </w:pPr>
+      <w:rPr>
+        <w:rFonts w:ascii="Courier New" w:hAnsi="Courier New" w:cs="Courier New" w:hint="default"/>
+      </w:rPr>
+    </w:lvl>
+    <w:lvl w:ilvl="5" w:tplc="04090005" w:tentative="1">
+      <w:start w:val="1"/>
+      <w:numFmt w:val="bullet"/>
+      <w:lvlText w:val=""/>
+      <w:lvlJc w:val="left"/>
+      <w:pPr>
+        <w:ind w:left="4320" w:hanging="360"/>
+      </w:pPr>
+      <w:rPr>
+        <w:rFonts w:ascii="Wingdings" w:hAnsi="Wingdings" w:hint="default"/>
+      </w:rPr>
+    </w:lvl>
+    <w:lvl w:ilvl="6" w:tplc="04090001" w:tentative="1">
+      <w:start w:val="1"/>
+      <w:numFmt w:val="bullet"/>
+      <w:lvlText w:val=""/>
+      <w:lvlJc w:val="left"/>
+      <w:pPr>
+        <w:ind w:left="5040" w:hanging="360"/>
+      </w:pPr>
+      <w:rPr>
+        <w:rFonts w:ascii="Symbol" w:hAnsi="Symbol" w:hint="default"/>
+      </w:rPr>
+    </w:lvl>
+    <w:lvl w:ilvl="7" w:tplc="04090003" w:tentative="1">
+      <w:start w:val="1"/>
+      <w:numFmt w:val="bullet"/>
+      <w:lvlText w:val="o"/>
+      <w:lvlJc w:val="left"/>
+      <w:pPr>
+        <w:ind w:left="5760" w:hanging="360"/>
+      </w:pPr>
+      <w:rPr>
+        <w:rFonts w:ascii="Courier New" w:hAnsi="Courier New" w:cs="Courier New" w:hint="default"/>
+      </w:rPr>
+    </w:lvl>
+    <w:lvl w:ilvl="8" w:tplc="04090005" w:tentative="1">
+      <w:start w:val="1"/>
+      <w:numFmt w:val="bullet"/>
+      <w:lvlText w:val=""/>
+      <w:lvlJc w:val="left"/>
+      <w:pPr>
+        <w:ind w:left="6480" w:hanging="360"/>
+      </w:pPr>
+      <w:rPr>
+        <w:rFonts w:ascii="Wingdings" w:hAnsi="Wingdings" w:hint="default"/>
+      </w:rPr>
+    </w:lvl>
+  </w:abstractNum>
+  <w:abstractNum w:abstractNumId="17" w15:restartNumberingAfterBreak="0">
     <w:nsid w:val="7EA12BE1"/>
     <w:multiLevelType w:val="hybridMultilevel"/>
     <w:tmpl w:val="00DEB57C"/>
@@ -18957,7 +18312,7 @@
     <w:abstractNumId w:val="3"/>
   </w:num>
   <w:num w:numId="2" w16cid:durableId="2106874206">
-    <w:abstractNumId w:val="10"/>
+    <w:abstractNumId w:val="11"/>
   </w:num>
   <w:num w:numId="3" w16cid:durableId="400102106">
     <w:abstractNumId w:val="8"/>
@@ -18975,22 +18330,22 @@
     <w:abstractNumId w:val="6"/>
   </w:num>
   <w:num w:numId="8" w16cid:durableId="971791317">
-    <w:abstractNumId w:val="9"/>
+    <w:abstractNumId w:val="10"/>
   </w:num>
   <w:num w:numId="9" w16cid:durableId="996418795">
-    <w:abstractNumId w:val="13"/>
+    <w:abstractNumId w:val="15"/>
   </w:num>
   <w:num w:numId="10" w16cid:durableId="1249121052">
-    <w:abstractNumId w:val="14"/>
+    <w:abstractNumId w:val="17"/>
   </w:num>
   <w:num w:numId="11" w16cid:durableId="862935647">
     <w:abstractNumId w:val="1"/>
   </w:num>
   <w:num w:numId="12" w16cid:durableId="239868843">
-    <w:abstractNumId w:val="11"/>
+    <w:abstractNumId w:val="12"/>
   </w:num>
   <w:num w:numId="13" w16cid:durableId="2005158397">
-    <w:abstractNumId w:val="10"/>
+    <w:abstractNumId w:val="11"/>
     <w:lvlOverride w:ilvl="0">
       <w:startOverride w:val="1"/>
     </w:lvlOverride>
@@ -19023,16 +18378,25 @@
     <w:abstractNumId w:val="2"/>
   </w:num>
   <w:num w:numId="15" w16cid:durableId="629480171">
-    <w:abstractNumId w:val="12"/>
+    <w:abstractNumId w:val="14"/>
   </w:num>
   <w:num w:numId="16" w16cid:durableId="1726946206">
-    <w:abstractNumId w:val="10"/>
+    <w:abstractNumId w:val="11"/>
   </w:num>
   <w:num w:numId="17" w16cid:durableId="883904642">
-    <w:abstractNumId w:val="10"/>
+    <w:abstractNumId w:val="11"/>
   </w:num>
   <w:num w:numId="18" w16cid:durableId="1246963691">
     <w:abstractNumId w:val="4"/>
+  </w:num>
+  <w:num w:numId="19" w16cid:durableId="1244027685">
+    <w:abstractNumId w:val="16"/>
+  </w:num>
+  <w:num w:numId="20" w16cid:durableId="799112912">
+    <w:abstractNumId w:val="9"/>
+  </w:num>
+  <w:num w:numId="21" w16cid:durableId="1563783768">
+    <w:abstractNumId w:val="13"/>
   </w:num>
   <w:numIdMacAtCleanup w:val="5"/>
 </w:numbering>
@@ -19632,6 +18996,7 @@
   <w:style w:type="character" w:default="1" w:styleId="DefaultParagraphFont">
     <w:name w:val="Default Paragraph Font"/>
     <w:uiPriority w:val="1"/>
+    <w:semiHidden/>
     <w:unhideWhenUsed/>
   </w:style>
   <w:style w:type="table" w:default="1" w:styleId="TableNormal">

</xml_diff>

<commit_message>
Fixing thesis report and README formatting
</commit_message>
<xml_diff>
--- a/docs/graduation_thesis_report.docx
+++ b/docs/graduation_thesis_report.docx
@@ -305,6 +305,7 @@
           <w:lang w:val="en-US"/>
         </w:rPr>
       </w:pPr>
+      <w:proofErr w:type="spellStart"/>
       <w:r>
         <w:rPr>
           <w:b/>
@@ -313,12 +314,10 @@
           <w:szCs w:val="32"/>
           <w:lang w:val="en-US"/>
         </w:rPr>
-        <w:t>Gülse Dolunay ÜNLÜ</w:t>
-      </w:r>
-    </w:p>
-    <w:p>
-      <w:pPr>
-        <w:jc w:val="center"/>
+        <w:t>Gülse</w:t>
+      </w:r>
+      <w:proofErr w:type="spellEnd"/>
+      <w:r>
         <w:rPr>
           <w:b/>
           <w:color w:val="000000" w:themeColor="text1"/>
@@ -326,8 +325,12 @@
           <w:szCs w:val="32"/>
           <w:lang w:val="en-US"/>
         </w:rPr>
-      </w:pPr>
-      <w:r>
+        <w:t xml:space="preserve"> Dolunay ÜNLÜ</w:t>
+      </w:r>
+    </w:p>
+    <w:p>
+      <w:pPr>
+        <w:jc w:val="center"/>
         <w:rPr>
           <w:b/>
           <w:color w:val="000000" w:themeColor="text1"/>
@@ -335,6 +338,15 @@
           <w:szCs w:val="32"/>
           <w:lang w:val="en-US"/>
         </w:rPr>
+      </w:pPr>
+      <w:r>
+        <w:rPr>
+          <w:b/>
+          <w:color w:val="000000" w:themeColor="text1"/>
+          <w:sz w:val="32"/>
+          <w:szCs w:val="32"/>
+          <w:lang w:val="en-US"/>
+        </w:rPr>
         <w:t>20210305007</w:t>
       </w:r>
     </w:p>
@@ -403,71 +415,7 @@
           <w:szCs w:val="32"/>
           <w:lang w:val="en-US"/>
         </w:rPr>
-        <w:t>Doç. Dr. Orhan Özgür AYBAR</w:t>
-      </w:r>
-    </w:p>
-    <w:p>
-      <w:pPr>
-        <w:jc w:val="center"/>
-        <w:rPr>
-          <w:bCs/>
-          <w:sz w:val="32"/>
-          <w:szCs w:val="32"/>
-          <w:lang w:val="en-US"/>
-        </w:rPr>
-      </w:pPr>
-    </w:p>
-    <w:p>
-      <w:pPr>
-        <w:jc w:val="center"/>
-        <w:rPr>
-          <w:bCs/>
-          <w:sz w:val="32"/>
-          <w:szCs w:val="32"/>
-          <w:lang w:val="en-US"/>
-        </w:rPr>
-      </w:pPr>
-    </w:p>
-    <w:p>
-      <w:pPr>
-        <w:jc w:val="center"/>
-        <w:rPr>
-          <w:bCs/>
-          <w:sz w:val="32"/>
-          <w:szCs w:val="32"/>
-          <w:lang w:val="en-US"/>
-        </w:rPr>
-      </w:pPr>
-    </w:p>
-    <w:p>
-      <w:pPr>
-        <w:jc w:val="center"/>
-        <w:rPr>
-          <w:bCs/>
-          <w:sz w:val="32"/>
-          <w:szCs w:val="32"/>
-          <w:lang w:val="en-US"/>
-        </w:rPr>
-      </w:pPr>
-    </w:p>
-    <w:p>
-      <w:pPr>
-        <w:jc w:val="center"/>
-        <w:rPr>
-          <w:bCs/>
-          <w:sz w:val="32"/>
-          <w:szCs w:val="32"/>
-          <w:lang w:val="en-US"/>
-        </w:rPr>
-      </w:pPr>
-      <w:r>
-        <w:rPr>
-          <w:bCs/>
-          <w:sz w:val="32"/>
-          <w:szCs w:val="32"/>
-          <w:lang w:val="en-US"/>
-        </w:rPr>
-        <w:t xml:space="preserve">İstanbul </w:t>
+        <w:t>Assoc</w:t>
       </w:r>
       <w:r>
         <w:rPr>
@@ -477,7 +425,7 @@
           <w:szCs w:val="32"/>
           <w:lang w:val="en-US"/>
         </w:rPr>
-        <w:t>May, 202</w:t>
+        <w:t>.</w:t>
       </w:r>
       <w:r>
         <w:rPr>
@@ -487,6 +435,100 @@
           <w:szCs w:val="32"/>
           <w:lang w:val="en-US"/>
         </w:rPr>
+        <w:t xml:space="preserve"> Prof.</w:t>
+      </w:r>
+      <w:r>
+        <w:rPr>
+          <w:bCs/>
+          <w:color w:val="000000" w:themeColor="text1"/>
+          <w:sz w:val="32"/>
+          <w:szCs w:val="32"/>
+          <w:lang w:val="en-US"/>
+        </w:rPr>
+        <w:t xml:space="preserve"> Dr. Orhan Özgür AYBAR</w:t>
+      </w:r>
+    </w:p>
+    <w:p>
+      <w:pPr>
+        <w:jc w:val="center"/>
+        <w:rPr>
+          <w:bCs/>
+          <w:sz w:val="32"/>
+          <w:szCs w:val="32"/>
+          <w:lang w:val="en-US"/>
+        </w:rPr>
+      </w:pPr>
+    </w:p>
+    <w:p>
+      <w:pPr>
+        <w:jc w:val="center"/>
+        <w:rPr>
+          <w:bCs/>
+          <w:sz w:val="32"/>
+          <w:szCs w:val="32"/>
+          <w:lang w:val="en-US"/>
+        </w:rPr>
+      </w:pPr>
+    </w:p>
+    <w:p>
+      <w:pPr>
+        <w:jc w:val="center"/>
+        <w:rPr>
+          <w:bCs/>
+          <w:sz w:val="32"/>
+          <w:szCs w:val="32"/>
+          <w:lang w:val="en-US"/>
+        </w:rPr>
+      </w:pPr>
+    </w:p>
+    <w:p>
+      <w:pPr>
+        <w:jc w:val="center"/>
+        <w:rPr>
+          <w:bCs/>
+          <w:sz w:val="32"/>
+          <w:szCs w:val="32"/>
+          <w:lang w:val="en-US"/>
+        </w:rPr>
+      </w:pPr>
+    </w:p>
+    <w:p>
+      <w:pPr>
+        <w:jc w:val="center"/>
+        <w:rPr>
+          <w:bCs/>
+          <w:sz w:val="32"/>
+          <w:szCs w:val="32"/>
+          <w:lang w:val="en-US"/>
+        </w:rPr>
+      </w:pPr>
+      <w:r>
+        <w:rPr>
+          <w:bCs/>
+          <w:sz w:val="32"/>
+          <w:szCs w:val="32"/>
+          <w:lang w:val="en-US"/>
+        </w:rPr>
+        <w:t xml:space="preserve">İstanbul </w:t>
+      </w:r>
+      <w:r>
+        <w:rPr>
+          <w:bCs/>
+          <w:color w:val="000000" w:themeColor="text1"/>
+          <w:sz w:val="32"/>
+          <w:szCs w:val="32"/>
+          <w:lang w:val="en-US"/>
+        </w:rPr>
+        <w:t>May, 202</w:t>
+      </w:r>
+      <w:r>
+        <w:rPr>
+          <w:bCs/>
+          <w:color w:val="000000" w:themeColor="text1"/>
+          <w:sz w:val="32"/>
+          <w:szCs w:val="32"/>
+          <w:lang w:val="en-US"/>
+        </w:rPr>
         <w:t>6</w:t>
       </w:r>
       <w:r>
@@ -500,13 +542,13 @@
       <w:pPr>
         <w:pStyle w:val="Introsections"/>
       </w:pPr>
-      <w:bookmarkStart w:id="2" w:name="_Toc230203414"/>
-      <w:bookmarkStart w:id="3" w:name="_Toc28126413"/>
+      <w:bookmarkStart w:id="2" w:name="_Toc28126413"/>
+      <w:bookmarkStart w:id="3" w:name="_Toc230426988"/>
       <w:r>
         <w:lastRenderedPageBreak/>
         <w:t>DECLARATION</w:t>
       </w:r>
-      <w:bookmarkEnd w:id="2"/>
+      <w:bookmarkEnd w:id="3"/>
       <w:r>
         <w:t xml:space="preserve"> </w:t>
       </w:r>
@@ -521,7 +563,35 @@
         <w:rPr>
           <w:lang w:val="en-US"/>
         </w:rPr>
-        <w:t>I hereby declare that this thesis represents my own work which has been done after registration for the degree of bachelor at Piri Reis University, and has not been previously included in a thesis or dissertation submitted to this or any other institution for a degree, diploma or other qualifications.</w:t>
+        <w:t xml:space="preserve">I hereby declare that this thesis represents my own work which has been done after registration for the </w:t>
+      </w:r>
+      <w:proofErr w:type="gramStart"/>
+      <w:r>
+        <w:rPr>
+          <w:lang w:val="en-US"/>
+        </w:rPr>
+        <w:t>degree of bachelor</w:t>
+      </w:r>
+      <w:proofErr w:type="gramEnd"/>
+      <w:r>
+        <w:rPr>
+          <w:lang w:val="en-US"/>
+        </w:rPr>
+        <w:t xml:space="preserve"> at Piri Reis </w:t>
+      </w:r>
+      <w:proofErr w:type="gramStart"/>
+      <w:r>
+        <w:rPr>
+          <w:lang w:val="en-US"/>
+        </w:rPr>
+        <w:t>University, and</w:t>
+      </w:r>
+      <w:proofErr w:type="gramEnd"/>
+      <w:r>
+        <w:rPr>
+          <w:lang w:val="en-US"/>
+        </w:rPr>
+        <w:t xml:space="preserve"> has not been previously included in a thesis or dissertation submitted to this or any other institution for a degree, diploma or other qualifications.</w:t>
       </w:r>
     </w:p>
     <w:p>
@@ -626,7 +696,7 @@
         </w:rPr>
       </w:pPr>
     </w:p>
-    <w:bookmarkEnd w:id="3"/>
+    <w:bookmarkEnd w:id="2"/>
     <w:p>
       <w:pPr>
         <w:rPr>
@@ -687,7 +757,7 @@
           <w:lang w:eastAsia="tr-TR"/>
         </w:rPr>
       </w:pPr>
-      <w:bookmarkStart w:id="4" w:name="_Toc230203415"/>
+      <w:bookmarkStart w:id="4" w:name="_Toc230426989"/>
       <w:r>
         <w:rPr>
           <w:lang w:eastAsia="tr-TR"/>
@@ -731,7 +801,31 @@
         <w:rPr>
           <w:lang w:val="en-US" w:eastAsia="tr-TR"/>
         </w:rPr>
-        <w:t>I would like to express my sincere gratitude to my advisor, Doç. Dr. Orhan Özgür AYBAR, for his guidance and support during this graduation thesis.</w:t>
+        <w:t xml:space="preserve">I would like to express my sincere gratitude to my advisor, </w:t>
+      </w:r>
+      <w:r>
+        <w:rPr>
+          <w:lang w:val="en-US" w:eastAsia="tr-TR"/>
+        </w:rPr>
+        <w:t>Assoc</w:t>
+      </w:r>
+      <w:r>
+        <w:rPr>
+          <w:lang w:val="en-US" w:eastAsia="tr-TR"/>
+        </w:rPr>
+        <w:t>.</w:t>
+      </w:r>
+      <w:r>
+        <w:rPr>
+          <w:lang w:val="en-US" w:eastAsia="tr-TR"/>
+        </w:rPr>
+        <w:t xml:space="preserve"> Prof.</w:t>
+      </w:r>
+      <w:r>
+        <w:rPr>
+          <w:lang w:val="en-US" w:eastAsia="tr-TR"/>
+        </w:rPr>
+        <w:t xml:space="preserve"> Dr. Orhan Özgür AYBAR, for his guidance and support during this graduation thesis.</w:t>
       </w:r>
     </w:p>
     <w:p>
@@ -1006,7 +1100,7 @@
       <w:pPr>
         <w:pStyle w:val="Introsections"/>
       </w:pPr>
-      <w:bookmarkStart w:id="5" w:name="_Toc230203416"/>
+      <w:bookmarkStart w:id="5" w:name="_Toc230426990"/>
       <w:r>
         <w:lastRenderedPageBreak/>
         <w:t>ABSTRACT</w:t>
@@ -1043,7 +1137,35 @@
           <w:lang w:val="en-US"/>
         </w:rPr>
         <w:br/>
-        <w:t>The platform was developed with Python and Streamlit. It uses the public DataCo Smart Supply Chain dataset as the default demonstration dataset. In addition, the system allows users to upload a new supply chain dataset in CSV or Excel format. The uploaded dataset can be mapped to a standard supply chain schema and then used dynamically across the dashboard pages. The platform includes modules for overview analysis, regional performance, inventory control, shipment performance, supply chain risk, and demand forecasting.</w:t>
+        <w:t xml:space="preserve">The platform was developed with Python and </w:t>
+      </w:r>
+      <w:proofErr w:type="spellStart"/>
+      <w:r>
+        <w:rPr>
+          <w:lang w:val="en-US"/>
+        </w:rPr>
+        <w:t>Streamlit</w:t>
+      </w:r>
+      <w:proofErr w:type="spellEnd"/>
+      <w:r>
+        <w:rPr>
+          <w:lang w:val="en-US"/>
+        </w:rPr>
+        <w:t xml:space="preserve">. It uses the public </w:t>
+      </w:r>
+      <w:proofErr w:type="spellStart"/>
+      <w:r>
+        <w:rPr>
+          <w:lang w:val="en-US"/>
+        </w:rPr>
+        <w:t>DataCo</w:t>
+      </w:r>
+      <w:proofErr w:type="spellEnd"/>
+      <w:r>
+        <w:rPr>
+          <w:lang w:val="en-US"/>
+        </w:rPr>
+        <w:t xml:space="preserve"> Smart Supply Chain dataset as the default demonstration dataset. In addition, the system allows users to upload a new supply chain dataset in CSV or Excel format. The uploaded dataset can be mapped to a standard supply chain schema and then used dynamically across the dashboard pages. The platform includes modules for overview analysis, regional performance, inventory control, shipment performance, supply chain risk, and demand forecasting.</w:t>
       </w:r>
     </w:p>
     <w:p>
@@ -1063,7 +1185,19 @@
           <w:lang w:val="en-US"/>
         </w:rPr>
         <w:br/>
-        <w:t>The main contribution of the project is that it is not limited to a single static dataset. Instead, it provides a reusable dashboard structure where different supply chain datasets can be standardized and analysed. The results show that a dataset-adaptive dashboard can improve visibility and help users identify delivery risks, inventory warnings, regional issues, and demand patterns from a single interface.</w:t>
+        <w:t xml:space="preserve">The main contribution of the project is that it is not limited to a single static dataset. Instead, it provides a reusable dashboard structure where different supply chain datasets can be standardized and </w:t>
+      </w:r>
+      <w:r>
+        <w:rPr>
+          <w:lang w:val="en-US"/>
+        </w:rPr>
+        <w:t>analyzed</w:t>
+      </w:r>
+      <w:r>
+        <w:rPr>
+          <w:lang w:val="en-US"/>
+        </w:rPr>
+        <w:t>. The results show that a dataset-adaptive dashboard can improve visibility and help users identify delivery risks, inventory warnings, regional issues, and demand patterns from a single interface.</w:t>
       </w:r>
     </w:p>
     <w:p>
@@ -1083,7 +1217,21 @@
           <w:lang w:val="en-US"/>
         </w:rPr>
         <w:br/>
-        <w:t>Key Words: Supply Chain Visibility, Risk Assessment, Data Standardization, Streamlit Dashboard, Business Intelligence, Demand Forecasting</w:t>
+        <w:t xml:space="preserve">Key Words: Supply Chain Visibility, Risk Assessment, Data Standardization, </w:t>
+      </w:r>
+      <w:proofErr w:type="spellStart"/>
+      <w:r>
+        <w:rPr>
+          <w:lang w:val="en-US"/>
+        </w:rPr>
+        <w:t>Streamlit</w:t>
+      </w:r>
+      <w:proofErr w:type="spellEnd"/>
+      <w:r>
+        <w:rPr>
+          <w:lang w:val="en-US"/>
+        </w:rPr>
+        <w:t xml:space="preserve"> Dashboard, Business Intelligence, Demand Forecasting</w:t>
       </w:r>
     </w:p>
     <w:p>
@@ -1132,7 +1280,7 @@
       <w:pPr>
         <w:pStyle w:val="Introsections"/>
       </w:pPr>
-      <w:bookmarkStart w:id="6" w:name="_Toc230203417"/>
+      <w:bookmarkStart w:id="6" w:name="_Toc230426991"/>
       <w:r>
         <w:lastRenderedPageBreak/>
         <w:t>TABLE OF CONTENTS</w:t>
@@ -1207,7 +1355,7 @@
             </w:rPr>
             <w:fldChar w:fldCharType="separate"/>
           </w:r>
-          <w:hyperlink w:anchor="_Toc230203414" w:history="1">
+          <w:hyperlink w:anchor="_Toc230426988" w:history="1">
             <w:r>
               <w:rPr>
                 <w:rStyle w:val="Hyperlink"/>
@@ -1234,7 +1382,7 @@
                 <w:noProof/>
                 <w:webHidden/>
               </w:rPr>
-              <w:instrText xml:space="preserve"> PAGEREF _Toc230203414 \h </w:instrText>
+              <w:instrText xml:space="preserve"> PAGEREF _Toc230426988 \h </w:instrText>
             </w:r>
             <w:r>
               <w:rPr>
@@ -1282,7 +1430,7 @@
               <w14:ligatures w14:val="standardContextual"/>
             </w:rPr>
           </w:pPr>
-          <w:hyperlink w:anchor="_Toc230203415" w:history="1">
+          <w:hyperlink w:anchor="_Toc230426989" w:history="1">
             <w:r>
               <w:rPr>
                 <w:rStyle w:val="Hyperlink"/>
@@ -1310,7 +1458,7 @@
                 <w:noProof/>
                 <w:webHidden/>
               </w:rPr>
-              <w:instrText xml:space="preserve"> PAGEREF _Toc230203415 \h </w:instrText>
+              <w:instrText xml:space="preserve"> PAGEREF _Toc230426989 \h </w:instrText>
             </w:r>
             <w:r>
               <w:rPr>
@@ -1358,7 +1506,7 @@
               <w14:ligatures w14:val="standardContextual"/>
             </w:rPr>
           </w:pPr>
-          <w:hyperlink w:anchor="_Toc230203416" w:history="1">
+          <w:hyperlink w:anchor="_Toc230426990" w:history="1">
             <w:r>
               <w:rPr>
                 <w:rStyle w:val="Hyperlink"/>
@@ -1385,7 +1533,7 @@
                 <w:noProof/>
                 <w:webHidden/>
               </w:rPr>
-              <w:instrText xml:space="preserve"> PAGEREF _Toc230203416 \h </w:instrText>
+              <w:instrText xml:space="preserve"> PAGEREF _Toc230426990 \h </w:instrText>
             </w:r>
             <w:r>
               <w:rPr>
@@ -1433,7 +1581,7 @@
               <w14:ligatures w14:val="standardContextual"/>
             </w:rPr>
           </w:pPr>
-          <w:hyperlink w:anchor="_Toc230203417" w:history="1">
+          <w:hyperlink w:anchor="_Toc230426991" w:history="1">
             <w:r>
               <w:rPr>
                 <w:rStyle w:val="Hyperlink"/>
@@ -1460,7 +1608,7 @@
                 <w:noProof/>
                 <w:webHidden/>
               </w:rPr>
-              <w:instrText xml:space="preserve"> PAGEREF _Toc230203417 \h </w:instrText>
+              <w:instrText xml:space="preserve"> PAGEREF _Toc230426991 \h </w:instrText>
             </w:r>
             <w:r>
               <w:rPr>
@@ -1508,7 +1656,7 @@
               <w14:ligatures w14:val="standardContextual"/>
             </w:rPr>
           </w:pPr>
-          <w:hyperlink w:anchor="_Toc230203418" w:history="1">
+          <w:hyperlink w:anchor="_Toc230426992" w:history="1">
             <w:r>
               <w:rPr>
                 <w:rStyle w:val="Hyperlink"/>
@@ -1535,7 +1683,7 @@
                 <w:noProof/>
                 <w:webHidden/>
               </w:rPr>
-              <w:instrText xml:space="preserve"> PAGEREF _Toc230203418 \h </w:instrText>
+              <w:instrText xml:space="preserve"> PAGEREF _Toc230426992 \h </w:instrText>
             </w:r>
             <w:r>
               <w:rPr>
@@ -1583,7 +1731,7 @@
               <w14:ligatures w14:val="standardContextual"/>
             </w:rPr>
           </w:pPr>
-          <w:hyperlink w:anchor="_Toc230203419" w:history="1">
+          <w:hyperlink w:anchor="_Toc230426993" w:history="1">
             <w:r>
               <w:rPr>
                 <w:rStyle w:val="Hyperlink"/>
@@ -1611,7 +1759,7 @@
                 <w:noProof/>
                 <w:webHidden/>
               </w:rPr>
-              <w:instrText xml:space="preserve"> PAGEREF _Toc230203419 \h </w:instrText>
+              <w:instrText xml:space="preserve"> PAGEREF _Toc230426993 \h </w:instrText>
             </w:r>
             <w:r>
               <w:rPr>
@@ -1662,7 +1810,7 @@
               <w14:ligatures w14:val="standardContextual"/>
             </w:rPr>
           </w:pPr>
-          <w:hyperlink w:anchor="_Toc230203420" w:history="1">
+          <w:hyperlink w:anchor="_Toc230426994" w:history="1">
             <w:r>
               <w:rPr>
                 <w:rStyle w:val="Hyperlink"/>
@@ -1713,7 +1861,7 @@
                 <w:noProof/>
                 <w:webHidden/>
               </w:rPr>
-              <w:instrText xml:space="preserve"> PAGEREF _Toc230203420 \h </w:instrText>
+              <w:instrText xml:space="preserve"> PAGEREF _Toc230426994 \h </w:instrText>
             </w:r>
             <w:r>
               <w:rPr>
@@ -1764,7 +1912,7 @@
               <w14:ligatures w14:val="standardContextual"/>
             </w:rPr>
           </w:pPr>
-          <w:hyperlink w:anchor="_Toc230203421" w:history="1">
+          <w:hyperlink w:anchor="_Toc230426995" w:history="1">
             <w:r>
               <w:rPr>
                 <w:rStyle w:val="Hyperlink"/>
@@ -1815,7 +1963,7 @@
                 <w:noProof/>
                 <w:webHidden/>
               </w:rPr>
-              <w:instrText xml:space="preserve"> PAGEREF _Toc230203421 \h </w:instrText>
+              <w:instrText xml:space="preserve"> PAGEREF _Toc230426995 \h </w:instrText>
             </w:r>
             <w:r>
               <w:rPr>
@@ -1865,7 +2013,7 @@
               <w14:ligatures w14:val="standardContextual"/>
             </w:rPr>
           </w:pPr>
-          <w:hyperlink w:anchor="_Toc230203422" w:history="1">
+          <w:hyperlink w:anchor="_Toc230426996" w:history="1">
             <w:r>
               <w:rPr>
                 <w:rStyle w:val="Hyperlink"/>
@@ -1914,7 +2062,7 @@
                 <w:noProof/>
                 <w:webHidden/>
               </w:rPr>
-              <w:instrText xml:space="preserve"> PAGEREF _Toc230203422 \h </w:instrText>
+              <w:instrText xml:space="preserve"> PAGEREF _Toc230426996 \h </w:instrText>
             </w:r>
             <w:r>
               <w:rPr>
@@ -1963,7 +2111,7 @@
               <w14:ligatures w14:val="standardContextual"/>
             </w:rPr>
           </w:pPr>
-          <w:hyperlink w:anchor="_Toc230203423" w:history="1">
+          <w:hyperlink w:anchor="_Toc230426997" w:history="1">
             <w:r>
               <w:rPr>
                 <w:rStyle w:val="Hyperlink"/>
@@ -2012,7 +2160,7 @@
                 <w:noProof/>
                 <w:webHidden/>
               </w:rPr>
-              <w:instrText xml:space="preserve"> PAGEREF _Toc230203423 \h </w:instrText>
+              <w:instrText xml:space="preserve"> PAGEREF _Toc230426997 \h </w:instrText>
             </w:r>
             <w:r>
               <w:rPr>
@@ -2061,7 +2209,7 @@
               <w14:ligatures w14:val="standardContextual"/>
             </w:rPr>
           </w:pPr>
-          <w:hyperlink w:anchor="_Toc230203424" w:history="1">
+          <w:hyperlink w:anchor="_Toc230426998" w:history="1">
             <w:r>
               <w:rPr>
                 <w:rStyle w:val="Hyperlink"/>
@@ -2110,7 +2258,7 @@
                 <w:noProof/>
                 <w:webHidden/>
               </w:rPr>
-              <w:instrText xml:space="preserve"> PAGEREF _Toc230203424 \h </w:instrText>
+              <w:instrText xml:space="preserve"> PAGEREF _Toc230426998 \h </w:instrText>
             </w:r>
             <w:r>
               <w:rPr>
@@ -2159,7 +2307,7 @@
               <w14:ligatures w14:val="standardContextual"/>
             </w:rPr>
           </w:pPr>
-          <w:hyperlink w:anchor="_Toc230203425" w:history="1">
+          <w:hyperlink w:anchor="_Toc230426999" w:history="1">
             <w:r>
               <w:rPr>
                 <w:rStyle w:val="Hyperlink"/>
@@ -2208,7 +2356,7 @@
                 <w:noProof/>
                 <w:webHidden/>
               </w:rPr>
-              <w:instrText xml:space="preserve"> PAGEREF _Toc230203425 \h </w:instrText>
+              <w:instrText xml:space="preserve"> PAGEREF _Toc230426999 \h </w:instrText>
             </w:r>
             <w:r>
               <w:rPr>
@@ -2257,7 +2405,7 @@
               <w14:ligatures w14:val="standardContextual"/>
             </w:rPr>
           </w:pPr>
-          <w:hyperlink w:anchor="_Toc230203426" w:history="1">
+          <w:hyperlink w:anchor="_Toc230427000" w:history="1">
             <w:r>
               <w:rPr>
                 <w:rStyle w:val="Hyperlink"/>
@@ -2306,7 +2454,7 @@
                 <w:noProof/>
                 <w:webHidden/>
               </w:rPr>
-              <w:instrText xml:space="preserve"> PAGEREF _Toc230203426 \h </w:instrText>
+              <w:instrText xml:space="preserve"> PAGEREF _Toc230427000 \h </w:instrText>
             </w:r>
             <w:r>
               <w:rPr>
@@ -2355,7 +2503,7 @@
               <w14:ligatures w14:val="standardContextual"/>
             </w:rPr>
           </w:pPr>
-          <w:hyperlink w:anchor="_Toc230203427" w:history="1">
+          <w:hyperlink w:anchor="_Toc230427001" w:history="1">
             <w:r>
               <w:rPr>
                 <w:rStyle w:val="Hyperlink"/>
@@ -2404,7 +2552,7 @@
                 <w:noProof/>
                 <w:webHidden/>
               </w:rPr>
-              <w:instrText xml:space="preserve"> PAGEREF _Toc230203427 \h </w:instrText>
+              <w:instrText xml:space="preserve"> PAGEREF _Toc230427001 \h </w:instrText>
             </w:r>
             <w:r>
               <w:rPr>
@@ -2453,7 +2601,7 @@
               <w14:ligatures w14:val="standardContextual"/>
             </w:rPr>
           </w:pPr>
-          <w:hyperlink w:anchor="_Toc230203428" w:history="1">
+          <w:hyperlink w:anchor="_Toc230427002" w:history="1">
             <w:r>
               <w:rPr>
                 <w:rStyle w:val="Hyperlink"/>
@@ -2502,7 +2650,7 @@
                 <w:noProof/>
                 <w:webHidden/>
               </w:rPr>
-              <w:instrText xml:space="preserve"> PAGEREF _Toc230203428 \h </w:instrText>
+              <w:instrText xml:space="preserve"> PAGEREF _Toc230427002 \h </w:instrText>
             </w:r>
             <w:r>
               <w:rPr>
@@ -2552,7 +2700,7 @@
               <w14:ligatures w14:val="standardContextual"/>
             </w:rPr>
           </w:pPr>
-          <w:hyperlink w:anchor="_Toc230203429" w:history="1">
+          <w:hyperlink w:anchor="_Toc230427003" w:history="1">
             <w:r>
               <w:rPr>
                 <w:rStyle w:val="Hyperlink"/>
@@ -2603,7 +2751,7 @@
                 <w:noProof/>
                 <w:webHidden/>
               </w:rPr>
-              <w:instrText xml:space="preserve"> PAGEREF _Toc230203429 \h </w:instrText>
+              <w:instrText xml:space="preserve"> PAGEREF _Toc230427003 \h </w:instrText>
             </w:r>
             <w:r>
               <w:rPr>
@@ -2654,7 +2802,7 @@
               <w14:ligatures w14:val="standardContextual"/>
             </w:rPr>
           </w:pPr>
-          <w:hyperlink w:anchor="_Toc230203430" w:history="1">
+          <w:hyperlink w:anchor="_Toc230427004" w:history="1">
             <w:r>
               <w:rPr>
                 <w:rStyle w:val="Hyperlink"/>
@@ -2705,7 +2853,7 @@
                 <w:noProof/>
                 <w:webHidden/>
               </w:rPr>
-              <w:instrText xml:space="preserve"> PAGEREF _Toc230203430 \h </w:instrText>
+              <w:instrText xml:space="preserve"> PAGEREF _Toc230427004 \h </w:instrText>
             </w:r>
             <w:r>
               <w:rPr>
@@ -2756,7 +2904,7 @@
               <w14:ligatures w14:val="standardContextual"/>
             </w:rPr>
           </w:pPr>
-          <w:hyperlink w:anchor="_Toc230203431" w:history="1">
+          <w:hyperlink w:anchor="_Toc230427005" w:history="1">
             <w:r>
               <w:rPr>
                 <w:rStyle w:val="Hyperlink"/>
@@ -2807,7 +2955,7 @@
                 <w:noProof/>
                 <w:webHidden/>
               </w:rPr>
-              <w:instrText xml:space="preserve"> PAGEREF _Toc230203431 \h </w:instrText>
+              <w:instrText xml:space="preserve"> PAGEREF _Toc230427005 \h </w:instrText>
             </w:r>
             <w:r>
               <w:rPr>
@@ -2857,7 +3005,7 @@
               <w14:ligatures w14:val="standardContextual"/>
             </w:rPr>
           </w:pPr>
-          <w:hyperlink w:anchor="_Toc230203432" w:history="1">
+          <w:hyperlink w:anchor="_Toc230427006" w:history="1">
             <w:r>
               <w:rPr>
                 <w:rStyle w:val="Hyperlink"/>
@@ -2906,7 +3054,7 @@
                 <w:noProof/>
                 <w:webHidden/>
               </w:rPr>
-              <w:instrText xml:space="preserve"> PAGEREF _Toc230203432 \h </w:instrText>
+              <w:instrText xml:space="preserve"> PAGEREF _Toc230427006 \h </w:instrText>
             </w:r>
             <w:r>
               <w:rPr>
@@ -2955,7 +3103,7 @@
               <w14:ligatures w14:val="standardContextual"/>
             </w:rPr>
           </w:pPr>
-          <w:hyperlink w:anchor="_Toc230203433" w:history="1">
+          <w:hyperlink w:anchor="_Toc230427007" w:history="1">
             <w:r>
               <w:rPr>
                 <w:rStyle w:val="Hyperlink"/>
@@ -3004,7 +3152,7 @@
                 <w:noProof/>
                 <w:webHidden/>
               </w:rPr>
-              <w:instrText xml:space="preserve"> PAGEREF _Toc230203433 \h </w:instrText>
+              <w:instrText xml:space="preserve"> PAGEREF _Toc230427007 \h </w:instrText>
             </w:r>
             <w:r>
               <w:rPr>
@@ -3053,7 +3201,7 @@
               <w14:ligatures w14:val="standardContextual"/>
             </w:rPr>
           </w:pPr>
-          <w:hyperlink w:anchor="_Toc230203434" w:history="1">
+          <w:hyperlink w:anchor="_Toc230427008" w:history="1">
             <w:r>
               <w:rPr>
                 <w:rStyle w:val="Hyperlink"/>
@@ -3102,7 +3250,7 @@
                 <w:noProof/>
                 <w:webHidden/>
               </w:rPr>
-              <w:instrText xml:space="preserve"> PAGEREF _Toc230203434 \h </w:instrText>
+              <w:instrText xml:space="preserve"> PAGEREF _Toc230427008 \h </w:instrText>
             </w:r>
             <w:r>
               <w:rPr>
@@ -3151,7 +3299,7 @@
               <w14:ligatures w14:val="standardContextual"/>
             </w:rPr>
           </w:pPr>
-          <w:hyperlink w:anchor="_Toc230203435" w:history="1">
+          <w:hyperlink w:anchor="_Toc230427009" w:history="1">
             <w:r>
               <w:rPr>
                 <w:rStyle w:val="Hyperlink"/>
@@ -3200,7 +3348,7 @@
                 <w:noProof/>
                 <w:webHidden/>
               </w:rPr>
-              <w:instrText xml:space="preserve"> PAGEREF _Toc230203435 \h </w:instrText>
+              <w:instrText xml:space="preserve"> PAGEREF _Toc230427009 \h </w:instrText>
             </w:r>
             <w:r>
               <w:rPr>
@@ -3249,7 +3397,7 @@
               <w14:ligatures w14:val="standardContextual"/>
             </w:rPr>
           </w:pPr>
-          <w:hyperlink w:anchor="_Toc230203436" w:history="1">
+          <w:hyperlink w:anchor="_Toc230427010" w:history="1">
             <w:r>
               <w:rPr>
                 <w:rStyle w:val="Hyperlink"/>
@@ -3298,7 +3446,7 @@
                 <w:noProof/>
                 <w:webHidden/>
               </w:rPr>
-              <w:instrText xml:space="preserve"> PAGEREF _Toc230203436 \h </w:instrText>
+              <w:instrText xml:space="preserve"> PAGEREF _Toc230427010 \h </w:instrText>
             </w:r>
             <w:r>
               <w:rPr>
@@ -3348,7 +3496,7 @@
               <w14:ligatures w14:val="standardContextual"/>
             </w:rPr>
           </w:pPr>
-          <w:hyperlink w:anchor="_Toc230203437" w:history="1">
+          <w:hyperlink w:anchor="_Toc230427011" w:history="1">
             <w:r>
               <w:rPr>
                 <w:rStyle w:val="Hyperlink"/>
@@ -3399,7 +3547,7 @@
                 <w:noProof/>
                 <w:webHidden/>
               </w:rPr>
-              <w:instrText xml:space="preserve"> PAGEREF _Toc230203437 \h </w:instrText>
+              <w:instrText xml:space="preserve"> PAGEREF _Toc230427011 \h </w:instrText>
             </w:r>
             <w:r>
               <w:rPr>
@@ -3449,7 +3597,7 @@
               <w14:ligatures w14:val="standardContextual"/>
             </w:rPr>
           </w:pPr>
-          <w:hyperlink w:anchor="_Toc230203438" w:history="1">
+          <w:hyperlink w:anchor="_Toc230427012" w:history="1">
             <w:r>
               <w:rPr>
                 <w:rStyle w:val="Hyperlink"/>
@@ -3498,7 +3646,7 @@
                 <w:noProof/>
                 <w:webHidden/>
               </w:rPr>
-              <w:instrText xml:space="preserve"> PAGEREF _Toc230203438 \h </w:instrText>
+              <w:instrText xml:space="preserve"> PAGEREF _Toc230427012 \h </w:instrText>
             </w:r>
             <w:r>
               <w:rPr>
@@ -3547,7 +3695,7 @@
               <w14:ligatures w14:val="standardContextual"/>
             </w:rPr>
           </w:pPr>
-          <w:hyperlink w:anchor="_Toc230203439" w:history="1">
+          <w:hyperlink w:anchor="_Toc230427013" w:history="1">
             <w:r>
               <w:rPr>
                 <w:rStyle w:val="Hyperlink"/>
@@ -3596,7 +3744,7 @@
                 <w:noProof/>
                 <w:webHidden/>
               </w:rPr>
-              <w:instrText xml:space="preserve"> PAGEREF _Toc230203439 \h </w:instrText>
+              <w:instrText xml:space="preserve"> PAGEREF _Toc230427013 \h </w:instrText>
             </w:r>
             <w:r>
               <w:rPr>
@@ -3645,7 +3793,7 @@
               <w14:ligatures w14:val="standardContextual"/>
             </w:rPr>
           </w:pPr>
-          <w:hyperlink w:anchor="_Toc230203440" w:history="1">
+          <w:hyperlink w:anchor="_Toc230427014" w:history="1">
             <w:r>
               <w:rPr>
                 <w:rStyle w:val="Hyperlink"/>
@@ -3694,7 +3842,7 @@
                 <w:noProof/>
                 <w:webHidden/>
               </w:rPr>
-              <w:instrText xml:space="preserve"> PAGEREF _Toc230203440 \h </w:instrText>
+              <w:instrText xml:space="preserve"> PAGEREF _Toc230427014 \h </w:instrText>
             </w:r>
             <w:r>
               <w:rPr>
@@ -3743,7 +3891,7 @@
               <w14:ligatures w14:val="standardContextual"/>
             </w:rPr>
           </w:pPr>
-          <w:hyperlink w:anchor="_Toc230203441" w:history="1">
+          <w:hyperlink w:anchor="_Toc230427015" w:history="1">
             <w:r>
               <w:rPr>
                 <w:rStyle w:val="Hyperlink"/>
@@ -3792,7 +3940,7 @@
                 <w:noProof/>
                 <w:webHidden/>
               </w:rPr>
-              <w:instrText xml:space="preserve"> PAGEREF _Toc230203441 \h </w:instrText>
+              <w:instrText xml:space="preserve"> PAGEREF _Toc230427015 \h </w:instrText>
             </w:r>
             <w:r>
               <w:rPr>
@@ -3842,7 +3990,7 @@
               <w14:ligatures w14:val="standardContextual"/>
             </w:rPr>
           </w:pPr>
-          <w:hyperlink w:anchor="_Toc230203442" w:history="1">
+          <w:hyperlink w:anchor="_Toc230427016" w:history="1">
             <w:r>
               <w:rPr>
                 <w:rStyle w:val="Hyperlink"/>
@@ -3893,7 +4041,7 @@
                 <w:noProof/>
                 <w:webHidden/>
               </w:rPr>
-              <w:instrText xml:space="preserve"> PAGEREF _Toc230203442 \h </w:instrText>
+              <w:instrText xml:space="preserve"> PAGEREF _Toc230427016 \h </w:instrText>
             </w:r>
             <w:r>
               <w:rPr>
@@ -3943,7 +4091,7 @@
               <w14:ligatures w14:val="standardContextual"/>
             </w:rPr>
           </w:pPr>
-          <w:hyperlink w:anchor="_Toc230203443" w:history="1">
+          <w:hyperlink w:anchor="_Toc230427017" w:history="1">
             <w:r>
               <w:rPr>
                 <w:rStyle w:val="Hyperlink"/>
@@ -3992,7 +4140,7 @@
                 <w:noProof/>
                 <w:webHidden/>
               </w:rPr>
-              <w:instrText xml:space="preserve"> PAGEREF _Toc230203443 \h </w:instrText>
+              <w:instrText xml:space="preserve"> PAGEREF _Toc230427017 \h </w:instrText>
             </w:r>
             <w:r>
               <w:rPr>
@@ -4041,7 +4189,7 @@
               <w14:ligatures w14:val="standardContextual"/>
             </w:rPr>
           </w:pPr>
-          <w:hyperlink w:anchor="_Toc230203444" w:history="1">
+          <w:hyperlink w:anchor="_Toc230427018" w:history="1">
             <w:r>
               <w:rPr>
                 <w:rStyle w:val="Hyperlink"/>
@@ -4090,7 +4238,7 @@
                 <w:noProof/>
                 <w:webHidden/>
               </w:rPr>
-              <w:instrText xml:space="preserve"> PAGEREF _Toc230203444 \h </w:instrText>
+              <w:instrText xml:space="preserve"> PAGEREF _Toc230427018 \h </w:instrText>
             </w:r>
             <w:r>
               <w:rPr>
@@ -4139,7 +4287,7 @@
               <w14:ligatures w14:val="standardContextual"/>
             </w:rPr>
           </w:pPr>
-          <w:hyperlink w:anchor="_Toc230203445" w:history="1">
+          <w:hyperlink w:anchor="_Toc230427019" w:history="1">
             <w:r>
               <w:rPr>
                 <w:rStyle w:val="Hyperlink"/>
@@ -4188,7 +4336,7 @@
                 <w:noProof/>
                 <w:webHidden/>
               </w:rPr>
-              <w:instrText xml:space="preserve"> PAGEREF _Toc230203445 \h </w:instrText>
+              <w:instrText xml:space="preserve"> PAGEREF _Toc230427019 \h </w:instrText>
             </w:r>
             <w:r>
               <w:rPr>
@@ -4237,7 +4385,7 @@
               <w14:ligatures w14:val="standardContextual"/>
             </w:rPr>
           </w:pPr>
-          <w:hyperlink w:anchor="_Toc230203446" w:history="1">
+          <w:hyperlink w:anchor="_Toc230427020" w:history="1">
             <w:r>
               <w:rPr>
                 <w:rStyle w:val="Hyperlink"/>
@@ -4286,7 +4434,7 @@
                 <w:noProof/>
                 <w:webHidden/>
               </w:rPr>
-              <w:instrText xml:space="preserve"> PAGEREF _Toc230203446 \h </w:instrText>
+              <w:instrText xml:space="preserve"> PAGEREF _Toc230427020 \h </w:instrText>
             </w:r>
             <w:r>
               <w:rPr>
@@ -4335,7 +4483,7 @@
               <w14:ligatures w14:val="standardContextual"/>
             </w:rPr>
           </w:pPr>
-          <w:hyperlink w:anchor="_Toc230203447" w:history="1">
+          <w:hyperlink w:anchor="_Toc230427021" w:history="1">
             <w:r>
               <w:rPr>
                 <w:rStyle w:val="Hyperlink"/>
@@ -4384,7 +4532,7 @@
                 <w:noProof/>
                 <w:webHidden/>
               </w:rPr>
-              <w:instrText xml:space="preserve"> PAGEREF _Toc230203447 \h </w:instrText>
+              <w:instrText xml:space="preserve"> PAGEREF _Toc230427021 \h </w:instrText>
             </w:r>
             <w:r>
               <w:rPr>
@@ -4433,7 +4581,7 @@
               <w14:ligatures w14:val="standardContextual"/>
             </w:rPr>
           </w:pPr>
-          <w:hyperlink w:anchor="_Toc230203448" w:history="1">
+          <w:hyperlink w:anchor="_Toc230427022" w:history="1">
             <w:r>
               <w:rPr>
                 <w:rStyle w:val="Hyperlink"/>
@@ -4482,7 +4630,7 @@
                 <w:noProof/>
                 <w:webHidden/>
               </w:rPr>
-              <w:instrText xml:space="preserve"> PAGEREF _Toc230203448 \h </w:instrText>
+              <w:instrText xml:space="preserve"> PAGEREF _Toc230427022 \h </w:instrText>
             </w:r>
             <w:r>
               <w:rPr>
@@ -4531,7 +4679,7 @@
               <w14:ligatures w14:val="standardContextual"/>
             </w:rPr>
           </w:pPr>
-          <w:hyperlink w:anchor="_Toc230203449" w:history="1">
+          <w:hyperlink w:anchor="_Toc230427023" w:history="1">
             <w:r>
               <w:rPr>
                 <w:rStyle w:val="Hyperlink"/>
@@ -4580,7 +4728,7 @@
                 <w:noProof/>
                 <w:webHidden/>
               </w:rPr>
-              <w:instrText xml:space="preserve"> PAGEREF _Toc230203449 \h </w:instrText>
+              <w:instrText xml:space="preserve"> PAGEREF _Toc230427023 \h </w:instrText>
             </w:r>
             <w:r>
               <w:rPr>
@@ -4629,7 +4777,7 @@
               <w14:ligatures w14:val="standardContextual"/>
             </w:rPr>
           </w:pPr>
-          <w:hyperlink w:anchor="_Toc230203450" w:history="1">
+          <w:hyperlink w:anchor="_Toc230427024" w:history="1">
             <w:r>
               <w:rPr>
                 <w:rStyle w:val="Hyperlink"/>
@@ -4678,7 +4826,7 @@
                 <w:noProof/>
                 <w:webHidden/>
               </w:rPr>
-              <w:instrText xml:space="preserve"> PAGEREF _Toc230203450 \h </w:instrText>
+              <w:instrText xml:space="preserve"> PAGEREF _Toc230427024 \h </w:instrText>
             </w:r>
             <w:r>
               <w:rPr>
@@ -4728,7 +4876,7 @@
               <w14:ligatures w14:val="standardContextual"/>
             </w:rPr>
           </w:pPr>
-          <w:hyperlink w:anchor="_Toc230203451" w:history="1">
+          <w:hyperlink w:anchor="_Toc230427025" w:history="1">
             <w:r>
               <w:rPr>
                 <w:rStyle w:val="Hyperlink"/>
@@ -4779,7 +4927,7 @@
                 <w:noProof/>
                 <w:webHidden/>
               </w:rPr>
-              <w:instrText xml:space="preserve"> PAGEREF _Toc230203451 \h </w:instrText>
+              <w:instrText xml:space="preserve"> PAGEREF _Toc230427025 \h </w:instrText>
             </w:r>
             <w:r>
               <w:rPr>
@@ -4829,7 +4977,7 @@
               <w14:ligatures w14:val="standardContextual"/>
             </w:rPr>
           </w:pPr>
-          <w:hyperlink w:anchor="_Toc230203452" w:history="1">
+          <w:hyperlink w:anchor="_Toc230427026" w:history="1">
             <w:r>
               <w:rPr>
                 <w:rStyle w:val="Hyperlink"/>
@@ -4878,7 +5026,7 @@
                 <w:noProof/>
                 <w:webHidden/>
               </w:rPr>
-              <w:instrText xml:space="preserve"> PAGEREF _Toc230203452 \h </w:instrText>
+              <w:instrText xml:space="preserve"> PAGEREF _Toc230427026 \h </w:instrText>
             </w:r>
             <w:r>
               <w:rPr>
@@ -4927,7 +5075,7 @@
               <w14:ligatures w14:val="standardContextual"/>
             </w:rPr>
           </w:pPr>
-          <w:hyperlink w:anchor="_Toc230203453" w:history="1">
+          <w:hyperlink w:anchor="_Toc230427027" w:history="1">
             <w:r>
               <w:rPr>
                 <w:rStyle w:val="Hyperlink"/>
@@ -4976,7 +5124,7 @@
                 <w:noProof/>
                 <w:webHidden/>
               </w:rPr>
-              <w:instrText xml:space="preserve"> PAGEREF _Toc230203453 \h </w:instrText>
+              <w:instrText xml:space="preserve"> PAGEREF _Toc230427027 \h </w:instrText>
             </w:r>
             <w:r>
               <w:rPr>
@@ -5025,7 +5173,7 @@
               <w14:ligatures w14:val="standardContextual"/>
             </w:rPr>
           </w:pPr>
-          <w:hyperlink w:anchor="_Toc230203454" w:history="1">
+          <w:hyperlink w:anchor="_Toc230427028" w:history="1">
             <w:r>
               <w:rPr>
                 <w:rStyle w:val="Hyperlink"/>
@@ -5074,7 +5222,7 @@
                 <w:noProof/>
                 <w:webHidden/>
               </w:rPr>
-              <w:instrText xml:space="preserve"> PAGEREF _Toc230203454 \h </w:instrText>
+              <w:instrText xml:space="preserve"> PAGEREF _Toc230427028 \h </w:instrText>
             </w:r>
             <w:r>
               <w:rPr>
@@ -5123,7 +5271,7 @@
               <w14:ligatures w14:val="standardContextual"/>
             </w:rPr>
           </w:pPr>
-          <w:hyperlink w:anchor="_Toc230203455" w:history="1">
+          <w:hyperlink w:anchor="_Toc230427029" w:history="1">
             <w:r>
               <w:rPr>
                 <w:rStyle w:val="Hyperlink"/>
@@ -5172,7 +5320,7 @@
                 <w:noProof/>
                 <w:webHidden/>
               </w:rPr>
-              <w:instrText xml:space="preserve"> PAGEREF _Toc230203455 \h </w:instrText>
+              <w:instrText xml:space="preserve"> PAGEREF _Toc230427029 \h </w:instrText>
             </w:r>
             <w:r>
               <w:rPr>
@@ -5221,7 +5369,7 @@
               <w14:ligatures w14:val="standardContextual"/>
             </w:rPr>
           </w:pPr>
-          <w:hyperlink w:anchor="_Toc230203456" w:history="1">
+          <w:hyperlink w:anchor="_Toc230427030" w:history="1">
             <w:r>
               <w:rPr>
                 <w:rStyle w:val="Hyperlink"/>
@@ -5270,7 +5418,7 @@
                 <w:noProof/>
                 <w:webHidden/>
               </w:rPr>
-              <w:instrText xml:space="preserve"> PAGEREF _Toc230203456 \h </w:instrText>
+              <w:instrText xml:space="preserve"> PAGEREF _Toc230427030 \h </w:instrText>
             </w:r>
             <w:r>
               <w:rPr>
@@ -5320,7 +5468,7 @@
               <w14:ligatures w14:val="standardContextual"/>
             </w:rPr>
           </w:pPr>
-          <w:hyperlink w:anchor="_Toc230203457" w:history="1">
+          <w:hyperlink w:anchor="_Toc230427031" w:history="1">
             <w:r>
               <w:rPr>
                 <w:rStyle w:val="Hyperlink"/>
@@ -5371,7 +5519,7 @@
                 <w:noProof/>
                 <w:webHidden/>
               </w:rPr>
-              <w:instrText xml:space="preserve"> PAGEREF _Toc230203457 \h </w:instrText>
+              <w:instrText xml:space="preserve"> PAGEREF _Toc230427031 \h </w:instrText>
             </w:r>
             <w:r>
               <w:rPr>
@@ -5422,7 +5570,7 @@
               <w14:ligatures w14:val="standardContextual"/>
             </w:rPr>
           </w:pPr>
-          <w:hyperlink w:anchor="_Toc230203458" w:history="1">
+          <w:hyperlink w:anchor="_Toc230427032" w:history="1">
             <w:r>
               <w:rPr>
                 <w:rStyle w:val="Hyperlink"/>
@@ -5473,7 +5621,7 @@
                 <w:noProof/>
                 <w:webHidden/>
               </w:rPr>
-              <w:instrText xml:space="preserve"> PAGEREF _Toc230203458 \h </w:instrText>
+              <w:instrText xml:space="preserve"> PAGEREF _Toc230427032 \h </w:instrText>
             </w:r>
             <w:r>
               <w:rPr>
@@ -5524,7 +5672,7 @@
               <w14:ligatures w14:val="standardContextual"/>
             </w:rPr>
           </w:pPr>
-          <w:hyperlink w:anchor="_Toc230203459" w:history="1">
+          <w:hyperlink w:anchor="_Toc230427033" w:history="1">
             <w:r>
               <w:rPr>
                 <w:rStyle w:val="Hyperlink"/>
@@ -5575,7 +5723,7 @@
                 <w:noProof/>
                 <w:webHidden/>
               </w:rPr>
-              <w:instrText xml:space="preserve"> PAGEREF _Toc230203459 \h </w:instrText>
+              <w:instrText xml:space="preserve"> PAGEREF _Toc230427033 \h </w:instrText>
             </w:r>
             <w:r>
               <w:rPr>
@@ -5626,7 +5774,7 @@
               <w14:ligatures w14:val="standardContextual"/>
             </w:rPr>
           </w:pPr>
-          <w:hyperlink w:anchor="_Toc230203460" w:history="1">
+          <w:hyperlink w:anchor="_Toc230427034" w:history="1">
             <w:r>
               <w:rPr>
                 <w:rStyle w:val="Hyperlink"/>
@@ -5677,7 +5825,7 @@
                 <w:noProof/>
                 <w:webHidden/>
               </w:rPr>
-              <w:instrText xml:space="preserve"> PAGEREF _Toc230203460 \h </w:instrText>
+              <w:instrText xml:space="preserve"> PAGEREF _Toc230427034 \h </w:instrText>
             </w:r>
             <w:r>
               <w:rPr>
@@ -5743,7 +5891,7 @@
       <w:pPr>
         <w:pStyle w:val="Introsections"/>
       </w:pPr>
-      <w:bookmarkStart w:id="7" w:name="_Toc230203418"/>
+      <w:bookmarkStart w:id="7" w:name="_Toc230426992"/>
       <w:r>
         <w:lastRenderedPageBreak/>
         <w:t>LIST OF FIGURES</w:t>
@@ -6253,7 +6401,7 @@
           <w:lang w:eastAsia="zh-CN"/>
         </w:rPr>
       </w:pPr>
-      <w:bookmarkStart w:id="8" w:name="_Toc230203419"/>
+      <w:bookmarkStart w:id="8" w:name="_Toc230426993"/>
       <w:r>
         <w:rPr>
           <w:lang w:eastAsia="zh-CN"/>
@@ -6658,7 +6806,7 @@
       </w:pPr>
       <w:bookmarkStart w:id="9" w:name="_Toc494826182"/>
       <w:bookmarkStart w:id="10" w:name="_Toc32521124"/>
-      <w:bookmarkStart w:id="11" w:name="_Toc230203420"/>
+      <w:bookmarkStart w:id="11" w:name="_Toc230426994"/>
       <w:bookmarkEnd w:id="0"/>
       <w:bookmarkEnd w:id="1"/>
       <w:r>
@@ -6812,7 +6960,7 @@
         </w:rPr>
       </w:pPr>
       <w:bookmarkStart w:id="12" w:name="_Toc32521125"/>
-      <w:bookmarkStart w:id="13" w:name="_Toc230203421"/>
+      <w:bookmarkStart w:id="13" w:name="_Toc230426995"/>
       <w:r>
         <w:rPr>
           <w:lang w:val="en-US"/>
@@ -6849,7 +6997,7 @@
           <w:lang w:val="en-US"/>
         </w:rPr>
       </w:pPr>
-      <w:bookmarkStart w:id="14" w:name="_Toc230203422"/>
+      <w:bookmarkStart w:id="14" w:name="_Toc230426996"/>
       <w:r>
         <w:rPr>
           <w:lang w:val="en-US"/>
@@ -6951,13 +7099,7 @@
             <w:rPr>
               <w:lang w:val="en-US"/>
             </w:rPr>
-            <w:instrText xml:space="preserve"> CITATION Ora23 \l 1033 </w:instrText>
-          </w:r>
-          <w:r>
-            <w:rPr>
-              <w:lang w:val="en-US"/>
-            </w:rPr>
-            <w:instrText xml:space="preserve"> \m Kal22</w:instrText>
+            <w:instrText xml:space="preserve">CITATION Ora23 \m Kal22 \l 1033 </w:instrText>
           </w:r>
           <w:r>
             <w:rPr>
@@ -6970,7 +7112,7 @@
               <w:noProof/>
               <w:lang w:val="en-US"/>
             </w:rPr>
-            <w:t>(Oracle, 2023; Kalaiarasan, 2022)</w:t>
+            <w:t>(Oracle, 2023; Kalaiarasan, Olhager, Agrawal, &amp; Wiktorsson, 2022)</w:t>
           </w:r>
           <w:r>
             <w:rPr>
@@ -6998,7 +7140,21 @@
         <w:rPr>
           <w:lang w:val="en-US"/>
         </w:rPr>
-        <w:t>In this project, supply chain visibility is addressed through a multi-page dashboard structure. The platform brings different operational views together, including overview indicators, regional performance, inventory control, shipment performance, risk analysis, and demand forecasting. This supports the idea that supply chain visibility should not focus on only one metric, but should combine different operational indicators.</w:t>
+        <w:t xml:space="preserve">In this project, supply chain visibility is addressed through a multi-page dashboard structure. The platform brings different operational views together, including overview indicators, regional performance, inventory control, shipment performance, risk analysis, and demand forecasting. This supports the idea that supply chain visibility should not focus on only one </w:t>
+      </w:r>
+      <w:proofErr w:type="gramStart"/>
+      <w:r>
+        <w:rPr>
+          <w:lang w:val="en-US"/>
+        </w:rPr>
+        <w:t>metric, but</w:t>
+      </w:r>
+      <w:proofErr w:type="gramEnd"/>
+      <w:r>
+        <w:rPr>
+          <w:lang w:val="en-US"/>
+        </w:rPr>
+        <w:t xml:space="preserve"> should combine different operational indicators.</w:t>
       </w:r>
     </w:p>
     <w:p>
@@ -7015,7 +7171,7 @@
           <w:lang w:val="en-US"/>
         </w:rPr>
       </w:pPr>
-      <w:bookmarkStart w:id="15" w:name="_Toc230203423"/>
+      <w:bookmarkStart w:id="15" w:name="_Toc230426997"/>
       <w:r>
         <w:rPr>
           <w:lang w:val="en-US"/>
@@ -7176,7 +7332,7 @@
           <w:lang w:val="en-US"/>
         </w:rPr>
       </w:pPr>
-      <w:bookmarkStart w:id="16" w:name="_Toc230203424"/>
+      <w:bookmarkStart w:id="16" w:name="_Toc230426998"/>
       <w:r>
         <w:rPr>
           <w:lang w:val="en-US"/>
@@ -7336,7 +7492,7 @@
           <w:lang w:val="en-US"/>
         </w:rPr>
       </w:pPr>
-      <w:bookmarkStart w:id="17" w:name="_Toc230203425"/>
+      <w:bookmarkStart w:id="17" w:name="_Toc230426999"/>
       <w:r>
         <w:rPr>
           <w:lang w:val="en-US"/>
@@ -7496,7 +7652,7 @@
           <w:lang w:val="en-US"/>
         </w:rPr>
       </w:pPr>
-      <w:bookmarkStart w:id="18" w:name="_Toc230203426"/>
+      <w:bookmarkStart w:id="18" w:name="_Toc230427000"/>
       <w:r>
         <w:rPr>
           <w:lang w:val="en-US"/>
@@ -7657,7 +7813,7 @@
           <w:lang w:val="en-US"/>
         </w:rPr>
       </w:pPr>
-      <w:bookmarkStart w:id="19" w:name="_Toc230203427"/>
+      <w:bookmarkStart w:id="19" w:name="_Toc230427001"/>
       <w:r>
         <w:rPr>
           <w:lang w:val="en-US"/>
@@ -7758,7 +7914,21 @@
         <w:rPr>
           <w:lang w:val="en-US"/>
         </w:rPr>
-        <w:t>The dataset upload feature improves the originality and usefulness of the project. The default DataCo dataset is used as a demonstration dataset, but the system can also process new supply chain datasets. After the user maps the uploaded dataset to the standard schema, the dashboard pages are generated dynamically based on the active dataset. This makes the platform more reusable for different supply chain data sources.</w:t>
+        <w:t xml:space="preserve">The dataset upload feature improves the originality and usefulness of the project. The default </w:t>
+      </w:r>
+      <w:proofErr w:type="spellStart"/>
+      <w:r>
+        <w:rPr>
+          <w:lang w:val="en-US"/>
+        </w:rPr>
+        <w:t>DataCo</w:t>
+      </w:r>
+      <w:proofErr w:type="spellEnd"/>
+      <w:r>
+        <w:rPr>
+          <w:lang w:val="en-US"/>
+        </w:rPr>
+        <w:t xml:space="preserve"> dataset is used as a demonstration dataset, but the system can also process new supply chain datasets. After the user maps the uploaded dataset to the standard schema, the dashboard pages are generated dynamically based on the active dataset. This makes the platform more reusable for different supply chain data sources.</w:t>
       </w:r>
     </w:p>
     <w:p>
@@ -7775,7 +7945,7 @@
           <w:lang w:val="en-US"/>
         </w:rPr>
       </w:pPr>
-      <w:bookmarkStart w:id="20" w:name="_Toc230203428"/>
+      <w:bookmarkStart w:id="20" w:name="_Toc230427002"/>
       <w:r>
         <w:rPr>
           <w:lang w:val="en-US"/>
@@ -7814,7 +7984,21 @@
         <w:rPr>
           <w:lang w:val="en-US"/>
         </w:rPr>
-        <w:t>Based on these ideas, this project develops a dataset-adaptive supply chain visibility and risk assessment platform. The platform combines dashboard visualization, uploaded dataset support, data standardization, risk scoring, and demand forecasting in a single Streamlit-based system.</w:t>
+        <w:t xml:space="preserve">Based on these ideas, this project develops a dataset-adaptive supply chain visibility and risk assessment platform. The platform combines dashboard visualization, uploaded dataset support, data standardization, risk scoring, and demand forecasting in a single </w:t>
+      </w:r>
+      <w:proofErr w:type="spellStart"/>
+      <w:r>
+        <w:rPr>
+          <w:lang w:val="en-US"/>
+        </w:rPr>
+        <w:t>Streamlit</w:t>
+      </w:r>
+      <w:proofErr w:type="spellEnd"/>
+      <w:r>
+        <w:rPr>
+          <w:lang w:val="en-US"/>
+        </w:rPr>
+        <w:t>-based system.</w:t>
       </w:r>
     </w:p>
     <w:p>
@@ -7832,7 +8016,7 @@
         </w:rPr>
       </w:pPr>
       <w:bookmarkStart w:id="21" w:name="_Toc32521137"/>
-      <w:bookmarkStart w:id="22" w:name="_Toc230203429"/>
+      <w:bookmarkStart w:id="22" w:name="_Toc230427003"/>
       <w:r>
         <w:rPr>
           <w:lang w:val="en-US"/>
@@ -7852,7 +8036,21 @@
         <w:rPr>
           <w:lang w:val="en-US"/>
         </w:rPr>
-        <w:t>The originality of this study comes from developing a supply chain dashboard platform that is not limited to one fixed dataset. Many dashboard projects are designed only for a single prepared dataset. In this project, the DataCo Smart Supply Chain dataset is used as the default demonstration dataset, but the platform also allows users to upload a new supply chain dataset in CSV or Excel format.</w:t>
+        <w:t xml:space="preserve">The originality of this study comes from developing a supply chain dashboard platform that is not limited to one fixed dataset. Many dashboard projects are designed only for a single prepared dataset. In this project, the </w:t>
+      </w:r>
+      <w:proofErr w:type="spellStart"/>
+      <w:r>
+        <w:rPr>
+          <w:lang w:val="en-US"/>
+        </w:rPr>
+        <w:t>DataCo</w:t>
+      </w:r>
+      <w:proofErr w:type="spellEnd"/>
+      <w:r>
+        <w:rPr>
+          <w:lang w:val="en-US"/>
+        </w:rPr>
+        <w:t xml:space="preserve"> Smart Supply Chain dataset is used as the default demonstration dataset, but the platform also allows users to upload a new supply chain dataset in CSV or Excel format.</w:t>
       </w:r>
     </w:p>
     <w:p>
@@ -7899,7 +8097,21 @@
           <w:lang w:val="en-US"/>
         </w:rPr>
         <w:br/>
-        <w:t>Another original aspect of the project is the integration of multiple supply chain analysis areas in one platform. The system does not only show order or sales information. It combines executive KPIs, regional performance analysis, inventory control indicators, shipment performance, supply chain risk scoring, and demand forecasting. This makes the project closer to a decision-support platform rather than a simple visualization page.</w:t>
+        <w:t xml:space="preserve">Another original aspect of the project is the integration of multiple supply chain analysis areas </w:t>
+      </w:r>
+      <w:proofErr w:type="gramStart"/>
+      <w:r>
+        <w:rPr>
+          <w:lang w:val="en-US"/>
+        </w:rPr>
+        <w:t>in</w:t>
+      </w:r>
+      <w:proofErr w:type="gramEnd"/>
+      <w:r>
+        <w:rPr>
+          <w:lang w:val="en-US"/>
+        </w:rPr>
+        <w:t xml:space="preserve"> one platform. The system does not only show order or sales information. It combines executive KPIs, regional performance analysis, inventory control indicators, shipment performance, supply chain risk scoring, and demand forecasting. This makes the project closer to a decision-support platform rather than a simple visualization page.</w:t>
       </w:r>
     </w:p>
     <w:p>
@@ -7939,7 +8151,21 @@
           <w:lang w:val="en-US"/>
         </w:rPr>
         <w:br/>
-        <w:t>The project is original within its academic scope because it combines data upload, schema mapping, data standardization, dynamic dashboard generation, risk analysis, and forecasting in a single Streamlit-based system. Therefore, the main contribution of the project is the development of a reusable supply chain visibility and risk assessment platform that can work with both a default dataset and user-uploaded datasets.</w:t>
+        <w:t xml:space="preserve">The project is original within its academic scope because it combines data upload, schema mapping, data standardization, dynamic dashboard generation, risk analysis, and forecasting in a single </w:t>
+      </w:r>
+      <w:proofErr w:type="spellStart"/>
+      <w:r>
+        <w:rPr>
+          <w:lang w:val="en-US"/>
+        </w:rPr>
+        <w:t>Streamlit</w:t>
+      </w:r>
+      <w:proofErr w:type="spellEnd"/>
+      <w:r>
+        <w:rPr>
+          <w:lang w:val="en-US"/>
+        </w:rPr>
+        <w:t>-based system. Therefore, the main contribution of the project is the development of a reusable supply chain visibility and risk assessment platform that can work with both a default dataset and user-uploaded datasets.</w:t>
       </w:r>
     </w:p>
     <w:p>
@@ -7956,7 +8182,7 @@
           <w:lang w:val="en-US"/>
         </w:rPr>
       </w:pPr>
-      <w:bookmarkStart w:id="23" w:name="_Toc230203430"/>
+      <w:bookmarkStart w:id="23" w:name="_Toc230427004"/>
       <w:r>
         <w:rPr>
           <w:lang w:val="en-US"/>
@@ -8072,7 +8298,7 @@
           <w:lang w:val="en-US"/>
         </w:rPr>
       </w:pPr>
-      <w:bookmarkStart w:id="24" w:name="_Toc230203431"/>
+      <w:bookmarkStart w:id="24" w:name="_Toc230427005"/>
       <w:r>
         <w:rPr>
           <w:lang w:val="en-US"/>
@@ -8091,7 +8317,21 @@
         <w:rPr>
           <w:lang w:val="en-US"/>
         </w:rPr>
-        <w:t>The solution approach of this project is based on developing a dataset-adaptive supply chain dashboard platform. The system is designed to work with a default demonstration dataset and also with user-uploaded supply chain datasets. The main idea is to transform different supply chain datasets into a common analytical structure and then generate dashboard modules from the active dataset.</w:t>
+        <w:t xml:space="preserve">The solution approach of this project is based on developing a dataset-adaptive supply chain dashboard platform. The system is designed to work with a default demonstration dataset </w:t>
+      </w:r>
+      <w:proofErr w:type="gramStart"/>
+      <w:r>
+        <w:rPr>
+          <w:lang w:val="en-US"/>
+        </w:rPr>
+        <w:t>and also</w:t>
+      </w:r>
+      <w:proofErr w:type="gramEnd"/>
+      <w:r>
+        <w:rPr>
+          <w:lang w:val="en-US"/>
+        </w:rPr>
+        <w:t xml:space="preserve"> with user-uploaded supply chain datasets. The main idea is to transform different supply chain datasets into a common analytical structure and then generate dashboard modules from the active dataset.</w:t>
       </w:r>
     </w:p>
     <w:p>
@@ -8101,7 +8341,7 @@
           <w:lang w:val="en-US"/>
         </w:rPr>
       </w:pPr>
-      <w:bookmarkStart w:id="25" w:name="_Toc230203432"/>
+      <w:bookmarkStart w:id="25" w:name="_Toc230427006"/>
       <w:r>
         <w:rPr>
           <w:lang w:val="en-US"/>
@@ -8141,7 +8381,21 @@
           <w:lang w:val="en-US"/>
         </w:rPr>
         <w:br/>
-        <w:t>The platform uses the DataCo Smart Supply Chain dataset as the default dataset. This dataset is processed into different analytical tables such as orders, products, shipments, inventory, demand, and risk scores. These tables are used by the default dashboard when no uploaded dataset is active.</w:t>
+        <w:t xml:space="preserve">The platform uses the </w:t>
+      </w:r>
+      <w:proofErr w:type="spellStart"/>
+      <w:r>
+        <w:rPr>
+          <w:lang w:val="en-US"/>
+        </w:rPr>
+        <w:t>DataCo</w:t>
+      </w:r>
+      <w:proofErr w:type="spellEnd"/>
+      <w:r>
+        <w:rPr>
+          <w:lang w:val="en-US"/>
+        </w:rPr>
+        <w:t xml:space="preserve"> Smart Supply Chain dataset as the default dataset. This dataset is processed into different analytical tables such as orders, products, shipments, inventory, demand, and risk scores. These tables are used by the default dashboard when no uploaded dataset is active.</w:t>
       </w:r>
     </w:p>
     <w:p>
@@ -8178,7 +8432,7 @@
           <w:lang w:val="en-US"/>
         </w:rPr>
       </w:pPr>
-      <w:bookmarkStart w:id="26" w:name="_Toc230203433"/>
+      <w:bookmarkStart w:id="26" w:name="_Toc230427007"/>
       <w:r>
         <w:rPr>
           <w:lang w:val="en-US"/>
@@ -8223,7 +8477,21 @@
           <w:lang w:val="en-US"/>
         </w:rPr>
         <w:br/>
-        <w:t>In the Data Source Manager, users map the columns of the uploaded dataset to the standard supply chain schema. The required fields include order ID, order date, product name, category name, and order quantity. Optional fields include shipping date, scheduled delivery date, delivery status, actual shipping days, scheduled shipping days, shipping mode, market, region, country, sales, and profit.</w:t>
+        <w:t xml:space="preserve">In the Data Source Manager, users map the columns of the uploaded dataset to the standard supply chain </w:t>
+      </w:r>
+      <w:proofErr w:type="gramStart"/>
+      <w:r>
+        <w:rPr>
+          <w:lang w:val="en-US"/>
+        </w:rPr>
+        <w:t>schema</w:t>
+      </w:r>
+      <w:proofErr w:type="gramEnd"/>
+      <w:r>
+        <w:rPr>
+          <w:lang w:val="en-US"/>
+        </w:rPr>
+        <w:t>. The required fields include order ID, order date, product name, category name, and order quantity. Optional fields include shipping date, scheduled delivery date, delivery status, actual shipping days, scheduled shipping days, shipping mode, market, region, country, sales, and profit.</w:t>
       </w:r>
     </w:p>
     <w:p>
@@ -8243,7 +8511,63 @@
           <w:lang w:val="en-US"/>
         </w:rPr>
         <w:br/>
-        <w:t>After the mapping is completed, the system standardizes the uploaded dataset. It converts date fields, numeric fields, and text fields into a common format. It also derives additional indicators where possible. For example, if actual shipping days and scheduled shipping days are not available, the system can calculate delay days by comparing delivered date and scheduled delivery date.</w:t>
+        <w:t xml:space="preserve">After the mapping is completed, the system standardizes the uploaded dataset. It converts date fields, numeric fields, and text fields into a common format. It also derives additional indicators where possible. For example, if actual shipping days and scheduled shipping days are not available, the system can calculate </w:t>
+      </w:r>
+      <w:proofErr w:type="gramStart"/>
+      <w:r>
+        <w:rPr>
+          <w:lang w:val="en-US"/>
+        </w:rPr>
+        <w:t>delay</w:t>
+      </w:r>
+      <w:proofErr w:type="gramEnd"/>
+      <w:r>
+        <w:rPr>
+          <w:lang w:val="en-US"/>
+        </w:rPr>
+        <w:t xml:space="preserve"> days by comparing </w:t>
+      </w:r>
+      <w:proofErr w:type="gramStart"/>
+      <w:r>
+        <w:rPr>
+          <w:lang w:val="en-US"/>
+        </w:rPr>
+        <w:t>delivered</w:t>
+      </w:r>
+      <w:proofErr w:type="gramEnd"/>
+      <w:r>
+        <w:rPr>
+          <w:lang w:val="en-US"/>
+        </w:rPr>
+        <w:t xml:space="preserve"> </w:t>
+      </w:r>
+      <w:proofErr w:type="gramStart"/>
+      <w:r>
+        <w:rPr>
+          <w:lang w:val="en-US"/>
+        </w:rPr>
+        <w:t>date</w:t>
+      </w:r>
+      <w:proofErr w:type="gramEnd"/>
+      <w:r>
+        <w:rPr>
+          <w:lang w:val="en-US"/>
+        </w:rPr>
+        <w:t xml:space="preserve"> and scheduled delivery </w:t>
+      </w:r>
+      <w:proofErr w:type="gramStart"/>
+      <w:r>
+        <w:rPr>
+          <w:lang w:val="en-US"/>
+        </w:rPr>
+        <w:t>date</w:t>
+      </w:r>
+      <w:proofErr w:type="gramEnd"/>
+      <w:r>
+        <w:rPr>
+          <w:lang w:val="en-US"/>
+        </w:rPr>
+        <w:t>.</w:t>
       </w:r>
     </w:p>
     <w:p>
@@ -8260,7 +8584,7 @@
           <w:lang w:val="en-US"/>
         </w:rPr>
       </w:pPr>
-      <w:bookmarkStart w:id="27" w:name="_Toc230203434"/>
+      <w:bookmarkStart w:id="27" w:name="_Toc230427008"/>
       <w:r>
         <w:rPr>
           <w:lang w:val="en-US"/>
@@ -8285,7 +8609,35 @@
         <w:rPr>
           <w:lang w:val="en-US"/>
         </w:rPr>
-        <w:t>After the dataset is standardized, the dashboard pages are generated from the active dataset. If no uploaded dataset is active, the dashboard uses the default DataCo dataset. If the user uploads and activates a new dataset, all dashboard pages use the uploaded dataset during the active Streamlit session.</w:t>
+        <w:t xml:space="preserve">After the dataset is standardized, the dashboard pages are generated from the active dataset. If no uploaded dataset is active, the dashboard uses the default </w:t>
+      </w:r>
+      <w:proofErr w:type="spellStart"/>
+      <w:r>
+        <w:rPr>
+          <w:lang w:val="en-US"/>
+        </w:rPr>
+        <w:t>DataCo</w:t>
+      </w:r>
+      <w:proofErr w:type="spellEnd"/>
+      <w:r>
+        <w:rPr>
+          <w:lang w:val="en-US"/>
+        </w:rPr>
+        <w:t xml:space="preserve"> dataset. If the user uploads and activates a new dataset, all dashboard pages use the uploaded dataset during the active </w:t>
+      </w:r>
+      <w:proofErr w:type="spellStart"/>
+      <w:r>
+        <w:rPr>
+          <w:lang w:val="en-US"/>
+        </w:rPr>
+        <w:t>Streamlit</w:t>
+      </w:r>
+      <w:proofErr w:type="spellEnd"/>
+      <w:r>
+        <w:rPr>
+          <w:lang w:val="en-US"/>
+        </w:rPr>
+        <w:t xml:space="preserve"> session.</w:t>
       </w:r>
     </w:p>
     <w:p>
@@ -8325,7 +8677,21 @@
           <w:lang w:val="en-US"/>
         </w:rPr>
         <w:br/>
-        <w:t>This structure allows the system to work as a flexible platform instead of a static dashboard. The same dashboard pages can be used with different supply chain datasets as long as the required fields are mapped correctly.</w:t>
+        <w:t xml:space="preserve">This structure allows the system to work as a flexible platform instead of a static dashboard. The same dashboard pages can be used with different supply chain datasets </w:t>
+      </w:r>
+      <w:proofErr w:type="gramStart"/>
+      <w:r>
+        <w:rPr>
+          <w:lang w:val="en-US"/>
+        </w:rPr>
+        <w:t>as long as</w:t>
+      </w:r>
+      <w:proofErr w:type="gramEnd"/>
+      <w:r>
+        <w:rPr>
+          <w:lang w:val="en-US"/>
+        </w:rPr>
+        <w:t xml:space="preserve"> the required fields are mapped correctly.</w:t>
       </w:r>
     </w:p>
     <w:p>
@@ -8342,7 +8708,7 @@
           <w:lang w:val="en-US"/>
         </w:rPr>
       </w:pPr>
-      <w:bookmarkStart w:id="28" w:name="_Toc230203435"/>
+      <w:bookmarkStart w:id="28" w:name="_Toc230427009"/>
       <w:r>
         <w:rPr>
           <w:lang w:val="en-US"/>
@@ -8425,7 +8791,7 @@
           <w:lang w:val="en-US"/>
         </w:rPr>
       </w:pPr>
-      <w:bookmarkStart w:id="29" w:name="_Toc230203436"/>
+      <w:bookmarkStart w:id="29" w:name="_Toc230427010"/>
       <w:r>
         <w:rPr>
           <w:lang w:val="en-US"/>
@@ -8487,7 +8853,7 @@
           <w:lang w:val="en-US"/>
         </w:rPr>
       </w:pPr>
-      <w:bookmarkStart w:id="30" w:name="_Toc230203437"/>
+      <w:bookmarkStart w:id="30" w:name="_Toc230427011"/>
       <w:r>
         <w:rPr>
           <w:lang w:val="en-US"/>
@@ -8523,7 +8889,7 @@
           <w:lang w:val="en-US"/>
         </w:rPr>
       </w:pPr>
-      <w:bookmarkStart w:id="31" w:name="_Toc230203438"/>
+      <w:bookmarkStart w:id="31" w:name="_Toc230427012"/>
       <w:r>
         <w:rPr>
           <w:lang w:val="en-US"/>
@@ -8562,7 +8928,21 @@
           <w:lang w:val="en-US"/>
         </w:rPr>
         <w:br/>
-        <w:t>The project was developed as a local Streamlit application. A Windows batch file was also created to make the project easier to run. This file automatically creates the virtual environment if needed, installs the required packages, processes the default dataset, and starts the dashboard.</w:t>
+        <w:t xml:space="preserve">The project was developed as a local </w:t>
+      </w:r>
+      <w:proofErr w:type="spellStart"/>
+      <w:r>
+        <w:rPr>
+          <w:lang w:val="en-US"/>
+        </w:rPr>
+        <w:t>Streamlit</w:t>
+      </w:r>
+      <w:proofErr w:type="spellEnd"/>
+      <w:r>
+        <w:rPr>
+          <w:lang w:val="en-US"/>
+        </w:rPr>
+        <w:t xml:space="preserve"> application. A Windows batch file was also created to make the project easier to run. This file automatically creates the virtual environment if needed, installs the required packages, processes the default dataset, and starts the dashboard.</w:t>
       </w:r>
     </w:p>
     <w:p>
@@ -8579,7 +8959,7 @@
           <w:lang w:val="en-US"/>
         </w:rPr>
       </w:pPr>
-      <w:bookmarkStart w:id="32" w:name="_Toc230203439"/>
+      <w:bookmarkStart w:id="32" w:name="_Toc230427013"/>
       <w:r>
         <w:rPr>
           <w:lang w:val="en-US"/>
@@ -8594,11 +8974,33 @@
           <w:lang w:val="en-US"/>
         </w:rPr>
       </w:pPr>
-      <w:r>
-        <w:rPr>
-          <w:lang w:val="en-US"/>
-        </w:rPr>
-        <w:t>pandas was used for reading CSV and Excel files, cleaning the dataset, grouping records, calculating KPIs, and creating analytical tables. NumPy was used for numerical calculations and handling missing numerical values.</w:t>
+      <w:proofErr w:type="gramStart"/>
+      <w:r>
+        <w:rPr>
+          <w:lang w:val="en-US"/>
+        </w:rPr>
+        <w:t>pandas</w:t>
+      </w:r>
+      <w:proofErr w:type="gramEnd"/>
+      <w:r>
+        <w:rPr>
+          <w:lang w:val="en-US"/>
+        </w:rPr>
+        <w:t xml:space="preserve"> </w:t>
+      </w:r>
+      <w:proofErr w:type="gramStart"/>
+      <w:r>
+        <w:rPr>
+          <w:lang w:val="en-US"/>
+        </w:rPr>
+        <w:t>was</w:t>
+      </w:r>
+      <w:proofErr w:type="gramEnd"/>
+      <w:r>
+        <w:rPr>
+          <w:lang w:val="en-US"/>
+        </w:rPr>
+        <w:t xml:space="preserve"> used for reading CSV and Excel files, cleaning the dataset, grouping records, calculating KPIs, and creating analytical tables. NumPy was used for numerical calculations and handling missing numerical values.</w:t>
       </w:r>
       <w:sdt>
         <w:sdtPr>
@@ -8671,7 +9073,7 @@
           <w:lang w:val="en-US"/>
         </w:rPr>
       </w:pPr>
-      <w:bookmarkStart w:id="33" w:name="_Toc230203440"/>
+      <w:bookmarkStart w:id="33" w:name="_Toc230427014"/>
       <w:r>
         <w:rPr>
           <w:lang w:val="en-US"/>
@@ -8692,11 +9094,33 @@
           <w:lang w:val="en-US"/>
         </w:rPr>
       </w:pPr>
-      <w:r>
-        <w:rPr>
-          <w:lang w:val="en-US"/>
-        </w:rPr>
-        <w:t>Streamlit was used to develop the interactive dashboard interface. It allowed the project to include different pages, filters, file upload components, KPI cards, charts, and tables.</w:t>
+      <w:proofErr w:type="spellStart"/>
+      <w:r>
+        <w:rPr>
+          <w:lang w:val="en-US"/>
+        </w:rPr>
+        <w:t>Streamlit</w:t>
+      </w:r>
+      <w:proofErr w:type="spellEnd"/>
+      <w:r>
+        <w:rPr>
+          <w:lang w:val="en-US"/>
+        </w:rPr>
+        <w:t xml:space="preserve"> was used to develop </w:t>
+      </w:r>
+      <w:proofErr w:type="gramStart"/>
+      <w:r>
+        <w:rPr>
+          <w:lang w:val="en-US"/>
+        </w:rPr>
+        <w:t>the</w:t>
+      </w:r>
+      <w:proofErr w:type="gramEnd"/>
+      <w:r>
+        <w:rPr>
+          <w:lang w:val="en-US"/>
+        </w:rPr>
+        <w:t xml:space="preserve"> interactive dashboard interface. It allowed the project to include different pages, filters, file upload components, KPI cards, charts, and tables.</w:t>
       </w:r>
     </w:p>
     <w:p>
@@ -8720,7 +9144,7 @@
           <w:lang w:val="en-US"/>
         </w:rPr>
       </w:pPr>
-      <w:bookmarkStart w:id="34" w:name="_Toc230203441"/>
+      <w:bookmarkStart w:id="34" w:name="_Toc230427015"/>
       <w:r>
         <w:rPr>
           <w:lang w:val="en-US"/>
@@ -9017,12 +9441,14 @@
                 <w:lang w:val="en-US"/>
               </w:rPr>
             </w:pPr>
+            <w:proofErr w:type="spellStart"/>
             <w:r>
               <w:rPr>
                 <w:lang w:val="en-US"/>
               </w:rPr>
               <w:t>Streamlit</w:t>
             </w:r>
+            <w:proofErr w:type="spellEnd"/>
           </w:p>
         </w:tc>
         <w:tc>
@@ -9539,7 +9965,7 @@
           <w:lang w:val="en-US"/>
         </w:rPr>
       </w:pPr>
-      <w:bookmarkStart w:id="36" w:name="_Toc230203442"/>
+      <w:bookmarkStart w:id="36" w:name="_Toc230427016"/>
       <w:r>
         <w:rPr>
           <w:lang w:val="en-US"/>
@@ -9558,7 +9984,21 @@
         <w:rPr>
           <w:lang w:val="en-US"/>
         </w:rPr>
-        <w:t>This section explains the technical development of the Supply Chain Visibility and Risk Assessment Platform. The system was designed as a dataset-adaptive dashboard platform. It can work with the default DataCo dataset, and it can also process user-uploaded supply chain datasets through column mapping and data standardization.</w:t>
+        <w:t xml:space="preserve">This section explains the technical development of the Supply Chain Visibility and Risk Assessment Platform. The system was designed as a dataset-adaptive dashboard platform. It can work with the default </w:t>
+      </w:r>
+      <w:proofErr w:type="spellStart"/>
+      <w:r>
+        <w:rPr>
+          <w:lang w:val="en-US"/>
+        </w:rPr>
+        <w:t>DataCo</w:t>
+      </w:r>
+      <w:proofErr w:type="spellEnd"/>
+      <w:r>
+        <w:rPr>
+          <w:lang w:val="en-US"/>
+        </w:rPr>
+        <w:t xml:space="preserve"> dataset, and it can also process user-uploaded supply chain datasets through column mapping and data standardization.</w:t>
       </w:r>
       <w:r>
         <w:rPr>
@@ -9581,7 +10021,7 @@
           <w:lang w:val="en-US"/>
         </w:rPr>
       </w:pPr>
-      <w:bookmarkStart w:id="37" w:name="_Toc230203443"/>
+      <w:bookmarkStart w:id="37" w:name="_Toc230427017"/>
       <w:r>
         <w:rPr>
           <w:lang w:val="en-US"/>
@@ -9606,7 +10046,21 @@
         <w:rPr>
           <w:lang w:val="en-US"/>
         </w:rPr>
-        <w:t>The platform consists of several connected layers. The first layer is the data source layer. This layer includes the default DataCo dataset and user-uploaded CSV or Excel datasets. The second layer is the Data Source Manager, where the user can upload a new dataset and select the active data source. The third layer is the column mapping and data adapter layer. This layer converts different dataset structures into a common supply chain schema.</w:t>
+        <w:t xml:space="preserve">The platform consists of several connected layers. The first layer is the data source layer. This layer includes the default </w:t>
+      </w:r>
+      <w:proofErr w:type="spellStart"/>
+      <w:r>
+        <w:rPr>
+          <w:lang w:val="en-US"/>
+        </w:rPr>
+        <w:t>DataCo</w:t>
+      </w:r>
+      <w:proofErr w:type="spellEnd"/>
+      <w:r>
+        <w:rPr>
+          <w:lang w:val="en-US"/>
+        </w:rPr>
+        <w:t xml:space="preserve"> dataset and user-uploaded CSV or Excel datasets. The second layer is the Data Source Manager, where the user can upload a new dataset and select the active data source. The third layer is the column mapping and data adapter layer. This layer converts different dataset structures into a common supply chain schema.</w:t>
       </w:r>
       <w:r>
         <w:rPr>
@@ -9619,7 +10073,21 @@
           <w:lang w:val="en-US"/>
         </w:rPr>
         <w:br/>
-        <w:t>After the data is standardized, the system creates dashboard-ready analytical tables such as orders, products, shipments, inventory, demand, and risk scores. These tables are then used by the Streamlit dashboard modules. The main dashboard modules are Overview, Regional Performance, Inventory Control, Shipment Performance, Supply Chain Risk, and Demand Forecast.</w:t>
+        <w:t xml:space="preserve">After the data is standardized, the system creates dashboard-ready analytical tables such as orders, products, shipments, inventory, demand, and risk scores. These tables are then used by the </w:t>
+      </w:r>
+      <w:proofErr w:type="spellStart"/>
+      <w:r>
+        <w:rPr>
+          <w:lang w:val="en-US"/>
+        </w:rPr>
+        <w:t>Streamlit</w:t>
+      </w:r>
+      <w:proofErr w:type="spellEnd"/>
+      <w:r>
+        <w:rPr>
+          <w:lang w:val="en-US"/>
+        </w:rPr>
+        <w:t xml:space="preserve"> dashboard modules. The main dashboard modules are Overview, Regional Performance, Inventory Control, Shipment Performance, Supply Chain Risk, and Demand Forecast.</w:t>
       </w:r>
     </w:p>
     <w:p>
@@ -9668,7 +10136,7 @@
           <w:lang w:val="en-US"/>
         </w:rPr>
         <w:drawing>
-          <wp:inline distT="0" distB="0" distL="0" distR="0" wp14:anchorId="13F4F06E" wp14:editId="5ECB6FCF">
+          <wp:inline distT="0" distB="0" distL="0" distR="0" wp14:anchorId="13F4F06E" wp14:editId="2CF85516">
             <wp:extent cx="5997778" cy="3952875"/>
             <wp:effectExtent l="0" t="0" r="3175" b="0"/>
             <wp:docPr id="36948891" name="Picture 1"/>
@@ -9784,7 +10252,7 @@
           <w:lang w:val="en-US"/>
         </w:rPr>
       </w:pPr>
-      <w:bookmarkStart w:id="39" w:name="_Toc230203444"/>
+      <w:bookmarkStart w:id="39" w:name="_Toc230427018"/>
       <w:r>
         <w:rPr>
           <w:lang w:val="en-US"/>
@@ -9803,7 +10271,21 @@
         <w:rPr>
           <w:lang w:val="en-US"/>
         </w:rPr>
-        <w:t>The Data Source Manager is the main component that makes the platform reusable. When the dashboard is opened, the default DataCo dataset is active. If the user wants to analyze another supply chain dataset, the user can upload a CSV or Excel file from the Data Source Manager on the Overview page.</w:t>
+        <w:t xml:space="preserve">The Data Source Manager is the main component that makes the platform reusable. When the dashboard is opened, the default </w:t>
+      </w:r>
+      <w:proofErr w:type="spellStart"/>
+      <w:r>
+        <w:rPr>
+          <w:lang w:val="en-US"/>
+        </w:rPr>
+        <w:t>DataCo</w:t>
+      </w:r>
+      <w:proofErr w:type="spellEnd"/>
+      <w:r>
+        <w:rPr>
+          <w:lang w:val="en-US"/>
+        </w:rPr>
+        <w:t xml:space="preserve"> dataset is active. If the user wants to analyze another supply chain dataset, the user can upload a CSV or Excel file from the Data Source Manager on the Overview page.</w:t>
       </w:r>
     </w:p>
     <w:p>
@@ -9843,7 +10325,35 @@
         <w:rPr>
           <w:lang w:val="en-US"/>
         </w:rPr>
-        <w:t>The uploaded dataset is used during the active Streamlit session. If the user activates the uploaded dataset, all dashboard pages use the uploaded data. If the user wants to return to the default dataset, the Data Source Manager provides an option to return to the default DataCo dataset.</w:t>
+        <w:t xml:space="preserve">The uploaded dataset is used during the active </w:t>
+      </w:r>
+      <w:proofErr w:type="spellStart"/>
+      <w:r>
+        <w:rPr>
+          <w:lang w:val="en-US"/>
+        </w:rPr>
+        <w:t>Streamlit</w:t>
+      </w:r>
+      <w:proofErr w:type="spellEnd"/>
+      <w:r>
+        <w:rPr>
+          <w:lang w:val="en-US"/>
+        </w:rPr>
+        <w:t xml:space="preserve"> session. If the user activates the uploaded dataset, all dashboard pages use the uploaded data. If the user wants to return to the default dataset, the Data Source Manager provides an option to return to the default </w:t>
+      </w:r>
+      <w:proofErr w:type="spellStart"/>
+      <w:r>
+        <w:rPr>
+          <w:lang w:val="en-US"/>
+        </w:rPr>
+        <w:t>DataCo</w:t>
+      </w:r>
+      <w:proofErr w:type="spellEnd"/>
+      <w:r>
+        <w:rPr>
+          <w:lang w:val="en-US"/>
+        </w:rPr>
+        <w:t xml:space="preserve"> dataset.</w:t>
       </w:r>
     </w:p>
     <w:p>
@@ -9888,7 +10398,7 @@
           <w:lang w:val="en-US"/>
         </w:rPr>
       </w:pPr>
-      <w:bookmarkStart w:id="40" w:name="_Toc230203445"/>
+      <w:bookmarkStart w:id="40" w:name="_Toc230427019"/>
       <w:r>
         <w:rPr>
           <w:lang w:val="en-US"/>
@@ -9928,7 +10438,21 @@
         <w:rPr>
           <w:lang w:val="en-US"/>
         </w:rPr>
-        <w:t>The standard schema used in the platform is shown in Table 2.</w:t>
+        <w:t xml:space="preserve">The standard </w:t>
+      </w:r>
+      <w:proofErr w:type="gramStart"/>
+      <w:r>
+        <w:rPr>
+          <w:lang w:val="en-US"/>
+        </w:rPr>
+        <w:t>schema</w:t>
+      </w:r>
+      <w:proofErr w:type="gramEnd"/>
+      <w:r>
+        <w:rPr>
+          <w:lang w:val="en-US"/>
+        </w:rPr>
+        <w:t xml:space="preserve"> used in the platform is shown in Table 2.</w:t>
       </w:r>
       <w:r>
         <w:rPr>
@@ -10090,12 +10614,14 @@
                 <w:lang w:val="en-US"/>
               </w:rPr>
             </w:pPr>
+            <w:proofErr w:type="spellStart"/>
             <w:r>
               <w:rPr>
                 <w:lang w:val="en-US"/>
               </w:rPr>
               <w:t>order_id</w:t>
             </w:r>
+            <w:proofErr w:type="spellEnd"/>
           </w:p>
         </w:tc>
         <w:tc>
@@ -10158,12 +10684,14 @@
                 <w:lang w:val="en-US"/>
               </w:rPr>
             </w:pPr>
+            <w:proofErr w:type="spellStart"/>
             <w:r>
               <w:rPr>
                 <w:lang w:val="en-US"/>
               </w:rPr>
               <w:t>order_date</w:t>
             </w:r>
+            <w:proofErr w:type="spellEnd"/>
           </w:p>
         </w:tc>
         <w:tc>
@@ -10214,12 +10742,14 @@
                 <w:lang w:val="en-US"/>
               </w:rPr>
             </w:pPr>
+            <w:proofErr w:type="spellStart"/>
             <w:r>
               <w:rPr>
                 <w:lang w:val="en-US"/>
               </w:rPr>
               <w:t>product_name</w:t>
             </w:r>
+            <w:proofErr w:type="spellEnd"/>
           </w:p>
         </w:tc>
         <w:tc>
@@ -10270,12 +10800,14 @@
                 <w:lang w:val="en-US"/>
               </w:rPr>
             </w:pPr>
+            <w:proofErr w:type="spellStart"/>
             <w:r>
               <w:rPr>
                 <w:lang w:val="en-US"/>
               </w:rPr>
               <w:t>category_name</w:t>
             </w:r>
+            <w:proofErr w:type="spellEnd"/>
           </w:p>
         </w:tc>
         <w:tc>
@@ -10326,12 +10858,14 @@
                 <w:lang w:val="en-US"/>
               </w:rPr>
             </w:pPr>
+            <w:proofErr w:type="spellStart"/>
             <w:r>
               <w:rPr>
                 <w:lang w:val="en-US"/>
               </w:rPr>
               <w:t>order_quantity</w:t>
             </w:r>
+            <w:proofErr w:type="spellEnd"/>
           </w:p>
         </w:tc>
         <w:tc>
@@ -10382,12 +10916,14 @@
                 <w:lang w:val="en-US"/>
               </w:rPr>
             </w:pPr>
+            <w:proofErr w:type="spellStart"/>
             <w:r>
               <w:rPr>
                 <w:lang w:val="en-US"/>
               </w:rPr>
               <w:t>shipping_date</w:t>
             </w:r>
+            <w:proofErr w:type="spellEnd"/>
           </w:p>
         </w:tc>
         <w:tc>
@@ -10438,12 +10974,14 @@
                 <w:lang w:val="en-US"/>
               </w:rPr>
             </w:pPr>
+            <w:proofErr w:type="spellStart"/>
             <w:r>
               <w:rPr>
                 <w:lang w:val="en-US"/>
               </w:rPr>
               <w:t>scheduled_delivery_date</w:t>
             </w:r>
+            <w:proofErr w:type="spellEnd"/>
           </w:p>
         </w:tc>
         <w:tc>
@@ -10494,12 +11032,14 @@
                 <w:lang w:val="en-US"/>
               </w:rPr>
             </w:pPr>
+            <w:proofErr w:type="spellStart"/>
             <w:r>
               <w:rPr>
                 <w:lang w:val="en-US"/>
               </w:rPr>
               <w:t>delivery_status</w:t>
             </w:r>
+            <w:proofErr w:type="spellEnd"/>
           </w:p>
         </w:tc>
         <w:tc>
@@ -10550,12 +11090,14 @@
                 <w:lang w:val="en-US"/>
               </w:rPr>
             </w:pPr>
+            <w:proofErr w:type="spellStart"/>
             <w:r>
               <w:rPr>
                 <w:lang w:val="en-US"/>
               </w:rPr>
               <w:t>actual_shipping_days</w:t>
             </w:r>
+            <w:proofErr w:type="spellEnd"/>
           </w:p>
         </w:tc>
         <w:tc>
@@ -10606,12 +11148,14 @@
                 <w:lang w:val="en-US"/>
               </w:rPr>
             </w:pPr>
+            <w:proofErr w:type="spellStart"/>
             <w:r>
               <w:rPr>
                 <w:lang w:val="en-US"/>
               </w:rPr>
               <w:t>scheduled_shipping_days</w:t>
             </w:r>
+            <w:proofErr w:type="spellEnd"/>
           </w:p>
         </w:tc>
         <w:tc>
@@ -10662,12 +11206,14 @@
                 <w:lang w:val="en-US"/>
               </w:rPr>
             </w:pPr>
+            <w:proofErr w:type="spellStart"/>
             <w:r>
               <w:rPr>
                 <w:lang w:val="en-US"/>
               </w:rPr>
               <w:t>shipping_mode</w:t>
             </w:r>
+            <w:proofErr w:type="spellEnd"/>
           </w:p>
         </w:tc>
         <w:tc>
@@ -10774,12 +11320,14 @@
                 <w:lang w:val="en-US"/>
               </w:rPr>
             </w:pPr>
+            <w:proofErr w:type="spellStart"/>
             <w:r>
               <w:rPr>
                 <w:lang w:val="en-US"/>
               </w:rPr>
               <w:t>order_region</w:t>
             </w:r>
+            <w:proofErr w:type="spellEnd"/>
           </w:p>
         </w:tc>
         <w:tc>
@@ -10830,12 +11378,14 @@
                 <w:lang w:val="en-US"/>
               </w:rPr>
             </w:pPr>
+            <w:proofErr w:type="spellStart"/>
             <w:r>
               <w:rPr>
                 <w:lang w:val="en-US"/>
               </w:rPr>
               <w:t>order_country</w:t>
             </w:r>
+            <w:proofErr w:type="spellEnd"/>
           </w:p>
         </w:tc>
         <w:tc>
@@ -10942,12 +11492,14 @@
                 <w:lang w:val="en-US"/>
               </w:rPr>
             </w:pPr>
+            <w:proofErr w:type="spellStart"/>
             <w:r>
               <w:rPr>
                 <w:lang w:val="en-US"/>
               </w:rPr>
               <w:t>order_profit</w:t>
             </w:r>
+            <w:proofErr w:type="spellEnd"/>
           </w:p>
         </w:tc>
         <w:tc>
@@ -11005,7 +11557,21 @@
         <w:rPr>
           <w:lang w:val="en-US"/>
         </w:rPr>
-        <w:t>If an optional field is not available in the uploaded dataset, the system uses default values or derives indicators when possible. For example, if actual shipping days and scheduled shipping days are not available, the system can calculate delay days by comparing the actual delivery date and the scheduled delivery date. This improves the flexibility of the platform and allows it to work with different supply chain datasets.</w:t>
+        <w:t xml:space="preserve">If an optional field is not available in the uploaded dataset, the system uses default values or derives indicators when possible. For example, if actual shipping days and scheduled shipping days are not available, the system can calculate </w:t>
+      </w:r>
+      <w:proofErr w:type="gramStart"/>
+      <w:r>
+        <w:rPr>
+          <w:lang w:val="en-US"/>
+        </w:rPr>
+        <w:t>delay</w:t>
+      </w:r>
+      <w:proofErr w:type="gramEnd"/>
+      <w:r>
+        <w:rPr>
+          <w:lang w:val="en-US"/>
+        </w:rPr>
+        <w:t xml:space="preserve"> days by comparing the actual delivery date and the scheduled delivery date. This improves the flexibility of the platform and allows it to work with different supply chain datasets.</w:t>
       </w:r>
     </w:p>
     <w:p>
@@ -11015,7 +11581,7 @@
           <w:lang w:val="en-US"/>
         </w:rPr>
       </w:pPr>
-      <w:bookmarkStart w:id="42" w:name="_Toc230203446"/>
+      <w:bookmarkStart w:id="42" w:name="_Toc230427020"/>
       <w:r>
         <w:rPr>
           <w:lang w:val="en-US"/>
@@ -11054,7 +11620,35 @@
           <w:lang w:val="en-US"/>
         </w:rPr>
         <w:br/>
-        <w:t>The main analytical tables are orders, products, shipments, inventory, demand, and risk_scores. The orders table is the central table because it contains the main order-level information. The shipments table is created from order and delivery-related fields. The inventory table is generated from product and demand patterns. The demand table summarizes monthly demand by product category. The risk_scores table stores regional risk indicators.</w:t>
+        <w:t xml:space="preserve">The main analytical tables are orders, products, shipments, inventory, demand, and </w:t>
+      </w:r>
+      <w:proofErr w:type="spellStart"/>
+      <w:r>
+        <w:rPr>
+          <w:lang w:val="en-US"/>
+        </w:rPr>
+        <w:t>risk_scores</w:t>
+      </w:r>
+      <w:proofErr w:type="spellEnd"/>
+      <w:r>
+        <w:rPr>
+          <w:lang w:val="en-US"/>
+        </w:rPr>
+        <w:t xml:space="preserve">. The orders table is the central table because it contains the main order-level information. The shipments table is created from order and delivery-related fields. The inventory table is generated from product and demand patterns. The demand table summarizes monthly demand by product category. The </w:t>
+      </w:r>
+      <w:proofErr w:type="spellStart"/>
+      <w:r>
+        <w:rPr>
+          <w:lang w:val="en-US"/>
+        </w:rPr>
+        <w:t>risk_scores</w:t>
+      </w:r>
+      <w:proofErr w:type="spellEnd"/>
+      <w:r>
+        <w:rPr>
+          <w:lang w:val="en-US"/>
+        </w:rPr>
+        <w:t xml:space="preserve"> table stores regional risk indicators.</w:t>
       </w:r>
       <w:r>
         <w:rPr>
@@ -11083,7 +11677,7 @@
           <w:lang w:val="en-US"/>
         </w:rPr>
         <w:drawing>
-          <wp:inline distT="0" distB="0" distL="0" distR="0" wp14:anchorId="670A0A81" wp14:editId="286FA9A2">
+          <wp:inline distT="0" distB="0" distL="0" distR="0" wp14:anchorId="670A0A81" wp14:editId="4E3A4866">
             <wp:extent cx="6162675" cy="4108228"/>
             <wp:effectExtent l="0" t="0" r="0" b="6985"/>
             <wp:docPr id="604311595" name="Picture 2"/>
@@ -11213,7 +11807,7 @@
           <w:lang w:val="en-US"/>
         </w:rPr>
       </w:pPr>
-      <w:bookmarkStart w:id="44" w:name="_Toc230203447"/>
+      <w:bookmarkStart w:id="44" w:name="_Toc230427021"/>
       <w:r>
         <w:rPr>
           <w:lang w:val="en-US"/>
@@ -11232,7 +11826,21 @@
         <w:rPr>
           <w:lang w:val="en-US"/>
         </w:rPr>
-        <w:t>The platform includes six dashboard modules. Each module focuses on a different part of supply chain visibility and risk analysis. These modules work with the active dataset. If the user activates an uploaded dataset, the same dashboard modules are updated according to the uploaded data.</w:t>
+        <w:t xml:space="preserve">The platform includes six dashboard modules. Each module focuses on a different part of supply chain visibility and risk analysis. These modules work with </w:t>
+      </w:r>
+      <w:proofErr w:type="gramStart"/>
+      <w:r>
+        <w:rPr>
+          <w:lang w:val="en-US"/>
+        </w:rPr>
+        <w:t>the</w:t>
+      </w:r>
+      <w:proofErr w:type="gramEnd"/>
+      <w:r>
+        <w:rPr>
+          <w:lang w:val="en-US"/>
+        </w:rPr>
+        <w:t xml:space="preserve"> active dataset. If the user activates an uploaded dataset, the same dashboard modules are updated according to the uploaded data.</w:t>
       </w:r>
     </w:p>
     <w:p>
@@ -11504,11 +12112,19 @@
                 <w:lang w:val="en-US"/>
               </w:rPr>
             </w:pPr>
-            <w:r>
-              <w:rPr>
-                <w:lang w:val="en-US"/>
-              </w:rPr>
-              <w:t>Compares markets, regions, and countries</w:t>
+            <w:proofErr w:type="gramStart"/>
+            <w:r>
+              <w:rPr>
+                <w:lang w:val="en-US"/>
+              </w:rPr>
+              <w:t>Compares</w:t>
+            </w:r>
+            <w:proofErr w:type="gramEnd"/>
+            <w:r>
+              <w:rPr>
+                <w:lang w:val="en-US"/>
+              </w:rPr>
+              <w:t xml:space="preserve"> markets, regions, and countries</w:t>
             </w:r>
           </w:p>
         </w:tc>
@@ -11766,7 +12382,21 @@
         <w:rPr>
           <w:lang w:val="en-US"/>
         </w:rPr>
-        <w:t>The modular structure makes the platform easier to understand and maintain. Each page has a specific responsibility, but all pages use the same active dataset. This design supports both the default DataCo dataset and user-uploaded datasets.</w:t>
+        <w:t xml:space="preserve">The modular structure makes the platform easier to understand and maintain. Each page has a specific responsibility, but all pages use the same active dataset. This design supports both the default </w:t>
+      </w:r>
+      <w:proofErr w:type="spellStart"/>
+      <w:r>
+        <w:rPr>
+          <w:lang w:val="en-US"/>
+        </w:rPr>
+        <w:t>DataCo</w:t>
+      </w:r>
+      <w:proofErr w:type="spellEnd"/>
+      <w:r>
+        <w:rPr>
+          <w:lang w:val="en-US"/>
+        </w:rPr>
+        <w:t xml:space="preserve"> dataset and user-uploaded datasets.</w:t>
       </w:r>
     </w:p>
     <w:p>
@@ -11776,7 +12406,7 @@
           <w:lang w:val="en-US"/>
         </w:rPr>
       </w:pPr>
-      <w:bookmarkStart w:id="46" w:name="_Toc230203448"/>
+      <w:bookmarkStart w:id="46" w:name="_Toc230427022"/>
       <w:r>
         <w:rPr>
           <w:lang w:val="en-US"/>
@@ -12713,7 +13343,21 @@
         <w:rPr>
           <w:lang w:val="en-US"/>
         </w:rPr>
-        <w:t>The risk scoring logic is also affected by dashboard filters. When the user filters the dataset by market, category, shipping mode, or date range, the risk components are recalculated based on the filtered data. This makes the risk analysis interactive and more useful for decision-making.</w:t>
+        <w:t xml:space="preserve">The risk scoring logic is also affected by dashboard filters. When the user filters the dataset by market, category, shipping mode, or date range, the risk components are recalculated based on the filtered data. This makes </w:t>
+      </w:r>
+      <w:proofErr w:type="gramStart"/>
+      <w:r>
+        <w:rPr>
+          <w:lang w:val="en-US"/>
+        </w:rPr>
+        <w:t>the risk</w:t>
+      </w:r>
+      <w:proofErr w:type="gramEnd"/>
+      <w:r>
+        <w:rPr>
+          <w:lang w:val="en-US"/>
+        </w:rPr>
+        <w:t xml:space="preserve"> analysis interactive and more useful for decision-making.</w:t>
       </w:r>
     </w:p>
     <w:p>
@@ -12723,7 +13367,7 @@
           <w:lang w:val="en-US"/>
         </w:rPr>
       </w:pPr>
-      <w:bookmarkStart w:id="48" w:name="_Toc230203449"/>
+      <w:bookmarkStart w:id="48" w:name="_Toc230427023"/>
       <w:r>
         <w:rPr>
           <w:lang w:val="en-US"/>
@@ -12850,7 +13494,35 @@
         <w:rPr>
           <w:lang w:val="en-US"/>
         </w:rPr>
-        <w:t>The forecasting approach is intentionally simple because the main focus of the project is supply chain visibility and risk assessment. The purpose of the forecast module is to demonstrate how demand data can support planning decisions, not to create a highly advanced forecasting system.</w:t>
+        <w:t xml:space="preserve">The forecasting approach is intentionally simple because the </w:t>
+      </w:r>
+      <w:proofErr w:type="gramStart"/>
+      <w:r>
+        <w:rPr>
+          <w:lang w:val="en-US"/>
+        </w:rPr>
+        <w:t>main focus</w:t>
+      </w:r>
+      <w:proofErr w:type="gramEnd"/>
+      <w:r>
+        <w:rPr>
+          <w:lang w:val="en-US"/>
+        </w:rPr>
+        <w:t xml:space="preserve"> of the project is </w:t>
+      </w:r>
+      <w:proofErr w:type="gramStart"/>
+      <w:r>
+        <w:rPr>
+          <w:lang w:val="en-US"/>
+        </w:rPr>
+        <w:t>supply</w:t>
+      </w:r>
+      <w:proofErr w:type="gramEnd"/>
+      <w:r>
+        <w:rPr>
+          <w:lang w:val="en-US"/>
+        </w:rPr>
+        <w:t xml:space="preserve"> chain visibility and risk assessment. The purpose of the forecast module is to demonstrate how demand data can support planning decisions, not to create a highly advanced forecasting system.</w:t>
       </w:r>
     </w:p>
     <w:p>
@@ -12867,7 +13539,7 @@
           <w:lang w:val="en-US"/>
         </w:rPr>
       </w:pPr>
-      <w:bookmarkStart w:id="49" w:name="_Toc230203450"/>
+      <w:bookmarkStart w:id="49" w:name="_Toc230427024"/>
       <w:r>
         <w:rPr>
           <w:lang w:val="en-US"/>
@@ -12886,7 +13558,35 @@
         <w:rPr>
           <w:lang w:val="en-US"/>
         </w:rPr>
-        <w:t>The dashboard interface was developed with Streamlit. The platform includes a sidebar navigation menu and multiple dashboard pages. The Overview page includes the Data Source Manager, which allows users to upload a new dataset, map columns, activate the uploaded dataset, or return to the default DataCo dataset.</w:t>
+        <w:t xml:space="preserve">The dashboard interface was developed with </w:t>
+      </w:r>
+      <w:proofErr w:type="spellStart"/>
+      <w:r>
+        <w:rPr>
+          <w:lang w:val="en-US"/>
+        </w:rPr>
+        <w:t>Streamlit</w:t>
+      </w:r>
+      <w:proofErr w:type="spellEnd"/>
+      <w:r>
+        <w:rPr>
+          <w:lang w:val="en-US"/>
+        </w:rPr>
+        <w:t xml:space="preserve">. The platform includes a sidebar navigation menu and multiple dashboard pages. The Overview page includes the Data Source Manager, which allows users to upload a new dataset, map columns, activate the uploaded dataset, or return to the default </w:t>
+      </w:r>
+      <w:proofErr w:type="spellStart"/>
+      <w:r>
+        <w:rPr>
+          <w:lang w:val="en-US"/>
+        </w:rPr>
+        <w:t>DataCo</w:t>
+      </w:r>
+      <w:proofErr w:type="spellEnd"/>
+      <w:r>
+        <w:rPr>
+          <w:lang w:val="en-US"/>
+        </w:rPr>
+        <w:t xml:space="preserve"> dataset.</w:t>
       </w:r>
     </w:p>
     <w:p>
@@ -12929,7 +13629,7 @@
         </w:rPr>
         <w:lastRenderedPageBreak/>
         <w:drawing>
-          <wp:inline distT="0" distB="0" distL="0" distR="0" wp14:anchorId="385ACC34" wp14:editId="6C62E171">
+          <wp:inline distT="0" distB="0" distL="0" distR="0" wp14:anchorId="385ACC34" wp14:editId="62BED690">
             <wp:extent cx="6357908" cy="3705225"/>
             <wp:effectExtent l="0" t="0" r="5080" b="0"/>
             <wp:docPr id="1801230199" name="Picture 4"/>
@@ -13476,7 +14176,7 @@
           <w:lang w:val="en-US"/>
         </w:rPr>
       </w:pPr>
-      <w:bookmarkStart w:id="54" w:name="_Toc230203451"/>
+      <w:bookmarkStart w:id="54" w:name="_Toc230427025"/>
       <w:r>
         <w:rPr>
           <w:lang w:val="en-US"/>
@@ -13505,7 +14205,7 @@
           <w:lang w:val="en-US"/>
         </w:rPr>
       </w:pPr>
-      <w:bookmarkStart w:id="55" w:name="_Toc230203452"/>
+      <w:bookmarkStart w:id="55" w:name="_Toc230427026"/>
       <w:r>
         <w:rPr>
           <w:lang w:val="en-US"/>
@@ -13550,7 +14250,21 @@
           <w:lang w:val="en-US"/>
         </w:rPr>
         <w:br/>
-        <w:t>The company needs a reusable dashboard platform that can work with different supply chain datasets. The platform should not require code changes every time a new dataset is analyzed. Instead, users should be able to upload a dataset, map its columns to a standard schema, and generate dashboard pages based on the active dataset.</w:t>
+        <w:t xml:space="preserve">The company needs a reusable dashboard platform that can work with different supply chain datasets. The platform should not require code changes every time a new </w:t>
+      </w:r>
+      <w:proofErr w:type="gramStart"/>
+      <w:r>
+        <w:rPr>
+          <w:lang w:val="en-US"/>
+        </w:rPr>
+        <w:t>dataset</w:t>
+      </w:r>
+      <w:proofErr w:type="gramEnd"/>
+      <w:r>
+        <w:rPr>
+          <w:lang w:val="en-US"/>
+        </w:rPr>
+        <w:t xml:space="preserve"> is analyzed. Instead, users should be able to upload a dataset, map its columns to a standard schema, and generate dashboard pages based on the active dataset.</w:t>
       </w:r>
     </w:p>
     <w:p>
@@ -13570,7 +14284,21 @@
           <w:lang w:val="en-US"/>
         </w:rPr>
         <w:br/>
-        <w:t>In this project, the DataCo dataset is used as the default demonstration dataset. However, the business case also considers a situation where a user uploads a new company dataset. After the uploaded dataset is mapped and standardized, the dashboard pages are updated dynamically.</w:t>
+        <w:t xml:space="preserve">In this project, the </w:t>
+      </w:r>
+      <w:proofErr w:type="spellStart"/>
+      <w:r>
+        <w:rPr>
+          <w:lang w:val="en-US"/>
+        </w:rPr>
+        <w:t>DataCo</w:t>
+      </w:r>
+      <w:proofErr w:type="spellEnd"/>
+      <w:r>
+        <w:rPr>
+          <w:lang w:val="en-US"/>
+        </w:rPr>
+        <w:t xml:space="preserve"> dataset is used as the default demonstration dataset. However, the business case also considers a situation where a user uploads a new company dataset. After the uploaded dataset is mapped and standardized, the dashboard pages are updated dynamically.</w:t>
       </w:r>
     </w:p>
     <w:p>
@@ -13580,7 +14308,7 @@
           <w:lang w:val="en-US"/>
         </w:rPr>
       </w:pPr>
-      <w:bookmarkStart w:id="56" w:name="_Toc230203453"/>
+      <w:bookmarkStart w:id="56" w:name="_Toc230427027"/>
       <w:r>
         <w:rPr>
           <w:lang w:val="en-US"/>
@@ -13981,7 +14709,7 @@
           <w:lang w:val="en-US"/>
         </w:rPr>
       </w:pPr>
-      <w:bookmarkStart w:id="58" w:name="_Toc230203454"/>
+      <w:bookmarkStart w:id="58" w:name="_Toc230427028"/>
       <w:r>
         <w:rPr>
           <w:lang w:val="en-US"/>
@@ -14037,7 +14765,7 @@
         </w:rPr>
         <w:lastRenderedPageBreak/>
         <w:drawing>
-          <wp:inline distT="0" distB="0" distL="0" distR="0" wp14:anchorId="2FC8B4CF" wp14:editId="3640BB6C">
+          <wp:inline distT="0" distB="0" distL="0" distR="0" wp14:anchorId="2FC8B4CF" wp14:editId="1FBAF7BD">
             <wp:extent cx="5868670" cy="3867785"/>
             <wp:effectExtent l="0" t="0" r="0" b="0"/>
             <wp:docPr id="656098705" name="Picture 5"/>
@@ -14160,7 +14888,7 @@
           <w:lang w:val="en-US"/>
         </w:rPr>
       </w:pPr>
-      <w:bookmarkStart w:id="60" w:name="_Toc230203455"/>
+      <w:bookmarkStart w:id="60" w:name="_Toc230427029"/>
       <w:r>
         <w:rPr>
           <w:lang w:val="en-US"/>
@@ -14179,7 +14907,49 @@
         <w:rPr>
           <w:lang w:val="en-US"/>
         </w:rPr>
-        <w:t>An example usage flow starts with the user opening the platform. At first, the default DataCo dataset is active. The user can review the default dashboard, or upload a new supply chain dataset through the Data Source Manager.</w:t>
+        <w:t xml:space="preserve">An example usage flow starts with the user opening the platform. </w:t>
+      </w:r>
+      <w:proofErr w:type="gramStart"/>
+      <w:r>
+        <w:rPr>
+          <w:lang w:val="en-US"/>
+        </w:rPr>
+        <w:t>At first</w:t>
+      </w:r>
+      <w:proofErr w:type="gramEnd"/>
+      <w:r>
+        <w:rPr>
+          <w:lang w:val="en-US"/>
+        </w:rPr>
+        <w:t xml:space="preserve">, the default </w:t>
+      </w:r>
+      <w:proofErr w:type="spellStart"/>
+      <w:r>
+        <w:rPr>
+          <w:lang w:val="en-US"/>
+        </w:rPr>
+        <w:t>DataCo</w:t>
+      </w:r>
+      <w:proofErr w:type="spellEnd"/>
+      <w:r>
+        <w:rPr>
+          <w:lang w:val="en-US"/>
+        </w:rPr>
+        <w:t xml:space="preserve"> dataset is active. The user can review the default </w:t>
+      </w:r>
+      <w:proofErr w:type="gramStart"/>
+      <w:r>
+        <w:rPr>
+          <w:lang w:val="en-US"/>
+        </w:rPr>
+        <w:t>dashboard, or</w:t>
+      </w:r>
+      <w:proofErr w:type="gramEnd"/>
+      <w:r>
+        <w:rPr>
+          <w:lang w:val="en-US"/>
+        </w:rPr>
+        <w:t xml:space="preserve"> upload a new supply chain dataset through the Data Source Manager.</w:t>
       </w:r>
     </w:p>
     <w:p>
@@ -14236,7 +15006,7 @@
           <w:lang w:val="en-US"/>
         </w:rPr>
       </w:pPr>
-      <w:bookmarkStart w:id="61" w:name="_Toc230203456"/>
+      <w:bookmarkStart w:id="61" w:name="_Toc230427030"/>
       <w:r>
         <w:rPr>
           <w:lang w:val="en-US"/>
@@ -14306,7 +15076,7 @@
           <w:lang w:val="en-US"/>
         </w:rPr>
       </w:pPr>
-      <w:bookmarkStart w:id="62" w:name="_Toc230203457"/>
+      <w:bookmarkStart w:id="62" w:name="_Toc230427031"/>
       <w:r>
         <w:rPr>
           <w:lang w:val="en-US"/>
@@ -14331,7 +15101,21 @@
         <w:rPr>
           <w:lang w:val="en-US"/>
         </w:rPr>
-        <w:t>This graduation thesis developed a Supply Chain Visibility and Risk Assessment Platform using Python and Streamlit. The main goal of the project was to create an interactive decision-support system that can help users monitor supply chain performance, identify operational risks, and analyze demand patterns from a single interface.</w:t>
+        <w:t xml:space="preserve">This graduation thesis developed a Supply Chain Visibility and Risk Assessment Platform using Python and </w:t>
+      </w:r>
+      <w:proofErr w:type="spellStart"/>
+      <w:r>
+        <w:rPr>
+          <w:lang w:val="en-US"/>
+        </w:rPr>
+        <w:t>Streamlit</w:t>
+      </w:r>
+      <w:proofErr w:type="spellEnd"/>
+      <w:r>
+        <w:rPr>
+          <w:lang w:val="en-US"/>
+        </w:rPr>
+        <w:t>. The main goal of the project was to create an interactive decision-support system that can help users monitor supply chain performance, identify operational risks, and analyze demand patterns from a single interface.</w:t>
       </w:r>
     </w:p>
     <w:p>
@@ -14351,7 +15135,21 @@
           <w:lang w:val="en-US"/>
         </w:rPr>
         <w:br/>
-        <w:t>The completed platform includes several dashboard modules: Overview, Regional Performance, Inventory Control, Shipment Performance, Supply Chain Risk, and Demand Forecast. These modules provide key performance indicators, charts, tables, risk scores, and forecasting outputs. The dashboard helps users analyze delivery performance, shipment delays, inventory status, regional differences, demand trends, and overall supply chain risk.</w:t>
+        <w:t xml:space="preserve">The completed platform includes several dashboard modules: Overview, Regional Performance, Inventory Control, Shipment Performance, Supply Chain Risk, and Demand Forecast. These modules provide key performance indicators, charts, tables, risk scores, and </w:t>
+      </w:r>
+      <w:proofErr w:type="gramStart"/>
+      <w:r>
+        <w:rPr>
+          <w:lang w:val="en-US"/>
+        </w:rPr>
+        <w:t>forecasting</w:t>
+      </w:r>
+      <w:proofErr w:type="gramEnd"/>
+      <w:r>
+        <w:rPr>
+          <w:lang w:val="en-US"/>
+        </w:rPr>
+        <w:t xml:space="preserve"> outputs. The dashboard helps users analyze delivery performance, shipment delays, inventory status, regional differences, demand trends, and overall supply chain risk.</w:t>
       </w:r>
     </w:p>
     <w:p>
@@ -14371,7 +15169,21 @@
           <w:lang w:val="en-US"/>
         </w:rPr>
         <w:br/>
-        <w:t>One of the strongest parts of the project is the dataset upload and standardization feature. The system is not limited to the default DataCo dataset. Users can upload a new supply chain dataset in CSV or Excel format, map the dataset columns to a standard schema, and generate dashboard pages based on the uploaded dataset. This makes the platform more reusable and flexible than a static dashboard built for only one dataset.</w:t>
+        <w:t xml:space="preserve">One of the strongest parts of the project is the dataset upload and standardization feature. The system is not limited to the default </w:t>
+      </w:r>
+      <w:proofErr w:type="spellStart"/>
+      <w:r>
+        <w:rPr>
+          <w:lang w:val="en-US"/>
+        </w:rPr>
+        <w:t>DataCo</w:t>
+      </w:r>
+      <w:proofErr w:type="spellEnd"/>
+      <w:r>
+        <w:rPr>
+          <w:lang w:val="en-US"/>
+        </w:rPr>
+        <w:t xml:space="preserve"> dataset. Users can upload a new supply chain dataset in CSV or Excel format, map the dataset columns to a standard schema, and generate dashboard pages based on the uploaded dataset. This makes the platform more reusable and flexible than a static dashboard built for only one dataset.</w:t>
       </w:r>
     </w:p>
     <w:p>
@@ -14431,7 +15243,21 @@
           <w:lang w:val="en-US"/>
         </w:rPr>
         <w:br/>
-        <w:t>The project has some limitations. The default DataCo dataset is a public historical dataset and does not represent the current operations of a specific company. In addition, the quality of the dashboard outputs depends on the structure and completeness of the uploaded dataset. Some indicators, especially inventory-related fields, are generated for academic demonstration purposes when the uploaded dataset does not contain complete inventory information. The risk score is also rule-based rather than machine-learning-based.</w:t>
+        <w:t xml:space="preserve">The project has some limitations. The default </w:t>
+      </w:r>
+      <w:proofErr w:type="spellStart"/>
+      <w:r>
+        <w:rPr>
+          <w:lang w:val="en-US"/>
+        </w:rPr>
+        <w:t>DataCo</w:t>
+      </w:r>
+      <w:proofErr w:type="spellEnd"/>
+      <w:r>
+        <w:rPr>
+          <w:lang w:val="en-US"/>
+        </w:rPr>
+        <w:t xml:space="preserve"> dataset is a public historical dataset and does not represent the current operations of a specific company. In addition, the quality of the dashboard outputs depends on the structure and completeness of the uploaded dataset. Some indicators, especially inventory-related fields, are generated for academic demonstration purposes when the uploaded dataset does not contain complete inventory information. The risk score is also rule-based rather than machine-learning-based.</w:t>
       </w:r>
     </w:p>
     <w:p>
@@ -14525,9 +15351,9 @@
         </w:rPr>
       </w:pPr>
     </w:p>
-    <w:bookmarkStart w:id="63" w:name="_Toc32521151" w:displacedByCustomXml="next"/>
+    <w:bookmarkStart w:id="63" w:name="_Toc230427032" w:displacedByCustomXml="next"/>
     <w:bookmarkStart w:id="64" w:name="_Toc494826192" w:displacedByCustomXml="next"/>
-    <w:bookmarkStart w:id="65" w:name="_Toc230203458" w:displacedByCustomXml="next"/>
+    <w:bookmarkStart w:id="65" w:name="_Toc32521151" w:displacedByCustomXml="next"/>
     <w:sdt>
       <w:sdtPr>
         <w:rPr>
@@ -14736,7 +15562,7 @@
             <w:rPr>
               <w:noProof/>
             </w:rPr>
-            <w:t xml:space="preserve">Kalaiarasan, R. O. (2022). The ABCDE of supply chain visibility: A systematic literature review and framework. </w:t>
+            <w:t xml:space="preserve">Kalaiarasan, R., Olhager, J., Agrawal, T., &amp; Wiktorsson, M. (2022). The ABCDE of supply chain visibility: A systematic literature review and framework. </w:t>
           </w:r>
           <w:r>
             <w:rPr>
@@ -14953,13 +15779,27 @@
           <w:lang w:val="en-US"/>
         </w:rPr>
       </w:pPr>
-      <w:bookmarkStart w:id="67" w:name="_Toc230203459"/>
+      <w:bookmarkStart w:id="67" w:name="_Toc230427033"/>
       <w:r>
         <w:rPr>
           <w:lang w:val="en-US"/>
         </w:rPr>
         <w:lastRenderedPageBreak/>
-        <w:t>GIT/KAGGLE/COLAB/etc.. LINK</w:t>
+        <w:t>GIT/KAGGLE/COLAB/</w:t>
+      </w:r>
+      <w:proofErr w:type="gramStart"/>
+      <w:r>
+        <w:rPr>
+          <w:lang w:val="en-US"/>
+        </w:rPr>
+        <w:t>etc..</w:t>
+      </w:r>
+      <w:proofErr w:type="gramEnd"/>
+      <w:r>
+        <w:rPr>
+          <w:lang w:val="en-US"/>
+        </w:rPr>
+        <w:t xml:space="preserve"> LINK</w:t>
       </w:r>
       <w:bookmarkEnd w:id="67"/>
     </w:p>
@@ -15037,7 +15877,23 @@
           <w:lang w:val="en-US"/>
         </w:rPr>
         <w:br/>
-        <w:t>The default dataset is the DataCo Smart Supply Chain dataset. The platform also supports user-uploaded CSV and Excel supply chain datasets through the Data Source Manager.</w:t>
+        <w:t xml:space="preserve">The default dataset is the </w:t>
+      </w:r>
+      <w:proofErr w:type="spellStart"/>
+      <w:r>
+        <w:rPr>
+          <w:color w:val="000000" w:themeColor="text1"/>
+          <w:lang w:val="en-US"/>
+        </w:rPr>
+        <w:t>DataCo</w:t>
+      </w:r>
+      <w:proofErr w:type="spellEnd"/>
+      <w:r>
+        <w:rPr>
+          <w:color w:val="000000" w:themeColor="text1"/>
+          <w:lang w:val="en-US"/>
+        </w:rPr>
+        <w:t xml:space="preserve"> Smart Supply Chain dataset. The platform also supports user-uploaded CSV and Excel supply chain datasets through the Data Source Manager.</w:t>
       </w:r>
     </w:p>
     <w:p>
@@ -15064,7 +15920,7 @@
           <w:lang w:val="en-US"/>
         </w:rPr>
       </w:pPr>
-      <w:bookmarkStart w:id="68" w:name="_Toc230203460"/>
+      <w:bookmarkStart w:id="68" w:name="_Toc230427034"/>
       <w:r>
         <w:rPr>
           <w:lang w:val="en-US"/>
@@ -15084,12 +15940,21 @@
           <w:lang w:val="en-US"/>
         </w:rPr>
       </w:pPr>
+      <w:proofErr w:type="spellStart"/>
       <w:r>
         <w:rPr>
           <w:color w:val="000000" w:themeColor="text1"/>
           <w:lang w:val="en-US"/>
         </w:rPr>
-        <w:t>Gülse Dolunay Ünlü</w:t>
+        <w:t>Gülse</w:t>
+      </w:r>
+      <w:proofErr w:type="spellEnd"/>
+      <w:r>
+        <w:rPr>
+          <w:color w:val="000000" w:themeColor="text1"/>
+          <w:lang w:val="en-US"/>
+        </w:rPr>
+        <w:t xml:space="preserve"> Dolunay Ünlü</w:t>
       </w:r>
     </w:p>
     <w:p>
@@ -15112,7 +15977,7 @@
           <w:b/>
           <w:lang w:val="en-US" w:eastAsia="tr-TR"/>
         </w:rPr>
-        <w:t>Education :</w:t>
+        <w:t>Education:</w:t>
       </w:r>
     </w:p>
     <w:p>
@@ -15127,13 +15992,25 @@
           <w:iCs/>
           <w:lang w:val="en-US" w:eastAsia="tr-TR"/>
         </w:rPr>
-        <w:t>Bachelors</w:t>
+        <w:t>Bachelor’s</w:t>
       </w:r>
       <w:r>
         <w:rPr>
           <w:lang w:val="en-US" w:eastAsia="tr-TR"/>
         </w:rPr>
-        <w:t xml:space="preserve"> : Piri Reis University </w:t>
+        <w:t xml:space="preserve"> </w:t>
+      </w:r>
+      <w:r>
+        <w:rPr>
+          <w:lang w:val="en-US" w:eastAsia="tr-TR"/>
+        </w:rPr>
+        <w:t>Degree</w:t>
+      </w:r>
+      <w:r>
+        <w:rPr>
+          <w:lang w:val="en-US" w:eastAsia="tr-TR"/>
+        </w:rPr>
+        <w:t xml:space="preserve">: Piri Reis University </w:t>
       </w:r>
     </w:p>
     <w:p>
@@ -15205,18 +16082,48 @@
         </w:rPr>
         <w:t xml:space="preserve"> </w:t>
       </w:r>
+      <w:proofErr w:type="spellStart"/>
       <w:r>
         <w:rPr>
           <w:lang w:val="en-US" w:eastAsia="tr-TR"/>
         </w:rPr>
-        <w:t xml:space="preserve">Düzce </w:t>
-      </w:r>
+        <w:t>Düzce</w:t>
+      </w:r>
+      <w:proofErr w:type="spellEnd"/>
       <w:r>
         <w:rPr>
           <w:lang w:val="en-US" w:eastAsia="tr-TR"/>
         </w:rPr>
-        <w:t>Turgut Özal Anadolu Lisesi</w:t>
-      </w:r>
+        <w:t xml:space="preserve"> </w:t>
+      </w:r>
+      <w:r>
+        <w:rPr>
+          <w:lang w:val="en-US" w:eastAsia="tr-TR"/>
+        </w:rPr>
+        <w:t xml:space="preserve">Turgut </w:t>
+      </w:r>
+      <w:proofErr w:type="spellStart"/>
+      <w:r>
+        <w:rPr>
+          <w:lang w:val="en-US" w:eastAsia="tr-TR"/>
+        </w:rPr>
+        <w:t>Özal</w:t>
+      </w:r>
+      <w:proofErr w:type="spellEnd"/>
+      <w:r>
+        <w:rPr>
+          <w:lang w:val="en-US" w:eastAsia="tr-TR"/>
+        </w:rPr>
+        <w:t xml:space="preserve"> Anadolu </w:t>
+      </w:r>
+      <w:proofErr w:type="spellStart"/>
+      <w:r>
+        <w:rPr>
+          <w:lang w:val="en-US" w:eastAsia="tr-TR"/>
+        </w:rPr>
+        <w:t>Lisesi</w:t>
+      </w:r>
+      <w:proofErr w:type="spellEnd"/>
       <w:r>
         <w:rPr>
           <w:lang w:val="en-US" w:eastAsia="tr-TR"/>
@@ -15414,7 +16321,23 @@
           <w:bCs/>
           <w:lang w:val="en-US" w:eastAsia="tr-TR"/>
         </w:rPr>
-        <w:t>Professional skill:</w:t>
+        <w:t xml:space="preserve">Professional </w:t>
+      </w:r>
+      <w:r>
+        <w:rPr>
+          <w:b/>
+          <w:bCs/>
+          <w:lang w:val="en-US" w:eastAsia="tr-TR"/>
+        </w:rPr>
+        <w:t>Skills</w:t>
+      </w:r>
+      <w:r>
+        <w:rPr>
+          <w:b/>
+          <w:bCs/>
+          <w:lang w:val="en-US" w:eastAsia="tr-TR"/>
+        </w:rPr>
+        <w:t>:</w:t>
       </w:r>
     </w:p>
     <w:p>
@@ -15494,7 +16417,25 @@
           <w:bCs/>
           <w:lang w:val="en-US" w:eastAsia="tr-TR"/>
         </w:rPr>
-        <w:t>Performed data cleaning and exploratory data analysis on housing data using Python.</w:t>
+        <w:t xml:space="preserve">Performed data cleaning and </w:t>
+      </w:r>
+      <w:proofErr w:type="gramStart"/>
+      <w:r>
+        <w:rPr>
+          <w:b/>
+          <w:bCs/>
+          <w:lang w:val="en-US" w:eastAsia="tr-TR"/>
+        </w:rPr>
+        <w:t>exploratory</w:t>
+      </w:r>
+      <w:proofErr w:type="gramEnd"/>
+      <w:r>
+        <w:rPr>
+          <w:b/>
+          <w:bCs/>
+          <w:lang w:val="en-US" w:eastAsia="tr-TR"/>
+        </w:rPr>
+        <w:t xml:space="preserve"> data analysis on housing data using Python.</w:t>
       </w:r>
     </w:p>
     <w:p>
@@ -15533,7 +16474,25 @@
           <w:bCs/>
           <w:lang w:val="en-US" w:eastAsia="tr-TR"/>
         </w:rPr>
-        <w:t>Conducted data preprocessing and exploratory analysis on a biological dataset using Python.</w:t>
+        <w:t xml:space="preserve">Conducted data preprocessing and </w:t>
+      </w:r>
+      <w:proofErr w:type="gramStart"/>
+      <w:r>
+        <w:rPr>
+          <w:b/>
+          <w:bCs/>
+          <w:lang w:val="en-US" w:eastAsia="tr-TR"/>
+        </w:rPr>
+        <w:t>exploratory</w:t>
+      </w:r>
+      <w:proofErr w:type="gramEnd"/>
+      <w:r>
+        <w:rPr>
+          <w:b/>
+          <w:bCs/>
+          <w:lang w:val="en-US" w:eastAsia="tr-TR"/>
+        </w:rPr>
+        <w:t xml:space="preserve"> analysis on a biological dataset using Python.</w:t>
       </w:r>
     </w:p>
     <w:p>
@@ -15672,7 +16631,23 @@
           <w:bCs/>
           <w:lang w:val="en-US" w:eastAsia="tr-TR"/>
         </w:rPr>
-        <w:t>Social activities:</w:t>
+        <w:t xml:space="preserve">Social </w:t>
+      </w:r>
+      <w:r>
+        <w:rPr>
+          <w:b/>
+          <w:bCs/>
+          <w:lang w:val="en-US" w:eastAsia="tr-TR"/>
+        </w:rPr>
+        <w:t>A</w:t>
+      </w:r>
+      <w:r>
+        <w:rPr>
+          <w:b/>
+          <w:bCs/>
+          <w:lang w:val="en-US" w:eastAsia="tr-TR"/>
+        </w:rPr>
+        <w:t>ctivities:</w:t>
       </w:r>
     </w:p>
     <w:p>
@@ -15877,8 +16852,18 @@
                 <w:bCs/>
                 <w:lang w:val="en-US" w:eastAsia="tr-TR"/>
               </w:rPr>
-              <w:t xml:space="preserve"> 10.06.2002 Düzce</w:t>
-            </w:r>
+              <w:t xml:space="preserve"> 10.06.2002 </w:t>
+            </w:r>
+            <w:proofErr w:type="spellStart"/>
+            <w:r>
+              <w:rPr>
+                <w:b/>
+                <w:bCs/>
+                <w:lang w:val="en-US" w:eastAsia="tr-TR"/>
+              </w:rPr>
+              <w:t>Düzce</w:t>
+            </w:r>
+            <w:proofErr w:type="spellEnd"/>
           </w:p>
         </w:tc>
         <w:tc>
@@ -16075,8 +17060,18 @@
                 <w:bCs/>
                 <w:lang w:val="en-US" w:eastAsia="tr-TR"/>
               </w:rPr>
-              <w:t xml:space="preserve"> linkedin.com/in/gulsedolunayunlu</w:t>
-            </w:r>
+              <w:t xml:space="preserve"> linkedin.com/in/</w:t>
+            </w:r>
+            <w:proofErr w:type="spellStart"/>
+            <w:r>
+              <w:rPr>
+                <w:b/>
+                <w:bCs/>
+                <w:lang w:val="en-US" w:eastAsia="tr-TR"/>
+              </w:rPr>
+              <w:t>gulsedolunayunlu</w:t>
+            </w:r>
+            <w:proofErr w:type="spellEnd"/>
           </w:p>
         </w:tc>
         <w:tc>
@@ -16251,46 +17246,49 @@
 
 <file path=word/footer2.xml><?xml version="1.0" encoding="utf-8"?>
 <w:ftr xmlns:wpc="http://schemas.microsoft.com/office/word/2010/wordprocessingCanvas" xmlns:cx="http://schemas.microsoft.com/office/drawing/2014/chartex" xmlns:cx1="http://schemas.microsoft.com/office/drawing/2015/9/8/chartex" xmlns:cx2="http://schemas.microsoft.com/office/drawing/2015/10/21/chartex" xmlns:cx3="http://schemas.microsoft.com/office/drawing/2016/5/9/chartex" xmlns:cx4="http://schemas.microsoft.com/office/drawing/2016/5/10/chartex" xmlns:cx5="http://schemas.microsoft.com/office/drawing/2016/5/11/chartex" xmlns:cx6="http://schemas.microsoft.com/office/drawing/2016/5/12/chartex" xmlns:cx7="http://schemas.microsoft.com/office/drawing/2016/5/13/chartex" xmlns:cx8="http://schemas.microsoft.com/office/drawing/2016/5/14/chartex" xmlns:mc="http://schemas.openxmlformats.org/markup-compatibility/2006" xmlns:aink="http://schemas.microsoft.com/office/drawing/2016/ink" xmlns:am3d="http://schemas.microsoft.com/office/drawing/2017/model3d" xmlns:o="urn:schemas-microsoft-com:office:office" xmlns:oel="http://schemas.microsoft.com/office/2019/extlst" xmlns:r="http://schemas.openxmlformats.org/officeDocument/2006/relationships" xmlns:m="http://schemas.openxmlformats.org/officeDocument/2006/math" xmlns:v="urn:schemas-microsoft-com:vml" xmlns:wp14="http://schemas.microsoft.com/office/word/2010/wordprocessingDrawing" xmlns:wp="http://schemas.openxmlformats.org/drawingml/2006/wordprocessingDrawing" xmlns:w10="urn:schemas-microsoft-com:office:word" xmlns:w="http://schemas.openxmlformats.org/wordprocessingml/2006/main" xmlns:w14="http://schemas.microsoft.com/office/word/2010/wordml" xmlns:w15="http://schemas.microsoft.com/office/word/2012/wordml" xmlns:w16cex="http://schemas.microsoft.com/office/word/2018/wordml/cex" xmlns:w16cid="http://schemas.microsoft.com/office/word/2016/wordml/cid" xmlns:w16="http://schemas.microsoft.com/office/word/2018/wordml" xmlns:w16du="http://schemas.microsoft.com/office/word/2023/wordml/word16du" xmlns:w16sdtdh="http://schemas.microsoft.com/office/word/2020/wordml/sdtdatahash" xmlns:w16sdtfl="http://schemas.microsoft.com/office/word/2024/wordml/sdtformatlock" xmlns:w16se="http://schemas.microsoft.com/office/word/2015/wordml/symex" xmlns:wpg="http://schemas.microsoft.com/office/word/2010/wordprocessingGroup" xmlns:wpi="http://schemas.microsoft.com/office/word/2010/wordprocessingInk" xmlns:wne="http://schemas.microsoft.com/office/word/2006/wordml" xmlns:wps="http://schemas.microsoft.com/office/word/2010/wordprocessingShape" mc:Ignorable="w14 w15 w16se w16cid w16 w16cex w16sdtdh w16sdtfl w16du wp14">
-  <w:p>
-    <w:pPr>
-      <w:pStyle w:val="Footer"/>
-      <w:jc w:val="center"/>
+  <w:sdt>
+    <w:sdtPr>
+      <w:id w:val="-1869978541"/>
+      <w:docPartObj>
+        <w:docPartGallery w:val="Page Numbers (Bottom of Page)"/>
+        <w:docPartUnique/>
+      </w:docPartObj>
+    </w:sdtPr>
+    <w:sdtEndPr>
       <w:rPr>
-        <w:rFonts w:ascii="Trebuchet MS" w:hAnsi="Trebuchet MS"/>
-      </w:rPr>
-    </w:pPr>
-    <w:r>
-      <w:rPr>
-        <w:rFonts w:ascii="Trebuchet MS" w:hAnsi="Trebuchet MS"/>
-      </w:rPr>
-      <w:fldChar w:fldCharType="begin"/>
-    </w:r>
-    <w:r>
-      <w:rPr>
-        <w:rFonts w:ascii="Trebuchet MS" w:hAnsi="Trebuchet MS"/>
-      </w:rPr>
-      <w:instrText xml:space="preserve"> PAGE   \* MERGEFORMAT </w:instrText>
-    </w:r>
-    <w:r>
-      <w:rPr>
-        <w:rFonts w:ascii="Trebuchet MS" w:hAnsi="Trebuchet MS"/>
-      </w:rPr>
-      <w:fldChar w:fldCharType="separate"/>
-    </w:r>
-    <w:r>
-      <w:rPr>
-        <w:rFonts w:ascii="Trebuchet MS" w:hAnsi="Trebuchet MS"/>
         <w:noProof/>
       </w:rPr>
-      <w:t>12</w:t>
-    </w:r>
-    <w:r>
-      <w:rPr>
-        <w:rFonts w:ascii="Trebuchet MS" w:hAnsi="Trebuchet MS"/>
-      </w:rPr>
-      <w:fldChar w:fldCharType="end"/>
-    </w:r>
-  </w:p>
+    </w:sdtEndPr>
+    <w:sdtContent>
+      <w:p>
+        <w:pPr>
+          <w:pStyle w:val="Footer"/>
+          <w:jc w:val="center"/>
+        </w:pPr>
+        <w:r>
+          <w:fldChar w:fldCharType="begin"/>
+        </w:r>
+        <w:r>
+          <w:instrText xml:space="preserve"> PAGE   \* MERGEFORMAT </w:instrText>
+        </w:r>
+        <w:r>
+          <w:fldChar w:fldCharType="separate"/>
+        </w:r>
+        <w:r>
+          <w:rPr>
+            <w:noProof/>
+          </w:rPr>
+          <w:t>2</w:t>
+        </w:r>
+        <w:r>
+          <w:rPr>
+            <w:noProof/>
+          </w:rPr>
+          <w:fldChar w:fldCharType="end"/>
+        </w:r>
+      </w:p>
+    </w:sdtContent>
+  </w:sdt>
 </w:ftr>
 </file>
 
@@ -16301,10 +17299,18 @@
       <w:pStyle w:val="Footer"/>
     </w:pPr>
     <w:r>
-      <w:t>South African Journal of Industrial Engineering</w:t>
+      <w:t xml:space="preserve"> African Journal of Industrial Engineering</w:t>
     </w:r>
     <w:r>
-      <w:t xml:space="preserve"> Month Year Vol __(_):  p1-3</w:t>
+      <w:t xml:space="preserve"> Month Year Vol _</w:t>
+    </w:r>
+    <w:proofErr w:type="gramStart"/>
+    <w:r>
+      <w:t>_(</w:t>
+    </w:r>
+    <w:proofErr w:type="gramEnd"/>
+    <w:r>
+      <w:t>_):  p1-3</w:t>
     </w:r>
   </w:p>
 </w:ftr>
@@ -16348,8 +17354,6 @@
         <w:tab w:val="clear" w:pos="9360"/>
         <w:tab w:val="right" w:pos="8364"/>
       </w:tabs>
-      <w:ind w:leftChars="193" w:left="347"/>
-      <w:jc w:val="right"/>
       <w:rPr>
         <w:rFonts w:eastAsiaTheme="minorEastAsia"/>
         <w:i/>
@@ -18446,7 +19450,7 @@
     <w:lsdException w:name="footnote text" w:semiHidden="1" w:uiPriority="99" w:unhideWhenUsed="1"/>
     <w:lsdException w:name="annotation text" w:semiHidden="1" w:uiPriority="99" w:unhideWhenUsed="1"/>
     <w:lsdException w:name="header" w:semiHidden="1" w:unhideWhenUsed="1"/>
-    <w:lsdException w:name="footer" w:semiHidden="1" w:unhideWhenUsed="1"/>
+    <w:lsdException w:name="footer" w:semiHidden="1" w:uiPriority="99" w:unhideWhenUsed="1"/>
     <w:lsdException w:name="index heading" w:semiHidden="1" w:unhideWhenUsed="1"/>
     <w:lsdException w:name="caption" w:semiHidden="1" w:uiPriority="99" w:unhideWhenUsed="1" w:qFormat="1"/>
     <w:lsdException w:name="table of figures" w:semiHidden="1" w:uiPriority="99" w:unhideWhenUsed="1"/>
@@ -19045,6 +20049,7 @@
     <w:name w:val="footer"/>
     <w:basedOn w:val="Normal"/>
     <w:link w:val="FooterChar"/>
+    <w:uiPriority w:val="99"/>
     <w:rsid w:val="00405735"/>
     <w:pPr>
       <w:tabs>
@@ -19797,6 +20802,7 @@
   <w:style w:type="character" w:customStyle="1" w:styleId="FooterChar">
     <w:name w:val="Footer Char"/>
     <w:link w:val="Footer"/>
+    <w:uiPriority w:val="99"/>
     <w:rsid w:val="00405735"/>
     <w:rPr>
       <w:rFonts w:eastAsia="Calibri"/>
@@ -20770,26 +21776,6 @@
     <b:RefOrder>11</b:RefOrder>
   </b:Source>
   <b:Source>
-    <b:Tag>Kal22</b:Tag>
-    <b:SourceType>JournalArticle</b:SourceType>
-    <b:Guid>{7DD221FB-111C-4A83-85E0-FDB04653BFCA}</b:Guid>
-    <b:Title>The ABCDE of supply chain visibility: A systematic literature review and framework</b:Title>
-    <b:Year>2022</b:Year>
-    <b:Author>
-      <b:Author>
-        <b:NameList>
-          <b:Person>
-            <b:Last>Kalaiarasan</b:Last>
-            <b:First>R.,</b:First>
-            <b:Middle>Olhager, J., Agrawal, T. K., &amp; Wiktorsson, M.</b:Middle>
-          </b:Person>
-        </b:NameList>
-      </b:Author>
-    </b:Author>
-    <b:JournalName>International Journal of Production Economics</b:JournalName>
-    <b:RefOrder>2</b:RefOrder>
-  </b:Source>
-  <b:Source>
     <b:Tag>pannd</b:Tag>
     <b:SourceType>InternetSite</b:SourceType>
     <b:Guid>{14189F99-7B06-4A09-949B-0FDA649F5C96}</b:Guid>
@@ -20819,11 +21805,42 @@
     <b:URL>https://scikit-learn.org/stable/modules/generated/sklearn.linear_model.LinearRegression.html</b:URL>
     <b:RefOrder>9</b:RefOrder>
   </b:Source>
+  <b:Source>
+    <b:Tag>Kal22</b:Tag>
+    <b:SourceType>JournalArticle</b:SourceType>
+    <b:Guid>{828BD708-D23F-42E0-A6B2-30F748E43517}</b:Guid>
+    <b:Title>The ABCDE of supply chain visibility: A systematic literature review and framework</b:Title>
+    <b:Year>2022</b:Year>
+    <b:Author>
+      <b:Author>
+        <b:NameList>
+          <b:Person>
+            <b:Last>Kalaiarasan</b:Last>
+            <b:First>R.</b:First>
+          </b:Person>
+          <b:Person>
+            <b:Last>Olhager</b:Last>
+            <b:First>J.</b:First>
+          </b:Person>
+          <b:Person>
+            <b:Last>Agrawal</b:Last>
+            <b:First>T. K.</b:First>
+          </b:Person>
+          <b:Person>
+            <b:Last>Wiktorsson</b:Last>
+            <b:First>M.</b:First>
+          </b:Person>
+        </b:NameList>
+      </b:Author>
+    </b:Author>
+    <b:JournalName>International Journal of Production Economics</b:JournalName>
+    <b:RefOrder>2</b:RefOrder>
+  </b:Source>
 </b:Sources>
 </file>
 
 <file path=customXml/itemProps1.xml><?xml version="1.0" encoding="utf-8"?>
-<ds:datastoreItem xmlns:ds="http://schemas.openxmlformats.org/officeDocument/2006/customXml" ds:itemID="{E9EBBA65-AB08-42BA-868F-0536AD648E93}">
+<ds:datastoreItem xmlns:ds="http://schemas.openxmlformats.org/officeDocument/2006/customXml" ds:itemID="{75CBD9F4-6656-4014-B4D5-8B17207FEA1A}">
   <ds:schemaRefs>
     <ds:schemaRef ds:uri="http://schemas.openxmlformats.org/officeDocument/2006/bibliography"/>
   </ds:schemaRefs>

</xml_diff>

<commit_message>
Improve thesis validation and risk scoring documentation
</commit_message>
<xml_diff>
--- a/docs/graduation_thesis_report.docx
+++ b/docs/graduation_thesis_report.docx
@@ -305,7 +305,6 @@
           <w:lang w:val="en-US"/>
         </w:rPr>
       </w:pPr>
-      <w:proofErr w:type="spellStart"/>
       <w:r>
         <w:rPr>
           <w:b/>
@@ -314,10 +313,12 @@
           <w:szCs w:val="32"/>
           <w:lang w:val="en-US"/>
         </w:rPr>
-        <w:t>Gülse</w:t>
-      </w:r>
-      <w:proofErr w:type="spellEnd"/>
-      <w:r>
+        <w:t>Gülse Dolunay ÜNLÜ</w:t>
+      </w:r>
+    </w:p>
+    <w:p>
+      <w:pPr>
+        <w:jc w:val="center"/>
         <w:rPr>
           <w:b/>
           <w:color w:val="000000" w:themeColor="text1"/>
@@ -325,12 +326,8 @@
           <w:szCs w:val="32"/>
           <w:lang w:val="en-US"/>
         </w:rPr>
-        <w:t xml:space="preserve"> Dolunay ÜNLÜ</w:t>
-      </w:r>
-    </w:p>
-    <w:p>
-      <w:pPr>
-        <w:jc w:val="center"/>
+      </w:pPr>
+      <w:r>
         <w:rPr>
           <w:b/>
           <w:color w:val="000000" w:themeColor="text1"/>
@@ -338,15 +335,6 @@
           <w:szCs w:val="32"/>
           <w:lang w:val="en-US"/>
         </w:rPr>
-      </w:pPr>
-      <w:r>
-        <w:rPr>
-          <w:b/>
-          <w:color w:val="000000" w:themeColor="text1"/>
-          <w:sz w:val="32"/>
-          <w:szCs w:val="32"/>
-          <w:lang w:val="en-US"/>
-        </w:rPr>
         <w:t>20210305007</w:t>
       </w:r>
     </w:p>
@@ -543,7 +531,7 @@
         <w:pStyle w:val="Introsections"/>
       </w:pPr>
       <w:bookmarkStart w:id="2" w:name="_Toc28126413"/>
-      <w:bookmarkStart w:id="3" w:name="_Toc230426988"/>
+      <w:bookmarkStart w:id="3" w:name="_Toc230437497"/>
       <w:r>
         <w:lastRenderedPageBreak/>
         <w:t>DECLARATION</w:t>
@@ -565,14 +553,12 @@
         </w:rPr>
         <w:t xml:space="preserve">I hereby declare that this thesis represents my own work which has been done after registration for the </w:t>
       </w:r>
-      <w:proofErr w:type="gramStart"/>
-      <w:r>
-        <w:rPr>
-          <w:lang w:val="en-US"/>
-        </w:rPr>
-        <w:t>degree of bachelor</w:t>
-      </w:r>
-      <w:proofErr w:type="gramEnd"/>
+      <w:r>
+        <w:rPr>
+          <w:lang w:val="en-US"/>
+        </w:rPr>
+        <w:t>bachelor’s degree</w:t>
+      </w:r>
       <w:r>
         <w:rPr>
           <w:lang w:val="en-US"/>
@@ -757,7 +743,7 @@
           <w:lang w:eastAsia="tr-TR"/>
         </w:rPr>
       </w:pPr>
-      <w:bookmarkStart w:id="4" w:name="_Toc230426989"/>
+      <w:bookmarkStart w:id="4" w:name="_Toc230437498"/>
       <w:r>
         <w:rPr>
           <w:lang w:eastAsia="tr-TR"/>
@@ -1100,7 +1086,7 @@
       <w:pPr>
         <w:pStyle w:val="Introsections"/>
       </w:pPr>
-      <w:bookmarkStart w:id="5" w:name="_Toc230426990"/>
+      <w:bookmarkStart w:id="5" w:name="_Toc230437499"/>
       <w:r>
         <w:lastRenderedPageBreak/>
         <w:t>ABSTRACT</w:t>
@@ -1137,35 +1123,7 @@
           <w:lang w:val="en-US"/>
         </w:rPr>
         <w:br/>
-        <w:t xml:space="preserve">The platform was developed with Python and </w:t>
-      </w:r>
-      <w:proofErr w:type="spellStart"/>
-      <w:r>
-        <w:rPr>
-          <w:lang w:val="en-US"/>
-        </w:rPr>
-        <w:t>Streamlit</w:t>
-      </w:r>
-      <w:proofErr w:type="spellEnd"/>
-      <w:r>
-        <w:rPr>
-          <w:lang w:val="en-US"/>
-        </w:rPr>
-        <w:t xml:space="preserve">. It uses the public </w:t>
-      </w:r>
-      <w:proofErr w:type="spellStart"/>
-      <w:r>
-        <w:rPr>
-          <w:lang w:val="en-US"/>
-        </w:rPr>
-        <w:t>DataCo</w:t>
-      </w:r>
-      <w:proofErr w:type="spellEnd"/>
-      <w:r>
-        <w:rPr>
-          <w:lang w:val="en-US"/>
-        </w:rPr>
-        <w:t xml:space="preserve"> Smart Supply Chain dataset as the default demonstration dataset. In addition, the system allows users to upload a new supply chain dataset in CSV or Excel format. The uploaded dataset can be mapped to a standard supply chain schema and then used dynamically across the dashboard pages. The platform includes modules for overview analysis, regional performance, inventory control, shipment performance, supply chain risk, and demand forecasting.</w:t>
+        <w:t>The platform was developed with Python and Streamlit. It uses the public DataCo Smart Supply Chain dataset as the default demonstration dataset. In addition, the system allows users to upload a new supply chain dataset in CSV or Excel format. The uploaded dataset can be mapped to a standard supply chain schema and then used dynamically across the dashboard pages. The platform includes modules for overview analysis, regional performance, inventory control, shipment performance, supply chain risk, and demand forecasting.</w:t>
       </w:r>
     </w:p>
     <w:p>
@@ -1217,21 +1175,7 @@
           <w:lang w:val="en-US"/>
         </w:rPr>
         <w:br/>
-        <w:t xml:space="preserve">Key Words: Supply Chain Visibility, Risk Assessment, Data Standardization, </w:t>
-      </w:r>
-      <w:proofErr w:type="spellStart"/>
-      <w:r>
-        <w:rPr>
-          <w:lang w:val="en-US"/>
-        </w:rPr>
-        <w:t>Streamlit</w:t>
-      </w:r>
-      <w:proofErr w:type="spellEnd"/>
-      <w:r>
-        <w:rPr>
-          <w:lang w:val="en-US"/>
-        </w:rPr>
-        <w:t xml:space="preserve"> Dashboard, Business Intelligence, Demand Forecasting</w:t>
+        <w:t>Key Words: Supply Chain Visibility, Risk Assessment, Data Standardization, Streamlit Dashboard, Business Intelligence, Demand Forecasting</w:t>
       </w:r>
     </w:p>
     <w:p>
@@ -1280,7 +1224,7 @@
       <w:pPr>
         <w:pStyle w:val="Introsections"/>
       </w:pPr>
-      <w:bookmarkStart w:id="6" w:name="_Toc230426991"/>
+      <w:bookmarkStart w:id="6" w:name="_Toc230437500"/>
       <w:r>
         <w:lastRenderedPageBreak/>
         <w:t>TABLE OF CONTENTS</w:t>
@@ -1355,7 +1299,7 @@
             </w:rPr>
             <w:fldChar w:fldCharType="separate"/>
           </w:r>
-          <w:hyperlink w:anchor="_Toc230426988" w:history="1">
+          <w:hyperlink w:anchor="_Toc230437497" w:history="1">
             <w:r>
               <w:rPr>
                 <w:rStyle w:val="Hyperlink"/>
@@ -1382,7 +1326,7 @@
                 <w:noProof/>
                 <w:webHidden/>
               </w:rPr>
-              <w:instrText xml:space="preserve"> PAGEREF _Toc230426988 \h </w:instrText>
+              <w:instrText xml:space="preserve"> PAGEREF _Toc230437497 \h </w:instrText>
             </w:r>
             <w:r>
               <w:rPr>
@@ -1430,7 +1374,7 @@
               <w14:ligatures w14:val="standardContextual"/>
             </w:rPr>
           </w:pPr>
-          <w:hyperlink w:anchor="_Toc230426989" w:history="1">
+          <w:hyperlink w:anchor="_Toc230437498" w:history="1">
             <w:r>
               <w:rPr>
                 <w:rStyle w:val="Hyperlink"/>
@@ -1458,7 +1402,7 @@
                 <w:noProof/>
                 <w:webHidden/>
               </w:rPr>
-              <w:instrText xml:space="preserve"> PAGEREF _Toc230426989 \h </w:instrText>
+              <w:instrText xml:space="preserve"> PAGEREF _Toc230437498 \h </w:instrText>
             </w:r>
             <w:r>
               <w:rPr>
@@ -1506,7 +1450,7 @@
               <w14:ligatures w14:val="standardContextual"/>
             </w:rPr>
           </w:pPr>
-          <w:hyperlink w:anchor="_Toc230426990" w:history="1">
+          <w:hyperlink w:anchor="_Toc230437499" w:history="1">
             <w:r>
               <w:rPr>
                 <w:rStyle w:val="Hyperlink"/>
@@ -1533,7 +1477,7 @@
                 <w:noProof/>
                 <w:webHidden/>
               </w:rPr>
-              <w:instrText xml:space="preserve"> PAGEREF _Toc230426990 \h </w:instrText>
+              <w:instrText xml:space="preserve"> PAGEREF _Toc230437499 \h </w:instrText>
             </w:r>
             <w:r>
               <w:rPr>
@@ -1581,7 +1525,7 @@
               <w14:ligatures w14:val="standardContextual"/>
             </w:rPr>
           </w:pPr>
-          <w:hyperlink w:anchor="_Toc230426991" w:history="1">
+          <w:hyperlink w:anchor="_Toc230437500" w:history="1">
             <w:r>
               <w:rPr>
                 <w:rStyle w:val="Hyperlink"/>
@@ -1608,7 +1552,7 @@
                 <w:noProof/>
                 <w:webHidden/>
               </w:rPr>
-              <w:instrText xml:space="preserve"> PAGEREF _Toc230426991 \h </w:instrText>
+              <w:instrText xml:space="preserve"> PAGEREF _Toc230437500 \h </w:instrText>
             </w:r>
             <w:r>
               <w:rPr>
@@ -1656,7 +1600,7 @@
               <w14:ligatures w14:val="standardContextual"/>
             </w:rPr>
           </w:pPr>
-          <w:hyperlink w:anchor="_Toc230426992" w:history="1">
+          <w:hyperlink w:anchor="_Toc230437501" w:history="1">
             <w:r>
               <w:rPr>
                 <w:rStyle w:val="Hyperlink"/>
@@ -1683,7 +1627,7 @@
                 <w:noProof/>
                 <w:webHidden/>
               </w:rPr>
-              <w:instrText xml:space="preserve"> PAGEREF _Toc230426992 \h </w:instrText>
+              <w:instrText xml:space="preserve"> PAGEREF _Toc230437501 \h </w:instrText>
             </w:r>
             <w:r>
               <w:rPr>
@@ -1731,7 +1675,7 @@
               <w14:ligatures w14:val="standardContextual"/>
             </w:rPr>
           </w:pPr>
-          <w:hyperlink w:anchor="_Toc230426993" w:history="1">
+          <w:hyperlink w:anchor="_Toc230437502" w:history="1">
             <w:r>
               <w:rPr>
                 <w:rStyle w:val="Hyperlink"/>
@@ -1759,7 +1703,7 @@
                 <w:noProof/>
                 <w:webHidden/>
               </w:rPr>
-              <w:instrText xml:space="preserve"> PAGEREF _Toc230426993 \h </w:instrText>
+              <w:instrText xml:space="preserve"> PAGEREF _Toc230437502 \h </w:instrText>
             </w:r>
             <w:r>
               <w:rPr>
@@ -1810,7 +1754,7 @@
               <w14:ligatures w14:val="standardContextual"/>
             </w:rPr>
           </w:pPr>
-          <w:hyperlink w:anchor="_Toc230426994" w:history="1">
+          <w:hyperlink w:anchor="_Toc230437503" w:history="1">
             <w:r>
               <w:rPr>
                 <w:rStyle w:val="Hyperlink"/>
@@ -1861,7 +1805,7 @@
                 <w:noProof/>
                 <w:webHidden/>
               </w:rPr>
-              <w:instrText xml:space="preserve"> PAGEREF _Toc230426994 \h </w:instrText>
+              <w:instrText xml:space="preserve"> PAGEREF _Toc230437503 \h </w:instrText>
             </w:r>
             <w:r>
               <w:rPr>
@@ -1912,7 +1856,7 @@
               <w14:ligatures w14:val="standardContextual"/>
             </w:rPr>
           </w:pPr>
-          <w:hyperlink w:anchor="_Toc230426995" w:history="1">
+          <w:hyperlink w:anchor="_Toc230437504" w:history="1">
             <w:r>
               <w:rPr>
                 <w:rStyle w:val="Hyperlink"/>
@@ -1963,7 +1907,7 @@
                 <w:noProof/>
                 <w:webHidden/>
               </w:rPr>
-              <w:instrText xml:space="preserve"> PAGEREF _Toc230426995 \h </w:instrText>
+              <w:instrText xml:space="preserve"> PAGEREF _Toc230437504 \h </w:instrText>
             </w:r>
             <w:r>
               <w:rPr>
@@ -2013,7 +1957,7 @@
               <w14:ligatures w14:val="standardContextual"/>
             </w:rPr>
           </w:pPr>
-          <w:hyperlink w:anchor="_Toc230426996" w:history="1">
+          <w:hyperlink w:anchor="_Toc230437505" w:history="1">
             <w:r>
               <w:rPr>
                 <w:rStyle w:val="Hyperlink"/>
@@ -2062,7 +2006,7 @@
                 <w:noProof/>
                 <w:webHidden/>
               </w:rPr>
-              <w:instrText xml:space="preserve"> PAGEREF _Toc230426996 \h </w:instrText>
+              <w:instrText xml:space="preserve"> PAGEREF _Toc230437505 \h </w:instrText>
             </w:r>
             <w:r>
               <w:rPr>
@@ -2111,7 +2055,7 @@
               <w14:ligatures w14:val="standardContextual"/>
             </w:rPr>
           </w:pPr>
-          <w:hyperlink w:anchor="_Toc230426997" w:history="1">
+          <w:hyperlink w:anchor="_Toc230437506" w:history="1">
             <w:r>
               <w:rPr>
                 <w:rStyle w:val="Hyperlink"/>
@@ -2160,7 +2104,7 @@
                 <w:noProof/>
                 <w:webHidden/>
               </w:rPr>
-              <w:instrText xml:space="preserve"> PAGEREF _Toc230426997 \h </w:instrText>
+              <w:instrText xml:space="preserve"> PAGEREF _Toc230437506 \h </w:instrText>
             </w:r>
             <w:r>
               <w:rPr>
@@ -2209,7 +2153,7 @@
               <w14:ligatures w14:val="standardContextual"/>
             </w:rPr>
           </w:pPr>
-          <w:hyperlink w:anchor="_Toc230426998" w:history="1">
+          <w:hyperlink w:anchor="_Toc230437507" w:history="1">
             <w:r>
               <w:rPr>
                 <w:rStyle w:val="Hyperlink"/>
@@ -2258,7 +2202,7 @@
                 <w:noProof/>
                 <w:webHidden/>
               </w:rPr>
-              <w:instrText xml:space="preserve"> PAGEREF _Toc230426998 \h </w:instrText>
+              <w:instrText xml:space="preserve"> PAGEREF _Toc230437507 \h </w:instrText>
             </w:r>
             <w:r>
               <w:rPr>
@@ -2307,7 +2251,7 @@
               <w14:ligatures w14:val="standardContextual"/>
             </w:rPr>
           </w:pPr>
-          <w:hyperlink w:anchor="_Toc230426999" w:history="1">
+          <w:hyperlink w:anchor="_Toc230437508" w:history="1">
             <w:r>
               <w:rPr>
                 <w:rStyle w:val="Hyperlink"/>
@@ -2356,7 +2300,7 @@
                 <w:noProof/>
                 <w:webHidden/>
               </w:rPr>
-              <w:instrText xml:space="preserve"> PAGEREF _Toc230426999 \h </w:instrText>
+              <w:instrText xml:space="preserve"> PAGEREF _Toc230437508 \h </w:instrText>
             </w:r>
             <w:r>
               <w:rPr>
@@ -2405,7 +2349,7 @@
               <w14:ligatures w14:val="standardContextual"/>
             </w:rPr>
           </w:pPr>
-          <w:hyperlink w:anchor="_Toc230427000" w:history="1">
+          <w:hyperlink w:anchor="_Toc230437509" w:history="1">
             <w:r>
               <w:rPr>
                 <w:rStyle w:val="Hyperlink"/>
@@ -2454,7 +2398,7 @@
                 <w:noProof/>
                 <w:webHidden/>
               </w:rPr>
-              <w:instrText xml:space="preserve"> PAGEREF _Toc230427000 \h </w:instrText>
+              <w:instrText xml:space="preserve"> PAGEREF _Toc230437509 \h </w:instrText>
             </w:r>
             <w:r>
               <w:rPr>
@@ -2503,7 +2447,7 @@
               <w14:ligatures w14:val="standardContextual"/>
             </w:rPr>
           </w:pPr>
-          <w:hyperlink w:anchor="_Toc230427001" w:history="1">
+          <w:hyperlink w:anchor="_Toc230437510" w:history="1">
             <w:r>
               <w:rPr>
                 <w:rStyle w:val="Hyperlink"/>
@@ -2552,7 +2496,7 @@
                 <w:noProof/>
                 <w:webHidden/>
               </w:rPr>
-              <w:instrText xml:space="preserve"> PAGEREF _Toc230427001 \h </w:instrText>
+              <w:instrText xml:space="preserve"> PAGEREF _Toc230437510 \h </w:instrText>
             </w:r>
             <w:r>
               <w:rPr>
@@ -2601,7 +2545,7 @@
               <w14:ligatures w14:val="standardContextual"/>
             </w:rPr>
           </w:pPr>
-          <w:hyperlink w:anchor="_Toc230427002" w:history="1">
+          <w:hyperlink w:anchor="_Toc230437511" w:history="1">
             <w:r>
               <w:rPr>
                 <w:rStyle w:val="Hyperlink"/>
@@ -2650,7 +2594,7 @@
                 <w:noProof/>
                 <w:webHidden/>
               </w:rPr>
-              <w:instrText xml:space="preserve"> PAGEREF _Toc230427002 \h </w:instrText>
+              <w:instrText xml:space="preserve"> PAGEREF _Toc230437511 \h </w:instrText>
             </w:r>
             <w:r>
               <w:rPr>
@@ -2700,7 +2644,7 @@
               <w14:ligatures w14:val="standardContextual"/>
             </w:rPr>
           </w:pPr>
-          <w:hyperlink w:anchor="_Toc230427003" w:history="1">
+          <w:hyperlink w:anchor="_Toc230437512" w:history="1">
             <w:r>
               <w:rPr>
                 <w:rStyle w:val="Hyperlink"/>
@@ -2751,7 +2695,7 @@
                 <w:noProof/>
                 <w:webHidden/>
               </w:rPr>
-              <w:instrText xml:space="preserve"> PAGEREF _Toc230427003 \h </w:instrText>
+              <w:instrText xml:space="preserve"> PAGEREF _Toc230437512 \h </w:instrText>
             </w:r>
             <w:r>
               <w:rPr>
@@ -2802,7 +2746,7 @@
               <w14:ligatures w14:val="standardContextual"/>
             </w:rPr>
           </w:pPr>
-          <w:hyperlink w:anchor="_Toc230427004" w:history="1">
+          <w:hyperlink w:anchor="_Toc230437513" w:history="1">
             <w:r>
               <w:rPr>
                 <w:rStyle w:val="Hyperlink"/>
@@ -2853,7 +2797,7 @@
                 <w:noProof/>
                 <w:webHidden/>
               </w:rPr>
-              <w:instrText xml:space="preserve"> PAGEREF _Toc230427004 \h </w:instrText>
+              <w:instrText xml:space="preserve"> PAGEREF _Toc230437513 \h </w:instrText>
             </w:r>
             <w:r>
               <w:rPr>
@@ -2904,7 +2848,7 @@
               <w14:ligatures w14:val="standardContextual"/>
             </w:rPr>
           </w:pPr>
-          <w:hyperlink w:anchor="_Toc230427005" w:history="1">
+          <w:hyperlink w:anchor="_Toc230437514" w:history="1">
             <w:r>
               <w:rPr>
                 <w:rStyle w:val="Hyperlink"/>
@@ -2955,7 +2899,7 @@
                 <w:noProof/>
                 <w:webHidden/>
               </w:rPr>
-              <w:instrText xml:space="preserve"> PAGEREF _Toc230427005 \h </w:instrText>
+              <w:instrText xml:space="preserve"> PAGEREF _Toc230437514 \h </w:instrText>
             </w:r>
             <w:r>
               <w:rPr>
@@ -3005,7 +2949,7 @@
               <w14:ligatures w14:val="standardContextual"/>
             </w:rPr>
           </w:pPr>
-          <w:hyperlink w:anchor="_Toc230427006" w:history="1">
+          <w:hyperlink w:anchor="_Toc230437515" w:history="1">
             <w:r>
               <w:rPr>
                 <w:rStyle w:val="Hyperlink"/>
@@ -3054,7 +2998,7 @@
                 <w:noProof/>
                 <w:webHidden/>
               </w:rPr>
-              <w:instrText xml:space="preserve"> PAGEREF _Toc230427006 \h </w:instrText>
+              <w:instrText xml:space="preserve"> PAGEREF _Toc230437515 \h </w:instrText>
             </w:r>
             <w:r>
               <w:rPr>
@@ -3103,7 +3047,7 @@
               <w14:ligatures w14:val="standardContextual"/>
             </w:rPr>
           </w:pPr>
-          <w:hyperlink w:anchor="_Toc230427007" w:history="1">
+          <w:hyperlink w:anchor="_Toc230437516" w:history="1">
             <w:r>
               <w:rPr>
                 <w:rStyle w:val="Hyperlink"/>
@@ -3152,7 +3096,7 @@
                 <w:noProof/>
                 <w:webHidden/>
               </w:rPr>
-              <w:instrText xml:space="preserve"> PAGEREF _Toc230427007 \h </w:instrText>
+              <w:instrText xml:space="preserve"> PAGEREF _Toc230437516 \h </w:instrText>
             </w:r>
             <w:r>
               <w:rPr>
@@ -3201,7 +3145,7 @@
               <w14:ligatures w14:val="standardContextual"/>
             </w:rPr>
           </w:pPr>
-          <w:hyperlink w:anchor="_Toc230427008" w:history="1">
+          <w:hyperlink w:anchor="_Toc230437517" w:history="1">
             <w:r>
               <w:rPr>
                 <w:rStyle w:val="Hyperlink"/>
@@ -3250,7 +3194,7 @@
                 <w:noProof/>
                 <w:webHidden/>
               </w:rPr>
-              <w:instrText xml:space="preserve"> PAGEREF _Toc230427008 \h </w:instrText>
+              <w:instrText xml:space="preserve"> PAGEREF _Toc230437517 \h </w:instrText>
             </w:r>
             <w:r>
               <w:rPr>
@@ -3299,7 +3243,7 @@
               <w14:ligatures w14:val="standardContextual"/>
             </w:rPr>
           </w:pPr>
-          <w:hyperlink w:anchor="_Toc230427009" w:history="1">
+          <w:hyperlink w:anchor="_Toc230437518" w:history="1">
             <w:r>
               <w:rPr>
                 <w:rStyle w:val="Hyperlink"/>
@@ -3348,7 +3292,7 @@
                 <w:noProof/>
                 <w:webHidden/>
               </w:rPr>
-              <w:instrText xml:space="preserve"> PAGEREF _Toc230427009 \h </w:instrText>
+              <w:instrText xml:space="preserve"> PAGEREF _Toc230437518 \h </w:instrText>
             </w:r>
             <w:r>
               <w:rPr>
@@ -3397,7 +3341,7 @@
               <w14:ligatures w14:val="standardContextual"/>
             </w:rPr>
           </w:pPr>
-          <w:hyperlink w:anchor="_Toc230427010" w:history="1">
+          <w:hyperlink w:anchor="_Toc230437519" w:history="1">
             <w:r>
               <w:rPr>
                 <w:rStyle w:val="Hyperlink"/>
@@ -3446,7 +3390,7 @@
                 <w:noProof/>
                 <w:webHidden/>
               </w:rPr>
-              <w:instrText xml:space="preserve"> PAGEREF _Toc230427010 \h </w:instrText>
+              <w:instrText xml:space="preserve"> PAGEREF _Toc230437519 \h </w:instrText>
             </w:r>
             <w:r>
               <w:rPr>
@@ -3496,7 +3440,7 @@
               <w14:ligatures w14:val="standardContextual"/>
             </w:rPr>
           </w:pPr>
-          <w:hyperlink w:anchor="_Toc230427011" w:history="1">
+          <w:hyperlink w:anchor="_Toc230437520" w:history="1">
             <w:r>
               <w:rPr>
                 <w:rStyle w:val="Hyperlink"/>
@@ -3547,7 +3491,7 @@
                 <w:noProof/>
                 <w:webHidden/>
               </w:rPr>
-              <w:instrText xml:space="preserve"> PAGEREF _Toc230427011 \h </w:instrText>
+              <w:instrText xml:space="preserve"> PAGEREF _Toc230437520 \h </w:instrText>
             </w:r>
             <w:r>
               <w:rPr>
@@ -3597,7 +3541,7 @@
               <w14:ligatures w14:val="standardContextual"/>
             </w:rPr>
           </w:pPr>
-          <w:hyperlink w:anchor="_Toc230427012" w:history="1">
+          <w:hyperlink w:anchor="_Toc230437521" w:history="1">
             <w:r>
               <w:rPr>
                 <w:rStyle w:val="Hyperlink"/>
@@ -3646,7 +3590,7 @@
                 <w:noProof/>
                 <w:webHidden/>
               </w:rPr>
-              <w:instrText xml:space="preserve"> PAGEREF _Toc230427012 \h </w:instrText>
+              <w:instrText xml:space="preserve"> PAGEREF _Toc230437521 \h </w:instrText>
             </w:r>
             <w:r>
               <w:rPr>
@@ -3695,7 +3639,7 @@
               <w14:ligatures w14:val="standardContextual"/>
             </w:rPr>
           </w:pPr>
-          <w:hyperlink w:anchor="_Toc230427013" w:history="1">
+          <w:hyperlink w:anchor="_Toc230437522" w:history="1">
             <w:r>
               <w:rPr>
                 <w:rStyle w:val="Hyperlink"/>
@@ -3744,7 +3688,7 @@
                 <w:noProof/>
                 <w:webHidden/>
               </w:rPr>
-              <w:instrText xml:space="preserve"> PAGEREF _Toc230427013 \h </w:instrText>
+              <w:instrText xml:space="preserve"> PAGEREF _Toc230437522 \h </w:instrText>
             </w:r>
             <w:r>
               <w:rPr>
@@ -3793,7 +3737,7 @@
               <w14:ligatures w14:val="standardContextual"/>
             </w:rPr>
           </w:pPr>
-          <w:hyperlink w:anchor="_Toc230427014" w:history="1">
+          <w:hyperlink w:anchor="_Toc230437523" w:history="1">
             <w:r>
               <w:rPr>
                 <w:rStyle w:val="Hyperlink"/>
@@ -3842,7 +3786,7 @@
                 <w:noProof/>
                 <w:webHidden/>
               </w:rPr>
-              <w:instrText xml:space="preserve"> PAGEREF _Toc230427014 \h </w:instrText>
+              <w:instrText xml:space="preserve"> PAGEREF _Toc230437523 \h </w:instrText>
             </w:r>
             <w:r>
               <w:rPr>
@@ -3891,7 +3835,7 @@
               <w14:ligatures w14:val="standardContextual"/>
             </w:rPr>
           </w:pPr>
-          <w:hyperlink w:anchor="_Toc230427015" w:history="1">
+          <w:hyperlink w:anchor="_Toc230437524" w:history="1">
             <w:r>
               <w:rPr>
                 <w:rStyle w:val="Hyperlink"/>
@@ -3940,7 +3884,7 @@
                 <w:noProof/>
                 <w:webHidden/>
               </w:rPr>
-              <w:instrText xml:space="preserve"> PAGEREF _Toc230427015 \h </w:instrText>
+              <w:instrText xml:space="preserve"> PAGEREF _Toc230437524 \h </w:instrText>
             </w:r>
             <w:r>
               <w:rPr>
@@ -3990,7 +3934,7 @@
               <w14:ligatures w14:val="standardContextual"/>
             </w:rPr>
           </w:pPr>
-          <w:hyperlink w:anchor="_Toc230427016" w:history="1">
+          <w:hyperlink w:anchor="_Toc230437525" w:history="1">
             <w:r>
               <w:rPr>
                 <w:rStyle w:val="Hyperlink"/>
@@ -4041,7 +3985,7 @@
                 <w:noProof/>
                 <w:webHidden/>
               </w:rPr>
-              <w:instrText xml:space="preserve"> PAGEREF _Toc230427016 \h </w:instrText>
+              <w:instrText xml:space="preserve"> PAGEREF _Toc230437525 \h </w:instrText>
             </w:r>
             <w:r>
               <w:rPr>
@@ -4091,7 +4035,7 @@
               <w14:ligatures w14:val="standardContextual"/>
             </w:rPr>
           </w:pPr>
-          <w:hyperlink w:anchor="_Toc230427017" w:history="1">
+          <w:hyperlink w:anchor="_Toc230437526" w:history="1">
             <w:r>
               <w:rPr>
                 <w:rStyle w:val="Hyperlink"/>
@@ -4140,7 +4084,7 @@
                 <w:noProof/>
                 <w:webHidden/>
               </w:rPr>
-              <w:instrText xml:space="preserve"> PAGEREF _Toc230427017 \h </w:instrText>
+              <w:instrText xml:space="preserve"> PAGEREF _Toc230437526 \h </w:instrText>
             </w:r>
             <w:r>
               <w:rPr>
@@ -4189,7 +4133,7 @@
               <w14:ligatures w14:val="standardContextual"/>
             </w:rPr>
           </w:pPr>
-          <w:hyperlink w:anchor="_Toc230427018" w:history="1">
+          <w:hyperlink w:anchor="_Toc230437527" w:history="1">
             <w:r>
               <w:rPr>
                 <w:rStyle w:val="Hyperlink"/>
@@ -4238,7 +4182,7 @@
                 <w:noProof/>
                 <w:webHidden/>
               </w:rPr>
-              <w:instrText xml:space="preserve"> PAGEREF _Toc230427018 \h </w:instrText>
+              <w:instrText xml:space="preserve"> PAGEREF _Toc230437527 \h </w:instrText>
             </w:r>
             <w:r>
               <w:rPr>
@@ -4287,7 +4231,7 @@
               <w14:ligatures w14:val="standardContextual"/>
             </w:rPr>
           </w:pPr>
-          <w:hyperlink w:anchor="_Toc230427019" w:history="1">
+          <w:hyperlink w:anchor="_Toc230437528" w:history="1">
             <w:r>
               <w:rPr>
                 <w:rStyle w:val="Hyperlink"/>
@@ -4336,7 +4280,7 @@
                 <w:noProof/>
                 <w:webHidden/>
               </w:rPr>
-              <w:instrText xml:space="preserve"> PAGEREF _Toc230427019 \h </w:instrText>
+              <w:instrText xml:space="preserve"> PAGEREF _Toc230437528 \h </w:instrText>
             </w:r>
             <w:r>
               <w:rPr>
@@ -4385,7 +4329,7 @@
               <w14:ligatures w14:val="standardContextual"/>
             </w:rPr>
           </w:pPr>
-          <w:hyperlink w:anchor="_Toc230427020" w:history="1">
+          <w:hyperlink w:anchor="_Toc230437529" w:history="1">
             <w:r>
               <w:rPr>
                 <w:rStyle w:val="Hyperlink"/>
@@ -4434,7 +4378,7 @@
                 <w:noProof/>
                 <w:webHidden/>
               </w:rPr>
-              <w:instrText xml:space="preserve"> PAGEREF _Toc230427020 \h </w:instrText>
+              <w:instrText xml:space="preserve"> PAGEREF _Toc230437529 \h </w:instrText>
             </w:r>
             <w:r>
               <w:rPr>
@@ -4483,7 +4427,7 @@
               <w14:ligatures w14:val="standardContextual"/>
             </w:rPr>
           </w:pPr>
-          <w:hyperlink w:anchor="_Toc230427021" w:history="1">
+          <w:hyperlink w:anchor="_Toc230437530" w:history="1">
             <w:r>
               <w:rPr>
                 <w:rStyle w:val="Hyperlink"/>
@@ -4532,7 +4476,7 @@
                 <w:noProof/>
                 <w:webHidden/>
               </w:rPr>
-              <w:instrText xml:space="preserve"> PAGEREF _Toc230427021 \h </w:instrText>
+              <w:instrText xml:space="preserve"> PAGEREF _Toc230437530 \h </w:instrText>
             </w:r>
             <w:r>
               <w:rPr>
@@ -4581,7 +4525,7 @@
               <w14:ligatures w14:val="standardContextual"/>
             </w:rPr>
           </w:pPr>
-          <w:hyperlink w:anchor="_Toc230427022" w:history="1">
+          <w:hyperlink w:anchor="_Toc230437531" w:history="1">
             <w:r>
               <w:rPr>
                 <w:rStyle w:val="Hyperlink"/>
@@ -4630,7 +4574,7 @@
                 <w:noProof/>
                 <w:webHidden/>
               </w:rPr>
-              <w:instrText xml:space="preserve"> PAGEREF _Toc230427022 \h </w:instrText>
+              <w:instrText xml:space="preserve"> PAGEREF _Toc230437531 \h </w:instrText>
             </w:r>
             <w:r>
               <w:rPr>
@@ -4679,7 +4623,7 @@
               <w14:ligatures w14:val="standardContextual"/>
             </w:rPr>
           </w:pPr>
-          <w:hyperlink w:anchor="_Toc230427023" w:history="1">
+          <w:hyperlink w:anchor="_Toc230437532" w:history="1">
             <w:r>
               <w:rPr>
                 <w:rStyle w:val="Hyperlink"/>
@@ -4728,7 +4672,7 @@
                 <w:noProof/>
                 <w:webHidden/>
               </w:rPr>
-              <w:instrText xml:space="preserve"> PAGEREF _Toc230427023 \h </w:instrText>
+              <w:instrText xml:space="preserve"> PAGEREF _Toc230437532 \h </w:instrText>
             </w:r>
             <w:r>
               <w:rPr>
@@ -4777,7 +4721,7 @@
               <w14:ligatures w14:val="standardContextual"/>
             </w:rPr>
           </w:pPr>
-          <w:hyperlink w:anchor="_Toc230427024" w:history="1">
+          <w:hyperlink w:anchor="_Toc230437533" w:history="1">
             <w:r>
               <w:rPr>
                 <w:rStyle w:val="Hyperlink"/>
@@ -4826,7 +4770,7 @@
                 <w:noProof/>
                 <w:webHidden/>
               </w:rPr>
-              <w:instrText xml:space="preserve"> PAGEREF _Toc230427024 \h </w:instrText>
+              <w:instrText xml:space="preserve"> PAGEREF _Toc230437533 \h </w:instrText>
             </w:r>
             <w:r>
               <w:rPr>
@@ -4876,7 +4820,7 @@
               <w14:ligatures w14:val="standardContextual"/>
             </w:rPr>
           </w:pPr>
-          <w:hyperlink w:anchor="_Toc230427025" w:history="1">
+          <w:hyperlink w:anchor="_Toc230437534" w:history="1">
             <w:r>
               <w:rPr>
                 <w:rStyle w:val="Hyperlink"/>
@@ -4927,7 +4871,7 @@
                 <w:noProof/>
                 <w:webHidden/>
               </w:rPr>
-              <w:instrText xml:space="preserve"> PAGEREF _Toc230427025 \h </w:instrText>
+              <w:instrText xml:space="preserve"> PAGEREF _Toc230437534 \h </w:instrText>
             </w:r>
             <w:r>
               <w:rPr>
@@ -4977,7 +4921,7 @@
               <w14:ligatures w14:val="standardContextual"/>
             </w:rPr>
           </w:pPr>
-          <w:hyperlink w:anchor="_Toc230427026" w:history="1">
+          <w:hyperlink w:anchor="_Toc230437535" w:history="1">
             <w:r>
               <w:rPr>
                 <w:rStyle w:val="Hyperlink"/>
@@ -5026,7 +4970,7 @@
                 <w:noProof/>
                 <w:webHidden/>
               </w:rPr>
-              <w:instrText xml:space="preserve"> PAGEREF _Toc230427026 \h </w:instrText>
+              <w:instrText xml:space="preserve"> PAGEREF _Toc230437535 \h </w:instrText>
             </w:r>
             <w:r>
               <w:rPr>
@@ -5075,7 +5019,7 @@
               <w14:ligatures w14:val="standardContextual"/>
             </w:rPr>
           </w:pPr>
-          <w:hyperlink w:anchor="_Toc230427027" w:history="1">
+          <w:hyperlink w:anchor="_Toc230437536" w:history="1">
             <w:r>
               <w:rPr>
                 <w:rStyle w:val="Hyperlink"/>
@@ -5124,7 +5068,7 @@
                 <w:noProof/>
                 <w:webHidden/>
               </w:rPr>
-              <w:instrText xml:space="preserve"> PAGEREF _Toc230427027 \h </w:instrText>
+              <w:instrText xml:space="preserve"> PAGEREF _Toc230437536 \h </w:instrText>
             </w:r>
             <w:r>
               <w:rPr>
@@ -5173,7 +5117,7 @@
               <w14:ligatures w14:val="standardContextual"/>
             </w:rPr>
           </w:pPr>
-          <w:hyperlink w:anchor="_Toc230427028" w:history="1">
+          <w:hyperlink w:anchor="_Toc230437537" w:history="1">
             <w:r>
               <w:rPr>
                 <w:rStyle w:val="Hyperlink"/>
@@ -5222,7 +5166,7 @@
                 <w:noProof/>
                 <w:webHidden/>
               </w:rPr>
-              <w:instrText xml:space="preserve"> PAGEREF _Toc230427028 \h </w:instrText>
+              <w:instrText xml:space="preserve"> PAGEREF _Toc230437537 \h </w:instrText>
             </w:r>
             <w:r>
               <w:rPr>
@@ -5271,7 +5215,7 @@
               <w14:ligatures w14:val="standardContextual"/>
             </w:rPr>
           </w:pPr>
-          <w:hyperlink w:anchor="_Toc230427029" w:history="1">
+          <w:hyperlink w:anchor="_Toc230437538" w:history="1">
             <w:r>
               <w:rPr>
                 <w:rStyle w:val="Hyperlink"/>
@@ -5320,7 +5264,7 @@
                 <w:noProof/>
                 <w:webHidden/>
               </w:rPr>
-              <w:instrText xml:space="preserve"> PAGEREF _Toc230427029 \h </w:instrText>
+              <w:instrText xml:space="preserve"> PAGEREF _Toc230437538 \h </w:instrText>
             </w:r>
             <w:r>
               <w:rPr>
@@ -5369,7 +5313,7 @@
               <w14:ligatures w14:val="standardContextual"/>
             </w:rPr>
           </w:pPr>
-          <w:hyperlink w:anchor="_Toc230427030" w:history="1">
+          <w:hyperlink w:anchor="_Toc230437539" w:history="1">
             <w:r>
               <w:rPr>
                 <w:rStyle w:val="Hyperlink"/>
@@ -5418,7 +5362,7 @@
                 <w:noProof/>
                 <w:webHidden/>
               </w:rPr>
-              <w:instrText xml:space="preserve"> PAGEREF _Toc230427030 \h </w:instrText>
+              <w:instrText xml:space="preserve"> PAGEREF _Toc230437539 \h </w:instrText>
             </w:r>
             <w:r>
               <w:rPr>
@@ -5439,6 +5383,104 @@
                 <w:webHidden/>
               </w:rPr>
               <w:t>24</w:t>
+            </w:r>
+            <w:r>
+              <w:rPr>
+                <w:noProof/>
+                <w:webHidden/>
+              </w:rPr>
+              <w:fldChar w:fldCharType="end"/>
+            </w:r>
+          </w:hyperlink>
+        </w:p>
+        <w:p>
+          <w:pPr>
+            <w:pStyle w:val="TOC2"/>
+            <w:tabs>
+              <w:tab w:val="left" w:pos="880"/>
+              <w:tab w:val="right" w:leader="dot" w:pos="9232"/>
+            </w:tabs>
+            <w:rPr>
+              <w:rFonts w:asciiTheme="minorHAnsi" w:hAnsiTheme="minorHAnsi" w:cstheme="minorBidi"/>
+              <w:noProof/>
+              <w:color w:val="auto"/>
+              <w:kern w:val="2"/>
+              <w:sz w:val="24"/>
+              <w:szCs w:val="24"/>
+              <w:lang w:val="en-US"/>
+              <w14:ligatures w14:val="standardContextual"/>
+            </w:rPr>
+          </w:pPr>
+          <w:hyperlink w:anchor="_Toc230437540" w:history="1">
+            <w:r>
+              <w:rPr>
+                <w:rStyle w:val="Hyperlink"/>
+                <w:noProof/>
+                <w:lang w:val="en-US"/>
+              </w:rPr>
+              <w:t>8.6</w:t>
+            </w:r>
+            <w:r>
+              <w:rPr>
+                <w:rFonts w:asciiTheme="minorHAnsi" w:hAnsiTheme="minorHAnsi" w:cstheme="minorBidi"/>
+                <w:noProof/>
+                <w:color w:val="auto"/>
+                <w:kern w:val="2"/>
+                <w:sz w:val="24"/>
+                <w:szCs w:val="24"/>
+                <w:lang w:val="en-US"/>
+                <w14:ligatures w14:val="standardContextual"/>
+              </w:rPr>
+              <w:tab/>
+            </w:r>
+            <w:r>
+              <w:rPr>
+                <w:rStyle w:val="Hyperlink"/>
+                <w:noProof/>
+                <w:lang w:val="en-US"/>
+              </w:rPr>
+              <w:t>Testing and Validation</w:t>
+            </w:r>
+            <w:r>
+              <w:rPr>
+                <w:noProof/>
+                <w:webHidden/>
+              </w:rPr>
+              <w:tab/>
+            </w:r>
+            <w:r>
+              <w:rPr>
+                <w:noProof/>
+                <w:webHidden/>
+              </w:rPr>
+              <w:fldChar w:fldCharType="begin"/>
+            </w:r>
+            <w:r>
+              <w:rPr>
+                <w:noProof/>
+                <w:webHidden/>
+              </w:rPr>
+              <w:instrText xml:space="preserve"> PAGEREF _Toc230437540 \h </w:instrText>
+            </w:r>
+            <w:r>
+              <w:rPr>
+                <w:noProof/>
+                <w:webHidden/>
+              </w:rPr>
+            </w:r>
+            <w:r>
+              <w:rPr>
+                <w:noProof/>
+                <w:webHidden/>
+              </w:rPr>
+              <w:fldChar w:fldCharType="separate"/>
+            </w:r>
+            <w:r>
+              <w:rPr>
+                <w:noProof/>
+                <w:webHidden/>
+              </w:rPr>
+              <w:t>25</w:t>
             </w:r>
             <w:r>
               <w:rPr>
@@ -5468,7 +5510,7 @@
               <w14:ligatures w14:val="standardContextual"/>
             </w:rPr>
           </w:pPr>
-          <w:hyperlink w:anchor="_Toc230427031" w:history="1">
+          <w:hyperlink w:anchor="_Toc230437541" w:history="1">
             <w:r>
               <w:rPr>
                 <w:rStyle w:val="Hyperlink"/>
@@ -5519,7 +5561,7 @@
                 <w:noProof/>
                 <w:webHidden/>
               </w:rPr>
-              <w:instrText xml:space="preserve"> PAGEREF _Toc230427031 \h </w:instrText>
+              <w:instrText xml:space="preserve"> PAGEREF _Toc230437541 \h </w:instrText>
             </w:r>
             <w:r>
               <w:rPr>
@@ -5540,7 +5582,7 @@
                 <w:noProof/>
                 <w:webHidden/>
               </w:rPr>
-              <w:t>25</w:t>
+              <w:t>26</w:t>
             </w:r>
             <w:r>
               <w:rPr>
@@ -5570,7 +5612,7 @@
               <w14:ligatures w14:val="standardContextual"/>
             </w:rPr>
           </w:pPr>
-          <w:hyperlink w:anchor="_Toc230427032" w:history="1">
+          <w:hyperlink w:anchor="_Toc230437542" w:history="1">
             <w:r>
               <w:rPr>
                 <w:rStyle w:val="Hyperlink"/>
@@ -5621,7 +5663,7 @@
                 <w:noProof/>
                 <w:webHidden/>
               </w:rPr>
-              <w:instrText xml:space="preserve"> PAGEREF _Toc230427032 \h </w:instrText>
+              <w:instrText xml:space="preserve"> PAGEREF _Toc230437542 \h </w:instrText>
             </w:r>
             <w:r>
               <w:rPr>
@@ -5672,7 +5714,7 @@
               <w14:ligatures w14:val="standardContextual"/>
             </w:rPr>
           </w:pPr>
-          <w:hyperlink w:anchor="_Toc230427033" w:history="1">
+          <w:hyperlink w:anchor="_Toc230437543" w:history="1">
             <w:r>
               <w:rPr>
                 <w:rStyle w:val="Hyperlink"/>
@@ -5702,7 +5744,7 @@
                 <w:noProof/>
                 <w:lang w:val="en-US"/>
               </w:rPr>
-              <w:t>GIT/KAGGLE/COLAB/etc.. LINK</w:t>
+              <w:t>GIT/KAGGLE/COLAB/ETC. LINK</w:t>
             </w:r>
             <w:r>
               <w:rPr>
@@ -5723,7 +5765,7 @@
                 <w:noProof/>
                 <w:webHidden/>
               </w:rPr>
-              <w:instrText xml:space="preserve"> PAGEREF _Toc230427033 \h </w:instrText>
+              <w:instrText xml:space="preserve"> PAGEREF _Toc230437543 \h </w:instrText>
             </w:r>
             <w:r>
               <w:rPr>
@@ -5744,7 +5786,7 @@
                 <w:noProof/>
                 <w:webHidden/>
               </w:rPr>
-              <w:t>27</w:t>
+              <w:t>28</w:t>
             </w:r>
             <w:r>
               <w:rPr>
@@ -5774,7 +5816,7 @@
               <w14:ligatures w14:val="standardContextual"/>
             </w:rPr>
           </w:pPr>
-          <w:hyperlink w:anchor="_Toc230427034" w:history="1">
+          <w:hyperlink w:anchor="_Toc230437544" w:history="1">
             <w:r>
               <w:rPr>
                 <w:rStyle w:val="Hyperlink"/>
@@ -5825,7 +5867,7 @@
                 <w:noProof/>
                 <w:webHidden/>
               </w:rPr>
-              <w:instrText xml:space="preserve"> PAGEREF _Toc230427034 \h </w:instrText>
+              <w:instrText xml:space="preserve"> PAGEREF _Toc230437544 \h </w:instrText>
             </w:r>
             <w:r>
               <w:rPr>
@@ -5846,7 +5888,7 @@
                 <w:noProof/>
                 <w:webHidden/>
               </w:rPr>
-              <w:t>28</w:t>
+              <w:t>29</w:t>
             </w:r>
             <w:r>
               <w:rPr>
@@ -5891,7 +5933,7 @@
       <w:pPr>
         <w:pStyle w:val="Introsections"/>
       </w:pPr>
-      <w:bookmarkStart w:id="7" w:name="_Toc230426992"/>
+      <w:bookmarkStart w:id="7" w:name="_Toc230437501"/>
       <w:r>
         <w:lastRenderedPageBreak/>
         <w:t>LIST OF FIGURES</w:t>
@@ -6401,7 +6443,7 @@
           <w:lang w:eastAsia="zh-CN"/>
         </w:rPr>
       </w:pPr>
-      <w:bookmarkStart w:id="8" w:name="_Toc230426993"/>
+      <w:bookmarkStart w:id="8" w:name="_Toc230437502"/>
       <w:r>
         <w:rPr>
           <w:lang w:eastAsia="zh-CN"/>
@@ -6443,7 +6485,7 @@
         </w:rPr>
         <w:fldChar w:fldCharType="separate"/>
       </w:r>
-      <w:hyperlink w:anchor="_Toc230202521" w:history="1">
+      <w:hyperlink w:anchor="_Toc230437484" w:history="1">
         <w:r>
           <w:rPr>
             <w:rStyle w:val="Hyperlink"/>
@@ -6466,7 +6508,7 @@
           <w:rPr>
             <w:webHidden/>
           </w:rPr>
-          <w:instrText xml:space="preserve"> PAGEREF _Toc230202521 \h </w:instrText>
+          <w:instrText xml:space="preserve"> PAGEREF _Toc230437484 \h </w:instrText>
         </w:r>
         <w:r>
           <w:rPr>
@@ -6507,7 +6549,7 @@
           <w14:ligatures w14:val="standardContextual"/>
         </w:rPr>
       </w:pPr>
-      <w:hyperlink w:anchor="_Toc230202522" w:history="1">
+      <w:hyperlink w:anchor="_Toc230437485" w:history="1">
         <w:r>
           <w:rPr>
             <w:rStyle w:val="Hyperlink"/>
@@ -6530,7 +6572,7 @@
           <w:rPr>
             <w:webHidden/>
           </w:rPr>
-          <w:instrText xml:space="preserve"> PAGEREF _Toc230202522 \h </w:instrText>
+          <w:instrText xml:space="preserve"> PAGEREF _Toc230437485 \h </w:instrText>
         </w:r>
         <w:r>
           <w:rPr>
@@ -6571,7 +6613,7 @@
           <w14:ligatures w14:val="standardContextual"/>
         </w:rPr>
       </w:pPr>
-      <w:hyperlink w:anchor="_Toc230202523" w:history="1">
+      <w:hyperlink w:anchor="_Toc230437486" w:history="1">
         <w:r>
           <w:rPr>
             <w:rStyle w:val="Hyperlink"/>
@@ -6594,7 +6636,7 @@
           <w:rPr>
             <w:webHidden/>
           </w:rPr>
-          <w:instrText xml:space="preserve"> PAGEREF _Toc230202523 \h </w:instrText>
+          <w:instrText xml:space="preserve"> PAGEREF _Toc230437486 \h </w:instrText>
         </w:r>
         <w:r>
           <w:rPr>
@@ -6635,7 +6677,7 @@
           <w14:ligatures w14:val="standardContextual"/>
         </w:rPr>
       </w:pPr>
-      <w:hyperlink w:anchor="_Toc230202524" w:history="1">
+      <w:hyperlink w:anchor="_Toc230437487" w:history="1">
         <w:r>
           <w:rPr>
             <w:rStyle w:val="Hyperlink"/>
@@ -6658,7 +6700,7 @@
           <w:rPr>
             <w:webHidden/>
           </w:rPr>
-          <w:instrText xml:space="preserve"> PAGEREF _Toc230202524 \h </w:instrText>
+          <w:instrText xml:space="preserve"> PAGEREF _Toc230437487 \h </w:instrText>
         </w:r>
         <w:r>
           <w:rPr>
@@ -6699,7 +6741,7 @@
           <w14:ligatures w14:val="standardContextual"/>
         </w:rPr>
       </w:pPr>
-      <w:hyperlink w:anchor="_Toc230202525" w:history="1">
+      <w:hyperlink w:anchor="_Toc230437488" w:history="1">
         <w:r>
           <w:rPr>
             <w:rStyle w:val="Hyperlink"/>
@@ -6722,7 +6764,7 @@
           <w:rPr>
             <w:webHidden/>
           </w:rPr>
-          <w:instrText xml:space="preserve"> PAGEREF _Toc230202525 \h </w:instrText>
+          <w:instrText xml:space="preserve"> PAGEREF _Toc230437488 \h </w:instrText>
         </w:r>
         <w:r>
           <w:rPr>
@@ -6751,6 +6793,70 @@
     </w:p>
     <w:p>
       <w:pPr>
+        <w:pStyle w:val="TableofFigures"/>
+        <w:tabs>
+          <w:tab w:val="right" w:leader="dot" w:pos="9232"/>
+        </w:tabs>
+        <w:rPr>
+          <w:rFonts w:eastAsiaTheme="minorEastAsia"/>
+          <w:kern w:val="2"/>
+          <w:sz w:val="24"/>
+          <w:szCs w:val="24"/>
+          <w14:ligatures w14:val="standardContextual"/>
+        </w:rPr>
+      </w:pPr>
+      <w:hyperlink w:anchor="_Toc230437489" w:history="1">
+        <w:r>
+          <w:rPr>
+            <w:rStyle w:val="Hyperlink"/>
+          </w:rPr>
+          <w:t>Table 6. Summary of Functional Testing and Validation Results</w:t>
+        </w:r>
+        <w:r>
+          <w:rPr>
+            <w:webHidden/>
+          </w:rPr>
+          <w:tab/>
+        </w:r>
+        <w:r>
+          <w:rPr>
+            <w:webHidden/>
+          </w:rPr>
+          <w:fldChar w:fldCharType="begin"/>
+        </w:r>
+        <w:r>
+          <w:rPr>
+            <w:webHidden/>
+          </w:rPr>
+          <w:instrText xml:space="preserve"> PAGEREF _Toc230437489 \h </w:instrText>
+        </w:r>
+        <w:r>
+          <w:rPr>
+            <w:webHidden/>
+          </w:rPr>
+        </w:r>
+        <w:r>
+          <w:rPr>
+            <w:webHidden/>
+          </w:rPr>
+          <w:fldChar w:fldCharType="separate"/>
+        </w:r>
+        <w:r>
+          <w:rPr>
+            <w:webHidden/>
+          </w:rPr>
+          <w:t>25</w:t>
+        </w:r>
+        <w:r>
+          <w:rPr>
+            <w:webHidden/>
+          </w:rPr>
+          <w:fldChar w:fldCharType="end"/>
+        </w:r>
+      </w:hyperlink>
+    </w:p>
+    <w:p>
+      <w:pPr>
         <w:rPr>
           <w:lang w:val="en-US" w:eastAsia="zh-CN"/>
         </w:rPr>
@@ -6806,7 +6912,7 @@
       </w:pPr>
       <w:bookmarkStart w:id="9" w:name="_Toc494826182"/>
       <w:bookmarkStart w:id="10" w:name="_Toc32521124"/>
-      <w:bookmarkStart w:id="11" w:name="_Toc230426994"/>
+      <w:bookmarkStart w:id="11" w:name="_Toc230437503"/>
       <w:bookmarkEnd w:id="0"/>
       <w:bookmarkEnd w:id="1"/>
       <w:r>
@@ -6960,7 +7066,7 @@
         </w:rPr>
       </w:pPr>
       <w:bookmarkStart w:id="12" w:name="_Toc32521125"/>
-      <w:bookmarkStart w:id="13" w:name="_Toc230426995"/>
+      <w:bookmarkStart w:id="13" w:name="_Toc230437504"/>
       <w:r>
         <w:rPr>
           <w:lang w:val="en-US"/>
@@ -6997,7 +7103,7 @@
           <w:lang w:val="en-US"/>
         </w:rPr>
       </w:pPr>
-      <w:bookmarkStart w:id="14" w:name="_Toc230426996"/>
+      <w:bookmarkStart w:id="14" w:name="_Toc230437505"/>
       <w:r>
         <w:rPr>
           <w:lang w:val="en-US"/>
@@ -7140,21 +7246,7 @@
         <w:rPr>
           <w:lang w:val="en-US"/>
         </w:rPr>
-        <w:t xml:space="preserve">In this project, supply chain visibility is addressed through a multi-page dashboard structure. The platform brings different operational views together, including overview indicators, regional performance, inventory control, shipment performance, risk analysis, and demand forecasting. This supports the idea that supply chain visibility should not focus on only one </w:t>
-      </w:r>
-      <w:proofErr w:type="gramStart"/>
-      <w:r>
-        <w:rPr>
-          <w:lang w:val="en-US"/>
-        </w:rPr>
-        <w:t>metric, but</w:t>
-      </w:r>
-      <w:proofErr w:type="gramEnd"/>
-      <w:r>
-        <w:rPr>
-          <w:lang w:val="en-US"/>
-        </w:rPr>
-        <w:t xml:space="preserve"> should combine different operational indicators.</w:t>
+        <w:t>In this project, supply chain visibility is addressed through a multi-page dashboard structure. The platform brings different operational views together, including overview indicators, regional performance, inventory control, shipment performance, risk analysis, and demand forecasting. This supports the idea that supply chain visibility should not focus on only one metric, but should combine different operational indicators.</w:t>
       </w:r>
     </w:p>
     <w:p>
@@ -7171,7 +7263,7 @@
           <w:lang w:val="en-US"/>
         </w:rPr>
       </w:pPr>
-      <w:bookmarkStart w:id="15" w:name="_Toc230426997"/>
+      <w:bookmarkStart w:id="15" w:name="_Toc230437506"/>
       <w:r>
         <w:rPr>
           <w:lang w:val="en-US"/>
@@ -7332,7 +7424,7 @@
           <w:lang w:val="en-US"/>
         </w:rPr>
       </w:pPr>
-      <w:bookmarkStart w:id="16" w:name="_Toc230426998"/>
+      <w:bookmarkStart w:id="16" w:name="_Toc230437507"/>
       <w:r>
         <w:rPr>
           <w:lang w:val="en-US"/>
@@ -7492,7 +7584,7 @@
           <w:lang w:val="en-US"/>
         </w:rPr>
       </w:pPr>
-      <w:bookmarkStart w:id="17" w:name="_Toc230426999"/>
+      <w:bookmarkStart w:id="17" w:name="_Toc230437508"/>
       <w:r>
         <w:rPr>
           <w:lang w:val="en-US"/>
@@ -7652,7 +7744,7 @@
           <w:lang w:val="en-US"/>
         </w:rPr>
       </w:pPr>
-      <w:bookmarkStart w:id="18" w:name="_Toc230427000"/>
+      <w:bookmarkStart w:id="18" w:name="_Toc230437509"/>
       <w:r>
         <w:rPr>
           <w:lang w:val="en-US"/>
@@ -7813,7 +7905,7 @@
           <w:lang w:val="en-US"/>
         </w:rPr>
       </w:pPr>
-      <w:bookmarkStart w:id="19" w:name="_Toc230427001"/>
+      <w:bookmarkStart w:id="19" w:name="_Toc230437510"/>
       <w:r>
         <w:rPr>
           <w:lang w:val="en-US"/>
@@ -7914,21 +8006,7 @@
         <w:rPr>
           <w:lang w:val="en-US"/>
         </w:rPr>
-        <w:t xml:space="preserve">The dataset upload feature improves the originality and usefulness of the project. The default </w:t>
-      </w:r>
-      <w:proofErr w:type="spellStart"/>
-      <w:r>
-        <w:rPr>
-          <w:lang w:val="en-US"/>
-        </w:rPr>
-        <w:t>DataCo</w:t>
-      </w:r>
-      <w:proofErr w:type="spellEnd"/>
-      <w:r>
-        <w:rPr>
-          <w:lang w:val="en-US"/>
-        </w:rPr>
-        <w:t xml:space="preserve"> dataset is used as a demonstration dataset, but the system can also process new supply chain datasets. After the user maps the uploaded dataset to the standard schema, the dashboard pages are generated dynamically based on the active dataset. This makes the platform more reusable for different supply chain data sources.</w:t>
+        <w:t>The dataset upload feature improves the originality and usefulness of the project. The default DataCo dataset is used as a demonstration dataset, but the system can also process new supply chain datasets. After the user maps the uploaded dataset to the standard schema, the dashboard pages are generated dynamically based on the active dataset. This makes the platform more reusable for different supply chain data sources.</w:t>
       </w:r>
     </w:p>
     <w:p>
@@ -7945,7 +8023,7 @@
           <w:lang w:val="en-US"/>
         </w:rPr>
       </w:pPr>
-      <w:bookmarkStart w:id="20" w:name="_Toc230427002"/>
+      <w:bookmarkStart w:id="20" w:name="_Toc230437511"/>
       <w:r>
         <w:rPr>
           <w:lang w:val="en-US"/>
@@ -7984,21 +8062,7 @@
         <w:rPr>
           <w:lang w:val="en-US"/>
         </w:rPr>
-        <w:t xml:space="preserve">Based on these ideas, this project develops a dataset-adaptive supply chain visibility and risk assessment platform. The platform combines dashboard visualization, uploaded dataset support, data standardization, risk scoring, and demand forecasting in a single </w:t>
-      </w:r>
-      <w:proofErr w:type="spellStart"/>
-      <w:r>
-        <w:rPr>
-          <w:lang w:val="en-US"/>
-        </w:rPr>
-        <w:t>Streamlit</w:t>
-      </w:r>
-      <w:proofErr w:type="spellEnd"/>
-      <w:r>
-        <w:rPr>
-          <w:lang w:val="en-US"/>
-        </w:rPr>
-        <w:t>-based system.</w:t>
+        <w:t>Based on these ideas, this project develops a dataset-adaptive supply chain visibility and risk assessment platform. The platform combines dashboard visualization, uploaded dataset support, data standardization, risk scoring, and demand forecasting in a single Streamlit-based system.</w:t>
       </w:r>
     </w:p>
     <w:p>
@@ -8016,7 +8080,7 @@
         </w:rPr>
       </w:pPr>
       <w:bookmarkStart w:id="21" w:name="_Toc32521137"/>
-      <w:bookmarkStart w:id="22" w:name="_Toc230427003"/>
+      <w:bookmarkStart w:id="22" w:name="_Toc230437512"/>
       <w:r>
         <w:rPr>
           <w:lang w:val="en-US"/>
@@ -8036,21 +8100,7 @@
         <w:rPr>
           <w:lang w:val="en-US"/>
         </w:rPr>
-        <w:t xml:space="preserve">The originality of this study comes from developing a supply chain dashboard platform that is not limited to one fixed dataset. Many dashboard projects are designed only for a single prepared dataset. In this project, the </w:t>
-      </w:r>
-      <w:proofErr w:type="spellStart"/>
-      <w:r>
-        <w:rPr>
-          <w:lang w:val="en-US"/>
-        </w:rPr>
-        <w:t>DataCo</w:t>
-      </w:r>
-      <w:proofErr w:type="spellEnd"/>
-      <w:r>
-        <w:rPr>
-          <w:lang w:val="en-US"/>
-        </w:rPr>
-        <w:t xml:space="preserve"> Smart Supply Chain dataset is used as the default demonstration dataset, but the platform also allows users to upload a new supply chain dataset in CSV or Excel format.</w:t>
+        <w:t>The originality of this study comes from developing a supply chain dashboard platform that is not limited to one fixed dataset. Many dashboard projects are designed only for a single prepared dataset. In this project, the DataCo Smart Supply Chain dataset is used as the default demonstration dataset, but the platform also allows users to upload a new supply chain dataset in CSV or Excel format.</w:t>
       </w:r>
     </w:p>
     <w:p>
@@ -8151,21 +8201,7 @@
           <w:lang w:val="en-US"/>
         </w:rPr>
         <w:br/>
-        <w:t xml:space="preserve">The project is original within its academic scope because it combines data upload, schema mapping, data standardization, dynamic dashboard generation, risk analysis, and forecasting in a single </w:t>
-      </w:r>
-      <w:proofErr w:type="spellStart"/>
-      <w:r>
-        <w:rPr>
-          <w:lang w:val="en-US"/>
-        </w:rPr>
-        <w:t>Streamlit</w:t>
-      </w:r>
-      <w:proofErr w:type="spellEnd"/>
-      <w:r>
-        <w:rPr>
-          <w:lang w:val="en-US"/>
-        </w:rPr>
-        <w:t>-based system. Therefore, the main contribution of the project is the development of a reusable supply chain visibility and risk assessment platform that can work with both a default dataset and user-uploaded datasets.</w:t>
+        <w:t>The project is original within its academic scope because it combines data upload, schema mapping, data standardization, dynamic dashboard generation, risk analysis, and forecasting in a single Streamlit-based system. Therefore, the main contribution of the project is the development of a reusable supply chain visibility and risk assessment platform that can work with both a default dataset and user-uploaded datasets.</w:t>
       </w:r>
     </w:p>
     <w:p>
@@ -8182,7 +8218,7 @@
           <w:lang w:val="en-US"/>
         </w:rPr>
       </w:pPr>
-      <w:bookmarkStart w:id="23" w:name="_Toc230427004"/>
+      <w:bookmarkStart w:id="23" w:name="_Toc230437513"/>
       <w:r>
         <w:rPr>
           <w:lang w:val="en-US"/>
@@ -8298,7 +8334,7 @@
           <w:lang w:val="en-US"/>
         </w:rPr>
       </w:pPr>
-      <w:bookmarkStart w:id="24" w:name="_Toc230427005"/>
+      <w:bookmarkStart w:id="24" w:name="_Toc230437514"/>
       <w:r>
         <w:rPr>
           <w:lang w:val="en-US"/>
@@ -8317,21 +8353,7 @@
         <w:rPr>
           <w:lang w:val="en-US"/>
         </w:rPr>
-        <w:t xml:space="preserve">The solution approach of this project is based on developing a dataset-adaptive supply chain dashboard platform. The system is designed to work with a default demonstration dataset </w:t>
-      </w:r>
-      <w:proofErr w:type="gramStart"/>
-      <w:r>
-        <w:rPr>
-          <w:lang w:val="en-US"/>
-        </w:rPr>
-        <w:t>and also</w:t>
-      </w:r>
-      <w:proofErr w:type="gramEnd"/>
-      <w:r>
-        <w:rPr>
-          <w:lang w:val="en-US"/>
-        </w:rPr>
-        <w:t xml:space="preserve"> with user-uploaded supply chain datasets. The main idea is to transform different supply chain datasets into a common analytical structure and then generate dashboard modules from the active dataset.</w:t>
+        <w:t>The solution approach of this project is based on developing a dataset-adaptive supply chain dashboard platform. The system is designed to work with a default demonstration dataset and also with user-uploaded supply chain datasets. The main idea is to transform different supply chain datasets into a common analytical structure and then generate dashboard modules from the active dataset.</w:t>
       </w:r>
     </w:p>
     <w:p>
@@ -8341,7 +8363,7 @@
           <w:lang w:val="en-US"/>
         </w:rPr>
       </w:pPr>
-      <w:bookmarkStart w:id="25" w:name="_Toc230427006"/>
+      <w:bookmarkStart w:id="25" w:name="_Toc230437515"/>
       <w:r>
         <w:rPr>
           <w:lang w:val="en-US"/>
@@ -8381,21 +8403,7 @@
           <w:lang w:val="en-US"/>
         </w:rPr>
         <w:br/>
-        <w:t xml:space="preserve">The platform uses the </w:t>
-      </w:r>
-      <w:proofErr w:type="spellStart"/>
-      <w:r>
-        <w:rPr>
-          <w:lang w:val="en-US"/>
-        </w:rPr>
-        <w:t>DataCo</w:t>
-      </w:r>
-      <w:proofErr w:type="spellEnd"/>
-      <w:r>
-        <w:rPr>
-          <w:lang w:val="en-US"/>
-        </w:rPr>
-        <w:t xml:space="preserve"> Smart Supply Chain dataset as the default dataset. This dataset is processed into different analytical tables such as orders, products, shipments, inventory, demand, and risk scores. These tables are used by the default dashboard when no uploaded dataset is active.</w:t>
+        <w:t>The platform uses the DataCo Smart Supply Chain dataset as the default dataset. This dataset is processed into different analytical tables such as orders, products, shipments, inventory, demand, and risk scores. These tables are used by the default dashboard when no uploaded dataset is active.</w:t>
       </w:r>
     </w:p>
     <w:p>
@@ -8432,7 +8440,7 @@
           <w:lang w:val="en-US"/>
         </w:rPr>
       </w:pPr>
-      <w:bookmarkStart w:id="26" w:name="_Toc230427007"/>
+      <w:bookmarkStart w:id="26" w:name="_Toc230437516"/>
       <w:r>
         <w:rPr>
           <w:lang w:val="en-US"/>
@@ -8477,21 +8485,7 @@
           <w:lang w:val="en-US"/>
         </w:rPr>
         <w:br/>
-        <w:t xml:space="preserve">In the Data Source Manager, users map the columns of the uploaded dataset to the standard supply chain </w:t>
-      </w:r>
-      <w:proofErr w:type="gramStart"/>
-      <w:r>
-        <w:rPr>
-          <w:lang w:val="en-US"/>
-        </w:rPr>
-        <w:t>schema</w:t>
-      </w:r>
-      <w:proofErr w:type="gramEnd"/>
-      <w:r>
-        <w:rPr>
-          <w:lang w:val="en-US"/>
-        </w:rPr>
-        <w:t>. The required fields include order ID, order date, product name, category name, and order quantity. Optional fields include shipping date, scheduled delivery date, delivery status, actual shipping days, scheduled shipping days, shipping mode, market, region, country, sales, and profit.</w:t>
+        <w:t>In the Data Source Manager, users map the columns of the uploaded dataset to the standard supply chain schema. The required fields include order ID, order date, product name, category name, and order quantity. Optional fields include shipping date, scheduled delivery date, delivery status, actual shipping days, scheduled shipping days, shipping mode, market, region, country, sales, and profit.</w:t>
       </w:r>
     </w:p>
     <w:p>
@@ -8511,133 +8505,49 @@
           <w:lang w:val="en-US"/>
         </w:rPr>
         <w:br/>
-        <w:t xml:space="preserve">After the mapping is completed, the system standardizes the uploaded dataset. It converts date fields, numeric fields, and text fields into a common format. It also derives additional indicators where possible. For example, if actual shipping days and scheduled shipping days are not available, the system can calculate </w:t>
-      </w:r>
-      <w:proofErr w:type="gramStart"/>
-      <w:r>
-        <w:rPr>
-          <w:lang w:val="en-US"/>
-        </w:rPr>
-        <w:t>delay</w:t>
-      </w:r>
-      <w:proofErr w:type="gramEnd"/>
-      <w:r>
-        <w:rPr>
-          <w:lang w:val="en-US"/>
-        </w:rPr>
-        <w:t xml:space="preserve"> days by comparing </w:t>
-      </w:r>
-      <w:proofErr w:type="gramStart"/>
-      <w:r>
-        <w:rPr>
-          <w:lang w:val="en-US"/>
-        </w:rPr>
-        <w:t>delivered</w:t>
-      </w:r>
-      <w:proofErr w:type="gramEnd"/>
+        <w:t>After the mapping is completed, the system standardizes the uploaded dataset. It converts date fields, numeric fields, and text fields into a common format. It also derives additional indicators where possible. For example, if actual shipping days and scheduled shipping days are not available, the system can calculate delay days by comparing delivered date and scheduled delivery date.</w:t>
+      </w:r>
+    </w:p>
+    <w:p>
+      <w:pPr>
+        <w:rPr>
+          <w:lang w:val="en-US"/>
+        </w:rPr>
+      </w:pPr>
+    </w:p>
+    <w:p>
+      <w:pPr>
+        <w:pStyle w:val="Heading2"/>
+        <w:rPr>
+          <w:lang w:val="en-US"/>
+        </w:rPr>
+      </w:pPr>
+      <w:bookmarkStart w:id="27" w:name="_Toc230437517"/>
+      <w:r>
+        <w:rPr>
+          <w:lang w:val="en-US"/>
+        </w:rPr>
+        <w:t>Dynamic Dashboard Generation</w:t>
+      </w:r>
+      <w:bookmarkEnd w:id="27"/>
       <w:r>
         <w:rPr>
           <w:lang w:val="en-US"/>
         </w:rPr>
         <w:t xml:space="preserve"> </w:t>
       </w:r>
-      <w:proofErr w:type="gramStart"/>
-      <w:r>
-        <w:rPr>
-          <w:lang w:val="en-US"/>
-        </w:rPr>
-        <w:t>date</w:t>
-      </w:r>
-      <w:proofErr w:type="gramEnd"/>
-      <w:r>
-        <w:rPr>
-          <w:lang w:val="en-US"/>
-        </w:rPr>
-        <w:t xml:space="preserve"> and scheduled delivery </w:t>
-      </w:r>
-      <w:proofErr w:type="gramStart"/>
-      <w:r>
-        <w:rPr>
-          <w:lang w:val="en-US"/>
-        </w:rPr>
-        <w:t>date</w:t>
-      </w:r>
-      <w:proofErr w:type="gramEnd"/>
-      <w:r>
-        <w:rPr>
-          <w:lang w:val="en-US"/>
-        </w:rPr>
-        <w:t>.</w:t>
-      </w:r>
-    </w:p>
-    <w:p>
-      <w:pPr>
-        <w:rPr>
-          <w:lang w:val="en-US"/>
-        </w:rPr>
-      </w:pPr>
-    </w:p>
-    <w:p>
-      <w:pPr>
-        <w:pStyle w:val="Heading2"/>
-        <w:rPr>
-          <w:lang w:val="en-US"/>
-        </w:rPr>
-      </w:pPr>
-      <w:bookmarkStart w:id="27" w:name="_Toc230427008"/>
-      <w:r>
-        <w:rPr>
-          <w:lang w:val="en-US"/>
-        </w:rPr>
-        <w:t>Dynamic Dashboard Generation</w:t>
-      </w:r>
-      <w:bookmarkEnd w:id="27"/>
-      <w:r>
-        <w:rPr>
-          <w:lang w:val="en-US"/>
-        </w:rPr>
-        <w:t xml:space="preserve"> </w:t>
-      </w:r>
-    </w:p>
-    <w:p>
-      <w:pPr>
-        <w:rPr>
-          <w:lang w:val="en-US"/>
-        </w:rPr>
-      </w:pPr>
-      <w:r>
-        <w:rPr>
-          <w:lang w:val="en-US"/>
-        </w:rPr>
-        <w:t xml:space="preserve">After the dataset is standardized, the dashboard pages are generated from the active dataset. If no uploaded dataset is active, the dashboard uses the default </w:t>
-      </w:r>
-      <w:proofErr w:type="spellStart"/>
-      <w:r>
-        <w:rPr>
-          <w:lang w:val="en-US"/>
-        </w:rPr>
-        <w:t>DataCo</w:t>
-      </w:r>
-      <w:proofErr w:type="spellEnd"/>
-      <w:r>
-        <w:rPr>
-          <w:lang w:val="en-US"/>
-        </w:rPr>
-        <w:t xml:space="preserve"> dataset. If the user uploads and activates a new dataset, all dashboard pages use the uploaded dataset during the active </w:t>
-      </w:r>
-      <w:proofErr w:type="spellStart"/>
-      <w:r>
-        <w:rPr>
-          <w:lang w:val="en-US"/>
-        </w:rPr>
-        <w:t>Streamlit</w:t>
-      </w:r>
-      <w:proofErr w:type="spellEnd"/>
-      <w:r>
-        <w:rPr>
-          <w:lang w:val="en-US"/>
-        </w:rPr>
-        <w:t xml:space="preserve"> session.</w:t>
+    </w:p>
+    <w:p>
+      <w:pPr>
+        <w:rPr>
+          <w:lang w:val="en-US"/>
+        </w:rPr>
+      </w:pPr>
+      <w:r>
+        <w:rPr>
+          <w:lang w:val="en-US"/>
+        </w:rPr>
+        <w:t>After the dataset is standardized, the dashboard pages are generated from the active dataset. If no uploaded dataset is active, the dashboard uses the default DataCo dataset. If the user uploads and activates a new dataset, all dashboard pages use the uploaded dataset during the active Streamlit session.</w:t>
       </w:r>
     </w:p>
     <w:p>
@@ -8677,21 +8587,7 @@
           <w:lang w:val="en-US"/>
         </w:rPr>
         <w:br/>
-        <w:t xml:space="preserve">This structure allows the system to work as a flexible platform instead of a static dashboard. The same dashboard pages can be used with different supply chain datasets </w:t>
-      </w:r>
-      <w:proofErr w:type="gramStart"/>
-      <w:r>
-        <w:rPr>
-          <w:lang w:val="en-US"/>
-        </w:rPr>
-        <w:t>as long as</w:t>
-      </w:r>
-      <w:proofErr w:type="gramEnd"/>
-      <w:r>
-        <w:rPr>
-          <w:lang w:val="en-US"/>
-        </w:rPr>
-        <w:t xml:space="preserve"> the required fields are mapped correctly.</w:t>
+        <w:t>This structure allows the system to work as a flexible platform instead of a static dashboard. The same dashboard pages can be used with different supply chain datasets as long as the required fields are mapped correctly.</w:t>
       </w:r>
     </w:p>
     <w:p>
@@ -8708,7 +8604,7 @@
           <w:lang w:val="en-US"/>
         </w:rPr>
       </w:pPr>
-      <w:bookmarkStart w:id="28" w:name="_Toc230427009"/>
+      <w:bookmarkStart w:id="28" w:name="_Toc230437518"/>
       <w:r>
         <w:rPr>
           <w:lang w:val="en-US"/>
@@ -8754,7 +8650,12 @@
           <w:lang w:val="en-US"/>
         </w:rPr>
         <w:br/>
-        <w:t>The system evaluates risk by using operational indicators such as late delivery rate, average delay days, inventory status, demand volatility, and regional performance. These indicators are combined into risk scores that help users identify problematic areas in the supply chain. The risk results are shown through KPI cards, charts, tables, and risk-level classifications.</w:t>
+      </w:r>
+      <w:r>
+        <w:rPr>
+          <w:lang w:val="en-US"/>
+        </w:rPr>
+        <w:t>The platform uses different rule-based risk scores for different analysis levels, including overall supply chain risk, regional risk, and category-level risk. The overall risk score combines delivery risk, inventory risk, delay risk, and demand volatility risk, while regional and category-level scores use related operational indicators such as late delivery rate, delay days, profit risk, and inventory condition.</w:t>
       </w:r>
     </w:p>
     <w:p>
@@ -8791,7 +8692,7 @@
           <w:lang w:val="en-US"/>
         </w:rPr>
       </w:pPr>
-      <w:bookmarkStart w:id="29" w:name="_Toc230427010"/>
+      <w:bookmarkStart w:id="29" w:name="_Toc230437519"/>
       <w:r>
         <w:rPr>
           <w:lang w:val="en-US"/>
@@ -8853,7 +8754,7 @@
           <w:lang w:val="en-US"/>
         </w:rPr>
       </w:pPr>
-      <w:bookmarkStart w:id="30" w:name="_Toc230427011"/>
+      <w:bookmarkStart w:id="30" w:name="_Toc230437520"/>
       <w:r>
         <w:rPr>
           <w:lang w:val="en-US"/>
@@ -8889,7 +8790,7 @@
           <w:lang w:val="en-US"/>
         </w:rPr>
       </w:pPr>
-      <w:bookmarkStart w:id="31" w:name="_Toc230427012"/>
+      <w:bookmarkStart w:id="31" w:name="_Toc230437521"/>
       <w:r>
         <w:rPr>
           <w:lang w:val="en-US"/>
@@ -8928,21 +8829,7 @@
           <w:lang w:val="en-US"/>
         </w:rPr>
         <w:br/>
-        <w:t xml:space="preserve">The project was developed as a local </w:t>
-      </w:r>
-      <w:proofErr w:type="spellStart"/>
-      <w:r>
-        <w:rPr>
-          <w:lang w:val="en-US"/>
-        </w:rPr>
-        <w:t>Streamlit</w:t>
-      </w:r>
-      <w:proofErr w:type="spellEnd"/>
-      <w:r>
-        <w:rPr>
-          <w:lang w:val="en-US"/>
-        </w:rPr>
-        <w:t xml:space="preserve"> application. A Windows batch file was also created to make the project easier to run. This file automatically creates the virtual environment if needed, installs the required packages, processes the default dataset, and starts the dashboard.</w:t>
+        <w:t>The project was developed as a local Streamlit application. A Windows batch file was also created to make the project easier to run. This file automatically creates the virtual environment if needed, installs the required packages, processes the default dataset, and starts the dashboard.</w:t>
       </w:r>
     </w:p>
     <w:p>
@@ -8959,7 +8846,7 @@
           <w:lang w:val="en-US"/>
         </w:rPr>
       </w:pPr>
-      <w:bookmarkStart w:id="32" w:name="_Toc230427013"/>
+      <w:bookmarkStart w:id="32" w:name="_Toc230437522"/>
       <w:r>
         <w:rPr>
           <w:lang w:val="en-US"/>
@@ -8974,33 +8861,11 @@
           <w:lang w:val="en-US"/>
         </w:rPr>
       </w:pPr>
-      <w:proofErr w:type="gramStart"/>
-      <w:r>
-        <w:rPr>
-          <w:lang w:val="en-US"/>
-        </w:rPr>
-        <w:t>pandas</w:t>
-      </w:r>
-      <w:proofErr w:type="gramEnd"/>
-      <w:r>
-        <w:rPr>
-          <w:lang w:val="en-US"/>
-        </w:rPr>
-        <w:t xml:space="preserve"> </w:t>
-      </w:r>
-      <w:proofErr w:type="gramStart"/>
-      <w:r>
-        <w:rPr>
-          <w:lang w:val="en-US"/>
-        </w:rPr>
-        <w:t>was</w:t>
-      </w:r>
-      <w:proofErr w:type="gramEnd"/>
-      <w:r>
-        <w:rPr>
-          <w:lang w:val="en-US"/>
-        </w:rPr>
-        <w:t xml:space="preserve"> used for reading CSV and Excel files, cleaning the dataset, grouping records, calculating KPIs, and creating analytical tables. NumPy was used for numerical calculations and handling missing numerical values.</w:t>
+      <w:r>
+        <w:rPr>
+          <w:lang w:val="en-US"/>
+        </w:rPr>
+        <w:t>pandas was used for reading CSV and Excel files, cleaning the dataset, grouping records, calculating KPIs, and creating analytical tables. NumPy was used for numerical calculations and handling missing numerical values.</w:t>
       </w:r>
       <w:sdt>
         <w:sdtPr>
@@ -9073,7 +8938,7 @@
           <w:lang w:val="en-US"/>
         </w:rPr>
       </w:pPr>
-      <w:bookmarkStart w:id="33" w:name="_Toc230427014"/>
+      <w:bookmarkStart w:id="33" w:name="_Toc230437523"/>
       <w:r>
         <w:rPr>
           <w:lang w:val="en-US"/>
@@ -9094,33 +8959,11 @@
           <w:lang w:val="en-US"/>
         </w:rPr>
       </w:pPr>
-      <w:proofErr w:type="spellStart"/>
-      <w:r>
-        <w:rPr>
-          <w:lang w:val="en-US"/>
-        </w:rPr>
-        <w:t>Streamlit</w:t>
-      </w:r>
-      <w:proofErr w:type="spellEnd"/>
-      <w:r>
-        <w:rPr>
-          <w:lang w:val="en-US"/>
-        </w:rPr>
-        <w:t xml:space="preserve"> was used to develop </w:t>
-      </w:r>
-      <w:proofErr w:type="gramStart"/>
-      <w:r>
-        <w:rPr>
-          <w:lang w:val="en-US"/>
-        </w:rPr>
-        <w:t>the</w:t>
-      </w:r>
-      <w:proofErr w:type="gramEnd"/>
-      <w:r>
-        <w:rPr>
-          <w:lang w:val="en-US"/>
-        </w:rPr>
-        <w:t xml:space="preserve"> interactive dashboard interface. It allowed the project to include different pages, filters, file upload components, KPI cards, charts, and tables.</w:t>
+      <w:r>
+        <w:rPr>
+          <w:lang w:val="en-US"/>
+        </w:rPr>
+        <w:t>Streamlit was used to develop the interactive dashboard interface. It allowed the project to include different pages, filters, file upload components, KPI cards, charts, and tables.</w:t>
       </w:r>
     </w:p>
     <w:p>
@@ -9144,7 +8987,7 @@
           <w:lang w:val="en-US"/>
         </w:rPr>
       </w:pPr>
-      <w:bookmarkStart w:id="34" w:name="_Toc230427015"/>
+      <w:bookmarkStart w:id="34" w:name="_Toc230437524"/>
       <w:r>
         <w:rPr>
           <w:lang w:val="en-US"/>
@@ -9208,7 +9051,7 @@
           <w:lang w:val="en-US"/>
         </w:rPr>
       </w:pPr>
-      <w:bookmarkStart w:id="35" w:name="_Toc230202521"/>
+      <w:bookmarkStart w:id="35" w:name="_Toc230437484"/>
       <w:r>
         <w:rPr>
           <w:lang w:val="en-US"/>
@@ -9441,14 +9284,12 @@
                 <w:lang w:val="en-US"/>
               </w:rPr>
             </w:pPr>
-            <w:proofErr w:type="spellStart"/>
             <w:r>
               <w:rPr>
                 <w:lang w:val="en-US"/>
               </w:rPr>
               <w:t>Streamlit</w:t>
             </w:r>
-            <w:proofErr w:type="spellEnd"/>
           </w:p>
         </w:tc>
         <w:tc>
@@ -9965,7 +9806,7 @@
           <w:lang w:val="en-US"/>
         </w:rPr>
       </w:pPr>
-      <w:bookmarkStart w:id="36" w:name="_Toc230427016"/>
+      <w:bookmarkStart w:id="36" w:name="_Toc230437525"/>
       <w:r>
         <w:rPr>
           <w:lang w:val="en-US"/>
@@ -9984,21 +9825,7 @@
         <w:rPr>
           <w:lang w:val="en-US"/>
         </w:rPr>
-        <w:t xml:space="preserve">This section explains the technical development of the Supply Chain Visibility and Risk Assessment Platform. The system was designed as a dataset-adaptive dashboard platform. It can work with the default </w:t>
-      </w:r>
-      <w:proofErr w:type="spellStart"/>
-      <w:r>
-        <w:rPr>
-          <w:lang w:val="en-US"/>
-        </w:rPr>
-        <w:t>DataCo</w:t>
-      </w:r>
-      <w:proofErr w:type="spellEnd"/>
-      <w:r>
-        <w:rPr>
-          <w:lang w:val="en-US"/>
-        </w:rPr>
-        <w:t xml:space="preserve"> dataset, and it can also process user-uploaded supply chain datasets through column mapping and data standardization.</w:t>
+        <w:t>This section explains the technical development of the Supply Chain Visibility and Risk Assessment Platform. The system was designed as a dataset-adaptive dashboard platform. It can work with the default DataCo dataset, and it can also process user-uploaded supply chain datasets through column mapping and data standardization.</w:t>
       </w:r>
       <w:r>
         <w:rPr>
@@ -10021,7 +9848,7 @@
           <w:lang w:val="en-US"/>
         </w:rPr>
       </w:pPr>
-      <w:bookmarkStart w:id="37" w:name="_Toc230427017"/>
+      <w:bookmarkStart w:id="37" w:name="_Toc230437526"/>
       <w:r>
         <w:rPr>
           <w:lang w:val="en-US"/>
@@ -10046,21 +9873,7 @@
         <w:rPr>
           <w:lang w:val="en-US"/>
         </w:rPr>
-        <w:t xml:space="preserve">The platform consists of several connected layers. The first layer is the data source layer. This layer includes the default </w:t>
-      </w:r>
-      <w:proofErr w:type="spellStart"/>
-      <w:r>
-        <w:rPr>
-          <w:lang w:val="en-US"/>
-        </w:rPr>
-        <w:t>DataCo</w:t>
-      </w:r>
-      <w:proofErr w:type="spellEnd"/>
-      <w:r>
-        <w:rPr>
-          <w:lang w:val="en-US"/>
-        </w:rPr>
-        <w:t xml:space="preserve"> dataset and user-uploaded CSV or Excel datasets. The second layer is the Data Source Manager, where the user can upload a new dataset and select the active data source. The third layer is the column mapping and data adapter layer. This layer converts different dataset structures into a common supply chain schema.</w:t>
+        <w:t>The platform consists of several connected layers. The first layer is the data source layer. This layer includes the default DataCo dataset and user-uploaded CSV or Excel datasets. The second layer is the Data Source Manager, where the user can upload a new dataset and select the active data source. The third layer is the column mapping and data adapter layer. This layer converts different dataset structures into a common supply chain schema.</w:t>
       </w:r>
       <w:r>
         <w:rPr>
@@ -10073,21 +9886,7 @@
           <w:lang w:val="en-US"/>
         </w:rPr>
         <w:br/>
-        <w:t xml:space="preserve">After the data is standardized, the system creates dashboard-ready analytical tables such as orders, products, shipments, inventory, demand, and risk scores. These tables are then used by the </w:t>
-      </w:r>
-      <w:proofErr w:type="spellStart"/>
-      <w:r>
-        <w:rPr>
-          <w:lang w:val="en-US"/>
-        </w:rPr>
-        <w:t>Streamlit</w:t>
-      </w:r>
-      <w:proofErr w:type="spellEnd"/>
-      <w:r>
-        <w:rPr>
-          <w:lang w:val="en-US"/>
-        </w:rPr>
-        <w:t xml:space="preserve"> dashboard modules. The main dashboard modules are Overview, Regional Performance, Inventory Control, Shipment Performance, Supply Chain Risk, and Demand Forecast.</w:t>
+        <w:t>After the data is standardized, the system creates dashboard-ready analytical tables such as orders, products, shipments, inventory, demand, and risk scores. These tables are then used by the Streamlit dashboard modules. The main dashboard modules are Overview, Regional Performance, Inventory Control, Shipment Performance, Supply Chain Risk, and Demand Forecast.</w:t>
       </w:r>
     </w:p>
     <w:p>
@@ -10136,7 +9935,7 @@
           <w:lang w:val="en-US"/>
         </w:rPr>
         <w:drawing>
-          <wp:inline distT="0" distB="0" distL="0" distR="0" wp14:anchorId="13F4F06E" wp14:editId="2CF85516">
+          <wp:inline distT="0" distB="0" distL="0" distR="0" wp14:anchorId="13F4F06E" wp14:editId="79A16526">
             <wp:extent cx="5997778" cy="3952875"/>
             <wp:effectExtent l="0" t="0" r="3175" b="0"/>
             <wp:docPr id="36948891" name="Picture 1"/>
@@ -10252,7 +10051,7 @@
           <w:lang w:val="en-US"/>
         </w:rPr>
       </w:pPr>
-      <w:bookmarkStart w:id="39" w:name="_Toc230427018"/>
+      <w:bookmarkStart w:id="39" w:name="_Toc230437527"/>
       <w:r>
         <w:rPr>
           <w:lang w:val="en-US"/>
@@ -10271,21 +10070,7 @@
         <w:rPr>
           <w:lang w:val="en-US"/>
         </w:rPr>
-        <w:t xml:space="preserve">The Data Source Manager is the main component that makes the platform reusable. When the dashboard is opened, the default </w:t>
-      </w:r>
-      <w:proofErr w:type="spellStart"/>
-      <w:r>
-        <w:rPr>
-          <w:lang w:val="en-US"/>
-        </w:rPr>
-        <w:t>DataCo</w:t>
-      </w:r>
-      <w:proofErr w:type="spellEnd"/>
-      <w:r>
-        <w:rPr>
-          <w:lang w:val="en-US"/>
-        </w:rPr>
-        <w:t xml:space="preserve"> dataset is active. If the user wants to analyze another supply chain dataset, the user can upload a CSV or Excel file from the Data Source Manager on the Overview page.</w:t>
+        <w:t>The Data Source Manager is the main component that makes the platform reusable. When the dashboard is opened, the default DataCo dataset is active. If the user wants to analyze another supply chain dataset, the user can upload a CSV or Excel file from the Data Source Manager on the Overview page.</w:t>
       </w:r>
     </w:p>
     <w:p>
@@ -10325,35 +10110,7 @@
         <w:rPr>
           <w:lang w:val="en-US"/>
         </w:rPr>
-        <w:t xml:space="preserve">The uploaded dataset is used during the active </w:t>
-      </w:r>
-      <w:proofErr w:type="spellStart"/>
-      <w:r>
-        <w:rPr>
-          <w:lang w:val="en-US"/>
-        </w:rPr>
-        <w:t>Streamlit</w:t>
-      </w:r>
-      <w:proofErr w:type="spellEnd"/>
-      <w:r>
-        <w:rPr>
-          <w:lang w:val="en-US"/>
-        </w:rPr>
-        <w:t xml:space="preserve"> session. If the user activates the uploaded dataset, all dashboard pages use the uploaded data. If the user wants to return to the default dataset, the Data Source Manager provides an option to return to the default </w:t>
-      </w:r>
-      <w:proofErr w:type="spellStart"/>
-      <w:r>
-        <w:rPr>
-          <w:lang w:val="en-US"/>
-        </w:rPr>
-        <w:t>DataCo</w:t>
-      </w:r>
-      <w:proofErr w:type="spellEnd"/>
-      <w:r>
-        <w:rPr>
-          <w:lang w:val="en-US"/>
-        </w:rPr>
-        <w:t xml:space="preserve"> dataset.</w:t>
+        <w:t>The uploaded dataset is used during the active Streamlit session. If the user activates the uploaded dataset, all dashboard pages use the uploaded data. If the user wants to return to the default dataset, the Data Source Manager provides an option to return to the default DataCo dataset.</w:t>
       </w:r>
     </w:p>
     <w:p>
@@ -10398,7 +10155,7 @@
           <w:lang w:val="en-US"/>
         </w:rPr>
       </w:pPr>
-      <w:bookmarkStart w:id="40" w:name="_Toc230427019"/>
+      <w:bookmarkStart w:id="40" w:name="_Toc230437528"/>
       <w:r>
         <w:rPr>
           <w:lang w:val="en-US"/>
@@ -10438,21 +10195,7 @@
         <w:rPr>
           <w:lang w:val="en-US"/>
         </w:rPr>
-        <w:t xml:space="preserve">The standard </w:t>
-      </w:r>
-      <w:proofErr w:type="gramStart"/>
-      <w:r>
-        <w:rPr>
-          <w:lang w:val="en-US"/>
-        </w:rPr>
-        <w:t>schema</w:t>
-      </w:r>
-      <w:proofErr w:type="gramEnd"/>
-      <w:r>
-        <w:rPr>
-          <w:lang w:val="en-US"/>
-        </w:rPr>
-        <w:t xml:space="preserve"> used in the platform is shown in Table 2.</w:t>
+        <w:t>The standard schema used in the platform is shown in Table 2.</w:t>
       </w:r>
       <w:r>
         <w:rPr>
@@ -10478,7 +10221,7 @@
           <w:lang w:val="en-US"/>
         </w:rPr>
       </w:pPr>
-      <w:bookmarkStart w:id="41" w:name="_Toc230202522"/>
+      <w:bookmarkStart w:id="41" w:name="_Toc230437485"/>
       <w:r>
         <w:rPr>
           <w:lang w:val="en-US"/>
@@ -10614,14 +10357,12 @@
                 <w:lang w:val="en-US"/>
               </w:rPr>
             </w:pPr>
-            <w:proofErr w:type="spellStart"/>
             <w:r>
               <w:rPr>
                 <w:lang w:val="en-US"/>
               </w:rPr>
               <w:t>order_id</w:t>
             </w:r>
-            <w:proofErr w:type="spellEnd"/>
           </w:p>
         </w:tc>
         <w:tc>
@@ -10684,14 +10425,12 @@
                 <w:lang w:val="en-US"/>
               </w:rPr>
             </w:pPr>
-            <w:proofErr w:type="spellStart"/>
             <w:r>
               <w:rPr>
                 <w:lang w:val="en-US"/>
               </w:rPr>
               <w:t>order_date</w:t>
             </w:r>
-            <w:proofErr w:type="spellEnd"/>
           </w:p>
         </w:tc>
         <w:tc>
@@ -10742,14 +10481,12 @@
                 <w:lang w:val="en-US"/>
               </w:rPr>
             </w:pPr>
-            <w:proofErr w:type="spellStart"/>
             <w:r>
               <w:rPr>
                 <w:lang w:val="en-US"/>
               </w:rPr>
               <w:t>product_name</w:t>
             </w:r>
-            <w:proofErr w:type="spellEnd"/>
           </w:p>
         </w:tc>
         <w:tc>
@@ -10800,14 +10537,12 @@
                 <w:lang w:val="en-US"/>
               </w:rPr>
             </w:pPr>
-            <w:proofErr w:type="spellStart"/>
             <w:r>
               <w:rPr>
                 <w:lang w:val="en-US"/>
               </w:rPr>
               <w:t>category_name</w:t>
             </w:r>
-            <w:proofErr w:type="spellEnd"/>
           </w:p>
         </w:tc>
         <w:tc>
@@ -10858,14 +10593,12 @@
                 <w:lang w:val="en-US"/>
               </w:rPr>
             </w:pPr>
-            <w:proofErr w:type="spellStart"/>
             <w:r>
               <w:rPr>
                 <w:lang w:val="en-US"/>
               </w:rPr>
               <w:t>order_quantity</w:t>
             </w:r>
-            <w:proofErr w:type="spellEnd"/>
           </w:p>
         </w:tc>
         <w:tc>
@@ -10916,14 +10649,12 @@
                 <w:lang w:val="en-US"/>
               </w:rPr>
             </w:pPr>
-            <w:proofErr w:type="spellStart"/>
             <w:r>
               <w:rPr>
                 <w:lang w:val="en-US"/>
               </w:rPr>
               <w:t>shipping_date</w:t>
             </w:r>
-            <w:proofErr w:type="spellEnd"/>
           </w:p>
         </w:tc>
         <w:tc>
@@ -10974,14 +10705,12 @@
                 <w:lang w:val="en-US"/>
               </w:rPr>
             </w:pPr>
-            <w:proofErr w:type="spellStart"/>
             <w:r>
               <w:rPr>
                 <w:lang w:val="en-US"/>
               </w:rPr>
               <w:t>scheduled_delivery_date</w:t>
             </w:r>
-            <w:proofErr w:type="spellEnd"/>
           </w:p>
         </w:tc>
         <w:tc>
@@ -11032,14 +10761,12 @@
                 <w:lang w:val="en-US"/>
               </w:rPr>
             </w:pPr>
-            <w:proofErr w:type="spellStart"/>
             <w:r>
               <w:rPr>
                 <w:lang w:val="en-US"/>
               </w:rPr>
               <w:t>delivery_status</w:t>
             </w:r>
-            <w:proofErr w:type="spellEnd"/>
           </w:p>
         </w:tc>
         <w:tc>
@@ -11090,14 +10817,12 @@
                 <w:lang w:val="en-US"/>
               </w:rPr>
             </w:pPr>
-            <w:proofErr w:type="spellStart"/>
             <w:r>
               <w:rPr>
                 <w:lang w:val="en-US"/>
               </w:rPr>
               <w:t>actual_shipping_days</w:t>
             </w:r>
-            <w:proofErr w:type="spellEnd"/>
           </w:p>
         </w:tc>
         <w:tc>
@@ -11148,14 +10873,12 @@
                 <w:lang w:val="en-US"/>
               </w:rPr>
             </w:pPr>
-            <w:proofErr w:type="spellStart"/>
             <w:r>
               <w:rPr>
                 <w:lang w:val="en-US"/>
               </w:rPr>
               <w:t>scheduled_shipping_days</w:t>
             </w:r>
-            <w:proofErr w:type="spellEnd"/>
           </w:p>
         </w:tc>
         <w:tc>
@@ -11206,14 +10929,12 @@
                 <w:lang w:val="en-US"/>
               </w:rPr>
             </w:pPr>
-            <w:proofErr w:type="spellStart"/>
             <w:r>
               <w:rPr>
                 <w:lang w:val="en-US"/>
               </w:rPr>
               <w:t>shipping_mode</w:t>
             </w:r>
-            <w:proofErr w:type="spellEnd"/>
           </w:p>
         </w:tc>
         <w:tc>
@@ -11320,14 +11041,12 @@
                 <w:lang w:val="en-US"/>
               </w:rPr>
             </w:pPr>
-            <w:proofErr w:type="spellStart"/>
             <w:r>
               <w:rPr>
                 <w:lang w:val="en-US"/>
               </w:rPr>
               <w:t>order_region</w:t>
             </w:r>
-            <w:proofErr w:type="spellEnd"/>
           </w:p>
         </w:tc>
         <w:tc>
@@ -11378,14 +11097,12 @@
                 <w:lang w:val="en-US"/>
               </w:rPr>
             </w:pPr>
-            <w:proofErr w:type="spellStart"/>
             <w:r>
               <w:rPr>
                 <w:lang w:val="en-US"/>
               </w:rPr>
               <w:t>order_country</w:t>
             </w:r>
-            <w:proofErr w:type="spellEnd"/>
           </w:p>
         </w:tc>
         <w:tc>
@@ -11492,14 +11209,12 @@
                 <w:lang w:val="en-US"/>
               </w:rPr>
             </w:pPr>
-            <w:proofErr w:type="spellStart"/>
             <w:r>
               <w:rPr>
                 <w:lang w:val="en-US"/>
               </w:rPr>
               <w:t>order_profit</w:t>
             </w:r>
-            <w:proofErr w:type="spellEnd"/>
           </w:p>
         </w:tc>
         <w:tc>
@@ -11557,21 +11272,7 @@
         <w:rPr>
           <w:lang w:val="en-US"/>
         </w:rPr>
-        <w:t xml:space="preserve">If an optional field is not available in the uploaded dataset, the system uses default values or derives indicators when possible. For example, if actual shipping days and scheduled shipping days are not available, the system can calculate </w:t>
-      </w:r>
-      <w:proofErr w:type="gramStart"/>
-      <w:r>
-        <w:rPr>
-          <w:lang w:val="en-US"/>
-        </w:rPr>
-        <w:t>delay</w:t>
-      </w:r>
-      <w:proofErr w:type="gramEnd"/>
-      <w:r>
-        <w:rPr>
-          <w:lang w:val="en-US"/>
-        </w:rPr>
-        <w:t xml:space="preserve"> days by comparing the actual delivery date and the scheduled delivery date. This improves the flexibility of the platform and allows it to work with different supply chain datasets.</w:t>
+        <w:t>If an optional field is not available in the uploaded dataset, the system uses default values or derives indicators when possible. For example, if actual shipping days and scheduled shipping days are not available, the system can calculate delay days by comparing the actual delivery date and the scheduled delivery date. This improves the flexibility of the platform and allows it to work with different supply chain datasets.</w:t>
       </w:r>
     </w:p>
     <w:p>
@@ -11581,7 +11282,7 @@
           <w:lang w:val="en-US"/>
         </w:rPr>
       </w:pPr>
-      <w:bookmarkStart w:id="42" w:name="_Toc230427020"/>
+      <w:bookmarkStart w:id="42" w:name="_Toc230437529"/>
       <w:r>
         <w:rPr>
           <w:lang w:val="en-US"/>
@@ -11620,35 +11321,7 @@
           <w:lang w:val="en-US"/>
         </w:rPr>
         <w:br/>
-        <w:t xml:space="preserve">The main analytical tables are orders, products, shipments, inventory, demand, and </w:t>
-      </w:r>
-      <w:proofErr w:type="spellStart"/>
-      <w:r>
-        <w:rPr>
-          <w:lang w:val="en-US"/>
-        </w:rPr>
-        <w:t>risk_scores</w:t>
-      </w:r>
-      <w:proofErr w:type="spellEnd"/>
-      <w:r>
-        <w:rPr>
-          <w:lang w:val="en-US"/>
-        </w:rPr>
-        <w:t xml:space="preserve">. The orders table is the central table because it contains the main order-level information. The shipments table is created from order and delivery-related fields. The inventory table is generated from product and demand patterns. The demand table summarizes monthly demand by product category. The </w:t>
-      </w:r>
-      <w:proofErr w:type="spellStart"/>
-      <w:r>
-        <w:rPr>
-          <w:lang w:val="en-US"/>
-        </w:rPr>
-        <w:t>risk_scores</w:t>
-      </w:r>
-      <w:proofErr w:type="spellEnd"/>
-      <w:r>
-        <w:rPr>
-          <w:lang w:val="en-US"/>
-        </w:rPr>
-        <w:t xml:space="preserve"> table stores regional risk indicators.</w:t>
+        <w:t>The main analytical tables are orders, products, shipments, inventory, demand, and risk_scores. The orders table is the central table because it contains the main order-level information. The shipments table is created from order and delivery-related fields. The inventory table is generated from product and demand patterns. The demand table summarizes monthly demand by product category. The risk_scores table stores regional risk indicators.</w:t>
       </w:r>
       <w:r>
         <w:rPr>
@@ -11677,7 +11350,7 @@
           <w:lang w:val="en-US"/>
         </w:rPr>
         <w:drawing>
-          <wp:inline distT="0" distB="0" distL="0" distR="0" wp14:anchorId="670A0A81" wp14:editId="4E3A4866">
+          <wp:inline distT="0" distB="0" distL="0" distR="0" wp14:anchorId="670A0A81" wp14:editId="43BB0AFD">
             <wp:extent cx="6162675" cy="4108228"/>
             <wp:effectExtent l="0" t="0" r="0" b="6985"/>
             <wp:docPr id="604311595" name="Picture 2"/>
@@ -11807,7 +11480,7 @@
           <w:lang w:val="en-US"/>
         </w:rPr>
       </w:pPr>
-      <w:bookmarkStart w:id="44" w:name="_Toc230427021"/>
+      <w:bookmarkStart w:id="44" w:name="_Toc230437530"/>
       <w:r>
         <w:rPr>
           <w:lang w:val="en-US"/>
@@ -11826,21 +11499,7 @@
         <w:rPr>
           <w:lang w:val="en-US"/>
         </w:rPr>
-        <w:t xml:space="preserve">The platform includes six dashboard modules. Each module focuses on a different part of supply chain visibility and risk analysis. These modules work with </w:t>
-      </w:r>
-      <w:proofErr w:type="gramStart"/>
-      <w:r>
-        <w:rPr>
-          <w:lang w:val="en-US"/>
-        </w:rPr>
-        <w:t>the</w:t>
-      </w:r>
-      <w:proofErr w:type="gramEnd"/>
-      <w:r>
-        <w:rPr>
-          <w:lang w:val="en-US"/>
-        </w:rPr>
-        <w:t xml:space="preserve"> active dataset. If the user activates an uploaded dataset, the same dashboard modules are updated according to the uploaded data.</w:t>
+        <w:t>The platform includes six dashboard modules. Each module focuses on a different part of supply chain visibility and risk analysis. These modules work with the active dataset. If the user activates an uploaded dataset, the same dashboard modules are updated according to the uploaded data.</w:t>
       </w:r>
     </w:p>
     <w:p>
@@ -11901,7 +11560,7 @@
           <w:lang w:val="en-US"/>
         </w:rPr>
       </w:pPr>
-      <w:bookmarkStart w:id="45" w:name="_Toc230202523"/>
+      <w:bookmarkStart w:id="45" w:name="_Toc230437486"/>
       <w:r>
         <w:rPr>
           <w:lang w:val="en-US"/>
@@ -12112,19 +11771,11 @@
                 <w:lang w:val="en-US"/>
               </w:rPr>
             </w:pPr>
-            <w:proofErr w:type="gramStart"/>
-            <w:r>
-              <w:rPr>
-                <w:lang w:val="en-US"/>
-              </w:rPr>
-              <w:t>Compares</w:t>
-            </w:r>
-            <w:proofErr w:type="gramEnd"/>
-            <w:r>
-              <w:rPr>
-                <w:lang w:val="en-US"/>
-              </w:rPr>
-              <w:t xml:space="preserve"> markets, regions, and countries</w:t>
+            <w:r>
+              <w:rPr>
+                <w:lang w:val="en-US"/>
+              </w:rPr>
+              <w:t>Compares markets, regions, and countries</w:t>
             </w:r>
           </w:p>
         </w:tc>
@@ -12382,21 +12033,7 @@
         <w:rPr>
           <w:lang w:val="en-US"/>
         </w:rPr>
-        <w:t xml:space="preserve">The modular structure makes the platform easier to understand and maintain. Each page has a specific responsibility, but all pages use the same active dataset. This design supports both the default </w:t>
-      </w:r>
-      <w:proofErr w:type="spellStart"/>
-      <w:r>
-        <w:rPr>
-          <w:lang w:val="en-US"/>
-        </w:rPr>
-        <w:t>DataCo</w:t>
-      </w:r>
-      <w:proofErr w:type="spellEnd"/>
-      <w:r>
-        <w:rPr>
-          <w:lang w:val="en-US"/>
-        </w:rPr>
-        <w:t xml:space="preserve"> dataset and user-uploaded datasets.</w:t>
+        <w:t>The modular structure makes the platform easier to understand and maintain. Each page has a specific responsibility, but all pages use the same active dataset. This design supports both the default DataCo dataset and user-uploaded datasets.</w:t>
       </w:r>
     </w:p>
     <w:p>
@@ -12406,7 +12043,7 @@
           <w:lang w:val="en-US"/>
         </w:rPr>
       </w:pPr>
-      <w:bookmarkStart w:id="46" w:name="_Toc230427022"/>
+      <w:bookmarkStart w:id="46" w:name="_Toc230437531"/>
       <w:r>
         <w:rPr>
           <w:lang w:val="en-US"/>
@@ -12456,7 +12093,7 @@
           <w:lang w:val="en-US"/>
         </w:rPr>
       </w:pPr>
-      <w:bookmarkStart w:id="47" w:name="_Toc230202524"/>
+      <w:bookmarkStart w:id="47" w:name="_Toc230437487"/>
       <w:r>
         <w:rPr>
           <w:lang w:val="en-US"/>
@@ -12667,10 +12304,7 @@
               </w:rPr>
             </w:pPr>
             <w:r>
-              <w:rPr>
-                <w:lang w:val="en-US"/>
-              </w:rPr>
-              <w:t>Share of critical and warning inventory items</w:t>
+              <w:t>Weighted share of critical and warning inventory items</w:t>
             </w:r>
           </w:p>
         </w:tc>
@@ -12723,10 +12357,7 @@
               </w:rPr>
             </w:pPr>
             <w:r>
-              <w:rPr>
-                <w:lang w:val="en-US"/>
-              </w:rPr>
-              <w:t>Normalized average delay days</w:t>
+              <w:t>Average delay days normalized with 3 or more days treated as maximum delay risk</w:t>
             </w:r>
           </w:p>
         </w:tc>
@@ -12826,6 +12457,12 @@
         </w:rPr>
       </w:pPr>
     </w:p>
+    <w:p>
+      <w:r>
+        <w:t>The platform uses rule-based risk scores to provide an interpretable assessment of supply chain performance. The overall supply chain risk score is calculated from four main components: delivery risk, inventory risk, delay risk, and demand volatility risk. In addition to the overall score, regional and category-level risk tables use related operational indicators to compare risk across regions and product categories.</w:t>
+      </w:r>
+    </w:p>
+    <w:p/>
     <w:p>
       <w:pPr>
         <w:rPr>
@@ -12928,18 +12565,6 @@
       </m:oMathPara>
     </w:p>
     <w:p>
-      <w:pPr>
-        <w:rPr>
-          <w:lang w:val="en-US"/>
-        </w:rPr>
-      </w:pPr>
-    </w:p>
-    <w:p>
-      <w:pPr>
-        <w:rPr>
-          <w:lang w:val="en-US"/>
-        </w:rPr>
-      </w:pPr>
       <m:oMathPara>
         <m:oMath>
           <m:eqArr>
@@ -13023,6 +12648,134 @@
       </m:oMathPara>
     </w:p>
     <w:p>
+      <m:oMathPara>
+        <m:oMath>
+          <m:eqArr>
+            <m:eqArrPr>
+              <m:maxDist m:val="1"/>
+              <m:ctrlPr>
+                <w:rPr>
+                  <w:rFonts w:ascii="Cambria Math" w:hAnsi="Cambria Math"/>
+                  <w:i/>
+                </w:rPr>
+              </m:ctrlPr>
+            </m:eqArrPr>
+            <m:e>
+              <m:r>
+                <w:rPr>
+                  <w:rFonts w:ascii="Cambria Math" w:hAnsi="Cambria Math"/>
+                </w:rPr>
+                <m:t>Delay Risk=</m:t>
+              </m:r>
+              <m:func>
+                <m:funcPr>
+                  <m:ctrlPr>
+                    <w:rPr>
+                      <w:rFonts w:ascii="Cambria Math" w:hAnsi="Cambria Math"/>
+                      <w:i/>
+                    </w:rPr>
+                  </m:ctrlPr>
+                </m:funcPr>
+                <m:fName>
+                  <m:r>
+                    <m:rPr>
+                      <m:sty m:val="p"/>
+                    </m:rPr>
+                    <w:rPr>
+                      <w:rFonts w:ascii="Cambria Math" w:hAnsi="Cambria Math"/>
+                    </w:rPr>
+                    <m:t>min</m:t>
+                  </m:r>
+                </m:fName>
+                <m:e>
+                  <m:d>
+                    <m:dPr>
+                      <m:ctrlPr>
+                        <w:rPr>
+                          <w:rFonts w:ascii="Cambria Math" w:hAnsi="Cambria Math"/>
+                          <w:i/>
+                        </w:rPr>
+                      </m:ctrlPr>
+                    </m:dPr>
+                    <m:e>
+                      <m:d>
+                        <m:dPr>
+                          <m:ctrlPr>
+                            <w:rPr>
+                              <w:rFonts w:ascii="Cambria Math" w:hAnsi="Cambria Math"/>
+                              <w:i/>
+                            </w:rPr>
+                          </m:ctrlPr>
+                        </m:dPr>
+                        <m:e>
+                          <m:f>
+                            <m:fPr>
+                              <m:ctrlPr>
+                                <w:rPr>
+                                  <w:rFonts w:ascii="Cambria Math" w:hAnsi="Cambria Math"/>
+                                  <w:i/>
+                                </w:rPr>
+                              </m:ctrlPr>
+                            </m:fPr>
+                            <m:num>
+                              <m:r>
+                                <w:rPr>
+                                  <w:rFonts w:ascii="Cambria Math" w:hAnsi="Cambria Math"/>
+                                </w:rPr>
+                                <m:t>Average Delay Days</m:t>
+                              </m:r>
+                            </m:num>
+                            <m:den>
+                              <m:r>
+                                <w:rPr>
+                                  <w:rFonts w:ascii="Cambria Math" w:hAnsi="Cambria Math"/>
+                                </w:rPr>
+                                <m:t>3</m:t>
+                              </m:r>
+                            </m:den>
+                          </m:f>
+                        </m:e>
+                      </m:d>
+                      <m:r>
+                        <w:rPr>
+                          <w:rFonts w:ascii="Cambria Math" w:hAnsi="Cambria Math"/>
+                        </w:rPr>
+                        <m:t>x100,100</m:t>
+                      </m:r>
+                    </m:e>
+                  </m:d>
+                </m:e>
+              </m:func>
+              <m:r>
+                <w:rPr>
+                  <w:rFonts w:ascii="Cambria Math" w:hAnsi="Cambria Math"/>
+                </w:rPr>
+                <m:t>#</m:t>
+              </m:r>
+              <m:d>
+                <m:dPr>
+                  <m:ctrlPr>
+                    <w:rPr>
+                      <w:rFonts w:ascii="Cambria Math" w:hAnsi="Cambria Math"/>
+                      <w:i/>
+                    </w:rPr>
+                  </m:ctrlPr>
+                </m:dPr>
+                <m:e>
+                  <m:r>
+                    <w:rPr>
+                      <w:rFonts w:ascii="Cambria Math" w:hAnsi="Cambria Math"/>
+                    </w:rPr>
+                    <m:t>3</m:t>
+                  </m:r>
+                </m:e>
+              </m:d>
+            </m:e>
+          </m:eqArr>
+        </m:oMath>
+      </m:oMathPara>
+    </w:p>
+    <w:p>
       <w:pPr>
         <w:rPr>
           <w:lang w:val="en-US"/>
@@ -13076,7 +12829,7 @@
                           <w:rFonts w:ascii="Cambria Math" w:hAnsi="Cambria Math"/>
                           <w:lang w:val="en-US"/>
                         </w:rPr>
-                        <m:t>Critical Items+Warning Items</m:t>
+                        <m:t>(Critical Items x 1.0)+(Warning Items x 0.5)</m:t>
                       </m:r>
                     </m:num>
                     <m:den>
@@ -13085,7 +12838,7 @@
                           <w:rFonts w:ascii="Cambria Math" w:hAnsi="Cambria Math"/>
                           <w:lang w:val="en-US"/>
                         </w:rPr>
-                        <m:t>Total Inventory Items</m:t>
+                        <m:t xml:space="preserve">Total Inventory Items </m:t>
                       </m:r>
                     </m:den>
                   </m:f>
@@ -13096,7 +12849,7 @@
                   <w:rFonts w:ascii="Cambria Math" w:hAnsi="Cambria Math"/>
                   <w:lang w:val="en-US"/>
                 </w:rPr>
-                <m:t>x 100 #</m:t>
+                <m:t xml:space="preserve"> x 100#</m:t>
               </m:r>
               <m:d>
                 <m:dPr>
@@ -13114,7 +12867,7 @@
                       <w:rFonts w:ascii="Cambria Math" w:hAnsi="Cambria Math"/>
                       <w:lang w:val="en-US"/>
                     </w:rPr>
-                    <m:t>3</m:t>
+                    <m:t>4</m:t>
                   </m:r>
                 </m:e>
               </m:d>
@@ -13222,7 +12975,7 @@
                       <w:rFonts w:ascii="Cambria Math" w:hAnsi="Cambria Math"/>
                       <w:lang w:val="en-US"/>
                     </w:rPr>
-                    <m:t>4</m:t>
+                    <m:t>5</m:t>
                   </m:r>
                 </m:e>
               </m:d>
@@ -13244,6 +12997,27 @@
           <w:lang w:val="en-US"/>
         </w:rPr>
       </w:pPr>
+      <w:r>
+        <w:rPr>
+          <w:lang w:val="en-US"/>
+        </w:rPr>
+        <w:t>The overall supply chain risk score is then calculated as:</w:t>
+      </w:r>
+    </w:p>
+    <w:p>
+      <w:pPr>
+        <w:rPr>
+          <w:lang w:val="en-US"/>
+        </w:rPr>
+      </w:pPr>
+      <w:r>
+        <w:rPr>
+          <w:rFonts w:ascii="Cambria Math" w:hAnsi="Cambria Math"/>
+          <w:i/>
+          <w:lang w:val="en-US"/>
+        </w:rPr>
+        <w:br/>
+      </w:r>
       <m:oMathPara>
         <m:oMath>
           <m:eqArr>
@@ -13279,7 +13053,7 @@
                   <w:rFonts w:ascii="Cambria Math" w:hAnsi="Cambria Math"/>
                   <w:lang w:val="en-US"/>
                 </w:rPr>
-                <m:t>0.35 x Delivery Risk+0.25 x Inventory Risk+0.20 x Delay Risk+0.20 x Demand Volatility Risk #</m:t>
+                <m:t>0.35 x Late Delivery Rate+0.25 x Inventory Risk+0.20 x Delay Risk+0.20 x Demand Volatility Risk #</m:t>
               </m:r>
               <m:d>
                 <m:dPr>
@@ -13297,7 +13071,7 @@
                       <w:rFonts w:ascii="Cambria Math" w:hAnsi="Cambria Math"/>
                       <w:lang w:val="en-US"/>
                     </w:rPr>
-                    <m:t>5</m:t>
+                    <m:t>6</m:t>
                   </m:r>
                 </m:e>
               </m:d>
@@ -13312,6 +13086,9 @@
           <w:lang w:val="en-US"/>
         </w:rPr>
       </w:pPr>
+      <w:r>
+        <w:t>In this prototype, an average delay of three days or more is treated as the maximum delay risk. Critical inventory items are treated as full-risk items, while warning inventory items are treated as half-risk items. This makes the inventory risk score more balanced than treating all warning items as severe as critical items.</w:t>
+      </w:r>
     </w:p>
     <w:p>
       <w:pPr>
@@ -13332,32 +13109,17 @@
           <w:lang w:val="en-US"/>
         </w:rPr>
       </w:pPr>
-    </w:p>
-    <w:p>
-      <w:pPr>
-        <w:rPr>
-          <w:lang w:val="en-US"/>
-        </w:rPr>
-      </w:pPr>
-      <w:r>
-        <w:rPr>
-          <w:lang w:val="en-US"/>
-        </w:rPr>
-        <w:t xml:space="preserve">The risk scoring logic is also affected by dashboard filters. When the user filters the dataset by market, category, shipping mode, or date range, the risk components are recalculated based on the filtered data. This makes </w:t>
-      </w:r>
-      <w:proofErr w:type="gramStart"/>
-      <w:r>
-        <w:rPr>
-          <w:lang w:val="en-US"/>
-        </w:rPr>
-        <w:t>the risk</w:t>
-      </w:r>
-      <w:proofErr w:type="gramEnd"/>
-      <w:r>
-        <w:rPr>
-          <w:lang w:val="en-US"/>
-        </w:rPr>
-        <w:t xml:space="preserve"> analysis interactive and more useful for decision-making.</w:t>
+      <w:r>
+        <w:rPr>
+          <w:lang w:val="en-US"/>
+        </w:rPr>
+        <w:t>The displayed risk scores are also affected by dashboard filters</w:t>
+      </w:r>
+      <w:r>
+        <w:rPr>
+          <w:lang w:val="en-US"/>
+        </w:rPr>
+        <w:t>. When the user filters the dataset by market, category, shipping mode, or date range, the risk components are recalculated based on the filtered data. This makes the risk analysis interactive and more useful for decision-making.</w:t>
       </w:r>
     </w:p>
     <w:p>
@@ -13367,7 +13129,7 @@
           <w:lang w:val="en-US"/>
         </w:rPr>
       </w:pPr>
-      <w:bookmarkStart w:id="48" w:name="_Toc230427023"/>
+      <w:bookmarkStart w:id="48" w:name="_Toc230437532"/>
       <w:r>
         <w:rPr>
           <w:lang w:val="en-US"/>
@@ -13494,35 +13256,7 @@
         <w:rPr>
           <w:lang w:val="en-US"/>
         </w:rPr>
-        <w:t xml:space="preserve">The forecasting approach is intentionally simple because the </w:t>
-      </w:r>
-      <w:proofErr w:type="gramStart"/>
-      <w:r>
-        <w:rPr>
-          <w:lang w:val="en-US"/>
-        </w:rPr>
-        <w:t>main focus</w:t>
-      </w:r>
-      <w:proofErr w:type="gramEnd"/>
-      <w:r>
-        <w:rPr>
-          <w:lang w:val="en-US"/>
-        </w:rPr>
-        <w:t xml:space="preserve"> of the project is </w:t>
-      </w:r>
-      <w:proofErr w:type="gramStart"/>
-      <w:r>
-        <w:rPr>
-          <w:lang w:val="en-US"/>
-        </w:rPr>
-        <w:t>supply</w:t>
-      </w:r>
-      <w:proofErr w:type="gramEnd"/>
-      <w:r>
-        <w:rPr>
-          <w:lang w:val="en-US"/>
-        </w:rPr>
-        <w:t xml:space="preserve"> chain visibility and risk assessment. The purpose of the forecast module is to demonstrate how demand data can support planning decisions, not to create a highly advanced forecasting system.</w:t>
+        <w:t>The forecasting approach is intentionally simple because the main focus of the project is supply chain visibility and risk assessment. The purpose of the forecast module is to demonstrate how demand data can support planning decisions, not to create a highly advanced forecasting system.</w:t>
       </w:r>
     </w:p>
     <w:p>
@@ -13539,7 +13273,7 @@
           <w:lang w:val="en-US"/>
         </w:rPr>
       </w:pPr>
-      <w:bookmarkStart w:id="49" w:name="_Toc230427024"/>
+      <w:bookmarkStart w:id="49" w:name="_Toc230437533"/>
       <w:r>
         <w:rPr>
           <w:lang w:val="en-US"/>
@@ -13558,35 +13292,7 @@
         <w:rPr>
           <w:lang w:val="en-US"/>
         </w:rPr>
-        <w:t xml:space="preserve">The dashboard interface was developed with </w:t>
-      </w:r>
-      <w:proofErr w:type="spellStart"/>
-      <w:r>
-        <w:rPr>
-          <w:lang w:val="en-US"/>
-        </w:rPr>
-        <w:t>Streamlit</w:t>
-      </w:r>
-      <w:proofErr w:type="spellEnd"/>
-      <w:r>
-        <w:rPr>
-          <w:lang w:val="en-US"/>
-        </w:rPr>
-        <w:t xml:space="preserve">. The platform includes a sidebar navigation menu and multiple dashboard pages. The Overview page includes the Data Source Manager, which allows users to upload a new dataset, map columns, activate the uploaded dataset, or return to the default </w:t>
-      </w:r>
-      <w:proofErr w:type="spellStart"/>
-      <w:r>
-        <w:rPr>
-          <w:lang w:val="en-US"/>
-        </w:rPr>
-        <w:t>DataCo</w:t>
-      </w:r>
-      <w:proofErr w:type="spellEnd"/>
-      <w:r>
-        <w:rPr>
-          <w:lang w:val="en-US"/>
-        </w:rPr>
-        <w:t xml:space="preserve"> dataset.</w:t>
+        <w:t>The dashboard interface was developed with Streamlit. The platform includes a sidebar navigation menu and multiple dashboard pages. The Overview page includes the Data Source Manager, which allows users to upload a new dataset, map columns, activate the uploaded dataset, or return to the default DataCo dataset.</w:t>
       </w:r>
     </w:p>
     <w:p>
@@ -13629,7 +13335,7 @@
         </w:rPr>
         <w:lastRenderedPageBreak/>
         <w:drawing>
-          <wp:inline distT="0" distB="0" distL="0" distR="0" wp14:anchorId="385ACC34" wp14:editId="62BED690">
+          <wp:inline distT="0" distB="0" distL="0" distR="0" wp14:anchorId="385ACC34" wp14:editId="3314E5A7">
             <wp:extent cx="6357908" cy="3705225"/>
             <wp:effectExtent l="0" t="0" r="5080" b="0"/>
             <wp:docPr id="1801230199" name="Picture 4"/>
@@ -14176,7 +13882,7 @@
           <w:lang w:val="en-US"/>
         </w:rPr>
       </w:pPr>
-      <w:bookmarkStart w:id="54" w:name="_Toc230427025"/>
+      <w:bookmarkStart w:id="54" w:name="_Toc230437534"/>
       <w:r>
         <w:rPr>
           <w:lang w:val="en-US"/>
@@ -14205,7 +13911,7 @@
           <w:lang w:val="en-US"/>
         </w:rPr>
       </w:pPr>
-      <w:bookmarkStart w:id="55" w:name="_Toc230427026"/>
+      <w:bookmarkStart w:id="55" w:name="_Toc230437535"/>
       <w:r>
         <w:rPr>
           <w:lang w:val="en-US"/>
@@ -14250,21 +13956,7 @@
           <w:lang w:val="en-US"/>
         </w:rPr>
         <w:br/>
-        <w:t xml:space="preserve">The company needs a reusable dashboard platform that can work with different supply chain datasets. The platform should not require code changes every time a new </w:t>
-      </w:r>
-      <w:proofErr w:type="gramStart"/>
-      <w:r>
-        <w:rPr>
-          <w:lang w:val="en-US"/>
-        </w:rPr>
-        <w:t>dataset</w:t>
-      </w:r>
-      <w:proofErr w:type="gramEnd"/>
-      <w:r>
-        <w:rPr>
-          <w:lang w:val="en-US"/>
-        </w:rPr>
-        <w:t xml:space="preserve"> is analyzed. Instead, users should be able to upload a dataset, map its columns to a standard schema, and generate dashboard pages based on the active dataset.</w:t>
+        <w:t>The company needs a reusable dashboard platform that can work with different supply chain datasets. The platform should not require code changes every time a new dataset is analyzed. Instead, users should be able to upload a dataset, map its columns to a standard schema, and generate dashboard pages based on the active dataset.</w:t>
       </w:r>
     </w:p>
     <w:p>
@@ -14284,21 +13976,7 @@
           <w:lang w:val="en-US"/>
         </w:rPr>
         <w:br/>
-        <w:t xml:space="preserve">In this project, the </w:t>
-      </w:r>
-      <w:proofErr w:type="spellStart"/>
-      <w:r>
-        <w:rPr>
-          <w:lang w:val="en-US"/>
-        </w:rPr>
-        <w:t>DataCo</w:t>
-      </w:r>
-      <w:proofErr w:type="spellEnd"/>
-      <w:r>
-        <w:rPr>
-          <w:lang w:val="en-US"/>
-        </w:rPr>
-        <w:t xml:space="preserve"> dataset is used as the default demonstration dataset. However, the business case also considers a situation where a user uploads a new company dataset. After the uploaded dataset is mapped and standardized, the dashboard pages are updated dynamically.</w:t>
+        <w:t>In this project, the DataCo dataset is used as the default demonstration dataset. However, the business case also considers a situation where a user uploads a new company dataset. After the uploaded dataset is mapped and standardized, the dashboard pages are updated dynamically.</w:t>
       </w:r>
     </w:p>
     <w:p>
@@ -14308,7 +13986,7 @@
           <w:lang w:val="en-US"/>
         </w:rPr>
       </w:pPr>
-      <w:bookmarkStart w:id="56" w:name="_Toc230427027"/>
+      <w:bookmarkStart w:id="56" w:name="_Toc230437536"/>
       <w:r>
         <w:rPr>
           <w:lang w:val="en-US"/>
@@ -14344,7 +14022,7 @@
           <w:lang w:val="en-US"/>
         </w:rPr>
       </w:pPr>
-      <w:bookmarkStart w:id="57" w:name="_Toc230202525"/>
+      <w:bookmarkStart w:id="57" w:name="_Toc230437488"/>
       <w:r>
         <w:rPr>
           <w:lang w:val="en-US"/>
@@ -14709,7 +14387,7 @@
           <w:lang w:val="en-US"/>
         </w:rPr>
       </w:pPr>
-      <w:bookmarkStart w:id="58" w:name="_Toc230427028"/>
+      <w:bookmarkStart w:id="58" w:name="_Toc230437537"/>
       <w:r>
         <w:rPr>
           <w:lang w:val="en-US"/>
@@ -14765,7 +14443,7 @@
         </w:rPr>
         <w:lastRenderedPageBreak/>
         <w:drawing>
-          <wp:inline distT="0" distB="0" distL="0" distR="0" wp14:anchorId="2FC8B4CF" wp14:editId="1FBAF7BD">
+          <wp:inline distT="0" distB="0" distL="0" distR="0" wp14:anchorId="2FC8B4CF" wp14:editId="49509299">
             <wp:extent cx="5868670" cy="3867785"/>
             <wp:effectExtent l="0" t="0" r="0" b="0"/>
             <wp:docPr id="656098705" name="Picture 5"/>
@@ -14888,7 +14566,7 @@
           <w:lang w:val="en-US"/>
         </w:rPr>
       </w:pPr>
-      <w:bookmarkStart w:id="60" w:name="_Toc230427029"/>
+      <w:bookmarkStart w:id="60" w:name="_Toc230437538"/>
       <w:r>
         <w:rPr>
           <w:lang w:val="en-US"/>
@@ -14907,49 +14585,7 @@
         <w:rPr>
           <w:lang w:val="en-US"/>
         </w:rPr>
-        <w:t xml:space="preserve">An example usage flow starts with the user opening the platform. </w:t>
-      </w:r>
-      <w:proofErr w:type="gramStart"/>
-      <w:r>
-        <w:rPr>
-          <w:lang w:val="en-US"/>
-        </w:rPr>
-        <w:t>At first</w:t>
-      </w:r>
-      <w:proofErr w:type="gramEnd"/>
-      <w:r>
-        <w:rPr>
-          <w:lang w:val="en-US"/>
-        </w:rPr>
-        <w:t xml:space="preserve">, the default </w:t>
-      </w:r>
-      <w:proofErr w:type="spellStart"/>
-      <w:r>
-        <w:rPr>
-          <w:lang w:val="en-US"/>
-        </w:rPr>
-        <w:t>DataCo</w:t>
-      </w:r>
-      <w:proofErr w:type="spellEnd"/>
-      <w:r>
-        <w:rPr>
-          <w:lang w:val="en-US"/>
-        </w:rPr>
-        <w:t xml:space="preserve"> dataset is active. The user can review the default </w:t>
-      </w:r>
-      <w:proofErr w:type="gramStart"/>
-      <w:r>
-        <w:rPr>
-          <w:lang w:val="en-US"/>
-        </w:rPr>
-        <w:t>dashboard, or</w:t>
-      </w:r>
-      <w:proofErr w:type="gramEnd"/>
-      <w:r>
-        <w:rPr>
-          <w:lang w:val="en-US"/>
-        </w:rPr>
-        <w:t xml:space="preserve"> upload a new supply chain dataset through the Data Source Manager.</w:t>
+        <w:t>An example usage flow starts with the user opening the platform. At first, the default DataCo dataset is active. The user can review the default dashboard, or upload a new supply chain dataset through the Data Source Manager.</w:t>
       </w:r>
     </w:p>
     <w:p>
@@ -15006,7 +14642,7 @@
           <w:lang w:val="en-US"/>
         </w:rPr>
       </w:pPr>
-      <w:bookmarkStart w:id="61" w:name="_Toc230427030"/>
+      <w:bookmarkStart w:id="61" w:name="_Toc230437539"/>
       <w:r>
         <w:rPr>
           <w:lang w:val="en-US"/>
@@ -15071,16 +14707,760 @@
     </w:p>
     <w:p>
       <w:pPr>
+        <w:pStyle w:val="Heading2"/>
+        <w:rPr>
+          <w:lang w:val="en-US"/>
+        </w:rPr>
+      </w:pPr>
+      <w:bookmarkStart w:id="62" w:name="_Toc230437540"/>
+      <w:r>
+        <w:rPr>
+          <w:lang w:val="en-US"/>
+        </w:rPr>
+        <w:t>Testing and Validation</w:t>
+      </w:r>
+      <w:bookmarkEnd w:id="62"/>
+    </w:p>
+    <w:p>
+      <w:pPr>
+        <w:rPr>
+          <w:lang w:val="en-US"/>
+        </w:rPr>
+      </w:pPr>
+      <w:r>
+        <w:rPr>
+          <w:lang w:val="en-US"/>
+        </w:rPr>
+        <w:t>Testing and Validation</w:t>
+      </w:r>
+    </w:p>
+    <w:p>
+      <w:pPr>
+        <w:rPr>
+          <w:lang w:val="en-US"/>
+        </w:rPr>
+      </w:pPr>
+      <w:r>
+        <w:rPr>
+          <w:lang w:val="en-US"/>
+        </w:rPr>
+        <w:t xml:space="preserve">The developed platform was tested by using both the default </w:t>
+      </w:r>
+      <w:proofErr w:type="spellStart"/>
+      <w:r>
+        <w:rPr>
+          <w:lang w:val="en-US"/>
+        </w:rPr>
+        <w:t>DataCo</w:t>
+      </w:r>
+      <w:proofErr w:type="spellEnd"/>
+      <w:r>
+        <w:rPr>
+          <w:lang w:val="en-US"/>
+        </w:rPr>
+        <w:t xml:space="preserve"> supply chain dataset and the uploaded dataset workflow. The purpose of testing was to verify that the data processing pipeline, dashboard modules, risk scoring logic, and demand forecasting outputs work correctly with the standardized data structure.</w:t>
+      </w:r>
+    </w:p>
+    <w:p>
+      <w:pPr>
+        <w:rPr>
+          <w:lang w:val="en-US"/>
+        </w:rPr>
+      </w:pPr>
+      <w:r>
+        <w:rPr>
+          <w:lang w:val="en-US"/>
+        </w:rPr>
+        <w:t xml:space="preserve">First, the default </w:t>
+      </w:r>
+      <w:proofErr w:type="spellStart"/>
+      <w:r>
+        <w:rPr>
+          <w:lang w:val="en-US"/>
+        </w:rPr>
+        <w:t>DataCo</w:t>
+      </w:r>
+      <w:proofErr w:type="spellEnd"/>
+      <w:r>
+        <w:rPr>
+          <w:lang w:val="en-US"/>
+        </w:rPr>
+        <w:t xml:space="preserve"> dataset was processed through the data preparation script. The raw dataset contained 180,519 order records, and the script generated dashboard-ready analytical tables such as orders, shipments, products, inventory, demand, and risk scores. These processed files were then used by the </w:t>
+      </w:r>
+      <w:proofErr w:type="spellStart"/>
+      <w:r>
+        <w:rPr>
+          <w:lang w:val="en-US"/>
+        </w:rPr>
+        <w:t>Streamlit</w:t>
+      </w:r>
+      <w:proofErr w:type="spellEnd"/>
+      <w:r>
+        <w:rPr>
+          <w:lang w:val="en-US"/>
+        </w:rPr>
+        <w:t xml:space="preserve"> dashboard pages.</w:t>
+      </w:r>
+    </w:p>
+    <w:p>
+      <w:pPr>
+        <w:rPr>
+          <w:lang w:val="en-US"/>
+        </w:rPr>
+      </w:pPr>
+      <w:r>
+        <w:rPr>
+          <w:lang w:val="en-US"/>
+        </w:rPr>
+        <w:t>Second, the uploaded dataset workflow was tested through the column mapping interface. Required fields were mapped to the standard schema, while optional fields were either mapped when available or handled through default and derived values. After the uploaded dataset was activated, the dashboard modules were generated based on the active standardized dataset.</w:t>
+      </w:r>
+    </w:p>
+    <w:p>
+      <w:pPr>
+        <w:rPr>
+          <w:lang w:val="en-US"/>
+        </w:rPr>
+      </w:pPr>
+      <w:r>
+        <w:rPr>
+          <w:lang w:val="en-US"/>
+        </w:rPr>
+        <w:t>The main validation checks are summarized below.</w:t>
+      </w:r>
+    </w:p>
+    <w:p>
+      <w:pPr>
+        <w:pStyle w:val="Caption"/>
+        <w:keepNext/>
+      </w:pPr>
+      <w:bookmarkStart w:id="63" w:name="_Toc230437489"/>
+      <w:r>
+        <w:t xml:space="preserve">Table </w:t>
+      </w:r>
+      <w:fldSimple w:instr=" SEQ Table \* ARABIC ">
+        <w:r>
+          <w:rPr>
+            <w:noProof/>
+          </w:rPr>
+          <w:t>6</w:t>
+        </w:r>
+      </w:fldSimple>
+      <w:r>
+        <w:t xml:space="preserve">. </w:t>
+      </w:r>
+      <w:r>
+        <w:t>Summary of Functional Testing and Validation Results</w:t>
+      </w:r>
+      <w:bookmarkEnd w:id="63"/>
+    </w:p>
+    <w:tbl>
+      <w:tblPr>
+        <w:tblStyle w:val="TableGrid"/>
+        <w:tblW w:w="0" w:type="auto"/>
+        <w:tblLook w:val="04A0" w:firstRow="1" w:lastRow="0" w:firstColumn="1" w:lastColumn="0" w:noHBand="0" w:noVBand="1"/>
+      </w:tblPr>
+      <w:tblGrid>
+        <w:gridCol w:w="2308"/>
+        <w:gridCol w:w="2308"/>
+        <w:gridCol w:w="2308"/>
+        <w:gridCol w:w="2308"/>
+      </w:tblGrid>
+      <w:tr>
+        <w:tc>
+          <w:tcPr>
+            <w:tcW w:w="2308" w:type="dxa"/>
+          </w:tcPr>
+          <w:p>
+            <w:pPr>
+              <w:rPr>
+                <w:b/>
+                <w:bCs/>
+                <w:lang w:val="en-US"/>
+              </w:rPr>
+            </w:pPr>
+            <w:r>
+              <w:rPr>
+                <w:b/>
+                <w:bCs/>
+                <w:lang w:val="en-US"/>
+              </w:rPr>
+              <w:t xml:space="preserve">Test Case </w:t>
+            </w:r>
+          </w:p>
+        </w:tc>
+        <w:tc>
+          <w:tcPr>
+            <w:tcW w:w="2308" w:type="dxa"/>
+          </w:tcPr>
+          <w:p>
+            <w:pPr>
+              <w:rPr>
+                <w:b/>
+                <w:bCs/>
+                <w:lang w:val="en-US"/>
+              </w:rPr>
+            </w:pPr>
+            <w:r>
+              <w:rPr>
+                <w:b/>
+                <w:bCs/>
+                <w:lang w:val="en-US"/>
+              </w:rPr>
+              <w:t xml:space="preserve"> Expected Result </w:t>
+            </w:r>
+          </w:p>
+        </w:tc>
+        <w:tc>
+          <w:tcPr>
+            <w:tcW w:w="2308" w:type="dxa"/>
+          </w:tcPr>
+          <w:p>
+            <w:pPr>
+              <w:rPr>
+                <w:b/>
+                <w:bCs/>
+                <w:lang w:val="en-US"/>
+              </w:rPr>
+            </w:pPr>
+            <w:r>
+              <w:rPr>
+                <w:b/>
+                <w:bCs/>
+                <w:lang w:val="en-US"/>
+              </w:rPr>
+              <w:t xml:space="preserve"> Actual Result </w:t>
+            </w:r>
+          </w:p>
+        </w:tc>
+        <w:tc>
+          <w:tcPr>
+            <w:tcW w:w="2308" w:type="dxa"/>
+          </w:tcPr>
+          <w:p>
+            <w:pPr>
+              <w:rPr>
+                <w:b/>
+                <w:bCs/>
+                <w:lang w:val="en-US"/>
+              </w:rPr>
+            </w:pPr>
+            <w:r>
+              <w:rPr>
+                <w:b/>
+                <w:bCs/>
+                <w:lang w:val="en-US"/>
+              </w:rPr>
+              <w:t xml:space="preserve"> Status</w:t>
+            </w:r>
+          </w:p>
+        </w:tc>
+      </w:tr>
+      <w:tr>
+        <w:tc>
+          <w:tcPr>
+            <w:tcW w:w="2308" w:type="dxa"/>
+          </w:tcPr>
+          <w:p>
+            <w:pPr>
+              <w:rPr>
+                <w:lang w:val="en-US"/>
+              </w:rPr>
+            </w:pPr>
+            <w:r>
+              <w:rPr>
+                <w:lang w:val="en-US"/>
+              </w:rPr>
+              <w:t xml:space="preserve">Default dataset processing </w:t>
+            </w:r>
+          </w:p>
+        </w:tc>
+        <w:tc>
+          <w:tcPr>
+            <w:tcW w:w="2308" w:type="dxa"/>
+          </w:tcPr>
+          <w:p>
+            <w:pPr>
+              <w:rPr>
+                <w:lang w:val="en-US"/>
+              </w:rPr>
+            </w:pPr>
+            <w:r>
+              <w:rPr>
+                <w:lang w:val="en-US"/>
+              </w:rPr>
+              <w:t xml:space="preserve"> Processed CSV files and SQLite database are generated </w:t>
+            </w:r>
+          </w:p>
+        </w:tc>
+        <w:tc>
+          <w:tcPr>
+            <w:tcW w:w="2308" w:type="dxa"/>
+          </w:tcPr>
+          <w:p>
+            <w:pPr>
+              <w:rPr>
+                <w:lang w:val="en-US"/>
+              </w:rPr>
+            </w:pPr>
+            <w:r>
+              <w:rPr>
+                <w:lang w:val="en-US"/>
+              </w:rPr>
+              <w:t xml:space="preserve"> Generated successfully </w:t>
+            </w:r>
+          </w:p>
+        </w:tc>
+        <w:tc>
+          <w:tcPr>
+            <w:tcW w:w="2308" w:type="dxa"/>
+          </w:tcPr>
+          <w:p>
+            <w:pPr>
+              <w:rPr>
+                <w:lang w:val="en-US"/>
+              </w:rPr>
+            </w:pPr>
+            <w:r>
+              <w:rPr>
+                <w:lang w:val="en-US"/>
+              </w:rPr>
+              <w:t xml:space="preserve"> Passed</w:t>
+            </w:r>
+          </w:p>
+        </w:tc>
+      </w:tr>
+      <w:tr>
+        <w:tc>
+          <w:tcPr>
+            <w:tcW w:w="2308" w:type="dxa"/>
+          </w:tcPr>
+          <w:p>
+            <w:pPr>
+              <w:rPr>
+                <w:lang w:val="en-US"/>
+              </w:rPr>
+            </w:pPr>
+            <w:r>
+              <w:rPr>
+                <w:lang w:val="en-US"/>
+              </w:rPr>
+              <w:t xml:space="preserve">Dashboard module loading </w:t>
+            </w:r>
+          </w:p>
+        </w:tc>
+        <w:tc>
+          <w:tcPr>
+            <w:tcW w:w="2308" w:type="dxa"/>
+          </w:tcPr>
+          <w:p>
+            <w:pPr>
+              <w:rPr>
+                <w:lang w:val="en-US"/>
+              </w:rPr>
+            </w:pPr>
+            <w:r>
+              <w:rPr>
+                <w:lang w:val="en-US"/>
+              </w:rPr>
+              <w:t xml:space="preserve"> Overview, regional performance, inventory, shipment, risk, and demand pages load without syntax errors </w:t>
+            </w:r>
+          </w:p>
+        </w:tc>
+        <w:tc>
+          <w:tcPr>
+            <w:tcW w:w="2308" w:type="dxa"/>
+          </w:tcPr>
+          <w:p>
+            <w:pPr>
+              <w:rPr>
+                <w:lang w:val="en-US"/>
+              </w:rPr>
+            </w:pPr>
+            <w:r>
+              <w:rPr>
+                <w:lang w:val="en-US"/>
+              </w:rPr>
+              <w:t xml:space="preserve"> Dashboard modules are available </w:t>
+            </w:r>
+          </w:p>
+        </w:tc>
+        <w:tc>
+          <w:tcPr>
+            <w:tcW w:w="2308" w:type="dxa"/>
+          </w:tcPr>
+          <w:p>
+            <w:pPr>
+              <w:rPr>
+                <w:lang w:val="en-US"/>
+              </w:rPr>
+            </w:pPr>
+            <w:r>
+              <w:rPr>
+                <w:lang w:val="en-US"/>
+              </w:rPr>
+              <w:t xml:space="preserve"> Passed</w:t>
+            </w:r>
+          </w:p>
+        </w:tc>
+      </w:tr>
+      <w:tr>
+        <w:tc>
+          <w:tcPr>
+            <w:tcW w:w="2308" w:type="dxa"/>
+          </w:tcPr>
+          <w:p>
+            <w:pPr>
+              <w:rPr>
+                <w:lang w:val="en-US"/>
+              </w:rPr>
+            </w:pPr>
+            <w:r>
+              <w:rPr>
+                <w:lang w:val="en-US"/>
+              </w:rPr>
+              <w:t xml:space="preserve">Uploaded dataset mapping </w:t>
+            </w:r>
+          </w:p>
+        </w:tc>
+        <w:tc>
+          <w:tcPr>
+            <w:tcW w:w="2308" w:type="dxa"/>
+          </w:tcPr>
+          <w:p>
+            <w:pPr>
+              <w:rPr>
+                <w:lang w:val="en-US"/>
+              </w:rPr>
+            </w:pPr>
+            <w:r>
+              <w:rPr>
+                <w:lang w:val="en-US"/>
+              </w:rPr>
+              <w:t xml:space="preserve"> Required columns are mapped to the standard schema </w:t>
+            </w:r>
+          </w:p>
+        </w:tc>
+        <w:tc>
+          <w:tcPr>
+            <w:tcW w:w="2308" w:type="dxa"/>
+          </w:tcPr>
+          <w:p>
+            <w:pPr>
+              <w:rPr>
+                <w:lang w:val="en-US"/>
+              </w:rPr>
+            </w:pPr>
+            <w:r>
+              <w:rPr>
+                <w:lang w:val="en-US"/>
+              </w:rPr>
+              <w:t xml:space="preserve"> Dataset can be standardized and activated </w:t>
+            </w:r>
+          </w:p>
+        </w:tc>
+        <w:tc>
+          <w:tcPr>
+            <w:tcW w:w="2308" w:type="dxa"/>
+          </w:tcPr>
+          <w:p>
+            <w:pPr>
+              <w:rPr>
+                <w:lang w:val="en-US"/>
+              </w:rPr>
+            </w:pPr>
+            <w:r>
+              <w:rPr>
+                <w:lang w:val="en-US"/>
+              </w:rPr>
+              <w:t xml:space="preserve"> Passed</w:t>
+            </w:r>
+          </w:p>
+        </w:tc>
+      </w:tr>
+      <w:tr>
+        <w:tc>
+          <w:tcPr>
+            <w:tcW w:w="2308" w:type="dxa"/>
+          </w:tcPr>
+          <w:p>
+            <w:pPr>
+              <w:rPr>
+                <w:lang w:val="en-US"/>
+              </w:rPr>
+            </w:pPr>
+            <w:r>
+              <w:rPr>
+                <w:lang w:val="en-US"/>
+              </w:rPr>
+              <w:t xml:space="preserve">Missing optional fields </w:t>
+            </w:r>
+          </w:p>
+        </w:tc>
+        <w:tc>
+          <w:tcPr>
+            <w:tcW w:w="2308" w:type="dxa"/>
+          </w:tcPr>
+          <w:p>
+            <w:pPr>
+              <w:rPr>
+                <w:lang w:val="en-US"/>
+              </w:rPr>
+            </w:pPr>
+            <w:r>
+              <w:rPr>
+                <w:lang w:val="en-US"/>
+              </w:rPr>
+              <w:t xml:space="preserve"> Missing optional fields are handled with default or derived values </w:t>
+            </w:r>
+          </w:p>
+        </w:tc>
+        <w:tc>
+          <w:tcPr>
+            <w:tcW w:w="2308" w:type="dxa"/>
+          </w:tcPr>
+          <w:p>
+            <w:pPr>
+              <w:rPr>
+                <w:lang w:val="en-US"/>
+              </w:rPr>
+            </w:pPr>
+            <w:r>
+              <w:rPr>
+                <w:lang w:val="en-US"/>
+              </w:rPr>
+              <w:t xml:space="preserve"> Dashboard remains usable </w:t>
+            </w:r>
+          </w:p>
+        </w:tc>
+        <w:tc>
+          <w:tcPr>
+            <w:tcW w:w="2308" w:type="dxa"/>
+          </w:tcPr>
+          <w:p>
+            <w:pPr>
+              <w:rPr>
+                <w:lang w:val="en-US"/>
+              </w:rPr>
+            </w:pPr>
+            <w:r>
+              <w:rPr>
+                <w:lang w:val="en-US"/>
+              </w:rPr>
+              <w:t xml:space="preserve"> Passed</w:t>
+            </w:r>
+          </w:p>
+        </w:tc>
+      </w:tr>
+      <w:tr>
+        <w:tc>
+          <w:tcPr>
+            <w:tcW w:w="2308" w:type="dxa"/>
+          </w:tcPr>
+          <w:p>
+            <w:pPr>
+              <w:rPr>
+                <w:lang w:val="en-US"/>
+              </w:rPr>
+            </w:pPr>
+            <w:r>
+              <w:rPr>
+                <w:lang w:val="en-US"/>
+              </w:rPr>
+              <w:t xml:space="preserve">Risk scoring logic </w:t>
+            </w:r>
+          </w:p>
+        </w:tc>
+        <w:tc>
+          <w:tcPr>
+            <w:tcW w:w="2308" w:type="dxa"/>
+          </w:tcPr>
+          <w:p>
+            <w:pPr>
+              <w:rPr>
+                <w:lang w:val="en-US"/>
+              </w:rPr>
+            </w:pPr>
+            <w:r>
+              <w:rPr>
+                <w:lang w:val="en-US"/>
+              </w:rPr>
+              <w:t xml:space="preserve"> Overall risk score uses late delivery rate, inventory risk, delay risk, and demand volatility risk </w:t>
+            </w:r>
+          </w:p>
+        </w:tc>
+        <w:tc>
+          <w:tcPr>
+            <w:tcW w:w="2308" w:type="dxa"/>
+          </w:tcPr>
+          <w:p>
+            <w:pPr>
+              <w:rPr>
+                <w:lang w:val="en-US"/>
+              </w:rPr>
+            </w:pPr>
+            <w:r>
+              <w:rPr>
+                <w:lang w:val="en-US"/>
+              </w:rPr>
+              <w:t xml:space="preserve"> Rule-based risk score is calculated and displayed </w:t>
+            </w:r>
+          </w:p>
+        </w:tc>
+        <w:tc>
+          <w:tcPr>
+            <w:tcW w:w="2308" w:type="dxa"/>
+          </w:tcPr>
+          <w:p>
+            <w:pPr>
+              <w:rPr>
+                <w:lang w:val="en-US"/>
+              </w:rPr>
+            </w:pPr>
+            <w:r>
+              <w:rPr>
+                <w:lang w:val="en-US"/>
+              </w:rPr>
+              <w:t xml:space="preserve"> Passed</w:t>
+            </w:r>
+          </w:p>
+        </w:tc>
+      </w:tr>
+      <w:tr>
+        <w:tc>
+          <w:tcPr>
+            <w:tcW w:w="2308" w:type="dxa"/>
+          </w:tcPr>
+          <w:p>
+            <w:pPr>
+              <w:rPr>
+                <w:lang w:val="en-US"/>
+              </w:rPr>
+            </w:pPr>
+            <w:r>
+              <w:rPr>
+                <w:lang w:val="en-US"/>
+              </w:rPr>
+              <w:t xml:space="preserve">Demand forecasting </w:t>
+            </w:r>
+          </w:p>
+        </w:tc>
+        <w:tc>
+          <w:tcPr>
+            <w:tcW w:w="2308" w:type="dxa"/>
+          </w:tcPr>
+          <w:p>
+            <w:pPr>
+              <w:rPr>
+                <w:lang w:val="en-US"/>
+              </w:rPr>
+            </w:pPr>
+            <w:r>
+              <w:rPr>
+                <w:lang w:val="en-US"/>
+              </w:rPr>
+              <w:t xml:space="preserve"> Moving average and linear regression forecasts are generated from monthly demand data </w:t>
+            </w:r>
+          </w:p>
+        </w:tc>
+        <w:tc>
+          <w:tcPr>
+            <w:tcW w:w="2308" w:type="dxa"/>
+          </w:tcPr>
+          <w:p>
+            <w:pPr>
+              <w:rPr>
+                <w:lang w:val="en-US"/>
+              </w:rPr>
+            </w:pPr>
+            <w:r>
+              <w:rPr>
+                <w:lang w:val="en-US"/>
+              </w:rPr>
+              <w:t xml:space="preserve"> Forecast tables and charts are displayed </w:t>
+            </w:r>
+          </w:p>
+        </w:tc>
+        <w:tc>
+          <w:tcPr>
+            <w:tcW w:w="2308" w:type="dxa"/>
+          </w:tcPr>
+          <w:p>
+            <w:pPr>
+              <w:rPr>
+                <w:lang w:val="en-US"/>
+              </w:rPr>
+            </w:pPr>
+            <w:r>
+              <w:rPr>
+                <w:lang w:val="en-US"/>
+              </w:rPr>
+              <w:t xml:space="preserve"> Passed</w:t>
+            </w:r>
+          </w:p>
+        </w:tc>
+      </w:tr>
+    </w:tbl>
+    <w:p>
+      <w:pPr>
+        <w:rPr>
+          <w:lang w:val="en-US"/>
+        </w:rPr>
+      </w:pPr>
+    </w:p>
+    <w:p>
+      <w:pPr>
+        <w:rPr>
+          <w:lang w:val="en-US"/>
+        </w:rPr>
+      </w:pPr>
+      <w:r>
+        <w:rPr>
+          <w:lang w:val="en-US"/>
+        </w:rPr>
+        <w:t xml:space="preserve">These tests show that the platform can process the default dataset, support uploaded datasets through schema mapping, and generate the main dashboard outputs. However, the validation is limited to functional testing. The current version does not include automated unit tests, stress testing with very </w:t>
+      </w:r>
+      <w:proofErr w:type="gramStart"/>
+      <w:r>
+        <w:rPr>
+          <w:lang w:val="en-US"/>
+        </w:rPr>
+        <w:t>large uploaded</w:t>
+      </w:r>
+      <w:proofErr w:type="gramEnd"/>
+      <w:r>
+        <w:rPr>
+          <w:lang w:val="en-US"/>
+        </w:rPr>
+        <w:t xml:space="preserve"> files, or live ERP/API integration testing. These limitations are considered future improvement areas.</w:t>
+      </w:r>
+    </w:p>
+    <w:p>
+      <w:pPr>
+        <w:rPr>
+          <w:lang w:val="en-US"/>
+        </w:rPr>
+      </w:pPr>
+    </w:p>
+    <w:p>
+      <w:pPr>
+        <w:rPr>
+          <w:lang w:val="en-US"/>
+        </w:rPr>
+      </w:pPr>
+    </w:p>
+    <w:p>
+      <w:pPr>
         <w:pStyle w:val="Heading1"/>
         <w:rPr>
           <w:lang w:val="en-US"/>
         </w:rPr>
       </w:pPr>
-      <w:bookmarkStart w:id="62" w:name="_Toc230427031"/>
-      <w:r>
-        <w:rPr>
-          <w:lang w:val="en-US"/>
-        </w:rPr>
+      <w:bookmarkStart w:id="64" w:name="_Toc230437541"/>
+      <w:r>
+        <w:rPr>
+          <w:lang w:val="en-US"/>
+        </w:rPr>
+        <w:lastRenderedPageBreak/>
         <w:t>CONCLUSIO</w:t>
       </w:r>
       <w:r>
@@ -15089,33 +15469,19 @@
         </w:rPr>
         <w:t>NS</w:t>
       </w:r>
-      <w:bookmarkEnd w:id="62"/>
-    </w:p>
-    <w:p>
-      <w:pPr>
-        <w:rPr>
-          <w:lang w:val="en-US"/>
-        </w:rPr>
-      </w:pPr>
-      <w:r>
-        <w:rPr>
-          <w:lang w:val="en-US"/>
-        </w:rPr>
-        <w:t xml:space="preserve">This graduation thesis developed a Supply Chain Visibility and Risk Assessment Platform using Python and </w:t>
-      </w:r>
-      <w:proofErr w:type="spellStart"/>
-      <w:r>
-        <w:rPr>
-          <w:lang w:val="en-US"/>
-        </w:rPr>
-        <w:t>Streamlit</w:t>
-      </w:r>
-      <w:proofErr w:type="spellEnd"/>
-      <w:r>
-        <w:rPr>
-          <w:lang w:val="en-US"/>
-        </w:rPr>
-        <w:t>. The main goal of the project was to create an interactive decision-support system that can help users monitor supply chain performance, identify operational risks, and analyze demand patterns from a single interface.</w:t>
+      <w:bookmarkEnd w:id="64"/>
+    </w:p>
+    <w:p>
+      <w:pPr>
+        <w:rPr>
+          <w:lang w:val="en-US"/>
+        </w:rPr>
+      </w:pPr>
+      <w:r>
+        <w:rPr>
+          <w:lang w:val="en-US"/>
+        </w:rPr>
+        <w:t>This graduation thesis developed a Supply Chain Visibility and Risk Assessment Platform using Python and Streamlit. The main goal of the project was to create an interactive decision-support system that can help users monitor supply chain performance, identify operational risks, and analyze demand patterns from a single interface.</w:t>
       </w:r>
     </w:p>
     <w:p>
@@ -15135,21 +15501,7 @@
           <w:lang w:val="en-US"/>
         </w:rPr>
         <w:br/>
-        <w:t xml:space="preserve">The completed platform includes several dashboard modules: Overview, Regional Performance, Inventory Control, Shipment Performance, Supply Chain Risk, and Demand Forecast. These modules provide key performance indicators, charts, tables, risk scores, and </w:t>
-      </w:r>
-      <w:proofErr w:type="gramStart"/>
-      <w:r>
-        <w:rPr>
-          <w:lang w:val="en-US"/>
-        </w:rPr>
-        <w:t>forecasting</w:t>
-      </w:r>
-      <w:proofErr w:type="gramEnd"/>
-      <w:r>
-        <w:rPr>
-          <w:lang w:val="en-US"/>
-        </w:rPr>
-        <w:t xml:space="preserve"> outputs. The dashboard helps users analyze delivery performance, shipment delays, inventory status, regional differences, demand trends, and overall supply chain risk.</w:t>
+        <w:t>The completed platform includes several dashboard modules: Overview, Regional Performance, Inventory Control, Shipment Performance, Supply Chain Risk, and Demand Forecast. These modules provide key performance indicators, charts, tables, risk scores, and forecasting outputs. The dashboard helps users analyze delivery performance, shipment delays, inventory status, regional differences, demand trends, and overall supply chain risk.</w:t>
       </w:r>
     </w:p>
     <w:p>
@@ -15169,21 +15521,7 @@
           <w:lang w:val="en-US"/>
         </w:rPr>
         <w:br/>
-        <w:t xml:space="preserve">One of the strongest parts of the project is the dataset upload and standardization feature. The system is not limited to the default </w:t>
-      </w:r>
-      <w:proofErr w:type="spellStart"/>
-      <w:r>
-        <w:rPr>
-          <w:lang w:val="en-US"/>
-        </w:rPr>
-        <w:t>DataCo</w:t>
-      </w:r>
-      <w:proofErr w:type="spellEnd"/>
-      <w:r>
-        <w:rPr>
-          <w:lang w:val="en-US"/>
-        </w:rPr>
-        <w:t xml:space="preserve"> dataset. Users can upload a new supply chain dataset in CSV or Excel format, map the dataset columns to a standard schema, and generate dashboard pages based on the uploaded dataset. This makes the platform more reusable and flexible than a static dashboard built for only one dataset.</w:t>
+        <w:t>One of the strongest parts of the project is the dataset upload and standardization feature. The system is not limited to the default DataCo dataset. Users can upload a new supply chain dataset in CSV or Excel format, map the dataset columns to a standard schema, and generate dashboard pages based on the uploaded dataset. This makes the platform more reusable and flexible than a static dashboard built for only one dataset.</w:t>
       </w:r>
     </w:p>
     <w:p>
@@ -15243,21 +15581,7 @@
           <w:lang w:val="en-US"/>
         </w:rPr>
         <w:br/>
-        <w:t xml:space="preserve">The project has some limitations. The default </w:t>
-      </w:r>
-      <w:proofErr w:type="spellStart"/>
-      <w:r>
-        <w:rPr>
-          <w:lang w:val="en-US"/>
-        </w:rPr>
-        <w:t>DataCo</w:t>
-      </w:r>
-      <w:proofErr w:type="spellEnd"/>
-      <w:r>
-        <w:rPr>
-          <w:lang w:val="en-US"/>
-        </w:rPr>
-        <w:t xml:space="preserve"> dataset is a public historical dataset and does not represent the current operations of a specific company. In addition, the quality of the dashboard outputs depends on the structure and completeness of the uploaded dataset. Some indicators, especially inventory-related fields, are generated for academic demonstration purposes when the uploaded dataset does not contain complete inventory information. The risk score is also rule-based rather than machine-learning-based.</w:t>
+        <w:t>The project has some limitations. The default DataCo dataset is a public historical dataset and does not represent the current operations of a specific company. In addition, the quality of the dashboard outputs depends on the structure and completeness of the uploaded dataset. Some indicators, especially inventory-related fields, are generated for academic demonstration purposes when the uploaded dataset does not contain complete inventory information. The risk score is also rule-based rather than machine-learning-based.</w:t>
       </w:r>
     </w:p>
     <w:p>
@@ -15351,9 +15675,33 @@
         </w:rPr>
       </w:pPr>
     </w:p>
-    <w:bookmarkStart w:id="63" w:name="_Toc230427032" w:displacedByCustomXml="next"/>
-    <w:bookmarkStart w:id="64" w:name="_Toc494826192" w:displacedByCustomXml="next"/>
-    <w:bookmarkStart w:id="65" w:name="_Toc32521151" w:displacedByCustomXml="next"/>
+    <w:p>
+      <w:pPr>
+        <w:rPr>
+          <w:noProof/>
+          <w:lang w:val="en-US"/>
+        </w:rPr>
+      </w:pPr>
+    </w:p>
+    <w:p>
+      <w:pPr>
+        <w:rPr>
+          <w:noProof/>
+          <w:lang w:val="en-US"/>
+        </w:rPr>
+      </w:pPr>
+    </w:p>
+    <w:p>
+      <w:pPr>
+        <w:rPr>
+          <w:noProof/>
+          <w:lang w:val="en-US"/>
+        </w:rPr>
+      </w:pPr>
+    </w:p>
+    <w:bookmarkStart w:id="65" w:name="_Toc230437542" w:displacedByCustomXml="next"/>
+    <w:bookmarkStart w:id="66" w:name="_Toc494826192" w:displacedByCustomXml="next"/>
+    <w:bookmarkStart w:id="67" w:name="_Toc32521151" w:displacedByCustomXml="next"/>
     <w:sdt>
       <w:sdtPr>
         <w:rPr>
@@ -15381,9 +15729,9 @@
             </w:rPr>
             <w:t>REFERENCES</w:t>
           </w:r>
+          <w:bookmarkEnd w:id="67"/>
+          <w:bookmarkEnd w:id="66"/>
           <w:bookmarkEnd w:id="65"/>
-          <w:bookmarkEnd w:id="64"/>
-          <w:bookmarkEnd w:id="63"/>
         </w:p>
         <w:p>
           <w:pPr>
@@ -15764,7 +16112,7 @@
           <w:lang w:val="en-US"/>
         </w:rPr>
       </w:pPr>
-      <w:bookmarkStart w:id="66" w:name="_Toc41690539"/>
+      <w:bookmarkStart w:id="68" w:name="_Toc41690539"/>
       <w:r>
         <w:rPr>
           <w:lang w:val="en-US"/>
@@ -15779,7 +16127,7 @@
           <w:lang w:val="en-US"/>
         </w:rPr>
       </w:pPr>
-      <w:bookmarkStart w:id="67" w:name="_Toc230427033"/>
+      <w:bookmarkStart w:id="69" w:name="_Toc230437543"/>
       <w:r>
         <w:rPr>
           <w:lang w:val="en-US"/>
@@ -15787,21 +16135,19 @@
         <w:lastRenderedPageBreak/>
         <w:t>GIT/KAGGLE/COLAB/</w:t>
       </w:r>
-      <w:proofErr w:type="gramStart"/>
-      <w:r>
-        <w:rPr>
-          <w:lang w:val="en-US"/>
-        </w:rPr>
-        <w:t>etc..</w:t>
-      </w:r>
-      <w:proofErr w:type="gramEnd"/>
+      <w:r>
+        <w:rPr>
+          <w:lang w:val="en-US"/>
+        </w:rPr>
+        <w:t>ETC.</w:t>
+      </w:r>
       <w:r>
         <w:rPr>
           <w:lang w:val="en-US"/>
         </w:rPr>
         <w:t xml:space="preserve"> LINK</w:t>
       </w:r>
-      <w:bookmarkEnd w:id="67"/>
+      <w:bookmarkEnd w:id="69"/>
     </w:p>
     <w:p>
       <w:pPr>
@@ -15877,23 +16223,7 @@
           <w:lang w:val="en-US"/>
         </w:rPr>
         <w:br/>
-        <w:t xml:space="preserve">The default dataset is the </w:t>
-      </w:r>
-      <w:proofErr w:type="spellStart"/>
-      <w:r>
-        <w:rPr>
-          <w:color w:val="000000" w:themeColor="text1"/>
-          <w:lang w:val="en-US"/>
-        </w:rPr>
-        <w:t>DataCo</w:t>
-      </w:r>
-      <w:proofErr w:type="spellEnd"/>
-      <w:r>
-        <w:rPr>
-          <w:color w:val="000000" w:themeColor="text1"/>
-          <w:lang w:val="en-US"/>
-        </w:rPr>
-        <w:t xml:space="preserve"> Smart Supply Chain dataset. The platform also supports user-uploaded CSV and Excel supply chain datasets through the Data Source Manager.</w:t>
+        <w:t>The default dataset is the DataCo Smart Supply Chain dataset. The platform also supports user-uploaded CSV and Excel supply chain datasets through the Data Source Manager.</w:t>
       </w:r>
     </w:p>
     <w:p>
@@ -15920,7 +16250,7 @@
           <w:lang w:val="en-US"/>
         </w:rPr>
       </w:pPr>
-      <w:bookmarkStart w:id="68" w:name="_Toc230427034"/>
+      <w:bookmarkStart w:id="70" w:name="_Toc230437544"/>
       <w:r>
         <w:rPr>
           <w:lang w:val="en-US"/>
@@ -15928,8 +16258,8 @@
         <w:lastRenderedPageBreak/>
         <w:t>CURRICULUM VITAE</w:t>
       </w:r>
-      <w:bookmarkEnd w:id="66"/>
       <w:bookmarkEnd w:id="68"/>
+      <w:bookmarkEnd w:id="70"/>
     </w:p>
     <w:p>
       <w:pPr>
@@ -15940,21 +16270,12 @@
           <w:lang w:val="en-US"/>
         </w:rPr>
       </w:pPr>
-      <w:proofErr w:type="spellStart"/>
       <w:r>
         <w:rPr>
           <w:color w:val="000000" w:themeColor="text1"/>
           <w:lang w:val="en-US"/>
         </w:rPr>
-        <w:t>Gülse</w:t>
-      </w:r>
-      <w:proofErr w:type="spellEnd"/>
-      <w:r>
-        <w:rPr>
-          <w:color w:val="000000" w:themeColor="text1"/>
-          <w:lang w:val="en-US"/>
-        </w:rPr>
-        <w:t xml:space="preserve"> Dolunay Ünlü</w:t>
+        <w:t>Gülse Dolunay Ünlü</w:t>
       </w:r>
     </w:p>
     <w:p>
@@ -16082,48 +16403,18 @@
         </w:rPr>
         <w:t xml:space="preserve"> </w:t>
       </w:r>
-      <w:proofErr w:type="spellStart"/>
       <w:r>
         <w:rPr>
           <w:lang w:val="en-US" w:eastAsia="tr-TR"/>
         </w:rPr>
-        <w:t>Düzce</w:t>
-      </w:r>
-      <w:proofErr w:type="spellEnd"/>
+        <w:t xml:space="preserve">Düzce </w:t>
+      </w:r>
       <w:r>
         <w:rPr>
           <w:lang w:val="en-US" w:eastAsia="tr-TR"/>
         </w:rPr>
-        <w:t xml:space="preserve"> </w:t>
-      </w:r>
-      <w:r>
-        <w:rPr>
-          <w:lang w:val="en-US" w:eastAsia="tr-TR"/>
-        </w:rPr>
-        <w:t xml:space="preserve">Turgut </w:t>
-      </w:r>
-      <w:proofErr w:type="spellStart"/>
-      <w:r>
-        <w:rPr>
-          <w:lang w:val="en-US" w:eastAsia="tr-TR"/>
-        </w:rPr>
-        <w:t>Özal</w:t>
-      </w:r>
-      <w:proofErr w:type="spellEnd"/>
-      <w:r>
-        <w:rPr>
-          <w:lang w:val="en-US" w:eastAsia="tr-TR"/>
-        </w:rPr>
-        <w:t xml:space="preserve"> Anadolu </w:t>
-      </w:r>
-      <w:proofErr w:type="spellStart"/>
-      <w:r>
-        <w:rPr>
-          <w:lang w:val="en-US" w:eastAsia="tr-TR"/>
-        </w:rPr>
-        <w:t>Lisesi</w:t>
-      </w:r>
-      <w:proofErr w:type="spellEnd"/>
+        <w:t>Turgut Özal Anadolu Lisesi</w:t>
+      </w:r>
       <w:r>
         <w:rPr>
           <w:lang w:val="en-US" w:eastAsia="tr-TR"/>
@@ -16417,25 +16708,7 @@
           <w:bCs/>
           <w:lang w:val="en-US" w:eastAsia="tr-TR"/>
         </w:rPr>
-        <w:t xml:space="preserve">Performed data cleaning and </w:t>
-      </w:r>
-      <w:proofErr w:type="gramStart"/>
-      <w:r>
-        <w:rPr>
-          <w:b/>
-          <w:bCs/>
-          <w:lang w:val="en-US" w:eastAsia="tr-TR"/>
-        </w:rPr>
-        <w:t>exploratory</w:t>
-      </w:r>
-      <w:proofErr w:type="gramEnd"/>
-      <w:r>
-        <w:rPr>
-          <w:b/>
-          <w:bCs/>
-          <w:lang w:val="en-US" w:eastAsia="tr-TR"/>
-        </w:rPr>
-        <w:t xml:space="preserve"> data analysis on housing data using Python.</w:t>
+        <w:t>Performed data cleaning and exploratory data analysis on housing data using Python.</w:t>
       </w:r>
     </w:p>
     <w:p>
@@ -16474,25 +16747,7 @@
           <w:bCs/>
           <w:lang w:val="en-US" w:eastAsia="tr-TR"/>
         </w:rPr>
-        <w:t xml:space="preserve">Conducted data preprocessing and </w:t>
-      </w:r>
-      <w:proofErr w:type="gramStart"/>
-      <w:r>
-        <w:rPr>
-          <w:b/>
-          <w:bCs/>
-          <w:lang w:val="en-US" w:eastAsia="tr-TR"/>
-        </w:rPr>
-        <w:t>exploratory</w:t>
-      </w:r>
-      <w:proofErr w:type="gramEnd"/>
-      <w:r>
-        <w:rPr>
-          <w:b/>
-          <w:bCs/>
-          <w:lang w:val="en-US" w:eastAsia="tr-TR"/>
-        </w:rPr>
-        <w:t xml:space="preserve"> analysis on a biological dataset using Python.</w:t>
+        <w:t>Conducted data preprocessing and exploratory analysis on a biological dataset using Python.</w:t>
       </w:r>
     </w:p>
     <w:p>
@@ -16852,18 +17107,8 @@
                 <w:bCs/>
                 <w:lang w:val="en-US" w:eastAsia="tr-TR"/>
               </w:rPr>
-              <w:t xml:space="preserve"> 10.06.2002 </w:t>
-            </w:r>
-            <w:proofErr w:type="spellStart"/>
-            <w:r>
-              <w:rPr>
-                <w:b/>
-                <w:bCs/>
-                <w:lang w:val="en-US" w:eastAsia="tr-TR"/>
-              </w:rPr>
-              <w:t>Düzce</w:t>
-            </w:r>
-            <w:proofErr w:type="spellEnd"/>
+              <w:t xml:space="preserve"> 10.06.2002 Düzce</w:t>
+            </w:r>
           </w:p>
         </w:tc>
         <w:tc>
@@ -17060,18 +17305,8 @@
                 <w:bCs/>
                 <w:lang w:val="en-US" w:eastAsia="tr-TR"/>
               </w:rPr>
-              <w:t xml:space="preserve"> linkedin.com/in/</w:t>
-            </w:r>
-            <w:proofErr w:type="spellStart"/>
-            <w:r>
-              <w:rPr>
-                <w:b/>
-                <w:bCs/>
-                <w:lang w:val="en-US" w:eastAsia="tr-TR"/>
-              </w:rPr>
-              <w:t>gulsedolunayunlu</w:t>
-            </w:r>
-            <w:proofErr w:type="spellEnd"/>
+              <w:t xml:space="preserve"> linkedin.com/in/gulsedolunayunlu</w:t>
+            </w:r>
           </w:p>
         </w:tc>
         <w:tc>

</xml_diff>

<commit_message>
Strengthen literature review citations
</commit_message>
<xml_diff>
--- a/docs/graduation_thesis_report.docx
+++ b/docs/graduation_thesis_report.docx
@@ -530,13 +530,13 @@
       <w:pPr>
         <w:pStyle w:val="Introsections"/>
       </w:pPr>
-      <w:bookmarkStart w:id="2" w:name="_Toc28126413"/>
-      <w:bookmarkStart w:id="3" w:name="_Toc230437497"/>
+      <w:bookmarkStart w:id="2" w:name="_Toc230437497"/>
+      <w:bookmarkStart w:id="3" w:name="_Toc28126413"/>
       <w:r>
         <w:lastRenderedPageBreak/>
         <w:t>DECLARATION</w:t>
       </w:r>
-      <w:bookmarkEnd w:id="3"/>
+      <w:bookmarkEnd w:id="2"/>
       <w:r>
         <w:t xml:space="preserve"> </w:t>
       </w:r>
@@ -565,14 +565,12 @@
         </w:rPr>
         <w:t xml:space="preserve"> at Piri Reis </w:t>
       </w:r>
-      <w:proofErr w:type="gramStart"/>
-      <w:r>
-        <w:rPr>
-          <w:lang w:val="en-US"/>
-        </w:rPr>
-        <w:t>University, and</w:t>
-      </w:r>
-      <w:proofErr w:type="gramEnd"/>
+      <w:r>
+        <w:rPr>
+          <w:lang w:val="en-US"/>
+        </w:rPr>
+        <w:t>University and</w:t>
+      </w:r>
       <w:r>
         <w:rPr>
           <w:lang w:val="en-US"/>
@@ -682,7 +680,7 @@
         </w:rPr>
       </w:pPr>
     </w:p>
-    <w:bookmarkEnd w:id="2"/>
+    <w:bookmarkEnd w:id="3"/>
     <w:p>
       <w:pPr>
         <w:rPr>
@@ -6959,33 +6957,35 @@
           <w:lang w:val="en-US"/>
         </w:rPr>
         <w:br/>
-      </w:r>
-      <w:r>
+        <w:t>Visibility is one of the most important needs in supply chain operations. Managers need to see how orders, shipments, products, regions, inventory indicators, and demand patterns are performing. Without a clear visibility system, late deliveries, stock risks, regional problems, and demand changes may not be noticed early enough. For this reason, dashboard-based decision-support systems are useful for transforming raw supply chain data into understandable information.</w:t>
+      </w:r>
+    </w:p>
+    <w:p>
+      <w:pPr>
         <w:rPr>
           <w:noProof/>
           <w:color w:val="000000" w:themeColor="text1"/>
           <w:lang w:val="en-US"/>
         </w:rPr>
-        <w:br/>
-        <w:t>Visibility is one of the most important needs in supply chain operations. Managers need to see how orders, shipments, products, regions, inventory indicators, and demand patterns are performing. Without a clear visibility system, late deliveries, stock risks, regional problems, and demand changes may not be noticed early enough. For this reason, dashboard-based decision-support systems are useful for transforming raw supply chain data into understandable information.</w:t>
-      </w:r>
-    </w:p>
-    <w:p>
-      <w:pPr>
+      </w:pPr>
+      <w:r>
         <w:rPr>
           <w:noProof/>
           <w:color w:val="000000" w:themeColor="text1"/>
           <w:lang w:val="en-US"/>
         </w:rPr>
-      </w:pPr>
-      <w:r>
+        <w:br/>
+        <w:t>This graduation thesis develops a Supply Chain Visibility and Risk Assessment Platform. The aim of the project is to create an interactive system that helps users monitor supply chain performance and operational risk from a single interface. The platform provides dashboard modules for executive overview, regional performance, inventory control, shipment performance, supply chain risk analysis, and demand forecasting.</w:t>
+      </w:r>
+    </w:p>
+    <w:p>
+      <w:pPr>
         <w:rPr>
           <w:noProof/>
           <w:color w:val="000000" w:themeColor="text1"/>
           <w:lang w:val="en-US"/>
         </w:rPr>
-        <w:br/>
-      </w:r>
+      </w:pPr>
       <w:r>
         <w:rPr>
           <w:noProof/>
@@ -6993,7 +6993,7 @@
           <w:lang w:val="en-US"/>
         </w:rPr>
         <w:br/>
-        <w:t>This graduation thesis develops a Supply Chain Visibility and Risk Assessment Platform. The aim of the project is to create an interactive system that helps users monitor supply chain performance and operational risk from a single interface. The platform provides dashboard modules for executive overview, regional performance, inventory control, shipment performance, supply chain risk analysis, and demand forecasting.</w:t>
+        <w:t>The project uses the public DataCo Smart Supply Chain dataset as the default demonstration dataset. However, the system is not limited to this dataset. Users can also upload their own supply chain datasets in CSV or Excel format. After uploading a dataset, users map its columns to a standard supply chain schema. The system then standardizes the uploaded data and dynamically updates the dashboard pages according to the active dataset.</w:t>
       </w:r>
     </w:p>
     <w:p>
@@ -7004,40 +7004,6 @@
           <w:lang w:val="en-US"/>
         </w:rPr>
       </w:pPr>
-      <w:r>
-        <w:rPr>
-          <w:noProof/>
-          <w:color w:val="000000" w:themeColor="text1"/>
-          <w:lang w:val="en-US"/>
-        </w:rPr>
-        <w:br/>
-      </w:r>
-      <w:r>
-        <w:rPr>
-          <w:noProof/>
-          <w:color w:val="000000" w:themeColor="text1"/>
-          <w:lang w:val="en-US"/>
-        </w:rPr>
-        <w:br/>
-        <w:t>The project uses the public DataCo Smart Supply Chain dataset as the default demonstration dataset. However, the system is not limited to this dataset. Users can also upload their own supply chain datasets in CSV or Excel format. After uploading a dataset, users map its columns to a standard supply chain schema. The system then standardizes the uploaded data and dynamically updates the dashboard pages according to the active dataset.</w:t>
-      </w:r>
-    </w:p>
-    <w:p>
-      <w:pPr>
-        <w:rPr>
-          <w:noProof/>
-          <w:color w:val="000000" w:themeColor="text1"/>
-          <w:lang w:val="en-US"/>
-        </w:rPr>
-      </w:pPr>
-      <w:r>
-        <w:rPr>
-          <w:noProof/>
-          <w:color w:val="000000" w:themeColor="text1"/>
-          <w:lang w:val="en-US"/>
-        </w:rPr>
-        <w:br/>
-      </w:r>
       <w:r>
         <w:rPr>
           <w:noProof/>
@@ -7173,13 +7139,6 @@
           <w:lang w:val="en-US"/>
         </w:rPr>
       </w:pPr>
-    </w:p>
-    <w:p>
-      <w:pPr>
-        <w:rPr>
-          <w:lang w:val="en-US"/>
-        </w:rPr>
-      </w:pPr>
       <w:r>
         <w:rPr>
           <w:lang w:val="en-US"/>
@@ -7235,13 +7194,6 @@
           <w:lang w:val="en-US"/>
         </w:rPr>
       </w:pPr>
-    </w:p>
-    <w:p>
-      <w:pPr>
-        <w:rPr>
-          <w:lang w:val="en-US"/>
-        </w:rPr>
-      </w:pPr>
       <w:r>
         <w:rPr>
           <w:lang w:val="en-US"/>
@@ -7268,7 +7220,6 @@
         <w:rPr>
           <w:lang w:val="en-US"/>
         </w:rPr>
-        <w:lastRenderedPageBreak/>
         <w:t>Business Intelligence Dashboards and Decision Support</w:t>
       </w:r>
       <w:bookmarkEnd w:id="15"/>
@@ -7334,17 +7285,11 @@
           <w:lang w:val="en-US"/>
         </w:rPr>
       </w:pPr>
-    </w:p>
-    <w:p>
-      <w:pPr>
-        <w:rPr>
-          <w:lang w:val="en-US"/>
-        </w:rPr>
-      </w:pPr>
-      <w:r>
-        <w:rPr>
-          <w:lang w:val="en-US"/>
-        </w:rPr>
+      <w:r>
+        <w:rPr>
+          <w:lang w:val="en-US"/>
+        </w:rPr>
+        <w:lastRenderedPageBreak/>
         <w:t xml:space="preserve">In supply chain management, dashboards can support decision-making by showing delivery performance, regional differences, inventory problems, shipment delays, and risk indicators. A well-designed dashboard does not only display data; it also helps users compare performance, identify patterns, and focus on problem areas. For this reason, dashboards can act as decision-support tools for supply chain managers, logistics analysts, inventory planners, and business analysts. </w:t>
       </w:r>
       <w:sdt>
@@ -7396,6 +7341,60 @@
           <w:lang w:val="en-US"/>
         </w:rPr>
       </w:pPr>
+      <w:r>
+        <w:rPr>
+          <w:lang w:val="en-US"/>
+        </w:rPr>
+        <w:t>In this context, business intelligence dashboards support managerial decision-making by transforming raw operational data into structured indicators, visual summaries, and performance monitoring tools</w:t>
+      </w:r>
+      <w:r>
+        <w:rPr>
+          <w:lang w:val="en-US"/>
+        </w:rPr>
+        <w:t xml:space="preserve">. </w:t>
+      </w:r>
+      <w:sdt>
+        <w:sdtPr>
+          <w:rPr>
+            <w:lang w:val="en-US"/>
+          </w:rPr>
+          <w:id w:val="1718775694"/>
+          <w:citation/>
+        </w:sdtPr>
+        <w:sdtContent>
+          <w:r>
+            <w:rPr>
+              <w:lang w:val="en-US"/>
+            </w:rPr>
+            <w:fldChar w:fldCharType="begin"/>
+          </w:r>
+          <w:r>
+            <w:rPr>
+              <w:lang w:val="tr-TR"/>
+            </w:rPr>
+            <w:instrText xml:space="preserve"> CITATION Gra19 \l 1055 </w:instrText>
+          </w:r>
+          <w:r>
+            <w:rPr>
+              <w:lang w:val="en-US"/>
+            </w:rPr>
+            <w:fldChar w:fldCharType="separate"/>
+          </w:r>
+          <w:r>
+            <w:rPr>
+              <w:noProof/>
+              <w:lang w:val="tr-TR"/>
+            </w:rPr>
+            <w:t>(Grabińska, 2019)</w:t>
+          </w:r>
+          <w:r>
+            <w:rPr>
+              <w:lang w:val="en-US"/>
+            </w:rPr>
+            <w:fldChar w:fldCharType="end"/>
+          </w:r>
+        </w:sdtContent>
+      </w:sdt>
     </w:p>
     <w:p>
       <w:pPr>
@@ -7409,6 +7408,61 @@
         </w:rPr>
         <w:t>This project uses a dashboard-based approach because the goal is to make supply chain data more usable for decision-making. The system includes interactive filters, KPI cards, charts, tables, risk scores, and forecast outputs. These features help users move from raw data to operational insight.</w:t>
       </w:r>
+    </w:p>
+    <w:p>
+      <w:pPr>
+        <w:rPr>
+          <w:lang w:val="en-US"/>
+        </w:rPr>
+      </w:pPr>
+      <w:r>
+        <w:rPr>
+          <w:lang w:val="en-US"/>
+        </w:rPr>
+        <w:t xml:space="preserve">Recent studies also emphasize that supply chain visibility improves coordination, responsiveness, and decision-making by making operational information more accessible across the supply chain network </w:t>
+      </w:r>
+      <w:sdt>
+        <w:sdtPr>
+          <w:rPr>
+            <w:lang w:val="en-US"/>
+          </w:rPr>
+          <w:id w:val="-130097898"/>
+          <w:citation/>
+        </w:sdtPr>
+        <w:sdtContent>
+          <w:r>
+            <w:rPr>
+              <w:lang w:val="en-US"/>
+            </w:rPr>
+            <w:fldChar w:fldCharType="begin"/>
+          </w:r>
+          <w:r>
+            <w:rPr>
+              <w:lang w:val="tr-TR"/>
+            </w:rPr>
+            <w:instrText xml:space="preserve"> CITATION Kal22 \l 1055 </w:instrText>
+          </w:r>
+          <w:r>
+            <w:rPr>
+              <w:lang w:val="en-US"/>
+            </w:rPr>
+            <w:fldChar w:fldCharType="separate"/>
+          </w:r>
+          <w:r>
+            <w:rPr>
+              <w:noProof/>
+              <w:lang w:val="tr-TR"/>
+            </w:rPr>
+            <w:t>(Kalaiarasan, Olhager, Agrawal, &amp; Wiktorsson, 2022)</w:t>
+          </w:r>
+          <w:r>
+            <w:rPr>
+              <w:lang w:val="en-US"/>
+            </w:rPr>
+            <w:fldChar w:fldCharType="end"/>
+          </w:r>
+        </w:sdtContent>
+      </w:sdt>
     </w:p>
     <w:p>
       <w:pPr>
@@ -7494,13 +7548,6 @@
           <w:lang w:val="en-US"/>
         </w:rPr>
       </w:pPr>
-    </w:p>
-    <w:p>
-      <w:pPr>
-        <w:rPr>
-          <w:lang w:val="en-US"/>
-        </w:rPr>
-      </w:pPr>
       <w:r>
         <w:rPr>
           <w:lang w:val="en-US"/>
@@ -7556,19 +7603,73 @@
           <w:lang w:val="en-US"/>
         </w:rPr>
       </w:pPr>
-    </w:p>
-    <w:p>
-      <w:pPr>
-        <w:rPr>
-          <w:lang w:val="en-US"/>
-        </w:rPr>
-      </w:pPr>
       <w:r>
         <w:rPr>
           <w:lang w:val="en-US"/>
         </w:rPr>
         <w:t>In this project, supply chain risk is calculated using rule-based and interpretable indicators. The system analyzes delivery risk, delay risk, inventory risk, demand volatility risk, and region-level risk. The purpose is not to create a complex black-box prediction model, but to provide a clear and understandable risk assessment structure for decision support.</w:t>
       </w:r>
+    </w:p>
+    <w:p>
+      <w:pPr>
+        <w:rPr>
+          <w:lang w:val="en-US"/>
+        </w:rPr>
+      </w:pPr>
+      <w:r>
+        <w:rPr>
+          <w:lang w:val="en-US"/>
+        </w:rPr>
+        <w:t>For this reason, interpretable risk indicators are useful in operational dashboards because they allow managers to identify problematic areas such as late deliveries, inventory shortages, and regional performance issues without relying on black-box models</w:t>
+      </w:r>
+      <w:r>
+        <w:rPr>
+          <w:lang w:val="en-US"/>
+        </w:rPr>
+        <w:t xml:space="preserve">. </w:t>
+      </w:r>
+      <w:sdt>
+        <w:sdtPr>
+          <w:rPr>
+            <w:lang w:val="en-US"/>
+          </w:rPr>
+          <w:id w:val="-1658459070"/>
+          <w:citation/>
+        </w:sdtPr>
+        <w:sdtContent>
+          <w:r>
+            <w:rPr>
+              <w:lang w:val="en-US"/>
+            </w:rPr>
+            <w:fldChar w:fldCharType="begin"/>
+          </w:r>
+          <w:r>
+            <w:rPr>
+              <w:lang w:val="tr-TR"/>
+            </w:rPr>
+            <w:instrText xml:space="preserve"> CITATION IBM24 \l 1055 </w:instrText>
+          </w:r>
+          <w:r>
+            <w:rPr>
+              <w:lang w:val="en-US"/>
+            </w:rPr>
+            <w:fldChar w:fldCharType="separate"/>
+          </w:r>
+          <w:r>
+            <w:rPr>
+              <w:noProof/>
+              <w:lang w:val="tr-TR"/>
+            </w:rPr>
+            <w:t>(IBM, 2024)</w:t>
+          </w:r>
+          <w:r>
+            <w:rPr>
+              <w:lang w:val="en-US"/>
+            </w:rPr>
+            <w:fldChar w:fldCharType="end"/>
+          </w:r>
+        </w:sdtContent>
+      </w:sdt>
     </w:p>
     <w:p>
       <w:pPr>
@@ -7654,13 +7755,6 @@
           <w:lang w:val="en-US"/>
         </w:rPr>
       </w:pPr>
-    </w:p>
-    <w:p>
-      <w:pPr>
-        <w:rPr>
-          <w:lang w:val="en-US"/>
-        </w:rPr>
-      </w:pPr>
       <w:r>
         <w:rPr>
           <w:lang w:val="en-US"/>
@@ -7716,13 +7810,6 @@
           <w:lang w:val="en-US"/>
         </w:rPr>
       </w:pPr>
-    </w:p>
-    <w:p>
-      <w:pPr>
-        <w:rPr>
-          <w:lang w:val="en-US"/>
-        </w:rPr>
-      </w:pPr>
       <w:r>
         <w:rPr>
           <w:lang w:val="en-US"/>
@@ -7749,7 +7836,6 @@
         <w:rPr>
           <w:lang w:val="en-US"/>
         </w:rPr>
-        <w:lastRenderedPageBreak/>
         <w:t>Demand Forecasting in Supply Chain Planning</w:t>
       </w:r>
       <w:bookmarkEnd w:id="18"/>
@@ -7815,18 +7901,18 @@
           <w:lang w:val="en-US"/>
         </w:rPr>
       </w:pPr>
-    </w:p>
-    <w:p>
-      <w:pPr>
-        <w:rPr>
-          <w:lang w:val="en-US"/>
-        </w:rPr>
-      </w:pPr>
-      <w:r>
-        <w:rPr>
-          <w:lang w:val="en-US"/>
-        </w:rPr>
-        <w:t xml:space="preserve">In supply chain dashboards, demand forecasting is often used together with historical demand analysis. Users can compare past demand patterns with forecasted values and evaluate whether demand is increasing, decreasing, or unstable. Forecast accuracy metrics can also help users understand how well a forecasting method performs. </w:t>
+      <w:r>
+        <w:rPr>
+          <w:lang w:val="en-US"/>
+        </w:rPr>
+        <w:t xml:space="preserve">In supply chain dashboards, demand forecasting is often used together with historical demand analysis. Users can compare past demand patterns with forecasted values and evaluate whether demand is increasing, decreasing, or </w:t>
+      </w:r>
+      <w:r>
+        <w:rPr>
+          <w:lang w:val="en-US"/>
+        </w:rPr>
+        <w:lastRenderedPageBreak/>
+        <w:t xml:space="preserve">unstable. Forecast accuracy metrics can also help users understand how well a forecasting method performs. </w:t>
       </w:r>
       <w:sdt>
         <w:sdtPr>
@@ -7877,19 +7963,73 @@
           <w:lang w:val="en-US"/>
         </w:rPr>
       </w:pPr>
-    </w:p>
-    <w:p>
-      <w:pPr>
-        <w:rPr>
-          <w:lang w:val="en-US"/>
-        </w:rPr>
-      </w:pPr>
       <w:r>
         <w:rPr>
           <w:lang w:val="en-US"/>
         </w:rPr>
         <w:t>In this project, the demand forecasting module uses historical monthly demand data. The platform includes simple forecasting methods such as moving average and linear regression. These methods are suitable for a dashboard prototype because they are understandable, easy to implement, and useful for demonstrating how demand data can be turned into future demand estimates.</w:t>
       </w:r>
+    </w:p>
+    <w:p>
+      <w:pPr>
+        <w:rPr>
+          <w:lang w:val="en-US"/>
+        </w:rPr>
+      </w:pPr>
+      <w:r>
+        <w:rPr>
+          <w:lang w:val="en-US"/>
+        </w:rPr>
+        <w:t>Moving average and regression-based models are commonly used as baseline forecasting approaches because they are simple, interpretable, and suitable for demonstrating demand trends in decision-support systems</w:t>
+      </w:r>
+      <w:r>
+        <w:rPr>
+          <w:lang w:val="en-US"/>
+        </w:rPr>
+        <w:t xml:space="preserve">. </w:t>
+      </w:r>
+      <w:sdt>
+        <w:sdtPr>
+          <w:rPr>
+            <w:lang w:val="en-US"/>
+          </w:rPr>
+          <w:id w:val="218019113"/>
+          <w:citation/>
+        </w:sdtPr>
+        <w:sdtContent>
+          <w:r>
+            <w:rPr>
+              <w:lang w:val="en-US"/>
+            </w:rPr>
+            <w:fldChar w:fldCharType="begin"/>
+          </w:r>
+          <w:r>
+            <w:rPr>
+              <w:lang w:val="tr-TR"/>
+            </w:rPr>
+            <w:instrText xml:space="preserve"> CITATION Hyn21 \l 1055 </w:instrText>
+          </w:r>
+          <w:r>
+            <w:rPr>
+              <w:lang w:val="en-US"/>
+            </w:rPr>
+            <w:fldChar w:fldCharType="separate"/>
+          </w:r>
+          <w:r>
+            <w:rPr>
+              <w:noProof/>
+              <w:lang w:val="tr-TR"/>
+            </w:rPr>
+            <w:t>(Hyndman &amp; Athanasopoulos, 2021)</w:t>
+          </w:r>
+          <w:r>
+            <w:rPr>
+              <w:lang w:val="en-US"/>
+            </w:rPr>
+            <w:fldChar w:fldCharType="end"/>
+          </w:r>
+        </w:sdtContent>
+      </w:sdt>
     </w:p>
     <w:p>
       <w:pPr>
@@ -7975,13 +8115,6 @@
           <w:lang w:val="en-US"/>
         </w:rPr>
       </w:pPr>
-    </w:p>
-    <w:p>
-      <w:pPr>
-        <w:rPr>
-          <w:lang w:val="en-US"/>
-        </w:rPr>
-      </w:pPr>
       <w:r>
         <w:rPr>
           <w:lang w:val="en-US"/>
@@ -7995,13 +8128,6 @@
           <w:lang w:val="en-US"/>
         </w:rPr>
       </w:pPr>
-    </w:p>
-    <w:p>
-      <w:pPr>
-        <w:rPr>
-          <w:lang w:val="en-US"/>
-        </w:rPr>
-      </w:pPr>
       <w:r>
         <w:rPr>
           <w:lang w:val="en-US"/>
@@ -8015,6 +8141,81 @@
           <w:lang w:val="en-US"/>
         </w:rPr>
       </w:pPr>
+      <w:r>
+        <w:rPr>
+          <w:lang w:val="en-US"/>
+        </w:rPr>
+        <w:t xml:space="preserve">The </w:t>
+      </w:r>
+      <w:proofErr w:type="spellStart"/>
+      <w:r>
+        <w:rPr>
+          <w:lang w:val="en-US"/>
+        </w:rPr>
+        <w:t>DataCo</w:t>
+      </w:r>
+      <w:proofErr w:type="spellEnd"/>
+      <w:r>
+        <w:rPr>
+          <w:lang w:val="en-US"/>
+        </w:rPr>
+        <w:t xml:space="preserve"> supply chain dataset is suitable for this prototype because it contains order, customer, product, shipment, sales, and delivery-related fields that can be transformed into dashboard-ready analytical tables</w:t>
+      </w:r>
+      <w:r>
+        <w:rPr>
+          <w:lang w:val="en-US"/>
+        </w:rPr>
+        <w:t xml:space="preserve">. </w:t>
+      </w:r>
+      <w:sdt>
+        <w:sdtPr>
+          <w:rPr>
+            <w:lang w:val="en-US"/>
+          </w:rPr>
+          <w:id w:val="-562795329"/>
+          <w:citation/>
+        </w:sdtPr>
+        <w:sdtContent>
+          <w:r>
+            <w:rPr>
+              <w:lang w:val="en-US"/>
+            </w:rPr>
+            <w:fldChar w:fldCharType="begin"/>
+          </w:r>
+          <w:r>
+            <w:rPr>
+              <w:lang w:val="tr-TR"/>
+            </w:rPr>
+            <w:instrText xml:space="preserve"> CITATION Kagnd \l 1055 </w:instrText>
+          </w:r>
+          <w:r>
+            <w:rPr>
+              <w:lang w:val="en-US"/>
+            </w:rPr>
+            <w:fldChar w:fldCharType="separate"/>
+          </w:r>
+          <w:r>
+            <w:rPr>
+              <w:noProof/>
+              <w:lang w:val="tr-TR"/>
+            </w:rPr>
+            <w:t>(Kaggle, n.d.)</w:t>
+          </w:r>
+          <w:r>
+            <w:rPr>
+              <w:lang w:val="en-US"/>
+            </w:rPr>
+            <w:fldChar w:fldCharType="end"/>
+          </w:r>
+        </w:sdtContent>
+      </w:sdt>
+    </w:p>
+    <w:p>
+      <w:pPr>
+        <w:rPr>
+          <w:lang w:val="en-US"/>
+        </w:rPr>
+      </w:pPr>
     </w:p>
     <w:p>
       <w:pPr>
@@ -8044,13 +8245,6 @@
         </w:rPr>
         <w:t>The reviewed concepts show that supply chain visibility, dashboard-based decision support, risk assessment, digital transformation, forecasting, and data standardization are strongly connected. Supply chain visibility helps managers monitor operational activities. Business intelligence dashboards make complex data easier to understand. Risk management supports the identification of delivery, inventory, demand, and regional risks. Forecasting helps users observe future demand trends. Data standardization allows different datasets to be used in a common dashboard structure.</w:t>
       </w:r>
-    </w:p>
-    <w:p>
-      <w:pPr>
-        <w:rPr>
-          <w:lang w:val="en-US"/>
-        </w:rPr>
-      </w:pPr>
     </w:p>
     <w:p>
       <w:pPr>
@@ -8113,95 +8307,526 @@
         <w:rPr>
           <w:lang w:val="en-US"/>
         </w:rPr>
-        <w:br/>
-      </w:r>
-      <w:r>
-        <w:rPr>
-          <w:lang w:val="en-US"/>
-        </w:rPr>
-        <w:br/>
-        <w:t xml:space="preserve">The system includes a Data Source Manager that supports column mapping and dataset standardization. This means that different datasets with different column names can be mapped to a common supply chain schema. After the </w:t>
+        <w:t>The system includes a Data Source Manager that supports column mapping and dataset standardization. This means that different datasets with different column names can be mapped to a common supply chain schema. After the mapping process, the system converts the uploaded dataset into standardized analytical tables and uses these tables across all dashboard pages.</w:t>
+      </w:r>
+    </w:p>
+    <w:p>
+      <w:pPr>
+        <w:rPr>
+          <w:lang w:val="en-US"/>
+        </w:rPr>
+      </w:pPr>
+      <w:r>
+        <w:rPr>
+          <w:lang w:val="en-US"/>
+        </w:rPr>
+        <w:t xml:space="preserve">Another original aspect of the project is the integration of multiple supply chain analysis areas </w:t>
+      </w:r>
+      <w:proofErr w:type="gramStart"/>
+      <w:r>
+        <w:rPr>
+          <w:lang w:val="en-US"/>
+        </w:rPr>
+        <w:t>in</w:t>
+      </w:r>
+      <w:proofErr w:type="gramEnd"/>
+      <w:r>
+        <w:rPr>
+          <w:lang w:val="en-US"/>
+        </w:rPr>
+        <w:t xml:space="preserve"> one platform. The system does not only show order or sales information. It combines executive KPIs, regional performance analysis, inventory control indicators, shipment performance, supply chain risk scoring, and demand forecasting. This makes the project closer to a decision-support platform rather than a simple visualization page.</w:t>
+      </w:r>
+    </w:p>
+    <w:p>
+      <w:pPr>
+        <w:rPr>
+          <w:lang w:val="en-US"/>
+        </w:rPr>
+      </w:pPr>
+      <w:r>
+        <w:rPr>
+          <w:lang w:val="en-US"/>
+        </w:rPr>
+        <w:t xml:space="preserve">The risk analysis structure is also designed to be understandable for users. Instead of using a black-box model, the project uses rule-based and interpretable risk indicators such as late delivery rate, delay days, inventory status, </w:t>
       </w:r>
       <w:r>
         <w:rPr>
           <w:lang w:val="en-US"/>
         </w:rPr>
         <w:lastRenderedPageBreak/>
-        <w:t>mapping process, the system converts the uploaded dataset into standardized analytical tables and uses these tables across all dashboard pages.</w:t>
-      </w:r>
-    </w:p>
-    <w:p>
-      <w:pPr>
-        <w:rPr>
-          <w:lang w:val="en-US"/>
-        </w:rPr>
-      </w:pPr>
-      <w:r>
-        <w:rPr>
-          <w:lang w:val="en-US"/>
-        </w:rPr>
-        <w:br/>
-      </w:r>
-      <w:r>
-        <w:rPr>
-          <w:lang w:val="en-US"/>
-        </w:rPr>
-        <w:br/>
-        <w:t xml:space="preserve">Another original aspect of the project is the integration of multiple supply chain analysis areas </w:t>
+        <w:t>demand volatility, and regional performance. This helps users understand why a specific market, region, shipment mode, or product category may be risky.</w:t>
+      </w:r>
+    </w:p>
+    <w:p>
+      <w:pPr>
+        <w:rPr>
+          <w:lang w:val="en-US"/>
+        </w:rPr>
+      </w:pPr>
+      <w:r>
+        <w:rPr>
+          <w:lang w:val="en-US"/>
+        </w:rPr>
+        <w:t>The project is original within its academic scope because it combines data upload, schema mapping, data standardization, dynamic dashboard generation, risk analysis, and forecasting in a single Streamlit-based system. Therefore, the main contribution of the project is the development of a reusable supply chain visibility and risk assessment platform that can work with both a default dataset and user-uploaded datasets.</w:t>
+      </w:r>
+    </w:p>
+    <w:p>
+      <w:pPr>
+        <w:rPr>
+          <w:lang w:val="en-US"/>
+        </w:rPr>
+      </w:pPr>
+    </w:p>
+    <w:p>
+      <w:pPr>
+        <w:pStyle w:val="Heading1"/>
+        <w:rPr>
+          <w:lang w:val="en-US"/>
+        </w:rPr>
+      </w:pPr>
+      <w:bookmarkStart w:id="23" w:name="_Toc230437513"/>
+      <w:r>
+        <w:rPr>
+          <w:lang w:val="en-US"/>
+        </w:rPr>
+        <w:t>PROBLEM DEFINITION</w:t>
+      </w:r>
+      <w:bookmarkEnd w:id="23"/>
+    </w:p>
+    <w:p>
+      <w:pPr>
+        <w:rPr>
+          <w:lang w:val="en-US"/>
+        </w:rPr>
+      </w:pPr>
+      <w:r>
+        <w:rPr>
+          <w:lang w:val="en-US"/>
+        </w:rPr>
+        <w:t>Supply chain operations produce large amounts of data related to orders, products, shipments, delivery performance, inventory, regions, sales, and demand. However, this data is often stored in different files, systems, or formats. When the data is not standardized and analyzed together, it becomes difficult for managers to understand the overall performance of the supply chain.</w:t>
+      </w:r>
+    </w:p>
+    <w:p>
+      <w:pPr>
+        <w:rPr>
+          <w:lang w:val="en-US"/>
+        </w:rPr>
+      </w:pPr>
+      <w:r>
+        <w:rPr>
+          <w:lang w:val="en-US"/>
+        </w:rPr>
+        <w:t>One of the main problems is the lack of integrated visibility. A manager may need to check different reports to understand late deliveries, shipment delays, inventory warnings, regional performance, and demand changes. This slows down decision-making and increases the risk of missing important operational problems.</w:t>
+      </w:r>
+    </w:p>
+    <w:p>
+      <w:pPr>
+        <w:rPr>
+          <w:lang w:val="en-US"/>
+        </w:rPr>
+      </w:pPr>
+      <w:r>
+        <w:rPr>
+          <w:lang w:val="en-US"/>
+        </w:rPr>
+        <w:t>Another problem is that many dashboard systems are designed for a single prepared dataset. If a new dataset has different column names or a different structure, the dashboard may not work without manual code changes. This limits the reusability of the system. For example, one dataset may use “order date,” while another dataset may use “PO created date” for the same concept. Without a standard mapping and transformation process, these datasets cannot be analyzed through the same dashboard structure.</w:t>
+      </w:r>
+    </w:p>
+    <w:p>
+      <w:pPr>
+        <w:rPr>
+          <w:lang w:val="en-US"/>
+        </w:rPr>
+      </w:pPr>
+      <w:r>
+        <w:rPr>
+          <w:lang w:val="en-US"/>
+        </w:rPr>
+        <w:t>There is also a risk assessment problem. Supply chain risk should not be evaluated by looking at only one indicator. Late delivery rate, average delay days, inventory status, demand volatility, regional performance, and financial indicators can all affect operational risk. If these indicators are not combined in a clear way, users may not understand which areas of the supply chain require attention.</w:t>
+      </w:r>
+    </w:p>
+    <w:p>
+      <w:pPr>
+        <w:rPr>
+          <w:lang w:val="en-US"/>
+        </w:rPr>
+      </w:pPr>
+      <w:r>
+        <w:rPr>
+          <w:lang w:val="en-US"/>
+        </w:rPr>
+        <w:t>Therefore, the main problem addressed in this project is the need for a reusable and interactive decision-support platform that can transform different supply chain datasets into a standard analytical format and generate visibility dashboards and risk analysis from the active dataset.</w:t>
+      </w:r>
+    </w:p>
+    <w:p>
+      <w:pPr>
+        <w:rPr>
+          <w:lang w:val="en-US"/>
+        </w:rPr>
+      </w:pPr>
+    </w:p>
+    <w:p>
+      <w:pPr>
+        <w:pStyle w:val="Heading1"/>
+        <w:rPr>
+          <w:lang w:val="en-US"/>
+        </w:rPr>
+      </w:pPr>
+      <w:bookmarkStart w:id="24" w:name="_Toc230437514"/>
+      <w:r>
+        <w:rPr>
+          <w:lang w:val="en-US"/>
+        </w:rPr>
+        <w:t>SOLUTION APPROACH</w:t>
+      </w:r>
+      <w:bookmarkEnd w:id="24"/>
+    </w:p>
+    <w:p>
+      <w:pPr>
+        <w:rPr>
+          <w:lang w:val="en-US"/>
+        </w:rPr>
+      </w:pPr>
+      <w:r>
+        <w:rPr>
+          <w:lang w:val="en-US"/>
+        </w:rPr>
+        <w:t>The solution approach of this project is based on developing a dataset-adaptive supply chain dashboard platform. The system is designed to work with a default demonstration dataset and also with user-uploaded supply chain datasets. The main idea is to transform different supply chain datasets into a common analytical structure and then generate dashboard modules from the active dataset.</w:t>
+      </w:r>
+    </w:p>
+    <w:p>
+      <w:pPr>
+        <w:pStyle w:val="Heading2"/>
+        <w:rPr>
+          <w:lang w:val="en-US"/>
+        </w:rPr>
+      </w:pPr>
+      <w:bookmarkStart w:id="25" w:name="_Toc230437515"/>
+      <w:r>
+        <w:rPr>
+          <w:lang w:val="en-US"/>
+        </w:rPr>
+        <w:t>Overall Approach</w:t>
+      </w:r>
+      <w:bookmarkEnd w:id="25"/>
+    </w:p>
+    <w:p>
+      <w:pPr>
+        <w:rPr>
+          <w:lang w:val="en-US"/>
+        </w:rPr>
+      </w:pPr>
+      <w:r>
+        <w:rPr>
+          <w:lang w:val="en-US"/>
+        </w:rPr>
+        <w:t>The project follows a data-driven decision-support approach. First, supply chain data is collected or uploaded into the system. Then, the data is cleaned, standardized, and transformed into dashboard-ready analytical tables. After this transformation, the dashboard modules calculate KPIs, generate visualizations, and support risk assessment.</w:t>
+      </w:r>
+    </w:p>
+    <w:p>
+      <w:pPr>
+        <w:rPr>
+          <w:lang w:val="en-US"/>
+        </w:rPr>
+      </w:pPr>
+      <w:r>
+        <w:rPr>
+          <w:lang w:val="en-US"/>
+        </w:rPr>
+        <w:t>The platform uses the DataCo Smart Supply Chain dataset as the default dataset. This dataset is processed into different analytical tables such as orders, products, shipments, inventory, demand, and risk scores. These tables are used by the default dashboard when no uploaded dataset is active.</w:t>
+      </w:r>
+    </w:p>
+    <w:p>
+      <w:pPr>
+        <w:rPr>
+          <w:lang w:val="en-US"/>
+        </w:rPr>
+      </w:pPr>
+      <w:r>
+        <w:rPr>
+          <w:lang w:val="en-US"/>
+        </w:rPr>
+        <w:t>However, the project is not limited to the default dataset. Users can upload a new company supply chain dataset in CSV or Excel format. The uploaded dataset is mapped to a standard schema through the Data Source Manager. After the mapping process, the system creates the same type of analytical tables and updates the dashboard pages according to the uploaded dataset.</w:t>
+      </w:r>
+    </w:p>
+    <w:p>
+      <w:pPr>
+        <w:rPr>
+          <w:lang w:val="en-US"/>
+        </w:rPr>
+      </w:pPr>
+    </w:p>
+    <w:p>
+      <w:pPr>
+        <w:pStyle w:val="Heading2"/>
+        <w:rPr>
+          <w:lang w:val="en-US"/>
+        </w:rPr>
+      </w:pPr>
+      <w:bookmarkStart w:id="26" w:name="_Toc230437516"/>
+      <w:r>
+        <w:rPr>
+          <w:lang w:val="en-US"/>
+        </w:rPr>
+        <w:t>Dataset Upload and Standardization</w:t>
+      </w:r>
+      <w:bookmarkEnd w:id="26"/>
+      <w:r>
+        <w:rPr>
+          <w:lang w:val="en-US"/>
+        </w:rPr>
+        <w:t xml:space="preserve"> </w:t>
+      </w:r>
+    </w:p>
+    <w:p>
+      <w:pPr>
+        <w:rPr>
+          <w:lang w:val="en-US"/>
+        </w:rPr>
+      </w:pPr>
+      <w:r>
+        <w:rPr>
+          <w:lang w:val="en-US"/>
+        </w:rPr>
+        <w:t>The dataset upload feature is one of the main parts of the solution. Different supply chain datasets may use different column names for similar concepts. For example, one dataset may use “order date,” another may use “PO created date,” and another may use “created at.” To solve this problem, the platform includes a column mapping process.</w:t>
+      </w:r>
+    </w:p>
+    <w:p>
+      <w:pPr>
+        <w:rPr>
+          <w:lang w:val="en-US"/>
+        </w:rPr>
+      </w:pPr>
+      <w:r>
+        <w:rPr>
+          <w:lang w:val="en-US"/>
+        </w:rPr>
+        <w:t xml:space="preserve">In the Data Source Manager, users map the columns of the uploaded dataset to the standard supply chain </w:t>
       </w:r>
       <w:proofErr w:type="gramStart"/>
       <w:r>
         <w:rPr>
           <w:lang w:val="en-US"/>
         </w:rPr>
-        <w:t>in</w:t>
+        <w:t>schema</w:t>
       </w:r>
       <w:proofErr w:type="gramEnd"/>
       <w:r>
         <w:rPr>
           <w:lang w:val="en-US"/>
         </w:rPr>
-        <w:t xml:space="preserve"> one platform. The system does not only show order or sales information. It combines executive KPIs, regional performance analysis, inventory control indicators, shipment performance, supply chain risk scoring, and demand forecasting. This makes the project closer to a decision-support platform rather than a simple visualization page.</w:t>
-      </w:r>
-    </w:p>
-    <w:p>
-      <w:pPr>
-        <w:rPr>
-          <w:lang w:val="en-US"/>
-        </w:rPr>
-      </w:pPr>
-      <w:r>
-        <w:rPr>
-          <w:lang w:val="en-US"/>
-        </w:rPr>
-        <w:br/>
-      </w:r>
-      <w:r>
-        <w:rPr>
-          <w:lang w:val="en-US"/>
-        </w:rPr>
-        <w:br/>
-        <w:t>The risk analysis structure is also designed to be understandable for users. Instead of using a black-box model, the project uses rule-based and interpretable risk indicators such as late delivery rate, delay days, inventory status, demand volatility, and regional performance. This helps users understand why a specific market, region, shipment mode, or product category may be risky.</w:t>
-      </w:r>
-    </w:p>
-    <w:p>
-      <w:pPr>
-        <w:rPr>
-          <w:lang w:val="en-US"/>
-        </w:rPr>
-      </w:pPr>
-      <w:r>
-        <w:rPr>
-          <w:lang w:val="en-US"/>
-        </w:rPr>
-        <w:br/>
-      </w:r>
-      <w:r>
-        <w:rPr>
-          <w:lang w:val="en-US"/>
-        </w:rPr>
-        <w:br/>
-        <w:t>The project is original within its academic scope because it combines data upload, schema mapping, data standardization, dynamic dashboard generation, risk analysis, and forecasting in a single Streamlit-based system. Therefore, the main contribution of the project is the development of a reusable supply chain visibility and risk assessment platform that can work with both a default dataset and user-uploaded datasets.</w:t>
+        <w:t xml:space="preserve">. The required fields include order ID, order date, product name, category name, and order quantity. Optional fields </w:t>
+      </w:r>
+      <w:r>
+        <w:rPr>
+          <w:lang w:val="en-US"/>
+        </w:rPr>
+        <w:lastRenderedPageBreak/>
+        <w:t>include shipping date, scheduled delivery date, delivery status, actual shipping days, scheduled shipping days, shipping mode, market, region, country, sales, and profit.</w:t>
+      </w:r>
+    </w:p>
+    <w:p>
+      <w:pPr>
+        <w:rPr>
+          <w:lang w:val="en-US"/>
+        </w:rPr>
+      </w:pPr>
+      <w:r>
+        <w:rPr>
+          <w:lang w:val="en-US"/>
+        </w:rPr>
+        <w:t>After the mapping is completed, the system standardizes the uploaded dataset. It converts date fields, numeric fields, and text fields into a common format. It also derives additional indicators where possible. For example, if actual shipping days and scheduled shipping days are not available, the system can calculate delay days by comparing delivered date and scheduled delivery date.</w:t>
+      </w:r>
+    </w:p>
+    <w:p>
+      <w:pPr>
+        <w:rPr>
+          <w:lang w:val="en-US"/>
+        </w:rPr>
+      </w:pPr>
+    </w:p>
+    <w:p>
+      <w:pPr>
+        <w:pStyle w:val="Heading2"/>
+        <w:rPr>
+          <w:lang w:val="en-US"/>
+        </w:rPr>
+      </w:pPr>
+      <w:bookmarkStart w:id="27" w:name="_Toc230437517"/>
+      <w:r>
+        <w:rPr>
+          <w:lang w:val="en-US"/>
+        </w:rPr>
+        <w:t>Dynamic Dashboard Generation</w:t>
+      </w:r>
+      <w:bookmarkEnd w:id="27"/>
+      <w:r>
+        <w:rPr>
+          <w:lang w:val="en-US"/>
+        </w:rPr>
+        <w:t xml:space="preserve"> </w:t>
+      </w:r>
+    </w:p>
+    <w:p>
+      <w:pPr>
+        <w:rPr>
+          <w:lang w:val="en-US"/>
+        </w:rPr>
+      </w:pPr>
+      <w:r>
+        <w:rPr>
+          <w:lang w:val="en-US"/>
+        </w:rPr>
+        <w:t>After the dataset is standardized, the dashboard pages are generated from the active dataset. If no uploaded dataset is active, the dashboard uses the default DataCo dataset. If the user uploads and activates a new dataset, all dashboard pages use the uploaded dataset during the active Streamlit session.</w:t>
+      </w:r>
+    </w:p>
+    <w:p>
+      <w:pPr>
+        <w:rPr>
+          <w:lang w:val="en-US"/>
+        </w:rPr>
+      </w:pPr>
+      <w:r>
+        <w:rPr>
+          <w:lang w:val="en-US"/>
+        </w:rPr>
+        <w:t>The dashboard includes six main modules: Overview, Regional Performance, Inventory Control, Shipment Performance, Supply Chain Risk, and Demand Forecast. Each module focuses on a different part of supply chain visibility. The Overview page shows general KPIs and summary charts. The Regional Performance page compares markets and regions. The Inventory Control page shows generated inventory indicators. The Shipment Performance page analyzes delivery and delay performance. The Supply Chain Risk page calculates risk indicators. The Demand Forecast page analyzes historical demand and creates simple forecasts.</w:t>
+      </w:r>
+    </w:p>
+    <w:p>
+      <w:pPr>
+        <w:rPr>
+          <w:lang w:val="en-US"/>
+        </w:rPr>
+      </w:pPr>
+      <w:r>
+        <w:rPr>
+          <w:lang w:val="en-US"/>
+        </w:rPr>
+        <w:t>This structure allows the system to work as a flexible platform instead of a static dashboard. The same dashboard pages can be used with different supply chain datasets as long as the required fields are mapped correctly.</w:t>
+      </w:r>
+    </w:p>
+    <w:p>
+      <w:pPr>
+        <w:rPr>
+          <w:lang w:val="en-US"/>
+        </w:rPr>
+      </w:pPr>
+    </w:p>
+    <w:p>
+      <w:pPr>
+        <w:pStyle w:val="Heading2"/>
+        <w:rPr>
+          <w:lang w:val="en-US"/>
+        </w:rPr>
+      </w:pPr>
+      <w:bookmarkStart w:id="28" w:name="_Toc230437518"/>
+      <w:r>
+        <w:rPr>
+          <w:lang w:val="en-US"/>
+        </w:rPr>
+        <w:t>Risk Assessment Approach</w:t>
+      </w:r>
+      <w:bookmarkEnd w:id="28"/>
+      <w:r>
+        <w:rPr>
+          <w:lang w:val="en-US"/>
+        </w:rPr>
+        <w:t xml:space="preserve"> </w:t>
+      </w:r>
+    </w:p>
+    <w:p>
+      <w:pPr>
+        <w:rPr>
+          <w:lang w:val="en-US"/>
+        </w:rPr>
+      </w:pPr>
+      <w:r>
+        <w:rPr>
+          <w:lang w:val="en-US"/>
+        </w:rPr>
+        <w:t>The risk assessment approach is rule-based and interpretable. The purpose of the risk model is not to create a complex black-box prediction system. Instead, the aim is to provide clear risk indicators that users can understand and discuss.</w:t>
+      </w:r>
+    </w:p>
+    <w:p>
+      <w:pPr>
+        <w:rPr>
+          <w:lang w:val="en-US"/>
+        </w:rPr>
+      </w:pPr>
+      <w:r>
+        <w:rPr>
+          <w:lang w:val="en-US"/>
+        </w:rPr>
+        <w:t>The platform uses different rule-based risk scores for different analysis levels, including overall supply chain risk, regional risk, and category-level risk. The overall risk score combines delivery risk, inventory risk, delay risk, and demand volatility risk, while regional and category-level scores use related operational indicators such as late delivery rate, delay days, profit risk, and inventory condition.</w:t>
+      </w:r>
+    </w:p>
+    <w:p>
+      <w:pPr>
+        <w:rPr>
+          <w:lang w:val="en-US"/>
+        </w:rPr>
+      </w:pPr>
+      <w:r>
+        <w:rPr>
+          <w:lang w:val="en-US"/>
+        </w:rPr>
+        <w:t>This approach is suitable for a graduation thesis prototype because it provides a transparent decision-support structure. Users can understand which factors affect the risk score and can use the dashboard to explore risky regions, shipment modes, categories, and inventory items.</w:t>
+      </w:r>
+    </w:p>
+    <w:p>
+      <w:pPr>
+        <w:rPr>
+          <w:lang w:val="en-US"/>
+        </w:rPr>
+      </w:pPr>
+    </w:p>
+    <w:p>
+      <w:pPr>
+        <w:pStyle w:val="Heading2"/>
+        <w:rPr>
+          <w:lang w:val="en-US"/>
+        </w:rPr>
+      </w:pPr>
+      <w:bookmarkStart w:id="29" w:name="_Toc230437519"/>
+      <w:r>
+        <w:rPr>
+          <w:lang w:val="en-US"/>
+        </w:rPr>
+        <w:t>Forecasting Approach</w:t>
+      </w:r>
+      <w:bookmarkEnd w:id="29"/>
+      <w:r>
+        <w:rPr>
+          <w:lang w:val="en-US"/>
+        </w:rPr>
+        <w:t xml:space="preserve"> </w:t>
+      </w:r>
+    </w:p>
+    <w:p>
+      <w:pPr>
+        <w:rPr>
+          <w:lang w:val="en-US"/>
+        </w:rPr>
+      </w:pPr>
+      <w:r>
+        <w:rPr>
+          <w:lang w:val="en-US"/>
+        </w:rPr>
+        <w:t>The platform also includes a demand forecasting module. This module uses historical monthly demand values and applies simple forecasting methods such as moving average and linear regression. The purpose is to show how historical demand data can be used to estimate future demand patterns.</w:t>
+      </w:r>
+    </w:p>
+    <w:p>
+      <w:pPr>
+        <w:rPr>
+          <w:lang w:val="en-US"/>
+        </w:rPr>
+      </w:pPr>
+      <w:r>
+        <w:rPr>
+          <w:lang w:val="en-US"/>
+        </w:rPr>
+        <w:t>The forecasting module also includes basic performance evaluation metrics such as MAE and MAPE. These metrics help users compare forecast accuracy and understand the reliability of the forecast results. Since the project focuses mainly on supply chain visibility and risk assessment, the forecasting module is designed as a planning-support feature rather than an advanced forecasting system.</w:t>
       </w:r>
     </w:p>
     <w:p>
@@ -8218,143 +8843,34 @@
           <w:lang w:val="en-US"/>
         </w:rPr>
       </w:pPr>
-      <w:bookmarkStart w:id="23" w:name="_Toc230437513"/>
-      <w:r>
-        <w:rPr>
-          <w:lang w:val="en-US"/>
-        </w:rPr>
-        <w:t>PROBLEM DEFINITION</w:t>
-      </w:r>
-      <w:bookmarkEnd w:id="23"/>
-    </w:p>
-    <w:p>
-      <w:pPr>
-        <w:rPr>
-          <w:lang w:val="en-US"/>
-        </w:rPr>
-      </w:pPr>
-      <w:r>
-        <w:rPr>
-          <w:lang w:val="en-US"/>
-        </w:rPr>
-        <w:t>Supply chain operations produce large amounts of data related to orders, products, shipments, delivery performance, inventory, regions, sales, and demand. However, this data is often stored in different files, systems, or formats. When the data is not standardized and analyzed together, it becomes difficult for managers to understand the overall performance of the supply chain.</w:t>
-      </w:r>
-    </w:p>
-    <w:p>
-      <w:pPr>
-        <w:rPr>
-          <w:lang w:val="en-US"/>
-        </w:rPr>
-      </w:pPr>
-      <w:r>
-        <w:rPr>
-          <w:lang w:val="en-US"/>
-        </w:rPr>
-        <w:br/>
-      </w:r>
-      <w:r>
-        <w:rPr>
-          <w:lang w:val="en-US"/>
-        </w:rPr>
-        <w:br/>
-        <w:t>One of the main problems is the lack of integrated visibility. A manager may need to check different reports to understand late deliveries, shipment delays, inventory warnings, regional performance, and demand changes. This slows down decision-making and increases the risk of missing important operational problems.</w:t>
-      </w:r>
-    </w:p>
-    <w:p>
-      <w:pPr>
-        <w:rPr>
-          <w:lang w:val="en-US"/>
-        </w:rPr>
-      </w:pPr>
-      <w:r>
-        <w:rPr>
-          <w:lang w:val="en-US"/>
-        </w:rPr>
-        <w:br/>
-      </w:r>
-      <w:r>
-        <w:rPr>
-          <w:lang w:val="en-US"/>
-        </w:rPr>
-        <w:br/>
-        <w:t>Another problem is that many dashboard systems are designed for a single prepared dataset. If a new dataset has different column names or a different structure, the dashboard may not work without manual code changes. This limits the reusability of the system. For example, one dataset may use “order date,” while another dataset may use “PO created date” for the same concept. Without a standard mapping and transformation process, these datasets cannot be analyzed through the same dashboard structure.</w:t>
-      </w:r>
-    </w:p>
-    <w:p>
-      <w:pPr>
-        <w:rPr>
-          <w:lang w:val="en-US"/>
-        </w:rPr>
-      </w:pPr>
-      <w:r>
-        <w:rPr>
-          <w:lang w:val="en-US"/>
-        </w:rPr>
-        <w:br/>
-      </w:r>
-      <w:r>
-        <w:rPr>
-          <w:lang w:val="en-US"/>
-        </w:rPr>
-        <w:br/>
-        <w:t>There is also a risk assessment problem. Supply chain risk should not be evaluated by looking at only one indicator. Late delivery rate, average delay days, inventory status, demand volatility, regional performance, and financial indicators can all affect operational risk. If these indicators are not combined in a clear way, users may not understand which areas of the supply chain require attention.</w:t>
-      </w:r>
-    </w:p>
-    <w:p>
-      <w:pPr>
-        <w:rPr>
-          <w:lang w:val="en-US"/>
-        </w:rPr>
-      </w:pPr>
-      <w:r>
-        <w:rPr>
-          <w:lang w:val="en-US"/>
-        </w:rPr>
-        <w:br/>
-      </w:r>
-      <w:r>
-        <w:rPr>
-          <w:lang w:val="en-US"/>
-        </w:rPr>
-        <w:br/>
-        <w:t>Therefore, the main problem addressed in this project is the need for a reusable and interactive decision-support platform that can transform different supply chain datasets into a standard analytical format and generate visibility dashboards and risk analysis from the active dataset.</w:t>
-      </w:r>
-    </w:p>
-    <w:p>
-      <w:pPr>
-        <w:rPr>
-          <w:lang w:val="en-US"/>
-        </w:rPr>
-      </w:pPr>
-    </w:p>
-    <w:p>
-      <w:pPr>
-        <w:pStyle w:val="Heading1"/>
-        <w:rPr>
-          <w:lang w:val="en-US"/>
-        </w:rPr>
-      </w:pPr>
-      <w:bookmarkStart w:id="24" w:name="_Toc230437514"/>
-      <w:r>
-        <w:rPr>
-          <w:lang w:val="en-US"/>
-        </w:rPr>
-        <w:t>SOLUTION APPROACH</w:t>
-      </w:r>
-      <w:bookmarkEnd w:id="24"/>
-    </w:p>
-    <w:p>
-      <w:pPr>
-        <w:rPr>
-          <w:lang w:val="en-US"/>
-        </w:rPr>
-      </w:pPr>
-      <w:r>
-        <w:rPr>
-          <w:lang w:val="en-US"/>
-        </w:rPr>
-        <w:t>The solution approach of this project is based on developing a dataset-adaptive supply chain dashboard platform. The system is designed to work with a default demonstration dataset and also with user-uploaded supply chain datasets. The main idea is to transform different supply chain datasets into a common analytical structure and then generate dashboard modules from the active dataset.</w:t>
-      </w:r>
+      <w:bookmarkStart w:id="30" w:name="_Toc230437520"/>
+      <w:r>
+        <w:rPr>
+          <w:lang w:val="en-US"/>
+        </w:rPr>
+        <w:t>REQUIRED TOOLS</w:t>
+      </w:r>
+      <w:bookmarkEnd w:id="30"/>
+    </w:p>
+    <w:p>
+      <w:pPr>
+        <w:rPr>
+          <w:lang w:val="en-US"/>
+        </w:rPr>
+      </w:pPr>
+      <w:r>
+        <w:rPr>
+          <w:lang w:val="en-US"/>
+        </w:rPr>
+        <w:t>This project was developed by using Python-based data analysis and dashboard development tools. The selected tools were chosen because they are open-source, widely used, and suitable for building a supply chain analytics prototype.</w:t>
+      </w:r>
+    </w:p>
+    <w:p>
+      <w:pPr>
+        <w:rPr>
+          <w:lang w:val="en-US"/>
+        </w:rPr>
+      </w:pPr>
     </w:p>
     <w:p>
       <w:pPr>
@@ -8363,471 +8879,45 @@
           <w:lang w:val="en-US"/>
         </w:rPr>
       </w:pPr>
-      <w:bookmarkStart w:id="25" w:name="_Toc230437515"/>
+      <w:bookmarkStart w:id="31" w:name="_Toc230437521"/>
+      <w:r>
+        <w:rPr>
+          <w:lang w:val="en-US"/>
+        </w:rPr>
+        <w:t>Programming and Development Environment</w:t>
+      </w:r>
+      <w:bookmarkEnd w:id="31"/>
+      <w:r>
+        <w:rPr>
+          <w:lang w:val="en-US"/>
+        </w:rPr>
+        <w:t xml:space="preserve"> </w:t>
+      </w:r>
+    </w:p>
+    <w:p>
+      <w:pPr>
+        <w:rPr>
+          <w:lang w:val="en-US"/>
+        </w:rPr>
+      </w:pPr>
+      <w:r>
+        <w:rPr>
+          <w:lang w:val="en-US"/>
+        </w:rPr>
+        <w:t>Python was used as the main programming language of the project. It was used for data cleaning, data transformation, KPI calculation, risk score generation, demand forecasting, and dashboard development. Visual Studio Code was used as the development environment for writing and editing the project files.</w:t>
+      </w:r>
+    </w:p>
+    <w:p>
+      <w:pPr>
+        <w:rPr>
+          <w:lang w:val="en-US"/>
+        </w:rPr>
+      </w:pPr>
       <w:r>
         <w:rPr>
           <w:lang w:val="en-US"/>
         </w:rPr>
         <w:lastRenderedPageBreak/>
-        <w:t>Overall Approach</w:t>
-      </w:r>
-      <w:bookmarkEnd w:id="25"/>
-    </w:p>
-    <w:p>
-      <w:pPr>
-        <w:rPr>
-          <w:lang w:val="en-US"/>
-        </w:rPr>
-      </w:pPr>
-      <w:r>
-        <w:rPr>
-          <w:lang w:val="en-US"/>
-        </w:rPr>
-        <w:t>The project follows a data-driven decision-support approach. First, supply chain data is collected or uploaded into the system. Then, the data is cleaned, standardized, and transformed into dashboard-ready analytical tables. After this transformation, the dashboard modules calculate KPIs, generate visualizations, and support risk assessment.</w:t>
-      </w:r>
-    </w:p>
-    <w:p>
-      <w:pPr>
-        <w:rPr>
-          <w:lang w:val="en-US"/>
-        </w:rPr>
-      </w:pPr>
-      <w:r>
-        <w:rPr>
-          <w:lang w:val="en-US"/>
-        </w:rPr>
-        <w:br/>
-      </w:r>
-      <w:r>
-        <w:rPr>
-          <w:lang w:val="en-US"/>
-        </w:rPr>
-        <w:br/>
-        <w:t>The platform uses the DataCo Smart Supply Chain dataset as the default dataset. This dataset is processed into different analytical tables such as orders, products, shipments, inventory, demand, and risk scores. These tables are used by the default dashboard when no uploaded dataset is active.</w:t>
-      </w:r>
-    </w:p>
-    <w:p>
-      <w:pPr>
-        <w:rPr>
-          <w:lang w:val="en-US"/>
-        </w:rPr>
-      </w:pPr>
-      <w:r>
-        <w:rPr>
-          <w:lang w:val="en-US"/>
-        </w:rPr>
-        <w:br/>
-      </w:r>
-      <w:r>
-        <w:rPr>
-          <w:lang w:val="en-US"/>
-        </w:rPr>
-        <w:br/>
-        <w:t>However, the project is not limited to the default dataset. Users can upload a new company supply chain dataset in CSV or Excel format. The uploaded dataset is mapped to a standard schema through the Data Source Manager. After the mapping process, the system creates the same type of analytical tables and updates the dashboard pages according to the uploaded dataset.</w:t>
-      </w:r>
-    </w:p>
-    <w:p>
-      <w:pPr>
-        <w:rPr>
-          <w:lang w:val="en-US"/>
-        </w:rPr>
-      </w:pPr>
-    </w:p>
-    <w:p>
-      <w:pPr>
-        <w:pStyle w:val="Heading2"/>
-        <w:rPr>
-          <w:lang w:val="en-US"/>
-        </w:rPr>
-      </w:pPr>
-      <w:bookmarkStart w:id="26" w:name="_Toc230437516"/>
-      <w:r>
-        <w:rPr>
-          <w:lang w:val="en-US"/>
-        </w:rPr>
-        <w:t>Dataset Upload and Standardization</w:t>
-      </w:r>
-      <w:bookmarkEnd w:id="26"/>
-      <w:r>
-        <w:rPr>
-          <w:lang w:val="en-US"/>
-        </w:rPr>
-        <w:t xml:space="preserve"> </w:t>
-      </w:r>
-    </w:p>
-    <w:p>
-      <w:pPr>
-        <w:rPr>
-          <w:lang w:val="en-US"/>
-        </w:rPr>
-      </w:pPr>
-      <w:r>
-        <w:rPr>
-          <w:lang w:val="en-US"/>
-        </w:rPr>
-        <w:t>The dataset upload feature is one of the main parts of the solution. Different supply chain datasets may use different column names for similar concepts. For example, one dataset may use “order date,” another may use “PO created date,” and another may use “created at.” To solve this problem, the platform includes a column mapping process.</w:t>
-      </w:r>
-    </w:p>
-    <w:p>
-      <w:pPr>
-        <w:rPr>
-          <w:lang w:val="en-US"/>
-        </w:rPr>
-      </w:pPr>
-      <w:r>
-        <w:rPr>
-          <w:lang w:val="en-US"/>
-        </w:rPr>
-        <w:br/>
-      </w:r>
-      <w:r>
-        <w:rPr>
-          <w:lang w:val="en-US"/>
-        </w:rPr>
-        <w:br/>
-        <w:t>In the Data Source Manager, users map the columns of the uploaded dataset to the standard supply chain schema. The required fields include order ID, order date, product name, category name, and order quantity. Optional fields include shipping date, scheduled delivery date, delivery status, actual shipping days, scheduled shipping days, shipping mode, market, region, country, sales, and profit.</w:t>
-      </w:r>
-    </w:p>
-    <w:p>
-      <w:pPr>
-        <w:rPr>
-          <w:lang w:val="en-US"/>
-        </w:rPr>
-      </w:pPr>
-      <w:r>
-        <w:rPr>
-          <w:lang w:val="en-US"/>
-        </w:rPr>
-        <w:br/>
-      </w:r>
-      <w:r>
-        <w:rPr>
-          <w:lang w:val="en-US"/>
-        </w:rPr>
-        <w:br/>
-        <w:t>After the mapping is completed, the system standardizes the uploaded dataset. It converts date fields, numeric fields, and text fields into a common format. It also derives additional indicators where possible. For example, if actual shipping days and scheduled shipping days are not available, the system can calculate delay days by comparing delivered date and scheduled delivery date.</w:t>
-      </w:r>
-    </w:p>
-    <w:p>
-      <w:pPr>
-        <w:rPr>
-          <w:lang w:val="en-US"/>
-        </w:rPr>
-      </w:pPr>
-    </w:p>
-    <w:p>
-      <w:pPr>
-        <w:pStyle w:val="Heading2"/>
-        <w:rPr>
-          <w:lang w:val="en-US"/>
-        </w:rPr>
-      </w:pPr>
-      <w:bookmarkStart w:id="27" w:name="_Toc230437517"/>
-      <w:r>
-        <w:rPr>
-          <w:lang w:val="en-US"/>
-        </w:rPr>
-        <w:t>Dynamic Dashboard Generation</w:t>
-      </w:r>
-      <w:bookmarkEnd w:id="27"/>
-      <w:r>
-        <w:rPr>
-          <w:lang w:val="en-US"/>
-        </w:rPr>
-        <w:t xml:space="preserve"> </w:t>
-      </w:r>
-    </w:p>
-    <w:p>
-      <w:pPr>
-        <w:rPr>
-          <w:lang w:val="en-US"/>
-        </w:rPr>
-      </w:pPr>
-      <w:r>
-        <w:rPr>
-          <w:lang w:val="en-US"/>
-        </w:rPr>
-        <w:t>After the dataset is standardized, the dashboard pages are generated from the active dataset. If no uploaded dataset is active, the dashboard uses the default DataCo dataset. If the user uploads and activates a new dataset, all dashboard pages use the uploaded dataset during the active Streamlit session.</w:t>
-      </w:r>
-    </w:p>
-    <w:p>
-      <w:pPr>
-        <w:rPr>
-          <w:lang w:val="en-US"/>
-        </w:rPr>
-      </w:pPr>
-      <w:r>
-        <w:rPr>
-          <w:lang w:val="en-US"/>
-        </w:rPr>
-        <w:br/>
-      </w:r>
-      <w:r>
-        <w:rPr>
-          <w:lang w:val="en-US"/>
-        </w:rPr>
-        <w:br/>
-        <w:t>The dashboard includes six main modules: Overview, Regional Performance, Inventory Control, Shipment Performance, Supply Chain Risk, and Demand Forecast. Each module focuses on a different part of supply chain visibility. The Overview page shows general KPIs and summary charts. The Regional Performance page compares markets and regions. The Inventory Control page shows generated inventory indicators. The Shipment Performance page analyzes delivery and delay performance. The Supply Chain Risk page calculates risk indicators. The Demand Forecast page analyzes historical demand and creates simple forecasts.</w:t>
-      </w:r>
-    </w:p>
-    <w:p>
-      <w:pPr>
-        <w:rPr>
-          <w:lang w:val="en-US"/>
-        </w:rPr>
-      </w:pPr>
-      <w:r>
-        <w:rPr>
-          <w:lang w:val="en-US"/>
-        </w:rPr>
-        <w:br/>
-      </w:r>
-      <w:r>
-        <w:rPr>
-          <w:lang w:val="en-US"/>
-        </w:rPr>
-        <w:br/>
-        <w:t>This structure allows the system to work as a flexible platform instead of a static dashboard. The same dashboard pages can be used with different supply chain datasets as long as the required fields are mapped correctly.</w:t>
-      </w:r>
-    </w:p>
-    <w:p>
-      <w:pPr>
-        <w:rPr>
-          <w:lang w:val="en-US"/>
-        </w:rPr>
-      </w:pPr>
-    </w:p>
-    <w:p>
-      <w:pPr>
-        <w:pStyle w:val="Heading2"/>
-        <w:rPr>
-          <w:lang w:val="en-US"/>
-        </w:rPr>
-      </w:pPr>
-      <w:bookmarkStart w:id="28" w:name="_Toc230437518"/>
-      <w:r>
-        <w:rPr>
-          <w:lang w:val="en-US"/>
-        </w:rPr>
-        <w:t>Risk Assessment Approach</w:t>
-      </w:r>
-      <w:bookmarkEnd w:id="28"/>
-      <w:r>
-        <w:rPr>
-          <w:lang w:val="en-US"/>
-        </w:rPr>
-        <w:t xml:space="preserve"> </w:t>
-      </w:r>
-    </w:p>
-    <w:p>
-      <w:pPr>
-        <w:rPr>
-          <w:lang w:val="en-US"/>
-        </w:rPr>
-      </w:pPr>
-      <w:r>
-        <w:rPr>
-          <w:lang w:val="en-US"/>
-        </w:rPr>
-        <w:t>The risk assessment approach is rule-based and interpretable. The purpose of the risk model is not to create a complex black-box prediction system. Instead, the aim is to provide clear risk indicators that users can understand and discuss.</w:t>
-      </w:r>
-    </w:p>
-    <w:p>
-      <w:pPr>
-        <w:rPr>
-          <w:lang w:val="en-US"/>
-        </w:rPr>
-      </w:pPr>
-      <w:r>
-        <w:rPr>
-          <w:lang w:val="en-US"/>
-        </w:rPr>
-        <w:lastRenderedPageBreak/>
-        <w:br/>
-      </w:r>
-      <w:r>
-        <w:rPr>
-          <w:lang w:val="en-US"/>
-        </w:rPr>
-        <w:br/>
-      </w:r>
-      <w:r>
-        <w:rPr>
-          <w:lang w:val="en-US"/>
-        </w:rPr>
-        <w:t>The platform uses different rule-based risk scores for different analysis levels, including overall supply chain risk, regional risk, and category-level risk. The overall risk score combines delivery risk, inventory risk, delay risk, and demand volatility risk, while regional and category-level scores use related operational indicators such as late delivery rate, delay days, profit risk, and inventory condition.</w:t>
-      </w:r>
-    </w:p>
-    <w:p>
-      <w:pPr>
-        <w:rPr>
-          <w:lang w:val="en-US"/>
-        </w:rPr>
-      </w:pPr>
-      <w:r>
-        <w:rPr>
-          <w:lang w:val="en-US"/>
-        </w:rPr>
-        <w:br/>
-      </w:r>
-      <w:r>
-        <w:rPr>
-          <w:lang w:val="en-US"/>
-        </w:rPr>
-        <w:br/>
-        <w:t>This approach is suitable for a graduation thesis prototype because it provides a transparent decision-support structure. Users can understand which factors affect the risk score and can use the dashboard to explore risky regions, shipment modes, categories, and inventory items.</w:t>
-      </w:r>
-    </w:p>
-    <w:p>
-      <w:pPr>
-        <w:rPr>
-          <w:lang w:val="en-US"/>
-        </w:rPr>
-      </w:pPr>
-    </w:p>
-    <w:p>
-      <w:pPr>
-        <w:pStyle w:val="Heading2"/>
-        <w:rPr>
-          <w:lang w:val="en-US"/>
-        </w:rPr>
-      </w:pPr>
-      <w:bookmarkStart w:id="29" w:name="_Toc230437519"/>
-      <w:r>
-        <w:rPr>
-          <w:lang w:val="en-US"/>
-        </w:rPr>
-        <w:t>Forecasting Approach</w:t>
-      </w:r>
-      <w:bookmarkEnd w:id="29"/>
-      <w:r>
-        <w:rPr>
-          <w:lang w:val="en-US"/>
-        </w:rPr>
-        <w:t xml:space="preserve"> </w:t>
-      </w:r>
-    </w:p>
-    <w:p>
-      <w:pPr>
-        <w:rPr>
-          <w:lang w:val="en-US"/>
-        </w:rPr>
-      </w:pPr>
-      <w:r>
-        <w:rPr>
-          <w:lang w:val="en-US"/>
-        </w:rPr>
-        <w:t>The platform also includes a demand forecasting module. This module uses historical monthly demand values and applies simple forecasting methods such as moving average and linear regression. The purpose is to show how historical demand data can be used to estimate future demand patterns.</w:t>
-      </w:r>
-    </w:p>
-    <w:p>
-      <w:pPr>
-        <w:rPr>
-          <w:lang w:val="en-US"/>
-        </w:rPr>
-      </w:pPr>
-      <w:r>
-        <w:rPr>
-          <w:lang w:val="en-US"/>
-        </w:rPr>
-        <w:br/>
-      </w:r>
-      <w:r>
-        <w:rPr>
-          <w:lang w:val="en-US"/>
-        </w:rPr>
-        <w:br/>
-        <w:t>The forecasting module also includes basic performance evaluation metrics such as MAE and MAPE. These metrics help users compare forecast accuracy and understand the reliability of the forecast results. Since the project focuses mainly on supply chain visibility and risk assessment, the forecasting module is designed as a planning-support feature rather than an advanced forecasting system.</w:t>
-      </w:r>
-    </w:p>
-    <w:p>
-      <w:pPr>
-        <w:rPr>
-          <w:lang w:val="en-US"/>
-        </w:rPr>
-      </w:pPr>
-    </w:p>
-    <w:p>
-      <w:pPr>
-        <w:pStyle w:val="Heading1"/>
-        <w:rPr>
-          <w:lang w:val="en-US"/>
-        </w:rPr>
-      </w:pPr>
-      <w:bookmarkStart w:id="30" w:name="_Toc230437520"/>
-      <w:r>
-        <w:rPr>
-          <w:lang w:val="en-US"/>
-        </w:rPr>
-        <w:t>REQUIRED TOOLS</w:t>
-      </w:r>
-      <w:bookmarkEnd w:id="30"/>
-    </w:p>
-    <w:p>
-      <w:pPr>
-        <w:rPr>
-          <w:lang w:val="en-US"/>
-        </w:rPr>
-      </w:pPr>
-      <w:r>
-        <w:rPr>
-          <w:lang w:val="en-US"/>
-        </w:rPr>
-        <w:t>This project was developed by using Python-based data analysis and dashboard development tools. The selected tools were chosen because they are open-source, widely used, and suitable for building a supply chain analytics prototype.</w:t>
-      </w:r>
-    </w:p>
-    <w:p>
-      <w:pPr>
-        <w:rPr>
-          <w:lang w:val="en-US"/>
-        </w:rPr>
-      </w:pPr>
-    </w:p>
-    <w:p>
-      <w:pPr>
-        <w:pStyle w:val="Heading2"/>
-        <w:rPr>
-          <w:lang w:val="en-US"/>
-        </w:rPr>
-      </w:pPr>
-      <w:bookmarkStart w:id="31" w:name="_Toc230437521"/>
-      <w:r>
-        <w:rPr>
-          <w:lang w:val="en-US"/>
-        </w:rPr>
-        <w:t>Programming and Development Environment</w:t>
-      </w:r>
-      <w:bookmarkEnd w:id="31"/>
-      <w:r>
-        <w:rPr>
-          <w:lang w:val="en-US"/>
-        </w:rPr>
-        <w:t xml:space="preserve"> </w:t>
-      </w:r>
-    </w:p>
-    <w:p>
-      <w:pPr>
-        <w:rPr>
-          <w:lang w:val="en-US"/>
-        </w:rPr>
-      </w:pPr>
-      <w:r>
-        <w:rPr>
-          <w:lang w:val="en-US"/>
-        </w:rPr>
-        <w:t>Python was used as the main programming language of the project. It was used for data cleaning, data transformation, KPI calculation, risk score generation, demand forecasting, and dashboard development. Visual Studio Code was used as the development environment for writing and editing the project files.</w:t>
-      </w:r>
-    </w:p>
-    <w:p>
-      <w:pPr>
-        <w:rPr>
-          <w:lang w:val="en-US"/>
-        </w:rPr>
-      </w:pPr>
-      <w:r>
-        <w:rPr>
-          <w:lang w:val="en-US"/>
-        </w:rPr>
         <w:br/>
         <w:t>The project was developed as a local Streamlit application. A Windows batch file was also created to make the project easier to run. This file automatically creates the virtual environment if needed, installs the required packages, processes the default dataset, and starts the dashboard.</w:t>
       </w:r>
@@ -8927,7 +9017,6 @@
         <w:rPr>
           <w:lang w:val="en-US"/>
         </w:rPr>
-        <w:br/>
         <w:t>SQLite was used as a lightweight database solution for storing the processed default dataset. The processed data files were also saved as CSV files so that the dashboard could load them easily.</w:t>
       </w:r>
     </w:p>
@@ -8976,7 +9065,6 @@
         <w:rPr>
           <w:lang w:val="en-US"/>
         </w:rPr>
-        <w:br/>
         <w:t>Plotly was used for creating interactive charts such as bar charts, line charts, heatmaps, and risk visualizations. These visualizations help users understand supply chain performance and risk indicators more easily.</w:t>
       </w:r>
     </w:p>
@@ -8992,7 +9080,6 @@
         <w:rPr>
           <w:lang w:val="en-US"/>
         </w:rPr>
-        <w:lastRenderedPageBreak/>
         <w:t>Forecasting and Version Control Tools</w:t>
       </w:r>
       <w:bookmarkEnd w:id="34"/>
@@ -9022,12 +9109,6 @@
           <w:lang w:val="en-US"/>
         </w:rPr>
       </w:pPr>
-      <w:r>
-        <w:rPr>
-          <w:lang w:val="en-US"/>
-        </w:rPr>
-        <w:br/>
-      </w:r>
       <w:r>
         <w:rPr>
           <w:lang w:val="en-US"/>
@@ -9811,6 +9892,7 @@
         <w:rPr>
           <w:lang w:val="en-US"/>
         </w:rPr>
+        <w:lastRenderedPageBreak/>
         <w:t>SYSTEM / MODEL &amp; SOLUTION DEVELOPMENT</w:t>
       </w:r>
       <w:bookmarkEnd w:id="36"/>
@@ -9833,11 +9915,17 @@
         </w:rPr>
         <w:br/>
       </w:r>
-      <w:r>
-        <w:rPr>
-          <w:lang w:val="en-US"/>
-        </w:rPr>
-        <w:br/>
+    </w:p>
+    <w:p>
+      <w:pPr>
+        <w:rPr>
+          <w:lang w:val="en-US"/>
+        </w:rPr>
+      </w:pPr>
+      <w:r>
+        <w:rPr>
+          <w:lang w:val="en-US"/>
+        </w:rPr>
         <w:t>The system development process includes data source selection, dataset upload, column mapping, data standardization, analytical table generation, dashboard module development, risk score calculation, and demand forecasting.</w:t>
       </w:r>
     </w:p>
@@ -9899,26 +9987,6 @@
         <w:rPr>
           <w:lang w:val="en-US"/>
         </w:rPr>
-        <w:lastRenderedPageBreak/>
-        <w:br/>
-      </w:r>
-      <w:r>
-        <w:rPr>
-          <w:lang w:val="en-US"/>
-        </w:rPr>
-        <w:br/>
-      </w:r>
-    </w:p>
-    <w:p>
-      <w:pPr>
-        <w:rPr>
-          <w:lang w:val="en-US"/>
-        </w:rPr>
-      </w:pPr>
-      <w:r>
-        <w:rPr>
-          <w:lang w:val="en-US"/>
-        </w:rPr>
         <w:t>The system architecture is shown in Figure 1.</w:t>
       </w:r>
     </w:p>
@@ -9935,7 +10003,7 @@
           <w:lang w:val="en-US"/>
         </w:rPr>
         <w:drawing>
-          <wp:inline distT="0" distB="0" distL="0" distR="0" wp14:anchorId="13F4F06E" wp14:editId="79A16526">
+          <wp:inline distT="0" distB="0" distL="0" distR="0" wp14:anchorId="13F4F06E" wp14:editId="450C107E">
             <wp:extent cx="5997778" cy="3952875"/>
             <wp:effectExtent l="0" t="0" r="3175" b="0"/>
             <wp:docPr id="36948891" name="Picture 1"/>
@@ -10079,17 +10147,11 @@
           <w:lang w:val="en-US"/>
         </w:rPr>
       </w:pPr>
-    </w:p>
-    <w:p>
-      <w:pPr>
-        <w:rPr>
-          <w:lang w:val="en-US"/>
-        </w:rPr>
-      </w:pPr>
-      <w:r>
-        <w:rPr>
-          <w:lang w:val="en-US"/>
-        </w:rPr>
+      <w:r>
+        <w:rPr>
+          <w:lang w:val="en-US"/>
+        </w:rPr>
+        <w:lastRenderedPageBreak/>
         <w:t>After uploading a dataset, the system shows a preview of the raw data. Then, the user maps the uploaded columns to the standard supply chain schema. This mapping process is necessary because different datasets may use different column names for the same concept. For example, one dataset may use “Order Date,” while another dataset may use “PO Created At.”</w:t>
       </w:r>
     </w:p>
@@ -10099,54 +10161,26 @@
           <w:lang w:val="en-US"/>
         </w:rPr>
       </w:pPr>
-    </w:p>
-    <w:p>
-      <w:pPr>
-        <w:rPr>
-          <w:lang w:val="en-US"/>
-        </w:rPr>
-      </w:pPr>
-      <w:r>
-        <w:rPr>
-          <w:lang w:val="en-US"/>
-        </w:rPr>
-        <w:t>The uploaded dataset is used during the active Streamlit session. If the user activates the uploaded dataset, all dashboard pages use the uploaded data. If the user wants to return to the default dataset, the Data Source Manager provides an option to return to the default DataCo dataset.</w:t>
-      </w:r>
-    </w:p>
-    <w:p>
-      <w:pPr>
-        <w:rPr>
-          <w:lang w:val="en-US"/>
-        </w:rPr>
-      </w:pPr>
-    </w:p>
-    <w:p>
-      <w:pPr>
-        <w:rPr>
-          <w:lang w:val="en-US"/>
-        </w:rPr>
-      </w:pPr>
-    </w:p>
-    <w:p>
-      <w:pPr>
-        <w:rPr>
-          <w:lang w:val="en-US"/>
-        </w:rPr>
-      </w:pPr>
-    </w:p>
-    <w:p>
-      <w:pPr>
-        <w:rPr>
-          <w:lang w:val="en-US"/>
-        </w:rPr>
-      </w:pPr>
-    </w:p>
-    <w:p>
-      <w:pPr>
-        <w:rPr>
-          <w:lang w:val="en-US"/>
-        </w:rPr>
-      </w:pPr>
+      <w:r>
+        <w:rPr>
+          <w:lang w:val="en-US"/>
+        </w:rPr>
+        <w:t xml:space="preserve">The uploaded dataset is used during the active Streamlit session. If the user activates the uploaded dataset, all dashboard pages use the uploaded data. If the user wants to return to the default dataset, the Data Source Manager provides an option to return to the default </w:t>
+      </w:r>
+      <w:proofErr w:type="spellStart"/>
+      <w:r>
+        <w:rPr>
+          <w:lang w:val="en-US"/>
+        </w:rPr>
+        <w:t>DataCo</w:t>
+      </w:r>
+      <w:proofErr w:type="spellEnd"/>
+      <w:r>
+        <w:rPr>
+          <w:lang w:val="en-US"/>
+        </w:rPr>
+        <w:t xml:space="preserve"> dataset.</w:t>
+      </w:r>
     </w:p>
     <w:p>
       <w:pPr>
@@ -10160,7 +10194,6 @@
         <w:rPr>
           <w:lang w:val="en-US"/>
         </w:rPr>
-        <w:lastRenderedPageBreak/>
         <w:t>Standard Data Schema</w:t>
       </w:r>
       <w:bookmarkEnd w:id="40"/>
@@ -10184,18 +10217,25 @@
           <w:lang w:val="en-US"/>
         </w:rPr>
       </w:pPr>
-    </w:p>
-    <w:p>
-      <w:pPr>
-        <w:rPr>
-          <w:lang w:val="en-US"/>
-        </w:rPr>
-      </w:pPr>
-      <w:r>
-        <w:rPr>
-          <w:lang w:val="en-US"/>
-        </w:rPr>
-        <w:t>The standard schema used in the platform is shown in Table 2.</w:t>
+      <w:r>
+        <w:rPr>
+          <w:lang w:val="en-US"/>
+        </w:rPr>
+        <w:t xml:space="preserve">The standard </w:t>
+      </w:r>
+      <w:proofErr w:type="gramStart"/>
+      <w:r>
+        <w:rPr>
+          <w:lang w:val="en-US"/>
+        </w:rPr>
+        <w:t>schema</w:t>
+      </w:r>
+      <w:proofErr w:type="gramEnd"/>
+      <w:r>
+        <w:rPr>
+          <w:lang w:val="en-US"/>
+        </w:rPr>
+        <w:t xml:space="preserve"> used in the platform is shown in Table 2.</w:t>
       </w:r>
       <w:r>
         <w:rPr>
@@ -10207,8 +10247,6 @@
     <w:p>
       <w:pPr>
         <w:rPr>
-          <w:b/>
-          <w:bCs/>
           <w:lang w:val="en-US"/>
         </w:rPr>
       </w:pPr>
@@ -11287,7 +11325,6 @@
         <w:rPr>
           <w:lang w:val="en-US"/>
         </w:rPr>
-        <w:lastRenderedPageBreak/>
         <w:t>Dashboard Data Model</w:t>
       </w:r>
       <w:bookmarkEnd w:id="42"/>
@@ -11350,7 +11387,7 @@
           <w:lang w:val="en-US"/>
         </w:rPr>
         <w:drawing>
-          <wp:inline distT="0" distB="0" distL="0" distR="0" wp14:anchorId="670A0A81" wp14:editId="43BB0AFD">
+          <wp:inline distT="0" distB="0" distL="0" distR="0" wp14:anchorId="670A0A81" wp14:editId="5FC288EF">
             <wp:extent cx="6162675" cy="4108228"/>
             <wp:effectExtent l="0" t="0" r="0" b="6985"/>
             <wp:docPr id="604311595" name="Picture 2"/>
@@ -11468,13 +11505,6 @@
     </w:p>
     <w:p>
       <w:pPr>
-        <w:rPr>
-          <w:lang w:val="en-US"/>
-        </w:rPr>
-      </w:pPr>
-    </w:p>
-    <w:p>
-      <w:pPr>
         <w:pStyle w:val="Heading2"/>
         <w:rPr>
           <w:lang w:val="en-US"/>
@@ -11501,13 +11531,6 @@
         </w:rPr>
         <w:t>The platform includes six dashboard modules. Each module focuses on a different part of supply chain visibility and risk analysis. These modules work with the active dataset. If the user activates an uploaded dataset, the same dashboard modules are updated according to the uploaded data.</w:t>
       </w:r>
-    </w:p>
-    <w:p>
-      <w:pPr>
-        <w:rPr>
-          <w:lang w:val="en-US"/>
-        </w:rPr>
-      </w:pPr>
     </w:p>
     <w:p>
       <w:pPr>
@@ -11565,7 +11588,6 @@
         <w:rPr>
           <w:lang w:val="en-US"/>
         </w:rPr>
-        <w:lastRenderedPageBreak/>
         <w:t xml:space="preserve">Table </w:t>
       </w:r>
       <w:r>
@@ -12459,6 +12481,7 @@
     </w:p>
     <w:p>
       <w:r>
+        <w:lastRenderedPageBreak/>
         <w:t>The platform uses rule-based risk scores to provide an interpretable assessment of supply chain performance. The overall supply chain risk score is calculated from four main components: delivery risk, inventory risk, delay risk, and demand volatility risk. In addition to the overall score, regional and category-level risk tables use related operational indicators to compare risk across regions and product categories.</w:t>
       </w:r>
     </w:p>
@@ -13157,13 +13180,6 @@
           <w:lang w:val="en-US"/>
         </w:rPr>
       </w:pPr>
-    </w:p>
-    <w:p>
-      <w:pPr>
-        <w:rPr>
-          <w:lang w:val="en-US"/>
-        </w:rPr>
-      </w:pPr>
       <w:r>
         <w:rPr>
           <w:lang w:val="en-US"/>
@@ -13225,13 +13241,6 @@
           <w:lang w:val="en-US"/>
         </w:rPr>
       </w:pPr>
-    </w:p>
-    <w:p>
-      <w:pPr>
-        <w:rPr>
-          <w:lang w:val="en-US"/>
-        </w:rPr>
-      </w:pPr>
       <w:r>
         <w:rPr>
           <w:lang w:val="en-US"/>
@@ -13245,18 +13254,39 @@
           <w:lang w:val="en-US"/>
         </w:rPr>
       </w:pPr>
-    </w:p>
-    <w:p>
-      <w:pPr>
-        <w:rPr>
-          <w:lang w:val="en-US"/>
-        </w:rPr>
-      </w:pPr>
-      <w:r>
-        <w:rPr>
-          <w:lang w:val="en-US"/>
-        </w:rPr>
-        <w:t>The forecasting approach is intentionally simple because the main focus of the project is supply chain visibility and risk assessment. The purpose of the forecast module is to demonstrate how demand data can support planning decisions, not to create a highly advanced forecasting system.</w:t>
+      <w:r>
+        <w:rPr>
+          <w:lang w:val="en-US"/>
+        </w:rPr>
+        <w:t xml:space="preserve">The forecasting approach is intentionally simple because the </w:t>
+      </w:r>
+      <w:proofErr w:type="gramStart"/>
+      <w:r>
+        <w:rPr>
+          <w:lang w:val="en-US"/>
+        </w:rPr>
+        <w:t>main focus</w:t>
+      </w:r>
+      <w:proofErr w:type="gramEnd"/>
+      <w:r>
+        <w:rPr>
+          <w:lang w:val="en-US"/>
+        </w:rPr>
+        <w:t xml:space="preserve"> of the project is </w:t>
+      </w:r>
+      <w:proofErr w:type="gramStart"/>
+      <w:r>
+        <w:rPr>
+          <w:lang w:val="en-US"/>
+        </w:rPr>
+        <w:t>supply</w:t>
+      </w:r>
+      <w:proofErr w:type="gramEnd"/>
+      <w:r>
+        <w:rPr>
+          <w:lang w:val="en-US"/>
+        </w:rPr>
+        <w:t xml:space="preserve"> chain visibility and risk assessment. The purpose of the forecast module is to demonstrate how demand data can support planning decisions, not to create a highly advanced forecasting system.</w:t>
       </w:r>
     </w:p>
     <w:p>
@@ -13292,15 +13322,22 @@
         <w:rPr>
           <w:lang w:val="en-US"/>
         </w:rPr>
-        <w:t>The dashboard interface was developed with Streamlit. The platform includes a sidebar navigation menu and multiple dashboard pages. The Overview page includes the Data Source Manager, which allows users to upload a new dataset, map columns, activate the uploaded dataset, or return to the default DataCo dataset.</w:t>
-      </w:r>
-    </w:p>
-    <w:p>
-      <w:pPr>
-        <w:rPr>
-          <w:lang w:val="en-US"/>
-        </w:rPr>
-      </w:pPr>
+        <w:t xml:space="preserve">The dashboard interface was developed with Streamlit. The platform includes a sidebar navigation menu and multiple dashboard pages. The Overview page includes the Data Source Manager, which allows users to upload a new dataset, map columns, activate the uploaded dataset, or return to the default </w:t>
+      </w:r>
+      <w:proofErr w:type="spellStart"/>
+      <w:r>
+        <w:rPr>
+          <w:lang w:val="en-US"/>
+        </w:rPr>
+        <w:t>DataCo</w:t>
+      </w:r>
+      <w:proofErr w:type="spellEnd"/>
+      <w:r>
+        <w:rPr>
+          <w:lang w:val="en-US"/>
+        </w:rPr>
+        <w:t xml:space="preserve"> dataset.</w:t>
+      </w:r>
     </w:p>
     <w:p>
       <w:pPr>
@@ -13335,7 +13372,7 @@
         </w:rPr>
         <w:lastRenderedPageBreak/>
         <w:drawing>
-          <wp:inline distT="0" distB="0" distL="0" distR="0" wp14:anchorId="385ACC34" wp14:editId="3314E5A7">
+          <wp:inline distT="0" distB="0" distL="0" distR="0" wp14:anchorId="385ACC34" wp14:editId="433B94A6">
             <wp:extent cx="6357908" cy="3705225"/>
             <wp:effectExtent l="0" t="0" r="5080" b="0"/>
             <wp:docPr id="1801230199" name="Picture 4"/>
@@ -13451,13 +13488,6 @@
           <w:lang w:val="en-US"/>
         </w:rPr>
       </w:pPr>
-    </w:p>
-    <w:p>
-      <w:pPr>
-        <w:rPr>
-          <w:lang w:val="en-US"/>
-        </w:rPr>
-      </w:pPr>
       <w:r>
         <w:rPr>
           <w:lang w:val="en-US"/>
@@ -13601,13 +13631,6 @@
           <w:lang w:val="en-US"/>
         </w:rPr>
       </w:pPr>
-    </w:p>
-    <w:p>
-      <w:pPr>
-        <w:rPr>
-          <w:lang w:val="en-US"/>
-        </w:rPr>
-      </w:pPr>
       <w:r>
         <w:rPr>
           <w:lang w:val="en-US"/>
@@ -13737,13 +13760,6 @@
           <w:lang w:val="en-US"/>
         </w:rPr>
       </w:pPr>
-    </w:p>
-    <w:p>
-      <w:pPr>
-        <w:rPr>
-          <w:lang w:val="en-US"/>
-        </w:rPr>
-      </w:pPr>
       <w:r>
         <w:rPr>
           <w:lang w:val="en-US"/>
@@ -13864,7 +13880,6 @@
         <w:rPr>
           <w:lang w:val="en-US"/>
         </w:rPr>
-        <w:lastRenderedPageBreak/>
         <w:t>These dashboard pages show that the platform is not limited to a static dataset. When a new dataset is uploaded and activated, the same dashboard structure is regenerated based on the active dataset. This supports the main goal of the project: creating a reusable supply chain visibility and risk assessment platform.</w:t>
       </w:r>
     </w:p>
@@ -13949,22 +13964,8 @@
         <w:rPr>
           <w:lang w:val="en-US"/>
         </w:rPr>
-        <w:br/>
-      </w:r>
-      <w:r>
-        <w:rPr>
-          <w:lang w:val="en-US"/>
-        </w:rPr>
-        <w:br/>
         <w:t>The company needs a reusable dashboard platform that can work with different supply chain datasets. The platform should not require code changes every time a new dataset is analyzed. Instead, users should be able to upload a dataset, map its columns to a standard schema, and generate dashboard pages based on the active dataset.</w:t>
       </w:r>
-    </w:p>
-    <w:p>
-      <w:pPr>
-        <w:rPr>
-          <w:lang w:val="en-US"/>
-        </w:rPr>
-      </w:pPr>
       <w:r>
         <w:rPr>
           <w:lang w:val="en-US"/>
@@ -13978,6 +13979,13 @@
         <w:br/>
         <w:t>In this project, the DataCo dataset is used as the default demonstration dataset. However, the business case also considers a situation where a user uploads a new company dataset. After the uploaded dataset is mapped and standardized, the dashboard pages are updated dynamically.</w:t>
       </w:r>
+    </w:p>
+    <w:p>
+      <w:pPr>
+        <w:rPr>
+          <w:lang w:val="en-US"/>
+        </w:rPr>
+      </w:pPr>
     </w:p>
     <w:p>
       <w:pPr>
@@ -14415,13 +14423,6 @@
           <w:lang w:val="en-US"/>
         </w:rPr>
       </w:pPr>
-    </w:p>
-    <w:p>
-      <w:pPr>
-        <w:rPr>
-          <w:lang w:val="en-US"/>
-        </w:rPr>
-      </w:pPr>
       <w:r>
         <w:rPr>
           <w:lang w:val="en-US"/>
@@ -14443,7 +14444,7 @@
         </w:rPr>
         <w:lastRenderedPageBreak/>
         <w:drawing>
-          <wp:inline distT="0" distB="0" distL="0" distR="0" wp14:anchorId="2FC8B4CF" wp14:editId="49509299">
+          <wp:inline distT="0" distB="0" distL="0" distR="0" wp14:anchorId="2FC8B4CF" wp14:editId="595F9748">
             <wp:extent cx="5868670" cy="3867785"/>
             <wp:effectExtent l="0" t="0" r="0" b="0"/>
             <wp:docPr id="656098705" name="Picture 5"/>
@@ -14594,13 +14595,6 @@
           <w:lang w:val="en-US"/>
         </w:rPr>
       </w:pPr>
-    </w:p>
-    <w:p>
-      <w:pPr>
-        <w:rPr>
-          <w:lang w:val="en-US"/>
-        </w:rPr>
-      </w:pPr>
       <w:r>
         <w:rPr>
           <w:lang w:val="en-US"/>
@@ -14614,13 +14608,6 @@
           <w:lang w:val="en-US"/>
         </w:rPr>
       </w:pPr>
-    </w:p>
-    <w:p>
-      <w:pPr>
-        <w:rPr>
-          <w:lang w:val="en-US"/>
-        </w:rPr>
-      </w:pPr>
       <w:r>
         <w:rPr>
           <w:lang w:val="en-US"/>
@@ -14670,13 +14657,6 @@
           <w:lang w:val="en-US"/>
         </w:rPr>
       </w:pPr>
-    </w:p>
-    <w:p>
-      <w:pPr>
-        <w:rPr>
-          <w:lang w:val="en-US"/>
-        </w:rPr>
-      </w:pPr>
       <w:r>
         <w:rPr>
           <w:lang w:val="en-US"/>
@@ -14690,33 +14670,26 @@
           <w:lang w:val="en-US"/>
         </w:rPr>
       </w:pPr>
-    </w:p>
-    <w:p>
-      <w:pPr>
-        <w:rPr>
-          <w:lang w:val="en-US"/>
-        </w:rPr>
-      </w:pPr>
+      <w:r>
+        <w:rPr>
+          <w:lang w:val="en-US"/>
+        </w:rPr>
+        <w:t>The platform can help users identify late delivery problems, risky regions, critical inventory items, delay patterns, and demand changes. These insights can support better planning and faster decision-making in supply chain operations.</w:t>
+      </w:r>
+    </w:p>
+    <w:p>
+      <w:pPr>
+        <w:pStyle w:val="Heading2"/>
+        <w:rPr>
+          <w:lang w:val="en-US"/>
+        </w:rPr>
+      </w:pPr>
+      <w:bookmarkStart w:id="62" w:name="_Toc230437540"/>
       <w:r>
         <w:rPr>
           <w:lang w:val="en-US"/>
         </w:rPr>
         <w:lastRenderedPageBreak/>
-        <w:t>The platform can help users identify late delivery problems, risky regions, critical inventory items, delay patterns, and demand changes. These insights can support better planning and faster decision-making in supply chain operations.</w:t>
-      </w:r>
-    </w:p>
-    <w:p>
-      <w:pPr>
-        <w:pStyle w:val="Heading2"/>
-        <w:rPr>
-          <w:lang w:val="en-US"/>
-        </w:rPr>
-      </w:pPr>
-      <w:bookmarkStart w:id="62" w:name="_Toc230437540"/>
-      <w:r>
-        <w:rPr>
-          <w:lang w:val="en-US"/>
-        </w:rPr>
         <w:t>Testing and Validation</w:t>
       </w:r>
       <w:bookmarkEnd w:id="62"/>
@@ -15436,20 +15409,6 @@
     </w:p>
     <w:p>
       <w:pPr>
-        <w:rPr>
-          <w:lang w:val="en-US"/>
-        </w:rPr>
-      </w:pPr>
-    </w:p>
-    <w:p>
-      <w:pPr>
-        <w:rPr>
-          <w:lang w:val="en-US"/>
-        </w:rPr>
-      </w:pPr>
-    </w:p>
-    <w:p>
-      <w:pPr>
         <w:pStyle w:val="Heading1"/>
         <w:rPr>
           <w:lang w:val="en-US"/>
@@ -15460,67 +15419,59 @@
         <w:rPr>
           <w:lang w:val="en-US"/>
         </w:rPr>
+        <w:t>CONCLUSIO</w:t>
+      </w:r>
+      <w:r>
+        <w:rPr>
+          <w:lang w:val="en-US"/>
+        </w:rPr>
+        <w:t>NS</w:t>
+      </w:r>
+      <w:bookmarkEnd w:id="64"/>
+    </w:p>
+    <w:p>
+      <w:pPr>
+        <w:rPr>
+          <w:lang w:val="en-US"/>
+        </w:rPr>
+      </w:pPr>
+      <w:r>
+        <w:rPr>
+          <w:lang w:val="en-US"/>
+        </w:rPr>
+        <w:t>This graduation thesis developed a Supply Chain Visibility and Risk Assessment Platform using Python and Streamlit. The main goal of the project was to create an interactive decision-support system that can help users monitor supply chain performance, identify operational risks, and analyze demand patterns from a single interface.</w:t>
+      </w:r>
+    </w:p>
+    <w:p>
+      <w:pPr>
+        <w:rPr>
+          <w:lang w:val="en-US"/>
+        </w:rPr>
+      </w:pPr>
+      <w:r>
+        <w:rPr>
+          <w:lang w:val="en-US"/>
+        </w:rPr>
+        <w:t xml:space="preserve">The completed platform includes several dashboard modules: Overview, Regional Performance, Inventory Control, Shipment Performance, Supply Chain Risk, and Demand Forecast. These modules provide key performance indicators, charts, tables, risk scores, and forecasting outputs. The dashboard helps users analyze delivery </w:t>
+      </w:r>
+      <w:r>
+        <w:rPr>
+          <w:lang w:val="en-US"/>
+        </w:rPr>
         <w:lastRenderedPageBreak/>
-        <w:t>CONCLUSIO</w:t>
-      </w:r>
-      <w:r>
-        <w:rPr>
-          <w:lang w:val="en-US"/>
-        </w:rPr>
-        <w:t>NS</w:t>
-      </w:r>
-      <w:bookmarkEnd w:id="64"/>
-    </w:p>
-    <w:p>
-      <w:pPr>
-        <w:rPr>
-          <w:lang w:val="en-US"/>
-        </w:rPr>
-      </w:pPr>
-      <w:r>
-        <w:rPr>
-          <w:lang w:val="en-US"/>
-        </w:rPr>
-        <w:t>This graduation thesis developed a Supply Chain Visibility and Risk Assessment Platform using Python and Streamlit. The main goal of the project was to create an interactive decision-support system that can help users monitor supply chain performance, identify operational risks, and analyze demand patterns from a single interface.</w:t>
-      </w:r>
-    </w:p>
-    <w:p>
-      <w:pPr>
-        <w:rPr>
-          <w:lang w:val="en-US"/>
-        </w:rPr>
-      </w:pPr>
-      <w:r>
-        <w:rPr>
-          <w:lang w:val="en-US"/>
-        </w:rPr>
-        <w:br/>
-      </w:r>
-      <w:r>
-        <w:rPr>
-          <w:lang w:val="en-US"/>
-        </w:rPr>
-        <w:br/>
-        <w:t>The completed platform includes several dashboard modules: Overview, Regional Performance, Inventory Control, Shipment Performance, Supply Chain Risk, and Demand Forecast. These modules provide key performance indicators, charts, tables, risk scores, and forecasting outputs. The dashboard helps users analyze delivery performance, shipment delays, inventory status, regional differences, demand trends, and overall supply chain risk.</w:t>
-      </w:r>
-    </w:p>
-    <w:p>
-      <w:pPr>
-        <w:rPr>
-          <w:lang w:val="en-US"/>
-        </w:rPr>
-      </w:pPr>
-      <w:r>
-        <w:rPr>
-          <w:lang w:val="en-US"/>
-        </w:rPr>
-        <w:br/>
-      </w:r>
-      <w:r>
-        <w:rPr>
-          <w:lang w:val="en-US"/>
-        </w:rPr>
-        <w:br/>
+        <w:t>performance, shipment delays, inventory status, regional differences, demand trends, and overall supply chain risk.</w:t>
+      </w:r>
+    </w:p>
+    <w:p>
+      <w:pPr>
+        <w:rPr>
+          <w:lang w:val="en-US"/>
+        </w:rPr>
+      </w:pPr>
+      <w:r>
+        <w:rPr>
+          <w:lang w:val="en-US"/>
+        </w:rPr>
         <w:t>One of the strongest parts of the project is the dataset upload and standardization feature. The system is not limited to the default DataCo dataset. Users can upload a new supply chain dataset in CSV or Excel format, map the dataset columns to a standard schema, and generate dashboard pages based on the uploaded dataset. This makes the platform more reusable and flexible than a static dashboard built for only one dataset.</w:t>
       </w:r>
     </w:p>
@@ -15534,13 +15485,6 @@
         <w:rPr>
           <w:lang w:val="en-US"/>
         </w:rPr>
-        <w:br/>
-      </w:r>
-      <w:r>
-        <w:rPr>
-          <w:lang w:val="en-US"/>
-        </w:rPr>
-        <w:br/>
         <w:t>The project also demonstrates how supply chain data can be transformed into dashboard-ready analytical tables. The system creates or uses order, product, shipment, inventory, demand, and risk score tables. These tables support the dashboard modules and make it possible to analyze different parts of the supply chain in an integrated way.</w:t>
       </w:r>
     </w:p>
@@ -15554,13 +15498,6 @@
         <w:rPr>
           <w:lang w:val="en-US"/>
         </w:rPr>
-        <w:br/>
-      </w:r>
-      <w:r>
-        <w:rPr>
-          <w:lang w:val="en-US"/>
-        </w:rPr>
-        <w:br/>
         <w:t>The risk assessment approach is rule-based and interpretable. The platform calculates risk by using indicators such as late delivery rate, average delay days, inventory status, and demand volatility. This approach allows users to understand the main reasons behind the risk score. The forecasting module also supports planning by showing historical demand patterns and simple future demand estimates.</w:t>
       </w:r>
     </w:p>
@@ -15574,13 +15511,6 @@
         <w:rPr>
           <w:lang w:val="en-US"/>
         </w:rPr>
-        <w:br/>
-      </w:r>
-      <w:r>
-        <w:rPr>
-          <w:lang w:val="en-US"/>
-        </w:rPr>
-        <w:br/>
         <w:t>The project has some limitations. The default DataCo dataset is a public historical dataset and does not represent the current operations of a specific company. In addition, the quality of the dashboard outputs depends on the structure and completeness of the uploaded dataset. Some indicators, especially inventory-related fields, are generated for academic demonstration purposes when the uploaded dataset does not contain complete inventory information. The risk score is also rule-based rather than machine-learning-based.</w:t>
       </w:r>
     </w:p>
@@ -15594,13 +15524,6 @@
         <w:rPr>
           <w:lang w:val="en-US"/>
         </w:rPr>
-        <w:br/>
-      </w:r>
-      <w:r>
-        <w:rPr>
-          <w:lang w:val="en-US"/>
-        </w:rPr>
-        <w:br/>
         <w:t>In future work, the platform can be improved by adding automatic column detection, database persistence for uploaded datasets, exportable PDF risk reports, real-time ERP or API integration, and more advanced forecasting models. The risk scoring system can also be improved by using machine learning methods if enough historical labeled risk data is available.</w:t>
       </w:r>
     </w:p>
@@ -15614,94 +15537,12 @@
         <w:rPr>
           <w:lang w:val="en-US"/>
         </w:rPr>
-        <w:br/>
-      </w:r>
-      <w:r>
-        <w:rPr>
-          <w:lang w:val="en-US"/>
-        </w:rPr>
-        <w:br/>
         <w:t>Overall, the project successfully demonstrates a reusable and dataset-adaptive dashboard platform for supply chain visibility and risk assessment. It shows how different supply chain datasets can be standardized and transformed into operational insights through dashboards, risk indicators, and forecasting modules.</w:t>
       </w:r>
     </w:p>
-    <w:p>
-      <w:pPr>
-        <w:rPr>
-          <w:lang w:val="en-US"/>
-        </w:rPr>
-      </w:pPr>
-    </w:p>
-    <w:p>
-      <w:pPr>
-        <w:rPr>
-          <w:noProof/>
-          <w:color w:val="000000" w:themeColor="text1"/>
-          <w:lang w:val="en-US"/>
-        </w:rPr>
-      </w:pPr>
-    </w:p>
-    <w:p>
-      <w:pPr>
-        <w:rPr>
-          <w:noProof/>
-          <w:color w:val="000000" w:themeColor="text1"/>
-          <w:lang w:val="en-US"/>
-        </w:rPr>
-      </w:pPr>
-    </w:p>
-    <w:p>
-      <w:pPr>
-        <w:rPr>
-          <w:noProof/>
-          <w:color w:val="000000" w:themeColor="text1"/>
-          <w:lang w:val="en-US"/>
-        </w:rPr>
-      </w:pPr>
-    </w:p>
-    <w:p>
-      <w:pPr>
-        <w:rPr>
-          <w:noProof/>
-          <w:color w:val="000000" w:themeColor="text1"/>
-          <w:lang w:val="en-US"/>
-        </w:rPr>
-      </w:pPr>
-    </w:p>
-    <w:p>
-      <w:pPr>
-        <w:rPr>
-          <w:noProof/>
-          <w:lang w:val="en-US"/>
-        </w:rPr>
-      </w:pPr>
-    </w:p>
-    <w:p>
-      <w:pPr>
-        <w:rPr>
-          <w:noProof/>
-          <w:lang w:val="en-US"/>
-        </w:rPr>
-      </w:pPr>
-    </w:p>
-    <w:p>
-      <w:pPr>
-        <w:rPr>
-          <w:noProof/>
-          <w:lang w:val="en-US"/>
-        </w:rPr>
-      </w:pPr>
-    </w:p>
-    <w:p>
-      <w:pPr>
-        <w:rPr>
-          <w:noProof/>
-          <w:lang w:val="en-US"/>
-        </w:rPr>
-      </w:pPr>
-    </w:p>
-    <w:bookmarkStart w:id="65" w:name="_Toc230437542" w:displacedByCustomXml="next"/>
+    <w:bookmarkStart w:id="65" w:name="_Toc32521151" w:displacedByCustomXml="next"/>
     <w:bookmarkStart w:id="66" w:name="_Toc494826192" w:displacedByCustomXml="next"/>
-    <w:bookmarkStart w:id="67" w:name="_Toc32521151" w:displacedByCustomXml="next"/>
+    <w:bookmarkStart w:id="67" w:name="_Toc230437542" w:displacedByCustomXml="next"/>
     <w:sdt>
       <w:sdtPr>
         <w:rPr>
@@ -16087,21 +15928,6 @@
         </w:p>
       </w:sdtContent>
     </w:sdt>
-    <w:p>
-      <w:pPr>
-        <w:rPr>
-          <w:noProof/>
-          <w:lang w:val="en-US"/>
-        </w:rPr>
-      </w:pPr>
-      <w:r>
-        <w:rPr>
-          <w:noProof/>
-          <w:lang w:val="en-US"/>
-        </w:rPr>
-        <w:t>--</w:t>
-      </w:r>
-    </w:p>
     <w:p>
       <w:pPr>
         <w:spacing w:before="0" w:after="0"/>
@@ -21939,7 +21765,7 @@
     <b:InternetSiteTitle>Computers in Industry</b:InternetSiteTitle>
     <b:Year>2023</b:Year>
     <b:URL>https://www.sciencedirect.com/science/article/pii/S016636152200207X</b:URL>
-    <b:RefOrder>5</b:RefOrder>
+    <b:RefOrder>6</b:RefOrder>
   </b:Source>
   <b:Source>
     <b:Tag>IBM24</b:Tag>
@@ -21954,7 +21780,7 @@
     <b:InternetSiteTitle>IBM Think</b:InternetSiteTitle>
     <b:Year>2024</b:Year>
     <b:URL>https://www.ibm.com/think/topics/data-quality-dimensions</b:URL>
-    <b:RefOrder>6</b:RefOrder>
+    <b:RefOrder>5</b:RefOrder>
   </b:Source>
   <b:Source>
     <b:Tag>Hyn21</b:Tag>
@@ -21993,7 +21819,7 @@
     <b:InternetSiteTitle>Streamlit Documentation</b:InternetSiteTitle>
     <b:URL>https://docs.streamlit.io/develop/api-reference/widgets/st.file_uploader</b:URL>
     <b:Year>n.d.</b:Year>
-    <b:RefOrder>10</b:RefOrder>
+    <b:RefOrder>11</b:RefOrder>
   </b:Source>
   <b:Source>
     <b:Tag>Kagnd</b:Tag>
@@ -22008,7 +21834,7 @@
     <b:InternetSiteTitle>Kaggle</b:InternetSiteTitle>
     <b:URL>https://www.kaggle.com/datasets/shashwatwork/dataco-smart-supply-chain-for-big-data-analysis</b:URL>
     <b:Year>n.d.</b:Year>
-    <b:RefOrder>11</b:RefOrder>
+    <b:RefOrder>8</b:RefOrder>
   </b:Source>
   <b:Source>
     <b:Tag>pannd</b:Tag>
@@ -22023,7 +21849,7 @@
     </b:Author>
     <b:InternetSiteTitle>pandas Documentation</b:InternetSiteTitle>
     <b:URL>https://pandas.pydata.org/docs/user_guide/index.html</b:URL>
-    <b:RefOrder>8</b:RefOrder>
+    <b:RefOrder>9</b:RefOrder>
   </b:Source>
   <b:Source>
     <b:Tag>scind</b:Tag>
@@ -22038,7 +21864,7 @@
     <b:InternetSiteTitle>scikit-learn Documentation</b:InternetSiteTitle>
     <b:Year>n.d.</b:Year>
     <b:URL>https://scikit-learn.org/stable/modules/generated/sklearn.linear_model.LinearRegression.html</b:URL>
-    <b:RefOrder>9</b:RefOrder>
+    <b:RefOrder>10</b:RefOrder>
   </b:Source>
   <b:Source>
     <b:Tag>Kal22</b:Tag>
@@ -22075,7 +21901,7 @@
 </file>
 
 <file path=customXml/itemProps1.xml><?xml version="1.0" encoding="utf-8"?>
-<ds:datastoreItem xmlns:ds="http://schemas.openxmlformats.org/officeDocument/2006/customXml" ds:itemID="{75CBD9F4-6656-4014-B4D5-8B17207FEA1A}">
+<ds:datastoreItem xmlns:ds="http://schemas.openxmlformats.org/officeDocument/2006/customXml" ds:itemID="{1A296CD6-EC7F-4CC7-BFB1-0DA8C626D5FD}">
   <ds:schemaRefs>
     <ds:schemaRef ds:uri="http://schemas.openxmlformats.org/officeDocument/2006/bibliography"/>
   </ds:schemaRefs>

</xml_diff>

<commit_message>
Clean thesis document metadata
</commit_message>
<xml_diff>
--- a/docs/graduation_thesis_report.docx
+++ b/docs/graduation_thesis_report.docx
@@ -10003,7 +10003,7 @@
           <w:lang w:val="en-US"/>
         </w:rPr>
         <w:drawing>
-          <wp:inline distT="0" distB="0" distL="0" distR="0" wp14:anchorId="13F4F06E" wp14:editId="450C107E">
+          <wp:inline distT="0" distB="0" distL="0" distR="0" wp14:anchorId="13F4F06E" wp14:editId="4CA3AFF0">
             <wp:extent cx="5997778" cy="3952875"/>
             <wp:effectExtent l="0" t="0" r="3175" b="0"/>
             <wp:docPr id="36948891" name="Picture 1"/>
@@ -11387,7 +11387,7 @@
           <w:lang w:val="en-US"/>
         </w:rPr>
         <w:drawing>
-          <wp:inline distT="0" distB="0" distL="0" distR="0" wp14:anchorId="670A0A81" wp14:editId="5FC288EF">
+          <wp:inline distT="0" distB="0" distL="0" distR="0" wp14:anchorId="670A0A81" wp14:editId="72F8C4D2">
             <wp:extent cx="6162675" cy="4108228"/>
             <wp:effectExtent l="0" t="0" r="0" b="6985"/>
             <wp:docPr id="604311595" name="Picture 2"/>
@@ -13372,7 +13372,7 @@
         </w:rPr>
         <w:lastRenderedPageBreak/>
         <w:drawing>
-          <wp:inline distT="0" distB="0" distL="0" distR="0" wp14:anchorId="385ACC34" wp14:editId="433B94A6">
+          <wp:inline distT="0" distB="0" distL="0" distR="0" wp14:anchorId="385ACC34" wp14:editId="54844FDD">
             <wp:extent cx="6357908" cy="3705225"/>
             <wp:effectExtent l="0" t="0" r="5080" b="0"/>
             <wp:docPr id="1801230199" name="Picture 4"/>
@@ -14444,7 +14444,7 @@
         </w:rPr>
         <w:lastRenderedPageBreak/>
         <w:drawing>
-          <wp:inline distT="0" distB="0" distL="0" distR="0" wp14:anchorId="2FC8B4CF" wp14:editId="595F9748">
+          <wp:inline distT="0" distB="0" distL="0" distR="0" wp14:anchorId="2FC8B4CF" wp14:editId="638A87B0">
             <wp:extent cx="5868670" cy="3867785"/>
             <wp:effectExtent l="0" t="0" r="0" b="0"/>
             <wp:docPr id="656098705" name="Picture 5"/>
@@ -15540,9 +15540,9 @@
         <w:t>Overall, the project successfully demonstrates a reusable and dataset-adaptive dashboard platform for supply chain visibility and risk assessment. It shows how different supply chain datasets can be standardized and transformed into operational insights through dashboards, risk indicators, and forecasting modules.</w:t>
       </w:r>
     </w:p>
-    <w:bookmarkStart w:id="65" w:name="_Toc32521151" w:displacedByCustomXml="next"/>
+    <w:bookmarkStart w:id="65" w:name="_Toc230437542" w:displacedByCustomXml="next"/>
     <w:bookmarkStart w:id="66" w:name="_Toc494826192" w:displacedByCustomXml="next"/>
-    <w:bookmarkStart w:id="67" w:name="_Toc230437542" w:displacedByCustomXml="next"/>
+    <w:bookmarkStart w:id="67" w:name="_Toc32521151" w:displacedByCustomXml="next"/>
     <w:sdt>
       <w:sdtPr>
         <w:rPr>
@@ -17358,21 +17358,10 @@
   <w:p>
     <w:pPr>
       <w:pStyle w:val="Footer"/>
+      <w:rPr>
+        <w:lang w:val="tr-TR"/>
+      </w:rPr>
     </w:pPr>
-    <w:r>
-      <w:t xml:space="preserve"> African Journal of Industrial Engineering</w:t>
-    </w:r>
-    <w:r>
-      <w:t xml:space="preserve"> Month Year Vol _</w:t>
-    </w:r>
-    <w:proofErr w:type="gramStart"/>
-    <w:r>
-      <w:t>_(</w:t>
-    </w:r>
-    <w:proofErr w:type="gramEnd"/>
-    <w:r>
-      <w:t>_):  p1-3</w:t>
-    </w:r>
   </w:p>
 </w:ftr>
 </file>

</xml_diff>

<commit_message>
Fix inventory health generation and restore healthy metric
</commit_message>
<xml_diff>
--- a/docs/graduation_thesis_report.docx
+++ b/docs/graduation_thesis_report.docx
@@ -8621,7 +8621,7 @@
           <w:noProof/>
         </w:rPr>
         <w:drawing>
-          <wp:inline distT="0" distB="0" distL="0" distR="0" wp14:anchorId="670A0A81" wp14:editId="104D7BF7">
+          <wp:inline distT="0" distB="0" distL="0" distR="0" wp14:anchorId="670A0A81" wp14:editId="6C6008FE">
             <wp:extent cx="6162675" cy="4108228"/>
             <wp:effectExtent l="0" t="0" r="0" b="6985"/>
             <wp:docPr id="604311595" name="Picture 2"/>
@@ -9706,39 +9706,7 @@
                           <w:sz w:val="20"/>
                           <w:szCs w:val="20"/>
                         </w:rPr>
-                        <m:t>x</m:t>
-                      </m:r>
-                      <m:r>
-                        <w:rPr>
-                          <w:rFonts w:ascii="Cambria Math" w:hAnsi="Cambria Math"/>
-                          <w:sz w:val="20"/>
-                          <w:szCs w:val="20"/>
-                        </w:rPr>
-                        <m:t xml:space="preserve"> </m:t>
-                      </m:r>
-                      <m:r>
-                        <w:rPr>
-                          <w:rFonts w:ascii="Cambria Math" w:hAnsi="Cambria Math"/>
-                          <w:sz w:val="20"/>
-                          <w:szCs w:val="20"/>
-                        </w:rPr>
-                        <m:t>100,</m:t>
-                      </m:r>
-                      <m:r>
-                        <w:rPr>
-                          <w:rFonts w:ascii="Cambria Math" w:hAnsi="Cambria Math"/>
-                          <w:sz w:val="20"/>
-                          <w:szCs w:val="20"/>
-                        </w:rPr>
-                        <m:t xml:space="preserve"> </m:t>
-                      </m:r>
-                      <m:r>
-                        <w:rPr>
-                          <w:rFonts w:ascii="Cambria Math" w:hAnsi="Cambria Math"/>
-                          <w:sz w:val="20"/>
-                          <w:szCs w:val="20"/>
-                        </w:rPr>
-                        <m:t>100</m:t>
+                        <m:t>x 100, 100</m:t>
                       </m:r>
                     </m:e>
                   </m:d>
@@ -10056,15 +10024,7 @@
                   <w:sz w:val="20"/>
                   <w:szCs w:val="20"/>
                 </w:rPr>
-                <m:t>+0.20 x Delay Risk+0.20 x Demand Volatility Risk</m:t>
-              </m:r>
-              <m:r>
-                <w:rPr>
-                  <w:rFonts w:ascii="Cambria Math" w:hAnsi="Cambria Math"/>
-                  <w:sz w:val="20"/>
-                  <w:szCs w:val="20"/>
-                </w:rPr>
-                <m:t xml:space="preserve"> #</m:t>
+                <m:t>+0.20 x Delay Risk+0.20 x Demand Volatility Risk #</m:t>
               </m:r>
               <m:d>
                 <m:dPr>
@@ -10109,7 +10069,31 @@
     </w:p>
     <w:p>
       <w:r>
-        <w:t>The risk score is interpreted in three levels. A score below 30 is classified as Low Risk, a score between 30 and 60 is classified as Medium Risk, and a score above 60 is classified as High Risk. This classification helps users understand the risk level quickly without analyzing every component separately.</w:t>
+        <w:t xml:space="preserve">The risk score is interpreted in three levels. A score below </w:t>
+      </w:r>
+      <w:r>
+        <w:t>4</w:t>
+      </w:r>
+      <w:r>
+        <w:t xml:space="preserve">0 is classified as Low Risk, a score between </w:t>
+      </w:r>
+      <w:r>
+        <w:t>4</w:t>
+      </w:r>
+      <w:r>
+        <w:t xml:space="preserve">0 and </w:t>
+      </w:r>
+      <w:r>
+        <w:t>7</w:t>
+      </w:r>
+      <w:r>
+        <w:t xml:space="preserve">0 is classified as Medium Risk, and a score above </w:t>
+      </w:r>
+      <w:r>
+        <w:t>7</w:t>
+      </w:r>
+      <w:r>
+        <w:t>0 is classified as High Risk. This classification helps users understand the risk level quickly without analyzing every component separately.</w:t>
       </w:r>
     </w:p>
     <w:p>
@@ -10260,7 +10244,7 @@
         </w:rPr>
         <w:lastRenderedPageBreak/>
         <w:drawing>
-          <wp:inline distT="0" distB="0" distL="0" distR="0" wp14:anchorId="385ACC34" wp14:editId="7E976012">
+          <wp:inline distT="0" distB="0" distL="0" distR="0" wp14:anchorId="385ACC34" wp14:editId="08B03EA6">
             <wp:extent cx="5965647" cy="3476625"/>
             <wp:effectExtent l="0" t="0" r="0" b="0"/>
             <wp:docPr id="1801230199" name="Picture 4"/>
@@ -11066,7 +11050,7 @@
         </w:rPr>
         <w:lastRenderedPageBreak/>
         <w:drawing>
-          <wp:inline distT="0" distB="0" distL="0" distR="0" wp14:anchorId="2FC8B4CF" wp14:editId="7F3DBD62">
+          <wp:inline distT="0" distB="0" distL="0" distR="0" wp14:anchorId="2FC8B4CF" wp14:editId="129C13CC">
             <wp:extent cx="5868670" cy="3867785"/>
             <wp:effectExtent l="0" t="0" r="0" b="0"/>
             <wp:docPr id="656098705" name="Picture 5"/>
@@ -11805,9 +11789,9 @@
         <w:t>datasets can be standardized and transformed into operational insights through dashboards, risk indicators, and forecasting modules.</w:t>
       </w:r>
     </w:p>
-    <w:bookmarkStart w:id="65" w:name="_Toc230437542" w:displacedByCustomXml="next"/>
+    <w:bookmarkStart w:id="65" w:name="_Toc32521151" w:displacedByCustomXml="next"/>
     <w:bookmarkStart w:id="66" w:name="_Toc494826192" w:displacedByCustomXml="next"/>
-    <w:bookmarkStart w:id="67" w:name="_Toc32521151" w:displacedByCustomXml="next"/>
+    <w:bookmarkStart w:id="67" w:name="_Toc230437542" w:displacedByCustomXml="next"/>
     <w:sdt>
       <w:sdtPr>
         <w:rPr>
@@ -16112,7 +16096,7 @@
   <w:style w:type="paragraph" w:default="1" w:styleId="Normal">
     <w:name w:val="Normal"/>
     <w:qFormat/>
-    <w:rsid w:val="00B65A29"/>
+    <w:rsid w:val="00690EA2"/>
     <w:pPr>
       <w:spacing w:after="160" w:line="278" w:lineRule="auto"/>
     </w:pPr>
@@ -16319,7 +16303,7 @@
     <w:uiPriority w:val="1"/>
     <w:semiHidden/>
     <w:unhideWhenUsed/>
-    <w:rsid w:val="00B65A29"/>
+    <w:rsid w:val="00690EA2"/>
   </w:style>
   <w:style w:type="table" w:default="1" w:styleId="TableNormal">
     <w:name w:val="Normal Table"/>
@@ -16341,7 +16325,7 @@
     <w:uiPriority w:val="99"/>
     <w:semiHidden/>
     <w:unhideWhenUsed/>
-    <w:rsid w:val="00B65A29"/>
+    <w:rsid w:val="00690EA2"/>
   </w:style>
   <w:style w:type="paragraph" w:styleId="Title">
     <w:name w:val="Title"/>

</xml_diff>

<commit_message>
Align risk scoring formula and improve inventory generation
</commit_message>
<xml_diff>
--- a/docs/graduation_thesis_report.docx
+++ b/docs/graduation_thesis_report.docx
@@ -5976,15 +5976,7 @@
     </w:p>
     <w:p>
       <w:r>
-        <w:t xml:space="preserve">In this project, supply chain visibility is addressed through a multi-page dashboard structure. The platform brings different operational views together, including overview indicators, regional performance, inventory control, shipment performance, risk analysis, and demand forecasting. This supports the idea that supply chain visibility should not focus on only one </w:t>
-      </w:r>
-      <w:proofErr w:type="gramStart"/>
-      <w:r>
-        <w:t>metric, but</w:t>
-      </w:r>
-      <w:proofErr w:type="gramEnd"/>
-      <w:r>
-        <w:t xml:space="preserve"> should combine different operational indicators.</w:t>
+        <w:t>In this project, supply chain visibility is addressed through a multi-page dashboard structure. The platform brings different operational views together, including overview indicators, regional performance, inventory control, shipment performance, risk analysis, and demand forecasting. This supports the idea that supply chain visibility should not focus on only one metric, but should combine different operational indicators.</w:t>
       </w:r>
     </w:p>
     <w:p>
@@ -6191,7 +6183,7 @@
       </w:r>
       <w:sdt>
         <w:sdtPr>
-          <w:id w:val="-203481882"/>
+          <w:id w:val="1822148175"/>
           <w:citation/>
         </w:sdtPr>
         <w:sdtContent>
@@ -6199,7 +6191,10 @@
             <w:fldChar w:fldCharType="begin"/>
           </w:r>
           <w:r>
-            <w:instrText xml:space="preserve"> CITATION Das25 \l 1033 </w:instrText>
+            <w:rPr>
+              <w:lang w:val="tr-TR"/>
+            </w:rPr>
+            <w:instrText xml:space="preserve"> CITATION Chr04 \l 1055 </w:instrText>
           </w:r>
           <w:r>
             <w:fldChar w:fldCharType="separate"/>
@@ -6207,8 +6202,9 @@
           <w:r>
             <w:rPr>
               <w:noProof/>
+              <w:lang w:val="tr-TR"/>
             </w:rPr>
-            <w:t>(Das, Kumar, &amp; Tiwari, 2025)</w:t>
+            <w:t>(Christopher &amp; Peck, 2004)</w:t>
           </w:r>
           <w:r>
             <w:fldChar w:fldCharType="end"/>
@@ -6310,7 +6306,7 @@
       </w:r>
       <w:sdt>
         <w:sdtPr>
-          <w:id w:val="788474870"/>
+          <w:id w:val="-37368276"/>
           <w:citation/>
         </w:sdtPr>
         <w:sdtContent>
@@ -6318,7 +6314,10 @@
             <w:fldChar w:fldCharType="begin"/>
           </w:r>
           <w:r>
-            <w:instrText xml:space="preserve"> CITATION IBM24 \l 1033 </w:instrText>
+            <w:rPr>
+              <w:lang w:val="tr-TR"/>
+            </w:rPr>
+            <w:instrText xml:space="preserve"> CITATION Kac17 \l 1055 </w:instrText>
           </w:r>
           <w:r>
             <w:fldChar w:fldCharType="separate"/>
@@ -6326,8 +6325,9 @@
           <w:r>
             <w:rPr>
               <w:noProof/>
+              <w:lang w:val="tr-TR"/>
             </w:rPr>
-            <w:t>(IBM, 2024)</w:t>
+            <w:t>(Kache &amp; Seuring, 2017)</w:t>
           </w:r>
           <w:r>
             <w:fldChar w:fldCharType="end"/>
@@ -6624,15 +6624,7 @@
     </w:p>
     <w:p>
       <w:r>
-        <w:t xml:space="preserve">Another original aspect of the project is the integration of multiple supply chain analysis areas </w:t>
-      </w:r>
-      <w:proofErr w:type="gramStart"/>
-      <w:r>
-        <w:t>in</w:t>
-      </w:r>
-      <w:proofErr w:type="gramEnd"/>
-      <w:r>
-        <w:t xml:space="preserve"> one platform. The system does not only show order or sales information. It combines executive KPIs, regional performance analysis, inventory control indicators, shipment </w:t>
+        <w:t xml:space="preserve">Another original aspect of the project is the integration of multiple supply chain analysis areas in one platform. The system does not only show order or sales information. It combines executive KPIs, regional performance analysis, inventory control indicators, shipment </w:t>
       </w:r>
       <w:r>
         <w:lastRenderedPageBreak/>
@@ -6705,15 +6697,7 @@
     </w:p>
     <w:p>
       <w:r>
-        <w:t xml:space="preserve">The solution approach of this project is based on developing a dataset-adaptive supply chain dashboard platform. The system is designed to work with a default demonstration dataset </w:t>
-      </w:r>
-      <w:proofErr w:type="gramStart"/>
-      <w:r>
-        <w:t>and also</w:t>
-      </w:r>
-      <w:proofErr w:type="gramEnd"/>
-      <w:r>
-        <w:t xml:space="preserve"> with user-uploaded supply chain datasets. The main idea is to transform different supply chain datasets into a common analytical structure and then generate dashboard modules from the active dataset.</w:t>
+        <w:t>The solution approach of this project is based on developing a dataset-adaptive supply chain dashboard platform. The system is designed to work with a default demonstration dataset and also with user-uploaded supply chain datasets. The main idea is to transform different supply chain datasets into a common analytical structure and then generate dashboard modules from the active dataset.</w:t>
       </w:r>
     </w:p>
     <w:p>
@@ -6769,52 +6753,12 @@
     </w:p>
     <w:p>
       <w:r>
-        <w:t xml:space="preserve">In the Data Source Manager, users map the columns of the uploaded dataset to the standard supply chain </w:t>
-      </w:r>
-      <w:proofErr w:type="gramStart"/>
-      <w:r>
-        <w:t>schema</w:t>
-      </w:r>
-      <w:proofErr w:type="gramEnd"/>
-      <w:r>
-        <w:t>. The required fields include order ID, order date, product name, category name, and order quantity. Optional fields include shipping date, scheduled delivery date, delivery status, actual shipping days, scheduled shipping days, shipping mode, market, region, country, sales, and profit.</w:t>
-      </w:r>
-    </w:p>
-    <w:p>
-      <w:r>
-        <w:t xml:space="preserve">After the mapping is completed, the system standardizes the uploaded dataset. It converts date fields, numeric fields, and text fields into a common format. It also derives additional indicators where possible. For example, if actual shipping days and scheduled shipping days are not available, the system can calculate </w:t>
-      </w:r>
-      <w:proofErr w:type="gramStart"/>
-      <w:r>
-        <w:t>delay</w:t>
-      </w:r>
-      <w:proofErr w:type="gramEnd"/>
-      <w:r>
-        <w:t xml:space="preserve"> days by comparing </w:t>
-      </w:r>
-      <w:proofErr w:type="gramStart"/>
-      <w:r>
-        <w:t>delivered</w:t>
-      </w:r>
-      <w:proofErr w:type="gramEnd"/>
-      <w:r>
-        <w:t xml:space="preserve"> </w:t>
-      </w:r>
-      <w:proofErr w:type="gramStart"/>
-      <w:r>
-        <w:t>date</w:t>
-      </w:r>
-      <w:proofErr w:type="gramEnd"/>
-      <w:r>
-        <w:t xml:space="preserve"> and scheduled delivery </w:t>
-      </w:r>
-      <w:proofErr w:type="gramStart"/>
-      <w:r>
-        <w:t>date</w:t>
-      </w:r>
-      <w:proofErr w:type="gramEnd"/>
-      <w:r>
-        <w:t>.</w:t>
+        <w:t>In the Data Source Manager, users map the columns of the uploaded dataset to the standard supply chain schema. The required fields include order ID, order date, product name, category name, and order quantity. Optional fields include shipping date, scheduled delivery date, delivery status, actual shipping days, scheduled shipping days, shipping mode, market, region, country, sales, and profit.</w:t>
+      </w:r>
+    </w:p>
+    <w:p>
+      <w:r>
+        <w:t>After the mapping is completed, the system standardizes the uploaded dataset. It converts date fields, numeric fields, and text fields into a common format. It also derives additional indicators where possible. For example, if actual shipping days and scheduled shipping days are not available, the system can calculate delay days by comparing delivered date and scheduled delivery date.</w:t>
       </w:r>
     </w:p>
     <w:p>
@@ -6859,15 +6803,7 @@
     </w:p>
     <w:p>
       <w:r>
-        <w:t xml:space="preserve">This structure allows the system to work as a flexible platform instead of a static dashboard. The same dashboard pages can be used with different supply chain datasets </w:t>
-      </w:r>
-      <w:proofErr w:type="gramStart"/>
-      <w:r>
-        <w:t>as long as</w:t>
-      </w:r>
-      <w:proofErr w:type="gramEnd"/>
-      <w:r>
-        <w:t xml:space="preserve"> the required fields are mapped correctly.</w:t>
+        <w:t>This structure allows the system to work as a flexible platform instead of a static dashboard. The same dashboard pages can be used with different supply chain datasets as long as the required fields are mapped correctly.</w:t>
       </w:r>
     </w:p>
     <w:p>
@@ -6983,21 +6919,8 @@
       <w:bookmarkEnd w:id="32"/>
     </w:p>
     <w:p>
-      <w:proofErr w:type="gramStart"/>
-      <w:r>
-        <w:t>pandas</w:t>
-      </w:r>
-      <w:proofErr w:type="gramEnd"/>
-      <w:r>
-        <w:t xml:space="preserve"> </w:t>
-      </w:r>
-      <w:proofErr w:type="gramStart"/>
-      <w:r>
-        <w:t>was</w:t>
-      </w:r>
-      <w:proofErr w:type="gramEnd"/>
-      <w:r>
-        <w:t xml:space="preserve"> used for reading CSV and Excel files, cleaning the dataset, grouping records, calculating KPIs, and creating analytical tables. NumPy was used for numerical calculations and handling missing numerical values.</w:t>
+      <w:r>
+        <w:t>pandas was used for reading CSV and Excel files, cleaning the dataset, grouping records, calculating KPIs, and creating analytical tables. NumPy was used for numerical calculations and handling missing numerical values.</w:t>
       </w:r>
       <w:sdt>
         <w:sdtPr>
@@ -7018,13 +6941,7 @@
             <w:rPr>
               <w:noProof/>
             </w:rPr>
-            <w:t xml:space="preserve"> </w:t>
-          </w:r>
-          <w:r>
-            <w:rPr>
-              <w:noProof/>
-            </w:rPr>
-            <w:t>(pandas development team, n.d.)</w:t>
+            <w:t xml:space="preserve"> (pandas development team, n.d.)</w:t>
           </w:r>
           <w:r>
             <w:fldChar w:fldCharType="end"/>
@@ -7057,15 +6974,7 @@
       </w:r>
       <w:proofErr w:type="spellEnd"/>
       <w:r>
-        <w:t xml:space="preserve"> was used to develop </w:t>
-      </w:r>
-      <w:proofErr w:type="gramStart"/>
-      <w:r>
-        <w:t>the</w:t>
-      </w:r>
-      <w:proofErr w:type="gramEnd"/>
-      <w:r>
-        <w:t xml:space="preserve"> interactive dashboard interface. It allowed the project to include different pages, filters, file upload components, KPI cards, charts, and tables.</w:t>
+        <w:t xml:space="preserve"> was used to develop the interactive dashboard interface. It allowed the project to include different pages, filters, file upload components, KPI cards, charts, and tables.</w:t>
       </w:r>
     </w:p>
     <w:p>
@@ -7850,15 +7759,7 @@
     </w:p>
     <w:p>
       <w:r>
-        <w:t xml:space="preserve">The standard </w:t>
-      </w:r>
-      <w:proofErr w:type="gramStart"/>
-      <w:r>
-        <w:t>schema</w:t>
-      </w:r>
-      <w:proofErr w:type="gramEnd"/>
-      <w:r>
-        <w:t xml:space="preserve"> used in the platform is shown in Table 2.</w:t>
+        <w:t>The standard schema used in the platform is shown in Table 2.</w:t>
       </w:r>
       <w:r>
         <w:t xml:space="preserve"> </w:t>
@@ -8553,15 +8454,7 @@
     <w:p>
       <w:r>
         <w:lastRenderedPageBreak/>
-        <w:t xml:space="preserve">If an optional field is not available in the uploaded dataset, the system uses default values or derives indicators when possible. For example, if actual shipping days and scheduled shipping days are not available, the system can calculate </w:t>
-      </w:r>
-      <w:proofErr w:type="gramStart"/>
-      <w:r>
-        <w:t>delay</w:t>
-      </w:r>
-      <w:proofErr w:type="gramEnd"/>
-      <w:r>
-        <w:t xml:space="preserve"> days by comparing the actual delivery date and the scheduled delivery date. This improves the flexibility of the platform and allows it to work with different supply chain datasets.</w:t>
+        <w:t>If an optional field is not available in the uploaded dataset, the system uses default values or derives indicators when possible. For example, if actual shipping days and scheduled shipping days are not available, the system can calculate delay days by comparing the actual delivery date and the scheduled delivery date. This improves the flexibility of the platform and allows it to work with different supply chain datasets.</w:t>
       </w:r>
     </w:p>
     <w:p>
@@ -8621,7 +8514,7 @@
           <w:noProof/>
         </w:rPr>
         <w:drawing>
-          <wp:inline distT="0" distB="0" distL="0" distR="0" wp14:anchorId="670A0A81" wp14:editId="6C6008FE">
+          <wp:inline distT="0" distB="0" distL="0" distR="0" wp14:anchorId="670A0A81" wp14:editId="2B695BA8">
             <wp:extent cx="6162675" cy="4108228"/>
             <wp:effectExtent l="0" t="0" r="0" b="6985"/>
             <wp:docPr id="604311595" name="Picture 2"/>
@@ -8735,15 +8628,7 @@
     </w:p>
     <w:p>
       <w:r>
-        <w:t xml:space="preserve">The platform includes six dashboard modules. Each module focuses on a different part of supply chain visibility and risk analysis. These modules work with </w:t>
-      </w:r>
-      <w:proofErr w:type="gramStart"/>
-      <w:r>
-        <w:t>the</w:t>
-      </w:r>
-      <w:proofErr w:type="gramEnd"/>
-      <w:r>
-        <w:t xml:space="preserve"> active dataset. If the user activates an uploaded dataset, the same dashboard modules are updated according to the uploaded data.</w:t>
+        <w:t>The platform includes six dashboard modules. Each module focuses on a different part of supply chain visibility and risk analysis. These modules work with the active dataset. If the user activates an uploaded dataset, the same dashboard modules are updated according to the uploaded data.</w:t>
       </w:r>
     </w:p>
     <w:p>
@@ -8926,13 +8811,8 @@
             <w:tcW w:w="1666" w:type="pct"/>
           </w:tcPr>
           <w:p>
-            <w:proofErr w:type="gramStart"/>
-            <w:r>
-              <w:t>Compares</w:t>
-            </w:r>
-            <w:proofErr w:type="gramEnd"/>
-            <w:r>
-              <w:t xml:space="preserve"> markets, regions, and countries</w:t>
+            <w:r>
+              <w:t>Compares markets, regions, and countries</w:t>
             </w:r>
           </w:p>
         </w:tc>
@@ -10098,26 +9978,10 @@
     </w:p>
     <w:p>
       <w:r>
-        <w:t xml:space="preserve">The </w:t>
-      </w:r>
-      <w:proofErr w:type="gramStart"/>
-      <w:r>
-        <w:t>displayed risk scores</w:t>
-      </w:r>
-      <w:proofErr w:type="gramEnd"/>
-      <w:r>
-        <w:t xml:space="preserve"> are also affected by dashboard filters</w:t>
-      </w:r>
-      <w:r>
-        <w:t xml:space="preserve">. When the user filters the dataset by market, category, shipping mode, or date range, the risk components are recalculated based on the filtered data. This makes </w:t>
-      </w:r>
-      <w:proofErr w:type="gramStart"/>
-      <w:r>
-        <w:t>the risk</w:t>
-      </w:r>
-      <w:proofErr w:type="gramEnd"/>
-      <w:r>
-        <w:t xml:space="preserve"> analysis interactive and more useful for decision-making.</w:t>
+        <w:t>The displayed risk scores are also affected by dashboard filters</w:t>
+      </w:r>
+      <w:r>
+        <w:t>. When the user filters the dataset by market, category, shipping mode, or date range, the risk components are recalculated based on the filtered data. This makes the risk analysis interactive and more useful for decision-making.</w:t>
       </w:r>
     </w:p>
     <w:p>
@@ -10176,23 +10040,7 @@
     </w:p>
     <w:p>
       <w:r>
-        <w:t xml:space="preserve">The forecasting approach is intentionally simple because the </w:t>
-      </w:r>
-      <w:proofErr w:type="gramStart"/>
-      <w:r>
-        <w:t>main focus</w:t>
-      </w:r>
-      <w:proofErr w:type="gramEnd"/>
-      <w:r>
-        <w:t xml:space="preserve"> of the project is </w:t>
-      </w:r>
-      <w:proofErr w:type="gramStart"/>
-      <w:r>
-        <w:t>supply</w:t>
-      </w:r>
-      <w:proofErr w:type="gramEnd"/>
-      <w:r>
-        <w:t xml:space="preserve"> chain visibility and risk assessment. The purpose of the forecast module is to demonstrate how demand data can support planning decisions, not to create a highly advanced forecasting system.</w:t>
+        <w:t>The forecasting approach is intentionally simple because the main focus of the project is supply chain visibility and risk assessment. The purpose of the forecast module is to demonstrate how demand data can support planning decisions, not to create a highly advanced forecasting system.</w:t>
       </w:r>
     </w:p>
     <w:p>
@@ -10244,7 +10092,7 @@
         </w:rPr>
         <w:lastRenderedPageBreak/>
         <w:drawing>
-          <wp:inline distT="0" distB="0" distL="0" distR="0" wp14:anchorId="385ACC34" wp14:editId="08B03EA6">
+          <wp:inline distT="0" distB="0" distL="0" distR="0" wp14:anchorId="385ACC34" wp14:editId="4588C7E4">
             <wp:extent cx="5965647" cy="3476625"/>
             <wp:effectExtent l="0" t="0" r="0" b="0"/>
             <wp:docPr id="1801230199" name="Picture 4"/>
@@ -10715,15 +10563,7 @@
     </w:p>
     <w:p>
       <w:r>
-        <w:t xml:space="preserve">The company needs a reusable dashboard platform that can work with different supply chain datasets. The platform should not require code changes every time a new </w:t>
-      </w:r>
-      <w:proofErr w:type="gramStart"/>
-      <w:r>
-        <w:t>dataset</w:t>
-      </w:r>
-      <w:proofErr w:type="gramEnd"/>
-      <w:r>
-        <w:t xml:space="preserve"> is analyzed. </w:t>
+        <w:t xml:space="preserve">The company needs a reusable dashboard platform that can work with different supply chain datasets. The platform should not require code changes every time a new dataset is analyzed. </w:t>
       </w:r>
       <w:r>
         <w:lastRenderedPageBreak/>
@@ -11050,7 +10890,7 @@
         </w:rPr>
         <w:lastRenderedPageBreak/>
         <w:drawing>
-          <wp:inline distT="0" distB="0" distL="0" distR="0" wp14:anchorId="2FC8B4CF" wp14:editId="129C13CC">
+          <wp:inline distT="0" distB="0" distL="0" distR="0" wp14:anchorId="2FC8B4CF" wp14:editId="089B368F">
             <wp:extent cx="5868670" cy="3867785"/>
             <wp:effectExtent l="0" t="0" r="0" b="0"/>
             <wp:docPr id="656098705" name="Picture 5"/>
@@ -11163,15 +11003,7 @@
     </w:p>
     <w:p>
       <w:r>
-        <w:t xml:space="preserve">An example usage flow starts with the user opening the platform. </w:t>
-      </w:r>
-      <w:proofErr w:type="gramStart"/>
-      <w:r>
-        <w:t>At first</w:t>
-      </w:r>
-      <w:proofErr w:type="gramEnd"/>
-      <w:r>
-        <w:t xml:space="preserve">, the default </w:t>
+        <w:t xml:space="preserve">An example usage flow starts with the user opening the platform. At first, the default </w:t>
       </w:r>
       <w:proofErr w:type="spellStart"/>
       <w:r>
@@ -11179,15 +11011,7 @@
       </w:r>
       <w:proofErr w:type="spellEnd"/>
       <w:r>
-        <w:t xml:space="preserve"> dataset is active. The user can review the default </w:t>
-      </w:r>
-      <w:proofErr w:type="gramStart"/>
-      <w:r>
-        <w:t>dashboard, or</w:t>
-      </w:r>
-      <w:proofErr w:type="gramEnd"/>
-      <w:r>
-        <w:t xml:space="preserve"> upload a new supply chain dataset through the Data Source Manager.</w:t>
+        <w:t xml:space="preserve"> dataset is active. The user can review the default dashboard, or upload a new supply chain dataset through the Data Source Manager.</w:t>
       </w:r>
     </w:p>
     <w:p>
@@ -11680,15 +11504,7 @@
     <w:p/>
     <w:p>
       <w:r>
-        <w:t xml:space="preserve">These tests show that the platform can process the default dataset, support uploaded datasets through schema mapping, and generate the main dashboard outputs. However, the validation is limited to functional testing. The current version does not include automated unit tests, stress testing with very </w:t>
-      </w:r>
-      <w:proofErr w:type="gramStart"/>
-      <w:r>
-        <w:t>large uploaded</w:t>
-      </w:r>
-      <w:proofErr w:type="gramEnd"/>
-      <w:r>
-        <w:t xml:space="preserve"> files, or live ERP/API integration testing. These limitations are considered future improvement areas.</w:t>
+        <w:t>These tests show that the platform can process the default dataset, support uploaded datasets through schema mapping, and generate the main dashboard outputs. However, the validation is limited to functional testing. The current version does not include automated unit tests, stress testing with very large uploaded files, or live ERP/API integration testing. These limitations are considered future improvement areas.</w:t>
       </w:r>
     </w:p>
     <w:p>
@@ -11728,15 +11544,7 @@
     </w:p>
     <w:p>
       <w:r>
-        <w:t xml:space="preserve">The completed platform includes several dashboard modules: Overview, Regional Performance, Inventory Control, Shipment Performance, Supply Chain Risk, and Demand Forecast. These modules provide key performance indicators, charts, tables, risk scores, and </w:t>
-      </w:r>
-      <w:proofErr w:type="gramStart"/>
-      <w:r>
-        <w:t>forecasting</w:t>
-      </w:r>
-      <w:proofErr w:type="gramEnd"/>
-      <w:r>
-        <w:t xml:space="preserve"> outputs. The dashboard helps users analyze delivery performance, shipment delays, inventory status, regional differences, demand trends, and overall supply chain risk.</w:t>
+        <w:t>The completed platform includes several dashboard modules: Overview, Regional Performance, Inventory Control, Shipment Performance, Supply Chain Risk, and Demand Forecast. These modules provide key performance indicators, charts, tables, risk scores, and forecasting outputs. The dashboard helps users analyze delivery performance, shipment delays, inventory status, regional differences, demand trends, and overall supply chain risk.</w:t>
       </w:r>
     </w:p>
     <w:p>
@@ -11789,9 +11597,9 @@
         <w:t>datasets can be standardized and transformed into operational insights through dashboards, risk indicators, and forecasting modules.</w:t>
       </w:r>
     </w:p>
-    <w:bookmarkStart w:id="65" w:name="_Toc32521151" w:displacedByCustomXml="next"/>
+    <w:bookmarkStart w:id="65" w:name="_Toc230437542" w:displacedByCustomXml="next"/>
     <w:bookmarkStart w:id="66" w:name="_Toc494826192" w:displacedByCustomXml="next"/>
-    <w:bookmarkStart w:id="67" w:name="_Toc230437542" w:displacedByCustomXml="next"/>
+    <w:bookmarkStart w:id="67" w:name="_Toc32521151" w:displacedByCustomXml="next"/>
     <w:sdt>
       <w:sdtPr>
         <w:rPr>
@@ -11822,6 +11630,8 @@
             <w:ind w:left="720" w:hanging="720"/>
             <w:rPr>
               <w:noProof/>
+              <w:kern w:val="0"/>
+              <w14:ligatures w14:val="none"/>
             </w:rPr>
           </w:pPr>
           <w:r>
@@ -11833,6 +11643,35 @@
           <w:r>
             <w:fldChar w:fldCharType="separate"/>
           </w:r>
+          <w:r>
+            <w:rPr>
+              <w:noProof/>
+            </w:rPr>
+            <w:t xml:space="preserve">Christopher, M., &amp; Peck, H. (2004). Building the resilient supply chain. </w:t>
+          </w:r>
+          <w:r>
+            <w:rPr>
+              <w:i/>
+              <w:iCs/>
+              <w:noProof/>
+            </w:rPr>
+            <w:t>The International Journal of Logistics Management</w:t>
+          </w:r>
+          <w:r>
+            <w:rPr>
+              <w:noProof/>
+            </w:rPr>
+            <w:t>, 15(2), 1–13.</w:t>
+          </w:r>
+        </w:p>
+        <w:p>
+          <w:pPr>
+            <w:pStyle w:val="Bibliography"/>
+            <w:ind w:left="720" w:hanging="720"/>
+            <w:rPr>
+              <w:noProof/>
+            </w:rPr>
+          </w:pPr>
           <w:r>
             <w:rPr>
               <w:noProof/>
@@ -11939,6 +11778,35 @@
               <w:noProof/>
             </w:rPr>
             <w:t xml:space="preserve"> Retrieved from IBM Think: https://www.ibm.com/think/topics/data-quality-dimensions</w:t>
+          </w:r>
+        </w:p>
+        <w:p>
+          <w:pPr>
+            <w:pStyle w:val="Bibliography"/>
+            <w:ind w:left="720" w:hanging="720"/>
+            <w:rPr>
+              <w:noProof/>
+            </w:rPr>
+          </w:pPr>
+          <w:r>
+            <w:rPr>
+              <w:noProof/>
+            </w:rPr>
+            <w:t xml:space="preserve">Kache, F., &amp; Seuring, S. (2017). Challenges and opportunities of digital information at the intersection of Big Data Analytics and supply chain management. </w:t>
+          </w:r>
+          <w:r>
+            <w:rPr>
+              <w:i/>
+              <w:iCs/>
+              <w:noProof/>
+            </w:rPr>
+            <w:t>International Journal of Operations &amp; Production Management</w:t>
+          </w:r>
+          <w:r>
+            <w:rPr>
+              <w:noProof/>
+            </w:rPr>
+            <w:t>, 37(1), 10–36.</w:t>
           </w:r>
         </w:p>
         <w:p>
@@ -12145,6 +12013,36 @@
           </w:r>
         </w:p>
         <w:p>
+          <w:pPr>
+            <w:pStyle w:val="Bibliography"/>
+            <w:ind w:left="720" w:hanging="720"/>
+            <w:rPr>
+              <w:noProof/>
+            </w:rPr>
+          </w:pPr>
+          <w:r>
+            <w:rPr>
+              <w:noProof/>
+            </w:rPr>
+            <w:lastRenderedPageBreak/>
+            <w:t xml:space="preserve">Wieland, A., &amp; Wallenburg, C. (2012). Dealing with supply chain risks: Linking risk management practices and strategies to performance. </w:t>
+          </w:r>
+          <w:r>
+            <w:rPr>
+              <w:i/>
+              <w:iCs/>
+              <w:noProof/>
+            </w:rPr>
+            <w:t>International Journal of Physical Distribution &amp; Logistics Management</w:t>
+          </w:r>
+          <w:r>
+            <w:rPr>
+              <w:noProof/>
+            </w:rPr>
+            <w:t>, 42(10), 887–905.</w:t>
+          </w:r>
+        </w:p>
+        <w:p>
           <w:r>
             <w:fldChar w:fldCharType="end"/>
           </w:r>
@@ -12768,25 +12666,7 @@
           <w:bCs/>
           <w:lang w:eastAsia="tr-TR"/>
         </w:rPr>
-        <w:t xml:space="preserve">Performed data cleaning and </w:t>
-      </w:r>
-      <w:proofErr w:type="gramStart"/>
-      <w:r>
-        <w:rPr>
-          <w:b/>
-          <w:bCs/>
-          <w:lang w:eastAsia="tr-TR"/>
-        </w:rPr>
-        <w:t>exploratory</w:t>
-      </w:r>
-      <w:proofErr w:type="gramEnd"/>
-      <w:r>
-        <w:rPr>
-          <w:b/>
-          <w:bCs/>
-          <w:lang w:eastAsia="tr-TR"/>
-        </w:rPr>
-        <w:t xml:space="preserve"> data analysis on housing data using Python.</w:t>
+        <w:t>Performed data cleaning and exploratory data analysis on housing data using Python.</w:t>
       </w:r>
     </w:p>
     <w:p>
@@ -12825,25 +12705,7 @@
           <w:bCs/>
           <w:lang w:eastAsia="tr-TR"/>
         </w:rPr>
-        <w:t xml:space="preserve">Conducted data preprocessing and </w:t>
-      </w:r>
-      <w:proofErr w:type="gramStart"/>
-      <w:r>
-        <w:rPr>
-          <w:b/>
-          <w:bCs/>
-          <w:lang w:eastAsia="tr-TR"/>
-        </w:rPr>
-        <w:t>exploratory</w:t>
-      </w:r>
-      <w:proofErr w:type="gramEnd"/>
-      <w:r>
-        <w:rPr>
-          <w:b/>
-          <w:bCs/>
-          <w:lang w:eastAsia="tr-TR"/>
-        </w:rPr>
-        <w:t xml:space="preserve"> analysis on a biological dataset using Python.</w:t>
+        <w:t>Conducted data preprocessing and exploratory analysis on a biological dataset using Python.</w:t>
       </w:r>
     </w:p>
     <w:p>
@@ -16096,7 +15958,7 @@
   <w:style w:type="paragraph" w:default="1" w:styleId="Normal">
     <w:name w:val="Normal"/>
     <w:qFormat/>
-    <w:rsid w:val="00690EA2"/>
+    <w:rsid w:val="009866A0"/>
     <w:pPr>
       <w:spacing w:after="160" w:line="278" w:lineRule="auto"/>
     </w:pPr>
@@ -16303,7 +16165,7 @@
     <w:uiPriority w:val="1"/>
     <w:semiHidden/>
     <w:unhideWhenUsed/>
-    <w:rsid w:val="00690EA2"/>
+    <w:rsid w:val="009866A0"/>
   </w:style>
   <w:style w:type="table" w:default="1" w:styleId="TableNormal">
     <w:name w:val="Normal Table"/>
@@ -16325,7 +16187,7 @@
     <w:uiPriority w:val="99"/>
     <w:semiHidden/>
     <w:unhideWhenUsed/>
-    <w:rsid w:val="00690EA2"/>
+    <w:rsid w:val="009866A0"/>
   </w:style>
   <w:style w:type="paragraph" w:styleId="Title">
     <w:name w:val="Title"/>
@@ -17973,7 +17835,7 @@
     <b:InternetSiteTitle>Computers in Industry</b:InternetSiteTitle>
     <b:Year>2023</b:Year>
     <b:URL>https://www.sciencedirect.com/science/article/pii/S016636152200207X</b:URL>
-    <b:RefOrder>6</b:RefOrder>
+    <b:RefOrder>7</b:RefOrder>
   </b:Source>
   <b:Source>
     <b:Tag>IBM24</b:Tag>
@@ -17988,7 +17850,7 @@
     <b:InternetSiteTitle>IBM Think</b:InternetSiteTitle>
     <b:Year>2024</b:Year>
     <b:URL>https://www.ibm.com/think/topics/data-quality-dimensions</b:URL>
-    <b:RefOrder>5</b:RefOrder>
+    <b:RefOrder>6</b:RefOrder>
   </b:Source>
   <b:Source>
     <b:Tag>Hyn21</b:Tag>
@@ -18012,7 +17874,7 @@
       </b:Author>
     </b:Author>
     <b:Publisher>OTexts</b:Publisher>
-    <b:RefOrder>7</b:RefOrder>
+    <b:RefOrder>9</b:RefOrder>
   </b:Source>
   <b:Source>
     <b:Tag>Str</b:Tag>
@@ -18027,7 +17889,7 @@
     <b:InternetSiteTitle>Streamlit Documentation</b:InternetSiteTitle>
     <b:URL>https://docs.streamlit.io/develop/api-reference/widgets/st.file_uploader</b:URL>
     <b:Year>n.d.</b:Year>
-    <b:RefOrder>11</b:RefOrder>
+    <b:RefOrder>13</b:RefOrder>
   </b:Source>
   <b:Source>
     <b:Tag>Kagnd</b:Tag>
@@ -18042,7 +17904,7 @@
     <b:InternetSiteTitle>Kaggle</b:InternetSiteTitle>
     <b:URL>https://www.kaggle.com/datasets/shashwatwork/dataco-smart-supply-chain-for-big-data-analysis</b:URL>
     <b:Year>n.d.</b:Year>
-    <b:RefOrder>8</b:RefOrder>
+    <b:RefOrder>10</b:RefOrder>
   </b:Source>
   <b:Source>
     <b:Tag>pannd</b:Tag>
@@ -18057,7 +17919,7 @@
     </b:Author>
     <b:InternetSiteTitle>pandas Documentation</b:InternetSiteTitle>
     <b:URL>https://pandas.pydata.org/docs/user_guide/index.html</b:URL>
-    <b:RefOrder>9</b:RefOrder>
+    <b:RefOrder>11</b:RefOrder>
   </b:Source>
   <b:Source>
     <b:Tag>scind</b:Tag>
@@ -18072,7 +17934,7 @@
     <b:InternetSiteTitle>scikit-learn Documentation</b:InternetSiteTitle>
     <b:Year>n.d.</b:Year>
     <b:URL>https://scikit-learn.org/stable/modules/generated/sklearn.linear_model.LinearRegression.html</b:URL>
-    <b:RefOrder>10</b:RefOrder>
+    <b:RefOrder>12</b:RefOrder>
   </b:Source>
   <b:Source>
     <b:Tag>Kal22</b:Tag>
@@ -18105,11 +17967,83 @@
     <b:JournalName>International Journal of Production Economics</b:JournalName>
     <b:RefOrder>2</b:RefOrder>
   </b:Source>
+  <b:Source>
+    <b:Tag>Chr04</b:Tag>
+    <b:SourceType>JournalArticle</b:SourceType>
+    <b:Guid>{C26D6BA7-B762-423C-8780-33CFDC6C909C}</b:Guid>
+    <b:Title>Building the resilient supply chain</b:Title>
+    <b:Year>2004</b:Year>
+    <b:Author>
+      <b:Author>
+        <b:NameList>
+          <b:Person>
+            <b:Last>Christopher</b:Last>
+            <b:First>M.</b:First>
+          </b:Person>
+          <b:Person>
+            <b:Last>Peck</b:Last>
+            <b:First>H.</b:First>
+          </b:Person>
+        </b:NameList>
+      </b:Author>
+    </b:Author>
+    <b:JournalName>The International Journal of Logistics Management</b:JournalName>
+    <b:Pages>15(2), 1–13</b:Pages>
+    <b:RefOrder>5</b:RefOrder>
+  </b:Source>
+  <b:Source>
+    <b:Tag>Wie12</b:Tag>
+    <b:SourceType>JournalArticle</b:SourceType>
+    <b:Guid>{A0C1881F-DF0B-4A68-AC92-E78F3904A273}</b:Guid>
+    <b:Title>Dealing with supply chain risks: Linking risk management practices and strategies to performance.</b:Title>
+    <b:JournalName>International Journal of Physical Distribution &amp; Logistics Management</b:JournalName>
+    <b:Year>2012</b:Year>
+    <b:Pages>42(10), 887–905</b:Pages>
+    <b:Author>
+      <b:Author>
+        <b:NameList>
+          <b:Person>
+            <b:Last>Wieland</b:Last>
+            <b:First>A.</b:First>
+          </b:Person>
+          <b:Person>
+            <b:Last>Wallenburg</b:Last>
+            <b:First>C. M.</b:First>
+          </b:Person>
+        </b:NameList>
+      </b:Author>
+    </b:Author>
+    <b:RefOrder>14</b:RefOrder>
+  </b:Source>
+  <b:Source>
+    <b:Tag>Kac17</b:Tag>
+    <b:SourceType>JournalArticle</b:SourceType>
+    <b:Guid>{3FAAE433-C11C-44FD-B726-46FACC67BE1E}</b:Guid>
+    <b:Title>Challenges and opportunities of digital information at the intersection of Big Data Analytics and supply chain management.</b:Title>
+    <b:JournalName>International Journal of Operations &amp; Production Management</b:JournalName>
+    <b:Year>2017</b:Year>
+    <b:Pages>37(1), 10–36</b:Pages>
+    <b:Author>
+      <b:Author>
+        <b:NameList>
+          <b:Person>
+            <b:Last>Kache</b:Last>
+            <b:First>F.</b:First>
+          </b:Person>
+          <b:Person>
+            <b:Last>Seuring</b:Last>
+            <b:First>S.</b:First>
+          </b:Person>
+        </b:NameList>
+      </b:Author>
+    </b:Author>
+    <b:RefOrder>8</b:RefOrder>
+  </b:Source>
 </b:Sources>
 </file>
 
 <file path=customXml/itemProps1.xml><?xml version="1.0" encoding="utf-8"?>
-<ds:datastoreItem xmlns:ds="http://schemas.openxmlformats.org/officeDocument/2006/customXml" ds:itemID="{1A296CD6-EC7F-4CC7-BFB1-0DA8C626D5FD}">
+<ds:datastoreItem xmlns:ds="http://schemas.openxmlformats.org/officeDocument/2006/customXml" ds:itemID="{D58BBEA2-10E2-421B-A258-D65937CA6344}">
   <ds:schemaRefs>
     <ds:schemaRef ds:uri="http://schemas.openxmlformats.org/officeDocument/2006/bibliography"/>
   </ds:schemaRefs>

</xml_diff>

<commit_message>
Finalize thesis report PDF and DOCX
</commit_message>
<xml_diff>
--- a/docs/graduation_thesis_report.docx
+++ b/docs/graduation_thesis_report.docx
@@ -5976,7 +5976,15 @@
     </w:p>
     <w:p>
       <w:r>
-        <w:t>In this project, supply chain visibility is addressed through a multi-page dashboard structure. The platform brings different operational views together, including overview indicators, regional performance, inventory control, shipment performance, risk analysis, and demand forecasting. This supports the idea that supply chain visibility should not focus on only one metric, but should combine different operational indicators.</w:t>
+        <w:t xml:space="preserve">In this project, supply chain visibility is addressed through a multi-page dashboard structure. The platform brings different operational views together, including overview indicators, regional performance, inventory control, shipment performance, risk analysis, and demand forecasting. This supports the idea that supply chain visibility should not focus on only one </w:t>
+      </w:r>
+      <w:proofErr w:type="gramStart"/>
+      <w:r>
+        <w:t>metric, but</w:t>
+      </w:r>
+      <w:proofErr w:type="gramEnd"/>
+      <w:r>
+        <w:t xml:space="preserve"> should combine different operational indicators.</w:t>
       </w:r>
     </w:p>
     <w:p>
@@ -6624,7 +6632,15 @@
     </w:p>
     <w:p>
       <w:r>
-        <w:t xml:space="preserve">Another original aspect of the project is the integration of multiple supply chain analysis areas in one platform. The system does not only show order or sales information. It combines executive KPIs, regional performance analysis, inventory control indicators, shipment </w:t>
+        <w:t xml:space="preserve">Another original aspect of the project is the integration of multiple supply chain analysis areas </w:t>
+      </w:r>
+      <w:proofErr w:type="gramStart"/>
+      <w:r>
+        <w:t>in</w:t>
+      </w:r>
+      <w:proofErr w:type="gramEnd"/>
+      <w:r>
+        <w:t xml:space="preserve"> one platform. The system does not only show order or sales information. It combines executive KPIs, regional performance analysis, inventory control indicators, shipment </w:t>
       </w:r>
       <w:r>
         <w:lastRenderedPageBreak/>
@@ -6697,7 +6713,15 @@
     </w:p>
     <w:p>
       <w:r>
-        <w:t>The solution approach of this project is based on developing a dataset-adaptive supply chain dashboard platform. The system is designed to work with a default demonstration dataset and also with user-uploaded supply chain datasets. The main idea is to transform different supply chain datasets into a common analytical structure and then generate dashboard modules from the active dataset.</w:t>
+        <w:t xml:space="preserve">The solution approach of this project is based on developing a dataset-adaptive supply chain dashboard platform. The system is designed to work with a default demonstration dataset </w:t>
+      </w:r>
+      <w:proofErr w:type="gramStart"/>
+      <w:r>
+        <w:t>and also</w:t>
+      </w:r>
+      <w:proofErr w:type="gramEnd"/>
+      <w:r>
+        <w:t xml:space="preserve"> with user-uploaded supply chain datasets. The main idea is to transform different supply chain datasets into a common analytical structure and then generate dashboard modules from the active dataset.</w:t>
       </w:r>
     </w:p>
     <w:p>
@@ -6753,12 +6777,52 @@
     </w:p>
     <w:p>
       <w:r>
-        <w:t>In the Data Source Manager, users map the columns of the uploaded dataset to the standard supply chain schema. The required fields include order ID, order date, product name, category name, and order quantity. Optional fields include shipping date, scheduled delivery date, delivery status, actual shipping days, scheduled shipping days, shipping mode, market, region, country, sales, and profit.</w:t>
-      </w:r>
-    </w:p>
-    <w:p>
-      <w:r>
-        <w:t>After the mapping is completed, the system standardizes the uploaded dataset. It converts date fields, numeric fields, and text fields into a common format. It also derives additional indicators where possible. For example, if actual shipping days and scheduled shipping days are not available, the system can calculate delay days by comparing delivered date and scheduled delivery date.</w:t>
+        <w:t xml:space="preserve">In the Data Source Manager, users map the columns of the uploaded dataset to the standard supply chain </w:t>
+      </w:r>
+      <w:proofErr w:type="gramStart"/>
+      <w:r>
+        <w:t>schema</w:t>
+      </w:r>
+      <w:proofErr w:type="gramEnd"/>
+      <w:r>
+        <w:t>. The required fields include order ID, order date, product name, category name, and order quantity. Optional fields include shipping date, scheduled delivery date, delivery status, actual shipping days, scheduled shipping days, shipping mode, market, region, country, sales, and profit.</w:t>
+      </w:r>
+    </w:p>
+    <w:p>
+      <w:r>
+        <w:t xml:space="preserve">After the mapping is completed, the system standardizes the uploaded dataset. It converts date fields, numeric fields, and text fields into a common format. It also derives additional indicators where possible. For example, if actual shipping days and scheduled shipping days are not available, the system can calculate </w:t>
+      </w:r>
+      <w:proofErr w:type="gramStart"/>
+      <w:r>
+        <w:t>delay</w:t>
+      </w:r>
+      <w:proofErr w:type="gramEnd"/>
+      <w:r>
+        <w:t xml:space="preserve"> days by comparing </w:t>
+      </w:r>
+      <w:proofErr w:type="gramStart"/>
+      <w:r>
+        <w:t>delivered</w:t>
+      </w:r>
+      <w:proofErr w:type="gramEnd"/>
+      <w:r>
+        <w:t xml:space="preserve"> </w:t>
+      </w:r>
+      <w:proofErr w:type="gramStart"/>
+      <w:r>
+        <w:t>date</w:t>
+      </w:r>
+      <w:proofErr w:type="gramEnd"/>
+      <w:r>
+        <w:t xml:space="preserve"> and scheduled delivery </w:t>
+      </w:r>
+      <w:proofErr w:type="gramStart"/>
+      <w:r>
+        <w:t>date</w:t>
+      </w:r>
+      <w:proofErr w:type="gramEnd"/>
+      <w:r>
+        <w:t>.</w:t>
       </w:r>
     </w:p>
     <w:p>
@@ -6803,7 +6867,15 @@
     </w:p>
     <w:p>
       <w:r>
-        <w:t>This structure allows the system to work as a flexible platform instead of a static dashboard. The same dashboard pages can be used with different supply chain datasets as long as the required fields are mapped correctly.</w:t>
+        <w:t xml:space="preserve">This structure allows the system to work as a flexible platform instead of a static dashboard. The same dashboard pages can be used with different supply chain datasets </w:t>
+      </w:r>
+      <w:proofErr w:type="gramStart"/>
+      <w:r>
+        <w:t>as long as</w:t>
+      </w:r>
+      <w:proofErr w:type="gramEnd"/>
+      <w:r>
+        <w:t xml:space="preserve"> the required fields are mapped correctly.</w:t>
       </w:r>
     </w:p>
     <w:p>
@@ -6919,8 +6991,21 @@
       <w:bookmarkEnd w:id="32"/>
     </w:p>
     <w:p>
-      <w:r>
-        <w:t>pandas was used for reading CSV and Excel files, cleaning the dataset, grouping records, calculating KPIs, and creating analytical tables. NumPy was used for numerical calculations and handling missing numerical values.</w:t>
+      <w:proofErr w:type="gramStart"/>
+      <w:r>
+        <w:t>pandas</w:t>
+      </w:r>
+      <w:proofErr w:type="gramEnd"/>
+      <w:r>
+        <w:t xml:space="preserve"> </w:t>
+      </w:r>
+      <w:proofErr w:type="gramStart"/>
+      <w:r>
+        <w:t>was</w:t>
+      </w:r>
+      <w:proofErr w:type="gramEnd"/>
+      <w:r>
+        <w:t xml:space="preserve"> used for reading CSV and Excel files, cleaning the dataset, grouping records, calculating KPIs, and creating analytical tables. NumPy was used for numerical calculations and handling missing numerical values.</w:t>
       </w:r>
       <w:sdt>
         <w:sdtPr>
@@ -6974,7 +7059,15 @@
       </w:r>
       <w:proofErr w:type="spellEnd"/>
       <w:r>
-        <w:t xml:space="preserve"> was used to develop the interactive dashboard interface. It allowed the project to include different pages, filters, file upload components, KPI cards, charts, and tables.</w:t>
+        <w:t xml:space="preserve"> was used to develop </w:t>
+      </w:r>
+      <w:proofErr w:type="gramStart"/>
+      <w:r>
+        <w:t>the</w:t>
+      </w:r>
+      <w:proofErr w:type="gramEnd"/>
+      <w:r>
+        <w:t xml:space="preserve"> interactive dashboard interface. It allowed the project to include different pages, filters, file upload components, KPI cards, charts, and tables.</w:t>
       </w:r>
     </w:p>
     <w:p>
@@ -7759,7 +7852,15 @@
     </w:p>
     <w:p>
       <w:r>
-        <w:t>The standard schema used in the platform is shown in Table 2.</w:t>
+        <w:t xml:space="preserve">The standard </w:t>
+      </w:r>
+      <w:proofErr w:type="gramStart"/>
+      <w:r>
+        <w:t>schema</w:t>
+      </w:r>
+      <w:proofErr w:type="gramEnd"/>
+      <w:r>
+        <w:t xml:space="preserve"> used in the platform is shown in Table 2.</w:t>
       </w:r>
       <w:r>
         <w:t xml:space="preserve"> </w:t>
@@ -8454,7 +8555,15 @@
     <w:p>
       <w:r>
         <w:lastRenderedPageBreak/>
-        <w:t>If an optional field is not available in the uploaded dataset, the system uses default values or derives indicators when possible. For example, if actual shipping days and scheduled shipping days are not available, the system can calculate delay days by comparing the actual delivery date and the scheduled delivery date. This improves the flexibility of the platform and allows it to work with different supply chain datasets.</w:t>
+        <w:t xml:space="preserve">If an optional field is not available in the uploaded dataset, the system uses default values or derives indicators when possible. For example, if actual shipping days and scheduled shipping days are not available, the system can calculate </w:t>
+      </w:r>
+      <w:proofErr w:type="gramStart"/>
+      <w:r>
+        <w:t>delay</w:t>
+      </w:r>
+      <w:proofErr w:type="gramEnd"/>
+      <w:r>
+        <w:t xml:space="preserve"> days by comparing the actual delivery date and the scheduled delivery date. This improves the flexibility of the platform and allows it to work with different supply chain datasets.</w:t>
       </w:r>
     </w:p>
     <w:p>
@@ -8514,7 +8623,7 @@
           <w:noProof/>
         </w:rPr>
         <w:drawing>
-          <wp:inline distT="0" distB="0" distL="0" distR="0" wp14:anchorId="670A0A81" wp14:editId="2B695BA8">
+          <wp:inline distT="0" distB="0" distL="0" distR="0" wp14:anchorId="670A0A81" wp14:editId="6C7142A5">
             <wp:extent cx="6162675" cy="4108228"/>
             <wp:effectExtent l="0" t="0" r="0" b="6985"/>
             <wp:docPr id="604311595" name="Picture 2"/>
@@ -8628,7 +8737,15 @@
     </w:p>
     <w:p>
       <w:r>
-        <w:t>The platform includes six dashboard modules. Each module focuses on a different part of supply chain visibility and risk analysis. These modules work with the active dataset. If the user activates an uploaded dataset, the same dashboard modules are updated according to the uploaded data.</w:t>
+        <w:t xml:space="preserve">The platform includes six dashboard modules. Each module focuses on a different part of supply chain visibility and risk analysis. These modules work with </w:t>
+      </w:r>
+      <w:proofErr w:type="gramStart"/>
+      <w:r>
+        <w:t>the</w:t>
+      </w:r>
+      <w:proofErr w:type="gramEnd"/>
+      <w:r>
+        <w:t xml:space="preserve"> active dataset. If the user activates an uploaded dataset, the same dashboard modules are updated according to the uploaded data.</w:t>
       </w:r>
     </w:p>
     <w:p>
@@ -8811,8 +8928,13 @@
             <w:tcW w:w="1666" w:type="pct"/>
           </w:tcPr>
           <w:p>
-            <w:r>
-              <w:t>Compares markets, regions, and countries</w:t>
+            <w:proofErr w:type="gramStart"/>
+            <w:r>
+              <w:t>Compares</w:t>
+            </w:r>
+            <w:proofErr w:type="gramEnd"/>
+            <w:r>
+              <w:t xml:space="preserve"> markets, regions, and countries</w:t>
             </w:r>
           </w:p>
         </w:tc>
@@ -9978,10 +10100,26 @@
     </w:p>
     <w:p>
       <w:r>
-        <w:t>The displayed risk scores are also affected by dashboard filters</w:t>
-      </w:r>
-      <w:r>
-        <w:t>. When the user filters the dataset by market, category, shipping mode, or date range, the risk components are recalculated based on the filtered data. This makes the risk analysis interactive and more useful for decision-making.</w:t>
+        <w:t xml:space="preserve">The </w:t>
+      </w:r>
+      <w:proofErr w:type="gramStart"/>
+      <w:r>
+        <w:t>displayed risk scores</w:t>
+      </w:r>
+      <w:proofErr w:type="gramEnd"/>
+      <w:r>
+        <w:t xml:space="preserve"> are also affected by dashboard filters</w:t>
+      </w:r>
+      <w:r>
+        <w:t xml:space="preserve">. When the user filters the dataset by market, category, shipping mode, or date range, the risk components are recalculated based on the filtered data. This makes </w:t>
+      </w:r>
+      <w:proofErr w:type="gramStart"/>
+      <w:r>
+        <w:t>the risk</w:t>
+      </w:r>
+      <w:proofErr w:type="gramEnd"/>
+      <w:r>
+        <w:t xml:space="preserve"> analysis interactive and more useful for decision-making.</w:t>
       </w:r>
     </w:p>
     <w:p>
@@ -10040,7 +10178,23 @@
     </w:p>
     <w:p>
       <w:r>
-        <w:t>The forecasting approach is intentionally simple because the main focus of the project is supply chain visibility and risk assessment. The purpose of the forecast module is to demonstrate how demand data can support planning decisions, not to create a highly advanced forecasting system.</w:t>
+        <w:t xml:space="preserve">The forecasting approach is intentionally simple because the </w:t>
+      </w:r>
+      <w:proofErr w:type="gramStart"/>
+      <w:r>
+        <w:t>main focus</w:t>
+      </w:r>
+      <w:proofErr w:type="gramEnd"/>
+      <w:r>
+        <w:t xml:space="preserve"> of the project is </w:t>
+      </w:r>
+      <w:proofErr w:type="gramStart"/>
+      <w:r>
+        <w:t>supply</w:t>
+      </w:r>
+      <w:proofErr w:type="gramEnd"/>
+      <w:r>
+        <w:t xml:space="preserve"> chain visibility and risk assessment. The purpose of the forecast module is to demonstrate how demand data can support planning decisions, not to create a highly advanced forecasting system.</w:t>
       </w:r>
     </w:p>
     <w:p>
@@ -10092,7 +10246,7 @@
         </w:rPr>
         <w:lastRenderedPageBreak/>
         <w:drawing>
-          <wp:inline distT="0" distB="0" distL="0" distR="0" wp14:anchorId="385ACC34" wp14:editId="4588C7E4">
+          <wp:inline distT="0" distB="0" distL="0" distR="0" wp14:anchorId="385ACC34" wp14:editId="18E6E1CD">
             <wp:extent cx="5965647" cy="3476625"/>
             <wp:effectExtent l="0" t="0" r="0" b="0"/>
             <wp:docPr id="1801230199" name="Picture 4"/>
@@ -10563,7 +10717,15 @@
     </w:p>
     <w:p>
       <w:r>
-        <w:t xml:space="preserve">The company needs a reusable dashboard platform that can work with different supply chain datasets. The platform should not require code changes every time a new dataset is analyzed. </w:t>
+        <w:t xml:space="preserve">The company needs a reusable dashboard platform that can work with different supply chain datasets. The platform should not require code changes every time a new </w:t>
+      </w:r>
+      <w:proofErr w:type="gramStart"/>
+      <w:r>
+        <w:t>dataset</w:t>
+      </w:r>
+      <w:proofErr w:type="gramEnd"/>
+      <w:r>
+        <w:t xml:space="preserve"> is analyzed. </w:t>
       </w:r>
       <w:r>
         <w:lastRenderedPageBreak/>
@@ -10890,7 +11052,7 @@
         </w:rPr>
         <w:lastRenderedPageBreak/>
         <w:drawing>
-          <wp:inline distT="0" distB="0" distL="0" distR="0" wp14:anchorId="2FC8B4CF" wp14:editId="089B368F">
+          <wp:inline distT="0" distB="0" distL="0" distR="0" wp14:anchorId="2FC8B4CF" wp14:editId="2DEA846C">
             <wp:extent cx="5868670" cy="3867785"/>
             <wp:effectExtent l="0" t="0" r="0" b="0"/>
             <wp:docPr id="656098705" name="Picture 5"/>
@@ -11003,7 +11165,15 @@
     </w:p>
     <w:p>
       <w:r>
-        <w:t xml:space="preserve">An example usage flow starts with the user opening the platform. At first, the default </w:t>
+        <w:t xml:space="preserve">An example usage flow starts with the user opening the platform. </w:t>
+      </w:r>
+      <w:proofErr w:type="gramStart"/>
+      <w:r>
+        <w:t>At first</w:t>
+      </w:r>
+      <w:proofErr w:type="gramEnd"/>
+      <w:r>
+        <w:t xml:space="preserve">, the default </w:t>
       </w:r>
       <w:proofErr w:type="spellStart"/>
       <w:r>
@@ -11011,7 +11181,15 @@
       </w:r>
       <w:proofErr w:type="spellEnd"/>
       <w:r>
-        <w:t xml:space="preserve"> dataset is active. The user can review the default dashboard, or upload a new supply chain dataset through the Data Source Manager.</w:t>
+        <w:t xml:space="preserve"> dataset is active. The user can review the default </w:t>
+      </w:r>
+      <w:proofErr w:type="gramStart"/>
+      <w:r>
+        <w:t>dashboard, or</w:t>
+      </w:r>
+      <w:proofErr w:type="gramEnd"/>
+      <w:r>
+        <w:t xml:space="preserve"> upload a new supply chain dataset through the Data Source Manager.</w:t>
       </w:r>
     </w:p>
     <w:p>
@@ -11504,7 +11682,15 @@
     <w:p/>
     <w:p>
       <w:r>
-        <w:t>These tests show that the platform can process the default dataset, support uploaded datasets through schema mapping, and generate the main dashboard outputs. However, the validation is limited to functional testing. The current version does not include automated unit tests, stress testing with very large uploaded files, or live ERP/API integration testing. These limitations are considered future improvement areas.</w:t>
+        <w:t xml:space="preserve">These tests show that the platform can process the default dataset, support uploaded datasets through schema mapping, and generate the main dashboard outputs. However, the validation is limited to functional testing. The current version does not include automated unit tests, stress testing with very </w:t>
+      </w:r>
+      <w:proofErr w:type="gramStart"/>
+      <w:r>
+        <w:t>large uploaded</w:t>
+      </w:r>
+      <w:proofErr w:type="gramEnd"/>
+      <w:r>
+        <w:t xml:space="preserve"> files, or live ERP/API integration testing. These limitations are considered future improvement areas.</w:t>
       </w:r>
     </w:p>
     <w:p>
@@ -11544,7 +11730,15 @@
     </w:p>
     <w:p>
       <w:r>
-        <w:t>The completed platform includes several dashboard modules: Overview, Regional Performance, Inventory Control, Shipment Performance, Supply Chain Risk, and Demand Forecast. These modules provide key performance indicators, charts, tables, risk scores, and forecasting outputs. The dashboard helps users analyze delivery performance, shipment delays, inventory status, regional differences, demand trends, and overall supply chain risk.</w:t>
+        <w:t xml:space="preserve">The completed platform includes several dashboard modules: Overview, Regional Performance, Inventory Control, Shipment Performance, Supply Chain Risk, and Demand Forecast. These modules provide key performance indicators, charts, tables, risk scores, and </w:t>
+      </w:r>
+      <w:proofErr w:type="gramStart"/>
+      <w:r>
+        <w:t>forecasting</w:t>
+      </w:r>
+      <w:proofErr w:type="gramEnd"/>
+      <w:r>
+        <w:t xml:space="preserve"> outputs. The dashboard helps users analyze delivery performance, shipment delays, inventory status, regional differences, demand trends, and overall supply chain risk.</w:t>
       </w:r>
     </w:p>
     <w:p>
@@ -11597,9 +11791,9 @@
         <w:t>datasets can be standardized and transformed into operational insights through dashboards, risk indicators, and forecasting modules.</w:t>
       </w:r>
     </w:p>
-    <w:bookmarkStart w:id="65" w:name="_Toc230437542" w:displacedByCustomXml="next"/>
+    <w:bookmarkStart w:id="65" w:name="_Toc32521151" w:displacedByCustomXml="next"/>
     <w:bookmarkStart w:id="66" w:name="_Toc494826192" w:displacedByCustomXml="next"/>
-    <w:bookmarkStart w:id="67" w:name="_Toc32521151" w:displacedByCustomXml="next"/>
+    <w:bookmarkStart w:id="67" w:name="_Toc230437542" w:displacedByCustomXml="next"/>
     <w:sdt>
       <w:sdtPr>
         <w:rPr>
@@ -12666,7 +12860,25 @@
           <w:bCs/>
           <w:lang w:eastAsia="tr-TR"/>
         </w:rPr>
-        <w:t>Performed data cleaning and exploratory data analysis on housing data using Python.</w:t>
+        <w:t xml:space="preserve">Performed data cleaning and </w:t>
+      </w:r>
+      <w:proofErr w:type="gramStart"/>
+      <w:r>
+        <w:rPr>
+          <w:b/>
+          <w:bCs/>
+          <w:lang w:eastAsia="tr-TR"/>
+        </w:rPr>
+        <w:t>exploratory</w:t>
+      </w:r>
+      <w:proofErr w:type="gramEnd"/>
+      <w:r>
+        <w:rPr>
+          <w:b/>
+          <w:bCs/>
+          <w:lang w:eastAsia="tr-TR"/>
+        </w:rPr>
+        <w:t xml:space="preserve"> data analysis on housing data using Python.</w:t>
       </w:r>
     </w:p>
     <w:p>
@@ -12705,7 +12917,25 @@
           <w:bCs/>
           <w:lang w:eastAsia="tr-TR"/>
         </w:rPr>
-        <w:t>Conducted data preprocessing and exploratory analysis on a biological dataset using Python.</w:t>
+        <w:t xml:space="preserve">Conducted data preprocessing and </w:t>
+      </w:r>
+      <w:proofErr w:type="gramStart"/>
+      <w:r>
+        <w:rPr>
+          <w:b/>
+          <w:bCs/>
+          <w:lang w:eastAsia="tr-TR"/>
+        </w:rPr>
+        <w:t>exploratory</w:t>
+      </w:r>
+      <w:proofErr w:type="gramEnd"/>
+      <w:r>
+        <w:rPr>
+          <w:b/>
+          <w:bCs/>
+          <w:lang w:eastAsia="tr-TR"/>
+        </w:rPr>
+        <w:t xml:space="preserve"> analysis on a biological dataset using Python.</w:t>
       </w:r>
     </w:p>
     <w:p>
@@ -15958,7 +16188,7 @@
   <w:style w:type="paragraph" w:default="1" w:styleId="Normal">
     <w:name w:val="Normal"/>
     <w:qFormat/>
-    <w:rsid w:val="009866A0"/>
+    <w:rsid w:val="00701174"/>
     <w:pPr>
       <w:spacing w:after="160" w:line="278" w:lineRule="auto"/>
     </w:pPr>
@@ -16165,7 +16395,7 @@
     <w:uiPriority w:val="1"/>
     <w:semiHidden/>
     <w:unhideWhenUsed/>
-    <w:rsid w:val="009866A0"/>
+    <w:rsid w:val="00701174"/>
   </w:style>
   <w:style w:type="table" w:default="1" w:styleId="TableNormal">
     <w:name w:val="Normal Table"/>
@@ -16187,7 +16417,7 @@
     <w:uiPriority w:val="99"/>
     <w:semiHidden/>
     <w:unhideWhenUsed/>
-    <w:rsid w:val="009866A0"/>
+    <w:rsid w:val="00701174"/>
   </w:style>
   <w:style w:type="paragraph" w:styleId="Title">
     <w:name w:val="Title"/>

</xml_diff>